<commit_message>
Livro policial: cap. 1 com a plataforma do crematório
Co-Authored-By: Claude Opus 5.5 <noreply@anthropic.com>
Claude-Session: https://claude.ai/code/session_01BrurxSYygRC3rRhaUYosm1
</commit_message>
<xml_diff>
--- a/docs/livro-policial/TODO_CRIME_TEM_UM_AUTOR.docx
+++ b/docs/livro-policial/TODO_CRIME_TEM_UM_AUTOR.docx
@@ -45,7 +45,7 @@
           <w:sz w:val="21"/>
           <w:szCs w:val="21"/>
         </w:rPr>
-        <w:t xml:space="preserve">Henrique Salvallus tinha escapado da morte quatro vezes em oito meses. Na quinta, ela veio sem barulho, numa terça-feira de manhã, e ninguém do lado de fora da capela parecia muito surpreso.</w:t>
+        <w:t xml:space="preserve">Henrique Salvallus tinha escapado da morte quatro vezes em oito meses. Na quinta, ela veio sem barulho, numa terça-feira de manhã, e ninguém do lado de fora da sala de velório parecia muito surpreso.</w:t>
       </w:r>
     </w:p>
     <w:p>
@@ -105,7 +105,7 @@
           <w:sz w:val="21"/>
           <w:szCs w:val="21"/>
         </w:rPr>
-        <w:t xml:space="preserve">A capela era pequena para tanta gente. Coroas de flores cobriam a parede do fundo, e as faixas roxas diziam coisas em que ninguém ali acreditava: Saudades eternas. Ao grande amigo. Com profundo pesar. A maior delas vinha assinada por Rubens Falcão. Lia leu o nome duas vezes. O pai tinha passado o último ano dizendo que aquele homem queria vê-lo enterrado.</w:t>
+        <w:t xml:space="preserve">A sala de velório era pequena para tanta gente. Coroas de flores cobriam a parede do fundo, e as faixas roxas diziam coisas em que ninguém ali acreditava: Saudades eternas. Ao grande amigo. Com profundo pesar. A maior delas vinha assinada por Rubens Falcão. Lia leu o nome duas vezes. O pai tinha passado o último ano dizendo que aquele homem queria vê-lo enterrado.</w:t>
       </w:r>
     </w:p>
     <w:p>
@@ -239,7 +239,7 @@
           <w:sz w:val="21"/>
           <w:szCs w:val="21"/>
         </w:rPr>
-        <w:t xml:space="preserve">Do outro lado da capela, as três mulheres de Henrique estavam sentadas como se uma linha invisível as separasse. Marta, a primeira, mãe de Lucas, de costas retas e sem uma lágrima, recebia as pessoas com a educação de quem já tinha chorado por aquele homem tudo o que havia para chorar, muitos anos antes. Sílvia, a segunda, mãe de Lia, segurava o braço de Carlos, que olhava para o chão. E Helena, a viúva, a mais nova das três, recebia os pêsames de pé, ao lado do caixão, como a dona da casa.</w:t>
+        <w:t xml:space="preserve">Do outro lado da sala, as três mulheres de Henrique estavam sentadas como se uma linha invisível as separasse. Marta, a primeira, mãe de Lucas, de costas retas e sem uma lágrima, recebia as pessoas com a educação de quem já tinha chorado por aquele homem tudo o que havia para chorar, muitos anos antes. Sílvia, a segunda, mãe de Lia, segurava o braço de Carlos, que olhava para o chão. E Helena, a viúva, a mais nova das três, recebia os pêsames de pé, ao lado do caixão, como a dona da casa.</w:t>
       </w:r>
     </w:p>
     <w:p>
@@ -373,7 +373,7 @@
           <w:sz w:val="21"/>
           <w:szCs w:val="21"/>
         </w:rPr>
-        <w:t xml:space="preserve">Lucas chegou quase às dez, quando o padre já tinha começado. Entrou pela porta lateral, de óculos escuros, e ficou de pé, encostado na parede do fundo, longe do caixão. Lia o observou durante toda a cerimônia. O irmão não se aproximou do pai nem uma vez. Também não chorou. Tinha as mãos nos bolsos e o maxilar tão apertado que ela via o músculo saltar no rosto dele.</w:t>
+        <w:t xml:space="preserve">Lucas chegou quase às dez, quando a sala já estava cheia. Entrou pela porta lateral, de óculos escuros, e ficou de pé, encostado na parede do fundo, longe do caixão. Lia o observou durante todo o velório. O irmão não se aproximou do pai nem uma vez. Também não chorou. Tinha as mãos nos bolsos e o maxilar tão apertado que ela via o músculo saltar no rosto dele.</w:t>
       </w:r>
     </w:p>
     <w:p>
@@ -447,7 +447,7 @@
           <w:sz w:val="21"/>
           <w:szCs w:val="21"/>
         </w:rPr>
-        <w:t xml:space="preserve">Foi no intervalo, enquanto o padre aguardava a família para a encomendação, que Lia ouviu a discussão.</w:t>
+        <w:t xml:space="preserve">Foi pouco antes da cerimônia de despedida, quando os funcionários começaram a chamar a família, que Lia ouviu a discussão.</w:t>
       </w:r>
     </w:p>
     <w:p>
@@ -567,22 +567,22 @@
           <w:sz w:val="21"/>
           <w:szCs w:val="21"/>
         </w:rPr>
-        <w:t xml:space="preserve">Lia se afastou antes que a porta se abrisse. Voltou para a capela com o coração acelerado, sem saber direito por quê. Um homem que sempre defendera a cremação implorando por um enterro. Um médico pedindo a uma viúva que mudasse de ideia faltando meia hora.</w:t>
-      </w:r>
-    </w:p>
-    <w:p>
-      <w:pPr>
-        <w:spacing w:after="0" w:line="312"/>
-        <w:ind w:firstLine="340"/>
-        <w:jc w:val="both"/>
-      </w:pPr>
-      <w:r>
-        <w:rPr>
-          <w:rFonts w:ascii="Georgia" w:cs="Georgia" w:eastAsia="Georgia" w:hAnsi="Georgia"/>
-          <w:sz w:val="21"/>
-          <w:szCs w:val="21"/>
-        </w:rPr>
-        <w:t xml:space="preserve">Quando o doutor Álvaro entrou na capela, minutos depois, estava pálido e suava, apesar do ar-condicionado. Olhou o relógio duas vezes enquanto o padre falava. Na terceira, Lia viu a mão dele tremer.</w:t>
+        <w:t xml:space="preserve">Lia se afastou antes que a porta se abrisse. Voltou para a sala com o coração acelerado, sem saber direito por quê. Um homem que sempre defendera a cremação implorando por um enterro. Um médico pedindo a uma viúva que mudasse de ideia faltando meia hora.</w:t>
+      </w:r>
+    </w:p>
+    <w:p>
+      <w:pPr>
+        <w:spacing w:after="0" w:line="312"/>
+        <w:ind w:firstLine="340"/>
+        <w:jc w:val="both"/>
+      </w:pPr>
+      <w:r>
+        <w:rPr>
+          <w:rFonts w:ascii="Georgia" w:cs="Georgia" w:eastAsia="Georgia" w:hAnsi="Georgia"/>
+          <w:sz w:val="21"/>
+          <w:szCs w:val="21"/>
+        </w:rPr>
+        <w:t xml:space="preserve">Quando o doutor Álvaro voltou, minutos depois, estava pálido e suava, apesar do ar-condicionado. Olhou o relógio duas vezes enquanto todos se encaminhavam para o salão. Na terceira, Lia viu a mão dele tremer.</w:t>
       </w:r>
     </w:p>
     <w:p>
@@ -626,52 +626,97 @@
           <w:sz w:val="21"/>
           <w:szCs w:val="21"/>
         </w:rPr>
-        <w:t xml:space="preserve">A encomendação foi curta. O padre falou de ressurreição, e alguém na segunda fila soltou um riso abafado que virou tosse. Depois, os funcionários fecharam o caixão.</w:t>
-      </w:r>
-    </w:p>
-    <w:p>
-      <w:pPr>
-        <w:spacing w:after="0" w:line="312"/>
-        <w:ind w:firstLine="340"/>
-        <w:jc w:val="both"/>
-      </w:pPr>
-      <w:r>
-        <w:rPr>
-          <w:rFonts w:ascii="Georgia" w:cs="Georgia" w:eastAsia="Georgia" w:hAnsi="Georgia"/>
-          <w:sz w:val="21"/>
-          <w:szCs w:val="21"/>
-        </w:rPr>
-        <w:t xml:space="preserve">Lia se levantou junto com a mãe. Lucas, finalmente, deu dois passos à frente, mas parou antes de chegar perto. Helena pousou a mão sobre a tampa. Marta continuou sentada. Carlos continuou olhando para o chão.</w:t>
-      </w:r>
-    </w:p>
-    <w:p>
-      <w:pPr>
-        <w:spacing w:after="0" w:line="312"/>
-        <w:ind w:firstLine="340"/>
-        <w:jc w:val="both"/>
-      </w:pPr>
-      <w:r>
-        <w:rPr>
-          <w:rFonts w:ascii="Georgia" w:cs="Georgia" w:eastAsia="Georgia" w:hAnsi="Georgia"/>
-          <w:sz w:val="21"/>
-          <w:szCs w:val="21"/>
-        </w:rPr>
-        <w:t xml:space="preserve">O caixão deslizou devagar pela abertura na parede, rumo à sala onde a família não entra. Uma cortina de veludo se fechou atrás dele. Foi tudo silencioso, limpo, quase educado. Lia tinha imaginado algo mais dramático, uma chama, um estrondo. Não houve nada. Só a cortina e o zumbido do ar-condicionado.</w:t>
-      </w:r>
-    </w:p>
-    <w:p>
-      <w:pPr>
-        <w:spacing w:after="0" w:line="312"/>
-        <w:ind w:firstLine="340"/>
-        <w:jc w:val="both"/>
-      </w:pPr>
-      <w:r>
-        <w:rPr>
-          <w:rFonts w:ascii="Georgia" w:cs="Georgia" w:eastAsia="Georgia" w:hAnsi="Georgia"/>
-          <w:sz w:val="21"/>
-          <w:szCs w:val="21"/>
-        </w:rPr>
-        <w:t xml:space="preserve">O doutor Álvaro fechou os olhos. Ficou assim, imóvel, até a cortina parar de balançar.</w:t>
+        <w:t xml:space="preserve">A cerimônia de despedida foi no salão principal. As poltronas formavam um semicírculo, e o centro ficava vazio: um piso liso, onde não havia nada. Lia estranhou aquele espaço em branco até ouvir o ruído suave de um motor. Um alçapão se abriu no chão e, de baixo, do subsolo, uma plataforma subiu devagar, trazendo o caixão já fechado. Parou no centro, rente ao piso, e ficou ali, cercado pelas poltronas, como se o pai estivesse no meio de uma roda de conversa.</w:t>
+      </w:r>
+    </w:p>
+    <w:p>
+      <w:pPr>
+        <w:spacing w:after="0" w:line="312"/>
+        <w:ind w:firstLine="340"/>
+        <w:jc w:val="both"/>
+      </w:pPr>
+      <w:r>
+        <w:rPr>
+          <w:rFonts w:ascii="Georgia" w:cs="Georgia" w:eastAsia="Georgia" w:hAnsi="Georgia"/>
+          <w:sz w:val="21"/>
+          <w:szCs w:val="21"/>
+        </w:rPr>
+        <w:t xml:space="preserve">Lia sentou-se ao lado da mãe. Lucas escolheu a última poltrona do semicírculo, a mais distante. Marta, Helena e Carlos ocuparam os seus lugares sem se olhar.</w:t>
+      </w:r>
+    </w:p>
+    <w:p>
+      <w:pPr>
+        <w:spacing w:after="0" w:line="312"/>
+        <w:ind w:firstLine="340"/>
+        <w:jc w:val="both"/>
+      </w:pPr>
+      <w:r>
+        <w:rPr>
+          <w:rFonts w:ascii="Georgia" w:cs="Georgia" w:eastAsia="Georgia" w:hAnsi="Georgia"/>
+          <w:sz w:val="21"/>
+          <w:szCs w:val="21"/>
+        </w:rPr>
+        <w:t xml:space="preserve">O padre falou de ressurreição, e alguém na segunda fileira soltou um riso abafado que virou tosse.</w:t>
+      </w:r>
+    </w:p>
+    <w:p>
+      <w:pPr>
+        <w:spacing w:after="0" w:line="312"/>
+        <w:ind w:firstLine="340"/>
+        <w:jc w:val="both"/>
+      </w:pPr>
+      <w:r>
+        <w:rPr>
+          <w:rFonts w:ascii="Georgia" w:cs="Georgia" w:eastAsia="Georgia" w:hAnsi="Georgia"/>
+          <w:sz w:val="21"/>
+          <w:szCs w:val="21"/>
+        </w:rPr>
+        <w:t xml:space="preserve">Quando ele terminou, Helena se levantou e pousou a mão sobre a tampa. Ficou um instante assim. Depois voltou ao seu lugar, e o ruído do motor recomeçou.</w:t>
+      </w:r>
+    </w:p>
+    <w:p>
+      <w:pPr>
+        <w:spacing w:after="0" w:line="312"/>
+        <w:ind w:firstLine="340"/>
+        <w:jc w:val="both"/>
+      </w:pPr>
+      <w:r>
+        <w:rPr>
+          <w:rFonts w:ascii="Georgia" w:cs="Georgia" w:eastAsia="Georgia" w:hAnsi="Georgia"/>
+          <w:sz w:val="21"/>
+          <w:szCs w:val="21"/>
+        </w:rPr>
+        <w:t xml:space="preserve">A plataforma desceu pelo mesmo caminho por onde tinha subido. Devagar, centímetro por centímetro, como um caixão que baixa à cova. Lia pensou que era isso: o enterro possível. O pai descendo à terra, só que ali a terra terminava num forno.</w:t>
+      </w:r>
+    </w:p>
+    <w:p>
+      <w:pPr>
+        <w:spacing w:after="0" w:line="312"/>
+        <w:ind w:firstLine="340"/>
+        <w:jc w:val="both"/>
+      </w:pPr>
+      <w:r>
+        <w:rPr>
+          <w:rFonts w:ascii="Georgia" w:cs="Georgia" w:eastAsia="Georgia" w:hAnsi="Georgia"/>
+          <w:sz w:val="21"/>
+          <w:szCs w:val="21"/>
+        </w:rPr>
+        <w:t xml:space="preserve">O alçapão se fechou. O piso voltou a ser liso, inteiro, como se nunca tivesse se aberto. Foi tudo silencioso, limpo, quase educado. Lia tinha imaginado algo mais dramático, uma chama, um estrondo. Não houve nada. Só o chão fechado e o zumbido do ar-condicionado.</w:t>
+      </w:r>
+    </w:p>
+    <w:p>
+      <w:pPr>
+        <w:spacing w:after="0" w:line="312"/>
+        <w:ind w:firstLine="340"/>
+        <w:jc w:val="both"/>
+      </w:pPr>
+      <w:r>
+        <w:rPr>
+          <w:rFonts w:ascii="Georgia" w:cs="Georgia" w:eastAsia="Georgia" w:hAnsi="Georgia"/>
+          <w:sz w:val="21"/>
+          <w:szCs w:val="21"/>
+        </w:rPr>
+        <w:t xml:space="preserve">O doutor Álvaro tinha fechado os olhos quando a plataforma começou a descer. Só os abriu muito depois de o alçapão se fechar.</w:t>
       </w:r>
     </w:p>
     <w:p>
@@ -776,7 +821,7 @@
           <w:sz w:val="21"/>
           <w:szCs w:val="21"/>
         </w:rPr>
-        <w:t xml:space="preserve">Procurou Lucas com os olhos. Ele estava parado no meio da capela, olhando para o mesmo grupo de homens.</w:t>
+        <w:t xml:space="preserve">Procurou Lucas com os olhos. Ele estava de pé, ao lado da última poltrona, olhando para o mesmo grupo de homens.</w:t>
       </w:r>
     </w:p>
     <w:p>

</xml_diff>

<commit_message>
Livro policial: capítulo 2 (4821)
Co-Authored-By: Claude Opus 5.5 <noreply@anthropic.com>
Claude-Session: https://claude.ai/code/session_01BrurxSYygRC3rRhaUYosm1
</commit_message>
<xml_diff>
--- a/docs/livro-policial/TODO_CRIME_TEM_UM_AUTOR.docx
+++ b/docs/livro-policial/TODO_CRIME_TEM_UM_AUTOR.docx
@@ -837,6 +837,784 @@
           <w:szCs w:val="21"/>
         </w:rPr>
         <w:t xml:space="preserve">Tinha ouvido também.</w:t>
+      </w:r>
+    </w:p>
+    <w:p>
+      <w:pPr>
+        <w:pageBreakBefore/>
+        <w:spacing w:after="120" w:before="1800"/>
+        <w:jc w:val="center"/>
+      </w:pPr>
+      <w:r>
+        <w:rPr>
+          <w:rFonts w:ascii="Georgia" w:cs="Georgia" w:eastAsia="Georgia" w:hAnsi="Georgia"/>
+          <w:spacing w:val="40"/>
+          <w:sz w:val="20"/>
+          <w:szCs w:val="20"/>
+        </w:rPr>
+        <w:t xml:space="preserve">CAPÍTULO 2</w:t>
+      </w:r>
+    </w:p>
+    <w:p>
+      <w:pPr>
+        <w:spacing w:after="720"/>
+        <w:jc w:val="center"/>
+      </w:pPr>
+      <w:r>
+        <w:rPr>
+          <w:rFonts w:ascii="Georgia" w:cs="Georgia" w:eastAsia="Georgia" w:hAnsi="Georgia"/>
+          <w:b/>
+          <w:bCs/>
+          <w:sz w:val="32"/>
+          <w:szCs w:val="32"/>
+        </w:rPr>
+        <w:t xml:space="preserve">4821</w:t>
+      </w:r>
+    </w:p>
+    <w:p>
+      <w:pPr>
+        <w:spacing w:after="0" w:line="312"/>
+        <w:ind w:firstLine="340"/>
+        <w:jc w:val="both"/>
+      </w:pPr>
+      <w:r>
+        <w:rPr>
+          <w:rFonts w:ascii="Georgia" w:cs="Georgia" w:eastAsia="Georgia" w:hAnsi="Georgia"/>
+          <w:sz w:val="21"/>
+          <w:szCs w:val="21"/>
+        </w:rPr>
+        <w:t xml:space="preserve">O saco plástico tinha o logotipo de uma farmácia e pesava quase nada.</w:t>
+      </w:r>
+    </w:p>
+    <w:p>
+      <w:pPr>
+        <w:spacing w:after="0" w:line="312"/>
+        <w:ind w:firstLine="340"/>
+        <w:jc w:val="both"/>
+      </w:pPr>
+      <w:r>
+        <w:rPr>
+          <w:rFonts w:ascii="Georgia" w:cs="Georgia" w:eastAsia="Georgia" w:hAnsi="Georgia"/>
+          <w:sz w:val="21"/>
+          <w:szCs w:val="21"/>
+        </w:rPr>
+        <w:t xml:space="preserve">— Era o que ele tinha nos bolsos — disse Helena, estendendo o saco por cima da mesa de centro. — A carteira, as chaves, o relógio. E isso.</w:t>
+      </w:r>
+    </w:p>
+    <w:p>
+      <w:pPr>
+        <w:spacing w:after="0" w:line="312"/>
+        <w:ind w:firstLine="340"/>
+        <w:jc w:val="both"/>
+      </w:pPr>
+      <w:r>
+        <w:rPr>
+          <w:rFonts w:ascii="Georgia" w:cs="Georgia" w:eastAsia="Georgia" w:hAnsi="Georgia"/>
+          <w:sz w:val="21"/>
+          <w:szCs w:val="21"/>
+        </w:rPr>
+        <w:t xml:space="preserve">Isso era o BlackBerry do pai. Preto, com o teclado gasto nas letras mais usadas, a tela riscada num canto. Lucas reconheceria aquele aparelho em qualquer lugar. Tinha passado a vida inteira disputando a atenção do pai com ele.</w:t>
+      </w:r>
+    </w:p>
+    <w:p>
+      <w:pPr>
+        <w:spacing w:after="0" w:line="312"/>
+        <w:ind w:firstLine="340"/>
+        <w:jc w:val="both"/>
+      </w:pPr>
+      <w:r>
+        <w:rPr>
+          <w:rFonts w:ascii="Georgia" w:cs="Georgia" w:eastAsia="Georgia" w:hAnsi="Georgia"/>
+          <w:sz w:val="21"/>
+          <w:szCs w:val="21"/>
+        </w:rPr>
+        <w:t xml:space="preserve">Estavam na sala da casa do Jardim Europa, na quinta-feira à tarde, um dia depois da cremação. Os móveis eram os mesmos de sempre, mas a casa parecia maior, como se tivesse perdido alguma coisa que ocupava espaço. Helena usava um vestido cinza e nenhuma maquiagem. Não tinha chorado no velório. Também não chorava agora.</w:t>
+      </w:r>
+    </w:p>
+    <w:p>
+      <w:pPr>
+        <w:spacing w:after="0" w:line="312"/>
+        <w:ind w:firstLine="340"/>
+        <w:jc w:val="both"/>
+      </w:pPr>
+      <w:r>
+        <w:rPr>
+          <w:rFonts w:ascii="Georgia" w:cs="Georgia" w:eastAsia="Georgia" w:hAnsi="Georgia"/>
+          <w:sz w:val="21"/>
+          <w:szCs w:val="21"/>
+        </w:rPr>
+        <w:t xml:space="preserve">— Por que eu? — perguntou Lucas. — Você é a viúva.</w:t>
+      </w:r>
+    </w:p>
+    <w:p>
+      <w:pPr>
+        <w:spacing w:after="0" w:line="312"/>
+        <w:ind w:firstLine="340"/>
+        <w:jc w:val="both"/>
+      </w:pPr>
+      <w:r>
+        <w:rPr>
+          <w:rFonts w:ascii="Georgia" w:cs="Georgia" w:eastAsia="Georgia" w:hAnsi="Georgia"/>
+          <w:sz w:val="21"/>
+          <w:szCs w:val="21"/>
+        </w:rPr>
+        <w:t xml:space="preserve">— Porque ele dizia que, se um dia acontecesse alguma coisa, era pra entregar a você. — Ela cruzou os braços. — E porque eu não quero saber o que tem aí dentro.</w:t>
+      </w:r>
+    </w:p>
+    <w:p>
+      <w:pPr>
+        <w:spacing w:after="0" w:line="312"/>
+        <w:ind w:firstLine="340"/>
+        <w:jc w:val="both"/>
+      </w:pPr>
+      <w:r>
+        <w:rPr>
+          <w:rFonts w:ascii="Georgia" w:cs="Georgia" w:eastAsia="Georgia" w:hAnsi="Georgia"/>
+          <w:sz w:val="21"/>
+          <w:szCs w:val="21"/>
+        </w:rPr>
+        <w:t xml:space="preserve">Lucas olhou para ela por um segundo a mais do que devia. Helena sustentou o olhar.</w:t>
+      </w:r>
+    </w:p>
+    <w:p>
+      <w:pPr>
+        <w:spacing w:after="0" w:line="312"/>
+        <w:ind w:firstLine="340"/>
+        <w:jc w:val="both"/>
+      </w:pPr>
+      <w:r>
+        <w:rPr>
+          <w:rFonts w:ascii="Georgia" w:cs="Georgia" w:eastAsia="Georgia" w:hAnsi="Georgia"/>
+          <w:sz w:val="21"/>
+          <w:szCs w:val="21"/>
+        </w:rPr>
+        <w:t xml:space="preserve">— Pode levar a pasta do escritório também. Otávio já veio buscar os contratos. Disse que é para não parar a empresa.</w:t>
+      </w:r>
+    </w:p>
+    <w:p>
+      <w:pPr>
+        <w:spacing w:after="0" w:line="312"/>
+        <w:ind w:firstLine="340"/>
+        <w:jc w:val="both"/>
+      </w:pPr>
+      <w:r>
+        <w:rPr>
+          <w:rFonts w:ascii="Georgia" w:cs="Georgia" w:eastAsia="Georgia" w:hAnsi="Georgia"/>
+          <w:sz w:val="21"/>
+          <w:szCs w:val="21"/>
+        </w:rPr>
+        <w:t xml:space="preserve">— Ele veio ontem?</w:t>
+      </w:r>
+    </w:p>
+    <w:p>
+      <w:pPr>
+        <w:spacing w:after="0" w:line="312"/>
+        <w:ind w:firstLine="340"/>
+        <w:jc w:val="both"/>
+      </w:pPr>
+      <w:r>
+        <w:rPr>
+          <w:rFonts w:ascii="Georgia" w:cs="Georgia" w:eastAsia="Georgia" w:hAnsi="Georgia"/>
+          <w:sz w:val="21"/>
+          <w:szCs w:val="21"/>
+        </w:rPr>
+        <w:t xml:space="preserve">— Hoje cedo. Antes das oito.</w:t>
+      </w:r>
+    </w:p>
+    <w:p>
+      <w:pPr>
+        <w:spacing w:after="0" w:line="312"/>
+        <w:ind w:firstLine="340"/>
+        <w:jc w:val="both"/>
+      </w:pPr>
+      <w:r>
+        <w:rPr>
+          <w:rFonts w:ascii="Georgia" w:cs="Georgia" w:eastAsia="Georgia" w:hAnsi="Georgia"/>
+          <w:sz w:val="21"/>
+          <w:szCs w:val="21"/>
+        </w:rPr>
+        <w:t xml:space="preserve">Lucas guardou a informação sem saber ainda onde ia colocá-la.</w:t>
+      </w:r>
+    </w:p>
+    <w:p>
+      <w:pPr>
+        <w:spacing w:after="200" w:before="200"/>
+        <w:jc w:val="center"/>
+      </w:pPr>
+      <w:r>
+        <w:rPr>
+          <w:rFonts w:ascii="Georgia" w:cs="Georgia" w:eastAsia="Georgia" w:hAnsi="Georgia"/>
+          <w:sz w:val="22"/>
+          <w:szCs w:val="22"/>
+        </w:rPr>
+        <w:t xml:space="preserve">*</w:t>
+      </w:r>
+    </w:p>
+    <w:p>
+      <w:pPr>
+        <w:spacing w:after="0" w:line="312"/>
+        <w:ind w:firstLine="340"/>
+        <w:jc w:val="both"/>
+      </w:pPr>
+      <w:r>
+        <w:rPr>
+          <w:rFonts w:ascii="Georgia" w:cs="Georgia" w:eastAsia="Georgia" w:hAnsi="Georgia"/>
+          <w:sz w:val="21"/>
+          <w:szCs w:val="21"/>
+        </w:rPr>
+        <w:t xml:space="preserve">Em casa, no apartamento da Vila Nova Conceição, ele deixou o saco sobre a bancada da cozinha e ficou um tempo olhando para ele sem abrir. Serviu um copo de água. Não bebeu. Tirou o celular do saco e apertou o botão lateral.</w:t>
+      </w:r>
+    </w:p>
+    <w:p>
+      <w:pPr>
+        <w:spacing w:after="0" w:line="312"/>
+        <w:ind w:firstLine="340"/>
+        <w:jc w:val="both"/>
+      </w:pPr>
+      <w:r>
+        <w:rPr>
+          <w:rFonts w:ascii="Georgia" w:cs="Georgia" w:eastAsia="Georgia" w:hAnsi="Georgia"/>
+          <w:sz w:val="21"/>
+          <w:szCs w:val="21"/>
+        </w:rPr>
+        <w:t xml:space="preserve">A tela acendeu pedindo a senha.</w:t>
+      </w:r>
+    </w:p>
+    <w:p>
+      <w:pPr>
+        <w:spacing w:after="0" w:line="312"/>
+        <w:ind w:firstLine="340"/>
+        <w:jc w:val="both"/>
+      </w:pPr>
+      <w:r>
+        <w:rPr>
+          <w:rFonts w:ascii="Georgia" w:cs="Georgia" w:eastAsia="Georgia" w:hAnsi="Georgia"/>
+          <w:sz w:val="21"/>
+          <w:szCs w:val="21"/>
+        </w:rPr>
+        <w:t xml:space="preserve">Tentou a data de nascimento do pai. Errada. Tentou a dele mesmo, achando que talvez, só talvez, o pai tivesse escolhido algo assim. Errada. Tentou a de Lia, com uma pontada de ciúme que o envergonhou. Errada. O aparelho avisou que restavam poucas tentativas antes de apagar tudo.</w:t>
+      </w:r>
+    </w:p>
+    <w:p>
+      <w:pPr>
+        <w:spacing w:after="0" w:line="312"/>
+        <w:ind w:firstLine="340"/>
+        <w:jc w:val="both"/>
+      </w:pPr>
+      <w:r>
+        <w:rPr>
+          <w:rFonts w:ascii="Georgia" w:cs="Georgia" w:eastAsia="Georgia" w:hAnsi="Georgia"/>
+          <w:sz w:val="21"/>
+          <w:szCs w:val="21"/>
+        </w:rPr>
+        <w:t xml:space="preserve">Lucas largou o celular na bancada e passou as mãos pelo rosto.</w:t>
+      </w:r>
+    </w:p>
+    <w:p>
+      <w:pPr>
+        <w:spacing w:after="0" w:line="312"/>
+        <w:ind w:firstLine="340"/>
+        <w:jc w:val="both"/>
+      </w:pPr>
+      <w:r>
+        <w:rPr>
+          <w:rFonts w:ascii="Georgia" w:cs="Georgia" w:eastAsia="Georgia" w:hAnsi="Georgia"/>
+          <w:sz w:val="21"/>
+          <w:szCs w:val="21"/>
+        </w:rPr>
+        <w:t xml:space="preserve">Quatro dígitos. O pai não era um homem de datas. Era um homem de números: margens, prazos, apólices, comissões. Esquecia aniversários e lembrava, de cabeça, o valor exato de um contrato assinado dez anos antes.</w:t>
+      </w:r>
+    </w:p>
+    <w:p>
+      <w:pPr>
+        <w:spacing w:after="0" w:line="312"/>
+        <w:ind w:firstLine="340"/>
+        <w:jc w:val="both"/>
+      </w:pPr>
+      <w:r>
+        <w:rPr>
+          <w:rFonts w:ascii="Georgia" w:cs="Georgia" w:eastAsia="Georgia" w:hAnsi="Georgia"/>
+          <w:sz w:val="21"/>
+          <w:szCs w:val="21"/>
+        </w:rPr>
+        <w:t xml:space="preserve">E então lembrou do ramal.</w:t>
+      </w:r>
+    </w:p>
+    <w:p>
+      <w:pPr>
+        <w:spacing w:after="0" w:line="312"/>
+        <w:ind w:firstLine="340"/>
+        <w:jc w:val="both"/>
+      </w:pPr>
+      <w:r>
+        <w:rPr>
+          <w:rFonts w:ascii="Georgia" w:cs="Georgia" w:eastAsia="Georgia" w:hAnsi="Georgia"/>
+          <w:sz w:val="21"/>
+          <w:szCs w:val="21"/>
+        </w:rPr>
+        <w:t xml:space="preserve">Quando Lucas era criança, a corretora ainda funcionava num andar só, num prédio antigo da Avenida Paulista. Para falar com o pai, ele ligava para a recepção e pedia o ramal. Sempre o mesmo, durante anos, até a empresa se mudar para a Faria Lima. Ele repetia aqueles números como uma senha de criança, de pé ao lado do telefone da sala, enquanto a mãe esperava.</w:t>
+      </w:r>
+    </w:p>
+    <w:p>
+      <w:pPr>
+        <w:spacing w:after="0" w:line="312"/>
+        <w:ind w:firstLine="340"/>
+        <w:jc w:val="both"/>
+      </w:pPr>
+      <w:r>
+        <w:rPr>
+          <w:rFonts w:ascii="Georgia" w:cs="Georgia" w:eastAsia="Georgia" w:hAnsi="Georgia"/>
+          <w:sz w:val="21"/>
+          <w:szCs w:val="21"/>
+        </w:rPr>
+        <w:t xml:space="preserve">Quatro, oito, dois, um.</w:t>
+      </w:r>
+    </w:p>
+    <w:p>
+      <w:pPr>
+        <w:spacing w:after="0" w:line="312"/>
+        <w:ind w:firstLine="340"/>
+        <w:jc w:val="both"/>
+      </w:pPr>
+      <w:r>
+        <w:rPr>
+          <w:rFonts w:ascii="Georgia" w:cs="Georgia" w:eastAsia="Georgia" w:hAnsi="Georgia"/>
+          <w:sz w:val="21"/>
+          <w:szCs w:val="21"/>
+        </w:rPr>
+        <w:t xml:space="preserve">A tela se abriu.</w:t>
+      </w:r>
+    </w:p>
+    <w:p>
+      <w:pPr>
+        <w:spacing w:after="200" w:before="200"/>
+        <w:jc w:val="center"/>
+      </w:pPr>
+      <w:r>
+        <w:rPr>
+          <w:rFonts w:ascii="Georgia" w:cs="Georgia" w:eastAsia="Georgia" w:hAnsi="Georgia"/>
+          <w:sz w:val="22"/>
+          <w:szCs w:val="22"/>
+        </w:rPr>
+        <w:t xml:space="preserve">*</w:t>
+      </w:r>
+    </w:p>
+    <w:p>
+      <w:pPr>
+        <w:spacing w:after="0" w:line="312"/>
+        <w:ind w:firstLine="340"/>
+        <w:jc w:val="both"/>
+      </w:pPr>
+      <w:r>
+        <w:rPr>
+          <w:rFonts w:ascii="Georgia" w:cs="Georgia" w:eastAsia="Georgia" w:hAnsi="Georgia"/>
+          <w:sz w:val="21"/>
+          <w:szCs w:val="21"/>
+        </w:rPr>
+        <w:t xml:space="preserve">Lucas puxou uma banqueta e sentou-se.</w:t>
+      </w:r>
+    </w:p>
+    <w:p>
+      <w:pPr>
+        <w:spacing w:after="0" w:line="312"/>
+        <w:ind w:firstLine="340"/>
+        <w:jc w:val="both"/>
+      </w:pPr>
+      <w:r>
+        <w:rPr>
+          <w:rFonts w:ascii="Georgia" w:cs="Georgia" w:eastAsia="Georgia" w:hAnsi="Georgia"/>
+          <w:sz w:val="21"/>
+          <w:szCs w:val="21"/>
+        </w:rPr>
+        <w:t xml:space="preserve">O BlackBerry do pai era um mapa de todas as vidas dele. Na caixa de entrada, centenas de mensagens: e-mails da corretora, avisos do banco, convites para eventos, relatórios de sinistros com números de apólice no assunto. No BlackBerry Messenger, os contatos que importavam: Otávio, Helena, o escritório, um tal de Contabilidade que mandava mensagens todos os dias, sempre curtas, sempre secas. Pagamento confirmado. Relatório enviado. Ok.</w:t>
+      </w:r>
+    </w:p>
+    <w:p>
+      <w:pPr>
+        <w:spacing w:after="0" w:line="312"/>
+        <w:ind w:firstLine="340"/>
+        <w:jc w:val="both"/>
+      </w:pPr>
+      <w:r>
+        <w:rPr>
+          <w:rFonts w:ascii="Georgia" w:cs="Georgia" w:eastAsia="Georgia" w:hAnsi="Georgia"/>
+          <w:sz w:val="21"/>
+          <w:szCs w:val="21"/>
+        </w:rPr>
+        <w:t xml:space="preserve">Helena escrevia como uma esposa escreve: chego tarde, comprei o vinho que você gosta, não esquece do jantar de sábado. Nada que destoasse. Nada que denunciasse uma mulher que, um dia depois, entregaria o celular do marido dentro de um saco de farmácia sem querer saber o que havia dentro.</w:t>
+      </w:r>
+    </w:p>
+    <w:p>
+      <w:pPr>
+        <w:spacing w:after="0" w:line="312"/>
+        <w:ind w:firstLine="340"/>
+        <w:jc w:val="both"/>
+      </w:pPr>
+      <w:r>
+        <w:rPr>
+          <w:rFonts w:ascii="Georgia" w:cs="Georgia" w:eastAsia="Georgia" w:hAnsi="Georgia"/>
+          <w:sz w:val="21"/>
+          <w:szCs w:val="21"/>
+        </w:rPr>
+        <w:t xml:space="preserve">Otávio escrevia como um sócio: horários, nomes, valores. E, de vez em quando, uma frase mais pessoal, que soava estranha no meio dos números. Cuida de você, Henrique. Esses dias não estão fáceis.</w:t>
+      </w:r>
+    </w:p>
+    <w:p>
+      <w:pPr>
+        <w:spacing w:after="0" w:line="312"/>
+        <w:ind w:firstLine="340"/>
+        <w:jc w:val="both"/>
+      </w:pPr>
+      <w:r>
+        <w:rPr>
+          <w:rFonts w:ascii="Georgia" w:cs="Georgia" w:eastAsia="Georgia" w:hAnsi="Georgia"/>
+          <w:sz w:val="21"/>
+          <w:szCs w:val="21"/>
+        </w:rPr>
+        <w:t xml:space="preserve">O doutor Álvaro aparecia pouco, e só para falar de saúde. Lembretes de consulta, resultados de exame, um aviso para não esquecer o remédio da pressão. Na segunda-feira à tarde, a véspera da morte, uma troca rápida depois de uma consulta. O médico tinha escrito: Tudo certo com os exames. Amanhã cedo eu passo aí. E o pai respondera, com dois pontos de exclamação que ele nunca usava:</w:t>
+      </w:r>
+    </w:p>
+    <w:p>
+      <w:pPr>
+        <w:spacing w:after="0" w:line="312"/>
+        <w:ind w:firstLine="340"/>
+        <w:jc w:val="both"/>
+      </w:pPr>
+      <w:r>
+        <w:rPr>
+          <w:rFonts w:ascii="Georgia" w:cs="Georgia" w:eastAsia="Georgia" w:hAnsi="Georgia"/>
+          <w:sz w:val="21"/>
+          <w:szCs w:val="21"/>
+        </w:rPr>
+        <w:t xml:space="preserve">Minha vida em tuas mãos!!</w:t>
+      </w:r>
+    </w:p>
+    <w:p>
+      <w:pPr>
+        <w:spacing w:after="0" w:line="312"/>
+        <w:ind w:firstLine="340"/>
+        <w:jc w:val="both"/>
+      </w:pPr>
+      <w:r>
+        <w:rPr>
+          <w:rFonts w:ascii="Georgia" w:cs="Georgia" w:eastAsia="Georgia" w:hAnsi="Georgia"/>
+          <w:sz w:val="21"/>
+          <w:szCs w:val="21"/>
+        </w:rPr>
+        <w:t xml:space="preserve">Lucas sorriu, sem querer. O pai confiava naquele homem mais do que em qualquer pessoa da família. Fazia sentido que fosse assim até o fim. Passou adiante.</w:t>
+      </w:r>
+    </w:p>
+    <w:p>
+      <w:pPr>
+        <w:spacing w:after="200" w:before="200"/>
+        <w:jc w:val="center"/>
+      </w:pPr>
+      <w:r>
+        <w:rPr>
+          <w:rFonts w:ascii="Georgia" w:cs="Georgia" w:eastAsia="Georgia" w:hAnsi="Georgia"/>
+          <w:sz w:val="22"/>
+          <w:szCs w:val="22"/>
+        </w:rPr>
+        <w:t xml:space="preserve">*</w:t>
+      </w:r>
+    </w:p>
+    <w:p>
+      <w:pPr>
+        <w:spacing w:after="0" w:line="312"/>
+        <w:ind w:firstLine="340"/>
+        <w:jc w:val="both"/>
+      </w:pPr>
+      <w:r>
+        <w:rPr>
+          <w:rFonts w:ascii="Georgia" w:cs="Georgia" w:eastAsia="Georgia" w:hAnsi="Georgia"/>
+          <w:sz w:val="21"/>
+          <w:szCs w:val="21"/>
+        </w:rPr>
+        <w:t xml:space="preserve">Foi na pasta de mensagens de texto que ele parou.</w:t>
+      </w:r>
+    </w:p>
+    <w:p>
+      <w:pPr>
+        <w:spacing w:after="0" w:line="312"/>
+        <w:ind w:firstLine="340"/>
+        <w:jc w:val="both"/>
+      </w:pPr>
+      <w:r>
+        <w:rPr>
+          <w:rFonts w:ascii="Georgia" w:cs="Georgia" w:eastAsia="Georgia" w:hAnsi="Georgia"/>
+          <w:sz w:val="21"/>
+          <w:szCs w:val="21"/>
+        </w:rPr>
+        <w:t xml:space="preserve">O nome dele estava ali, no topo da lista. A última conversa entre os dois era de quinze dias antes. Lucas não precisava abrir para saber o que havia dentro, mas abriu.</w:t>
+      </w:r>
+    </w:p>
+    <w:p>
+      <w:pPr>
+        <w:spacing w:after="0" w:line="312"/>
+        <w:ind w:firstLine="340"/>
+        <w:jc w:val="both"/>
+      </w:pPr>
+      <w:r>
+        <w:rPr>
+          <w:rFonts w:ascii="Georgia" w:cs="Georgia" w:eastAsia="Georgia" w:hAnsi="Georgia"/>
+          <w:sz w:val="21"/>
+          <w:szCs w:val="21"/>
+        </w:rPr>
+        <w:t xml:space="preserve">Pai, eu preciso de uma resposta até sexta. Não é pra mim, é pra empresa. Se o banco executar, eu perco tudo.</w:t>
+      </w:r>
+    </w:p>
+    <w:p>
+      <w:pPr>
+        <w:spacing w:after="0" w:line="312"/>
+        <w:ind w:firstLine="340"/>
+        <w:jc w:val="both"/>
+      </w:pPr>
+      <w:r>
+        <w:rPr>
+          <w:rFonts w:ascii="Georgia" w:cs="Georgia" w:eastAsia="Georgia" w:hAnsi="Georgia"/>
+          <w:sz w:val="21"/>
+          <w:szCs w:val="21"/>
+        </w:rPr>
+        <w:t xml:space="preserve">Já te dei a resposta, Lucas. Você não sabe administrar. Eu não vou jogar dinheiro bom em negócio ruim.</w:t>
+      </w:r>
+    </w:p>
+    <w:p>
+      <w:pPr>
+        <w:spacing w:after="0" w:line="312"/>
+        <w:ind w:firstLine="340"/>
+        <w:jc w:val="both"/>
+      </w:pPr>
+      <w:r>
+        <w:rPr>
+          <w:rFonts w:ascii="Georgia" w:cs="Georgia" w:eastAsia="Georgia" w:hAnsi="Georgia"/>
+          <w:sz w:val="21"/>
+          <w:szCs w:val="21"/>
+        </w:rPr>
+        <w:t xml:space="preserve">Você nunca acreditou em mim.</w:t>
+      </w:r>
+    </w:p>
+    <w:p>
+      <w:pPr>
+        <w:spacing w:after="0" w:line="312"/>
+        <w:ind w:firstLine="340"/>
+        <w:jc w:val="both"/>
+      </w:pPr>
+      <w:r>
+        <w:rPr>
+          <w:rFonts w:ascii="Georgia" w:cs="Georgia" w:eastAsia="Georgia" w:hAnsi="Georgia"/>
+          <w:sz w:val="21"/>
+          <w:szCs w:val="21"/>
+        </w:rPr>
+        <w:t xml:space="preserve">Acredito no que vejo.</w:t>
+      </w:r>
+    </w:p>
+    <w:p>
+      <w:pPr>
+        <w:spacing w:after="0" w:line="312"/>
+        <w:ind w:firstLine="340"/>
+        <w:jc w:val="both"/>
+      </w:pPr>
+      <w:r>
+        <w:rPr>
+          <w:rFonts w:ascii="Georgia" w:cs="Georgia" w:eastAsia="Georgia" w:hAnsi="Georgia"/>
+          <w:sz w:val="21"/>
+          <w:szCs w:val="21"/>
+        </w:rPr>
+        <w:t xml:space="preserve">Depois disso, Lucas tinha escrito coisas que nenhum filho deveria escrever ao pai. Coisas ditas com raiva, às duas da manhã, depois de um dia inteiro tentando salvar a pequena empresa que tinha aberto sozinho, sem o sobrenome Salvallus na porta. E o pai, no dia seguinte, sem uma palavra, tinha transferido o dinheiro.</w:t>
+      </w:r>
+    </w:p>
+    <w:p>
+      <w:pPr>
+        <w:spacing w:after="0" w:line="312"/>
+        <w:ind w:firstLine="340"/>
+        <w:jc w:val="both"/>
+      </w:pPr>
+      <w:r>
+        <w:rPr>
+          <w:rFonts w:ascii="Georgia" w:cs="Georgia" w:eastAsia="Georgia" w:hAnsi="Georgia"/>
+          <w:sz w:val="21"/>
+          <w:szCs w:val="21"/>
+        </w:rPr>
+        <w:t xml:space="preserve">Nunca mais conversaram. A transferência foi a última coisa que o pai fez por ele. As mensagens foram a última coisa que ele disse ao pai.</w:t>
+      </w:r>
+    </w:p>
+    <w:p>
+      <w:pPr>
+        <w:spacing w:after="0" w:line="312"/>
+        <w:ind w:firstLine="340"/>
+        <w:jc w:val="both"/>
+      </w:pPr>
+      <w:r>
+        <w:rPr>
+          <w:rFonts w:ascii="Georgia" w:cs="Georgia" w:eastAsia="Georgia" w:hAnsi="Georgia"/>
+          <w:sz w:val="21"/>
+          <w:szCs w:val="21"/>
+        </w:rPr>
+        <w:t xml:space="preserve">Lucas leu tudo duas vezes. Depois olhou para a porta da cozinha, como se alguém pudesse estar ali, e apertou a tecla de excluir. A conversa sumiu da lista. Ficou só o espaço em branco onde antes estava o nome dele.</w:t>
+      </w:r>
+    </w:p>
+    <w:p>
+      <w:pPr>
+        <w:spacing w:after="0" w:line="312"/>
+        <w:ind w:firstLine="340"/>
+        <w:jc w:val="both"/>
+      </w:pPr>
+      <w:r>
+        <w:rPr>
+          <w:rFonts w:ascii="Georgia" w:cs="Georgia" w:eastAsia="Georgia" w:hAnsi="Georgia"/>
+          <w:sz w:val="21"/>
+          <w:szCs w:val="21"/>
+        </w:rPr>
+        <w:t xml:space="preserve">Sabia que aquilo não mudava nada. O dinheiro continuava na conta da empresa, e a vergonha continuava nele. Mas, se alguém pegasse aquele celular, ninguém leria o que ele tinha escrito. Pelo menos isso ele podia proteger.</w:t>
+      </w:r>
+    </w:p>
+    <w:p>
+      <w:pPr>
+        <w:spacing w:after="0" w:line="312"/>
+        <w:ind w:firstLine="340"/>
+        <w:jc w:val="both"/>
+      </w:pPr>
+      <w:r>
+        <w:rPr>
+          <w:rFonts w:ascii="Georgia" w:cs="Georgia" w:eastAsia="Georgia" w:hAnsi="Georgia"/>
+          <w:sz w:val="21"/>
+          <w:szCs w:val="21"/>
+        </w:rPr>
+        <w:t xml:space="preserve">Só depois, com o coração ainda acelerado, pensou que talvez não devesse ter feito isso. Que, se alguém um dia perguntasse por que ele tinha apagado as últimas mensagens trocadas com o pai, não haveria resposta que soasse inocente.</w:t>
+      </w:r>
+    </w:p>
+    <w:p>
+      <w:pPr>
+        <w:spacing w:after="200" w:before="200"/>
+        <w:jc w:val="center"/>
+      </w:pPr>
+      <w:r>
+        <w:rPr>
+          <w:rFonts w:ascii="Georgia" w:cs="Georgia" w:eastAsia="Georgia" w:hAnsi="Georgia"/>
+          <w:sz w:val="22"/>
+          <w:szCs w:val="22"/>
+        </w:rPr>
+        <w:t xml:space="preserve">*</w:t>
+      </w:r>
+    </w:p>
+    <w:p>
+      <w:pPr>
+        <w:spacing w:after="0" w:line="312"/>
+        <w:ind w:firstLine="340"/>
+        <w:jc w:val="both"/>
+      </w:pPr>
+      <w:r>
+        <w:rPr>
+          <w:rFonts w:ascii="Georgia" w:cs="Georgia" w:eastAsia="Georgia" w:hAnsi="Georgia"/>
+          <w:sz w:val="21"/>
+          <w:szCs w:val="21"/>
+        </w:rPr>
+        <w:t xml:space="preserve">Já passava das dez da noite quando abriu o registro de chamadas.</w:t>
+      </w:r>
+    </w:p>
+    <w:p>
+      <w:pPr>
+        <w:spacing w:after="0" w:line="312"/>
+        <w:ind w:firstLine="340"/>
+        <w:jc w:val="both"/>
+      </w:pPr>
+      <w:r>
+        <w:rPr>
+          <w:rFonts w:ascii="Georgia" w:cs="Georgia" w:eastAsia="Georgia" w:hAnsi="Georgia"/>
+          <w:sz w:val="21"/>
+          <w:szCs w:val="21"/>
+        </w:rPr>
+        <w:t xml:space="preserve">As últimas ligações eram do dia da morte. Às 7h02, para o doutor Álvaro, quarenta e sete segundos. Às 7h40, uma chamada do mesmo número, não atendida. Nenhuma ligação feita depois disso. A partir das oito, só chamadas perdidas: Helena, Otávio, o escritório, Lia. Sete chamadas perdidas de Lia.</w:t>
+      </w:r>
+    </w:p>
+    <w:p>
+      <w:pPr>
+        <w:spacing w:after="0" w:line="312"/>
+        <w:ind w:firstLine="340"/>
+        <w:jc w:val="both"/>
+      </w:pPr>
+      <w:r>
+        <w:rPr>
+          <w:rFonts w:ascii="Georgia" w:cs="Georgia" w:eastAsia="Georgia" w:hAnsi="Georgia"/>
+          <w:sz w:val="21"/>
+          <w:szCs w:val="21"/>
+        </w:rPr>
+        <w:t xml:space="preserve">Lucas franziu a testa. Lia tinha ligado sete vezes para o pai entre as oito e as nove da manhã. Antes de alguém saber que ele estava morto.</w:t>
+      </w:r>
+    </w:p>
+    <w:p>
+      <w:pPr>
+        <w:spacing w:after="0" w:line="312"/>
+        <w:ind w:firstLine="340"/>
+        <w:jc w:val="both"/>
+      </w:pPr>
+      <w:r>
+        <w:rPr>
+          <w:rFonts w:ascii="Georgia" w:cs="Georgia" w:eastAsia="Georgia" w:hAnsi="Georgia"/>
+          <w:sz w:val="21"/>
+          <w:szCs w:val="21"/>
+        </w:rPr>
+        <w:t xml:space="preserve">Voltou à lista de mensagens de texto e procurou o nome da irmã. A última conversa era de quase um mês antes. Nada na véspera. Nada naquela manhã. Só as sete chamadas, uma atrás da outra, como quem tenta falar com alguém que prometeu atender.</w:t>
+      </w:r>
+    </w:p>
+    <w:p>
+      <w:pPr>
+        <w:spacing w:after="0" w:line="312"/>
+        <w:ind w:firstLine="340"/>
+        <w:jc w:val="both"/>
+      </w:pPr>
+      <w:r>
+        <w:rPr>
+          <w:rFonts w:ascii="Georgia" w:cs="Georgia" w:eastAsia="Georgia" w:hAnsi="Georgia"/>
+          <w:sz w:val="21"/>
+          <w:szCs w:val="21"/>
+        </w:rPr>
+        <w:t xml:space="preserve">Ele pensou em ligar para ela e perguntar. Pegou o próprio celular, procurou o número, o polegar parado sobre a tecla verde.</w:t>
+      </w:r>
+    </w:p>
+    <w:p>
+      <w:pPr>
+        <w:spacing w:after="0" w:line="312"/>
+        <w:ind w:firstLine="340"/>
+        <w:jc w:val="both"/>
+      </w:pPr>
+      <w:r>
+        <w:rPr>
+          <w:rFonts w:ascii="Georgia" w:cs="Georgia" w:eastAsia="Georgia" w:hAnsi="Georgia"/>
+          <w:sz w:val="21"/>
+          <w:szCs w:val="21"/>
+        </w:rPr>
+        <w:t xml:space="preserve">Não ligou.</w:t>
+      </w:r>
+    </w:p>
+    <w:p>
+      <w:pPr>
+        <w:spacing w:after="0" w:line="312"/>
+        <w:ind w:firstLine="340"/>
+        <w:jc w:val="both"/>
+      </w:pPr>
+      <w:r>
+        <w:rPr>
+          <w:rFonts w:ascii="Georgia" w:cs="Georgia" w:eastAsia="Georgia" w:hAnsi="Georgia"/>
+          <w:sz w:val="21"/>
+          <w:szCs w:val="21"/>
+        </w:rPr>
+        <w:t xml:space="preserve">Ficou olhando para a tela do BlackBerry do pai, aberta numa lista de chamadas perdidas, e lembrou da voz no crematório, entre os homens de terno: agora o imorrível morreu.</w:t>
+      </w:r>
+    </w:p>
+    <w:p>
+      <w:pPr>
+        <w:spacing w:after="0" w:line="312"/>
+        <w:ind w:firstLine="340"/>
+        <w:jc w:val="both"/>
+      </w:pPr>
+      <w:r>
+        <w:rPr>
+          <w:rFonts w:ascii="Georgia" w:cs="Georgia" w:eastAsia="Georgia" w:hAnsi="Georgia"/>
+          <w:sz w:val="21"/>
+          <w:szCs w:val="21"/>
+        </w:rPr>
+        <w:t xml:space="preserve">Pela primeira vez desde a terça-feira, Lucas teve a sensação de que não era o único da família guardando um segredo.</w:t>
       </w:r>
     </w:p>
     <w:sectPr>

</xml_diff>

<commit_message>
Livro policial: cap. 2, a briga de Lucas é sobre assumir a corretora
Co-Authored-By: Claude Opus 5.5 <noreply@anthropic.com>
Claude-Session: https://claude.ai/code/session_01BrurxSYygRC3rRhaUYosm1
</commit_message>
<xml_diff>
--- a/docs/livro-policial/TODO_CRIME_TEM_UM_AUTOR.docx
+++ b/docs/livro-policial/TODO_CRIME_TEM_UM_AUTOR.docx
@@ -1360,127 +1360,232 @@
           <w:sz w:val="21"/>
           <w:szCs w:val="21"/>
         </w:rPr>
-        <w:t xml:space="preserve">Pai, eu preciso de uma resposta até sexta. Não é pra mim, é pra empresa. Se o banco executar, eu perco tudo.</w:t>
-      </w:r>
-    </w:p>
-    <w:p>
-      <w:pPr>
-        <w:spacing w:after="0" w:line="312"/>
-        <w:ind w:firstLine="340"/>
-        <w:jc w:val="both"/>
-      </w:pPr>
-      <w:r>
-        <w:rPr>
-          <w:rFonts w:ascii="Georgia" w:cs="Georgia" w:eastAsia="Georgia" w:hAnsi="Georgia"/>
-          <w:sz w:val="21"/>
-          <w:szCs w:val="21"/>
-        </w:rPr>
-        <w:t xml:space="preserve">Já te dei a resposta, Lucas. Você não sabe administrar. Eu não vou jogar dinheiro bom em negócio ruim.</w:t>
-      </w:r>
-    </w:p>
-    <w:p>
-      <w:pPr>
-        <w:spacing w:after="0" w:line="312"/>
-        <w:ind w:firstLine="340"/>
-        <w:jc w:val="both"/>
-      </w:pPr>
-      <w:r>
-        <w:rPr>
-          <w:rFonts w:ascii="Georgia" w:cs="Georgia" w:eastAsia="Georgia" w:hAnsi="Georgia"/>
-          <w:sz w:val="21"/>
-          <w:szCs w:val="21"/>
-        </w:rPr>
-        <w:t xml:space="preserve">Você nunca acreditou em mim.</w:t>
-      </w:r>
-    </w:p>
-    <w:p>
-      <w:pPr>
-        <w:spacing w:after="0" w:line="312"/>
-        <w:ind w:firstLine="340"/>
-        <w:jc w:val="both"/>
-      </w:pPr>
-      <w:r>
-        <w:rPr>
-          <w:rFonts w:ascii="Georgia" w:cs="Georgia" w:eastAsia="Georgia" w:hAnsi="Georgia"/>
-          <w:sz w:val="21"/>
-          <w:szCs w:val="21"/>
-        </w:rPr>
-        <w:t xml:space="preserve">Acredito no que vejo.</w:t>
-      </w:r>
-    </w:p>
-    <w:p>
-      <w:pPr>
-        <w:spacing w:after="0" w:line="312"/>
-        <w:ind w:firstLine="340"/>
-        <w:jc w:val="both"/>
-      </w:pPr>
-      <w:r>
-        <w:rPr>
-          <w:rFonts w:ascii="Georgia" w:cs="Georgia" w:eastAsia="Georgia" w:hAnsi="Georgia"/>
-          <w:sz w:val="21"/>
-          <w:szCs w:val="21"/>
-        </w:rPr>
-        <w:t xml:space="preserve">Depois disso, Lucas tinha escrito coisas que nenhum filho deveria escrever ao pai. Coisas ditas com raiva, às duas da manhã, depois de um dia inteiro tentando salvar a pequena empresa que tinha aberto sozinho, sem o sobrenome Salvallus na porta. E o pai, no dia seguinte, sem uma palavra, tinha transferido o dinheiro.</w:t>
-      </w:r>
-    </w:p>
-    <w:p>
-      <w:pPr>
-        <w:spacing w:after="0" w:line="312"/>
-        <w:ind w:firstLine="340"/>
-        <w:jc w:val="both"/>
-      </w:pPr>
-      <w:r>
-        <w:rPr>
-          <w:rFonts w:ascii="Georgia" w:cs="Georgia" w:eastAsia="Georgia" w:hAnsi="Georgia"/>
-          <w:sz w:val="21"/>
-          <w:szCs w:val="21"/>
-        </w:rPr>
-        <w:t xml:space="preserve">Nunca mais conversaram. A transferência foi a última coisa que o pai fez por ele. As mensagens foram a última coisa que ele disse ao pai.</w:t>
-      </w:r>
-    </w:p>
-    <w:p>
-      <w:pPr>
-        <w:spacing w:after="0" w:line="312"/>
-        <w:ind w:firstLine="340"/>
-        <w:jc w:val="both"/>
-      </w:pPr>
-      <w:r>
-        <w:rPr>
-          <w:rFonts w:ascii="Georgia" w:cs="Georgia" w:eastAsia="Georgia" w:hAnsi="Georgia"/>
-          <w:sz w:val="21"/>
-          <w:szCs w:val="21"/>
-        </w:rPr>
-        <w:t xml:space="preserve">Lucas leu tudo duas vezes. Depois olhou para a porta da cozinha, como se alguém pudesse estar ali, e apertou a tecla de excluir. A conversa sumiu da lista. Ficou só o espaço em branco onde antes estava o nome dele.</w:t>
-      </w:r>
-    </w:p>
-    <w:p>
-      <w:pPr>
-        <w:spacing w:after="0" w:line="312"/>
-        <w:ind w:firstLine="340"/>
-        <w:jc w:val="both"/>
-      </w:pPr>
-      <w:r>
-        <w:rPr>
-          <w:rFonts w:ascii="Georgia" w:cs="Georgia" w:eastAsia="Georgia" w:hAnsi="Georgia"/>
-          <w:sz w:val="21"/>
-          <w:szCs w:val="21"/>
-        </w:rPr>
-        <w:t xml:space="preserve">Sabia que aquilo não mudava nada. O dinheiro continuava na conta da empresa, e a vergonha continuava nele. Mas, se alguém pegasse aquele celular, ninguém leria o que ele tinha escrito. Pelo menos isso ele podia proteger.</w:t>
-      </w:r>
-    </w:p>
-    <w:p>
-      <w:pPr>
-        <w:spacing w:after="0" w:line="312"/>
-        <w:ind w:firstLine="340"/>
-        <w:jc w:val="both"/>
-      </w:pPr>
-      <w:r>
-        <w:rPr>
-          <w:rFonts w:ascii="Georgia" w:cs="Georgia" w:eastAsia="Georgia" w:hAnsi="Georgia"/>
-          <w:sz w:val="21"/>
-          <w:szCs w:val="21"/>
-        </w:rPr>
-        <w:t xml:space="preserve">Só depois, com o coração ainda acelerado, pensou que talvez não devesse ter feito isso. Que, se alguém um dia perguntasse por que ele tinha apagado as últimas mensagens trocadas com o pai, não haveria resposta que soasse inocente.</w:t>
+        <w:t xml:space="preserve">Lucas, eu preciso de você na corretora. Agora, não daqui a cinco anos.</w:t>
+      </w:r>
+    </w:p>
+    <w:p>
+      <w:pPr>
+        <w:spacing w:after="0" w:line="312"/>
+        <w:ind w:firstLine="340"/>
+        <w:jc w:val="both"/>
+      </w:pPr>
+      <w:r>
+        <w:rPr>
+          <w:rFonts w:ascii="Georgia" w:cs="Georgia" w:eastAsia="Georgia" w:hAnsi="Georgia"/>
+          <w:sz w:val="21"/>
+          <w:szCs w:val="21"/>
+        </w:rPr>
+        <w:t xml:space="preserve">Pai, a gente já conversou sobre isso. Eu tenho a minha empresa.</w:t>
+      </w:r>
+    </w:p>
+    <w:p>
+      <w:pPr>
+        <w:spacing w:after="0" w:line="312"/>
+        <w:ind w:firstLine="340"/>
+        <w:jc w:val="both"/>
+      </w:pPr>
+      <w:r>
+        <w:rPr>
+          <w:rFonts w:ascii="Georgia" w:cs="Georgia" w:eastAsia="Georgia" w:hAnsi="Georgia"/>
+          <w:sz w:val="21"/>
+          <w:szCs w:val="21"/>
+        </w:rPr>
+        <w:t xml:space="preserve">Deixa alguém tocando por um tempo. Eu preciso de você aqui.</w:t>
+      </w:r>
+    </w:p>
+    <w:p>
+      <w:pPr>
+        <w:spacing w:after="0" w:line="312"/>
+        <w:ind w:firstLine="340"/>
+        <w:jc w:val="both"/>
+      </w:pPr>
+      <w:r>
+        <w:rPr>
+          <w:rFonts w:ascii="Georgia" w:cs="Georgia" w:eastAsia="Georgia" w:hAnsi="Georgia"/>
+          <w:sz w:val="21"/>
+          <w:szCs w:val="21"/>
+        </w:rPr>
+        <w:t xml:space="preserve">Por quê? Você nunca precisou de ninguém.</w:t>
+      </w:r>
+    </w:p>
+    <w:p>
+      <w:pPr>
+        <w:spacing w:after="0" w:line="312"/>
+        <w:ind w:firstLine="340"/>
+        <w:jc w:val="both"/>
+      </w:pPr>
+      <w:r>
+        <w:rPr>
+          <w:rFonts w:ascii="Georgia" w:cs="Georgia" w:eastAsia="Georgia" w:hAnsi="Georgia"/>
+          <w:sz w:val="21"/>
+          <w:szCs w:val="21"/>
+        </w:rPr>
+        <w:t xml:space="preserve">Não posso explicar agora. Confia em mim.</w:t>
+      </w:r>
+    </w:p>
+    <w:p>
+      <w:pPr>
+        <w:spacing w:after="0" w:line="312"/>
+        <w:ind w:firstLine="340"/>
+        <w:jc w:val="both"/>
+      </w:pPr>
+      <w:r>
+        <w:rPr>
+          <w:rFonts w:ascii="Georgia" w:cs="Georgia" w:eastAsia="Georgia" w:hAnsi="Georgia"/>
+          <w:sz w:val="21"/>
+          <w:szCs w:val="21"/>
+        </w:rPr>
+        <w:t xml:space="preserve">Confiar? Você quer que eu sente todo dia ao lado do Otávio. Você sabe muito bem o que eu acho dele.</w:t>
+      </w:r>
+    </w:p>
+    <w:p>
+      <w:pPr>
+        <w:spacing w:after="0" w:line="312"/>
+        <w:ind w:firstLine="340"/>
+        <w:jc w:val="both"/>
+      </w:pPr>
+      <w:r>
+        <w:rPr>
+          <w:rFonts w:ascii="Georgia" w:cs="Georgia" w:eastAsia="Georgia" w:hAnsi="Georgia"/>
+          <w:sz w:val="21"/>
+          <w:szCs w:val="21"/>
+        </w:rPr>
+        <w:t xml:space="preserve">Justamente por isso.</w:t>
+      </w:r>
+    </w:p>
+    <w:p>
+      <w:pPr>
+        <w:spacing w:after="0" w:line="312"/>
+        <w:ind w:firstLine="340"/>
+        <w:jc w:val="both"/>
+      </w:pPr>
+      <w:r>
+        <w:rPr>
+          <w:rFonts w:ascii="Georgia" w:cs="Georgia" w:eastAsia="Georgia" w:hAnsi="Georgia"/>
+          <w:sz w:val="21"/>
+          <w:szCs w:val="21"/>
+        </w:rPr>
+        <w:t xml:space="preserve">Lucas lembrava de cada palavra que tinha escrito depois. Às duas da manhã, com raiva, ele dissera ao pai que não queria o sobrenome na porta, nem a sala ao lado do sócio, nem a vida que o pai tinha escolhido para ele. Que a pequena empresa que ele tinha aberto sozinho, sem pedir nada a ninguém, era a única coisa que era dele de verdade. Que estava cansado de ser tratado como herdeiro e nunca como filho.</w:t>
+      </w:r>
+    </w:p>
+    <w:p>
+      <w:pPr>
+        <w:spacing w:after="0" w:line="312"/>
+        <w:ind w:firstLine="340"/>
+        <w:jc w:val="both"/>
+      </w:pPr>
+      <w:r>
+        <w:rPr>
+          <w:rFonts w:ascii="Georgia" w:cs="Georgia" w:eastAsia="Georgia" w:hAnsi="Georgia"/>
+          <w:sz w:val="21"/>
+          <w:szCs w:val="21"/>
+        </w:rPr>
+        <w:t xml:space="preserve">O pai não respondeu naquela noite. No dia seguinte, às sete da manhã, chegou uma única linha:</w:t>
+      </w:r>
+    </w:p>
+    <w:p>
+      <w:pPr>
+        <w:spacing w:after="0" w:line="312"/>
+        <w:ind w:firstLine="340"/>
+        <w:jc w:val="both"/>
+      </w:pPr>
+      <w:r>
+        <w:rPr>
+          <w:rFonts w:ascii="Georgia" w:cs="Georgia" w:eastAsia="Georgia" w:hAnsi="Georgia"/>
+          <w:sz w:val="21"/>
+          <w:szCs w:val="21"/>
+        </w:rPr>
+        <w:t xml:space="preserve">Um dia você vai entender. Te amo, filho.</w:t>
+      </w:r>
+    </w:p>
+    <w:p>
+      <w:pPr>
+        <w:spacing w:after="0" w:line="312"/>
+        <w:ind w:firstLine="340"/>
+        <w:jc w:val="both"/>
+      </w:pPr>
+      <w:r>
+        <w:rPr>
+          <w:rFonts w:ascii="Georgia" w:cs="Georgia" w:eastAsia="Georgia" w:hAnsi="Georgia"/>
+          <w:sz w:val="21"/>
+          <w:szCs w:val="21"/>
+        </w:rPr>
+        <w:t xml:space="preserve">Lucas não respondeu. Achou que haveria tempo. Achou que, dali a algumas semanas, quando a raiva passasse, os dois se encontrariam num almoço qualquer e fariam de conta que nada tinha acontecido, como sempre fizeram.</w:t>
+      </w:r>
+    </w:p>
+    <w:p>
+      <w:pPr>
+        <w:spacing w:after="0" w:line="312"/>
+        <w:ind w:firstLine="340"/>
+        <w:jc w:val="both"/>
+      </w:pPr>
+      <w:r>
+        <w:rPr>
+          <w:rFonts w:ascii="Georgia" w:cs="Georgia" w:eastAsia="Georgia" w:hAnsi="Georgia"/>
+          <w:sz w:val="21"/>
+          <w:szCs w:val="21"/>
+        </w:rPr>
+        <w:t xml:space="preserve">Agora ele ia assumir a corretora de qualquer jeito. O testamento, o sócio, os funcionários, tudo cairia no colo dele nos próximos dias. Ia sentar na sala que o pai queria, ao lado do homem de quem desconfiava, exatamente como o pai tinha pedido. Só que sem o pai.</w:t>
+      </w:r>
+    </w:p>
+    <w:p>
+      <w:pPr>
+        <w:spacing w:after="0" w:line="312"/>
+        <w:ind w:firstLine="340"/>
+        <w:jc w:val="both"/>
+      </w:pPr>
+      <w:r>
+        <w:rPr>
+          <w:rFonts w:ascii="Georgia" w:cs="Georgia" w:eastAsia="Georgia" w:hAnsi="Georgia"/>
+          <w:sz w:val="21"/>
+          <w:szCs w:val="21"/>
+        </w:rPr>
+        <w:t xml:space="preserve">Podia ter feito isso sem brigar. Podia ter dito sim, ou pelo menos ter dito que ia pensar. Não teve tempo nem de pedir desculpas.</w:t>
+      </w:r>
+    </w:p>
+    <w:p>
+      <w:pPr>
+        <w:spacing w:after="0" w:line="312"/>
+        <w:ind w:firstLine="340"/>
+        <w:jc w:val="both"/>
+      </w:pPr>
+      <w:r>
+        <w:rPr>
+          <w:rFonts w:ascii="Georgia" w:cs="Georgia" w:eastAsia="Georgia" w:hAnsi="Georgia"/>
+          <w:sz w:val="21"/>
+          <w:szCs w:val="21"/>
+        </w:rPr>
+        <w:t xml:space="preserve">Lucas leu a conversa inteira duas vezes. Na segunda, parou em Não posso explicar agora e ficou olhando para a frase como se ela tivesse mudado de sentido. Depois olhou para a porta da cozinha, como se alguém pudesse estar ali, e apertou a tecla de excluir. A conversa sumiu da lista. Ficou só o espaço em branco onde antes estava o nome dele.</w:t>
+      </w:r>
+    </w:p>
+    <w:p>
+      <w:pPr>
+        <w:spacing w:after="0" w:line="312"/>
+        <w:ind w:firstLine="340"/>
+        <w:jc w:val="both"/>
+      </w:pPr>
+      <w:r>
+        <w:rPr>
+          <w:rFonts w:ascii="Georgia" w:cs="Georgia" w:eastAsia="Georgia" w:hAnsi="Georgia"/>
+          <w:sz w:val="21"/>
+          <w:szCs w:val="21"/>
+        </w:rPr>
+        <w:t xml:space="preserve">Sabia que aquilo não mudava nada. Mas, se alguém pegasse aquele celular, ninguém leria o que ele tinha escrito ao pai às duas da manhã. Pelo menos isso ele podia proteger.</w:t>
+      </w:r>
+    </w:p>
+    <w:p>
+      <w:pPr>
+        <w:spacing w:after="0" w:line="312"/>
+        <w:ind w:firstLine="340"/>
+        <w:jc w:val="both"/>
+      </w:pPr>
+      <w:r>
+        <w:rPr>
+          <w:rFonts w:ascii="Georgia" w:cs="Georgia" w:eastAsia="Georgia" w:hAnsi="Georgia"/>
+          <w:sz w:val="21"/>
+          <w:szCs w:val="21"/>
+        </w:rPr>
+        <w:t xml:space="preserve">Só depois, com o coração ainda acelerado, pensou que talvez não devesse ter feito isso. Que o filho que ia herdar a empresa tinha acabado de apagar a última briga com o pai sobre a empresa. E que, se alguém um dia perguntasse por quê, não haveria resposta que soasse inocente.</w:t>
       </w:r>
     </w:p>
     <w:p>

</xml_diff>

<commit_message>
Livro policial: capítulo 3 (Suíte 14)
Co-Authored-By: Claude Opus 5.5 <noreply@anthropic.com>
Claude-Session: https://claude.ai/code/session_01BrurxSYygRC3rRhaUYosm1
</commit_message>
<xml_diff>
--- a/docs/livro-policial/TODO_CRIME_TEM_UM_AUTOR.docx
+++ b/docs/livro-policial/TODO_CRIME_TEM_UM_AUTOR.docx
@@ -1720,6 +1720,1218 @@
           <w:szCs w:val="21"/>
         </w:rPr>
         <w:t xml:space="preserve">Pela primeira vez desde a terça-feira, Lucas teve a sensação de que não era o único da família guardando um segredo.</w:t>
+      </w:r>
+    </w:p>
+    <w:p>
+      <w:pPr>
+        <w:pageBreakBefore/>
+        <w:spacing w:after="120" w:before="1800"/>
+        <w:jc w:val="center"/>
+      </w:pPr>
+      <w:r>
+        <w:rPr>
+          <w:rFonts w:ascii="Georgia" w:cs="Georgia" w:eastAsia="Georgia" w:hAnsi="Georgia"/>
+          <w:spacing w:val="40"/>
+          <w:sz w:val="20"/>
+          <w:szCs w:val="20"/>
+        </w:rPr>
+        <w:t xml:space="preserve">CAPÍTULO 3</w:t>
+      </w:r>
+    </w:p>
+    <w:p>
+      <w:pPr>
+        <w:spacing w:after="720"/>
+        <w:jc w:val="center"/>
+      </w:pPr>
+      <w:r>
+        <w:rPr>
+          <w:rFonts w:ascii="Georgia" w:cs="Georgia" w:eastAsia="Georgia" w:hAnsi="Georgia"/>
+          <w:b/>
+          <w:bCs/>
+          <w:sz w:val="32"/>
+          <w:szCs w:val="32"/>
+        </w:rPr>
+        <w:t xml:space="preserve">Suíte 14</w:t>
+      </w:r>
+    </w:p>
+    <w:p>
+      <w:pPr>
+        <w:spacing w:after="0" w:line="312"/>
+        <w:ind w:firstLine="340"/>
+        <w:jc w:val="both"/>
+      </w:pPr>
+      <w:r>
+        <w:rPr>
+          <w:rFonts w:ascii="Georgia" w:cs="Georgia" w:eastAsia="Georgia" w:hAnsi="Georgia"/>
+          <w:sz w:val="21"/>
+          <w:szCs w:val="21"/>
+        </w:rPr>
+        <w:t xml:space="preserve">Oito meses antes.</w:t>
+      </w:r>
+    </w:p>
+    <w:p>
+      <w:pPr>
+        <w:spacing w:after="0" w:line="312"/>
+        <w:ind w:firstLine="340"/>
+        <w:jc w:val="both"/>
+      </w:pPr>
+      <w:r>
+        <w:rPr>
+          <w:rFonts w:ascii="Georgia" w:cs="Georgia" w:eastAsia="Georgia" w:hAnsi="Georgia"/>
+          <w:sz w:val="21"/>
+          <w:szCs w:val="21"/>
+        </w:rPr>
+        <w:t xml:space="preserve">O portão da garagem subiu devagar, rangendo, e o funcionário de sempre apareceu na guarita com a lanterna apontada para o chão, por educação.</w:t>
+      </w:r>
+    </w:p>
+    <w:p>
+      <w:pPr>
+        <w:spacing w:after="0" w:line="312"/>
+        <w:ind w:firstLine="340"/>
+        <w:jc w:val="both"/>
+      </w:pPr>
+      <w:r>
+        <w:rPr>
+          <w:rFonts w:ascii="Georgia" w:cs="Georgia" w:eastAsia="Georgia" w:hAnsi="Georgia"/>
+          <w:sz w:val="21"/>
+          <w:szCs w:val="21"/>
+        </w:rPr>
+        <w:t xml:space="preserve">— Boa noite, doutor.</w:t>
+      </w:r>
+    </w:p>
+    <w:p>
+      <w:pPr>
+        <w:spacing w:after="0" w:line="312"/>
+        <w:ind w:firstLine="340"/>
+        <w:jc w:val="both"/>
+      </w:pPr>
+      <w:r>
+        <w:rPr>
+          <w:rFonts w:ascii="Georgia" w:cs="Georgia" w:eastAsia="Georgia" w:hAnsi="Georgia"/>
+          <w:sz w:val="21"/>
+          <w:szCs w:val="21"/>
+        </w:rPr>
+        <w:t xml:space="preserve">— Boa noite, seu Joaquim.</w:t>
+      </w:r>
+    </w:p>
+    <w:p>
+      <w:pPr>
+        <w:spacing w:after="0" w:line="312"/>
+        <w:ind w:firstLine="340"/>
+        <w:jc w:val="both"/>
+      </w:pPr>
+      <w:r>
+        <w:rPr>
+          <w:rFonts w:ascii="Georgia" w:cs="Georgia" w:eastAsia="Georgia" w:hAnsi="Georgia"/>
+          <w:sz w:val="21"/>
+          <w:szCs w:val="21"/>
+        </w:rPr>
+        <w:t xml:space="preserve">Henrique não sabia o sobrenome dele, nem quantos filhos tinha, nem onde morava. Sabia que se chamava Joaquim, que tinha os cabelos inteiramente brancos e que nunca, em dois anos, tinha olhado para dentro do carro. Henrique abriu o vidro e estendeu uma nota dobrada. O velho a guardou no bolso da camisa com um aceno de cabeça e baixou o portão atrás deles.</w:t>
+      </w:r>
+    </w:p>
+    <w:p>
+      <w:pPr>
+        <w:spacing w:after="0" w:line="312"/>
+        <w:ind w:firstLine="340"/>
+        <w:jc w:val="both"/>
+      </w:pPr>
+      <w:r>
+        <w:rPr>
+          <w:rFonts w:ascii="Georgia" w:cs="Georgia" w:eastAsia="Georgia" w:hAnsi="Georgia"/>
+          <w:sz w:val="21"/>
+          <w:szCs w:val="21"/>
+        </w:rPr>
+        <w:t xml:space="preserve">No banco do passageiro, Bianca riu.</w:t>
+      </w:r>
+    </w:p>
+    <w:p>
+      <w:pPr>
+        <w:spacing w:after="0" w:line="312"/>
+        <w:ind w:firstLine="340"/>
+        <w:jc w:val="both"/>
+      </w:pPr>
+      <w:r>
+        <w:rPr>
+          <w:rFonts w:ascii="Georgia" w:cs="Georgia" w:eastAsia="Georgia" w:hAnsi="Georgia"/>
+          <w:sz w:val="21"/>
+          <w:szCs w:val="21"/>
+        </w:rPr>
+        <w:t xml:space="preserve">— Você dá gorjeta até na entrada.</w:t>
+      </w:r>
+    </w:p>
+    <w:p>
+      <w:pPr>
+        <w:spacing w:after="0" w:line="312"/>
+        <w:ind w:firstLine="340"/>
+        <w:jc w:val="both"/>
+      </w:pPr>
+      <w:r>
+        <w:rPr>
+          <w:rFonts w:ascii="Georgia" w:cs="Georgia" w:eastAsia="Georgia" w:hAnsi="Georgia"/>
+          <w:sz w:val="21"/>
+          <w:szCs w:val="21"/>
+        </w:rPr>
+        <w:t xml:space="preserve">— Discrição é um serviço. E serviço se paga.</w:t>
+      </w:r>
+    </w:p>
+    <w:p>
+      <w:pPr>
+        <w:spacing w:after="0" w:line="312"/>
+        <w:ind w:firstLine="340"/>
+        <w:jc w:val="both"/>
+      </w:pPr>
+      <w:r>
+        <w:rPr>
+          <w:rFonts w:ascii="Georgia" w:cs="Georgia" w:eastAsia="Georgia" w:hAnsi="Georgia"/>
+          <w:sz w:val="21"/>
+          <w:szCs w:val="21"/>
+        </w:rPr>
+        <w:t xml:space="preserve">— Você é um homem de seguros até aqui.</w:t>
+      </w:r>
+    </w:p>
+    <w:p>
+      <w:pPr>
+        <w:spacing w:after="0" w:line="312"/>
+        <w:ind w:firstLine="340"/>
+        <w:jc w:val="both"/>
+      </w:pPr>
+      <w:r>
+        <w:rPr>
+          <w:rFonts w:ascii="Georgia" w:cs="Georgia" w:eastAsia="Georgia" w:hAnsi="Georgia"/>
+          <w:sz w:val="21"/>
+          <w:szCs w:val="21"/>
+        </w:rPr>
+        <w:t xml:space="preserve">— Principalmente aqui.</w:t>
+      </w:r>
+    </w:p>
+    <w:p>
+      <w:pPr>
+        <w:spacing w:after="200" w:before="200"/>
+        <w:jc w:val="center"/>
+      </w:pPr>
+      <w:r>
+        <w:rPr>
+          <w:rFonts w:ascii="Georgia" w:cs="Georgia" w:eastAsia="Georgia" w:hAnsi="Georgia"/>
+          <w:sz w:val="22"/>
+          <w:szCs w:val="22"/>
+        </w:rPr>
+        <w:t xml:space="preserve">*</w:t>
+      </w:r>
+    </w:p>
+    <w:p>
+      <w:pPr>
+        <w:spacing w:after="0" w:line="312"/>
+        <w:ind w:firstLine="340"/>
+        <w:jc w:val="both"/>
+      </w:pPr>
+      <w:r>
+        <w:rPr>
+          <w:rFonts w:ascii="Georgia" w:cs="Georgia" w:eastAsia="Georgia" w:hAnsi="Georgia"/>
+          <w:sz w:val="21"/>
+          <w:szCs w:val="21"/>
+        </w:rPr>
+        <w:t xml:space="preserve">A suíte 14 tinha espelho no teto, uma banheira redonda que ninguém usava e uma janela falsa com cortinas de veludo vinho, fechadas sobre uma parede. Henrique gostava dela justamente por isso: era um quarto que não fingia ser outra coisa.</w:t>
+      </w:r>
+    </w:p>
+    <w:p>
+      <w:pPr>
+        <w:spacing w:after="0" w:line="312"/>
+        <w:ind w:firstLine="340"/>
+        <w:jc w:val="both"/>
+      </w:pPr>
+      <w:r>
+        <w:rPr>
+          <w:rFonts w:ascii="Georgia" w:cs="Georgia" w:eastAsia="Georgia" w:hAnsi="Georgia"/>
+          <w:sz w:val="21"/>
+          <w:szCs w:val="21"/>
+        </w:rPr>
+        <w:t xml:space="preserve">Bianca tirou os sapatos assim que entrou e pediu pelo interfone o de sempre: um balde de gelo, uma garrafa de uísque doze anos, duas taças de champanhe para depois. Pouco depois, a campainha da portinhola de serviço tocou, e a bandeja apareceu do outro lado da pequena porta de madeira, sem que ninguém se mostrasse. Era assim que funcionava ali. As mãos de quem servia nunca tinham rosto.</w:t>
+      </w:r>
+    </w:p>
+    <w:p>
+      <w:pPr>
+        <w:spacing w:after="0" w:line="312"/>
+        <w:ind w:firstLine="340"/>
+        <w:jc w:val="both"/>
+      </w:pPr>
+      <w:r>
+        <w:rPr>
+          <w:rFonts w:ascii="Georgia" w:cs="Georgia" w:eastAsia="Georgia" w:hAnsi="Georgia"/>
+          <w:sz w:val="21"/>
+          <w:szCs w:val="21"/>
+        </w:rPr>
+        <w:t xml:space="preserve">Bianca serviu as doses. Fez questão. Gelo primeiro, depois o uísque, dois dedos para ela, três para ele, como ele gostava. Entregou o copo e ficou olhando.</w:t>
+      </w:r>
+    </w:p>
+    <w:p>
+      <w:pPr>
+        <w:spacing w:after="0" w:line="312"/>
+        <w:ind w:firstLine="340"/>
+        <w:jc w:val="both"/>
+      </w:pPr>
+      <w:r>
+        <w:rPr>
+          <w:rFonts w:ascii="Georgia" w:cs="Georgia" w:eastAsia="Georgia" w:hAnsi="Georgia"/>
+          <w:sz w:val="21"/>
+          <w:szCs w:val="21"/>
+        </w:rPr>
+        <w:t xml:space="preserve">— Ao quê? — perguntou Henrique.</w:t>
+      </w:r>
+    </w:p>
+    <w:p>
+      <w:pPr>
+        <w:spacing w:after="0" w:line="312"/>
+        <w:ind w:firstLine="340"/>
+        <w:jc w:val="both"/>
+      </w:pPr>
+      <w:r>
+        <w:rPr>
+          <w:rFonts w:ascii="Georgia" w:cs="Georgia" w:eastAsia="Georgia" w:hAnsi="Georgia"/>
+          <w:sz w:val="21"/>
+          <w:szCs w:val="21"/>
+        </w:rPr>
+        <w:t xml:space="preserve">— A nós. E ao seu sócio não descobrir que você saiu mais cedo da reunião.</w:t>
+      </w:r>
+    </w:p>
+    <w:p>
+      <w:pPr>
+        <w:spacing w:after="0" w:line="312"/>
+        <w:ind w:firstLine="340"/>
+        <w:jc w:val="both"/>
+      </w:pPr>
+      <w:r>
+        <w:rPr>
+          <w:rFonts w:ascii="Georgia" w:cs="Georgia" w:eastAsia="Georgia" w:hAnsi="Georgia"/>
+          <w:sz w:val="21"/>
+          <w:szCs w:val="21"/>
+        </w:rPr>
+        <w:t xml:space="preserve">Ele riu e encostou o copo no dela. O vidro tilintou. Henrique levou o uísque até perto da boca, sentiu o cheiro forte, amadeirado, e então o BlackBerry vibrou no bolso do paletó, sobre a poltrona.</w:t>
+      </w:r>
+    </w:p>
+    <w:p>
+      <w:pPr>
+        <w:spacing w:after="0" w:line="312"/>
+        <w:ind w:firstLine="340"/>
+        <w:jc w:val="both"/>
+      </w:pPr>
+      <w:r>
+        <w:rPr>
+          <w:rFonts w:ascii="Georgia" w:cs="Georgia" w:eastAsia="Georgia" w:hAnsi="Georgia"/>
+          <w:sz w:val="21"/>
+          <w:szCs w:val="21"/>
+        </w:rPr>
+        <w:t xml:space="preserve">— Deixa — disse Bianca.</w:t>
+      </w:r>
+    </w:p>
+    <w:p>
+      <w:pPr>
+        <w:spacing w:after="0" w:line="312"/>
+        <w:ind w:firstLine="340"/>
+        <w:jc w:val="both"/>
+      </w:pPr>
+      <w:r>
+        <w:rPr>
+          <w:rFonts w:ascii="Georgia" w:cs="Georgia" w:eastAsia="Georgia" w:hAnsi="Georgia"/>
+          <w:sz w:val="21"/>
+          <w:szCs w:val="21"/>
+        </w:rPr>
+        <w:t xml:space="preserve">— Pode ser a Helena.</w:t>
+      </w:r>
+    </w:p>
+    <w:p>
+      <w:pPr>
+        <w:spacing w:after="0" w:line="312"/>
+        <w:ind w:firstLine="340"/>
+        <w:jc w:val="both"/>
+      </w:pPr>
+      <w:r>
+        <w:rPr>
+          <w:rFonts w:ascii="Georgia" w:cs="Georgia" w:eastAsia="Georgia" w:hAnsi="Georgia"/>
+          <w:sz w:val="21"/>
+          <w:szCs w:val="21"/>
+        </w:rPr>
+        <w:t xml:space="preserve">— Por isso mesmo. Deixa.</w:t>
+      </w:r>
+    </w:p>
+    <w:p>
+      <w:pPr>
+        <w:spacing w:after="0" w:line="312"/>
+        <w:ind w:firstLine="340"/>
+        <w:jc w:val="both"/>
+      </w:pPr>
+      <w:r>
+        <w:rPr>
+          <w:rFonts w:ascii="Georgia" w:cs="Georgia" w:eastAsia="Georgia" w:hAnsi="Georgia"/>
+          <w:sz w:val="21"/>
+          <w:szCs w:val="21"/>
+        </w:rPr>
+        <w:t xml:space="preserve">Ele pousou o copo cheio na mesa de cabeceira, ao lado do abajur, e foi até a poltrona. Era Otávio. Uma mensagem curta, como todas: O pessoal do loteamento quer antecipar para amanhã às oito. Consegue? Henrique respondeu que sim, sem pensar, e voltou para a cama.</w:t>
+      </w:r>
+    </w:p>
+    <w:p>
+      <w:pPr>
+        <w:spacing w:after="0" w:line="312"/>
+        <w:ind w:firstLine="340"/>
+        <w:jc w:val="both"/>
+      </w:pPr>
+      <w:r>
+        <w:rPr>
+          <w:rFonts w:ascii="Georgia" w:cs="Georgia" w:eastAsia="Georgia" w:hAnsi="Georgia"/>
+          <w:sz w:val="21"/>
+          <w:szCs w:val="21"/>
+        </w:rPr>
+        <w:t xml:space="preserve">Bianca já não estava sorrindo.</w:t>
+      </w:r>
+    </w:p>
+    <w:p>
+      <w:pPr>
+        <w:spacing w:after="0" w:line="312"/>
+        <w:ind w:firstLine="340"/>
+        <w:jc w:val="both"/>
+      </w:pPr>
+      <w:r>
+        <w:rPr>
+          <w:rFonts w:ascii="Georgia" w:cs="Georgia" w:eastAsia="Georgia" w:hAnsi="Georgia"/>
+          <w:sz w:val="21"/>
+          <w:szCs w:val="21"/>
+        </w:rPr>
+        <w:t xml:space="preserve">Durou um segundo, talvez menos. Henrique pegou o olhar dela indo do rosto dele para o copo intocado na mesa de cabeceira, e depois de volta para o rosto. Um olhar rápido, de alguém que confere uma conta. Ele achou graça. Achou que era ciúme da Helena, ou do trabalho, ou de tudo o que sempre vinha antes dela.</w:t>
+      </w:r>
+    </w:p>
+    <w:p>
+      <w:pPr>
+        <w:spacing w:after="0" w:line="312"/>
+        <w:ind w:firstLine="340"/>
+        <w:jc w:val="both"/>
+      </w:pPr>
+      <w:r>
+        <w:rPr>
+          <w:rFonts w:ascii="Georgia" w:cs="Georgia" w:eastAsia="Georgia" w:hAnsi="Georgia"/>
+          <w:sz w:val="21"/>
+          <w:szCs w:val="21"/>
+        </w:rPr>
+        <w:t xml:space="preserve">— Que foi? — perguntou.</w:t>
+      </w:r>
+    </w:p>
+    <w:p>
+      <w:pPr>
+        <w:spacing w:after="0" w:line="312"/>
+        <w:ind w:firstLine="340"/>
+        <w:jc w:val="both"/>
+      </w:pPr>
+      <w:r>
+        <w:rPr>
+          <w:rFonts w:ascii="Georgia" w:cs="Georgia" w:eastAsia="Georgia" w:hAnsi="Georgia"/>
+          <w:sz w:val="21"/>
+          <w:szCs w:val="21"/>
+        </w:rPr>
+        <w:t xml:space="preserve">— Nada. Você não larga esse telefone nem aqui.</w:t>
+      </w:r>
+    </w:p>
+    <w:p>
+      <w:pPr>
+        <w:spacing w:after="0" w:line="312"/>
+        <w:ind w:firstLine="340"/>
+        <w:jc w:val="both"/>
+      </w:pPr>
+      <w:r>
+        <w:rPr>
+          <w:rFonts w:ascii="Georgia" w:cs="Georgia" w:eastAsia="Georgia" w:hAnsi="Georgia"/>
+          <w:sz w:val="21"/>
+          <w:szCs w:val="21"/>
+        </w:rPr>
+        <w:t xml:space="preserve">— É o meu trabalho.</w:t>
+      </w:r>
+    </w:p>
+    <w:p>
+      <w:pPr>
+        <w:spacing w:after="0" w:line="312"/>
+        <w:ind w:firstLine="340"/>
+        <w:jc w:val="both"/>
+      </w:pPr>
+      <w:r>
+        <w:rPr>
+          <w:rFonts w:ascii="Georgia" w:cs="Georgia" w:eastAsia="Georgia" w:hAnsi="Georgia"/>
+          <w:sz w:val="21"/>
+          <w:szCs w:val="21"/>
+        </w:rPr>
+        <w:t xml:space="preserve">— O seu trabalho é ter medo de que as coisas deem errado.</w:t>
+      </w:r>
+    </w:p>
+    <w:p>
+      <w:pPr>
+        <w:spacing w:after="0" w:line="312"/>
+        <w:ind w:firstLine="340"/>
+        <w:jc w:val="both"/>
+      </w:pPr>
+      <w:r>
+        <w:rPr>
+          <w:rFonts w:ascii="Georgia" w:cs="Georgia" w:eastAsia="Georgia" w:hAnsi="Georgia"/>
+          <w:sz w:val="21"/>
+          <w:szCs w:val="21"/>
+        </w:rPr>
+        <w:t xml:space="preserve">— E elas dão — disse ele. — Sempre dão. Por isso as pessoas me pagam.</w:t>
+      </w:r>
+    </w:p>
+    <w:p>
+      <w:pPr>
+        <w:spacing w:after="0" w:line="312"/>
+        <w:ind w:firstLine="340"/>
+        <w:jc w:val="both"/>
+      </w:pPr>
+      <w:r>
+        <w:rPr>
+          <w:rFonts w:ascii="Georgia" w:cs="Georgia" w:eastAsia="Georgia" w:hAnsi="Georgia"/>
+          <w:sz w:val="21"/>
+          <w:szCs w:val="21"/>
+        </w:rPr>
+        <w:t xml:space="preserve">Bianca se aproximou, e por um bom tempo ninguém se lembrou do uísque.</w:t>
+      </w:r>
+    </w:p>
+    <w:p>
+      <w:pPr>
+        <w:spacing w:after="200" w:before="200"/>
+        <w:jc w:val="center"/>
+      </w:pPr>
+      <w:r>
+        <w:rPr>
+          <w:rFonts w:ascii="Georgia" w:cs="Georgia" w:eastAsia="Georgia" w:hAnsi="Georgia"/>
+          <w:sz w:val="22"/>
+          <w:szCs w:val="22"/>
+        </w:rPr>
+        <w:t xml:space="preserve">*</w:t>
+      </w:r>
+    </w:p>
+    <w:p>
+      <w:pPr>
+        <w:spacing w:after="0" w:line="312"/>
+        <w:ind w:firstLine="340"/>
+        <w:jc w:val="both"/>
+      </w:pPr>
+      <w:r>
+        <w:rPr>
+          <w:rFonts w:ascii="Georgia" w:cs="Georgia" w:eastAsia="Georgia" w:hAnsi="Georgia"/>
+          <w:sz w:val="21"/>
+          <w:szCs w:val="21"/>
+        </w:rPr>
+        <w:t xml:space="preserve">Passava da meia-noite quando ele começou a se vestir.</w:t>
+      </w:r>
+    </w:p>
+    <w:p>
+      <w:pPr>
+        <w:spacing w:after="0" w:line="312"/>
+        <w:ind w:firstLine="340"/>
+        <w:jc w:val="both"/>
+      </w:pPr>
+      <w:r>
+        <w:rPr>
+          <w:rFonts w:ascii="Georgia" w:cs="Georgia" w:eastAsia="Georgia" w:hAnsi="Georgia"/>
+          <w:sz w:val="21"/>
+          <w:szCs w:val="21"/>
+        </w:rPr>
+        <w:t xml:space="preserve">Bianca ficou deitada, enrolada no lençol, olhando para o teto espelhado. Ela tinha vinte e nove anos e um jeito de olhar para as coisas como se já soubesse o preço de cada uma. Henrique nunca tinha perguntado o que ela queria dele. Achava que sabia: atenção, presentes, um apartamento que ele pagava sem que Helena soubesse. As coisas que mulheres como ela queriam de homens como ele.</w:t>
+      </w:r>
+    </w:p>
+    <w:p>
+      <w:pPr>
+        <w:spacing w:after="0" w:line="312"/>
+        <w:ind w:firstLine="340"/>
+        <w:jc w:val="both"/>
+      </w:pPr>
+      <w:r>
+        <w:rPr>
+          <w:rFonts w:ascii="Georgia" w:cs="Georgia" w:eastAsia="Georgia" w:hAnsi="Georgia"/>
+          <w:sz w:val="21"/>
+          <w:szCs w:val="21"/>
+        </w:rPr>
+        <w:t xml:space="preserve">— Você nem bebeu — disse ela.</w:t>
+      </w:r>
+    </w:p>
+    <w:p>
+      <w:pPr>
+        <w:spacing w:after="0" w:line="312"/>
+        <w:ind w:firstLine="340"/>
+        <w:jc w:val="both"/>
+      </w:pPr>
+      <w:r>
+        <w:rPr>
+          <w:rFonts w:ascii="Georgia" w:cs="Georgia" w:eastAsia="Georgia" w:hAnsi="Georgia"/>
+          <w:sz w:val="21"/>
+          <w:szCs w:val="21"/>
+        </w:rPr>
+        <w:t xml:space="preserve">Ele olhou para a mesa de cabeceira. O copo estava lá, intacto, o gelo derretido numa camada clara sobre o uísque escuro.</w:t>
+      </w:r>
+    </w:p>
+    <w:p>
+      <w:pPr>
+        <w:spacing w:after="0" w:line="312"/>
+        <w:ind w:firstLine="340"/>
+        <w:jc w:val="both"/>
+      </w:pPr>
+      <w:r>
+        <w:rPr>
+          <w:rFonts w:ascii="Georgia" w:cs="Georgia" w:eastAsia="Georgia" w:hAnsi="Georgia"/>
+          <w:sz w:val="21"/>
+          <w:szCs w:val="21"/>
+        </w:rPr>
+        <w:t xml:space="preserve">— Amanhã tenho reunião às oito. Se eu beber, durmo na mesa do cliente.</w:t>
+      </w:r>
+    </w:p>
+    <w:p>
+      <w:pPr>
+        <w:spacing w:after="0" w:line="312"/>
+        <w:ind w:firstLine="340"/>
+        <w:jc w:val="both"/>
+      </w:pPr>
+      <w:r>
+        <w:rPr>
+          <w:rFonts w:ascii="Georgia" w:cs="Georgia" w:eastAsia="Georgia" w:hAnsi="Georgia"/>
+          <w:sz w:val="21"/>
+          <w:szCs w:val="21"/>
+        </w:rPr>
+        <w:t xml:space="preserve">— Uma dose, Henrique.</w:t>
+      </w:r>
+    </w:p>
+    <w:p>
+      <w:pPr>
+        <w:spacing w:after="0" w:line="312"/>
+        <w:ind w:firstLine="340"/>
+        <w:jc w:val="both"/>
+      </w:pPr>
+      <w:r>
+        <w:rPr>
+          <w:rFonts w:ascii="Georgia" w:cs="Georgia" w:eastAsia="Georgia" w:hAnsi="Georgia"/>
+          <w:sz w:val="21"/>
+          <w:szCs w:val="21"/>
+        </w:rPr>
+        <w:t xml:space="preserve">— Bebe você.</w:t>
+      </w:r>
+    </w:p>
+    <w:p>
+      <w:pPr>
+        <w:spacing w:after="0" w:line="312"/>
+        <w:ind w:firstLine="340"/>
+        <w:jc w:val="both"/>
+      </w:pPr>
+      <w:r>
+        <w:rPr>
+          <w:rFonts w:ascii="Georgia" w:cs="Georgia" w:eastAsia="Georgia" w:hAnsi="Georgia"/>
+          <w:sz w:val="21"/>
+          <w:szCs w:val="21"/>
+        </w:rPr>
+        <w:t xml:space="preserve">— Eu já bebi a minha.</w:t>
+      </w:r>
+    </w:p>
+    <w:p>
+      <w:pPr>
+        <w:spacing w:after="0" w:line="312"/>
+        <w:ind w:firstLine="340"/>
+        <w:jc w:val="both"/>
+      </w:pPr>
+      <w:r>
+        <w:rPr>
+          <w:rFonts w:ascii="Georgia" w:cs="Georgia" w:eastAsia="Georgia" w:hAnsi="Georgia"/>
+          <w:sz w:val="21"/>
+          <w:szCs w:val="21"/>
+        </w:rPr>
+        <w:t xml:space="preserve">Havia uma insistência na voz dela que não combinava com a preguiça do corpo. Henrique notou e deixou passar, como deixava passar quase tudo o que não envolvia dinheiro. Ajeitou a gravata no espelho, guardou o BlackBerry no bolso e pegou a chave do carro.</w:t>
+      </w:r>
+    </w:p>
+    <w:p>
+      <w:pPr>
+        <w:spacing w:after="0" w:line="312"/>
+        <w:ind w:firstLine="340"/>
+        <w:jc w:val="both"/>
+      </w:pPr>
+      <w:r>
+        <w:rPr>
+          <w:rFonts w:ascii="Georgia" w:cs="Georgia" w:eastAsia="Georgia" w:hAnsi="Georgia"/>
+          <w:sz w:val="21"/>
+          <w:szCs w:val="21"/>
+        </w:rPr>
+        <w:t xml:space="preserve">— Vai ficar?</w:t>
+      </w:r>
+    </w:p>
+    <w:p>
+      <w:pPr>
+        <w:spacing w:after="0" w:line="312"/>
+        <w:ind w:firstLine="340"/>
+        <w:jc w:val="both"/>
+      </w:pPr>
+      <w:r>
+        <w:rPr>
+          <w:rFonts w:ascii="Georgia" w:cs="Georgia" w:eastAsia="Georgia" w:hAnsi="Georgia"/>
+          <w:sz w:val="21"/>
+          <w:szCs w:val="21"/>
+        </w:rPr>
+        <w:t xml:space="preserve">— Um pouco. Vou tomar um banho. Pode deixar que eu peço um táxi.</w:t>
+      </w:r>
+    </w:p>
+    <w:p>
+      <w:pPr>
+        <w:spacing w:after="0" w:line="312"/>
+        <w:ind w:firstLine="340"/>
+        <w:jc w:val="both"/>
+      </w:pPr>
+      <w:r>
+        <w:rPr>
+          <w:rFonts w:ascii="Georgia" w:cs="Georgia" w:eastAsia="Georgia" w:hAnsi="Georgia"/>
+          <w:sz w:val="21"/>
+          <w:szCs w:val="21"/>
+        </w:rPr>
+        <w:t xml:space="preserve">Ele se inclinou e beijou a testa dela. Ela não se mexeu.</w:t>
+      </w:r>
+    </w:p>
+    <w:p>
+      <w:pPr>
+        <w:spacing w:after="0" w:line="312"/>
+        <w:ind w:firstLine="340"/>
+        <w:jc w:val="both"/>
+      </w:pPr>
+      <w:r>
+        <w:rPr>
+          <w:rFonts w:ascii="Georgia" w:cs="Georgia" w:eastAsia="Georgia" w:hAnsi="Georgia"/>
+          <w:sz w:val="21"/>
+          <w:szCs w:val="21"/>
+        </w:rPr>
+        <w:t xml:space="preserve">Na saída, o portão rangeu de novo, e seu Joaquim apareceu na guarita com a lanterna apontada para o chão.</w:t>
+      </w:r>
+    </w:p>
+    <w:p>
+      <w:pPr>
+        <w:spacing w:after="0" w:line="312"/>
+        <w:ind w:firstLine="340"/>
+        <w:jc w:val="both"/>
+      </w:pPr>
+      <w:r>
+        <w:rPr>
+          <w:rFonts w:ascii="Georgia" w:cs="Georgia" w:eastAsia="Georgia" w:hAnsi="Georgia"/>
+          <w:sz w:val="21"/>
+          <w:szCs w:val="21"/>
+        </w:rPr>
+        <w:t xml:space="preserve">— Boa noite, doutor. Vai com Deus.</w:t>
+      </w:r>
+    </w:p>
+    <w:p>
+      <w:pPr>
+        <w:spacing w:after="0" w:line="312"/>
+        <w:ind w:firstLine="340"/>
+        <w:jc w:val="both"/>
+      </w:pPr>
+      <w:r>
+        <w:rPr>
+          <w:rFonts w:ascii="Georgia" w:cs="Georgia" w:eastAsia="Georgia" w:hAnsi="Georgia"/>
+          <w:sz w:val="21"/>
+          <w:szCs w:val="21"/>
+        </w:rPr>
+        <w:t xml:space="preserve">— Boa noite, seu Joaquim.</w:t>
+      </w:r>
+    </w:p>
+    <w:p>
+      <w:pPr>
+        <w:spacing w:after="0" w:line="312"/>
+        <w:ind w:firstLine="340"/>
+        <w:jc w:val="both"/>
+      </w:pPr>
+      <w:r>
+        <w:rPr>
+          <w:rFonts w:ascii="Georgia" w:cs="Georgia" w:eastAsia="Georgia" w:hAnsi="Georgia"/>
+          <w:sz w:val="21"/>
+          <w:szCs w:val="21"/>
+        </w:rPr>
+        <w:t xml:space="preserve">Henrique não deu gorjeta na saída. Nunca dava. Depois, por muitos meses, ia pensar nisso mais do que gostaria.</w:t>
+      </w:r>
+    </w:p>
+    <w:p>
+      <w:pPr>
+        <w:spacing w:after="200" w:before="200"/>
+        <w:jc w:val="center"/>
+      </w:pPr>
+      <w:r>
+        <w:rPr>
+          <w:rFonts w:ascii="Georgia" w:cs="Georgia" w:eastAsia="Georgia" w:hAnsi="Georgia"/>
+          <w:sz w:val="22"/>
+          <w:szCs w:val="22"/>
+        </w:rPr>
+        <w:t xml:space="preserve">*</w:t>
+      </w:r>
+    </w:p>
+    <w:p>
+      <w:pPr>
+        <w:spacing w:after="0" w:line="312"/>
+        <w:ind w:firstLine="340"/>
+        <w:jc w:val="both"/>
+      </w:pPr>
+      <w:r>
+        <w:rPr>
+          <w:rFonts w:ascii="Georgia" w:cs="Georgia" w:eastAsia="Georgia" w:hAnsi="Georgia"/>
+          <w:sz w:val="21"/>
+          <w:szCs w:val="21"/>
+        </w:rPr>
+        <w:t xml:space="preserve">Às seis e meia da manhã, Helena o acordou com a televisão ligada.</w:t>
+      </w:r>
+    </w:p>
+    <w:p>
+      <w:pPr>
+        <w:spacing w:after="0" w:line="312"/>
+        <w:ind w:firstLine="340"/>
+        <w:jc w:val="both"/>
+      </w:pPr>
+      <w:r>
+        <w:rPr>
+          <w:rFonts w:ascii="Georgia" w:cs="Georgia" w:eastAsia="Georgia" w:hAnsi="Georgia"/>
+          <w:sz w:val="21"/>
+          <w:szCs w:val="21"/>
+        </w:rPr>
+        <w:t xml:space="preserve">— Não é aquele motel da Marginal? — perguntou ela, de pé ao lado da cama, com a xícara de café na mão. — Onde você foi jantar com o pessoal de Campinas, uma vez, e ficou rindo porque o restaurante era do lado?</w:t>
+      </w:r>
+    </w:p>
+    <w:p>
+      <w:pPr>
+        <w:spacing w:after="0" w:line="312"/>
+        <w:ind w:firstLine="340"/>
+        <w:jc w:val="both"/>
+      </w:pPr>
+      <w:r>
+        <w:rPr>
+          <w:rFonts w:ascii="Georgia" w:cs="Georgia" w:eastAsia="Georgia" w:hAnsi="Georgia"/>
+          <w:sz w:val="21"/>
+          <w:szCs w:val="21"/>
+        </w:rPr>
+        <w:t xml:space="preserve">Henrique sentou-se na cama.</w:t>
+      </w:r>
+    </w:p>
+    <w:p>
+      <w:pPr>
+        <w:spacing w:after="0" w:line="312"/>
+        <w:ind w:firstLine="340"/>
+        <w:jc w:val="both"/>
+      </w:pPr>
+      <w:r>
+        <w:rPr>
+          <w:rFonts w:ascii="Georgia" w:cs="Georgia" w:eastAsia="Georgia" w:hAnsi="Georgia"/>
+          <w:sz w:val="21"/>
+          <w:szCs w:val="21"/>
+        </w:rPr>
+        <w:t xml:space="preserve">Na tela, uma repórter de capa de chuva falava diante do portão que ele conhecia bem. Funcionário de motel é encontrado morto em suíte na Marginal Pinheiros. A polícia suspeita de envenenamento. A imagem mostrava a guarita vazia. O portão fechado. Uma viatura com o giroflex ligado.</w:t>
+      </w:r>
+    </w:p>
+    <w:p>
+      <w:pPr>
+        <w:spacing w:after="0" w:line="312"/>
+        <w:ind w:firstLine="340"/>
+        <w:jc w:val="both"/>
+      </w:pPr>
+      <w:r>
+        <w:rPr>
+          <w:rFonts w:ascii="Georgia" w:cs="Georgia" w:eastAsia="Georgia" w:hAnsi="Georgia"/>
+          <w:sz w:val="21"/>
+          <w:szCs w:val="21"/>
+        </w:rPr>
+        <w:t xml:space="preserve">— Que horror — disse Helena. — Um senhor de sessenta e poucos anos. Foi fazer a limpeza do quarto e morreu lá dentro.</w:t>
+      </w:r>
+    </w:p>
+    <w:p>
+      <w:pPr>
+        <w:spacing w:after="0" w:line="312"/>
+        <w:ind w:firstLine="340"/>
+        <w:jc w:val="both"/>
+      </w:pPr>
+      <w:r>
+        <w:rPr>
+          <w:rFonts w:ascii="Georgia" w:cs="Georgia" w:eastAsia="Georgia" w:hAnsi="Georgia"/>
+          <w:sz w:val="21"/>
+          <w:szCs w:val="21"/>
+        </w:rPr>
+        <w:t xml:space="preserve">Henrique não disse nada. Ficou olhando para a guarita vazia na televisão.</w:t>
+      </w:r>
+    </w:p>
+    <w:p>
+      <w:pPr>
+        <w:spacing w:after="0" w:line="312"/>
+        <w:ind w:firstLine="340"/>
+        <w:jc w:val="both"/>
+      </w:pPr>
+      <w:r>
+        <w:rPr>
+          <w:rFonts w:ascii="Georgia" w:cs="Georgia" w:eastAsia="Georgia" w:hAnsi="Georgia"/>
+          <w:sz w:val="21"/>
+          <w:szCs w:val="21"/>
+        </w:rPr>
+        <w:t xml:space="preserve">— Henrique? Você está pálido.</w:t>
+      </w:r>
+    </w:p>
+    <w:p>
+      <w:pPr>
+        <w:spacing w:after="0" w:line="312"/>
+        <w:ind w:firstLine="340"/>
+        <w:jc w:val="both"/>
+      </w:pPr>
+      <w:r>
+        <w:rPr>
+          <w:rFonts w:ascii="Georgia" w:cs="Georgia" w:eastAsia="Georgia" w:hAnsi="Georgia"/>
+          <w:sz w:val="21"/>
+          <w:szCs w:val="21"/>
+        </w:rPr>
+        <w:t xml:space="preserve">— Dormi mal.</w:t>
+      </w:r>
+    </w:p>
+    <w:p>
+      <w:pPr>
+        <w:spacing w:after="0" w:line="312"/>
+        <w:ind w:firstLine="340"/>
+        <w:jc w:val="both"/>
+      </w:pPr>
+      <w:r>
+        <w:rPr>
+          <w:rFonts w:ascii="Georgia" w:cs="Georgia" w:eastAsia="Georgia" w:hAnsi="Georgia"/>
+          <w:sz w:val="21"/>
+          <w:szCs w:val="21"/>
+        </w:rPr>
+        <w:t xml:space="preserve">Ela o olhou por um momento. Depois deu de ombros, voltou para a cozinha e deixou a televisão ligada.</w:t>
+      </w:r>
+    </w:p>
+    <w:p>
+      <w:pPr>
+        <w:spacing w:after="0" w:line="312"/>
+        <w:ind w:firstLine="340"/>
+        <w:jc w:val="both"/>
+      </w:pPr>
+      <w:r>
+        <w:rPr>
+          <w:rFonts w:ascii="Georgia" w:cs="Georgia" w:eastAsia="Georgia" w:hAnsi="Georgia"/>
+          <w:sz w:val="21"/>
+          <w:szCs w:val="21"/>
+        </w:rPr>
+        <w:t xml:space="preserve">Henrique pegou o BlackBerry na mesa de cabeceira. Tinha uma mensagem de Bianca, enviada às duas e quarenta da madrugada: Cheguei. Dorme bem. E mais nada. Nenhuma mensagem depois disso. Ele escreveu, apagou, escreveu de novo. Viu o jornal? Apagou. Não mandou nada.</w:t>
+      </w:r>
+    </w:p>
+    <w:p>
+      <w:pPr>
+        <w:spacing w:after="0" w:line="312"/>
+        <w:ind w:firstLine="340"/>
+        <w:jc w:val="both"/>
+      </w:pPr>
+      <w:r>
+        <w:rPr>
+          <w:rFonts w:ascii="Georgia" w:cs="Georgia" w:eastAsia="Georgia" w:hAnsi="Georgia"/>
+          <w:sz w:val="21"/>
+          <w:szCs w:val="21"/>
+        </w:rPr>
+        <w:t xml:space="preserve">Foi para a reunião das oito porque não sabia o que mais fazer. Assinou o que precisava assinar. Sorriu para o pessoal do loteamento. Às onze, quando voltou para a corretora, a secretária o esperava na porta da sala, com uma expressão que ele nunca tinha visto nela.</w:t>
+      </w:r>
+    </w:p>
+    <w:p>
+      <w:pPr>
+        <w:spacing w:after="0" w:line="312"/>
+        <w:ind w:firstLine="340"/>
+        <w:jc w:val="both"/>
+      </w:pPr>
+      <w:r>
+        <w:rPr>
+          <w:rFonts w:ascii="Georgia" w:cs="Georgia" w:eastAsia="Georgia" w:hAnsi="Georgia"/>
+          <w:sz w:val="21"/>
+          <w:szCs w:val="21"/>
+        </w:rPr>
+        <w:t xml:space="preserve">— Doutor Henrique, tem uma delegada aqui. Ela disse que espera o tempo que for preciso.</w:t>
+      </w:r>
+    </w:p>
+    <w:p>
+      <w:pPr>
+        <w:spacing w:after="200" w:before="200"/>
+        <w:jc w:val="center"/>
+      </w:pPr>
+      <w:r>
+        <w:rPr>
+          <w:rFonts w:ascii="Georgia" w:cs="Georgia" w:eastAsia="Georgia" w:hAnsi="Georgia"/>
+          <w:sz w:val="22"/>
+          <w:szCs w:val="22"/>
+        </w:rPr>
+        <w:t xml:space="preserve">*</w:t>
+      </w:r>
+    </w:p>
+    <w:p>
+      <w:pPr>
+        <w:spacing w:after="0" w:line="312"/>
+        <w:ind w:firstLine="340"/>
+        <w:jc w:val="both"/>
+      </w:pPr>
+      <w:r>
+        <w:rPr>
+          <w:rFonts w:ascii="Georgia" w:cs="Georgia" w:eastAsia="Georgia" w:hAnsi="Georgia"/>
+          <w:sz w:val="21"/>
+          <w:szCs w:val="21"/>
+        </w:rPr>
+        <w:t xml:space="preserve">A delegada estava sentada na poltrona dele, do lado errado da mesa, e não se levantou quando ele entrou.</w:t>
+      </w:r>
+    </w:p>
+    <w:p>
+      <w:pPr>
+        <w:spacing w:after="0" w:line="312"/>
+        <w:ind w:firstLine="340"/>
+        <w:jc w:val="both"/>
+      </w:pPr>
+      <w:r>
+        <w:rPr>
+          <w:rFonts w:ascii="Georgia" w:cs="Georgia" w:eastAsia="Georgia" w:hAnsi="Georgia"/>
+          <w:sz w:val="21"/>
+          <w:szCs w:val="21"/>
+        </w:rPr>
+        <w:t xml:space="preserve">Tinha uns quarenta e cinco anos, o cabelo preso num coque prático e um terninho azul-marinho que já tinha visto dias melhores. Na mão, uma caneta que ela girava devagar entre os dedos.</w:t>
+      </w:r>
+    </w:p>
+    <w:p>
+      <w:pPr>
+        <w:spacing w:after="0" w:line="312"/>
+        <w:ind w:firstLine="340"/>
+        <w:jc w:val="both"/>
+      </w:pPr>
+      <w:r>
+        <w:rPr>
+          <w:rFonts w:ascii="Georgia" w:cs="Georgia" w:eastAsia="Georgia" w:hAnsi="Georgia"/>
+          <w:sz w:val="21"/>
+          <w:szCs w:val="21"/>
+        </w:rPr>
+        <w:t xml:space="preserve">— Regina Paiva — disse. — Delegada. O senhor esteve na suíte 14 de um motel na Marginal Pinheiros ontem à noite, entre as nove e meia e a meia-noite e quinze.</w:t>
+      </w:r>
+    </w:p>
+    <w:p>
+      <w:pPr>
+        <w:spacing w:after="0" w:line="312"/>
+        <w:ind w:firstLine="340"/>
+        <w:jc w:val="both"/>
+      </w:pPr>
+      <w:r>
+        <w:rPr>
+          <w:rFonts w:ascii="Georgia" w:cs="Georgia" w:eastAsia="Georgia" w:hAnsi="Georgia"/>
+          <w:sz w:val="21"/>
+          <w:szCs w:val="21"/>
+        </w:rPr>
+        <w:t xml:space="preserve">Não era uma pergunta. Henrique sentou-se na cadeira dos clientes, porque era a que sobrava.</w:t>
+      </w:r>
+    </w:p>
+    <w:p>
+      <w:pPr>
+        <w:spacing w:after="0" w:line="312"/>
+        <w:ind w:firstLine="340"/>
+        <w:jc w:val="both"/>
+      </w:pPr>
+      <w:r>
+        <w:rPr>
+          <w:rFonts w:ascii="Georgia" w:cs="Georgia" w:eastAsia="Georgia" w:hAnsi="Georgia"/>
+          <w:sz w:val="21"/>
+          <w:szCs w:val="21"/>
+        </w:rPr>
+        <w:t xml:space="preserve">— Estive.</w:t>
+      </w:r>
+    </w:p>
+    <w:p>
+      <w:pPr>
+        <w:spacing w:after="0" w:line="312"/>
+        <w:ind w:firstLine="340"/>
+        <w:jc w:val="both"/>
+      </w:pPr>
+      <w:r>
+        <w:rPr>
+          <w:rFonts w:ascii="Georgia" w:cs="Georgia" w:eastAsia="Georgia" w:hAnsi="Georgia"/>
+          <w:sz w:val="21"/>
+          <w:szCs w:val="21"/>
+        </w:rPr>
+        <w:t xml:space="preserve">— Acompanhado.</w:t>
+      </w:r>
+    </w:p>
+    <w:p>
+      <w:pPr>
+        <w:spacing w:after="0" w:line="312"/>
+        <w:ind w:firstLine="340"/>
+        <w:jc w:val="both"/>
+      </w:pPr>
+      <w:r>
+        <w:rPr>
+          <w:rFonts w:ascii="Georgia" w:cs="Georgia" w:eastAsia="Georgia" w:hAnsi="Georgia"/>
+          <w:sz w:val="21"/>
+          <w:szCs w:val="21"/>
+        </w:rPr>
+        <w:t xml:space="preserve">— Isso é relevante?</w:t>
+      </w:r>
+    </w:p>
+    <w:p>
+      <w:pPr>
+        <w:spacing w:after="0" w:line="312"/>
+        <w:ind w:firstLine="340"/>
+        <w:jc w:val="both"/>
+      </w:pPr>
+      <w:r>
+        <w:rPr>
+          <w:rFonts w:ascii="Georgia" w:cs="Georgia" w:eastAsia="Georgia" w:hAnsi="Georgia"/>
+          <w:sz w:val="21"/>
+          <w:szCs w:val="21"/>
+        </w:rPr>
+        <w:t xml:space="preserve">— Tudo é relevante quando um homem de sessenta e três anos morre envenenado com arsênico, senhor Salvallus. — Ela parou de girar a caneta. — O funcionário que limpou a suíte depois que o senhor saiu foi encontrado no chão do quarto. Ao lado dele, um copo de uísque vazio. O laboratório ainda vai confirmar, mas o perito tem pouca dúvida.</w:t>
+      </w:r>
+    </w:p>
+    <w:p>
+      <w:pPr>
+        <w:spacing w:after="0" w:line="312"/>
+        <w:ind w:firstLine="340"/>
+        <w:jc w:val="both"/>
+      </w:pPr>
+      <w:r>
+        <w:rPr>
+          <w:rFonts w:ascii="Georgia" w:cs="Georgia" w:eastAsia="Georgia" w:hAnsi="Georgia"/>
+          <w:sz w:val="21"/>
+          <w:szCs w:val="21"/>
+        </w:rPr>
+        <w:t xml:space="preserve">Henrique sentiu a boca seca.</w:t>
+      </w:r>
+    </w:p>
+    <w:p>
+      <w:pPr>
+        <w:spacing w:after="0" w:line="312"/>
+        <w:ind w:firstLine="340"/>
+        <w:jc w:val="both"/>
+      </w:pPr>
+      <w:r>
+        <w:rPr>
+          <w:rFonts w:ascii="Georgia" w:cs="Georgia" w:eastAsia="Georgia" w:hAnsi="Georgia"/>
+          <w:sz w:val="21"/>
+          <w:szCs w:val="21"/>
+        </w:rPr>
+        <w:t xml:space="preserve">— Eu não bebi aquele uísque.</w:t>
+      </w:r>
+    </w:p>
+    <w:p>
+      <w:pPr>
+        <w:spacing w:after="0" w:line="312"/>
+        <w:ind w:firstLine="340"/>
+        <w:jc w:val="both"/>
+      </w:pPr>
+      <w:r>
+        <w:rPr>
+          <w:rFonts w:ascii="Georgia" w:cs="Georgia" w:eastAsia="Georgia" w:hAnsi="Georgia"/>
+          <w:sz w:val="21"/>
+          <w:szCs w:val="21"/>
+        </w:rPr>
+        <w:t xml:space="preserve">— Eu sei. Quem bebeu foi o seu Joaquim. — Regina inclinou a cabeça. — O que eu ainda não sei é por que o senhor não bebeu. E por que o copo que o senhor deixou intacto na mesa de cabeceira tinha as suas digitais.</w:t>
+      </w:r>
+    </w:p>
+    <w:p>
+      <w:pPr>
+        <w:spacing w:after="200" w:before="200"/>
+        <w:jc w:val="center"/>
+      </w:pPr>
+      <w:r>
+        <w:rPr>
+          <w:rFonts w:ascii="Georgia" w:cs="Georgia" w:eastAsia="Georgia" w:hAnsi="Georgia"/>
+          <w:sz w:val="22"/>
+          <w:szCs w:val="22"/>
+        </w:rPr>
+        <w:t xml:space="preserve">*</w:t>
+      </w:r>
+    </w:p>
+    <w:p>
+      <w:pPr>
+        <w:spacing w:after="0" w:line="312"/>
+        <w:ind w:firstLine="340"/>
+        <w:jc w:val="both"/>
+      </w:pPr>
+      <w:r>
+        <w:rPr>
+          <w:rFonts w:ascii="Georgia" w:cs="Georgia" w:eastAsia="Georgia" w:hAnsi="Georgia"/>
+          <w:sz w:val="21"/>
+          <w:szCs w:val="21"/>
+        </w:rPr>
+        <w:t xml:space="preserve">Naquela noite, sozinho no escritório de casa, Henrique abriu o BlackBerry e ficou um longo tempo olhando para o nome de Bianca.</w:t>
+      </w:r>
+    </w:p>
+    <w:p>
+      <w:pPr>
+        <w:spacing w:after="0" w:line="312"/>
+        <w:ind w:firstLine="340"/>
+        <w:jc w:val="both"/>
+      </w:pPr>
+      <w:r>
+        <w:rPr>
+          <w:rFonts w:ascii="Georgia" w:cs="Georgia" w:eastAsia="Georgia" w:hAnsi="Georgia"/>
+          <w:sz w:val="21"/>
+          <w:szCs w:val="21"/>
+        </w:rPr>
+        <w:t xml:space="preserve">Pensou no olhar dela indo do rosto dele para o copo. Pensou na insistência. Uma dose, Henrique. Pensou também na portinhola de serviço, nas mãos sem rosto que tinham deixado a bandeja do outro lado da madeira, no motel inteiro de gente que ele nunca tinha visto. Qualquer um podia ter colocado alguma coisa naquela garrafa. Qualquer um.</w:t>
+      </w:r>
+    </w:p>
+    <w:p>
+      <w:pPr>
+        <w:spacing w:after="0" w:line="312"/>
+        <w:ind w:firstLine="340"/>
+        <w:jc w:val="both"/>
+      </w:pPr>
+      <w:r>
+        <w:rPr>
+          <w:rFonts w:ascii="Georgia" w:cs="Georgia" w:eastAsia="Georgia" w:hAnsi="Georgia"/>
+          <w:sz w:val="21"/>
+          <w:szCs w:val="21"/>
+        </w:rPr>
+        <w:t xml:space="preserve">Ou ninguém. Talvez fosse para o velho mesmo. Talvez ele, Henrique, não tivesse nada com aquilo.</w:t>
+      </w:r>
+    </w:p>
+    <w:p>
+      <w:pPr>
+        <w:spacing w:after="0" w:line="312"/>
+        <w:ind w:firstLine="340"/>
+        <w:jc w:val="both"/>
+      </w:pPr>
+      <w:r>
+        <w:rPr>
+          <w:rFonts w:ascii="Georgia" w:cs="Georgia" w:eastAsia="Georgia" w:hAnsi="Georgia"/>
+          <w:sz w:val="21"/>
+          <w:szCs w:val="21"/>
+        </w:rPr>
+        <w:t xml:space="preserve">Mas ele era um homem de seguros. Passara a vida inteira calculando o risco das coisas que ainda não tinham acontecido. E todos os cálculos, naquela noite, chegavam ao mesmo lugar.</w:t>
+      </w:r>
+    </w:p>
+    <w:p>
+      <w:pPr>
+        <w:spacing w:after="0" w:line="312"/>
+        <w:ind w:firstLine="340"/>
+        <w:jc w:val="both"/>
+      </w:pPr>
+      <w:r>
+        <w:rPr>
+          <w:rFonts w:ascii="Georgia" w:cs="Georgia" w:eastAsia="Georgia" w:hAnsi="Georgia"/>
+          <w:sz w:val="21"/>
+          <w:szCs w:val="21"/>
+        </w:rPr>
+        <w:t xml:space="preserve">O copo era dele.</w:t>
+      </w:r>
+    </w:p>
+    <w:p>
+      <w:pPr>
+        <w:spacing w:after="0" w:line="312"/>
+        <w:ind w:firstLine="340"/>
+        <w:jc w:val="both"/>
+      </w:pPr>
+      <w:r>
+        <w:rPr>
+          <w:rFonts w:ascii="Georgia" w:cs="Georgia" w:eastAsia="Georgia" w:hAnsi="Georgia"/>
+          <w:sz w:val="21"/>
+          <w:szCs w:val="21"/>
+        </w:rPr>
+        <w:t xml:space="preserve">O veneno era para ele.</w:t>
+      </w:r>
+    </w:p>
+    <w:p>
+      <w:pPr>
+        <w:spacing w:after="0" w:line="312"/>
+        <w:ind w:firstLine="340"/>
+        <w:jc w:val="both"/>
+      </w:pPr>
+      <w:r>
+        <w:rPr>
+          <w:rFonts w:ascii="Georgia" w:cs="Georgia" w:eastAsia="Georgia" w:hAnsi="Georgia"/>
+          <w:sz w:val="21"/>
+          <w:szCs w:val="21"/>
+        </w:rPr>
+        <w:t xml:space="preserve">E quem tinha morrido era o homem que sempre lhe desejava boa noite e que, na última vez, lhe disse para ir com Deus.</w:t>
       </w:r>
     </w:p>
     <w:sectPr>

</xml_diff>

<commit_message>
Livro policial: capítulo 4 (A hora certa)
Co-Authored-By: Claude Opus 5.5 <noreply@anthropic.com>
Claude-Session: https://claude.ai/code/session_01BrurxSYygRC3rRhaUYosm1
</commit_message>
<xml_diff>
--- a/docs/livro-policial/TODO_CRIME_TEM_UM_AUTOR.docx
+++ b/docs/livro-policial/TODO_CRIME_TEM_UM_AUTOR.docx
@@ -2932,6 +2932,889 @@
           <w:szCs w:val="21"/>
         </w:rPr>
         <w:t xml:space="preserve">E quem tinha morrido era o homem que sempre lhe desejava boa noite e que, na última vez, lhe disse para ir com Deus.</w:t>
+      </w:r>
+    </w:p>
+    <w:p>
+      <w:pPr>
+        <w:pageBreakBefore/>
+        <w:spacing w:after="120" w:before="1800"/>
+        <w:jc w:val="center"/>
+      </w:pPr>
+      <w:r>
+        <w:rPr>
+          <w:rFonts w:ascii="Georgia" w:cs="Georgia" w:eastAsia="Georgia" w:hAnsi="Georgia"/>
+          <w:spacing w:val="40"/>
+          <w:sz w:val="20"/>
+          <w:szCs w:val="20"/>
+        </w:rPr>
+        <w:t xml:space="preserve">CAPÍTULO 4</w:t>
+      </w:r>
+    </w:p>
+    <w:p>
+      <w:pPr>
+        <w:spacing w:after="720"/>
+        <w:jc w:val="center"/>
+      </w:pPr>
+      <w:r>
+        <w:rPr>
+          <w:rFonts w:ascii="Georgia" w:cs="Georgia" w:eastAsia="Georgia" w:hAnsi="Georgia"/>
+          <w:b/>
+          <w:bCs/>
+          <w:sz w:val="32"/>
+          <w:szCs w:val="32"/>
+        </w:rPr>
+        <w:t xml:space="preserve">A hora certa</w:t>
+      </w:r>
+    </w:p>
+    <w:p>
+      <w:pPr>
+        <w:spacing w:after="0" w:line="312"/>
+        <w:ind w:firstLine="340"/>
+        <w:jc w:val="both"/>
+      </w:pPr>
+      <w:r>
+        <w:rPr>
+          <w:rFonts w:ascii="Georgia" w:cs="Georgia" w:eastAsia="Georgia" w:hAnsi="Georgia"/>
+          <w:sz w:val="21"/>
+          <w:szCs w:val="21"/>
+        </w:rPr>
+        <w:t xml:space="preserve">O prédio do Departamento de Homicídios ficava no centro, perto da Estação da Luz, numa rua onde Lia nunca tinha estado. Na calçada, um vendedor de guarda-chuvas apostava numa chuva que não vinha. Na recepção, uma escrivã de óculos pediu o documento dela, anotou o nome num caderno de capa dura e apontou para um banco de madeira.</w:t>
+      </w:r>
+    </w:p>
+    <w:p>
+      <w:pPr>
+        <w:spacing w:after="0" w:line="312"/>
+        <w:ind w:firstLine="340"/>
+        <w:jc w:val="both"/>
+      </w:pPr>
+      <w:r>
+        <w:rPr>
+          <w:rFonts w:ascii="Georgia" w:cs="Georgia" w:eastAsia="Georgia" w:hAnsi="Georgia"/>
+          <w:sz w:val="21"/>
+          <w:szCs w:val="21"/>
+        </w:rPr>
+        <w:t xml:space="preserve">— A doutora Regina já vem.</w:t>
+      </w:r>
+    </w:p>
+    <w:p>
+      <w:pPr>
+        <w:spacing w:after="0" w:line="312"/>
+        <w:ind w:firstLine="340"/>
+        <w:jc w:val="both"/>
+      </w:pPr>
+      <w:r>
+        <w:rPr>
+          <w:rFonts w:ascii="Georgia" w:cs="Georgia" w:eastAsia="Georgia" w:hAnsi="Georgia"/>
+          <w:sz w:val="21"/>
+          <w:szCs w:val="21"/>
+        </w:rPr>
+        <w:t xml:space="preserve">Lia sentou-se. Era sexta-feira, três dias depois da morte do pai, e ela ainda não tinha contado a ninguém que estava ali. Nem à mãe. Nem a Lucas.</w:t>
+      </w:r>
+    </w:p>
+    <w:p>
+      <w:pPr>
+        <w:spacing w:after="0" w:line="312"/>
+        <w:ind w:firstLine="340"/>
+        <w:jc w:val="both"/>
+      </w:pPr>
+      <w:r>
+        <w:rPr>
+          <w:rFonts w:ascii="Georgia" w:cs="Georgia" w:eastAsia="Georgia" w:hAnsi="Georgia"/>
+          <w:sz w:val="21"/>
+          <w:szCs w:val="21"/>
+        </w:rPr>
+        <w:t xml:space="preserve">Principalmente a Lucas.</w:t>
+      </w:r>
+    </w:p>
+    <w:p>
+      <w:pPr>
+        <w:spacing w:after="0" w:line="312"/>
+        <w:ind w:firstLine="340"/>
+        <w:jc w:val="both"/>
+      </w:pPr>
+      <w:r>
+        <w:rPr>
+          <w:rFonts w:ascii="Georgia" w:cs="Georgia" w:eastAsia="Georgia" w:hAnsi="Georgia"/>
+          <w:sz w:val="21"/>
+          <w:szCs w:val="21"/>
+        </w:rPr>
+        <w:t xml:space="preserve">Na noite anterior, o irmão tinha ligado para perguntar se ela estava bem. Uma conversa curta, de frases educadas e pausas longas demais. Lia esperou que ele dissesse alguma coisa sobre o crematório, sobre a voz entre os homens de terno, sobre a palavra que os dois tinham ouvido. Ele não disse. Ela também não. Desligaram como dois estranhos que dividem o mesmo sobrenome.</w:t>
+      </w:r>
+    </w:p>
+    <w:p>
+      <w:pPr>
+        <w:spacing w:after="200" w:before="200"/>
+        <w:jc w:val="center"/>
+      </w:pPr>
+      <w:r>
+        <w:rPr>
+          <w:rFonts w:ascii="Georgia" w:cs="Georgia" w:eastAsia="Georgia" w:hAnsi="Georgia"/>
+          <w:sz w:val="22"/>
+          <w:szCs w:val="22"/>
+        </w:rPr>
+        <w:t xml:space="preserve">*</w:t>
+      </w:r>
+    </w:p>
+    <w:p>
+      <w:pPr>
+        <w:spacing w:after="0" w:line="312"/>
+        <w:ind w:firstLine="340"/>
+        <w:jc w:val="both"/>
+      </w:pPr>
+      <w:r>
+        <w:rPr>
+          <w:rFonts w:ascii="Georgia" w:cs="Georgia" w:eastAsia="Georgia" w:hAnsi="Georgia"/>
+          <w:sz w:val="21"/>
+          <w:szCs w:val="21"/>
+        </w:rPr>
+        <w:t xml:space="preserve">A delegada Regina Paiva a recebeu numa sala sem janelas, com um ventilador de teto que girava devagar e uma pilha de pastas sobre a mesa. Não estendeu a mão. Apontou para a cadeira.</w:t>
+      </w:r>
+    </w:p>
+    <w:p>
+      <w:pPr>
+        <w:spacing w:after="0" w:line="312"/>
+        <w:ind w:firstLine="340"/>
+        <w:jc w:val="both"/>
+      </w:pPr>
+      <w:r>
+        <w:rPr>
+          <w:rFonts w:ascii="Georgia" w:cs="Georgia" w:eastAsia="Georgia" w:hAnsi="Georgia"/>
+          <w:sz w:val="21"/>
+          <w:szCs w:val="21"/>
+        </w:rPr>
+        <w:t xml:space="preserve">— Meus pêsames.</w:t>
+      </w:r>
+    </w:p>
+    <w:p>
+      <w:pPr>
+        <w:spacing w:after="0" w:line="312"/>
+        <w:ind w:firstLine="340"/>
+        <w:jc w:val="both"/>
+      </w:pPr>
+      <w:r>
+        <w:rPr>
+          <w:rFonts w:ascii="Georgia" w:cs="Georgia" w:eastAsia="Georgia" w:hAnsi="Georgia"/>
+          <w:sz w:val="21"/>
+          <w:szCs w:val="21"/>
+        </w:rPr>
+        <w:t xml:space="preserve">— Obrigada.</w:t>
+      </w:r>
+    </w:p>
+    <w:p>
+      <w:pPr>
+        <w:spacing w:after="0" w:line="312"/>
+        <w:ind w:firstLine="340"/>
+        <w:jc w:val="both"/>
+      </w:pPr>
+      <w:r>
+        <w:rPr>
+          <w:rFonts w:ascii="Georgia" w:cs="Georgia" w:eastAsia="Georgia" w:hAnsi="Georgia"/>
+          <w:sz w:val="21"/>
+          <w:szCs w:val="21"/>
+        </w:rPr>
+        <w:t xml:space="preserve">— A senhora veio por quê?</w:t>
+      </w:r>
+    </w:p>
+    <w:p>
+      <w:pPr>
+        <w:spacing w:after="0" w:line="312"/>
+        <w:ind w:firstLine="340"/>
+        <w:jc w:val="both"/>
+      </w:pPr>
+      <w:r>
+        <w:rPr>
+          <w:rFonts w:ascii="Georgia" w:cs="Georgia" w:eastAsia="Georgia" w:hAnsi="Georgia"/>
+          <w:sz w:val="21"/>
+          <w:szCs w:val="21"/>
+        </w:rPr>
+        <w:t xml:space="preserve">Lia tinha ensaiado aquela resposta no carro. Arquiteta, acostumada a apresentar projetos para clientes difíceis, sabia começar uma conversa pelo ponto mais seguro. Mas, diante daquela mulher de terninho azul-marinho e olhar cansado, o ensaio sumiu.</w:t>
+      </w:r>
+    </w:p>
+    <w:p>
+      <w:pPr>
+        <w:spacing w:after="0" w:line="312"/>
+        <w:ind w:firstLine="340"/>
+        <w:jc w:val="both"/>
+      </w:pPr>
+      <w:r>
+        <w:rPr>
+          <w:rFonts w:ascii="Georgia" w:cs="Georgia" w:eastAsia="Georgia" w:hAnsi="Georgia"/>
+          <w:sz w:val="21"/>
+          <w:szCs w:val="21"/>
+        </w:rPr>
+        <w:t xml:space="preserve">— Porque eu não acho que o meu pai morreu do coração.</w:t>
+      </w:r>
+    </w:p>
+    <w:p>
+      <w:pPr>
+        <w:spacing w:after="0" w:line="312"/>
+        <w:ind w:firstLine="340"/>
+        <w:jc w:val="both"/>
+      </w:pPr>
+      <w:r>
+        <w:rPr>
+          <w:rFonts w:ascii="Georgia" w:cs="Georgia" w:eastAsia="Georgia" w:hAnsi="Georgia"/>
+          <w:sz w:val="21"/>
+          <w:szCs w:val="21"/>
+        </w:rPr>
+        <w:t xml:space="preserve">Regina não se mexeu. Ficou olhando para ela por um tempo que pareceu longo.</w:t>
+      </w:r>
+    </w:p>
+    <w:p>
+      <w:pPr>
+        <w:spacing w:after="0" w:line="312"/>
+        <w:ind w:firstLine="340"/>
+        <w:jc w:val="both"/>
+      </w:pPr>
+      <w:r>
+        <w:rPr>
+          <w:rFonts w:ascii="Georgia" w:cs="Georgia" w:eastAsia="Georgia" w:hAnsi="Georgia"/>
+          <w:sz w:val="21"/>
+          <w:szCs w:val="21"/>
+        </w:rPr>
+        <w:t xml:space="preserve">— O atestado diz infarto agudo do miocárdio — disse, enfim. — Assinado pelo médico que acompanhava o seu pai há mais de trinta anos e por um segundo médico, como a lei exige para a cremação. Hipertensão antiga, histórico registrado. Um homem de sessenta e um anos, sob estresse, que morre em casa de manhã cedo. — Ela fez uma pausa. — No papel, é a morte mais natural do mundo.</w:t>
+      </w:r>
+    </w:p>
+    <w:p>
+      <w:pPr>
+        <w:spacing w:after="0" w:line="312"/>
+        <w:ind w:firstLine="340"/>
+        <w:jc w:val="both"/>
+      </w:pPr>
+      <w:r>
+        <w:rPr>
+          <w:rFonts w:ascii="Georgia" w:cs="Georgia" w:eastAsia="Georgia" w:hAnsi="Georgia"/>
+          <w:sz w:val="21"/>
+          <w:szCs w:val="21"/>
+        </w:rPr>
+        <w:t xml:space="preserve">— E fora do papel?</w:t>
+      </w:r>
+    </w:p>
+    <w:p>
+      <w:pPr>
+        <w:spacing w:after="0" w:line="312"/>
+        <w:ind w:firstLine="340"/>
+        <w:jc w:val="both"/>
+      </w:pPr>
+      <w:r>
+        <w:rPr>
+          <w:rFonts w:ascii="Georgia" w:cs="Georgia" w:eastAsia="Georgia" w:hAnsi="Georgia"/>
+          <w:sz w:val="21"/>
+          <w:szCs w:val="21"/>
+        </w:rPr>
+        <w:t xml:space="preserve">A delegada abriu a gaveta, tirou uma pasta grossa e a pousou sobre a mesa, sem abrir.</w:t>
+      </w:r>
+    </w:p>
+    <w:p>
+      <w:pPr>
+        <w:spacing w:after="0" w:line="312"/>
+        <w:ind w:firstLine="340"/>
+        <w:jc w:val="both"/>
+      </w:pPr>
+      <w:r>
+        <w:rPr>
+          <w:rFonts w:ascii="Georgia" w:cs="Georgia" w:eastAsia="Georgia" w:hAnsi="Georgia"/>
+          <w:sz w:val="21"/>
+          <w:szCs w:val="21"/>
+        </w:rPr>
+        <w:t xml:space="preserve">— Fora do papel, senhora Salvallus, o seu pai era o principal suspeito de quatro mortes nesta cidade.</w:t>
+      </w:r>
+    </w:p>
+    <w:p>
+      <w:pPr>
+        <w:spacing w:after="200" w:before="200"/>
+        <w:jc w:val="center"/>
+      </w:pPr>
+      <w:r>
+        <w:rPr>
+          <w:rFonts w:ascii="Georgia" w:cs="Georgia" w:eastAsia="Georgia" w:hAnsi="Georgia"/>
+          <w:sz w:val="22"/>
+          <w:szCs w:val="22"/>
+        </w:rPr>
+        <w:t xml:space="preserve">*</w:t>
+      </w:r>
+    </w:p>
+    <w:p>
+      <w:pPr>
+        <w:spacing w:after="0" w:line="312"/>
+        <w:ind w:firstLine="340"/>
+        <w:jc w:val="both"/>
+      </w:pPr>
+      <w:r>
+        <w:rPr>
+          <w:rFonts w:ascii="Georgia" w:cs="Georgia" w:eastAsia="Georgia" w:hAnsi="Georgia"/>
+          <w:sz w:val="21"/>
+          <w:szCs w:val="21"/>
+        </w:rPr>
+        <w:t xml:space="preserve">Lia sabia de uma. Todo mundo sabia.</w:t>
+      </w:r>
+    </w:p>
+    <w:p>
+      <w:pPr>
+        <w:spacing w:after="0" w:line="312"/>
+        <w:ind w:firstLine="340"/>
+        <w:jc w:val="both"/>
+      </w:pPr>
+      <w:r>
+        <w:rPr>
+          <w:rFonts w:ascii="Georgia" w:cs="Georgia" w:eastAsia="Georgia" w:hAnsi="Georgia"/>
+          <w:sz w:val="21"/>
+          <w:szCs w:val="21"/>
+        </w:rPr>
+        <w:t xml:space="preserve">Em maio, um empresário chamado Marcelo Duarte tinha morrido no meio de uma briga com o pai, na porta de um restaurante dos Jardins. Os jornais publicaram a foto de Henrique Salvallus algemado, com o paletó rasgado e o rosto inchado. Durante dois dias, o pai foi o empresário que matou outro a socos. No terceiro, a autópsia encontrou uma bala na cabeça de Marcelo, e a manchete mudou. O pai foi solto. Ninguém soube dizer de onde tinha vindo o tiro.</w:t>
+      </w:r>
+    </w:p>
+    <w:p>
+      <w:pPr>
+        <w:spacing w:after="0" w:line="312"/>
+        <w:ind w:firstLine="340"/>
+        <w:jc w:val="both"/>
+      </w:pPr>
+      <w:r>
+        <w:rPr>
+          <w:rFonts w:ascii="Georgia" w:cs="Georgia" w:eastAsia="Georgia" w:hAnsi="Georgia"/>
+          <w:sz w:val="21"/>
+          <w:szCs w:val="21"/>
+        </w:rPr>
+        <w:t xml:space="preserve">Lia lembrava de ter ligado para ele naquela semana. Ele atendeu rindo, um riso cansado, e disse que estava tudo bem, que era só política, que inveja também mata. Ela não insistiu.</w:t>
+      </w:r>
+    </w:p>
+    <w:p>
+      <w:pPr>
+        <w:spacing w:after="0" w:line="312"/>
+        <w:ind w:firstLine="340"/>
+        <w:jc w:val="both"/>
+      </w:pPr>
+      <w:r>
+        <w:rPr>
+          <w:rFonts w:ascii="Georgia" w:cs="Georgia" w:eastAsia="Georgia" w:hAnsi="Georgia"/>
+          <w:sz w:val="21"/>
+          <w:szCs w:val="21"/>
+        </w:rPr>
+        <w:t xml:space="preserve">Regina abriu a pasta.</w:t>
+      </w:r>
+    </w:p>
+    <w:p>
+      <w:pPr>
+        <w:spacing w:after="0" w:line="312"/>
+        <w:ind w:firstLine="340"/>
+        <w:jc w:val="both"/>
+      </w:pPr>
+      <w:r>
+        <w:rPr>
+          <w:rFonts w:ascii="Georgia" w:cs="Georgia" w:eastAsia="Georgia" w:hAnsi="Georgia"/>
+          <w:sz w:val="21"/>
+          <w:szCs w:val="21"/>
+        </w:rPr>
+        <w:t xml:space="preserve">— Fevereiro — disse, virando uma fotografia sobre a mesa. Um homem de cabelos brancos, sorrindo para a câmera num documento de identidade. — Joaquim Ferreira da Silva, sessenta e três anos, funcionário de um motel na Marginal Pinheiros. Morreu envenenado com arsênico numa suíte onde o seu pai tinha estado poucas horas antes.</w:t>
+      </w:r>
+    </w:p>
+    <w:p>
+      <w:pPr>
+        <w:spacing w:after="0" w:line="312"/>
+        <w:ind w:firstLine="340"/>
+        <w:jc w:val="both"/>
+      </w:pPr>
+      <w:r>
+        <w:rPr>
+          <w:rFonts w:ascii="Georgia" w:cs="Georgia" w:eastAsia="Georgia" w:hAnsi="Georgia"/>
+          <w:sz w:val="21"/>
+          <w:szCs w:val="21"/>
+        </w:rPr>
+        <w:t xml:space="preserve">Lia sentiu o rosto esquentar. Regina não esperou.</w:t>
+      </w:r>
+    </w:p>
+    <w:p>
+      <w:pPr>
+        <w:spacing w:after="0" w:line="312"/>
+        <w:ind w:firstLine="340"/>
+        <w:jc w:val="both"/>
+      </w:pPr>
+      <w:r>
+        <w:rPr>
+          <w:rFonts w:ascii="Georgia" w:cs="Georgia" w:eastAsia="Georgia" w:hAnsi="Georgia"/>
+          <w:sz w:val="21"/>
+          <w:szCs w:val="21"/>
+        </w:rPr>
+        <w:t xml:space="preserve">— Maio. Marcelo Duarte, o restaurante. Esse a senhora conhece.</w:t>
+      </w:r>
+    </w:p>
+    <w:p>
+      <w:pPr>
+        <w:spacing w:after="0" w:line="312"/>
+        <w:ind w:firstLine="340"/>
+        <w:jc w:val="both"/>
+      </w:pPr>
+      <w:r>
+        <w:rPr>
+          <w:rFonts w:ascii="Georgia" w:cs="Georgia" w:eastAsia="Georgia" w:hAnsi="Georgia"/>
+          <w:sz w:val="21"/>
+          <w:szCs w:val="21"/>
+        </w:rPr>
+        <w:t xml:space="preserve">Outra fotografia.</w:t>
+      </w:r>
+    </w:p>
+    <w:p>
+      <w:pPr>
+        <w:spacing w:after="0" w:line="312"/>
+        <w:ind w:firstLine="340"/>
+        <w:jc w:val="both"/>
+      </w:pPr>
+      <w:r>
+        <w:rPr>
+          <w:rFonts w:ascii="Georgia" w:cs="Georgia" w:eastAsia="Georgia" w:hAnsi="Georgia"/>
+          <w:sz w:val="21"/>
+          <w:szCs w:val="21"/>
+        </w:rPr>
+        <w:t xml:space="preserve">— Julho. Fábio Teixeira, representante comercial, hospedado num hotel da Avenida Paulista. Morto a facadas no quarto. As câmeras do corredor mostram uma única pessoa entrando e saindo daquele quarto naquela noite. — Regina girou a foto seguinte para ela: uma imagem granulada, em preto e branco, de um homem de terno fechando uma porta. — O seu pai.</w:t>
+      </w:r>
+    </w:p>
+    <w:p>
+      <w:pPr>
+        <w:spacing w:after="0" w:line="312"/>
+        <w:ind w:firstLine="340"/>
+        <w:jc w:val="both"/>
+      </w:pPr>
+      <w:r>
+        <w:rPr>
+          <w:rFonts w:ascii="Georgia" w:cs="Georgia" w:eastAsia="Georgia" w:hAnsi="Georgia"/>
+          <w:sz w:val="21"/>
+          <w:szCs w:val="21"/>
+        </w:rPr>
+        <w:t xml:space="preserve">Lia olhou para a imagem. Era ele. O jeito de ajeitar o paletó com as duas mãos, o ombro direito um pouco mais baixo que o esquerdo.</w:t>
+      </w:r>
+    </w:p>
+    <w:p>
+      <w:pPr>
+        <w:spacing w:after="0" w:line="312"/>
+        <w:ind w:firstLine="340"/>
+        <w:jc w:val="both"/>
+      </w:pPr>
+      <w:r>
+        <w:rPr>
+          <w:rFonts w:ascii="Georgia" w:cs="Georgia" w:eastAsia="Georgia" w:hAnsi="Georgia"/>
+          <w:sz w:val="21"/>
+          <w:szCs w:val="21"/>
+        </w:rPr>
+        <w:t xml:space="preserve">— Setembro — continuou a delegada, sem mudar o tom. — Renato Sales, braço direito do sócio do seu pai, e Nestor Gomes, o motorista da família. O carro perdeu o freio numa estrada perto de Cajamar e explodiu numa ribanceira. Os dois estavam indo ao escritório buscar documentos. Quem mandou os dois naquele carro foi o seu pai.</w:t>
+      </w:r>
+    </w:p>
+    <w:p>
+      <w:pPr>
+        <w:spacing w:after="0" w:line="312"/>
+        <w:ind w:firstLine="340"/>
+        <w:jc w:val="both"/>
+      </w:pPr>
+      <w:r>
+        <w:rPr>
+          <w:rFonts w:ascii="Georgia" w:cs="Georgia" w:eastAsia="Georgia" w:hAnsi="Georgia"/>
+          <w:sz w:val="21"/>
+          <w:szCs w:val="21"/>
+        </w:rPr>
+        <w:t xml:space="preserve">Ela fechou a pasta.</w:t>
+      </w:r>
+    </w:p>
+    <w:p>
+      <w:pPr>
+        <w:spacing w:after="0" w:line="312"/>
+        <w:ind w:firstLine="340"/>
+        <w:jc w:val="both"/>
+      </w:pPr>
+      <w:r>
+        <w:rPr>
+          <w:rFonts w:ascii="Georgia" w:cs="Georgia" w:eastAsia="Georgia" w:hAnsi="Georgia"/>
+          <w:sz w:val="21"/>
+          <w:szCs w:val="21"/>
+        </w:rPr>
+        <w:t xml:space="preserve">— Cinco pessoas mortas em oito meses, senhora Salvallus. E em todas as cenas, de um jeito ou de outro, aparece o nome do seu pai.</w:t>
+      </w:r>
+    </w:p>
+    <w:p>
+      <w:pPr>
+        <w:spacing w:after="200" w:before="200"/>
+        <w:jc w:val="center"/>
+      </w:pPr>
+      <w:r>
+        <w:rPr>
+          <w:rFonts w:ascii="Georgia" w:cs="Georgia" w:eastAsia="Georgia" w:hAnsi="Georgia"/>
+          <w:sz w:val="22"/>
+          <w:szCs w:val="22"/>
+        </w:rPr>
+        <w:t xml:space="preserve">*</w:t>
+      </w:r>
+    </w:p>
+    <w:p>
+      <w:pPr>
+        <w:spacing w:after="0" w:line="312"/>
+        <w:ind w:firstLine="340"/>
+        <w:jc w:val="both"/>
+      </w:pPr>
+      <w:r>
+        <w:rPr>
+          <w:rFonts w:ascii="Georgia" w:cs="Georgia" w:eastAsia="Georgia" w:hAnsi="Georgia"/>
+          <w:sz w:val="21"/>
+          <w:szCs w:val="21"/>
+        </w:rPr>
+        <w:t xml:space="preserve">Lia demorou a encontrar a voz.</w:t>
+      </w:r>
+    </w:p>
+    <w:p>
+      <w:pPr>
+        <w:spacing w:after="0" w:line="312"/>
+        <w:ind w:firstLine="340"/>
+        <w:jc w:val="both"/>
+      </w:pPr>
+      <w:r>
+        <w:rPr>
+          <w:rFonts w:ascii="Georgia" w:cs="Georgia" w:eastAsia="Georgia" w:hAnsi="Georgia"/>
+          <w:sz w:val="21"/>
+          <w:szCs w:val="21"/>
+        </w:rPr>
+        <w:t xml:space="preserve">— O Nestor me levava para a escola.</w:t>
+      </w:r>
+    </w:p>
+    <w:p>
+      <w:pPr>
+        <w:spacing w:after="0" w:line="312"/>
+        <w:ind w:firstLine="340"/>
+        <w:jc w:val="both"/>
+      </w:pPr>
+      <w:r>
+        <w:rPr>
+          <w:rFonts w:ascii="Georgia" w:cs="Georgia" w:eastAsia="Georgia" w:hAnsi="Georgia"/>
+          <w:sz w:val="21"/>
+          <w:szCs w:val="21"/>
+        </w:rPr>
+        <w:t xml:space="preserve">— Eu sei. Li a ficha dele.</w:t>
+      </w:r>
+    </w:p>
+    <w:p>
+      <w:pPr>
+        <w:spacing w:after="0" w:line="312"/>
+        <w:ind w:firstLine="340"/>
+        <w:jc w:val="both"/>
+      </w:pPr>
+      <w:r>
+        <w:rPr>
+          <w:rFonts w:ascii="Georgia" w:cs="Georgia" w:eastAsia="Georgia" w:hAnsi="Georgia"/>
+          <w:sz w:val="21"/>
+          <w:szCs w:val="21"/>
+        </w:rPr>
+        <w:t xml:space="preserve">— O meu pai não mataria o Nestor.</w:t>
+      </w:r>
+    </w:p>
+    <w:p>
+      <w:pPr>
+        <w:spacing w:after="0" w:line="312"/>
+        <w:ind w:firstLine="340"/>
+        <w:jc w:val="both"/>
+      </w:pPr>
+      <w:r>
+        <w:rPr>
+          <w:rFonts w:ascii="Georgia" w:cs="Georgia" w:eastAsia="Georgia" w:hAnsi="Georgia"/>
+          <w:sz w:val="21"/>
+          <w:szCs w:val="21"/>
+        </w:rPr>
+        <w:t xml:space="preserve">— Talvez não. — Regina se recostou na cadeira. — Mas há outra leitura, e eu sou paga para considerar todas. Talvez as mortes não fossem obra dele. Talvez fossem para ele.</w:t>
+      </w:r>
+    </w:p>
+    <w:p>
+      <w:pPr>
+        <w:spacing w:after="0" w:line="312"/>
+        <w:ind w:firstLine="340"/>
+        <w:jc w:val="both"/>
+      </w:pPr>
+      <w:r>
+        <w:rPr>
+          <w:rFonts w:ascii="Georgia" w:cs="Georgia" w:eastAsia="Georgia" w:hAnsi="Georgia"/>
+          <w:sz w:val="21"/>
+          <w:szCs w:val="21"/>
+        </w:rPr>
+        <w:t xml:space="preserve">Lia ficou em silêncio. A delegada continuou, no mesmo tom de quem lê um relatório:</w:t>
+      </w:r>
+    </w:p>
+    <w:p>
+      <w:pPr>
+        <w:spacing w:after="0" w:line="312"/>
+        <w:ind w:firstLine="340"/>
+        <w:jc w:val="both"/>
+      </w:pPr>
+      <w:r>
+        <w:rPr>
+          <w:rFonts w:ascii="Georgia" w:cs="Georgia" w:eastAsia="Georgia" w:hAnsi="Georgia"/>
+          <w:sz w:val="21"/>
+          <w:szCs w:val="21"/>
+        </w:rPr>
+        <w:t xml:space="preserve">— O uísque envenenado estava no copo dele. A bala que matou Marcelo Duarte veio de cima, de um prédio em frente, e Marcelo estava abraçado ao seu pai na hora do disparo. O quarto do hotel era de Fábio, mas o seu pai tinha acabado de sair de lá. E o carro que explodiu era o carro em que ele costumava andar. — Ela abriu as mãos. — Ou o seu pai era o homem mais perigoso de São Paulo, ou era o homem mais azarado. Ou o mais sortudo. Ainda não decidi.</w:t>
+      </w:r>
+    </w:p>
+    <w:p>
+      <w:pPr>
+        <w:spacing w:after="0" w:line="312"/>
+        <w:ind w:firstLine="340"/>
+        <w:jc w:val="both"/>
+      </w:pPr>
+      <w:r>
+        <w:rPr>
+          <w:rFonts w:ascii="Georgia" w:cs="Georgia" w:eastAsia="Georgia" w:hAnsi="Georgia"/>
+          <w:sz w:val="21"/>
+          <w:szCs w:val="21"/>
+        </w:rPr>
+        <w:t xml:space="preserve">— E agora?</w:t>
+      </w:r>
+    </w:p>
+    <w:p>
+      <w:pPr>
+        <w:spacing w:after="0" w:line="312"/>
+        <w:ind w:firstLine="340"/>
+        <w:jc w:val="both"/>
+      </w:pPr>
+      <w:r>
+        <w:rPr>
+          <w:rFonts w:ascii="Georgia" w:cs="Georgia" w:eastAsia="Georgia" w:hAnsi="Georgia"/>
+          <w:sz w:val="21"/>
+          <w:szCs w:val="21"/>
+        </w:rPr>
+        <w:t xml:space="preserve">— Agora o principal suspeito, ou a principal vítima, foi cremado. — Regina deixou a frase no ar. — Não há corpo para exumar, não há sangue para examinar, não há o que pedir ao juiz. Ontem eu tinha quatro casos abertos e um suspeito vivo. Hoje tenho quatro casos abertos e uma urna de cinzas.</w:t>
+      </w:r>
+    </w:p>
+    <w:p>
+      <w:pPr>
+        <w:spacing w:after="200" w:before="200"/>
+        <w:jc w:val="center"/>
+      </w:pPr>
+      <w:r>
+        <w:rPr>
+          <w:rFonts w:ascii="Georgia" w:cs="Georgia" w:eastAsia="Georgia" w:hAnsi="Georgia"/>
+          <w:sz w:val="22"/>
+          <w:szCs w:val="22"/>
+        </w:rPr>
+        <w:t xml:space="preserve">*</w:t>
+      </w:r>
+    </w:p>
+    <w:p>
+      <w:pPr>
+        <w:spacing w:after="0" w:line="312"/>
+        <w:ind w:firstLine="340"/>
+        <w:jc w:val="both"/>
+      </w:pPr>
+      <w:r>
+        <w:rPr>
+          <w:rFonts w:ascii="Georgia" w:cs="Georgia" w:eastAsia="Georgia" w:hAnsi="Georgia"/>
+          <w:sz w:val="21"/>
+          <w:szCs w:val="21"/>
+        </w:rPr>
+        <w:t xml:space="preserve">— Uma última pergunta — disse a delegada, quando Lia já se levantava.</w:t>
+      </w:r>
+    </w:p>
+    <w:p>
+      <w:pPr>
+        <w:spacing w:after="0" w:line="312"/>
+        <w:ind w:firstLine="340"/>
+        <w:jc w:val="both"/>
+      </w:pPr>
+      <w:r>
+        <w:rPr>
+          <w:rFonts w:ascii="Georgia" w:cs="Georgia" w:eastAsia="Georgia" w:hAnsi="Georgia"/>
+          <w:sz w:val="21"/>
+          <w:szCs w:val="21"/>
+        </w:rPr>
+        <w:t xml:space="preserve">Lia parou.</w:t>
+      </w:r>
+    </w:p>
+    <w:p>
+      <w:pPr>
+        <w:spacing w:after="0" w:line="312"/>
+        <w:ind w:firstLine="340"/>
+        <w:jc w:val="both"/>
+      </w:pPr>
+      <w:r>
+        <w:rPr>
+          <w:rFonts w:ascii="Georgia" w:cs="Georgia" w:eastAsia="Georgia" w:hAnsi="Georgia"/>
+          <w:sz w:val="21"/>
+          <w:szCs w:val="21"/>
+        </w:rPr>
+        <w:t xml:space="preserve">— Durante a investigação, tivemos autorização para acompanhar os registros de chamadas do seu pai. Na manhã em que ele morreu, a senhora ligou para ele sete vezes. Entre as oito e as nove. — Regina a observava sem pressa. — Ninguém da família sabia ainda que ele estava morto. Por que a senhora ligou tanto?</w:t>
+      </w:r>
+    </w:p>
+    <w:p>
+      <w:pPr>
+        <w:spacing w:after="0" w:line="312"/>
+        <w:ind w:firstLine="340"/>
+        <w:jc w:val="both"/>
+      </w:pPr>
+      <w:r>
+        <w:rPr>
+          <w:rFonts w:ascii="Georgia" w:cs="Georgia" w:eastAsia="Georgia" w:hAnsi="Georgia"/>
+          <w:sz w:val="21"/>
+          <w:szCs w:val="21"/>
+        </w:rPr>
+        <w:t xml:space="preserve">O ventilador de teto girou uma volta inteira.</w:t>
+      </w:r>
+    </w:p>
+    <w:p>
+      <w:pPr>
+        <w:spacing w:after="0" w:line="312"/>
+        <w:ind w:firstLine="340"/>
+        <w:jc w:val="both"/>
+      </w:pPr>
+      <w:r>
+        <w:rPr>
+          <w:rFonts w:ascii="Georgia" w:cs="Georgia" w:eastAsia="Georgia" w:hAnsi="Georgia"/>
+          <w:sz w:val="21"/>
+          <w:szCs w:val="21"/>
+        </w:rPr>
+        <w:t xml:space="preserve">Lia pensou no pai sentado no sofá do apartamento dela, na segunda à noite, com a garrafa de vinho fechada no colo. Na viagem que nunca fizeram. Nas mãos dele segurando o rosto dela. Não conta pra ninguém que eu vim, tá? Nem pro seu irmão.</w:t>
+      </w:r>
+    </w:p>
+    <w:p>
+      <w:pPr>
+        <w:spacing w:after="0" w:line="312"/>
+        <w:ind w:firstLine="340"/>
+        <w:jc w:val="both"/>
+      </w:pPr>
+      <w:r>
+        <w:rPr>
+          <w:rFonts w:ascii="Georgia" w:cs="Georgia" w:eastAsia="Georgia" w:hAnsi="Georgia"/>
+          <w:sz w:val="21"/>
+          <w:szCs w:val="21"/>
+        </w:rPr>
+        <w:t xml:space="preserve">— Eu tive um pressentimento — disse.</w:t>
+      </w:r>
+    </w:p>
+    <w:p>
+      <w:pPr>
+        <w:spacing w:after="0" w:line="312"/>
+        <w:ind w:firstLine="340"/>
+        <w:jc w:val="both"/>
+      </w:pPr>
+      <w:r>
+        <w:rPr>
+          <w:rFonts w:ascii="Georgia" w:cs="Georgia" w:eastAsia="Georgia" w:hAnsi="Georgia"/>
+          <w:sz w:val="21"/>
+          <w:szCs w:val="21"/>
+        </w:rPr>
+        <w:t xml:space="preserve">Era verdade. Não era tudo.</w:t>
+      </w:r>
+    </w:p>
+    <w:p>
+      <w:pPr>
+        <w:spacing w:after="0" w:line="312"/>
+        <w:ind w:firstLine="340"/>
+        <w:jc w:val="both"/>
+      </w:pPr>
+      <w:r>
+        <w:rPr>
+          <w:rFonts w:ascii="Georgia" w:cs="Georgia" w:eastAsia="Georgia" w:hAnsi="Georgia"/>
+          <w:sz w:val="21"/>
+          <w:szCs w:val="21"/>
+        </w:rPr>
+        <w:t xml:space="preserve">Regina assentiu devagar, como quem guarda uma resposta numa gaveta para abrir depois.</w:t>
+      </w:r>
+    </w:p>
+    <w:p>
+      <w:pPr>
+        <w:spacing w:after="0" w:line="312"/>
+        <w:ind w:firstLine="340"/>
+        <w:jc w:val="both"/>
+      </w:pPr>
+      <w:r>
+        <w:rPr>
+          <w:rFonts w:ascii="Georgia" w:cs="Georgia" w:eastAsia="Georgia" w:hAnsi="Georgia"/>
+          <w:sz w:val="21"/>
+          <w:szCs w:val="21"/>
+        </w:rPr>
+        <w:t xml:space="preserve">— Pressentimentos são comuns nesta sala. — Pegou um cartão na mesa e estendeu a ela. — Se lembrar de mais alguma coisa, me ligue. A qualquer hora.</w:t>
+      </w:r>
+    </w:p>
+    <w:p>
+      <w:pPr>
+        <w:spacing w:after="0" w:line="312"/>
+        <w:ind w:firstLine="340"/>
+        <w:jc w:val="both"/>
+      </w:pPr>
+      <w:r>
+        <w:rPr>
+          <w:rFonts w:ascii="Georgia" w:cs="Georgia" w:eastAsia="Georgia" w:hAnsi="Georgia"/>
+          <w:sz w:val="21"/>
+          <w:szCs w:val="21"/>
+        </w:rPr>
+        <w:t xml:space="preserve">Lia pegou o cartão. Na porta, voltou-se.</w:t>
+      </w:r>
+    </w:p>
+    <w:p>
+      <w:pPr>
+        <w:spacing w:after="0" w:line="312"/>
+        <w:ind w:firstLine="340"/>
+        <w:jc w:val="both"/>
+      </w:pPr>
+      <w:r>
+        <w:rPr>
+          <w:rFonts w:ascii="Georgia" w:cs="Georgia" w:eastAsia="Georgia" w:hAnsi="Georgia"/>
+          <w:sz w:val="21"/>
+          <w:szCs w:val="21"/>
+        </w:rPr>
+        <w:t xml:space="preserve">— Delegada. A senhora já ouviu alguém chamar o meu pai de imorrível?</w:t>
+      </w:r>
+    </w:p>
+    <w:p>
+      <w:pPr>
+        <w:spacing w:after="0" w:line="312"/>
+        <w:ind w:firstLine="340"/>
+        <w:jc w:val="both"/>
+      </w:pPr>
+      <w:r>
+        <w:rPr>
+          <w:rFonts w:ascii="Georgia" w:cs="Georgia" w:eastAsia="Georgia" w:hAnsi="Georgia"/>
+          <w:sz w:val="21"/>
+          <w:szCs w:val="21"/>
+        </w:rPr>
+        <w:t xml:space="preserve">Pela primeira vez, Regina sorriu. Um sorriso curto, sem nenhuma graça.</w:t>
+      </w:r>
+    </w:p>
+    <w:p>
+      <w:pPr>
+        <w:spacing w:after="0" w:line="312"/>
+        <w:ind w:firstLine="340"/>
+        <w:jc w:val="both"/>
+      </w:pPr>
+      <w:r>
+        <w:rPr>
+          <w:rFonts w:ascii="Georgia" w:cs="Georgia" w:eastAsia="Georgia" w:hAnsi="Georgia"/>
+          <w:sz w:val="21"/>
+          <w:szCs w:val="21"/>
+        </w:rPr>
+        <w:t xml:space="preserve">— Eu já ouvi muita gente chamar o seu pai de muita coisa. — Ela voltou a abrir a pasta. — Mas vou lhe dizer o que eu penso, senhora Salvallus, e depois a senhora decide o que fazer com isso.</w:t>
+      </w:r>
+    </w:p>
+    <w:p>
+      <w:pPr>
+        <w:spacing w:after="0" w:line="312"/>
+        <w:ind w:firstLine="340"/>
+        <w:jc w:val="both"/>
+      </w:pPr>
+      <w:r>
+        <w:rPr>
+          <w:rFonts w:ascii="Georgia" w:cs="Georgia" w:eastAsia="Georgia" w:hAnsi="Georgia"/>
+          <w:sz w:val="21"/>
+          <w:szCs w:val="21"/>
+        </w:rPr>
+        <w:t xml:space="preserve">Lia esperou.</w:t>
+      </w:r>
+    </w:p>
+    <w:p>
+      <w:pPr>
+        <w:spacing w:after="0" w:line="312"/>
+        <w:ind w:firstLine="340"/>
+        <w:jc w:val="both"/>
+      </w:pPr>
+      <w:r>
+        <w:rPr>
+          <w:rFonts w:ascii="Georgia" w:cs="Georgia" w:eastAsia="Georgia" w:hAnsi="Georgia"/>
+          <w:sz w:val="21"/>
+          <w:szCs w:val="21"/>
+        </w:rPr>
+        <w:t xml:space="preserve">— Seu pai morreu na hora certa para muita gente.</w:t>
       </w:r>
     </w:p>
     <w:sectPr>

</xml_diff>

<commit_message>
Livro policial: capítulo 5 (A lista)
Co-Authored-By: Claude Opus 5.5 <noreply@anthropic.com>
Claude-Session: https://claude.ai/code/session_01BrurxSYygRC3rRhaUYosm1
</commit_message>
<xml_diff>
--- a/docs/livro-policial/TODO_CRIME_TEM_UM_AUTOR.docx
+++ b/docs/livro-policial/TODO_CRIME_TEM_UM_AUTOR.docx
@@ -3815,6 +3815,1278 @@
           <w:szCs w:val="21"/>
         </w:rPr>
         <w:t xml:space="preserve">— Seu pai morreu na hora certa para muita gente.</w:t>
+      </w:r>
+    </w:p>
+    <w:p>
+      <w:pPr>
+        <w:pageBreakBefore/>
+        <w:spacing w:after="120" w:before="1800"/>
+        <w:jc w:val="center"/>
+      </w:pPr>
+      <w:r>
+        <w:rPr>
+          <w:rFonts w:ascii="Georgia" w:cs="Georgia" w:eastAsia="Georgia" w:hAnsi="Georgia"/>
+          <w:spacing w:val="40"/>
+          <w:sz w:val="20"/>
+          <w:szCs w:val="20"/>
+        </w:rPr>
+        <w:t xml:space="preserve">CAPÍTULO 5</w:t>
+      </w:r>
+    </w:p>
+    <w:p>
+      <w:pPr>
+        <w:spacing w:after="720"/>
+        <w:jc w:val="center"/>
+      </w:pPr>
+      <w:r>
+        <w:rPr>
+          <w:rFonts w:ascii="Georgia" w:cs="Georgia" w:eastAsia="Georgia" w:hAnsi="Georgia"/>
+          <w:b/>
+          <w:bCs/>
+          <w:sz w:val="32"/>
+          <w:szCs w:val="32"/>
+        </w:rPr>
+        <w:t xml:space="preserve">A lista</w:t>
+      </w:r>
+    </w:p>
+    <w:p>
+      <w:pPr>
+        <w:spacing w:after="0" w:line="312"/>
+        <w:ind w:firstLine="340"/>
+        <w:jc w:val="both"/>
+      </w:pPr>
+      <w:r>
+        <w:rPr>
+          <w:rFonts w:ascii="Georgia" w:cs="Georgia" w:eastAsia="Georgia" w:hAnsi="Georgia"/>
+          <w:sz w:val="21"/>
+          <w:szCs w:val="21"/>
+        </w:rPr>
+        <w:t xml:space="preserve">A padaria da esquina da Teodoro Sampaio estava cheia de gente comum fazendo coisas comuns num sábado de manhã: um casal dividindo um misto-quente, um senhor lendo o jornal de pé no balcão, uma criança pedindo sonho. Lucas escolheu a mesa do fundo, de costas para a parede, e pediu dois cafés antes de Lia chegar.</w:t>
+      </w:r>
+    </w:p>
+    <w:p>
+      <w:pPr>
+        <w:spacing w:after="0" w:line="312"/>
+        <w:ind w:firstLine="340"/>
+        <w:jc w:val="both"/>
+      </w:pPr>
+      <w:r>
+        <w:rPr>
+          <w:rFonts w:ascii="Georgia" w:cs="Georgia" w:eastAsia="Georgia" w:hAnsi="Georgia"/>
+          <w:sz w:val="21"/>
+          <w:szCs w:val="21"/>
+        </w:rPr>
+        <w:t xml:space="preserve">Ela entrou de óculos escuros e sentou-se sem tirá-los.</w:t>
+      </w:r>
+    </w:p>
+    <w:p>
+      <w:pPr>
+        <w:spacing w:after="0" w:line="312"/>
+        <w:ind w:firstLine="340"/>
+        <w:jc w:val="both"/>
+      </w:pPr>
+      <w:r>
+        <w:rPr>
+          <w:rFonts w:ascii="Georgia" w:cs="Georgia" w:eastAsia="Georgia" w:hAnsi="Georgia"/>
+          <w:sz w:val="21"/>
+          <w:szCs w:val="21"/>
+        </w:rPr>
+        <w:t xml:space="preserve">— Você foi à polícia — disse ele.</w:t>
+      </w:r>
+    </w:p>
+    <w:p>
+      <w:pPr>
+        <w:spacing w:after="0" w:line="312"/>
+        <w:ind w:firstLine="340"/>
+        <w:jc w:val="both"/>
+      </w:pPr>
+      <w:r>
+        <w:rPr>
+          <w:rFonts w:ascii="Georgia" w:cs="Georgia" w:eastAsia="Georgia" w:hAnsi="Georgia"/>
+          <w:sz w:val="21"/>
+          <w:szCs w:val="21"/>
+        </w:rPr>
+        <w:t xml:space="preserve">Não era uma pergunta, e Lia não fingiu que era.</w:t>
+      </w:r>
+    </w:p>
+    <w:p>
+      <w:pPr>
+        <w:spacing w:after="0" w:line="312"/>
+        <w:ind w:firstLine="340"/>
+        <w:jc w:val="both"/>
+      </w:pPr>
+      <w:r>
+        <w:rPr>
+          <w:rFonts w:ascii="Georgia" w:cs="Georgia" w:eastAsia="Georgia" w:hAnsi="Georgia"/>
+          <w:sz w:val="21"/>
+          <w:szCs w:val="21"/>
+        </w:rPr>
+        <w:t xml:space="preserve">— Quem te contou?</w:t>
+      </w:r>
+    </w:p>
+    <w:p>
+      <w:pPr>
+        <w:spacing w:after="0" w:line="312"/>
+        <w:ind w:firstLine="340"/>
+        <w:jc w:val="both"/>
+      </w:pPr>
+      <w:r>
+        <w:rPr>
+          <w:rFonts w:ascii="Georgia" w:cs="Georgia" w:eastAsia="Georgia" w:hAnsi="Georgia"/>
+          <w:sz w:val="21"/>
+          <w:szCs w:val="21"/>
+        </w:rPr>
+        <w:t xml:space="preserve">— A Helena. Uma amiga dela viu você saindo do prédio dos Homicídios ontem. — Lucas mexeu o café que não tinha açúcar. — Por que você não me disse que ia?</w:t>
+      </w:r>
+    </w:p>
+    <w:p>
+      <w:pPr>
+        <w:spacing w:after="0" w:line="312"/>
+        <w:ind w:firstLine="340"/>
+        <w:jc w:val="both"/>
+      </w:pPr>
+      <w:r>
+        <w:rPr>
+          <w:rFonts w:ascii="Georgia" w:cs="Georgia" w:eastAsia="Georgia" w:hAnsi="Georgia"/>
+          <w:sz w:val="21"/>
+          <w:szCs w:val="21"/>
+        </w:rPr>
+        <w:t xml:space="preserve">— Pela mesma razão que você não me disse que estava com o celular do pai.</w:t>
+      </w:r>
+    </w:p>
+    <w:p>
+      <w:pPr>
+        <w:spacing w:after="0" w:line="312"/>
+        <w:ind w:firstLine="340"/>
+        <w:jc w:val="both"/>
+      </w:pPr>
+      <w:r>
+        <w:rPr>
+          <w:rFonts w:ascii="Georgia" w:cs="Georgia" w:eastAsia="Georgia" w:hAnsi="Georgia"/>
+          <w:sz w:val="21"/>
+          <w:szCs w:val="21"/>
+        </w:rPr>
+        <w:t xml:space="preserve">Lucas parou a colher no ar. Lia tirou os óculos. Tinha os olhos inchados, mas firmes.</w:t>
+      </w:r>
+    </w:p>
+    <w:p>
+      <w:pPr>
+        <w:spacing w:after="0" w:line="312"/>
+        <w:ind w:firstLine="340"/>
+        <w:jc w:val="both"/>
+      </w:pPr>
+      <w:r>
+        <w:rPr>
+          <w:rFonts w:ascii="Georgia" w:cs="Georgia" w:eastAsia="Georgia" w:hAnsi="Georgia"/>
+          <w:sz w:val="21"/>
+          <w:szCs w:val="21"/>
+        </w:rPr>
+        <w:t xml:space="preserve">— A Helena também fala comigo, Lucas.</w:t>
+      </w:r>
+    </w:p>
+    <w:p>
+      <w:pPr>
+        <w:spacing w:after="200" w:before="200"/>
+        <w:jc w:val="center"/>
+      </w:pPr>
+      <w:r>
+        <w:rPr>
+          <w:rFonts w:ascii="Georgia" w:cs="Georgia" w:eastAsia="Georgia" w:hAnsi="Georgia"/>
+          <w:sz w:val="22"/>
+          <w:szCs w:val="22"/>
+        </w:rPr>
+        <w:t xml:space="preserve">*</w:t>
+      </w:r>
+    </w:p>
+    <w:p>
+      <w:pPr>
+        <w:spacing w:after="0" w:line="312"/>
+        <w:ind w:firstLine="340"/>
+        <w:jc w:val="both"/>
+      </w:pPr>
+      <w:r>
+        <w:rPr>
+          <w:rFonts w:ascii="Georgia" w:cs="Georgia" w:eastAsia="Georgia" w:hAnsi="Georgia"/>
+          <w:sz w:val="21"/>
+          <w:szCs w:val="21"/>
+        </w:rPr>
+        <w:t xml:space="preserve">Durante alguns minutos, ninguém disse nada. O garçom trouxe os cafés. O senhor do balcão virou a página do jornal.</w:t>
+      </w:r>
+    </w:p>
+    <w:p>
+      <w:pPr>
+        <w:spacing w:after="0" w:line="312"/>
+        <w:ind w:firstLine="340"/>
+        <w:jc w:val="both"/>
+      </w:pPr>
+      <w:r>
+        <w:rPr>
+          <w:rFonts w:ascii="Georgia" w:cs="Georgia" w:eastAsia="Georgia" w:hAnsi="Georgia"/>
+          <w:sz w:val="21"/>
+          <w:szCs w:val="21"/>
+        </w:rPr>
+        <w:t xml:space="preserve">Depois, em voz baixa, Lia contou tudo o que a delegada tinha mostrado: o motel, o restaurante, o hotel, a estrada. Seu Joaquim. Marcelo Duarte. Fábio Teixeira. Renato e Nestor. Cinco mortos em oito meses, e o pai no meio de todos. Lucas ouviu sem interromper. Quando ela chegou ao Nestor, ele fechou os olhos por um instante.</w:t>
+      </w:r>
+    </w:p>
+    <w:p>
+      <w:pPr>
+        <w:spacing w:after="0" w:line="312"/>
+        <w:ind w:firstLine="340"/>
+        <w:jc w:val="both"/>
+      </w:pPr>
+      <w:r>
+        <w:rPr>
+          <w:rFonts w:ascii="Georgia" w:cs="Georgia" w:eastAsia="Georgia" w:hAnsi="Georgia"/>
+          <w:sz w:val="21"/>
+          <w:szCs w:val="21"/>
+        </w:rPr>
+        <w:t xml:space="preserve">— Ele me ensinou a dirigir — disse. — No estacionamento do Pacaembu, num domingo. O pai nunca teve paciência.</w:t>
+      </w:r>
+    </w:p>
+    <w:p>
+      <w:pPr>
+        <w:spacing w:after="0" w:line="312"/>
+        <w:ind w:firstLine="340"/>
+        <w:jc w:val="both"/>
+      </w:pPr>
+      <w:r>
+        <w:rPr>
+          <w:rFonts w:ascii="Georgia" w:cs="Georgia" w:eastAsia="Georgia" w:hAnsi="Georgia"/>
+          <w:sz w:val="21"/>
+          <w:szCs w:val="21"/>
+        </w:rPr>
+        <w:t xml:space="preserve">— Eu sei.</w:t>
+      </w:r>
+    </w:p>
+    <w:p>
+      <w:pPr>
+        <w:spacing w:after="0" w:line="312"/>
+        <w:ind w:firstLine="340"/>
+        <w:jc w:val="both"/>
+      </w:pPr>
+      <w:r>
+        <w:rPr>
+          <w:rFonts w:ascii="Georgia" w:cs="Georgia" w:eastAsia="Georgia" w:hAnsi="Georgia"/>
+          <w:sz w:val="21"/>
+          <w:szCs w:val="21"/>
+        </w:rPr>
+        <w:t xml:space="preserve">— A delegada acha que foi o pai?</w:t>
+      </w:r>
+    </w:p>
+    <w:p>
+      <w:pPr>
+        <w:spacing w:after="0" w:line="312"/>
+        <w:ind w:firstLine="340"/>
+        <w:jc w:val="both"/>
+      </w:pPr>
+      <w:r>
+        <w:rPr>
+          <w:rFonts w:ascii="Georgia" w:cs="Georgia" w:eastAsia="Georgia" w:hAnsi="Georgia"/>
+          <w:sz w:val="21"/>
+          <w:szCs w:val="21"/>
+        </w:rPr>
+        <w:t xml:space="preserve">— A delegada acha que alguém queria matar o pai. — Lia girou a xícara entre as mãos. — E que errou quatro vezes.</w:t>
+      </w:r>
+    </w:p>
+    <w:p>
+      <w:pPr>
+        <w:spacing w:after="0" w:line="312"/>
+        <w:ind w:firstLine="340"/>
+        <w:jc w:val="both"/>
+      </w:pPr>
+      <w:r>
+        <w:rPr>
+          <w:rFonts w:ascii="Georgia" w:cs="Georgia" w:eastAsia="Georgia" w:hAnsi="Georgia"/>
+          <w:sz w:val="21"/>
+          <w:szCs w:val="21"/>
+        </w:rPr>
+        <w:t xml:space="preserve">— E na quinta acertou.</w:t>
+      </w:r>
+    </w:p>
+    <w:p>
+      <w:pPr>
+        <w:spacing w:after="0" w:line="312"/>
+        <w:ind w:firstLine="340"/>
+        <w:jc w:val="both"/>
+      </w:pPr>
+      <w:r>
+        <w:rPr>
+          <w:rFonts w:ascii="Georgia" w:cs="Georgia" w:eastAsia="Georgia" w:hAnsi="Georgia"/>
+          <w:sz w:val="21"/>
+          <w:szCs w:val="21"/>
+        </w:rPr>
+        <w:t xml:space="preserve">— Ou na quinta não precisou mais.</w:t>
+      </w:r>
+    </w:p>
+    <w:p>
+      <w:pPr>
+        <w:spacing w:after="0" w:line="312"/>
+        <w:ind w:firstLine="340"/>
+        <w:jc w:val="both"/>
+      </w:pPr>
+      <w:r>
+        <w:rPr>
+          <w:rFonts w:ascii="Georgia" w:cs="Georgia" w:eastAsia="Georgia" w:hAnsi="Georgia"/>
+          <w:sz w:val="21"/>
+          <w:szCs w:val="21"/>
+        </w:rPr>
+        <w:t xml:space="preserve">Lucas olhou para ela. Lia sustentou o olhar.</w:t>
+      </w:r>
+    </w:p>
+    <w:p>
+      <w:pPr>
+        <w:spacing w:after="0" w:line="312"/>
+        <w:ind w:firstLine="340"/>
+        <w:jc w:val="both"/>
+      </w:pPr>
+      <w:r>
+        <w:rPr>
+          <w:rFonts w:ascii="Georgia" w:cs="Georgia" w:eastAsia="Georgia" w:hAnsi="Georgia"/>
+          <w:sz w:val="21"/>
+          <w:szCs w:val="21"/>
+        </w:rPr>
+        <w:t xml:space="preserve">— Ela disse uma coisa no final — continuou a irmã. — Que o pai morreu na hora certa para muita gente.</w:t>
+      </w:r>
+    </w:p>
+    <w:p>
+      <w:pPr>
+        <w:spacing w:after="0" w:line="312"/>
+        <w:ind w:firstLine="340"/>
+        <w:jc w:val="both"/>
+      </w:pPr>
+      <w:r>
+        <w:rPr>
+          <w:rFonts w:ascii="Georgia" w:cs="Georgia" w:eastAsia="Georgia" w:hAnsi="Georgia"/>
+          <w:sz w:val="21"/>
+          <w:szCs w:val="21"/>
+        </w:rPr>
+        <w:t xml:space="preserve">— Ela tem razão.</w:t>
+      </w:r>
+    </w:p>
+    <w:p>
+      <w:pPr>
+        <w:spacing w:after="0" w:line="312"/>
+        <w:ind w:firstLine="340"/>
+        <w:jc w:val="both"/>
+      </w:pPr>
+      <w:r>
+        <w:rPr>
+          <w:rFonts w:ascii="Georgia" w:cs="Georgia" w:eastAsia="Georgia" w:hAnsi="Georgia"/>
+          <w:sz w:val="21"/>
+          <w:szCs w:val="21"/>
+        </w:rPr>
+        <w:t xml:space="preserve">— Então vamos descobrir quem é essa gente.</w:t>
+      </w:r>
+    </w:p>
+    <w:p>
+      <w:pPr>
+        <w:spacing w:after="200" w:before="200"/>
+        <w:jc w:val="center"/>
+      </w:pPr>
+      <w:r>
+        <w:rPr>
+          <w:rFonts w:ascii="Georgia" w:cs="Georgia" w:eastAsia="Georgia" w:hAnsi="Georgia"/>
+          <w:sz w:val="22"/>
+          <w:szCs w:val="22"/>
+        </w:rPr>
+        <w:t xml:space="preserve">*</w:t>
+      </w:r>
+    </w:p>
+    <w:p>
+      <w:pPr>
+        <w:spacing w:after="0" w:line="312"/>
+        <w:ind w:firstLine="340"/>
+        <w:jc w:val="both"/>
+      </w:pPr>
+      <w:r>
+        <w:rPr>
+          <w:rFonts w:ascii="Georgia" w:cs="Georgia" w:eastAsia="Georgia" w:hAnsi="Georgia"/>
+          <w:sz w:val="21"/>
+          <w:szCs w:val="21"/>
+        </w:rPr>
+        <w:t xml:space="preserve">Lucas tirou do bolso uma caneta e puxou um guardanapo de papel.</w:t>
+      </w:r>
+    </w:p>
+    <w:p>
+      <w:pPr>
+        <w:spacing w:after="0" w:line="312"/>
+        <w:ind w:firstLine="340"/>
+        <w:jc w:val="both"/>
+      </w:pPr>
+      <w:r>
+        <w:rPr>
+          <w:rFonts w:ascii="Georgia" w:cs="Georgia" w:eastAsia="Georgia" w:hAnsi="Georgia"/>
+          <w:sz w:val="21"/>
+          <w:szCs w:val="21"/>
+        </w:rPr>
+        <w:t xml:space="preserve">— Começa pelos óbvios.</w:t>
+      </w:r>
+    </w:p>
+    <w:p>
+      <w:pPr>
+        <w:spacing w:after="0" w:line="312"/>
+        <w:ind w:firstLine="340"/>
+        <w:jc w:val="both"/>
+      </w:pPr>
+      <w:r>
+        <w:rPr>
+          <w:rFonts w:ascii="Georgia" w:cs="Georgia" w:eastAsia="Georgia" w:hAnsi="Georgia"/>
+          <w:sz w:val="21"/>
+          <w:szCs w:val="21"/>
+        </w:rPr>
+        <w:t xml:space="preserve">— O Falcão — disse Lia. — Mandou a maior coroa de flores do velório. O pai dizia que ele queria vê-lo enterrado.</w:t>
+      </w:r>
+    </w:p>
+    <w:p>
+      <w:pPr>
+        <w:spacing w:after="0" w:line="312"/>
+        <w:ind w:firstLine="340"/>
+        <w:jc w:val="both"/>
+      </w:pPr>
+      <w:r>
+        <w:rPr>
+          <w:rFonts w:ascii="Georgia" w:cs="Georgia" w:eastAsia="Georgia" w:hAnsi="Georgia"/>
+          <w:sz w:val="21"/>
+          <w:szCs w:val="21"/>
+        </w:rPr>
+        <w:t xml:space="preserve">Lucas escreveu. Rubens Falcão.</w:t>
+      </w:r>
+    </w:p>
+    <w:p>
+      <w:pPr>
+        <w:spacing w:after="0" w:line="312"/>
+        <w:ind w:firstLine="340"/>
+        <w:jc w:val="both"/>
+      </w:pPr>
+      <w:r>
+        <w:rPr>
+          <w:rFonts w:ascii="Georgia" w:cs="Georgia" w:eastAsia="Georgia" w:hAnsi="Georgia"/>
+          <w:sz w:val="21"/>
+          <w:szCs w:val="21"/>
+        </w:rPr>
+        <w:t xml:space="preserve">— O Augusto Lemos. Perdeu um contrato enorme para o pai no ano passado e ameaçou ele num jantar, na frente de todo mundo. Eu estava lá.</w:t>
+      </w:r>
+    </w:p>
+    <w:p>
+      <w:pPr>
+        <w:spacing w:after="0" w:line="312"/>
+        <w:ind w:firstLine="340"/>
+        <w:jc w:val="both"/>
+      </w:pPr>
+      <w:r>
+        <w:rPr>
+          <w:rFonts w:ascii="Georgia" w:cs="Georgia" w:eastAsia="Georgia" w:hAnsi="Georgia"/>
+          <w:sz w:val="21"/>
+          <w:szCs w:val="21"/>
+        </w:rPr>
+        <w:t xml:space="preserve">Augusto Lemos.</w:t>
+      </w:r>
+    </w:p>
+    <w:p>
+      <w:pPr>
+        <w:spacing w:after="0" w:line="312"/>
+        <w:ind w:firstLine="340"/>
+        <w:jc w:val="both"/>
+      </w:pPr>
+      <w:r>
+        <w:rPr>
+          <w:rFonts w:ascii="Georgia" w:cs="Georgia" w:eastAsia="Georgia" w:hAnsi="Georgia"/>
+          <w:sz w:val="21"/>
+          <w:szCs w:val="21"/>
+        </w:rPr>
+        <w:t xml:space="preserve">— A família do Marcelo Duarte — continuou Lia. — Se acharam que o pai matou o Marcelo, alguém pode ter querido se vingar.</w:t>
+      </w:r>
+    </w:p>
+    <w:p>
+      <w:pPr>
+        <w:spacing w:after="0" w:line="312"/>
+        <w:ind w:firstLine="340"/>
+        <w:jc w:val="both"/>
+      </w:pPr>
+      <w:r>
+        <w:rPr>
+          <w:rFonts w:ascii="Georgia" w:cs="Georgia" w:eastAsia="Georgia" w:hAnsi="Georgia"/>
+          <w:sz w:val="21"/>
+          <w:szCs w:val="21"/>
+        </w:rPr>
+        <w:t xml:space="preserve">Família Duarte?</w:t>
+      </w:r>
+    </w:p>
+    <w:p>
+      <w:pPr>
+        <w:spacing w:after="0" w:line="312"/>
+        <w:ind w:firstLine="340"/>
+        <w:jc w:val="both"/>
+      </w:pPr>
+      <w:r>
+        <w:rPr>
+          <w:rFonts w:ascii="Georgia" w:cs="Georgia" w:eastAsia="Georgia" w:hAnsi="Georgia"/>
+          <w:sz w:val="21"/>
+          <w:szCs w:val="21"/>
+        </w:rPr>
+        <w:t xml:space="preserve">— O Otávio — disse Lucas, e escreveu antes que a irmã concordasse.</w:t>
+      </w:r>
+    </w:p>
+    <w:p>
+      <w:pPr>
+        <w:spacing w:after="0" w:line="312"/>
+        <w:ind w:firstLine="340"/>
+        <w:jc w:val="both"/>
+      </w:pPr>
+      <w:r>
+        <w:rPr>
+          <w:rFonts w:ascii="Georgia" w:cs="Georgia" w:eastAsia="Georgia" w:hAnsi="Georgia"/>
+          <w:sz w:val="21"/>
+          <w:szCs w:val="21"/>
+        </w:rPr>
+        <w:t xml:space="preserve">Lia levantou as sobrancelhas.</w:t>
+      </w:r>
+    </w:p>
+    <w:p>
+      <w:pPr>
+        <w:spacing w:after="0" w:line="312"/>
+        <w:ind w:firstLine="340"/>
+        <w:jc w:val="both"/>
+      </w:pPr>
+      <w:r>
+        <w:rPr>
+          <w:rFonts w:ascii="Georgia" w:cs="Georgia" w:eastAsia="Georgia" w:hAnsi="Georgia"/>
+          <w:sz w:val="21"/>
+          <w:szCs w:val="21"/>
+        </w:rPr>
+        <w:t xml:space="preserve">— O Otávio organizou o velório inteiro. Chorou mais que todo mundo.</w:t>
+      </w:r>
+    </w:p>
+    <w:p>
+      <w:pPr>
+        <w:spacing w:after="0" w:line="312"/>
+        <w:ind w:firstLine="340"/>
+        <w:jc w:val="both"/>
+      </w:pPr>
+      <w:r>
+        <w:rPr>
+          <w:rFonts w:ascii="Georgia" w:cs="Georgia" w:eastAsia="Georgia" w:hAnsi="Georgia"/>
+          <w:sz w:val="21"/>
+          <w:szCs w:val="21"/>
+        </w:rPr>
+        <w:t xml:space="preserve">— Por isso mesmo. — Lucas bateu a caneta no guardanapo. — Ele foi à casa do pai na quinta, antes das oito da manhã, buscar os contratos. Um dia depois da cremação. Quem tem tanta pressa assim?</w:t>
+      </w:r>
+    </w:p>
+    <w:p>
+      <w:pPr>
+        <w:spacing w:after="0" w:line="312"/>
+        <w:ind w:firstLine="340"/>
+        <w:jc w:val="both"/>
+      </w:pPr>
+      <w:r>
+        <w:rPr>
+          <w:rFonts w:ascii="Georgia" w:cs="Georgia" w:eastAsia="Georgia" w:hAnsi="Georgia"/>
+          <w:sz w:val="21"/>
+          <w:szCs w:val="21"/>
+        </w:rPr>
+        <w:t xml:space="preserve">Lia não respondeu. Lucas sabia o que ela estava pensando: que ele nunca tinha gostado de Otávio, e que isso não era prova de nada. Ela tinha razão. Ele não disse que o pai, quinze dias antes de morrer, tinha insistido para que ele assumisse a corretora justamente por causa do sócio. Não disse nada sobre aquela conversa. Ela continuava apagada, e ele queria que continuasse assim.</w:t>
+      </w:r>
+    </w:p>
+    <w:p>
+      <w:pPr>
+        <w:spacing w:after="0" w:line="312"/>
+        <w:ind w:firstLine="340"/>
+        <w:jc w:val="both"/>
+      </w:pPr>
+      <w:r>
+        <w:rPr>
+          <w:rFonts w:ascii="Georgia" w:cs="Georgia" w:eastAsia="Georgia" w:hAnsi="Georgia"/>
+          <w:sz w:val="21"/>
+          <w:szCs w:val="21"/>
+        </w:rPr>
+        <w:t xml:space="preserve">— A Helena — disse ele, mais baixo.</w:t>
+      </w:r>
+    </w:p>
+    <w:p>
+      <w:pPr>
+        <w:spacing w:after="0" w:line="312"/>
+        <w:ind w:firstLine="340"/>
+        <w:jc w:val="both"/>
+      </w:pPr>
+      <w:r>
+        <w:rPr>
+          <w:rFonts w:ascii="Georgia" w:cs="Georgia" w:eastAsia="Georgia" w:hAnsi="Georgia"/>
+          <w:sz w:val="21"/>
+          <w:szCs w:val="21"/>
+        </w:rPr>
+        <w:t xml:space="preserve">— Ela te entregou o celular do pai sem nem olhar o que tinha dentro.</w:t>
+      </w:r>
+    </w:p>
+    <w:p>
+      <w:pPr>
+        <w:spacing w:after="0" w:line="312"/>
+        <w:ind w:firstLine="340"/>
+        <w:jc w:val="both"/>
+      </w:pPr>
+      <w:r>
+        <w:rPr>
+          <w:rFonts w:ascii="Georgia" w:cs="Georgia" w:eastAsia="Georgia" w:hAnsi="Georgia"/>
+          <w:sz w:val="21"/>
+          <w:szCs w:val="21"/>
+        </w:rPr>
+        <w:t xml:space="preserve">— Pois é. Que viúva não quer saber o que tem no celular do marido?</w:t>
+      </w:r>
+    </w:p>
+    <w:p>
+      <w:pPr>
+        <w:spacing w:after="0" w:line="312"/>
+        <w:ind w:firstLine="340"/>
+        <w:jc w:val="both"/>
+      </w:pPr>
+      <w:r>
+        <w:rPr>
+          <w:rFonts w:ascii="Georgia" w:cs="Georgia" w:eastAsia="Georgia" w:hAnsi="Georgia"/>
+          <w:sz w:val="21"/>
+          <w:szCs w:val="21"/>
+        </w:rPr>
+        <w:t xml:space="preserve">— Uma viúva que já sabe — disse Lia.</w:t>
+      </w:r>
+    </w:p>
+    <w:p>
+      <w:pPr>
+        <w:spacing w:after="0" w:line="312"/>
+        <w:ind w:firstLine="340"/>
+        <w:jc w:val="both"/>
+      </w:pPr>
+      <w:r>
+        <w:rPr>
+          <w:rFonts w:ascii="Georgia" w:cs="Georgia" w:eastAsia="Georgia" w:hAnsi="Georgia"/>
+          <w:sz w:val="21"/>
+          <w:szCs w:val="21"/>
+        </w:rPr>
+        <w:t xml:space="preserve">Lucas escreveu: Helena.</w:t>
+      </w:r>
+    </w:p>
+    <w:p>
+      <w:pPr>
+        <w:spacing w:after="200" w:before="200"/>
+        <w:jc w:val="center"/>
+      </w:pPr>
+      <w:r>
+        <w:rPr>
+          <w:rFonts w:ascii="Georgia" w:cs="Georgia" w:eastAsia="Georgia" w:hAnsi="Georgia"/>
+          <w:sz w:val="22"/>
+          <w:szCs w:val="22"/>
+        </w:rPr>
+        <w:t xml:space="preserve">*</w:t>
+      </w:r>
+    </w:p>
+    <w:p>
+      <w:pPr>
+        <w:spacing w:after="0" w:line="312"/>
+        <w:ind w:firstLine="340"/>
+        <w:jc w:val="both"/>
+      </w:pPr>
+      <w:r>
+        <w:rPr>
+          <w:rFonts w:ascii="Georgia" w:cs="Georgia" w:eastAsia="Georgia" w:hAnsi="Georgia"/>
+          <w:sz w:val="21"/>
+          <w:szCs w:val="21"/>
+        </w:rPr>
+        <w:t xml:space="preserve">Ficaram olhando para o guardanapo. Cinco nomes, um ponto de interrogação. Havia mais gente, e os dois sabiam disso.</w:t>
+      </w:r>
+    </w:p>
+    <w:p>
+      <w:pPr>
+        <w:spacing w:after="0" w:line="312"/>
+        <w:ind w:firstLine="340"/>
+        <w:jc w:val="both"/>
+      </w:pPr>
+      <w:r>
+        <w:rPr>
+          <w:rFonts w:ascii="Georgia" w:cs="Georgia" w:eastAsia="Georgia" w:hAnsi="Georgia"/>
+          <w:sz w:val="21"/>
+          <w:szCs w:val="21"/>
+        </w:rPr>
+        <w:t xml:space="preserve">— As mulheres dele — disse Lucas, enfim.</w:t>
+      </w:r>
+    </w:p>
+    <w:p>
+      <w:pPr>
+        <w:spacing w:after="0" w:line="312"/>
+        <w:ind w:firstLine="340"/>
+        <w:jc w:val="both"/>
+      </w:pPr>
+      <w:r>
+        <w:rPr>
+          <w:rFonts w:ascii="Georgia" w:cs="Georgia" w:eastAsia="Georgia" w:hAnsi="Georgia"/>
+          <w:sz w:val="21"/>
+          <w:szCs w:val="21"/>
+        </w:rPr>
+        <w:t xml:space="preserve">— Você quer escrever o nome da sua mãe nesse guardanapo?</w:t>
+      </w:r>
+    </w:p>
+    <w:p>
+      <w:pPr>
+        <w:spacing w:after="0" w:line="312"/>
+        <w:ind w:firstLine="340"/>
+        <w:jc w:val="both"/>
+      </w:pPr>
+      <w:r>
+        <w:rPr>
+          <w:rFonts w:ascii="Georgia" w:cs="Georgia" w:eastAsia="Georgia" w:hAnsi="Georgia"/>
+          <w:sz w:val="21"/>
+          <w:szCs w:val="21"/>
+        </w:rPr>
+        <w:t xml:space="preserve">— Não. — Ele hesitou. — Nem o da sua.</w:t>
+      </w:r>
+    </w:p>
+    <w:p>
+      <w:pPr>
+        <w:spacing w:after="0" w:line="312"/>
+        <w:ind w:firstLine="340"/>
+        <w:jc w:val="both"/>
+      </w:pPr>
+      <w:r>
+        <w:rPr>
+          <w:rFonts w:ascii="Georgia" w:cs="Georgia" w:eastAsia="Georgia" w:hAnsi="Georgia"/>
+          <w:sz w:val="21"/>
+          <w:szCs w:val="21"/>
+        </w:rPr>
+        <w:t xml:space="preserve">O silêncio que veio depois foi diferente dos outros. Lia olhou para a janela. Lucas olhou para a caneta. Os dois sabiam que Marta tinha passado vinte anos sem dizer o nome do ex-marido em voz alta. Os dois sabiam que Sílvia tinha adoecido depois do divórcio, de um jeito que nenhum médico conseguia explicar direito, e que Carlos nunca perdoara o pai por isso.</w:t>
+      </w:r>
+    </w:p>
+    <w:p>
+      <w:pPr>
+        <w:spacing w:after="0" w:line="312"/>
+        <w:ind w:firstLine="340"/>
+        <w:jc w:val="both"/>
+      </w:pPr>
+      <w:r>
+        <w:rPr>
+          <w:rFonts w:ascii="Georgia" w:cs="Georgia" w:eastAsia="Georgia" w:hAnsi="Georgia"/>
+          <w:sz w:val="21"/>
+          <w:szCs w:val="21"/>
+        </w:rPr>
+        <w:t xml:space="preserve">Carlos.</w:t>
+      </w:r>
+    </w:p>
+    <w:p>
+      <w:pPr>
+        <w:spacing w:after="0" w:line="312"/>
+        <w:ind w:firstLine="340"/>
+        <w:jc w:val="both"/>
+      </w:pPr>
+      <w:r>
+        <w:rPr>
+          <w:rFonts w:ascii="Georgia" w:cs="Georgia" w:eastAsia="Georgia" w:hAnsi="Georgia"/>
+          <w:sz w:val="21"/>
+          <w:szCs w:val="21"/>
+        </w:rPr>
+        <w:t xml:space="preserve">Lucas não escreveu o nome do meio-irmão. Lia percebeu que ele não escreveu. Ele percebeu que ela percebeu.</w:t>
+      </w:r>
+    </w:p>
+    <w:p>
+      <w:pPr>
+        <w:spacing w:after="0" w:line="312"/>
+        <w:ind w:firstLine="340"/>
+        <w:jc w:val="both"/>
+      </w:pPr>
+      <w:r>
+        <w:rPr>
+          <w:rFonts w:ascii="Georgia" w:cs="Georgia" w:eastAsia="Georgia" w:hAnsi="Georgia"/>
+          <w:sz w:val="21"/>
+          <w:szCs w:val="21"/>
+        </w:rPr>
+        <w:t xml:space="preserve">— E as outras — disse ela, mudando de assunto rápido demais. — Você sabe que tinha outras.</w:t>
+      </w:r>
+    </w:p>
+    <w:p>
+      <w:pPr>
+        <w:spacing w:after="0" w:line="312"/>
+        <w:ind w:firstLine="340"/>
+        <w:jc w:val="both"/>
+      </w:pPr>
+      <w:r>
+        <w:rPr>
+          <w:rFonts w:ascii="Georgia" w:cs="Georgia" w:eastAsia="Georgia" w:hAnsi="Georgia"/>
+          <w:sz w:val="21"/>
+          <w:szCs w:val="21"/>
+        </w:rPr>
+        <w:t xml:space="preserve">— Sei que tinha. Não sei quem.</w:t>
+      </w:r>
+    </w:p>
+    <w:p>
+      <w:pPr>
+        <w:spacing w:after="0" w:line="312"/>
+        <w:ind w:firstLine="340"/>
+        <w:jc w:val="both"/>
+      </w:pPr>
+      <w:r>
+        <w:rPr>
+          <w:rFonts w:ascii="Georgia" w:cs="Georgia" w:eastAsia="Georgia" w:hAnsi="Georgia"/>
+          <w:sz w:val="21"/>
+          <w:szCs w:val="21"/>
+        </w:rPr>
+        <w:t xml:space="preserve">— O motel — disse Lia. — A delegada não falou com quem ele estava. Mas ele não estava sozinho.</w:t>
+      </w:r>
+    </w:p>
+    <w:p>
+      <w:pPr>
+        <w:spacing w:after="0" w:line="312"/>
+        <w:ind w:firstLine="340"/>
+        <w:jc w:val="both"/>
+      </w:pPr>
+      <w:r>
+        <w:rPr>
+          <w:rFonts w:ascii="Georgia" w:cs="Georgia" w:eastAsia="Georgia" w:hAnsi="Georgia"/>
+          <w:sz w:val="21"/>
+          <w:szCs w:val="21"/>
+        </w:rPr>
+        <w:t xml:space="preserve">Lucas escreveu, no pé do guardanapo: a mulher do motel.</w:t>
+      </w:r>
+    </w:p>
+    <w:p>
+      <w:pPr>
+        <w:spacing w:after="0" w:line="312"/>
+        <w:ind w:firstLine="340"/>
+        <w:jc w:val="both"/>
+      </w:pPr>
+      <w:r>
+        <w:rPr>
+          <w:rFonts w:ascii="Georgia" w:cs="Georgia" w:eastAsia="Georgia" w:hAnsi="Georgia"/>
+          <w:sz w:val="21"/>
+          <w:szCs w:val="21"/>
+        </w:rPr>
+        <w:t xml:space="preserve">Depois dobrou o papel em quatro e guardou no bolso da camisa.</w:t>
+      </w:r>
+    </w:p>
+    <w:p>
+      <w:pPr>
+        <w:spacing w:after="0" w:line="312"/>
+        <w:ind w:firstLine="340"/>
+        <w:jc w:val="both"/>
+      </w:pPr>
+      <w:r>
+        <w:rPr>
+          <w:rFonts w:ascii="Georgia" w:cs="Georgia" w:eastAsia="Georgia" w:hAnsi="Georgia"/>
+          <w:sz w:val="21"/>
+          <w:szCs w:val="21"/>
+        </w:rPr>
+        <w:t xml:space="preserve">— Uma regra — disse. — Tudo o que um descobrir, o outro fica sabendo.</w:t>
+      </w:r>
+    </w:p>
+    <w:p>
+      <w:pPr>
+        <w:spacing w:after="0" w:line="312"/>
+        <w:ind w:firstLine="340"/>
+        <w:jc w:val="both"/>
+      </w:pPr>
+      <w:r>
+        <w:rPr>
+          <w:rFonts w:ascii="Georgia" w:cs="Georgia" w:eastAsia="Georgia" w:hAnsi="Georgia"/>
+          <w:sz w:val="21"/>
+          <w:szCs w:val="21"/>
+        </w:rPr>
+        <w:t xml:space="preserve">— Tudo.</w:t>
+      </w:r>
+    </w:p>
+    <w:p>
+      <w:pPr>
+        <w:spacing w:after="0" w:line="312"/>
+        <w:ind w:firstLine="340"/>
+        <w:jc w:val="both"/>
+      </w:pPr>
+      <w:r>
+        <w:rPr>
+          <w:rFonts w:ascii="Georgia" w:cs="Georgia" w:eastAsia="Georgia" w:hAnsi="Georgia"/>
+          <w:sz w:val="21"/>
+          <w:szCs w:val="21"/>
+        </w:rPr>
+        <w:t xml:space="preserve">Apertaram as mãos por cima da mesa, como dois sócios fechando um contrato. Lucas pensou na conversa apagada no BlackBerry do pai. Lia pensou na garrafa de vinho fechada no colo dele, na segunda à noite. Nenhum dos dois soltou a mão primeiro.</w:t>
+      </w:r>
+    </w:p>
+    <w:p>
+      <w:pPr>
+        <w:spacing w:after="200" w:before="200"/>
+        <w:jc w:val="center"/>
+      </w:pPr>
+      <w:r>
+        <w:rPr>
+          <w:rFonts w:ascii="Georgia" w:cs="Georgia" w:eastAsia="Georgia" w:hAnsi="Georgia"/>
+          <w:sz w:val="22"/>
+          <w:szCs w:val="22"/>
+        </w:rPr>
+        <w:t xml:space="preserve">*</w:t>
+      </w:r>
+    </w:p>
+    <w:p>
+      <w:pPr>
+        <w:spacing w:after="0" w:line="312"/>
+        <w:ind w:firstLine="340"/>
+        <w:jc w:val="both"/>
+      </w:pPr>
+      <w:r>
+        <w:rPr>
+          <w:rFonts w:ascii="Georgia" w:cs="Georgia" w:eastAsia="Georgia" w:hAnsi="Georgia"/>
+          <w:sz w:val="21"/>
+          <w:szCs w:val="21"/>
+        </w:rPr>
+        <w:t xml:space="preserve">Na segunda-feira, às oito e meia da manhã, Lucas entrou pela primeira vez na corretora como o dono dela.</w:t>
+      </w:r>
+    </w:p>
+    <w:p>
+      <w:pPr>
+        <w:spacing w:after="0" w:line="312"/>
+        <w:ind w:firstLine="340"/>
+        <w:jc w:val="both"/>
+      </w:pPr>
+      <w:r>
+        <w:rPr>
+          <w:rFonts w:ascii="Georgia" w:cs="Georgia" w:eastAsia="Georgia" w:hAnsi="Georgia"/>
+          <w:sz w:val="21"/>
+          <w:szCs w:val="21"/>
+        </w:rPr>
+        <w:t xml:space="preserve">A recepção da Salvallus Seguros, no décimo quarto andar de um prédio espelhado da Faria Lima, tinha flores brancas no balcão e uma foto do pai num porta-retratos com fita preta. Os funcionários se levantavam quando ele passava. Alguns choravam. Outros o olhavam como se ele tivesse vindo cobrar alguma coisa.</w:t>
+      </w:r>
+    </w:p>
+    <w:p>
+      <w:pPr>
+        <w:spacing w:after="0" w:line="312"/>
+        <w:ind w:firstLine="340"/>
+        <w:jc w:val="both"/>
+      </w:pPr>
+      <w:r>
+        <w:rPr>
+          <w:rFonts w:ascii="Georgia" w:cs="Georgia" w:eastAsia="Georgia" w:hAnsi="Georgia"/>
+          <w:sz w:val="21"/>
+          <w:szCs w:val="21"/>
+        </w:rPr>
+        <w:t xml:space="preserve">Otávio o esperava na porta da sala do pai.</w:t>
+      </w:r>
+    </w:p>
+    <w:p>
+      <w:pPr>
+        <w:spacing w:after="0" w:line="312"/>
+        <w:ind w:firstLine="340"/>
+        <w:jc w:val="both"/>
+      </w:pPr>
+      <w:r>
+        <w:rPr>
+          <w:rFonts w:ascii="Georgia" w:cs="Georgia" w:eastAsia="Georgia" w:hAnsi="Georgia"/>
+          <w:sz w:val="21"/>
+          <w:szCs w:val="21"/>
+        </w:rPr>
+        <w:t xml:space="preserve">— Bem-vindo, Lucas. — O sócio o abraçou com força, dois tapas nas costas. — Teu pai ficaria orgulhoso. Ele sempre quis você aqui.</w:t>
+      </w:r>
+    </w:p>
+    <w:p>
+      <w:pPr>
+        <w:spacing w:after="0" w:line="312"/>
+        <w:ind w:firstLine="340"/>
+        <w:jc w:val="both"/>
+      </w:pPr>
+      <w:r>
+        <w:rPr>
+          <w:rFonts w:ascii="Georgia" w:cs="Georgia" w:eastAsia="Georgia" w:hAnsi="Georgia"/>
+          <w:sz w:val="21"/>
+          <w:szCs w:val="21"/>
+        </w:rPr>
+        <w:t xml:space="preserve">— Eu sei.</w:t>
+      </w:r>
+    </w:p>
+    <w:p>
+      <w:pPr>
+        <w:spacing w:after="0" w:line="312"/>
+        <w:ind w:firstLine="340"/>
+        <w:jc w:val="both"/>
+      </w:pPr>
+      <w:r>
+        <w:rPr>
+          <w:rFonts w:ascii="Georgia" w:cs="Georgia" w:eastAsia="Georgia" w:hAnsi="Georgia"/>
+          <w:sz w:val="21"/>
+          <w:szCs w:val="21"/>
+        </w:rPr>
+        <w:t xml:space="preserve">— Deixei tudo organizado na mesa. Os contratos em andamento, as procurações, as senhas dos sistemas. O que precisar, a minha sala é ao lado.</w:t>
+      </w:r>
+    </w:p>
+    <w:p>
+      <w:pPr>
+        <w:spacing w:after="0" w:line="312"/>
+        <w:ind w:firstLine="340"/>
+        <w:jc w:val="both"/>
+      </w:pPr>
+      <w:r>
+        <w:rPr>
+          <w:rFonts w:ascii="Georgia" w:cs="Georgia" w:eastAsia="Georgia" w:hAnsi="Georgia"/>
+          <w:sz w:val="21"/>
+          <w:szCs w:val="21"/>
+        </w:rPr>
+        <w:t xml:space="preserve">Ao lado, pensou Lucas. Exatamente como o pai tinha dito.</w:t>
+      </w:r>
+    </w:p>
+    <w:p>
+      <w:pPr>
+        <w:spacing w:after="0" w:line="312"/>
+        <w:ind w:firstLine="340"/>
+        <w:jc w:val="both"/>
+      </w:pPr>
+      <w:r>
+        <w:rPr>
+          <w:rFonts w:ascii="Georgia" w:cs="Georgia" w:eastAsia="Georgia" w:hAnsi="Georgia"/>
+          <w:sz w:val="21"/>
+          <w:szCs w:val="21"/>
+        </w:rPr>
+        <w:t xml:space="preserve">Passou a manhã inteira assinando papéis que mal entendia. Ao meio-dia, a secretária do pai bateu na porta.</w:t>
+      </w:r>
+    </w:p>
+    <w:p>
+      <w:pPr>
+        <w:spacing w:after="0" w:line="312"/>
+        <w:ind w:firstLine="340"/>
+        <w:jc w:val="both"/>
+      </w:pPr>
+      <w:r>
+        <w:rPr>
+          <w:rFonts w:ascii="Georgia" w:cs="Georgia" w:eastAsia="Georgia" w:hAnsi="Georgia"/>
+          <w:sz w:val="21"/>
+          <w:szCs w:val="21"/>
+        </w:rPr>
+        <w:t xml:space="preserve">— Tem um senhor da Aurora Vida e Previdência na recepção. Tomás Ribeiro. Disse que é sobre o seguro de vida do doutor Henrique.</w:t>
+      </w:r>
+    </w:p>
+    <w:p>
+      <w:pPr>
+        <w:spacing w:after="200" w:before="200"/>
+        <w:jc w:val="center"/>
+      </w:pPr>
+      <w:r>
+        <w:rPr>
+          <w:rFonts w:ascii="Georgia" w:cs="Georgia" w:eastAsia="Georgia" w:hAnsi="Georgia"/>
+          <w:sz w:val="22"/>
+          <w:szCs w:val="22"/>
+        </w:rPr>
+        <w:t xml:space="preserve">*</w:t>
+      </w:r>
+    </w:p>
+    <w:p>
+      <w:pPr>
+        <w:spacing w:after="0" w:line="312"/>
+        <w:ind w:firstLine="340"/>
+        <w:jc w:val="both"/>
+      </w:pPr>
+      <w:r>
+        <w:rPr>
+          <w:rFonts w:ascii="Georgia" w:cs="Georgia" w:eastAsia="Georgia" w:hAnsi="Georgia"/>
+          <w:sz w:val="21"/>
+          <w:szCs w:val="21"/>
+        </w:rPr>
+        <w:t xml:space="preserve">Tomás Ribeiro era um homem magro, de terno cinza e pasta de couro gasta, com o jeito educado e implacável de quem passou a vida inteira desconfiando de viúvas. Sentou-se diante de Lucas, recusou o café e abriu a pasta.</w:t>
+      </w:r>
+    </w:p>
+    <w:p>
+      <w:pPr>
+        <w:spacing w:after="0" w:line="312"/>
+        <w:ind w:firstLine="340"/>
+        <w:jc w:val="both"/>
+      </w:pPr>
+      <w:r>
+        <w:rPr>
+          <w:rFonts w:ascii="Georgia" w:cs="Georgia" w:eastAsia="Georgia" w:hAnsi="Georgia"/>
+          <w:sz w:val="21"/>
+          <w:szCs w:val="21"/>
+        </w:rPr>
+        <w:t xml:space="preserve">— Meus sentimentos, senhor Salvallus. Serei breve. O seu pai tinha uma apólice de seguro de vida conosco. Os beneficiários são os três filhos, em partes iguais: o senhor, a senhora Lia e o senhor Carlos.</w:t>
+      </w:r>
+    </w:p>
+    <w:p>
+      <w:pPr>
+        <w:spacing w:after="0" w:line="312"/>
+        <w:ind w:firstLine="340"/>
+        <w:jc w:val="both"/>
+      </w:pPr>
+      <w:r>
+        <w:rPr>
+          <w:rFonts w:ascii="Georgia" w:cs="Georgia" w:eastAsia="Georgia" w:hAnsi="Georgia"/>
+          <w:sz w:val="21"/>
+          <w:szCs w:val="21"/>
+        </w:rPr>
+        <w:t xml:space="preserve">Lucas assentiu. Sabia da apólice. Não sabia do valor, e não perguntou.</w:t>
+      </w:r>
+    </w:p>
+    <w:p>
+      <w:pPr>
+        <w:spacing w:after="0" w:line="312"/>
+        <w:ind w:firstLine="340"/>
+        <w:jc w:val="both"/>
+      </w:pPr>
+      <w:r>
+        <w:rPr>
+          <w:rFonts w:ascii="Georgia" w:cs="Georgia" w:eastAsia="Georgia" w:hAnsi="Georgia"/>
+          <w:sz w:val="21"/>
+          <w:szCs w:val="21"/>
+        </w:rPr>
+        <w:t xml:space="preserve">— Há dois detalhes que eu preciso registrar — continuou Tomás. — O primeiro é rotina. A cremação foi feita pouco mais de vinte e quatro horas depois do óbito. É o prazo mínimo que a lei permite. Em vinte anos de profissão, poucas vezes vi uma família tão rápida.</w:t>
+      </w:r>
+    </w:p>
+    <w:p>
+      <w:pPr>
+        <w:spacing w:after="0" w:line="312"/>
+        <w:ind w:firstLine="340"/>
+        <w:jc w:val="both"/>
+      </w:pPr>
+      <w:r>
+        <w:rPr>
+          <w:rFonts w:ascii="Georgia" w:cs="Georgia" w:eastAsia="Georgia" w:hAnsi="Georgia"/>
+          <w:sz w:val="21"/>
+          <w:szCs w:val="21"/>
+        </w:rPr>
+        <w:t xml:space="preserve">— A decisão foi da viúva.</w:t>
+      </w:r>
+    </w:p>
+    <w:p>
+      <w:pPr>
+        <w:spacing w:after="0" w:line="312"/>
+        <w:ind w:firstLine="340"/>
+        <w:jc w:val="both"/>
+      </w:pPr>
+      <w:r>
+        <w:rPr>
+          <w:rFonts w:ascii="Georgia" w:cs="Georgia" w:eastAsia="Georgia" w:hAnsi="Georgia"/>
+          <w:sz w:val="21"/>
+          <w:szCs w:val="21"/>
+        </w:rPr>
+        <w:t xml:space="preserve">— Eu sei. — Tomás tirou um papel da pasta e o virou na direção de Lucas. — O segundo detalhe não é rotina.</w:t>
+      </w:r>
+    </w:p>
+    <w:p>
+      <w:pPr>
+        <w:spacing w:after="0" w:line="312"/>
+        <w:ind w:firstLine="340"/>
+        <w:jc w:val="both"/>
+      </w:pPr>
+      <w:r>
+        <w:rPr>
+          <w:rFonts w:ascii="Georgia" w:cs="Georgia" w:eastAsia="Georgia" w:hAnsi="Georgia"/>
+          <w:sz w:val="21"/>
+          <w:szCs w:val="21"/>
+        </w:rPr>
+        <w:t xml:space="preserve">Era uma cópia de um aditivo contratual, com a assinatura do pai no pé da página. Lucas reconheceu a letra inclinada, o traço firme que cortava o H.</w:t>
+      </w:r>
+    </w:p>
+    <w:p>
+      <w:pPr>
+        <w:spacing w:after="0" w:line="312"/>
+        <w:ind w:firstLine="340"/>
+        <w:jc w:val="both"/>
+      </w:pPr>
+      <w:r>
+        <w:rPr>
+          <w:rFonts w:ascii="Georgia" w:cs="Georgia" w:eastAsia="Georgia" w:hAnsi="Georgia"/>
+          <w:sz w:val="21"/>
+          <w:szCs w:val="21"/>
+        </w:rPr>
+        <w:t xml:space="preserve">— Há três meses, o seu pai aumentou o valor da apólice. Bastante. — Tomás deixou um silêncio. — Pessoas costumam aumentar o seguro de vida quando têm filhos pequenos, quando compram uma casa ou quando ficam doentes. O seu pai não tinha filhos pequenos, não comprou casa e, segundo o próprio médico, o doutor Álvaro Mendes, estava com a saúde controlada.</w:t>
+      </w:r>
+    </w:p>
+    <w:p>
+      <w:pPr>
+        <w:spacing w:after="0" w:line="312"/>
+        <w:ind w:firstLine="340"/>
+        <w:jc w:val="both"/>
+      </w:pPr>
+      <w:r>
+        <w:rPr>
+          <w:rFonts w:ascii="Georgia" w:cs="Georgia" w:eastAsia="Georgia" w:hAnsi="Georgia"/>
+          <w:sz w:val="21"/>
+          <w:szCs w:val="21"/>
+        </w:rPr>
+        <w:t xml:space="preserve">Lucas olhou para a assinatura do pai.</w:t>
+      </w:r>
+    </w:p>
+    <w:p>
+      <w:pPr>
+        <w:spacing w:after="0" w:line="312"/>
+        <w:ind w:firstLine="340"/>
+        <w:jc w:val="both"/>
+      </w:pPr>
+      <w:r>
+        <w:rPr>
+          <w:rFonts w:ascii="Georgia" w:cs="Georgia" w:eastAsia="Georgia" w:hAnsi="Georgia"/>
+          <w:sz w:val="21"/>
+          <w:szCs w:val="21"/>
+        </w:rPr>
+        <w:t xml:space="preserve">— O senhor está dizendo o quê?</w:t>
+      </w:r>
+    </w:p>
+    <w:p>
+      <w:pPr>
+        <w:spacing w:after="0" w:line="312"/>
+        <w:ind w:firstLine="340"/>
+        <w:jc w:val="both"/>
+      </w:pPr>
+      <w:r>
+        <w:rPr>
+          <w:rFonts w:ascii="Georgia" w:cs="Georgia" w:eastAsia="Georgia" w:hAnsi="Georgia"/>
+          <w:sz w:val="21"/>
+          <w:szCs w:val="21"/>
+        </w:rPr>
+        <w:t xml:space="preserve">— Nada, por enquanto. Só estou dizendo o que a seguradora vai perguntar. — Tomás fechou a pasta. — Por que um homem saudável aumenta o próprio seguro de vida três meses antes de morrer de um infarto. E por que a família teve tanta pressa de transformá-lo em cinzas.</w:t>
+      </w:r>
+    </w:p>
+    <w:p>
+      <w:pPr>
+        <w:spacing w:after="0" w:line="312"/>
+        <w:ind w:firstLine="340"/>
+        <w:jc w:val="both"/>
+      </w:pPr>
+      <w:r>
+        <w:rPr>
+          <w:rFonts w:ascii="Georgia" w:cs="Georgia" w:eastAsia="Georgia" w:hAnsi="Georgia"/>
+          <w:sz w:val="21"/>
+          <w:szCs w:val="21"/>
+        </w:rPr>
+        <w:t xml:space="preserve">Ele se levantou, ajeitou o paletó e estendeu um cartão.</w:t>
+      </w:r>
+    </w:p>
+    <w:p>
+      <w:pPr>
+        <w:spacing w:after="0" w:line="312"/>
+        <w:ind w:firstLine="340"/>
+        <w:jc w:val="both"/>
+      </w:pPr>
+      <w:r>
+        <w:rPr>
+          <w:rFonts w:ascii="Georgia" w:cs="Georgia" w:eastAsia="Georgia" w:hAnsi="Georgia"/>
+          <w:sz w:val="21"/>
+          <w:szCs w:val="21"/>
+        </w:rPr>
+        <w:t xml:space="preserve">— E, já que o senhor vai perguntar a alguém, comece pelos beneficiários. Nós sempre começamos.</w:t>
+      </w:r>
+    </w:p>
+    <w:p>
+      <w:pPr>
+        <w:spacing w:after="0" w:line="312"/>
+        <w:ind w:firstLine="340"/>
+        <w:jc w:val="both"/>
+      </w:pPr>
+      <w:r>
+        <w:rPr>
+          <w:rFonts w:ascii="Georgia" w:cs="Georgia" w:eastAsia="Georgia" w:hAnsi="Georgia"/>
+          <w:sz w:val="21"/>
+          <w:szCs w:val="21"/>
+        </w:rPr>
+        <w:t xml:space="preserve">Lucas ficou sozinho na sala do pai, com o cartão numa mão e, no bolso da camisa, um guardanapo dobrado com cinco nomes. Pela primeira vez, entendeu que, se ele e Lia tinham uma lista de suspeitos, alguém lá fora também tinha uma.</w:t>
+      </w:r>
+    </w:p>
+    <w:p>
+      <w:pPr>
+        <w:spacing w:after="0" w:line="312"/>
+        <w:ind w:firstLine="340"/>
+        <w:jc w:val="both"/>
+      </w:pPr>
+      <w:r>
+        <w:rPr>
+          <w:rFonts w:ascii="Georgia" w:cs="Georgia" w:eastAsia="Georgia" w:hAnsi="Georgia"/>
+          <w:sz w:val="21"/>
+          <w:szCs w:val="21"/>
+        </w:rPr>
+        <w:t xml:space="preserve">E que, nela, os primeiros nomes eram os dos filhos.</w:t>
       </w:r>
     </w:p>
     <w:sectPr>

</xml_diff>

<commit_message>
Livro policial: capítulo 6 (O soco)
Co-Authored-By: Claude Opus 5.5 <noreply@anthropic.com>
Claude-Session: https://claude.ai/code/session_01BrurxSYygRC3rRhaUYosm1
</commit_message>
<xml_diff>
--- a/docs/livro-policial/TODO_CRIME_TEM_UM_AUTOR.docx
+++ b/docs/livro-policial/TODO_CRIME_TEM_UM_AUTOR.docx
@@ -5087,6 +5087,918 @@
           <w:szCs w:val="21"/>
         </w:rPr>
         <w:t xml:space="preserve">E que, nela, os primeiros nomes eram os dos filhos.</w:t>
+      </w:r>
+    </w:p>
+    <w:p>
+      <w:pPr>
+        <w:pageBreakBefore/>
+        <w:spacing w:after="120" w:before="1800"/>
+        <w:jc w:val="center"/>
+      </w:pPr>
+      <w:r>
+        <w:rPr>
+          <w:rFonts w:ascii="Georgia" w:cs="Georgia" w:eastAsia="Georgia" w:hAnsi="Georgia"/>
+          <w:spacing w:val="40"/>
+          <w:sz w:val="20"/>
+          <w:szCs w:val="20"/>
+        </w:rPr>
+        <w:t xml:space="preserve">CAPÍTULO 6</w:t>
+      </w:r>
+    </w:p>
+    <w:p>
+      <w:pPr>
+        <w:spacing w:after="720"/>
+        <w:jc w:val="center"/>
+      </w:pPr>
+      <w:r>
+        <w:rPr>
+          <w:rFonts w:ascii="Georgia" w:cs="Georgia" w:eastAsia="Georgia" w:hAnsi="Georgia"/>
+          <w:b/>
+          <w:bCs/>
+          <w:sz w:val="32"/>
+          <w:szCs w:val="32"/>
+        </w:rPr>
+        <w:t xml:space="preserve">O soco</w:t>
+      </w:r>
+    </w:p>
+    <w:p>
+      <w:pPr>
+        <w:spacing w:after="0" w:line="312"/>
+        <w:ind w:firstLine="340"/>
+        <w:jc w:val="both"/>
+      </w:pPr>
+      <w:r>
+        <w:rPr>
+          <w:rFonts w:ascii="Georgia" w:cs="Georgia" w:eastAsia="Georgia" w:hAnsi="Georgia"/>
+          <w:sz w:val="21"/>
+          <w:szCs w:val="21"/>
+        </w:rPr>
+        <w:t xml:space="preserve">Maio.</w:t>
+      </w:r>
+    </w:p>
+    <w:p>
+      <w:pPr>
+        <w:spacing w:after="0" w:line="312"/>
+        <w:ind w:firstLine="340"/>
+        <w:jc w:val="both"/>
+      </w:pPr>
+      <w:r>
+        <w:rPr>
+          <w:rFonts w:ascii="Georgia" w:cs="Georgia" w:eastAsia="Georgia" w:hAnsi="Georgia"/>
+          <w:sz w:val="21"/>
+          <w:szCs w:val="21"/>
+        </w:rPr>
+        <w:t xml:space="preserve">O terraço do Il Ponte, na Haddock Lobo, tinha seis mesas, toldos verdes e uma vista que ninguém olhava: o paredão de um prédio comercial do outro lado da rua, vidros espelhados até o décimo quinto andar. Henrique almoçava ali às quintas-feiras havia três anos. Mesa do canto, de frente para a rua, de costas para a parede. Um hábito que Nestor, o motorista, chamava de mania e que Henrique chamava de prudência.</w:t>
+      </w:r>
+    </w:p>
+    <w:p>
+      <w:pPr>
+        <w:spacing w:after="0" w:line="312"/>
+        <w:ind w:firstLine="340"/>
+        <w:jc w:val="both"/>
+      </w:pPr>
+      <w:r>
+        <w:rPr>
+          <w:rFonts w:ascii="Georgia" w:cs="Georgia" w:eastAsia="Georgia" w:hAnsi="Georgia"/>
+          <w:sz w:val="21"/>
+          <w:szCs w:val="21"/>
+        </w:rPr>
+        <w:t xml:space="preserve">Naquela quinta, almoçava com um cliente de Ribeirão Preto que queria segurar dezoito galpões e não queria pagar o que dezoito galpões custam. Henrique deixava o homem falar. Era a parte do trabalho de que mais gostava: ouvir alguém explicar por que o risco dele era menor do que o de todo mundo.</w:t>
+      </w:r>
+    </w:p>
+    <w:p>
+      <w:pPr>
+        <w:spacing w:after="0" w:line="312"/>
+        <w:ind w:firstLine="340"/>
+        <w:jc w:val="both"/>
+      </w:pPr>
+      <w:r>
+        <w:rPr>
+          <w:rFonts w:ascii="Georgia" w:cs="Georgia" w:eastAsia="Georgia" w:hAnsi="Georgia"/>
+          <w:sz w:val="21"/>
+          <w:szCs w:val="21"/>
+        </w:rPr>
+        <w:t xml:space="preserve">— Galpão novo, doutor. Sprinkler, câmera, vigia vinte e quatro horas.</w:t>
+      </w:r>
+    </w:p>
+    <w:p>
+      <w:pPr>
+        <w:spacing w:after="0" w:line="312"/>
+        <w:ind w:firstLine="340"/>
+        <w:jc w:val="both"/>
+      </w:pPr>
+      <w:r>
+        <w:rPr>
+          <w:rFonts w:ascii="Georgia" w:cs="Georgia" w:eastAsia="Georgia" w:hAnsi="Georgia"/>
+          <w:sz w:val="21"/>
+          <w:szCs w:val="21"/>
+        </w:rPr>
+        <w:t xml:space="preserve">— O fogo não sabe que o galpão é novo — disse Henrique, servindo água para os dois.</w:t>
+      </w:r>
+    </w:p>
+    <w:p>
+      <w:pPr>
+        <w:spacing w:after="0" w:line="312"/>
+        <w:ind w:firstLine="340"/>
+        <w:jc w:val="both"/>
+      </w:pPr>
+      <w:r>
+        <w:rPr>
+          <w:rFonts w:ascii="Georgia" w:cs="Georgia" w:eastAsia="Georgia" w:hAnsi="Georgia"/>
+          <w:sz w:val="21"/>
+          <w:szCs w:val="21"/>
+        </w:rPr>
+        <w:t xml:space="preserve">O cliente riu. Henrique não riu. Desde fevereiro, ria menos.</w:t>
+      </w:r>
+    </w:p>
+    <w:p>
+      <w:pPr>
+        <w:spacing w:after="200" w:before="200"/>
+        <w:jc w:val="center"/>
+      </w:pPr>
+      <w:r>
+        <w:rPr>
+          <w:rFonts w:ascii="Georgia" w:cs="Georgia" w:eastAsia="Georgia" w:hAnsi="Georgia"/>
+          <w:sz w:val="22"/>
+          <w:szCs w:val="22"/>
+        </w:rPr>
+        <w:t xml:space="preserve">*</w:t>
+      </w:r>
+    </w:p>
+    <w:p>
+      <w:pPr>
+        <w:spacing w:after="0" w:line="312"/>
+        <w:ind w:firstLine="340"/>
+        <w:jc w:val="both"/>
+      </w:pPr>
+      <w:r>
+        <w:rPr>
+          <w:rFonts w:ascii="Georgia" w:cs="Georgia" w:eastAsia="Georgia" w:hAnsi="Georgia"/>
+          <w:sz w:val="21"/>
+          <w:szCs w:val="21"/>
+        </w:rPr>
+        <w:t xml:space="preserve">Três meses tinham se passado desde a suíte 14, e o caso de seu Joaquim continuava aberto. A delegada Regina Paiva o chamara duas vezes para depor. Na segunda, mostrara a ele uma foto de Bianca saindo do motel às duas e vinte da manhã, sozinha, de táxi. Perguntou se ele confirmava que era ela. Ele confirmou. Bianca dissera à polícia que tinha tomado banho, dormido um pouco e ido embora, e que o copo de uísque ainda estava na mesa de cabeceira quando ela saiu. Ninguém tinha visto o funcionário entrar no quarto. Ninguém sabia quem tinha mexido na garrafa.</w:t>
+      </w:r>
+    </w:p>
+    <w:p>
+      <w:pPr>
+        <w:spacing w:after="0" w:line="312"/>
+        <w:ind w:firstLine="340"/>
+        <w:jc w:val="both"/>
+      </w:pPr>
+      <w:r>
+        <w:rPr>
+          <w:rFonts w:ascii="Georgia" w:cs="Georgia" w:eastAsia="Georgia" w:hAnsi="Georgia"/>
+          <w:sz w:val="21"/>
+          <w:szCs w:val="21"/>
+        </w:rPr>
+        <w:t xml:space="preserve">Henrique não via Bianca desde então. Ela mandara duas mensagens. Ele não respondera nenhuma.</w:t>
+      </w:r>
+    </w:p>
+    <w:p>
+      <w:pPr>
+        <w:spacing w:after="0" w:line="312"/>
+        <w:ind w:firstLine="340"/>
+        <w:jc w:val="both"/>
+      </w:pPr>
+      <w:r>
+        <w:rPr>
+          <w:rFonts w:ascii="Georgia" w:cs="Georgia" w:eastAsia="Georgia" w:hAnsi="Georgia"/>
+          <w:sz w:val="21"/>
+          <w:szCs w:val="21"/>
+        </w:rPr>
+        <w:t xml:space="preserve">Pagava, desde março, um segurança que andava com ele à noite. Nunca de dia. De dia, achava que a cidade o protegia.</w:t>
+      </w:r>
+    </w:p>
+    <w:p>
+      <w:pPr>
+        <w:spacing w:after="200" w:before="200"/>
+        <w:jc w:val="center"/>
+      </w:pPr>
+      <w:r>
+        <w:rPr>
+          <w:rFonts w:ascii="Georgia" w:cs="Georgia" w:eastAsia="Georgia" w:hAnsi="Georgia"/>
+          <w:sz w:val="22"/>
+          <w:szCs w:val="22"/>
+        </w:rPr>
+        <w:t xml:space="preserve">*</w:t>
+      </w:r>
+    </w:p>
+    <w:p>
+      <w:pPr>
+        <w:spacing w:after="0" w:line="312"/>
+        <w:ind w:firstLine="340"/>
+        <w:jc w:val="both"/>
+      </w:pPr>
+      <w:r>
+        <w:rPr>
+          <w:rFonts w:ascii="Georgia" w:cs="Georgia" w:eastAsia="Georgia" w:hAnsi="Georgia"/>
+          <w:sz w:val="21"/>
+          <w:szCs w:val="21"/>
+        </w:rPr>
+        <w:t xml:space="preserve">Estavam na sobremesa quando ele viu Marcelo Duarte atravessar a rua.</w:t>
+      </w:r>
+    </w:p>
+    <w:p>
+      <w:pPr>
+        <w:spacing w:after="0" w:line="312"/>
+        <w:ind w:firstLine="340"/>
+        <w:jc w:val="both"/>
+      </w:pPr>
+      <w:r>
+        <w:rPr>
+          <w:rFonts w:ascii="Georgia" w:cs="Georgia" w:eastAsia="Georgia" w:hAnsi="Georgia"/>
+          <w:sz w:val="21"/>
+          <w:szCs w:val="21"/>
+        </w:rPr>
+        <w:t xml:space="preserve">Reconheceu primeiro o jeito de andar, os ombros largos jogados para a frente, como quem empurra uma porta que não existe. Depois o rosto vermelho. Marcelo tinha sido dono da segunda maior corretora de imóveis comerciais de São Paulo até o ano anterior, quando perdeu para a Salvallus Seguros os três maiores clientes que tinha. Depois perdeu o resto. Em dezembro, pediu recuperação judicial. Em janeiro, a mulher pediu o divórcio. Em fevereiro, num coquetel, disse a quem quisesse ouvir que Henrique Salvallus tinha comprado os clientes dele com propina, e que um dia ia pagar.</w:t>
+      </w:r>
+    </w:p>
+    <w:p>
+      <w:pPr>
+        <w:spacing w:after="0" w:line="312"/>
+        <w:ind w:firstLine="340"/>
+        <w:jc w:val="both"/>
+      </w:pPr>
+      <w:r>
+        <w:rPr>
+          <w:rFonts w:ascii="Georgia" w:cs="Georgia" w:eastAsia="Georgia" w:hAnsi="Georgia"/>
+          <w:sz w:val="21"/>
+          <w:szCs w:val="21"/>
+        </w:rPr>
+        <w:t xml:space="preserve">Henrique nunca tinha comprado ninguém. Tinha apenas oferecido o que Marcelo não sabia oferecer: o preço certo na hora certa. Mas sabia que, para um homem que perde tudo, a explicação não faz diferença.</w:t>
+      </w:r>
+    </w:p>
+    <w:p>
+      <w:pPr>
+        <w:spacing w:after="0" w:line="312"/>
+        <w:ind w:firstLine="340"/>
+        <w:jc w:val="both"/>
+      </w:pPr>
+      <w:r>
+        <w:rPr>
+          <w:rFonts w:ascii="Georgia" w:cs="Georgia" w:eastAsia="Georgia" w:hAnsi="Georgia"/>
+          <w:sz w:val="21"/>
+          <w:szCs w:val="21"/>
+        </w:rPr>
+        <w:t xml:space="preserve">— Algum problema, doutor? — perguntou o cliente.</w:t>
+      </w:r>
+    </w:p>
+    <w:p>
+      <w:pPr>
+        <w:spacing w:after="0" w:line="312"/>
+        <w:ind w:firstLine="340"/>
+        <w:jc w:val="both"/>
+      </w:pPr>
+      <w:r>
+        <w:rPr>
+          <w:rFonts w:ascii="Georgia" w:cs="Georgia" w:eastAsia="Georgia" w:hAnsi="Georgia"/>
+          <w:sz w:val="21"/>
+          <w:szCs w:val="21"/>
+        </w:rPr>
+        <w:t xml:space="preserve">— Nenhum. Fica aqui.</w:t>
+      </w:r>
+    </w:p>
+    <w:p>
+      <w:pPr>
+        <w:spacing w:after="0" w:line="312"/>
+        <w:ind w:firstLine="340"/>
+        <w:jc w:val="both"/>
+      </w:pPr>
+      <w:r>
+        <w:rPr>
+          <w:rFonts w:ascii="Georgia" w:cs="Georgia" w:eastAsia="Georgia" w:hAnsi="Georgia"/>
+          <w:sz w:val="21"/>
+          <w:szCs w:val="21"/>
+        </w:rPr>
+        <w:t xml:space="preserve">Henrique se levantou e foi até a beira do terraço, onde três degraus o separavam da calçada. Queria que aquilo acontecesse longe da mesa. Longe do cliente. Longe dos garçons.</w:t>
+      </w:r>
+    </w:p>
+    <w:p>
+      <w:pPr>
+        <w:spacing w:after="0" w:line="312"/>
+        <w:ind w:firstLine="340"/>
+        <w:jc w:val="both"/>
+      </w:pPr>
+      <w:r>
+        <w:rPr>
+          <w:rFonts w:ascii="Georgia" w:cs="Georgia" w:eastAsia="Georgia" w:hAnsi="Georgia"/>
+          <w:sz w:val="21"/>
+          <w:szCs w:val="21"/>
+        </w:rPr>
+        <w:t xml:space="preserve">Marcelo subiu os três degraus de uma vez.</w:t>
+      </w:r>
+    </w:p>
+    <w:p>
+      <w:pPr>
+        <w:spacing w:after="0" w:line="312"/>
+        <w:ind w:firstLine="340"/>
+        <w:jc w:val="both"/>
+      </w:pPr>
+      <w:r>
+        <w:rPr>
+          <w:rFonts w:ascii="Georgia" w:cs="Georgia" w:eastAsia="Georgia" w:hAnsi="Georgia"/>
+          <w:sz w:val="21"/>
+          <w:szCs w:val="21"/>
+        </w:rPr>
+        <w:t xml:space="preserve">— Você destruiu a minha vida, Salvallus.</w:t>
+      </w:r>
+    </w:p>
+    <w:p>
+      <w:pPr>
+        <w:spacing w:after="0" w:line="312"/>
+        <w:ind w:firstLine="340"/>
+        <w:jc w:val="both"/>
+      </w:pPr>
+      <w:r>
+        <w:rPr>
+          <w:rFonts w:ascii="Georgia" w:cs="Georgia" w:eastAsia="Georgia" w:hAnsi="Georgia"/>
+          <w:sz w:val="21"/>
+          <w:szCs w:val="21"/>
+        </w:rPr>
+        <w:t xml:space="preserve">— Marcelo. Aqui não.</w:t>
+      </w:r>
+    </w:p>
+    <w:p>
+      <w:pPr>
+        <w:spacing w:after="0" w:line="312"/>
+        <w:ind w:firstLine="340"/>
+        <w:jc w:val="both"/>
+      </w:pPr>
+      <w:r>
+        <w:rPr>
+          <w:rFonts w:ascii="Georgia" w:cs="Georgia" w:eastAsia="Georgia" w:hAnsi="Georgia"/>
+          <w:sz w:val="21"/>
+          <w:szCs w:val="21"/>
+        </w:rPr>
+        <w:t xml:space="preserve">— Aqui sim. Aqui, onde todo mundo vê. — Marcelo o agarrou pela gola do paletó com as duas mãos. Cheirava a cerveja e a noite mal dormida. — Eu quero que todo mundo veja quem você é.</w:t>
+      </w:r>
+    </w:p>
+    <w:p>
+      <w:pPr>
+        <w:spacing w:after="0" w:line="312"/>
+        <w:ind w:firstLine="340"/>
+        <w:jc w:val="both"/>
+      </w:pPr>
+      <w:r>
+        <w:rPr>
+          <w:rFonts w:ascii="Georgia" w:cs="Georgia" w:eastAsia="Georgia" w:hAnsi="Georgia"/>
+          <w:sz w:val="21"/>
+          <w:szCs w:val="21"/>
+        </w:rPr>
+        <w:t xml:space="preserve">— Me solta.</w:t>
+      </w:r>
+    </w:p>
+    <w:p>
+      <w:pPr>
+        <w:spacing w:after="0" w:line="312"/>
+        <w:ind w:firstLine="340"/>
+        <w:jc w:val="both"/>
+      </w:pPr>
+      <w:r>
+        <w:rPr>
+          <w:rFonts w:ascii="Georgia" w:cs="Georgia" w:eastAsia="Georgia" w:hAnsi="Georgia"/>
+          <w:sz w:val="21"/>
+          <w:szCs w:val="21"/>
+        </w:rPr>
+        <w:t xml:space="preserve">— Você comprou os meus clientes. Comprou o meu banco. Comprou até a minha mulher, que agora mora num apartamento que eu sei quem paga.</w:t>
+      </w:r>
+    </w:p>
+    <w:p>
+      <w:pPr>
+        <w:spacing w:after="0" w:line="312"/>
+        <w:ind w:firstLine="340"/>
+        <w:jc w:val="both"/>
+      </w:pPr>
+      <w:r>
+        <w:rPr>
+          <w:rFonts w:ascii="Georgia" w:cs="Georgia" w:eastAsia="Georgia" w:hAnsi="Georgia"/>
+          <w:sz w:val="21"/>
+          <w:szCs w:val="21"/>
+        </w:rPr>
+        <w:t xml:space="preserve">Aquilo era mentira, e Henrique quase riu. Foi o quase que Marcelo viu.</w:t>
+      </w:r>
+    </w:p>
+    <w:p>
+      <w:pPr>
+        <w:spacing w:after="0" w:line="312"/>
+        <w:ind w:firstLine="340"/>
+        <w:jc w:val="both"/>
+      </w:pPr>
+      <w:r>
+        <w:rPr>
+          <w:rFonts w:ascii="Georgia" w:cs="Georgia" w:eastAsia="Georgia" w:hAnsi="Georgia"/>
+          <w:sz w:val="21"/>
+          <w:szCs w:val="21"/>
+        </w:rPr>
+        <w:t xml:space="preserve">O primeiro empurrão jogou Henrique contra a grade do terraço. O segundo rasgou a manga do paletó. Henrique sentiu o gosto de sangue na boca, sem saber de onde vinha. Alguém gritou. Um garçom largou a bandeja. Marcelo puxou de novo, os dois rostos quase colados, e Henrique, sem pensar, fechou a mão direita e acertou um soco no queixo dele com toda a força que tinha.</w:t>
+      </w:r>
+    </w:p>
+    <w:p>
+      <w:pPr>
+        <w:spacing w:after="0" w:line="312"/>
+        <w:ind w:firstLine="340"/>
+        <w:jc w:val="both"/>
+      </w:pPr>
+      <w:r>
+        <w:rPr>
+          <w:rFonts w:ascii="Georgia" w:cs="Georgia" w:eastAsia="Georgia" w:hAnsi="Georgia"/>
+          <w:sz w:val="21"/>
+          <w:szCs w:val="21"/>
+        </w:rPr>
+        <w:t xml:space="preserve">No mesmo instante, a cabeça de Marcelo deu um tranco para o lado, como se tivesse sido empurrada por uma mão invisível.</w:t>
+      </w:r>
+    </w:p>
+    <w:p>
+      <w:pPr>
+        <w:spacing w:after="0" w:line="312"/>
+        <w:ind w:firstLine="340"/>
+        <w:jc w:val="both"/>
+      </w:pPr>
+      <w:r>
+        <w:rPr>
+          <w:rFonts w:ascii="Georgia" w:cs="Georgia" w:eastAsia="Georgia" w:hAnsi="Georgia"/>
+          <w:sz w:val="21"/>
+          <w:szCs w:val="21"/>
+        </w:rPr>
+        <w:t xml:space="preserve">Henrique não ouviu nada. Ninguém ouviu. Um ônibus passava na Haddock Lobo, freando no ponto, e o chiado dos freios encheu a rua.</w:t>
+      </w:r>
+    </w:p>
+    <w:p>
+      <w:pPr>
+        <w:spacing w:after="0" w:line="312"/>
+        <w:ind w:firstLine="340"/>
+        <w:jc w:val="both"/>
+      </w:pPr>
+      <w:r>
+        <w:rPr>
+          <w:rFonts w:ascii="Georgia" w:cs="Georgia" w:eastAsia="Georgia" w:hAnsi="Georgia"/>
+          <w:sz w:val="21"/>
+          <w:szCs w:val="21"/>
+        </w:rPr>
+        <w:t xml:space="preserve">Marcelo soltou a gola dele. Ficou um segundo de pé, com os olhos abertos e uma expressão de surpresa quase infantil. Depois caiu para trás, desceu os três degraus de costas e bateu a cabeça no meio-fio com um som seco que todos ouviram.</w:t>
+      </w:r>
+    </w:p>
+    <w:p>
+      <w:pPr>
+        <w:spacing w:after="200" w:before="200"/>
+        <w:jc w:val="center"/>
+      </w:pPr>
+      <w:r>
+        <w:rPr>
+          <w:rFonts w:ascii="Georgia" w:cs="Georgia" w:eastAsia="Georgia" w:hAnsi="Georgia"/>
+          <w:sz w:val="22"/>
+          <w:szCs w:val="22"/>
+        </w:rPr>
+        <w:t xml:space="preserve">*</w:t>
+      </w:r>
+    </w:p>
+    <w:p>
+      <w:pPr>
+        <w:spacing w:after="0" w:line="312"/>
+        <w:ind w:firstLine="340"/>
+        <w:jc w:val="both"/>
+      </w:pPr>
+      <w:r>
+        <w:rPr>
+          <w:rFonts w:ascii="Georgia" w:cs="Georgia" w:eastAsia="Georgia" w:hAnsi="Georgia"/>
+          <w:sz w:val="21"/>
+          <w:szCs w:val="21"/>
+        </w:rPr>
+        <w:t xml:space="preserve">O resto aconteceu depressa e devagar ao mesmo tempo.</w:t>
+      </w:r>
+    </w:p>
+    <w:p>
+      <w:pPr>
+        <w:spacing w:after="0" w:line="312"/>
+        <w:ind w:firstLine="340"/>
+        <w:jc w:val="both"/>
+      </w:pPr>
+      <w:r>
+        <w:rPr>
+          <w:rFonts w:ascii="Georgia" w:cs="Georgia" w:eastAsia="Georgia" w:hAnsi="Georgia"/>
+          <w:sz w:val="21"/>
+          <w:szCs w:val="21"/>
+        </w:rPr>
+        <w:t xml:space="preserve">O sangue escorrendo da nuca de Marcelo para a sarjeta. O cliente de Ribeirão Preto de pé, branco como a toalha da mesa. Uma mulher gritando chamem uma ambulância. Um homem gritando ele matou, ele matou o cara com um soco. O garçom ajoelhado ao lado do corpo, tentando achar o pulso. Henrique de pé no alto dos degraus, com a mão direita ainda fechada e latejando, olhando para a própria mão como se ela pertencesse a outra pessoa.</w:t>
+      </w:r>
+    </w:p>
+    <w:p>
+      <w:pPr>
+        <w:spacing w:after="0" w:line="312"/>
+        <w:ind w:firstLine="340"/>
+        <w:jc w:val="both"/>
+      </w:pPr>
+      <w:r>
+        <w:rPr>
+          <w:rFonts w:ascii="Georgia" w:cs="Georgia" w:eastAsia="Georgia" w:hAnsi="Georgia"/>
+          <w:sz w:val="21"/>
+          <w:szCs w:val="21"/>
+        </w:rPr>
+        <w:t xml:space="preserve">Depois, as sirenes.</w:t>
+      </w:r>
+    </w:p>
+    <w:p>
+      <w:pPr>
+        <w:spacing w:after="0" w:line="312"/>
+        <w:ind w:firstLine="340"/>
+        <w:jc w:val="both"/>
+      </w:pPr>
+      <w:r>
+        <w:rPr>
+          <w:rFonts w:ascii="Georgia" w:cs="Georgia" w:eastAsia="Georgia" w:hAnsi="Georgia"/>
+          <w:sz w:val="21"/>
+          <w:szCs w:val="21"/>
+        </w:rPr>
+        <w:t xml:space="preserve">Dois policiais militares chegaram em menos de dez minutos. Um deles se abaixou ao lado de Marcelo e balançou a cabeça para o colega. O outro olhou para Henrique, para a mão dele, para o paletó rasgado, e pegou as algemas.</w:t>
+      </w:r>
+    </w:p>
+    <w:p>
+      <w:pPr>
+        <w:spacing w:after="0" w:line="312"/>
+        <w:ind w:firstLine="340"/>
+        <w:jc w:val="both"/>
+      </w:pPr>
+      <w:r>
+        <w:rPr>
+          <w:rFonts w:ascii="Georgia" w:cs="Georgia" w:eastAsia="Georgia" w:hAnsi="Georgia"/>
+          <w:sz w:val="21"/>
+          <w:szCs w:val="21"/>
+        </w:rPr>
+        <w:t xml:space="preserve">— O senhor está preso em flagrante.</w:t>
+      </w:r>
+    </w:p>
+    <w:p>
+      <w:pPr>
+        <w:spacing w:after="0" w:line="312"/>
+        <w:ind w:firstLine="340"/>
+        <w:jc w:val="both"/>
+      </w:pPr>
+      <w:r>
+        <w:rPr>
+          <w:rFonts w:ascii="Georgia" w:cs="Georgia" w:eastAsia="Georgia" w:hAnsi="Georgia"/>
+          <w:sz w:val="21"/>
+          <w:szCs w:val="21"/>
+        </w:rPr>
+        <w:t xml:space="preserve">Foi nessa hora, enquanto o policial fechava as algemas nos pulsos dele, que Henrique olhou para cima. Não sabia por quê. Talvez para não olhar para o corpo. Olhou para o paredão espelhado do outro lado da rua, o prédio que nunca ninguém olhava, e teve a impressão de ver, lá no alto, numa das janelas do décimo segundo andar, uma persiana se fechar.</w:t>
+      </w:r>
+    </w:p>
+    <w:p>
+      <w:pPr>
+        <w:spacing w:after="0" w:line="312"/>
+        <w:ind w:firstLine="340"/>
+        <w:jc w:val="both"/>
+      </w:pPr>
+      <w:r>
+        <w:rPr>
+          <w:rFonts w:ascii="Georgia" w:cs="Georgia" w:eastAsia="Georgia" w:hAnsi="Georgia"/>
+          <w:sz w:val="21"/>
+          <w:szCs w:val="21"/>
+        </w:rPr>
+        <w:t xml:space="preserve">Piscou. A persiana estava fechada. Talvez sempre tivesse estado.</w:t>
+      </w:r>
+    </w:p>
+    <w:p>
+      <w:pPr>
+        <w:spacing w:after="0" w:line="312"/>
+        <w:ind w:firstLine="340"/>
+        <w:jc w:val="both"/>
+      </w:pPr>
+      <w:r>
+        <w:rPr>
+          <w:rFonts w:ascii="Georgia" w:cs="Georgia" w:eastAsia="Georgia" w:hAnsi="Georgia"/>
+          <w:sz w:val="21"/>
+          <w:szCs w:val="21"/>
+        </w:rPr>
+        <w:t xml:space="preserve">Um fotógrafo que almoçava duas mesas adiante já estava de pé, com a câmera na mão.</w:t>
+      </w:r>
+    </w:p>
+    <w:p>
+      <w:pPr>
+        <w:spacing w:after="200" w:before="200"/>
+        <w:jc w:val="center"/>
+      </w:pPr>
+      <w:r>
+        <w:rPr>
+          <w:rFonts w:ascii="Georgia" w:cs="Georgia" w:eastAsia="Georgia" w:hAnsi="Georgia"/>
+          <w:sz w:val="22"/>
+          <w:szCs w:val="22"/>
+        </w:rPr>
+        <w:t xml:space="preserve">*</w:t>
+      </w:r>
+    </w:p>
+    <w:p>
+      <w:pPr>
+        <w:spacing w:after="0" w:line="312"/>
+        <w:ind w:firstLine="340"/>
+        <w:jc w:val="both"/>
+      </w:pPr>
+      <w:r>
+        <w:rPr>
+          <w:rFonts w:ascii="Georgia" w:cs="Georgia" w:eastAsia="Georgia" w:hAnsi="Georgia"/>
+          <w:sz w:val="21"/>
+          <w:szCs w:val="21"/>
+        </w:rPr>
+        <w:t xml:space="preserve">Henrique passou duas noites numa cela do 78º Distrito Policial, nos Jardins.</w:t>
+      </w:r>
+    </w:p>
+    <w:p>
+      <w:pPr>
+        <w:spacing w:after="0" w:line="312"/>
+        <w:ind w:firstLine="340"/>
+        <w:jc w:val="both"/>
+      </w:pPr>
+      <w:r>
+        <w:rPr>
+          <w:rFonts w:ascii="Georgia" w:cs="Georgia" w:eastAsia="Georgia" w:hAnsi="Georgia"/>
+          <w:sz w:val="21"/>
+          <w:szCs w:val="21"/>
+        </w:rPr>
+        <w:t xml:space="preserve">O advogado da corretora conseguiu que ele ficasse sozinho, num banco de cimento, sob uma lâmpada que nunca se apagava. Ele não dormiu. Pensou em Marcelo caindo. Pensou na expressão de surpresa no rosto dele, antes da queda. Pensou que nunca tinha visto um homem morrer de um soco e que, se alguém tinha de morrer daquele jeito, o soco teria de ser muito mais forte do que o dele.</w:t>
+      </w:r>
+    </w:p>
+    <w:p>
+      <w:pPr>
+        <w:spacing w:after="0" w:line="312"/>
+        <w:ind w:firstLine="340"/>
+        <w:jc w:val="both"/>
+      </w:pPr>
+      <w:r>
+        <w:rPr>
+          <w:rFonts w:ascii="Georgia" w:cs="Georgia" w:eastAsia="Georgia" w:hAnsi="Georgia"/>
+          <w:sz w:val="21"/>
+          <w:szCs w:val="21"/>
+        </w:rPr>
+        <w:t xml:space="preserve">Na manhã do terceiro dia, a porta da cela se abriu e a delegada Regina Paiva entrou, com uma pasta debaixo do braço.</w:t>
+      </w:r>
+    </w:p>
+    <w:p>
+      <w:pPr>
+        <w:spacing w:after="0" w:line="312"/>
+        <w:ind w:firstLine="340"/>
+        <w:jc w:val="both"/>
+      </w:pPr>
+      <w:r>
+        <w:rPr>
+          <w:rFonts w:ascii="Georgia" w:cs="Georgia" w:eastAsia="Georgia" w:hAnsi="Georgia"/>
+          <w:sz w:val="21"/>
+          <w:szCs w:val="21"/>
+        </w:rPr>
+        <w:t xml:space="preserve">— Bom dia, senhor Salvallus. Nos encontramos de novo.</w:t>
+      </w:r>
+    </w:p>
+    <w:p>
+      <w:pPr>
+        <w:spacing w:after="0" w:line="312"/>
+        <w:ind w:firstLine="340"/>
+        <w:jc w:val="both"/>
+      </w:pPr>
+      <w:r>
+        <w:rPr>
+          <w:rFonts w:ascii="Georgia" w:cs="Georgia" w:eastAsia="Georgia" w:hAnsi="Georgia"/>
+          <w:sz w:val="21"/>
+          <w:szCs w:val="21"/>
+        </w:rPr>
+        <w:t xml:space="preserve">— Não é um bom dia.</w:t>
+      </w:r>
+    </w:p>
+    <w:p>
+      <w:pPr>
+        <w:spacing w:after="0" w:line="312"/>
+        <w:ind w:firstLine="340"/>
+        <w:jc w:val="both"/>
+      </w:pPr>
+      <w:r>
+        <w:rPr>
+          <w:rFonts w:ascii="Georgia" w:cs="Georgia" w:eastAsia="Georgia" w:hAnsi="Georgia"/>
+          <w:sz w:val="21"/>
+          <w:szCs w:val="21"/>
+        </w:rPr>
+        <w:t xml:space="preserve">— Para o senhor, talvez seja. — Ela abriu a pasta. — O laudo do IML chegou há uma hora. Marcelo Duarte não morreu do soco, nem da queda. Morreu com um tiro na nuca. Calibre de fuzil, disparado de longe, de cima para baixo. A bala entrou atrás da orelha esquerda. O cabelo e o sangue da queda esconderam o furo.</w:t>
+      </w:r>
+    </w:p>
+    <w:p>
+      <w:pPr>
+        <w:spacing w:after="0" w:line="312"/>
+        <w:ind w:firstLine="340"/>
+        <w:jc w:val="both"/>
+      </w:pPr>
+      <w:r>
+        <w:rPr>
+          <w:rFonts w:ascii="Georgia" w:cs="Georgia" w:eastAsia="Georgia" w:hAnsi="Georgia"/>
+          <w:sz w:val="21"/>
+          <w:szCs w:val="21"/>
+        </w:rPr>
+        <w:t xml:space="preserve">Henrique ficou olhando para ela.</w:t>
+      </w:r>
+    </w:p>
+    <w:p>
+      <w:pPr>
+        <w:spacing w:after="0" w:line="312"/>
+        <w:ind w:firstLine="340"/>
+        <w:jc w:val="both"/>
+      </w:pPr>
+      <w:r>
+        <w:rPr>
+          <w:rFonts w:ascii="Georgia" w:cs="Georgia" w:eastAsia="Georgia" w:hAnsi="Georgia"/>
+          <w:sz w:val="21"/>
+          <w:szCs w:val="21"/>
+        </w:rPr>
+        <w:t xml:space="preserve">— O senhor está solto — continuou Regina. — Mas preste atenção ao que vou dizer. O senhor e Marcelo estavam agarrados, com os rostos a menos de um palmo. Um atirador de longe, mirando um dos dois, podia acertar qualquer um. — Ela fechou a pasta. — Então eu tenho duas perguntas, e o senhor não precisa responder agora. Quem mandaria atirar em Marcelo Duarte justamente quando ele estava abraçado ao senhor? E quem mandaria atirar no senhor justamente quando havia outro homem na frente?</w:t>
+      </w:r>
+    </w:p>
+    <w:p>
+      <w:pPr>
+        <w:spacing w:after="200" w:before="200"/>
+        <w:jc w:val="center"/>
+      </w:pPr>
+      <w:r>
+        <w:rPr>
+          <w:rFonts w:ascii="Georgia" w:cs="Georgia" w:eastAsia="Georgia" w:hAnsi="Georgia"/>
+          <w:sz w:val="22"/>
+          <w:szCs w:val="22"/>
+        </w:rPr>
+        <w:t xml:space="preserve">*</w:t>
+      </w:r>
+    </w:p>
+    <w:p>
+      <w:pPr>
+        <w:spacing w:after="0" w:line="312"/>
+        <w:ind w:firstLine="340"/>
+        <w:jc w:val="both"/>
+      </w:pPr>
+      <w:r>
+        <w:rPr>
+          <w:rFonts w:ascii="Georgia" w:cs="Georgia" w:eastAsia="Georgia" w:hAnsi="Georgia"/>
+          <w:sz w:val="21"/>
+          <w:szCs w:val="21"/>
+        </w:rPr>
+        <w:t xml:space="preserve">Henrique voltou para a corretora naquela tarde, com a barba por fazer e o paletó do advogado, dois números maior.</w:t>
+      </w:r>
+    </w:p>
+    <w:p>
+      <w:pPr>
+        <w:spacing w:after="0" w:line="312"/>
+        <w:ind w:firstLine="340"/>
+        <w:jc w:val="both"/>
+      </w:pPr>
+      <w:r>
+        <w:rPr>
+          <w:rFonts w:ascii="Georgia" w:cs="Georgia" w:eastAsia="Georgia" w:hAnsi="Georgia"/>
+          <w:sz w:val="21"/>
+          <w:szCs w:val="21"/>
+        </w:rPr>
+        <w:t xml:space="preserve">Otávio o esperava na porta da sala. Abraçou-o com força, dois tapas nas costas, e só então disse:</w:t>
+      </w:r>
+    </w:p>
+    <w:p>
+      <w:pPr>
+        <w:spacing w:after="0" w:line="312"/>
+        <w:ind w:firstLine="340"/>
+        <w:jc w:val="both"/>
+      </w:pPr>
+      <w:r>
+        <w:rPr>
+          <w:rFonts w:ascii="Georgia" w:cs="Georgia" w:eastAsia="Georgia" w:hAnsi="Georgia"/>
+          <w:sz w:val="21"/>
+          <w:szCs w:val="21"/>
+        </w:rPr>
+        <w:t xml:space="preserve">— Viu a televisão?</w:t>
+      </w:r>
+    </w:p>
+    <w:p>
+      <w:pPr>
+        <w:spacing w:after="0" w:line="312"/>
+        <w:ind w:firstLine="340"/>
+        <w:jc w:val="both"/>
+      </w:pPr>
+      <w:r>
+        <w:rPr>
+          <w:rFonts w:ascii="Georgia" w:cs="Georgia" w:eastAsia="Georgia" w:hAnsi="Georgia"/>
+          <w:sz w:val="21"/>
+          <w:szCs w:val="21"/>
+        </w:rPr>
+        <w:t xml:space="preserve">— Passei dois dias numa cela, Otávio. A televisão de lá não funcionava.</w:t>
+      </w:r>
+    </w:p>
+    <w:p>
+      <w:pPr>
+        <w:spacing w:after="0" w:line="312"/>
+        <w:ind w:firstLine="340"/>
+        <w:jc w:val="both"/>
+      </w:pPr>
+      <w:r>
+        <w:rPr>
+          <w:rFonts w:ascii="Georgia" w:cs="Georgia" w:eastAsia="Georgia" w:hAnsi="Georgia"/>
+          <w:sz w:val="21"/>
+          <w:szCs w:val="21"/>
+        </w:rPr>
+        <w:t xml:space="preserve">O sócio pegou o controle e ligou o aparelho da sala de reuniões. Era a reprise do noticiário do meio-dia. Na tela, a foto que o fotógrafo tinha tirado: Henrique algemado, o paletó rasgado, o rosto inchado. Depois a notícia do laudo, a bala, a soltura. E, por fim, uma entrevista gravada na porta da Assembleia Legislativa.</w:t>
+      </w:r>
+    </w:p>
+    <w:p>
+      <w:pPr>
+        <w:spacing w:after="0" w:line="312"/>
+        <w:ind w:firstLine="340"/>
+        <w:jc w:val="both"/>
+      </w:pPr>
+      <w:r>
+        <w:rPr>
+          <w:rFonts w:ascii="Georgia" w:cs="Georgia" w:eastAsia="Georgia" w:hAnsi="Georgia"/>
+          <w:sz w:val="21"/>
+          <w:szCs w:val="21"/>
+        </w:rPr>
+        <w:t xml:space="preserve">Rubens Falcão, de terno azul e gravata vermelha, falava para três microfones com a calma de quem já tinha ensaiado a indignação.</w:t>
+      </w:r>
+    </w:p>
+    <w:p>
+      <w:pPr>
+        <w:spacing w:after="0" w:line="312"/>
+        <w:ind w:firstLine="340"/>
+        <w:jc w:val="both"/>
+      </w:pPr>
+      <w:r>
+        <w:rPr>
+          <w:rFonts w:ascii="Georgia" w:cs="Georgia" w:eastAsia="Georgia" w:hAnsi="Georgia"/>
+          <w:sz w:val="21"/>
+          <w:szCs w:val="21"/>
+        </w:rPr>
+        <w:t xml:space="preserve">— Eu não acuso ninguém. Quem acusa é a polícia. Mas a população tem o direito de pensar. Em três meses, duas pessoas morrem ao lado do mesmo empresário. Um funcionário humilde, num motel, e agora um pai de família, na porta de um restaurante. — Ele abriu os braços. — Ninguém escapa de duas tentativas de homicídio seguidas enquanto os outros morrem no lugar dele. Não existe sorte assim. Ou o senhor Henrique Salvallus sabia de tudo, ou ele é imorrível!</w:t>
+      </w:r>
+    </w:p>
+    <w:p>
+      <w:pPr>
+        <w:spacing w:after="0" w:line="312"/>
+        <w:ind w:firstLine="340"/>
+        <w:jc w:val="both"/>
+      </w:pPr>
+      <w:r>
+        <w:rPr>
+          <w:rFonts w:ascii="Georgia" w:cs="Georgia" w:eastAsia="Georgia" w:hAnsi="Georgia"/>
+          <w:sz w:val="21"/>
+          <w:szCs w:val="21"/>
+        </w:rPr>
+        <w:t xml:space="preserve">O repórter riu. Falcão também. Cortaram para a previsão do tempo.</w:t>
+      </w:r>
+    </w:p>
+    <w:p>
+      <w:pPr>
+        <w:spacing w:after="0" w:line="312"/>
+        <w:ind w:firstLine="340"/>
+        <w:jc w:val="both"/>
+      </w:pPr>
+      <w:r>
+        <w:rPr>
+          <w:rFonts w:ascii="Georgia" w:cs="Georgia" w:eastAsia="Georgia" w:hAnsi="Georgia"/>
+          <w:sz w:val="21"/>
+          <w:szCs w:val="21"/>
+        </w:rPr>
+        <w:t xml:space="preserve">Henrique continuou olhando para a tela, onde uma moça sorridente anunciava frio para o fim de semana.</w:t>
+      </w:r>
+    </w:p>
+    <w:p>
+      <w:pPr>
+        <w:spacing w:after="0" w:line="312"/>
+        <w:ind w:firstLine="340"/>
+        <w:jc w:val="both"/>
+      </w:pPr>
+      <w:r>
+        <w:rPr>
+          <w:rFonts w:ascii="Georgia" w:cs="Georgia" w:eastAsia="Georgia" w:hAnsi="Georgia"/>
+          <w:sz w:val="21"/>
+          <w:szCs w:val="21"/>
+        </w:rPr>
+        <w:t xml:space="preserve">— Esse Falcão fala demais — disse Otávio, desligando a televisão.</w:t>
+      </w:r>
+    </w:p>
+    <w:p>
+      <w:pPr>
+        <w:spacing w:after="0" w:line="312"/>
+        <w:ind w:firstLine="340"/>
+        <w:jc w:val="both"/>
+      </w:pPr>
+      <w:r>
+        <w:rPr>
+          <w:rFonts w:ascii="Georgia" w:cs="Georgia" w:eastAsia="Georgia" w:hAnsi="Georgia"/>
+          <w:sz w:val="21"/>
+          <w:szCs w:val="21"/>
+        </w:rPr>
+        <w:t xml:space="preserve">Henrique não respondeu. Estava pensando numa coisa que não conseguia explicar.</w:t>
+      </w:r>
+    </w:p>
+    <w:p>
+      <w:pPr>
+        <w:spacing w:after="0" w:line="312"/>
+        <w:ind w:firstLine="340"/>
+        <w:jc w:val="both"/>
+      </w:pPr>
+      <w:r>
+        <w:rPr>
+          <w:rFonts w:ascii="Georgia" w:cs="Georgia" w:eastAsia="Georgia" w:hAnsi="Georgia"/>
+          <w:sz w:val="21"/>
+          <w:szCs w:val="21"/>
+        </w:rPr>
+        <w:t xml:space="preserve">Ninguém tinha dito à imprensa que o motel tinha alguma coisa a ver com ele.</w:t>
       </w:r>
     </w:p>
     <w:sectPr>

</xml_diff>

<commit_message>
Livro policial: capítulo 7 (Sinistro 2006)
Co-Authored-By: Claude Opus 5.5 <noreply@anthropic.com>
Claude-Session: https://claude.ai/code/session_01BrurxSYygRC3rRhaUYosm1
</commit_message>
<xml_diff>
--- a/docs/livro-policial/TODO_CRIME_TEM_UM_AUTOR.docx
+++ b/docs/livro-policial/TODO_CRIME_TEM_UM_AUTOR.docx
@@ -5999,6 +5999,994 @@
           <w:szCs w:val="21"/>
         </w:rPr>
         <w:t xml:space="preserve">Ninguém tinha dito à imprensa que o motel tinha alguma coisa a ver com ele.</w:t>
+      </w:r>
+    </w:p>
+    <w:p>
+      <w:pPr>
+        <w:pageBreakBefore/>
+        <w:spacing w:after="120" w:before="1800"/>
+        <w:jc w:val="center"/>
+      </w:pPr>
+      <w:r>
+        <w:rPr>
+          <w:rFonts w:ascii="Georgia" w:cs="Georgia" w:eastAsia="Georgia" w:hAnsi="Georgia"/>
+          <w:spacing w:val="40"/>
+          <w:sz w:val="20"/>
+          <w:szCs w:val="20"/>
+        </w:rPr>
+        <w:t xml:space="preserve">CAPÍTULO 7</w:t>
+      </w:r>
+    </w:p>
+    <w:p>
+      <w:pPr>
+        <w:spacing w:after="720"/>
+        <w:jc w:val="center"/>
+      </w:pPr>
+      <w:r>
+        <w:rPr>
+          <w:rFonts w:ascii="Georgia" w:cs="Georgia" w:eastAsia="Georgia" w:hAnsi="Georgia"/>
+          <w:b/>
+          <w:bCs/>
+          <w:sz w:val="32"/>
+          <w:szCs w:val="32"/>
+        </w:rPr>
+        <w:t xml:space="preserve">Sinistro 2006</w:t>
+      </w:r>
+    </w:p>
+    <w:p>
+      <w:pPr>
+        <w:spacing w:after="0" w:line="312"/>
+        <w:ind w:firstLine="340"/>
+        <w:jc w:val="both"/>
+      </w:pPr>
+      <w:r>
+        <w:rPr>
+          <w:rFonts w:ascii="Georgia" w:cs="Georgia" w:eastAsia="Georgia" w:hAnsi="Georgia"/>
+          <w:sz w:val="21"/>
+          <w:szCs w:val="21"/>
+        </w:rPr>
+        <w:t xml:space="preserve">Helena abriu a porta da casa do Jardim Europa antes que Lia tocasse a campainha, como se estivesse esperando atrás dela.</w:t>
+      </w:r>
+    </w:p>
+    <w:p>
+      <w:pPr>
+        <w:spacing w:after="0" w:line="312"/>
+        <w:ind w:firstLine="340"/>
+        <w:jc w:val="both"/>
+      </w:pPr>
+      <w:r>
+        <w:rPr>
+          <w:rFonts w:ascii="Georgia" w:cs="Georgia" w:eastAsia="Georgia" w:hAnsi="Georgia"/>
+          <w:sz w:val="21"/>
+          <w:szCs w:val="21"/>
+        </w:rPr>
+        <w:t xml:space="preserve">— Os desenhos estão no escritório — disse, sem cumprimentar. — Na última gaveta do arquivo. Ele guardava tudo.</w:t>
+      </w:r>
+    </w:p>
+    <w:p>
+      <w:pPr>
+        <w:spacing w:after="0" w:line="312"/>
+        <w:ind w:firstLine="340"/>
+        <w:jc w:val="both"/>
+      </w:pPr>
+      <w:r>
+        <w:rPr>
+          <w:rFonts w:ascii="Georgia" w:cs="Georgia" w:eastAsia="Georgia" w:hAnsi="Georgia"/>
+          <w:sz w:val="21"/>
+          <w:szCs w:val="21"/>
+        </w:rPr>
+        <w:t xml:space="preserve">Era terça-feira, uma semana exata depois da morte. Lia tinha ligado na véspera pedindo para buscar os desenhos de infância que o pai guardava, os castelos e as casas de varanda que ela fazia aos oito anos e que, segundo ele, explicavam por que ela tinha virado arquiteta. Helena dissera que sim, num tom de quem diz que sim para encerrar uma conversa.</w:t>
+      </w:r>
+    </w:p>
+    <w:p>
+      <w:pPr>
+        <w:spacing w:after="0" w:line="312"/>
+        <w:ind w:firstLine="340"/>
+        <w:jc w:val="both"/>
+      </w:pPr>
+      <w:r>
+        <w:rPr>
+          <w:rFonts w:ascii="Georgia" w:cs="Georgia" w:eastAsia="Georgia" w:hAnsi="Georgia"/>
+          <w:sz w:val="21"/>
+          <w:szCs w:val="21"/>
+        </w:rPr>
+        <w:t xml:space="preserve">— Quer um café?</w:t>
+      </w:r>
+    </w:p>
+    <w:p>
+      <w:pPr>
+        <w:spacing w:after="0" w:line="312"/>
+        <w:ind w:firstLine="340"/>
+        <w:jc w:val="both"/>
+      </w:pPr>
+      <w:r>
+        <w:rPr>
+          <w:rFonts w:ascii="Georgia" w:cs="Georgia" w:eastAsia="Georgia" w:hAnsi="Georgia"/>
+          <w:sz w:val="21"/>
+          <w:szCs w:val="21"/>
+        </w:rPr>
+        <w:t xml:space="preserve">— Não, obrigada. Não vou demorar.</w:t>
+      </w:r>
+    </w:p>
+    <w:p>
+      <w:pPr>
+        <w:spacing w:after="0" w:line="312"/>
+        <w:ind w:firstLine="340"/>
+        <w:jc w:val="both"/>
+      </w:pPr>
+      <w:r>
+        <w:rPr>
+          <w:rFonts w:ascii="Georgia" w:cs="Georgia" w:eastAsia="Georgia" w:hAnsi="Georgia"/>
+          <w:sz w:val="21"/>
+          <w:szCs w:val="21"/>
+        </w:rPr>
+        <w:t xml:space="preserve">— Fique à vontade. — Helena cruzou os braços. — A casa ainda é um pouco sua.</w:t>
+      </w:r>
+    </w:p>
+    <w:p>
+      <w:pPr>
+        <w:spacing w:after="0" w:line="312"/>
+        <w:ind w:firstLine="340"/>
+        <w:jc w:val="both"/>
+      </w:pPr>
+      <w:r>
+        <w:rPr>
+          <w:rFonts w:ascii="Georgia" w:cs="Georgia" w:eastAsia="Georgia" w:hAnsi="Georgia"/>
+          <w:sz w:val="21"/>
+          <w:szCs w:val="21"/>
+        </w:rPr>
+        <w:t xml:space="preserve">Lia não soube se aquilo era gentileza ou aviso.</w:t>
+      </w:r>
+    </w:p>
+    <w:p>
+      <w:pPr>
+        <w:spacing w:after="200" w:before="200"/>
+        <w:jc w:val="center"/>
+      </w:pPr>
+      <w:r>
+        <w:rPr>
+          <w:rFonts w:ascii="Georgia" w:cs="Georgia" w:eastAsia="Georgia" w:hAnsi="Georgia"/>
+          <w:sz w:val="22"/>
+          <w:szCs w:val="22"/>
+        </w:rPr>
+        <w:t xml:space="preserve">*</w:t>
+      </w:r>
+    </w:p>
+    <w:p>
+      <w:pPr>
+        <w:spacing w:after="0" w:line="312"/>
+        <w:ind w:firstLine="340"/>
+        <w:jc w:val="both"/>
+      </w:pPr>
+      <w:r>
+        <w:rPr>
+          <w:rFonts w:ascii="Georgia" w:cs="Georgia" w:eastAsia="Georgia" w:hAnsi="Georgia"/>
+          <w:sz w:val="21"/>
+          <w:szCs w:val="21"/>
+        </w:rPr>
+        <w:t xml:space="preserve">O escritório do pai cheirava a ele: couro, papel velho, o perfume amadeirado que ele usava havia trinta anos. A cadeira estava afastada da mesa, como se ele tivesse acabado de se levantar. Lia ficou parada na porta por um tempo, sem coragem de entrar.</w:t>
+      </w:r>
+    </w:p>
+    <w:p>
+      <w:pPr>
+        <w:spacing w:after="0" w:line="312"/>
+        <w:ind w:firstLine="340"/>
+        <w:jc w:val="both"/>
+      </w:pPr>
+      <w:r>
+        <w:rPr>
+          <w:rFonts w:ascii="Georgia" w:cs="Georgia" w:eastAsia="Georgia" w:hAnsi="Georgia"/>
+          <w:sz w:val="21"/>
+          <w:szCs w:val="21"/>
+        </w:rPr>
+        <w:t xml:space="preserve">Depois entrou.</w:t>
+      </w:r>
+    </w:p>
+    <w:p>
+      <w:pPr>
+        <w:spacing w:after="0" w:line="312"/>
+        <w:ind w:firstLine="340"/>
+        <w:jc w:val="both"/>
+      </w:pPr>
+      <w:r>
+        <w:rPr>
+          <w:rFonts w:ascii="Georgia" w:cs="Georgia" w:eastAsia="Georgia" w:hAnsi="Georgia"/>
+          <w:sz w:val="21"/>
+          <w:szCs w:val="21"/>
+        </w:rPr>
+        <w:t xml:space="preserve">O arquivo de aço ficava no canto, quatro gavetas com etiquetas na letra inclinada do pai. Contratos. Imóveis. Pessoal. Sinistros. Os desenhos estavam na última, numa pasta de elástico, exatamente onde Helena dissera. Lia abriu a pasta e sentiu a garganta apertar. Castelos com bandeiras. Uma casa com doze janelas e nenhuma porta. Um homem de terno ao lado de uma menina, os dois sorrindo, e embaixo, com letra de criança: EU E O PAPAI NA CASA QUE EU VOU FAZER PRA ELE.</w:t>
+      </w:r>
+    </w:p>
+    <w:p>
+      <w:pPr>
+        <w:spacing w:after="0" w:line="312"/>
+        <w:ind w:firstLine="340"/>
+        <w:jc w:val="both"/>
+      </w:pPr>
+      <w:r>
+        <w:rPr>
+          <w:rFonts w:ascii="Georgia" w:cs="Georgia" w:eastAsia="Georgia" w:hAnsi="Georgia"/>
+          <w:sz w:val="21"/>
+          <w:szCs w:val="21"/>
+        </w:rPr>
+        <w:t xml:space="preserve">Guardou a pasta na bolsa e se virou para sair.</w:t>
+      </w:r>
+    </w:p>
+    <w:p>
+      <w:pPr>
+        <w:spacing w:after="0" w:line="312"/>
+        <w:ind w:firstLine="340"/>
+        <w:jc w:val="both"/>
+      </w:pPr>
+      <w:r>
+        <w:rPr>
+          <w:rFonts w:ascii="Georgia" w:cs="Georgia" w:eastAsia="Georgia" w:hAnsi="Georgia"/>
+          <w:sz w:val="21"/>
+          <w:szCs w:val="21"/>
+        </w:rPr>
+        <w:t xml:space="preserve">Foi então que viu a gaveta de cima.</w:t>
+      </w:r>
+    </w:p>
+    <w:p>
+      <w:pPr>
+        <w:spacing w:after="0" w:line="312"/>
+        <w:ind w:firstLine="340"/>
+        <w:jc w:val="both"/>
+      </w:pPr>
+      <w:r>
+        <w:rPr>
+          <w:rFonts w:ascii="Georgia" w:cs="Georgia" w:eastAsia="Georgia" w:hAnsi="Georgia"/>
+          <w:sz w:val="21"/>
+          <w:szCs w:val="21"/>
+        </w:rPr>
+        <w:t xml:space="preserve">A etiqueta dizia Sinistros. Estava aberta, dois dedos, o suficiente para mostrar que alguém tinha mexido ali e não fechara direito. O pai nunca deixava uma gaveta aberta. Era o tipo de homem que voltava do carro para conferir se tinha trancado a porta.</w:t>
+      </w:r>
+    </w:p>
+    <w:p>
+      <w:pPr>
+        <w:spacing w:after="0" w:line="312"/>
+        <w:ind w:firstLine="340"/>
+        <w:jc w:val="both"/>
+      </w:pPr>
+      <w:r>
+        <w:rPr>
+          <w:rFonts w:ascii="Georgia" w:cs="Georgia" w:eastAsia="Georgia" w:hAnsi="Georgia"/>
+          <w:sz w:val="21"/>
+          <w:szCs w:val="21"/>
+        </w:rPr>
+        <w:t xml:space="preserve">Lia olhou para o corredor. Ouviu, lá embaixo, a voz de Helena ao telefone, baixa, e o tilintar de uma colher numa xícara.</w:t>
+      </w:r>
+    </w:p>
+    <w:p>
+      <w:pPr>
+        <w:spacing w:after="0" w:line="312"/>
+        <w:ind w:firstLine="340"/>
+        <w:jc w:val="both"/>
+      </w:pPr>
+      <w:r>
+        <w:rPr>
+          <w:rFonts w:ascii="Georgia" w:cs="Georgia" w:eastAsia="Georgia" w:hAnsi="Georgia"/>
+          <w:sz w:val="21"/>
+          <w:szCs w:val="21"/>
+        </w:rPr>
+        <w:t xml:space="preserve">Abriu a gaveta.</w:t>
+      </w:r>
+    </w:p>
+    <w:p>
+      <w:pPr>
+        <w:spacing w:after="200" w:before="200"/>
+        <w:jc w:val="center"/>
+      </w:pPr>
+      <w:r>
+        <w:rPr>
+          <w:rFonts w:ascii="Georgia" w:cs="Georgia" w:eastAsia="Georgia" w:hAnsi="Georgia"/>
+          <w:sz w:val="22"/>
+          <w:szCs w:val="22"/>
+        </w:rPr>
+        <w:t xml:space="preserve">*</w:t>
+      </w:r>
+    </w:p>
+    <w:p>
+      <w:pPr>
+        <w:spacing w:after="0" w:line="312"/>
+        <w:ind w:firstLine="340"/>
+        <w:jc w:val="both"/>
+      </w:pPr>
+      <w:r>
+        <w:rPr>
+          <w:rFonts w:ascii="Georgia" w:cs="Georgia" w:eastAsia="Georgia" w:hAnsi="Georgia"/>
+          <w:sz w:val="21"/>
+          <w:szCs w:val="21"/>
+        </w:rPr>
+        <w:t xml:space="preserve">As pastas estavam em ordem alfabética, todas iguais, verdes, com o nome do cliente e o ano na lombada. Todas, menos uma. Uma pasta estava fora do lugar, deitada por cima das outras, como se alguém a tivesse tirado, lido e devolvido às pressas.</w:t>
+      </w:r>
+    </w:p>
+    <w:p>
+      <w:pPr>
+        <w:spacing w:after="0" w:line="312"/>
+        <w:ind w:firstLine="340"/>
+        <w:jc w:val="both"/>
+      </w:pPr>
+      <w:r>
+        <w:rPr>
+          <w:rFonts w:ascii="Georgia" w:cs="Georgia" w:eastAsia="Georgia" w:hAnsi="Georgia"/>
+          <w:sz w:val="21"/>
+          <w:szCs w:val="21"/>
+        </w:rPr>
+        <w:t xml:space="preserve">TÊXTIL FERRAZ — AMERICANA — 2006. E, embaixo, um carimbo vermelho: NEGADO.</w:t>
+      </w:r>
+    </w:p>
+    <w:p>
+      <w:pPr>
+        <w:spacing w:after="0" w:line="312"/>
+        <w:ind w:firstLine="340"/>
+        <w:jc w:val="both"/>
+      </w:pPr>
+      <w:r>
+        <w:rPr>
+          <w:rFonts w:ascii="Georgia" w:cs="Georgia" w:eastAsia="Georgia" w:hAnsi="Georgia"/>
+          <w:sz w:val="21"/>
+          <w:szCs w:val="21"/>
+        </w:rPr>
+        <w:t xml:space="preserve">Lia abriu.</w:t>
+      </w:r>
+    </w:p>
+    <w:p>
+      <w:pPr>
+        <w:spacing w:after="0" w:line="312"/>
+        <w:ind w:firstLine="340"/>
+        <w:jc w:val="both"/>
+      </w:pPr>
+      <w:r>
+        <w:rPr>
+          <w:rFonts w:ascii="Georgia" w:cs="Georgia" w:eastAsia="Georgia" w:hAnsi="Georgia"/>
+          <w:sz w:val="21"/>
+          <w:szCs w:val="21"/>
+        </w:rPr>
+        <w:t xml:space="preserve">Era o processo de um incêndio. Uma fábrica de tecidos em Americana, no interior, destruída numa madrugada de março. As fotos mostravam um galpão enorme reduzido a vigas retorcidas e paredes pretas. O laudo da corretora tinha dezenas de páginas, e Lia, que lia plantas e memoriais descritivos todos os dias, entendeu o essencial em poucos minutos: o seguro fora negado porque a fábrica tinha feito uma reforma elétrica sem comunicar à seguradora. Uma cláusula na página catorze do contrato, em letra miúda. Tecnicamente correto. Humanamente devastador.</w:t>
+      </w:r>
+    </w:p>
+    <w:p>
+      <w:pPr>
+        <w:spacing w:after="0" w:line="312"/>
+        <w:ind w:firstLine="340"/>
+        <w:jc w:val="both"/>
+      </w:pPr>
+      <w:r>
+        <w:rPr>
+          <w:rFonts w:ascii="Georgia" w:cs="Georgia" w:eastAsia="Georgia" w:hAnsi="Georgia"/>
+          <w:sz w:val="21"/>
+          <w:szCs w:val="21"/>
+        </w:rPr>
+        <w:t xml:space="preserve">No final da pasta, um recorte de jornal, já amarelado. Empresário de Americana perde fábrica e indenização. A foto mostrava um homem de uns sessenta anos, de pé diante das ruínas, com as mãos na cintura. A legenda dizia Raul Ferraz, fundador da Têxtil Ferraz. A data do incêndio estava no alto do laudo, sublinhada a caneta: 14 de março de 2006.</w:t>
+      </w:r>
+    </w:p>
+    <w:p>
+      <w:pPr>
+        <w:spacing w:after="0" w:line="312"/>
+        <w:ind w:firstLine="340"/>
+        <w:jc w:val="both"/>
+      </w:pPr>
+      <w:r>
+        <w:rPr>
+          <w:rFonts w:ascii="Georgia" w:cs="Georgia" w:eastAsia="Georgia" w:hAnsi="Georgia"/>
+          <w:sz w:val="21"/>
+          <w:szCs w:val="21"/>
+        </w:rPr>
+        <w:t xml:space="preserve">E havia mais uma coisa. Presa com um clipe à contracapa, uma fotografia antiga, colorida, de festa: a inauguração da fábrica, anos antes. Raul Ferraz mais jovem, cortando uma fita. Ao lado dele, uma mulher de vestido florido. E, na frente dos dois, uma menina de uns doze anos, de cabelo curto, segurando a tesoura.</w:t>
+      </w:r>
+    </w:p>
+    <w:p>
+      <w:pPr>
+        <w:spacing w:after="0" w:line="312"/>
+        <w:ind w:firstLine="340"/>
+        <w:jc w:val="both"/>
+      </w:pPr>
+      <w:r>
+        <w:rPr>
+          <w:rFonts w:ascii="Georgia" w:cs="Georgia" w:eastAsia="Georgia" w:hAnsi="Georgia"/>
+          <w:sz w:val="21"/>
+          <w:szCs w:val="21"/>
+        </w:rPr>
+        <w:t xml:space="preserve">Lia aproximou a foto da janela.</w:t>
+      </w:r>
+    </w:p>
+    <w:p>
+      <w:pPr>
+        <w:spacing w:after="0" w:line="312"/>
+        <w:ind w:firstLine="340"/>
+        <w:jc w:val="both"/>
+      </w:pPr>
+      <w:r>
+        <w:rPr>
+          <w:rFonts w:ascii="Georgia" w:cs="Georgia" w:eastAsia="Georgia" w:hAnsi="Georgia"/>
+          <w:sz w:val="21"/>
+          <w:szCs w:val="21"/>
+        </w:rPr>
+        <w:t xml:space="preserve">A menina tinha uma pinta pequena no canto esquerdo do queixo. Lia já tinha visto aquela pinta. Tinha visto naquela mesma casa, na semana anterior, de perto, quando Helena se inclinara sobre o caixão do pai.</w:t>
+      </w:r>
+    </w:p>
+    <w:p>
+      <w:pPr>
+        <w:spacing w:after="0" w:line="312"/>
+        <w:ind w:firstLine="340"/>
+        <w:jc w:val="both"/>
+      </w:pPr>
+      <w:r>
+        <w:rPr>
+          <w:rFonts w:ascii="Georgia" w:cs="Georgia" w:eastAsia="Georgia" w:hAnsi="Georgia"/>
+          <w:sz w:val="21"/>
+          <w:szCs w:val="21"/>
+        </w:rPr>
+        <w:t xml:space="preserve">— Achou os desenhos?</w:t>
+      </w:r>
+    </w:p>
+    <w:p>
+      <w:pPr>
+        <w:spacing w:after="0" w:line="312"/>
+        <w:ind w:firstLine="340"/>
+        <w:jc w:val="both"/>
+      </w:pPr>
+      <w:r>
+        <w:rPr>
+          <w:rFonts w:ascii="Georgia" w:cs="Georgia" w:eastAsia="Georgia" w:hAnsi="Georgia"/>
+          <w:sz w:val="21"/>
+          <w:szCs w:val="21"/>
+        </w:rPr>
+        <w:t xml:space="preserve">Lia quase deixou a pasta cair. Helena estava na porta do escritório, com a xícara de café na mão.</w:t>
+      </w:r>
+    </w:p>
+    <w:p>
+      <w:pPr>
+        <w:spacing w:after="0" w:line="312"/>
+        <w:ind w:firstLine="340"/>
+        <w:jc w:val="both"/>
+      </w:pPr>
+      <w:r>
+        <w:rPr>
+          <w:rFonts w:ascii="Georgia" w:cs="Georgia" w:eastAsia="Georgia" w:hAnsi="Georgia"/>
+          <w:sz w:val="21"/>
+          <w:szCs w:val="21"/>
+        </w:rPr>
+        <w:t xml:space="preserve">— Achei — disse Lia, fechando a gaveta com o quadril. A pasta verde estava dentro da bolsa, junto com os castelos e a casa de doze janelas. Não sabia em que momento tinha decidido levá-la. — Estavam onde você disse.</w:t>
+      </w:r>
+    </w:p>
+    <w:p>
+      <w:pPr>
+        <w:spacing w:after="0" w:line="312"/>
+        <w:ind w:firstLine="340"/>
+        <w:jc w:val="both"/>
+      </w:pPr>
+      <w:r>
+        <w:rPr>
+          <w:rFonts w:ascii="Georgia" w:cs="Georgia" w:eastAsia="Georgia" w:hAnsi="Georgia"/>
+          <w:sz w:val="21"/>
+          <w:szCs w:val="21"/>
+        </w:rPr>
+        <w:t xml:space="preserve">Helena olhou para a gaveta de cima. Depois para Lia. Depois para a bolsa.</w:t>
+      </w:r>
+    </w:p>
+    <w:p>
+      <w:pPr>
+        <w:spacing w:after="0" w:line="312"/>
+        <w:ind w:firstLine="340"/>
+        <w:jc w:val="both"/>
+      </w:pPr>
+      <w:r>
+        <w:rPr>
+          <w:rFonts w:ascii="Georgia" w:cs="Georgia" w:eastAsia="Georgia" w:hAnsi="Georgia"/>
+          <w:sz w:val="21"/>
+          <w:szCs w:val="21"/>
+        </w:rPr>
+        <w:t xml:space="preserve">— Que bom — disse. — Ele ia gostar de saber que você levou.</w:t>
+      </w:r>
+    </w:p>
+    <w:p>
+      <w:pPr>
+        <w:spacing w:after="200" w:before="200"/>
+        <w:jc w:val="center"/>
+      </w:pPr>
+      <w:r>
+        <w:rPr>
+          <w:rFonts w:ascii="Georgia" w:cs="Georgia" w:eastAsia="Georgia" w:hAnsi="Georgia"/>
+          <w:sz w:val="22"/>
+          <w:szCs w:val="22"/>
+        </w:rPr>
+        <w:t xml:space="preserve">*</w:t>
+      </w:r>
+    </w:p>
+    <w:p>
+      <w:pPr>
+        <w:spacing w:after="0" w:line="312"/>
+        <w:ind w:firstLine="340"/>
+        <w:jc w:val="both"/>
+      </w:pPr>
+      <w:r>
+        <w:rPr>
+          <w:rFonts w:ascii="Georgia" w:cs="Georgia" w:eastAsia="Georgia" w:hAnsi="Georgia"/>
+          <w:sz w:val="21"/>
+          <w:szCs w:val="21"/>
+        </w:rPr>
+        <w:t xml:space="preserve">Lia ligou para Lucas do carro, ainda na rua da casa, com as mãos tremendo no volante.</w:t>
+      </w:r>
+    </w:p>
+    <w:p>
+      <w:pPr>
+        <w:spacing w:after="0" w:line="312"/>
+        <w:ind w:firstLine="340"/>
+        <w:jc w:val="both"/>
+      </w:pPr>
+      <w:r>
+        <w:rPr>
+          <w:rFonts w:ascii="Georgia" w:cs="Georgia" w:eastAsia="Georgia" w:hAnsi="Georgia"/>
+          <w:sz w:val="21"/>
+          <w:szCs w:val="21"/>
+        </w:rPr>
+        <w:t xml:space="preserve">— Você está com o celular do pai aí?</w:t>
+      </w:r>
+    </w:p>
+    <w:p>
+      <w:pPr>
+        <w:spacing w:after="0" w:line="312"/>
+        <w:ind w:firstLine="340"/>
+        <w:jc w:val="both"/>
+      </w:pPr>
+      <w:r>
+        <w:rPr>
+          <w:rFonts w:ascii="Georgia" w:cs="Georgia" w:eastAsia="Georgia" w:hAnsi="Georgia"/>
+          <w:sz w:val="21"/>
+          <w:szCs w:val="21"/>
+        </w:rPr>
+        <w:t xml:space="preserve">— Estou. Por quê?</w:t>
+      </w:r>
+    </w:p>
+    <w:p>
+      <w:pPr>
+        <w:spacing w:after="0" w:line="312"/>
+        <w:ind w:firstLine="340"/>
+        <w:jc w:val="both"/>
+      </w:pPr>
+      <w:r>
+        <w:rPr>
+          <w:rFonts w:ascii="Georgia" w:cs="Georgia" w:eastAsia="Georgia" w:hAnsi="Georgia"/>
+          <w:sz w:val="21"/>
+          <w:szCs w:val="21"/>
+        </w:rPr>
+        <w:t xml:space="preserve">— Tem alguma coisa nele sobre uma fábrica em Americana? Têxtil Ferraz. Um incêndio em 2006.</w:t>
+      </w:r>
+    </w:p>
+    <w:p>
+      <w:pPr>
+        <w:spacing w:after="0" w:line="312"/>
+        <w:ind w:firstLine="340"/>
+        <w:jc w:val="both"/>
+      </w:pPr>
+      <w:r>
+        <w:rPr>
+          <w:rFonts w:ascii="Georgia" w:cs="Georgia" w:eastAsia="Georgia" w:hAnsi="Georgia"/>
+          <w:sz w:val="21"/>
+          <w:szCs w:val="21"/>
+        </w:rPr>
+        <w:t xml:space="preserve">Lucas ficou em silêncio. Lia ouviu o barulho de teclas.</w:t>
+      </w:r>
+    </w:p>
+    <w:p>
+      <w:pPr>
+        <w:spacing w:after="0" w:line="312"/>
+        <w:ind w:firstLine="340"/>
+        <w:jc w:val="both"/>
+      </w:pPr>
+      <w:r>
+        <w:rPr>
+          <w:rFonts w:ascii="Georgia" w:cs="Georgia" w:eastAsia="Georgia" w:hAnsi="Georgia"/>
+          <w:sz w:val="21"/>
+          <w:szCs w:val="21"/>
+        </w:rPr>
+        <w:t xml:space="preserve">— Não. Nada com esse nome. — Uma pausa. — Mas tem uma coisa que eu não te falei. Tem uma pasta protegida no celular. Um desses programas que escondem mensagens. Ela pede uma senha, e não é o ramal. Eu tentei de tudo.</w:t>
+      </w:r>
+    </w:p>
+    <w:p>
+      <w:pPr>
+        <w:spacing w:after="0" w:line="312"/>
+        <w:ind w:firstLine="340"/>
+        <w:jc w:val="both"/>
+      </w:pPr>
+      <w:r>
+        <w:rPr>
+          <w:rFonts w:ascii="Georgia" w:cs="Georgia" w:eastAsia="Georgia" w:hAnsi="Georgia"/>
+          <w:sz w:val="21"/>
+          <w:szCs w:val="21"/>
+        </w:rPr>
+        <w:t xml:space="preserve">— Tenta uma data — disse Lia. — Catorze de março de 2006.</w:t>
+      </w:r>
+    </w:p>
+    <w:p>
+      <w:pPr>
+        <w:spacing w:after="0" w:line="312"/>
+        <w:ind w:firstLine="340"/>
+        <w:jc w:val="both"/>
+      </w:pPr>
+      <w:r>
+        <w:rPr>
+          <w:rFonts w:ascii="Georgia" w:cs="Georgia" w:eastAsia="Georgia" w:hAnsi="Georgia"/>
+          <w:sz w:val="21"/>
+          <w:szCs w:val="21"/>
+        </w:rPr>
+        <w:t xml:space="preserve">— Quatro dígitos?</w:t>
+      </w:r>
+    </w:p>
+    <w:p>
+      <w:pPr>
+        <w:spacing w:after="0" w:line="312"/>
+        <w:ind w:firstLine="340"/>
+        <w:jc w:val="both"/>
+      </w:pPr>
+      <w:r>
+        <w:rPr>
+          <w:rFonts w:ascii="Georgia" w:cs="Georgia" w:eastAsia="Georgia" w:hAnsi="Georgia"/>
+          <w:sz w:val="21"/>
+          <w:szCs w:val="21"/>
+        </w:rPr>
+        <w:t xml:space="preserve">— Dia e mês. Um, quatro, zero, três.</w:t>
+      </w:r>
+    </w:p>
+    <w:p>
+      <w:pPr>
+        <w:spacing w:after="0" w:line="312"/>
+        <w:ind w:firstLine="340"/>
+        <w:jc w:val="both"/>
+      </w:pPr>
+      <w:r>
+        <w:rPr>
+          <w:rFonts w:ascii="Georgia" w:cs="Georgia" w:eastAsia="Georgia" w:hAnsi="Georgia"/>
+          <w:sz w:val="21"/>
+          <w:szCs w:val="21"/>
+        </w:rPr>
+        <w:t xml:space="preserve">Ela ouviu o irmão respirar do outro lado da linha. Ouviu as teclas. Depois, nada.</w:t>
+      </w:r>
+    </w:p>
+    <w:p>
+      <w:pPr>
+        <w:spacing w:after="0" w:line="312"/>
+        <w:ind w:firstLine="340"/>
+        <w:jc w:val="both"/>
+      </w:pPr>
+      <w:r>
+        <w:rPr>
+          <w:rFonts w:ascii="Georgia" w:cs="Georgia" w:eastAsia="Georgia" w:hAnsi="Georgia"/>
+          <w:sz w:val="21"/>
+          <w:szCs w:val="21"/>
+        </w:rPr>
+        <w:t xml:space="preserve">— Lucas?</w:t>
+      </w:r>
+    </w:p>
+    <w:p>
+      <w:pPr>
+        <w:spacing w:after="0" w:line="312"/>
+        <w:ind w:firstLine="340"/>
+        <w:jc w:val="both"/>
+      </w:pPr>
+      <w:r>
+        <w:rPr>
+          <w:rFonts w:ascii="Georgia" w:cs="Georgia" w:eastAsia="Georgia" w:hAnsi="Georgia"/>
+          <w:sz w:val="21"/>
+          <w:szCs w:val="21"/>
+        </w:rPr>
+        <w:t xml:space="preserve">— Abriu.</w:t>
+      </w:r>
+    </w:p>
+    <w:p>
+      <w:pPr>
+        <w:spacing w:after="200" w:before="200"/>
+        <w:jc w:val="center"/>
+      </w:pPr>
+      <w:r>
+        <w:rPr>
+          <w:rFonts w:ascii="Georgia" w:cs="Georgia" w:eastAsia="Georgia" w:hAnsi="Georgia"/>
+          <w:sz w:val="22"/>
+          <w:szCs w:val="22"/>
+        </w:rPr>
+        <w:t xml:space="preserve">*</w:t>
+      </w:r>
+    </w:p>
+    <w:p>
+      <w:pPr>
+        <w:spacing w:after="0" w:line="312"/>
+        <w:ind w:firstLine="340"/>
+        <w:jc w:val="both"/>
+      </w:pPr>
+      <w:r>
+        <w:rPr>
+          <w:rFonts w:ascii="Georgia" w:cs="Georgia" w:eastAsia="Georgia" w:hAnsi="Georgia"/>
+          <w:sz w:val="21"/>
+          <w:szCs w:val="21"/>
+        </w:rPr>
+        <w:t xml:space="preserve">Meia hora depois, os dois estavam sentados no carro dela, estacionado numa rua tranquila de Pinheiros, com o BlackBerry do pai entre eles, sobre o freio de mão.</w:t>
+      </w:r>
+    </w:p>
+    <w:p>
+      <w:pPr>
+        <w:spacing w:after="0" w:line="312"/>
+        <w:ind w:firstLine="340"/>
+        <w:jc w:val="both"/>
+      </w:pPr>
+      <w:r>
+        <w:rPr>
+          <w:rFonts w:ascii="Georgia" w:cs="Georgia" w:eastAsia="Georgia" w:hAnsi="Georgia"/>
+          <w:sz w:val="21"/>
+          <w:szCs w:val="21"/>
+        </w:rPr>
+        <w:t xml:space="preserve">A pasta protegida tinha uma única conversa. O nome do contato era Sinistro 2006 – Família R.</w:t>
+      </w:r>
+    </w:p>
+    <w:p>
+      <w:pPr>
+        <w:spacing w:after="0" w:line="312"/>
+        <w:ind w:firstLine="340"/>
+        <w:jc w:val="both"/>
+      </w:pPr>
+      <w:r>
+        <w:rPr>
+          <w:rFonts w:ascii="Georgia" w:cs="Georgia" w:eastAsia="Georgia" w:hAnsi="Georgia"/>
+          <w:sz w:val="21"/>
+          <w:szCs w:val="21"/>
+        </w:rPr>
+        <w:t xml:space="preserve">As mensagens começavam em abril de 2006, um mês depois do incêndio. Eram de um número de Americana, e quem escrevia assinava sempre do mesmo jeito: Raul.</w:t>
+      </w:r>
+    </w:p>
+    <w:p>
+      <w:pPr>
+        <w:spacing w:after="0" w:line="312"/>
+        <w:ind w:firstLine="340"/>
+        <w:jc w:val="both"/>
+      </w:pPr>
+      <w:r>
+        <w:rPr>
+          <w:rFonts w:ascii="Georgia" w:cs="Georgia" w:eastAsia="Georgia" w:hAnsi="Georgia"/>
+          <w:sz w:val="21"/>
+          <w:szCs w:val="21"/>
+        </w:rPr>
+        <w:t xml:space="preserve">Doutor Henrique, peço que reconsidere. A reforma foi para cumprir uma exigência dos bombeiros. Eu não sabia que precisava avisar a seguradora.</w:t>
+      </w:r>
+    </w:p>
+    <w:p>
+      <w:pPr>
+        <w:spacing w:after="0" w:line="312"/>
+        <w:ind w:firstLine="340"/>
+        <w:jc w:val="both"/>
+      </w:pPr>
+      <w:r>
+        <w:rPr>
+          <w:rFonts w:ascii="Georgia" w:cs="Georgia" w:eastAsia="Georgia" w:hAnsi="Georgia"/>
+          <w:sz w:val="21"/>
+          <w:szCs w:val="21"/>
+        </w:rPr>
+        <w:t xml:space="preserve">Doutor Henrique, são cento e vinte funcionários. Eu não tenho como pagar a rescisão de ninguém.</w:t>
+      </w:r>
+    </w:p>
+    <w:p>
+      <w:pPr>
+        <w:spacing w:after="0" w:line="312"/>
+        <w:ind w:firstLine="340"/>
+        <w:jc w:val="both"/>
+      </w:pPr>
+      <w:r>
+        <w:rPr>
+          <w:rFonts w:ascii="Georgia" w:cs="Georgia" w:eastAsia="Georgia" w:hAnsi="Georgia"/>
+          <w:sz w:val="21"/>
+          <w:szCs w:val="21"/>
+        </w:rPr>
+        <w:t xml:space="preserve">Doutor Henrique, minha mulher está doente. Minha filha, a Lelê, está apavorada. Ela tem vinte e oito anos e nunca me viu chorar. Agora me vê todas as noites.</w:t>
+      </w:r>
+    </w:p>
+    <w:p>
+      <w:pPr>
+        <w:spacing w:after="0" w:line="312"/>
+        <w:ind w:firstLine="340"/>
+        <w:jc w:val="both"/>
+      </w:pPr>
+      <w:r>
+        <w:rPr>
+          <w:rFonts w:ascii="Georgia" w:cs="Georgia" w:eastAsia="Georgia" w:hAnsi="Georgia"/>
+          <w:sz w:val="21"/>
+          <w:szCs w:val="21"/>
+        </w:rPr>
+        <w:t xml:space="preserve">O pai tinha respondido poucas vezes. Sempre igual, sempre educado, sempre frio. Lamento, senhor Raul. A decisão é técnica. O contrato é claro. Desejo sorte ao senhor e à sua família.</w:t>
+      </w:r>
+    </w:p>
+    <w:p>
+      <w:pPr>
+        <w:spacing w:after="0" w:line="312"/>
+        <w:ind w:firstLine="340"/>
+        <w:jc w:val="both"/>
+      </w:pPr>
+      <w:r>
+        <w:rPr>
+          <w:rFonts w:ascii="Georgia" w:cs="Georgia" w:eastAsia="Georgia" w:hAnsi="Georgia"/>
+          <w:sz w:val="21"/>
+          <w:szCs w:val="21"/>
+        </w:rPr>
+        <w:t xml:space="preserve">Lia sentiu o estômago revirar. Conhecia aquele tom. Era o tom que o pai usava quando decidia que uma coisa não era problema dele.</w:t>
+      </w:r>
+    </w:p>
+    <w:p>
+      <w:pPr>
+        <w:spacing w:after="0" w:line="312"/>
+        <w:ind w:firstLine="340"/>
+        <w:jc w:val="both"/>
+      </w:pPr>
+      <w:r>
+        <w:rPr>
+          <w:rFonts w:ascii="Georgia" w:cs="Georgia" w:eastAsia="Georgia" w:hAnsi="Georgia"/>
+          <w:sz w:val="21"/>
+          <w:szCs w:val="21"/>
+        </w:rPr>
+        <w:t xml:space="preserve">— Ele guardou isso escondido — disse Lucas. — Por quê? Ele negava sinistros todo mês. Por que esse?</w:t>
+      </w:r>
+    </w:p>
+    <w:p>
+      <w:pPr>
+        <w:spacing w:after="0" w:line="312"/>
+        <w:ind w:firstLine="340"/>
+        <w:jc w:val="both"/>
+      </w:pPr>
+      <w:r>
+        <w:rPr>
+          <w:rFonts w:ascii="Georgia" w:cs="Georgia" w:eastAsia="Georgia" w:hAnsi="Georgia"/>
+          <w:sz w:val="21"/>
+          <w:szCs w:val="21"/>
+        </w:rPr>
+        <w:t xml:space="preserve">— Porque esse doeu — respondeu Lia. — Mesmo nele.</w:t>
+      </w:r>
+    </w:p>
+    <w:p>
+      <w:pPr>
+        <w:spacing w:after="0" w:line="312"/>
+        <w:ind w:firstLine="340"/>
+        <w:jc w:val="both"/>
+      </w:pPr>
+      <w:r>
+        <w:rPr>
+          <w:rFonts w:ascii="Georgia" w:cs="Georgia" w:eastAsia="Georgia" w:hAnsi="Georgia"/>
+          <w:sz w:val="21"/>
+          <w:szCs w:val="21"/>
+        </w:rPr>
+        <w:t xml:space="preserve">Desceram a tela. As mensagens de Raul foram ficando mais curtas, mais espaçadas. Em agosto, uma só: Perdi a casa. Em outubro, nenhuma. Em novembro, nenhuma.</w:t>
+      </w:r>
+    </w:p>
+    <w:p>
+      <w:pPr>
+        <w:spacing w:after="0" w:line="312"/>
+        <w:ind w:firstLine="340"/>
+        <w:jc w:val="both"/>
+      </w:pPr>
+      <w:r>
+        <w:rPr>
+          <w:rFonts w:ascii="Georgia" w:cs="Georgia" w:eastAsia="Georgia" w:hAnsi="Georgia"/>
+          <w:sz w:val="21"/>
+          <w:szCs w:val="21"/>
+        </w:rPr>
+        <w:t xml:space="preserve">A última mensagem da conversa era de janeiro de 2007. Vinha do mesmo número, mas não era de Raul.</w:t>
+      </w:r>
+    </w:p>
+    <w:p>
+      <w:pPr>
+        <w:spacing w:after="0" w:line="312"/>
+        <w:ind w:firstLine="340"/>
+        <w:jc w:val="both"/>
+      </w:pPr>
+      <w:r>
+        <w:rPr>
+          <w:rFonts w:ascii="Georgia" w:cs="Georgia" w:eastAsia="Georgia" w:hAnsi="Georgia"/>
+          <w:sz w:val="21"/>
+          <w:szCs w:val="21"/>
+        </w:rPr>
+        <w:t xml:space="preserve">Senhor Henrique Salvallus. Meu pai faleceu ontem, de infarto, aos sessenta e três anos. A família pede que o senhor não compareça ao enterro.</w:t>
+      </w:r>
+    </w:p>
+    <w:p>
+      <w:pPr>
+        <w:spacing w:after="0" w:line="312"/>
+        <w:ind w:firstLine="340"/>
+        <w:jc w:val="both"/>
+      </w:pPr>
+      <w:r>
+        <w:rPr>
+          <w:rFonts w:ascii="Georgia" w:cs="Georgia" w:eastAsia="Georgia" w:hAnsi="Georgia"/>
+          <w:sz w:val="21"/>
+          <w:szCs w:val="21"/>
+        </w:rPr>
+        <w:t xml:space="preserve">Não tinha assinatura.</w:t>
+      </w:r>
+    </w:p>
+    <w:p>
+      <w:pPr>
+        <w:spacing w:after="0" w:line="312"/>
+        <w:ind w:firstLine="340"/>
+        <w:jc w:val="both"/>
+      </w:pPr>
+      <w:r>
+        <w:rPr>
+          <w:rFonts w:ascii="Georgia" w:cs="Georgia" w:eastAsia="Georgia" w:hAnsi="Georgia"/>
+          <w:sz w:val="21"/>
+          <w:szCs w:val="21"/>
+        </w:rPr>
+        <w:t xml:space="preserve">Lucas apagou a tela do celular e ficou olhando para o vidro escuro.</w:t>
+      </w:r>
+    </w:p>
+    <w:p>
+      <w:pPr>
+        <w:spacing w:after="0" w:line="312"/>
+        <w:ind w:firstLine="340"/>
+        <w:jc w:val="both"/>
+      </w:pPr>
+      <w:r>
+        <w:rPr>
+          <w:rFonts w:ascii="Georgia" w:cs="Georgia" w:eastAsia="Georgia" w:hAnsi="Georgia"/>
+          <w:sz w:val="21"/>
+          <w:szCs w:val="21"/>
+        </w:rPr>
+        <w:t xml:space="preserve">Lia tirou da bolsa a fotografia da inauguração e a colocou no colo do irmão, sem dizer nada. Lucas olhou para a menina de cabelo curto segurando a tesoura. Demorou alguns segundos. Depois aproximou a foto do rosto, como ela tinha feito na janela do escritório.</w:t>
+      </w:r>
+    </w:p>
+    <w:p>
+      <w:pPr>
+        <w:spacing w:after="0" w:line="312"/>
+        <w:ind w:firstLine="340"/>
+        <w:jc w:val="both"/>
+      </w:pPr>
+      <w:r>
+        <w:rPr>
+          <w:rFonts w:ascii="Georgia" w:cs="Georgia" w:eastAsia="Georgia" w:hAnsi="Georgia"/>
+          <w:sz w:val="21"/>
+          <w:szCs w:val="21"/>
+        </w:rPr>
+        <w:t xml:space="preserve">— A pinta — disse ele, baixinho.</w:t>
+      </w:r>
+    </w:p>
+    <w:p>
+      <w:pPr>
+        <w:spacing w:after="0" w:line="312"/>
+        <w:ind w:firstLine="340"/>
+        <w:jc w:val="both"/>
+      </w:pPr>
+      <w:r>
+        <w:rPr>
+          <w:rFonts w:ascii="Georgia" w:cs="Georgia" w:eastAsia="Georgia" w:hAnsi="Georgia"/>
+          <w:sz w:val="21"/>
+          <w:szCs w:val="21"/>
+        </w:rPr>
+        <w:t xml:space="preserve">— A pinta.</w:t>
+      </w:r>
+    </w:p>
+    <w:p>
+      <w:pPr>
+        <w:spacing w:after="0" w:line="312"/>
+        <w:ind w:firstLine="340"/>
+        <w:jc w:val="both"/>
+      </w:pPr>
+      <w:r>
+        <w:rPr>
+          <w:rFonts w:ascii="Georgia" w:cs="Georgia" w:eastAsia="Georgia" w:hAnsi="Georgia"/>
+          <w:sz w:val="21"/>
+          <w:szCs w:val="21"/>
+        </w:rPr>
+        <w:t xml:space="preserve">— Pode ser coincidência.</w:t>
+      </w:r>
+    </w:p>
+    <w:p>
+      <w:pPr>
+        <w:spacing w:after="0" w:line="312"/>
+        <w:ind w:firstLine="340"/>
+        <w:jc w:val="both"/>
+      </w:pPr>
+      <w:r>
+        <w:rPr>
+          <w:rFonts w:ascii="Georgia" w:cs="Georgia" w:eastAsia="Georgia" w:hAnsi="Georgia"/>
+          <w:sz w:val="21"/>
+          <w:szCs w:val="21"/>
+        </w:rPr>
+        <w:t xml:space="preserve">— Pode — disse Lia. — Mas a gaveta estava aberta, Lucas. E alguém tinha tirado essa pasta do lugar antes de mim.</w:t>
       </w:r>
     </w:p>
     <w:sectPr>

</xml_diff>

<commit_message>
Livro policial: cap. 7, apelido Leninha e ajuste de texto
Co-Authored-By: Claude Opus 5.5 <noreply@anthropic.com>
Claude-Session: https://claude.ai/code/session_01BrurxSYygRC3rRhaUYosm1
</commit_message>
<xml_diff>
--- a/docs/livro-policial/TODO_CRIME_TEM_UM_AUTOR.docx
+++ b/docs/livro-policial/TODO_CRIME_TEM_UM_AUTOR.docx
@@ -6343,7 +6343,7 @@
           <w:sz w:val="21"/>
           <w:szCs w:val="21"/>
         </w:rPr>
-        <w:t xml:space="preserve">Era o processo de um incêndio. Uma fábrica de tecidos em Americana, no interior, destruída numa madrugada de março. As fotos mostravam um galpão enorme reduzido a vigas retorcidas e paredes pretas. O laudo da corretora tinha dezenas de páginas, e Lia, que lia plantas e memoriais descritivos todos os dias, entendeu o essencial em poucos minutos: o seguro fora negado porque a fábrica tinha feito uma reforma elétrica sem comunicar à seguradora. Uma cláusula na página catorze do contrato, em letra miúda. Tecnicamente correto. Humanamente devastador.</w:t>
+        <w:t xml:space="preserve">Era o processo de um incêndio. Uma fábrica de tecidos em Americana, no interior, destruída numa madrugada de março. As fotos mostravam um galpão enorme reduzido a vigas retorcidas e paredes pretas. O laudo da corretora tinha dezenas de páginas, e Lia, que analisava plantas e memoriais descritivos todos os dias, entendeu o essencial em poucos minutos: o seguro fora negado porque a fábrica tinha feito uma reforma elétrica sem comunicar à seguradora. Uma cláusula na página catorze do contrato, em letra miúda. Tecnicamente correto. Humanamente devastador.</w:t>
       </w:r>
     </w:p>
     <w:p>
@@ -6776,7 +6776,7 @@
           <w:sz w:val="21"/>
           <w:szCs w:val="21"/>
         </w:rPr>
-        <w:t xml:space="preserve">Doutor Henrique, minha mulher está doente. Minha filha, a Lelê, está apavorada. Ela tem vinte e oito anos e nunca me viu chorar. Agora me vê todas as noites.</w:t>
+        <w:t xml:space="preserve">Doutor Henrique, minha mulher está doente. Minha filha, a Leninha, está apavorada. Ela tem vinte e oito anos e nunca me viu chorar. Agora me vê todas as noites.</w:t>
       </w:r>
     </w:p>
     <w:p>

</xml_diff>

<commit_message>
Livro policial: capítulo 8 (Leninha)
Co-Authored-By: Claude Opus 5.5 <noreply@anthropic.com>
Claude-Session: https://claude.ai/code/session_01BrurxSYygRC3rRhaUYosm1
</commit_message>
<xml_diff>
--- a/docs/livro-policial/TODO_CRIME_TEM_UM_AUTOR.docx
+++ b/docs/livro-policial/TODO_CRIME_TEM_UM_AUTOR.docx
@@ -6987,6 +6987,964 @@
           <w:szCs w:val="21"/>
         </w:rPr>
         <w:t xml:space="preserve">— Pode — disse Lia. — Mas a gaveta estava aberta, Lucas. E alguém tinha tirado essa pasta do lugar antes de mim.</w:t>
+      </w:r>
+    </w:p>
+    <w:p>
+      <w:pPr>
+        <w:pageBreakBefore/>
+        <w:spacing w:after="120" w:before="1800"/>
+        <w:jc w:val="center"/>
+      </w:pPr>
+      <w:r>
+        <w:rPr>
+          <w:rFonts w:ascii="Georgia" w:cs="Georgia" w:eastAsia="Georgia" w:hAnsi="Georgia"/>
+          <w:spacing w:val="40"/>
+          <w:sz w:val="20"/>
+          <w:szCs w:val="20"/>
+        </w:rPr>
+        <w:t xml:space="preserve">CAPÍTULO 8</w:t>
+      </w:r>
+    </w:p>
+    <w:p>
+      <w:pPr>
+        <w:spacing w:after="720"/>
+        <w:jc w:val="center"/>
+      </w:pPr>
+      <w:r>
+        <w:rPr>
+          <w:rFonts w:ascii="Georgia" w:cs="Georgia" w:eastAsia="Georgia" w:hAnsi="Georgia"/>
+          <w:b/>
+          <w:bCs/>
+          <w:sz w:val="32"/>
+          <w:szCs w:val="32"/>
+        </w:rPr>
+        <w:t xml:space="preserve">Leninha</w:t>
+      </w:r>
+    </w:p>
+    <w:p>
+      <w:pPr>
+        <w:spacing w:after="0" w:line="312"/>
+        <w:ind w:firstLine="340"/>
+        <w:jc w:val="both"/>
+      </w:pPr>
+      <w:r>
+        <w:rPr>
+          <w:rFonts w:ascii="Georgia" w:cs="Georgia" w:eastAsia="Georgia" w:hAnsi="Georgia"/>
+          <w:sz w:val="21"/>
+          <w:szCs w:val="21"/>
+        </w:rPr>
+        <w:t xml:space="preserve">Lucas passou a noite inteira lendo as mensagens de Helena.</w:t>
+      </w:r>
+    </w:p>
+    <w:p>
+      <w:pPr>
+        <w:spacing w:after="0" w:line="312"/>
+        <w:ind w:firstLine="340"/>
+        <w:jc w:val="both"/>
+      </w:pPr>
+      <w:r>
+        <w:rPr>
+          <w:rFonts w:ascii="Georgia" w:cs="Georgia" w:eastAsia="Georgia" w:hAnsi="Georgia"/>
+          <w:sz w:val="21"/>
+          <w:szCs w:val="21"/>
+        </w:rPr>
+        <w:t xml:space="preserve">Não as da pasta protegida. As outras, as de todo dia, as que ele tinha atravessado às pressas na primeira vez porque pareciam as mensagens de qualquer esposa. Agora, com a foto da menina da tesoura apoiada no abajur da mesa da sala, ele as percorria uma a uma, do começo, como quem procura um erro de digitação num contrato de cem páginas.</w:t>
+      </w:r>
+    </w:p>
+    <w:p>
+      <w:pPr>
+        <w:spacing w:after="0" w:line="312"/>
+        <w:ind w:firstLine="340"/>
+        <w:jc w:val="both"/>
+      </w:pPr>
+      <w:r>
+        <w:rPr>
+          <w:rFonts w:ascii="Georgia" w:cs="Georgia" w:eastAsia="Georgia" w:hAnsi="Georgia"/>
+          <w:sz w:val="21"/>
+          <w:szCs w:val="21"/>
+        </w:rPr>
+        <w:t xml:space="preserve">Eram mais de três anos de conversa no BlackBerry Messenger. Helena escrevia pouco e escrevia bem. Frases curtas, sem erros, sem emoticons. Chego às oito. Comprei o vinho. Seu filho ligou. Sua filha ligou. Seu médico ligou, quer remarcar. Não esquece o remédio da pressão. Lucas reparou que ela nunca dizia o nome de ninguém da família. Era sempre seu filho, sua filha, sua ex. Como se ela estivesse ali de passagem, cuidando da casa de outra pessoa.</w:t>
+      </w:r>
+    </w:p>
+    <w:p>
+      <w:pPr>
+        <w:spacing w:after="0" w:line="312"/>
+        <w:ind w:firstLine="340"/>
+        <w:jc w:val="both"/>
+      </w:pPr>
+      <w:r>
+        <w:rPr>
+          <w:rFonts w:ascii="Georgia" w:cs="Georgia" w:eastAsia="Georgia" w:hAnsi="Georgia"/>
+          <w:sz w:val="21"/>
+          <w:szCs w:val="21"/>
+        </w:rPr>
+        <w:t xml:space="preserve">Às três da manhã, ele encontrou.</w:t>
+      </w:r>
+    </w:p>
+    <w:p>
+      <w:pPr>
+        <w:spacing w:after="200" w:before="200"/>
+        <w:jc w:val="center"/>
+      </w:pPr>
+      <w:r>
+        <w:rPr>
+          <w:rFonts w:ascii="Georgia" w:cs="Georgia" w:eastAsia="Georgia" w:hAnsi="Georgia"/>
+          <w:sz w:val="22"/>
+          <w:szCs w:val="22"/>
+        </w:rPr>
+        <w:t xml:space="preserve">*</w:t>
+      </w:r>
+    </w:p>
+    <w:p>
+      <w:pPr>
+        <w:spacing w:after="0" w:line="312"/>
+        <w:ind w:firstLine="340"/>
+        <w:jc w:val="both"/>
+      </w:pPr>
+      <w:r>
+        <w:rPr>
+          <w:rFonts w:ascii="Georgia" w:cs="Georgia" w:eastAsia="Georgia" w:hAnsi="Georgia"/>
+          <w:sz w:val="21"/>
+          <w:szCs w:val="21"/>
+        </w:rPr>
+        <w:t xml:space="preserve">Era uma mensagem de janeiro de 2008. Dia 17, uma quinta-feira, às onze e meia da noite. Destoava de todas as outras como uma nota fora do tom.</w:t>
+      </w:r>
+    </w:p>
+    <w:p>
+      <w:pPr>
+        <w:spacing w:after="0" w:line="312"/>
+        <w:ind w:firstLine="340"/>
+        <w:jc w:val="both"/>
+      </w:pPr>
+      <w:r>
+        <w:rPr>
+          <w:rFonts w:ascii="Georgia" w:cs="Georgia" w:eastAsia="Georgia" w:hAnsi="Georgia"/>
+          <w:sz w:val="21"/>
+          <w:szCs w:val="21"/>
+        </w:rPr>
+        <w:t xml:space="preserve">Hoje não estou bem. Não me pergunte por quê. Leninha</w:t>
+      </w:r>
+    </w:p>
+    <w:p>
+      <w:pPr>
+        <w:spacing w:after="0" w:line="312"/>
+        <w:ind w:firstLine="340"/>
+        <w:jc w:val="both"/>
+      </w:pPr>
+      <w:r>
+        <w:rPr>
+          <w:rFonts w:ascii="Georgia" w:cs="Georgia" w:eastAsia="Georgia" w:hAnsi="Georgia"/>
+          <w:sz w:val="21"/>
+          <w:szCs w:val="21"/>
+        </w:rPr>
+        <w:t xml:space="preserve">O pai respondera alguns minutos depois.</w:t>
+      </w:r>
+    </w:p>
+    <w:p>
+      <w:pPr>
+        <w:spacing w:after="0" w:line="312"/>
+        <w:ind w:firstLine="340"/>
+        <w:jc w:val="both"/>
+      </w:pPr>
+      <w:r>
+        <w:rPr>
+          <w:rFonts w:ascii="Georgia" w:cs="Georgia" w:eastAsia="Georgia" w:hAnsi="Georgia"/>
+          <w:sz w:val="21"/>
+          <w:szCs w:val="21"/>
+        </w:rPr>
+        <w:t xml:space="preserve">Leninha? Desde quando você é Leninha?</w:t>
+      </w:r>
+    </w:p>
+    <w:p>
+      <w:pPr>
+        <w:spacing w:after="0" w:line="312"/>
+        <w:ind w:firstLine="340"/>
+        <w:jc w:val="both"/>
+      </w:pPr>
+      <w:r>
+        <w:rPr>
+          <w:rFonts w:ascii="Georgia" w:cs="Georgia" w:eastAsia="Georgia" w:hAnsi="Georgia"/>
+          <w:sz w:val="21"/>
+          <w:szCs w:val="21"/>
+        </w:rPr>
+        <w:t xml:space="preserve">Bobagem. Apelido de criança. Esquece.</w:t>
+      </w:r>
+    </w:p>
+    <w:p>
+      <w:pPr>
+        <w:spacing w:after="0" w:line="312"/>
+        <w:ind w:firstLine="340"/>
+        <w:jc w:val="both"/>
+      </w:pPr>
+      <w:r>
+        <w:rPr>
+          <w:rFonts w:ascii="Georgia" w:cs="Georgia" w:eastAsia="Georgia" w:hAnsi="Georgia"/>
+          <w:sz w:val="21"/>
+          <w:szCs w:val="21"/>
+        </w:rPr>
+        <w:t xml:space="preserve">Esquecido. Boa noite, Helena.</w:t>
+      </w:r>
+    </w:p>
+    <w:p>
+      <w:pPr>
+        <w:spacing w:after="0" w:line="312"/>
+        <w:ind w:firstLine="340"/>
+        <w:jc w:val="both"/>
+      </w:pPr>
+      <w:r>
+        <w:rPr>
+          <w:rFonts w:ascii="Georgia" w:cs="Georgia" w:eastAsia="Georgia" w:hAnsi="Georgia"/>
+          <w:sz w:val="21"/>
+          <w:szCs w:val="21"/>
+        </w:rPr>
+        <w:t xml:space="preserve">E mais nada. No dia seguinte, a conversa voltava ao normal: chego às oito, comprei o vinho, não esquece o remédio.</w:t>
+      </w:r>
+    </w:p>
+    <w:p>
+      <w:pPr>
+        <w:spacing w:after="0" w:line="312"/>
+        <w:ind w:firstLine="340"/>
+        <w:jc w:val="both"/>
+      </w:pPr>
+      <w:r>
+        <w:rPr>
+          <w:rFonts w:ascii="Georgia" w:cs="Georgia" w:eastAsia="Georgia" w:hAnsi="Georgia"/>
+          <w:sz w:val="21"/>
+          <w:szCs w:val="21"/>
+        </w:rPr>
+        <w:t xml:space="preserve">Lucas ficou olhando para aquela palavra por muito tempo. Leninha. Depois pegou o BlackBerry, abriu a pasta protegida, digitou de novo a data do incêndio e desceu até o fim da conversa com a família R.</w:t>
+      </w:r>
+    </w:p>
+    <w:p>
+      <w:pPr>
+        <w:spacing w:after="0" w:line="312"/>
+        <w:ind w:firstLine="340"/>
+        <w:jc w:val="both"/>
+      </w:pPr>
+      <w:r>
+        <w:rPr>
+          <w:rFonts w:ascii="Georgia" w:cs="Georgia" w:eastAsia="Georgia" w:hAnsi="Georgia"/>
+          <w:sz w:val="21"/>
+          <w:szCs w:val="21"/>
+        </w:rPr>
+        <w:t xml:space="preserve">Minha filha, a Leninha, está apavorada.</w:t>
+      </w:r>
+    </w:p>
+    <w:p>
+      <w:pPr>
+        <w:spacing w:after="0" w:line="312"/>
+        <w:ind w:firstLine="340"/>
+        <w:jc w:val="both"/>
+      </w:pPr>
+      <w:r>
+        <w:rPr>
+          <w:rFonts w:ascii="Georgia" w:cs="Georgia" w:eastAsia="Georgia" w:hAnsi="Georgia"/>
+          <w:sz w:val="21"/>
+          <w:szCs w:val="21"/>
+        </w:rPr>
+        <w:t xml:space="preserve">E, logo abaixo, a última mensagem, a que não tinha assinatura. Meu pai faleceu ontem, de infarto, aos sessenta e três anos. A família pede que o senhor não compareça ao enterro.</w:t>
+      </w:r>
+    </w:p>
+    <w:p>
+      <w:pPr>
+        <w:spacing w:after="0" w:line="312"/>
+        <w:ind w:firstLine="340"/>
+        <w:jc w:val="both"/>
+      </w:pPr>
+      <w:r>
+        <w:rPr>
+          <w:rFonts w:ascii="Georgia" w:cs="Georgia" w:eastAsia="Georgia" w:hAnsi="Georgia"/>
+          <w:sz w:val="21"/>
+          <w:szCs w:val="21"/>
+        </w:rPr>
+        <w:t xml:space="preserve">A data no alto da mensagem era 18 de janeiro de 2007.</w:t>
+      </w:r>
+    </w:p>
+    <w:p>
+      <w:pPr>
+        <w:spacing w:after="0" w:line="312"/>
+        <w:ind w:firstLine="340"/>
+        <w:jc w:val="both"/>
+      </w:pPr>
+      <w:r>
+        <w:rPr>
+          <w:rFonts w:ascii="Georgia" w:cs="Georgia" w:eastAsia="Georgia" w:hAnsi="Georgia"/>
+          <w:sz w:val="21"/>
+          <w:szCs w:val="21"/>
+        </w:rPr>
+        <w:t xml:space="preserve">Lucas fez a conta duas vezes, como o pai faria. Se Raul Ferraz tinha morrido no dia anterior, morrera em 17 de janeiro de 2007. E exatamente um ano depois, no mesmo dia, Helena tinha escrito ao marido que não estava bem, que não lhe perguntasse por quê, e assinara com o apelido que o pai dela usava.</w:t>
+      </w:r>
+    </w:p>
+    <w:p>
+      <w:pPr>
+        <w:spacing w:after="0" w:line="312"/>
+        <w:ind w:firstLine="340"/>
+        <w:jc w:val="both"/>
+      </w:pPr>
+      <w:r>
+        <w:rPr>
+          <w:rFonts w:ascii="Georgia" w:cs="Georgia" w:eastAsia="Georgia" w:hAnsi="Georgia"/>
+          <w:sz w:val="21"/>
+          <w:szCs w:val="21"/>
+        </w:rPr>
+        <w:t xml:space="preserve">Um aniversário de morte. Uma filha de luto. Ao lado do homem que ela culpava por aquela morte.</w:t>
+      </w:r>
+    </w:p>
+    <w:p>
+      <w:pPr>
+        <w:spacing w:after="200" w:before="200"/>
+        <w:jc w:val="center"/>
+      </w:pPr>
+      <w:r>
+        <w:rPr>
+          <w:rFonts w:ascii="Georgia" w:cs="Georgia" w:eastAsia="Georgia" w:hAnsi="Georgia"/>
+          <w:sz w:val="22"/>
+          <w:szCs w:val="22"/>
+        </w:rPr>
+        <w:t xml:space="preserve">*</w:t>
+      </w:r>
+    </w:p>
+    <w:p>
+      <w:pPr>
+        <w:spacing w:after="0" w:line="312"/>
+        <w:ind w:firstLine="340"/>
+        <w:jc w:val="both"/>
+      </w:pPr>
+      <w:r>
+        <w:rPr>
+          <w:rFonts w:ascii="Georgia" w:cs="Georgia" w:eastAsia="Georgia" w:hAnsi="Georgia"/>
+          <w:sz w:val="21"/>
+          <w:szCs w:val="21"/>
+        </w:rPr>
+        <w:t xml:space="preserve">Às oito da manhã, Lucas já estava na corretora.</w:t>
+      </w:r>
+    </w:p>
+    <w:p>
+      <w:pPr>
+        <w:spacing w:after="0" w:line="312"/>
+        <w:ind w:firstLine="340"/>
+        <w:jc w:val="both"/>
+      </w:pPr>
+      <w:r>
+        <w:rPr>
+          <w:rFonts w:ascii="Georgia" w:cs="Georgia" w:eastAsia="Georgia" w:hAnsi="Georgia"/>
+          <w:sz w:val="21"/>
+          <w:szCs w:val="21"/>
+        </w:rPr>
+        <w:t xml:space="preserve">Não tinha dormido, mas a cabeça funcionava com a clareza estranha das noites sem sono. Pediu à secretária do pai a pasta do plano de saúde da empresa, aquele que cobria os sócios, os diretores e as famílias. A secretária olhou para ele como se ele tivesse pedido a planta do prédio.</w:t>
+      </w:r>
+    </w:p>
+    <w:p>
+      <w:pPr>
+        <w:spacing w:after="0" w:line="312"/>
+        <w:ind w:firstLine="340"/>
+        <w:jc w:val="both"/>
+      </w:pPr>
+      <w:r>
+        <w:rPr>
+          <w:rFonts w:ascii="Georgia" w:cs="Georgia" w:eastAsia="Georgia" w:hAnsi="Georgia"/>
+          <w:sz w:val="21"/>
+          <w:szCs w:val="21"/>
+        </w:rPr>
+        <w:t xml:space="preserve">— O plano de saúde, doutor Lucas?</w:t>
+      </w:r>
+    </w:p>
+    <w:p>
+      <w:pPr>
+        <w:spacing w:after="0" w:line="312"/>
+        <w:ind w:firstLine="340"/>
+        <w:jc w:val="both"/>
+      </w:pPr>
+      <w:r>
+        <w:rPr>
+          <w:rFonts w:ascii="Georgia" w:cs="Georgia" w:eastAsia="Georgia" w:hAnsi="Georgia"/>
+          <w:sz w:val="21"/>
+          <w:szCs w:val="21"/>
+        </w:rPr>
+        <w:t xml:space="preserve">— Preciso atualizar os dependentes. Agora que o meu pai… — Ele não terminou a frase. Não precisou.</w:t>
+      </w:r>
+    </w:p>
+    <w:p>
+      <w:pPr>
+        <w:spacing w:after="0" w:line="312"/>
+        <w:ind w:firstLine="340"/>
+        <w:jc w:val="both"/>
+      </w:pPr>
+      <w:r>
+        <w:rPr>
+          <w:rFonts w:ascii="Georgia" w:cs="Georgia" w:eastAsia="Georgia" w:hAnsi="Georgia"/>
+          <w:sz w:val="21"/>
+          <w:szCs w:val="21"/>
+        </w:rPr>
+        <w:t xml:space="preserve">A pasta chegou em dez minutos. Lucas fechou a porta da sala, abriu na página dos dependentes de Henrique Salvallus e correu o dedo pela lista. Lucas Salvallus, filho. Lia Salvallus, filha. Carlos Salvallus, filho. E, na primeira linha, acima de todos, cônjuge:</w:t>
+      </w:r>
+    </w:p>
+    <w:p>
+      <w:pPr>
+        <w:spacing w:after="0" w:line="312"/>
+        <w:ind w:firstLine="340"/>
+        <w:jc w:val="both"/>
+      </w:pPr>
+      <w:r>
+        <w:rPr>
+          <w:rFonts w:ascii="Georgia" w:cs="Georgia" w:eastAsia="Georgia" w:hAnsi="Georgia"/>
+          <w:sz w:val="21"/>
+          <w:szCs w:val="21"/>
+        </w:rPr>
+        <w:t xml:space="preserve">Helena Aguiar Ferraz.</w:t>
+      </w:r>
+    </w:p>
+    <w:p>
+      <w:pPr>
+        <w:spacing w:after="0" w:line="312"/>
+        <w:ind w:firstLine="340"/>
+        <w:jc w:val="both"/>
+      </w:pPr>
+      <w:r>
+        <w:rPr>
+          <w:rFonts w:ascii="Georgia" w:cs="Georgia" w:eastAsia="Georgia" w:hAnsi="Georgia"/>
+          <w:sz w:val="21"/>
+          <w:szCs w:val="21"/>
+        </w:rPr>
+        <w:t xml:space="preserve">Ferraz.</w:t>
+      </w:r>
+    </w:p>
+    <w:p>
+      <w:pPr>
+        <w:spacing w:after="0" w:line="312"/>
+        <w:ind w:firstLine="340"/>
+        <w:jc w:val="both"/>
+      </w:pPr>
+      <w:r>
+        <w:rPr>
+          <w:rFonts w:ascii="Georgia" w:cs="Georgia" w:eastAsia="Georgia" w:hAnsi="Georgia"/>
+          <w:sz w:val="21"/>
+          <w:szCs w:val="21"/>
+        </w:rPr>
+        <w:t xml:space="preserve">Ele conhecia a viúva do pai havia mais de três anos e nunca tinha ouvido aquele sobrenome. No convite do casamento, no cartão de Natal, nas apresentações nos jantares, ela era sempre Helena Aguiar. O Ferraz estava ali só porque um plano de saúde exige o nome completo, igual ao da carteira de identidade, e ninguém lê a lista de dependentes de um plano de saúde.</w:t>
+      </w:r>
+    </w:p>
+    <w:p>
+      <w:pPr>
+        <w:spacing w:after="0" w:line="312"/>
+        <w:ind w:firstLine="340"/>
+        <w:jc w:val="both"/>
+      </w:pPr>
+      <w:r>
+        <w:rPr>
+          <w:rFonts w:ascii="Georgia" w:cs="Georgia" w:eastAsia="Georgia" w:hAnsi="Georgia"/>
+          <w:sz w:val="21"/>
+          <w:szCs w:val="21"/>
+        </w:rPr>
+        <w:t xml:space="preserve">O pai provavelmente nunca tinha lido.</w:t>
+      </w:r>
+    </w:p>
+    <w:p>
+      <w:pPr>
+        <w:spacing w:after="0" w:line="312"/>
+        <w:ind w:firstLine="340"/>
+        <w:jc w:val="both"/>
+      </w:pPr>
+      <w:r>
+        <w:rPr>
+          <w:rFonts w:ascii="Georgia" w:cs="Georgia" w:eastAsia="Georgia" w:hAnsi="Georgia"/>
+          <w:sz w:val="21"/>
+          <w:szCs w:val="21"/>
+        </w:rPr>
+        <w:t xml:space="preserve">Lucas tirou do bolso a foto da inauguração da fábrica e a colocou ao lado da folha. Raul Ferraz cortando a fita. A mulher de vestido florido. A menina de cabelo curto segurando a tesoura, com a pinta no canto do queixo.</w:t>
+      </w:r>
+    </w:p>
+    <w:p>
+      <w:pPr>
+        <w:spacing w:after="0" w:line="312"/>
+        <w:ind w:firstLine="340"/>
+        <w:jc w:val="both"/>
+      </w:pPr>
+      <w:r>
+        <w:rPr>
+          <w:rFonts w:ascii="Georgia" w:cs="Georgia" w:eastAsia="Georgia" w:hAnsi="Georgia"/>
+          <w:sz w:val="21"/>
+          <w:szCs w:val="21"/>
+        </w:rPr>
+        <w:t xml:space="preserve">Helena tinha casado com o homem que arruinou o pai dela.</w:t>
+      </w:r>
+    </w:p>
+    <w:p>
+      <w:pPr>
+        <w:spacing w:after="200" w:before="200"/>
+        <w:jc w:val="center"/>
+      </w:pPr>
+      <w:r>
+        <w:rPr>
+          <w:rFonts w:ascii="Georgia" w:cs="Georgia" w:eastAsia="Georgia" w:hAnsi="Georgia"/>
+          <w:sz w:val="22"/>
+          <w:szCs w:val="22"/>
+        </w:rPr>
+        <w:t xml:space="preserve">*</w:t>
+      </w:r>
+    </w:p>
+    <w:p>
+      <w:pPr>
+        <w:spacing w:after="0" w:line="312"/>
+        <w:ind w:firstLine="340"/>
+        <w:jc w:val="both"/>
+      </w:pPr>
+      <w:r>
+        <w:rPr>
+          <w:rFonts w:ascii="Georgia" w:cs="Georgia" w:eastAsia="Georgia" w:hAnsi="Georgia"/>
+          <w:sz w:val="21"/>
+          <w:szCs w:val="21"/>
+        </w:rPr>
+        <w:t xml:space="preserve">Alguém bateu na porta. Antes que Lucas respondesse, Otávio abriu.</w:t>
+      </w:r>
+    </w:p>
+    <w:p>
+      <w:pPr>
+        <w:spacing w:after="0" w:line="312"/>
+        <w:ind w:firstLine="340"/>
+        <w:jc w:val="both"/>
+      </w:pPr>
+      <w:r>
+        <w:rPr>
+          <w:rFonts w:ascii="Georgia" w:cs="Georgia" w:eastAsia="Georgia" w:hAnsi="Georgia"/>
+          <w:sz w:val="21"/>
+          <w:szCs w:val="21"/>
+        </w:rPr>
+        <w:t xml:space="preserve">— Bom dia, bom dia. Já está aqui a essa hora? Teu pai ia gostar. — O sócio entrou com dois cafés na mão e pousou um diante de Lucas. Os olhos dele foram da pasta aberta para a foto e da foto para Lucas, numa fração de segundo. — Plano de saúde?</w:t>
+      </w:r>
+    </w:p>
+    <w:p>
+      <w:pPr>
+        <w:spacing w:after="0" w:line="312"/>
+        <w:ind w:firstLine="340"/>
+        <w:jc w:val="both"/>
+      </w:pPr>
+      <w:r>
+        <w:rPr>
+          <w:rFonts w:ascii="Georgia" w:cs="Georgia" w:eastAsia="Georgia" w:hAnsi="Georgia"/>
+          <w:sz w:val="21"/>
+          <w:szCs w:val="21"/>
+        </w:rPr>
+        <w:t xml:space="preserve">— Atualizando os dependentes.</w:t>
+      </w:r>
+    </w:p>
+    <w:p>
+      <w:pPr>
+        <w:spacing w:after="0" w:line="312"/>
+        <w:ind w:firstLine="340"/>
+        <w:jc w:val="both"/>
+      </w:pPr>
+      <w:r>
+        <w:rPr>
+          <w:rFonts w:ascii="Georgia" w:cs="Georgia" w:eastAsia="Georgia" w:hAnsi="Georgia"/>
+          <w:sz w:val="21"/>
+          <w:szCs w:val="21"/>
+        </w:rPr>
+        <w:t xml:space="preserve">— Boa. Isso é coisa que ninguém lembra. — Otávio sorriu e pegou a própria xícara. — Se precisar de alguma coisa do RH, me chama. Eu cuido disso há vinte anos.</w:t>
+      </w:r>
+    </w:p>
+    <w:p>
+      <w:pPr>
+        <w:spacing w:after="0" w:line="312"/>
+        <w:ind w:firstLine="340"/>
+        <w:jc w:val="both"/>
+      </w:pPr>
+      <w:r>
+        <w:rPr>
+          <w:rFonts w:ascii="Georgia" w:cs="Georgia" w:eastAsia="Georgia" w:hAnsi="Georgia"/>
+          <w:sz w:val="21"/>
+          <w:szCs w:val="21"/>
+        </w:rPr>
+        <w:t xml:space="preserve">— Obrigado.</w:t>
+      </w:r>
+    </w:p>
+    <w:p>
+      <w:pPr>
+        <w:spacing w:after="0" w:line="312"/>
+        <w:ind w:firstLine="340"/>
+        <w:jc w:val="both"/>
+      </w:pPr>
+      <w:r>
+        <w:rPr>
+          <w:rFonts w:ascii="Georgia" w:cs="Georgia" w:eastAsia="Georgia" w:hAnsi="Georgia"/>
+          <w:sz w:val="21"/>
+          <w:szCs w:val="21"/>
+        </w:rPr>
+        <w:t xml:space="preserve">Otávio ficou mais um instante parado na porta, soprando o café, como se esperasse que Lucas dissesse mais alguma coisa. Lucas não disse. O sócio saiu e deixou a porta entreaberta.</w:t>
+      </w:r>
+    </w:p>
+    <w:p>
+      <w:pPr>
+        <w:spacing w:after="0" w:line="312"/>
+        <w:ind w:firstLine="340"/>
+        <w:jc w:val="both"/>
+      </w:pPr>
+      <w:r>
+        <w:rPr>
+          <w:rFonts w:ascii="Georgia" w:cs="Georgia" w:eastAsia="Georgia" w:hAnsi="Georgia"/>
+          <w:sz w:val="21"/>
+          <w:szCs w:val="21"/>
+        </w:rPr>
+        <w:t xml:space="preserve">Lucas guardou a foto no bolso e fechou a pasta. Só então percebeu que tinha prendido a respiração.</w:t>
+      </w:r>
+    </w:p>
+    <w:p>
+      <w:pPr>
+        <w:spacing w:after="200" w:before="200"/>
+        <w:jc w:val="center"/>
+      </w:pPr>
+      <w:r>
+        <w:rPr>
+          <w:rFonts w:ascii="Georgia" w:cs="Georgia" w:eastAsia="Georgia" w:hAnsi="Georgia"/>
+          <w:sz w:val="22"/>
+          <w:szCs w:val="22"/>
+        </w:rPr>
+        <w:t xml:space="preserve">*</w:t>
+      </w:r>
+    </w:p>
+    <w:p>
+      <w:pPr>
+        <w:spacing w:after="0" w:line="312"/>
+        <w:ind w:firstLine="340"/>
+        <w:jc w:val="both"/>
+      </w:pPr>
+      <w:r>
+        <w:rPr>
+          <w:rFonts w:ascii="Georgia" w:cs="Georgia" w:eastAsia="Georgia" w:hAnsi="Georgia"/>
+          <w:sz w:val="21"/>
+          <w:szCs w:val="21"/>
+        </w:rPr>
+        <w:t xml:space="preserve">Ligou para Lia do carro, na garagem do prédio, onde tinha certeza de que ninguém o ouviria.</w:t>
+      </w:r>
+    </w:p>
+    <w:p>
+      <w:pPr>
+        <w:spacing w:after="0" w:line="312"/>
+        <w:ind w:firstLine="340"/>
+        <w:jc w:val="both"/>
+      </w:pPr>
+      <w:r>
+        <w:rPr>
+          <w:rFonts w:ascii="Georgia" w:cs="Georgia" w:eastAsia="Georgia" w:hAnsi="Georgia"/>
+          <w:sz w:val="21"/>
+          <w:szCs w:val="21"/>
+        </w:rPr>
+        <w:t xml:space="preserve">Contou tudo. A mensagem de janeiro, a assinatura, a data, o aniversário da morte de Raul. O sobrenome escondido no plano de saúde. Do outro lado da linha, a irmã ficou em silêncio por tanto tempo que ele achou que a ligação tinha caído.</w:t>
+      </w:r>
+    </w:p>
+    <w:p>
+      <w:pPr>
+        <w:spacing w:after="0" w:line="312"/>
+        <w:ind w:firstLine="340"/>
+        <w:jc w:val="both"/>
+      </w:pPr>
+      <w:r>
+        <w:rPr>
+          <w:rFonts w:ascii="Georgia" w:cs="Georgia" w:eastAsia="Georgia" w:hAnsi="Georgia"/>
+          <w:sz w:val="21"/>
+          <w:szCs w:val="21"/>
+        </w:rPr>
+        <w:t xml:space="preserve">— Lia?</w:t>
+      </w:r>
+    </w:p>
+    <w:p>
+      <w:pPr>
+        <w:spacing w:after="0" w:line="312"/>
+        <w:ind w:firstLine="340"/>
+        <w:jc w:val="both"/>
+      </w:pPr>
+      <w:r>
+        <w:rPr>
+          <w:rFonts w:ascii="Georgia" w:cs="Georgia" w:eastAsia="Georgia" w:hAnsi="Georgia"/>
+          <w:sz w:val="21"/>
+          <w:szCs w:val="21"/>
+        </w:rPr>
+        <w:t xml:space="preserve">— Estou aqui. — A voz dela estava baixa. — Ela casou com ele de propósito.</w:t>
+      </w:r>
+    </w:p>
+    <w:p>
+      <w:pPr>
+        <w:spacing w:after="0" w:line="312"/>
+        <w:ind w:firstLine="340"/>
+        <w:jc w:val="both"/>
+      </w:pPr>
+      <w:r>
+        <w:rPr>
+          <w:rFonts w:ascii="Georgia" w:cs="Georgia" w:eastAsia="Georgia" w:hAnsi="Georgia"/>
+          <w:sz w:val="21"/>
+          <w:szCs w:val="21"/>
+        </w:rPr>
+        <w:t xml:space="preserve">— Parece que sim.</w:t>
+      </w:r>
+    </w:p>
+    <w:p>
+      <w:pPr>
+        <w:spacing w:after="0" w:line="312"/>
+        <w:ind w:firstLine="340"/>
+        <w:jc w:val="both"/>
+      </w:pPr>
+      <w:r>
+        <w:rPr>
+          <w:rFonts w:ascii="Georgia" w:cs="Georgia" w:eastAsia="Georgia" w:hAnsi="Georgia"/>
+          <w:sz w:val="21"/>
+          <w:szCs w:val="21"/>
+        </w:rPr>
+        <w:t xml:space="preserve">— Por três anos, Lucas. Três anos dormindo ao lado do homem que ela achava que tinha matado o pai dela. Cuidando do remédio da pressão dele. — Lia respirou fundo. — Você lembra do que a Helena disse quando te deu o celular?</w:t>
+      </w:r>
+    </w:p>
+    <w:p>
+      <w:pPr>
+        <w:spacing w:after="0" w:line="312"/>
+        <w:ind w:firstLine="340"/>
+        <w:jc w:val="both"/>
+      </w:pPr>
+      <w:r>
+        <w:rPr>
+          <w:rFonts w:ascii="Georgia" w:cs="Georgia" w:eastAsia="Georgia" w:hAnsi="Georgia"/>
+          <w:sz w:val="21"/>
+          <w:szCs w:val="21"/>
+        </w:rPr>
+        <w:t xml:space="preserve">Lucas lembrava. Eu não quero saber o que tem aí dentro.</w:t>
+      </w:r>
+    </w:p>
+    <w:p>
+      <w:pPr>
+        <w:spacing w:after="0" w:line="312"/>
+        <w:ind w:firstLine="340"/>
+        <w:jc w:val="both"/>
+      </w:pPr>
+      <w:r>
+        <w:rPr>
+          <w:rFonts w:ascii="Georgia" w:cs="Georgia" w:eastAsia="Georgia" w:hAnsi="Georgia"/>
+          <w:sz w:val="21"/>
+          <w:szCs w:val="21"/>
+        </w:rPr>
+        <w:t xml:space="preserve">— Ela já sabia — disse a irmã. — Ela sempre soube o que tinha aí dentro. Foi ela quem tirou a pasta da gaveta antes de mim.</w:t>
+      </w:r>
+    </w:p>
+    <w:p>
+      <w:pPr>
+        <w:spacing w:after="0" w:line="312"/>
+        <w:ind w:firstLine="340"/>
+        <w:jc w:val="both"/>
+      </w:pPr>
+      <w:r>
+        <w:rPr>
+          <w:rFonts w:ascii="Georgia" w:cs="Georgia" w:eastAsia="Georgia" w:hAnsi="Georgia"/>
+          <w:sz w:val="21"/>
+          <w:szCs w:val="21"/>
+        </w:rPr>
+        <w:t xml:space="preserve">— E foi ela quem escolheu a cremação.</w:t>
+      </w:r>
+    </w:p>
+    <w:p>
+      <w:pPr>
+        <w:spacing w:after="0" w:line="312"/>
+        <w:ind w:firstLine="340"/>
+        <w:jc w:val="both"/>
+      </w:pPr>
+      <w:r>
+        <w:rPr>
+          <w:rFonts w:ascii="Georgia" w:cs="Georgia" w:eastAsia="Georgia" w:hAnsi="Georgia"/>
+          <w:sz w:val="21"/>
+          <w:szCs w:val="21"/>
+        </w:rPr>
+        <w:t xml:space="preserve">Os dois ficaram calados. Pela janela do carro, Lucas via a cancela da garagem subir e descer, subir e descer, deixando entrar os carros de quem chegava para mais um dia de trabalho na Faria Lima.</w:t>
+      </w:r>
+    </w:p>
+    <w:p>
+      <w:pPr>
+        <w:spacing w:after="0" w:line="312"/>
+        <w:ind w:firstLine="340"/>
+        <w:jc w:val="both"/>
+      </w:pPr>
+      <w:r>
+        <w:rPr>
+          <w:rFonts w:ascii="Georgia" w:cs="Georgia" w:eastAsia="Georgia" w:hAnsi="Georgia"/>
+          <w:sz w:val="21"/>
+          <w:szCs w:val="21"/>
+        </w:rPr>
+        <w:t xml:space="preserve">— Tem uma coisa que eu não entendo — disse ele, enfim. — Se ela queria vingança, por que esperou três anos?</w:t>
+      </w:r>
+    </w:p>
+    <w:p>
+      <w:pPr>
+        <w:spacing w:after="0" w:line="312"/>
+        <w:ind w:firstLine="340"/>
+        <w:jc w:val="both"/>
+      </w:pPr>
+      <w:r>
+        <w:rPr>
+          <w:rFonts w:ascii="Georgia" w:cs="Georgia" w:eastAsia="Georgia" w:hAnsi="Georgia"/>
+          <w:sz w:val="21"/>
+          <w:szCs w:val="21"/>
+        </w:rPr>
+        <w:t xml:space="preserve">— Talvez não tenha esperado — respondeu Lia. — Talvez tenha tentado antes. Mais de uma vez.</w:t>
+      </w:r>
+    </w:p>
+    <w:p>
+      <w:pPr>
+        <w:spacing w:after="0" w:line="312"/>
+        <w:ind w:firstLine="340"/>
+        <w:jc w:val="both"/>
+      </w:pPr>
+      <w:r>
+        <w:rPr>
+          <w:rFonts w:ascii="Georgia" w:cs="Georgia" w:eastAsia="Georgia" w:hAnsi="Georgia"/>
+          <w:sz w:val="21"/>
+          <w:szCs w:val="21"/>
+        </w:rPr>
+        <w:t xml:space="preserve">Lucas pensou no motel. No restaurante. No hotel. Na estrada. Em todas as vezes em que alguém tinha morrido no lugar do pai.</w:t>
+      </w:r>
+    </w:p>
+    <w:p>
+      <w:pPr>
+        <w:spacing w:after="0" w:line="312"/>
+        <w:ind w:firstLine="340"/>
+        <w:jc w:val="both"/>
+      </w:pPr>
+      <w:r>
+        <w:rPr>
+          <w:rFonts w:ascii="Georgia" w:cs="Georgia" w:eastAsia="Georgia" w:hAnsi="Georgia"/>
+          <w:sz w:val="21"/>
+          <w:szCs w:val="21"/>
+        </w:rPr>
+        <w:t xml:space="preserve">— Ou talvez — continuou a irmã, mais devagar — ela tenha só esperado a pessoa certa errar no lugar dela.</w:t>
+      </w:r>
+    </w:p>
+    <w:p>
+      <w:pPr>
+        <w:spacing w:after="0" w:line="312"/>
+        <w:ind w:firstLine="340"/>
+        <w:jc w:val="both"/>
+      </w:pPr>
+      <w:r>
+        <w:rPr>
+          <w:rFonts w:ascii="Georgia" w:cs="Georgia" w:eastAsia="Georgia" w:hAnsi="Georgia"/>
+          <w:sz w:val="21"/>
+          <w:szCs w:val="21"/>
+        </w:rPr>
+        <w:t xml:space="preserve">Ele não soube o que responder.</w:t>
+      </w:r>
+    </w:p>
+    <w:p>
+      <w:pPr>
+        <w:spacing w:after="0" w:line="312"/>
+        <w:ind w:firstLine="340"/>
+        <w:jc w:val="both"/>
+      </w:pPr>
+      <w:r>
+        <w:rPr>
+          <w:rFonts w:ascii="Georgia" w:cs="Georgia" w:eastAsia="Georgia" w:hAnsi="Georgia"/>
+          <w:sz w:val="21"/>
+          <w:szCs w:val="21"/>
+        </w:rPr>
+        <w:t xml:space="preserve">— Vou voltar àquela casa — disse Lia.</w:t>
+      </w:r>
+    </w:p>
+    <w:p>
+      <w:pPr>
+        <w:spacing w:after="0" w:line="312"/>
+        <w:ind w:firstLine="340"/>
+        <w:jc w:val="both"/>
+      </w:pPr>
+      <w:r>
+        <w:rPr>
+          <w:rFonts w:ascii="Georgia" w:cs="Georgia" w:eastAsia="Georgia" w:hAnsi="Georgia"/>
+          <w:sz w:val="21"/>
+          <w:szCs w:val="21"/>
+        </w:rPr>
+        <w:t xml:space="preserve">— Para quê?</w:t>
+      </w:r>
+    </w:p>
+    <w:p>
+      <w:pPr>
+        <w:spacing w:after="0" w:line="312"/>
+        <w:ind w:firstLine="340"/>
+        <w:jc w:val="both"/>
+      </w:pPr>
+      <w:r>
+        <w:rPr>
+          <w:rFonts w:ascii="Georgia" w:cs="Georgia" w:eastAsia="Georgia" w:hAnsi="Georgia"/>
+          <w:sz w:val="21"/>
+          <w:szCs w:val="21"/>
+        </w:rPr>
+        <w:t xml:space="preserve">— Para ver o que mais ela guarda naquele escritório. E no banheiro. E no armário de remédios.</w:t>
+      </w:r>
+    </w:p>
+    <w:p>
+      <w:pPr>
+        <w:spacing w:after="0" w:line="312"/>
+        <w:ind w:firstLine="340"/>
+        <w:jc w:val="both"/>
+      </w:pPr>
+      <w:r>
+        <w:rPr>
+          <w:rFonts w:ascii="Georgia" w:cs="Georgia" w:eastAsia="Georgia" w:hAnsi="Georgia"/>
+          <w:sz w:val="21"/>
+          <w:szCs w:val="21"/>
+        </w:rPr>
+        <w:t xml:space="preserve">— Lia, se ela for quem a gente está pensando…</w:t>
+      </w:r>
+    </w:p>
+    <w:p>
+      <w:pPr>
+        <w:spacing w:after="0" w:line="312"/>
+        <w:ind w:firstLine="340"/>
+        <w:jc w:val="both"/>
+      </w:pPr>
+      <w:r>
+        <w:rPr>
+          <w:rFonts w:ascii="Georgia" w:cs="Georgia" w:eastAsia="Georgia" w:hAnsi="Georgia"/>
+          <w:sz w:val="21"/>
+          <w:szCs w:val="21"/>
+        </w:rPr>
+        <w:t xml:space="preserve">— Então é melhor eu ir antes que ela perceba que a gente sabe.</w:t>
+      </w:r>
+    </w:p>
+    <w:p>
+      <w:pPr>
+        <w:spacing w:after="0" w:line="312"/>
+        <w:ind w:firstLine="340"/>
+        <w:jc w:val="both"/>
+      </w:pPr>
+      <w:r>
+        <w:rPr>
+          <w:rFonts w:ascii="Georgia" w:cs="Georgia" w:eastAsia="Georgia" w:hAnsi="Georgia"/>
+          <w:sz w:val="21"/>
+          <w:szCs w:val="21"/>
+        </w:rPr>
+        <w:t xml:space="preserve">Ela desligou. Lucas ficou um tempo com o celular na mão, olhando para a cancela.</w:t>
+      </w:r>
+    </w:p>
+    <w:p>
+      <w:pPr>
+        <w:spacing w:after="0" w:line="312"/>
+        <w:ind w:firstLine="340"/>
+        <w:jc w:val="both"/>
+      </w:pPr>
+      <w:r>
+        <w:rPr>
+          <w:rFonts w:ascii="Georgia" w:cs="Georgia" w:eastAsia="Georgia" w:hAnsi="Georgia"/>
+          <w:sz w:val="21"/>
+          <w:szCs w:val="21"/>
+        </w:rPr>
+        <w:t xml:space="preserve">Só depois lembrou que não tinha contado à irmã sobre o olhar de Otávio para a foto em cima da mesa.</w:t>
+      </w:r>
+    </w:p>
+    <w:p>
+      <w:pPr>
+        <w:spacing w:after="0" w:line="312"/>
+        <w:ind w:firstLine="340"/>
+        <w:jc w:val="both"/>
+      </w:pPr>
+      <w:r>
+        <w:rPr>
+          <w:rFonts w:ascii="Georgia" w:cs="Georgia" w:eastAsia="Georgia" w:hAnsi="Georgia"/>
+          <w:sz w:val="21"/>
+          <w:szCs w:val="21"/>
+        </w:rPr>
+        <w:t xml:space="preserve">Também não sabia por que não tinha contado.</w:t>
       </w:r>
     </w:p>
     <w:sectPr>

</xml_diff>

<commit_message>
Livro policial: capítulo 9 (O frasco)
Co-Authored-By: Claude Opus 5.5 <noreply@anthropic.com>
Claude-Session: https://claude.ai/code/session_01BrurxSYygRC3rRhaUYosm1
</commit_message>
<xml_diff>
--- a/docs/livro-policial/TODO_CRIME_TEM_UM_AUTOR.docx
+++ b/docs/livro-policial/TODO_CRIME_TEM_UM_AUTOR.docx
@@ -7945,6 +7945,964 @@
           <w:szCs w:val="21"/>
         </w:rPr>
         <w:t xml:space="preserve">Também não sabia por que não tinha contado.</w:t>
+      </w:r>
+    </w:p>
+    <w:p>
+      <w:pPr>
+        <w:pageBreakBefore/>
+        <w:spacing w:after="120" w:before="1800"/>
+        <w:jc w:val="center"/>
+      </w:pPr>
+      <w:r>
+        <w:rPr>
+          <w:rFonts w:ascii="Georgia" w:cs="Georgia" w:eastAsia="Georgia" w:hAnsi="Georgia"/>
+          <w:spacing w:val="40"/>
+          <w:sz w:val="20"/>
+          <w:szCs w:val="20"/>
+        </w:rPr>
+        <w:t xml:space="preserve">CAPÍTULO 9</w:t>
+      </w:r>
+    </w:p>
+    <w:p>
+      <w:pPr>
+        <w:spacing w:after="720"/>
+        <w:jc w:val="center"/>
+      </w:pPr>
+      <w:r>
+        <w:rPr>
+          <w:rFonts w:ascii="Georgia" w:cs="Georgia" w:eastAsia="Georgia" w:hAnsi="Georgia"/>
+          <w:b/>
+          <w:bCs/>
+          <w:sz w:val="32"/>
+          <w:szCs w:val="32"/>
+        </w:rPr>
+        <w:t xml:space="preserve">O frasco</w:t>
+      </w:r>
+    </w:p>
+    <w:p>
+      <w:pPr>
+        <w:spacing w:after="0" w:line="312"/>
+        <w:ind w:firstLine="340"/>
+        <w:jc w:val="both"/>
+      </w:pPr>
+      <w:r>
+        <w:rPr>
+          <w:rFonts w:ascii="Georgia" w:cs="Georgia" w:eastAsia="Georgia" w:hAnsi="Georgia"/>
+          <w:sz w:val="21"/>
+          <w:szCs w:val="21"/>
+        </w:rPr>
+        <w:t xml:space="preserve">Dona Cida abriu o portão com o pano de prato ainda no ombro e um sorriso que tentou ser alegre e não conseguiu.</w:t>
+      </w:r>
+    </w:p>
+    <w:p>
+      <w:pPr>
+        <w:spacing w:after="0" w:line="312"/>
+        <w:ind w:firstLine="340"/>
+        <w:jc w:val="both"/>
+      </w:pPr>
+      <w:r>
+        <w:rPr>
+          <w:rFonts w:ascii="Georgia" w:cs="Georgia" w:eastAsia="Georgia" w:hAnsi="Georgia"/>
+          <w:sz w:val="21"/>
+          <w:szCs w:val="21"/>
+        </w:rPr>
+        <w:t xml:space="preserve">— Menina Lia! A dona Helena não está. Foi ao advogado, volta só no fim da tarde.</w:t>
+      </w:r>
+    </w:p>
+    <w:p>
+      <w:pPr>
+        <w:spacing w:after="0" w:line="312"/>
+        <w:ind w:firstLine="340"/>
+        <w:jc w:val="both"/>
+      </w:pPr>
+      <w:r>
+        <w:rPr>
+          <w:rFonts w:ascii="Georgia" w:cs="Georgia" w:eastAsia="Georgia" w:hAnsi="Georgia"/>
+          <w:sz w:val="21"/>
+          <w:szCs w:val="21"/>
+        </w:rPr>
+        <w:t xml:space="preserve">— Eu sei, Cida. Eu esqueci uma coisa no escritório do pai, na semana passada. É rapidinho.</w:t>
+      </w:r>
+    </w:p>
+    <w:p>
+      <w:pPr>
+        <w:spacing w:after="0" w:line="312"/>
+        <w:ind w:firstLine="340"/>
+        <w:jc w:val="both"/>
+      </w:pPr>
+      <w:r>
+        <w:rPr>
+          <w:rFonts w:ascii="Georgia" w:cs="Georgia" w:eastAsia="Georgia" w:hAnsi="Georgia"/>
+          <w:sz w:val="21"/>
+          <w:szCs w:val="21"/>
+        </w:rPr>
+        <w:t xml:space="preserve">Dona Cida trabalhava naquela casa havia vinte e dois anos. Tinha visto Lia aprender a andar no corredor de mármore, tinha cuidado da catapora dela, tinha chorado escondida na lavanderia no dia em que Sílvia saiu de casa levando as duas crianças. Para ela, a menina Lia nunca precisaria de motivo para entrar.</w:t>
+      </w:r>
+    </w:p>
+    <w:p>
+      <w:pPr>
+        <w:spacing w:after="0" w:line="312"/>
+        <w:ind w:firstLine="340"/>
+        <w:jc w:val="both"/>
+      </w:pPr>
+      <w:r>
+        <w:rPr>
+          <w:rFonts w:ascii="Georgia" w:cs="Georgia" w:eastAsia="Georgia" w:hAnsi="Georgia"/>
+          <w:sz w:val="21"/>
+          <w:szCs w:val="21"/>
+        </w:rPr>
+        <w:t xml:space="preserve">— Quer um suco? Eu fiz de laranja.</w:t>
+      </w:r>
+    </w:p>
+    <w:p>
+      <w:pPr>
+        <w:spacing w:after="0" w:line="312"/>
+        <w:ind w:firstLine="340"/>
+        <w:jc w:val="both"/>
+      </w:pPr>
+      <w:r>
+        <w:rPr>
+          <w:rFonts w:ascii="Georgia" w:cs="Georgia" w:eastAsia="Georgia" w:hAnsi="Georgia"/>
+          <w:sz w:val="21"/>
+          <w:szCs w:val="21"/>
+        </w:rPr>
+        <w:t xml:space="preserve">— Depois, Cida. Obrigada.</w:t>
+      </w:r>
+    </w:p>
+    <w:p>
+      <w:pPr>
+        <w:spacing w:after="0" w:line="312"/>
+        <w:ind w:firstLine="340"/>
+        <w:jc w:val="both"/>
+      </w:pPr>
+      <w:r>
+        <w:rPr>
+          <w:rFonts w:ascii="Georgia" w:cs="Georgia" w:eastAsia="Georgia" w:hAnsi="Georgia"/>
+          <w:sz w:val="21"/>
+          <w:szCs w:val="21"/>
+        </w:rPr>
+        <w:t xml:space="preserve">Lia subiu a escada sem fazer barulho, embora não houvesse ninguém para ouvir.</w:t>
+      </w:r>
+    </w:p>
+    <w:p>
+      <w:pPr>
+        <w:spacing w:after="200" w:before="200"/>
+        <w:jc w:val="center"/>
+      </w:pPr>
+      <w:r>
+        <w:rPr>
+          <w:rFonts w:ascii="Georgia" w:cs="Georgia" w:eastAsia="Georgia" w:hAnsi="Georgia"/>
+          <w:sz w:val="22"/>
+          <w:szCs w:val="22"/>
+        </w:rPr>
+        <w:t xml:space="preserve">*</w:t>
+      </w:r>
+    </w:p>
+    <w:p>
+      <w:pPr>
+        <w:spacing w:after="0" w:line="312"/>
+        <w:ind w:firstLine="340"/>
+        <w:jc w:val="both"/>
+      </w:pPr>
+      <w:r>
+        <w:rPr>
+          <w:rFonts w:ascii="Georgia" w:cs="Georgia" w:eastAsia="Georgia" w:hAnsi="Georgia"/>
+          <w:sz w:val="21"/>
+          <w:szCs w:val="21"/>
+        </w:rPr>
+        <w:t xml:space="preserve">Não foi ao escritório.</w:t>
+      </w:r>
+    </w:p>
+    <w:p>
+      <w:pPr>
+        <w:spacing w:after="0" w:line="312"/>
+        <w:ind w:firstLine="340"/>
+        <w:jc w:val="both"/>
+      </w:pPr>
+      <w:r>
+        <w:rPr>
+          <w:rFonts w:ascii="Georgia" w:cs="Georgia" w:eastAsia="Georgia" w:hAnsi="Georgia"/>
+          <w:sz w:val="21"/>
+          <w:szCs w:val="21"/>
+        </w:rPr>
+        <w:t xml:space="preserve">Foi direto ao quarto do casal, no fim do corredor, e parou na porta com o coração batendo na garganta. Nunca tinha entrado ali depois que Helena se mudou. A cama estava feita com lençóis brancos, esticados como numa vitrine. Do lado esquerdo, o lado do pai, a mesa de cabeceira continuava com os óculos de leitura dele e um livro de capa dura sobre a história do seguro marítimo, marcado na página cento e doze. Do lado direito, o de Helena, só um abajur e um porta-retratos virado para baixo.</w:t>
+      </w:r>
+    </w:p>
+    <w:p>
+      <w:pPr>
+        <w:spacing w:after="0" w:line="312"/>
+        <w:ind w:firstLine="340"/>
+        <w:jc w:val="both"/>
+      </w:pPr>
+      <w:r>
+        <w:rPr>
+          <w:rFonts w:ascii="Georgia" w:cs="Georgia" w:eastAsia="Georgia" w:hAnsi="Georgia"/>
+          <w:sz w:val="21"/>
+          <w:szCs w:val="21"/>
+        </w:rPr>
+        <w:t xml:space="preserve">Lia levantou o porta-retratos. Era uma foto do casamento: Henrique de terno claro, Helena de vestido creme, os dois sorrindo para alguém fora do quadro. Lia não lembrava daquele sorriso no rosto do pai. Não lembrava daquele sorriso no rosto de Helena, nunca.</w:t>
+      </w:r>
+    </w:p>
+    <w:p>
+      <w:pPr>
+        <w:spacing w:after="0" w:line="312"/>
+        <w:ind w:firstLine="340"/>
+        <w:jc w:val="both"/>
+      </w:pPr>
+      <w:r>
+        <w:rPr>
+          <w:rFonts w:ascii="Georgia" w:cs="Georgia" w:eastAsia="Georgia" w:hAnsi="Georgia"/>
+          <w:sz w:val="21"/>
+          <w:szCs w:val="21"/>
+        </w:rPr>
+        <w:t xml:space="preserve">Pôs o porta-retratos de volta, virado para baixo, exatamente como estava.</w:t>
+      </w:r>
+    </w:p>
+    <w:p>
+      <w:pPr>
+        <w:spacing w:after="0" w:line="312"/>
+        <w:ind w:firstLine="340"/>
+        <w:jc w:val="both"/>
+      </w:pPr>
+      <w:r>
+        <w:rPr>
+          <w:rFonts w:ascii="Georgia" w:cs="Georgia" w:eastAsia="Georgia" w:hAnsi="Georgia"/>
+          <w:sz w:val="21"/>
+          <w:szCs w:val="21"/>
+        </w:rPr>
+        <w:t xml:space="preserve">O banheiro da suíte era maior que o quarto dela na infância. No armário de espelho, três prateleiras. Na de cima, as coisas do pai: o barbeador, a loção pós-barba, o frasco do remédio da pressão, com o nome dele no rótulo da farmácia e a letra do doutor Álvaro na receita grampeada. Lia abriu o frasco. Comprimidos brancos, redondos, iguais. Contou por alto. Faltavam poucos. O pai tomava direitinho.</w:t>
+      </w:r>
+    </w:p>
+    <w:p>
+      <w:pPr>
+        <w:spacing w:after="0" w:line="312"/>
+        <w:ind w:firstLine="340"/>
+        <w:jc w:val="both"/>
+      </w:pPr>
+      <w:r>
+        <w:rPr>
+          <w:rFonts w:ascii="Georgia" w:cs="Georgia" w:eastAsia="Georgia" w:hAnsi="Georgia"/>
+          <w:sz w:val="21"/>
+          <w:szCs w:val="21"/>
+        </w:rPr>
+        <w:t xml:space="preserve">Na prateleira do meio, os cremes de Helena, alinhados como soldados. Na de baixo, uma nécessaire de couro marrom, fechada com zíper.</w:t>
+      </w:r>
+    </w:p>
+    <w:p>
+      <w:pPr>
+        <w:spacing w:after="0" w:line="312"/>
+        <w:ind w:firstLine="340"/>
+        <w:jc w:val="both"/>
+      </w:pPr>
+      <w:r>
+        <w:rPr>
+          <w:rFonts w:ascii="Georgia" w:cs="Georgia" w:eastAsia="Georgia" w:hAnsi="Georgia"/>
+          <w:sz w:val="21"/>
+          <w:szCs w:val="21"/>
+        </w:rPr>
+        <w:t xml:space="preserve">Lia abriu.</w:t>
+      </w:r>
+    </w:p>
+    <w:p>
+      <w:pPr>
+        <w:spacing w:after="0" w:line="312"/>
+        <w:ind w:firstLine="340"/>
+        <w:jc w:val="both"/>
+      </w:pPr>
+      <w:r>
+        <w:rPr>
+          <w:rFonts w:ascii="Georgia" w:cs="Georgia" w:eastAsia="Georgia" w:hAnsi="Georgia"/>
+          <w:sz w:val="21"/>
+          <w:szCs w:val="21"/>
+        </w:rPr>
+        <w:t xml:space="preserve">Batom. Pinça. Um vidro de perfume pequeno. Uma cartela de calmantes pela metade. E, no fundo, embrulhado num lenço de papel, um frasco âmbar, do tamanho de um dedo, com tampa de rosca e nenhum rótulo.</w:t>
+      </w:r>
+    </w:p>
+    <w:p>
+      <w:pPr>
+        <w:spacing w:after="0" w:line="312"/>
+        <w:ind w:firstLine="340"/>
+        <w:jc w:val="both"/>
+      </w:pPr>
+      <w:r>
+        <w:rPr>
+          <w:rFonts w:ascii="Georgia" w:cs="Georgia" w:eastAsia="Georgia" w:hAnsi="Georgia"/>
+          <w:sz w:val="21"/>
+          <w:szCs w:val="21"/>
+        </w:rPr>
+        <w:t xml:space="preserve">Lia segurou o frasco contra a luz da janela. Estava quase cheio de um líquido transparente. Não tinha nome, não tinha data, não tinha farmácia. Não era o tipo de coisa que alguém compra numa drogaria e guarda junto com o batom.</w:t>
+      </w:r>
+    </w:p>
+    <w:p>
+      <w:pPr>
+        <w:spacing w:after="0" w:line="312"/>
+        <w:ind w:firstLine="340"/>
+        <w:jc w:val="both"/>
+      </w:pPr>
+      <w:r>
+        <w:rPr>
+          <w:rFonts w:ascii="Georgia" w:cs="Georgia" w:eastAsia="Georgia" w:hAnsi="Georgia"/>
+          <w:sz w:val="21"/>
+          <w:szCs w:val="21"/>
+        </w:rPr>
+        <w:t xml:space="preserve">Ela ouviu, lá embaixo, o liquidificador de Dona Cida.</w:t>
+      </w:r>
+    </w:p>
+    <w:p>
+      <w:pPr>
+        <w:spacing w:after="0" w:line="312"/>
+        <w:ind w:firstLine="340"/>
+        <w:jc w:val="both"/>
+      </w:pPr>
+      <w:r>
+        <w:rPr>
+          <w:rFonts w:ascii="Georgia" w:cs="Georgia" w:eastAsia="Georgia" w:hAnsi="Georgia"/>
+          <w:sz w:val="21"/>
+          <w:szCs w:val="21"/>
+        </w:rPr>
+        <w:t xml:space="preserve">Embrulhou o frasco de novo no lenço e o colocou no bolso do casaco.</w:t>
+      </w:r>
+    </w:p>
+    <w:p>
+      <w:pPr>
+        <w:spacing w:after="200" w:before="200"/>
+        <w:jc w:val="center"/>
+      </w:pPr>
+      <w:r>
+        <w:rPr>
+          <w:rFonts w:ascii="Georgia" w:cs="Georgia" w:eastAsia="Georgia" w:hAnsi="Georgia"/>
+          <w:sz w:val="22"/>
+          <w:szCs w:val="22"/>
+        </w:rPr>
+        <w:t xml:space="preserve">*</w:t>
+      </w:r>
+    </w:p>
+    <w:p>
+      <w:pPr>
+        <w:spacing w:after="0" w:line="312"/>
+        <w:ind w:firstLine="340"/>
+        <w:jc w:val="both"/>
+      </w:pPr>
+      <w:r>
+        <w:rPr>
+          <w:rFonts w:ascii="Georgia" w:cs="Georgia" w:eastAsia="Georgia" w:hAnsi="Georgia"/>
+          <w:sz w:val="21"/>
+          <w:szCs w:val="21"/>
+        </w:rPr>
+        <w:t xml:space="preserve">O caderno estava na gaveta da mesa de cabeceira de Helena, debaixo de uma caixa de lenços.</w:t>
+      </w:r>
+    </w:p>
+    <w:p>
+      <w:pPr>
+        <w:spacing w:after="0" w:line="312"/>
+        <w:ind w:firstLine="340"/>
+        <w:jc w:val="both"/>
+      </w:pPr>
+      <w:r>
+        <w:rPr>
+          <w:rFonts w:ascii="Georgia" w:cs="Georgia" w:eastAsia="Georgia" w:hAnsi="Georgia"/>
+          <w:sz w:val="21"/>
+          <w:szCs w:val="21"/>
+        </w:rPr>
+        <w:t xml:space="preserve">Era um caderno simples, de capa preta, desses de papelaria de bairro. Na primeira página, com a letra redonda e firme que Lia conhecia dos cartões de Natal, estava escrito um nome só: Raul.</w:t>
+      </w:r>
+    </w:p>
+    <w:p>
+      <w:pPr>
+        <w:spacing w:after="0" w:line="312"/>
+        <w:ind w:firstLine="340"/>
+        <w:jc w:val="both"/>
+      </w:pPr>
+      <w:r>
+        <w:rPr>
+          <w:rFonts w:ascii="Georgia" w:cs="Georgia" w:eastAsia="Georgia" w:hAnsi="Georgia"/>
+          <w:sz w:val="21"/>
+          <w:szCs w:val="21"/>
+        </w:rPr>
+        <w:t xml:space="preserve">Lia sentou-se na beira da cama.</w:t>
+      </w:r>
+    </w:p>
+    <w:p>
+      <w:pPr>
+        <w:spacing w:after="0" w:line="312"/>
+        <w:ind w:firstLine="340"/>
+        <w:jc w:val="both"/>
+      </w:pPr>
+      <w:r>
+        <w:rPr>
+          <w:rFonts w:ascii="Georgia" w:cs="Georgia" w:eastAsia="Georgia" w:hAnsi="Georgia"/>
+          <w:sz w:val="21"/>
+          <w:szCs w:val="21"/>
+        </w:rPr>
+        <w:t xml:space="preserve">As primeiras páginas eram de 2007. Frases soltas, às vezes uma por mês, às vezes uma por semana. Hoje fez seis meses. Hoje ele me chamou de querida no restaurante e eu sorri. Hoje eu vi a assinatura dele num contrato e lembrei da sua mão tremendo. Não eram cartas, exatamente. Eram uma conversa com um morto. A conversa de uma filha que tinha entrado na casa do inimigo e precisava contar a alguém o que via lá dentro.</w:t>
+      </w:r>
+    </w:p>
+    <w:p>
+      <w:pPr>
+        <w:spacing w:after="0" w:line="312"/>
+        <w:ind w:firstLine="340"/>
+        <w:jc w:val="both"/>
+      </w:pPr>
+      <w:r>
+        <w:rPr>
+          <w:rFonts w:ascii="Georgia" w:cs="Georgia" w:eastAsia="Georgia" w:hAnsi="Georgia"/>
+          <w:sz w:val="21"/>
+          <w:szCs w:val="21"/>
+        </w:rPr>
+        <w:t xml:space="preserve">Lia virou as páginas mais depressa. Chegou a 2010.</w:t>
+      </w:r>
+    </w:p>
+    <w:p>
+      <w:pPr>
+        <w:spacing w:after="0" w:line="312"/>
+        <w:ind w:firstLine="340"/>
+        <w:jc w:val="both"/>
+      </w:pPr>
+      <w:r>
+        <w:rPr>
+          <w:rFonts w:ascii="Georgia" w:cs="Georgia" w:eastAsia="Georgia" w:hAnsi="Georgia"/>
+          <w:sz w:val="21"/>
+          <w:szCs w:val="21"/>
+        </w:rPr>
+        <w:t xml:space="preserve">Fevereiro. Não foi dessa vez. Ele saiu de lá como se nada tivesse acontecido. Um homem morreu no lugar dele, pai. Um homem que abria um portão.</w:t>
+      </w:r>
+    </w:p>
+    <w:p>
+      <w:pPr>
+        <w:spacing w:after="0" w:line="312"/>
+        <w:ind w:firstLine="340"/>
+        <w:jc w:val="both"/>
+      </w:pPr>
+      <w:r>
+        <w:rPr>
+          <w:rFonts w:ascii="Georgia" w:cs="Georgia" w:eastAsia="Georgia" w:hAnsi="Georgia"/>
+          <w:sz w:val="21"/>
+          <w:szCs w:val="21"/>
+        </w:rPr>
+        <w:t xml:space="preserve">Lia sentiu o sangue gelar. O motel.</w:t>
+      </w:r>
+    </w:p>
+    <w:p>
+      <w:pPr>
+        <w:spacing w:after="0" w:line="312"/>
+        <w:ind w:firstLine="340"/>
+        <w:jc w:val="both"/>
+      </w:pPr>
+      <w:r>
+        <w:rPr>
+          <w:rFonts w:ascii="Georgia" w:cs="Georgia" w:eastAsia="Georgia" w:hAnsi="Georgia"/>
+          <w:sz w:val="21"/>
+          <w:szCs w:val="21"/>
+        </w:rPr>
+        <w:t xml:space="preserve">Maio. De novo. Saiu andando, algemado, mas andando. Todo mundo fala dele na televisão. Chamaram ele de imorrível. Ninguém é imorrível, pai. Ninguém.</w:t>
+      </w:r>
+    </w:p>
+    <w:p>
+      <w:pPr>
+        <w:spacing w:after="0" w:line="312"/>
+        <w:ind w:firstLine="340"/>
+        <w:jc w:val="both"/>
+      </w:pPr>
+      <w:r>
+        <w:rPr>
+          <w:rFonts w:ascii="Georgia" w:cs="Georgia" w:eastAsia="Georgia" w:hAnsi="Georgia"/>
+          <w:sz w:val="21"/>
+          <w:szCs w:val="21"/>
+        </w:rPr>
+        <w:t xml:space="preserve">Julho. Mais um. Agora no hotel. A polícia veio aqui em casa. Eu servi café para a delegada.</w:t>
+      </w:r>
+    </w:p>
+    <w:p>
+      <w:pPr>
+        <w:spacing w:after="0" w:line="312"/>
+        <w:ind w:firstLine="340"/>
+        <w:jc w:val="both"/>
+      </w:pPr>
+      <w:r>
+        <w:rPr>
+          <w:rFonts w:ascii="Georgia" w:cs="Georgia" w:eastAsia="Georgia" w:hAnsi="Georgia"/>
+          <w:sz w:val="21"/>
+          <w:szCs w:val="21"/>
+        </w:rPr>
+        <w:t xml:space="preserve">Setembro. O Nestor. O Nestor, pai. Que me levava ao supermercado às quintas e me contava das netas. Quantas pessoas ainda vão morrer no lugar dele?</w:t>
+      </w:r>
+    </w:p>
+    <w:p>
+      <w:pPr>
+        <w:spacing w:after="0" w:line="312"/>
+        <w:ind w:firstLine="340"/>
+        <w:jc w:val="both"/>
+      </w:pPr>
+      <w:r>
+        <w:rPr>
+          <w:rFonts w:ascii="Georgia" w:cs="Georgia" w:eastAsia="Georgia" w:hAnsi="Georgia"/>
+          <w:sz w:val="21"/>
+          <w:szCs w:val="21"/>
+        </w:rPr>
+        <w:t xml:space="preserve">E depois disso, quase em branco, uma página inteira para uma única linha, escrita com uma caneta diferente, mais grossa, apertada contra o papel com tanta força que atravessava a folha.</w:t>
+      </w:r>
+    </w:p>
+    <w:p>
+      <w:pPr>
+        <w:spacing w:after="0" w:line="312"/>
+        <w:ind w:firstLine="340"/>
+        <w:jc w:val="both"/>
+      </w:pPr>
+      <w:r>
+        <w:rPr>
+          <w:rFonts w:ascii="Georgia" w:cs="Georgia" w:eastAsia="Georgia" w:hAnsi="Georgia"/>
+          <w:sz w:val="21"/>
+          <w:szCs w:val="21"/>
+        </w:rPr>
+        <w:t xml:space="preserve">Era de uma segunda-feira. A segunda-feira em que o pai tinha aparecido no apartamento de Lia com uma garrafa de vinho fechada. A véspera da morte.</w:t>
+      </w:r>
+    </w:p>
+    <w:p>
+      <w:pPr>
+        <w:spacing w:after="0" w:line="312"/>
+        <w:ind w:firstLine="340"/>
+        <w:jc w:val="both"/>
+      </w:pPr>
+      <w:r>
+        <w:rPr>
+          <w:rFonts w:ascii="Georgia" w:cs="Georgia" w:eastAsia="Georgia" w:hAnsi="Georgia"/>
+          <w:sz w:val="21"/>
+          <w:szCs w:val="21"/>
+        </w:rPr>
+        <w:t xml:space="preserve">Amanhã. Por você.</w:t>
+      </w:r>
+    </w:p>
+    <w:p>
+      <w:pPr>
+        <w:spacing w:after="200" w:before="200"/>
+        <w:jc w:val="center"/>
+      </w:pPr>
+      <w:r>
+        <w:rPr>
+          <w:rFonts w:ascii="Georgia" w:cs="Georgia" w:eastAsia="Georgia" w:hAnsi="Georgia"/>
+          <w:sz w:val="22"/>
+          <w:szCs w:val="22"/>
+        </w:rPr>
+        <w:t xml:space="preserve">*</w:t>
+      </w:r>
+    </w:p>
+    <w:p>
+      <w:pPr>
+        <w:spacing w:after="0" w:line="312"/>
+        <w:ind w:firstLine="340"/>
+        <w:jc w:val="both"/>
+      </w:pPr>
+      <w:r>
+        <w:rPr>
+          <w:rFonts w:ascii="Georgia" w:cs="Georgia" w:eastAsia="Georgia" w:hAnsi="Georgia"/>
+          <w:sz w:val="21"/>
+          <w:szCs w:val="21"/>
+        </w:rPr>
+        <w:t xml:space="preserve">Lia fotografou as páginas com o celular, uma por uma, as mãos tremendo tanto que precisou repetir três fotos. Depois devolveu o caderno à gaveta, debaixo da caixa de lenços, na mesma posição. Alisou a colcha onde tinha se sentado.</w:t>
+      </w:r>
+    </w:p>
+    <w:p>
+      <w:pPr>
+        <w:spacing w:after="0" w:line="312"/>
+        <w:ind w:firstLine="340"/>
+        <w:jc w:val="both"/>
+      </w:pPr>
+      <w:r>
+        <w:rPr>
+          <w:rFonts w:ascii="Georgia" w:cs="Georgia" w:eastAsia="Georgia" w:hAnsi="Georgia"/>
+          <w:sz w:val="21"/>
+          <w:szCs w:val="21"/>
+        </w:rPr>
+        <w:t xml:space="preserve">Na escada, cruzou com Dona Cida subindo com um copo de suco.</w:t>
+      </w:r>
+    </w:p>
+    <w:p>
+      <w:pPr>
+        <w:spacing w:after="0" w:line="312"/>
+        <w:ind w:firstLine="340"/>
+        <w:jc w:val="both"/>
+      </w:pPr>
+      <w:r>
+        <w:rPr>
+          <w:rFonts w:ascii="Georgia" w:cs="Georgia" w:eastAsia="Georgia" w:hAnsi="Georgia"/>
+          <w:sz w:val="21"/>
+          <w:szCs w:val="21"/>
+        </w:rPr>
+        <w:t xml:space="preserve">— Achou o que veio buscar, menina?</w:t>
+      </w:r>
+    </w:p>
+    <w:p>
+      <w:pPr>
+        <w:spacing w:after="0" w:line="312"/>
+        <w:ind w:firstLine="340"/>
+        <w:jc w:val="both"/>
+      </w:pPr>
+      <w:r>
+        <w:rPr>
+          <w:rFonts w:ascii="Georgia" w:cs="Georgia" w:eastAsia="Georgia" w:hAnsi="Georgia"/>
+          <w:sz w:val="21"/>
+          <w:szCs w:val="21"/>
+        </w:rPr>
+        <w:t xml:space="preserve">— Achei, Cida.</w:t>
+      </w:r>
+    </w:p>
+    <w:p>
+      <w:pPr>
+        <w:spacing w:after="0" w:line="312"/>
+        <w:ind w:firstLine="340"/>
+        <w:jc w:val="both"/>
+      </w:pPr>
+      <w:r>
+        <w:rPr>
+          <w:rFonts w:ascii="Georgia" w:cs="Georgia" w:eastAsia="Georgia" w:hAnsi="Georgia"/>
+          <w:sz w:val="21"/>
+          <w:szCs w:val="21"/>
+        </w:rPr>
+        <w:t xml:space="preserve">— Toma pelo menos o suco. Você está branca.</w:t>
+      </w:r>
+    </w:p>
+    <w:p>
+      <w:pPr>
+        <w:spacing w:after="0" w:line="312"/>
+        <w:ind w:firstLine="340"/>
+        <w:jc w:val="both"/>
+      </w:pPr>
+      <w:r>
+        <w:rPr>
+          <w:rFonts w:ascii="Georgia" w:cs="Georgia" w:eastAsia="Georgia" w:hAnsi="Georgia"/>
+          <w:sz w:val="21"/>
+          <w:szCs w:val="21"/>
+        </w:rPr>
+        <w:t xml:space="preserve">Lia tomou o suco de pé, no corredor, em três goles. Estava doce demais, como sempre. Dona Cida a olhava com aquele carinho preocupado de quem ainda vê uma criança de seis anos.</w:t>
+      </w:r>
+    </w:p>
+    <w:p>
+      <w:pPr>
+        <w:spacing w:after="0" w:line="312"/>
+        <w:ind w:firstLine="340"/>
+        <w:jc w:val="both"/>
+      </w:pPr>
+      <w:r>
+        <w:rPr>
+          <w:rFonts w:ascii="Georgia" w:cs="Georgia" w:eastAsia="Georgia" w:hAnsi="Georgia"/>
+          <w:sz w:val="21"/>
+          <w:szCs w:val="21"/>
+        </w:rPr>
+        <w:t xml:space="preserve">— Cida. Quem cuidava dos remédios do meu pai?</w:t>
+      </w:r>
+    </w:p>
+    <w:p>
+      <w:pPr>
+        <w:spacing w:after="0" w:line="312"/>
+        <w:ind w:firstLine="340"/>
+        <w:jc w:val="both"/>
+      </w:pPr>
+      <w:r>
+        <w:rPr>
+          <w:rFonts w:ascii="Georgia" w:cs="Georgia" w:eastAsia="Georgia" w:hAnsi="Georgia"/>
+          <w:sz w:val="21"/>
+          <w:szCs w:val="21"/>
+        </w:rPr>
+        <w:t xml:space="preserve">A empregada pensou um pouco.</w:t>
+      </w:r>
+    </w:p>
+    <w:p>
+      <w:pPr>
+        <w:spacing w:after="0" w:line="312"/>
+        <w:ind w:firstLine="340"/>
+        <w:jc w:val="both"/>
+      </w:pPr>
+      <w:r>
+        <w:rPr>
+          <w:rFonts w:ascii="Georgia" w:cs="Georgia" w:eastAsia="Georgia" w:hAnsi="Georgia"/>
+          <w:sz w:val="21"/>
+          <w:szCs w:val="21"/>
+        </w:rPr>
+        <w:t xml:space="preserve">— Ele mesmo, menina. Ele era muito certinho. Mas, nos últimos tempos, era a dona Helena que separava os comprimidos de manhã, numa caixinha com os dias da semana. Ela dizia que ele andava esquecido. — Dona Cida baixou a voz. — Ele andava mesmo. Esquecido, nervoso. Dormia mal. Às vezes eu chegava de manhã e ele já estava acordado no escritório, sentado no escuro.</w:t>
+      </w:r>
+    </w:p>
+    <w:p>
+      <w:pPr>
+        <w:spacing w:after="0" w:line="312"/>
+        <w:ind w:firstLine="340"/>
+        <w:jc w:val="both"/>
+      </w:pPr>
+      <w:r>
+        <w:rPr>
+          <w:rFonts w:ascii="Georgia" w:cs="Georgia" w:eastAsia="Georgia" w:hAnsi="Georgia"/>
+          <w:sz w:val="21"/>
+          <w:szCs w:val="21"/>
+        </w:rPr>
+        <w:t xml:space="preserve">Lia devolveu o copo.</w:t>
+      </w:r>
+    </w:p>
+    <w:p>
+      <w:pPr>
+        <w:spacing w:after="0" w:line="312"/>
+        <w:ind w:firstLine="340"/>
+        <w:jc w:val="both"/>
+      </w:pPr>
+      <w:r>
+        <w:rPr>
+          <w:rFonts w:ascii="Georgia" w:cs="Georgia" w:eastAsia="Georgia" w:hAnsi="Georgia"/>
+          <w:sz w:val="21"/>
+          <w:szCs w:val="21"/>
+        </w:rPr>
+        <w:t xml:space="preserve">— Obrigada pelo suco.</w:t>
+      </w:r>
+    </w:p>
+    <w:p>
+      <w:pPr>
+        <w:spacing w:after="200" w:before="200"/>
+        <w:jc w:val="center"/>
+      </w:pPr>
+      <w:r>
+        <w:rPr>
+          <w:rFonts w:ascii="Georgia" w:cs="Georgia" w:eastAsia="Georgia" w:hAnsi="Georgia"/>
+          <w:sz w:val="22"/>
+          <w:szCs w:val="22"/>
+        </w:rPr>
+        <w:t xml:space="preserve">*</w:t>
+      </w:r>
+    </w:p>
+    <w:p>
+      <w:pPr>
+        <w:spacing w:after="0" w:line="312"/>
+        <w:ind w:firstLine="340"/>
+        <w:jc w:val="both"/>
+      </w:pPr>
+      <w:r>
+        <w:rPr>
+          <w:rFonts w:ascii="Georgia" w:cs="Georgia" w:eastAsia="Georgia" w:hAnsi="Georgia"/>
+          <w:sz w:val="21"/>
+          <w:szCs w:val="21"/>
+        </w:rPr>
+        <w:t xml:space="preserve">Ligou para Lucas do carro, ainda na frente da casa, com o frasco no bolso do casaco pesando como uma pedra.</w:t>
+      </w:r>
+    </w:p>
+    <w:p>
+      <w:pPr>
+        <w:spacing w:after="0" w:line="312"/>
+        <w:ind w:firstLine="340"/>
+        <w:jc w:val="both"/>
+      </w:pPr>
+      <w:r>
+        <w:rPr>
+          <w:rFonts w:ascii="Georgia" w:cs="Georgia" w:eastAsia="Georgia" w:hAnsi="Georgia"/>
+          <w:sz w:val="21"/>
+          <w:szCs w:val="21"/>
+        </w:rPr>
+        <w:t xml:space="preserve">— Foi ela — disse, antes que ele falasse alô.</w:t>
+      </w:r>
+    </w:p>
+    <w:p>
+      <w:pPr>
+        <w:spacing w:after="0" w:line="312"/>
+        <w:ind w:firstLine="340"/>
+        <w:jc w:val="both"/>
+      </w:pPr>
+      <w:r>
+        <w:rPr>
+          <w:rFonts w:ascii="Georgia" w:cs="Georgia" w:eastAsia="Georgia" w:hAnsi="Georgia"/>
+          <w:sz w:val="21"/>
+          <w:szCs w:val="21"/>
+        </w:rPr>
+        <w:t xml:space="preserve">Contou do caderno, do nome Raul na primeira página, das entradas depois de cada morte, da caixinha de comprimidos com os dias da semana. E, por último, da página quase em branco.</w:t>
+      </w:r>
+    </w:p>
+    <w:p>
+      <w:pPr>
+        <w:spacing w:after="0" w:line="312"/>
+        <w:ind w:firstLine="340"/>
+        <w:jc w:val="both"/>
+      </w:pPr>
+      <w:r>
+        <w:rPr>
+          <w:rFonts w:ascii="Georgia" w:cs="Georgia" w:eastAsia="Georgia" w:hAnsi="Georgia"/>
+          <w:sz w:val="21"/>
+          <w:szCs w:val="21"/>
+        </w:rPr>
+        <w:t xml:space="preserve">— Amanhã. Por você — repetiu Lucas, devagar. — Escrito na segunda.</w:t>
+      </w:r>
+    </w:p>
+    <w:p>
+      <w:pPr>
+        <w:spacing w:after="0" w:line="312"/>
+        <w:ind w:firstLine="340"/>
+        <w:jc w:val="both"/>
+      </w:pPr>
+      <w:r>
+        <w:rPr>
+          <w:rFonts w:ascii="Georgia" w:cs="Georgia" w:eastAsia="Georgia" w:hAnsi="Georgia"/>
+          <w:sz w:val="21"/>
+          <w:szCs w:val="21"/>
+        </w:rPr>
+        <w:t xml:space="preserve">— Na véspera, Lucas. Na véspera de ele morrer. E ela separava os remédios dele. E ela escolheu a cremação. E eu estou com um frasco sem rótulo no bolso que estava escondido na nécessaire dela.</w:t>
+      </w:r>
+    </w:p>
+    <w:p>
+      <w:pPr>
+        <w:spacing w:after="0" w:line="312"/>
+        <w:ind w:firstLine="340"/>
+        <w:jc w:val="both"/>
+      </w:pPr>
+      <w:r>
+        <w:rPr>
+          <w:rFonts w:ascii="Georgia" w:cs="Georgia" w:eastAsia="Georgia" w:hAnsi="Georgia"/>
+          <w:sz w:val="21"/>
+          <w:szCs w:val="21"/>
+        </w:rPr>
+        <w:t xml:space="preserve">— Você levou o frasco?</w:t>
+      </w:r>
+    </w:p>
+    <w:p>
+      <w:pPr>
+        <w:spacing w:after="0" w:line="312"/>
+        <w:ind w:firstLine="340"/>
+        <w:jc w:val="both"/>
+      </w:pPr>
+      <w:r>
+        <w:rPr>
+          <w:rFonts w:ascii="Georgia" w:cs="Georgia" w:eastAsia="Georgia" w:hAnsi="Georgia"/>
+          <w:sz w:val="21"/>
+          <w:szCs w:val="21"/>
+        </w:rPr>
+        <w:t xml:space="preserve">— Levei.</w:t>
+      </w:r>
+    </w:p>
+    <w:p>
+      <w:pPr>
+        <w:spacing w:after="0" w:line="312"/>
+        <w:ind w:firstLine="340"/>
+        <w:jc w:val="both"/>
+      </w:pPr>
+      <w:r>
+        <w:rPr>
+          <w:rFonts w:ascii="Georgia" w:cs="Georgia" w:eastAsia="Georgia" w:hAnsi="Georgia"/>
+          <w:sz w:val="21"/>
+          <w:szCs w:val="21"/>
+        </w:rPr>
+        <w:t xml:space="preserve">Lucas ficou em silêncio. Lia o imaginou na sala do pai, na corretora, com a porta fechada.</w:t>
+      </w:r>
+    </w:p>
+    <w:p>
+      <w:pPr>
+        <w:spacing w:after="0" w:line="312"/>
+        <w:ind w:firstLine="340"/>
+        <w:jc w:val="both"/>
+      </w:pPr>
+      <w:r>
+        <w:rPr>
+          <w:rFonts w:ascii="Georgia" w:cs="Georgia" w:eastAsia="Georgia" w:hAnsi="Georgia"/>
+          <w:sz w:val="21"/>
+          <w:szCs w:val="21"/>
+        </w:rPr>
+        <w:t xml:space="preserve">— Leva para a delegada — disse ele, enfim. — Hoje. Antes que a Helena dê falta.</w:t>
+      </w:r>
+    </w:p>
+    <w:p>
+      <w:pPr>
+        <w:spacing w:after="0" w:line="312"/>
+        <w:ind w:firstLine="340"/>
+        <w:jc w:val="both"/>
+      </w:pPr>
+      <w:r>
+        <w:rPr>
+          <w:rFonts w:ascii="Georgia" w:cs="Georgia" w:eastAsia="Georgia" w:hAnsi="Georgia"/>
+          <w:sz w:val="21"/>
+          <w:szCs w:val="21"/>
+        </w:rPr>
+        <w:t xml:space="preserve">— E se ela der falta antes?</w:t>
+      </w:r>
+    </w:p>
+    <w:p>
+      <w:pPr>
+        <w:spacing w:after="0" w:line="312"/>
+        <w:ind w:firstLine="340"/>
+        <w:jc w:val="both"/>
+      </w:pPr>
+      <w:r>
+        <w:rPr>
+          <w:rFonts w:ascii="Georgia" w:cs="Georgia" w:eastAsia="Georgia" w:hAnsi="Georgia"/>
+          <w:sz w:val="21"/>
+          <w:szCs w:val="21"/>
+        </w:rPr>
+        <w:t xml:space="preserve">— Então ela vai saber que a gente sabe.</w:t>
+      </w:r>
+    </w:p>
+    <w:p>
+      <w:pPr>
+        <w:spacing w:after="0" w:line="312"/>
+        <w:ind w:firstLine="340"/>
+        <w:jc w:val="both"/>
+      </w:pPr>
+      <w:r>
+        <w:rPr>
+          <w:rFonts w:ascii="Georgia" w:cs="Georgia" w:eastAsia="Georgia" w:hAnsi="Georgia"/>
+          <w:sz w:val="21"/>
+          <w:szCs w:val="21"/>
+        </w:rPr>
+        <w:t xml:space="preserve">Lia ligou o carro. Pelo retrovisor, viu Dona Cida no portão, acenando com o pano de prato, como fazia quando ela era pequena e ia embora com a mãe depois do fim de semana com o pai.</w:t>
+      </w:r>
+    </w:p>
+    <w:p>
+      <w:pPr>
+        <w:spacing w:after="0" w:line="312"/>
+        <w:ind w:firstLine="340"/>
+        <w:jc w:val="both"/>
+      </w:pPr>
+      <w:r>
+        <w:rPr>
+          <w:rFonts w:ascii="Georgia" w:cs="Georgia" w:eastAsia="Georgia" w:hAnsi="Georgia"/>
+          <w:sz w:val="21"/>
+          <w:szCs w:val="21"/>
+        </w:rPr>
+        <w:t xml:space="preserve">Acenou de volta.</w:t>
+      </w:r>
+    </w:p>
+    <w:p>
+      <w:pPr>
+        <w:spacing w:after="0" w:line="312"/>
+        <w:ind w:firstLine="340"/>
+        <w:jc w:val="both"/>
+      </w:pPr>
+      <w:r>
+        <w:rPr>
+          <w:rFonts w:ascii="Georgia" w:cs="Georgia" w:eastAsia="Georgia" w:hAnsi="Georgia"/>
+          <w:sz w:val="21"/>
+          <w:szCs w:val="21"/>
+        </w:rPr>
+        <w:t xml:space="preserve">Pela primeira vez desde a terça-feira, sentiu algo parecido com alívio. A dor continuava ali, inteira, mas agora tinha um nome. Tinha um rosto com uma pinta no canto do queixo.</w:t>
+      </w:r>
+    </w:p>
+    <w:p>
+      <w:pPr>
+        <w:spacing w:after="0" w:line="312"/>
+        <w:ind w:firstLine="340"/>
+        <w:jc w:val="both"/>
+      </w:pPr>
+      <w:r>
+        <w:rPr>
+          <w:rFonts w:ascii="Georgia" w:cs="Georgia" w:eastAsia="Georgia" w:hAnsi="Georgia"/>
+          <w:sz w:val="21"/>
+          <w:szCs w:val="21"/>
+        </w:rPr>
+        <w:t xml:space="preserve">Estava quase certa.</w:t>
+      </w:r>
+    </w:p>
+    <w:p>
+      <w:pPr>
+        <w:spacing w:after="0" w:line="312"/>
+        <w:ind w:firstLine="340"/>
+        <w:jc w:val="both"/>
+      </w:pPr>
+      <w:r>
+        <w:rPr>
+          <w:rFonts w:ascii="Georgia" w:cs="Georgia" w:eastAsia="Georgia" w:hAnsi="Georgia"/>
+          <w:sz w:val="21"/>
+          <w:szCs w:val="21"/>
+        </w:rPr>
+        <w:t xml:space="preserve">E era esse quase que não a deixou dormir naquela noite.</w:t>
       </w:r>
     </w:p>
     <w:sectPr>

</xml_diff>

<commit_message>
Livro policial: capítulo 10 (Alguém chegou antes)
Co-Authored-By: Claude Opus 5.5 <noreply@anthropic.com>
Claude-Session: https://claude.ai/code/session_01BrurxSYygRC3rRhaUYosm1
</commit_message>
<xml_diff>
--- a/docs/livro-policial/TODO_CRIME_TEM_UM_AUTOR.docx
+++ b/docs/livro-policial/TODO_CRIME_TEM_UM_AUTOR.docx
@@ -8903,6 +8903,888 @@
           <w:szCs w:val="21"/>
         </w:rPr>
         <w:t xml:space="preserve">E era esse quase que não a deixou dormir naquela noite.</w:t>
+      </w:r>
+    </w:p>
+    <w:p>
+      <w:pPr>
+        <w:pageBreakBefore/>
+        <w:spacing w:after="120" w:before="1800"/>
+        <w:jc w:val="center"/>
+      </w:pPr>
+      <w:r>
+        <w:rPr>
+          <w:rFonts w:ascii="Georgia" w:cs="Georgia" w:eastAsia="Georgia" w:hAnsi="Georgia"/>
+          <w:spacing w:val="40"/>
+          <w:sz w:val="20"/>
+          <w:szCs w:val="20"/>
+        </w:rPr>
+        <w:t xml:space="preserve">CAPÍTULO 10</w:t>
+      </w:r>
+    </w:p>
+    <w:p>
+      <w:pPr>
+        <w:spacing w:after="720"/>
+        <w:jc w:val="center"/>
+      </w:pPr>
+      <w:r>
+        <w:rPr>
+          <w:rFonts w:ascii="Georgia" w:cs="Georgia" w:eastAsia="Georgia" w:hAnsi="Georgia"/>
+          <w:b/>
+          <w:bCs/>
+          <w:sz w:val="32"/>
+          <w:szCs w:val="32"/>
+        </w:rPr>
+        <w:t xml:space="preserve">Alguém chegou antes</w:t>
+      </w:r>
+    </w:p>
+    <w:p>
+      <w:pPr>
+        <w:spacing w:after="0" w:line="312"/>
+        <w:ind w:firstLine="340"/>
+        <w:jc w:val="both"/>
+      </w:pPr>
+      <w:r>
+        <w:rPr>
+          <w:rFonts w:ascii="Georgia" w:cs="Georgia" w:eastAsia="Georgia" w:hAnsi="Georgia"/>
+          <w:sz w:val="21"/>
+          <w:szCs w:val="21"/>
+        </w:rPr>
+        <w:t xml:space="preserve">A delegada Regina Paiva segurou o frasco âmbar pela tampa, com a ponta de dois dedos, como quem segura um inseto morto.</w:t>
+      </w:r>
+    </w:p>
+    <w:p>
+      <w:pPr>
+        <w:spacing w:after="0" w:line="312"/>
+        <w:ind w:firstLine="340"/>
+        <w:jc w:val="both"/>
+      </w:pPr>
+      <w:r>
+        <w:rPr>
+          <w:rFonts w:ascii="Georgia" w:cs="Georgia" w:eastAsia="Georgia" w:hAnsi="Georgia"/>
+          <w:sz w:val="21"/>
+          <w:szCs w:val="21"/>
+        </w:rPr>
+        <w:t xml:space="preserve">— A senhora tirou isto de uma casa onde não mora, sem mandado, sem testemunha e sem luvas — disse, olhando para Lia. — Qualquer advogado razoável derruba esta prova em cinco minutos.</w:t>
+      </w:r>
+    </w:p>
+    <w:p>
+      <w:pPr>
+        <w:spacing w:after="0" w:line="312"/>
+        <w:ind w:firstLine="340"/>
+        <w:jc w:val="both"/>
+      </w:pPr>
+      <w:r>
+        <w:rPr>
+          <w:rFonts w:ascii="Georgia" w:cs="Georgia" w:eastAsia="Georgia" w:hAnsi="Georgia"/>
+          <w:sz w:val="21"/>
+          <w:szCs w:val="21"/>
+        </w:rPr>
+        <w:t xml:space="preserve">— Eu sei — respondeu Lia.</w:t>
+      </w:r>
+    </w:p>
+    <w:p>
+      <w:pPr>
+        <w:spacing w:after="0" w:line="312"/>
+        <w:ind w:firstLine="340"/>
+        <w:jc w:val="both"/>
+      </w:pPr>
+      <w:r>
+        <w:rPr>
+          <w:rFonts w:ascii="Georgia" w:cs="Georgia" w:eastAsia="Georgia" w:hAnsi="Georgia"/>
+          <w:sz w:val="21"/>
+          <w:szCs w:val="21"/>
+        </w:rPr>
+        <w:t xml:space="preserve">— Ótimo. Então sabemos as duas.</w:t>
+      </w:r>
+    </w:p>
+    <w:p>
+      <w:pPr>
+        <w:spacing w:after="0" w:line="312"/>
+        <w:ind w:firstLine="340"/>
+        <w:jc w:val="both"/>
+      </w:pPr>
+      <w:r>
+        <w:rPr>
+          <w:rFonts w:ascii="Georgia" w:cs="Georgia" w:eastAsia="Georgia" w:hAnsi="Georgia"/>
+          <w:sz w:val="21"/>
+          <w:szCs w:val="21"/>
+        </w:rPr>
+        <w:t xml:space="preserve">Lucas estava sentado ao lado da irmã, na mesma sala sem janelas onde ela tinha estado dez dias antes. O ventilador de teto girava devagar. Sobre a mesa, o celular de Lia mostrava a foto de uma página quase em branco. Amanhã. Por você.</w:t>
+      </w:r>
+    </w:p>
+    <w:p>
+      <w:pPr>
+        <w:spacing w:after="0" w:line="312"/>
+        <w:ind w:firstLine="340"/>
+        <w:jc w:val="both"/>
+      </w:pPr>
+      <w:r>
+        <w:rPr>
+          <w:rFonts w:ascii="Georgia" w:cs="Georgia" w:eastAsia="Georgia" w:hAnsi="Georgia"/>
+          <w:sz w:val="21"/>
+          <w:szCs w:val="21"/>
+        </w:rPr>
+        <w:t xml:space="preserve">Regina olhou para a foto por um longo tempo. Depois colocou o frasco num saco plástico transparente, fechou, escreveu alguma coisa na etiqueta e chamou a escrivã.</w:t>
+      </w:r>
+    </w:p>
+    <w:p>
+      <w:pPr>
+        <w:spacing w:after="0" w:line="312"/>
+        <w:ind w:firstLine="340"/>
+        <w:jc w:val="both"/>
+      </w:pPr>
+      <w:r>
+        <w:rPr>
+          <w:rFonts w:ascii="Georgia" w:cs="Georgia" w:eastAsia="Georgia" w:hAnsi="Georgia"/>
+          <w:sz w:val="21"/>
+          <w:szCs w:val="21"/>
+        </w:rPr>
+        <w:t xml:space="preserve">— Para o laboratório. Urgente. — E, quando a escrivã saiu: — Não prometo nada. Mas, se isto for o que vocês acham que é, eu quero saber antes da senhora Helena.</w:t>
+      </w:r>
+    </w:p>
+    <w:p>
+      <w:pPr>
+        <w:spacing w:after="200" w:before="200"/>
+        <w:jc w:val="center"/>
+      </w:pPr>
+      <w:r>
+        <w:rPr>
+          <w:rFonts w:ascii="Georgia" w:cs="Georgia" w:eastAsia="Georgia" w:hAnsi="Georgia"/>
+          <w:sz w:val="22"/>
+          <w:szCs w:val="22"/>
+        </w:rPr>
+        <w:t xml:space="preserve">*</w:t>
+      </w:r>
+    </w:p>
+    <w:p>
+      <w:pPr>
+        <w:spacing w:after="0" w:line="312"/>
+        <w:ind w:firstLine="340"/>
+        <w:jc w:val="both"/>
+      </w:pPr>
+      <w:r>
+        <w:rPr>
+          <w:rFonts w:ascii="Georgia" w:cs="Georgia" w:eastAsia="Georgia" w:hAnsi="Georgia"/>
+          <w:sz w:val="21"/>
+          <w:szCs w:val="21"/>
+        </w:rPr>
+        <w:t xml:space="preserve">O resultado chegou numa quinta-feira, cinco dias depois.</w:t>
+      </w:r>
+    </w:p>
+    <w:p>
+      <w:pPr>
+        <w:spacing w:after="0" w:line="312"/>
+        <w:ind w:firstLine="340"/>
+        <w:jc w:val="both"/>
+      </w:pPr>
+      <w:r>
+        <w:rPr>
+          <w:rFonts w:ascii="Georgia" w:cs="Georgia" w:eastAsia="Georgia" w:hAnsi="Georgia"/>
+          <w:sz w:val="21"/>
+          <w:szCs w:val="21"/>
+        </w:rPr>
+        <w:t xml:space="preserve">Regina ligou para Lucas às sete da manhã, antes que ele saísse para a corretora, e pediu que os dois fossem até lá. Não disse por quê. Na sala, havia uma pasta nova sobre a mesa e, ao lado dela, um saquinho com uma caixa plástica de comprimidos, dessas com os dias da semana nas tampas.</w:t>
+      </w:r>
+    </w:p>
+    <w:p>
+      <w:pPr>
+        <w:spacing w:after="0" w:line="312"/>
+        <w:ind w:firstLine="340"/>
+        <w:jc w:val="both"/>
+      </w:pPr>
+      <w:r>
+        <w:rPr>
+          <w:rFonts w:ascii="Georgia" w:cs="Georgia" w:eastAsia="Georgia" w:hAnsi="Georgia"/>
+          <w:sz w:val="21"/>
+          <w:szCs w:val="21"/>
+        </w:rPr>
+        <w:t xml:space="preserve">— O líquido do frasco é um extrato concentrado de uma planta chamada dedaleira — disse a delegada, sem rodeios. — Digitálico. Em dose pequena, é remédio para o coração. Em dose grande, provoca arritmia e parada cardíaca. Num homem de sessenta e um anos com pressão alta, ninguém estranharia um infarto.</w:t>
+      </w:r>
+    </w:p>
+    <w:p>
+      <w:pPr>
+        <w:spacing w:after="0" w:line="312"/>
+        <w:ind w:firstLine="340"/>
+        <w:jc w:val="both"/>
+      </w:pPr>
+      <w:r>
+        <w:rPr>
+          <w:rFonts w:ascii="Georgia" w:cs="Georgia" w:eastAsia="Georgia" w:hAnsi="Georgia"/>
+          <w:sz w:val="21"/>
+          <w:szCs w:val="21"/>
+        </w:rPr>
+        <w:t xml:space="preserve">Lia fechou os olhos. Lucas sentiu a nuca gelar.</w:t>
+      </w:r>
+    </w:p>
+    <w:p>
+      <w:pPr>
+        <w:spacing w:after="0" w:line="312"/>
+        <w:ind w:firstLine="340"/>
+        <w:jc w:val="both"/>
+      </w:pPr>
+      <w:r>
+        <w:rPr>
+          <w:rFonts w:ascii="Georgia" w:cs="Georgia" w:eastAsia="Georgia" w:hAnsi="Georgia"/>
+          <w:sz w:val="21"/>
+          <w:szCs w:val="21"/>
+        </w:rPr>
+        <w:t xml:space="preserve">— Então foi ela — disse.</w:t>
+      </w:r>
+    </w:p>
+    <w:p>
+      <w:pPr>
+        <w:spacing w:after="0" w:line="312"/>
+        <w:ind w:firstLine="340"/>
+        <w:jc w:val="both"/>
+      </w:pPr>
+      <w:r>
+        <w:rPr>
+          <w:rFonts w:ascii="Georgia" w:cs="Georgia" w:eastAsia="Georgia" w:hAnsi="Georgia"/>
+          <w:sz w:val="21"/>
+          <w:szCs w:val="21"/>
+        </w:rPr>
+        <w:t xml:space="preserve">— Esperem. — Regina levantou a mão. — Ontem eu fui até a casa do Jardim Europa com dois investigadores e uma ordem judicial. Conversei com a senhora Helena. Recolhi isto. — Ela empurrou a caixinha de comprimidos para o centro da mesa. — A caixa onde ela separava os remédios do marido para a semana. Montada no domingo à noite. Domingo, segunda, terça, quarta. Mandei examinar todos os comprimidos que sobraram. Todos. São exatamente o que diz a receita do doutor Álvaro. Nem um grama de dedaleira.</w:t>
+      </w:r>
+    </w:p>
+    <w:p>
+      <w:pPr>
+        <w:spacing w:after="0" w:line="312"/>
+        <w:ind w:firstLine="340"/>
+        <w:jc w:val="both"/>
+      </w:pPr>
+      <w:r>
+        <w:rPr>
+          <w:rFonts w:ascii="Georgia" w:cs="Georgia" w:eastAsia="Georgia" w:hAnsi="Georgia"/>
+          <w:sz w:val="21"/>
+          <w:szCs w:val="21"/>
+        </w:rPr>
+        <w:t xml:space="preserve">— Ela pode ter usado outra coisa — disse Lucas. — Pode ter colocado no café, no…</w:t>
+      </w:r>
+    </w:p>
+    <w:p>
+      <w:pPr>
+        <w:spacing w:after="0" w:line="312"/>
+        <w:ind w:firstLine="340"/>
+        <w:jc w:val="both"/>
+      </w:pPr>
+      <w:r>
+        <w:rPr>
+          <w:rFonts w:ascii="Georgia" w:cs="Georgia" w:eastAsia="Georgia" w:hAnsi="Georgia"/>
+          <w:sz w:val="21"/>
+          <w:szCs w:val="21"/>
+        </w:rPr>
+        <w:t xml:space="preserve">— Pode. — Regina assentiu. — Então vamos à segunda coisa. Onde estava a senhora Helena Aguiar Ferraz na noite de segunda para terça?</w:t>
+      </w:r>
+    </w:p>
+    <w:p>
+      <w:pPr>
+        <w:spacing w:after="0" w:line="312"/>
+        <w:ind w:firstLine="340"/>
+        <w:jc w:val="both"/>
+      </w:pPr>
+      <w:r>
+        <w:rPr>
+          <w:rFonts w:ascii="Georgia" w:cs="Georgia" w:eastAsia="Georgia" w:hAnsi="Georgia"/>
+          <w:sz w:val="21"/>
+          <w:szCs w:val="21"/>
+        </w:rPr>
+        <w:t xml:space="preserve">Os dois irmãos se entreolharam.</w:t>
+      </w:r>
+    </w:p>
+    <w:p>
+      <w:pPr>
+        <w:spacing w:after="0" w:line="312"/>
+        <w:ind w:firstLine="340"/>
+        <w:jc w:val="both"/>
+      </w:pPr>
+      <w:r>
+        <w:rPr>
+          <w:rFonts w:ascii="Georgia" w:cs="Georgia" w:eastAsia="Georgia" w:hAnsi="Georgia"/>
+          <w:sz w:val="21"/>
+          <w:szCs w:val="21"/>
+        </w:rPr>
+        <w:t xml:space="preserve">— Em Americana — respondeu a delegada, ela mesma. — No hospital onde a mãe dela está internada há quatro meses. Entrou às sete e quinze da noite de segunda, assinou o livro de visitas, passou a noite numa poltrona ao lado da cama. Duas enfermeiras confirmam. As câmeras do corredor confirmam. Saiu às oito e vinte da manhã de terça, depois de receber um telefonema. Chegou a São Paulo às dez. O seu pai, segundo o atestado, morreu entre as sete e as oito.</w:t>
+      </w:r>
+    </w:p>
+    <w:p>
+      <w:pPr>
+        <w:spacing w:after="200" w:before="200"/>
+        <w:jc w:val="center"/>
+      </w:pPr>
+      <w:r>
+        <w:rPr>
+          <w:rFonts w:ascii="Georgia" w:cs="Georgia" w:eastAsia="Georgia" w:hAnsi="Georgia"/>
+          <w:sz w:val="22"/>
+          <w:szCs w:val="22"/>
+        </w:rPr>
+        <w:t xml:space="preserve">*</w:t>
+      </w:r>
+    </w:p>
+    <w:p>
+      <w:pPr>
+        <w:spacing w:after="0" w:line="312"/>
+        <w:ind w:firstLine="340"/>
+        <w:jc w:val="both"/>
+      </w:pPr>
+      <w:r>
+        <w:rPr>
+          <w:rFonts w:ascii="Georgia" w:cs="Georgia" w:eastAsia="Georgia" w:hAnsi="Georgia"/>
+          <w:sz w:val="21"/>
+          <w:szCs w:val="21"/>
+        </w:rPr>
+        <w:t xml:space="preserve">Ninguém disse nada por um tempo.</w:t>
+      </w:r>
+    </w:p>
+    <w:p>
+      <w:pPr>
+        <w:spacing w:after="0" w:line="312"/>
+        <w:ind w:firstLine="340"/>
+        <w:jc w:val="both"/>
+      </w:pPr>
+      <w:r>
+        <w:rPr>
+          <w:rFonts w:ascii="Georgia" w:cs="Georgia" w:eastAsia="Georgia" w:hAnsi="Georgia"/>
+          <w:sz w:val="21"/>
+          <w:szCs w:val="21"/>
+        </w:rPr>
+        <w:t xml:space="preserve">— E o frasco? — perguntou Lia, por fim. — E o caderno?</w:t>
+      </w:r>
+    </w:p>
+    <w:p>
+      <w:pPr>
+        <w:spacing w:after="0" w:line="312"/>
+        <w:ind w:firstLine="340"/>
+        <w:jc w:val="both"/>
+      </w:pPr>
+      <w:r>
+        <w:rPr>
+          <w:rFonts w:ascii="Georgia" w:cs="Georgia" w:eastAsia="Georgia" w:hAnsi="Georgia"/>
+          <w:sz w:val="21"/>
+          <w:szCs w:val="21"/>
+        </w:rPr>
+        <w:t xml:space="preserve">— O frasco está quase cheio. Quem compra veneno para matar alguém e não usa geralmente não conseguiu usar. — Regina se recostou na cadeira. — E o caderno, senhora Salvallus, é a coisa mais triste que eu li este ano. Mas um caderno não é crime. Pela nossa lei, querer matar não é crime. Planejar não é crime. Comprar o veneno e guardar na nécessaire, sozinho, também não é tentativa. Tentativa começa quando a pessoa põe a mão na execução. A senhora Helena nunca chegou lá.</w:t>
+      </w:r>
+    </w:p>
+    <w:p>
+      <w:pPr>
+        <w:spacing w:after="0" w:line="312"/>
+        <w:ind w:firstLine="340"/>
+        <w:jc w:val="both"/>
+      </w:pPr>
+      <w:r>
+        <w:rPr>
+          <w:rFonts w:ascii="Georgia" w:cs="Georgia" w:eastAsia="Georgia" w:hAnsi="Georgia"/>
+          <w:sz w:val="21"/>
+          <w:szCs w:val="21"/>
+        </w:rPr>
+        <w:t xml:space="preserve">— Porque alguém chegou antes — disse Lucas, devagar.</w:t>
+      </w:r>
+    </w:p>
+    <w:p>
+      <w:pPr>
+        <w:spacing w:after="0" w:line="312"/>
+        <w:ind w:firstLine="340"/>
+        <w:jc w:val="both"/>
+      </w:pPr>
+      <w:r>
+        <w:rPr>
+          <w:rFonts w:ascii="Georgia" w:cs="Georgia" w:eastAsia="Georgia" w:hAnsi="Georgia"/>
+          <w:sz w:val="21"/>
+          <w:szCs w:val="21"/>
+        </w:rPr>
+        <w:t xml:space="preserve">Regina o olhou com atenção.</w:t>
+      </w:r>
+    </w:p>
+    <w:p>
+      <w:pPr>
+        <w:spacing w:after="0" w:line="312"/>
+        <w:ind w:firstLine="340"/>
+        <w:jc w:val="both"/>
+      </w:pPr>
+      <w:r>
+        <w:rPr>
+          <w:rFonts w:ascii="Georgia" w:cs="Georgia" w:eastAsia="Georgia" w:hAnsi="Georgia"/>
+          <w:sz w:val="21"/>
+          <w:szCs w:val="21"/>
+        </w:rPr>
+        <w:t xml:space="preserve">— Foi o que ela me disse ontem. Com essas palavras.</w:t>
+      </w:r>
+    </w:p>
+    <w:p>
+      <w:pPr>
+        <w:spacing w:after="200" w:before="200"/>
+        <w:jc w:val="center"/>
+      </w:pPr>
+      <w:r>
+        <w:rPr>
+          <w:rFonts w:ascii="Georgia" w:cs="Georgia" w:eastAsia="Georgia" w:hAnsi="Georgia"/>
+          <w:sz w:val="22"/>
+          <w:szCs w:val="22"/>
+        </w:rPr>
+        <w:t xml:space="preserve">*</w:t>
+      </w:r>
+    </w:p>
+    <w:p>
+      <w:pPr>
+        <w:spacing w:after="0" w:line="312"/>
+        <w:ind w:firstLine="340"/>
+        <w:jc w:val="both"/>
+      </w:pPr>
+      <w:r>
+        <w:rPr>
+          <w:rFonts w:ascii="Georgia" w:cs="Georgia" w:eastAsia="Georgia" w:hAnsi="Georgia"/>
+          <w:sz w:val="21"/>
+          <w:szCs w:val="21"/>
+        </w:rPr>
+        <w:t xml:space="preserve">Helena os recebeu naquela mesma tarde, a pedido dela.</w:t>
+      </w:r>
+    </w:p>
+    <w:p>
+      <w:pPr>
+        <w:spacing w:after="0" w:line="312"/>
+        <w:ind w:firstLine="340"/>
+        <w:jc w:val="both"/>
+      </w:pPr>
+      <w:r>
+        <w:rPr>
+          <w:rFonts w:ascii="Georgia" w:cs="Georgia" w:eastAsia="Georgia" w:hAnsi="Georgia"/>
+          <w:sz w:val="21"/>
+          <w:szCs w:val="21"/>
+        </w:rPr>
+        <w:t xml:space="preserve">Estava sentada na sala da casa do Jardim Europa, de vestido preto, sem joias, com o caderno de capa preta sobre os joelhos. Dona Cida trouxe café e saiu sem olhar para ninguém. A casa estava em silêncio. Até o relógio da parede parecia ter baixado o volume.</w:t>
+      </w:r>
+    </w:p>
+    <w:p>
+      <w:pPr>
+        <w:spacing w:after="0" w:line="312"/>
+        <w:ind w:firstLine="340"/>
+        <w:jc w:val="both"/>
+      </w:pPr>
+      <w:r>
+        <w:rPr>
+          <w:rFonts w:ascii="Georgia" w:cs="Georgia" w:eastAsia="Georgia" w:hAnsi="Georgia"/>
+          <w:sz w:val="21"/>
+          <w:szCs w:val="21"/>
+        </w:rPr>
+        <w:t xml:space="preserve">— A delegada me contou que foram vocês — disse Helena. Não havia raiva na voz. Havia cansaço. — Não estou brava. No lugar de vocês, eu teria feito o mesmo. Eu fiz o mesmo, durante três anos.</w:t>
+      </w:r>
+    </w:p>
+    <w:p>
+      <w:pPr>
+        <w:spacing w:after="0" w:line="312"/>
+        <w:ind w:firstLine="340"/>
+        <w:jc w:val="both"/>
+      </w:pPr>
+      <w:r>
+        <w:rPr>
+          <w:rFonts w:ascii="Georgia" w:cs="Georgia" w:eastAsia="Georgia" w:hAnsi="Georgia"/>
+          <w:sz w:val="21"/>
+          <w:szCs w:val="21"/>
+        </w:rPr>
+        <w:t xml:space="preserve">Lia sentou-se na poltrona em frente. Lucas ficou de pé, encostado na lareira.</w:t>
+      </w:r>
+    </w:p>
+    <w:p>
+      <w:pPr>
+        <w:spacing w:after="0" w:line="312"/>
+        <w:ind w:firstLine="340"/>
+        <w:jc w:val="both"/>
+      </w:pPr>
+      <w:r>
+        <w:rPr>
+          <w:rFonts w:ascii="Georgia" w:cs="Georgia" w:eastAsia="Georgia" w:hAnsi="Georgia"/>
+          <w:sz w:val="21"/>
+          <w:szCs w:val="21"/>
+        </w:rPr>
+        <w:t xml:space="preserve">— Você casou com ele por causa do seu pai — disse Lia.</w:t>
+      </w:r>
+    </w:p>
+    <w:p>
+      <w:pPr>
+        <w:spacing w:after="0" w:line="312"/>
+        <w:ind w:firstLine="340"/>
+        <w:jc w:val="both"/>
+      </w:pPr>
+      <w:r>
+        <w:rPr>
+          <w:rFonts w:ascii="Georgia" w:cs="Georgia" w:eastAsia="Georgia" w:hAnsi="Georgia"/>
+          <w:sz w:val="21"/>
+          <w:szCs w:val="21"/>
+        </w:rPr>
+        <w:t xml:space="preserve">— Casei. — Helena passou a mão sobre a capa do caderno. — Eu tinha vinte e nove anos e tinha acabado de enterrar o meu pai. Ele perdeu a fábrica, a casa, os amigos e, por último, o coração. Literalmente. O médico disse que foi infarto. Eu sabia que foi vergonha. Ele passou os últimos meses mandando mensagens para o Henrique, implorando. E o Henrique respondia como quem recusa um vendedor de enciclopédia.</w:t>
+      </w:r>
+    </w:p>
+    <w:p>
+      <w:pPr>
+        <w:spacing w:after="0" w:line="312"/>
+        <w:ind w:firstLine="340"/>
+        <w:jc w:val="both"/>
+      </w:pPr>
+      <w:r>
+        <w:rPr>
+          <w:rFonts w:ascii="Georgia" w:cs="Georgia" w:eastAsia="Georgia" w:hAnsi="Georgia"/>
+          <w:sz w:val="21"/>
+          <w:szCs w:val="21"/>
+        </w:rPr>
+        <w:t xml:space="preserve">— E você quis se vingar.</w:t>
+      </w:r>
+    </w:p>
+    <w:p>
+      <w:pPr>
+        <w:spacing w:after="0" w:line="312"/>
+        <w:ind w:firstLine="340"/>
+        <w:jc w:val="both"/>
+      </w:pPr>
+      <w:r>
+        <w:rPr>
+          <w:rFonts w:ascii="Georgia" w:cs="Georgia" w:eastAsia="Georgia" w:hAnsi="Georgia"/>
+          <w:sz w:val="21"/>
+          <w:szCs w:val="21"/>
+        </w:rPr>
+        <w:t xml:space="preserve">— Eu quis olhar nos olhos dele todos os dias e ver se havia alguma coisa ali. Culpa. Remorso. Qualquer coisa. — Ela riu, um riso curto, sem graça. — Mudei de sobrenome nos lugares que importavam, frequentei os lugares certos, sorri nas horas certas. Foi fácil. Homens como o seu pai acham que são sempre eles que escolhem.</w:t>
+      </w:r>
+    </w:p>
+    <w:p>
+      <w:pPr>
+        <w:spacing w:after="0" w:line="312"/>
+        <w:ind w:firstLine="340"/>
+        <w:jc w:val="both"/>
+      </w:pPr>
+      <w:r>
+        <w:rPr>
+          <w:rFonts w:ascii="Georgia" w:cs="Georgia" w:eastAsia="Georgia" w:hAnsi="Georgia"/>
+          <w:sz w:val="21"/>
+          <w:szCs w:val="21"/>
+        </w:rPr>
+        <w:t xml:space="preserve">— E encontrou? — perguntou Lucas. — Alguma coisa nos olhos dele?</w:t>
+      </w:r>
+    </w:p>
+    <w:p>
+      <w:pPr>
+        <w:spacing w:after="0" w:line="312"/>
+        <w:ind w:firstLine="340"/>
+        <w:jc w:val="both"/>
+      </w:pPr>
+      <w:r>
+        <w:rPr>
+          <w:rFonts w:ascii="Georgia" w:cs="Georgia" w:eastAsia="Georgia" w:hAnsi="Georgia"/>
+          <w:sz w:val="21"/>
+          <w:szCs w:val="21"/>
+        </w:rPr>
+        <w:t xml:space="preserve">Helena demorou a responder.</w:t>
+      </w:r>
+    </w:p>
+    <w:p>
+      <w:pPr>
+        <w:spacing w:after="0" w:line="312"/>
+        <w:ind w:firstLine="340"/>
+        <w:jc w:val="both"/>
+      </w:pPr>
+      <w:r>
+        <w:rPr>
+          <w:rFonts w:ascii="Georgia" w:cs="Georgia" w:eastAsia="Georgia" w:hAnsi="Georgia"/>
+          <w:sz w:val="21"/>
+          <w:szCs w:val="21"/>
+        </w:rPr>
+        <w:t xml:space="preserve">— Às vezes — disse. — Mais do que eu queria. E isso foi o pior.</w:t>
+      </w:r>
+    </w:p>
+    <w:p>
+      <w:pPr>
+        <w:spacing w:after="200" w:before="200"/>
+        <w:jc w:val="center"/>
+      </w:pPr>
+      <w:r>
+        <w:rPr>
+          <w:rFonts w:ascii="Georgia" w:cs="Georgia" w:eastAsia="Georgia" w:hAnsi="Georgia"/>
+          <w:sz w:val="22"/>
+          <w:szCs w:val="22"/>
+        </w:rPr>
+        <w:t xml:space="preserve">*</w:t>
+      </w:r>
+    </w:p>
+    <w:p>
+      <w:pPr>
+        <w:spacing w:after="0" w:line="312"/>
+        <w:ind w:firstLine="340"/>
+        <w:jc w:val="both"/>
+      </w:pPr>
+      <w:r>
+        <w:rPr>
+          <w:rFonts w:ascii="Georgia" w:cs="Georgia" w:eastAsia="Georgia" w:hAnsi="Georgia"/>
+          <w:sz w:val="21"/>
+          <w:szCs w:val="21"/>
+        </w:rPr>
+        <w:t xml:space="preserve">— O frasco — disse Lia.</w:t>
+      </w:r>
+    </w:p>
+    <w:p>
+      <w:pPr>
+        <w:spacing w:after="0" w:line="312"/>
+        <w:ind w:firstLine="340"/>
+        <w:jc w:val="both"/>
+      </w:pPr>
+      <w:r>
+        <w:rPr>
+          <w:rFonts w:ascii="Georgia" w:cs="Georgia" w:eastAsia="Georgia" w:hAnsi="Georgia"/>
+          <w:sz w:val="21"/>
+          <w:szCs w:val="21"/>
+        </w:rPr>
+        <w:t xml:space="preserve">— Comprei há um ano, de um homem em Campinas que vende ervas e outras coisas por baixo do balcão. Fiquei com ele na nécessaire durante meses. Eu tirava, olhava e guardava de novo. — Helena olhou para as próprias mãos. — Aí as pessoas começaram a morrer em volta dele. O homem do motel. O empresário do restaurante. O rapaz do hotel. O Nestor. E eu escrevia no caderno, toda vez, porque não tinha mais com quem falar. Toda vez eu pensava: não fui eu. Alguém está fazendo o que eu não tive coragem. E toda vez ele voltava para casa vivo, com aquela cara de quem não entende nada, e jantava do meu lado.</w:t>
+      </w:r>
+    </w:p>
+    <w:p>
+      <w:pPr>
+        <w:spacing w:after="0" w:line="312"/>
+        <w:ind w:firstLine="340"/>
+        <w:jc w:val="both"/>
+      </w:pPr>
+      <w:r>
+        <w:rPr>
+          <w:rFonts w:ascii="Georgia" w:cs="Georgia" w:eastAsia="Georgia" w:hAnsi="Georgia"/>
+          <w:sz w:val="21"/>
+          <w:szCs w:val="21"/>
+        </w:rPr>
+        <w:t xml:space="preserve">— Amanhã. Por você — disse Lucas.</w:t>
+      </w:r>
+    </w:p>
+    <w:p>
+      <w:pPr>
+        <w:spacing w:after="0" w:line="312"/>
+        <w:ind w:firstLine="340"/>
+        <w:jc w:val="both"/>
+      </w:pPr>
+      <w:r>
+        <w:rPr>
+          <w:rFonts w:ascii="Georgia" w:cs="Georgia" w:eastAsia="Georgia" w:hAnsi="Georgia"/>
+          <w:sz w:val="21"/>
+          <w:szCs w:val="21"/>
+        </w:rPr>
+        <w:t xml:space="preserve">— Escrevi na segunda à noite, no hospital, ao lado da minha mãe. Ela não me reconhece mais. Eu decidi que ia ser na terça, quando eu voltasse. Na janta. Ia acabar com aquilo de uma vez. — Helena ergueu os olhos para ele. — Na terça de manhã, às oito e quinze, o doutor Álvaro me ligou dizendo que o Henrique estava morto.</w:t>
+      </w:r>
+    </w:p>
+    <w:p>
+      <w:pPr>
+        <w:spacing w:after="0" w:line="312"/>
+        <w:ind w:firstLine="340"/>
+        <w:jc w:val="both"/>
+      </w:pPr>
+      <w:r>
+        <w:rPr>
+          <w:rFonts w:ascii="Georgia" w:cs="Georgia" w:eastAsia="Georgia" w:hAnsi="Georgia"/>
+          <w:sz w:val="21"/>
+          <w:szCs w:val="21"/>
+        </w:rPr>
+        <w:t xml:space="preserve">A sala ficou em silêncio.</w:t>
+      </w:r>
+    </w:p>
+    <w:p>
+      <w:pPr>
+        <w:spacing w:after="0" w:line="312"/>
+        <w:ind w:firstLine="340"/>
+        <w:jc w:val="both"/>
+      </w:pPr>
+      <w:r>
+        <w:rPr>
+          <w:rFonts w:ascii="Georgia" w:cs="Georgia" w:eastAsia="Georgia" w:hAnsi="Georgia"/>
+          <w:sz w:val="21"/>
+          <w:szCs w:val="21"/>
+        </w:rPr>
+        <w:t xml:space="preserve">— Eu queria — disse ela. — Eu juro para vocês que queria. Mas alguém chegou antes.</w:t>
+      </w:r>
+    </w:p>
+    <w:p>
+      <w:pPr>
+        <w:spacing w:after="200" w:before="200"/>
+        <w:jc w:val="center"/>
+      </w:pPr>
+      <w:r>
+        <w:rPr>
+          <w:rFonts w:ascii="Georgia" w:cs="Georgia" w:eastAsia="Georgia" w:hAnsi="Georgia"/>
+          <w:sz w:val="22"/>
+          <w:szCs w:val="22"/>
+        </w:rPr>
+        <w:t xml:space="preserve">*</w:t>
+      </w:r>
+    </w:p>
+    <w:p>
+      <w:pPr>
+        <w:spacing w:after="0" w:line="312"/>
+        <w:ind w:firstLine="340"/>
+        <w:jc w:val="both"/>
+      </w:pPr>
+      <w:r>
+        <w:rPr>
+          <w:rFonts w:ascii="Georgia" w:cs="Georgia" w:eastAsia="Georgia" w:hAnsi="Georgia"/>
+          <w:sz w:val="21"/>
+          <w:szCs w:val="21"/>
+        </w:rPr>
+        <w:t xml:space="preserve">— E a cremação? — perguntou Lia. A voz dela tremia. — Foi você que decidiu.</w:t>
+      </w:r>
+    </w:p>
+    <w:p>
+      <w:pPr>
+        <w:spacing w:after="0" w:line="312"/>
+        <w:ind w:firstLine="340"/>
+        <w:jc w:val="both"/>
+      </w:pPr>
+      <w:r>
+        <w:rPr>
+          <w:rFonts w:ascii="Georgia" w:cs="Georgia" w:eastAsia="Georgia" w:hAnsi="Georgia"/>
+          <w:sz w:val="21"/>
+          <w:szCs w:val="21"/>
+        </w:rPr>
+        <w:t xml:space="preserve">— Foi a única coisa que ele me deixou decidir em três anos. No velório do irmão dele, ele disse, rindo, que a decisão era minha. Eu lembrei disso na terça, sentada no carro, voltando de Americana. — Helena olhou para a janela. — E aí, nos dias seguintes, todo mundo começou a me dizer a mesma coisa. O Otávio. Dois amigos dele da Associação Comercial. Uma senhora que eu nunca tinha visto, que se apresentou como cliente antiga. O próprio Falcão mandou recado por um assessor. Cremação é mais digno. Cremação é mais prático. Cremação é o que ele ia querer. Parecia que a cidade inteira queria ter certeza de que ele não ia voltar.</w:t>
+      </w:r>
+    </w:p>
+    <w:p>
+      <w:pPr>
+        <w:spacing w:after="0" w:line="312"/>
+        <w:ind w:firstLine="340"/>
+        <w:jc w:val="both"/>
+      </w:pPr>
+      <w:r>
+        <w:rPr>
+          <w:rFonts w:ascii="Georgia" w:cs="Georgia" w:eastAsia="Georgia" w:hAnsi="Georgia"/>
+          <w:sz w:val="21"/>
+          <w:szCs w:val="21"/>
+        </w:rPr>
+        <w:t xml:space="preserve">— Imorrível — disse Lucas, baixinho.</w:t>
+      </w:r>
+    </w:p>
+    <w:p>
+      <w:pPr>
+        <w:spacing w:after="0" w:line="312"/>
+        <w:ind w:firstLine="340"/>
+        <w:jc w:val="both"/>
+      </w:pPr>
+      <w:r>
+        <w:rPr>
+          <w:rFonts w:ascii="Georgia" w:cs="Georgia" w:eastAsia="Georgia" w:hAnsi="Georgia"/>
+          <w:sz w:val="21"/>
+          <w:szCs w:val="21"/>
+        </w:rPr>
+        <w:t xml:space="preserve">— Imorrível. — Helena quase sorriu. — Até eu acreditei um pouco nisso. Quando a plataforma desceu, eu senti alívio. Que Deus me perdoe, mas eu senti.</w:t>
+      </w:r>
+    </w:p>
+    <w:p>
+      <w:pPr>
+        <w:spacing w:after="0" w:line="312"/>
+        <w:ind w:firstLine="340"/>
+        <w:jc w:val="both"/>
+      </w:pPr>
+      <w:r>
+        <w:rPr>
+          <w:rFonts w:ascii="Georgia" w:cs="Georgia" w:eastAsia="Georgia" w:hAnsi="Georgia"/>
+          <w:sz w:val="21"/>
+          <w:szCs w:val="21"/>
+        </w:rPr>
+        <w:t xml:space="preserve">Ninguém disse nada. Lá fora, um carro buzinou na rua e seguiu.</w:t>
+      </w:r>
+    </w:p>
+    <w:p>
+      <w:pPr>
+        <w:spacing w:after="0" w:line="312"/>
+        <w:ind w:firstLine="340"/>
+        <w:jc w:val="both"/>
+      </w:pPr>
+      <w:r>
+        <w:rPr>
+          <w:rFonts w:ascii="Georgia" w:cs="Georgia" w:eastAsia="Georgia" w:hAnsi="Georgia"/>
+          <w:sz w:val="21"/>
+          <w:szCs w:val="21"/>
+        </w:rPr>
+        <w:t xml:space="preserve">— Só uma pessoa não queria a cremação — continuou Helena. — O doutor Álvaro. Ele implorou. Ele, que passou trinta anos dizendo que enterro era coisa do passado. Na hora eu achei que era luto. Hoje eu já não sei o que acho de nada.</w:t>
+      </w:r>
+    </w:p>
+    <w:p>
+      <w:pPr>
+        <w:spacing w:after="0" w:line="312"/>
+        <w:ind w:firstLine="340"/>
+        <w:jc w:val="both"/>
+      </w:pPr>
+      <w:r>
+        <w:rPr>
+          <w:rFonts w:ascii="Georgia" w:cs="Georgia" w:eastAsia="Georgia" w:hAnsi="Georgia"/>
+          <w:sz w:val="21"/>
+          <w:szCs w:val="21"/>
+        </w:rPr>
+        <w:t xml:space="preserve">Lucas olhou para Lia. Lia olhou para ele. Os dois tinham ouvido aquela discussão no corredor do crematório de jeitos diferentes, e agora ela voltava com um peso novo.</w:t>
+      </w:r>
+    </w:p>
+    <w:p>
+      <w:pPr>
+        <w:spacing w:after="0" w:line="312"/>
+        <w:ind w:firstLine="340"/>
+        <w:jc w:val="both"/>
+      </w:pPr>
+      <w:r>
+        <w:rPr>
+          <w:rFonts w:ascii="Georgia" w:cs="Georgia" w:eastAsia="Georgia" w:hAnsi="Georgia"/>
+          <w:sz w:val="21"/>
+          <w:szCs w:val="21"/>
+        </w:rPr>
+        <w:t xml:space="preserve">Helena se levantou. A conversa tinha acabado.</w:t>
+      </w:r>
+    </w:p>
+    <w:p>
+      <w:pPr>
+        <w:spacing w:after="0" w:line="312"/>
+        <w:ind w:firstLine="340"/>
+        <w:jc w:val="both"/>
+      </w:pPr>
+      <w:r>
+        <w:rPr>
+          <w:rFonts w:ascii="Georgia" w:cs="Georgia" w:eastAsia="Georgia" w:hAnsi="Georgia"/>
+          <w:sz w:val="21"/>
+          <w:szCs w:val="21"/>
+        </w:rPr>
+        <w:t xml:space="preserve">Na porta, enquanto os dois saíam, ela segurou o braço de Lucas.</w:t>
+      </w:r>
+    </w:p>
+    <w:p>
+      <w:pPr>
+        <w:spacing w:after="0" w:line="312"/>
+        <w:ind w:firstLine="340"/>
+        <w:jc w:val="both"/>
+      </w:pPr>
+      <w:r>
+        <w:rPr>
+          <w:rFonts w:ascii="Georgia" w:cs="Georgia" w:eastAsia="Georgia" w:hAnsi="Georgia"/>
+          <w:sz w:val="21"/>
+          <w:szCs w:val="21"/>
+        </w:rPr>
+        <w:t xml:space="preserve">— Mais uma coisa, já que estamos falando a verdade. — Ela baixou a voz. — Quando eu cheguei de Americana, na terça, o portão da garagem estava aberto. Escancarado. O Henrique nunca deixava aquele portão aberto. Nunca, em três anos.</w:t>
+      </w:r>
+    </w:p>
+    <w:p>
+      <w:pPr>
+        <w:spacing w:after="0" w:line="312"/>
+        <w:ind w:firstLine="340"/>
+        <w:jc w:val="both"/>
+      </w:pPr>
+      <w:r>
+        <w:rPr>
+          <w:rFonts w:ascii="Georgia" w:cs="Georgia" w:eastAsia="Georgia" w:hAnsi="Georgia"/>
+          <w:sz w:val="21"/>
+          <w:szCs w:val="21"/>
+        </w:rPr>
+        <w:t xml:space="preserve">— O doutor Álvaro pode ter deixado — disse Lucas.</w:t>
+      </w:r>
+    </w:p>
+    <w:p>
+      <w:pPr>
+        <w:spacing w:after="0" w:line="312"/>
+        <w:ind w:firstLine="340"/>
+        <w:jc w:val="both"/>
+      </w:pPr>
+      <w:r>
+        <w:rPr>
+          <w:rFonts w:ascii="Georgia" w:cs="Georgia" w:eastAsia="Georgia" w:hAnsi="Georgia"/>
+          <w:sz w:val="21"/>
+          <w:szCs w:val="21"/>
+        </w:rPr>
+        <w:t xml:space="preserve">— O doutor Álvaro entra pela porta da frente. Sempre entrou. — Helena soltou o braço dele. — Perguntem a quem entra pela garagem.</w:t>
       </w:r>
     </w:p>
     <w:sectPr>

</xml_diff>

<commit_message>
Livro policial: capítulo 11 (Quarto 1412)
Co-Authored-By: Claude Opus 5.5 <noreply@anthropic.com>
Claude-Session: https://claude.ai/code/session_01BrurxSYygRC3rRhaUYosm1
</commit_message>
<xml_diff>
--- a/docs/livro-policial/TODO_CRIME_TEM_UM_AUTOR.docx
+++ b/docs/livro-policial/TODO_CRIME_TEM_UM_AUTOR.docx
@@ -9785,6 +9785,978 @@
           <w:szCs w:val="21"/>
         </w:rPr>
         <w:t xml:space="preserve">— O doutor Álvaro entra pela porta da frente. Sempre entrou. — Helena soltou o braço dele. — Perguntem a quem entra pela garagem.</w:t>
+      </w:r>
+    </w:p>
+    <w:p>
+      <w:pPr>
+        <w:pageBreakBefore/>
+        <w:spacing w:after="120" w:before="1800"/>
+        <w:jc w:val="center"/>
+      </w:pPr>
+      <w:r>
+        <w:rPr>
+          <w:rFonts w:ascii="Georgia" w:cs="Georgia" w:eastAsia="Georgia" w:hAnsi="Georgia"/>
+          <w:spacing w:val="40"/>
+          <w:sz w:val="20"/>
+          <w:szCs w:val="20"/>
+        </w:rPr>
+        <w:t xml:space="preserve">CAPÍTULO 11</w:t>
+      </w:r>
+    </w:p>
+    <w:p>
+      <w:pPr>
+        <w:spacing w:after="720"/>
+        <w:jc w:val="center"/>
+      </w:pPr>
+      <w:r>
+        <w:rPr>
+          <w:rFonts w:ascii="Georgia" w:cs="Georgia" w:eastAsia="Georgia" w:hAnsi="Georgia"/>
+          <w:b/>
+          <w:bCs/>
+          <w:sz w:val="32"/>
+          <w:szCs w:val="32"/>
+        </w:rPr>
+        <w:t xml:space="preserve">Quarto 1412</w:t>
+      </w:r>
+    </w:p>
+    <w:p>
+      <w:pPr>
+        <w:spacing w:after="0" w:line="312"/>
+        <w:ind w:firstLine="340"/>
+        <w:jc w:val="both"/>
+      </w:pPr>
+      <w:r>
+        <w:rPr>
+          <w:rFonts w:ascii="Georgia" w:cs="Georgia" w:eastAsia="Georgia" w:hAnsi="Georgia"/>
+          <w:sz w:val="21"/>
+          <w:szCs w:val="21"/>
+        </w:rPr>
+        <w:t xml:space="preserve">Julho.</w:t>
+      </w:r>
+    </w:p>
+    <w:p>
+      <w:pPr>
+        <w:spacing w:after="0" w:line="312"/>
+        <w:ind w:firstLine="340"/>
+        <w:jc w:val="both"/>
+      </w:pPr>
+      <w:r>
+        <w:rPr>
+          <w:rFonts w:ascii="Georgia" w:cs="Georgia" w:eastAsia="Georgia" w:hAnsi="Georgia"/>
+          <w:sz w:val="21"/>
+          <w:szCs w:val="21"/>
+        </w:rPr>
+        <w:t xml:space="preserve">Desde o restaurante, Henrique não dormia em casa mais de três noites seguidas.</w:t>
+      </w:r>
+    </w:p>
+    <w:p>
+      <w:pPr>
+        <w:spacing w:after="0" w:line="312"/>
+        <w:ind w:firstLine="340"/>
+        <w:jc w:val="both"/>
+      </w:pPr>
+      <w:r>
+        <w:rPr>
+          <w:rFonts w:ascii="Georgia" w:cs="Georgia" w:eastAsia="Georgia" w:hAnsi="Georgia"/>
+          <w:sz w:val="21"/>
+          <w:szCs w:val="21"/>
+        </w:rPr>
+        <w:t xml:space="preserve">Tinha sido ideia do segurança que contratara depois de maio, um ex-policial de poucas palavras chamado Valdir. Homem com rotina é homem fácil, doutor. Muda o caminho, muda o horário, muda a cama. Henrique achou exagero, depois achou prudência, depois achou que era a única coisa que ainda lhe dava a sensação de controlar alguma coisa. Uma noite no apartamento de Moema, que ninguém sabia que era dele. Uma noite na casa de um amigo no Morumbi. Uma noite num hotel.</w:t>
+      </w:r>
+    </w:p>
+    <w:p>
+      <w:pPr>
+        <w:spacing w:after="0" w:line="312"/>
+        <w:ind w:firstLine="340"/>
+        <w:jc w:val="both"/>
+      </w:pPr>
+      <w:r>
+        <w:rPr>
+          <w:rFonts w:ascii="Georgia" w:cs="Georgia" w:eastAsia="Georgia" w:hAnsi="Georgia"/>
+          <w:sz w:val="21"/>
+          <w:szCs w:val="21"/>
+        </w:rPr>
+        <w:t xml:space="preserve">Naquela quinta-feira, o hotel era o Castellane, na Avenida Paulista. Quarto 908, no nome da corretora. Helena achava que ele estava em Belo Horizonte.</w:t>
+      </w:r>
+    </w:p>
+    <w:p>
+      <w:pPr>
+        <w:spacing w:after="0" w:line="312"/>
+        <w:ind w:firstLine="340"/>
+        <w:jc w:val="both"/>
+      </w:pPr>
+      <w:r>
+        <w:rPr>
+          <w:rFonts w:ascii="Georgia" w:cs="Georgia" w:eastAsia="Georgia" w:hAnsi="Georgia"/>
+          <w:sz w:val="21"/>
+          <w:szCs w:val="21"/>
+        </w:rPr>
+        <w:t xml:space="preserve">Valdir o deixou na porta às nove da noite e foi para casa. De hotel, doutor, eu não dou conta. Lá dentro o senhor está mais seguro do que comigo.</w:t>
+      </w:r>
+    </w:p>
+    <w:p>
+      <w:pPr>
+        <w:spacing w:after="200" w:before="200"/>
+        <w:jc w:val="center"/>
+      </w:pPr>
+      <w:r>
+        <w:rPr>
+          <w:rFonts w:ascii="Georgia" w:cs="Georgia" w:eastAsia="Georgia" w:hAnsi="Georgia"/>
+          <w:sz w:val="22"/>
+          <w:szCs w:val="22"/>
+        </w:rPr>
+        <w:t xml:space="preserve">*</w:t>
+      </w:r>
+    </w:p>
+    <w:p>
+      <w:pPr>
+        <w:spacing w:after="0" w:line="312"/>
+        <w:ind w:firstLine="340"/>
+        <w:jc w:val="both"/>
+      </w:pPr>
+      <w:r>
+        <w:rPr>
+          <w:rFonts w:ascii="Georgia" w:cs="Georgia" w:eastAsia="Georgia" w:hAnsi="Georgia"/>
+          <w:sz w:val="21"/>
+          <w:szCs w:val="21"/>
+        </w:rPr>
+        <w:t xml:space="preserve">O bar do Castellane ficava no mezanino, com poltronas de couro, luz baixa e um pianista que tocava bossa nova para ninguém. Henrique pediu um uísque, depois outro. No terceiro, o homem da poltrona ao lado levantou o copo na direção dele.</w:t>
+      </w:r>
+    </w:p>
+    <w:p>
+      <w:pPr>
+        <w:spacing w:after="0" w:line="312"/>
+        <w:ind w:firstLine="340"/>
+        <w:jc w:val="both"/>
+      </w:pPr>
+      <w:r>
+        <w:rPr>
+          <w:rFonts w:ascii="Georgia" w:cs="Georgia" w:eastAsia="Georgia" w:hAnsi="Georgia"/>
+          <w:sz w:val="21"/>
+          <w:szCs w:val="21"/>
+        </w:rPr>
+        <w:t xml:space="preserve">— Saúde. Dia difícil?</w:t>
+      </w:r>
+    </w:p>
+    <w:p>
+      <w:pPr>
+        <w:spacing w:after="0" w:line="312"/>
+        <w:ind w:firstLine="340"/>
+        <w:jc w:val="both"/>
+      </w:pPr>
+      <w:r>
+        <w:rPr>
+          <w:rFonts w:ascii="Georgia" w:cs="Georgia" w:eastAsia="Georgia" w:hAnsi="Georgia"/>
+          <w:sz w:val="21"/>
+          <w:szCs w:val="21"/>
+        </w:rPr>
+        <w:t xml:space="preserve">— Ano difícil.</w:t>
+      </w:r>
+    </w:p>
+    <w:p>
+      <w:pPr>
+        <w:spacing w:after="0" w:line="312"/>
+        <w:ind w:firstLine="340"/>
+        <w:jc w:val="both"/>
+      </w:pPr>
+      <w:r>
+        <w:rPr>
+          <w:rFonts w:ascii="Georgia" w:cs="Georgia" w:eastAsia="Georgia" w:hAnsi="Georgia"/>
+          <w:sz w:val="21"/>
+          <w:szCs w:val="21"/>
+        </w:rPr>
+        <w:t xml:space="preserve">O homem riu. Tinha uns quarenta e poucos anos, gravata afrouxada, o paletó pendurado no braço da poltrona e o rosto vermelho de quem já estava ali havia algum tempo. Estendeu a mão.</w:t>
+      </w:r>
+    </w:p>
+    <w:p>
+      <w:pPr>
+        <w:spacing w:after="0" w:line="312"/>
+        <w:ind w:firstLine="340"/>
+        <w:jc w:val="both"/>
+      </w:pPr>
+      <w:r>
+        <w:rPr>
+          <w:rFonts w:ascii="Georgia" w:cs="Georgia" w:eastAsia="Georgia" w:hAnsi="Georgia"/>
+          <w:sz w:val="21"/>
+          <w:szCs w:val="21"/>
+        </w:rPr>
+        <w:t xml:space="preserve">— Fábio. Fábio Teixeira. Curitiba. Vendo elevador.</w:t>
+      </w:r>
+    </w:p>
+    <w:p>
+      <w:pPr>
+        <w:spacing w:after="0" w:line="312"/>
+        <w:ind w:firstLine="340"/>
+        <w:jc w:val="both"/>
+      </w:pPr>
+      <w:r>
+        <w:rPr>
+          <w:rFonts w:ascii="Georgia" w:cs="Georgia" w:eastAsia="Georgia" w:hAnsi="Georgia"/>
+          <w:sz w:val="21"/>
+          <w:szCs w:val="21"/>
+        </w:rPr>
+        <w:t xml:space="preserve">— Henrique.</w:t>
+      </w:r>
+    </w:p>
+    <w:p>
+      <w:pPr>
+        <w:spacing w:after="0" w:line="312"/>
+        <w:ind w:firstLine="340"/>
+        <w:jc w:val="both"/>
+      </w:pPr>
+      <w:r>
+        <w:rPr>
+          <w:rFonts w:ascii="Georgia" w:cs="Georgia" w:eastAsia="Georgia" w:hAnsi="Georgia"/>
+          <w:sz w:val="21"/>
+          <w:szCs w:val="21"/>
+        </w:rPr>
+        <w:t xml:space="preserve">— Prazer, Henrique. Elevador, imagina. Passo a vida subindo e descendo e nunca saio do lugar. — Ele riu da própria piada. — E você?</w:t>
+      </w:r>
+    </w:p>
+    <w:p>
+      <w:pPr>
+        <w:spacing w:after="0" w:line="312"/>
+        <w:ind w:firstLine="340"/>
+        <w:jc w:val="both"/>
+      </w:pPr>
+      <w:r>
+        <w:rPr>
+          <w:rFonts w:ascii="Georgia" w:cs="Georgia" w:eastAsia="Georgia" w:hAnsi="Georgia"/>
+          <w:sz w:val="21"/>
+          <w:szCs w:val="21"/>
+        </w:rPr>
+        <w:t xml:space="preserve">— Seguro.</w:t>
+      </w:r>
+    </w:p>
+    <w:p>
+      <w:pPr>
+        <w:spacing w:after="0" w:line="312"/>
+        <w:ind w:firstLine="340"/>
+        <w:jc w:val="both"/>
+      </w:pPr>
+      <w:r>
+        <w:rPr>
+          <w:rFonts w:ascii="Georgia" w:cs="Georgia" w:eastAsia="Georgia" w:hAnsi="Georgia"/>
+          <w:sz w:val="21"/>
+          <w:szCs w:val="21"/>
+        </w:rPr>
+        <w:t xml:space="preserve">— Ah. Então você ganha dinheiro com o medo dos outros.</w:t>
+      </w:r>
+    </w:p>
+    <w:p>
+      <w:pPr>
+        <w:spacing w:after="0" w:line="312"/>
+        <w:ind w:firstLine="340"/>
+        <w:jc w:val="both"/>
+      </w:pPr>
+      <w:r>
+        <w:rPr>
+          <w:rFonts w:ascii="Georgia" w:cs="Georgia" w:eastAsia="Georgia" w:hAnsi="Georgia"/>
+          <w:sz w:val="21"/>
+          <w:szCs w:val="21"/>
+        </w:rPr>
+        <w:t xml:space="preserve">— Mais ou menos isso.</w:t>
+      </w:r>
+    </w:p>
+    <w:p>
+      <w:pPr>
+        <w:spacing w:after="0" w:line="312"/>
+        <w:ind w:firstLine="340"/>
+        <w:jc w:val="both"/>
+      </w:pPr>
+      <w:r>
+        <w:rPr>
+          <w:rFonts w:ascii="Georgia" w:cs="Georgia" w:eastAsia="Georgia" w:hAnsi="Georgia"/>
+          <w:sz w:val="21"/>
+          <w:szCs w:val="21"/>
+        </w:rPr>
+        <w:t xml:space="preserve">— E eu ganho dinheiro com a preguiça dos outros de subir escada. — Fábio ergueu o copo de novo. — Somos dois parasitas honestos.</w:t>
+      </w:r>
+    </w:p>
+    <w:p>
+      <w:pPr>
+        <w:spacing w:after="0" w:line="312"/>
+        <w:ind w:firstLine="340"/>
+        <w:jc w:val="both"/>
+      </w:pPr>
+      <w:r>
+        <w:rPr>
+          <w:rFonts w:ascii="Georgia" w:cs="Georgia" w:eastAsia="Georgia" w:hAnsi="Georgia"/>
+          <w:sz w:val="21"/>
+          <w:szCs w:val="21"/>
+        </w:rPr>
+        <w:t xml:space="preserve">Henrique riu. Riu de verdade, pela primeira vez em muito tempo, e se surpreendeu com o som da própria risada.</w:t>
+      </w:r>
+    </w:p>
+    <w:p>
+      <w:pPr>
+        <w:spacing w:after="200" w:before="200"/>
+        <w:jc w:val="center"/>
+      </w:pPr>
+      <w:r>
+        <w:rPr>
+          <w:rFonts w:ascii="Georgia" w:cs="Georgia" w:eastAsia="Georgia" w:hAnsi="Georgia"/>
+          <w:sz w:val="22"/>
+          <w:szCs w:val="22"/>
+        </w:rPr>
+        <w:t xml:space="preserve">*</w:t>
+      </w:r>
+    </w:p>
+    <w:p>
+      <w:pPr>
+        <w:spacing w:after="0" w:line="312"/>
+        <w:ind w:firstLine="340"/>
+        <w:jc w:val="both"/>
+      </w:pPr>
+      <w:r>
+        <w:rPr>
+          <w:rFonts w:ascii="Georgia" w:cs="Georgia" w:eastAsia="Georgia" w:hAnsi="Georgia"/>
+          <w:sz w:val="21"/>
+          <w:szCs w:val="21"/>
+        </w:rPr>
+        <w:t xml:space="preserve">Conversaram por quase duas horas.</w:t>
+      </w:r>
+    </w:p>
+    <w:p>
+      <w:pPr>
+        <w:spacing w:after="0" w:line="312"/>
+        <w:ind w:firstLine="340"/>
+        <w:jc w:val="both"/>
+      </w:pPr>
+      <w:r>
+        <w:rPr>
+          <w:rFonts w:ascii="Georgia" w:cs="Georgia" w:eastAsia="Georgia" w:hAnsi="Georgia"/>
+          <w:sz w:val="21"/>
+          <w:szCs w:val="21"/>
+        </w:rPr>
+        <w:t xml:space="preserve">Fábio falou da filha de nove anos, que fazia aniversário no sábado e queria uma festa com tema de astronauta. Mostrou a foto no celular: uma menina sem os dois dentes da frente, com um capacete de papelão. Falou da mulher, que não gostava das viagens dele. Falou de um contrato enorme que estava para fechar com uma construtora de São Paulo, quarenta elevadores, se Deus quisesse.</w:t>
+      </w:r>
+    </w:p>
+    <w:p>
+      <w:pPr>
+        <w:spacing w:after="0" w:line="312"/>
+        <w:ind w:firstLine="340"/>
+        <w:jc w:val="both"/>
+      </w:pPr>
+      <w:r>
+        <w:rPr>
+          <w:rFonts w:ascii="Georgia" w:cs="Georgia" w:eastAsia="Georgia" w:hAnsi="Georgia"/>
+          <w:sz w:val="21"/>
+          <w:szCs w:val="21"/>
+        </w:rPr>
+        <w:t xml:space="preserve">Henrique falou pouco, como sempre. Falou de Lucas, que tinha aberto uma empresa sozinho e não queria nada com a corretora. Falou de Lia, que desenhava casas desde os oito anos. Não falou de Carlos. Não falou das mulheres. Não falou do motel, nem do restaurante.</w:t>
+      </w:r>
+    </w:p>
+    <w:p>
+      <w:pPr>
+        <w:spacing w:after="0" w:line="312"/>
+        <w:ind w:firstLine="340"/>
+        <w:jc w:val="both"/>
+      </w:pPr>
+      <w:r>
+        <w:rPr>
+          <w:rFonts w:ascii="Georgia" w:cs="Georgia" w:eastAsia="Georgia" w:hAnsi="Georgia"/>
+          <w:sz w:val="21"/>
+          <w:szCs w:val="21"/>
+        </w:rPr>
+        <w:t xml:space="preserve">Mas, perto da meia-noite, Fábio inclinou a cabeça e o olhou de um jeito diferente.</w:t>
+      </w:r>
+    </w:p>
+    <w:p>
+      <w:pPr>
+        <w:spacing w:after="0" w:line="312"/>
+        <w:ind w:firstLine="340"/>
+        <w:jc w:val="both"/>
+      </w:pPr>
+      <w:r>
+        <w:rPr>
+          <w:rFonts w:ascii="Georgia" w:cs="Georgia" w:eastAsia="Georgia" w:hAnsi="Georgia"/>
+          <w:sz w:val="21"/>
+          <w:szCs w:val="21"/>
+        </w:rPr>
+        <w:t xml:space="preserve">— Espera aí. Eu te conheço.</w:t>
+      </w:r>
+    </w:p>
+    <w:p>
+      <w:pPr>
+        <w:spacing w:after="0" w:line="312"/>
+        <w:ind w:firstLine="340"/>
+        <w:jc w:val="both"/>
+      </w:pPr>
+      <w:r>
+        <w:rPr>
+          <w:rFonts w:ascii="Georgia" w:cs="Georgia" w:eastAsia="Georgia" w:hAnsi="Georgia"/>
+          <w:sz w:val="21"/>
+          <w:szCs w:val="21"/>
+        </w:rPr>
+        <w:t xml:space="preserve">Henrique sentiu os ombros endurecerem.</w:t>
+      </w:r>
+    </w:p>
+    <w:p>
+      <w:pPr>
+        <w:spacing w:after="0" w:line="312"/>
+        <w:ind w:firstLine="340"/>
+        <w:jc w:val="both"/>
+      </w:pPr>
+      <w:r>
+        <w:rPr>
+          <w:rFonts w:ascii="Georgia" w:cs="Georgia" w:eastAsia="Georgia" w:hAnsi="Georgia"/>
+          <w:sz w:val="21"/>
+          <w:szCs w:val="21"/>
+        </w:rPr>
+        <w:t xml:space="preserve">— Acho difícil.</w:t>
+      </w:r>
+    </w:p>
+    <w:p>
+      <w:pPr>
+        <w:spacing w:after="0" w:line="312"/>
+        <w:ind w:firstLine="340"/>
+        <w:jc w:val="both"/>
+      </w:pPr>
+      <w:r>
+        <w:rPr>
+          <w:rFonts w:ascii="Georgia" w:cs="Georgia" w:eastAsia="Georgia" w:hAnsi="Georgia"/>
+          <w:sz w:val="21"/>
+          <w:szCs w:val="21"/>
+        </w:rPr>
+        <w:t xml:space="preserve">— Conheço sim. Da televisão. — Fábio estalou os dedos. — O cara do soco! O do restaurante! Como é que o deputado chamou… o imorrível!</w:t>
+      </w:r>
+    </w:p>
+    <w:p>
+      <w:pPr>
+        <w:spacing w:after="0" w:line="312"/>
+        <w:ind w:firstLine="340"/>
+        <w:jc w:val="both"/>
+      </w:pPr>
+      <w:r>
+        <w:rPr>
+          <w:rFonts w:ascii="Georgia" w:cs="Georgia" w:eastAsia="Georgia" w:hAnsi="Georgia"/>
+          <w:sz w:val="21"/>
+          <w:szCs w:val="21"/>
+        </w:rPr>
+        <w:t xml:space="preserve">O pianista errou uma nota. Ou talvez não tivesse errado, e Henrique só tivesse ouvido assim.</w:t>
+      </w:r>
+    </w:p>
+    <w:p>
+      <w:pPr>
+        <w:spacing w:after="0" w:line="312"/>
+        <w:ind w:firstLine="340"/>
+        <w:jc w:val="both"/>
+      </w:pPr>
+      <w:r>
+        <w:rPr>
+          <w:rFonts w:ascii="Georgia" w:cs="Georgia" w:eastAsia="Georgia" w:hAnsi="Georgia"/>
+          <w:sz w:val="21"/>
+          <w:szCs w:val="21"/>
+        </w:rPr>
+        <w:t xml:space="preserve">— Não sou eu.</w:t>
+      </w:r>
+    </w:p>
+    <w:p>
+      <w:pPr>
+        <w:spacing w:after="0" w:line="312"/>
+        <w:ind w:firstLine="340"/>
+        <w:jc w:val="both"/>
+      </w:pPr>
+      <w:r>
+        <w:rPr>
+          <w:rFonts w:ascii="Georgia" w:cs="Georgia" w:eastAsia="Georgia" w:hAnsi="Georgia"/>
+          <w:sz w:val="21"/>
+          <w:szCs w:val="21"/>
+        </w:rPr>
+        <w:t xml:space="preserve">— É você. — Fábio riu alto, encantado com a descoberta, sem nenhuma maldade. — Rapaz, que honra. Tomei uísque com o imorrível. Ninguém lá em Curitiba vai acreditar.</w:t>
+      </w:r>
+    </w:p>
+    <w:p>
+      <w:pPr>
+        <w:spacing w:after="0" w:line="312"/>
+        <w:ind w:firstLine="340"/>
+        <w:jc w:val="both"/>
+      </w:pPr>
+      <w:r>
+        <w:rPr>
+          <w:rFonts w:ascii="Georgia" w:cs="Georgia" w:eastAsia="Georgia" w:hAnsi="Georgia"/>
+          <w:sz w:val="21"/>
+          <w:szCs w:val="21"/>
+        </w:rPr>
+        <w:t xml:space="preserve">Henrique terminou o copo de uma vez. Pensou em ir embora. Pensou em Valdir dizendo homem com rotina é homem fácil. Olhou em volta do bar: o pianista, o barman secando taças, um casal de estrangeiros no canto, um funcionário do hotel de colete escuro parado perto da escada do mezanino, olhando para o celular. Ninguém olhava para ele.</w:t>
+      </w:r>
+    </w:p>
+    <w:p>
+      <w:pPr>
+        <w:spacing w:after="0" w:line="312"/>
+        <w:ind w:firstLine="340"/>
+        <w:jc w:val="both"/>
+      </w:pPr>
+      <w:r>
+        <w:rPr>
+          <w:rFonts w:ascii="Georgia" w:cs="Georgia" w:eastAsia="Georgia" w:hAnsi="Georgia"/>
+          <w:sz w:val="21"/>
+          <w:szCs w:val="21"/>
+        </w:rPr>
+        <w:t xml:space="preserve">— Olha — disse Fábio, de repente sério, ou o mais sério que o uísque permitia. — Eu preciso de um favor seu. Profissional. Esse contrato dos quarenta elevadores, a construtora está exigindo um seguro que eu nunca vi. Tenho a apólice lá em cima, no quarto. Você dá uma olhada em cinco minutos e me diz se estão me roubando. Eu pago o próximo uísque e o seguinte.</w:t>
+      </w:r>
+    </w:p>
+    <w:p>
+      <w:pPr>
+        <w:spacing w:after="0" w:line="312"/>
+        <w:ind w:firstLine="340"/>
+        <w:jc w:val="both"/>
+      </w:pPr>
+      <w:r>
+        <w:rPr>
+          <w:rFonts w:ascii="Georgia" w:cs="Georgia" w:eastAsia="Georgia" w:hAnsi="Georgia"/>
+          <w:sz w:val="21"/>
+          <w:szCs w:val="21"/>
+        </w:rPr>
+        <w:t xml:space="preserve">Tirou do bolso um cartão magnético e o colocou na mesa.</w:t>
+      </w:r>
+    </w:p>
+    <w:p>
+      <w:pPr>
+        <w:spacing w:after="0" w:line="312"/>
+        <w:ind w:firstLine="340"/>
+        <w:jc w:val="both"/>
+      </w:pPr>
+      <w:r>
+        <w:rPr>
+          <w:rFonts w:ascii="Georgia" w:cs="Georgia" w:eastAsia="Georgia" w:hAnsi="Georgia"/>
+          <w:sz w:val="21"/>
+          <w:szCs w:val="21"/>
+        </w:rPr>
+        <w:t xml:space="preserve">— 1412. Sobe daqui a dez minutos. Vou tomar um banho pra tirar essa cara de bêbado. Se eu demorar, entra e me espera.</w:t>
+      </w:r>
+    </w:p>
+    <w:p>
+      <w:pPr>
+        <w:spacing w:after="0" w:line="312"/>
+        <w:ind w:firstLine="340"/>
+        <w:jc w:val="both"/>
+      </w:pPr>
+      <w:r>
+        <w:rPr>
+          <w:rFonts w:ascii="Georgia" w:cs="Georgia" w:eastAsia="Georgia" w:hAnsi="Georgia"/>
+          <w:sz w:val="21"/>
+          <w:szCs w:val="21"/>
+        </w:rPr>
+        <w:t xml:space="preserve">Levantou-se, quase derrubou a poltrona, bateu no ombro de Henrique e foi embora pelo corredor dos elevadores, cantarolando a música do pianista.</w:t>
+      </w:r>
+    </w:p>
+    <w:p>
+      <w:pPr>
+        <w:spacing w:after="200" w:before="200"/>
+        <w:jc w:val="center"/>
+      </w:pPr>
+      <w:r>
+        <w:rPr>
+          <w:rFonts w:ascii="Georgia" w:cs="Georgia" w:eastAsia="Georgia" w:hAnsi="Georgia"/>
+          <w:sz w:val="22"/>
+          <w:szCs w:val="22"/>
+        </w:rPr>
+        <w:t xml:space="preserve">*</w:t>
+      </w:r>
+    </w:p>
+    <w:p>
+      <w:pPr>
+        <w:spacing w:after="0" w:line="312"/>
+        <w:ind w:firstLine="340"/>
+        <w:jc w:val="both"/>
+      </w:pPr>
+      <w:r>
+        <w:rPr>
+          <w:rFonts w:ascii="Georgia" w:cs="Georgia" w:eastAsia="Georgia" w:hAnsi="Georgia"/>
+          <w:sz w:val="21"/>
+          <w:szCs w:val="21"/>
+        </w:rPr>
+        <w:t xml:space="preserve">Henrique ficou sozinho no bar, olhando para o cartão.</w:t>
+      </w:r>
+    </w:p>
+    <w:p>
+      <w:pPr>
+        <w:spacing w:after="0" w:line="312"/>
+        <w:ind w:firstLine="340"/>
+        <w:jc w:val="both"/>
+      </w:pPr>
+      <w:r>
+        <w:rPr>
+          <w:rFonts w:ascii="Georgia" w:cs="Georgia" w:eastAsia="Georgia" w:hAnsi="Georgia"/>
+          <w:sz w:val="21"/>
+          <w:szCs w:val="21"/>
+        </w:rPr>
+        <w:t xml:space="preserve">Não era homem de subir ao quarto de desconhecidos. Também não era homem de beber quatro uísques numa quinta-feira, nem de rir com estranhos, nem de dormir em hotel com o nome da empresa. Era um ano de coisas que ele não era.</w:t>
+      </w:r>
+    </w:p>
+    <w:p>
+      <w:pPr>
+        <w:spacing w:after="0" w:line="312"/>
+        <w:ind w:firstLine="340"/>
+        <w:jc w:val="both"/>
+      </w:pPr>
+      <w:r>
+        <w:rPr>
+          <w:rFonts w:ascii="Georgia" w:cs="Georgia" w:eastAsia="Georgia" w:hAnsi="Georgia"/>
+          <w:sz w:val="21"/>
+          <w:szCs w:val="21"/>
+        </w:rPr>
+        <w:t xml:space="preserve">Pensou na menina de capacete de papelão. Pensou nos quarenta elevadores. Pensou que, se havia uma coisa que ele sabia fazer melhor do que qualquer pessoa em São Paulo, era ler uma apólice e dizer a alguém se estava sendo roubado.</w:t>
+      </w:r>
+    </w:p>
+    <w:p>
+      <w:pPr>
+        <w:spacing w:after="0" w:line="312"/>
+        <w:ind w:firstLine="340"/>
+        <w:jc w:val="both"/>
+      </w:pPr>
+      <w:r>
+        <w:rPr>
+          <w:rFonts w:ascii="Georgia" w:cs="Georgia" w:eastAsia="Georgia" w:hAnsi="Georgia"/>
+          <w:sz w:val="21"/>
+          <w:szCs w:val="21"/>
+        </w:rPr>
+        <w:t xml:space="preserve">Levou quinze minutos para decidir. Depois pegou o cartão e subiu.</w:t>
+      </w:r>
+    </w:p>
+    <w:p>
+      <w:pPr>
+        <w:spacing w:after="200" w:before="200"/>
+        <w:jc w:val="center"/>
+      </w:pPr>
+      <w:r>
+        <w:rPr>
+          <w:rFonts w:ascii="Georgia" w:cs="Georgia" w:eastAsia="Georgia" w:hAnsi="Georgia"/>
+          <w:sz w:val="22"/>
+          <w:szCs w:val="22"/>
+        </w:rPr>
+        <w:t xml:space="preserve">*</w:t>
+      </w:r>
+    </w:p>
+    <w:p>
+      <w:pPr>
+        <w:spacing w:after="0" w:line="312"/>
+        <w:ind w:firstLine="340"/>
+        <w:jc w:val="both"/>
+      </w:pPr>
+      <w:r>
+        <w:rPr>
+          <w:rFonts w:ascii="Georgia" w:cs="Georgia" w:eastAsia="Georgia" w:hAnsi="Georgia"/>
+          <w:sz w:val="21"/>
+          <w:szCs w:val="21"/>
+        </w:rPr>
+        <w:t xml:space="preserve">O corredor do décimo quarto andar estava vazio e silencioso, com aquele carpete grosso que engole os passos. Henrique passou o cartão na porta do 1412. A luz verde acendeu.</w:t>
+      </w:r>
+    </w:p>
+    <w:p>
+      <w:pPr>
+        <w:spacing w:after="0" w:line="312"/>
+        <w:ind w:firstLine="340"/>
+        <w:jc w:val="both"/>
+      </w:pPr>
+      <w:r>
+        <w:rPr>
+          <w:rFonts w:ascii="Georgia" w:cs="Georgia" w:eastAsia="Georgia" w:hAnsi="Georgia"/>
+          <w:sz w:val="21"/>
+          <w:szCs w:val="21"/>
+        </w:rPr>
+        <w:t xml:space="preserve">— Fábio?</w:t>
+      </w:r>
+    </w:p>
+    <w:p>
+      <w:pPr>
+        <w:spacing w:after="0" w:line="312"/>
+        <w:ind w:firstLine="340"/>
+        <w:jc w:val="both"/>
+      </w:pPr>
+      <w:r>
+        <w:rPr>
+          <w:rFonts w:ascii="Georgia" w:cs="Georgia" w:eastAsia="Georgia" w:hAnsi="Georgia"/>
+          <w:sz w:val="21"/>
+          <w:szCs w:val="21"/>
+        </w:rPr>
+        <w:t xml:space="preserve">Ninguém respondeu.</w:t>
+      </w:r>
+    </w:p>
+    <w:p>
+      <w:pPr>
+        <w:spacing w:after="0" w:line="312"/>
+        <w:ind w:firstLine="340"/>
+        <w:jc w:val="both"/>
+      </w:pPr>
+      <w:r>
+        <w:rPr>
+          <w:rFonts w:ascii="Georgia" w:cs="Georgia" w:eastAsia="Georgia" w:hAnsi="Georgia"/>
+          <w:sz w:val="21"/>
+          <w:szCs w:val="21"/>
+        </w:rPr>
+        <w:t xml:space="preserve">O quarto estava na penumbra, só com o abajur da escrivaninha aceso. A apólice estava lá, em cima da escrivaninha, presa com um clipe, ao lado de uma garrafa de uísque do frigobar pela metade. Fábio estava na cama, de bruços, atravessado, com a camisa ainda abotoada e um dos sapatos no pé. A respiração era funda e regular. O banho não tinha acontecido.</w:t>
+      </w:r>
+    </w:p>
+    <w:p>
+      <w:pPr>
+        <w:spacing w:after="0" w:line="312"/>
+        <w:ind w:firstLine="340"/>
+        <w:jc w:val="both"/>
+      </w:pPr>
+      <w:r>
+        <w:rPr>
+          <w:rFonts w:ascii="Georgia" w:cs="Georgia" w:eastAsia="Georgia" w:hAnsi="Georgia"/>
+          <w:sz w:val="21"/>
+          <w:szCs w:val="21"/>
+        </w:rPr>
+        <w:t xml:space="preserve">Henrique ficou parado um instante. Depois, quase sem pensar, fez o que nunca tinha feito pelos próprios filhos quando eram pequenos. Tirou o sapato de Fábio e o colocou ao lado da cama. Puxou o corpo pesado até que ele ficasse inteiro sobre o colchão, com a cabeça no travesseiro. Soltou o primeiro botão da camisa. Puxou o edredom até os ombros dele.</w:t>
+      </w:r>
+    </w:p>
+    <w:p>
+      <w:pPr>
+        <w:spacing w:after="0" w:line="312"/>
+        <w:ind w:firstLine="340"/>
+        <w:jc w:val="both"/>
+      </w:pPr>
+      <w:r>
+        <w:rPr>
+          <w:rFonts w:ascii="Georgia" w:cs="Georgia" w:eastAsia="Georgia" w:hAnsi="Georgia"/>
+          <w:sz w:val="21"/>
+          <w:szCs w:val="21"/>
+        </w:rPr>
+        <w:t xml:space="preserve">Fábio resmungou alguma coisa sobre astronautas e continuou dormindo.</w:t>
+      </w:r>
+    </w:p>
+    <w:p>
+      <w:pPr>
+        <w:spacing w:after="0" w:line="312"/>
+        <w:ind w:firstLine="340"/>
+        <w:jc w:val="both"/>
+      </w:pPr>
+      <w:r>
+        <w:rPr>
+          <w:rFonts w:ascii="Georgia" w:cs="Georgia" w:eastAsia="Georgia" w:hAnsi="Georgia"/>
+          <w:sz w:val="21"/>
+          <w:szCs w:val="21"/>
+        </w:rPr>
+        <w:t xml:space="preserve">Henrique deu uma olhada rápida na apólice, à luz do abajur. A construtora estava, sim, roubando Fábio, numa cláusula de franquia na página sete. Ele pegou a caneta do hotel e circulou a cláusula. Escreveu na margem: renegocie isto. E, embaixo, sem saber por quê: obrigado pela risada. H.</w:t>
+      </w:r>
+    </w:p>
+    <w:p>
+      <w:pPr>
+        <w:spacing w:after="0" w:line="312"/>
+        <w:ind w:firstLine="340"/>
+        <w:jc w:val="both"/>
+      </w:pPr>
+      <w:r>
+        <w:rPr>
+          <w:rFonts w:ascii="Georgia" w:cs="Georgia" w:eastAsia="Georgia" w:hAnsi="Georgia"/>
+          <w:sz w:val="21"/>
+          <w:szCs w:val="21"/>
+        </w:rPr>
+        <w:t xml:space="preserve">Apagou o abajur, saiu e fechou a porta devagar, até ouvir o clique da fechadura.</w:t>
+      </w:r>
+    </w:p>
+    <w:p>
+      <w:pPr>
+        <w:spacing w:after="0" w:line="312"/>
+        <w:ind w:firstLine="340"/>
+        <w:jc w:val="both"/>
+      </w:pPr>
+      <w:r>
+        <w:rPr>
+          <w:rFonts w:ascii="Georgia" w:cs="Georgia" w:eastAsia="Georgia" w:hAnsi="Georgia"/>
+          <w:sz w:val="21"/>
+          <w:szCs w:val="21"/>
+        </w:rPr>
+        <w:t xml:space="preserve">No fim do corredor, perto do elevador de serviço, um funcionário de colete escuro empurrava um carrinho de toalhas, de cabeça baixa. Henrique não olhou para o rosto dele. Nunca olhava para o rosto de quem trabalhava em hotel. Desceu ao nono andar, deitou-se vestido sobre a cama do 908 e, pela primeira vez em semanas, dormiu antes de uma da manhã.</w:t>
+      </w:r>
+    </w:p>
+    <w:p>
+      <w:pPr>
+        <w:spacing w:after="200" w:before="200"/>
+        <w:jc w:val="center"/>
+      </w:pPr>
+      <w:r>
+        <w:rPr>
+          <w:rFonts w:ascii="Georgia" w:cs="Georgia" w:eastAsia="Georgia" w:hAnsi="Georgia"/>
+          <w:sz w:val="22"/>
+          <w:szCs w:val="22"/>
+        </w:rPr>
+        <w:t xml:space="preserve">*</w:t>
+      </w:r>
+    </w:p>
+    <w:p>
+      <w:pPr>
+        <w:spacing w:after="0" w:line="312"/>
+        <w:ind w:firstLine="340"/>
+        <w:jc w:val="both"/>
+      </w:pPr>
+      <w:r>
+        <w:rPr>
+          <w:rFonts w:ascii="Georgia" w:cs="Georgia" w:eastAsia="Georgia" w:hAnsi="Georgia"/>
+          <w:sz w:val="21"/>
+          <w:szCs w:val="21"/>
+        </w:rPr>
+        <w:t xml:space="preserve">Acordou às sete com o telefone do quarto tocando.</w:t>
+      </w:r>
+    </w:p>
+    <w:p>
+      <w:pPr>
+        <w:spacing w:after="0" w:line="312"/>
+        <w:ind w:firstLine="340"/>
+        <w:jc w:val="both"/>
+      </w:pPr>
+      <w:r>
+        <w:rPr>
+          <w:rFonts w:ascii="Georgia" w:cs="Georgia" w:eastAsia="Georgia" w:hAnsi="Georgia"/>
+          <w:sz w:val="21"/>
+          <w:szCs w:val="21"/>
+        </w:rPr>
+        <w:t xml:space="preserve">— Senhor Henrique Salvallus? — A voz do outro lado era conhecida. Cansada, sem pressa. — Aqui é a delegada Regina Paiva. Estou na recepção do hotel. O senhor pode descer, por favor? Ou prefere que eu suba?</w:t>
+      </w:r>
+    </w:p>
+    <w:p>
+      <w:pPr>
+        <w:spacing w:after="0" w:line="312"/>
+        <w:ind w:firstLine="340"/>
+        <w:jc w:val="both"/>
+      </w:pPr>
+      <w:r>
+        <w:rPr>
+          <w:rFonts w:ascii="Georgia" w:cs="Georgia" w:eastAsia="Georgia" w:hAnsi="Georgia"/>
+          <w:sz w:val="21"/>
+          <w:szCs w:val="21"/>
+        </w:rPr>
+        <w:t xml:space="preserve">Ele desceu.</w:t>
+      </w:r>
+    </w:p>
+    <w:p>
+      <w:pPr>
+        <w:spacing w:after="0" w:line="312"/>
+        <w:ind w:firstLine="340"/>
+        <w:jc w:val="both"/>
+      </w:pPr>
+      <w:r>
+        <w:rPr>
+          <w:rFonts w:ascii="Georgia" w:cs="Georgia" w:eastAsia="Georgia" w:hAnsi="Georgia"/>
+          <w:sz w:val="21"/>
+          <w:szCs w:val="21"/>
+        </w:rPr>
+        <w:t xml:space="preserve">Regina estava no saguão, de pé, ao lado de dois policiais militares e de um homem de terno que devia ser o gerente. Havia uma fita amarela na porta dos elevadores do décimo quarto andar, ele saberia depois. Naquele momento, só viu o rosto da delegada, e soube.</w:t>
+      </w:r>
+    </w:p>
+    <w:p>
+      <w:pPr>
+        <w:spacing w:after="0" w:line="312"/>
+        <w:ind w:firstLine="340"/>
+        <w:jc w:val="both"/>
+      </w:pPr>
+      <w:r>
+        <w:rPr>
+          <w:rFonts w:ascii="Georgia" w:cs="Georgia" w:eastAsia="Georgia" w:hAnsi="Georgia"/>
+          <w:sz w:val="21"/>
+          <w:szCs w:val="21"/>
+        </w:rPr>
+        <w:t xml:space="preserve">— Fábio Teixeira — disse ela. — Representante comercial, de Curitiba. Hospedado no 1412. A camareira o encontrou às seis e meia. Dezessete facadas. Na cama, coberto até os ombros.</w:t>
+      </w:r>
+    </w:p>
+    <w:p>
+      <w:pPr>
+        <w:spacing w:after="0" w:line="312"/>
+        <w:ind w:firstLine="340"/>
+        <w:jc w:val="both"/>
+      </w:pPr>
+      <w:r>
+        <w:rPr>
+          <w:rFonts w:ascii="Georgia" w:cs="Georgia" w:eastAsia="Georgia" w:hAnsi="Georgia"/>
+          <w:sz w:val="21"/>
+          <w:szCs w:val="21"/>
+        </w:rPr>
+        <w:t xml:space="preserve">Henrique sentiu as pernas cederem e se apoiou no balcão da recepção.</w:t>
+      </w:r>
+    </w:p>
+    <w:p>
+      <w:pPr>
+        <w:spacing w:after="0" w:line="312"/>
+        <w:ind w:firstLine="340"/>
+        <w:jc w:val="both"/>
+      </w:pPr>
+      <w:r>
+        <w:rPr>
+          <w:rFonts w:ascii="Georgia" w:cs="Georgia" w:eastAsia="Georgia" w:hAnsi="Georgia"/>
+          <w:sz w:val="21"/>
+          <w:szCs w:val="21"/>
+        </w:rPr>
+        <w:t xml:space="preserve">— Eu estive lá. Eu…</w:t>
+      </w:r>
+    </w:p>
+    <w:p>
+      <w:pPr>
+        <w:spacing w:after="0" w:line="312"/>
+        <w:ind w:firstLine="340"/>
+        <w:jc w:val="both"/>
+      </w:pPr>
+      <w:r>
+        <w:rPr>
+          <w:rFonts w:ascii="Georgia" w:cs="Georgia" w:eastAsia="Georgia" w:hAnsi="Georgia"/>
+          <w:sz w:val="21"/>
+          <w:szCs w:val="21"/>
+        </w:rPr>
+        <w:t xml:space="preserve">— Eu sei que o senhor esteve lá. — Regina abriu uma pasta e mostrou a ele uma folha impressa, uma imagem granulada em preto e branco. Um homem de terno fechando a porta de um quarto, com cuidado. — Zero hora e quarenta e um minuto. É a única pessoa que as câmeras mostram entrando e saindo daquele quarto a noite inteira.</w:t>
+      </w:r>
+    </w:p>
+    <w:p>
+      <w:pPr>
+        <w:spacing w:after="0" w:line="312"/>
+        <w:ind w:firstLine="340"/>
+        <w:jc w:val="both"/>
+      </w:pPr>
+      <w:r>
+        <w:rPr>
+          <w:rFonts w:ascii="Georgia" w:cs="Georgia" w:eastAsia="Georgia" w:hAnsi="Georgia"/>
+          <w:sz w:val="21"/>
+          <w:szCs w:val="21"/>
+        </w:rPr>
+        <w:t xml:space="preserve">Ela fechou a pasta. Olhou para ele por um tempo longo.</w:t>
+      </w:r>
+    </w:p>
+    <w:p>
+      <w:pPr>
+        <w:spacing w:after="0" w:line="312"/>
+        <w:ind w:firstLine="340"/>
+        <w:jc w:val="both"/>
+      </w:pPr>
+      <w:r>
+        <w:rPr>
+          <w:rFonts w:ascii="Georgia" w:cs="Georgia" w:eastAsia="Georgia" w:hAnsi="Georgia"/>
+          <w:sz w:val="21"/>
+          <w:szCs w:val="21"/>
+        </w:rPr>
+        <w:t xml:space="preserve">— Tem só um detalhe que me incomoda, senhor Salvallus. Às zero hora e cinquenta e dois, a câmera daquele corredor teve uma falha de onze minutos. O sistema registrou como queda de energia. — Ela guardou a pasta debaixo do braço. — No resto do prédio, a energia não caiu.</w:t>
+      </w:r>
+    </w:p>
+    <w:p>
+      <w:pPr>
+        <w:spacing w:after="0" w:line="312"/>
+        <w:ind w:firstLine="340"/>
+        <w:jc w:val="both"/>
+      </w:pPr>
+      <w:r>
+        <w:rPr>
+          <w:rFonts w:ascii="Georgia" w:cs="Georgia" w:eastAsia="Georgia" w:hAnsi="Georgia"/>
+          <w:sz w:val="21"/>
+          <w:szCs w:val="21"/>
+        </w:rPr>
+        <w:t xml:space="preserve">Henrique não disse nada. Estava pensando num homem de colete escuro empurrando um carrinho de toalhas, de cabeça baixa, cujo rosto ele não tinha olhado.</w:t>
+      </w:r>
+    </w:p>
+    <w:p>
+      <w:pPr>
+        <w:spacing w:after="0" w:line="312"/>
+        <w:ind w:firstLine="340"/>
+        <w:jc w:val="both"/>
+      </w:pPr>
+      <w:r>
+        <w:rPr>
+          <w:rFonts w:ascii="Georgia" w:cs="Georgia" w:eastAsia="Georgia" w:hAnsi="Georgia"/>
+          <w:sz w:val="21"/>
+          <w:szCs w:val="21"/>
+        </w:rPr>
+        <w:t xml:space="preserve">Estava pensando também que, se não tivesse subido, Fábio estaria vivo. E que, se tivesse ficado no quarto cinco minutos a mais, quem estaria debaixo daquele edredom era ele.</w:t>
       </w:r>
     </w:p>
     <w:sectPr>

</xml_diff>

<commit_message>
Livro policial: capítulo 12 (O carro prata)
Co-Authored-By: Claude Opus 5.5 <noreply@anthropic.com>
Claude-Session: https://claude.ai/code/session_01BrurxSYygRC3rRhaUYosm1
</commit_message>
<xml_diff>
--- a/docs/livro-policial/TODO_CRIME_TEM_UM_AUTOR.docx
+++ b/docs/livro-policial/TODO_CRIME_TEM_UM_AUTOR.docx
@@ -1226,7 +1226,7 @@
           <w:sz w:val="21"/>
           <w:szCs w:val="21"/>
         </w:rPr>
-        <w:t xml:space="preserve">O BlackBerry do pai era um mapa de todas as vidas dele. Na caixa de entrada, centenas de mensagens: e-mails da corretora, avisos do banco, convites para eventos, relatórios de sinistros com números de apólice no assunto. No BlackBerry Messenger, os contatos que importavam: Otávio, Helena, o escritório, um tal de Contabilidade que mandava mensagens todos os dias, sempre curtas, sempre secas. Pagamento confirmado. Relatório enviado. Ok.</w:t>
+        <w:t xml:space="preserve">O BlackBerry do pai era um mapa de todas as vidas dele. Na caixa de entrada, centenas de mensagens: e-mails da corretora, avisos do banco, convites para eventos, relatórios de sinistros com números de apólice no assunto. No BlackBerry Messenger, os contatos que importavam: Otávio, Helena, o escritório. Nas mensagens de texto, um tal de Contabilidade, que mandava mensagens todos os dias, sempre curtas, sempre secas. Pagamento confirmado. Relatório enviado. Ok.</w:t>
       </w:r>
     </w:p>
     <w:p>
@@ -10757,6 +10757,1187 @@
           <w:szCs w:val="21"/>
         </w:rPr>
         <w:t xml:space="preserve">Estava pensando também que, se não tivesse subido, Fábio estaria vivo. E que, se tivesse ficado no quarto cinco minutos a mais, quem estaria debaixo daquele edredom era ele.</w:t>
+      </w:r>
+    </w:p>
+    <w:p>
+      <w:pPr>
+        <w:pageBreakBefore/>
+        <w:spacing w:after="120" w:before="1800"/>
+        <w:jc w:val="center"/>
+      </w:pPr>
+      <w:r>
+        <w:rPr>
+          <w:rFonts w:ascii="Georgia" w:cs="Georgia" w:eastAsia="Georgia" w:hAnsi="Georgia"/>
+          <w:spacing w:val="40"/>
+          <w:sz w:val="20"/>
+          <w:szCs w:val="20"/>
+        </w:rPr>
+        <w:t xml:space="preserve">CAPÍTULO 12</w:t>
+      </w:r>
+    </w:p>
+    <w:p>
+      <w:pPr>
+        <w:spacing w:after="720"/>
+        <w:jc w:val="center"/>
+      </w:pPr>
+      <w:r>
+        <w:rPr>
+          <w:rFonts w:ascii="Georgia" w:cs="Georgia" w:eastAsia="Georgia" w:hAnsi="Georgia"/>
+          <w:b/>
+          <w:bCs/>
+          <w:sz w:val="32"/>
+          <w:szCs w:val="32"/>
+        </w:rPr>
+        <w:t xml:space="preserve">O carro prata</w:t>
+      </w:r>
+    </w:p>
+    <w:p>
+      <w:pPr>
+        <w:spacing w:after="0" w:line="312"/>
+        <w:ind w:firstLine="340"/>
+        <w:jc w:val="both"/>
+      </w:pPr>
+      <w:r>
+        <w:rPr>
+          <w:rFonts w:ascii="Georgia" w:cs="Georgia" w:eastAsia="Georgia" w:hAnsi="Georgia"/>
+          <w:sz w:val="21"/>
+          <w:szCs w:val="21"/>
+        </w:rPr>
+        <w:t xml:space="preserve">— Controle da garagem? — Dona Cida franziu a testa do outro lado da linha. — Tinha quatro, menino Lucas. O do seu pai, o da dona Helena, o do Nestor e um que ficava comigo, na gaveta da cozinha, para quando eu chegava com as compras.</w:t>
+      </w:r>
+    </w:p>
+    <w:p>
+      <w:pPr>
+        <w:spacing w:after="0" w:line="312"/>
+        <w:ind w:firstLine="340"/>
+        <w:jc w:val="both"/>
+      </w:pPr>
+      <w:r>
+        <w:rPr>
+          <w:rFonts w:ascii="Georgia" w:cs="Georgia" w:eastAsia="Georgia" w:hAnsi="Georgia"/>
+          <w:sz w:val="21"/>
+          <w:szCs w:val="21"/>
+        </w:rPr>
+        <w:t xml:space="preserve">— Só quatro?</w:t>
+      </w:r>
+    </w:p>
+    <w:p>
+      <w:pPr>
+        <w:spacing w:after="0" w:line="312"/>
+        <w:ind w:firstLine="340"/>
+        <w:jc w:val="both"/>
+      </w:pPr>
+      <w:r>
+        <w:rPr>
+          <w:rFonts w:ascii="Georgia" w:cs="Georgia" w:eastAsia="Georgia" w:hAnsi="Georgia"/>
+          <w:sz w:val="21"/>
+          <w:szCs w:val="21"/>
+        </w:rPr>
+        <w:t xml:space="preserve">— Só. — Ela pensou um pouco. — Quer dizer, teve uma época que o seu Otávio também tinha um. Faz anos. Quando ele vinha trazer papel pro seu pai de madrugada. Mas acho que ele devolveu.</w:t>
+      </w:r>
+    </w:p>
+    <w:p>
+      <w:pPr>
+        <w:spacing w:after="0" w:line="312"/>
+        <w:ind w:firstLine="340"/>
+        <w:jc w:val="both"/>
+      </w:pPr>
+      <w:r>
+        <w:rPr>
+          <w:rFonts w:ascii="Georgia" w:cs="Georgia" w:eastAsia="Georgia" w:hAnsi="Georgia"/>
+          <w:sz w:val="21"/>
+          <w:szCs w:val="21"/>
+        </w:rPr>
+        <w:t xml:space="preserve">— Acha?</w:t>
+      </w:r>
+    </w:p>
+    <w:p>
+      <w:pPr>
+        <w:spacing w:after="0" w:line="312"/>
+        <w:ind w:firstLine="340"/>
+        <w:jc w:val="both"/>
+      </w:pPr>
+      <w:r>
+        <w:rPr>
+          <w:rFonts w:ascii="Georgia" w:cs="Georgia" w:eastAsia="Georgia" w:hAnsi="Georgia"/>
+          <w:sz w:val="21"/>
+          <w:szCs w:val="21"/>
+        </w:rPr>
+        <w:t xml:space="preserve">— Ah, menino, eu não sei. Ninguém me conta nada nesta casa.</w:t>
+      </w:r>
+    </w:p>
+    <w:p>
+      <w:pPr>
+        <w:spacing w:after="0" w:line="312"/>
+        <w:ind w:firstLine="340"/>
+        <w:jc w:val="both"/>
+      </w:pPr>
+      <w:r>
+        <w:rPr>
+          <w:rFonts w:ascii="Georgia" w:cs="Georgia" w:eastAsia="Georgia" w:hAnsi="Georgia"/>
+          <w:sz w:val="21"/>
+          <w:szCs w:val="21"/>
+        </w:rPr>
+        <w:t xml:space="preserve">Lucas agradeceu e desligou. Ficou olhando pela janela da sala do pai, no décimo quarto andar da Faria Lima, para o trânsito parado lá embaixo.</w:t>
+      </w:r>
+    </w:p>
+    <w:p>
+      <w:pPr>
+        <w:spacing w:after="0" w:line="312"/>
+        <w:ind w:firstLine="340"/>
+        <w:jc w:val="both"/>
+      </w:pPr>
+      <w:r>
+        <w:rPr>
+          <w:rFonts w:ascii="Georgia" w:cs="Georgia" w:eastAsia="Georgia" w:hAnsi="Georgia"/>
+          <w:sz w:val="21"/>
+          <w:szCs w:val="21"/>
+        </w:rPr>
+        <w:t xml:space="preserve">Quatro controles. Talvez cinco. E um deles estava com Nestor no dia em que o carro explodiu numa ribanceira perto de Cajamar.</w:t>
+      </w:r>
+    </w:p>
+    <w:p>
+      <w:pPr>
+        <w:spacing w:after="200" w:before="200"/>
+        <w:jc w:val="center"/>
+      </w:pPr>
+      <w:r>
+        <w:rPr>
+          <w:rFonts w:ascii="Georgia" w:cs="Georgia" w:eastAsia="Georgia" w:hAnsi="Georgia"/>
+          <w:sz w:val="22"/>
+          <w:szCs w:val="22"/>
+        </w:rPr>
+        <w:t xml:space="preserve">*</w:t>
+      </w:r>
+    </w:p>
+    <w:p>
+      <w:pPr>
+        <w:spacing w:after="0" w:line="312"/>
+        <w:ind w:firstLine="340"/>
+        <w:jc w:val="both"/>
+      </w:pPr>
+      <w:r>
+        <w:rPr>
+          <w:rFonts w:ascii="Georgia" w:cs="Georgia" w:eastAsia="Georgia" w:hAnsi="Georgia"/>
+          <w:sz w:val="21"/>
+          <w:szCs w:val="21"/>
+        </w:rPr>
+        <w:t xml:space="preserve">Ele já tinha visto o carro três vezes antes de prestar atenção nele.</w:t>
+      </w:r>
+    </w:p>
+    <w:p>
+      <w:pPr>
+        <w:spacing w:after="0" w:line="312"/>
+        <w:ind w:firstLine="340"/>
+        <w:jc w:val="both"/>
+      </w:pPr>
+      <w:r>
+        <w:rPr>
+          <w:rFonts w:ascii="Georgia" w:cs="Georgia" w:eastAsia="Georgia" w:hAnsi="Georgia"/>
+          <w:sz w:val="21"/>
+          <w:szCs w:val="21"/>
+        </w:rPr>
+        <w:t xml:space="preserve">Um sedã prata, comum, desses que somem no trânsito de São Paulo como uma gota no mar. A primeira vez foi na quinta-feira depois da cremação, na rua da casa do Jardim Europa, quando ele saiu com o saco de farmácia na mão. A segunda, na segunda-feira seguinte, estacionado em frente à padaria da esquina da corretora. A terceira, naquela manhã mesmo, parado na saída da garagem do prédio, com o motor ligado e um homem de boné ao volante, lendo jornal.</w:t>
+      </w:r>
+    </w:p>
+    <w:p>
+      <w:pPr>
+        <w:spacing w:after="0" w:line="312"/>
+        <w:ind w:firstLine="340"/>
+        <w:jc w:val="both"/>
+      </w:pPr>
+      <w:r>
+        <w:rPr>
+          <w:rFonts w:ascii="Georgia" w:cs="Georgia" w:eastAsia="Georgia" w:hAnsi="Georgia"/>
+          <w:sz w:val="21"/>
+          <w:szCs w:val="21"/>
+        </w:rPr>
+        <w:t xml:space="preserve">Na terceira vez, Lucas anotou a placa no verso de um cartão de visita. EJK-7316. Depois se sentiu ridículo. Era só um carro.</w:t>
+      </w:r>
+    </w:p>
+    <w:p>
+      <w:pPr>
+        <w:spacing w:after="0" w:line="312"/>
+        <w:ind w:firstLine="340"/>
+        <w:jc w:val="both"/>
+      </w:pPr>
+      <w:r>
+        <w:rPr>
+          <w:rFonts w:ascii="Georgia" w:cs="Georgia" w:eastAsia="Georgia" w:hAnsi="Georgia"/>
+          <w:sz w:val="21"/>
+          <w:szCs w:val="21"/>
+        </w:rPr>
+        <w:t xml:space="preserve">Mas o pai também andava se sentindo ridículo, nos últimos meses. Dona Cida tinha dito: esquecido, nervoso, sentado no escuro do escritório de madrugada.</w:t>
+      </w:r>
+    </w:p>
+    <w:p>
+      <w:pPr>
+        <w:spacing w:after="200" w:before="200"/>
+        <w:jc w:val="center"/>
+      </w:pPr>
+      <w:r>
+        <w:rPr>
+          <w:rFonts w:ascii="Georgia" w:cs="Georgia" w:eastAsia="Georgia" w:hAnsi="Georgia"/>
+          <w:sz w:val="22"/>
+          <w:szCs w:val="22"/>
+        </w:rPr>
+        <w:t xml:space="preserve">*</w:t>
+      </w:r>
+    </w:p>
+    <w:p>
+      <w:pPr>
+        <w:spacing w:after="0" w:line="312"/>
+        <w:ind w:firstLine="340"/>
+        <w:jc w:val="both"/>
+      </w:pPr>
+      <w:r>
+        <w:rPr>
+          <w:rFonts w:ascii="Georgia" w:cs="Georgia" w:eastAsia="Georgia" w:hAnsi="Georgia"/>
+          <w:sz w:val="21"/>
+          <w:szCs w:val="21"/>
+        </w:rPr>
+        <w:t xml:space="preserve">A mesa do pai na corretora era de madeira escura, com três gavetas de cada lado. Lucas já tinha aberto todas na primeira semana, à procura de contratos, procurações, qualquer coisa que o ajudasse a entender a empresa que agora era dele. Nunca tinha olhado embaixo das gavetas.</w:t>
+      </w:r>
+    </w:p>
+    <w:p>
+      <w:pPr>
+        <w:spacing w:after="0" w:line="312"/>
+        <w:ind w:firstLine="340"/>
+        <w:jc w:val="both"/>
+      </w:pPr>
+      <w:r>
+        <w:rPr>
+          <w:rFonts w:ascii="Georgia" w:cs="Georgia" w:eastAsia="Georgia" w:hAnsi="Georgia"/>
+          <w:sz w:val="21"/>
+          <w:szCs w:val="21"/>
+        </w:rPr>
+        <w:t xml:space="preserve">Fez isso por acaso, ao procurar uma caneta que tinha rolado para o fundo. Ajoelhou-se no carpete, enfiou o braço até o cotovelo e sentiu, colado com fita adesiva na madeira de baixo da gaveta do meio, um papel dobrado.</w:t>
+      </w:r>
+    </w:p>
+    <w:p>
+      <w:pPr>
+        <w:spacing w:after="0" w:line="312"/>
+        <w:ind w:firstLine="340"/>
+        <w:jc w:val="both"/>
+      </w:pPr>
+      <w:r>
+        <w:rPr>
+          <w:rFonts w:ascii="Georgia" w:cs="Georgia" w:eastAsia="Georgia" w:hAnsi="Georgia"/>
+          <w:sz w:val="21"/>
+          <w:szCs w:val="21"/>
+        </w:rPr>
+        <w:t xml:space="preserve">Era um bilhete adesivo amarelo, desses de escritório, com a letra inclinada do pai. Uma linha só.</w:t>
+      </w:r>
+    </w:p>
+    <w:p>
+      <w:pPr>
+        <w:spacing w:after="0" w:line="312"/>
+        <w:ind w:firstLine="340"/>
+        <w:jc w:val="both"/>
+      </w:pPr>
+      <w:r>
+        <w:rPr>
+          <w:rFonts w:ascii="Georgia" w:cs="Georgia" w:eastAsia="Georgia" w:hAnsi="Georgia"/>
+          <w:sz w:val="21"/>
+          <w:szCs w:val="21"/>
+        </w:rPr>
+        <w:t xml:space="preserve">Senha do e-mail: o carro que me segue.</w:t>
+      </w:r>
+    </w:p>
+    <w:p>
+      <w:pPr>
+        <w:spacing w:after="0" w:line="312"/>
+        <w:ind w:firstLine="340"/>
+        <w:jc w:val="both"/>
+      </w:pPr>
+      <w:r>
+        <w:rPr>
+          <w:rFonts w:ascii="Georgia" w:cs="Georgia" w:eastAsia="Georgia" w:hAnsi="Georgia"/>
+          <w:sz w:val="21"/>
+          <w:szCs w:val="21"/>
+        </w:rPr>
+        <w:t xml:space="preserve">Lucas ficou sentado no chão, atrás da mesa, com o bilhete na mão, por quase um minuto.</w:t>
+      </w:r>
+    </w:p>
+    <w:p>
+      <w:pPr>
+        <w:spacing w:after="0" w:line="312"/>
+        <w:ind w:firstLine="340"/>
+        <w:jc w:val="both"/>
+      </w:pPr>
+      <w:r>
+        <w:rPr>
+          <w:rFonts w:ascii="Georgia" w:cs="Georgia" w:eastAsia="Georgia" w:hAnsi="Georgia"/>
+          <w:sz w:val="21"/>
+          <w:szCs w:val="21"/>
+        </w:rPr>
+        <w:t xml:space="preserve">Depois tirou o BlackBerry do bolso. No menu, além do e-mail da corretora, havia um segundo ícone de correio, uma conta pessoal que ele tinha visto na primeira noite e deixado de lado porque pedia uma senha. Tinha tentado o ramal, a data do incêndio, os aniversários. Nada.</w:t>
+      </w:r>
+    </w:p>
+    <w:p>
+      <w:pPr>
+        <w:spacing w:after="0" w:line="312"/>
+        <w:ind w:firstLine="340"/>
+        <w:jc w:val="both"/>
+      </w:pPr>
+      <w:r>
+        <w:rPr>
+          <w:rFonts w:ascii="Georgia" w:cs="Georgia" w:eastAsia="Georgia" w:hAnsi="Georgia"/>
+          <w:sz w:val="21"/>
+          <w:szCs w:val="21"/>
+        </w:rPr>
+        <w:t xml:space="preserve">Pegou o cartão de visita com a placa anotada no verso.</w:t>
+      </w:r>
+    </w:p>
+    <w:p>
+      <w:pPr>
+        <w:spacing w:after="0" w:line="312"/>
+        <w:ind w:firstLine="340"/>
+        <w:jc w:val="both"/>
+      </w:pPr>
+      <w:r>
+        <w:rPr>
+          <w:rFonts w:ascii="Georgia" w:cs="Georgia" w:eastAsia="Georgia" w:hAnsi="Georgia"/>
+          <w:sz w:val="21"/>
+          <w:szCs w:val="21"/>
+        </w:rPr>
+        <w:t xml:space="preserve">Quatro dígitos. Sete, três, um, seis.</w:t>
+      </w:r>
+    </w:p>
+    <w:p>
+      <w:pPr>
+        <w:spacing w:after="0" w:line="312"/>
+        <w:ind w:firstLine="340"/>
+        <w:jc w:val="both"/>
+      </w:pPr>
+      <w:r>
+        <w:rPr>
+          <w:rFonts w:ascii="Georgia" w:cs="Georgia" w:eastAsia="Georgia" w:hAnsi="Georgia"/>
+          <w:sz w:val="21"/>
+          <w:szCs w:val="21"/>
+        </w:rPr>
+        <w:t xml:space="preserve">A caixa de entrada se abriu.</w:t>
+      </w:r>
+    </w:p>
+    <w:p>
+      <w:pPr>
+        <w:spacing w:after="200" w:before="200"/>
+        <w:jc w:val="center"/>
+      </w:pPr>
+      <w:r>
+        <w:rPr>
+          <w:rFonts w:ascii="Georgia" w:cs="Georgia" w:eastAsia="Georgia" w:hAnsi="Georgia"/>
+          <w:sz w:val="22"/>
+          <w:szCs w:val="22"/>
+        </w:rPr>
+        <w:t xml:space="preserve">*</w:t>
+      </w:r>
+    </w:p>
+    <w:p>
+      <w:pPr>
+        <w:spacing w:after="0" w:line="312"/>
+        <w:ind w:firstLine="340"/>
+        <w:jc w:val="both"/>
+      </w:pPr>
+      <w:r>
+        <w:rPr>
+          <w:rFonts w:ascii="Georgia" w:cs="Georgia" w:eastAsia="Georgia" w:hAnsi="Georgia"/>
+          <w:sz w:val="21"/>
+          <w:szCs w:val="21"/>
+        </w:rPr>
+        <w:t xml:space="preserve">A conta pessoal do pai tinha poucas mensagens, e quase todas eram dele para ele mesmo.</w:t>
+      </w:r>
+    </w:p>
+    <w:p>
+      <w:pPr>
+        <w:spacing w:after="0" w:line="312"/>
+        <w:ind w:firstLine="340"/>
+        <w:jc w:val="both"/>
+      </w:pPr>
+      <w:r>
+        <w:rPr>
+          <w:rFonts w:ascii="Georgia" w:cs="Georgia" w:eastAsia="Georgia" w:hAnsi="Georgia"/>
+          <w:sz w:val="21"/>
+          <w:szCs w:val="21"/>
+        </w:rPr>
+        <w:t xml:space="preserve">Lucas levou um tempo para entender. O pai usava aquele e-mail como um caderno. Mandava para si próprio anotações curtas, datas, números, frases soltas. Como alguém que não confia na própria memória, ou que não confia em mais ninguém.</w:t>
+      </w:r>
+    </w:p>
+    <w:p>
+      <w:pPr>
+        <w:spacing w:after="0" w:line="312"/>
+        <w:ind w:firstLine="340"/>
+        <w:jc w:val="both"/>
+      </w:pPr>
+      <w:r>
+        <w:rPr>
+          <w:rFonts w:ascii="Georgia" w:cs="Georgia" w:eastAsia="Georgia" w:hAnsi="Georgia"/>
+          <w:sz w:val="21"/>
+          <w:szCs w:val="21"/>
+        </w:rPr>
+        <w:t xml:space="preserve">A primeira era de junho, poucas semanas depois do restaurante.</w:t>
+      </w:r>
+    </w:p>
+    <w:p>
+      <w:pPr>
+        <w:spacing w:after="0" w:line="312"/>
+        <w:ind w:firstLine="340"/>
+        <w:jc w:val="both"/>
+      </w:pPr>
+      <w:r>
+        <w:rPr>
+          <w:rFonts w:ascii="Georgia" w:cs="Georgia" w:eastAsia="Georgia" w:hAnsi="Georgia"/>
+          <w:sz w:val="21"/>
+          <w:szCs w:val="21"/>
+        </w:rPr>
+        <w:t xml:space="preserve">Carro prata. Placa EJK-7316. Terceira vez esta semana. Na saída de casa e na porta da corretora.</w:t>
+      </w:r>
+    </w:p>
+    <w:p>
+      <w:pPr>
+        <w:spacing w:after="0" w:line="312"/>
+        <w:ind w:firstLine="340"/>
+        <w:jc w:val="both"/>
+      </w:pPr>
+      <w:r>
+        <w:rPr>
+          <w:rFonts w:ascii="Georgia" w:cs="Georgia" w:eastAsia="Georgia" w:hAnsi="Georgia"/>
+          <w:sz w:val="21"/>
+          <w:szCs w:val="21"/>
+        </w:rPr>
+        <w:t xml:space="preserve">Depois, em julho:</w:t>
+      </w:r>
+    </w:p>
+    <w:p>
+      <w:pPr>
+        <w:spacing w:after="0" w:line="312"/>
+        <w:ind w:firstLine="340"/>
+        <w:jc w:val="both"/>
+      </w:pPr>
+      <w:r>
+        <w:rPr>
+          <w:rFonts w:ascii="Georgia" w:cs="Georgia" w:eastAsia="Georgia" w:hAnsi="Georgia"/>
+          <w:sz w:val="21"/>
+          <w:szCs w:val="21"/>
+        </w:rPr>
+        <w:t xml:space="preserve">Valdir checou a placa. Carro em nome de uma empresa de Barueri. Empresa sem funcionários, sem telefone. Caixa postal.</w:t>
+      </w:r>
+    </w:p>
+    <w:p>
+      <w:pPr>
+        <w:spacing w:after="0" w:line="312"/>
+        <w:ind w:firstLine="340"/>
+        <w:jc w:val="both"/>
+      </w:pPr>
+      <w:r>
+        <w:rPr>
+          <w:rFonts w:ascii="Georgia" w:cs="Georgia" w:eastAsia="Georgia" w:hAnsi="Georgia"/>
+          <w:sz w:val="21"/>
+          <w:szCs w:val="21"/>
+        </w:rPr>
+        <w:t xml:space="preserve">Ainda em julho, dias depois do hotel:</w:t>
+      </w:r>
+    </w:p>
+    <w:p>
+      <w:pPr>
+        <w:spacing w:after="0" w:line="312"/>
+        <w:ind w:firstLine="340"/>
+        <w:jc w:val="both"/>
+      </w:pPr>
+      <w:r>
+        <w:rPr>
+          <w:rFonts w:ascii="Georgia" w:cs="Georgia" w:eastAsia="Georgia" w:hAnsi="Georgia"/>
+          <w:sz w:val="21"/>
+          <w:szCs w:val="21"/>
+        </w:rPr>
+        <w:t xml:space="preserve">O mesmo carro na Paulista, na manhã seguinte. Estacionado em frente ao Castellane.</w:t>
+      </w:r>
+    </w:p>
+    <w:p>
+      <w:pPr>
+        <w:spacing w:after="0" w:line="312"/>
+        <w:ind w:firstLine="340"/>
+        <w:jc w:val="both"/>
+      </w:pPr>
+      <w:r>
+        <w:rPr>
+          <w:rFonts w:ascii="Georgia" w:cs="Georgia" w:eastAsia="Georgia" w:hAnsi="Georgia"/>
+          <w:sz w:val="21"/>
+          <w:szCs w:val="21"/>
+        </w:rPr>
+        <w:t xml:space="preserve">Lucas sentiu a boca secar. Continuou descendo.</w:t>
+      </w:r>
+    </w:p>
+    <w:p>
+      <w:pPr>
+        <w:spacing w:after="0" w:line="312"/>
+        <w:ind w:firstLine="340"/>
+        <w:jc w:val="both"/>
+      </w:pPr>
+      <w:r>
+        <w:rPr>
+          <w:rFonts w:ascii="Georgia" w:cs="Georgia" w:eastAsia="Georgia" w:hAnsi="Georgia"/>
+          <w:sz w:val="21"/>
+          <w:szCs w:val="21"/>
+        </w:rPr>
+        <w:t xml:space="preserve">Em agosto, as anotações mudavam de assunto.</w:t>
+      </w:r>
+    </w:p>
+    <w:p>
+      <w:pPr>
+        <w:spacing w:after="0" w:line="312"/>
+        <w:ind w:firstLine="340"/>
+        <w:jc w:val="both"/>
+      </w:pPr>
+      <w:r>
+        <w:rPr>
+          <w:rFonts w:ascii="Georgia" w:cs="Georgia" w:eastAsia="Georgia" w:hAnsi="Georgia"/>
+          <w:sz w:val="21"/>
+          <w:szCs w:val="21"/>
+        </w:rPr>
+        <w:t xml:space="preserve">Revisar os pagamentos aprovados por mensagem desde janeiro. Alguma coisa não fecha.</w:t>
+      </w:r>
+    </w:p>
+    <w:p>
+      <w:pPr>
+        <w:spacing w:after="0" w:line="312"/>
+        <w:ind w:firstLine="340"/>
+        <w:jc w:val="both"/>
+      </w:pPr>
+      <w:r>
+        <w:rPr>
+          <w:rFonts w:ascii="Georgia" w:cs="Georgia" w:eastAsia="Georgia" w:hAnsi="Georgia"/>
+          <w:sz w:val="21"/>
+          <w:szCs w:val="21"/>
+        </w:rPr>
+        <w:t xml:space="preserve">Pagamentos para três fornecedores que eu não conheço. Todos aprovados por mim. Todos com o meu ok.</w:t>
+      </w:r>
+    </w:p>
+    <w:p>
+      <w:pPr>
+        <w:spacing w:after="0" w:line="312"/>
+        <w:ind w:firstLine="340"/>
+        <w:jc w:val="both"/>
+      </w:pPr>
+      <w:r>
+        <w:rPr>
+          <w:rFonts w:ascii="Georgia" w:cs="Georgia" w:eastAsia="Georgia" w:hAnsi="Georgia"/>
+          <w:sz w:val="21"/>
+          <w:szCs w:val="21"/>
+        </w:rPr>
+        <w:t xml:space="preserve">Eu não lembro de ter aprovado isso. Ou lembro e não li o que aprovava.</w:t>
+      </w:r>
+    </w:p>
+    <w:p>
+      <w:pPr>
+        <w:spacing w:after="0" w:line="312"/>
+        <w:ind w:firstLine="340"/>
+        <w:jc w:val="both"/>
+      </w:pPr>
+      <w:r>
+        <w:rPr>
+          <w:rFonts w:ascii="Georgia" w:cs="Georgia" w:eastAsia="Georgia" w:hAnsi="Georgia"/>
+          <w:sz w:val="21"/>
+          <w:szCs w:val="21"/>
+        </w:rPr>
+        <w:t xml:space="preserve">E, no fim de agosto, uma mensagem mais longa, com uma planilha anexada:</w:t>
+      </w:r>
+    </w:p>
+    <w:p>
+      <w:pPr>
+        <w:spacing w:after="0" w:line="312"/>
+        <w:ind w:firstLine="340"/>
+        <w:jc w:val="both"/>
+      </w:pPr>
+      <w:r>
+        <w:rPr>
+          <w:rFonts w:ascii="Georgia" w:cs="Georgia" w:eastAsia="Georgia" w:hAnsi="Georgia"/>
+          <w:sz w:val="21"/>
+          <w:szCs w:val="21"/>
+        </w:rPr>
+        <w:t xml:space="preserve">Os pagamentos chegam como mensagem da Contabilidade. Pagamento confirmado. Relatório enviado. Eu respondo ok porque sempre respondi ok. Liguei hoje para o escritório de contabilidade. Eles nunca me mandaram mensagem nenhuma. Nunca tiveram esse número.</w:t>
+      </w:r>
+    </w:p>
+    <w:p>
+      <w:pPr>
+        <w:spacing w:after="0" w:line="312"/>
+        <w:ind w:firstLine="340"/>
+        <w:jc w:val="both"/>
+      </w:pPr>
+      <w:r>
+        <w:rPr>
+          <w:rFonts w:ascii="Georgia" w:cs="Georgia" w:eastAsia="Georgia" w:hAnsi="Georgia"/>
+          <w:sz w:val="21"/>
+          <w:szCs w:val="21"/>
+        </w:rPr>
+        <w:t xml:space="preserve">De quem é esse número?</w:t>
+      </w:r>
+    </w:p>
+    <w:p>
+      <w:pPr>
+        <w:spacing w:after="200" w:before="200"/>
+        <w:jc w:val="center"/>
+      </w:pPr>
+      <w:r>
+        <w:rPr>
+          <w:rFonts w:ascii="Georgia" w:cs="Georgia" w:eastAsia="Georgia" w:hAnsi="Georgia"/>
+          <w:sz w:val="22"/>
+          <w:szCs w:val="22"/>
+        </w:rPr>
+        <w:t xml:space="preserve">*</w:t>
+      </w:r>
+    </w:p>
+    <w:p>
+      <w:pPr>
+        <w:spacing w:after="0" w:line="312"/>
+        <w:ind w:firstLine="340"/>
+        <w:jc w:val="both"/>
+      </w:pPr>
+      <w:r>
+        <w:rPr>
+          <w:rFonts w:ascii="Georgia" w:cs="Georgia" w:eastAsia="Georgia" w:hAnsi="Georgia"/>
+          <w:sz w:val="21"/>
+          <w:szCs w:val="21"/>
+        </w:rPr>
+        <w:t xml:space="preserve">Lucas abriu as mensagens de texto e procurou o contato.</w:t>
+      </w:r>
+    </w:p>
+    <w:p>
+      <w:pPr>
+        <w:spacing w:after="0" w:line="312"/>
+        <w:ind w:firstLine="340"/>
+        <w:jc w:val="both"/>
+      </w:pPr>
+      <w:r>
+        <w:rPr>
+          <w:rFonts w:ascii="Georgia" w:cs="Georgia" w:eastAsia="Georgia" w:hAnsi="Georgia"/>
+          <w:sz w:val="21"/>
+          <w:szCs w:val="21"/>
+        </w:rPr>
+        <w:t xml:space="preserve">Contabilidade. A mesma lista de mensagens secas que ele tinha atravessado na primeira noite sem pensar duas vezes. Pagamento confirmado. Ok. Relatório enviado. Ok. Pagamento confirmado. Ok. Meses e meses de oks do pai, um atrás do outro, como os carimbos de um funcionário cansado.</w:t>
+      </w:r>
+    </w:p>
+    <w:p>
+      <w:pPr>
+        <w:spacing w:after="0" w:line="312"/>
+        <w:ind w:firstLine="340"/>
+        <w:jc w:val="both"/>
+      </w:pPr>
+      <w:r>
+        <w:rPr>
+          <w:rFonts w:ascii="Georgia" w:cs="Georgia" w:eastAsia="Georgia" w:hAnsi="Georgia"/>
+          <w:sz w:val="21"/>
+          <w:szCs w:val="21"/>
+        </w:rPr>
+        <w:t xml:space="preserve">Desceu até o fim. Até a segunda-feira, a véspera.</w:t>
+      </w:r>
+    </w:p>
+    <w:p>
+      <w:pPr>
+        <w:spacing w:after="0" w:line="312"/>
+        <w:ind w:firstLine="340"/>
+        <w:jc w:val="both"/>
+      </w:pPr>
+      <w:r>
+        <w:rPr>
+          <w:rFonts w:ascii="Georgia" w:cs="Georgia" w:eastAsia="Georgia" w:hAnsi="Georgia"/>
+          <w:sz w:val="21"/>
+          <w:szCs w:val="21"/>
+        </w:rPr>
+        <w:t xml:space="preserve">Às seis e dez da tarde daquela segunda, o pai tinha escrito ao contato, pela primeira vez, uma mensagem que não era ok.</w:t>
+      </w:r>
+    </w:p>
+    <w:p>
+      <w:pPr>
+        <w:spacing w:after="0" w:line="312"/>
+        <w:ind w:firstLine="340"/>
+        <w:jc w:val="both"/>
+      </w:pPr>
+      <w:r>
+        <w:rPr>
+          <w:rFonts w:ascii="Georgia" w:cs="Georgia" w:eastAsia="Georgia" w:hAnsi="Georgia"/>
+          <w:sz w:val="21"/>
+          <w:szCs w:val="21"/>
+        </w:rPr>
+        <w:t xml:space="preserve">Amanhã, sete e meia, aqui em casa. Traga os originais. Eu quero encerrar isso antes que alguém mais saia machucado.</w:t>
+      </w:r>
+    </w:p>
+    <w:p>
+      <w:pPr>
+        <w:spacing w:after="0" w:line="312"/>
+        <w:ind w:firstLine="340"/>
+        <w:jc w:val="both"/>
+      </w:pPr>
+      <w:r>
+        <w:rPr>
+          <w:rFonts w:ascii="Georgia" w:cs="Georgia" w:eastAsia="Georgia" w:hAnsi="Georgia"/>
+          <w:sz w:val="21"/>
+          <w:szCs w:val="21"/>
+        </w:rPr>
+        <w:t xml:space="preserve">E a resposta, quatro minutos depois:</w:t>
+      </w:r>
+    </w:p>
+    <w:p>
+      <w:pPr>
+        <w:spacing w:after="0" w:line="312"/>
+        <w:ind w:firstLine="340"/>
+        <w:jc w:val="both"/>
+      </w:pPr>
+      <w:r>
+        <w:rPr>
+          <w:rFonts w:ascii="Georgia" w:cs="Georgia" w:eastAsia="Georgia" w:hAnsi="Georgia"/>
+          <w:sz w:val="21"/>
+          <w:szCs w:val="21"/>
+        </w:rPr>
+        <w:t xml:space="preserve">Confirmado amanhã cedo. Pode deixar o portão aberto.</w:t>
+      </w:r>
+    </w:p>
+    <w:p>
+      <w:pPr>
+        <w:spacing w:after="0" w:line="312"/>
+        <w:ind w:firstLine="340"/>
+        <w:jc w:val="both"/>
+      </w:pPr>
+      <w:r>
+        <w:rPr>
+          <w:rFonts w:ascii="Georgia" w:cs="Georgia" w:eastAsia="Georgia" w:hAnsi="Georgia"/>
+          <w:sz w:val="21"/>
+          <w:szCs w:val="21"/>
+        </w:rPr>
+        <w:t xml:space="preserve">Lucas leu aquilo três vezes. Depois voltou à conta pessoal do pai e procurou a última anotação. Era da mesma segunda-feira, das seis e três da tarde, sete minutos antes da mensagem para a Contabilidade.</w:t>
+      </w:r>
+    </w:p>
+    <w:p>
+      <w:pPr>
+        <w:spacing w:after="0" w:line="312"/>
+        <w:ind w:firstLine="340"/>
+        <w:jc w:val="both"/>
+      </w:pPr>
+      <w:r>
+        <w:rPr>
+          <w:rFonts w:ascii="Georgia" w:cs="Georgia" w:eastAsia="Georgia" w:hAnsi="Georgia"/>
+          <w:sz w:val="21"/>
+          <w:szCs w:val="21"/>
+        </w:rPr>
+        <w:t xml:space="preserve">Contabilidade = Otávio?</w:t>
+      </w:r>
+    </w:p>
+    <w:p>
+      <w:pPr>
+        <w:spacing w:after="0" w:line="312"/>
+        <w:ind w:firstLine="340"/>
+        <w:jc w:val="both"/>
+      </w:pPr>
+      <w:r>
+        <w:rPr>
+          <w:rFonts w:ascii="Georgia" w:cs="Georgia" w:eastAsia="Georgia" w:hAnsi="Georgia"/>
+          <w:sz w:val="21"/>
+          <w:szCs w:val="21"/>
+        </w:rPr>
+        <w:t xml:space="preserve">Só isso. Uma pergunta, com o nome do sócio e um ponto de interrogação.</w:t>
+      </w:r>
+    </w:p>
+    <w:p>
+      <w:pPr>
+        <w:spacing w:after="200" w:before="200"/>
+        <w:jc w:val="center"/>
+      </w:pPr>
+      <w:r>
+        <w:rPr>
+          <w:rFonts w:ascii="Georgia" w:cs="Georgia" w:eastAsia="Georgia" w:hAnsi="Georgia"/>
+          <w:sz w:val="22"/>
+          <w:szCs w:val="22"/>
+        </w:rPr>
+        <w:t xml:space="preserve">*</w:t>
+      </w:r>
+    </w:p>
+    <w:p>
+      <w:pPr>
+        <w:spacing w:after="0" w:line="312"/>
+        <w:ind w:firstLine="340"/>
+        <w:jc w:val="both"/>
+      </w:pPr>
+      <w:r>
+        <w:rPr>
+          <w:rFonts w:ascii="Georgia" w:cs="Georgia" w:eastAsia="Georgia" w:hAnsi="Georgia"/>
+          <w:sz w:val="21"/>
+          <w:szCs w:val="21"/>
+        </w:rPr>
+        <w:t xml:space="preserve">Alguém bateu na porta.</w:t>
+      </w:r>
+    </w:p>
+    <w:p>
+      <w:pPr>
+        <w:spacing w:after="0" w:line="312"/>
+        <w:ind w:firstLine="340"/>
+        <w:jc w:val="both"/>
+      </w:pPr>
+      <w:r>
+        <w:rPr>
+          <w:rFonts w:ascii="Georgia" w:cs="Georgia" w:eastAsia="Georgia" w:hAnsi="Georgia"/>
+          <w:sz w:val="21"/>
+          <w:szCs w:val="21"/>
+        </w:rPr>
+        <w:t xml:space="preserve">Lucas se levantou rápido demais, bateu a cabeça na borda da mesa e enfiou o BlackBerry no bolso do paletó. O bilhete amarelo ficou na mão fechada.</w:t>
+      </w:r>
+    </w:p>
+    <w:p>
+      <w:pPr>
+        <w:spacing w:after="0" w:line="312"/>
+        <w:ind w:firstLine="340"/>
+        <w:jc w:val="both"/>
+      </w:pPr>
+      <w:r>
+        <w:rPr>
+          <w:rFonts w:ascii="Georgia" w:cs="Georgia" w:eastAsia="Georgia" w:hAnsi="Georgia"/>
+          <w:sz w:val="21"/>
+          <w:szCs w:val="21"/>
+        </w:rPr>
+        <w:t xml:space="preserve">— Pode entrar.</w:t>
+      </w:r>
+    </w:p>
+    <w:p>
+      <w:pPr>
+        <w:spacing w:after="0" w:line="312"/>
+        <w:ind w:firstLine="340"/>
+        <w:jc w:val="both"/>
+      </w:pPr>
+      <w:r>
+        <w:rPr>
+          <w:rFonts w:ascii="Georgia" w:cs="Georgia" w:eastAsia="Georgia" w:hAnsi="Georgia"/>
+          <w:sz w:val="21"/>
+          <w:szCs w:val="21"/>
+        </w:rPr>
+        <w:t xml:space="preserve">Otávio enfiou a cabeça pela porta, sorrindo.</w:t>
+      </w:r>
+    </w:p>
+    <w:p>
+      <w:pPr>
+        <w:spacing w:after="0" w:line="312"/>
+        <w:ind w:firstLine="340"/>
+        <w:jc w:val="both"/>
+      </w:pPr>
+      <w:r>
+        <w:rPr>
+          <w:rFonts w:ascii="Georgia" w:cs="Georgia" w:eastAsia="Georgia" w:hAnsi="Georgia"/>
+          <w:sz w:val="21"/>
+          <w:szCs w:val="21"/>
+        </w:rPr>
+        <w:t xml:space="preserve">— Tudo bem aí? Ouvi um barulho.</w:t>
+      </w:r>
+    </w:p>
+    <w:p>
+      <w:pPr>
+        <w:spacing w:after="0" w:line="312"/>
+        <w:ind w:firstLine="340"/>
+        <w:jc w:val="both"/>
+      </w:pPr>
+      <w:r>
+        <w:rPr>
+          <w:rFonts w:ascii="Georgia" w:cs="Georgia" w:eastAsia="Georgia" w:hAnsi="Georgia"/>
+          <w:sz w:val="21"/>
+          <w:szCs w:val="21"/>
+        </w:rPr>
+        <w:t xml:space="preserve">— Deixei cair uma caneta.</w:t>
+      </w:r>
+    </w:p>
+    <w:p>
+      <w:pPr>
+        <w:spacing w:after="0" w:line="312"/>
+        <w:ind w:firstLine="340"/>
+        <w:jc w:val="both"/>
+      </w:pPr>
+      <w:r>
+        <w:rPr>
+          <w:rFonts w:ascii="Georgia" w:cs="Georgia" w:eastAsia="Georgia" w:hAnsi="Georgia"/>
+          <w:sz w:val="21"/>
+          <w:szCs w:val="21"/>
+        </w:rPr>
+        <w:t xml:space="preserve">— Achou?</w:t>
+      </w:r>
+    </w:p>
+    <w:p>
+      <w:pPr>
+        <w:spacing w:after="0" w:line="312"/>
+        <w:ind w:firstLine="340"/>
+        <w:jc w:val="both"/>
+      </w:pPr>
+      <w:r>
+        <w:rPr>
+          <w:rFonts w:ascii="Georgia" w:cs="Georgia" w:eastAsia="Georgia" w:hAnsi="Georgia"/>
+          <w:sz w:val="21"/>
+          <w:szCs w:val="21"/>
+        </w:rPr>
+        <w:t xml:space="preserve">— Achei.</w:t>
+      </w:r>
+    </w:p>
+    <w:p>
+      <w:pPr>
+        <w:spacing w:after="0" w:line="312"/>
+        <w:ind w:firstLine="340"/>
+        <w:jc w:val="both"/>
+      </w:pPr>
+      <w:r>
+        <w:rPr>
+          <w:rFonts w:ascii="Georgia" w:cs="Georgia" w:eastAsia="Georgia" w:hAnsi="Georgia"/>
+          <w:sz w:val="21"/>
+          <w:szCs w:val="21"/>
+        </w:rPr>
+        <w:t xml:space="preserve">O sócio olhou para ele, depois para o chão atrás da mesa, depois de novo para ele. Tinha na mão um envelope pardo.</w:t>
+      </w:r>
+    </w:p>
+    <w:p>
+      <w:pPr>
+        <w:spacing w:after="0" w:line="312"/>
+        <w:ind w:firstLine="340"/>
+        <w:jc w:val="both"/>
+      </w:pPr>
+      <w:r>
+        <w:rPr>
+          <w:rFonts w:ascii="Georgia" w:cs="Georgia" w:eastAsia="Georgia" w:hAnsi="Georgia"/>
+          <w:sz w:val="21"/>
+          <w:szCs w:val="21"/>
+        </w:rPr>
+        <w:t xml:space="preserve">— Trouxe os relatórios do mês para você assinar. Coisa de rotina. — Ele atravessou a sala e pousou o envelope sobre a mesa. — Pode dar um ok rápido. Teu pai sempre dava.</w:t>
+      </w:r>
+    </w:p>
+    <w:p>
+      <w:pPr>
+        <w:spacing w:after="0" w:line="312"/>
+        <w:ind w:firstLine="340"/>
+        <w:jc w:val="both"/>
+      </w:pPr>
+      <w:r>
+        <w:rPr>
+          <w:rFonts w:ascii="Georgia" w:cs="Georgia" w:eastAsia="Georgia" w:hAnsi="Georgia"/>
+          <w:sz w:val="21"/>
+          <w:szCs w:val="21"/>
+        </w:rPr>
+        <w:t xml:space="preserve">Lucas olhou para o envelope. Depois olhou para Otávio.</w:t>
+      </w:r>
+    </w:p>
+    <w:p>
+      <w:pPr>
+        <w:spacing w:after="0" w:line="312"/>
+        <w:ind w:firstLine="340"/>
+        <w:jc w:val="both"/>
+      </w:pPr>
+      <w:r>
+        <w:rPr>
+          <w:rFonts w:ascii="Georgia" w:cs="Georgia" w:eastAsia="Georgia" w:hAnsi="Georgia"/>
+          <w:sz w:val="21"/>
+          <w:szCs w:val="21"/>
+        </w:rPr>
+        <w:t xml:space="preserve">— Vou ler com calma.</w:t>
+      </w:r>
+    </w:p>
+    <w:p>
+      <w:pPr>
+        <w:spacing w:after="0" w:line="312"/>
+        <w:ind w:firstLine="340"/>
+        <w:jc w:val="both"/>
+      </w:pPr>
+      <w:r>
+        <w:rPr>
+          <w:rFonts w:ascii="Georgia" w:cs="Georgia" w:eastAsia="Georgia" w:hAnsi="Georgia"/>
+          <w:sz w:val="21"/>
+          <w:szCs w:val="21"/>
+        </w:rPr>
+        <w:t xml:space="preserve">— Claro, claro. — Otávio sorriu de novo. — Com calma. Você é igualzinho a ele.</w:t>
+      </w:r>
+    </w:p>
+    <w:p>
+      <w:pPr>
+        <w:spacing w:after="0" w:line="312"/>
+        <w:ind w:firstLine="340"/>
+        <w:jc w:val="both"/>
+      </w:pPr>
+      <w:r>
+        <w:rPr>
+          <w:rFonts w:ascii="Georgia" w:cs="Georgia" w:eastAsia="Georgia" w:hAnsi="Georgia"/>
+          <w:sz w:val="21"/>
+          <w:szCs w:val="21"/>
+        </w:rPr>
+        <w:t xml:space="preserve">Na porta, parou.</w:t>
+      </w:r>
+    </w:p>
+    <w:p>
+      <w:pPr>
+        <w:spacing w:after="0" w:line="312"/>
+        <w:ind w:firstLine="340"/>
+        <w:jc w:val="both"/>
+      </w:pPr>
+      <w:r>
+        <w:rPr>
+          <w:rFonts w:ascii="Georgia" w:cs="Georgia" w:eastAsia="Georgia" w:hAnsi="Georgia"/>
+          <w:sz w:val="21"/>
+          <w:szCs w:val="21"/>
+        </w:rPr>
+        <w:t xml:space="preserve">— Ah, Lucas. Aquele carro prata lá embaixo, na saída da garagem. Você viu? Eu já pedi para a segurança do prédio dar uma olhada. Esses tempos andam esquisitos.</w:t>
+      </w:r>
+    </w:p>
+    <w:p>
+      <w:pPr>
+        <w:spacing w:after="0" w:line="312"/>
+        <w:ind w:firstLine="340"/>
+        <w:jc w:val="both"/>
+      </w:pPr>
+      <w:r>
+        <w:rPr>
+          <w:rFonts w:ascii="Georgia" w:cs="Georgia" w:eastAsia="Georgia" w:hAnsi="Georgia"/>
+          <w:sz w:val="21"/>
+          <w:szCs w:val="21"/>
+        </w:rPr>
+        <w:t xml:space="preserve">E saiu.</w:t>
+      </w:r>
+    </w:p>
+    <w:p>
+      <w:pPr>
+        <w:spacing w:after="200" w:before="200"/>
+        <w:jc w:val="center"/>
+      </w:pPr>
+      <w:r>
+        <w:rPr>
+          <w:rFonts w:ascii="Georgia" w:cs="Georgia" w:eastAsia="Georgia" w:hAnsi="Georgia"/>
+          <w:sz w:val="22"/>
+          <w:szCs w:val="22"/>
+        </w:rPr>
+        <w:t xml:space="preserve">*</w:t>
+      </w:r>
+    </w:p>
+    <w:p>
+      <w:pPr>
+        <w:spacing w:after="0" w:line="312"/>
+        <w:ind w:firstLine="340"/>
+        <w:jc w:val="both"/>
+      </w:pPr>
+      <w:r>
+        <w:rPr>
+          <w:rFonts w:ascii="Georgia" w:cs="Georgia" w:eastAsia="Georgia" w:hAnsi="Georgia"/>
+          <w:sz w:val="21"/>
+          <w:szCs w:val="21"/>
+        </w:rPr>
+        <w:t xml:space="preserve">Lucas esperou o barulho dos passos sumir no corredor. Depois foi até a janela.</w:t>
+      </w:r>
+    </w:p>
+    <w:p>
+      <w:pPr>
+        <w:spacing w:after="0" w:line="312"/>
+        <w:ind w:firstLine="340"/>
+        <w:jc w:val="both"/>
+      </w:pPr>
+      <w:r>
+        <w:rPr>
+          <w:rFonts w:ascii="Georgia" w:cs="Georgia" w:eastAsia="Georgia" w:hAnsi="Georgia"/>
+          <w:sz w:val="21"/>
+          <w:szCs w:val="21"/>
+        </w:rPr>
+        <w:t xml:space="preserve">Lá embaixo, na saída da garagem, a vaga onde o sedã prata estava parado naquela manhã estava vazia.</w:t>
+      </w:r>
+    </w:p>
+    <w:p>
+      <w:pPr>
+        <w:spacing w:after="0" w:line="312"/>
+        <w:ind w:firstLine="340"/>
+        <w:jc w:val="both"/>
+      </w:pPr>
+      <w:r>
+        <w:rPr>
+          <w:rFonts w:ascii="Georgia" w:cs="Georgia" w:eastAsia="Georgia" w:hAnsi="Georgia"/>
+          <w:sz w:val="21"/>
+          <w:szCs w:val="21"/>
+        </w:rPr>
+        <w:t xml:space="preserve">Ele abriu a mão e olhou para o bilhete amarelo. Senha do e-mail: o carro que me segue.</w:t>
+      </w:r>
+    </w:p>
+    <w:p>
+      <w:pPr>
+        <w:spacing w:after="0" w:line="312"/>
+        <w:ind w:firstLine="340"/>
+        <w:jc w:val="both"/>
+      </w:pPr>
+      <w:r>
+        <w:rPr>
+          <w:rFonts w:ascii="Georgia" w:cs="Georgia" w:eastAsia="Georgia" w:hAnsi="Georgia"/>
+          <w:sz w:val="21"/>
+          <w:szCs w:val="21"/>
+        </w:rPr>
+        <w:t xml:space="preserve">O pai tinha anotado a placa. Tinha descoberto que o número da Contabilidade não era da contabilidade. Tinha escrito o nome de Otávio com um ponto de interrogação e, sete minutos depois, chamado quem quer que fosse para ir à casa dele na manhã seguinte, às sete e meia, pela garagem.</w:t>
+      </w:r>
+    </w:p>
+    <w:p>
+      <w:pPr>
+        <w:spacing w:after="0" w:line="312"/>
+        <w:ind w:firstLine="340"/>
+        <w:jc w:val="both"/>
+      </w:pPr>
+      <w:r>
+        <w:rPr>
+          <w:rFonts w:ascii="Georgia" w:cs="Georgia" w:eastAsia="Georgia" w:hAnsi="Georgia"/>
+          <w:sz w:val="21"/>
+          <w:szCs w:val="21"/>
+        </w:rPr>
+        <w:t xml:space="preserve">Na manhã seguinte, o pai estava morto. E o portão estava aberto.</w:t>
+      </w:r>
+    </w:p>
+    <w:p>
+      <w:pPr>
+        <w:spacing w:after="0" w:line="312"/>
+        <w:ind w:firstLine="340"/>
+        <w:jc w:val="both"/>
+      </w:pPr>
+      <w:r>
+        <w:rPr>
+          <w:rFonts w:ascii="Georgia" w:cs="Georgia" w:eastAsia="Georgia" w:hAnsi="Georgia"/>
+          <w:sz w:val="21"/>
+          <w:szCs w:val="21"/>
+        </w:rPr>
+        <w:t xml:space="preserve">Lucas pensou em ligar para Lia. Era o combinado: tudo o que um descobrir, o outro fica sabendo. Pegou o celular. Olhou para a tela.</w:t>
+      </w:r>
+    </w:p>
+    <w:p>
+      <w:pPr>
+        <w:spacing w:after="0" w:line="312"/>
+        <w:ind w:firstLine="340"/>
+        <w:jc w:val="both"/>
+      </w:pPr>
+      <w:r>
+        <w:rPr>
+          <w:rFonts w:ascii="Georgia" w:cs="Georgia" w:eastAsia="Georgia" w:hAnsi="Georgia"/>
+          <w:sz w:val="21"/>
+          <w:szCs w:val="21"/>
+        </w:rPr>
+        <w:t xml:space="preserve">Lembrou que a irmã estava escondendo alguma coisa sobre aquela manhã. As sete ligações para o pai, entre as oito e as nove, sobre as quais ela nunca tinha dito uma palavra.</w:t>
+      </w:r>
+    </w:p>
+    <w:p>
+      <w:pPr>
+        <w:spacing w:after="0" w:line="312"/>
+        <w:ind w:firstLine="340"/>
+        <w:jc w:val="both"/>
+      </w:pPr>
+      <w:r>
+        <w:rPr>
+          <w:rFonts w:ascii="Georgia" w:cs="Georgia" w:eastAsia="Georgia" w:hAnsi="Georgia"/>
+          <w:sz w:val="21"/>
+          <w:szCs w:val="21"/>
+        </w:rPr>
+        <w:t xml:space="preserve">Guardou o celular.</w:t>
+      </w:r>
+    </w:p>
+    <w:p>
+      <w:pPr>
+        <w:spacing w:after="0" w:line="312"/>
+        <w:ind w:firstLine="340"/>
+        <w:jc w:val="both"/>
+      </w:pPr>
+      <w:r>
+        <w:rPr>
+          <w:rFonts w:ascii="Georgia" w:cs="Georgia" w:eastAsia="Georgia" w:hAnsi="Georgia"/>
+          <w:sz w:val="21"/>
+          <w:szCs w:val="21"/>
+        </w:rPr>
+        <w:t xml:space="preserve">Ia contar. Claro que ia contar. Mas antes queria ter certeza de que estava falando com a pessoa certa.</w:t>
       </w:r>
     </w:p>
     <w:sectPr>

</xml_diff>

<commit_message>
Livro policial: capítulo 13 (Duas tentativas)
Co-Authored-By: Claude Opus 5.5 <noreply@anthropic.com>
Claude-Session: https://claude.ai/code/session_01BrurxSYygRC3rRhaUYosm1
</commit_message>
<xml_diff>
--- a/docs/livro-policial/TODO_CRIME_TEM_UM_AUTOR.docx
+++ b/docs/livro-policial/TODO_CRIME_TEM_UM_AUTOR.docx
@@ -11938,6 +11938,1052 @@
           <w:szCs w:val="21"/>
         </w:rPr>
         <w:t xml:space="preserve">Ia contar. Claro que ia contar. Mas antes queria ter certeza de que estava falando com a pessoa certa.</w:t>
+      </w:r>
+    </w:p>
+    <w:p>
+      <w:pPr>
+        <w:pageBreakBefore/>
+        <w:spacing w:after="120" w:before="1800"/>
+        <w:jc w:val="center"/>
+      </w:pPr>
+      <w:r>
+        <w:rPr>
+          <w:rFonts w:ascii="Georgia" w:cs="Georgia" w:eastAsia="Georgia" w:hAnsi="Georgia"/>
+          <w:spacing w:val="40"/>
+          <w:sz w:val="20"/>
+          <w:szCs w:val="20"/>
+        </w:rPr>
+        <w:t xml:space="preserve">CAPÍTULO 13</w:t>
+      </w:r>
+    </w:p>
+    <w:p>
+      <w:pPr>
+        <w:spacing w:after="720"/>
+        <w:jc w:val="center"/>
+      </w:pPr>
+      <w:r>
+        <w:rPr>
+          <w:rFonts w:ascii="Georgia" w:cs="Georgia" w:eastAsia="Georgia" w:hAnsi="Georgia"/>
+          <w:b/>
+          <w:bCs/>
+          <w:sz w:val="32"/>
+          <w:szCs w:val="32"/>
+        </w:rPr>
+        <w:t xml:space="preserve">Duas tentativas</w:t>
+      </w:r>
+    </w:p>
+    <w:p>
+      <w:pPr>
+        <w:spacing w:after="0" w:line="312"/>
+        <w:ind w:firstLine="340"/>
+        <w:jc w:val="both"/>
+      </w:pPr>
+      <w:r>
+        <w:rPr>
+          <w:rFonts w:ascii="Georgia" w:cs="Georgia" w:eastAsia="Georgia" w:hAnsi="Georgia"/>
+          <w:sz w:val="21"/>
+          <w:szCs w:val="21"/>
+        </w:rPr>
+        <w:t xml:space="preserve">Lucas apareceu no apartamento de Lia às onze da noite de uma quarta-feira, sem avisar, com o BlackBerry do pai na mão e a cara de quem não dormia havia dois dias.</w:t>
+      </w:r>
+    </w:p>
+    <w:p>
+      <w:pPr>
+        <w:spacing w:after="0" w:line="312"/>
+        <w:ind w:firstLine="340"/>
+        <w:jc w:val="both"/>
+      </w:pPr>
+      <w:r>
+        <w:rPr>
+          <w:rFonts w:ascii="Georgia" w:cs="Georgia" w:eastAsia="Georgia" w:hAnsi="Georgia"/>
+          <w:sz w:val="21"/>
+          <w:szCs w:val="21"/>
+        </w:rPr>
+        <w:t xml:space="preserve">— Combinamos que tudo o que um descobrir, o outro fica sabendo — disse, ainda na porta. — Então eu vim cumprir.</w:t>
+      </w:r>
+    </w:p>
+    <w:p>
+      <w:pPr>
+        <w:spacing w:after="0" w:line="312"/>
+        <w:ind w:firstLine="340"/>
+        <w:jc w:val="both"/>
+      </w:pPr>
+      <w:r>
+        <w:rPr>
+          <w:rFonts w:ascii="Georgia" w:cs="Georgia" w:eastAsia="Georgia" w:hAnsi="Georgia"/>
+          <w:sz w:val="21"/>
+          <w:szCs w:val="21"/>
+        </w:rPr>
+        <w:t xml:space="preserve">Lia o deixou entrar. Ele se sentou no sofá, no mesmo lugar onde o pai tinha se sentado na segunda-feira da véspera, e ela teve de desviar os olhos.</w:t>
+      </w:r>
+    </w:p>
+    <w:p>
+      <w:pPr>
+        <w:spacing w:after="0" w:line="312"/>
+        <w:ind w:firstLine="340"/>
+        <w:jc w:val="both"/>
+      </w:pPr>
+      <w:r>
+        <w:rPr>
+          <w:rFonts w:ascii="Georgia" w:cs="Georgia" w:eastAsia="Georgia" w:hAnsi="Georgia"/>
+          <w:sz w:val="21"/>
+          <w:szCs w:val="21"/>
+        </w:rPr>
+        <w:t xml:space="preserve">Durante quase uma hora, Lucas mostrou tudo. O bilhete amarelo, a placa do carro prata, a conta de e-mail que o pai usava como caderno, os pagamentos aprovados com um ok, a pergunta solitária da véspera: Contabilidade = Otávio? E a última troca de mensagens. Amanhã, sete e meia, aqui em casa. Traga os originais. Confirmado amanhã cedo. Pode deixar o portão aberto.</w:t>
+      </w:r>
+    </w:p>
+    <w:p>
+      <w:pPr>
+        <w:spacing w:after="0" w:line="312"/>
+        <w:ind w:firstLine="340"/>
+        <w:jc w:val="both"/>
+      </w:pPr>
+      <w:r>
+        <w:rPr>
+          <w:rFonts w:ascii="Georgia" w:cs="Georgia" w:eastAsia="Georgia" w:hAnsi="Georgia"/>
+          <w:sz w:val="21"/>
+          <w:szCs w:val="21"/>
+        </w:rPr>
+        <w:t xml:space="preserve">Lia leu tudo duas vezes. Depois devolveu o aparelho.</w:t>
+      </w:r>
+    </w:p>
+    <w:p>
+      <w:pPr>
+        <w:spacing w:after="0" w:line="312"/>
+        <w:ind w:firstLine="340"/>
+        <w:jc w:val="both"/>
+      </w:pPr>
+      <w:r>
+        <w:rPr>
+          <w:rFonts w:ascii="Georgia" w:cs="Georgia" w:eastAsia="Georgia" w:hAnsi="Georgia"/>
+          <w:sz w:val="21"/>
+          <w:szCs w:val="21"/>
+        </w:rPr>
+        <w:t xml:space="preserve">— Por que você demorou tanto para me contar?</w:t>
+      </w:r>
+    </w:p>
+    <w:p>
+      <w:pPr>
+        <w:spacing w:after="0" w:line="312"/>
+        <w:ind w:firstLine="340"/>
+        <w:jc w:val="both"/>
+      </w:pPr>
+      <w:r>
+        <w:rPr>
+          <w:rFonts w:ascii="Georgia" w:cs="Georgia" w:eastAsia="Georgia" w:hAnsi="Georgia"/>
+          <w:sz w:val="21"/>
+          <w:szCs w:val="21"/>
+        </w:rPr>
+        <w:t xml:space="preserve">Lucas demorou para responder.</w:t>
+      </w:r>
+    </w:p>
+    <w:p>
+      <w:pPr>
+        <w:spacing w:after="0" w:line="312"/>
+        <w:ind w:firstLine="340"/>
+        <w:jc w:val="both"/>
+      </w:pPr>
+      <w:r>
+        <w:rPr>
+          <w:rFonts w:ascii="Georgia" w:cs="Georgia" w:eastAsia="Georgia" w:hAnsi="Georgia"/>
+          <w:sz w:val="21"/>
+          <w:szCs w:val="21"/>
+        </w:rPr>
+        <w:t xml:space="preserve">— Eu queria ter certeza.</w:t>
+      </w:r>
+    </w:p>
+    <w:p>
+      <w:pPr>
+        <w:spacing w:after="0" w:line="312"/>
+        <w:ind w:firstLine="340"/>
+        <w:jc w:val="both"/>
+      </w:pPr>
+      <w:r>
+        <w:rPr>
+          <w:rFonts w:ascii="Georgia" w:cs="Georgia" w:eastAsia="Georgia" w:hAnsi="Georgia"/>
+          <w:sz w:val="21"/>
+          <w:szCs w:val="21"/>
+        </w:rPr>
+        <w:t xml:space="preserve">— De quê?</w:t>
+      </w:r>
+    </w:p>
+    <w:p>
+      <w:pPr>
+        <w:spacing w:after="0" w:line="312"/>
+        <w:ind w:firstLine="340"/>
+        <w:jc w:val="both"/>
+      </w:pPr>
+      <w:r>
+        <w:rPr>
+          <w:rFonts w:ascii="Georgia" w:cs="Georgia" w:eastAsia="Georgia" w:hAnsi="Georgia"/>
+          <w:sz w:val="21"/>
+          <w:szCs w:val="21"/>
+        </w:rPr>
+        <w:t xml:space="preserve">— De tudo.</w:t>
+      </w:r>
+    </w:p>
+    <w:p>
+      <w:pPr>
+        <w:spacing w:after="0" w:line="312"/>
+        <w:ind w:firstLine="340"/>
+        <w:jc w:val="both"/>
+      </w:pPr>
+      <w:r>
+        <w:rPr>
+          <w:rFonts w:ascii="Georgia" w:cs="Georgia" w:eastAsia="Georgia" w:hAnsi="Georgia"/>
+          <w:sz w:val="21"/>
+          <w:szCs w:val="21"/>
+        </w:rPr>
+        <w:t xml:space="preserve">Ela sabia que não era tudo. Ele sabia que ela sabia. Mas era quase meia-noite, os dois estavam cansados e havia um homem que talvez tivesse entrado pela garagem da casa do pai na manhã em que ele morreu. Lia escolheu não perguntar. Lucas escolheu não explicar.</w:t>
+      </w:r>
+    </w:p>
+    <w:p>
+      <w:pPr>
+        <w:spacing w:after="0" w:line="312"/>
+        <w:ind w:firstLine="340"/>
+        <w:jc w:val="both"/>
+      </w:pPr>
+      <w:r>
+        <w:rPr>
+          <w:rFonts w:ascii="Georgia" w:cs="Georgia" w:eastAsia="Georgia" w:hAnsi="Georgia"/>
+          <w:sz w:val="21"/>
+          <w:szCs w:val="21"/>
+        </w:rPr>
+        <w:t xml:space="preserve">— A planilha — disse ela. — Os três fornecedores que o pai não conhecia. Deixa comigo.</w:t>
+      </w:r>
+    </w:p>
+    <w:p>
+      <w:pPr>
+        <w:spacing w:after="200" w:before="200"/>
+        <w:jc w:val="center"/>
+      </w:pPr>
+      <w:r>
+        <w:rPr>
+          <w:rFonts w:ascii="Georgia" w:cs="Georgia" w:eastAsia="Georgia" w:hAnsi="Georgia"/>
+          <w:sz w:val="22"/>
+          <w:szCs w:val="22"/>
+        </w:rPr>
+        <w:t xml:space="preserve">*</w:t>
+      </w:r>
+    </w:p>
+    <w:p>
+      <w:pPr>
+        <w:spacing w:after="0" w:line="312"/>
+        <w:ind w:firstLine="340"/>
+        <w:jc w:val="both"/>
+      </w:pPr>
+      <w:r>
+        <w:rPr>
+          <w:rFonts w:ascii="Georgia" w:cs="Georgia" w:eastAsia="Georgia" w:hAnsi="Georgia"/>
+          <w:sz w:val="21"/>
+          <w:szCs w:val="21"/>
+        </w:rPr>
+        <w:t xml:space="preserve">A planilha tinha vinte e três pagamentos, de janeiro a agosto, divididos entre três empresas. Somados, davam um número que fez Lia conferir a conta três vezes na calculadora do celular.</w:t>
+      </w:r>
+    </w:p>
+    <w:p>
+      <w:pPr>
+        <w:spacing w:after="0" w:line="312"/>
+        <w:ind w:firstLine="340"/>
+        <w:jc w:val="both"/>
+      </w:pPr>
+      <w:r>
+        <w:rPr>
+          <w:rFonts w:ascii="Georgia" w:cs="Georgia" w:eastAsia="Georgia" w:hAnsi="Georgia"/>
+          <w:sz w:val="21"/>
+          <w:szCs w:val="21"/>
+        </w:rPr>
+        <w:t xml:space="preserve">Ela passou a manhã de quinta-feira no computador do escritório de arquitetura onde trabalhava, com a porta fechada, fingindo revisar um projeto de reforma em Higienópolis. Procurou as três empresas no site da Junta Comercial. Duas eram exatamente o que pareciam: firmas sem funcionários, abertas no ano anterior, com sócios que tinham nomes comuns demais e endereços que eram salas comerciais vazias em Osasco.</w:t>
+      </w:r>
+    </w:p>
+    <w:p>
+      <w:pPr>
+        <w:spacing w:after="0" w:line="312"/>
+        <w:ind w:firstLine="340"/>
+        <w:jc w:val="both"/>
+      </w:pPr>
+      <w:r>
+        <w:rPr>
+          <w:rFonts w:ascii="Georgia" w:cs="Georgia" w:eastAsia="Georgia" w:hAnsi="Georgia"/>
+          <w:sz w:val="21"/>
+          <w:szCs w:val="21"/>
+        </w:rPr>
+        <w:t xml:space="preserve">A terceira se chamava Cumeeira Engenharia e Participações.</w:t>
+      </w:r>
+    </w:p>
+    <w:p>
+      <w:pPr>
+        <w:spacing w:after="0" w:line="312"/>
+        <w:ind w:firstLine="340"/>
+        <w:jc w:val="both"/>
+      </w:pPr>
+      <w:r>
+        <w:rPr>
+          <w:rFonts w:ascii="Georgia" w:cs="Georgia" w:eastAsia="Georgia" w:hAnsi="Georgia"/>
+          <w:sz w:val="21"/>
+          <w:szCs w:val="21"/>
+        </w:rPr>
+        <w:t xml:space="preserve">Lia sorriu sem querer. Cumeeira era a parte mais alta de um telhado, a linha onde as duas águas se encontram. Uma palavra que só arquiteto e mestre de obras usam. Quem tinha batizado aquela empresa conhecia construção.</w:t>
+      </w:r>
+    </w:p>
+    <w:p>
+      <w:pPr>
+        <w:spacing w:after="0" w:line="312"/>
+        <w:ind w:firstLine="340"/>
+        <w:jc w:val="both"/>
+      </w:pPr>
+      <w:r>
+        <w:rPr>
+          <w:rFonts w:ascii="Georgia" w:cs="Georgia" w:eastAsia="Georgia" w:hAnsi="Georgia"/>
+          <w:sz w:val="21"/>
+          <w:szCs w:val="21"/>
+        </w:rPr>
+        <w:t xml:space="preserve">O endereço era em Barueri. Uma sala no quarto andar de um prédio comercial em Alphaville. Lia anotou o número. Depois abriu de novo o e-mail que Lucas tinha encaminhado para ela de madrugada, com as anotações do pai sobre o carro prata. Valdir checou a placa. Carro em nome de uma empresa de Barueri.</w:t>
+      </w:r>
+    </w:p>
+    <w:p>
+      <w:pPr>
+        <w:spacing w:after="0" w:line="312"/>
+        <w:ind w:firstLine="340"/>
+        <w:jc w:val="both"/>
+      </w:pPr>
+      <w:r>
+        <w:rPr>
+          <w:rFonts w:ascii="Georgia" w:cs="Georgia" w:eastAsia="Georgia" w:hAnsi="Georgia"/>
+          <w:sz w:val="21"/>
+          <w:szCs w:val="21"/>
+        </w:rPr>
+        <w:t xml:space="preserve">Não dizia o endereço.</w:t>
+      </w:r>
+    </w:p>
+    <w:p>
+      <w:pPr>
+        <w:spacing w:after="0" w:line="312"/>
+        <w:ind w:firstLine="340"/>
+        <w:jc w:val="both"/>
+      </w:pPr>
+      <w:r>
+        <w:rPr>
+          <w:rFonts w:ascii="Georgia" w:cs="Georgia" w:eastAsia="Georgia" w:hAnsi="Georgia"/>
+          <w:sz w:val="21"/>
+          <w:szCs w:val="21"/>
+        </w:rPr>
+        <w:t xml:space="preserve">Ela pegou o telefone e ligou para o irmão.</w:t>
+      </w:r>
+    </w:p>
+    <w:p>
+      <w:pPr>
+        <w:spacing w:after="0" w:line="312"/>
+        <w:ind w:firstLine="340"/>
+        <w:jc w:val="both"/>
+      </w:pPr>
+      <w:r>
+        <w:rPr>
+          <w:rFonts w:ascii="Georgia" w:cs="Georgia" w:eastAsia="Georgia" w:hAnsi="Georgia"/>
+          <w:sz w:val="21"/>
+          <w:szCs w:val="21"/>
+        </w:rPr>
+        <w:t xml:space="preserve">— O Valdir, o segurança do pai. Você tem o telefone dele?</w:t>
+      </w:r>
+    </w:p>
+    <w:p>
+      <w:pPr>
+        <w:spacing w:after="200" w:before="200"/>
+        <w:jc w:val="center"/>
+      </w:pPr>
+      <w:r>
+        <w:rPr>
+          <w:rFonts w:ascii="Georgia" w:cs="Georgia" w:eastAsia="Georgia" w:hAnsi="Georgia"/>
+          <w:sz w:val="22"/>
+          <w:szCs w:val="22"/>
+        </w:rPr>
+        <w:t xml:space="preserve">*</w:t>
+      </w:r>
+    </w:p>
+    <w:p>
+      <w:pPr>
+        <w:spacing w:after="0" w:line="312"/>
+        <w:ind w:firstLine="340"/>
+        <w:jc w:val="both"/>
+      </w:pPr>
+      <w:r>
+        <w:rPr>
+          <w:rFonts w:ascii="Georgia" w:cs="Georgia" w:eastAsia="Georgia" w:hAnsi="Georgia"/>
+          <w:sz w:val="21"/>
+          <w:szCs w:val="21"/>
+        </w:rPr>
+        <w:t xml:space="preserve">Valdir atendeu no quarto toque, desconfiado, e só relaxou quando ela disse quem era.</w:t>
+      </w:r>
+    </w:p>
+    <w:p>
+      <w:pPr>
+        <w:spacing w:after="0" w:line="312"/>
+        <w:ind w:firstLine="340"/>
+        <w:jc w:val="both"/>
+      </w:pPr>
+      <w:r>
+        <w:rPr>
+          <w:rFonts w:ascii="Georgia" w:cs="Georgia" w:eastAsia="Georgia" w:hAnsi="Georgia"/>
+          <w:sz w:val="21"/>
+          <w:szCs w:val="21"/>
+        </w:rPr>
+        <w:t xml:space="preserve">— A filha do doutor Henrique. Meus pêsames, dona Lia. Ele era um homem difícil, mas era um homem direito comigo.</w:t>
+      </w:r>
+    </w:p>
+    <w:p>
+      <w:pPr>
+        <w:spacing w:after="0" w:line="312"/>
+        <w:ind w:firstLine="340"/>
+        <w:jc w:val="both"/>
+      </w:pPr>
+      <w:r>
+        <w:rPr>
+          <w:rFonts w:ascii="Georgia" w:cs="Georgia" w:eastAsia="Georgia" w:hAnsi="Georgia"/>
+          <w:sz w:val="21"/>
+          <w:szCs w:val="21"/>
+        </w:rPr>
+        <w:t xml:space="preserve">— Obrigada, Valdir. Eu preciso de uma coisa. Em julho, o meu pai pediu para o senhor verificar a placa de um carro prata.</w:t>
+      </w:r>
+    </w:p>
+    <w:p>
+      <w:pPr>
+        <w:spacing w:after="0" w:line="312"/>
+        <w:ind w:firstLine="340"/>
+        <w:jc w:val="both"/>
+      </w:pPr>
+      <w:r>
+        <w:rPr>
+          <w:rFonts w:ascii="Georgia" w:cs="Georgia" w:eastAsia="Georgia" w:hAnsi="Georgia"/>
+          <w:sz w:val="21"/>
+          <w:szCs w:val="21"/>
+        </w:rPr>
+        <w:t xml:space="preserve">Silêncio do outro lado.</w:t>
+      </w:r>
+    </w:p>
+    <w:p>
+      <w:pPr>
+        <w:spacing w:after="0" w:line="312"/>
+        <w:ind w:firstLine="340"/>
+        <w:jc w:val="both"/>
+      </w:pPr>
+      <w:r>
+        <w:rPr>
+          <w:rFonts w:ascii="Georgia" w:cs="Georgia" w:eastAsia="Georgia" w:hAnsi="Georgia"/>
+          <w:sz w:val="21"/>
+          <w:szCs w:val="21"/>
+        </w:rPr>
+        <w:t xml:space="preserve">— Pedi pra ele largar isso, dona Lia. Falei: doutor, quem anda num carro registrado em empresa de fachada não é gente que a gente cutuca.</w:t>
+      </w:r>
+    </w:p>
+    <w:p>
+      <w:pPr>
+        <w:spacing w:after="0" w:line="312"/>
+        <w:ind w:firstLine="340"/>
+        <w:jc w:val="both"/>
+      </w:pPr>
+      <w:r>
+        <w:rPr>
+          <w:rFonts w:ascii="Georgia" w:cs="Georgia" w:eastAsia="Georgia" w:hAnsi="Georgia"/>
+          <w:sz w:val="21"/>
+          <w:szCs w:val="21"/>
+        </w:rPr>
+        <w:t xml:space="preserve">— Qual era a empresa?</w:t>
+      </w:r>
+    </w:p>
+    <w:p>
+      <w:pPr>
+        <w:spacing w:after="0" w:line="312"/>
+        <w:ind w:firstLine="340"/>
+        <w:jc w:val="both"/>
+      </w:pPr>
+      <w:r>
+        <w:rPr>
+          <w:rFonts w:ascii="Georgia" w:cs="Georgia" w:eastAsia="Georgia" w:hAnsi="Georgia"/>
+          <w:sz w:val="21"/>
+          <w:szCs w:val="21"/>
+        </w:rPr>
+        <w:t xml:space="preserve">Ele hesitou.</w:t>
+      </w:r>
+    </w:p>
+    <w:p>
+      <w:pPr>
+        <w:spacing w:after="0" w:line="312"/>
+        <w:ind w:firstLine="340"/>
+        <w:jc w:val="both"/>
+      </w:pPr>
+      <w:r>
+        <w:rPr>
+          <w:rFonts w:ascii="Georgia" w:cs="Georgia" w:eastAsia="Georgia" w:hAnsi="Georgia"/>
+          <w:sz w:val="21"/>
+          <w:szCs w:val="21"/>
+        </w:rPr>
+        <w:t xml:space="preserve">— Não lembro o nome. Lembro o endereço, porque achei engraçado. Alphaville, perto do shopping. Um prédio desses espelhados. Quarto andar.</w:t>
+      </w:r>
+    </w:p>
+    <w:p>
+      <w:pPr>
+        <w:spacing w:after="0" w:line="312"/>
+        <w:ind w:firstLine="340"/>
+        <w:jc w:val="both"/>
+      </w:pPr>
+      <w:r>
+        <w:rPr>
+          <w:rFonts w:ascii="Georgia" w:cs="Georgia" w:eastAsia="Georgia" w:hAnsi="Georgia"/>
+          <w:sz w:val="21"/>
+          <w:szCs w:val="21"/>
+        </w:rPr>
+        <w:t xml:space="preserve">Lia olhou para o papel onde tinha anotado o endereço da Cumeeira. Leu em voz alta.</w:t>
+      </w:r>
+    </w:p>
+    <w:p>
+      <w:pPr>
+        <w:spacing w:after="0" w:line="312"/>
+        <w:ind w:firstLine="340"/>
+        <w:jc w:val="both"/>
+      </w:pPr>
+      <w:r>
+        <w:rPr>
+          <w:rFonts w:ascii="Georgia" w:cs="Georgia" w:eastAsia="Georgia" w:hAnsi="Georgia"/>
+          <w:sz w:val="21"/>
+          <w:szCs w:val="21"/>
+        </w:rPr>
+        <w:t xml:space="preserve">Valdir ficou calado por tanto tempo que ela achou que ele tinha desligado.</w:t>
+      </w:r>
+    </w:p>
+    <w:p>
+      <w:pPr>
+        <w:spacing w:after="0" w:line="312"/>
+        <w:ind w:firstLine="340"/>
+        <w:jc w:val="both"/>
+      </w:pPr>
+      <w:r>
+        <w:rPr>
+          <w:rFonts w:ascii="Georgia" w:cs="Georgia" w:eastAsia="Georgia" w:hAnsi="Georgia"/>
+          <w:sz w:val="21"/>
+          <w:szCs w:val="21"/>
+        </w:rPr>
+        <w:t xml:space="preserve">— Esse mesmo — disse ele, enfim. — Dona Lia, pelo amor de Deus, tome cuidado.</w:t>
+      </w:r>
+    </w:p>
+    <w:p>
+      <w:pPr>
+        <w:spacing w:after="200" w:before="200"/>
+        <w:jc w:val="center"/>
+      </w:pPr>
+      <w:r>
+        <w:rPr>
+          <w:rFonts w:ascii="Georgia" w:cs="Georgia" w:eastAsia="Georgia" w:hAnsi="Georgia"/>
+          <w:sz w:val="22"/>
+          <w:szCs w:val="22"/>
+        </w:rPr>
+        <w:t xml:space="preserve">*</w:t>
+      </w:r>
+    </w:p>
+    <w:p>
+      <w:pPr>
+        <w:spacing w:after="0" w:line="312"/>
+        <w:ind w:firstLine="340"/>
+        <w:jc w:val="both"/>
+      </w:pPr>
+      <w:r>
+        <w:rPr>
+          <w:rFonts w:ascii="Georgia" w:cs="Georgia" w:eastAsia="Georgia" w:hAnsi="Georgia"/>
+          <w:sz w:val="21"/>
+          <w:szCs w:val="21"/>
+        </w:rPr>
+        <w:t xml:space="preserve">À tarde, Lia procurou a Cumeeira em outro lugar: nos arquivos de licitações e projetos que todo escritório de arquitetura de São Paulo consulta. Encontrou o nome dela em três documentos. Todos ligados ao mesmo empreendimento.</w:t>
+      </w:r>
+    </w:p>
+    <w:p>
+      <w:pPr>
+        <w:spacing w:after="0" w:line="312"/>
+        <w:ind w:firstLine="340"/>
+        <w:jc w:val="both"/>
+      </w:pPr>
+      <w:r>
+        <w:rPr>
+          <w:rFonts w:ascii="Georgia" w:cs="Georgia" w:eastAsia="Georgia" w:hAnsi="Georgia"/>
+          <w:sz w:val="21"/>
+          <w:szCs w:val="21"/>
+        </w:rPr>
+        <w:t xml:space="preserve">Um loteamento gigante em Cajamar. Casas, prédios, um shopping, um centro empresarial. O maior projeto imobiliário da região em vinte anos. A Cumeeira aparecia como consultora de engenharia, contratada para os estudos de viabilidade. E, num dos documentos, uma ata de audiência pública do ano anterior, ela achou a assinatura de quem tinha defendido o projeto na Assembleia, com mais entusiasmo do que qualquer outro deputado.</w:t>
+      </w:r>
+    </w:p>
+    <w:p>
+      <w:pPr>
+        <w:spacing w:after="0" w:line="312"/>
+        <w:ind w:firstLine="340"/>
+        <w:jc w:val="both"/>
+      </w:pPr>
+      <w:r>
+        <w:rPr>
+          <w:rFonts w:ascii="Georgia" w:cs="Georgia" w:eastAsia="Georgia" w:hAnsi="Georgia"/>
+          <w:sz w:val="21"/>
+          <w:szCs w:val="21"/>
+        </w:rPr>
+        <w:t xml:space="preserve">Rubens Falcão.</w:t>
+      </w:r>
+    </w:p>
+    <w:p>
+      <w:pPr>
+        <w:spacing w:after="0" w:line="312"/>
+        <w:ind w:firstLine="340"/>
+        <w:jc w:val="both"/>
+      </w:pPr>
+      <w:r>
+        <w:rPr>
+          <w:rFonts w:ascii="Georgia" w:cs="Georgia" w:eastAsia="Georgia" w:hAnsi="Georgia"/>
+          <w:sz w:val="21"/>
+          <w:szCs w:val="21"/>
+        </w:rPr>
+        <w:t xml:space="preserve">Lia afastou a cadeira da mesa.</w:t>
+      </w:r>
+    </w:p>
+    <w:p>
+      <w:pPr>
+        <w:spacing w:after="0" w:line="312"/>
+        <w:ind w:firstLine="340"/>
+        <w:jc w:val="both"/>
+      </w:pPr>
+      <w:r>
+        <w:rPr>
+          <w:rFonts w:ascii="Georgia" w:cs="Georgia" w:eastAsia="Georgia" w:hAnsi="Georgia"/>
+          <w:sz w:val="21"/>
+          <w:szCs w:val="21"/>
+        </w:rPr>
+        <w:t xml:space="preserve">Cajamar. A mesma região da estrada onde o carro de Nestor tinha perdido o freio. O pai estava fechando um negócio de seguros para aquele loteamento na semana em que Renato e Nestor morreram. A Cumeeira recebia dinheiro da corretora por mensagens falsas aprovadas com um ok. O carro prata que seguia o pai estava registrado no mesmo endereço da Cumeeira. E o deputado que defendia o loteamento era o mesmo que tinha chamado o pai de imorrível na televisão.</w:t>
+      </w:r>
+    </w:p>
+    <w:p>
+      <w:pPr>
+        <w:spacing w:after="0" w:line="312"/>
+        <w:ind w:firstLine="340"/>
+        <w:jc w:val="both"/>
+      </w:pPr>
+      <w:r>
+        <w:rPr>
+          <w:rFonts w:ascii="Georgia" w:cs="Georgia" w:eastAsia="Georgia" w:hAnsi="Georgia"/>
+          <w:sz w:val="21"/>
+          <w:szCs w:val="21"/>
+        </w:rPr>
+        <w:t xml:space="preserve">Tudo se tocava. Nada provava nada.</w:t>
+      </w:r>
+    </w:p>
+    <w:p>
+      <w:pPr>
+        <w:spacing w:after="200" w:before="200"/>
+        <w:jc w:val="center"/>
+      </w:pPr>
+      <w:r>
+        <w:rPr>
+          <w:rFonts w:ascii="Georgia" w:cs="Georgia" w:eastAsia="Georgia" w:hAnsi="Georgia"/>
+          <w:sz w:val="22"/>
+          <w:szCs w:val="22"/>
+        </w:rPr>
+        <w:t xml:space="preserve">*</w:t>
+      </w:r>
+    </w:p>
+    <w:p>
+      <w:pPr>
+        <w:spacing w:after="0" w:line="312"/>
+        <w:ind w:firstLine="340"/>
+        <w:jc w:val="both"/>
+      </w:pPr>
+      <w:r>
+        <w:rPr>
+          <w:rFonts w:ascii="Georgia" w:cs="Georgia" w:eastAsia="Georgia" w:hAnsi="Georgia"/>
+          <w:sz w:val="21"/>
+          <w:szCs w:val="21"/>
+        </w:rPr>
+        <w:t xml:space="preserve">Ela achou a entrevista no YouTube em menos de um minuto. Alguém tinha subido o trecho com o título Deputado chama empresário de imorrível, e o vídeo tinha mais de duzentas mil visualizações.</w:t>
+      </w:r>
+    </w:p>
+    <w:p>
+      <w:pPr>
+        <w:spacing w:after="0" w:line="312"/>
+        <w:ind w:firstLine="340"/>
+        <w:jc w:val="both"/>
+      </w:pPr>
+      <w:r>
+        <w:rPr>
+          <w:rFonts w:ascii="Georgia" w:cs="Georgia" w:eastAsia="Georgia" w:hAnsi="Georgia"/>
+          <w:sz w:val="21"/>
+          <w:szCs w:val="21"/>
+        </w:rPr>
+        <w:t xml:space="preserve">Lia assistiu uma vez inteira. Falcão de terno azul e gravata vermelha, os três microfones, a calma ensaiada.</w:t>
+      </w:r>
+    </w:p>
+    <w:p>
+      <w:pPr>
+        <w:spacing w:after="0" w:line="312"/>
+        <w:ind w:firstLine="340"/>
+        <w:jc w:val="both"/>
+      </w:pPr>
+      <w:r>
+        <w:rPr>
+          <w:rFonts w:ascii="Georgia" w:cs="Georgia" w:eastAsia="Georgia" w:hAnsi="Georgia"/>
+          <w:sz w:val="21"/>
+          <w:szCs w:val="21"/>
+        </w:rPr>
+        <w:t xml:space="preserve">Em três meses, duas pessoas morrem ao lado do mesmo empresário. Um funcionário humilde, num motel, e agora um pai de família, na porta de um restaurante. Ninguém escapa de duas tentativas de homicídio seguidas enquanto os outros morrem no lugar dele. Não existe sorte assim. Ou o senhor Henrique Salvallus sabia de tudo, ou ele é imorrível!</w:t>
+      </w:r>
+    </w:p>
+    <w:p>
+      <w:pPr>
+        <w:spacing w:after="0" w:line="312"/>
+        <w:ind w:firstLine="340"/>
+        <w:jc w:val="both"/>
+      </w:pPr>
+      <w:r>
+        <w:rPr>
+          <w:rFonts w:ascii="Georgia" w:cs="Georgia" w:eastAsia="Georgia" w:hAnsi="Georgia"/>
+          <w:sz w:val="21"/>
+          <w:szCs w:val="21"/>
+        </w:rPr>
+        <w:t xml:space="preserve">Assistiu de novo. E de novo. Na quarta vez, parou o vídeo e ficou olhando para o rosto congelado do deputado, com a boca meio aberta na palavra imorrível.</w:t>
+      </w:r>
+    </w:p>
+    <w:p>
+      <w:pPr>
+        <w:spacing w:after="0" w:line="312"/>
+        <w:ind w:firstLine="340"/>
+        <w:jc w:val="both"/>
+      </w:pPr>
+      <w:r>
+        <w:rPr>
+          <w:rFonts w:ascii="Georgia" w:cs="Georgia" w:eastAsia="Georgia" w:hAnsi="Georgia"/>
+          <w:sz w:val="21"/>
+          <w:szCs w:val="21"/>
+        </w:rPr>
+        <w:t xml:space="preserve">Não era a palavra que a incomodava.</w:t>
+      </w:r>
+    </w:p>
+    <w:p>
+      <w:pPr>
+        <w:spacing w:after="0" w:line="312"/>
+        <w:ind w:firstLine="340"/>
+        <w:jc w:val="both"/>
+      </w:pPr>
+      <w:r>
+        <w:rPr>
+          <w:rFonts w:ascii="Georgia" w:cs="Georgia" w:eastAsia="Georgia" w:hAnsi="Georgia"/>
+          <w:sz w:val="21"/>
+          <w:szCs w:val="21"/>
+        </w:rPr>
+        <w:t xml:space="preserve">Eram duas outras coisas, e ela levou a quarta vez inteira para entender quais.</w:t>
+      </w:r>
+    </w:p>
+    <w:p>
+      <w:pPr>
+        <w:spacing w:after="0" w:line="312"/>
+        <w:ind w:firstLine="340"/>
+        <w:jc w:val="both"/>
+      </w:pPr>
+      <w:r>
+        <w:rPr>
+          <w:rFonts w:ascii="Georgia" w:cs="Georgia" w:eastAsia="Georgia" w:hAnsi="Georgia"/>
+          <w:sz w:val="21"/>
+          <w:szCs w:val="21"/>
+        </w:rPr>
+        <w:t xml:space="preserve">A primeira: um funcionário humilde, num motel. A delegada tinha dito que o pai era suspeito da morte de seu Joaquim. Mas Lia nunca tinha lido aquilo em jornal nenhum. Quando o caso do restaurante explodiu, as matérias falavam de briga, de soco, de bala. Ninguém falava de motel.</w:t>
+      </w:r>
+    </w:p>
+    <w:p>
+      <w:pPr>
+        <w:spacing w:after="0" w:line="312"/>
+        <w:ind w:firstLine="340"/>
+        <w:jc w:val="both"/>
+      </w:pPr>
+      <w:r>
+        <w:rPr>
+          <w:rFonts w:ascii="Georgia" w:cs="Georgia" w:eastAsia="Georgia" w:hAnsi="Georgia"/>
+          <w:sz w:val="21"/>
+          <w:szCs w:val="21"/>
+        </w:rPr>
+        <w:t xml:space="preserve">A segunda era pior. Tentativas de homicídio. Em maio, quando Falcão deu aquela entrevista, a cidade inteira achava que o pai era o assassino. O homem do soco. O empresário perigoso. Ninguém falava em tentativas contra ele. Ninguém, a não ser quem soubesse que o alvo era ele.</w:t>
+      </w:r>
+    </w:p>
+    <w:p>
+      <w:pPr>
+        <w:spacing w:after="200" w:before="200"/>
+        <w:jc w:val="center"/>
+      </w:pPr>
+      <w:r>
+        <w:rPr>
+          <w:rFonts w:ascii="Georgia" w:cs="Georgia" w:eastAsia="Georgia" w:hAnsi="Georgia"/>
+          <w:sz w:val="22"/>
+          <w:szCs w:val="22"/>
+        </w:rPr>
+        <w:t xml:space="preserve">*</w:t>
+      </w:r>
+    </w:p>
+    <w:p>
+      <w:pPr>
+        <w:spacing w:after="0" w:line="312"/>
+        <w:ind w:firstLine="340"/>
+        <w:jc w:val="both"/>
+      </w:pPr>
+      <w:r>
+        <w:rPr>
+          <w:rFonts w:ascii="Georgia" w:cs="Georgia" w:eastAsia="Georgia" w:hAnsi="Georgia"/>
+          <w:sz w:val="21"/>
+          <w:szCs w:val="21"/>
+        </w:rPr>
+        <w:t xml:space="preserve">Ligou para a delegada às seis da tarde, do carro, no estacionamento do escritório.</w:t>
+      </w:r>
+    </w:p>
+    <w:p>
+      <w:pPr>
+        <w:spacing w:after="0" w:line="312"/>
+        <w:ind w:firstLine="340"/>
+        <w:jc w:val="both"/>
+      </w:pPr>
+      <w:r>
+        <w:rPr>
+          <w:rFonts w:ascii="Georgia" w:cs="Georgia" w:eastAsia="Georgia" w:hAnsi="Georgia"/>
+          <w:sz w:val="21"/>
+          <w:szCs w:val="21"/>
+        </w:rPr>
+        <w:t xml:space="preserve">— Doutora Regina, é a Lia Salvallus. Uma pergunta só. A ligação do meu pai com a morte do motel saiu na imprensa alguma vez?</w:t>
+      </w:r>
+    </w:p>
+    <w:p>
+      <w:pPr>
+        <w:spacing w:after="0" w:line="312"/>
+        <w:ind w:firstLine="340"/>
+        <w:jc w:val="both"/>
+      </w:pPr>
+      <w:r>
+        <w:rPr>
+          <w:rFonts w:ascii="Georgia" w:cs="Georgia" w:eastAsia="Georgia" w:hAnsi="Georgia"/>
+          <w:sz w:val="21"/>
+          <w:szCs w:val="21"/>
+        </w:rPr>
+        <w:t xml:space="preserve">Regina demorou a responder.</w:t>
+      </w:r>
+    </w:p>
+    <w:p>
+      <w:pPr>
+        <w:spacing w:after="0" w:line="312"/>
+        <w:ind w:firstLine="340"/>
+        <w:jc w:val="both"/>
+      </w:pPr>
+      <w:r>
+        <w:rPr>
+          <w:rFonts w:ascii="Georgia" w:cs="Georgia" w:eastAsia="Georgia" w:hAnsi="Georgia"/>
+          <w:sz w:val="21"/>
+          <w:szCs w:val="21"/>
+        </w:rPr>
+        <w:t xml:space="preserve">— Não. Nunca. Esse caso corre em sigilo desde o primeiro dia. Por quê?</w:t>
+      </w:r>
+    </w:p>
+    <w:p>
+      <w:pPr>
+        <w:spacing w:after="0" w:line="312"/>
+        <w:ind w:firstLine="340"/>
+        <w:jc w:val="both"/>
+      </w:pPr>
+      <w:r>
+        <w:rPr>
+          <w:rFonts w:ascii="Georgia" w:cs="Georgia" w:eastAsia="Georgia" w:hAnsi="Georgia"/>
+          <w:sz w:val="21"/>
+          <w:szCs w:val="21"/>
+        </w:rPr>
+        <w:t xml:space="preserve">Lia contou da entrevista. Do funcionário humilde, num motel. Das duas tentativas de homicídio. Do mês de maio.</w:t>
+      </w:r>
+    </w:p>
+    <w:p>
+      <w:pPr>
+        <w:spacing w:after="0" w:line="312"/>
+        <w:ind w:firstLine="340"/>
+        <w:jc w:val="both"/>
+      </w:pPr>
+      <w:r>
+        <w:rPr>
+          <w:rFonts w:ascii="Georgia" w:cs="Georgia" w:eastAsia="Georgia" w:hAnsi="Georgia"/>
+          <w:sz w:val="21"/>
+          <w:szCs w:val="21"/>
+        </w:rPr>
+        <w:t xml:space="preserve">Do outro lado da linha, a delegada ficou em silêncio. Lia ouviu o barulho de uma caneta batendo devagar numa mesa.</w:t>
+      </w:r>
+    </w:p>
+    <w:p>
+      <w:pPr>
+        <w:spacing w:after="0" w:line="312"/>
+        <w:ind w:firstLine="340"/>
+        <w:jc w:val="both"/>
+      </w:pPr>
+      <w:r>
+        <w:rPr>
+          <w:rFonts w:ascii="Georgia" w:cs="Georgia" w:eastAsia="Georgia" w:hAnsi="Georgia"/>
+          <w:sz w:val="21"/>
+          <w:szCs w:val="21"/>
+        </w:rPr>
+        <w:t xml:space="preserve">— Um deputado tem muitos amigos, senhora Salvallus — disse Regina, enfim. — Inclusive em delegacias. Alguém pode ter comentado com ele num jantar. Isso, sozinho, não prova nada.</w:t>
+      </w:r>
+    </w:p>
+    <w:p>
+      <w:pPr>
+        <w:spacing w:after="0" w:line="312"/>
+        <w:ind w:firstLine="340"/>
+        <w:jc w:val="both"/>
+      </w:pPr>
+      <w:r>
+        <w:rPr>
+          <w:rFonts w:ascii="Georgia" w:cs="Georgia" w:eastAsia="Georgia" w:hAnsi="Georgia"/>
+          <w:sz w:val="21"/>
+          <w:szCs w:val="21"/>
+        </w:rPr>
+        <w:t xml:space="preserve">— Eu sei.</w:t>
+      </w:r>
+    </w:p>
+    <w:p>
+      <w:pPr>
+        <w:spacing w:after="0" w:line="312"/>
+        <w:ind w:firstLine="340"/>
+        <w:jc w:val="both"/>
+      </w:pPr>
+      <w:r>
+        <w:rPr>
+          <w:rFonts w:ascii="Georgia" w:cs="Georgia" w:eastAsia="Georgia" w:hAnsi="Georgia"/>
+          <w:sz w:val="21"/>
+          <w:szCs w:val="21"/>
+        </w:rPr>
+        <w:t xml:space="preserve">— Ótimo. — Outra pausa. — Mas é interessante.</w:t>
+      </w:r>
+    </w:p>
+    <w:p>
+      <w:pPr>
+        <w:spacing w:after="0" w:line="312"/>
+        <w:ind w:firstLine="340"/>
+        <w:jc w:val="both"/>
+      </w:pPr>
+      <w:r>
+        <w:rPr>
+          <w:rFonts w:ascii="Georgia" w:cs="Georgia" w:eastAsia="Georgia" w:hAnsi="Georgia"/>
+          <w:sz w:val="21"/>
+          <w:szCs w:val="21"/>
+        </w:rPr>
+        <w:t xml:space="preserve">Desligou.</w:t>
+      </w:r>
+    </w:p>
+    <w:p>
+      <w:pPr>
+        <w:spacing w:after="200" w:before="200"/>
+        <w:jc w:val="center"/>
+      </w:pPr>
+      <w:r>
+        <w:rPr>
+          <w:rFonts w:ascii="Georgia" w:cs="Georgia" w:eastAsia="Georgia" w:hAnsi="Georgia"/>
+          <w:sz w:val="22"/>
+          <w:szCs w:val="22"/>
+        </w:rPr>
+        <w:t xml:space="preserve">*</w:t>
+      </w:r>
+    </w:p>
+    <w:p>
+      <w:pPr>
+        <w:spacing w:after="0" w:line="312"/>
+        <w:ind w:firstLine="340"/>
+        <w:jc w:val="both"/>
+      </w:pPr>
+      <w:r>
+        <w:rPr>
+          <w:rFonts w:ascii="Georgia" w:cs="Georgia" w:eastAsia="Georgia" w:hAnsi="Georgia"/>
+          <w:sz w:val="21"/>
+          <w:szCs w:val="21"/>
+        </w:rPr>
+        <w:t xml:space="preserve">Lia ficou no carro com o motor desligado e o celular no colo. Pensou em ligar para Lucas. Era o combinado.</w:t>
+      </w:r>
+    </w:p>
+    <w:p>
+      <w:pPr>
+        <w:spacing w:after="0" w:line="312"/>
+        <w:ind w:firstLine="340"/>
+        <w:jc w:val="both"/>
+      </w:pPr>
+      <w:r>
+        <w:rPr>
+          <w:rFonts w:ascii="Georgia" w:cs="Georgia" w:eastAsia="Georgia" w:hAnsi="Georgia"/>
+          <w:sz w:val="21"/>
+          <w:szCs w:val="21"/>
+        </w:rPr>
+        <w:t xml:space="preserve">Ligou. Caixa postal. Ligou de novo. Caixa postal.</w:t>
+      </w:r>
+    </w:p>
+    <w:p>
+      <w:pPr>
+        <w:spacing w:after="0" w:line="312"/>
+        <w:ind w:firstLine="340"/>
+        <w:jc w:val="both"/>
+      </w:pPr>
+      <w:r>
+        <w:rPr>
+          <w:rFonts w:ascii="Georgia" w:cs="Georgia" w:eastAsia="Georgia" w:hAnsi="Georgia"/>
+          <w:sz w:val="21"/>
+          <w:szCs w:val="21"/>
+        </w:rPr>
+        <w:t xml:space="preserve">Mandou uma mensagem: Preciso te contar uma coisa sobre o Falcão. Me liga.</w:t>
+      </w:r>
+    </w:p>
+    <w:p>
+      <w:pPr>
+        <w:spacing w:after="0" w:line="312"/>
+        <w:ind w:firstLine="340"/>
+        <w:jc w:val="both"/>
+      </w:pPr>
+      <w:r>
+        <w:rPr>
+          <w:rFonts w:ascii="Georgia" w:cs="Georgia" w:eastAsia="Georgia" w:hAnsi="Georgia"/>
+          <w:sz w:val="21"/>
+          <w:szCs w:val="21"/>
+        </w:rPr>
+        <w:t xml:space="preserve">Ficou esperando a resposta, olhando para o portão do estacionamento, para os carros que saíam um a um no fim do expediente. Um carro azul. Um preto. Uma moto. Outro preto.</w:t>
+      </w:r>
+    </w:p>
+    <w:p>
+      <w:pPr>
+        <w:spacing w:after="0" w:line="312"/>
+        <w:ind w:firstLine="340"/>
+        <w:jc w:val="both"/>
+      </w:pPr>
+      <w:r>
+        <w:rPr>
+          <w:rFonts w:ascii="Georgia" w:cs="Georgia" w:eastAsia="Georgia" w:hAnsi="Georgia"/>
+          <w:sz w:val="21"/>
+          <w:szCs w:val="21"/>
+        </w:rPr>
+        <w:t xml:space="preserve">E, parado do outro lado da rua, com o motor ligado e um homem de boné ao volante lendo jornal, um sedã prata.</w:t>
+      </w:r>
+    </w:p>
+    <w:p>
+      <w:pPr>
+        <w:spacing w:after="0" w:line="312"/>
+        <w:ind w:firstLine="340"/>
+        <w:jc w:val="both"/>
+      </w:pPr>
+      <w:r>
+        <w:rPr>
+          <w:rFonts w:ascii="Georgia" w:cs="Georgia" w:eastAsia="Georgia" w:hAnsi="Georgia"/>
+          <w:sz w:val="21"/>
+          <w:szCs w:val="21"/>
+        </w:rPr>
+        <w:t xml:space="preserve">Lia não conseguiu ler a placa daquela distância. Não precisava. Ligou o carro, saiu do estacionamento sem olhar para o lado e só percebeu que estava segurando a respiração quando chegou ao primeiro semáforo.</w:t>
+      </w:r>
+    </w:p>
+    <w:p>
+      <w:pPr>
+        <w:spacing w:after="0" w:line="312"/>
+        <w:ind w:firstLine="340"/>
+        <w:jc w:val="both"/>
+      </w:pPr>
+      <w:r>
+        <w:rPr>
+          <w:rFonts w:ascii="Georgia" w:cs="Georgia" w:eastAsia="Georgia" w:hAnsi="Georgia"/>
+          <w:sz w:val="21"/>
+          <w:szCs w:val="21"/>
+        </w:rPr>
+        <w:t xml:space="preserve">No retrovisor, o sedã prata saiu da vaga e entrou no trânsito, três carros atrás dela.</w:t>
       </w:r>
     </w:p>
     <w:sectPr>

</xml_diff>

<commit_message>
Livro policial: chamadas para o celular virtual e a foto de Helena (cap. 13)
Co-Authored-By: Claude Opus 5.5 <noreply@anthropic.com>
Claude-Session: https://claude.ai/code/session_01BrurxSYygRC3rRhaUYosm1
</commit_message>
<xml_diff>
--- a/docs/livro-policial/TODO_CRIME_TEM_UM_AUTOR.docx
+++ b/docs/livro-policial/TODO_CRIME_TEM_UM_AUTOR.docx
@@ -1187,6 +1187,55 @@
     </w:p>
     <w:p>
       <w:pPr>
+        <w:pBdr>
+          <w:top w:val="single" w:color="555555" w:sz="6" w:space="6"/>
+          <w:bottom w:val="single" w:color="555555" w:sz="6" w:space="6"/>
+          <w:left w:val="single" w:color="555555" w:sz="6" w:space="6"/>
+          <w:right w:val="single" w:color="555555" w:sz="6" w:space="6"/>
+        </w:pBdr>
+        <w:shd w:fill="EFEFEF" w:color="auto" w:val="clear"/>
+        <w:spacing w:after="0" w:before="240"/>
+        <w:ind w:left="227" w:right="227"/>
+        <w:jc w:val="center"/>
+      </w:pPr>
+      <w:r>
+        <w:rPr>
+          <w:rFonts w:ascii="Georgia" w:cs="Georgia" w:eastAsia="Georgia" w:hAnsi="Georgia"/>
+          <w:b/>
+          <w:bCs/>
+          <w:spacing w:val="30"/>
+          <w:sz w:val="17"/>
+          <w:szCs w:val="17"/>
+        </w:rPr>
+        <w:t xml:space="preserve">NO CELULAR DE HENRIQUE</w:t>
+      </w:r>
+    </w:p>
+    <w:p>
+      <w:pPr>
+        <w:pBdr>
+          <w:top w:val="single" w:color="555555" w:sz="6" w:space="6"/>
+          <w:bottom w:val="single" w:color="555555" w:sz="6" w:space="6"/>
+          <w:left w:val="single" w:color="555555" w:sz="6" w:space="6"/>
+          <w:right w:val="single" w:color="555555" w:sz="6" w:space="6"/>
+        </w:pBdr>
+        <w:shd w:fill="EFEFEF" w:color="auto" w:val="clear"/>
+        <w:spacing w:after="240" w:before="0" w:line="288"/>
+        <w:ind w:left="227" w:right="227"/>
+        <w:jc w:val="center"/>
+      </w:pPr>
+      <w:r>
+        <w:rPr>
+          <w:rFonts w:ascii="Georgia" w:cs="Georgia" w:eastAsia="Georgia" w:hAnsi="Georgia"/>
+          <w:i/>
+          <w:iCs/>
+          <w:sz w:val="19"/>
+          <w:szCs w:val="19"/>
+        </w:rPr>
+        <w:t xml:space="preserve">Agora é a sua vez. Abra o celular de Henrique na página do livro, no site da Irmandade Conhecimento com Luz, e digite 4821 somado ao seu código pessoal. As mensagens que Lucas vai ler estão lá, esperando por você.</w:t>
+      </w:r>
+    </w:p>
+    <w:p>
+      <w:pPr>
         <w:spacing w:after="200" w:before="200"/>
         <w:jc w:val="center"/>
       </w:pPr>
@@ -2603,7 +2652,56 @@
           <w:sz w:val="21"/>
           <w:szCs w:val="21"/>
         </w:rPr>
-        <w:t xml:space="preserve">Henrique pegou o BlackBerry na mesa de cabeceira. Tinha uma mensagem de Bianca, enviada às duas e quarenta da madrugada: Cheguei. Dorme bem. E mais nada. Nenhuma mensagem depois disso. Ele escreveu, apagou, escreveu de novo. Viu o jornal? Apagou. Não mandou nada.</w:t>
+        <w:t xml:space="preserve">Henrique pegou o BlackBerry na mesa de cabeceira. Tinha uma mensagem de Bianca, enviada às duas e quarenta da madrugada: Cheguei. Dorme bem. E mais nada. Nenhuma mensagem depois disso.</w:t>
+      </w:r>
+    </w:p>
+    <w:p>
+      <w:pPr>
+        <w:pBdr>
+          <w:top w:val="single" w:color="555555" w:sz="6" w:space="6"/>
+          <w:bottom w:val="single" w:color="555555" w:sz="6" w:space="6"/>
+          <w:left w:val="single" w:color="555555" w:sz="6" w:space="6"/>
+          <w:right w:val="single" w:color="555555" w:sz="6" w:space="6"/>
+        </w:pBdr>
+        <w:shd w:fill="EFEFEF" w:color="auto" w:val="clear"/>
+        <w:spacing w:after="0" w:before="240"/>
+        <w:ind w:left="227" w:right="227"/>
+        <w:jc w:val="center"/>
+      </w:pPr>
+      <w:r>
+        <w:rPr>
+          <w:rFonts w:ascii="Georgia" w:cs="Georgia" w:eastAsia="Georgia" w:hAnsi="Georgia"/>
+          <w:b/>
+          <w:bCs/>
+          <w:spacing w:val="30"/>
+          <w:sz w:val="17"/>
+          <w:szCs w:val="17"/>
+        </w:rPr>
+        <w:t xml:space="preserve">NO CELULAR DE HENRIQUE</w:t>
+      </w:r>
+    </w:p>
+    <w:p>
+      <w:pPr>
+        <w:pBdr>
+          <w:top w:val="single" w:color="555555" w:sz="6" w:space="6"/>
+          <w:bottom w:val="single" w:color="555555" w:sz="6" w:space="6"/>
+          <w:left w:val="single" w:color="555555" w:sz="6" w:space="6"/>
+          <w:right w:val="single" w:color="555555" w:sz="6" w:space="6"/>
+        </w:pBdr>
+        <w:shd w:fill="EFEFEF" w:color="auto" w:val="clear"/>
+        <w:spacing w:after="240" w:before="0" w:line="288"/>
+        <w:ind w:left="227" w:right="227"/>
+        <w:jc w:val="center"/>
+      </w:pPr>
+      <w:r>
+        <w:rPr>
+          <w:rFonts w:ascii="Georgia" w:cs="Georgia" w:eastAsia="Georgia" w:hAnsi="Georgia"/>
+          <w:i/>
+          <w:iCs/>
+          <w:sz w:val="19"/>
+          <w:szCs w:val="19"/>
+        </w:rPr>
+        <w:t xml:space="preserve">A mensagem de Bianca, enviada às duas e quarenta da madrugada, continua no celular de Henrique. Veja o que mais ela escreveu a ele naquela semana. Ele escreveu, apagou, escreveu de novo. Viu o jornal? Apagou. Não mandou nada.</w:t>
       </w:r>
     </w:p>
     <w:p>
@@ -6677,6 +6775,55 @@
     </w:p>
     <w:p>
       <w:pPr>
+        <w:pBdr>
+          <w:top w:val="single" w:color="555555" w:sz="6" w:space="6"/>
+          <w:bottom w:val="single" w:color="555555" w:sz="6" w:space="6"/>
+          <w:left w:val="single" w:color="555555" w:sz="6" w:space="6"/>
+          <w:right w:val="single" w:color="555555" w:sz="6" w:space="6"/>
+        </w:pBdr>
+        <w:shd w:fill="EFEFEF" w:color="auto" w:val="clear"/>
+        <w:spacing w:after="0" w:before="240"/>
+        <w:ind w:left="227" w:right="227"/>
+        <w:jc w:val="center"/>
+      </w:pPr>
+      <w:r>
+        <w:rPr>
+          <w:rFonts w:ascii="Georgia" w:cs="Georgia" w:eastAsia="Georgia" w:hAnsi="Georgia"/>
+          <w:b/>
+          <w:bCs/>
+          <w:spacing w:val="30"/>
+          <w:sz w:val="17"/>
+          <w:szCs w:val="17"/>
+        </w:rPr>
+        <w:t xml:space="preserve">NO CELULAR DE HENRIQUE</w:t>
+      </w:r>
+    </w:p>
+    <w:p>
+      <w:pPr>
+        <w:pBdr>
+          <w:top w:val="single" w:color="555555" w:sz="6" w:space="6"/>
+          <w:bottom w:val="single" w:color="555555" w:sz="6" w:space="6"/>
+          <w:left w:val="single" w:color="555555" w:sz="6" w:space="6"/>
+          <w:right w:val="single" w:color="555555" w:sz="6" w:space="6"/>
+        </w:pBdr>
+        <w:shd w:fill="EFEFEF" w:color="auto" w:val="clear"/>
+        <w:spacing w:after="240" w:before="0" w:line="288"/>
+        <w:ind w:left="227" w:right="227"/>
+        <w:jc w:val="center"/>
+      </w:pPr>
+      <w:r>
+        <w:rPr>
+          <w:rFonts w:ascii="Georgia" w:cs="Georgia" w:eastAsia="Georgia" w:hAnsi="Georgia"/>
+          <w:i/>
+          <w:iCs/>
+          <w:sz w:val="19"/>
+          <w:szCs w:val="19"/>
+        </w:rPr>
+        <w:t xml:space="preserve">Digite no celular de Henrique a data do incêndio, dia e mês, somada ao seu código pessoal. A pasta protegida vai se abrir para você também.</w:t>
+      </w:r>
+    </w:p>
+    <w:p>
+      <w:pPr>
         <w:spacing w:after="200" w:before="200"/>
         <w:jc w:val="center"/>
       </w:pPr>
@@ -7187,6 +7334,55 @@
     </w:p>
     <w:p>
       <w:pPr>
+        <w:pBdr>
+          <w:top w:val="single" w:color="555555" w:sz="6" w:space="6"/>
+          <w:bottom w:val="single" w:color="555555" w:sz="6" w:space="6"/>
+          <w:left w:val="single" w:color="555555" w:sz="6" w:space="6"/>
+          <w:right w:val="single" w:color="555555" w:sz="6" w:space="6"/>
+        </w:pBdr>
+        <w:shd w:fill="EFEFEF" w:color="auto" w:val="clear"/>
+        <w:spacing w:after="0" w:before="240"/>
+        <w:ind w:left="227" w:right="227"/>
+        <w:jc w:val="center"/>
+      </w:pPr>
+      <w:r>
+        <w:rPr>
+          <w:rFonts w:ascii="Georgia" w:cs="Georgia" w:eastAsia="Georgia" w:hAnsi="Georgia"/>
+          <w:b/>
+          <w:bCs/>
+          <w:spacing w:val="30"/>
+          <w:sz w:val="17"/>
+          <w:szCs w:val="17"/>
+        </w:rPr>
+        <w:t xml:space="preserve">NO CELULAR DE HENRIQUE</w:t>
+      </w:r>
+    </w:p>
+    <w:p>
+      <w:pPr>
+        <w:pBdr>
+          <w:top w:val="single" w:color="555555" w:sz="6" w:space="6"/>
+          <w:bottom w:val="single" w:color="555555" w:sz="6" w:space="6"/>
+          <w:left w:val="single" w:color="555555" w:sz="6" w:space="6"/>
+          <w:right w:val="single" w:color="555555" w:sz="6" w:space="6"/>
+        </w:pBdr>
+        <w:shd w:fill="EFEFEF" w:color="auto" w:val="clear"/>
+        <w:spacing w:after="240" w:before="0" w:line="288"/>
+        <w:ind w:left="227" w:right="227"/>
+        <w:jc w:val="center"/>
+      </w:pPr>
+      <w:r>
+        <w:rPr>
+          <w:rFonts w:ascii="Georgia" w:cs="Georgia" w:eastAsia="Georgia" w:hAnsi="Georgia"/>
+          <w:i/>
+          <w:iCs/>
+          <w:sz w:val="19"/>
+          <w:szCs w:val="19"/>
+        </w:rPr>
+        <w:t xml:space="preserve">Procure, nas conversas de Henrique com Helena, a mensagem de 17 de janeiro de 2008. Leia também o que vem antes e depois dela.</w:t>
+      </w:r>
+    </w:p>
+    <w:p>
+      <w:pPr>
         <w:spacing w:after="0" w:line="312"/>
         <w:ind w:firstLine="340"/>
         <w:jc w:val="both"/>
@@ -11121,6 +11317,55 @@
     </w:p>
     <w:p>
       <w:pPr>
+        <w:pBdr>
+          <w:top w:val="single" w:color="555555" w:sz="6" w:space="6"/>
+          <w:bottom w:val="single" w:color="555555" w:sz="6" w:space="6"/>
+          <w:left w:val="single" w:color="555555" w:sz="6" w:space="6"/>
+          <w:right w:val="single" w:color="555555" w:sz="6" w:space="6"/>
+        </w:pBdr>
+        <w:shd w:fill="EFEFEF" w:color="auto" w:val="clear"/>
+        <w:spacing w:after="0" w:before="240"/>
+        <w:ind w:left="227" w:right="227"/>
+        <w:jc w:val="center"/>
+      </w:pPr>
+      <w:r>
+        <w:rPr>
+          <w:rFonts w:ascii="Georgia" w:cs="Georgia" w:eastAsia="Georgia" w:hAnsi="Georgia"/>
+          <w:b/>
+          <w:bCs/>
+          <w:spacing w:val="30"/>
+          <w:sz w:val="17"/>
+          <w:szCs w:val="17"/>
+        </w:rPr>
+        <w:t xml:space="preserve">NO CELULAR DE HENRIQUE</w:t>
+      </w:r>
+    </w:p>
+    <w:p>
+      <w:pPr>
+        <w:pBdr>
+          <w:top w:val="single" w:color="555555" w:sz="6" w:space="6"/>
+          <w:bottom w:val="single" w:color="555555" w:sz="6" w:space="6"/>
+          <w:left w:val="single" w:color="555555" w:sz="6" w:space="6"/>
+          <w:right w:val="single" w:color="555555" w:sz="6" w:space="6"/>
+        </w:pBdr>
+        <w:shd w:fill="EFEFEF" w:color="auto" w:val="clear"/>
+        <w:spacing w:after="240" w:before="0" w:line="288"/>
+        <w:ind w:left="227" w:right="227"/>
+        <w:jc w:val="center"/>
+      </w:pPr>
+      <w:r>
+        <w:rPr>
+          <w:rFonts w:ascii="Georgia" w:cs="Georgia" w:eastAsia="Georgia" w:hAnsi="Georgia"/>
+          <w:i/>
+          <w:iCs/>
+          <w:sz w:val="19"/>
+          <w:szCs w:val="19"/>
+        </w:rPr>
+        <w:t xml:space="preserve">Para abrir o e-mail pessoal de Henrique, use os números da placa do carro prata, somados ao seu código pessoal. Leia as anotações na ordem em que ele as escreveu.</w:t>
+      </w:r>
+    </w:p>
+    <w:p>
+      <w:pPr>
         <w:spacing w:after="200" w:before="200"/>
         <w:jc w:val="center"/>
       </w:pPr>
@@ -12045,6 +12290,265 @@
           <w:szCs w:val="21"/>
         </w:rPr>
         <w:t xml:space="preserve">Lia leu tudo duas vezes. Depois devolveu o aparelho.</w:t>
+      </w:r>
+    </w:p>
+    <w:p>
+      <w:pPr>
+        <w:spacing w:after="0" w:line="312"/>
+        <w:ind w:firstLine="340"/>
+        <w:jc w:val="both"/>
+      </w:pPr>
+      <w:r>
+        <w:rPr>
+          <w:rFonts w:ascii="Georgia" w:cs="Georgia" w:eastAsia="Georgia" w:hAnsi="Georgia"/>
+          <w:sz w:val="21"/>
+          <w:szCs w:val="21"/>
+        </w:rPr>
+        <w:t xml:space="preserve">— Tem mais uma coisa — disse Lucas. — Achei hoje de manhã. Um e-mail do pai para ele mesmo, de duas semanas antes de morrer. Sem texto nenhum. Só um ponto de interrogação no assunto e duas fotos.</w:t>
+      </w:r>
+    </w:p>
+    <w:p>
+      <w:pPr>
+        <w:spacing w:after="0" w:line="312"/>
+        <w:ind w:firstLine="340"/>
+        <w:jc w:val="both"/>
+      </w:pPr>
+      <w:r>
+        <w:rPr>
+          <w:rFonts w:ascii="Georgia" w:cs="Georgia" w:eastAsia="Georgia" w:hAnsi="Georgia"/>
+          <w:sz w:val="21"/>
+          <w:szCs w:val="21"/>
+        </w:rPr>
+        <w:t xml:space="preserve">Ele abriu a mensagem e virou a tela para ela.</w:t>
+      </w:r>
+    </w:p>
+    <w:p>
+      <w:pPr>
+        <w:spacing w:after="0" w:line="312"/>
+        <w:ind w:firstLine="340"/>
+        <w:jc w:val="both"/>
+      </w:pPr>
+      <w:r>
+        <w:rPr>
+          <w:rFonts w:ascii="Georgia" w:cs="Georgia" w:eastAsia="Georgia" w:hAnsi="Georgia"/>
+          <w:sz w:val="21"/>
+          <w:szCs w:val="21"/>
+        </w:rPr>
+        <w:t xml:space="preserve">A primeira foto era de Helena, à mesa de jantar da casa do Jardim Europa, tirada de lado, sem que ela percebesse. O enquadramento era estranho, fechado demais: pegava o queixo, o canto da boca e a pinta pequena, e quase nada do resto do rosto. A segunda era uma foto de outra foto, apoiada sobre a mesa do escritório. A menina de cabelo curto segurando a tesoura na inauguração da Têxtil Ferraz.</w:t>
+      </w:r>
+    </w:p>
+    <w:p>
+      <w:pPr>
+        <w:pBdr>
+          <w:top w:val="single" w:color="555555" w:sz="6" w:space="6"/>
+          <w:bottom w:val="single" w:color="555555" w:sz="6" w:space="6"/>
+          <w:left w:val="single" w:color="555555" w:sz="6" w:space="6"/>
+          <w:right w:val="single" w:color="555555" w:sz="6" w:space="6"/>
+        </w:pBdr>
+        <w:shd w:fill="EFEFEF" w:color="auto" w:val="clear"/>
+        <w:spacing w:after="0" w:before="240"/>
+        <w:ind w:left="227" w:right="227"/>
+        <w:jc w:val="center"/>
+      </w:pPr>
+      <w:r>
+        <w:rPr>
+          <w:rFonts w:ascii="Georgia" w:cs="Georgia" w:eastAsia="Georgia" w:hAnsi="Georgia"/>
+          <w:b/>
+          <w:bCs/>
+          <w:spacing w:val="30"/>
+          <w:sz w:val="17"/>
+          <w:szCs w:val="17"/>
+        </w:rPr>
+        <w:t xml:space="preserve">NO CELULAR DE HENRIQUE</w:t>
+      </w:r>
+    </w:p>
+    <w:p>
+      <w:pPr>
+        <w:pBdr>
+          <w:top w:val="single" w:color="555555" w:sz="6" w:space="6"/>
+          <w:bottom w:val="single" w:color="555555" w:sz="6" w:space="6"/>
+          <w:left w:val="single" w:color="555555" w:sz="6" w:space="6"/>
+          <w:right w:val="single" w:color="555555" w:sz="6" w:space="6"/>
+        </w:pBdr>
+        <w:shd w:fill="EFEFEF" w:color="auto" w:val="clear"/>
+        <w:spacing w:after="240" w:before="0" w:line="288"/>
+        <w:ind w:left="227" w:right="227"/>
+        <w:jc w:val="center"/>
+      </w:pPr>
+      <w:r>
+        <w:rPr>
+          <w:rFonts w:ascii="Georgia" w:cs="Georgia" w:eastAsia="Georgia" w:hAnsi="Georgia"/>
+          <w:i/>
+          <w:iCs/>
+          <w:sz w:val="19"/>
+          <w:szCs w:val="19"/>
+        </w:rPr>
+        <w:t xml:space="preserve">Que foto é essa? Abra o e-mail pessoal de Henrique no celular virtual e procure a mensagem de 28 de setembro, com um ponto de interrogação no assunto. Olhe com atenção para as duas fotos, uma ao lado da outra.</w:t>
+      </w:r>
+    </w:p>
+    <w:p>
+      <w:pPr>
+        <w:spacing w:after="0" w:line="312"/>
+        <w:ind w:firstLine="340"/>
+        <w:jc w:val="both"/>
+      </w:pPr>
+      <w:r>
+        <w:rPr>
+          <w:rFonts w:ascii="Georgia" w:cs="Georgia" w:eastAsia="Georgia" w:hAnsi="Georgia"/>
+          <w:sz w:val="21"/>
+          <w:szCs w:val="21"/>
+        </w:rPr>
+        <w:t xml:space="preserve">Lia ficou olhando para a tela por muito tempo.</w:t>
+      </w:r>
+    </w:p>
+    <w:p>
+      <w:pPr>
+        <w:spacing w:after="0" w:line="312"/>
+        <w:ind w:firstLine="340"/>
+        <w:jc w:val="both"/>
+      </w:pPr>
+      <w:r>
+        <w:rPr>
+          <w:rFonts w:ascii="Georgia" w:cs="Georgia" w:eastAsia="Georgia" w:hAnsi="Georgia"/>
+          <w:sz w:val="21"/>
+          <w:szCs w:val="21"/>
+        </w:rPr>
+        <w:t xml:space="preserve">— Ele sabia — disse, enfim.</w:t>
+      </w:r>
+    </w:p>
+    <w:p>
+      <w:pPr>
+        <w:spacing w:after="0" w:line="312"/>
+        <w:ind w:firstLine="340"/>
+        <w:jc w:val="both"/>
+      </w:pPr>
+      <w:r>
+        <w:rPr>
+          <w:rFonts w:ascii="Georgia" w:cs="Georgia" w:eastAsia="Georgia" w:hAnsi="Georgia"/>
+          <w:sz w:val="21"/>
+          <w:szCs w:val="21"/>
+        </w:rPr>
+        <w:t xml:space="preserve">— Ou estava perto de saber.</w:t>
+      </w:r>
+    </w:p>
+    <w:p>
+      <w:pPr>
+        <w:spacing w:after="0" w:line="312"/>
+        <w:ind w:firstLine="340"/>
+        <w:jc w:val="both"/>
+      </w:pPr>
+      <w:r>
+        <w:rPr>
+          <w:rFonts w:ascii="Georgia" w:cs="Georgia" w:eastAsia="Georgia" w:hAnsi="Georgia"/>
+          <w:sz w:val="21"/>
+          <w:szCs w:val="21"/>
+        </w:rPr>
+        <w:t xml:space="preserve">— A Leninha. Ele guardou a conversa do Raul escondida, com o apelido dentro. E dois anos depois a Helena assina Leninha numa mensagem para ele. Ele respondeu desde quando você é Leninha, Lucas. Ele não esqueceu. Ficou com aquilo na cabeça.</w:t>
+      </w:r>
+    </w:p>
+    <w:p>
+      <w:pPr>
+        <w:spacing w:after="0" w:line="312"/>
+        <w:ind w:firstLine="340"/>
+        <w:jc w:val="both"/>
+      </w:pPr>
+      <w:r>
+        <w:rPr>
+          <w:rFonts w:ascii="Georgia" w:cs="Georgia" w:eastAsia="Georgia" w:hAnsi="Georgia"/>
+          <w:sz w:val="21"/>
+          <w:szCs w:val="21"/>
+        </w:rPr>
+        <w:t xml:space="preserve">— E foi atrás.</w:t>
+      </w:r>
+    </w:p>
+    <w:p>
+      <w:pPr>
+        <w:spacing w:after="0" w:line="312"/>
+        <w:ind w:firstLine="340"/>
+        <w:jc w:val="both"/>
+      </w:pPr>
+      <w:r>
+        <w:rPr>
+          <w:rFonts w:ascii="Georgia" w:cs="Georgia" w:eastAsia="Georgia" w:hAnsi="Georgia"/>
+          <w:sz w:val="21"/>
+          <w:szCs w:val="21"/>
+        </w:rPr>
+        <w:t xml:space="preserve">— E se ele foi atrás, ela pode ter percebido. — Lia pensou na gaveta de sinistros aberta dois dedos, na pasta fora do lugar. — Uma mulher que passou três anos fingindo ser outra pessoa sabe quando está sendo olhada. Se ele descobrisse, ela perdia tudo. O casamento. O testamento. A casa. Os três anos.</w:t>
+      </w:r>
+    </w:p>
+    <w:p>
+      <w:pPr>
+        <w:spacing w:after="0" w:line="312"/>
+        <w:ind w:firstLine="340"/>
+        <w:jc w:val="both"/>
+      </w:pPr>
+      <w:r>
+        <w:rPr>
+          <w:rFonts w:ascii="Georgia" w:cs="Georgia" w:eastAsia="Georgia" w:hAnsi="Georgia"/>
+          <w:sz w:val="21"/>
+          <w:szCs w:val="21"/>
+        </w:rPr>
+        <w:t xml:space="preserve">— Então ela tinha o maior motivo de todos para matar o pai antes que ele terminasse de descobrir.</w:t>
+      </w:r>
+    </w:p>
+    <w:p>
+      <w:pPr>
+        <w:spacing w:after="0" w:line="312"/>
+        <w:ind w:firstLine="340"/>
+        <w:jc w:val="both"/>
+      </w:pPr>
+      <w:r>
+        <w:rPr>
+          <w:rFonts w:ascii="Georgia" w:cs="Georgia" w:eastAsia="Georgia" w:hAnsi="Georgia"/>
+          <w:sz w:val="21"/>
+          <w:szCs w:val="21"/>
+        </w:rPr>
+        <w:t xml:space="preserve">— E estava em Americana — disse Lia. — Ao lado da mãe, com duas enfermeiras e uma câmera olhando para ela a noite inteira.</w:t>
+      </w:r>
+    </w:p>
+    <w:p>
+      <w:pPr>
+        <w:spacing w:after="0" w:line="312"/>
+        <w:ind w:firstLine="340"/>
+        <w:jc w:val="both"/>
+      </w:pPr>
+      <w:r>
+        <w:rPr>
+          <w:rFonts w:ascii="Georgia" w:cs="Georgia" w:eastAsia="Georgia" w:hAnsi="Georgia"/>
+          <w:sz w:val="21"/>
+          <w:szCs w:val="21"/>
+        </w:rPr>
+        <w:t xml:space="preserve">Lucas guardou o celular no bolso.</w:t>
+      </w:r>
+    </w:p>
+    <w:p>
+      <w:pPr>
+        <w:spacing w:after="0" w:line="312"/>
+        <w:ind w:firstLine="340"/>
+        <w:jc w:val="both"/>
+      </w:pPr>
+      <w:r>
+        <w:rPr>
+          <w:rFonts w:ascii="Georgia" w:cs="Georgia" w:eastAsia="Georgia" w:hAnsi="Georgia"/>
+          <w:sz w:val="21"/>
+          <w:szCs w:val="21"/>
+        </w:rPr>
+        <w:t xml:space="preserve">— Quem disse que precisava ser ela?</w:t>
+      </w:r>
+    </w:p>
+    <w:p>
+      <w:pPr>
+        <w:spacing w:after="0" w:line="312"/>
+        <w:ind w:firstLine="340"/>
+        <w:jc w:val="both"/>
+      </w:pPr>
+      <w:r>
+        <w:rPr>
+          <w:rFonts w:ascii="Georgia" w:cs="Georgia" w:eastAsia="Georgia" w:hAnsi="Georgia"/>
+          <w:sz w:val="21"/>
+          <w:szCs w:val="21"/>
+        </w:rPr>
+        <w:t xml:space="preserve">Os dois ficaram em silêncio. Lia pensou em Helena dizendo, naquela sala de lareira, que todo mundo tinha pedido a cremação. O Otávio. Dois amigos da Associação Comercial. Um recado do Falcão.</w:t>
       </w:r>
     </w:p>
     <w:p>

</xml_diff>

<commit_message>
Livro policial: sinais de que Henrique planejava sumir (caps. 1-12)
Co-Authored-By: Claude Opus 5.5 <noreply@anthropic.com>
Claude-Session: https://claude.ai/code/session_01BrurxSYygRC3rRhaUYosm1
</commit_message>
<xml_diff>
--- a/docs/livro-policial/TODO_CRIME_TEM_UM_AUTOR.docx
+++ b/docs/livro-policial/TODO_CRIME_TEM_UM_AUTOR.docx
@@ -299,7 +299,7 @@
           <w:sz w:val="21"/>
           <w:szCs w:val="21"/>
         </w:rPr>
-        <w:t xml:space="preserve">Era verdade, mas não era tudo. Lia não dormia direito desde segunda-feira. Naquela noite, a última da vida dele, o pai tinha ficado até quase meia-noite sentado no sofá do apartamento dela. Apareceu sem avisar, com uma garrafa de vinho que não chegou a abrir, e falou de coisas que não faziam sentido: da infância dela, de uma viagem que nunca fizeram, de como ela franzia a testa do mesmo jeito que ele quando estava desconfiada. Antes de sair, segurou o rosto dela com as duas mãos.</w:t>
+        <w:t xml:space="preserve">Era verdade, mas não era tudo. Lia não dormia direito desde segunda-feira. Naquela noite, a última da vida dele, o pai tinha ficado até quase meia-noite sentado no sofá do apartamento dela. Apareceu sem avisar, com uma garrafa de vinho que não chegou a abrir, e falou de coisas que não faziam sentido: da infância dela, de uma viagem que nunca fizeram, de como ela franzia a testa do mesmo jeito que ele quando estava desconfiada. Perguntou, de repente, se o passaporte dela ainda estava válido. Ela riu e disse que sim, que ele ia finalmente levá-la à Europa. Ele não riu. Disse só: um dia eu te mando um cartão-postal de um lugar com neve, e você vai entender. Antes de sair, segurou o rosto dela com as duas mãos.</w:t>
       </w:r>
     </w:p>
     <w:p>
@@ -1062,7 +1062,22 @@
           <w:sz w:val="21"/>
           <w:szCs w:val="21"/>
         </w:rPr>
-        <w:t xml:space="preserve">Em casa, no apartamento da Vila Nova Conceição, ele deixou o saco sobre a bancada da cozinha e ficou um tempo olhando para ele sem abrir. Serviu um copo de água. Não bebeu. Tirou o celular do saco e apertou o botão lateral.</w:t>
+        <w:t xml:space="preserve">Em casa, no apartamento da Vila Nova Conceição, ele deixou o saco sobre a bancada da cozinha e ficou um tempo olhando para ele sem abrir. Serviu um copo de água. Não bebeu. Abriu primeiro a carteira. Cartões, algum dinheiro, a foto antiga dos três filhos na praia. E, num bolso interno que Lucas não conhecia, um envelope pequeno com duas fotos 3x4 recém-tiradas do pai, de terno escuro, sem gravata, com o cabelo mais curto do que ele costumava usar. No verso do envelope, o carimbo de um estúdio fotográfico da Rua Augusta, com a data de três semanas antes. Lucas ficou se perguntando para que documento um homem de sessenta e um anos precisava de fotos novas. Guardou o envelope de volta.</w:t>
+      </w:r>
+    </w:p>
+    <w:p>
+      <w:pPr>
+        <w:spacing w:after="0" w:line="312"/>
+        <w:ind w:firstLine="340"/>
+        <w:jc w:val="both"/>
+      </w:pPr>
+      <w:r>
+        <w:rPr>
+          <w:rFonts w:ascii="Georgia" w:cs="Georgia" w:eastAsia="Georgia" w:hAnsi="Georgia"/>
+          <w:sz w:val="21"/>
+          <w:szCs w:val="21"/>
+        </w:rPr>
+        <w:t xml:space="preserve">Depois tirou o celular do saco e apertou o botão lateral.</w:t>
       </w:r>
     </w:p>
     <w:p>
@@ -2234,6 +2249,51 @@
           <w:sz w:val="21"/>
           <w:szCs w:val="21"/>
         </w:rPr>
+        <w:t xml:space="preserve">— E a Europa? Você ainda vai me levar, como prometeu?</w:t>
+      </w:r>
+    </w:p>
+    <w:p>
+      <w:pPr>
+        <w:spacing w:after="0" w:line="312"/>
+        <w:ind w:firstLine="340"/>
+        <w:jc w:val="both"/>
+      </w:pPr>
+      <w:r>
+        <w:rPr>
+          <w:rFonts w:ascii="Georgia" w:cs="Georgia" w:eastAsia="Georgia" w:hAnsi="Georgia"/>
+          <w:sz w:val="21"/>
+          <w:szCs w:val="21"/>
+        </w:rPr>
+        <w:t xml:space="preserve">— Um dia eu vou para um lugar onde ninguém sabe quem eu sou — disse ele, olhando para o teto espelhado. — Não sei se cabe mais alguém.</w:t>
+      </w:r>
+    </w:p>
+    <w:p>
+      <w:pPr>
+        <w:spacing w:after="0" w:line="312"/>
+        <w:ind w:firstLine="340"/>
+        <w:jc w:val="both"/>
+      </w:pPr>
+      <w:r>
+        <w:rPr>
+          <w:rFonts w:ascii="Georgia" w:cs="Georgia" w:eastAsia="Georgia" w:hAnsi="Georgia"/>
+          <w:sz w:val="21"/>
+          <w:szCs w:val="21"/>
+        </w:rPr>
+        <w:t xml:space="preserve">Bianca riu, achando que era piada. Ele também achou, naquela noite.</w:t>
+      </w:r>
+    </w:p>
+    <w:p>
+      <w:pPr>
+        <w:spacing w:after="0" w:line="312"/>
+        <w:ind w:firstLine="340"/>
+        <w:jc w:val="both"/>
+      </w:pPr>
+      <w:r>
+        <w:rPr>
+          <w:rFonts w:ascii="Georgia" w:cs="Georgia" w:eastAsia="Georgia" w:hAnsi="Georgia"/>
+          <w:sz w:val="21"/>
+          <w:szCs w:val="21"/>
+        </w:rPr>
         <w:t xml:space="preserve">Bianca se aproximou, e por um bom tempo ninguém se lembrou do uísque.</w:t>
       </w:r>
     </w:p>
@@ -5812,7 +5872,7 @@
           <w:sz w:val="21"/>
           <w:szCs w:val="21"/>
         </w:rPr>
-        <w:t xml:space="preserve">O advogado da corretora conseguiu que ele ficasse sozinho, num banco de cimento, sob uma lâmpada que nunca se apagava. Ele não dormiu. Pensou em Marcelo caindo. Pensou na expressão de surpresa no rosto dele, antes da queda. Pensou que nunca tinha visto um homem morrer de um soco e que, se alguém tinha de morrer daquele jeito, o soco teria de ser muito mais forte do que o dele.</w:t>
+        <w:t xml:space="preserve">O advogado da corretora conseguiu que ele ficasse sozinho, num banco de cimento, sob uma lâmpada que nunca se apagava. Ele não dormiu. Pensou em Marcelo caindo. Pensou na expressão de surpresa no rosto dele, antes da queda. Pensou que nunca tinha visto um homem morrer de um soco e que, se alguém tinha de morrer daquele jeito, o soco teria de ser muito mais forte do que o dele. E pensou, pela primeira vez na vida, em como seria acordar num lugar onde ninguém soubesse o seu nome.</w:t>
       </w:r>
     </w:p>
     <w:p>
@@ -8814,7 +8874,7 @@
           <w:sz w:val="21"/>
           <w:szCs w:val="21"/>
         </w:rPr>
-        <w:t xml:space="preserve">— Ele mesmo, menina. Ele era muito certinho. Mas, nos últimos tempos, era a dona Helena que separava os comprimidos de manhã, numa caixinha com os dias da semana. Ela dizia que ele andava esquecido. — Dona Cida baixou a voz. — Ele andava mesmo. Esquecido, nervoso. Dormia mal. Às vezes eu chegava de manhã e ele já estava acordado no escritório, sentado no escuro.</w:t>
+        <w:t xml:space="preserve">— Ele mesmo, menina. Ele era muito certinho. Mas, nos últimos tempos, era a dona Helena que separava os comprimidos de manhã, numa caixinha com os dias da semana. Ela dizia que ele andava esquecido. — Dona Cida baixou a voz. — Ele andava mesmo. Esquecido, nervoso. Dormia mal. Às vezes eu chegava de manhã e ele já estava acordado no escritório, sentado no escuro. Um dia achei um mapa da Suíça aberto em cima da mesa. Perguntei se ele ia viajar. Ele disse que não, que estava só sonhando acordado.</w:t>
       </w:r>
     </w:p>
     <w:p>
@@ -9687,6 +9747,36 @@
     </w:p>
     <w:p>
       <w:pPr>
+        <w:spacing w:after="0" w:line="312"/>
+        <w:ind w:firstLine="340"/>
+        <w:jc w:val="both"/>
+      </w:pPr>
+      <w:r>
+        <w:rPr>
+          <w:rFonts w:ascii="Georgia" w:cs="Georgia" w:eastAsia="Georgia" w:hAnsi="Georgia"/>
+          <w:sz w:val="21"/>
+          <w:szCs w:val="21"/>
+        </w:rPr>
+        <w:t xml:space="preserve">Ela ficou um instante calada.</w:t>
+      </w:r>
+    </w:p>
+    <w:p>
+      <w:pPr>
+        <w:spacing w:after="0" w:line="312"/>
+        <w:ind w:firstLine="340"/>
+        <w:jc w:val="both"/>
+      </w:pPr>
+      <w:r>
+        <w:rPr>
+          <w:rFonts w:ascii="Georgia" w:cs="Georgia" w:eastAsia="Georgia" w:hAnsi="Georgia"/>
+          <w:sz w:val="21"/>
+          <w:szCs w:val="21"/>
+        </w:rPr>
+        <w:t xml:space="preserve">— Nos últimos meses, ele estava diferente. Falava em vender a casa. Perguntou duas vezes se eu gostava de frio. Uma noite, me disse que todo homem devia ter o direito de recomeçar do zero pelo menos uma vez na vida. Eu achei que era a idade.</w:t>
+      </w:r>
+    </w:p>
+    <w:p>
+      <w:pPr>
         <w:spacing w:after="200" w:before="200"/>
         <w:jc w:val="center"/>
       </w:pPr>
@@ -10475,7 +10565,52 @@
           <w:sz w:val="21"/>
           <w:szCs w:val="21"/>
         </w:rPr>
-        <w:t xml:space="preserve">Henrique terminou o copo de uma vez. Pensou em ir embora. Pensou em Valdir dizendo homem com rotina é homem fácil. Olhou em volta do bar: o pianista, o barman secando taças, um casal de estrangeiros no canto, um funcionário do hotel de colete escuro parado perto da escada do mezanino, olhando para o celular. Ninguém olhava para ele.</w:t>
+        <w:t xml:space="preserve">— Se eu fosse você, com tanta gente querendo a minha cabeça, eu sumia — disse Fábio. — Pegava o dinheiro e ia viver numa montanha.</w:t>
+      </w:r>
+    </w:p>
+    <w:p>
+      <w:pPr>
+        <w:spacing w:after="0" w:line="312"/>
+        <w:ind w:firstLine="340"/>
+        <w:jc w:val="both"/>
+      </w:pPr>
+      <w:r>
+        <w:rPr>
+          <w:rFonts w:ascii="Georgia" w:cs="Georgia" w:eastAsia="Georgia" w:hAnsi="Georgia"/>
+          <w:sz w:val="21"/>
+          <w:szCs w:val="21"/>
+        </w:rPr>
+        <w:t xml:space="preserve">— Sumir dá trabalho — respondeu Henrique, sem saber por que respondia. — Precisa de outro nome, outra conta, outro país. E de alguém de confiança para apagar a luz quando você sair.</w:t>
+      </w:r>
+    </w:p>
+    <w:p>
+      <w:pPr>
+        <w:spacing w:after="0" w:line="312"/>
+        <w:ind w:firstLine="340"/>
+        <w:jc w:val="both"/>
+      </w:pPr>
+      <w:r>
+        <w:rPr>
+          <w:rFonts w:ascii="Georgia" w:cs="Georgia" w:eastAsia="Georgia" w:hAnsi="Georgia"/>
+          <w:sz w:val="21"/>
+          <w:szCs w:val="21"/>
+        </w:rPr>
+        <w:t xml:space="preserve">— Fala como quem já pensou nisso.</w:t>
+      </w:r>
+    </w:p>
+    <w:p>
+      <w:pPr>
+        <w:spacing w:after="0" w:line="312"/>
+        <w:ind w:firstLine="340"/>
+        <w:jc w:val="both"/>
+      </w:pPr>
+      <w:r>
+        <w:rPr>
+          <w:rFonts w:ascii="Georgia" w:cs="Georgia" w:eastAsia="Georgia" w:hAnsi="Georgia"/>
+          <w:sz w:val="21"/>
+          <w:szCs w:val="21"/>
+        </w:rPr>
+        <w:t xml:space="preserve">Henrique não respondeu. Terminou o copo de uma vez. Pensou em ir embora. Pensou em Valdir dizendo homem com rotina é homem fácil. Olhou em volta do bar: o pianista, o barman secando taças, um casal de estrangeiros no canto, um funcionário do hotel de colete escuro parado perto da escada do mezanino, olhando para o celular. Ninguém olhava para ele.</w:t>
       </w:r>
     </w:p>
     <w:p>
@@ -11616,6 +11751,51 @@
           <w:szCs w:val="21"/>
         </w:rPr>
         <w:t xml:space="preserve">De quem é esse número?</w:t>
+      </w:r>
+    </w:p>
+    <w:p>
+      <w:pPr>
+        <w:spacing w:after="0" w:line="312"/>
+        <w:ind w:firstLine="340"/>
+        <w:jc w:val="both"/>
+      </w:pPr>
+      <w:r>
+        <w:rPr>
+          <w:rFonts w:ascii="Georgia" w:cs="Georgia" w:eastAsia="Georgia" w:hAnsi="Georgia"/>
+          <w:sz w:val="21"/>
+          <w:szCs w:val="21"/>
+        </w:rPr>
+        <w:t xml:space="preserve">Havia ainda uma anotação de setembro, solta entre as outras, que Lucas não soube onde encaixar.</w:t>
+      </w:r>
+    </w:p>
+    <w:p>
+      <w:pPr>
+        <w:spacing w:after="0" w:line="312"/>
+        <w:ind w:firstLine="340"/>
+        <w:jc w:val="both"/>
+      </w:pPr>
+      <w:r>
+        <w:rPr>
+          <w:rFonts w:ascii="Georgia" w:cs="Georgia" w:eastAsia="Georgia" w:hAnsi="Georgia"/>
+          <w:sz w:val="21"/>
+          <w:szCs w:val="21"/>
+        </w:rPr>
+        <w:t xml:space="preserve">Documentos: outubro. Confirmar com A.</w:t>
+      </w:r>
+    </w:p>
+    <w:p>
+      <w:pPr>
+        <w:spacing w:after="0" w:line="312"/>
+        <w:ind w:firstLine="340"/>
+        <w:jc w:val="both"/>
+      </w:pPr>
+      <w:r>
+        <w:rPr>
+          <w:rFonts w:ascii="Georgia" w:cs="Georgia" w:eastAsia="Georgia" w:hAnsi="Georgia"/>
+          <w:sz w:val="21"/>
+          <w:szCs w:val="21"/>
+        </w:rPr>
+        <w:t xml:space="preserve">A de quê? Do advogado? De Augusto Lemos, o empresário que tinha ameaçado o pai num jantar? Lucas anotou a frase no verso do mesmo cartão em que estava a placa e seguiu em frente.</w:t>
       </w:r>
     </w:p>
     <w:p>

</xml_diff>

<commit_message>
Livro policial: capítulo 14 (Portão aberto)
Co-Authored-By: Claude Opus 5.5 <noreply@anthropic.com>
Claude-Session: https://claude.ai/code/session_01BrurxSYygRC3rRhaUYosm1
</commit_message>
<xml_diff>
--- a/docs/livro-policial/TODO_CRIME_TEM_UM_AUTOR.docx
+++ b/docs/livro-policial/TODO_CRIME_TEM_UM_AUTOR.docx
@@ -13668,6 +13668,1281 @@
           <w:szCs w:val="21"/>
         </w:rPr>
         <w:t xml:space="preserve">No retrovisor, o sedã prata saiu da vaga e entrou no trânsito, três carros atrás dela.</w:t>
+      </w:r>
+    </w:p>
+    <w:p>
+      <w:pPr>
+        <w:pageBreakBefore/>
+        <w:spacing w:after="120" w:before="1800"/>
+        <w:jc w:val="center"/>
+      </w:pPr>
+      <w:r>
+        <w:rPr>
+          <w:rFonts w:ascii="Georgia" w:cs="Georgia" w:eastAsia="Georgia" w:hAnsi="Georgia"/>
+          <w:spacing w:val="40"/>
+          <w:sz w:val="20"/>
+          <w:szCs w:val="20"/>
+        </w:rPr>
+        <w:t xml:space="preserve">CAPÍTULO 14</w:t>
+      </w:r>
+    </w:p>
+    <w:p>
+      <w:pPr>
+        <w:spacing w:after="720"/>
+        <w:jc w:val="center"/>
+      </w:pPr>
+      <w:r>
+        <w:rPr>
+          <w:rFonts w:ascii="Georgia" w:cs="Georgia" w:eastAsia="Georgia" w:hAnsi="Georgia"/>
+          <w:b/>
+          <w:bCs/>
+          <w:sz w:val="32"/>
+          <w:szCs w:val="32"/>
+        </w:rPr>
+        <w:t xml:space="preserve">Portão aberto</w:t>
+      </w:r>
+    </w:p>
+    <w:p>
+      <w:pPr>
+        <w:spacing w:after="0" w:line="312"/>
+        <w:ind w:firstLine="340"/>
+        <w:jc w:val="both"/>
+      </w:pPr>
+      <w:r>
+        <w:rPr>
+          <w:rFonts w:ascii="Georgia" w:cs="Georgia" w:eastAsia="Georgia" w:hAnsi="Georgia"/>
+          <w:sz w:val="21"/>
+          <w:szCs w:val="21"/>
+        </w:rPr>
+        <w:t xml:space="preserve">A guarita ficava na esquina da rua da casa do Jardim Europa, uma cabine branca de vidro fumê com um ventilador velho e um rádio de pilha. Seu Ivo trabalhava ali havia catorze anos, das seis da manhã às seis da tarde, contratado pela associação dos moradores. Conhecia todos os carros da rua pela placa e todos os moradores pelo jeito de andar.</w:t>
+      </w:r>
+    </w:p>
+    <w:p>
+      <w:pPr>
+        <w:spacing w:after="0" w:line="312"/>
+        <w:ind w:firstLine="340"/>
+        <w:jc w:val="both"/>
+      </w:pPr>
+      <w:r>
+        <w:rPr>
+          <w:rFonts w:ascii="Georgia" w:cs="Georgia" w:eastAsia="Georgia" w:hAnsi="Georgia"/>
+          <w:sz w:val="21"/>
+          <w:szCs w:val="21"/>
+        </w:rPr>
+        <w:t xml:space="preserve">— O doutor Henrique sempre me dava bom-dia com a mão, sem abrir o vidro — disse ele, quando Lucas se apresentou. — Nunca falhou um dia. Meus sentimentos, menino.</w:t>
+      </w:r>
+    </w:p>
+    <w:p>
+      <w:pPr>
+        <w:spacing w:after="0" w:line="312"/>
+        <w:ind w:firstLine="340"/>
+        <w:jc w:val="both"/>
+      </w:pPr>
+      <w:r>
+        <w:rPr>
+          <w:rFonts w:ascii="Georgia" w:cs="Georgia" w:eastAsia="Georgia" w:hAnsi="Georgia"/>
+          <w:sz w:val="21"/>
+          <w:szCs w:val="21"/>
+        </w:rPr>
+        <w:t xml:space="preserve">— Obrigado, seu Ivo. O senhor estava aqui na terça-feira? No dia em que ele morreu?</w:t>
+      </w:r>
+    </w:p>
+    <w:p>
+      <w:pPr>
+        <w:spacing w:after="0" w:line="312"/>
+        <w:ind w:firstLine="340"/>
+        <w:jc w:val="both"/>
+      </w:pPr>
+      <w:r>
+        <w:rPr>
+          <w:rFonts w:ascii="Georgia" w:cs="Georgia" w:eastAsia="Georgia" w:hAnsi="Georgia"/>
+          <w:sz w:val="21"/>
+          <w:szCs w:val="21"/>
+        </w:rPr>
+        <w:t xml:space="preserve">— Estava. Eu estou aqui todo dia.</w:t>
+      </w:r>
+    </w:p>
+    <w:p>
+      <w:pPr>
+        <w:spacing w:after="0" w:line="312"/>
+        <w:ind w:firstLine="340"/>
+        <w:jc w:val="both"/>
+      </w:pPr>
+      <w:r>
+        <w:rPr>
+          <w:rFonts w:ascii="Georgia" w:cs="Georgia" w:eastAsia="Georgia" w:hAnsi="Georgia"/>
+          <w:sz w:val="21"/>
+          <w:szCs w:val="21"/>
+        </w:rPr>
+        <w:t xml:space="preserve">— O senhor anota quem entra e quem sai?</w:t>
+      </w:r>
+    </w:p>
+    <w:p>
+      <w:pPr>
+        <w:spacing w:after="0" w:line="312"/>
+        <w:ind w:firstLine="340"/>
+        <w:jc w:val="both"/>
+      </w:pPr>
+      <w:r>
+        <w:rPr>
+          <w:rFonts w:ascii="Georgia" w:cs="Georgia" w:eastAsia="Georgia" w:hAnsi="Georgia"/>
+          <w:sz w:val="21"/>
+          <w:szCs w:val="21"/>
+        </w:rPr>
+        <w:t xml:space="preserve">O vigia o olhou com um orgulho discreto e tirou de baixo do balcão um caderno de capa dura, gasto nas bordas, com o ano escrito na capa com caneta azul.</w:t>
+      </w:r>
+    </w:p>
+    <w:p>
+      <w:pPr>
+        <w:spacing w:after="0" w:line="312"/>
+        <w:ind w:firstLine="340"/>
+        <w:jc w:val="both"/>
+      </w:pPr>
+      <w:r>
+        <w:rPr>
+          <w:rFonts w:ascii="Georgia" w:cs="Georgia" w:eastAsia="Georgia" w:hAnsi="Georgia"/>
+          <w:sz w:val="21"/>
+          <w:szCs w:val="21"/>
+        </w:rPr>
+        <w:t xml:space="preserve">— A associação não pede. Mas eu anoto. Já ajudei a polícia três vezes com esse caderno.</w:t>
+      </w:r>
+    </w:p>
+    <w:p>
+      <w:pPr>
+        <w:spacing w:after="200" w:before="200"/>
+        <w:jc w:val="center"/>
+      </w:pPr>
+      <w:r>
+        <w:rPr>
+          <w:rFonts w:ascii="Georgia" w:cs="Georgia" w:eastAsia="Georgia" w:hAnsi="Georgia"/>
+          <w:sz w:val="22"/>
+          <w:szCs w:val="22"/>
+        </w:rPr>
+        <w:t xml:space="preserve">*</w:t>
+      </w:r>
+    </w:p>
+    <w:p>
+      <w:pPr>
+        <w:spacing w:after="0" w:line="312"/>
+        <w:ind w:firstLine="340"/>
+        <w:jc w:val="both"/>
+      </w:pPr>
+      <w:r>
+        <w:rPr>
+          <w:rFonts w:ascii="Georgia" w:cs="Georgia" w:eastAsia="Georgia" w:hAnsi="Georgia"/>
+          <w:sz w:val="21"/>
+          <w:szCs w:val="21"/>
+        </w:rPr>
+        <w:t xml:space="preserve">A página da terça-feira tinha a letra miúda e caprichada de seu Ivo, uma linha por carro.</w:t>
+      </w:r>
+    </w:p>
+    <w:p>
+      <w:pPr>
+        <w:spacing w:after="0" w:line="312"/>
+        <w:ind w:firstLine="340"/>
+        <w:jc w:val="both"/>
+      </w:pPr>
+      <w:r>
+        <w:rPr>
+          <w:rFonts w:ascii="Georgia" w:cs="Georgia" w:eastAsia="Georgia" w:hAnsi="Georgia"/>
+          <w:sz w:val="21"/>
+          <w:szCs w:val="21"/>
+        </w:rPr>
+        <w:t xml:space="preserve">6h50 — Dona Cida não veio (folga).</w:t>
+      </w:r>
+    </w:p>
+    <w:p>
+      <w:pPr>
+        <w:spacing w:after="0" w:line="312"/>
+        <w:ind w:firstLine="340"/>
+        <w:jc w:val="both"/>
+      </w:pPr>
+      <w:r>
+        <w:rPr>
+          <w:rFonts w:ascii="Georgia" w:cs="Georgia" w:eastAsia="Georgia" w:hAnsi="Georgia"/>
+          <w:sz w:val="21"/>
+          <w:szCs w:val="21"/>
+        </w:rPr>
+        <w:t xml:space="preserve">7h05 — Dr. Álvaro, carro cinza. Estacionou na frente da casa do Dr. Henrique. Entrou pela porta da frente.</w:t>
+      </w:r>
+    </w:p>
+    <w:p>
+      <w:pPr>
+        <w:spacing w:after="0" w:line="312"/>
+        <w:ind w:firstLine="340"/>
+        <w:jc w:val="both"/>
+      </w:pPr>
+      <w:r>
+        <w:rPr>
+          <w:rFonts w:ascii="Georgia" w:cs="Georgia" w:eastAsia="Georgia" w:hAnsi="Georgia"/>
+          <w:sz w:val="21"/>
+          <w:szCs w:val="21"/>
+        </w:rPr>
+        <w:t xml:space="preserve">7h28 — Sr. Otávio, Audi preto. Entrou pela garagem, com controle.</w:t>
+      </w:r>
+    </w:p>
+    <w:p>
+      <w:pPr>
+        <w:spacing w:after="0" w:line="312"/>
+        <w:ind w:firstLine="340"/>
+        <w:jc w:val="both"/>
+      </w:pPr>
+      <w:r>
+        <w:rPr>
+          <w:rFonts w:ascii="Georgia" w:cs="Georgia" w:eastAsia="Georgia" w:hAnsi="Georgia"/>
+          <w:sz w:val="21"/>
+          <w:szCs w:val="21"/>
+        </w:rPr>
+        <w:t xml:space="preserve">7h51 — Audi preto saiu. Rápido. Portão da garagem ficou aberto.</w:t>
+      </w:r>
+    </w:p>
+    <w:p>
+      <w:pPr>
+        <w:spacing w:after="0" w:line="312"/>
+        <w:ind w:firstLine="340"/>
+        <w:jc w:val="both"/>
+      </w:pPr>
+      <w:r>
+        <w:rPr>
+          <w:rFonts w:ascii="Georgia" w:cs="Georgia" w:eastAsia="Georgia" w:hAnsi="Georgia"/>
+          <w:sz w:val="21"/>
+          <w:szCs w:val="21"/>
+        </w:rPr>
+        <w:t xml:space="preserve">8h12 — Dr. Álvaro na calçada, falando no celular. Nervoso.</w:t>
+      </w:r>
+    </w:p>
+    <w:p>
+      <w:pPr>
+        <w:spacing w:after="0" w:line="312"/>
+        <w:ind w:firstLine="340"/>
+        <w:jc w:val="both"/>
+      </w:pPr>
+      <w:r>
+        <w:rPr>
+          <w:rFonts w:ascii="Georgia" w:cs="Georgia" w:eastAsia="Georgia" w:hAnsi="Georgia"/>
+          <w:sz w:val="21"/>
+          <w:szCs w:val="21"/>
+        </w:rPr>
+        <w:t xml:space="preserve">8h40 — Ambulância. Não ligou sirene.</w:t>
+      </w:r>
+    </w:p>
+    <w:p>
+      <w:pPr>
+        <w:spacing w:after="0" w:line="312"/>
+        <w:ind w:firstLine="340"/>
+        <w:jc w:val="both"/>
+      </w:pPr>
+      <w:r>
+        <w:rPr>
+          <w:rFonts w:ascii="Georgia" w:cs="Georgia" w:eastAsia="Georgia" w:hAnsi="Georgia"/>
+          <w:sz w:val="21"/>
+          <w:szCs w:val="21"/>
+        </w:rPr>
+        <w:t xml:space="preserve">Lucas leu a página três vezes. Depois fotografou com o celular, e seu Ivo deixou, com a seriedade de quem entrega uma prova.</w:t>
+      </w:r>
+    </w:p>
+    <w:p>
+      <w:pPr>
+        <w:spacing w:after="0" w:line="312"/>
+        <w:ind w:firstLine="340"/>
+        <w:jc w:val="both"/>
+      </w:pPr>
+      <w:r>
+        <w:rPr>
+          <w:rFonts w:ascii="Georgia" w:cs="Georgia" w:eastAsia="Georgia" w:hAnsi="Georgia"/>
+          <w:sz w:val="21"/>
+          <w:szCs w:val="21"/>
+        </w:rPr>
+        <w:t xml:space="preserve">— O senhor contou isso para a polícia?</w:t>
+      </w:r>
+    </w:p>
+    <w:p>
+      <w:pPr>
+        <w:spacing w:after="0" w:line="312"/>
+        <w:ind w:firstLine="340"/>
+        <w:jc w:val="both"/>
+      </w:pPr>
+      <w:r>
+        <w:rPr>
+          <w:rFonts w:ascii="Georgia" w:cs="Georgia" w:eastAsia="Georgia" w:hAnsi="Georgia"/>
+          <w:sz w:val="21"/>
+          <w:szCs w:val="21"/>
+        </w:rPr>
+        <w:t xml:space="preserve">— Ninguém me perguntou, menino. Disseram que foi do coração. — Ele coçou a cabeça. — Eu estranhei o portão. Liguei para a casa às oito e pouco, para avisar que tinha ficado aberto. Ninguém atendeu. Depois veio a ambulância, e eu esqueci.</w:t>
+      </w:r>
+    </w:p>
+    <w:p>
+      <w:pPr>
+        <w:spacing w:after="200" w:before="200"/>
+        <w:jc w:val="center"/>
+      </w:pPr>
+      <w:r>
+        <w:rPr>
+          <w:rFonts w:ascii="Georgia" w:cs="Georgia" w:eastAsia="Georgia" w:hAnsi="Georgia"/>
+          <w:sz w:val="22"/>
+          <w:szCs w:val="22"/>
+        </w:rPr>
+        <w:t xml:space="preserve">*</w:t>
+      </w:r>
+    </w:p>
+    <w:p>
+      <w:pPr>
+        <w:spacing w:after="0" w:line="312"/>
+        <w:ind w:firstLine="340"/>
+        <w:jc w:val="both"/>
+      </w:pPr>
+      <w:r>
+        <w:rPr>
+          <w:rFonts w:ascii="Georgia" w:cs="Georgia" w:eastAsia="Georgia" w:hAnsi="Georgia"/>
+          <w:sz w:val="21"/>
+          <w:szCs w:val="21"/>
+        </w:rPr>
+        <w:t xml:space="preserve">Lia chegou ao apartamento dele meia hora depois, ainda com o crachá do escritório pendurado no pescoço. Lucas mostrou a foto da página do caderno sem dizer nada. Ela leu duas vezes, como ele.</w:t>
+      </w:r>
+    </w:p>
+    <w:p>
+      <w:pPr>
+        <w:spacing w:after="0" w:line="312"/>
+        <w:ind w:firstLine="340"/>
+        <w:jc w:val="both"/>
+      </w:pPr>
+      <w:r>
+        <w:rPr>
+          <w:rFonts w:ascii="Georgia" w:cs="Georgia" w:eastAsia="Georgia" w:hAnsi="Georgia"/>
+          <w:sz w:val="21"/>
+          <w:szCs w:val="21"/>
+        </w:rPr>
+        <w:t xml:space="preserve">— Sete e vinte e oito — disse ela. — Pela garagem.</w:t>
+      </w:r>
+    </w:p>
+    <w:p>
+      <w:pPr>
+        <w:spacing w:after="0" w:line="312"/>
+        <w:ind w:firstLine="340"/>
+        <w:jc w:val="both"/>
+      </w:pPr>
+      <w:r>
+        <w:rPr>
+          <w:rFonts w:ascii="Georgia" w:cs="Georgia" w:eastAsia="Georgia" w:hAnsi="Georgia"/>
+          <w:sz w:val="21"/>
+          <w:szCs w:val="21"/>
+        </w:rPr>
+        <w:t xml:space="preserve">— Com controle. O quinto controle, que a Dona Cida achava que ele tinha devolvido.</w:t>
+      </w:r>
+    </w:p>
+    <w:p>
+      <w:pPr>
+        <w:spacing w:after="0" w:line="312"/>
+        <w:ind w:firstLine="340"/>
+        <w:jc w:val="both"/>
+      </w:pPr>
+      <w:r>
+        <w:rPr>
+          <w:rFonts w:ascii="Georgia" w:cs="Georgia" w:eastAsia="Georgia" w:hAnsi="Georgia"/>
+          <w:sz w:val="21"/>
+          <w:szCs w:val="21"/>
+        </w:rPr>
+        <w:t xml:space="preserve">— E saiu correndo vinte e três minutos depois. Deixando o portão aberto.</w:t>
+      </w:r>
+    </w:p>
+    <w:p>
+      <w:pPr>
+        <w:spacing w:after="0" w:line="312"/>
+        <w:ind w:firstLine="340"/>
+        <w:jc w:val="both"/>
+      </w:pPr>
+      <w:r>
+        <w:rPr>
+          <w:rFonts w:ascii="Georgia" w:cs="Georgia" w:eastAsia="Georgia" w:hAnsi="Georgia"/>
+          <w:sz w:val="21"/>
+          <w:szCs w:val="21"/>
+        </w:rPr>
+        <w:t xml:space="preserve">— Na manhã em que o pai morreu, entre sete e oito. Na manhã em que o pai tinha chamado a Contabilidade para levar os originais. Na manhã seguinte à pergunta Contabilidade igual a Otávio.</w:t>
+      </w:r>
+    </w:p>
+    <w:p>
+      <w:pPr>
+        <w:spacing w:after="0" w:line="312"/>
+        <w:ind w:firstLine="340"/>
+        <w:jc w:val="both"/>
+      </w:pPr>
+      <w:r>
+        <w:rPr>
+          <w:rFonts w:ascii="Georgia" w:cs="Georgia" w:eastAsia="Georgia" w:hAnsi="Georgia"/>
+          <w:sz w:val="21"/>
+          <w:szCs w:val="21"/>
+        </w:rPr>
+        <w:t xml:space="preserve">Lia sentou-se no braço do sofá.</w:t>
+      </w:r>
+    </w:p>
+    <w:p>
+      <w:pPr>
+        <w:spacing w:after="0" w:line="312"/>
+        <w:ind w:firstLine="340"/>
+        <w:jc w:val="both"/>
+      </w:pPr>
+      <w:r>
+        <w:rPr>
+          <w:rFonts w:ascii="Georgia" w:cs="Georgia" w:eastAsia="Georgia" w:hAnsi="Georgia"/>
+          <w:sz w:val="21"/>
+          <w:szCs w:val="21"/>
+        </w:rPr>
+        <w:t xml:space="preserve">— E foi o Otávio que organizou o velório. Que pediu a cremação para a Helena. Que foi buscar os contratos na casa antes das oito, dois dias depois. — Ela respirou fundo. — Lucas, é ele.</w:t>
+      </w:r>
+    </w:p>
+    <w:p>
+      <w:pPr>
+        <w:spacing w:after="0" w:line="312"/>
+        <w:ind w:firstLine="340"/>
+        <w:jc w:val="both"/>
+      </w:pPr>
+      <w:r>
+        <w:rPr>
+          <w:rFonts w:ascii="Georgia" w:cs="Georgia" w:eastAsia="Georgia" w:hAnsi="Georgia"/>
+          <w:sz w:val="21"/>
+          <w:szCs w:val="21"/>
+        </w:rPr>
+        <w:t xml:space="preserve">Pela segunda vez em duas semanas, os dois tiveram a sensação de que o caso estava fechando. Lucas sentiu um alívio que o envergonhou. Era mais fácil odiar Otávio do que qualquer outra pessoa daquela lista.</w:t>
+      </w:r>
+    </w:p>
+    <w:p>
+      <w:pPr>
+        <w:spacing w:after="0" w:line="312"/>
+        <w:ind w:firstLine="340"/>
+        <w:jc w:val="both"/>
+      </w:pPr>
+      <w:r>
+        <w:rPr>
+          <w:rFonts w:ascii="Georgia" w:cs="Georgia" w:eastAsia="Georgia" w:hAnsi="Georgia"/>
+          <w:sz w:val="21"/>
+          <w:szCs w:val="21"/>
+        </w:rPr>
+        <w:t xml:space="preserve">— Vamos falar com ele — disse.</w:t>
+      </w:r>
+    </w:p>
+    <w:p>
+      <w:pPr>
+        <w:spacing w:after="0" w:line="312"/>
+        <w:ind w:firstLine="340"/>
+        <w:jc w:val="both"/>
+      </w:pPr>
+      <w:r>
+        <w:rPr>
+          <w:rFonts w:ascii="Georgia" w:cs="Georgia" w:eastAsia="Georgia" w:hAnsi="Georgia"/>
+          <w:sz w:val="21"/>
+          <w:szCs w:val="21"/>
+        </w:rPr>
+        <w:t xml:space="preserve">— Não seria melhor ir à delegada?</w:t>
+      </w:r>
+    </w:p>
+    <w:p>
+      <w:pPr>
+        <w:spacing w:after="0" w:line="312"/>
+        <w:ind w:firstLine="340"/>
+        <w:jc w:val="both"/>
+      </w:pPr>
+      <w:r>
+        <w:rPr>
+          <w:rFonts w:ascii="Georgia" w:cs="Georgia" w:eastAsia="Georgia" w:hAnsi="Georgia"/>
+          <w:sz w:val="21"/>
+          <w:szCs w:val="21"/>
+        </w:rPr>
+        <w:t xml:space="preserve">— Primeiro eu quero olhar na cara dele.</w:t>
+      </w:r>
+    </w:p>
+    <w:p>
+      <w:pPr>
+        <w:spacing w:after="200" w:before="200"/>
+        <w:jc w:val="center"/>
+      </w:pPr>
+      <w:r>
+        <w:rPr>
+          <w:rFonts w:ascii="Georgia" w:cs="Georgia" w:eastAsia="Georgia" w:hAnsi="Georgia"/>
+          <w:sz w:val="22"/>
+          <w:szCs w:val="22"/>
+        </w:rPr>
+        <w:t xml:space="preserve">*</w:t>
+      </w:r>
+    </w:p>
+    <w:p>
+      <w:pPr>
+        <w:spacing w:after="0" w:line="312"/>
+        <w:ind w:firstLine="340"/>
+        <w:jc w:val="both"/>
+      </w:pPr>
+      <w:r>
+        <w:rPr>
+          <w:rFonts w:ascii="Georgia" w:cs="Georgia" w:eastAsia="Georgia" w:hAnsi="Georgia"/>
+          <w:sz w:val="21"/>
+          <w:szCs w:val="21"/>
+        </w:rPr>
+        <w:t xml:space="preserve">Otávio os recebeu na sala dele, na corretora, às sete da noite, quando o andar já estava vazio. Fechou a porta, serviu três copos de água que ninguém bebeu e sentou-se atrás da mesa com as mãos cruzadas, como se fosse conduzir uma reunião de rotina.</w:t>
+      </w:r>
+    </w:p>
+    <w:p>
+      <w:pPr>
+        <w:spacing w:after="0" w:line="312"/>
+        <w:ind w:firstLine="340"/>
+        <w:jc w:val="both"/>
+      </w:pPr>
+      <w:r>
+        <w:rPr>
+          <w:rFonts w:ascii="Georgia" w:cs="Georgia" w:eastAsia="Georgia" w:hAnsi="Georgia"/>
+          <w:sz w:val="21"/>
+          <w:szCs w:val="21"/>
+        </w:rPr>
+        <w:t xml:space="preserve">Lucas pôs o celular sobre a mesa, aberto na foto do caderno de seu Ivo.</w:t>
+      </w:r>
+    </w:p>
+    <w:p>
+      <w:pPr>
+        <w:spacing w:after="0" w:line="312"/>
+        <w:ind w:firstLine="340"/>
+        <w:jc w:val="both"/>
+      </w:pPr>
+      <w:r>
+        <w:rPr>
+          <w:rFonts w:ascii="Georgia" w:cs="Georgia" w:eastAsia="Georgia" w:hAnsi="Georgia"/>
+          <w:sz w:val="21"/>
+          <w:szCs w:val="21"/>
+        </w:rPr>
+        <w:t xml:space="preserve">Otávio olhou para a foto. Ficou muito tempo olhando. Depois tirou os óculos e esfregou os olhos com o polegar e o indicador.</w:t>
+      </w:r>
+    </w:p>
+    <w:p>
+      <w:pPr>
+        <w:spacing w:after="0" w:line="312"/>
+        <w:ind w:firstLine="340"/>
+        <w:jc w:val="both"/>
+      </w:pPr>
+      <w:r>
+        <w:rPr>
+          <w:rFonts w:ascii="Georgia" w:cs="Georgia" w:eastAsia="Georgia" w:hAnsi="Georgia"/>
+          <w:sz w:val="21"/>
+          <w:szCs w:val="21"/>
+        </w:rPr>
+        <w:t xml:space="preserve">— O vigia — disse. — Eu esqueci do vigia.</w:t>
+      </w:r>
+    </w:p>
+    <w:p>
+      <w:pPr>
+        <w:spacing w:after="0" w:line="312"/>
+        <w:ind w:firstLine="340"/>
+        <w:jc w:val="both"/>
+      </w:pPr>
+      <w:r>
+        <w:rPr>
+          <w:rFonts w:ascii="Georgia" w:cs="Georgia" w:eastAsia="Georgia" w:hAnsi="Georgia"/>
+          <w:sz w:val="21"/>
+          <w:szCs w:val="21"/>
+        </w:rPr>
+        <w:t xml:space="preserve">— O que você foi fazer na casa do meu pai às sete e vinte e oito da manhã? — perguntou Lucas.</w:t>
+      </w:r>
+    </w:p>
+    <w:p>
+      <w:pPr>
+        <w:spacing w:after="0" w:line="312"/>
+        <w:ind w:firstLine="340"/>
+        <w:jc w:val="both"/>
+      </w:pPr>
+      <w:r>
+        <w:rPr>
+          <w:rFonts w:ascii="Georgia" w:cs="Georgia" w:eastAsia="Georgia" w:hAnsi="Georgia"/>
+          <w:sz w:val="21"/>
+          <w:szCs w:val="21"/>
+        </w:rPr>
+        <w:t xml:space="preserve">— Ele me chamou.</w:t>
+      </w:r>
+    </w:p>
+    <w:p>
+      <w:pPr>
+        <w:spacing w:after="0" w:line="312"/>
+        <w:ind w:firstLine="340"/>
+        <w:jc w:val="both"/>
+      </w:pPr>
+      <w:r>
+        <w:rPr>
+          <w:rFonts w:ascii="Georgia" w:cs="Georgia" w:eastAsia="Georgia" w:hAnsi="Georgia"/>
+          <w:sz w:val="21"/>
+          <w:szCs w:val="21"/>
+        </w:rPr>
+        <w:t xml:space="preserve">— A Contabilidade — disse Lia. — Ele chamou a Contabilidade.</w:t>
+      </w:r>
+    </w:p>
+    <w:p>
+      <w:pPr>
+        <w:spacing w:after="0" w:line="312"/>
+        <w:ind w:firstLine="340"/>
+        <w:jc w:val="both"/>
+      </w:pPr>
+      <w:r>
+        <w:rPr>
+          <w:rFonts w:ascii="Georgia" w:cs="Georgia" w:eastAsia="Georgia" w:hAnsi="Georgia"/>
+          <w:sz w:val="21"/>
+          <w:szCs w:val="21"/>
+        </w:rPr>
+        <w:t xml:space="preserve">Otávio ergueu os olhos para ela. Não negou.</w:t>
+      </w:r>
+    </w:p>
+    <w:p>
+      <w:pPr>
+        <w:spacing w:after="0" w:line="312"/>
+        <w:ind w:firstLine="340"/>
+        <w:jc w:val="both"/>
+      </w:pPr>
+      <w:r>
+        <w:rPr>
+          <w:rFonts w:ascii="Georgia" w:cs="Georgia" w:eastAsia="Georgia" w:hAnsi="Georgia"/>
+          <w:sz w:val="21"/>
+          <w:szCs w:val="21"/>
+        </w:rPr>
+        <w:t xml:space="preserve">— O número é meu. Faz dois anos. — Ele falou devagar, como quem carrega um peso escada acima. — Não vou explicar o esquema para vocês. Vocês não precisam saber, e eu não vou dar a vocês o prazer de entender. O que importa é que o Henrique descobriu. Em agosto. E na segunda-feira ele me mandou aquela mensagem. Traga os originais. Eu quero encerrar isso.</w:t>
+      </w:r>
+    </w:p>
+    <w:p>
+      <w:pPr>
+        <w:spacing w:after="0" w:line="312"/>
+        <w:ind w:firstLine="340"/>
+        <w:jc w:val="both"/>
+      </w:pPr>
+      <w:r>
+        <w:rPr>
+          <w:rFonts w:ascii="Georgia" w:cs="Georgia" w:eastAsia="Georgia" w:hAnsi="Georgia"/>
+          <w:sz w:val="21"/>
+          <w:szCs w:val="21"/>
+        </w:rPr>
+        <w:t xml:space="preserve">— E você foi.</w:t>
+      </w:r>
+    </w:p>
+    <w:p>
+      <w:pPr>
+        <w:spacing w:after="0" w:line="312"/>
+        <w:ind w:firstLine="340"/>
+        <w:jc w:val="both"/>
+      </w:pPr>
+      <w:r>
+        <w:rPr>
+          <w:rFonts w:ascii="Georgia" w:cs="Georgia" w:eastAsia="Georgia" w:hAnsi="Georgia"/>
+          <w:sz w:val="21"/>
+          <w:szCs w:val="21"/>
+        </w:rPr>
+        <w:t xml:space="preserve">— Fui. Para buscar os originais que estavam com ele, não para levar os meus. Eu sabia a combinação do cofre do escritório de baixo. Sempre soube. Entrei pela garagem para não cruzar com ninguém na porta da frente.</w:t>
+      </w:r>
+    </w:p>
+    <w:p>
+      <w:pPr>
+        <w:spacing w:after="0" w:line="312"/>
+        <w:ind w:firstLine="340"/>
+        <w:jc w:val="both"/>
+      </w:pPr>
+      <w:r>
+        <w:rPr>
+          <w:rFonts w:ascii="Georgia" w:cs="Georgia" w:eastAsia="Georgia" w:hAnsi="Georgia"/>
+          <w:sz w:val="21"/>
+          <w:szCs w:val="21"/>
+        </w:rPr>
+        <w:t xml:space="preserve">— E matou ele — disse Lucas.</w:t>
+      </w:r>
+    </w:p>
+    <w:p>
+      <w:pPr>
+        <w:spacing w:after="0" w:line="312"/>
+        <w:ind w:firstLine="340"/>
+        <w:jc w:val="both"/>
+      </w:pPr>
+      <w:r>
+        <w:rPr>
+          <w:rFonts w:ascii="Georgia" w:cs="Georgia" w:eastAsia="Georgia" w:hAnsi="Georgia"/>
+          <w:sz w:val="21"/>
+          <w:szCs w:val="21"/>
+        </w:rPr>
+        <w:t xml:space="preserve">— Não. — Otávio bateu a mão aberta na mesa, uma vez só. — Não, Lucas. Eu roubei o teu pai durante dois anos, isso eu roubei. Mas eu não matei ninguém.</w:t>
+      </w:r>
+    </w:p>
+    <w:p>
+      <w:pPr>
+        <w:spacing w:after="200" w:before="200"/>
+        <w:jc w:val="center"/>
+      </w:pPr>
+      <w:r>
+        <w:rPr>
+          <w:rFonts w:ascii="Georgia" w:cs="Georgia" w:eastAsia="Georgia" w:hAnsi="Georgia"/>
+          <w:sz w:val="22"/>
+          <w:szCs w:val="22"/>
+        </w:rPr>
+        <w:t xml:space="preserve">*</w:t>
+      </w:r>
+    </w:p>
+    <w:p>
+      <w:pPr>
+        <w:spacing w:after="0" w:line="312"/>
+        <w:ind w:firstLine="340"/>
+        <w:jc w:val="both"/>
+      </w:pPr>
+      <w:r>
+        <w:rPr>
+          <w:rFonts w:ascii="Georgia" w:cs="Georgia" w:eastAsia="Georgia" w:hAnsi="Georgia"/>
+          <w:sz w:val="21"/>
+          <w:szCs w:val="21"/>
+        </w:rPr>
+        <w:t xml:space="preserve">Ninguém disse nada por um tempo. O ar-condicionado zumbia no teto.</w:t>
+      </w:r>
+    </w:p>
+    <w:p>
+      <w:pPr>
+        <w:spacing w:after="0" w:line="312"/>
+        <w:ind w:firstLine="340"/>
+        <w:jc w:val="both"/>
+      </w:pPr>
+      <w:r>
+        <w:rPr>
+          <w:rFonts w:ascii="Georgia" w:cs="Georgia" w:eastAsia="Georgia" w:hAnsi="Georgia"/>
+          <w:sz w:val="21"/>
+          <w:szCs w:val="21"/>
+        </w:rPr>
+        <w:t xml:space="preserve">— Quando eu entrei — continuou Otávio, mais baixo —, a casa estava em silêncio. Fui direto ao escritório de baixo, abri o cofre, peguei a pasta. Estava lá, a pasta inteira, com as minhas mensagens impressas e os extratos da Cumeeira grampeados. Ele tinha montado tudo. Era um homem de seguros. Documentava tudo. — Otávio riu sem graça. — Aí eu ouvi uma voz lá em cima.</w:t>
+      </w:r>
+    </w:p>
+    <w:p>
+      <w:pPr>
+        <w:spacing w:after="0" w:line="312"/>
+        <w:ind w:firstLine="340"/>
+        <w:jc w:val="both"/>
+      </w:pPr>
+      <w:r>
+        <w:rPr>
+          <w:rFonts w:ascii="Georgia" w:cs="Georgia" w:eastAsia="Georgia" w:hAnsi="Georgia"/>
+          <w:sz w:val="21"/>
+          <w:szCs w:val="21"/>
+        </w:rPr>
+        <w:t xml:space="preserve">— A voz do meu pai? — perguntou Lia.</w:t>
+      </w:r>
+    </w:p>
+    <w:p>
+      <w:pPr>
+        <w:spacing w:after="0" w:line="312"/>
+        <w:ind w:firstLine="340"/>
+        <w:jc w:val="both"/>
+      </w:pPr>
+      <w:r>
+        <w:rPr>
+          <w:rFonts w:ascii="Georgia" w:cs="Georgia" w:eastAsia="Georgia" w:hAnsi="Georgia"/>
+          <w:sz w:val="21"/>
+          <w:szCs w:val="21"/>
+        </w:rPr>
+        <w:t xml:space="preserve">— Não. Do Álvaro. Falando baixo. Parecia que estava rezando, ou falando sozinho. Eu não entendi as palavras. Vi o carro dele lá fora quando entrei, e achei que era uma consulta de rotina. Mas aquela voz… — Ele balançou a cabeça. — Me deu medo. Eu peguei a pasta e saí correndo. Nem fechei o portão. Só fui pensar nisso no meio da Avenida Europa.</w:t>
+      </w:r>
+    </w:p>
+    <w:p>
+      <w:pPr>
+        <w:spacing w:after="0" w:line="312"/>
+        <w:ind w:firstLine="340"/>
+        <w:jc w:val="both"/>
+      </w:pPr>
+      <w:r>
+        <w:rPr>
+          <w:rFonts w:ascii="Georgia" w:cs="Georgia" w:eastAsia="Georgia" w:hAnsi="Georgia"/>
+          <w:sz w:val="21"/>
+          <w:szCs w:val="21"/>
+        </w:rPr>
+        <w:t xml:space="preserve">— E depois?</w:t>
+      </w:r>
+    </w:p>
+    <w:p>
+      <w:pPr>
+        <w:spacing w:after="0" w:line="312"/>
+        <w:ind w:firstLine="340"/>
+        <w:jc w:val="both"/>
+      </w:pPr>
+      <w:r>
+        <w:rPr>
+          <w:rFonts w:ascii="Georgia" w:cs="Georgia" w:eastAsia="Georgia" w:hAnsi="Georgia"/>
+          <w:sz w:val="21"/>
+          <w:szCs w:val="21"/>
+        </w:rPr>
+        <w:t xml:space="preserve">— Depois o Álvaro me ligou, às oito e meia, dizendo que o Henrique tinha morrido. Infarto. Que ele tinha chegado cedo para a consulta e encontrado o Henrique caído no quarto. — Otávio olhou para Lucas. — Eu acreditei. Por que não acreditaria? Ele tinha pressão alta, andava nervoso, não dormia. Eu acreditei, e senti alívio. Que Deus me perdoe, mas senti. Os originais estavam no meu carro, e o único homem que sabia o que eles provavam estava morto.</w:t>
+      </w:r>
+    </w:p>
+    <w:p>
+      <w:pPr>
+        <w:spacing w:after="0" w:line="312"/>
+        <w:ind w:firstLine="340"/>
+        <w:jc w:val="both"/>
+      </w:pPr>
+      <w:r>
+        <w:rPr>
+          <w:rFonts w:ascii="Georgia" w:cs="Georgia" w:eastAsia="Georgia" w:hAnsi="Georgia"/>
+          <w:sz w:val="21"/>
+          <w:szCs w:val="21"/>
+        </w:rPr>
+        <w:t xml:space="preserve">— E você pediu a cremação.</w:t>
+      </w:r>
+    </w:p>
+    <w:p>
+      <w:pPr>
+        <w:spacing w:after="0" w:line="312"/>
+        <w:ind w:firstLine="340"/>
+        <w:jc w:val="both"/>
+      </w:pPr>
+      <w:r>
+        <w:rPr>
+          <w:rFonts w:ascii="Georgia" w:cs="Georgia" w:eastAsia="Georgia" w:hAnsi="Georgia"/>
+          <w:sz w:val="21"/>
+          <w:szCs w:val="21"/>
+        </w:rPr>
+        <w:t xml:space="preserve">— Pedi. — Otávio não desviou o olhar. — Pedi porque com um homem como o Henrique nunca se sabe. Todo mundo dizia que ele era imorrível. Eu queria ter certeza.</w:t>
+      </w:r>
+    </w:p>
+    <w:p>
+      <w:pPr>
+        <w:spacing w:after="200" w:before="200"/>
+        <w:jc w:val="center"/>
+      </w:pPr>
+      <w:r>
+        <w:rPr>
+          <w:rFonts w:ascii="Georgia" w:cs="Georgia" w:eastAsia="Georgia" w:hAnsi="Georgia"/>
+          <w:sz w:val="22"/>
+          <w:szCs w:val="22"/>
+        </w:rPr>
+        <w:t xml:space="preserve">*</w:t>
+      </w:r>
+    </w:p>
+    <w:p>
+      <w:pPr>
+        <w:spacing w:after="0" w:line="312"/>
+        <w:ind w:firstLine="340"/>
+        <w:jc w:val="both"/>
+      </w:pPr>
+      <w:r>
+        <w:rPr>
+          <w:rFonts w:ascii="Georgia" w:cs="Georgia" w:eastAsia="Georgia" w:hAnsi="Georgia"/>
+          <w:sz w:val="21"/>
+          <w:szCs w:val="21"/>
+        </w:rPr>
+        <w:t xml:space="preserve">Lia se inclinou para a frente.</w:t>
+      </w:r>
+    </w:p>
+    <w:p>
+      <w:pPr>
+        <w:spacing w:after="0" w:line="312"/>
+        <w:ind w:firstLine="340"/>
+        <w:jc w:val="both"/>
+      </w:pPr>
+      <w:r>
+        <w:rPr>
+          <w:rFonts w:ascii="Georgia" w:cs="Georgia" w:eastAsia="Georgia" w:hAnsi="Georgia"/>
+          <w:sz w:val="21"/>
+          <w:szCs w:val="21"/>
+        </w:rPr>
+        <w:t xml:space="preserve">— Os originais. Onde estão?</w:t>
+      </w:r>
+    </w:p>
+    <w:p>
+      <w:pPr>
+        <w:spacing w:after="0" w:line="312"/>
+        <w:ind w:firstLine="340"/>
+        <w:jc w:val="both"/>
+      </w:pPr>
+      <w:r>
+        <w:rPr>
+          <w:rFonts w:ascii="Georgia" w:cs="Georgia" w:eastAsia="Georgia" w:hAnsi="Georgia"/>
+          <w:sz w:val="21"/>
+          <w:szCs w:val="21"/>
+        </w:rPr>
+        <w:t xml:space="preserve">— Queimei. Na mesma tarde, na churrasqueira de casa.</w:t>
+      </w:r>
+    </w:p>
+    <w:p>
+      <w:pPr>
+        <w:spacing w:after="0" w:line="312"/>
+        <w:ind w:firstLine="340"/>
+        <w:jc w:val="both"/>
+      </w:pPr>
+      <w:r>
+        <w:rPr>
+          <w:rFonts w:ascii="Georgia" w:cs="Georgia" w:eastAsia="Georgia" w:hAnsi="Georgia"/>
+          <w:sz w:val="21"/>
+          <w:szCs w:val="21"/>
+        </w:rPr>
+        <w:t xml:space="preserve">— Então você não tem como provar nada do que está dizendo.</w:t>
+      </w:r>
+    </w:p>
+    <w:p>
+      <w:pPr>
+        <w:spacing w:after="0" w:line="312"/>
+        <w:ind w:firstLine="340"/>
+        <w:jc w:val="both"/>
+      </w:pPr>
+      <w:r>
+        <w:rPr>
+          <w:rFonts w:ascii="Georgia" w:cs="Georgia" w:eastAsia="Georgia" w:hAnsi="Georgia"/>
+          <w:sz w:val="21"/>
+          <w:szCs w:val="21"/>
+        </w:rPr>
+        <w:t xml:space="preserve">— Tenho uma coisa. — Otávio abriu a gaveta, tirou um papel dobrado e o empurrou na direção dos dois. — Isto estava em cima da pasta, no cofre. Não sei por quê. Não queimei. Não tive coragem.</w:t>
+      </w:r>
+    </w:p>
+    <w:p>
+      <w:pPr>
+        <w:spacing w:after="0" w:line="312"/>
+        <w:ind w:firstLine="340"/>
+        <w:jc w:val="both"/>
+      </w:pPr>
+      <w:r>
+        <w:rPr>
+          <w:rFonts w:ascii="Georgia" w:cs="Georgia" w:eastAsia="Georgia" w:hAnsi="Georgia"/>
+          <w:sz w:val="21"/>
+          <w:szCs w:val="21"/>
+        </w:rPr>
+        <w:t xml:space="preserve">Lucas desdobrou o papel. Era uma folha de bloco da corretora, com a letra inclinada do pai.</w:t>
+      </w:r>
+    </w:p>
+    <w:p>
+      <w:pPr>
+        <w:spacing w:after="0" w:line="312"/>
+        <w:ind w:firstLine="340"/>
+        <w:jc w:val="both"/>
+      </w:pPr>
+      <w:r>
+        <w:rPr>
+          <w:rFonts w:ascii="Georgia" w:cs="Georgia" w:eastAsia="Georgia" w:hAnsi="Georgia"/>
+          <w:sz w:val="21"/>
+          <w:szCs w:val="21"/>
+        </w:rPr>
+        <w:t xml:space="preserve">Otávio. Se você está lendo isto, é porque veio buscar o que é seu. Pode levar. Eu não vou estar aqui para cobrar. Mas fica longe do meu filho. H.</w:t>
+      </w:r>
+    </w:p>
+    <w:p>
+      <w:pPr>
+        <w:spacing w:after="0" w:line="312"/>
+        <w:ind w:firstLine="340"/>
+        <w:jc w:val="both"/>
+      </w:pPr>
+      <w:r>
+        <w:rPr>
+          <w:rFonts w:ascii="Georgia" w:cs="Georgia" w:eastAsia="Georgia" w:hAnsi="Georgia"/>
+          <w:sz w:val="21"/>
+          <w:szCs w:val="21"/>
+        </w:rPr>
+        <w:t xml:space="preserve">Lucas leu duas vezes. A mão começou a tremer, e ele pôs o papel sobre a mesa para que ninguém visse.</w:t>
+      </w:r>
+    </w:p>
+    <w:p>
+      <w:pPr>
+        <w:spacing w:after="0" w:line="312"/>
+        <w:ind w:firstLine="340"/>
+        <w:jc w:val="both"/>
+      </w:pPr>
+      <w:r>
+        <w:rPr>
+          <w:rFonts w:ascii="Georgia" w:cs="Georgia" w:eastAsia="Georgia" w:hAnsi="Georgia"/>
+          <w:sz w:val="21"/>
+          <w:szCs w:val="21"/>
+        </w:rPr>
+        <w:t xml:space="preserve">— Eu não vou estar aqui para cobrar — repetiu Lia, baixinho.</w:t>
+      </w:r>
+    </w:p>
+    <w:p>
+      <w:pPr>
+        <w:spacing w:after="0" w:line="312"/>
+        <w:ind w:firstLine="340"/>
+        <w:jc w:val="both"/>
+      </w:pPr>
+      <w:r>
+        <w:rPr>
+          <w:rFonts w:ascii="Georgia" w:cs="Georgia" w:eastAsia="Georgia" w:hAnsi="Georgia"/>
+          <w:sz w:val="21"/>
+          <w:szCs w:val="21"/>
+        </w:rPr>
+        <w:t xml:space="preserve">— Na hora eu achei que ele estava falando da denúncia — disse Otávio. — Que ia me entregar à polícia e não queria me ver. Depois, quando soube que ele tinha morrido, achei que ele sabia que ia morrer. Que estava doente e não contou a ninguém. — Ele recostou na cadeira. — Na sexta anterior, ele me perguntou quanto tempo a empresa aguentava sem ele. Eu achei que era o medo das ameaças falando.</w:t>
+      </w:r>
+    </w:p>
+    <w:p>
+      <w:pPr>
+        <w:spacing w:after="200" w:before="200"/>
+        <w:jc w:val="center"/>
+      </w:pPr>
+      <w:r>
+        <w:rPr>
+          <w:rFonts w:ascii="Georgia" w:cs="Georgia" w:eastAsia="Georgia" w:hAnsi="Georgia"/>
+          <w:sz w:val="22"/>
+          <w:szCs w:val="22"/>
+        </w:rPr>
+        <w:t xml:space="preserve">*</w:t>
+      </w:r>
+    </w:p>
+    <w:p>
+      <w:pPr>
+        <w:spacing w:after="0" w:line="312"/>
+        <w:ind w:firstLine="340"/>
+        <w:jc w:val="both"/>
+      </w:pPr>
+      <w:r>
+        <w:rPr>
+          <w:rFonts w:ascii="Georgia" w:cs="Georgia" w:eastAsia="Georgia" w:hAnsi="Georgia"/>
+          <w:sz w:val="21"/>
+          <w:szCs w:val="21"/>
+        </w:rPr>
+        <w:t xml:space="preserve">Saíram da corretora às nove da noite. No elevador, nenhum dos dois falou. Na garagem, Lia encostou no carro dela e cruzou os braços.</w:t>
+      </w:r>
+    </w:p>
+    <w:p>
+      <w:pPr>
+        <w:spacing w:after="0" w:line="312"/>
+        <w:ind w:firstLine="340"/>
+        <w:jc w:val="both"/>
+      </w:pPr>
+      <w:r>
+        <w:rPr>
+          <w:rFonts w:ascii="Georgia" w:cs="Georgia" w:eastAsia="Georgia" w:hAnsi="Georgia"/>
+          <w:sz w:val="21"/>
+          <w:szCs w:val="21"/>
+        </w:rPr>
+        <w:t xml:space="preserve">— Ele não matou o pai — disse.</w:t>
+      </w:r>
+    </w:p>
+    <w:p>
+      <w:pPr>
+        <w:spacing w:after="0" w:line="312"/>
+        <w:ind w:firstLine="340"/>
+        <w:jc w:val="both"/>
+      </w:pPr>
+      <w:r>
+        <w:rPr>
+          <w:rFonts w:ascii="Georgia" w:cs="Georgia" w:eastAsia="Georgia" w:hAnsi="Georgia"/>
+          <w:sz w:val="21"/>
+          <w:szCs w:val="21"/>
+        </w:rPr>
+        <w:t xml:space="preserve">— Você acredita nele?</w:t>
+      </w:r>
+    </w:p>
+    <w:p>
+      <w:pPr>
+        <w:spacing w:after="0" w:line="312"/>
+        <w:ind w:firstLine="340"/>
+        <w:jc w:val="both"/>
+      </w:pPr>
+      <w:r>
+        <w:rPr>
+          <w:rFonts w:ascii="Georgia" w:cs="Georgia" w:eastAsia="Georgia" w:hAnsi="Georgia"/>
+          <w:sz w:val="21"/>
+          <w:szCs w:val="21"/>
+        </w:rPr>
+        <w:t xml:space="preserve">— Não acredito em nada que ele diz. Mas pensa comigo. O Otávio ficou vinte e três minutos naquela casa. O doutor Álvaro estava lá em cima desde as sete e cinco. Se o Otávio tivesse subido e feito alguma coisa com o pai, o doutor teria visto. Teria ouvido. Teria contado à polícia.</w:t>
+      </w:r>
+    </w:p>
+    <w:p>
+      <w:pPr>
+        <w:spacing w:after="0" w:line="312"/>
+        <w:ind w:firstLine="340"/>
+        <w:jc w:val="both"/>
+      </w:pPr>
+      <w:r>
+        <w:rPr>
+          <w:rFonts w:ascii="Georgia" w:cs="Georgia" w:eastAsia="Georgia" w:hAnsi="Georgia"/>
+          <w:sz w:val="21"/>
+          <w:szCs w:val="21"/>
+        </w:rPr>
+        <w:t xml:space="preserve">Lucas pensou um pouco.</w:t>
+      </w:r>
+    </w:p>
+    <w:p>
+      <w:pPr>
+        <w:spacing w:after="0" w:line="312"/>
+        <w:ind w:firstLine="340"/>
+        <w:jc w:val="both"/>
+      </w:pPr>
+      <w:r>
+        <w:rPr>
+          <w:rFonts w:ascii="Georgia" w:cs="Georgia" w:eastAsia="Georgia" w:hAnsi="Georgia"/>
+          <w:sz w:val="21"/>
+          <w:szCs w:val="21"/>
+        </w:rPr>
+        <w:t xml:space="preserve">— A não ser que o doutor esteja mentindo.</w:t>
+      </w:r>
+    </w:p>
+    <w:p>
+      <w:pPr>
+        <w:spacing w:after="0" w:line="312"/>
+        <w:ind w:firstLine="340"/>
+        <w:jc w:val="both"/>
+      </w:pPr>
+      <w:r>
+        <w:rPr>
+          <w:rFonts w:ascii="Georgia" w:cs="Georgia" w:eastAsia="Georgia" w:hAnsi="Georgia"/>
+          <w:sz w:val="21"/>
+          <w:szCs w:val="21"/>
+        </w:rPr>
+        <w:t xml:space="preserve">Lia o olhou como se ele tivesse dito um palavrão.</w:t>
+      </w:r>
+    </w:p>
+    <w:p>
+      <w:pPr>
+        <w:spacing w:after="0" w:line="312"/>
+        <w:ind w:firstLine="340"/>
+        <w:jc w:val="both"/>
+      </w:pPr>
+      <w:r>
+        <w:rPr>
+          <w:rFonts w:ascii="Georgia" w:cs="Georgia" w:eastAsia="Georgia" w:hAnsi="Georgia"/>
+          <w:sz w:val="21"/>
+          <w:szCs w:val="21"/>
+        </w:rPr>
+        <w:t xml:space="preserve">— O doutor Álvaro, Lucas? Ele cuidou de você quando você teve catapora. Ele chorou mais do que todo mundo no crematório.</w:t>
+      </w:r>
+    </w:p>
+    <w:p>
+      <w:pPr>
+        <w:spacing w:after="0" w:line="312"/>
+        <w:ind w:firstLine="340"/>
+        <w:jc w:val="both"/>
+      </w:pPr>
+      <w:r>
+        <w:rPr>
+          <w:rFonts w:ascii="Georgia" w:cs="Georgia" w:eastAsia="Georgia" w:hAnsi="Georgia"/>
+          <w:sz w:val="21"/>
+          <w:szCs w:val="21"/>
+        </w:rPr>
+        <w:t xml:space="preserve">— Eu sei. — Lucas passou a mão pelo rosto. — Eu sei. Esquece.</w:t>
+      </w:r>
+    </w:p>
+    <w:p>
+      <w:pPr>
+        <w:spacing w:after="0" w:line="312"/>
+        <w:ind w:firstLine="340"/>
+        <w:jc w:val="both"/>
+      </w:pPr>
+      <w:r>
+        <w:rPr>
+          <w:rFonts w:ascii="Georgia" w:cs="Georgia" w:eastAsia="Georgia" w:hAnsi="Georgia"/>
+          <w:sz w:val="21"/>
+          <w:szCs w:val="21"/>
+        </w:rPr>
+        <w:t xml:space="preserve">Mas não esqueceu. Em casa, sozinho, abriu o BlackBerry do pai no registro de chamadas daquela terça-feira. Às 7h02, uma ligação do pai para o doutor Álvaro, quarenta e sete segundos. Às 7h40, uma chamada do doutor Álvaro para o pai, não atendida.</w:t>
+      </w:r>
+    </w:p>
+    <w:p>
+      <w:pPr>
+        <w:spacing w:after="0" w:line="312"/>
+        <w:ind w:firstLine="340"/>
+        <w:jc w:val="both"/>
+      </w:pPr>
+      <w:r>
+        <w:rPr>
+          <w:rFonts w:ascii="Georgia" w:cs="Georgia" w:eastAsia="Georgia" w:hAnsi="Georgia"/>
+          <w:sz w:val="21"/>
+          <w:szCs w:val="21"/>
+        </w:rPr>
+        <w:t xml:space="preserve">Às sete e quarenta, segundo o caderno de seu Ivo, o doutor Álvaro estava dentro da casa havia mais de meia hora.</w:t>
+      </w:r>
+    </w:p>
+    <w:p>
+      <w:pPr>
+        <w:pBdr>
+          <w:top w:val="single" w:color="555555" w:sz="6" w:space="6"/>
+          <w:bottom w:val="single" w:color="555555" w:sz="6" w:space="6"/>
+          <w:left w:val="single" w:color="555555" w:sz="6" w:space="6"/>
+          <w:right w:val="single" w:color="555555" w:sz="6" w:space="6"/>
+        </w:pBdr>
+        <w:shd w:fill="EFEFEF" w:color="auto" w:val="clear"/>
+        <w:spacing w:after="0" w:before="240"/>
+        <w:ind w:left="227" w:right="227"/>
+        <w:jc w:val="center"/>
+      </w:pPr>
+      <w:r>
+        <w:rPr>
+          <w:rFonts w:ascii="Georgia" w:cs="Georgia" w:eastAsia="Georgia" w:hAnsi="Georgia"/>
+          <w:b/>
+          <w:bCs/>
+          <w:spacing w:val="30"/>
+          <w:sz w:val="17"/>
+          <w:szCs w:val="17"/>
+        </w:rPr>
+        <w:t xml:space="preserve">NO CELULAR DE HENRIQUE</w:t>
+      </w:r>
+    </w:p>
+    <w:p>
+      <w:pPr>
+        <w:pBdr>
+          <w:top w:val="single" w:color="555555" w:sz="6" w:space="6"/>
+          <w:bottom w:val="single" w:color="555555" w:sz="6" w:space="6"/>
+          <w:left w:val="single" w:color="555555" w:sz="6" w:space="6"/>
+          <w:right w:val="single" w:color="555555" w:sz="6" w:space="6"/>
+        </w:pBdr>
+        <w:shd w:fill="EFEFEF" w:color="auto" w:val="clear"/>
+        <w:spacing w:after="240" w:before="0" w:line="288"/>
+        <w:ind w:left="227" w:right="227"/>
+        <w:jc w:val="center"/>
+      </w:pPr>
+      <w:r>
+        <w:rPr>
+          <w:rFonts w:ascii="Georgia" w:cs="Georgia" w:eastAsia="Georgia" w:hAnsi="Georgia"/>
+          <w:i/>
+          <w:iCs/>
+          <w:sz w:val="19"/>
+          <w:szCs w:val="19"/>
+        </w:rPr>
+        <w:t xml:space="preserve">Abra o registro de chamadas do celular de Henrique e confira os horários daquela terça-feira. Depois compare com o caderno de seu Ivo.</w:t>
+      </w:r>
+    </w:p>
+    <w:p>
+      <w:pPr>
+        <w:spacing w:after="0" w:line="312"/>
+        <w:ind w:firstLine="340"/>
+        <w:jc w:val="both"/>
+      </w:pPr>
+      <w:r>
+        <w:rPr>
+          <w:rFonts w:ascii="Georgia" w:cs="Georgia" w:eastAsia="Georgia" w:hAnsi="Georgia"/>
+          <w:sz w:val="21"/>
+          <w:szCs w:val="21"/>
+        </w:rPr>
+        <w:t xml:space="preserve">Por que um homem ligaria para o celular de alguém que está no andar de cima da mesma casa?</w:t>
+      </w:r>
+    </w:p>
+    <w:p>
+      <w:pPr>
+        <w:spacing w:after="0" w:line="312"/>
+        <w:ind w:firstLine="340"/>
+        <w:jc w:val="both"/>
+      </w:pPr>
+      <w:r>
+        <w:rPr>
+          <w:rFonts w:ascii="Georgia" w:cs="Georgia" w:eastAsia="Georgia" w:hAnsi="Georgia"/>
+          <w:sz w:val="21"/>
+          <w:szCs w:val="21"/>
+        </w:rPr>
+        <w:t xml:space="preserve">Lucas ficou olhando para a pergunta até a tela do BlackBerry se apagar sozinha. Não encontrou resposta. Guardou o aparelho na gaveta, junto com o bilhete do pai que Otávio tinha devolvido.</w:t>
+      </w:r>
+    </w:p>
+    <w:p>
+      <w:pPr>
+        <w:spacing w:after="0" w:line="312"/>
+        <w:ind w:firstLine="340"/>
+        <w:jc w:val="both"/>
+      </w:pPr>
+      <w:r>
+        <w:rPr>
+          <w:rFonts w:ascii="Georgia" w:cs="Georgia" w:eastAsia="Georgia" w:hAnsi="Georgia"/>
+          <w:sz w:val="21"/>
+          <w:szCs w:val="21"/>
+        </w:rPr>
+        <w:t xml:space="preserve">Eu não vou estar aqui para cobrar.</w:t>
+      </w:r>
+    </w:p>
+    <w:p>
+      <w:pPr>
+        <w:spacing w:after="0" w:line="312"/>
+        <w:ind w:firstLine="340"/>
+        <w:jc w:val="both"/>
+      </w:pPr>
+      <w:r>
+        <w:rPr>
+          <w:rFonts w:ascii="Georgia" w:cs="Georgia" w:eastAsia="Georgia" w:hAnsi="Georgia"/>
+          <w:sz w:val="21"/>
+          <w:szCs w:val="21"/>
+        </w:rPr>
+        <w:t xml:space="preserve">Naquela noite, pela primeira vez, sonhou com o pai. Ele estava de pé no meio do salão do crematório, sobre a plataforma, vivo, olhando para o alto, esperando alguém que não chegava.</w:t>
       </w:r>
     </w:p>
     <w:sectPr>

</xml_diff>

<commit_message>
Livro policial: capítulo 15 (A estrada)
Co-Authored-By: Claude Opus 5.5 <noreply@anthropic.com>
Claude-Session: https://claude.ai/code/session_01BrurxSYygRC3rRhaUYosm1
</commit_message>
<xml_diff>
--- a/docs/livro-policial/TODO_CRIME_TEM_UM_AUTOR.docx
+++ b/docs/livro-policial/TODO_CRIME_TEM_UM_AUTOR.docx
@@ -14943,6 +14943,1057 @@
           <w:szCs w:val="21"/>
         </w:rPr>
         <w:t xml:space="preserve">Naquela noite, pela primeira vez, sonhou com o pai. Ele estava de pé no meio do salão do crematório, sobre a plataforma, vivo, olhando para o alto, esperando alguém que não chegava.</w:t>
+      </w:r>
+    </w:p>
+    <w:p>
+      <w:pPr>
+        <w:pageBreakBefore/>
+        <w:spacing w:after="120" w:before="1800"/>
+        <w:jc w:val="center"/>
+      </w:pPr>
+      <w:r>
+        <w:rPr>
+          <w:rFonts w:ascii="Georgia" w:cs="Georgia" w:eastAsia="Georgia" w:hAnsi="Georgia"/>
+          <w:spacing w:val="40"/>
+          <w:sz w:val="20"/>
+          <w:szCs w:val="20"/>
+        </w:rPr>
+        <w:t xml:space="preserve">CAPÍTULO 15</w:t>
+      </w:r>
+    </w:p>
+    <w:p>
+      <w:pPr>
+        <w:spacing w:after="720"/>
+        <w:jc w:val="center"/>
+      </w:pPr>
+      <w:r>
+        <w:rPr>
+          <w:rFonts w:ascii="Georgia" w:cs="Georgia" w:eastAsia="Georgia" w:hAnsi="Georgia"/>
+          <w:b/>
+          <w:bCs/>
+          <w:sz w:val="32"/>
+          <w:szCs w:val="32"/>
+        </w:rPr>
+        <w:t xml:space="preserve">A estrada</w:t>
+      </w:r>
+    </w:p>
+    <w:p>
+      <w:pPr>
+        <w:spacing w:after="0" w:line="312"/>
+        <w:ind w:firstLine="340"/>
+        <w:jc w:val="both"/>
+      </w:pPr>
+      <w:r>
+        <w:rPr>
+          <w:rFonts w:ascii="Georgia" w:cs="Georgia" w:eastAsia="Georgia" w:hAnsi="Georgia"/>
+          <w:sz w:val="21"/>
+          <w:szCs w:val="21"/>
+        </w:rPr>
+        <w:t xml:space="preserve">Setembro.</w:t>
+      </w:r>
+    </w:p>
+    <w:p>
+      <w:pPr>
+        <w:spacing w:after="0" w:line="312"/>
+        <w:ind w:firstLine="340"/>
+        <w:jc w:val="both"/>
+      </w:pPr>
+      <w:r>
+        <w:rPr>
+          <w:rFonts w:ascii="Georgia" w:cs="Georgia" w:eastAsia="Georgia" w:hAnsi="Georgia"/>
+          <w:sz w:val="21"/>
+          <w:szCs w:val="21"/>
+        </w:rPr>
+        <w:t xml:space="preserve">Do alto do morro, o loteamento ainda era só terra vermelha, estacas com fitas coloridas e um estande de vendas de vidro e alumínio que brilhava no sol como um aquário vazio. Mas, na maquete que ocupava o centro do estande, já estava tudo pronto: duas mil casas, seis torres de escritórios, um shopping com cinema, um lago artificial com pedalinhos em forma de cisne. Tinha até árvores, pequenas, de espuma verde, plantadas em fila ao longo de avenidas que ainda não existiam.</w:t>
+      </w:r>
+    </w:p>
+    <w:p>
+      <w:pPr>
+        <w:spacing w:after="0" w:line="312"/>
+        <w:ind w:firstLine="340"/>
+        <w:jc w:val="both"/>
+      </w:pPr>
+      <w:r>
+        <w:rPr>
+          <w:rFonts w:ascii="Georgia" w:cs="Georgia" w:eastAsia="Georgia" w:hAnsi="Georgia"/>
+          <w:sz w:val="21"/>
+          <w:szCs w:val="21"/>
+        </w:rPr>
+        <w:t xml:space="preserve">— Vinte anos que eu não vejo um negócio desse tamanho na região — disse o diretor da incorporadora, apertando a mão de Henrique com as duas mãos. — E vinte anos que eu não vejo uma apólice desse tamanho também.</w:t>
+      </w:r>
+    </w:p>
+    <w:p>
+      <w:pPr>
+        <w:spacing w:after="0" w:line="312"/>
+        <w:ind w:firstLine="340"/>
+        <w:jc w:val="both"/>
+      </w:pPr>
+      <w:r>
+        <w:rPr>
+          <w:rFonts w:ascii="Georgia" w:cs="Georgia" w:eastAsia="Georgia" w:hAnsi="Georgia"/>
+          <w:sz w:val="21"/>
+          <w:szCs w:val="21"/>
+        </w:rPr>
+        <w:t xml:space="preserve">— Ela ainda não está assinada — respondeu Henrique.</w:t>
+      </w:r>
+    </w:p>
+    <w:p>
+      <w:pPr>
+        <w:spacing w:after="0" w:line="312"/>
+        <w:ind w:firstLine="340"/>
+        <w:jc w:val="both"/>
+      </w:pPr>
+      <w:r>
+        <w:rPr>
+          <w:rFonts w:ascii="Georgia" w:cs="Georgia" w:eastAsia="Georgia" w:hAnsi="Georgia"/>
+          <w:sz w:val="21"/>
+          <w:szCs w:val="21"/>
+        </w:rPr>
+        <w:t xml:space="preserve">— Mas vai estar. Hoje.</w:t>
+      </w:r>
+    </w:p>
+    <w:p>
+      <w:pPr>
+        <w:spacing w:after="0" w:line="312"/>
+        <w:ind w:firstLine="340"/>
+        <w:jc w:val="both"/>
+      </w:pPr>
+      <w:r>
+        <w:rPr>
+          <w:rFonts w:ascii="Georgia" w:cs="Georgia" w:eastAsia="Georgia" w:hAnsi="Georgia"/>
+          <w:sz w:val="21"/>
+          <w:szCs w:val="21"/>
+        </w:rPr>
+        <w:t xml:space="preserve">Henrique sorriu, porque era o que se esperava dele. Fazia dois meses que sorria por obrigação. Desde a manhã em que a delegada Regina Paiva lhe mostrara, no saguão de um hotel da Paulista, a foto de um homem de terno fechando a porta de um quarto.</w:t>
+      </w:r>
+    </w:p>
+    <w:p>
+      <w:pPr>
+        <w:spacing w:after="200" w:before="200"/>
+        <w:jc w:val="center"/>
+      </w:pPr>
+      <w:r>
+        <w:rPr>
+          <w:rFonts w:ascii="Georgia" w:cs="Georgia" w:eastAsia="Georgia" w:hAnsi="Georgia"/>
+          <w:sz w:val="22"/>
+          <w:szCs w:val="22"/>
+        </w:rPr>
+        <w:t xml:space="preserve">*</w:t>
+      </w:r>
+    </w:p>
+    <w:p>
+      <w:pPr>
+        <w:spacing w:after="0" w:line="312"/>
+        <w:ind w:firstLine="340"/>
+        <w:jc w:val="both"/>
+      </w:pPr>
+      <w:r>
+        <w:rPr>
+          <w:rFonts w:ascii="Georgia" w:cs="Georgia" w:eastAsia="Georgia" w:hAnsi="Georgia"/>
+          <w:sz w:val="21"/>
+          <w:szCs w:val="21"/>
+        </w:rPr>
+        <w:t xml:space="preserve">Tinham saído de São Paulo às nove da manhã. Nestor dirigindo, como sempre, com o rádio baixo numa estação de música sertaneja que Henrique fingia não ouvir. No banco de trás, ao lado dele, Renato Sales, o braço direito de Otávio, com uma pasta de couro no colo e o celular na mão.</w:t>
+      </w:r>
+    </w:p>
+    <w:p>
+      <w:pPr>
+        <w:spacing w:after="0" w:line="312"/>
+        <w:ind w:firstLine="340"/>
+        <w:jc w:val="both"/>
+      </w:pPr>
+      <w:r>
+        <w:rPr>
+          <w:rFonts w:ascii="Georgia" w:cs="Georgia" w:eastAsia="Georgia" w:hAnsi="Georgia"/>
+          <w:sz w:val="21"/>
+          <w:szCs w:val="21"/>
+        </w:rPr>
+        <w:t xml:space="preserve">Renato tinha trinta e poucos anos, gravata estreita e a eficiência silenciosa de quem nunca esquece um prazo. Otávio insistira para que ele fosse. O menino conhece o contrato de cor, Henrique. Vai que o pessoal da incorporadora pergunta uma vírgula. Henrique aceitou sem discutir. Desde agosto, aceitava muitas coisas sem discutir, porque discutir era dar sinal de que sabia demais.</w:t>
+      </w:r>
+    </w:p>
+    <w:p>
+      <w:pPr>
+        <w:spacing w:after="0" w:line="312"/>
+        <w:ind w:firstLine="340"/>
+        <w:jc w:val="both"/>
+      </w:pPr>
+      <w:r>
+        <w:rPr>
+          <w:rFonts w:ascii="Georgia" w:cs="Georgia" w:eastAsia="Georgia" w:hAnsi="Georgia"/>
+          <w:sz w:val="21"/>
+          <w:szCs w:val="21"/>
+        </w:rPr>
+        <w:t xml:space="preserve">E Henrique desconfiava de Renato. Não tinha prova, só a intuição de vinte anos de mercado. Duas vezes naquele ano, uma proposta da corretora tinha chegado à concorrência antes de chegar ao cliente. Nas duas vezes, Renato estava na sala quando a proposta foi discutida. Nas duas vezes, ele estava com o celular na mão, como agora, digitando com o polegar.</w:t>
+      </w:r>
+    </w:p>
+    <w:p>
+      <w:pPr>
+        <w:spacing w:after="0" w:line="312"/>
+        <w:ind w:firstLine="340"/>
+        <w:jc w:val="both"/>
+      </w:pPr>
+      <w:r>
+        <w:rPr>
+          <w:rFonts w:ascii="Georgia" w:cs="Georgia" w:eastAsia="Georgia" w:hAnsi="Georgia"/>
+          <w:sz w:val="21"/>
+          <w:szCs w:val="21"/>
+        </w:rPr>
+        <w:t xml:space="preserve">— Muito trabalho? — perguntou Henrique.</w:t>
+      </w:r>
+    </w:p>
+    <w:p>
+      <w:pPr>
+        <w:spacing w:after="0" w:line="312"/>
+        <w:ind w:firstLine="340"/>
+        <w:jc w:val="both"/>
+      </w:pPr>
+      <w:r>
+        <w:rPr>
+          <w:rFonts w:ascii="Georgia" w:cs="Georgia" w:eastAsia="Georgia" w:hAnsi="Georgia"/>
+          <w:sz w:val="21"/>
+          <w:szCs w:val="21"/>
+        </w:rPr>
+        <w:t xml:space="preserve">— O de sempre, doutor. — Renato guardou o celular no bolso. — O seu Otávio pediu para eu ir mandando notícias.</w:t>
+      </w:r>
+    </w:p>
+    <w:p>
+      <w:pPr>
+        <w:spacing w:after="0" w:line="312"/>
+        <w:ind w:firstLine="340"/>
+        <w:jc w:val="both"/>
+      </w:pPr>
+      <w:r>
+        <w:rPr>
+          <w:rFonts w:ascii="Georgia" w:cs="Georgia" w:eastAsia="Georgia" w:hAnsi="Georgia"/>
+          <w:sz w:val="21"/>
+          <w:szCs w:val="21"/>
+        </w:rPr>
+        <w:t xml:space="preserve">— Manda dizer a ele que ainda estamos vivos.</w:t>
+      </w:r>
+    </w:p>
+    <w:p>
+      <w:pPr>
+        <w:spacing w:after="0" w:line="312"/>
+        <w:ind w:firstLine="340"/>
+        <w:jc w:val="both"/>
+      </w:pPr>
+      <w:r>
+        <w:rPr>
+          <w:rFonts w:ascii="Georgia" w:cs="Georgia" w:eastAsia="Georgia" w:hAnsi="Georgia"/>
+          <w:sz w:val="21"/>
+          <w:szCs w:val="21"/>
+        </w:rPr>
+        <w:t xml:space="preserve">Renato riu, um pouco tarde demais.</w:t>
+      </w:r>
+    </w:p>
+    <w:p>
+      <w:pPr>
+        <w:spacing w:after="200" w:before="200"/>
+        <w:jc w:val="center"/>
+      </w:pPr>
+      <w:r>
+        <w:rPr>
+          <w:rFonts w:ascii="Georgia" w:cs="Georgia" w:eastAsia="Georgia" w:hAnsi="Georgia"/>
+          <w:sz w:val="22"/>
+          <w:szCs w:val="22"/>
+        </w:rPr>
+        <w:t xml:space="preserve">*</w:t>
+      </w:r>
+    </w:p>
+    <w:p>
+      <w:pPr>
+        <w:spacing w:after="0" w:line="312"/>
+        <w:ind w:firstLine="340"/>
+        <w:jc w:val="both"/>
+      </w:pPr>
+      <w:r>
+        <w:rPr>
+          <w:rFonts w:ascii="Georgia" w:cs="Georgia" w:eastAsia="Georgia" w:hAnsi="Georgia"/>
+          <w:sz w:val="21"/>
+          <w:szCs w:val="21"/>
+        </w:rPr>
+        <w:t xml:space="preserve">A reunião começou às onze, numa sala de reuniões improvisada nos fundos do estande, com ar-condicionado barulhento e garrafas de água mineral que ninguém abria. Do outro lado da mesa, o diretor da incorporadora, dois advogados, um engenheiro da prefeitura. E, chegando atrasado, de terno azul e gravata vermelha, cumprimentando todos com tapinhas nas costas, o deputado Rubens Falcão.</w:t>
+      </w:r>
+    </w:p>
+    <w:p>
+      <w:pPr>
+        <w:spacing w:after="0" w:line="312"/>
+        <w:ind w:firstLine="340"/>
+        <w:jc w:val="both"/>
+      </w:pPr>
+      <w:r>
+        <w:rPr>
+          <w:rFonts w:ascii="Georgia" w:cs="Georgia" w:eastAsia="Georgia" w:hAnsi="Georgia"/>
+          <w:sz w:val="21"/>
+          <w:szCs w:val="21"/>
+        </w:rPr>
+        <w:t xml:space="preserve">— Não podia deixar de vir — disse ele, apertando a mão de Henrique com força exagerada. — Esse projeto é a menina dos meus olhos. Gera oito mil empregos. — Inclinou-se, baixando a voz, com um sorriso de televisão. — E como vai o nosso imorrível?</w:t>
+      </w:r>
+    </w:p>
+    <w:p>
+      <w:pPr>
+        <w:spacing w:after="0" w:line="312"/>
+        <w:ind w:firstLine="340"/>
+        <w:jc w:val="both"/>
+      </w:pPr>
+      <w:r>
+        <w:rPr>
+          <w:rFonts w:ascii="Georgia" w:cs="Georgia" w:eastAsia="Georgia" w:hAnsi="Georgia"/>
+          <w:sz w:val="21"/>
+          <w:szCs w:val="21"/>
+        </w:rPr>
+        <w:t xml:space="preserve">— Vivo, deputado.</w:t>
+      </w:r>
+    </w:p>
+    <w:p>
+      <w:pPr>
+        <w:spacing w:after="0" w:line="312"/>
+        <w:ind w:firstLine="340"/>
+        <w:jc w:val="both"/>
+      </w:pPr>
+      <w:r>
+        <w:rPr>
+          <w:rFonts w:ascii="Georgia" w:cs="Georgia" w:eastAsia="Georgia" w:hAnsi="Georgia"/>
+          <w:sz w:val="21"/>
+          <w:szCs w:val="21"/>
+        </w:rPr>
+        <w:t xml:space="preserve">— É o que todos dizem. — Falcão piscou. — É o que todos dizem.</w:t>
+      </w:r>
+    </w:p>
+    <w:p>
+      <w:pPr>
+        <w:spacing w:after="0" w:line="312"/>
+        <w:ind w:firstLine="340"/>
+        <w:jc w:val="both"/>
+      </w:pPr>
+      <w:r>
+        <w:rPr>
+          <w:rFonts w:ascii="Georgia" w:cs="Georgia" w:eastAsia="Georgia" w:hAnsi="Georgia"/>
+          <w:sz w:val="21"/>
+          <w:szCs w:val="21"/>
+        </w:rPr>
+        <w:t xml:space="preserve">Henrique sentou-se e abriu a pasta do contrato. Leu a primeira página. Leu a segunda. Na terceira, parou.</w:t>
+      </w:r>
+    </w:p>
+    <w:p>
+      <w:pPr>
+        <w:spacing w:after="0" w:line="312"/>
+        <w:ind w:firstLine="340"/>
+        <w:jc w:val="both"/>
+      </w:pPr>
+      <w:r>
+        <w:rPr>
+          <w:rFonts w:ascii="Georgia" w:cs="Georgia" w:eastAsia="Georgia" w:hAnsi="Georgia"/>
+          <w:sz w:val="21"/>
+          <w:szCs w:val="21"/>
+        </w:rPr>
+        <w:t xml:space="preserve">Faltava o anexo de vistoria. Sem ele, a apólice não podia ser emitida. Era um documento de quarenta páginas, com os laudos de solo e as plantas de drenagem, e Henrique se lembrava perfeitamente de tê-lo visto pela última vez sobre a própria mesa, na corretora, na noite anterior.</w:t>
+      </w:r>
+    </w:p>
+    <w:p>
+      <w:pPr>
+        <w:spacing w:after="0" w:line="312"/>
+        <w:ind w:firstLine="340"/>
+        <w:jc w:val="both"/>
+      </w:pPr>
+      <w:r>
+        <w:rPr>
+          <w:rFonts w:ascii="Georgia" w:cs="Georgia" w:eastAsia="Georgia" w:hAnsi="Georgia"/>
+          <w:sz w:val="21"/>
+          <w:szCs w:val="21"/>
+        </w:rPr>
+        <w:t xml:space="preserve">Alguém tinha tirado o anexo da pasta.</w:t>
+      </w:r>
+    </w:p>
+    <w:p>
+      <w:pPr>
+        <w:spacing w:after="200" w:before="200"/>
+        <w:jc w:val="center"/>
+      </w:pPr>
+      <w:r>
+        <w:rPr>
+          <w:rFonts w:ascii="Georgia" w:cs="Georgia" w:eastAsia="Georgia" w:hAnsi="Georgia"/>
+          <w:sz w:val="22"/>
+          <w:szCs w:val="22"/>
+        </w:rPr>
+        <w:t xml:space="preserve">*</w:t>
+      </w:r>
+    </w:p>
+    <w:p>
+      <w:pPr>
+        <w:spacing w:after="0" w:line="312"/>
+        <w:ind w:firstLine="340"/>
+        <w:jc w:val="both"/>
+      </w:pPr>
+      <w:r>
+        <w:rPr>
+          <w:rFonts w:ascii="Georgia" w:cs="Georgia" w:eastAsia="Georgia" w:hAnsi="Georgia"/>
+          <w:sz w:val="21"/>
+          <w:szCs w:val="21"/>
+        </w:rPr>
+        <w:t xml:space="preserve">Ele ainda estava olhando para a pasta quando Nestor apareceu na porta da sala de reuniões, com o boné na mão, sem graça.</w:t>
+      </w:r>
+    </w:p>
+    <w:p>
+      <w:pPr>
+        <w:spacing w:after="0" w:line="312"/>
+        <w:ind w:firstLine="340"/>
+        <w:jc w:val="both"/>
+      </w:pPr>
+      <w:r>
+        <w:rPr>
+          <w:rFonts w:ascii="Georgia" w:cs="Georgia" w:eastAsia="Georgia" w:hAnsi="Georgia"/>
+          <w:sz w:val="21"/>
+          <w:szCs w:val="21"/>
+        </w:rPr>
+        <w:t xml:space="preserve">— Doutor? O senhor mandou me chamar?</w:t>
+      </w:r>
+    </w:p>
+    <w:p>
+      <w:pPr>
+        <w:spacing w:after="0" w:line="312"/>
+        <w:ind w:firstLine="340"/>
+        <w:jc w:val="both"/>
+      </w:pPr>
+      <w:r>
+        <w:rPr>
+          <w:rFonts w:ascii="Georgia" w:cs="Georgia" w:eastAsia="Georgia" w:hAnsi="Georgia"/>
+          <w:sz w:val="21"/>
+          <w:szCs w:val="21"/>
+        </w:rPr>
+        <w:t xml:space="preserve">Henrique franziu a testa.</w:t>
+      </w:r>
+    </w:p>
+    <w:p>
+      <w:pPr>
+        <w:spacing w:after="0" w:line="312"/>
+        <w:ind w:firstLine="340"/>
+        <w:jc w:val="both"/>
+      </w:pPr>
+      <w:r>
+        <w:rPr>
+          <w:rFonts w:ascii="Georgia" w:cs="Georgia" w:eastAsia="Georgia" w:hAnsi="Georgia"/>
+          <w:sz w:val="21"/>
+          <w:szCs w:val="21"/>
+        </w:rPr>
+        <w:t xml:space="preserve">— Não, Nestor.</w:t>
+      </w:r>
+    </w:p>
+    <w:p>
+      <w:pPr>
+        <w:spacing w:after="0" w:line="312"/>
+        <w:ind w:firstLine="340"/>
+        <w:jc w:val="both"/>
+      </w:pPr>
+      <w:r>
+        <w:rPr>
+          <w:rFonts w:ascii="Georgia" w:cs="Georgia" w:eastAsia="Georgia" w:hAnsi="Georgia"/>
+          <w:sz w:val="21"/>
+          <w:szCs w:val="21"/>
+        </w:rPr>
+        <w:t xml:space="preserve">— Um rapaz veio no carro agora há pouco. Um de colete escuro, da organização do evento, acho. Disse que o senhor precisava falar comigo com urgência. — Nestor olhou em volta, constrangido com tanta gente de terno. — Deixei o carro lá embaixo, no estacionamento.</w:t>
+      </w:r>
+    </w:p>
+    <w:p>
+      <w:pPr>
+        <w:spacing w:after="0" w:line="312"/>
+        <w:ind w:firstLine="340"/>
+        <w:jc w:val="both"/>
+      </w:pPr>
+      <w:r>
+        <w:rPr>
+          <w:rFonts w:ascii="Georgia" w:cs="Georgia" w:eastAsia="Georgia" w:hAnsi="Georgia"/>
+          <w:sz w:val="21"/>
+          <w:szCs w:val="21"/>
+        </w:rPr>
+        <w:t xml:space="preserve">Henrique ficou um segundo em silêncio. Pensou no anexo que faltava. Pensou em Renato, ao lado dele, com o celular de novo na mão, embaixo da mesa. Pensou que, se havia alguém naquela sala que não precisava estar ali, era o homem que ele desconfiava estar passando informações para fora.</w:t>
+      </w:r>
+    </w:p>
+    <w:p>
+      <w:pPr>
+        <w:spacing w:after="0" w:line="312"/>
+        <w:ind w:firstLine="340"/>
+        <w:jc w:val="both"/>
+      </w:pPr>
+      <w:r>
+        <w:rPr>
+          <w:rFonts w:ascii="Georgia" w:cs="Georgia" w:eastAsia="Georgia" w:hAnsi="Georgia"/>
+          <w:sz w:val="21"/>
+          <w:szCs w:val="21"/>
+        </w:rPr>
+        <w:t xml:space="preserve">— Já que você está aqui — disse ele, devagar —, vou precisar de você mesmo. Falta um anexo neste contrato. Está na minha mesa, na corretora. Uma pasta azul, com o nome da incorporadora na capa. — Virou-se para o lado. — Renato, vai com ele. Você sabe qual é. Sem isso a gente não assina nada hoje.</w:t>
+      </w:r>
+    </w:p>
+    <w:p>
+      <w:pPr>
+        <w:spacing w:after="0" w:line="312"/>
+        <w:ind w:firstLine="340"/>
+        <w:jc w:val="both"/>
+      </w:pPr>
+      <w:r>
+        <w:rPr>
+          <w:rFonts w:ascii="Georgia" w:cs="Georgia" w:eastAsia="Georgia" w:hAnsi="Georgia"/>
+          <w:sz w:val="21"/>
+          <w:szCs w:val="21"/>
+        </w:rPr>
+        <w:t xml:space="preserve">Renato abriu a boca para dizer alguma coisa. Fechou.</w:t>
+      </w:r>
+    </w:p>
+    <w:p>
+      <w:pPr>
+        <w:spacing w:after="0" w:line="312"/>
+        <w:ind w:firstLine="340"/>
+        <w:jc w:val="both"/>
+      </w:pPr>
+      <w:r>
+        <w:rPr>
+          <w:rFonts w:ascii="Georgia" w:cs="Georgia" w:eastAsia="Georgia" w:hAnsi="Georgia"/>
+          <w:sz w:val="21"/>
+          <w:szCs w:val="21"/>
+        </w:rPr>
+        <w:t xml:space="preserve">— Claro, doutor.</w:t>
+      </w:r>
+    </w:p>
+    <w:p>
+      <w:pPr>
+        <w:spacing w:after="0" w:line="312"/>
+        <w:ind w:firstLine="340"/>
+        <w:jc w:val="both"/>
+      </w:pPr>
+      <w:r>
+        <w:rPr>
+          <w:rFonts w:ascii="Georgia" w:cs="Georgia" w:eastAsia="Georgia" w:hAnsi="Georgia"/>
+          <w:sz w:val="21"/>
+          <w:szCs w:val="21"/>
+        </w:rPr>
+        <w:t xml:space="preserve">— E me manda uma mensagem quando estiverem voltando.</w:t>
+      </w:r>
+    </w:p>
+    <w:p>
+      <w:pPr>
+        <w:spacing w:after="0" w:line="312"/>
+        <w:ind w:firstLine="340"/>
+        <w:jc w:val="both"/>
+      </w:pPr>
+      <w:r>
+        <w:rPr>
+          <w:rFonts w:ascii="Georgia" w:cs="Georgia" w:eastAsia="Georgia" w:hAnsi="Georgia"/>
+          <w:sz w:val="21"/>
+          <w:szCs w:val="21"/>
+        </w:rPr>
+        <w:t xml:space="preserve">Renato se levantou, pegou a pasta de couro e saiu atrás de Nestor. Na porta, já com o celular na mão de novo, digitou alguma coisa rápido, olhando para a tela. Henrique viu de relance o polegar dele correndo sobre o teclado.</w:t>
+      </w:r>
+    </w:p>
+    <w:p>
+      <w:pPr>
+        <w:spacing w:after="0" w:line="312"/>
+        <w:ind w:firstLine="340"/>
+        <w:jc w:val="both"/>
+      </w:pPr>
+      <w:r>
+        <w:rPr>
+          <w:rFonts w:ascii="Georgia" w:cs="Georgia" w:eastAsia="Georgia" w:hAnsi="Georgia"/>
+          <w:sz w:val="21"/>
+          <w:szCs w:val="21"/>
+        </w:rPr>
+        <w:t xml:space="preserve">Depois os dois sumiram no corredor do estande.</w:t>
+      </w:r>
+    </w:p>
+    <w:p>
+      <w:pPr>
+        <w:spacing w:after="200" w:before="200"/>
+        <w:jc w:val="center"/>
+      </w:pPr>
+      <w:r>
+        <w:rPr>
+          <w:rFonts w:ascii="Georgia" w:cs="Georgia" w:eastAsia="Georgia" w:hAnsi="Georgia"/>
+          <w:sz w:val="22"/>
+          <w:szCs w:val="22"/>
+        </w:rPr>
+        <w:t xml:space="preserve">*</w:t>
+      </w:r>
+    </w:p>
+    <w:p>
+      <w:pPr>
+        <w:spacing w:after="0" w:line="312"/>
+        <w:ind w:firstLine="340"/>
+        <w:jc w:val="both"/>
+      </w:pPr>
+      <w:r>
+        <w:rPr>
+          <w:rFonts w:ascii="Georgia" w:cs="Georgia" w:eastAsia="Georgia" w:hAnsi="Georgia"/>
+          <w:sz w:val="21"/>
+          <w:szCs w:val="21"/>
+        </w:rPr>
+        <w:t xml:space="preserve">A reunião seguiu sem o anexo, em torno de detalhes que podiam ser discutidos sem ele. Falcão falou sobre empregos. O engenheiro da prefeitura falou sobre drenagem. O diretor da incorporadora falou sobre o lago com pedalinhos. Henrique ouviu metade de tudo e olhou o relógio a cada cinco minutos.</w:t>
+      </w:r>
+    </w:p>
+    <w:p>
+      <w:pPr>
+        <w:spacing w:after="0" w:line="312"/>
+        <w:ind w:firstLine="340"/>
+        <w:jc w:val="both"/>
+      </w:pPr>
+      <w:r>
+        <w:rPr>
+          <w:rFonts w:ascii="Georgia" w:cs="Georgia" w:eastAsia="Georgia" w:hAnsi="Georgia"/>
+          <w:sz w:val="21"/>
+          <w:szCs w:val="21"/>
+        </w:rPr>
+        <w:t xml:space="preserve">Às três e doze, mandou uma mensagem para Nestor. Traz também a pasta cinza que está ao lado. Por garantia.</w:t>
+      </w:r>
+    </w:p>
+    <w:p>
+      <w:pPr>
+        <w:spacing w:after="0" w:line="312"/>
+        <w:ind w:firstLine="340"/>
+        <w:jc w:val="both"/>
+      </w:pPr>
+      <w:r>
+        <w:rPr>
+          <w:rFonts w:ascii="Georgia" w:cs="Georgia" w:eastAsia="Georgia" w:hAnsi="Georgia"/>
+          <w:sz w:val="21"/>
+          <w:szCs w:val="21"/>
+        </w:rPr>
+        <w:t xml:space="preserve">A resposta chegou às três e catorze.</w:t>
+      </w:r>
+    </w:p>
+    <w:p>
+      <w:pPr>
+        <w:spacing w:after="0" w:line="312"/>
+        <w:ind w:firstLine="340"/>
+        <w:jc w:val="both"/>
+      </w:pPr>
+      <w:r>
+        <w:rPr>
+          <w:rFonts w:ascii="Georgia" w:cs="Georgia" w:eastAsia="Georgia" w:hAnsi="Georgia"/>
+          <w:sz w:val="21"/>
+          <w:szCs w:val="21"/>
+        </w:rPr>
+        <w:t xml:space="preserve">Ok doutor. Já na estrada.</w:t>
+      </w:r>
+    </w:p>
+    <w:p>
+      <w:pPr>
+        <w:pBdr>
+          <w:top w:val="single" w:color="555555" w:sz="6" w:space="6"/>
+          <w:bottom w:val="single" w:color="555555" w:sz="6" w:space="6"/>
+          <w:left w:val="single" w:color="555555" w:sz="6" w:space="6"/>
+          <w:right w:val="single" w:color="555555" w:sz="6" w:space="6"/>
+        </w:pBdr>
+        <w:shd w:fill="EFEFEF" w:color="auto" w:val="clear"/>
+        <w:spacing w:after="0" w:before="240"/>
+        <w:ind w:left="227" w:right="227"/>
+        <w:jc w:val="center"/>
+      </w:pPr>
+      <w:r>
+        <w:rPr>
+          <w:rFonts w:ascii="Georgia" w:cs="Georgia" w:eastAsia="Georgia" w:hAnsi="Georgia"/>
+          <w:b/>
+          <w:bCs/>
+          <w:spacing w:val="30"/>
+          <w:sz w:val="17"/>
+          <w:szCs w:val="17"/>
+        </w:rPr>
+        <w:t xml:space="preserve">NO CELULAR DE HENRIQUE</w:t>
+      </w:r>
+    </w:p>
+    <w:p>
+      <w:pPr>
+        <w:pBdr>
+          <w:top w:val="single" w:color="555555" w:sz="6" w:space="6"/>
+          <w:bottom w:val="single" w:color="555555" w:sz="6" w:space="6"/>
+          <w:left w:val="single" w:color="555555" w:sz="6" w:space="6"/>
+          <w:right w:val="single" w:color="555555" w:sz="6" w:space="6"/>
+        </w:pBdr>
+        <w:shd w:fill="EFEFEF" w:color="auto" w:val="clear"/>
+        <w:spacing w:after="240" w:before="0" w:line="288"/>
+        <w:ind w:left="227" w:right="227"/>
+        <w:jc w:val="center"/>
+      </w:pPr>
+      <w:r>
+        <w:rPr>
+          <w:rFonts w:ascii="Georgia" w:cs="Georgia" w:eastAsia="Georgia" w:hAnsi="Georgia"/>
+          <w:i/>
+          <w:iCs/>
+          <w:sz w:val="19"/>
+          <w:szCs w:val="19"/>
+        </w:rPr>
+        <w:t xml:space="preserve">Veja a última conversa entre Henrique e Nestor no celular virtual. Repare no horário de cada mensagem.</w:t>
+      </w:r>
+    </w:p>
+    <w:p>
+      <w:pPr>
+        <w:spacing w:after="0" w:line="312"/>
+        <w:ind w:firstLine="340"/>
+        <w:jc w:val="both"/>
+      </w:pPr>
+      <w:r>
+        <w:rPr>
+          <w:rFonts w:ascii="Georgia" w:cs="Georgia" w:eastAsia="Georgia" w:hAnsi="Georgia"/>
+          <w:sz w:val="21"/>
+          <w:szCs w:val="21"/>
+        </w:rPr>
+        <w:t xml:space="preserve">Às três e vinte e dois, alguém bateu na porta da sala de reuniões. Era uma moça do estande de vendas, pálida, com o celular na mão.</w:t>
+      </w:r>
+    </w:p>
+    <w:p>
+      <w:pPr>
+        <w:spacing w:after="0" w:line="312"/>
+        <w:ind w:firstLine="340"/>
+        <w:jc w:val="both"/>
+      </w:pPr>
+      <w:r>
+        <w:rPr>
+          <w:rFonts w:ascii="Georgia" w:cs="Georgia" w:eastAsia="Georgia" w:hAnsi="Georgia"/>
+          <w:sz w:val="21"/>
+          <w:szCs w:val="21"/>
+        </w:rPr>
+        <w:t xml:space="preserve">— Desculpa interromper. Tem uma fumaça enorme lá embaixo, na estrada. Dizem que um carro caiu na ribanceira e pegou fogo.</w:t>
+      </w:r>
+    </w:p>
+    <w:p>
+      <w:pPr>
+        <w:spacing w:after="0" w:line="312"/>
+        <w:ind w:firstLine="340"/>
+        <w:jc w:val="both"/>
+      </w:pPr>
+      <w:r>
+        <w:rPr>
+          <w:rFonts w:ascii="Georgia" w:cs="Georgia" w:eastAsia="Georgia" w:hAnsi="Georgia"/>
+          <w:sz w:val="21"/>
+          <w:szCs w:val="21"/>
+        </w:rPr>
+        <w:t xml:space="preserve">Todos se levantaram ao mesmo tempo e foram até a janela de vidro do estande.</w:t>
+      </w:r>
+    </w:p>
+    <w:p>
+      <w:pPr>
+        <w:spacing w:after="0" w:line="312"/>
+        <w:ind w:firstLine="340"/>
+        <w:jc w:val="both"/>
+      </w:pPr>
+      <w:r>
+        <w:rPr>
+          <w:rFonts w:ascii="Georgia" w:cs="Georgia" w:eastAsia="Georgia" w:hAnsi="Georgia"/>
+          <w:sz w:val="21"/>
+          <w:szCs w:val="21"/>
+        </w:rPr>
+        <w:t xml:space="preserve">No vale, a uns três quilômetros, onde a estrada de terra fazia uma curva fechada antes de chegar à rodovia, uma coluna de fumaça preta subia reta no ar parado da tarde. Lá embaixo, pequeno como os carrinhos da maquete, alguma coisa ardia.</w:t>
+      </w:r>
+    </w:p>
+    <w:p>
+      <w:pPr>
+        <w:spacing w:after="0" w:line="312"/>
+        <w:ind w:firstLine="340"/>
+        <w:jc w:val="both"/>
+      </w:pPr>
+      <w:r>
+        <w:rPr>
+          <w:rFonts w:ascii="Georgia" w:cs="Georgia" w:eastAsia="Georgia" w:hAnsi="Georgia"/>
+          <w:sz w:val="21"/>
+          <w:szCs w:val="21"/>
+        </w:rPr>
+        <w:t xml:space="preserve">Henrique não precisou ver mais nada. Soube pela cor do céu. Soube pela pasta que faltava. Soube pela mensagem que tinha mandado oito minutos antes, como quem manda o último recado sem saber que é o último.</w:t>
+      </w:r>
+    </w:p>
+    <w:p>
+      <w:pPr>
+        <w:spacing w:after="0" w:line="312"/>
+        <w:ind w:firstLine="340"/>
+        <w:jc w:val="both"/>
+      </w:pPr>
+      <w:r>
+        <w:rPr>
+          <w:rFonts w:ascii="Georgia" w:cs="Georgia" w:eastAsia="Georgia" w:hAnsi="Georgia"/>
+          <w:sz w:val="21"/>
+          <w:szCs w:val="21"/>
+        </w:rPr>
+        <w:t xml:space="preserve">Ao lado dele, Rubens Falcão olhava para a fumaça com as mãos nos bolsos.</w:t>
+      </w:r>
+    </w:p>
+    <w:p>
+      <w:pPr>
+        <w:spacing w:after="0" w:line="312"/>
+        <w:ind w:firstLine="340"/>
+        <w:jc w:val="both"/>
+      </w:pPr>
+      <w:r>
+        <w:rPr>
+          <w:rFonts w:ascii="Georgia" w:cs="Georgia" w:eastAsia="Georgia" w:hAnsi="Georgia"/>
+          <w:sz w:val="21"/>
+          <w:szCs w:val="21"/>
+        </w:rPr>
+        <w:t xml:space="preserve">— Meu Deus — disse o deputado. — Que tragédia.</w:t>
+      </w:r>
+    </w:p>
+    <w:p>
+      <w:pPr>
+        <w:spacing w:after="0" w:line="312"/>
+        <w:ind w:firstLine="340"/>
+        <w:jc w:val="both"/>
+      </w:pPr>
+      <w:r>
+        <w:rPr>
+          <w:rFonts w:ascii="Georgia" w:cs="Georgia" w:eastAsia="Georgia" w:hAnsi="Georgia"/>
+          <w:sz w:val="21"/>
+          <w:szCs w:val="21"/>
+        </w:rPr>
+        <w:t xml:space="preserve">E depois, sem tirar os olhos da janela, quase num sussurro, como quem fala sozinho:</w:t>
+      </w:r>
+    </w:p>
+    <w:p>
+      <w:pPr>
+        <w:spacing w:after="0" w:line="312"/>
+        <w:ind w:firstLine="340"/>
+        <w:jc w:val="both"/>
+      </w:pPr>
+      <w:r>
+        <w:rPr>
+          <w:rFonts w:ascii="Georgia" w:cs="Georgia" w:eastAsia="Georgia" w:hAnsi="Georgia"/>
+          <w:sz w:val="21"/>
+          <w:szCs w:val="21"/>
+        </w:rPr>
+        <w:t xml:space="preserve">— De novo.</w:t>
+      </w:r>
+    </w:p>
+    <w:p>
+      <w:pPr>
+        <w:spacing w:after="200" w:before="200"/>
+        <w:jc w:val="center"/>
+      </w:pPr>
+      <w:r>
+        <w:rPr>
+          <w:rFonts w:ascii="Georgia" w:cs="Georgia" w:eastAsia="Georgia" w:hAnsi="Georgia"/>
+          <w:sz w:val="22"/>
+          <w:szCs w:val="22"/>
+        </w:rPr>
+        <w:t xml:space="preserve">*</w:t>
+      </w:r>
+    </w:p>
+    <w:p>
+      <w:pPr>
+        <w:spacing w:after="0" w:line="312"/>
+        <w:ind w:firstLine="340"/>
+        <w:jc w:val="both"/>
+      </w:pPr>
+      <w:r>
+        <w:rPr>
+          <w:rFonts w:ascii="Georgia" w:cs="Georgia" w:eastAsia="Georgia" w:hAnsi="Georgia"/>
+          <w:sz w:val="21"/>
+          <w:szCs w:val="21"/>
+        </w:rPr>
+        <w:t xml:space="preserve">Às nove da noite, Henrique tocou a campainha do consultório do doutor Álvaro, em Higienópolis.</w:t>
+      </w:r>
+    </w:p>
+    <w:p>
+      <w:pPr>
+        <w:spacing w:after="0" w:line="312"/>
+        <w:ind w:firstLine="340"/>
+        <w:jc w:val="both"/>
+      </w:pPr>
+      <w:r>
+        <w:rPr>
+          <w:rFonts w:ascii="Georgia" w:cs="Georgia" w:eastAsia="Georgia" w:hAnsi="Georgia"/>
+          <w:sz w:val="21"/>
+          <w:szCs w:val="21"/>
+        </w:rPr>
+        <w:t xml:space="preserve">Não tinha marcado hora. Não tinha ligado antes. Tinha passado a tarde inteira entre a estrada interditada, a delegacia de Cajamar e o necrotério, onde reconheceu Nestor pela aliança, porque não havia mais nada para reconhecer. Renato, nem a aliança. A delegada Regina Paiva chegou às sete, olhou para ele de longe e não disse nada. Não precisava.</w:t>
+      </w:r>
+    </w:p>
+    <w:p>
+      <w:pPr>
+        <w:spacing w:after="0" w:line="312"/>
+        <w:ind w:firstLine="340"/>
+        <w:jc w:val="both"/>
+      </w:pPr>
+      <w:r>
+        <w:rPr>
+          <w:rFonts w:ascii="Georgia" w:cs="Georgia" w:eastAsia="Georgia" w:hAnsi="Georgia"/>
+          <w:sz w:val="21"/>
+          <w:szCs w:val="21"/>
+        </w:rPr>
+        <w:t xml:space="preserve">O doutor Álvaro abriu a porta ele mesmo. Estava de camisa, sem o jaleco, com os óculos de leitura na ponta do nariz. Olhou para Henrique por um longo tempo, de cima a baixo, como olhava para um exame.</w:t>
+      </w:r>
+    </w:p>
+    <w:p>
+      <w:pPr>
+        <w:spacing w:after="0" w:line="312"/>
+        <w:ind w:firstLine="340"/>
+        <w:jc w:val="both"/>
+      </w:pPr>
+      <w:r>
+        <w:rPr>
+          <w:rFonts w:ascii="Georgia" w:cs="Georgia" w:eastAsia="Georgia" w:hAnsi="Georgia"/>
+          <w:sz w:val="21"/>
+          <w:szCs w:val="21"/>
+        </w:rPr>
+        <w:t xml:space="preserve">— Entra.</w:t>
+      </w:r>
+    </w:p>
+    <w:p>
+      <w:pPr>
+        <w:spacing w:after="0" w:line="312"/>
+        <w:ind w:firstLine="340"/>
+        <w:jc w:val="both"/>
+      </w:pPr>
+      <w:r>
+        <w:rPr>
+          <w:rFonts w:ascii="Georgia" w:cs="Georgia" w:eastAsia="Georgia" w:hAnsi="Georgia"/>
+          <w:sz w:val="21"/>
+          <w:szCs w:val="21"/>
+        </w:rPr>
+        <w:t xml:space="preserve">O consultório tinha o cheiro de sempre, de álcool e madeira encerada. Na parede, os diplomas, as fotos de congressos, uma foto antiga de dois rapazes de vinte e poucos anos numa praia, de calção, rindo. Henrique e Álvaro, em Ubatuba, em 1971. Henrique sentou-se na cadeira dos pacientes, como tinha feito centenas de vezes. Álvaro pegou o aparelho de pressão por reflexo, depois desistiu e o pousou sobre a mesa.</w:t>
+      </w:r>
+    </w:p>
+    <w:p>
+      <w:pPr>
+        <w:spacing w:after="0" w:line="312"/>
+        <w:ind w:firstLine="340"/>
+        <w:jc w:val="both"/>
+      </w:pPr>
+      <w:r>
+        <w:rPr>
+          <w:rFonts w:ascii="Georgia" w:cs="Georgia" w:eastAsia="Georgia" w:hAnsi="Georgia"/>
+          <w:sz w:val="21"/>
+          <w:szCs w:val="21"/>
+        </w:rPr>
+        <w:t xml:space="preserve">— Eu soube — disse o médico.</w:t>
+      </w:r>
+    </w:p>
+    <w:p>
+      <w:pPr>
+        <w:spacing w:after="0" w:line="312"/>
+        <w:ind w:firstLine="340"/>
+        <w:jc w:val="both"/>
+      </w:pPr>
+      <w:r>
+        <w:rPr>
+          <w:rFonts w:ascii="Georgia" w:cs="Georgia" w:eastAsia="Georgia" w:hAnsi="Georgia"/>
+          <w:sz w:val="21"/>
+          <w:szCs w:val="21"/>
+        </w:rPr>
+        <w:t xml:space="preserve">— Cinco, Álvaro. — A voz de Henrique saiu rouca. — Cinco pessoas. O homem do motel. O Marcelo. O rapaz de Curitiba, que tinha uma filha de nove anos. O Renato. E o Nestor. O Nestor, que dirigiu para mim durante dezesseis anos. Que levou os meus filhos para a escola. Que eu mandei para a estrada hoje à tarde para buscar uma pasta.</w:t>
+      </w:r>
+    </w:p>
+    <w:p>
+      <w:pPr>
+        <w:spacing w:after="0" w:line="312"/>
+        <w:ind w:firstLine="340"/>
+        <w:jc w:val="both"/>
+      </w:pPr>
+      <w:r>
+        <w:rPr>
+          <w:rFonts w:ascii="Georgia" w:cs="Georgia" w:eastAsia="Georgia" w:hAnsi="Georgia"/>
+          <w:sz w:val="21"/>
+          <w:szCs w:val="21"/>
+        </w:rPr>
+        <w:t xml:space="preserve">O médico não respondeu.</w:t>
+      </w:r>
+    </w:p>
+    <w:p>
+      <w:pPr>
+        <w:spacing w:after="0" w:line="312"/>
+        <w:ind w:firstLine="340"/>
+        <w:jc w:val="both"/>
+      </w:pPr>
+      <w:r>
+        <w:rPr>
+          <w:rFonts w:ascii="Georgia" w:cs="Georgia" w:eastAsia="Georgia" w:hAnsi="Georgia"/>
+          <w:sz w:val="21"/>
+          <w:szCs w:val="21"/>
+        </w:rPr>
+        <w:t xml:space="preserve">— Alguém quer me matar. Ou muita gente. Eu já não sei. E toda vez quem morre é outro. Toda vez, Álvaro. — Henrique esfregou o rosto com as duas mãos. — Na rua, me chamam de imorrível. A polícia acha que sou eu que mato. A minha mulher dorme de costas para mim. O meu filho não fala comigo. E eu não consigo mais olhar para ninguém sem pensar se é a próxima pessoa que vai morrer no meu lugar.</w:t>
+      </w:r>
+    </w:p>
+    <w:p>
+      <w:pPr>
+        <w:spacing w:after="0" w:line="312"/>
+        <w:ind w:firstLine="340"/>
+        <w:jc w:val="both"/>
+      </w:pPr>
+      <w:r>
+        <w:rPr>
+          <w:rFonts w:ascii="Georgia" w:cs="Georgia" w:eastAsia="Georgia" w:hAnsi="Georgia"/>
+          <w:sz w:val="21"/>
+          <w:szCs w:val="21"/>
+        </w:rPr>
+        <w:t xml:space="preserve">Ficou em silêncio. Lá fora, um ônibus passou na Avenida Angélica.</w:t>
+      </w:r>
+    </w:p>
+    <w:p>
+      <w:pPr>
+        <w:spacing w:after="0" w:line="312"/>
+        <w:ind w:firstLine="340"/>
+        <w:jc w:val="both"/>
+      </w:pPr>
+      <w:r>
+        <w:rPr>
+          <w:rFonts w:ascii="Georgia" w:cs="Georgia" w:eastAsia="Georgia" w:hAnsi="Georgia"/>
+          <w:sz w:val="21"/>
+          <w:szCs w:val="21"/>
+        </w:rPr>
+        <w:t xml:space="preserve">Quando voltou a falar, a voz estava baixa e firme, como a de quem já decidiu uma coisa havia muito tempo e só agora tem coragem de dizer em voz alta.</w:t>
+      </w:r>
+    </w:p>
+    <w:p>
+      <w:pPr>
+        <w:spacing w:after="0" w:line="312"/>
+        <w:ind w:firstLine="340"/>
+        <w:jc w:val="both"/>
+      </w:pPr>
+      <w:r>
+        <w:rPr>
+          <w:rFonts w:ascii="Georgia" w:cs="Georgia" w:eastAsia="Georgia" w:hAnsi="Georgia"/>
+          <w:sz w:val="21"/>
+          <w:szCs w:val="21"/>
+        </w:rPr>
+        <w:t xml:space="preserve">— Preciso sumir, Álvaro.</w:t>
+      </w:r>
+    </w:p>
+    <w:p>
+      <w:pPr>
+        <w:spacing w:after="0" w:line="312"/>
+        <w:ind w:firstLine="340"/>
+        <w:jc w:val="both"/>
+      </w:pPr>
+      <w:r>
+        <w:rPr>
+          <w:rFonts w:ascii="Georgia" w:cs="Georgia" w:eastAsia="Georgia" w:hAnsi="Georgia"/>
+          <w:sz w:val="21"/>
+          <w:szCs w:val="21"/>
+        </w:rPr>
+        <w:t xml:space="preserve">O médico tirou os óculos. Dobrou as hastes devagar e os guardou no bolso da camisa. Olhou para a foto de Ubatuba na parede, os dois rapazes rindo de calção numa praia, quarenta anos antes.</w:t>
+      </w:r>
+    </w:p>
+    <w:p>
+      <w:pPr>
+        <w:spacing w:after="0" w:line="312"/>
+        <w:ind w:firstLine="340"/>
+        <w:jc w:val="both"/>
+      </w:pPr>
+      <w:r>
+        <w:rPr>
+          <w:rFonts w:ascii="Georgia" w:cs="Georgia" w:eastAsia="Georgia" w:hAnsi="Georgia"/>
+          <w:sz w:val="21"/>
+          <w:szCs w:val="21"/>
+        </w:rPr>
+        <w:t xml:space="preserve">Depois foi até a porta do consultório e a fechou.</w:t>
+      </w:r>
+    </w:p>
+    <w:p>
+      <w:pPr>
+        <w:spacing w:after="0" w:line="312"/>
+        <w:ind w:firstLine="340"/>
+        <w:jc w:val="both"/>
+      </w:pPr>
+      <w:r>
+        <w:rPr>
+          <w:rFonts w:ascii="Georgia" w:cs="Georgia" w:eastAsia="Georgia" w:hAnsi="Georgia"/>
+          <w:sz w:val="21"/>
+          <w:szCs w:val="21"/>
+        </w:rPr>
+        <w:t xml:space="preserve">— Então vamos conversar — disse.</w:t>
       </w:r>
     </w:p>
     <w:sectPr>

</xml_diff>

<commit_message>
Livro policial: capítulo 16 (Toda quinta)
Co-Authored-By: Claude Opus 5.5 <noreply@anthropic.com>
Claude-Session: https://claude.ai/code/session_01BrurxSYygRC3rRhaUYosm1
</commit_message>
<xml_diff>
--- a/docs/livro-policial/TODO_CRIME_TEM_UM_AUTOR.docx
+++ b/docs/livro-policial/TODO_CRIME_TEM_UM_AUTOR.docx
@@ -15994,6 +15994,1056 @@
           <w:szCs w:val="21"/>
         </w:rPr>
         <w:t xml:space="preserve">— Então vamos conversar — disse.</w:t>
+      </w:r>
+    </w:p>
+    <w:p>
+      <w:pPr>
+        <w:pageBreakBefore/>
+        <w:spacing w:after="120" w:before="1800"/>
+        <w:jc w:val="center"/>
+      </w:pPr>
+      <w:r>
+        <w:rPr>
+          <w:rFonts w:ascii="Georgia" w:cs="Georgia" w:eastAsia="Georgia" w:hAnsi="Georgia"/>
+          <w:spacing w:val="40"/>
+          <w:sz w:val="20"/>
+          <w:szCs w:val="20"/>
+        </w:rPr>
+        <w:t xml:space="preserve">CAPÍTULO 16</w:t>
+      </w:r>
+    </w:p>
+    <w:p>
+      <w:pPr>
+        <w:spacing w:after="720"/>
+        <w:jc w:val="center"/>
+      </w:pPr>
+      <w:r>
+        <w:rPr>
+          <w:rFonts w:ascii="Georgia" w:cs="Georgia" w:eastAsia="Georgia" w:hAnsi="Georgia"/>
+          <w:b/>
+          <w:bCs/>
+          <w:sz w:val="32"/>
+          <w:szCs w:val="32"/>
+        </w:rPr>
+        <w:t xml:space="preserve">Toda quinta</w:t>
+      </w:r>
+    </w:p>
+    <w:p>
+      <w:pPr>
+        <w:spacing w:after="0" w:line="312"/>
+        <w:ind w:firstLine="340"/>
+        <w:jc w:val="both"/>
+      </w:pPr>
+      <w:r>
+        <w:rPr>
+          <w:rFonts w:ascii="Georgia" w:cs="Georgia" w:eastAsia="Georgia" w:hAnsi="Georgia"/>
+          <w:sz w:val="21"/>
+          <w:szCs w:val="21"/>
+        </w:rPr>
+        <w:t xml:space="preserve">Lia não contou a ninguém sobre o carro prata.</w:t>
+      </w:r>
+    </w:p>
+    <w:p>
+      <w:pPr>
+        <w:spacing w:after="0" w:line="312"/>
+        <w:ind w:firstLine="340"/>
+        <w:jc w:val="both"/>
+      </w:pPr>
+      <w:r>
+        <w:rPr>
+          <w:rFonts w:ascii="Georgia" w:cs="Georgia" w:eastAsia="Georgia" w:hAnsi="Georgia"/>
+          <w:sz w:val="21"/>
+          <w:szCs w:val="21"/>
+        </w:rPr>
+        <w:t xml:space="preserve">Naquela noite, ele a seguiu até a Rebouças e, num semáforo, simplesmente não estava mais no retrovisor. Ela chegou em casa, trancou a porta duas vezes, fechou as cortinas e ficou sentada no escuro, de casaco, até a uma da manhã. Lucas retornou a ligação às onze e meia. Ela não atendeu. No dia seguinte, mandou uma mensagem dizendo que estava tudo bem e que depois contava do Falcão.</w:t>
+      </w:r>
+    </w:p>
+    <w:p>
+      <w:pPr>
+        <w:spacing w:after="0" w:line="312"/>
+        <w:ind w:firstLine="340"/>
+        <w:jc w:val="both"/>
+      </w:pPr>
+      <w:r>
+        <w:rPr>
+          <w:rFonts w:ascii="Georgia" w:cs="Georgia" w:eastAsia="Georgia" w:hAnsi="Georgia"/>
+          <w:sz w:val="21"/>
+          <w:szCs w:val="21"/>
+        </w:rPr>
+        <w:t xml:space="preserve">Depois. Era uma palavra que ela estava usando muito com o irmão.</w:t>
+      </w:r>
+    </w:p>
+    <w:p>
+      <w:pPr>
+        <w:spacing w:after="200" w:before="200"/>
+        <w:jc w:val="center"/>
+      </w:pPr>
+      <w:r>
+        <w:rPr>
+          <w:rFonts w:ascii="Georgia" w:cs="Georgia" w:eastAsia="Georgia" w:hAnsi="Georgia"/>
+          <w:sz w:val="22"/>
+          <w:szCs w:val="22"/>
+        </w:rPr>
+        <w:t xml:space="preserve">*</w:t>
+      </w:r>
+    </w:p>
+    <w:p>
+      <w:pPr>
+        <w:spacing w:after="0" w:line="312"/>
+        <w:ind w:firstLine="340"/>
+        <w:jc w:val="both"/>
+      </w:pPr>
+      <w:r>
+        <w:rPr>
+          <w:rFonts w:ascii="Georgia" w:cs="Georgia" w:eastAsia="Georgia" w:hAnsi="Georgia"/>
+          <w:sz w:val="21"/>
+          <w:szCs w:val="21"/>
+        </w:rPr>
+        <w:t xml:space="preserve">O BlackBerry do pai agora passava uma semana com Lucas e outra com ela. Foi ideia dele, depois da conversa com Otávio, e Lia aceitou sem perguntar por quê. Tinha a impressão de que o irmão já não queria ficar sozinho com aquele aparelho.</w:t>
+      </w:r>
+    </w:p>
+    <w:p>
+      <w:pPr>
+        <w:spacing w:after="0" w:line="312"/>
+        <w:ind w:firstLine="340"/>
+        <w:jc w:val="both"/>
+      </w:pPr>
+      <w:r>
+        <w:rPr>
+          <w:rFonts w:ascii="Georgia" w:cs="Georgia" w:eastAsia="Georgia" w:hAnsi="Georgia"/>
+          <w:sz w:val="21"/>
+          <w:szCs w:val="21"/>
+        </w:rPr>
+        <w:t xml:space="preserve">Na semana dela, Lia fez o que ninguém tinha feito ainda: abriu a agenda.</w:t>
+      </w:r>
+    </w:p>
+    <w:p>
+      <w:pPr>
+        <w:spacing w:after="0" w:line="312"/>
+        <w:ind w:firstLine="340"/>
+        <w:jc w:val="both"/>
+      </w:pPr>
+      <w:r>
+        <w:rPr>
+          <w:rFonts w:ascii="Georgia" w:cs="Georgia" w:eastAsia="Georgia" w:hAnsi="Georgia"/>
+          <w:sz w:val="21"/>
+          <w:szCs w:val="21"/>
+        </w:rPr>
+        <w:t xml:space="preserve">O pai usava a agenda do celular como usava tudo, com método. Reuniões em azul, viagens em verde, médicos em vermelho. Lia foi descendo pelos meses de 2010, por compromissos que já não importavam a ninguém: almoço com cliente, vistoria em Campinas, consulta com o doutor Álvaro, jantar da Associação Comercial.</w:t>
+      </w:r>
+    </w:p>
+    <w:p>
+      <w:pPr>
+        <w:spacing w:after="0" w:line="312"/>
+        <w:ind w:firstLine="340"/>
+        <w:jc w:val="both"/>
+      </w:pPr>
+      <w:r>
+        <w:rPr>
+          <w:rFonts w:ascii="Georgia" w:cs="Georgia" w:eastAsia="Georgia" w:hAnsi="Georgia"/>
+          <w:sz w:val="21"/>
+          <w:szCs w:val="21"/>
+        </w:rPr>
+        <w:t xml:space="preserve">E, toda quinta-feira, em cinza, a mesma entrada repetida, desde março.</w:t>
+      </w:r>
+    </w:p>
+    <w:p>
+      <w:pPr>
+        <w:spacing w:after="0" w:line="312"/>
+        <w:ind w:firstLine="340"/>
+        <w:jc w:val="both"/>
+      </w:pPr>
+      <w:r>
+        <w:rPr>
+          <w:rFonts w:ascii="Georgia" w:cs="Georgia" w:eastAsia="Georgia" w:hAnsi="Georgia"/>
+          <w:sz w:val="21"/>
+          <w:szCs w:val="21"/>
+        </w:rPr>
+        <w:t xml:space="preserve">19h — Carlos.</w:t>
+      </w:r>
+    </w:p>
+    <w:p>
+      <w:pPr>
+        <w:spacing w:after="0" w:line="312"/>
+        <w:ind w:firstLine="340"/>
+        <w:jc w:val="both"/>
+      </w:pPr>
+      <w:r>
+        <w:rPr>
+          <w:rFonts w:ascii="Georgia" w:cs="Georgia" w:eastAsia="Georgia" w:hAnsi="Georgia"/>
+          <w:sz w:val="21"/>
+          <w:szCs w:val="21"/>
+        </w:rPr>
+        <w:t xml:space="preserve">Sem endereço. Sem observação. Só o nome do irmão dela, toda semana, às sete da noite.</w:t>
+      </w:r>
+    </w:p>
+    <w:p>
+      <w:pPr>
+        <w:spacing w:after="0" w:line="312"/>
+        <w:ind w:firstLine="340"/>
+        <w:jc w:val="both"/>
+      </w:pPr>
+      <w:r>
+        <w:rPr>
+          <w:rFonts w:ascii="Georgia" w:cs="Georgia" w:eastAsia="Georgia" w:hAnsi="Georgia"/>
+          <w:sz w:val="21"/>
+          <w:szCs w:val="21"/>
+        </w:rPr>
+        <w:t xml:space="preserve">Lia ficou olhando para aquilo por muito tempo. Carlos não falava com o pai havia quase quatro anos. Desde que Sílvia adoecera depois do divórcio, de um jeito que os médicos chamavam de depressão e que Carlos chamava de culpa dele. Não atendia telefone, não respondia mensagem, não ia aos almoços de aniversário. Quando alguém mencionava o nome de Henrique na frente dele, Carlos saía da sala.</w:t>
+      </w:r>
+    </w:p>
+    <w:p>
+      <w:pPr>
+        <w:spacing w:after="0" w:line="312"/>
+        <w:ind w:firstLine="340"/>
+        <w:jc w:val="both"/>
+      </w:pPr>
+      <w:r>
+        <w:rPr>
+          <w:rFonts w:ascii="Georgia" w:cs="Georgia" w:eastAsia="Georgia" w:hAnsi="Georgia"/>
+          <w:sz w:val="21"/>
+          <w:szCs w:val="21"/>
+        </w:rPr>
+        <w:t xml:space="preserve">Que encontro era aquele, toda quinta, às sete?</w:t>
+      </w:r>
+    </w:p>
+    <w:p>
+      <w:pPr>
+        <w:spacing w:after="200" w:before="200"/>
+        <w:jc w:val="center"/>
+      </w:pPr>
+      <w:r>
+        <w:rPr>
+          <w:rFonts w:ascii="Georgia" w:cs="Georgia" w:eastAsia="Georgia" w:hAnsi="Georgia"/>
+          <w:sz w:val="22"/>
+          <w:szCs w:val="22"/>
+        </w:rPr>
+        <w:t xml:space="preserve">*</w:t>
+      </w:r>
+    </w:p>
+    <w:p>
+      <w:pPr>
+        <w:spacing w:after="0" w:line="312"/>
+        <w:ind w:firstLine="340"/>
+        <w:jc w:val="both"/>
+      </w:pPr>
+      <w:r>
+        <w:rPr>
+          <w:rFonts w:ascii="Georgia" w:cs="Georgia" w:eastAsia="Georgia" w:hAnsi="Georgia"/>
+          <w:sz w:val="21"/>
+          <w:szCs w:val="21"/>
+        </w:rPr>
+        <w:t xml:space="preserve">No menu do BlackBerry havia um ícone que ela não tinha notado antes. Um gravador de áudio, desses que o celular trazia de fábrica e quase ninguém usava. Lia tocou nele. O aparelho pediu uma senha.</w:t>
+      </w:r>
+    </w:p>
+    <w:p>
+      <w:pPr>
+        <w:spacing w:after="0" w:line="312"/>
+        <w:ind w:firstLine="340"/>
+        <w:jc w:val="both"/>
+      </w:pPr>
+      <w:r>
+        <w:rPr>
+          <w:rFonts w:ascii="Georgia" w:cs="Georgia" w:eastAsia="Georgia" w:hAnsi="Georgia"/>
+          <w:sz w:val="21"/>
+          <w:szCs w:val="21"/>
+        </w:rPr>
+        <w:t xml:space="preserve">Embaixo do campo da senha, uma dica, digitada pelo pai: Onde eu espero toda quinta.</w:t>
+      </w:r>
+    </w:p>
+    <w:p>
+      <w:pPr>
+        <w:spacing w:after="0" w:line="312"/>
+        <w:ind w:firstLine="340"/>
+        <w:jc w:val="both"/>
+      </w:pPr>
+      <w:r>
+        <w:rPr>
+          <w:rFonts w:ascii="Georgia" w:cs="Georgia" w:eastAsia="Georgia" w:hAnsi="Georgia"/>
+          <w:sz w:val="21"/>
+          <w:szCs w:val="21"/>
+        </w:rPr>
+        <w:t xml:space="preserve">Ela tentou o ramal. Tentou a data do incêndio. Tentou a placa do carro prata. Nada. O aparelho avisou que restavam duas tentativas.</w:t>
+      </w:r>
+    </w:p>
+    <w:p>
+      <w:pPr>
+        <w:spacing w:after="0" w:line="312"/>
+        <w:ind w:firstLine="340"/>
+        <w:jc w:val="both"/>
+      </w:pPr>
+      <w:r>
+        <w:rPr>
+          <w:rFonts w:ascii="Georgia" w:cs="Georgia" w:eastAsia="Georgia" w:hAnsi="Georgia"/>
+          <w:sz w:val="21"/>
+          <w:szCs w:val="21"/>
+        </w:rPr>
+        <w:t xml:space="preserve">Lia largou o celular no sofá e ligou para a mãe.</w:t>
+      </w:r>
+    </w:p>
+    <w:p>
+      <w:pPr>
+        <w:spacing w:after="0" w:line="312"/>
+        <w:ind w:firstLine="340"/>
+        <w:jc w:val="both"/>
+      </w:pPr>
+      <w:r>
+        <w:rPr>
+          <w:rFonts w:ascii="Georgia" w:cs="Georgia" w:eastAsia="Georgia" w:hAnsi="Georgia"/>
+          <w:sz w:val="21"/>
+          <w:szCs w:val="21"/>
+        </w:rPr>
+        <w:t xml:space="preserve">— Mãe, o Carlos ainda faz o mestrado à noite? Na faculdade de Direito?</w:t>
+      </w:r>
+    </w:p>
+    <w:p>
+      <w:pPr>
+        <w:spacing w:after="0" w:line="312"/>
+        <w:ind w:firstLine="340"/>
+        <w:jc w:val="both"/>
+      </w:pPr>
+      <w:r>
+        <w:rPr>
+          <w:rFonts w:ascii="Georgia" w:cs="Georgia" w:eastAsia="Georgia" w:hAnsi="Georgia"/>
+          <w:sz w:val="21"/>
+          <w:szCs w:val="21"/>
+        </w:rPr>
+        <w:t xml:space="preserve">— Faz, filha. Por quê? — A voz de Sílvia estava baixa, arrastada, como sempre depois do remédio da noite. — Ele não te contou? Ele não conta nada pra ninguém.</w:t>
+      </w:r>
+    </w:p>
+    <w:p>
+      <w:pPr>
+        <w:spacing w:after="0" w:line="312"/>
+        <w:ind w:firstLine="340"/>
+        <w:jc w:val="both"/>
+      </w:pPr>
+      <w:r>
+        <w:rPr>
+          <w:rFonts w:ascii="Georgia" w:cs="Georgia" w:eastAsia="Georgia" w:hAnsi="Georgia"/>
+          <w:sz w:val="21"/>
+          <w:szCs w:val="21"/>
+        </w:rPr>
+        <w:t xml:space="preserve">— Que dia ele tem aula?</w:t>
+      </w:r>
+    </w:p>
+    <w:p>
+      <w:pPr>
+        <w:spacing w:after="0" w:line="312"/>
+        <w:ind w:firstLine="340"/>
+        <w:jc w:val="both"/>
+      </w:pPr>
+      <w:r>
+        <w:rPr>
+          <w:rFonts w:ascii="Georgia" w:cs="Georgia" w:eastAsia="Georgia" w:hAnsi="Georgia"/>
+          <w:sz w:val="21"/>
+          <w:szCs w:val="21"/>
+        </w:rPr>
+        <w:t xml:space="preserve">— Segunda e quinta. — Uma pausa. — Por quê, Lia?</w:t>
+      </w:r>
+    </w:p>
+    <w:p>
+      <w:pPr>
+        <w:spacing w:after="0" w:line="312"/>
+        <w:ind w:firstLine="340"/>
+        <w:jc w:val="both"/>
+      </w:pPr>
+      <w:r>
+        <w:rPr>
+          <w:rFonts w:ascii="Georgia" w:cs="Georgia" w:eastAsia="Georgia" w:hAnsi="Georgia"/>
+          <w:sz w:val="21"/>
+          <w:szCs w:val="21"/>
+        </w:rPr>
+        <w:t xml:space="preserve">— Nada, mãe. Saudade dele.</w:t>
+      </w:r>
+    </w:p>
+    <w:p>
+      <w:pPr>
+        <w:spacing w:after="200" w:before="200"/>
+        <w:jc w:val="center"/>
+      </w:pPr>
+      <w:r>
+        <w:rPr>
+          <w:rFonts w:ascii="Georgia" w:cs="Georgia" w:eastAsia="Georgia" w:hAnsi="Georgia"/>
+          <w:sz w:val="22"/>
+          <w:szCs w:val="22"/>
+        </w:rPr>
+        <w:t xml:space="preserve">*</w:t>
+      </w:r>
+    </w:p>
+    <w:p>
+      <w:pPr>
+        <w:spacing w:after="0" w:line="312"/>
+        <w:ind w:firstLine="340"/>
+        <w:jc w:val="both"/>
+      </w:pPr>
+      <w:r>
+        <w:rPr>
+          <w:rFonts w:ascii="Georgia" w:cs="Georgia" w:eastAsia="Georgia" w:hAnsi="Georgia"/>
+          <w:sz w:val="21"/>
+          <w:szCs w:val="21"/>
+        </w:rPr>
+        <w:t xml:space="preserve">O prédio da faculdade ficava no centro, perto da Praça João Mendes. Lia chegou às seis e meia de uma quinta-feira e ficou parada na calçada em frente, olhando para as janelas acesas, sem coragem de entrar.</w:t>
+      </w:r>
+    </w:p>
+    <w:p>
+      <w:pPr>
+        <w:spacing w:after="0" w:line="312"/>
+        <w:ind w:firstLine="340"/>
+        <w:jc w:val="both"/>
+      </w:pPr>
+      <w:r>
+        <w:rPr>
+          <w:rFonts w:ascii="Georgia" w:cs="Georgia" w:eastAsia="Georgia" w:hAnsi="Georgia"/>
+          <w:sz w:val="21"/>
+          <w:szCs w:val="21"/>
+        </w:rPr>
+        <w:t xml:space="preserve">Na portaria, um funcionário de uniforme cinza conferia carteirinhas. Lia perguntou pela turma de mestrado em Direito Civil. Ele consultou uma lista presa com fita adesiva no vidro.</w:t>
+      </w:r>
+    </w:p>
+    <w:p>
+      <w:pPr>
+        <w:spacing w:after="0" w:line="312"/>
+        <w:ind w:firstLine="340"/>
+        <w:jc w:val="both"/>
+      </w:pPr>
+      <w:r>
+        <w:rPr>
+          <w:rFonts w:ascii="Georgia" w:cs="Georgia" w:eastAsia="Georgia" w:hAnsi="Georgia"/>
+          <w:sz w:val="21"/>
+          <w:szCs w:val="21"/>
+        </w:rPr>
+        <w:t xml:space="preserve">— Bloco doze, sala sete. Terceiro andar. Mas a senhora não pode subir sem carteirinha.</w:t>
+      </w:r>
+    </w:p>
+    <w:p>
+      <w:pPr>
+        <w:spacing w:after="0" w:line="312"/>
+        <w:ind w:firstLine="340"/>
+        <w:jc w:val="both"/>
+      </w:pPr>
+      <w:r>
+        <w:rPr>
+          <w:rFonts w:ascii="Georgia" w:cs="Georgia" w:eastAsia="Georgia" w:hAnsi="Georgia"/>
+          <w:sz w:val="21"/>
+          <w:szCs w:val="21"/>
+        </w:rPr>
+        <w:t xml:space="preserve">— Eu só queria saber onde é.</w:t>
+      </w:r>
+    </w:p>
+    <w:p>
+      <w:pPr>
+        <w:spacing w:after="0" w:line="312"/>
+        <w:ind w:firstLine="340"/>
+        <w:jc w:val="both"/>
+      </w:pPr>
+      <w:r>
+        <w:rPr>
+          <w:rFonts w:ascii="Georgia" w:cs="Georgia" w:eastAsia="Georgia" w:hAnsi="Georgia"/>
+          <w:sz w:val="21"/>
+          <w:szCs w:val="21"/>
+        </w:rPr>
+        <w:t xml:space="preserve">O porteiro a olhou com um ar curioso.</w:t>
+      </w:r>
+    </w:p>
+    <w:p>
+      <w:pPr>
+        <w:spacing w:after="0" w:line="312"/>
+        <w:ind w:firstLine="340"/>
+        <w:jc w:val="both"/>
+      </w:pPr>
+      <w:r>
+        <w:rPr>
+          <w:rFonts w:ascii="Georgia" w:cs="Georgia" w:eastAsia="Georgia" w:hAnsi="Georgia"/>
+          <w:sz w:val="21"/>
+          <w:szCs w:val="21"/>
+        </w:rPr>
+        <w:t xml:space="preserve">— A senhora é parente do senhor de terno?</w:t>
+      </w:r>
+    </w:p>
+    <w:p>
+      <w:pPr>
+        <w:spacing w:after="0" w:line="312"/>
+        <w:ind w:firstLine="340"/>
+        <w:jc w:val="both"/>
+      </w:pPr>
+      <w:r>
+        <w:rPr>
+          <w:rFonts w:ascii="Georgia" w:cs="Georgia" w:eastAsia="Georgia" w:hAnsi="Georgia"/>
+          <w:sz w:val="21"/>
+          <w:szCs w:val="21"/>
+        </w:rPr>
+        <w:t xml:space="preserve">— Que senhor?</w:t>
+      </w:r>
+    </w:p>
+    <w:p>
+      <w:pPr>
+        <w:spacing w:after="0" w:line="312"/>
+        <w:ind w:firstLine="340"/>
+        <w:jc w:val="both"/>
+      </w:pPr>
+      <w:r>
+        <w:rPr>
+          <w:rFonts w:ascii="Georgia" w:cs="Georgia" w:eastAsia="Georgia" w:hAnsi="Georgia"/>
+          <w:sz w:val="21"/>
+          <w:szCs w:val="21"/>
+        </w:rPr>
+        <w:t xml:space="preserve">— Um senhor que vinha toda quinta. Ficava aqui no banco da calçada, das sete até as nove e meia, esperando a turma do mestrado sair. Nunca subia. Uma vez eu ofereci café, ele aceitou. Disse que estava esperando o filho. — O porteiro coçou o queixo. — Faz umas semanas que ele não aparece. Acho que desistiu.</w:t>
+      </w:r>
+    </w:p>
+    <w:p>
+      <w:pPr>
+        <w:spacing w:after="0" w:line="312"/>
+        <w:ind w:firstLine="340"/>
+        <w:jc w:val="both"/>
+      </w:pPr>
+      <w:r>
+        <w:rPr>
+          <w:rFonts w:ascii="Georgia" w:cs="Georgia" w:eastAsia="Georgia" w:hAnsi="Georgia"/>
+          <w:sz w:val="21"/>
+          <w:szCs w:val="21"/>
+        </w:rPr>
+        <w:t xml:space="preserve">Lia olhou para o banco de madeira na calçada, sob a marquise, entre um ponto de ônibus e uma banca de jornal.</w:t>
+      </w:r>
+    </w:p>
+    <w:p>
+      <w:pPr>
+        <w:spacing w:after="0" w:line="312"/>
+        <w:ind w:firstLine="340"/>
+        <w:jc w:val="both"/>
+      </w:pPr>
+      <w:r>
+        <w:rPr>
+          <w:rFonts w:ascii="Georgia" w:cs="Georgia" w:eastAsia="Georgia" w:hAnsi="Georgia"/>
+          <w:sz w:val="21"/>
+          <w:szCs w:val="21"/>
+        </w:rPr>
+        <w:t xml:space="preserve">— O filho alguma vez desceu para falar com ele?</w:t>
+      </w:r>
+    </w:p>
+    <w:p>
+      <w:pPr>
+        <w:spacing w:after="0" w:line="312"/>
+        <w:ind w:firstLine="340"/>
+        <w:jc w:val="both"/>
+      </w:pPr>
+      <w:r>
+        <w:rPr>
+          <w:rFonts w:ascii="Georgia" w:cs="Georgia" w:eastAsia="Georgia" w:hAnsi="Georgia"/>
+          <w:sz w:val="21"/>
+          <w:szCs w:val="21"/>
+        </w:rPr>
+        <w:t xml:space="preserve">— Nunca que eu tenha visto, dona. O rapaz sai pela outra porta, a dos fundos. Toda quinta.</w:t>
+      </w:r>
+    </w:p>
+    <w:p>
+      <w:pPr>
+        <w:spacing w:after="200" w:before="200"/>
+        <w:jc w:val="center"/>
+      </w:pPr>
+      <w:r>
+        <w:rPr>
+          <w:rFonts w:ascii="Georgia" w:cs="Georgia" w:eastAsia="Georgia" w:hAnsi="Georgia"/>
+          <w:sz w:val="22"/>
+          <w:szCs w:val="22"/>
+        </w:rPr>
+        <w:t xml:space="preserve">*</w:t>
+      </w:r>
+    </w:p>
+    <w:p>
+      <w:pPr>
+        <w:spacing w:after="0" w:line="312"/>
+        <w:ind w:firstLine="340"/>
+        <w:jc w:val="both"/>
+      </w:pPr>
+      <w:r>
+        <w:rPr>
+          <w:rFonts w:ascii="Georgia" w:cs="Georgia" w:eastAsia="Georgia" w:hAnsi="Georgia"/>
+          <w:sz w:val="21"/>
+          <w:szCs w:val="21"/>
+        </w:rPr>
+        <w:t xml:space="preserve">Lia digitou os números sentada naquele banco, com o celular do pai no colo e os ônibus passando.</w:t>
+      </w:r>
+    </w:p>
+    <w:p>
+      <w:pPr>
+        <w:spacing w:after="0" w:line="312"/>
+        <w:ind w:firstLine="340"/>
+        <w:jc w:val="both"/>
+      </w:pPr>
+      <w:r>
+        <w:rPr>
+          <w:rFonts w:ascii="Georgia" w:cs="Georgia" w:eastAsia="Georgia" w:hAnsi="Georgia"/>
+          <w:sz w:val="21"/>
+          <w:szCs w:val="21"/>
+        </w:rPr>
+        <w:t xml:space="preserve">Bloco doze, sala sete. Um, dois, zero, sete.</w:t>
+      </w:r>
+    </w:p>
+    <w:p>
+      <w:pPr>
+        <w:pBdr>
+          <w:top w:val="single" w:color="555555" w:sz="6" w:space="6"/>
+          <w:bottom w:val="single" w:color="555555" w:sz="6" w:space="6"/>
+          <w:left w:val="single" w:color="555555" w:sz="6" w:space="6"/>
+          <w:right w:val="single" w:color="555555" w:sz="6" w:space="6"/>
+        </w:pBdr>
+        <w:shd w:fill="EFEFEF" w:color="auto" w:val="clear"/>
+        <w:spacing w:after="0" w:before="240"/>
+        <w:ind w:left="227" w:right="227"/>
+        <w:jc w:val="center"/>
+      </w:pPr>
+      <w:r>
+        <w:rPr>
+          <w:rFonts w:ascii="Georgia" w:cs="Georgia" w:eastAsia="Georgia" w:hAnsi="Georgia"/>
+          <w:b/>
+          <w:bCs/>
+          <w:spacing w:val="30"/>
+          <w:sz w:val="17"/>
+          <w:szCs w:val="17"/>
+        </w:rPr>
+        <w:t xml:space="preserve">NO CELULAR DE HENRIQUE</w:t>
+      </w:r>
+    </w:p>
+    <w:p>
+      <w:pPr>
+        <w:pBdr>
+          <w:top w:val="single" w:color="555555" w:sz="6" w:space="6"/>
+          <w:bottom w:val="single" w:color="555555" w:sz="6" w:space="6"/>
+          <w:left w:val="single" w:color="555555" w:sz="6" w:space="6"/>
+          <w:right w:val="single" w:color="555555" w:sz="6" w:space="6"/>
+        </w:pBdr>
+        <w:shd w:fill="EFEFEF" w:color="auto" w:val="clear"/>
+        <w:spacing w:after="240" w:before="0" w:line="288"/>
+        <w:ind w:left="227" w:right="227"/>
+        <w:jc w:val="center"/>
+      </w:pPr>
+      <w:r>
+        <w:rPr>
+          <w:rFonts w:ascii="Georgia" w:cs="Georgia" w:eastAsia="Georgia" w:hAnsi="Georgia"/>
+          <w:i/>
+          <w:iCs/>
+          <w:sz w:val="19"/>
+          <w:szCs w:val="19"/>
+        </w:rPr>
+        <w:t xml:space="preserve">Abra o gravador de áudio do celular de Henrique. A senha é o lugar onde ele esperava toda quinta: bloco e sala, somados ao seu código pessoal.</w:t>
+      </w:r>
+    </w:p>
+    <w:p>
+      <w:pPr>
+        <w:spacing w:after="0" w:line="312"/>
+        <w:ind w:firstLine="340"/>
+        <w:jc w:val="both"/>
+      </w:pPr>
+      <w:r>
+        <w:rPr>
+          <w:rFonts w:ascii="Georgia" w:cs="Georgia" w:eastAsia="Georgia" w:hAnsi="Georgia"/>
+          <w:sz w:val="21"/>
+          <w:szCs w:val="21"/>
+        </w:rPr>
+        <w:t xml:space="preserve">O gravador se abriu. Havia só um arquivo, de quarenta e um segundos, gravado no sábado anterior à morte. O nome do arquivo era Para o Carlos.</w:t>
+      </w:r>
+    </w:p>
+    <w:p>
+      <w:pPr>
+        <w:spacing w:after="0" w:line="312"/>
+        <w:ind w:firstLine="340"/>
+        <w:jc w:val="both"/>
+      </w:pPr>
+      <w:r>
+        <w:rPr>
+          <w:rFonts w:ascii="Georgia" w:cs="Georgia" w:eastAsia="Georgia" w:hAnsi="Georgia"/>
+          <w:sz w:val="21"/>
+          <w:szCs w:val="21"/>
+        </w:rPr>
+        <w:t xml:space="preserve">Ela olhou em volta. Ninguém prestava atenção nela. Pôs o fone de ouvido e apertou o play.</w:t>
+      </w:r>
+    </w:p>
+    <w:p>
+      <w:pPr>
+        <w:spacing w:after="0" w:line="312"/>
+        <w:ind w:firstLine="340"/>
+        <w:jc w:val="both"/>
+      </w:pPr>
+      <w:r>
+        <w:rPr>
+          <w:rFonts w:ascii="Georgia" w:cs="Georgia" w:eastAsia="Georgia" w:hAnsi="Georgia"/>
+          <w:sz w:val="21"/>
+          <w:szCs w:val="21"/>
+        </w:rPr>
+        <w:t xml:space="preserve">Primeiro, alguns segundos de silêncio e um barulho de carro passando, como se o pai estivesse gravando dentro de um carro estacionado. Depois a voz dele, rouca, mais baixa do que ela lembrava.</w:t>
+      </w:r>
+    </w:p>
+    <w:p>
+      <w:pPr>
+        <w:spacing w:after="0" w:line="312"/>
+        <w:ind w:firstLine="340"/>
+        <w:jc w:val="both"/>
+      </w:pPr>
+      <w:r>
+        <w:rPr>
+          <w:rFonts w:ascii="Georgia" w:cs="Georgia" w:eastAsia="Georgia" w:hAnsi="Georgia"/>
+          <w:sz w:val="21"/>
+          <w:szCs w:val="21"/>
+        </w:rPr>
+        <w:t xml:space="preserve">Carlos. Sou eu. Não apaga. Eu sei que você não quer ouvir a minha voz, e eu entendo. Eu fiquei esperando você naquele banco por seis meses e você nunca desceu. Tudo bem. Eu também não desceria. Mas eu não aguento mais carregar isso sozinho. Tem uma coisa que eu nunca contei para ninguém, e que eu devia ter contado há vinte anos. Semana que vem você vai entender por que eu estou falando isso agora. E a sua mãe vai saber de tudo.</w:t>
+      </w:r>
+    </w:p>
+    <w:p>
+      <w:pPr>
+        <w:spacing w:after="0" w:line="312"/>
+        <w:ind w:firstLine="340"/>
+        <w:jc w:val="both"/>
+      </w:pPr>
+      <w:r>
+        <w:rPr>
+          <w:rFonts w:ascii="Georgia" w:cs="Georgia" w:eastAsia="Georgia" w:hAnsi="Georgia"/>
+          <w:sz w:val="21"/>
+          <w:szCs w:val="21"/>
+        </w:rPr>
+        <w:t xml:space="preserve">Mais um segundo de silêncio. E a gravação acabava.</w:t>
+      </w:r>
+    </w:p>
+    <w:p>
+      <w:pPr>
+        <w:spacing w:after="0" w:line="312"/>
+        <w:ind w:firstLine="340"/>
+        <w:jc w:val="both"/>
+      </w:pPr>
+      <w:r>
+        <w:rPr>
+          <w:rFonts w:ascii="Georgia" w:cs="Georgia" w:eastAsia="Georgia" w:hAnsi="Georgia"/>
+          <w:sz w:val="21"/>
+          <w:szCs w:val="21"/>
+        </w:rPr>
+        <w:t xml:space="preserve">Lia tirou o fone de ouvido devagar.</w:t>
+      </w:r>
+    </w:p>
+    <w:p>
+      <w:pPr>
+        <w:spacing w:after="200" w:before="200"/>
+        <w:jc w:val="center"/>
+      </w:pPr>
+      <w:r>
+        <w:rPr>
+          <w:rFonts w:ascii="Georgia" w:cs="Georgia" w:eastAsia="Georgia" w:hAnsi="Georgia"/>
+          <w:sz w:val="22"/>
+          <w:szCs w:val="22"/>
+        </w:rPr>
+        <w:t xml:space="preserve">*</w:t>
+      </w:r>
+    </w:p>
+    <w:p>
+      <w:pPr>
+        <w:spacing w:after="0" w:line="312"/>
+        <w:ind w:firstLine="340"/>
+        <w:jc w:val="both"/>
+      </w:pPr>
+      <w:r>
+        <w:rPr>
+          <w:rFonts w:ascii="Georgia" w:cs="Georgia" w:eastAsia="Georgia" w:hAnsi="Georgia"/>
+          <w:sz w:val="21"/>
+          <w:szCs w:val="21"/>
+        </w:rPr>
+        <w:t xml:space="preserve">Ouviu de novo no carro. E de novo em casa, de luz apagada. Na quarta vez, já conseguia repetir cada palavra de cor, e cada palavra ficava mais pesada.</w:t>
+      </w:r>
+    </w:p>
+    <w:p>
+      <w:pPr>
+        <w:spacing w:after="0" w:line="312"/>
+        <w:ind w:firstLine="340"/>
+        <w:jc w:val="both"/>
+      </w:pPr>
+      <w:r>
+        <w:rPr>
+          <w:rFonts w:ascii="Georgia" w:cs="Georgia" w:eastAsia="Georgia" w:hAnsi="Georgia"/>
+          <w:sz w:val="21"/>
+          <w:szCs w:val="21"/>
+        </w:rPr>
+        <w:t xml:space="preserve">Uma coisa que eu nunca contei para ninguém. A sua mãe vai saber de tudo.</w:t>
+      </w:r>
+    </w:p>
+    <w:p>
+      <w:pPr>
+        <w:spacing w:after="0" w:line="312"/>
+        <w:ind w:firstLine="340"/>
+        <w:jc w:val="both"/>
+      </w:pPr>
+      <w:r>
+        <w:rPr>
+          <w:rFonts w:ascii="Georgia" w:cs="Georgia" w:eastAsia="Georgia" w:hAnsi="Georgia"/>
+          <w:sz w:val="21"/>
+          <w:szCs w:val="21"/>
+        </w:rPr>
+        <w:t xml:space="preserve">O que o pai podia contar a Sílvia que ela ainda não soubesse? As outras mulheres, ela sabia. O divórcio, ela tinha vivido. O dinheiro, ela tinha perdido. Restava o quê? Alguma coisa pior? Alguma coisa que, contada agora a uma mulher que mal saía da cama, pudesse acabar com o pouco que sobrava dela?</w:t>
+      </w:r>
+    </w:p>
+    <w:p>
+      <w:pPr>
+        <w:spacing w:after="0" w:line="312"/>
+        <w:ind w:firstLine="340"/>
+        <w:jc w:val="both"/>
+      </w:pPr>
+      <w:r>
+        <w:rPr>
+          <w:rFonts w:ascii="Georgia" w:cs="Georgia" w:eastAsia="Georgia" w:hAnsi="Georgia"/>
+          <w:sz w:val="21"/>
+          <w:szCs w:val="21"/>
+        </w:rPr>
+        <w:t xml:space="preserve">E Carlos tinha ouvido aquilo. Lia tinha certeza. O áudio aparecia como enviado no BlackBerry Messenger para o contato dele, no sábado às 22h14, com os dois tracinhos de entregue e o L de lido. Carlos tinha ouvido aquela voz dizendo semana que vem e a sua mãe vai saber de tudo, três dias antes de o pai morrer.</w:t>
+      </w:r>
+    </w:p>
+    <w:p>
+      <w:pPr>
+        <w:spacing w:after="0" w:line="312"/>
+        <w:ind w:firstLine="340"/>
+        <w:jc w:val="both"/>
+      </w:pPr>
+      <w:r>
+        <w:rPr>
+          <w:rFonts w:ascii="Georgia" w:cs="Georgia" w:eastAsia="Georgia" w:hAnsi="Georgia"/>
+          <w:sz w:val="21"/>
+          <w:szCs w:val="21"/>
+        </w:rPr>
+        <w:t xml:space="preserve">Lia pensou no irmão no crematório, olhando para o chão o tempo inteiro. Sem chorar. Sem levantar os olhos nem quando a plataforma desceu.</w:t>
+      </w:r>
+    </w:p>
+    <w:p>
+      <w:pPr>
+        <w:spacing w:after="0" w:line="312"/>
+        <w:ind w:firstLine="340"/>
+        <w:jc w:val="both"/>
+      </w:pPr>
+      <w:r>
+        <w:rPr>
+          <w:rFonts w:ascii="Georgia" w:cs="Georgia" w:eastAsia="Georgia" w:hAnsi="Georgia"/>
+          <w:sz w:val="21"/>
+          <w:szCs w:val="21"/>
+        </w:rPr>
+        <w:t xml:space="preserve">Pensou no guardanapo da padaria, na lista de nomes, e em Lucas deixando de escrever o nome de Carlos. E em como ela tinha percebido que ele não escreveu.</w:t>
+      </w:r>
+    </w:p>
+    <w:p>
+      <w:pPr>
+        <w:spacing w:after="0" w:line="312"/>
+        <w:ind w:firstLine="340"/>
+        <w:jc w:val="both"/>
+      </w:pPr>
+      <w:r>
+        <w:rPr>
+          <w:rFonts w:ascii="Georgia" w:cs="Georgia" w:eastAsia="Georgia" w:hAnsi="Georgia"/>
+          <w:sz w:val="21"/>
+          <w:szCs w:val="21"/>
+        </w:rPr>
+        <w:t xml:space="preserve">Lucas desconfiava de Carlos. Já desconfiava antes.</w:t>
+      </w:r>
+    </w:p>
+    <w:p>
+      <w:pPr>
+        <w:spacing w:after="0" w:line="312"/>
+        <w:ind w:firstLine="340"/>
+        <w:jc w:val="both"/>
+      </w:pPr>
+      <w:r>
+        <w:rPr>
+          <w:rFonts w:ascii="Georgia" w:cs="Georgia" w:eastAsia="Georgia" w:hAnsi="Georgia"/>
+          <w:sz w:val="21"/>
+          <w:szCs w:val="21"/>
+        </w:rPr>
+        <w:t xml:space="preserve">Se ouvisse aquele áudio, não teria mais dúvida nenhuma.</w:t>
+      </w:r>
+    </w:p>
+    <w:p>
+      <w:pPr>
+        <w:spacing w:after="200" w:before="200"/>
+        <w:jc w:val="center"/>
+      </w:pPr>
+      <w:r>
+        <w:rPr>
+          <w:rFonts w:ascii="Georgia" w:cs="Georgia" w:eastAsia="Georgia" w:hAnsi="Georgia"/>
+          <w:sz w:val="22"/>
+          <w:szCs w:val="22"/>
+        </w:rPr>
+        <w:t xml:space="preserve">*</w:t>
+      </w:r>
+    </w:p>
+    <w:p>
+      <w:pPr>
+        <w:spacing w:after="0" w:line="312"/>
+        <w:ind w:firstLine="340"/>
+        <w:jc w:val="both"/>
+      </w:pPr>
+      <w:r>
+        <w:rPr>
+          <w:rFonts w:ascii="Georgia" w:cs="Georgia" w:eastAsia="Georgia" w:hAnsi="Georgia"/>
+          <w:sz w:val="21"/>
+          <w:szCs w:val="21"/>
+        </w:rPr>
+        <w:t xml:space="preserve">Às onze da noite, o celular dela vibrou. Era Lucas.</w:t>
+      </w:r>
+    </w:p>
+    <w:p>
+      <w:pPr>
+        <w:spacing w:after="0" w:line="312"/>
+        <w:ind w:firstLine="340"/>
+        <w:jc w:val="both"/>
+      </w:pPr>
+      <w:r>
+        <w:rPr>
+          <w:rFonts w:ascii="Georgia" w:cs="Georgia" w:eastAsia="Georgia" w:hAnsi="Georgia"/>
+          <w:sz w:val="21"/>
+          <w:szCs w:val="21"/>
+        </w:rPr>
+        <w:t xml:space="preserve">Tudo bem? Achou alguma coisa nesta semana?</w:t>
+      </w:r>
+    </w:p>
+    <w:p>
+      <w:pPr>
+        <w:spacing w:after="0" w:line="312"/>
+        <w:ind w:firstLine="340"/>
+        <w:jc w:val="both"/>
+      </w:pPr>
+      <w:r>
+        <w:rPr>
+          <w:rFonts w:ascii="Georgia" w:cs="Georgia" w:eastAsia="Georgia" w:hAnsi="Georgia"/>
+          <w:sz w:val="21"/>
+          <w:szCs w:val="21"/>
+        </w:rPr>
+        <w:t xml:space="preserve">Lia ficou olhando para a mensagem. Do lado, no sofá, o BlackBerry do pai, aberto no gravador de áudio, com o arquivo Para o Carlos selecionado.</w:t>
+      </w:r>
+    </w:p>
+    <w:p>
+      <w:pPr>
+        <w:spacing w:after="0" w:line="312"/>
+        <w:ind w:firstLine="340"/>
+        <w:jc w:val="both"/>
+      </w:pPr>
+      <w:r>
+        <w:rPr>
+          <w:rFonts w:ascii="Georgia" w:cs="Georgia" w:eastAsia="Georgia" w:hAnsi="Georgia"/>
+          <w:sz w:val="21"/>
+          <w:szCs w:val="21"/>
+        </w:rPr>
+        <w:t xml:space="preserve">Lembrou do combinado na padaria, das mãos apertadas por cima da mesa. Tudo o que um descobrir, o outro fica sabendo.</w:t>
+      </w:r>
+    </w:p>
+    <w:p>
+      <w:pPr>
+        <w:spacing w:after="0" w:line="312"/>
+        <w:ind w:firstLine="340"/>
+        <w:jc w:val="both"/>
+      </w:pPr>
+      <w:r>
+        <w:rPr>
+          <w:rFonts w:ascii="Georgia" w:cs="Georgia" w:eastAsia="Georgia" w:hAnsi="Georgia"/>
+          <w:sz w:val="21"/>
+          <w:szCs w:val="21"/>
+        </w:rPr>
+        <w:t xml:space="preserve">Lembrou também que Lucas tinha demorado dias para contar sobre o e-mail do pai, e que, quando contou, disse só que queria ter certeza.</w:t>
+      </w:r>
+    </w:p>
+    <w:p>
+      <w:pPr>
+        <w:spacing w:after="0" w:line="312"/>
+        <w:ind w:firstLine="340"/>
+        <w:jc w:val="both"/>
+      </w:pPr>
+      <w:r>
+        <w:rPr>
+          <w:rFonts w:ascii="Georgia" w:cs="Georgia" w:eastAsia="Georgia" w:hAnsi="Georgia"/>
+          <w:sz w:val="21"/>
+          <w:szCs w:val="21"/>
+        </w:rPr>
+        <w:t xml:space="preserve">Ela também queria ter certeza.</w:t>
+      </w:r>
+    </w:p>
+    <w:p>
+      <w:pPr>
+        <w:spacing w:after="0" w:line="312"/>
+        <w:ind w:firstLine="340"/>
+        <w:jc w:val="both"/>
+      </w:pPr>
+      <w:r>
+        <w:rPr>
+          <w:rFonts w:ascii="Georgia" w:cs="Georgia" w:eastAsia="Georgia" w:hAnsi="Georgia"/>
+          <w:sz w:val="21"/>
+          <w:szCs w:val="21"/>
+        </w:rPr>
+        <w:t xml:space="preserve">Apagou o arquivo do gravador.</w:t>
+      </w:r>
+    </w:p>
+    <w:p>
+      <w:pPr>
+        <w:spacing w:after="0" w:line="312"/>
+        <w:ind w:firstLine="340"/>
+        <w:jc w:val="both"/>
+      </w:pPr>
+      <w:r>
+        <w:rPr>
+          <w:rFonts w:ascii="Georgia" w:cs="Georgia" w:eastAsia="Georgia" w:hAnsi="Georgia"/>
+          <w:sz w:val="21"/>
+          <w:szCs w:val="21"/>
+        </w:rPr>
+        <w:t xml:space="preserve">Não do mundo. Antes, tinha mandado uma cópia para o próprio e-mail, porque não era tola e porque, se um dia precisasse, queria poder ouvir de novo. Mas, do celular do pai, que na semana seguinte voltaria para as mãos de Lucas, o áudio sumiu. Ficou só a pasta vazia, protegida pela senha do banco da calçada.</w:t>
+      </w:r>
+    </w:p>
+    <w:p>
+      <w:pPr>
+        <w:spacing w:after="0" w:line="312"/>
+        <w:ind w:firstLine="340"/>
+        <w:jc w:val="both"/>
+      </w:pPr>
+      <w:r>
+        <w:rPr>
+          <w:rFonts w:ascii="Georgia" w:cs="Georgia" w:eastAsia="Georgia" w:hAnsi="Georgia"/>
+          <w:sz w:val="21"/>
+          <w:szCs w:val="21"/>
+        </w:rPr>
+        <w:t xml:space="preserve">Depois respondeu ao irmão.</w:t>
+      </w:r>
+    </w:p>
+    <w:p>
+      <w:pPr>
+        <w:spacing w:after="0" w:line="312"/>
+        <w:ind w:firstLine="340"/>
+        <w:jc w:val="both"/>
+      </w:pPr>
+      <w:r>
+        <w:rPr>
+          <w:rFonts w:ascii="Georgia" w:cs="Georgia" w:eastAsia="Georgia" w:hAnsi="Georgia"/>
+          <w:sz w:val="21"/>
+          <w:szCs w:val="21"/>
+        </w:rPr>
+        <w:t xml:space="preserve">Nada de novo. Só a agenda, cheia de reuniões. Amanhã te conto do Falcão.</w:t>
+      </w:r>
+    </w:p>
+    <w:p>
+      <w:pPr>
+        <w:spacing w:after="0" w:line="312"/>
+        <w:ind w:firstLine="340"/>
+        <w:jc w:val="both"/>
+      </w:pPr>
+      <w:r>
+        <w:rPr>
+          <w:rFonts w:ascii="Georgia" w:cs="Georgia" w:eastAsia="Georgia" w:hAnsi="Georgia"/>
+          <w:sz w:val="21"/>
+          <w:szCs w:val="21"/>
+        </w:rPr>
+        <w:t xml:space="preserve">Mandou, desligou o celular e ficou um tempo parada no escuro, entendendo devagar o que tinha acabado de fazer.</w:t>
+      </w:r>
+    </w:p>
+    <w:p>
+      <w:pPr>
+        <w:spacing w:after="0" w:line="312"/>
+        <w:ind w:firstLine="340"/>
+        <w:jc w:val="both"/>
+      </w:pPr>
+      <w:r>
+        <w:rPr>
+          <w:rFonts w:ascii="Georgia" w:cs="Georgia" w:eastAsia="Georgia" w:hAnsi="Georgia"/>
+          <w:sz w:val="21"/>
+          <w:szCs w:val="21"/>
+        </w:rPr>
+        <w:t xml:space="preserve">Tinha feito com Lucas exatamente o que, no crematório, desconfiara que ele estivesse fazendo com ela.</w:t>
       </w:r>
     </w:p>
     <w:sectPr>

</xml_diff>

<commit_message>
Livro policial: capítulo 17 (A lista de presença)
Co-Authored-By: Claude Opus 5.5 <noreply@anthropic.com>
Claude-Session: https://claude.ai/code/session_01BrurxSYygRC3rRhaUYosm1
</commit_message>
<xml_diff>
--- a/docs/livro-policial/TODO_CRIME_TEM_UM_AUTOR.docx
+++ b/docs/livro-policial/TODO_CRIME_TEM_UM_AUTOR.docx
@@ -17044,6 +17044,1251 @@
           <w:szCs w:val="21"/>
         </w:rPr>
         <w:t xml:space="preserve">Tinha feito com Lucas exatamente o que, no crematório, desconfiara que ele estivesse fazendo com ela.</w:t>
+      </w:r>
+    </w:p>
+    <w:p>
+      <w:pPr>
+        <w:pageBreakBefore/>
+        <w:spacing w:after="120" w:before="1800"/>
+        <w:jc w:val="center"/>
+      </w:pPr>
+      <w:r>
+        <w:rPr>
+          <w:rFonts w:ascii="Georgia" w:cs="Georgia" w:eastAsia="Georgia" w:hAnsi="Georgia"/>
+          <w:spacing w:val="40"/>
+          <w:sz w:val="20"/>
+          <w:szCs w:val="20"/>
+        </w:rPr>
+        <w:t xml:space="preserve">CAPÍTULO 17</w:t>
+      </w:r>
+    </w:p>
+    <w:p>
+      <w:pPr>
+        <w:spacing w:after="720"/>
+        <w:jc w:val="center"/>
+      </w:pPr>
+      <w:r>
+        <w:rPr>
+          <w:rFonts w:ascii="Georgia" w:cs="Georgia" w:eastAsia="Georgia" w:hAnsi="Georgia"/>
+          <w:b/>
+          <w:bCs/>
+          <w:sz w:val="32"/>
+          <w:szCs w:val="32"/>
+        </w:rPr>
+        <w:t xml:space="preserve">A lista de presença</w:t>
+      </w:r>
+    </w:p>
+    <w:p>
+      <w:pPr>
+        <w:spacing w:after="0" w:line="312"/>
+        <w:ind w:firstLine="340"/>
+        <w:jc w:val="both"/>
+      </w:pPr>
+      <w:r>
+        <w:rPr>
+          <w:rFonts w:ascii="Georgia" w:cs="Georgia" w:eastAsia="Georgia" w:hAnsi="Georgia"/>
+          <w:sz w:val="21"/>
+          <w:szCs w:val="21"/>
+        </w:rPr>
+        <w:t xml:space="preserve">Lia contou do Falcão numa sexta-feira à noite, num restaurante japonês de Pinheiros onde ninguém os conhecia.</w:t>
+      </w:r>
+    </w:p>
+    <w:p>
+      <w:pPr>
+        <w:spacing w:after="0" w:line="312"/>
+        <w:ind w:firstLine="340"/>
+        <w:jc w:val="both"/>
+      </w:pPr>
+      <w:r>
+        <w:rPr>
+          <w:rFonts w:ascii="Georgia" w:cs="Georgia" w:eastAsia="Georgia" w:hAnsi="Georgia"/>
+          <w:sz w:val="21"/>
+          <w:szCs w:val="21"/>
+        </w:rPr>
+        <w:t xml:space="preserve">Contou da Cumeeira, do endereço em Alphaville, do carro prata registrado no mesmo prédio, do loteamento de Cajamar e da ata em que o deputado defendia o projeto com mais entusiasmo do que todos. Contou da entrevista no YouTube, das duas tentativas de homicídio, do funcionário humilde num motel que nenhum jornal tinha mencionado. Contou da delegada dizendo que aquilo, sozinho, não provava nada, mas era interessante.</w:t>
+      </w:r>
+    </w:p>
+    <w:p>
+      <w:pPr>
+        <w:spacing w:after="0" w:line="312"/>
+        <w:ind w:firstLine="340"/>
+        <w:jc w:val="both"/>
+      </w:pPr>
+      <w:r>
+        <w:rPr>
+          <w:rFonts w:ascii="Georgia" w:cs="Georgia" w:eastAsia="Georgia" w:hAnsi="Georgia"/>
+          <w:sz w:val="21"/>
+          <w:szCs w:val="21"/>
+        </w:rPr>
+        <w:t xml:space="preserve">Lucas ouviu tudo sem tocar no sushi.</w:t>
+      </w:r>
+    </w:p>
+    <w:p>
+      <w:pPr>
+        <w:spacing w:after="0" w:line="312"/>
+        <w:ind w:firstLine="340"/>
+        <w:jc w:val="both"/>
+      </w:pPr>
+      <w:r>
+        <w:rPr>
+          <w:rFonts w:ascii="Georgia" w:cs="Georgia" w:eastAsia="Georgia" w:hAnsi="Georgia"/>
+          <w:sz w:val="21"/>
+          <w:szCs w:val="21"/>
+        </w:rPr>
+        <w:t xml:space="preserve">— Você foi seguida — disse ele, quando ela terminou.</w:t>
+      </w:r>
+    </w:p>
+    <w:p>
+      <w:pPr>
+        <w:spacing w:after="0" w:line="312"/>
+        <w:ind w:firstLine="340"/>
+        <w:jc w:val="both"/>
+      </w:pPr>
+      <w:r>
+        <w:rPr>
+          <w:rFonts w:ascii="Georgia" w:cs="Georgia" w:eastAsia="Georgia" w:hAnsi="Georgia"/>
+          <w:sz w:val="21"/>
+          <w:szCs w:val="21"/>
+        </w:rPr>
+        <w:t xml:space="preserve">Lia o olhou, surpresa.</w:t>
+      </w:r>
+    </w:p>
+    <w:p>
+      <w:pPr>
+        <w:spacing w:after="0" w:line="312"/>
+        <w:ind w:firstLine="340"/>
+        <w:jc w:val="both"/>
+      </w:pPr>
+      <w:r>
+        <w:rPr>
+          <w:rFonts w:ascii="Georgia" w:cs="Georgia" w:eastAsia="Georgia" w:hAnsi="Georgia"/>
+          <w:sz w:val="21"/>
+          <w:szCs w:val="21"/>
+        </w:rPr>
+        <w:t xml:space="preserve">— Como você sabe?</w:t>
+      </w:r>
+    </w:p>
+    <w:p>
+      <w:pPr>
+        <w:spacing w:after="0" w:line="312"/>
+        <w:ind w:firstLine="340"/>
+        <w:jc w:val="both"/>
+      </w:pPr>
+      <w:r>
+        <w:rPr>
+          <w:rFonts w:ascii="Georgia" w:cs="Georgia" w:eastAsia="Georgia" w:hAnsi="Georgia"/>
+          <w:sz w:val="21"/>
+          <w:szCs w:val="21"/>
+        </w:rPr>
+        <w:t xml:space="preserve">— Porque você contou tudo em ordem, com detalhe, e pulou a parte do estacionamento. — Ele largou os hashis. — Você sempre pula a parte que te assusta. Desde criança.</w:t>
+      </w:r>
+    </w:p>
+    <w:p>
+      <w:pPr>
+        <w:spacing w:after="0" w:line="312"/>
+        <w:ind w:firstLine="340"/>
+        <w:jc w:val="both"/>
+      </w:pPr>
+      <w:r>
+        <w:rPr>
+          <w:rFonts w:ascii="Georgia" w:cs="Georgia" w:eastAsia="Georgia" w:hAnsi="Georgia"/>
+          <w:sz w:val="21"/>
+          <w:szCs w:val="21"/>
+        </w:rPr>
+        <w:t xml:space="preserve">Ela demorou a responder. Depois contou do sedã prata, do homem de boné, do semáforo da Rebouças. Lucas ouviu com o maxilar apertado.</w:t>
+      </w:r>
+    </w:p>
+    <w:p>
+      <w:pPr>
+        <w:spacing w:after="0" w:line="312"/>
+        <w:ind w:firstLine="340"/>
+        <w:jc w:val="both"/>
+      </w:pPr>
+      <w:r>
+        <w:rPr>
+          <w:rFonts w:ascii="Georgia" w:cs="Georgia" w:eastAsia="Georgia" w:hAnsi="Georgia"/>
+          <w:sz w:val="21"/>
+          <w:szCs w:val="21"/>
+        </w:rPr>
+        <w:t xml:space="preserve">— Não vai mais sozinha a lugar nenhum — disse.</w:t>
+      </w:r>
+    </w:p>
+    <w:p>
+      <w:pPr>
+        <w:spacing w:after="0" w:line="312"/>
+        <w:ind w:firstLine="340"/>
+        <w:jc w:val="both"/>
+      </w:pPr>
+      <w:r>
+        <w:rPr>
+          <w:rFonts w:ascii="Georgia" w:cs="Georgia" w:eastAsia="Georgia" w:hAnsi="Georgia"/>
+          <w:sz w:val="21"/>
+          <w:szCs w:val="21"/>
+        </w:rPr>
+        <w:t xml:space="preserve">— Você também não.</w:t>
+      </w:r>
+    </w:p>
+    <w:p>
+      <w:pPr>
+        <w:spacing w:after="0" w:line="312"/>
+        <w:ind w:firstLine="340"/>
+        <w:jc w:val="both"/>
+      </w:pPr>
+      <w:r>
+        <w:rPr>
+          <w:rFonts w:ascii="Georgia" w:cs="Georgia" w:eastAsia="Georgia" w:hAnsi="Georgia"/>
+          <w:sz w:val="21"/>
+          <w:szCs w:val="21"/>
+        </w:rPr>
+        <w:t xml:space="preserve">Foi um bom momento. Durou até a conta chegar. Na calçada, ao se despedir, Lia entregou a ele o BlackBerry do pai, embrulhado num lenço, como faziam toda sexta.</w:t>
+      </w:r>
+    </w:p>
+    <w:p>
+      <w:pPr>
+        <w:spacing w:after="0" w:line="312"/>
+        <w:ind w:firstLine="340"/>
+        <w:jc w:val="both"/>
+      </w:pPr>
+      <w:r>
+        <w:rPr>
+          <w:rFonts w:ascii="Georgia" w:cs="Georgia" w:eastAsia="Georgia" w:hAnsi="Georgia"/>
+          <w:sz w:val="21"/>
+          <w:szCs w:val="21"/>
+        </w:rPr>
+        <w:t xml:space="preserve">— Alguma coisa nova nesta semana? — perguntou Lucas.</w:t>
+      </w:r>
+    </w:p>
+    <w:p>
+      <w:pPr>
+        <w:spacing w:after="0" w:line="312"/>
+        <w:ind w:firstLine="340"/>
+        <w:jc w:val="both"/>
+      </w:pPr>
+      <w:r>
+        <w:rPr>
+          <w:rFonts w:ascii="Georgia" w:cs="Georgia" w:eastAsia="Georgia" w:hAnsi="Georgia"/>
+          <w:sz w:val="21"/>
+          <w:szCs w:val="21"/>
+        </w:rPr>
+        <w:t xml:space="preserve">— Nada. Só a agenda.</w:t>
+      </w:r>
+    </w:p>
+    <w:p>
+      <w:pPr>
+        <w:spacing w:after="200" w:before="200"/>
+        <w:jc w:val="center"/>
+      </w:pPr>
+      <w:r>
+        <w:rPr>
+          <w:rFonts w:ascii="Georgia" w:cs="Georgia" w:eastAsia="Georgia" w:hAnsi="Georgia"/>
+          <w:sz w:val="22"/>
+          <w:szCs w:val="22"/>
+        </w:rPr>
+        <w:t xml:space="preserve">*</w:t>
+      </w:r>
+    </w:p>
+    <w:p>
+      <w:pPr>
+        <w:spacing w:after="0" w:line="312"/>
+        <w:ind w:firstLine="340"/>
+        <w:jc w:val="both"/>
+      </w:pPr>
+      <w:r>
+        <w:rPr>
+          <w:rFonts w:ascii="Georgia" w:cs="Georgia" w:eastAsia="Georgia" w:hAnsi="Georgia"/>
+          <w:sz w:val="21"/>
+          <w:szCs w:val="21"/>
+        </w:rPr>
+        <w:t xml:space="preserve">Lucas abriu a agenda naquela mesma noite, em casa, com um copo de água que não bebeu.</w:t>
+      </w:r>
+    </w:p>
+    <w:p>
+      <w:pPr>
+        <w:spacing w:after="0" w:line="312"/>
+        <w:ind w:firstLine="340"/>
+        <w:jc w:val="both"/>
+      </w:pPr>
+      <w:r>
+        <w:rPr>
+          <w:rFonts w:ascii="Georgia" w:cs="Georgia" w:eastAsia="Georgia" w:hAnsi="Georgia"/>
+          <w:sz w:val="21"/>
+          <w:szCs w:val="21"/>
+        </w:rPr>
+        <w:t xml:space="preserve">Reuniões em azul. Viagens em verde. Médicos em vermelho. E, toda quinta-feira, desde março, em cinza: 19h — Carlos.</w:t>
+      </w:r>
+    </w:p>
+    <w:p>
+      <w:pPr>
+        <w:pBdr>
+          <w:top w:val="single" w:color="555555" w:sz="6" w:space="6"/>
+          <w:bottom w:val="single" w:color="555555" w:sz="6" w:space="6"/>
+          <w:left w:val="single" w:color="555555" w:sz="6" w:space="6"/>
+          <w:right w:val="single" w:color="555555" w:sz="6" w:space="6"/>
+        </w:pBdr>
+        <w:shd w:fill="EFEFEF" w:color="auto" w:val="clear"/>
+        <w:spacing w:after="0" w:before="240"/>
+        <w:ind w:left="227" w:right="227"/>
+        <w:jc w:val="center"/>
+      </w:pPr>
+      <w:r>
+        <w:rPr>
+          <w:rFonts w:ascii="Georgia" w:cs="Georgia" w:eastAsia="Georgia" w:hAnsi="Georgia"/>
+          <w:b/>
+          <w:bCs/>
+          <w:spacing w:val="30"/>
+          <w:sz w:val="17"/>
+          <w:szCs w:val="17"/>
+        </w:rPr>
+        <w:t xml:space="preserve">NO CELULAR DE HENRIQUE</w:t>
+      </w:r>
+    </w:p>
+    <w:p>
+      <w:pPr>
+        <w:pBdr>
+          <w:top w:val="single" w:color="555555" w:sz="6" w:space="6"/>
+          <w:bottom w:val="single" w:color="555555" w:sz="6" w:space="6"/>
+          <w:left w:val="single" w:color="555555" w:sz="6" w:space="6"/>
+          <w:right w:val="single" w:color="555555" w:sz="6" w:space="6"/>
+        </w:pBdr>
+        <w:shd w:fill="EFEFEF" w:color="auto" w:val="clear"/>
+        <w:spacing w:after="240" w:before="0" w:line="288"/>
+        <w:ind w:left="227" w:right="227"/>
+        <w:jc w:val="center"/>
+      </w:pPr>
+      <w:r>
+        <w:rPr>
+          <w:rFonts w:ascii="Georgia" w:cs="Georgia" w:eastAsia="Georgia" w:hAnsi="Georgia"/>
+          <w:i/>
+          <w:iCs/>
+          <w:sz w:val="19"/>
+          <w:szCs w:val="19"/>
+        </w:rPr>
+        <w:t xml:space="preserve">Abra a agenda de Henrique no celular virtual e procure as quintas-feiras de 2010. Repare na cor das entradas e no que se repete.</w:t>
+      </w:r>
+    </w:p>
+    <w:p>
+      <w:pPr>
+        <w:spacing w:after="0" w:line="312"/>
+        <w:ind w:firstLine="340"/>
+        <w:jc w:val="both"/>
+      </w:pPr>
+      <w:r>
+        <w:rPr>
+          <w:rFonts w:ascii="Georgia" w:cs="Georgia" w:eastAsia="Georgia" w:hAnsi="Georgia"/>
+          <w:sz w:val="21"/>
+          <w:szCs w:val="21"/>
+        </w:rPr>
+        <w:t xml:space="preserve">Ele desceu pelas semanas, contando. Vinte e oito quintas-feiras. Vinte e oito encontros marcados com um filho que não falava com o pai havia quatro anos.</w:t>
+      </w:r>
+    </w:p>
+    <w:p>
+      <w:pPr>
+        <w:spacing w:after="0" w:line="312"/>
+        <w:ind w:firstLine="340"/>
+        <w:jc w:val="both"/>
+      </w:pPr>
+      <w:r>
+        <w:rPr>
+          <w:rFonts w:ascii="Georgia" w:cs="Georgia" w:eastAsia="Georgia" w:hAnsi="Georgia"/>
+          <w:sz w:val="21"/>
+          <w:szCs w:val="21"/>
+        </w:rPr>
+        <w:t xml:space="preserve">Só a agenda, Lia tinha dito. Cheia de reuniões.</w:t>
+      </w:r>
+    </w:p>
+    <w:p>
+      <w:pPr>
+        <w:spacing w:after="0" w:line="312"/>
+        <w:ind w:firstLine="340"/>
+        <w:jc w:val="both"/>
+      </w:pPr>
+      <w:r>
+        <w:rPr>
+          <w:rFonts w:ascii="Georgia" w:cs="Georgia" w:eastAsia="Georgia" w:hAnsi="Georgia"/>
+          <w:sz w:val="21"/>
+          <w:szCs w:val="21"/>
+        </w:rPr>
+        <w:t xml:space="preserve">Lucas ficou olhando para a tela. A irmã tinha passado uma semana inteira com aquele aparelho. Não tinha visto vinte e oito quintas-feiras com o nome do próprio irmão?</w:t>
+      </w:r>
+    </w:p>
+    <w:p>
+      <w:pPr>
+        <w:spacing w:after="0" w:line="312"/>
+        <w:ind w:firstLine="340"/>
+        <w:jc w:val="both"/>
+      </w:pPr>
+      <w:r>
+        <w:rPr>
+          <w:rFonts w:ascii="Georgia" w:cs="Georgia" w:eastAsia="Georgia" w:hAnsi="Georgia"/>
+          <w:sz w:val="21"/>
+          <w:szCs w:val="21"/>
+        </w:rPr>
+        <w:t xml:space="preserve">No menu, notou o ícone do gravador de áudio. Tocou nele. Pediu uma senha, com uma dica embaixo: Onde eu espero toda quinta. Lucas não sabia a resposta. Fechou o aplicativo antes de gastar as tentativas.</w:t>
+      </w:r>
+    </w:p>
+    <w:p>
+      <w:pPr>
+        <w:spacing w:after="0" w:line="312"/>
+        <w:ind w:firstLine="340"/>
+        <w:jc w:val="both"/>
+      </w:pPr>
+      <w:r>
+        <w:rPr>
+          <w:rFonts w:ascii="Georgia" w:cs="Georgia" w:eastAsia="Georgia" w:hAnsi="Georgia"/>
+          <w:sz w:val="21"/>
+          <w:szCs w:val="21"/>
+        </w:rPr>
+        <w:t xml:space="preserve">Mas sabia onde Carlos estudava.</w:t>
+      </w:r>
+    </w:p>
+    <w:p>
+      <w:pPr>
+        <w:spacing w:after="200" w:before="200"/>
+        <w:jc w:val="center"/>
+      </w:pPr>
+      <w:r>
+        <w:rPr>
+          <w:rFonts w:ascii="Georgia" w:cs="Georgia" w:eastAsia="Georgia" w:hAnsi="Georgia"/>
+          <w:sz w:val="22"/>
+          <w:szCs w:val="22"/>
+        </w:rPr>
+        <w:t xml:space="preserve">*</w:t>
+      </w:r>
+    </w:p>
+    <w:p>
+      <w:pPr>
+        <w:spacing w:after="0" w:line="312"/>
+        <w:ind w:firstLine="340"/>
+        <w:jc w:val="both"/>
+      </w:pPr>
+      <w:r>
+        <w:rPr>
+          <w:rFonts w:ascii="Georgia" w:cs="Georgia" w:eastAsia="Georgia" w:hAnsi="Georgia"/>
+          <w:sz w:val="21"/>
+          <w:szCs w:val="21"/>
+        </w:rPr>
+        <w:t xml:space="preserve">Foi à faculdade na segunda-feira seguinte, às seis e meia da tarde.</w:t>
+      </w:r>
+    </w:p>
+    <w:p>
+      <w:pPr>
+        <w:spacing w:after="0" w:line="312"/>
+        <w:ind w:firstLine="340"/>
+        <w:jc w:val="both"/>
+      </w:pPr>
+      <w:r>
+        <w:rPr>
+          <w:rFonts w:ascii="Georgia" w:cs="Georgia" w:eastAsia="Georgia" w:hAnsi="Georgia"/>
+          <w:sz w:val="21"/>
+          <w:szCs w:val="21"/>
+        </w:rPr>
+        <w:t xml:space="preserve">O porteiro de uniforme cinza conferia carteirinhas na entrada, com a mesma lista presa no vidro com fita adesiva. Lucas perguntou pela turma de mestrado em Direito Civil.</w:t>
+      </w:r>
+    </w:p>
+    <w:p>
+      <w:pPr>
+        <w:spacing w:after="0" w:line="312"/>
+        <w:ind w:firstLine="340"/>
+        <w:jc w:val="both"/>
+      </w:pPr>
+      <w:r>
+        <w:rPr>
+          <w:rFonts w:ascii="Georgia" w:cs="Georgia" w:eastAsia="Georgia" w:hAnsi="Georgia"/>
+          <w:sz w:val="21"/>
+          <w:szCs w:val="21"/>
+        </w:rPr>
+        <w:t xml:space="preserve">— Bloco doze, sala sete. — O porteiro o olhou de cima a baixo. — Engraçado. Semana passada veio uma moça perguntar a mesma coisa. Morena, de óculos escuros. Disse que era parente do senhor que esperava no banco.</w:t>
+      </w:r>
+    </w:p>
+    <w:p>
+      <w:pPr>
+        <w:spacing w:after="0" w:line="312"/>
+        <w:ind w:firstLine="340"/>
+        <w:jc w:val="both"/>
+      </w:pPr>
+      <w:r>
+        <w:rPr>
+          <w:rFonts w:ascii="Georgia" w:cs="Georgia" w:eastAsia="Georgia" w:hAnsi="Georgia"/>
+          <w:sz w:val="21"/>
+          <w:szCs w:val="21"/>
+        </w:rPr>
+        <w:t xml:space="preserve">— Que senhor?</w:t>
+      </w:r>
+    </w:p>
+    <w:p>
+      <w:pPr>
+        <w:spacing w:after="0" w:line="312"/>
+        <w:ind w:firstLine="340"/>
+        <w:jc w:val="both"/>
+      </w:pPr>
+      <w:r>
+        <w:rPr>
+          <w:rFonts w:ascii="Georgia" w:cs="Georgia" w:eastAsia="Georgia" w:hAnsi="Georgia"/>
+          <w:sz w:val="21"/>
+          <w:szCs w:val="21"/>
+        </w:rPr>
+        <w:t xml:space="preserve">O porteiro contou. O banco da calçada, toda quinta, das sete às nove e meia. O café que ele aceitou uma vez. O filho que nunca desceu e saía pela porta dos fundos.</w:t>
+      </w:r>
+    </w:p>
+    <w:p>
+      <w:pPr>
+        <w:spacing w:after="0" w:line="312"/>
+        <w:ind w:firstLine="340"/>
+        <w:jc w:val="both"/>
+      </w:pPr>
+      <w:r>
+        <w:rPr>
+          <w:rFonts w:ascii="Georgia" w:cs="Georgia" w:eastAsia="Georgia" w:hAnsi="Georgia"/>
+          <w:sz w:val="21"/>
+          <w:szCs w:val="21"/>
+        </w:rPr>
+        <w:t xml:space="preserve">Lucas olhou para o banco. Sentou-se nele, sem saber por quê. A madeira estava fria. Um ônibus passou levantando poeira.</w:t>
+      </w:r>
+    </w:p>
+    <w:p>
+      <w:pPr>
+        <w:spacing w:after="0" w:line="312"/>
+        <w:ind w:firstLine="340"/>
+        <w:jc w:val="both"/>
+      </w:pPr>
+      <w:r>
+        <w:rPr>
+          <w:rFonts w:ascii="Georgia" w:cs="Georgia" w:eastAsia="Georgia" w:hAnsi="Georgia"/>
+          <w:sz w:val="21"/>
+          <w:szCs w:val="21"/>
+        </w:rPr>
+        <w:t xml:space="preserve">Morena, de óculos escuros. Lia tinha estado ali, naquele mesmo banco, na semana anterior. E tinha dito a ele, na calçada do restaurante japonês, que só tinha visto a agenda.</w:t>
+      </w:r>
+    </w:p>
+    <w:p>
+      <w:pPr>
+        <w:spacing w:after="200" w:before="200"/>
+        <w:jc w:val="center"/>
+      </w:pPr>
+      <w:r>
+        <w:rPr>
+          <w:rFonts w:ascii="Georgia" w:cs="Georgia" w:eastAsia="Georgia" w:hAnsi="Georgia"/>
+          <w:sz w:val="22"/>
+          <w:szCs w:val="22"/>
+        </w:rPr>
+        <w:t xml:space="preserve">*</w:t>
+      </w:r>
+    </w:p>
+    <w:p>
+      <w:pPr>
+        <w:spacing w:after="0" w:line="312"/>
+        <w:ind w:firstLine="340"/>
+        <w:jc w:val="both"/>
+      </w:pPr>
+      <w:r>
+        <w:rPr>
+          <w:rFonts w:ascii="Georgia" w:cs="Georgia" w:eastAsia="Georgia" w:hAnsi="Georgia"/>
+          <w:sz w:val="21"/>
+          <w:szCs w:val="21"/>
+        </w:rPr>
+        <w:t xml:space="preserve">Esperou a turma sair às nove e meia, de pé do outro lado da rua, perto da banca de jornal.</w:t>
+      </w:r>
+    </w:p>
+    <w:p>
+      <w:pPr>
+        <w:spacing w:after="0" w:line="312"/>
+        <w:ind w:firstLine="340"/>
+        <w:jc w:val="both"/>
+      </w:pPr>
+      <w:r>
+        <w:rPr>
+          <w:rFonts w:ascii="Georgia" w:cs="Georgia" w:eastAsia="Georgia" w:hAnsi="Georgia"/>
+          <w:sz w:val="21"/>
+          <w:szCs w:val="21"/>
+        </w:rPr>
+        <w:t xml:space="preserve">Carlos saiu pela porta dos fundos, como o porteiro tinha dito, sozinho, de mochila nas costas, e virou a esquina sem olhar para trás. Lucas não o seguiu. Não era Carlos que ele tinha ido procurar.</w:t>
+      </w:r>
+    </w:p>
+    <w:p>
+      <w:pPr>
+        <w:spacing w:after="0" w:line="312"/>
+        <w:ind w:firstLine="340"/>
+        <w:jc w:val="both"/>
+      </w:pPr>
+      <w:r>
+        <w:rPr>
+          <w:rFonts w:ascii="Georgia" w:cs="Georgia" w:eastAsia="Georgia" w:hAnsi="Georgia"/>
+          <w:sz w:val="21"/>
+          <w:szCs w:val="21"/>
+        </w:rPr>
+        <w:t xml:space="preserve">Pela porta da frente saíram os outros, em grupinhos, rindo, acendendo cigarros. Lucas escolheu o que parecia mais falante, um rapaz de barba rala e camisa xadrez que contava uma piada para três colegas, e se aproximou com a pergunta mais neutra que conseguiu inventar.</w:t>
+      </w:r>
+    </w:p>
+    <w:p>
+      <w:pPr>
+        <w:spacing w:after="0" w:line="312"/>
+        <w:ind w:firstLine="340"/>
+        <w:jc w:val="both"/>
+      </w:pPr>
+      <w:r>
+        <w:rPr>
+          <w:rFonts w:ascii="Georgia" w:cs="Georgia" w:eastAsia="Georgia" w:hAnsi="Georgia"/>
+          <w:sz w:val="21"/>
+          <w:szCs w:val="21"/>
+        </w:rPr>
+        <w:t xml:space="preserve">— Vocês são da turma do Carlos Salvallus?</w:t>
+      </w:r>
+    </w:p>
+    <w:p>
+      <w:pPr>
+        <w:spacing w:after="0" w:line="312"/>
+        <w:ind w:firstLine="340"/>
+        <w:jc w:val="both"/>
+      </w:pPr>
+      <w:r>
+        <w:rPr>
+          <w:rFonts w:ascii="Georgia" w:cs="Georgia" w:eastAsia="Georgia" w:hAnsi="Georgia"/>
+          <w:sz w:val="21"/>
+          <w:szCs w:val="21"/>
+        </w:rPr>
+        <w:t xml:space="preserve">O rapaz da camisa xadrez se virou.</w:t>
+      </w:r>
+    </w:p>
+    <w:p>
+      <w:pPr>
+        <w:spacing w:after="0" w:line="312"/>
+        <w:ind w:firstLine="340"/>
+        <w:jc w:val="both"/>
+      </w:pPr>
+      <w:r>
+        <w:rPr>
+          <w:rFonts w:ascii="Georgia" w:cs="Georgia" w:eastAsia="Georgia" w:hAnsi="Georgia"/>
+          <w:sz w:val="21"/>
+          <w:szCs w:val="21"/>
+        </w:rPr>
+        <w:t xml:space="preserve">— Sou. Bruno. Você é…?</w:t>
+      </w:r>
+    </w:p>
+    <w:p>
+      <w:pPr>
+        <w:spacing w:after="0" w:line="312"/>
+        <w:ind w:firstLine="340"/>
+        <w:jc w:val="both"/>
+      </w:pPr>
+      <w:r>
+        <w:rPr>
+          <w:rFonts w:ascii="Georgia" w:cs="Georgia" w:eastAsia="Georgia" w:hAnsi="Georgia"/>
+          <w:sz w:val="21"/>
+          <w:szCs w:val="21"/>
+        </w:rPr>
+        <w:t xml:space="preserve">— Irmão dele. Por parte de pai.</w:t>
+      </w:r>
+    </w:p>
+    <w:p>
+      <w:pPr>
+        <w:spacing w:after="0" w:line="312"/>
+        <w:ind w:firstLine="340"/>
+        <w:jc w:val="both"/>
+      </w:pPr>
+      <w:r>
+        <w:rPr>
+          <w:rFonts w:ascii="Georgia" w:cs="Georgia" w:eastAsia="Georgia" w:hAnsi="Georgia"/>
+          <w:sz w:val="21"/>
+          <w:szCs w:val="21"/>
+        </w:rPr>
+        <w:t xml:space="preserve">A expressão do rapaz mudou na hora.</w:t>
+      </w:r>
+    </w:p>
+    <w:p>
+      <w:pPr>
+        <w:spacing w:after="0" w:line="312"/>
+        <w:ind w:firstLine="340"/>
+        <w:jc w:val="both"/>
+      </w:pPr>
+      <w:r>
+        <w:rPr>
+          <w:rFonts w:ascii="Georgia" w:cs="Georgia" w:eastAsia="Georgia" w:hAnsi="Georgia"/>
+          <w:sz w:val="21"/>
+          <w:szCs w:val="21"/>
+        </w:rPr>
+        <w:t xml:space="preserve">— Ah, cara. Sinto muito pelo seu pai. A gente soube.</w:t>
+      </w:r>
+    </w:p>
+    <w:p>
+      <w:pPr>
+        <w:spacing w:after="0" w:line="312"/>
+        <w:ind w:firstLine="340"/>
+        <w:jc w:val="both"/>
+      </w:pPr>
+      <w:r>
+        <w:rPr>
+          <w:rFonts w:ascii="Georgia" w:cs="Georgia" w:eastAsia="Georgia" w:hAnsi="Georgia"/>
+          <w:sz w:val="21"/>
+          <w:szCs w:val="21"/>
+        </w:rPr>
+        <w:t xml:space="preserve">Os colegas se afastaram com discrição. Lucas convidou Bruno para uma cerveja no bar da esquina. Bruno aceitou, porque cerveja grátis é cerveja grátis, e porque gostava de falar.</w:t>
+      </w:r>
+    </w:p>
+    <w:p>
+      <w:pPr>
+        <w:spacing w:after="200" w:before="200"/>
+        <w:jc w:val="center"/>
+      </w:pPr>
+      <w:r>
+        <w:rPr>
+          <w:rFonts w:ascii="Georgia" w:cs="Georgia" w:eastAsia="Georgia" w:hAnsi="Georgia"/>
+          <w:sz w:val="22"/>
+          <w:szCs w:val="22"/>
+        </w:rPr>
+        <w:t xml:space="preserve">*</w:t>
+      </w:r>
+    </w:p>
+    <w:p>
+      <w:pPr>
+        <w:spacing w:after="0" w:line="312"/>
+        <w:ind w:firstLine="340"/>
+        <w:jc w:val="both"/>
+      </w:pPr>
+      <w:r>
+        <w:rPr>
+          <w:rFonts w:ascii="Georgia" w:cs="Georgia" w:eastAsia="Georgia" w:hAnsi="Georgia"/>
+          <w:sz w:val="21"/>
+          <w:szCs w:val="21"/>
+        </w:rPr>
+        <w:t xml:space="preserve">Falou do professor de Direito de Família, que era um chato. Falou da dissertação que estava atrasada. Falou de Carlos, que era o melhor aluno da turma e o mais calado, que almoçava sozinho e nunca ia às festas.</w:t>
+      </w:r>
+    </w:p>
+    <w:p>
+      <w:pPr>
+        <w:spacing w:after="0" w:line="312"/>
+        <w:ind w:firstLine="340"/>
+        <w:jc w:val="both"/>
+      </w:pPr>
+      <w:r>
+        <w:rPr>
+          <w:rFonts w:ascii="Georgia" w:cs="Georgia" w:eastAsia="Georgia" w:hAnsi="Georgia"/>
+          <w:sz w:val="21"/>
+          <w:szCs w:val="21"/>
+        </w:rPr>
+        <w:t xml:space="preserve">— Ele está bem? Depois do pai?</w:t>
+      </w:r>
+    </w:p>
+    <w:p>
+      <w:pPr>
+        <w:spacing w:after="0" w:line="312"/>
+        <w:ind w:firstLine="340"/>
+        <w:jc w:val="both"/>
+      </w:pPr>
+      <w:r>
+        <w:rPr>
+          <w:rFonts w:ascii="Georgia" w:cs="Georgia" w:eastAsia="Georgia" w:hAnsi="Georgia"/>
+          <w:sz w:val="21"/>
+          <w:szCs w:val="21"/>
+        </w:rPr>
+        <w:t xml:space="preserve">— Não sei — disse Lucas, e era verdade. — A gente não é muito próximo.</w:t>
+      </w:r>
+    </w:p>
+    <w:p>
+      <w:pPr>
+        <w:spacing w:after="0" w:line="312"/>
+        <w:ind w:firstLine="340"/>
+        <w:jc w:val="both"/>
+      </w:pPr>
+      <w:r>
+        <w:rPr>
+          <w:rFonts w:ascii="Georgia" w:cs="Georgia" w:eastAsia="Georgia" w:hAnsi="Georgia"/>
+          <w:sz w:val="21"/>
+          <w:szCs w:val="21"/>
+        </w:rPr>
+        <w:t xml:space="preserve">— É, ele não é próximo de ninguém. — Bruno bebeu um gole. — Mas é gente boa. Me ajudou um monte com Processo Civil. Por isso eu não ligo de assinar a lista pra ele de vez em quando.</w:t>
+      </w:r>
+    </w:p>
+    <w:p>
+      <w:pPr>
+        <w:spacing w:after="0" w:line="312"/>
+        <w:ind w:firstLine="340"/>
+        <w:jc w:val="both"/>
+      </w:pPr>
+      <w:r>
+        <w:rPr>
+          <w:rFonts w:ascii="Georgia" w:cs="Georgia" w:eastAsia="Georgia" w:hAnsi="Georgia"/>
+          <w:sz w:val="21"/>
+          <w:szCs w:val="21"/>
+        </w:rPr>
+        <w:t xml:space="preserve">Lucas pousou o copo devagar.</w:t>
+      </w:r>
+    </w:p>
+    <w:p>
+      <w:pPr>
+        <w:spacing w:after="0" w:line="312"/>
+        <w:ind w:firstLine="340"/>
+        <w:jc w:val="both"/>
+      </w:pPr>
+      <w:r>
+        <w:rPr>
+          <w:rFonts w:ascii="Georgia" w:cs="Georgia" w:eastAsia="Georgia" w:hAnsi="Georgia"/>
+          <w:sz w:val="21"/>
+          <w:szCs w:val="21"/>
+        </w:rPr>
+        <w:t xml:space="preserve">— Assinar a lista?</w:t>
+      </w:r>
+    </w:p>
+    <w:p>
+      <w:pPr>
+        <w:spacing w:after="0" w:line="312"/>
+        <w:ind w:firstLine="340"/>
+        <w:jc w:val="both"/>
+      </w:pPr>
+      <w:r>
+        <w:rPr>
+          <w:rFonts w:ascii="Georgia" w:cs="Georgia" w:eastAsia="Georgia" w:hAnsi="Georgia"/>
+          <w:sz w:val="21"/>
+          <w:szCs w:val="21"/>
+        </w:rPr>
+        <w:t xml:space="preserve">— A lista de presença. — Bruno riu. — O professor de segunda não faz chamada, passa uma folha. Quando o Carlos falta, ele me manda uma mensagem e eu assino por ele. Todo mundo faz isso. Não vai me dedurar, hein.</w:t>
+      </w:r>
+    </w:p>
+    <w:p>
+      <w:pPr>
+        <w:spacing w:after="0" w:line="312"/>
+        <w:ind w:firstLine="340"/>
+        <w:jc w:val="both"/>
+      </w:pPr>
+      <w:r>
+        <w:rPr>
+          <w:rFonts w:ascii="Georgia" w:cs="Georgia" w:eastAsia="Georgia" w:hAnsi="Georgia"/>
+          <w:sz w:val="21"/>
+          <w:szCs w:val="21"/>
+        </w:rPr>
+        <w:t xml:space="preserve">— Ele faltou muito este semestre?</w:t>
+      </w:r>
+    </w:p>
+    <w:p>
+      <w:pPr>
+        <w:spacing w:after="0" w:line="312"/>
+        <w:ind w:firstLine="340"/>
+        <w:jc w:val="both"/>
+      </w:pPr>
+      <w:r>
+        <w:rPr>
+          <w:rFonts w:ascii="Georgia" w:cs="Georgia" w:eastAsia="Georgia" w:hAnsi="Georgia"/>
+          <w:sz w:val="21"/>
+          <w:szCs w:val="21"/>
+        </w:rPr>
+        <w:t xml:space="preserve">Bruno pensou.</w:t>
+      </w:r>
+    </w:p>
+    <w:p>
+      <w:pPr>
+        <w:spacing w:after="0" w:line="312"/>
+        <w:ind w:firstLine="340"/>
+        <w:jc w:val="both"/>
+      </w:pPr>
+      <w:r>
+        <w:rPr>
+          <w:rFonts w:ascii="Georgia" w:cs="Georgia" w:eastAsia="Georgia" w:hAnsi="Georgia"/>
+          <w:sz w:val="21"/>
+          <w:szCs w:val="21"/>
+        </w:rPr>
+        <w:t xml:space="preserve">— Não. Ele quase nunca falta. Acho que só uma vez. — Ele franziu a testa, puxando pela memória. — Foi numa segunda. Lembro porque ele mandou a mensagem tarde, já em cima da hora, dizendo que tinha um compromisso de família. Achei estranho, porque o Carlos nunca fala de família.</w:t>
+      </w:r>
+    </w:p>
+    <w:p>
+      <w:pPr>
+        <w:spacing w:after="0" w:line="312"/>
+        <w:ind w:firstLine="340"/>
+        <w:jc w:val="both"/>
+      </w:pPr>
+      <w:r>
+        <w:rPr>
+          <w:rFonts w:ascii="Georgia" w:cs="Georgia" w:eastAsia="Georgia" w:hAnsi="Georgia"/>
+          <w:sz w:val="21"/>
+          <w:szCs w:val="21"/>
+        </w:rPr>
+        <w:t xml:space="preserve">— Você lembra qual segunda?</w:t>
+      </w:r>
+    </w:p>
+    <w:p>
+      <w:pPr>
+        <w:spacing w:after="0" w:line="312"/>
+        <w:ind w:firstLine="340"/>
+        <w:jc w:val="both"/>
+      </w:pPr>
+      <w:r>
+        <w:rPr>
+          <w:rFonts w:ascii="Georgia" w:cs="Georgia" w:eastAsia="Georgia" w:hAnsi="Georgia"/>
+          <w:sz w:val="21"/>
+          <w:szCs w:val="21"/>
+        </w:rPr>
+        <w:t xml:space="preserve">Bruno pegou o celular e procurou na conversa. Virou a tela para Lucas.</w:t>
+      </w:r>
+    </w:p>
+    <w:p>
+      <w:pPr>
+        <w:spacing w:after="0" w:line="312"/>
+        <w:ind w:firstLine="340"/>
+        <w:jc w:val="both"/>
+      </w:pPr>
+      <w:r>
+        <w:rPr>
+          <w:rFonts w:ascii="Georgia" w:cs="Georgia" w:eastAsia="Georgia" w:hAnsi="Georgia"/>
+          <w:sz w:val="21"/>
+          <w:szCs w:val="21"/>
+        </w:rPr>
+        <w:t xml:space="preserve">Era uma mensagem de Carlos, enviada às 18h47 da segunda-feira em que o pai tinha passado a noite no apartamento de alguém que Lucas não sabia quem era. A véspera da morte.</w:t>
+      </w:r>
+    </w:p>
+    <w:p>
+      <w:pPr>
+        <w:spacing w:after="0" w:line="312"/>
+        <w:ind w:firstLine="340"/>
+        <w:jc w:val="both"/>
+      </w:pPr>
+      <w:r>
+        <w:rPr>
+          <w:rFonts w:ascii="Georgia" w:cs="Georgia" w:eastAsia="Georgia" w:hAnsi="Georgia"/>
+          <w:sz w:val="21"/>
+          <w:szCs w:val="21"/>
+        </w:rPr>
+        <w:t xml:space="preserve">Assina pra mim hoje? Compromisso de família. Valeu.</w:t>
+      </w:r>
+    </w:p>
+    <w:p>
+      <w:pPr>
+        <w:spacing w:after="200" w:before="200"/>
+        <w:jc w:val="center"/>
+      </w:pPr>
+      <w:r>
+        <w:rPr>
+          <w:rFonts w:ascii="Georgia" w:cs="Georgia" w:eastAsia="Georgia" w:hAnsi="Georgia"/>
+          <w:sz w:val="22"/>
+          <w:szCs w:val="22"/>
+        </w:rPr>
+        <w:t xml:space="preserve">*</w:t>
+      </w:r>
+    </w:p>
+    <w:p>
+      <w:pPr>
+        <w:spacing w:after="0" w:line="312"/>
+        <w:ind w:firstLine="340"/>
+        <w:jc w:val="both"/>
+      </w:pPr>
+      <w:r>
+        <w:rPr>
+          <w:rFonts w:ascii="Georgia" w:cs="Georgia" w:eastAsia="Georgia" w:hAnsi="Georgia"/>
+          <w:sz w:val="21"/>
+          <w:szCs w:val="21"/>
+        </w:rPr>
+        <w:t xml:space="preserve">Lucas pagou as cervejas e foi direto para o Jardim Europa.</w:t>
+      </w:r>
+    </w:p>
+    <w:p>
+      <w:pPr>
+        <w:spacing w:after="0" w:line="312"/>
+        <w:ind w:firstLine="340"/>
+        <w:jc w:val="both"/>
+      </w:pPr>
+      <w:r>
+        <w:rPr>
+          <w:rFonts w:ascii="Georgia" w:cs="Georgia" w:eastAsia="Georgia" w:hAnsi="Georgia"/>
+          <w:sz w:val="21"/>
+          <w:szCs w:val="21"/>
+        </w:rPr>
+        <w:t xml:space="preserve">A guarita da esquina estava acesa. Seu Ivo trabalhava de dia. À noite, ficava um rapaz mais novo, magro, de fone num ouvido só, chamado Edson. Lucas se apresentou, falou de seu Ivo, falou do caderno. Edson sorriu.</w:t>
+      </w:r>
+    </w:p>
+    <w:p>
+      <w:pPr>
+        <w:spacing w:after="0" w:line="312"/>
+        <w:ind w:firstLine="340"/>
+        <w:jc w:val="both"/>
+      </w:pPr>
+      <w:r>
+        <w:rPr>
+          <w:rFonts w:ascii="Georgia" w:cs="Georgia" w:eastAsia="Georgia" w:hAnsi="Georgia"/>
+          <w:sz w:val="21"/>
+          <w:szCs w:val="21"/>
+        </w:rPr>
+        <w:t xml:space="preserve">— O caderno do Ivo é famoso. Eu tenho o meu também. Mais bagunçado.</w:t>
+      </w:r>
+    </w:p>
+    <w:p>
+      <w:pPr>
+        <w:spacing w:after="0" w:line="312"/>
+        <w:ind w:firstLine="340"/>
+        <w:jc w:val="both"/>
+      </w:pPr>
+      <w:r>
+        <w:rPr>
+          <w:rFonts w:ascii="Georgia" w:cs="Georgia" w:eastAsia="Georgia" w:hAnsi="Georgia"/>
+          <w:sz w:val="21"/>
+          <w:szCs w:val="21"/>
+        </w:rPr>
+        <w:t xml:space="preserve">Abriu uma agenda de bolso amassada e procurou a segunda-feira. A letra era torta, apressada, mas legível.</w:t>
+      </w:r>
+    </w:p>
+    <w:p>
+      <w:pPr>
+        <w:spacing w:after="0" w:line="312"/>
+        <w:ind w:firstLine="340"/>
+        <w:jc w:val="both"/>
+      </w:pPr>
+      <w:r>
+        <w:rPr>
+          <w:rFonts w:ascii="Georgia" w:cs="Georgia" w:eastAsia="Georgia" w:hAnsi="Georgia"/>
+          <w:sz w:val="21"/>
+          <w:szCs w:val="21"/>
+        </w:rPr>
+        <w:t xml:space="preserve">22h55 — Moto parada na esquina, rapaz de capacete. Não desceu.</w:t>
+      </w:r>
+    </w:p>
+    <w:p>
+      <w:pPr>
+        <w:spacing w:after="0" w:line="312"/>
+        <w:ind w:firstLine="340"/>
+        <w:jc w:val="both"/>
+      </w:pPr>
+      <w:r>
+        <w:rPr>
+          <w:rFonts w:ascii="Georgia" w:cs="Georgia" w:eastAsia="Georgia" w:hAnsi="Georgia"/>
+          <w:sz w:val="21"/>
+          <w:szCs w:val="21"/>
+        </w:rPr>
+        <w:t xml:space="preserve">00h20 — Dr. Henrique chegou de carro, sozinho, sem motorista.</w:t>
+      </w:r>
+    </w:p>
+    <w:p>
+      <w:pPr>
+        <w:spacing w:after="0" w:line="312"/>
+        <w:ind w:firstLine="340"/>
+        <w:jc w:val="both"/>
+      </w:pPr>
+      <w:r>
+        <w:rPr>
+          <w:rFonts w:ascii="Georgia" w:cs="Georgia" w:eastAsia="Georgia" w:hAnsi="Georgia"/>
+          <w:sz w:val="21"/>
+          <w:szCs w:val="21"/>
+        </w:rPr>
+        <w:t xml:space="preserve">00h25 — Moto foi embora.</w:t>
+      </w:r>
+    </w:p>
+    <w:p>
+      <w:pPr>
+        <w:spacing w:after="0" w:line="312"/>
+        <w:ind w:firstLine="340"/>
+        <w:jc w:val="both"/>
+      </w:pPr>
+      <w:r>
+        <w:rPr>
+          <w:rFonts w:ascii="Georgia" w:cs="Georgia" w:eastAsia="Georgia" w:hAnsi="Georgia"/>
+          <w:sz w:val="21"/>
+          <w:szCs w:val="21"/>
+        </w:rPr>
+        <w:t xml:space="preserve">— Lembro dessa moto — disse Edson. — Fiquei de olho porque achei que era assalto. O rapaz ficou mais de uma hora parado, de capacete, olhando para a casa do doutor. Quando o doutor chegou e entrou na garagem, ele ligou a moto e foi embora. Rápido.</w:t>
+      </w:r>
+    </w:p>
+    <w:p>
+      <w:pPr>
+        <w:spacing w:after="0" w:line="312"/>
+        <w:ind w:firstLine="340"/>
+        <w:jc w:val="both"/>
+      </w:pPr>
+      <w:r>
+        <w:rPr>
+          <w:rFonts w:ascii="Georgia" w:cs="Georgia" w:eastAsia="Georgia" w:hAnsi="Georgia"/>
+          <w:sz w:val="21"/>
+          <w:szCs w:val="21"/>
+        </w:rPr>
+        <w:t xml:space="preserve">— Você viu o rosto dele?</w:t>
+      </w:r>
+    </w:p>
+    <w:p>
+      <w:pPr>
+        <w:spacing w:after="0" w:line="312"/>
+        <w:ind w:firstLine="340"/>
+        <w:jc w:val="both"/>
+      </w:pPr>
+      <w:r>
+        <w:rPr>
+          <w:rFonts w:ascii="Georgia" w:cs="Georgia" w:eastAsia="Georgia" w:hAnsi="Georgia"/>
+          <w:sz w:val="21"/>
+          <w:szCs w:val="21"/>
+        </w:rPr>
+        <w:t xml:space="preserve">— Não. Só que era magro, novo. Mochila nas costas.</w:t>
+      </w:r>
+    </w:p>
+    <w:p>
+      <w:pPr>
+        <w:spacing w:after="0" w:line="312"/>
+        <w:ind w:firstLine="340"/>
+        <w:jc w:val="both"/>
+      </w:pPr>
+      <w:r>
+        <w:rPr>
+          <w:rFonts w:ascii="Georgia" w:cs="Georgia" w:eastAsia="Georgia" w:hAnsi="Georgia"/>
+          <w:sz w:val="21"/>
+          <w:szCs w:val="21"/>
+        </w:rPr>
+        <w:t xml:space="preserve">Lucas tirou o celular do bolso, abriu uma foto do aniversário de quinze anos de Lia, a única em que Carlos aparecia de corpo inteiro, e mostrou. Edson olhou por muito tempo.</w:t>
+      </w:r>
+    </w:p>
+    <w:p>
+      <w:pPr>
+        <w:spacing w:after="0" w:line="312"/>
+        <w:ind w:firstLine="340"/>
+        <w:jc w:val="both"/>
+      </w:pPr>
+      <w:r>
+        <w:rPr>
+          <w:rFonts w:ascii="Georgia" w:cs="Georgia" w:eastAsia="Georgia" w:hAnsi="Georgia"/>
+          <w:sz w:val="21"/>
+          <w:szCs w:val="21"/>
+        </w:rPr>
+        <w:t xml:space="preserve">— Pode ser — disse, enfim. — O jeito de ficar parado, com os ombros para a frente. Pode ser. Mas eu não juro.</w:t>
+      </w:r>
+    </w:p>
+    <w:p>
+      <w:pPr>
+        <w:spacing w:after="200" w:before="200"/>
+        <w:jc w:val="center"/>
+      </w:pPr>
+      <w:r>
+        <w:rPr>
+          <w:rFonts w:ascii="Georgia" w:cs="Georgia" w:eastAsia="Georgia" w:hAnsi="Georgia"/>
+          <w:sz w:val="22"/>
+          <w:szCs w:val="22"/>
+        </w:rPr>
+        <w:t xml:space="preserve">*</w:t>
+      </w:r>
+    </w:p>
+    <w:p>
+      <w:pPr>
+        <w:spacing w:after="0" w:line="312"/>
+        <w:ind w:firstLine="340"/>
+        <w:jc w:val="both"/>
+      </w:pPr>
+      <w:r>
+        <w:rPr>
+          <w:rFonts w:ascii="Georgia" w:cs="Georgia" w:eastAsia="Georgia" w:hAnsi="Georgia"/>
+          <w:sz w:val="21"/>
+          <w:szCs w:val="21"/>
+        </w:rPr>
+        <w:t xml:space="preserve">Lucas ficou dentro do carro, estacionado na esquina, olhando para a casa escura do pai.</w:t>
+      </w:r>
+    </w:p>
+    <w:p>
+      <w:pPr>
+        <w:spacing w:after="0" w:line="312"/>
+        <w:ind w:firstLine="340"/>
+        <w:jc w:val="both"/>
+      </w:pPr>
+      <w:r>
+        <w:rPr>
+          <w:rFonts w:ascii="Georgia" w:cs="Georgia" w:eastAsia="Georgia" w:hAnsi="Georgia"/>
+          <w:sz w:val="21"/>
+          <w:szCs w:val="21"/>
+        </w:rPr>
+        <w:t xml:space="preserve">Carlos tinha faltado à aula na véspera da morte, pela primeira vez no semestre, e pedido a um colega que mentisse por ele. Um rapaz magro, de mochila, tinha ficado mais de uma hora parado de capacete na frente daquela casa, e só foi embora quando o pai chegou. Na manhã seguinte, o pai estava morto.</w:t>
+      </w:r>
+    </w:p>
+    <w:p>
+      <w:pPr>
+        <w:spacing w:after="0" w:line="312"/>
+        <w:ind w:firstLine="340"/>
+        <w:jc w:val="both"/>
+      </w:pPr>
+      <w:r>
+        <w:rPr>
+          <w:rFonts w:ascii="Georgia" w:cs="Georgia" w:eastAsia="Georgia" w:hAnsi="Georgia"/>
+          <w:sz w:val="21"/>
+          <w:szCs w:val="21"/>
+        </w:rPr>
+        <w:t xml:space="preserve">E Lia sabia de alguma coisa. Tinha estado na faculdade. Tinha visto as vinte e oito quintas-feiras. Tinha dito que era só a agenda.</w:t>
+      </w:r>
+    </w:p>
+    <w:p>
+      <w:pPr>
+        <w:spacing w:after="0" w:line="312"/>
+        <w:ind w:firstLine="340"/>
+        <w:jc w:val="both"/>
+      </w:pPr>
+      <w:r>
+        <w:rPr>
+          <w:rFonts w:ascii="Georgia" w:cs="Georgia" w:eastAsia="Georgia" w:hAnsi="Georgia"/>
+          <w:sz w:val="21"/>
+          <w:szCs w:val="21"/>
+        </w:rPr>
+        <w:t xml:space="preserve">Ela estava protegendo Carlos. Era o irmão dela, de pai e mãe. Era o filho de Sílvia, que mal saía da cama. Lucas entendia. No lugar dela, talvez fizesse o mesmo.</w:t>
+      </w:r>
+    </w:p>
+    <w:p>
+      <w:pPr>
+        <w:spacing w:after="0" w:line="312"/>
+        <w:ind w:firstLine="340"/>
+        <w:jc w:val="both"/>
+      </w:pPr>
+      <w:r>
+        <w:rPr>
+          <w:rFonts w:ascii="Georgia" w:cs="Georgia" w:eastAsia="Georgia" w:hAnsi="Georgia"/>
+          <w:sz w:val="21"/>
+          <w:szCs w:val="21"/>
+        </w:rPr>
+        <w:t xml:space="preserve">Mas havia outra coisa no caderno de Edson que não o deixava em paz, e que não tinha nada a ver com Carlos.</w:t>
+      </w:r>
+    </w:p>
+    <w:p>
+      <w:pPr>
+        <w:spacing w:after="0" w:line="312"/>
+        <w:ind w:firstLine="340"/>
+        <w:jc w:val="both"/>
+      </w:pPr>
+      <w:r>
+        <w:rPr>
+          <w:rFonts w:ascii="Georgia" w:cs="Georgia" w:eastAsia="Georgia" w:hAnsi="Georgia"/>
+          <w:sz w:val="21"/>
+          <w:szCs w:val="21"/>
+        </w:rPr>
+        <w:t xml:space="preserve">00h20 — Dr. Henrique chegou de carro, sozinho, sem motorista.</w:t>
+      </w:r>
+    </w:p>
+    <w:p>
+      <w:pPr>
+        <w:spacing w:after="0" w:line="312"/>
+        <w:ind w:firstLine="340"/>
+        <w:jc w:val="both"/>
+      </w:pPr>
+      <w:r>
+        <w:rPr>
+          <w:rFonts w:ascii="Georgia" w:cs="Georgia" w:eastAsia="Georgia" w:hAnsi="Georgia"/>
+          <w:sz w:val="21"/>
+          <w:szCs w:val="21"/>
+        </w:rPr>
+        <w:t xml:space="preserve">O pai tinha chegado em casa à meia-noite e vinte da véspera da morte, dirigindo ele mesmo, coisa que desde a morte de Nestor fazia o menos possível. Helena estava em Americana. Dona Cida estava de folga.</w:t>
+      </w:r>
+    </w:p>
+    <w:p>
+      <w:pPr>
+        <w:spacing w:after="0" w:line="312"/>
+        <w:ind w:firstLine="340"/>
+        <w:jc w:val="both"/>
+      </w:pPr>
+      <w:r>
+        <w:rPr>
+          <w:rFonts w:ascii="Georgia" w:cs="Georgia" w:eastAsia="Georgia" w:hAnsi="Georgia"/>
+          <w:sz w:val="21"/>
+          <w:szCs w:val="21"/>
+        </w:rPr>
+        <w:t xml:space="preserve">De onde o pai estava voltando, sozinho, àquela hora?</w:t>
+      </w:r>
+    </w:p>
+    <w:p>
+      <w:pPr>
+        <w:spacing w:after="0" w:line="312"/>
+        <w:ind w:firstLine="340"/>
+        <w:jc w:val="both"/>
+      </w:pPr>
+      <w:r>
+        <w:rPr>
+          <w:rFonts w:ascii="Georgia" w:cs="Georgia" w:eastAsia="Georgia" w:hAnsi="Georgia"/>
+          <w:sz w:val="21"/>
+          <w:szCs w:val="21"/>
+        </w:rPr>
+        <w:t xml:space="preserve">Lucas não sabia. Mas, pela primeira vez, teve a impressão de que alguém na família sabia, e não tinha contado.</w:t>
       </w:r>
     </w:p>
     <w:sectPr>

</xml_diff>

<commit_message>
Livro policial: capítulo 18 (Semana que vem) e consumíveis mais variados nas cenas
Co-Authored-By: Claude Opus 5.5 <noreply@anthropic.com>
Claude-Session: https://claude.ai/code/session_01BrurxSYygRC3rRhaUYosm1
</commit_message>
<xml_diff>
--- a/docs/livro-policial/TODO_CRIME_TEM_UM_AUTOR.docx
+++ b/docs/livro-policial/TODO_CRIME_TEM_UM_AUTOR.docx
@@ -1062,7 +1062,7 @@
           <w:sz w:val="21"/>
           <w:szCs w:val="21"/>
         </w:rPr>
-        <w:t xml:space="preserve">Em casa, no apartamento da Vila Nova Conceição, ele deixou o saco sobre a bancada da cozinha e ficou um tempo olhando para ele sem abrir. Serviu um copo de água. Não bebeu. Abriu primeiro a carteira. Cartões, algum dinheiro, a foto antiga dos três filhos na praia. E, num bolso interno que Lucas não conhecia, um envelope pequeno com duas fotos 3x4 recém-tiradas do pai, de terno escuro, sem gravata, com o cabelo mais curto do que ele costumava usar. No verso do envelope, o carimbo de um estúdio fotográfico da Rua Augusta, com a data de três semanas antes. Lucas ficou se perguntando para que documento um homem de sessenta e um anos precisava de fotos novas. Guardou o envelope de volta.</w:t>
+        <w:t xml:space="preserve">Em casa, no apartamento da Vila Nova Conceição, ele deixou o saco sobre a bancada da cozinha e ficou um tempo olhando para ele sem abrir. Serviu um copo de água e bebeu metade num gole só, como se tivesse subido a escada correndo. Abriu primeiro a carteira. Cartões, algum dinheiro, a foto antiga dos três filhos na praia. E, num bolso interno que Lucas não conhecia, um envelope pequeno com duas fotos 3x4 recém-tiradas do pai, de terno escuro, sem gravata, com o cabelo mais curto do que ele costumava usar. No verso do envelope, o carimbo de um estúdio fotográfico da Rua Augusta, com a data de três semanas antes. Lucas ficou se perguntando para que documento um homem de sessenta e um anos precisava de fotos novas. Guardou o envelope de volta.</w:t>
       </w:r>
     </w:p>
     <w:p>
@@ -4094,7 +4094,7 @@
           <w:sz w:val="21"/>
           <w:szCs w:val="21"/>
         </w:rPr>
-        <w:t xml:space="preserve">— A Helena. Uma amiga dela viu você saindo do prédio dos Homicídios ontem. — Lucas mexeu o café que não tinha açúcar. — Por que você não me disse que ia?</w:t>
+        <w:t xml:space="preserve">— A Helena. Uma amiga dela viu você saindo do prédio dos Homicídios ontem. — Lucas deu um gole longo no café, já morno. — Por que você não me disse que ia?</w:t>
       </w:r>
     </w:p>
     <w:p>
@@ -5034,7 +5034,7 @@
           <w:sz w:val="21"/>
           <w:szCs w:val="21"/>
         </w:rPr>
-        <w:t xml:space="preserve">Tomás Ribeiro era um homem magro, de terno cinza e pasta de couro gasta, com o jeito educado e implacável de quem passou a vida inteira desconfiando de viúvas. Sentou-se diante de Lucas, recusou o café e abriu a pasta.</w:t>
+        <w:t xml:space="preserve">Tomás Ribeiro era um homem magro, de terno cinza e pasta de couro gasta, com o jeito educado e implacável de quem passou a vida inteira desconfiando de viúvas. Sentou-se diante de Lucas, aceitou o café, bebeu de uma vez, sem açúcar, e abriu a pasta.</w:t>
       </w:r>
     </w:p>
     <w:p>
@@ -14176,7 +14176,7 @@
           <w:sz w:val="21"/>
           <w:szCs w:val="21"/>
         </w:rPr>
-        <w:t xml:space="preserve">Otávio os recebeu na sala dele, na corretora, às sete da noite, quando o andar já estava vazio. Fechou a porta, serviu três copos de água que ninguém bebeu e sentou-se atrás da mesa com as mãos cruzadas, como se fosse conduzir uma reunião de rotina.</w:t>
+        <w:t xml:space="preserve">Otávio os recebeu na sala dele, na corretora, às sete da noite, quando o andar já estava vazio. Fechou a porta, serviu três copos de água, bebeu o dele inteiro antes de terminar de servir os outros e sentou-se atrás da mesa com as mãos cruzadas, como se fosse conduzir uma reunião de rotina.</w:t>
       </w:r>
     </w:p>
     <w:p>
@@ -15212,7 +15212,7 @@
           <w:sz w:val="21"/>
           <w:szCs w:val="21"/>
         </w:rPr>
-        <w:t xml:space="preserve">A reunião começou às onze, numa sala de reuniões improvisada nos fundos do estande, com ar-condicionado barulhento e garrafas de água mineral que ninguém abria. Do outro lado da mesa, o diretor da incorporadora, dois advogados, um engenheiro da prefeitura. E, chegando atrasado, de terno azul e gravata vermelha, cumprimentando todos com tapinhas nas costas, o deputado Rubens Falcão.</w:t>
+        <w:t xml:space="preserve">A reunião começou às onze, numa sala de reuniões improvisada nos fundos do estande, com ar-condicionado barulhento e garrafas de água mineral sobre a mesa, uma ou outra aberta, a maioria ainda lacrada. Do outro lado da mesa, o diretor da incorporadora, dois advogados, um engenheiro da prefeitura. E, chegando atrasado, de terno azul e gravata vermelha, cumprimentando todos com tapinhas nas costas, o deputado Rubens Falcão.</w:t>
       </w:r>
     </w:p>
     <w:p>
@@ -16189,7 +16189,7 @@
           <w:sz w:val="21"/>
           <w:szCs w:val="21"/>
         </w:rPr>
-        <w:t xml:space="preserve">Lia ficou olhando para aquilo por muito tempo. Carlos não falava com o pai havia quase quatro anos. Desde que Sílvia adoecera depois do divórcio, de um jeito que os médicos chamavam de depressão e que Carlos chamava de culpa dele. Não atendia telefone, não respondia mensagem, não ia aos almoços de aniversário. Quando alguém mencionava o nome de Henrique na frente dele, Carlos saía da sala.</w:t>
+        <w:t xml:space="preserve">Lia ficou olhando para aquilo por muito tempo. Carlos não falava com o pai havia quase quatro anos. Desde que Sílvia, doente desde o divórcio, de um jeito que os médicos chamavam de depressão e que Carlos chamava de culpa do pai, fora internada pela primeira vez. Não atendia telefone, não respondia mensagem, não ia aos almoços de aniversário. Quando alguém mencionava o nome de Henrique na frente dele, Carlos saía da sala.</w:t>
       </w:r>
     </w:p>
     <w:p>
@@ -17120,7 +17120,7 @@
           <w:sz w:val="21"/>
           <w:szCs w:val="21"/>
         </w:rPr>
-        <w:t xml:space="preserve">Lucas ouviu tudo sem tocar no sushi.</w:t>
+        <w:t xml:space="preserve">Lucas ouviu tudo com um pedaço de sushi na boca que levou uma eternidade para engolir.</w:t>
       </w:r>
     </w:p>
     <w:p>
@@ -17299,7 +17299,7 @@
           <w:sz w:val="21"/>
           <w:szCs w:val="21"/>
         </w:rPr>
-        <w:t xml:space="preserve">Lucas abriu a agenda naquela mesma noite, em casa, com um copo de água que não bebeu.</w:t>
+        <w:t xml:space="preserve">Lucas abriu a agenda naquela mesma noite, em casa, com um copo de água que esvaziou em dois goles antes de chegar a abril.</w:t>
       </w:r>
     </w:p>
     <w:p>
@@ -18289,6 +18289,1292 @@
           <w:szCs w:val="21"/>
         </w:rPr>
         <w:t xml:space="preserve">Lucas não sabia. Mas, pela primeira vez, teve a impressão de que alguém na família sabia, e não tinha contado.</w:t>
+      </w:r>
+    </w:p>
+    <w:p>
+      <w:pPr>
+        <w:pageBreakBefore/>
+        <w:spacing w:after="120" w:before="1800"/>
+        <w:jc w:val="center"/>
+      </w:pPr>
+      <w:r>
+        <w:rPr>
+          <w:rFonts w:ascii="Georgia" w:cs="Georgia" w:eastAsia="Georgia" w:hAnsi="Georgia"/>
+          <w:spacing w:val="40"/>
+          <w:sz w:val="20"/>
+          <w:szCs w:val="20"/>
+        </w:rPr>
+        <w:t xml:space="preserve">CAPÍTULO 18</w:t>
+      </w:r>
+    </w:p>
+    <w:p>
+      <w:pPr>
+        <w:spacing w:after="720"/>
+        <w:jc w:val="center"/>
+      </w:pPr>
+      <w:r>
+        <w:rPr>
+          <w:rFonts w:ascii="Georgia" w:cs="Georgia" w:eastAsia="Georgia" w:hAnsi="Georgia"/>
+          <w:b/>
+          <w:bCs/>
+          <w:sz w:val="32"/>
+          <w:szCs w:val="32"/>
+        </w:rPr>
+        <w:t xml:space="preserve">Semana que vem</w:t>
+      </w:r>
+    </w:p>
+    <w:p>
+      <w:pPr>
+        <w:spacing w:after="0" w:line="312"/>
+        <w:ind w:firstLine="340"/>
+        <w:jc w:val="both"/>
+      </w:pPr>
+      <w:r>
+        <w:rPr>
+          <w:rFonts w:ascii="Georgia" w:cs="Georgia" w:eastAsia="Georgia" w:hAnsi="Georgia"/>
+          <w:sz w:val="21"/>
+          <w:szCs w:val="21"/>
+        </w:rPr>
+        <w:t xml:space="preserve">A casa de Sílvia, em Perdizes, tinha as janelas fechadas a qualquer hora do dia, e o cheiro de chá de camomila e de remédio que Lia associava, desde os doze anos, à palavra mãe.</w:t>
+      </w:r>
+    </w:p>
+    <w:p>
+      <w:pPr>
+        <w:spacing w:after="0" w:line="312"/>
+        <w:ind w:firstLine="340"/>
+        <w:jc w:val="both"/>
+      </w:pPr>
+      <w:r>
+        <w:rPr>
+          <w:rFonts w:ascii="Georgia" w:cs="Georgia" w:eastAsia="Georgia" w:hAnsi="Georgia"/>
+          <w:sz w:val="21"/>
+          <w:szCs w:val="21"/>
+        </w:rPr>
+        <w:t xml:space="preserve">Carlos abriu a porta de chinelo e camiseta, com um livro de Direito Civil debaixo do braço, e ficou um momento parado olhando para a irmã, como se tivesse esquecido quem ela era.</w:t>
+      </w:r>
+    </w:p>
+    <w:p>
+      <w:pPr>
+        <w:spacing w:after="0" w:line="312"/>
+        <w:ind w:firstLine="340"/>
+        <w:jc w:val="both"/>
+      </w:pPr>
+      <w:r>
+        <w:rPr>
+          <w:rFonts w:ascii="Georgia" w:cs="Georgia" w:eastAsia="Georgia" w:hAnsi="Georgia"/>
+          <w:sz w:val="21"/>
+          <w:szCs w:val="21"/>
+        </w:rPr>
+        <w:t xml:space="preserve">— A mãe está dormindo — disse.</w:t>
+      </w:r>
+    </w:p>
+    <w:p>
+      <w:pPr>
+        <w:spacing w:after="0" w:line="312"/>
+        <w:ind w:firstLine="340"/>
+        <w:jc w:val="both"/>
+      </w:pPr>
+      <w:r>
+        <w:rPr>
+          <w:rFonts w:ascii="Georgia" w:cs="Georgia" w:eastAsia="Georgia" w:hAnsi="Georgia"/>
+          <w:sz w:val="21"/>
+          <w:szCs w:val="21"/>
+        </w:rPr>
+        <w:t xml:space="preserve">— Eu vim falar com você.</w:t>
+      </w:r>
+    </w:p>
+    <w:p>
+      <w:pPr>
+        <w:spacing w:after="0" w:line="312"/>
+        <w:ind w:firstLine="340"/>
+        <w:jc w:val="both"/>
+      </w:pPr>
+      <w:r>
+        <w:rPr>
+          <w:rFonts w:ascii="Georgia" w:cs="Georgia" w:eastAsia="Georgia" w:hAnsi="Georgia"/>
+          <w:sz w:val="21"/>
+          <w:szCs w:val="21"/>
+        </w:rPr>
+        <w:t xml:space="preserve">Ele hesitou. Depois deu um passo para o lado e a deixou entrar.</w:t>
+      </w:r>
+    </w:p>
+    <w:p>
+      <w:pPr>
+        <w:spacing w:after="200" w:before="200"/>
+        <w:jc w:val="center"/>
+      </w:pPr>
+      <w:r>
+        <w:rPr>
+          <w:rFonts w:ascii="Georgia" w:cs="Georgia" w:eastAsia="Georgia" w:hAnsi="Georgia"/>
+          <w:sz w:val="22"/>
+          <w:szCs w:val="22"/>
+        </w:rPr>
+        <w:t xml:space="preserve">*</w:t>
+      </w:r>
+    </w:p>
+    <w:p>
+      <w:pPr>
+        <w:spacing w:after="0" w:line="312"/>
+        <w:ind w:firstLine="340"/>
+        <w:jc w:val="both"/>
+      </w:pPr>
+      <w:r>
+        <w:rPr>
+          <w:rFonts w:ascii="Georgia" w:cs="Georgia" w:eastAsia="Georgia" w:hAnsi="Georgia"/>
+          <w:sz w:val="21"/>
+          <w:szCs w:val="21"/>
+        </w:rPr>
+        <w:t xml:space="preserve">O quarto de Carlos era o mesmo da adolescência, com as mesmas prateleiras de madeira clara e um pôster desbotado de um time de basquete que ele já não acompanhava. A diferença eram os livros, empilhados no chão, na escrivaninha, na cama. Ele tirou uma pilha da cadeira para que ela sentasse e sentou-se na beira da cama.</w:t>
+      </w:r>
+    </w:p>
+    <w:p>
+      <w:pPr>
+        <w:spacing w:after="0" w:line="312"/>
+        <w:ind w:firstLine="340"/>
+        <w:jc w:val="both"/>
+      </w:pPr>
+      <w:r>
+        <w:rPr>
+          <w:rFonts w:ascii="Georgia" w:cs="Georgia" w:eastAsia="Georgia" w:hAnsi="Georgia"/>
+          <w:sz w:val="21"/>
+          <w:szCs w:val="21"/>
+        </w:rPr>
+        <w:t xml:space="preserve">Lia tirou da bolsa o celular dela e um fone de ouvido. Não disse nada. Estendeu o fone para o irmão.</w:t>
+      </w:r>
+    </w:p>
+    <w:p>
+      <w:pPr>
+        <w:spacing w:after="0" w:line="312"/>
+        <w:ind w:firstLine="340"/>
+        <w:jc w:val="both"/>
+      </w:pPr>
+      <w:r>
+        <w:rPr>
+          <w:rFonts w:ascii="Georgia" w:cs="Georgia" w:eastAsia="Georgia" w:hAnsi="Georgia"/>
+          <w:sz w:val="21"/>
+          <w:szCs w:val="21"/>
+        </w:rPr>
+        <w:t xml:space="preserve">Carlos olhou para o fone como se fosse uma arma.</w:t>
+      </w:r>
+    </w:p>
+    <w:p>
+      <w:pPr>
+        <w:spacing w:after="0" w:line="312"/>
+        <w:ind w:firstLine="340"/>
+        <w:jc w:val="both"/>
+      </w:pPr>
+      <w:r>
+        <w:rPr>
+          <w:rFonts w:ascii="Georgia" w:cs="Georgia" w:eastAsia="Georgia" w:hAnsi="Georgia"/>
+          <w:sz w:val="21"/>
+          <w:szCs w:val="21"/>
+        </w:rPr>
+        <w:t xml:space="preserve">— O que é isso?</w:t>
+      </w:r>
+    </w:p>
+    <w:p>
+      <w:pPr>
+        <w:spacing w:after="0" w:line="312"/>
+        <w:ind w:firstLine="340"/>
+        <w:jc w:val="both"/>
+      </w:pPr>
+      <w:r>
+        <w:rPr>
+          <w:rFonts w:ascii="Georgia" w:cs="Georgia" w:eastAsia="Georgia" w:hAnsi="Georgia"/>
+          <w:sz w:val="21"/>
+          <w:szCs w:val="21"/>
+        </w:rPr>
+        <w:t xml:space="preserve">— Você sabe o que é.</w:t>
+      </w:r>
+    </w:p>
+    <w:p>
+      <w:pPr>
+        <w:spacing w:after="0" w:line="312"/>
+        <w:ind w:firstLine="340"/>
+        <w:jc w:val="both"/>
+      </w:pPr>
+      <w:r>
+        <w:rPr>
+          <w:rFonts w:ascii="Georgia" w:cs="Georgia" w:eastAsia="Georgia" w:hAnsi="Georgia"/>
+          <w:sz w:val="21"/>
+          <w:szCs w:val="21"/>
+        </w:rPr>
+        <w:t xml:space="preserve">Ele não pegou o fone. Lia tirou o fone do celular e apertou o play no alto-falante. A voz do pai encheu o quarto pequeno, rouca, baixa, entre o barulho de um carro passando.</w:t>
+      </w:r>
+    </w:p>
+    <w:p>
+      <w:pPr>
+        <w:spacing w:after="0" w:line="312"/>
+        <w:ind w:firstLine="340"/>
+        <w:jc w:val="both"/>
+      </w:pPr>
+      <w:r>
+        <w:rPr>
+          <w:rFonts w:ascii="Georgia" w:cs="Georgia" w:eastAsia="Georgia" w:hAnsi="Georgia"/>
+          <w:sz w:val="21"/>
+          <w:szCs w:val="21"/>
+        </w:rPr>
+        <w:t xml:space="preserve">Carlos. Sou eu. Não apaga.</w:t>
+      </w:r>
+    </w:p>
+    <w:p>
+      <w:pPr>
+        <w:spacing w:after="0" w:line="312"/>
+        <w:ind w:firstLine="340"/>
+        <w:jc w:val="both"/>
+      </w:pPr>
+      <w:r>
+        <w:rPr>
+          <w:rFonts w:ascii="Georgia" w:cs="Georgia" w:eastAsia="Georgia" w:hAnsi="Georgia"/>
+          <w:sz w:val="21"/>
+          <w:szCs w:val="21"/>
+        </w:rPr>
+        <w:t xml:space="preserve">O irmão fechou os olhos. Não os abriu até a gravação terminar.</w:t>
+      </w:r>
+    </w:p>
+    <w:p>
+      <w:pPr>
+        <w:spacing w:after="0" w:line="312"/>
+        <w:ind w:firstLine="340"/>
+        <w:jc w:val="both"/>
+      </w:pPr>
+      <w:r>
+        <w:rPr>
+          <w:rFonts w:ascii="Georgia" w:cs="Georgia" w:eastAsia="Georgia" w:hAnsi="Georgia"/>
+          <w:sz w:val="21"/>
+          <w:szCs w:val="21"/>
+        </w:rPr>
+        <w:t xml:space="preserve">E a sua mãe vai saber de tudo.</w:t>
+      </w:r>
+    </w:p>
+    <w:p>
+      <w:pPr>
+        <w:spacing w:after="0" w:line="312"/>
+        <w:ind w:firstLine="340"/>
+        <w:jc w:val="both"/>
+      </w:pPr>
+      <w:r>
+        <w:rPr>
+          <w:rFonts w:ascii="Georgia" w:cs="Georgia" w:eastAsia="Georgia" w:hAnsi="Georgia"/>
+          <w:sz w:val="21"/>
+          <w:szCs w:val="21"/>
+        </w:rPr>
+        <w:t xml:space="preserve">O silêncio que veio depois foi longo. Do outro lado da parede, Lia ouviu a respiração lenta da mãe dormindo, e um rádio baixinho em alguma casa vizinha.</w:t>
+      </w:r>
+    </w:p>
+    <w:p>
+      <w:pPr>
+        <w:spacing w:after="0" w:line="312"/>
+        <w:ind w:firstLine="340"/>
+        <w:jc w:val="both"/>
+      </w:pPr>
+      <w:r>
+        <w:rPr>
+          <w:rFonts w:ascii="Georgia" w:cs="Georgia" w:eastAsia="Georgia" w:hAnsi="Georgia"/>
+          <w:sz w:val="21"/>
+          <w:szCs w:val="21"/>
+        </w:rPr>
+        <w:t xml:space="preserve">— Como você achou isso? — perguntou Carlos, enfim.</w:t>
+      </w:r>
+    </w:p>
+    <w:p>
+      <w:pPr>
+        <w:spacing w:after="0" w:line="312"/>
+        <w:ind w:firstLine="340"/>
+        <w:jc w:val="both"/>
+      </w:pPr>
+      <w:r>
+        <w:rPr>
+          <w:rFonts w:ascii="Georgia" w:cs="Georgia" w:eastAsia="Georgia" w:hAnsi="Georgia"/>
+          <w:sz w:val="21"/>
+          <w:szCs w:val="21"/>
+        </w:rPr>
+        <w:t xml:space="preserve">— No celular dele. Eu e o Lucas estamos investigando a morte do pai.</w:t>
+      </w:r>
+    </w:p>
+    <w:p>
+      <w:pPr>
+        <w:spacing w:after="0" w:line="312"/>
+        <w:ind w:firstLine="340"/>
+        <w:jc w:val="both"/>
+      </w:pPr>
+      <w:r>
+        <w:rPr>
+          <w:rFonts w:ascii="Georgia" w:cs="Georgia" w:eastAsia="Georgia" w:hAnsi="Georgia"/>
+          <w:sz w:val="21"/>
+          <w:szCs w:val="21"/>
+        </w:rPr>
+        <w:t xml:space="preserve">— O Lucas ouviu?</w:t>
+      </w:r>
+    </w:p>
+    <w:p>
+      <w:pPr>
+        <w:spacing w:after="0" w:line="312"/>
+        <w:ind w:firstLine="340"/>
+        <w:jc w:val="both"/>
+      </w:pPr>
+      <w:r>
+        <w:rPr>
+          <w:rFonts w:ascii="Georgia" w:cs="Georgia" w:eastAsia="Georgia" w:hAnsi="Georgia"/>
+          <w:sz w:val="21"/>
+          <w:szCs w:val="21"/>
+        </w:rPr>
+        <w:t xml:space="preserve">— Não. — Lia guardou o celular. — Eu apaguei antes que ele ouvisse.</w:t>
+      </w:r>
+    </w:p>
+    <w:p>
+      <w:pPr>
+        <w:spacing w:after="0" w:line="312"/>
+        <w:ind w:firstLine="340"/>
+        <w:jc w:val="both"/>
+      </w:pPr>
+      <w:r>
+        <w:rPr>
+          <w:rFonts w:ascii="Georgia" w:cs="Georgia" w:eastAsia="Georgia" w:hAnsi="Georgia"/>
+          <w:sz w:val="21"/>
+          <w:szCs w:val="21"/>
+        </w:rPr>
+        <w:t xml:space="preserve">Carlos abriu os olhos e olhou para ela de um jeito novo.</w:t>
+      </w:r>
+    </w:p>
+    <w:p>
+      <w:pPr>
+        <w:spacing w:after="0" w:line="312"/>
+        <w:ind w:firstLine="340"/>
+        <w:jc w:val="both"/>
+      </w:pPr>
+      <w:r>
+        <w:rPr>
+          <w:rFonts w:ascii="Georgia" w:cs="Georgia" w:eastAsia="Georgia" w:hAnsi="Georgia"/>
+          <w:sz w:val="21"/>
+          <w:szCs w:val="21"/>
+        </w:rPr>
+        <w:t xml:space="preserve">— Por quê?</w:t>
+      </w:r>
+    </w:p>
+    <w:p>
+      <w:pPr>
+        <w:spacing w:after="0" w:line="312"/>
+        <w:ind w:firstLine="340"/>
+        <w:jc w:val="both"/>
+      </w:pPr>
+      <w:r>
+        <w:rPr>
+          <w:rFonts w:ascii="Georgia" w:cs="Georgia" w:eastAsia="Georgia" w:hAnsi="Georgia"/>
+          <w:sz w:val="21"/>
+          <w:szCs w:val="21"/>
+        </w:rPr>
+        <w:t xml:space="preserve">— Porque eu queria ouvir de você primeiro.</w:t>
+      </w:r>
+    </w:p>
+    <w:p>
+      <w:pPr>
+        <w:spacing w:after="200" w:before="200"/>
+        <w:jc w:val="center"/>
+      </w:pPr>
+      <w:r>
+        <w:rPr>
+          <w:rFonts w:ascii="Georgia" w:cs="Georgia" w:eastAsia="Georgia" w:hAnsi="Georgia"/>
+          <w:sz w:val="22"/>
+          <w:szCs w:val="22"/>
+        </w:rPr>
+        <w:t xml:space="preserve">*</w:t>
+      </w:r>
+    </w:p>
+    <w:p>
+      <w:pPr>
+        <w:spacing w:after="0" w:line="312"/>
+        <w:ind w:firstLine="340"/>
+        <w:jc w:val="both"/>
+      </w:pPr>
+      <w:r>
+        <w:rPr>
+          <w:rFonts w:ascii="Georgia" w:cs="Georgia" w:eastAsia="Georgia" w:hAnsi="Georgia"/>
+          <w:sz w:val="21"/>
+          <w:szCs w:val="21"/>
+        </w:rPr>
+        <w:t xml:space="preserve">Ele levou um tempo para começar. Quando começou, falou olhando para o pôster desbotado, e não para ela.</w:t>
+      </w:r>
+    </w:p>
+    <w:p>
+      <w:pPr>
+        <w:spacing w:after="0" w:line="312"/>
+        <w:ind w:firstLine="340"/>
+        <w:jc w:val="both"/>
+      </w:pPr>
+      <w:r>
+        <w:rPr>
+          <w:rFonts w:ascii="Georgia" w:cs="Georgia" w:eastAsia="Georgia" w:hAnsi="Georgia"/>
+          <w:sz w:val="21"/>
+          <w:szCs w:val="21"/>
+        </w:rPr>
+        <w:t xml:space="preserve">— Eu ouvi no sábado à noite, aqui, nesta cama. Ouvi umas vinte vezes. Uma coisa que eu nunca contei para ninguém. Semana que vem. A sua mãe vai saber de tudo. — Carlos esfregou o rosto com as duas mãos. — Lia, você sabe como a mãe está. Você vem aqui aos domingos. Eu moro aqui. Eu vejo ela todos os dias. Tem dia que ela não levanta. Tem dia que ela não come. Tem dia que ela pergunta se a culpa do divórcio foi dela, e eu digo que não, e ela não acredita.</w:t>
+      </w:r>
+    </w:p>
+    <w:p>
+      <w:pPr>
+        <w:spacing w:after="0" w:line="312"/>
+        <w:ind w:firstLine="340"/>
+        <w:jc w:val="both"/>
+      </w:pPr>
+      <w:r>
+        <w:rPr>
+          <w:rFonts w:ascii="Georgia" w:cs="Georgia" w:eastAsia="Georgia" w:hAnsi="Georgia"/>
+          <w:sz w:val="21"/>
+          <w:szCs w:val="21"/>
+        </w:rPr>
+        <w:t xml:space="preserve">— Eu sei.</w:t>
+      </w:r>
+    </w:p>
+    <w:p>
+      <w:pPr>
+        <w:spacing w:after="0" w:line="312"/>
+        <w:ind w:firstLine="340"/>
+        <w:jc w:val="both"/>
+      </w:pPr>
+      <w:r>
+        <w:rPr>
+          <w:rFonts w:ascii="Georgia" w:cs="Georgia" w:eastAsia="Georgia" w:hAnsi="Georgia"/>
+          <w:sz w:val="21"/>
+          <w:szCs w:val="21"/>
+        </w:rPr>
+        <w:t xml:space="preserve">— Você não sabe. Você vem aos domingos. — Ele não disse aquilo com raiva. Disse com cansaço. — Ela demorou quatro anos para conseguir sair de casa e ir ao mercado sozinha. Quatro anos. E aí ele manda um áudio dizendo que vai contar tudo para ela. Tudo o quê? Mais uma mulher? Mais uma mentira? Mais um motivo para ela voltar para a cama?</w:t>
+      </w:r>
+    </w:p>
+    <w:p>
+      <w:pPr>
+        <w:spacing w:after="0" w:line="312"/>
+        <w:ind w:firstLine="340"/>
+        <w:jc w:val="both"/>
+      </w:pPr>
+      <w:r>
+        <w:rPr>
+          <w:rFonts w:ascii="Georgia" w:cs="Georgia" w:eastAsia="Georgia" w:hAnsi="Georgia"/>
+          <w:sz w:val="21"/>
+          <w:szCs w:val="21"/>
+        </w:rPr>
+        <w:t xml:space="preserve">Lia não respondeu.</w:t>
+      </w:r>
+    </w:p>
+    <w:p>
+      <w:pPr>
+        <w:spacing w:after="0" w:line="312"/>
+        <w:ind w:firstLine="340"/>
+        <w:jc w:val="both"/>
+      </w:pPr>
+      <w:r>
+        <w:rPr>
+          <w:rFonts w:ascii="Georgia" w:cs="Georgia" w:eastAsia="Georgia" w:hAnsi="Georgia"/>
+          <w:sz w:val="21"/>
+          <w:szCs w:val="21"/>
+        </w:rPr>
+        <w:t xml:space="preserve">— Na segunda, eu não fui à aula — continuou ele. — Pedi para o Bruno assinar. Peguei a moto e fui até a casa dele. Fiquei parado na esquina mais de uma hora, de capacete. Eu queria esperar ele chegar e…</w:t>
+      </w:r>
+    </w:p>
+    <w:p>
+      <w:pPr>
+        <w:spacing w:after="0" w:line="312"/>
+        <w:ind w:firstLine="340"/>
+        <w:jc w:val="both"/>
+      </w:pPr>
+      <w:r>
+        <w:rPr>
+          <w:rFonts w:ascii="Georgia" w:cs="Georgia" w:eastAsia="Georgia" w:hAnsi="Georgia"/>
+          <w:sz w:val="21"/>
+          <w:szCs w:val="21"/>
+        </w:rPr>
+        <w:t xml:space="preserve">Parou.</w:t>
+      </w:r>
+    </w:p>
+    <w:p>
+      <w:pPr>
+        <w:spacing w:after="0" w:line="312"/>
+        <w:ind w:firstLine="340"/>
+        <w:jc w:val="both"/>
+      </w:pPr>
+      <w:r>
+        <w:rPr>
+          <w:rFonts w:ascii="Georgia" w:cs="Georgia" w:eastAsia="Georgia" w:hAnsi="Georgia"/>
+          <w:sz w:val="21"/>
+          <w:szCs w:val="21"/>
+        </w:rPr>
+        <w:t xml:space="preserve">— E o quê, Carlos?</w:t>
+      </w:r>
+    </w:p>
+    <w:p>
+      <w:pPr>
+        <w:spacing w:after="0" w:line="312"/>
+        <w:ind w:firstLine="340"/>
+        <w:jc w:val="both"/>
+      </w:pPr>
+      <w:r>
+        <w:rPr>
+          <w:rFonts w:ascii="Georgia" w:cs="Georgia" w:eastAsia="Georgia" w:hAnsi="Georgia"/>
+          <w:sz w:val="21"/>
+          <w:szCs w:val="21"/>
+        </w:rPr>
+        <w:t xml:space="preserve">— E fazer ele calar a boca. — A voz do irmão quebrou. — Para sempre. Eu pensei nisso, Lia. Eu pensei de verdade. Eu fiquei uma hora olhando para aquela casa pensando em como seria.</w:t>
+      </w:r>
+    </w:p>
+    <w:p>
+      <w:pPr>
+        <w:spacing w:after="200" w:before="200"/>
+        <w:jc w:val="center"/>
+      </w:pPr>
+      <w:r>
+        <w:rPr>
+          <w:rFonts w:ascii="Georgia" w:cs="Georgia" w:eastAsia="Georgia" w:hAnsi="Georgia"/>
+          <w:sz w:val="22"/>
+          <w:szCs w:val="22"/>
+        </w:rPr>
+        <w:t xml:space="preserve">*</w:t>
+      </w:r>
+    </w:p>
+    <w:p>
+      <w:pPr>
+        <w:spacing w:after="0" w:line="312"/>
+        <w:ind w:firstLine="340"/>
+        <w:jc w:val="both"/>
+      </w:pPr>
+      <w:r>
+        <w:rPr>
+          <w:rFonts w:ascii="Georgia" w:cs="Georgia" w:eastAsia="Georgia" w:hAnsi="Georgia"/>
+          <w:sz w:val="21"/>
+          <w:szCs w:val="21"/>
+        </w:rPr>
+        <w:t xml:space="preserve">Lia sentiu as mãos frias. Não se mexeu.</w:t>
+      </w:r>
+    </w:p>
+    <w:p>
+      <w:pPr>
+        <w:spacing w:after="0" w:line="312"/>
+        <w:ind w:firstLine="340"/>
+        <w:jc w:val="both"/>
+      </w:pPr>
+      <w:r>
+        <w:rPr>
+          <w:rFonts w:ascii="Georgia" w:cs="Georgia" w:eastAsia="Georgia" w:hAnsi="Georgia"/>
+          <w:sz w:val="21"/>
+          <w:szCs w:val="21"/>
+        </w:rPr>
+        <w:t xml:space="preserve">— E aí ele chegou — disse Carlos. — Meia-noite e pouco. Sozinho, dirigindo. Desceu do carro para abrir o portão, porque o controle não funcionou na primeira vez. E eu vi ele de perto, debaixo do poste. Ele estava velho, Lia. Eu não via o pai fazia quatro anos e ele estava velho. Magro. Andando devagar, como quem carrega um saco de cimento nas costas. Ficou parado na frente do portão com o controle na mão, olhando para o nada, e eu pensei: esse homem já está morrendo. Não precisa de mim.</w:t>
+      </w:r>
+    </w:p>
+    <w:p>
+      <w:pPr>
+        <w:spacing w:after="0" w:line="312"/>
+        <w:ind w:firstLine="340"/>
+        <w:jc w:val="both"/>
+      </w:pPr>
+      <w:r>
+        <w:rPr>
+          <w:rFonts w:ascii="Georgia" w:cs="Georgia" w:eastAsia="Georgia" w:hAnsi="Georgia"/>
+          <w:sz w:val="21"/>
+          <w:szCs w:val="21"/>
+        </w:rPr>
+        <w:t xml:space="preserve">Ele riu, um riso que doeu de ouvir.</w:t>
+      </w:r>
+    </w:p>
+    <w:p>
+      <w:pPr>
+        <w:spacing w:after="0" w:line="312"/>
+        <w:ind w:firstLine="340"/>
+        <w:jc w:val="both"/>
+      </w:pPr>
+      <w:r>
+        <w:rPr>
+          <w:rFonts w:ascii="Georgia" w:cs="Georgia" w:eastAsia="Georgia" w:hAnsi="Georgia"/>
+          <w:sz w:val="21"/>
+          <w:szCs w:val="21"/>
+        </w:rPr>
+        <w:t xml:space="preserve">— Liguei a moto e fui embora. Vim pra casa. Não dormi. De manhã, a mãe me acordou chorando, com o telefone na mão. O doutor Álvaro tinha ligado. Infarto.</w:t>
+      </w:r>
+    </w:p>
+    <w:p>
+      <w:pPr>
+        <w:spacing w:after="0" w:line="312"/>
+        <w:ind w:firstLine="340"/>
+        <w:jc w:val="both"/>
+      </w:pPr>
+      <w:r>
+        <w:rPr>
+          <w:rFonts w:ascii="Georgia" w:cs="Georgia" w:eastAsia="Georgia" w:hAnsi="Georgia"/>
+          <w:sz w:val="21"/>
+          <w:szCs w:val="21"/>
+        </w:rPr>
+        <w:t xml:space="preserve">— Carlos…</w:t>
+      </w:r>
+    </w:p>
+    <w:p>
+      <w:pPr>
+        <w:spacing w:after="0" w:line="312"/>
+        <w:ind w:firstLine="340"/>
+        <w:jc w:val="both"/>
+      </w:pPr>
+      <w:r>
+        <w:rPr>
+          <w:rFonts w:ascii="Georgia" w:cs="Georgia" w:eastAsia="Georgia" w:hAnsi="Georgia"/>
+          <w:sz w:val="21"/>
+          <w:szCs w:val="21"/>
+        </w:rPr>
+        <w:t xml:space="preserve">— Eu não fiz nada, Lia. Juro por Deus que não fiz nada. — Ele finalmente olhou para ela. Os olhos estavam vermelhos. — Mas eu quis. Eu fiquei uma hora querendo. E de manhã ele estava morto, como se alguém tivesse ouvido o que eu estava pensando naquela esquina e feito por mim.</w:t>
+      </w:r>
+    </w:p>
+    <w:p>
+      <w:pPr>
+        <w:spacing w:after="0" w:line="312"/>
+        <w:ind w:firstLine="340"/>
+        <w:jc w:val="both"/>
+      </w:pPr>
+      <w:r>
+        <w:rPr>
+          <w:rFonts w:ascii="Georgia" w:cs="Georgia" w:eastAsia="Georgia" w:hAnsi="Georgia"/>
+          <w:sz w:val="21"/>
+          <w:szCs w:val="21"/>
+        </w:rPr>
+        <w:t xml:space="preserve">Ela se levantou da cadeira e sentou ao lado dele na cama, como fazia quando os dois eram crianças e um trovão acordava o irmão no meio da noite. Carlos não a abraçou. Mas encostou o ombro no dela, e ficou.</w:t>
+      </w:r>
+    </w:p>
+    <w:p>
+      <w:pPr>
+        <w:spacing w:after="200" w:before="200"/>
+        <w:jc w:val="center"/>
+      </w:pPr>
+      <w:r>
+        <w:rPr>
+          <w:rFonts w:ascii="Georgia" w:cs="Georgia" w:eastAsia="Georgia" w:hAnsi="Georgia"/>
+          <w:sz w:val="22"/>
+          <w:szCs w:val="22"/>
+        </w:rPr>
+        <w:t xml:space="preserve">*</w:t>
+      </w:r>
+    </w:p>
+    <w:p>
+      <w:pPr>
+        <w:spacing w:after="0" w:line="312"/>
+        <w:ind w:firstLine="340"/>
+        <w:jc w:val="both"/>
+      </w:pPr>
+      <w:r>
+        <w:rPr>
+          <w:rFonts w:ascii="Georgia" w:cs="Georgia" w:eastAsia="Georgia" w:hAnsi="Georgia"/>
+          <w:sz w:val="21"/>
+          <w:szCs w:val="21"/>
+        </w:rPr>
+        <w:t xml:space="preserve">A porta do quarto se abriu devagar.</w:t>
+      </w:r>
+    </w:p>
+    <w:p>
+      <w:pPr>
+        <w:spacing w:after="0" w:line="312"/>
+        <w:ind w:firstLine="340"/>
+        <w:jc w:val="both"/>
+      </w:pPr>
+      <w:r>
+        <w:rPr>
+          <w:rFonts w:ascii="Georgia" w:cs="Georgia" w:eastAsia="Georgia" w:hAnsi="Georgia"/>
+          <w:sz w:val="21"/>
+          <w:szCs w:val="21"/>
+        </w:rPr>
+        <w:t xml:space="preserve">Sílvia estava no corredor, de roupão, com o cabelo grisalho solto e uma xícara de chá na mão. Tinha a expressão confusa e lenta de quem acorda de um sono pesado, mas os olhos estavam atentos.</w:t>
+      </w:r>
+    </w:p>
+    <w:p>
+      <w:pPr>
+        <w:spacing w:after="0" w:line="312"/>
+        <w:ind w:firstLine="340"/>
+        <w:jc w:val="both"/>
+      </w:pPr>
+      <w:r>
+        <w:rPr>
+          <w:rFonts w:ascii="Georgia" w:cs="Georgia" w:eastAsia="Georgia" w:hAnsi="Georgia"/>
+          <w:sz w:val="21"/>
+          <w:szCs w:val="21"/>
+        </w:rPr>
+        <w:t xml:space="preserve">— Eu ouvi a voz dele — disse. — Achei que estava sonhando.</w:t>
+      </w:r>
+    </w:p>
+    <w:p>
+      <w:pPr>
+        <w:spacing w:after="0" w:line="312"/>
+        <w:ind w:firstLine="340"/>
+        <w:jc w:val="both"/>
+      </w:pPr>
+      <w:r>
+        <w:rPr>
+          <w:rFonts w:ascii="Georgia" w:cs="Georgia" w:eastAsia="Georgia" w:hAnsi="Georgia"/>
+          <w:sz w:val="21"/>
+          <w:szCs w:val="21"/>
+        </w:rPr>
+        <w:t xml:space="preserve">Lia se levantou.</w:t>
+      </w:r>
+    </w:p>
+    <w:p>
+      <w:pPr>
+        <w:spacing w:after="0" w:line="312"/>
+        <w:ind w:firstLine="340"/>
+        <w:jc w:val="both"/>
+      </w:pPr>
+      <w:r>
+        <w:rPr>
+          <w:rFonts w:ascii="Georgia" w:cs="Georgia" w:eastAsia="Georgia" w:hAnsi="Georgia"/>
+          <w:sz w:val="21"/>
+          <w:szCs w:val="21"/>
+        </w:rPr>
+        <w:t xml:space="preserve">— Mãe, volta para a cama…</w:t>
+      </w:r>
+    </w:p>
+    <w:p>
+      <w:pPr>
+        <w:spacing w:after="0" w:line="312"/>
+        <w:ind w:firstLine="340"/>
+        <w:jc w:val="both"/>
+      </w:pPr>
+      <w:r>
+        <w:rPr>
+          <w:rFonts w:ascii="Georgia" w:cs="Georgia" w:eastAsia="Georgia" w:hAnsi="Georgia"/>
+          <w:sz w:val="21"/>
+          <w:szCs w:val="21"/>
+        </w:rPr>
+        <w:t xml:space="preserve">— Põe de novo. — Sílvia entrou no quarto e sentou-se na cadeira que a filha tinha deixado. — Põe de novo o que ele disse.</w:t>
+      </w:r>
+    </w:p>
+    <w:p>
+      <w:pPr>
+        <w:spacing w:after="0" w:line="312"/>
+        <w:ind w:firstLine="340"/>
+        <w:jc w:val="both"/>
+      </w:pPr>
+      <w:r>
+        <w:rPr>
+          <w:rFonts w:ascii="Georgia" w:cs="Georgia" w:eastAsia="Georgia" w:hAnsi="Georgia"/>
+          <w:sz w:val="21"/>
+          <w:szCs w:val="21"/>
+        </w:rPr>
+        <w:t xml:space="preserve">Lia olhou para Carlos. Carlos olhou para o chão. Ela pegou o celular e apertou o play.</w:t>
+      </w:r>
+    </w:p>
+    <w:p>
+      <w:pPr>
+        <w:spacing w:after="0" w:line="312"/>
+        <w:ind w:firstLine="340"/>
+        <w:jc w:val="both"/>
+      </w:pPr>
+      <w:r>
+        <w:rPr>
+          <w:rFonts w:ascii="Georgia" w:cs="Georgia" w:eastAsia="Georgia" w:hAnsi="Georgia"/>
+          <w:sz w:val="21"/>
+          <w:szCs w:val="21"/>
+        </w:rPr>
+        <w:t xml:space="preserve">Sílvia ouviu de olhos fechados, segurando a xícara com as duas mãos. Quando a voz do pai disse e a sua mãe vai saber de tudo, ela abriu os olhos e deu um gole longo no chá, já morno, e ficou com ele na boca um tempo antes de engolir.</w:t>
+      </w:r>
+    </w:p>
+    <w:p>
+      <w:pPr>
+        <w:spacing w:after="0" w:line="312"/>
+        <w:ind w:firstLine="340"/>
+        <w:jc w:val="both"/>
+      </w:pPr>
+      <w:r>
+        <w:rPr>
+          <w:rFonts w:ascii="Georgia" w:cs="Georgia" w:eastAsia="Georgia" w:hAnsi="Georgia"/>
+          <w:sz w:val="21"/>
+          <w:szCs w:val="21"/>
+        </w:rPr>
+        <w:t xml:space="preserve">— Ele me ligou no domingo — disse.</w:t>
+      </w:r>
+    </w:p>
+    <w:p>
+      <w:pPr>
+        <w:spacing w:after="0" w:line="312"/>
+        <w:ind w:firstLine="340"/>
+        <w:jc w:val="both"/>
+      </w:pPr>
+      <w:r>
+        <w:rPr>
+          <w:rFonts w:ascii="Georgia" w:cs="Georgia" w:eastAsia="Georgia" w:hAnsi="Georgia"/>
+          <w:sz w:val="21"/>
+          <w:szCs w:val="21"/>
+        </w:rPr>
+        <w:t xml:space="preserve">Carlos ergueu a cabeça de uma vez.</w:t>
+      </w:r>
+    </w:p>
+    <w:p>
+      <w:pPr>
+        <w:spacing w:after="0" w:line="312"/>
+        <w:ind w:firstLine="340"/>
+        <w:jc w:val="both"/>
+      </w:pPr>
+      <w:r>
+        <w:rPr>
+          <w:rFonts w:ascii="Georgia" w:cs="Georgia" w:eastAsia="Georgia" w:hAnsi="Georgia"/>
+          <w:sz w:val="21"/>
+          <w:szCs w:val="21"/>
+        </w:rPr>
+        <w:t xml:space="preserve">— O quê?</w:t>
+      </w:r>
+    </w:p>
+    <w:p>
+      <w:pPr>
+        <w:spacing w:after="0" w:line="312"/>
+        <w:ind w:firstLine="340"/>
+        <w:jc w:val="both"/>
+      </w:pPr>
+      <w:r>
+        <w:rPr>
+          <w:rFonts w:ascii="Georgia" w:cs="Georgia" w:eastAsia="Georgia" w:hAnsi="Georgia"/>
+          <w:sz w:val="21"/>
+          <w:szCs w:val="21"/>
+        </w:rPr>
+        <w:t xml:space="preserve">— No domingo de manhã. Um dia depois desse áudio. Você estava na faculdade, na biblioteca. — Sílvia pousou a xícara no criado-mudo. — Eu quase não atendi. Fazia quatro anos que ele não ligava. Mas atendi.</w:t>
+      </w:r>
+    </w:p>
+    <w:p>
+      <w:pPr>
+        <w:spacing w:after="0" w:line="312"/>
+        <w:ind w:firstLine="340"/>
+        <w:jc w:val="both"/>
+      </w:pPr>
+      <w:r>
+        <w:rPr>
+          <w:rFonts w:ascii="Georgia" w:cs="Georgia" w:eastAsia="Georgia" w:hAnsi="Georgia"/>
+          <w:sz w:val="21"/>
+          <w:szCs w:val="21"/>
+        </w:rPr>
+        <w:t xml:space="preserve">— E o que ele disse? — perguntou Lia.</w:t>
+      </w:r>
+    </w:p>
+    <w:p>
+      <w:pPr>
+        <w:spacing w:after="0" w:line="312"/>
+        <w:ind w:firstLine="340"/>
+        <w:jc w:val="both"/>
+      </w:pPr>
+      <w:r>
+        <w:rPr>
+          <w:rFonts w:ascii="Georgia" w:cs="Georgia" w:eastAsia="Georgia" w:hAnsi="Georgia"/>
+          <w:sz w:val="21"/>
+          <w:szCs w:val="21"/>
+        </w:rPr>
+        <w:t xml:space="preserve">A mãe ficou um tempo olhando para as próprias mãos.</w:t>
+      </w:r>
+    </w:p>
+    <w:p>
+      <w:pPr>
+        <w:spacing w:after="0" w:line="312"/>
+        <w:ind w:firstLine="340"/>
+        <w:jc w:val="both"/>
+      </w:pPr>
+      <w:r>
+        <w:rPr>
+          <w:rFonts w:ascii="Georgia" w:cs="Georgia" w:eastAsia="Georgia" w:hAnsi="Georgia"/>
+          <w:sz w:val="21"/>
+          <w:szCs w:val="21"/>
+        </w:rPr>
+        <w:t xml:space="preserve">— Ele chorou. Seu pai, que eu nunca vi chorar em treze anos de casamento. Chorou no telefone e disse que a culpa nunca tinha sido minha. Que tudo o que ele me disse naqueles anos, que eu era fraca, que eu era fria, que eu não sabia ser mulher de um homem como ele, era mentira dele e não defeito meu. Que ele me traiu desde o primeiro ano e passou treze anos me fazendo acreditar que o problema era eu. — Sílvia respirou fundo. — Disse que devia ter me contado isso há vinte anos. Que eu tinha o direito de saber de tudo. E me pediu perdão.</w:t>
+      </w:r>
+    </w:p>
+    <w:p>
+      <w:pPr>
+        <w:spacing w:after="0" w:line="312"/>
+        <w:ind w:firstLine="340"/>
+        <w:jc w:val="both"/>
+      </w:pPr>
+      <w:r>
+        <w:rPr>
+          <w:rFonts w:ascii="Georgia" w:cs="Georgia" w:eastAsia="Georgia" w:hAnsi="Georgia"/>
+          <w:sz w:val="21"/>
+          <w:szCs w:val="21"/>
+        </w:rPr>
+        <w:t xml:space="preserve">Ninguém disse nada. No quarto ao lado, o rádio da vizinha tocava uma música antiga.</w:t>
+      </w:r>
+    </w:p>
+    <w:p>
+      <w:pPr>
+        <w:spacing w:after="0" w:line="312"/>
+        <w:ind w:firstLine="340"/>
+        <w:jc w:val="both"/>
+      </w:pPr>
+      <w:r>
+        <w:rPr>
+          <w:rFonts w:ascii="Georgia" w:cs="Georgia" w:eastAsia="Georgia" w:hAnsi="Georgia"/>
+          <w:sz w:val="21"/>
+          <w:szCs w:val="21"/>
+        </w:rPr>
+        <w:t xml:space="preserve">— Era isso — disse Carlos, num fio de voz. — Era isso que ele ia contar.</w:t>
+      </w:r>
+    </w:p>
+    <w:p>
+      <w:pPr>
+        <w:spacing w:after="0" w:line="312"/>
+        <w:ind w:firstLine="340"/>
+        <w:jc w:val="both"/>
+      </w:pPr>
+      <w:r>
+        <w:rPr>
+          <w:rFonts w:ascii="Georgia" w:cs="Georgia" w:eastAsia="Georgia" w:hAnsi="Georgia"/>
+          <w:sz w:val="21"/>
+          <w:szCs w:val="21"/>
+        </w:rPr>
+        <w:t xml:space="preserve">— Era isso. — Sílvia olhou para o filho com uma ternura que Lia não via no rosto da mãe havia anos. — Não era para me derrubar, filho. Era para me levantar.</w:t>
+      </w:r>
+    </w:p>
+    <w:p>
+      <w:pPr>
+        <w:spacing w:after="0" w:line="312"/>
+        <w:ind w:firstLine="340"/>
+        <w:jc w:val="both"/>
+      </w:pPr>
+      <w:r>
+        <w:rPr>
+          <w:rFonts w:ascii="Georgia" w:cs="Georgia" w:eastAsia="Georgia" w:hAnsi="Georgia"/>
+          <w:sz w:val="21"/>
+          <w:szCs w:val="21"/>
+        </w:rPr>
+        <w:t xml:space="preserve">Carlos se dobrou sobre os joelhos e começou a chorar como um menino. Sílvia não se levantou. Estendeu a mão e pôs no cabelo dele, e deixou lá.</w:t>
+      </w:r>
+    </w:p>
+    <w:p>
+      <w:pPr>
+        <w:spacing w:after="200" w:before="200"/>
+        <w:jc w:val="center"/>
+      </w:pPr>
+      <w:r>
+        <w:rPr>
+          <w:rFonts w:ascii="Georgia" w:cs="Georgia" w:eastAsia="Georgia" w:hAnsi="Georgia"/>
+          <w:sz w:val="22"/>
+          <w:szCs w:val="22"/>
+        </w:rPr>
+        <w:t xml:space="preserve">*</w:t>
+      </w:r>
+    </w:p>
+    <w:p>
+      <w:pPr>
+        <w:spacing w:after="0" w:line="312"/>
+        <w:ind w:firstLine="340"/>
+        <w:jc w:val="both"/>
+      </w:pPr>
+      <w:r>
+        <w:rPr>
+          <w:rFonts w:ascii="Georgia" w:cs="Georgia" w:eastAsia="Georgia" w:hAnsi="Georgia"/>
+          <w:sz w:val="21"/>
+          <w:szCs w:val="21"/>
+        </w:rPr>
+        <w:t xml:space="preserve">— Mãe — disse Lia, depois de um tempo. — Ele disse mais alguma coisa? Naquele telefonema?</w:t>
+      </w:r>
+    </w:p>
+    <w:p>
+      <w:pPr>
+        <w:spacing w:after="0" w:line="312"/>
+        <w:ind w:firstLine="340"/>
+        <w:jc w:val="both"/>
+      </w:pPr>
+      <w:r>
+        <w:rPr>
+          <w:rFonts w:ascii="Georgia" w:cs="Georgia" w:eastAsia="Georgia" w:hAnsi="Georgia"/>
+          <w:sz w:val="21"/>
+          <w:szCs w:val="21"/>
+        </w:rPr>
+        <w:t xml:space="preserve">Sílvia pensou.</w:t>
+      </w:r>
+    </w:p>
+    <w:p>
+      <w:pPr>
+        <w:spacing w:after="0" w:line="312"/>
+        <w:ind w:firstLine="340"/>
+        <w:jc w:val="both"/>
+      </w:pPr>
+      <w:r>
+        <w:rPr>
+          <w:rFonts w:ascii="Georgia" w:cs="Georgia" w:eastAsia="Georgia" w:hAnsi="Georgia"/>
+          <w:sz w:val="21"/>
+          <w:szCs w:val="21"/>
+        </w:rPr>
+        <w:t xml:space="preserve">— Disse uma coisa estranha, no final. Que ia fazer uma viagem longa. Que eu não me assustasse com nada do que ouvisse nas próximas semanas. — Ela franziu a testa. — Eu achei que era por causa daquelas mortes, dos jornais. Que ele ia se esconder por um tempo. Depois, quando ligaram dizendo que ele tinha morrido, eu achei que ele estava falando da morte. Que ele sabia que estava doente.</w:t>
+      </w:r>
+    </w:p>
+    <w:p>
+      <w:pPr>
+        <w:spacing w:after="0" w:line="312"/>
+        <w:ind w:firstLine="340"/>
+        <w:jc w:val="both"/>
+      </w:pPr>
+      <w:r>
+        <w:rPr>
+          <w:rFonts w:ascii="Georgia" w:cs="Georgia" w:eastAsia="Georgia" w:hAnsi="Georgia"/>
+          <w:sz w:val="21"/>
+          <w:szCs w:val="21"/>
+        </w:rPr>
+        <w:t xml:space="preserve">Lia sentiu um arrepio na nuca. Pensou no pai sentado no sofá dela, na segunda à noite. Um dia eu te mando um cartão-postal de um lugar com neve, e você vai entender.</w:t>
+      </w:r>
+    </w:p>
+    <w:p>
+      <w:pPr>
+        <w:spacing w:after="0" w:line="312"/>
+        <w:ind w:firstLine="340"/>
+        <w:jc w:val="both"/>
+      </w:pPr>
+      <w:r>
+        <w:rPr>
+          <w:rFonts w:ascii="Georgia" w:cs="Georgia" w:eastAsia="Georgia" w:hAnsi="Georgia"/>
+          <w:sz w:val="21"/>
+          <w:szCs w:val="21"/>
+        </w:rPr>
+        <w:t xml:space="preserve">— Ele sabia — disse Sílvia, baixinho. — De algum jeito, ele sabia que ia embora.</w:t>
+      </w:r>
+    </w:p>
+    <w:p>
+      <w:pPr>
+        <w:spacing w:after="200" w:before="200"/>
+        <w:jc w:val="center"/>
+      </w:pPr>
+      <w:r>
+        <w:rPr>
+          <w:rFonts w:ascii="Georgia" w:cs="Georgia" w:eastAsia="Georgia" w:hAnsi="Georgia"/>
+          <w:sz w:val="22"/>
+          <w:szCs w:val="22"/>
+        </w:rPr>
+        <w:t xml:space="preserve">*</w:t>
+      </w:r>
+    </w:p>
+    <w:p>
+      <w:pPr>
+        <w:spacing w:after="0" w:line="312"/>
+        <w:ind w:firstLine="340"/>
+        <w:jc w:val="both"/>
+      </w:pPr>
+      <w:r>
+        <w:rPr>
+          <w:rFonts w:ascii="Georgia" w:cs="Georgia" w:eastAsia="Georgia" w:hAnsi="Georgia"/>
+          <w:sz w:val="21"/>
+          <w:szCs w:val="21"/>
+        </w:rPr>
+        <w:t xml:space="preserve">Lia saiu da casa de Perdizes às onze da noite. Na calçada, o celular vibrou. Era Lucas.</w:t>
+      </w:r>
+    </w:p>
+    <w:p>
+      <w:pPr>
+        <w:spacing w:after="0" w:line="312"/>
+        <w:ind w:firstLine="340"/>
+        <w:jc w:val="both"/>
+      </w:pPr>
+      <w:r>
+        <w:rPr>
+          <w:rFonts w:ascii="Georgia" w:cs="Georgia" w:eastAsia="Georgia" w:hAnsi="Georgia"/>
+          <w:sz w:val="21"/>
+          <w:szCs w:val="21"/>
+        </w:rPr>
+        <w:t xml:space="preserve">— Você está onde?</w:t>
+      </w:r>
+    </w:p>
+    <w:p>
+      <w:pPr>
+        <w:spacing w:after="0" w:line="312"/>
+        <w:ind w:firstLine="340"/>
+        <w:jc w:val="both"/>
+      </w:pPr>
+      <w:r>
+        <w:rPr>
+          <w:rFonts w:ascii="Georgia" w:cs="Georgia" w:eastAsia="Georgia" w:hAnsi="Georgia"/>
+          <w:sz w:val="21"/>
+          <w:szCs w:val="21"/>
+        </w:rPr>
+        <w:t xml:space="preserve">— Na casa da minha mãe.</w:t>
+      </w:r>
+    </w:p>
+    <w:p>
+      <w:pPr>
+        <w:spacing w:after="0" w:line="312"/>
+        <w:ind w:firstLine="340"/>
+        <w:jc w:val="both"/>
+      </w:pPr>
+      <w:r>
+        <w:rPr>
+          <w:rFonts w:ascii="Georgia" w:cs="Georgia" w:eastAsia="Georgia" w:hAnsi="Georgia"/>
+          <w:sz w:val="21"/>
+          <w:szCs w:val="21"/>
+        </w:rPr>
+        <w:t xml:space="preserve">— Com o Carlos.</w:t>
+      </w:r>
+    </w:p>
+    <w:p>
+      <w:pPr>
+        <w:spacing w:after="0" w:line="312"/>
+        <w:ind w:firstLine="340"/>
+        <w:jc w:val="both"/>
+      </w:pPr>
+      <w:r>
+        <w:rPr>
+          <w:rFonts w:ascii="Georgia" w:cs="Georgia" w:eastAsia="Georgia" w:hAnsi="Georgia"/>
+          <w:sz w:val="21"/>
+          <w:szCs w:val="21"/>
+        </w:rPr>
+        <w:t xml:space="preserve">Não era uma pergunta. Lia parou ao lado do carro.</w:t>
+      </w:r>
+    </w:p>
+    <w:p>
+      <w:pPr>
+        <w:spacing w:after="0" w:line="312"/>
+        <w:ind w:firstLine="340"/>
+        <w:jc w:val="both"/>
+      </w:pPr>
+      <w:r>
+        <w:rPr>
+          <w:rFonts w:ascii="Georgia" w:cs="Georgia" w:eastAsia="Georgia" w:hAnsi="Georgia"/>
+          <w:sz w:val="21"/>
+          <w:szCs w:val="21"/>
+        </w:rPr>
+        <w:t xml:space="preserve">— Com o Carlos e com a minha mãe.</w:t>
+      </w:r>
+    </w:p>
+    <w:p>
+      <w:pPr>
+        <w:spacing w:after="0" w:line="312"/>
+        <w:ind w:firstLine="340"/>
+        <w:jc w:val="both"/>
+      </w:pPr>
+      <w:r>
+        <w:rPr>
+          <w:rFonts w:ascii="Georgia" w:cs="Georgia" w:eastAsia="Georgia" w:hAnsi="Georgia"/>
+          <w:sz w:val="21"/>
+          <w:szCs w:val="21"/>
+        </w:rPr>
+        <w:t xml:space="preserve">— Lia, eu sei. — A voz do irmão estava cansada e firme ao mesmo tempo. — Eu sei da lista de presença. Eu sei da moto parada na esquina da casa do pai na véspera, das onze à meia-noite e vinte. Eu sei que você foi à faculdade e me disse que só tinha visto a agenda. Eu sei que você está protegendo ele.</w:t>
+      </w:r>
+    </w:p>
+    <w:p>
+      <w:pPr>
+        <w:spacing w:after="0" w:line="312"/>
+        <w:ind w:firstLine="340"/>
+        <w:jc w:val="both"/>
+      </w:pPr>
+      <w:r>
+        <w:rPr>
+          <w:rFonts w:ascii="Georgia" w:cs="Georgia" w:eastAsia="Georgia" w:hAnsi="Georgia"/>
+          <w:sz w:val="21"/>
+          <w:szCs w:val="21"/>
+        </w:rPr>
+        <w:t xml:space="preserve">— Não foi ele.</w:t>
+      </w:r>
+    </w:p>
+    <w:p>
+      <w:pPr>
+        <w:spacing w:after="0" w:line="312"/>
+        <w:ind w:firstLine="340"/>
+        <w:jc w:val="both"/>
+      </w:pPr>
+      <w:r>
+        <w:rPr>
+          <w:rFonts w:ascii="Georgia" w:cs="Georgia" w:eastAsia="Georgia" w:hAnsi="Georgia"/>
+          <w:sz w:val="21"/>
+          <w:szCs w:val="21"/>
+        </w:rPr>
+        <w:t xml:space="preserve">— Então me prova.</w:t>
+      </w:r>
+    </w:p>
+    <w:p>
+      <w:pPr>
+        <w:spacing w:after="0" w:line="312"/>
+        <w:ind w:firstLine="340"/>
+        <w:jc w:val="both"/>
+      </w:pPr>
+      <w:r>
+        <w:rPr>
+          <w:rFonts w:ascii="Georgia" w:cs="Georgia" w:eastAsia="Georgia" w:hAnsi="Georgia"/>
+          <w:sz w:val="21"/>
+          <w:szCs w:val="21"/>
+        </w:rPr>
+        <w:t xml:space="preserve">Lia ficou em silêncio, com a mão na maçaneta do carro. Para provar, teria de contar do áudio. Teria de contar que o tinha apagado do celular do pai. Teria de dizer ao irmão que, durante uma semana inteira, tinha mentido para ele olhando nos olhos dele, na calçada de um restaurante japonês.</w:t>
+      </w:r>
+    </w:p>
+    <w:p>
+      <w:pPr>
+        <w:spacing w:after="0" w:line="312"/>
+        <w:ind w:firstLine="340"/>
+        <w:jc w:val="both"/>
+      </w:pPr>
+      <w:r>
+        <w:rPr>
+          <w:rFonts w:ascii="Georgia" w:cs="Georgia" w:eastAsia="Georgia" w:hAnsi="Georgia"/>
+          <w:sz w:val="21"/>
+          <w:szCs w:val="21"/>
+        </w:rPr>
+        <w:t xml:space="preserve">— Não foi ele, Lucas — repetiu.</w:t>
+      </w:r>
+    </w:p>
+    <w:p>
+      <w:pPr>
+        <w:spacing w:after="0" w:line="312"/>
+        <w:ind w:firstLine="340"/>
+        <w:jc w:val="both"/>
+      </w:pPr>
+      <w:r>
+        <w:rPr>
+          <w:rFonts w:ascii="Georgia" w:cs="Georgia" w:eastAsia="Georgia" w:hAnsi="Georgia"/>
+          <w:sz w:val="21"/>
+          <w:szCs w:val="21"/>
+        </w:rPr>
+        <w:t xml:space="preserve">— Para mim, chega. — Ele respirou fundo do outro lado da linha. — O caso está fechado. Amanhã eu vou à delegada.</w:t>
+      </w:r>
+    </w:p>
+    <w:p>
+      <w:pPr>
+        <w:spacing w:after="0" w:line="312"/>
+        <w:ind w:firstLine="340"/>
+        <w:jc w:val="both"/>
+      </w:pPr>
+      <w:r>
+        <w:rPr>
+          <w:rFonts w:ascii="Georgia" w:cs="Georgia" w:eastAsia="Georgia" w:hAnsi="Georgia"/>
+          <w:sz w:val="21"/>
+          <w:szCs w:val="21"/>
+        </w:rPr>
+        <w:t xml:space="preserve">E desligou.</w:t>
+      </w:r>
+    </w:p>
+    <w:p>
+      <w:pPr>
+        <w:spacing w:after="0" w:line="312"/>
+        <w:ind w:firstLine="340"/>
+        <w:jc w:val="both"/>
+      </w:pPr>
+      <w:r>
+        <w:rPr>
+          <w:rFonts w:ascii="Georgia" w:cs="Georgia" w:eastAsia="Georgia" w:hAnsi="Georgia"/>
+          <w:sz w:val="21"/>
+          <w:szCs w:val="21"/>
+        </w:rPr>
+        <w:t xml:space="preserve">Lia ficou parada na calçada escura de Perdizes, ouvindo o silêncio do celular. Lá dentro, pela fresta da janela fechada, a luz do quarto de Carlos continuava acesa.</w:t>
+      </w:r>
+    </w:p>
+    <w:p>
+      <w:pPr>
+        <w:spacing w:after="0" w:line="312"/>
+        <w:ind w:firstLine="340"/>
+        <w:jc w:val="both"/>
+      </w:pPr>
+      <w:r>
+        <w:rPr>
+          <w:rFonts w:ascii="Georgia" w:cs="Georgia" w:eastAsia="Georgia" w:hAnsi="Georgia"/>
+          <w:sz w:val="21"/>
+          <w:szCs w:val="21"/>
+        </w:rPr>
+        <w:t xml:space="preserve">Ela sabia que não tinha sido o irmão.</w:t>
+      </w:r>
+    </w:p>
+    <w:p>
+      <w:pPr>
+        <w:spacing w:after="0" w:line="312"/>
+        <w:ind w:firstLine="340"/>
+        <w:jc w:val="both"/>
+      </w:pPr>
+      <w:r>
+        <w:rPr>
+          <w:rFonts w:ascii="Georgia" w:cs="Georgia" w:eastAsia="Georgia" w:hAnsi="Georgia"/>
+          <w:sz w:val="21"/>
+          <w:szCs w:val="21"/>
+        </w:rPr>
+        <w:t xml:space="preserve">E sabia que, pela primeira vez, Lucas não ia acreditar nela.</w:t>
       </w:r>
     </w:p>
     <w:sectPr>

</xml_diff>

<commit_message>
Livro policial: capítulo 19 (Sete e dois)
Co-Authored-By: Claude Opus 5.5 <noreply@anthropic.com>
Claude-Session: https://claude.ai/code/session_01BrurxSYygRC3rRhaUYosm1
</commit_message>
<xml_diff>
--- a/docs/livro-policial/TODO_CRIME_TEM_UM_AUTOR.docx
+++ b/docs/livro-policial/TODO_CRIME_TEM_UM_AUTOR.docx
@@ -19575,6 +19575,1043 @@
           <w:szCs w:val="21"/>
         </w:rPr>
         <w:t xml:space="preserve">E sabia que, pela primeira vez, Lucas não ia acreditar nela.</w:t>
+      </w:r>
+    </w:p>
+    <w:p>
+      <w:pPr>
+        <w:pageBreakBefore/>
+        <w:spacing w:after="120" w:before="1800"/>
+        <w:jc w:val="center"/>
+      </w:pPr>
+      <w:r>
+        <w:rPr>
+          <w:rFonts w:ascii="Georgia" w:cs="Georgia" w:eastAsia="Georgia" w:hAnsi="Georgia"/>
+          <w:spacing w:val="40"/>
+          <w:sz w:val="20"/>
+          <w:szCs w:val="20"/>
+        </w:rPr>
+        <w:t xml:space="preserve">CAPÍTULO 19</w:t>
+      </w:r>
+    </w:p>
+    <w:p>
+      <w:pPr>
+        <w:spacing w:after="720"/>
+        <w:jc w:val="center"/>
+      </w:pPr>
+      <w:r>
+        <w:rPr>
+          <w:rFonts w:ascii="Georgia" w:cs="Georgia" w:eastAsia="Georgia" w:hAnsi="Georgia"/>
+          <w:b/>
+          <w:bCs/>
+          <w:sz w:val="32"/>
+          <w:szCs w:val="32"/>
+        </w:rPr>
+        <w:t xml:space="preserve">Sete e dois</w:t>
+      </w:r>
+    </w:p>
+    <w:p>
+      <w:pPr>
+        <w:spacing w:after="0" w:line="312"/>
+        <w:ind w:firstLine="340"/>
+        <w:jc w:val="both"/>
+      </w:pPr>
+      <w:r>
+        <w:rPr>
+          <w:rFonts w:ascii="Georgia" w:cs="Georgia" w:eastAsia="Georgia" w:hAnsi="Georgia"/>
+          <w:sz w:val="21"/>
+          <w:szCs w:val="21"/>
+        </w:rPr>
+        <w:t xml:space="preserve">— O senhor veio acusar o seu irmão — disse a delegada Regina Paiva, antes que Lucas abrisse a boca.</w:t>
+      </w:r>
+    </w:p>
+    <w:p>
+      <w:pPr>
+        <w:spacing w:after="0" w:line="312"/>
+        <w:ind w:firstLine="340"/>
+        <w:jc w:val="both"/>
+      </w:pPr>
+      <w:r>
+        <w:rPr>
+          <w:rFonts w:ascii="Georgia" w:cs="Georgia" w:eastAsia="Georgia" w:hAnsi="Georgia"/>
+          <w:sz w:val="21"/>
+          <w:szCs w:val="21"/>
+        </w:rPr>
+        <w:t xml:space="preserve">Ele parou com a mão no encosto da cadeira.</w:t>
+      </w:r>
+    </w:p>
+    <w:p>
+      <w:pPr>
+        <w:spacing w:after="0" w:line="312"/>
+        <w:ind w:firstLine="340"/>
+        <w:jc w:val="both"/>
+      </w:pPr>
+      <w:r>
+        <w:rPr>
+          <w:rFonts w:ascii="Georgia" w:cs="Georgia" w:eastAsia="Georgia" w:hAnsi="Georgia"/>
+          <w:sz w:val="21"/>
+          <w:szCs w:val="21"/>
+        </w:rPr>
+        <w:t xml:space="preserve">— Como a senhora sabe?</w:t>
+      </w:r>
+    </w:p>
+    <w:p>
+      <w:pPr>
+        <w:spacing w:after="0" w:line="312"/>
+        <w:ind w:firstLine="340"/>
+        <w:jc w:val="both"/>
+      </w:pPr>
+      <w:r>
+        <w:rPr>
+          <w:rFonts w:ascii="Georgia" w:cs="Georgia" w:eastAsia="Georgia" w:hAnsi="Georgia"/>
+          <w:sz w:val="21"/>
+          <w:szCs w:val="21"/>
+        </w:rPr>
+        <w:t xml:space="preserve">— Porque o senhor entrou nesta sala com a cara de quem passou a noite decidindo uma coisa difícil. E, nesta família, a única pessoa de quem o senhor ainda não tinha falado comigo é o Carlos. — Ela apontou a cadeira. — Senta. Quer café? É ruim, mas é quente.</w:t>
+      </w:r>
+    </w:p>
+    <w:p>
+      <w:pPr>
+        <w:spacing w:after="0" w:line="312"/>
+        <w:ind w:firstLine="340"/>
+        <w:jc w:val="both"/>
+      </w:pPr>
+      <w:r>
+        <w:rPr>
+          <w:rFonts w:ascii="Georgia" w:cs="Georgia" w:eastAsia="Georgia" w:hAnsi="Georgia"/>
+          <w:sz w:val="21"/>
+          <w:szCs w:val="21"/>
+        </w:rPr>
+        <w:t xml:space="preserve">Lucas aceitou. Era ruim mesmo. Bebeu metade de uma vez, queimando a língua, e pousou o copo de plástico na beira da mesa.</w:t>
+      </w:r>
+    </w:p>
+    <w:p>
+      <w:pPr>
+        <w:spacing w:after="0" w:line="312"/>
+        <w:ind w:firstLine="340"/>
+        <w:jc w:val="both"/>
+      </w:pPr>
+      <w:r>
+        <w:rPr>
+          <w:rFonts w:ascii="Georgia" w:cs="Georgia" w:eastAsia="Georgia" w:hAnsi="Georgia"/>
+          <w:sz w:val="21"/>
+          <w:szCs w:val="21"/>
+        </w:rPr>
+        <w:t xml:space="preserve">Contou tudo. O mestrado à noite, a lista de presença assinada por um colega, a mensagem compromisso de família, a moto parada na esquina da casa do pai das onze à meia-noite e vinte. O vigia Edson. O rapaz magro, de mochila, que podia ser Carlos. A irmã que tinha ido à faculdade e mentido para ele.</w:t>
+      </w:r>
+    </w:p>
+    <w:p>
+      <w:pPr>
+        <w:spacing w:after="0" w:line="312"/>
+        <w:ind w:firstLine="340"/>
+        <w:jc w:val="both"/>
+      </w:pPr>
+      <w:r>
+        <w:rPr>
+          <w:rFonts w:ascii="Georgia" w:cs="Georgia" w:eastAsia="Georgia" w:hAnsi="Georgia"/>
+          <w:sz w:val="21"/>
+          <w:szCs w:val="21"/>
+        </w:rPr>
+        <w:t xml:space="preserve">Regina ouviu sem interromper, girando a caneta entre os dedos. Quando ele terminou, abriu uma pasta e procurou uma folha.</w:t>
+      </w:r>
+    </w:p>
+    <w:p>
+      <w:pPr>
+        <w:spacing w:after="0" w:line="312"/>
+        <w:ind w:firstLine="340"/>
+        <w:jc w:val="both"/>
+      </w:pPr>
+      <w:r>
+        <w:rPr>
+          <w:rFonts w:ascii="Georgia" w:cs="Georgia" w:eastAsia="Georgia" w:hAnsi="Georgia"/>
+          <w:sz w:val="21"/>
+          <w:szCs w:val="21"/>
+        </w:rPr>
+        <w:t xml:space="preserve">— O seu pai estava vivo às sete e dois da manhã de terça-feira — disse. — Ligou para o doutor Álvaro e falou quarenta e sete segundos. Está no registro da operadora. — Ela virou a folha para ele. — O seu irmão foi embora da esquina à meia-noite e vinte e cinco. Às oito e quinze, segundo a dona Sílvia, estava em casa, em Perdizes, dormindo, quando ela o acordou com a notícia. Não há registro da moto dele em nenhuma câmera de trânsito entre Perdizes e o Jardim Europa naquela madrugada. Eu verifiquei semana passada.</w:t>
+      </w:r>
+    </w:p>
+    <w:p>
+      <w:pPr>
+        <w:spacing w:after="0" w:line="312"/>
+        <w:ind w:firstLine="340"/>
+        <w:jc w:val="both"/>
+      </w:pPr>
+      <w:r>
+        <w:rPr>
+          <w:rFonts w:ascii="Georgia" w:cs="Georgia" w:eastAsia="Georgia" w:hAnsi="Georgia"/>
+          <w:sz w:val="21"/>
+          <w:szCs w:val="21"/>
+        </w:rPr>
+        <w:t xml:space="preserve">Lucas ficou olhando para a folha.</w:t>
+      </w:r>
+    </w:p>
+    <w:p>
+      <w:pPr>
+        <w:spacing w:after="0" w:line="312"/>
+        <w:ind w:firstLine="340"/>
+        <w:jc w:val="both"/>
+      </w:pPr>
+      <w:r>
+        <w:rPr>
+          <w:rFonts w:ascii="Georgia" w:cs="Georgia" w:eastAsia="Georgia" w:hAnsi="Georgia"/>
+          <w:sz w:val="21"/>
+          <w:szCs w:val="21"/>
+        </w:rPr>
+        <w:t xml:space="preserve">— A senhora já sabia do Carlos.</w:t>
+      </w:r>
+    </w:p>
+    <w:p>
+      <w:pPr>
+        <w:spacing w:after="0" w:line="312"/>
+        <w:ind w:firstLine="340"/>
+        <w:jc w:val="both"/>
+      </w:pPr>
+      <w:r>
+        <w:rPr>
+          <w:rFonts w:ascii="Georgia" w:cs="Georgia" w:eastAsia="Georgia" w:hAnsi="Georgia"/>
+          <w:sz w:val="21"/>
+          <w:szCs w:val="21"/>
+        </w:rPr>
+        <w:t xml:space="preserve">— Eu sei de muita coisa, senhor Salvallus. É o meu trabalho. — Regina se recostou. — O seu irmão quis. Talvez tenha querido muito. Mas querer não mata ninguém. E ele não estava lá.</w:t>
+      </w:r>
+    </w:p>
+    <w:p>
+      <w:pPr>
+        <w:spacing w:after="200" w:before="200"/>
+        <w:jc w:val="center"/>
+      </w:pPr>
+      <w:r>
+        <w:rPr>
+          <w:rFonts w:ascii="Georgia" w:cs="Georgia" w:eastAsia="Georgia" w:hAnsi="Georgia"/>
+          <w:sz w:val="22"/>
+          <w:szCs w:val="22"/>
+        </w:rPr>
+        <w:t xml:space="preserve">*</w:t>
+      </w:r>
+    </w:p>
+    <w:p>
+      <w:pPr>
+        <w:spacing w:after="0" w:line="312"/>
+        <w:ind w:firstLine="340"/>
+        <w:jc w:val="both"/>
+      </w:pPr>
+      <w:r>
+        <w:rPr>
+          <w:rFonts w:ascii="Georgia" w:cs="Georgia" w:eastAsia="Georgia" w:hAnsi="Georgia"/>
+          <w:sz w:val="21"/>
+          <w:szCs w:val="21"/>
+        </w:rPr>
+        <w:t xml:space="preserve">— Então quem estava? — Lucas ouviu a própria voz subir e se controlou. — A Helena estava em Americana. O Otávio entrou pela garagem, mas o doutor Álvaro estava lá em cima o tempo todo. O Carlos foi embora à meia-noite. O Falcão mandou recado pedindo a cremação, mas nunca pisou naquela casa. Todo mundo queria. Ninguém pôde.</w:t>
+      </w:r>
+    </w:p>
+    <w:p>
+      <w:pPr>
+        <w:spacing w:after="0" w:line="312"/>
+        <w:ind w:firstLine="340"/>
+        <w:jc w:val="both"/>
+      </w:pPr>
+      <w:r>
+        <w:rPr>
+          <w:rFonts w:ascii="Georgia" w:cs="Georgia" w:eastAsia="Georgia" w:hAnsi="Georgia"/>
+          <w:sz w:val="21"/>
+          <w:szCs w:val="21"/>
+        </w:rPr>
+        <w:t xml:space="preserve">— Exatamente — disse a delegada.</w:t>
+      </w:r>
+    </w:p>
+    <w:p>
+      <w:pPr>
+        <w:spacing w:after="0" w:line="312"/>
+        <w:ind w:firstLine="340"/>
+        <w:jc w:val="both"/>
+      </w:pPr>
+      <w:r>
+        <w:rPr>
+          <w:rFonts w:ascii="Georgia" w:cs="Georgia" w:eastAsia="Georgia" w:hAnsi="Georgia"/>
+          <w:sz w:val="21"/>
+          <w:szCs w:val="21"/>
+        </w:rPr>
+        <w:t xml:space="preserve">Os dois ficaram em silêncio. Do corredor, vinha o barulho de uma impressora e de alguém discutindo ao telefone.</w:t>
+      </w:r>
+    </w:p>
+    <w:p>
+      <w:pPr>
+        <w:spacing w:after="0" w:line="312"/>
+        <w:ind w:firstLine="340"/>
+        <w:jc w:val="both"/>
+      </w:pPr>
+      <w:r>
+        <w:rPr>
+          <w:rFonts w:ascii="Georgia" w:cs="Georgia" w:eastAsia="Georgia" w:hAnsi="Georgia"/>
+          <w:sz w:val="21"/>
+          <w:szCs w:val="21"/>
+        </w:rPr>
+        <w:t xml:space="preserve">— Tem uma coisa que eu queria lhe perguntar — disse Regina, devagar. — Já que estamos falando da véspera.</w:t>
+      </w:r>
+    </w:p>
+    <w:p>
+      <w:pPr>
+        <w:spacing w:after="0" w:line="312"/>
+        <w:ind w:firstLine="340"/>
+        <w:jc w:val="both"/>
+      </w:pPr>
+      <w:r>
+        <w:rPr>
+          <w:rFonts w:ascii="Georgia" w:cs="Georgia" w:eastAsia="Georgia" w:hAnsi="Georgia"/>
+          <w:sz w:val="21"/>
+          <w:szCs w:val="21"/>
+        </w:rPr>
+        <w:t xml:space="preserve">Lucas esperou.</w:t>
+      </w:r>
+    </w:p>
+    <w:p>
+      <w:pPr>
+        <w:spacing w:after="0" w:line="312"/>
+        <w:ind w:firstLine="340"/>
+        <w:jc w:val="both"/>
+      </w:pPr>
+      <w:r>
+        <w:rPr>
+          <w:rFonts w:ascii="Georgia" w:cs="Georgia" w:eastAsia="Georgia" w:hAnsi="Georgia"/>
+          <w:sz w:val="21"/>
+          <w:szCs w:val="21"/>
+        </w:rPr>
+        <w:t xml:space="preserve">— A operadora nos deu também a localização do celular do seu pai naquela segunda-feira. As antenas por onde ele passou. — Ela consultou outra folha. — Das nove da noite até quase meia-noite, o aparelho ficou parado numa antena de Pinheiros. Na região da Rua Fradique Coutinho.</w:t>
+      </w:r>
+    </w:p>
+    <w:p>
+      <w:pPr>
+        <w:spacing w:after="0" w:line="312"/>
+        <w:ind w:firstLine="340"/>
+        <w:jc w:val="both"/>
+      </w:pPr>
+      <w:r>
+        <w:rPr>
+          <w:rFonts w:ascii="Georgia" w:cs="Georgia" w:eastAsia="Georgia" w:hAnsi="Georgia"/>
+          <w:sz w:val="21"/>
+          <w:szCs w:val="21"/>
+        </w:rPr>
+        <w:t xml:space="preserve">Lucas sentiu o estômago afundar.</w:t>
+      </w:r>
+    </w:p>
+    <w:p>
+      <w:pPr>
+        <w:spacing w:after="0" w:line="312"/>
+        <w:ind w:firstLine="340"/>
+        <w:jc w:val="both"/>
+      </w:pPr>
+      <w:r>
+        <w:rPr>
+          <w:rFonts w:ascii="Georgia" w:cs="Georgia" w:eastAsia="Georgia" w:hAnsi="Georgia"/>
+          <w:sz w:val="21"/>
+          <w:szCs w:val="21"/>
+        </w:rPr>
+        <w:t xml:space="preserve">A irmã morava na Fradique Coutinho.</w:t>
+      </w:r>
+    </w:p>
+    <w:p>
+      <w:pPr>
+        <w:spacing w:after="0" w:line="312"/>
+        <w:ind w:firstLine="340"/>
+        <w:jc w:val="both"/>
+      </w:pPr>
+      <w:r>
+        <w:rPr>
+          <w:rFonts w:ascii="Georgia" w:cs="Georgia" w:eastAsia="Georgia" w:hAnsi="Georgia"/>
+          <w:sz w:val="21"/>
+          <w:szCs w:val="21"/>
+        </w:rPr>
+        <w:t xml:space="preserve">— O senhor sabe o que o seu pai foi fazer em Pinheiros na véspera da morte? — perguntou a delegada, sem tirar os olhos dele.</w:t>
+      </w:r>
+    </w:p>
+    <w:p>
+      <w:pPr>
+        <w:spacing w:after="0" w:line="312"/>
+        <w:ind w:firstLine="340"/>
+        <w:jc w:val="both"/>
+      </w:pPr>
+      <w:r>
+        <w:rPr>
+          <w:rFonts w:ascii="Georgia" w:cs="Georgia" w:eastAsia="Georgia" w:hAnsi="Georgia"/>
+          <w:sz w:val="21"/>
+          <w:szCs w:val="21"/>
+        </w:rPr>
+        <w:t xml:space="preserve">— Não.</w:t>
+      </w:r>
+    </w:p>
+    <w:p>
+      <w:pPr>
+        <w:spacing w:after="0" w:line="312"/>
+        <w:ind w:firstLine="340"/>
+        <w:jc w:val="both"/>
+      </w:pPr>
+      <w:r>
+        <w:rPr>
+          <w:rFonts w:ascii="Georgia" w:cs="Georgia" w:eastAsia="Georgia" w:hAnsi="Georgia"/>
+          <w:sz w:val="21"/>
+          <w:szCs w:val="21"/>
+        </w:rPr>
+        <w:t xml:space="preserve">Era verdade. Regina assentiu, como quem guarda uma resposta numa gaveta.</w:t>
+      </w:r>
+    </w:p>
+    <w:p>
+      <w:pPr>
+        <w:spacing w:after="0" w:line="312"/>
+        <w:ind w:firstLine="340"/>
+        <w:jc w:val="both"/>
+      </w:pPr>
+      <w:r>
+        <w:rPr>
+          <w:rFonts w:ascii="Georgia" w:cs="Georgia" w:eastAsia="Georgia" w:hAnsi="Georgia"/>
+          <w:sz w:val="21"/>
+          <w:szCs w:val="21"/>
+        </w:rPr>
+        <w:t xml:space="preserve">— A sua irmã me disse que ligou para ele sete vezes na manhã de terça por causa de um pressentimento. — Ela fechou a pasta. — Talvez valha a pena perguntar a ela de onde veio esse pressentimento.</w:t>
+      </w:r>
+    </w:p>
+    <w:p>
+      <w:pPr>
+        <w:spacing w:after="200" w:before="200"/>
+        <w:jc w:val="center"/>
+      </w:pPr>
+      <w:r>
+        <w:rPr>
+          <w:rFonts w:ascii="Georgia" w:cs="Georgia" w:eastAsia="Georgia" w:hAnsi="Georgia"/>
+          <w:sz w:val="22"/>
+          <w:szCs w:val="22"/>
+        </w:rPr>
+        <w:t xml:space="preserve">*</w:t>
+      </w:r>
+    </w:p>
+    <w:p>
+      <w:pPr>
+        <w:spacing w:after="0" w:line="312"/>
+        <w:ind w:firstLine="340"/>
+        <w:jc w:val="both"/>
+      </w:pPr>
+      <w:r>
+        <w:rPr>
+          <w:rFonts w:ascii="Georgia" w:cs="Georgia" w:eastAsia="Georgia" w:hAnsi="Georgia"/>
+          <w:sz w:val="21"/>
+          <w:szCs w:val="21"/>
+        </w:rPr>
+        <w:t xml:space="preserve">Lucas passou a tarde na corretora sem conseguir ler um contrato.</w:t>
+      </w:r>
+    </w:p>
+    <w:p>
+      <w:pPr>
+        <w:spacing w:after="0" w:line="312"/>
+        <w:ind w:firstLine="340"/>
+        <w:jc w:val="both"/>
+      </w:pPr>
+      <w:r>
+        <w:rPr>
+          <w:rFonts w:ascii="Georgia" w:cs="Georgia" w:eastAsia="Georgia" w:hAnsi="Georgia"/>
+          <w:sz w:val="21"/>
+          <w:szCs w:val="21"/>
+        </w:rPr>
+        <w:t xml:space="preserve">À noite, em casa, fez o que o pai faria. Pegou uma folha de papel em branco, uma régua e uma caneta, e desenhou uma tabela. Nas linhas, os nomes. Nas colunas, três perguntas. Queria? Estava lá? Como teria feito?</w:t>
+      </w:r>
+    </w:p>
+    <w:p>
+      <w:pPr>
+        <w:spacing w:after="0" w:line="312"/>
+        <w:ind w:firstLine="340"/>
+        <w:jc w:val="both"/>
+      </w:pPr>
+      <w:r>
+        <w:rPr>
+          <w:rFonts w:ascii="Georgia" w:cs="Georgia" w:eastAsia="Georgia" w:hAnsi="Georgia"/>
+          <w:sz w:val="21"/>
+          <w:szCs w:val="21"/>
+        </w:rPr>
+        <w:t xml:space="preserve">Helena. Queria, há três anos. Não estava: dormiu num hospital de Americana, ao lado da mãe. O veneno estava na nécessaire, quase cheio.</w:t>
+      </w:r>
+    </w:p>
+    <w:p>
+      <w:pPr>
+        <w:spacing w:after="0" w:line="312"/>
+        <w:ind w:firstLine="340"/>
+        <w:jc w:val="both"/>
+      </w:pPr>
+      <w:r>
+        <w:rPr>
+          <w:rFonts w:ascii="Georgia" w:cs="Georgia" w:eastAsia="Georgia" w:hAnsi="Georgia"/>
+          <w:sz w:val="21"/>
+          <w:szCs w:val="21"/>
+        </w:rPr>
+        <w:t xml:space="preserve">Otávio. Queria, porque o pai ia denunciá-lo. Estava, das sete e vinte e oito às sete e cinquenta e um. Mas o doutor Álvaro estava no andar de cima, e Otávio nunca subiu.</w:t>
+      </w:r>
+    </w:p>
+    <w:p>
+      <w:pPr>
+        <w:spacing w:after="0" w:line="312"/>
+        <w:ind w:firstLine="340"/>
+        <w:jc w:val="both"/>
+      </w:pPr>
+      <w:r>
+        <w:rPr>
+          <w:rFonts w:ascii="Georgia" w:cs="Georgia" w:eastAsia="Georgia" w:hAnsi="Georgia"/>
+          <w:sz w:val="21"/>
+          <w:szCs w:val="21"/>
+        </w:rPr>
+        <w:t xml:space="preserve">Carlos. Queria, uma hora inteira, de capacete. Não estava: foi embora à meia-noite e vinte e cinco. O pai estava vivo às sete e dois.</w:t>
+      </w:r>
+    </w:p>
+    <w:p>
+      <w:pPr>
+        <w:spacing w:after="0" w:line="312"/>
+        <w:ind w:firstLine="340"/>
+        <w:jc w:val="both"/>
+      </w:pPr>
+      <w:r>
+        <w:rPr>
+          <w:rFonts w:ascii="Georgia" w:cs="Georgia" w:eastAsia="Georgia" w:hAnsi="Georgia"/>
+          <w:sz w:val="21"/>
+          <w:szCs w:val="21"/>
+        </w:rPr>
+        <w:t xml:space="preserve">Falcão. Queria, provavelmente. Sabia demais, com certeza. Nunca esteve na casa.</w:t>
+      </w:r>
+    </w:p>
+    <w:p>
+      <w:pPr>
+        <w:spacing w:after="0" w:line="312"/>
+        <w:ind w:firstLine="340"/>
+        <w:jc w:val="both"/>
+      </w:pPr>
+      <w:r>
+        <w:rPr>
+          <w:rFonts w:ascii="Georgia" w:cs="Georgia" w:eastAsia="Georgia" w:hAnsi="Georgia"/>
+          <w:sz w:val="21"/>
+          <w:szCs w:val="21"/>
+        </w:rPr>
+        <w:t xml:space="preserve">Bianca. A mulher do motel. Ninguém sabia dela desde fevereiro.</w:t>
+      </w:r>
+    </w:p>
+    <w:p>
+      <w:pPr>
+        <w:spacing w:after="0" w:line="312"/>
+        <w:ind w:firstLine="340"/>
+        <w:jc w:val="both"/>
+      </w:pPr>
+      <w:r>
+        <w:rPr>
+          <w:rFonts w:ascii="Georgia" w:cs="Georgia" w:eastAsia="Georgia" w:hAnsi="Georgia"/>
+          <w:sz w:val="21"/>
+          <w:szCs w:val="21"/>
+        </w:rPr>
+        <w:t xml:space="preserve">Lucas olhou para a tabela por muito tempo. Cada nome explicava um pedaço. Helena explicava a cremação. Otávio explicava o portão aberto. Carlos explicava a véspera. Falcão explicava as mortes por engano. Nenhum explicava tudo. Era como um contrato em que todas as cláusulas estavam certas e o total não fechava.</w:t>
+      </w:r>
+    </w:p>
+    <w:p>
+      <w:pPr>
+        <w:spacing w:after="0" w:line="312"/>
+        <w:ind w:firstLine="340"/>
+        <w:jc w:val="both"/>
+      </w:pPr>
+      <w:r>
+        <w:rPr>
+          <w:rFonts w:ascii="Georgia" w:cs="Georgia" w:eastAsia="Georgia" w:hAnsi="Georgia"/>
+          <w:sz w:val="21"/>
+          <w:szCs w:val="21"/>
+        </w:rPr>
+        <w:t xml:space="preserve">Na margem da folha, sem pensar muito, escreveu mais uma linha.</w:t>
+      </w:r>
+    </w:p>
+    <w:p>
+      <w:pPr>
+        <w:spacing w:after="0" w:line="312"/>
+        <w:ind w:firstLine="340"/>
+        <w:jc w:val="both"/>
+      </w:pPr>
+      <w:r>
+        <w:rPr>
+          <w:rFonts w:ascii="Georgia" w:cs="Georgia" w:eastAsia="Georgia" w:hAnsi="Georgia"/>
+          <w:sz w:val="21"/>
+          <w:szCs w:val="21"/>
+        </w:rPr>
+        <w:t xml:space="preserve">Dr. Álvaro. Estava lá das sete e cinco às oito e doze. Assinou o atestado. Proibiu a preparação do corpo. Lutou contra a cremação. Ligou para o celular do pai às sete e quarenta, de dentro da casa.</w:t>
+      </w:r>
+    </w:p>
+    <w:p>
+      <w:pPr>
+        <w:spacing w:after="0" w:line="312"/>
+        <w:ind w:firstLine="340"/>
+        <w:jc w:val="both"/>
+      </w:pPr>
+      <w:r>
+        <w:rPr>
+          <w:rFonts w:ascii="Georgia" w:cs="Georgia" w:eastAsia="Georgia" w:hAnsi="Georgia"/>
+          <w:sz w:val="21"/>
+          <w:szCs w:val="21"/>
+        </w:rPr>
+        <w:t xml:space="preserve">Ficou olhando para aquilo. Depois riscou a linha inteira, com força, até o papel rasgar.</w:t>
+      </w:r>
+    </w:p>
+    <w:p>
+      <w:pPr>
+        <w:spacing w:after="0" w:line="312"/>
+        <w:ind w:firstLine="340"/>
+        <w:jc w:val="both"/>
+      </w:pPr>
+      <w:r>
+        <w:rPr>
+          <w:rFonts w:ascii="Georgia" w:cs="Georgia" w:eastAsia="Georgia" w:hAnsi="Georgia"/>
+          <w:sz w:val="21"/>
+          <w:szCs w:val="21"/>
+        </w:rPr>
+        <w:t xml:space="preserve">O doutor Álvaro era o homem que tinha tratado a catapora dele. Que tinha chorado no crematório mais do que qualquer um. Que estava ao lado do pai numa foto de praia de 1971. Se havia uma pessoa no mundo que não tinha nenhum motivo para querer o pai morto, era ele.</w:t>
+      </w:r>
+    </w:p>
+    <w:p>
+      <w:pPr>
+        <w:spacing w:after="0" w:line="312"/>
+        <w:ind w:firstLine="340"/>
+        <w:jc w:val="both"/>
+      </w:pPr>
+      <w:r>
+        <w:rPr>
+          <w:rFonts w:ascii="Georgia" w:cs="Georgia" w:eastAsia="Georgia" w:hAnsi="Georgia"/>
+          <w:sz w:val="21"/>
+          <w:szCs w:val="21"/>
+        </w:rPr>
+        <w:t xml:space="preserve">Lucas dobrou a folha e guardou na gaveta.</w:t>
+      </w:r>
+    </w:p>
+    <w:p>
+      <w:pPr>
+        <w:pBdr>
+          <w:top w:val="single" w:color="555555" w:sz="6" w:space="6"/>
+          <w:bottom w:val="single" w:color="555555" w:sz="6" w:space="6"/>
+          <w:left w:val="single" w:color="555555" w:sz="6" w:space="6"/>
+          <w:right w:val="single" w:color="555555" w:sz="6" w:space="6"/>
+        </w:pBdr>
+        <w:shd w:fill="EFEFEF" w:color="auto" w:val="clear"/>
+        <w:spacing w:after="0" w:before="240"/>
+        <w:ind w:left="227" w:right="227"/>
+        <w:jc w:val="center"/>
+      </w:pPr>
+      <w:r>
+        <w:rPr>
+          <w:rFonts w:ascii="Georgia" w:cs="Georgia" w:eastAsia="Georgia" w:hAnsi="Georgia"/>
+          <w:b/>
+          <w:bCs/>
+          <w:spacing w:val="30"/>
+          <w:sz w:val="17"/>
+          <w:szCs w:val="17"/>
+        </w:rPr>
+        <w:t xml:space="preserve">NO CELULAR DE HENRIQUE</w:t>
+      </w:r>
+    </w:p>
+    <w:p>
+      <w:pPr>
+        <w:pBdr>
+          <w:top w:val="single" w:color="555555" w:sz="6" w:space="6"/>
+          <w:bottom w:val="single" w:color="555555" w:sz="6" w:space="6"/>
+          <w:left w:val="single" w:color="555555" w:sz="6" w:space="6"/>
+          <w:right w:val="single" w:color="555555" w:sz="6" w:space="6"/>
+        </w:pBdr>
+        <w:shd w:fill="EFEFEF" w:color="auto" w:val="clear"/>
+        <w:spacing w:after="240" w:before="0" w:line="288"/>
+        <w:ind w:left="227" w:right="227"/>
+        <w:jc w:val="center"/>
+      </w:pPr>
+      <w:r>
+        <w:rPr>
+          <w:rFonts w:ascii="Georgia" w:cs="Georgia" w:eastAsia="Georgia" w:hAnsi="Georgia"/>
+          <w:i/>
+          <w:iCs/>
+          <w:sz w:val="19"/>
+          <w:szCs w:val="19"/>
+        </w:rPr>
+        <w:t xml:space="preserve">Abra a agenda do celular de Henrique na segunda-feira, véspera da morte. Há um compromisso às 21h sem nome nenhum. Onde você acha que ele estava?</w:t>
+      </w:r>
+    </w:p>
+    <w:p>
+      <w:pPr>
+        <w:spacing w:after="200" w:before="200"/>
+        <w:jc w:val="center"/>
+      </w:pPr>
+      <w:r>
+        <w:rPr>
+          <w:rFonts w:ascii="Georgia" w:cs="Georgia" w:eastAsia="Georgia" w:hAnsi="Georgia"/>
+          <w:sz w:val="22"/>
+          <w:szCs w:val="22"/>
+        </w:rPr>
+        <w:t xml:space="preserve">*</w:t>
+      </w:r>
+    </w:p>
+    <w:p>
+      <w:pPr>
+        <w:spacing w:after="0" w:line="312"/>
+        <w:ind w:firstLine="340"/>
+        <w:jc w:val="both"/>
+      </w:pPr>
+      <w:r>
+        <w:rPr>
+          <w:rFonts w:ascii="Georgia" w:cs="Georgia" w:eastAsia="Georgia" w:hAnsi="Georgia"/>
+          <w:sz w:val="21"/>
+          <w:szCs w:val="21"/>
+        </w:rPr>
+        <w:t xml:space="preserve">Às dez da noite, ele estava na frente do prédio de Lia, na Fradique Coutinho.</w:t>
+      </w:r>
+    </w:p>
+    <w:p>
+      <w:pPr>
+        <w:spacing w:after="0" w:line="312"/>
+        <w:ind w:firstLine="340"/>
+        <w:jc w:val="both"/>
+      </w:pPr>
+      <w:r>
+        <w:rPr>
+          <w:rFonts w:ascii="Georgia" w:cs="Georgia" w:eastAsia="Georgia" w:hAnsi="Georgia"/>
+          <w:sz w:val="21"/>
+          <w:szCs w:val="21"/>
+        </w:rPr>
+        <w:t xml:space="preserve">Não tinha avisado. Disse a si mesmo que tinha ido pedir desculpas pela ligação da véspera, pelo caso está fechado, pela voz dura no telefone. Em parte, era verdade.</w:t>
+      </w:r>
+    </w:p>
+    <w:p>
+      <w:pPr>
+        <w:spacing w:after="0" w:line="312"/>
+        <w:ind w:firstLine="340"/>
+        <w:jc w:val="both"/>
+      </w:pPr>
+      <w:r>
+        <w:rPr>
+          <w:rFonts w:ascii="Georgia" w:cs="Georgia" w:eastAsia="Georgia" w:hAnsi="Georgia"/>
+          <w:sz w:val="21"/>
+          <w:szCs w:val="21"/>
+        </w:rPr>
+        <w:t xml:space="preserve">O porteiro da noite o conhecia de vista e abriu o portão sem interfonar. Enquanto Lucas esperava o elevador, o homem comentou, puxando conversa:</w:t>
+      </w:r>
+    </w:p>
+    <w:p>
+      <w:pPr>
+        <w:spacing w:after="0" w:line="312"/>
+        <w:ind w:firstLine="340"/>
+        <w:jc w:val="both"/>
+      </w:pPr>
+      <w:r>
+        <w:rPr>
+          <w:rFonts w:ascii="Georgia" w:cs="Georgia" w:eastAsia="Georgia" w:hAnsi="Georgia"/>
+          <w:sz w:val="21"/>
+          <w:szCs w:val="21"/>
+        </w:rPr>
+        <w:t xml:space="preserve">— Meus sentimentos pelo seu pai, viu. Eu nem sabia que ele estava doente. Ele veio aqui naquela segunda, na véspera, todo simpático. Ficou até quase meia-noite. Trouxe até um vinho.</w:t>
+      </w:r>
+    </w:p>
+    <w:p>
+      <w:pPr>
+        <w:spacing w:after="0" w:line="312"/>
+        <w:ind w:firstLine="340"/>
+        <w:jc w:val="both"/>
+      </w:pPr>
+      <w:r>
+        <w:rPr>
+          <w:rFonts w:ascii="Georgia" w:cs="Georgia" w:eastAsia="Georgia" w:hAnsi="Georgia"/>
+          <w:sz w:val="21"/>
+          <w:szCs w:val="21"/>
+        </w:rPr>
+        <w:t xml:space="preserve">O elevador chegou. Lucas entrou sem dizer nada. As portas se fecharam diante do rosto curioso do porteiro.</w:t>
+      </w:r>
+    </w:p>
+    <w:p>
+      <w:pPr>
+        <w:spacing w:after="0" w:line="312"/>
+        <w:ind w:firstLine="340"/>
+        <w:jc w:val="both"/>
+      </w:pPr>
+      <w:r>
+        <w:rPr>
+          <w:rFonts w:ascii="Georgia" w:cs="Georgia" w:eastAsia="Georgia" w:hAnsi="Georgia"/>
+          <w:sz w:val="21"/>
+          <w:szCs w:val="21"/>
+        </w:rPr>
+        <w:t xml:space="preserve">Até quase meia-noite. Na véspera. Com um vinho.</w:t>
+      </w:r>
+    </w:p>
+    <w:p>
+      <w:pPr>
+        <w:spacing w:after="0" w:line="312"/>
+        <w:ind w:firstLine="340"/>
+        <w:jc w:val="both"/>
+      </w:pPr>
+      <w:r>
+        <w:rPr>
+          <w:rFonts w:ascii="Georgia" w:cs="Georgia" w:eastAsia="Georgia" w:hAnsi="Georgia"/>
+          <w:sz w:val="21"/>
+          <w:szCs w:val="21"/>
+        </w:rPr>
+        <w:t xml:space="preserve">No quarto andar, a porta de Lia estava entreaberta, como sempre ficava quando ela esperava alguém subir. Ele bateu de leve e entrou.</w:t>
+      </w:r>
+    </w:p>
+    <w:p>
+      <w:pPr>
+        <w:spacing w:after="0" w:line="312"/>
+        <w:ind w:firstLine="340"/>
+        <w:jc w:val="both"/>
+      </w:pPr>
+      <w:r>
+        <w:rPr>
+          <w:rFonts w:ascii="Georgia" w:cs="Georgia" w:eastAsia="Georgia" w:hAnsi="Georgia"/>
+          <w:sz w:val="21"/>
+          <w:szCs w:val="21"/>
+        </w:rPr>
+        <w:t xml:space="preserve">A irmã estava sentada no sofá, de pijama, com o notebook no colo e um pote de pipoca pela metade ao lado. Quando o viu, fechou a tela do computador rápido demais. Lucas teve tempo de ver o que estava aberto: uma caixa de e-mail e um arquivo de áudio tocando, com uma barra azul que avançava.</w:t>
+      </w:r>
+    </w:p>
+    <w:p>
+      <w:pPr>
+        <w:spacing w:after="0" w:line="312"/>
+        <w:ind w:firstLine="340"/>
+        <w:jc w:val="both"/>
+      </w:pPr>
+      <w:r>
+        <w:rPr>
+          <w:rFonts w:ascii="Georgia" w:cs="Georgia" w:eastAsia="Georgia" w:hAnsi="Georgia"/>
+          <w:sz w:val="21"/>
+          <w:szCs w:val="21"/>
+        </w:rPr>
+        <w:t xml:space="preserve">— Você não avisou que vinha — disse ela.</w:t>
+      </w:r>
+    </w:p>
+    <w:p>
+      <w:pPr>
+        <w:spacing w:after="0" w:line="312"/>
+        <w:ind w:firstLine="340"/>
+        <w:jc w:val="both"/>
+      </w:pPr>
+      <w:r>
+        <w:rPr>
+          <w:rFonts w:ascii="Georgia" w:cs="Georgia" w:eastAsia="Georgia" w:hAnsi="Georgia"/>
+          <w:sz w:val="21"/>
+          <w:szCs w:val="21"/>
+        </w:rPr>
+        <w:t xml:space="preserve">— Vim pedir desculpas. Por ontem.</w:t>
+      </w:r>
+    </w:p>
+    <w:p>
+      <w:pPr>
+        <w:spacing w:after="0" w:line="312"/>
+        <w:ind w:firstLine="340"/>
+        <w:jc w:val="both"/>
+      </w:pPr>
+      <w:r>
+        <w:rPr>
+          <w:rFonts w:ascii="Georgia" w:cs="Georgia" w:eastAsia="Georgia" w:hAnsi="Georgia"/>
+          <w:sz w:val="21"/>
+          <w:szCs w:val="21"/>
+        </w:rPr>
+        <w:t xml:space="preserve">— Ah. — Lia pôs o notebook de lado, devagar. — Tudo bem. Eu também fui dura.</w:t>
+      </w:r>
+    </w:p>
+    <w:p>
+      <w:pPr>
+        <w:spacing w:after="0" w:line="312"/>
+        <w:ind w:firstLine="340"/>
+        <w:jc w:val="both"/>
+      </w:pPr>
+      <w:r>
+        <w:rPr>
+          <w:rFonts w:ascii="Georgia" w:cs="Georgia" w:eastAsia="Georgia" w:hAnsi="Georgia"/>
+          <w:sz w:val="21"/>
+          <w:szCs w:val="21"/>
+        </w:rPr>
+        <w:t xml:space="preserve">Ele se sentou na poltrona em frente. No mesmo sofá onde a irmã estava agora, pensou, o pai tinha se sentado na segunda-feira da véspera, até quase meia-noite, com uma garrafa de vinho.</w:t>
+      </w:r>
+    </w:p>
+    <w:p>
+      <w:pPr>
+        <w:spacing w:after="0" w:line="312"/>
+        <w:ind w:firstLine="340"/>
+        <w:jc w:val="both"/>
+      </w:pPr>
+      <w:r>
+        <w:rPr>
+          <w:rFonts w:ascii="Georgia" w:cs="Georgia" w:eastAsia="Georgia" w:hAnsi="Georgia"/>
+          <w:sz w:val="21"/>
+          <w:szCs w:val="21"/>
+        </w:rPr>
+        <w:t xml:space="preserve">— Lia. Quando foi a última vez que você viu o pai?</w:t>
+      </w:r>
+    </w:p>
+    <w:p>
+      <w:pPr>
+        <w:spacing w:after="0" w:line="312"/>
+        <w:ind w:firstLine="340"/>
+        <w:jc w:val="both"/>
+      </w:pPr>
+      <w:r>
+        <w:rPr>
+          <w:rFonts w:ascii="Georgia" w:cs="Georgia" w:eastAsia="Georgia" w:hAnsi="Georgia"/>
+          <w:sz w:val="21"/>
+          <w:szCs w:val="21"/>
+        </w:rPr>
+        <w:t xml:space="preserve">Ela não demorou nem um segundo para responder. Foi isso que mais doeu nele, depois.</w:t>
+      </w:r>
+    </w:p>
+    <w:p>
+      <w:pPr>
+        <w:spacing w:after="0" w:line="312"/>
+        <w:ind w:firstLine="340"/>
+        <w:jc w:val="both"/>
+      </w:pPr>
+      <w:r>
+        <w:rPr>
+          <w:rFonts w:ascii="Georgia" w:cs="Georgia" w:eastAsia="Georgia" w:hAnsi="Georgia"/>
+          <w:sz w:val="21"/>
+          <w:szCs w:val="21"/>
+        </w:rPr>
+        <w:t xml:space="preserve">— Faz mais de um mês. Num almoço, lembra? Aquele em que você não foi.</w:t>
+      </w:r>
+    </w:p>
+    <w:p>
+      <w:pPr>
+        <w:spacing w:after="0" w:line="312"/>
+        <w:ind w:firstLine="340"/>
+        <w:jc w:val="both"/>
+      </w:pPr>
+      <w:r>
+        <w:rPr>
+          <w:rFonts w:ascii="Georgia" w:cs="Georgia" w:eastAsia="Georgia" w:hAnsi="Georgia"/>
+          <w:sz w:val="21"/>
+          <w:szCs w:val="21"/>
+        </w:rPr>
+        <w:t xml:space="preserve">Lucas olhou para ela. Lia sustentou o olhar, com o rosto tranquilo, e pegou um punhado de pipoca do pote. Mastigou devagar, sem pressa nenhuma.</w:t>
+      </w:r>
+    </w:p>
+    <w:p>
+      <w:pPr>
+        <w:spacing w:after="0" w:line="312"/>
+        <w:ind w:firstLine="340"/>
+        <w:jc w:val="both"/>
+      </w:pPr>
+      <w:r>
+        <w:rPr>
+          <w:rFonts w:ascii="Georgia" w:cs="Georgia" w:eastAsia="Georgia" w:hAnsi="Georgia"/>
+          <w:sz w:val="21"/>
+          <w:szCs w:val="21"/>
+        </w:rPr>
+        <w:t xml:space="preserve">— Lembro — disse ele.</w:t>
+      </w:r>
+    </w:p>
+    <w:p>
+      <w:pPr>
+        <w:spacing w:after="200" w:before="200"/>
+        <w:jc w:val="center"/>
+      </w:pPr>
+      <w:r>
+        <w:rPr>
+          <w:rFonts w:ascii="Georgia" w:cs="Georgia" w:eastAsia="Georgia" w:hAnsi="Georgia"/>
+          <w:sz w:val="22"/>
+          <w:szCs w:val="22"/>
+        </w:rPr>
+        <w:t xml:space="preserve">*</w:t>
+      </w:r>
+    </w:p>
+    <w:p>
+      <w:pPr>
+        <w:spacing w:after="0" w:line="312"/>
+        <w:ind w:firstLine="340"/>
+        <w:jc w:val="both"/>
+      </w:pPr>
+      <w:r>
+        <w:rPr>
+          <w:rFonts w:ascii="Georgia" w:cs="Georgia" w:eastAsia="Georgia" w:hAnsi="Georgia"/>
+          <w:sz w:val="21"/>
+          <w:szCs w:val="21"/>
+        </w:rPr>
+        <w:t xml:space="preserve">Ficou mais vinte minutos. Falaram de Carlos, da delegada, do Falcão. Lucas não contou das antenas. Não contou do porteiro. Não contou da tabela riscada na gaveta. Lia não contou do áudio que tocava no notebook quando ele entrou.</w:t>
+      </w:r>
+    </w:p>
+    <w:p>
+      <w:pPr>
+        <w:spacing w:after="0" w:line="312"/>
+        <w:ind w:firstLine="340"/>
+        <w:jc w:val="both"/>
+      </w:pPr>
+      <w:r>
+        <w:rPr>
+          <w:rFonts w:ascii="Georgia" w:cs="Georgia" w:eastAsia="Georgia" w:hAnsi="Georgia"/>
+          <w:sz w:val="21"/>
+          <w:szCs w:val="21"/>
+        </w:rPr>
+        <w:t xml:space="preserve">Na porta, os dois se abraçaram, rápido, como dois conhecidos.</w:t>
+      </w:r>
+    </w:p>
+    <w:p>
+      <w:pPr>
+        <w:spacing w:after="0" w:line="312"/>
+        <w:ind w:firstLine="340"/>
+        <w:jc w:val="both"/>
+      </w:pPr>
+      <w:r>
+        <w:rPr>
+          <w:rFonts w:ascii="Georgia" w:cs="Georgia" w:eastAsia="Georgia" w:hAnsi="Georgia"/>
+          <w:sz w:val="21"/>
+          <w:szCs w:val="21"/>
+        </w:rPr>
+        <w:t xml:space="preserve">No elevador, Lucas encostou a cabeça no espelho e fechou os olhos.</w:t>
+      </w:r>
+    </w:p>
+    <w:p>
+      <w:pPr>
+        <w:spacing w:after="0" w:line="312"/>
+        <w:ind w:firstLine="340"/>
+        <w:jc w:val="both"/>
+      </w:pPr>
+      <w:r>
+        <w:rPr>
+          <w:rFonts w:ascii="Georgia" w:cs="Georgia" w:eastAsia="Georgia" w:hAnsi="Georgia"/>
+          <w:sz w:val="21"/>
+          <w:szCs w:val="21"/>
+        </w:rPr>
+        <w:t xml:space="preserve">A irmã tinha recebido o pai na véspera da morte, até meia-noite, e não tinha contado a ninguém. Tinha ligado sete vezes para ele na manhã seguinte, antes de qualquer pessoa saber que ele estava morto. Tinha apagado coisas, escondido coisas, protegido Carlos. E, agora, tinha mentido olhando nos olhos dele, comendo pipoca.</w:t>
+      </w:r>
+    </w:p>
+    <w:p>
+      <w:pPr>
+        <w:spacing w:after="0" w:line="312"/>
+        <w:ind w:firstLine="340"/>
+        <w:jc w:val="both"/>
+      </w:pPr>
+      <w:r>
+        <w:rPr>
+          <w:rFonts w:ascii="Georgia" w:cs="Georgia" w:eastAsia="Georgia" w:hAnsi="Georgia"/>
+          <w:sz w:val="21"/>
+          <w:szCs w:val="21"/>
+        </w:rPr>
+        <w:t xml:space="preserve">Ele não sabia o que aquilo significava. Não queria saber.</w:t>
+      </w:r>
+    </w:p>
+    <w:p>
+      <w:pPr>
+        <w:spacing w:after="0" w:line="312"/>
+        <w:ind w:firstLine="340"/>
+        <w:jc w:val="both"/>
+      </w:pPr>
+      <w:r>
+        <w:rPr>
+          <w:rFonts w:ascii="Georgia" w:cs="Georgia" w:eastAsia="Georgia" w:hAnsi="Georgia"/>
+          <w:sz w:val="21"/>
+          <w:szCs w:val="21"/>
+        </w:rPr>
+        <w:t xml:space="preserve">Mas, a partir daquela noite, quando abrisse o BlackBerry do pai, Lucas não ia mais procurar só o nome de um assassino.</w:t>
+      </w:r>
+    </w:p>
+    <w:p>
+      <w:pPr>
+        <w:spacing w:after="0" w:line="312"/>
+        <w:ind w:firstLine="340"/>
+        <w:jc w:val="both"/>
+      </w:pPr>
+      <w:r>
+        <w:rPr>
+          <w:rFonts w:ascii="Georgia" w:cs="Georgia" w:eastAsia="Georgia" w:hAnsi="Georgia"/>
+          <w:sz w:val="21"/>
+          <w:szCs w:val="21"/>
+        </w:rPr>
+        <w:t xml:space="preserve">Ia procurar o nome da irmã.</w:t>
       </w:r>
     </w:p>
     <w:sectPr>

</xml_diff>

<commit_message>
Livro policial: capítulo 20 (O herdeiro)
Co-Authored-By: Claude Opus 5.5 <noreply@anthropic.com>
Claude-Session: https://claude.ai/code/session_01BrurxSYygRC3rRhaUYosm1
</commit_message>
<xml_diff>
--- a/docs/livro-policial/TODO_CRIME_TEM_UM_AUTOR.docx
+++ b/docs/livro-policial/TODO_CRIME_TEM_UM_AUTOR.docx
@@ -20612,6 +20612,1057 @@
           <w:szCs w:val="21"/>
         </w:rPr>
         <w:t xml:space="preserve">Ia procurar o nome da irmã.</w:t>
+      </w:r>
+    </w:p>
+    <w:p>
+      <w:pPr>
+        <w:pageBreakBefore/>
+        <w:spacing w:after="120" w:before="1800"/>
+        <w:jc w:val="center"/>
+      </w:pPr>
+      <w:r>
+        <w:rPr>
+          <w:rFonts w:ascii="Georgia" w:cs="Georgia" w:eastAsia="Georgia" w:hAnsi="Georgia"/>
+          <w:spacing w:val="40"/>
+          <w:sz w:val="20"/>
+          <w:szCs w:val="20"/>
+        </w:rPr>
+        <w:t xml:space="preserve">CAPÍTULO 20</w:t>
+      </w:r>
+    </w:p>
+    <w:p>
+      <w:pPr>
+        <w:spacing w:after="720"/>
+        <w:jc w:val="center"/>
+      </w:pPr>
+      <w:r>
+        <w:rPr>
+          <w:rFonts w:ascii="Georgia" w:cs="Georgia" w:eastAsia="Georgia" w:hAnsi="Georgia"/>
+          <w:b/>
+          <w:bCs/>
+          <w:sz w:val="32"/>
+          <w:szCs w:val="32"/>
+        </w:rPr>
+        <w:t xml:space="preserve">O herdeiro</w:t>
+      </w:r>
+    </w:p>
+    <w:p>
+      <w:pPr>
+        <w:spacing w:after="0" w:line="312"/>
+        <w:ind w:firstLine="340"/>
+        <w:jc w:val="both"/>
+      </w:pPr>
+      <w:r>
+        <w:rPr>
+          <w:rFonts w:ascii="Georgia" w:cs="Georgia" w:eastAsia="Georgia" w:hAnsi="Georgia"/>
+          <w:sz w:val="21"/>
+          <w:szCs w:val="21"/>
+        </w:rPr>
+        <w:t xml:space="preserve">O escritório do advogado da família ficava num prédio antigo da Avenida Paulista, com elevador de grade e porteiro de quepe. Doutor Mauro Bittencourt cuidava dos papéis de Henrique Salvallus havia vinte e cinco anos e tinha a calma de quem já leu muitos testamentos para muitas famílias que não se falavam.</w:t>
+      </w:r>
+    </w:p>
+    <w:p>
+      <w:pPr>
+        <w:spacing w:after="0" w:line="312"/>
+        <w:ind w:firstLine="340"/>
+        <w:jc w:val="both"/>
+      </w:pPr>
+      <w:r>
+        <w:rPr>
+          <w:rFonts w:ascii="Georgia" w:cs="Georgia" w:eastAsia="Georgia" w:hAnsi="Georgia"/>
+          <w:sz w:val="21"/>
+          <w:szCs w:val="21"/>
+        </w:rPr>
+        <w:t xml:space="preserve">A sala de reuniões tinha uma mesa comprida demais para as pessoas que estavam ali. Helena de um lado, sozinha, de preto. Marta na cabeceira oposta, de costas retas, como no crematório. Sílvia ao lado de Carlos, apertando a mão dele por baixo da mesa. Otávio perto da janela, de pé, porque disse que preferia ficar de pé. Lucas no meio, com uma pasta fechada à frente. E Lia ao lado dele, porque era o lugar que sobrava.</w:t>
+      </w:r>
+    </w:p>
+    <w:p>
+      <w:pPr>
+        <w:spacing w:after="0" w:line="312"/>
+        <w:ind w:firstLine="340"/>
+        <w:jc w:val="both"/>
+      </w:pPr>
+      <w:r>
+        <w:rPr>
+          <w:rFonts w:ascii="Georgia" w:cs="Georgia" w:eastAsia="Georgia" w:hAnsi="Georgia"/>
+          <w:sz w:val="21"/>
+          <w:szCs w:val="21"/>
+        </w:rPr>
+        <w:t xml:space="preserve">Uma secretária trouxe água, café e uma bandeja de biscoitos amanteigados. Otávio pegou dois e comeu os dois em silêncio, olhando pela janela. Helena serviu água e bebeu devagar, em goles pequenos. Ninguém mais tocou na bandeja.</w:t>
+      </w:r>
+    </w:p>
+    <w:p>
+      <w:pPr>
+        <w:spacing w:after="0" w:line="312"/>
+        <w:ind w:firstLine="340"/>
+        <w:jc w:val="both"/>
+      </w:pPr>
+      <w:r>
+        <w:rPr>
+          <w:rFonts w:ascii="Georgia" w:cs="Georgia" w:eastAsia="Georgia" w:hAnsi="Georgia"/>
+          <w:sz w:val="21"/>
+          <w:szCs w:val="21"/>
+        </w:rPr>
+        <w:t xml:space="preserve">— Vou ser breve — disse o doutor Mauro, ajeitando os óculos. — O doutor Henrique alterou o testamento há três meses. Em julho.</w:t>
+      </w:r>
+    </w:p>
+    <w:p>
+      <w:pPr>
+        <w:spacing w:after="0" w:line="312"/>
+        <w:ind w:firstLine="340"/>
+        <w:jc w:val="both"/>
+      </w:pPr>
+      <w:r>
+        <w:rPr>
+          <w:rFonts w:ascii="Georgia" w:cs="Georgia" w:eastAsia="Georgia" w:hAnsi="Georgia"/>
+          <w:sz w:val="21"/>
+          <w:szCs w:val="21"/>
+        </w:rPr>
+        <w:t xml:space="preserve">Lia sentiu Lucas ficar imóvel ao lado dela.</w:t>
+      </w:r>
+    </w:p>
+    <w:p>
+      <w:pPr>
+        <w:spacing w:after="0" w:line="312"/>
+        <w:ind w:firstLine="340"/>
+        <w:jc w:val="both"/>
+      </w:pPr>
+      <w:r>
+        <w:rPr>
+          <w:rFonts w:ascii="Georgia" w:cs="Georgia" w:eastAsia="Georgia" w:hAnsi="Georgia"/>
+          <w:sz w:val="21"/>
+          <w:szCs w:val="21"/>
+        </w:rPr>
+        <w:t xml:space="preserve">Julho. O mesmo mês em que o pai tinha aumentado o seguro de vida, segundo o homem da seguradora. O mês do hotel.</w:t>
+      </w:r>
+    </w:p>
+    <w:p>
+      <w:pPr>
+        <w:spacing w:after="200" w:before="200"/>
+        <w:jc w:val="center"/>
+      </w:pPr>
+      <w:r>
+        <w:rPr>
+          <w:rFonts w:ascii="Georgia" w:cs="Georgia" w:eastAsia="Georgia" w:hAnsi="Georgia"/>
+          <w:sz w:val="22"/>
+          <w:szCs w:val="22"/>
+        </w:rPr>
+        <w:t xml:space="preserve">*</w:t>
+      </w:r>
+    </w:p>
+    <w:p>
+      <w:pPr>
+        <w:spacing w:after="0" w:line="312"/>
+        <w:ind w:firstLine="340"/>
+        <w:jc w:val="both"/>
+      </w:pPr>
+      <w:r>
+        <w:rPr>
+          <w:rFonts w:ascii="Georgia" w:cs="Georgia" w:eastAsia="Georgia" w:hAnsi="Georgia"/>
+          <w:sz w:val="21"/>
+          <w:szCs w:val="21"/>
+        </w:rPr>
+        <w:t xml:space="preserve">O advogado leu com voz neutra, cláusula por cláusula.</w:t>
+      </w:r>
+    </w:p>
+    <w:p>
+      <w:pPr>
+        <w:spacing w:after="0" w:line="312"/>
+        <w:ind w:firstLine="340"/>
+        <w:jc w:val="both"/>
+      </w:pPr>
+      <w:r>
+        <w:rPr>
+          <w:rFonts w:ascii="Georgia" w:cs="Georgia" w:eastAsia="Georgia" w:hAnsi="Georgia"/>
+          <w:sz w:val="21"/>
+          <w:szCs w:val="21"/>
+        </w:rPr>
+        <w:t xml:space="preserve">A casa do Jardim Europa ficava para os três filhos, em partes iguais, com o direito de Helena morar nela por dois anos. Um apartamento em Moema, que ninguém da família sabia que existia, ficava para Helena. Dois imóveis comerciais e uma aplicação financeira ficavam para Carlos e Lia. Uma quantia generosa ficava para Dona Cida. Outra, menor, para a família de Nestor Gomes.</w:t>
+      </w:r>
+    </w:p>
+    <w:p>
+      <w:pPr>
+        <w:spacing w:after="0" w:line="312"/>
+        <w:ind w:firstLine="340"/>
+        <w:jc w:val="both"/>
+      </w:pPr>
+      <w:r>
+        <w:rPr>
+          <w:rFonts w:ascii="Georgia" w:cs="Georgia" w:eastAsia="Georgia" w:hAnsi="Georgia"/>
+          <w:sz w:val="21"/>
+          <w:szCs w:val="21"/>
+        </w:rPr>
+        <w:t xml:space="preserve">Sílvia levou a mão à boca quando ouviu o nome do motorista. Ninguém disse nada.</w:t>
+      </w:r>
+    </w:p>
+    <w:p>
+      <w:pPr>
+        <w:spacing w:after="0" w:line="312"/>
+        <w:ind w:firstLine="340"/>
+        <w:jc w:val="both"/>
+      </w:pPr>
+      <w:r>
+        <w:rPr>
+          <w:rFonts w:ascii="Georgia" w:cs="Georgia" w:eastAsia="Georgia" w:hAnsi="Georgia"/>
+          <w:sz w:val="21"/>
+          <w:szCs w:val="21"/>
+        </w:rPr>
+        <w:t xml:space="preserve">— E, por fim — continuou o doutor Mauro —, as quotas da Salvallus Corretora de Seguros. Cinquenta e um por cento ficam com o senhor Lucas Salvallus, que passa a ter o controle da sociedade. Os outros quarenta e nove permanecem com o sócio, senhor Otávio Prado.</w:t>
+      </w:r>
+    </w:p>
+    <w:p>
+      <w:pPr>
+        <w:spacing w:after="0" w:line="312"/>
+        <w:ind w:firstLine="340"/>
+        <w:jc w:val="both"/>
+      </w:pPr>
+      <w:r>
+        <w:rPr>
+          <w:rFonts w:ascii="Georgia" w:cs="Georgia" w:eastAsia="Georgia" w:hAnsi="Georgia"/>
+          <w:sz w:val="21"/>
+          <w:szCs w:val="21"/>
+        </w:rPr>
+        <w:t xml:space="preserve">Na janela, Otávio parou de mastigar.</w:t>
+      </w:r>
+    </w:p>
+    <w:p>
+      <w:pPr>
+        <w:spacing w:after="0" w:line="312"/>
+        <w:ind w:firstLine="340"/>
+        <w:jc w:val="both"/>
+      </w:pPr>
+      <w:r>
+        <w:rPr>
+          <w:rFonts w:ascii="Georgia" w:cs="Georgia" w:eastAsia="Georgia" w:hAnsi="Georgia"/>
+          <w:sz w:val="21"/>
+          <w:szCs w:val="21"/>
+        </w:rPr>
+        <w:t xml:space="preserve">Lia olhou para o irmão. Lucas olhava para a pasta fechada à frente dele, sem levantar os olhos.</w:t>
+      </w:r>
+    </w:p>
+    <w:p>
+      <w:pPr>
+        <w:spacing w:after="0" w:line="312"/>
+        <w:ind w:firstLine="340"/>
+        <w:jc w:val="both"/>
+      </w:pPr>
+      <w:r>
+        <w:rPr>
+          <w:rFonts w:ascii="Georgia" w:cs="Georgia" w:eastAsia="Georgia" w:hAnsi="Georgia"/>
+          <w:sz w:val="21"/>
+          <w:szCs w:val="21"/>
+        </w:rPr>
+        <w:t xml:space="preserve">— Há uma observação manuscrita do doutor Henrique, anexada a esta cláusula — disse o advogado, virando a página. — Ele pediu que eu lesse em voz alta. Diz assim: Ao Lucas, que não queria, porque é o único que eu queria.</w:t>
+      </w:r>
+    </w:p>
+    <w:p>
+      <w:pPr>
+        <w:spacing w:after="0" w:line="312"/>
+        <w:ind w:firstLine="340"/>
+        <w:jc w:val="both"/>
+      </w:pPr>
+      <w:r>
+        <w:rPr>
+          <w:rFonts w:ascii="Georgia" w:cs="Georgia" w:eastAsia="Georgia" w:hAnsi="Georgia"/>
+          <w:sz w:val="21"/>
+          <w:szCs w:val="21"/>
+        </w:rPr>
+        <w:t xml:space="preserve">O silêncio na sala ficou pesado como um móvel.</w:t>
+      </w:r>
+    </w:p>
+    <w:p>
+      <w:pPr>
+        <w:spacing w:after="200" w:before="200"/>
+        <w:jc w:val="center"/>
+      </w:pPr>
+      <w:r>
+        <w:rPr>
+          <w:rFonts w:ascii="Georgia" w:cs="Georgia" w:eastAsia="Georgia" w:hAnsi="Georgia"/>
+          <w:sz w:val="22"/>
+          <w:szCs w:val="22"/>
+        </w:rPr>
+        <w:t xml:space="preserve">*</w:t>
+      </w:r>
+    </w:p>
+    <w:p>
+      <w:pPr>
+        <w:spacing w:after="0" w:line="312"/>
+        <w:ind w:firstLine="340"/>
+        <w:jc w:val="both"/>
+      </w:pPr>
+      <w:r>
+        <w:rPr>
+          <w:rFonts w:ascii="Georgia" w:cs="Georgia" w:eastAsia="Georgia" w:hAnsi="Georgia"/>
+          <w:sz w:val="21"/>
+          <w:szCs w:val="21"/>
+        </w:rPr>
+        <w:t xml:space="preserve">Na calçada da Paulista, depois da leitura, Lia esperou o irmão sair do prédio. Ele demorou. Quando apareceu, vinha com Otávio, conversando baixo, os dois com o rosto fechado. Otávio apertou a mão dele, deu dois tapas no ombro e foi embora a pé, na direção da Consolação.</w:t>
+      </w:r>
+    </w:p>
+    <w:p>
+      <w:pPr>
+        <w:spacing w:after="0" w:line="312"/>
+        <w:ind w:firstLine="340"/>
+        <w:jc w:val="both"/>
+      </w:pPr>
+      <w:r>
+        <w:rPr>
+          <w:rFonts w:ascii="Georgia" w:cs="Georgia" w:eastAsia="Georgia" w:hAnsi="Georgia"/>
+          <w:sz w:val="21"/>
+          <w:szCs w:val="21"/>
+        </w:rPr>
+        <w:t xml:space="preserve">— O que ele queria? — perguntou Lia.</w:t>
+      </w:r>
+    </w:p>
+    <w:p>
+      <w:pPr>
+        <w:spacing w:after="0" w:line="312"/>
+        <w:ind w:firstLine="340"/>
+        <w:jc w:val="both"/>
+      </w:pPr>
+      <w:r>
+        <w:rPr>
+          <w:rFonts w:ascii="Georgia" w:cs="Georgia" w:eastAsia="Georgia" w:hAnsi="Georgia"/>
+          <w:sz w:val="21"/>
+          <w:szCs w:val="21"/>
+        </w:rPr>
+        <w:t xml:space="preserve">— Saber se ia continuar sócio.</w:t>
+      </w:r>
+    </w:p>
+    <w:p>
+      <w:pPr>
+        <w:spacing w:after="0" w:line="312"/>
+        <w:ind w:firstLine="340"/>
+        <w:jc w:val="both"/>
+      </w:pPr>
+      <w:r>
+        <w:rPr>
+          <w:rFonts w:ascii="Georgia" w:cs="Georgia" w:eastAsia="Georgia" w:hAnsi="Georgia"/>
+          <w:sz w:val="21"/>
+          <w:szCs w:val="21"/>
+        </w:rPr>
+        <w:t xml:space="preserve">— E vai?</w:t>
+      </w:r>
+    </w:p>
+    <w:p>
+      <w:pPr>
+        <w:spacing w:after="0" w:line="312"/>
+        <w:ind w:firstLine="340"/>
+        <w:jc w:val="both"/>
+      </w:pPr>
+      <w:r>
+        <w:rPr>
+          <w:rFonts w:ascii="Georgia" w:cs="Georgia" w:eastAsia="Georgia" w:hAnsi="Georgia"/>
+          <w:sz w:val="21"/>
+          <w:szCs w:val="21"/>
+        </w:rPr>
+        <w:t xml:space="preserve">— Não sei ainda. — Lucas pôs as mãos nos bolsos. — Agora eu decido.</w:t>
+      </w:r>
+    </w:p>
+    <w:p>
+      <w:pPr>
+        <w:spacing w:after="0" w:line="312"/>
+        <w:ind w:firstLine="340"/>
+        <w:jc w:val="both"/>
+      </w:pPr>
+      <w:r>
+        <w:rPr>
+          <w:rFonts w:ascii="Georgia" w:cs="Georgia" w:eastAsia="Georgia" w:hAnsi="Georgia"/>
+          <w:sz w:val="21"/>
+          <w:szCs w:val="21"/>
+        </w:rPr>
+        <w:t xml:space="preserve">Agora eu decido. Lia ouviu aquilo e não gostou do que sentiu.</w:t>
+      </w:r>
+    </w:p>
+    <w:p>
+      <w:pPr>
+        <w:spacing w:after="0" w:line="312"/>
+        <w:ind w:firstLine="340"/>
+        <w:jc w:val="both"/>
+      </w:pPr>
+      <w:r>
+        <w:rPr>
+          <w:rFonts w:ascii="Georgia" w:cs="Georgia" w:eastAsia="Georgia" w:hAnsi="Georgia"/>
+          <w:sz w:val="21"/>
+          <w:szCs w:val="21"/>
+        </w:rPr>
+        <w:t xml:space="preserve">— Você sabia? — perguntou.</w:t>
+      </w:r>
+    </w:p>
+    <w:p>
+      <w:pPr>
+        <w:spacing w:after="0" w:line="312"/>
+        <w:ind w:firstLine="340"/>
+        <w:jc w:val="both"/>
+      </w:pPr>
+      <w:r>
+        <w:rPr>
+          <w:rFonts w:ascii="Georgia" w:cs="Georgia" w:eastAsia="Georgia" w:hAnsi="Georgia"/>
+          <w:sz w:val="21"/>
+          <w:szCs w:val="21"/>
+        </w:rPr>
+        <w:t xml:space="preserve">— Do testamento? Não.</w:t>
+      </w:r>
+    </w:p>
+    <w:p>
+      <w:pPr>
+        <w:spacing w:after="0" w:line="312"/>
+        <w:ind w:firstLine="340"/>
+        <w:jc w:val="both"/>
+      </w:pPr>
+      <w:r>
+        <w:rPr>
+          <w:rFonts w:ascii="Georgia" w:cs="Georgia" w:eastAsia="Georgia" w:hAnsi="Georgia"/>
+          <w:sz w:val="21"/>
+          <w:szCs w:val="21"/>
+        </w:rPr>
+        <w:t xml:space="preserve">— Da corretora. Que ele queria que você ficasse com ela.</w:t>
+      </w:r>
+    </w:p>
+    <w:p>
+      <w:pPr>
+        <w:spacing w:after="0" w:line="312"/>
+        <w:ind w:firstLine="340"/>
+        <w:jc w:val="both"/>
+      </w:pPr>
+      <w:r>
+        <w:rPr>
+          <w:rFonts w:ascii="Georgia" w:cs="Georgia" w:eastAsia="Georgia" w:hAnsi="Georgia"/>
+          <w:sz w:val="21"/>
+          <w:szCs w:val="21"/>
+        </w:rPr>
+        <w:t xml:space="preserve">Lucas demorou meio segundo para responder. Ela contou.</w:t>
+      </w:r>
+    </w:p>
+    <w:p>
+      <w:pPr>
+        <w:spacing w:after="0" w:line="312"/>
+        <w:ind w:firstLine="340"/>
+        <w:jc w:val="both"/>
+      </w:pPr>
+      <w:r>
+        <w:rPr>
+          <w:rFonts w:ascii="Georgia" w:cs="Georgia" w:eastAsia="Georgia" w:hAnsi="Georgia"/>
+          <w:sz w:val="21"/>
+          <w:szCs w:val="21"/>
+        </w:rPr>
+        <w:t xml:space="preserve">— Ele falava disso de vez em quando. Como sempre falou. Eu nunca levei a sério.</w:t>
+      </w:r>
+    </w:p>
+    <w:p>
+      <w:pPr>
+        <w:spacing w:after="0" w:line="312"/>
+        <w:ind w:firstLine="340"/>
+        <w:jc w:val="both"/>
+      </w:pPr>
+      <w:r>
+        <w:rPr>
+          <w:rFonts w:ascii="Georgia" w:cs="Georgia" w:eastAsia="Georgia" w:hAnsi="Georgia"/>
+          <w:sz w:val="21"/>
+          <w:szCs w:val="21"/>
+        </w:rPr>
+        <w:t xml:space="preserve">Era uma meia-verdade. Lia conhecia aquele tom. Era o mesmo tom que ela tinha usado com ele, três dias antes, ao dizer que não via o pai fazia mais de um mês.</w:t>
+      </w:r>
+    </w:p>
+    <w:p>
+      <w:pPr>
+        <w:spacing w:after="200" w:before="200"/>
+        <w:jc w:val="center"/>
+      </w:pPr>
+      <w:r>
+        <w:rPr>
+          <w:rFonts w:ascii="Georgia" w:cs="Georgia" w:eastAsia="Georgia" w:hAnsi="Georgia"/>
+          <w:sz w:val="22"/>
+          <w:szCs w:val="22"/>
+        </w:rPr>
+        <w:t xml:space="preserve">*</w:t>
+      </w:r>
+    </w:p>
+    <w:p>
+      <w:pPr>
+        <w:spacing w:after="0" w:line="312"/>
+        <w:ind w:firstLine="340"/>
+        <w:jc w:val="both"/>
+      </w:pPr>
+      <w:r>
+        <w:rPr>
+          <w:rFonts w:ascii="Georgia" w:cs="Georgia" w:eastAsia="Georgia" w:hAnsi="Georgia"/>
+          <w:sz w:val="21"/>
+          <w:szCs w:val="21"/>
+        </w:rPr>
+        <w:t xml:space="preserve">Na sexta-feira, Lucas entregou a ela o BlackBerry do pai, embrulhado no lenço, na porta do prédio dela, sem subir. Disse que estava atrasado para uma reunião. Lia não insistiu.</w:t>
+      </w:r>
+    </w:p>
+    <w:p>
+      <w:pPr>
+        <w:spacing w:after="0" w:line="312"/>
+        <w:ind w:firstLine="340"/>
+        <w:jc w:val="both"/>
+      </w:pPr>
+      <w:r>
+        <w:rPr>
+          <w:rFonts w:ascii="Georgia" w:cs="Georgia" w:eastAsia="Georgia" w:hAnsi="Georgia"/>
+          <w:sz w:val="21"/>
+          <w:szCs w:val="21"/>
+        </w:rPr>
+        <w:t xml:space="preserve">Naquela noite, ela fez uma coisa que ainda não tinha feito. Abriu as mensagens de texto do pai e começou a ler a lista de conversas de cima para baixo, contato por contato, como quem confere uma planta baixa cômodo por cômodo.</w:t>
+      </w:r>
+    </w:p>
+    <w:p>
+      <w:pPr>
+        <w:spacing w:after="0" w:line="312"/>
+        <w:ind w:firstLine="340"/>
+        <w:jc w:val="both"/>
+      </w:pPr>
+      <w:r>
+        <w:rPr>
+          <w:rFonts w:ascii="Georgia" w:cs="Georgia" w:eastAsia="Georgia" w:hAnsi="Georgia"/>
+          <w:sz w:val="21"/>
+          <w:szCs w:val="21"/>
+        </w:rPr>
+        <w:t xml:space="preserve">Helena. Otávio. Dona Cida, com fotos de feira e lembretes de remédio. Valdir, o segurança. A secretária da corretora. O escritório de contabilidade de verdade, com duas mensagens em três anos. A Contabilidade falsa, com centenas. O doutor Álvaro. O doutor Mauro. A mãe dela, Sílvia, com uma única mensagem de domingo, de duas palavras, que Lia leu e fechou rápido: Me perdoa. Ela mesma, Lia, com mensagens de um mês antes sobre um almoço. Até Carlos aparecia, com mensagens do pai que nunca tinham sido respondidas, uma por semana, toda quinta à tarde. Hoje às sete. No banco de sempre.</w:t>
+      </w:r>
+    </w:p>
+    <w:p>
+      <w:pPr>
+        <w:spacing w:after="0" w:line="312"/>
+        <w:ind w:firstLine="340"/>
+        <w:jc w:val="both"/>
+      </w:pPr>
+      <w:r>
+        <w:rPr>
+          <w:rFonts w:ascii="Georgia" w:cs="Georgia" w:eastAsia="Georgia" w:hAnsi="Georgia"/>
+          <w:sz w:val="21"/>
+          <w:szCs w:val="21"/>
+        </w:rPr>
+        <w:t xml:space="preserve">Lia desceu até o fim da lista. Depois subiu de novo.</w:t>
+      </w:r>
+    </w:p>
+    <w:p>
+      <w:pPr>
+        <w:spacing w:after="0" w:line="312"/>
+        <w:ind w:firstLine="340"/>
+        <w:jc w:val="both"/>
+      </w:pPr>
+      <w:r>
+        <w:rPr>
+          <w:rFonts w:ascii="Georgia" w:cs="Georgia" w:eastAsia="Georgia" w:hAnsi="Georgia"/>
+          <w:sz w:val="21"/>
+          <w:szCs w:val="21"/>
+        </w:rPr>
+        <w:t xml:space="preserve">Não havia nenhuma conversa com Lucas.</w:t>
+      </w:r>
+    </w:p>
+    <w:p>
+      <w:pPr>
+        <w:spacing w:after="0" w:line="312"/>
+        <w:ind w:firstLine="340"/>
+        <w:jc w:val="both"/>
+      </w:pPr>
+      <w:r>
+        <w:rPr>
+          <w:rFonts w:ascii="Georgia" w:cs="Georgia" w:eastAsia="Georgia" w:hAnsi="Georgia"/>
+          <w:sz w:val="21"/>
+          <w:szCs w:val="21"/>
+        </w:rPr>
+        <w:t xml:space="preserve">Nenhuma. Nem uma mensagem sobre futebol, nem um parabéns, nem um bom-dia. O pai e o filho mais velho, que trocavam mensagens toda segunda-feira desde que Lucas tinha o primeiro celular, para discutir o resultado do jogo do Corinthians. Lia sabia disso porque passara a adolescência inteira com ciúme daquelas mensagens.</w:t>
+      </w:r>
+    </w:p>
+    <w:p>
+      <w:pPr>
+        <w:pBdr>
+          <w:top w:val="single" w:color="555555" w:sz="6" w:space="6"/>
+          <w:bottom w:val="single" w:color="555555" w:sz="6" w:space="6"/>
+          <w:left w:val="single" w:color="555555" w:sz="6" w:space="6"/>
+          <w:right w:val="single" w:color="555555" w:sz="6" w:space="6"/>
+        </w:pBdr>
+        <w:shd w:fill="EFEFEF" w:color="auto" w:val="clear"/>
+        <w:spacing w:after="0" w:before="240"/>
+        <w:ind w:left="227" w:right="227"/>
+        <w:jc w:val="center"/>
+      </w:pPr>
+      <w:r>
+        <w:rPr>
+          <w:rFonts w:ascii="Georgia" w:cs="Georgia" w:eastAsia="Georgia" w:hAnsi="Georgia"/>
+          <w:b/>
+          <w:bCs/>
+          <w:spacing w:val="30"/>
+          <w:sz w:val="17"/>
+          <w:szCs w:val="17"/>
+        </w:rPr>
+        <w:t xml:space="preserve">NO CELULAR DE HENRIQUE</w:t>
+      </w:r>
+    </w:p>
+    <w:p>
+      <w:pPr>
+        <w:pBdr>
+          <w:top w:val="single" w:color="555555" w:sz="6" w:space="6"/>
+          <w:bottom w:val="single" w:color="555555" w:sz="6" w:space="6"/>
+          <w:left w:val="single" w:color="555555" w:sz="6" w:space="6"/>
+          <w:right w:val="single" w:color="555555" w:sz="6" w:space="6"/>
+        </w:pBdr>
+        <w:shd w:fill="EFEFEF" w:color="auto" w:val="clear"/>
+        <w:spacing w:after="240" w:before="0" w:line="288"/>
+        <w:ind w:left="227" w:right="227"/>
+        <w:jc w:val="center"/>
+      </w:pPr>
+      <w:r>
+        <w:rPr>
+          <w:rFonts w:ascii="Georgia" w:cs="Georgia" w:eastAsia="Georgia" w:hAnsi="Georgia"/>
+          <w:i/>
+          <w:iCs/>
+          <w:sz w:val="19"/>
+          <w:szCs w:val="19"/>
+        </w:rPr>
+        <w:t xml:space="preserve">Procure, nas mensagens de texto do celular de Henrique, a conversa entre ele e o filho mais velho. Compare com o que você leu no capítulo 2.</w:t>
+      </w:r>
+    </w:p>
+    <w:p>
+      <w:pPr>
+        <w:spacing w:after="0" w:line="312"/>
+        <w:ind w:firstLine="340"/>
+        <w:jc w:val="both"/>
+      </w:pPr>
+      <w:r>
+        <w:rPr>
+          <w:rFonts w:ascii="Georgia" w:cs="Georgia" w:eastAsia="Georgia" w:hAnsi="Georgia"/>
+          <w:sz w:val="21"/>
+          <w:szCs w:val="21"/>
+        </w:rPr>
+        <w:t xml:space="preserve">O pai nunca apagava nada. Guardava mensagens de cinco anos antes de um cliente que tinha morrido. Guardava as fotos de feira da Dona Cida.</w:t>
+      </w:r>
+    </w:p>
+    <w:p>
+      <w:pPr>
+        <w:spacing w:after="0" w:line="312"/>
+        <w:ind w:firstLine="340"/>
+        <w:jc w:val="both"/>
+      </w:pPr>
+      <w:r>
+        <w:rPr>
+          <w:rFonts w:ascii="Georgia" w:cs="Georgia" w:eastAsia="Georgia" w:hAnsi="Georgia"/>
+          <w:sz w:val="21"/>
+          <w:szCs w:val="21"/>
+        </w:rPr>
+        <w:t xml:space="preserve">Alguém tinha apagado a conversa com Lucas.</w:t>
+      </w:r>
+    </w:p>
+    <w:p>
+      <w:pPr>
+        <w:spacing w:after="0" w:line="312"/>
+        <w:ind w:firstLine="340"/>
+        <w:jc w:val="both"/>
+      </w:pPr>
+      <w:r>
+        <w:rPr>
+          <w:rFonts w:ascii="Georgia" w:cs="Georgia" w:eastAsia="Georgia" w:hAnsi="Georgia"/>
+          <w:sz w:val="21"/>
+          <w:szCs w:val="21"/>
+        </w:rPr>
+        <w:t xml:space="preserve">E, desde a quinta-feira depois da cremação, quem tinha passado mais tempo sozinho com aquele aparelho era o próprio Lucas.</w:t>
+      </w:r>
+    </w:p>
+    <w:p>
+      <w:pPr>
+        <w:spacing w:after="200" w:before="200"/>
+        <w:jc w:val="center"/>
+      </w:pPr>
+      <w:r>
+        <w:rPr>
+          <w:rFonts w:ascii="Georgia" w:cs="Georgia" w:eastAsia="Georgia" w:hAnsi="Georgia"/>
+          <w:sz w:val="22"/>
+          <w:szCs w:val="22"/>
+        </w:rPr>
+        <w:t xml:space="preserve">*</w:t>
+      </w:r>
+    </w:p>
+    <w:p>
+      <w:pPr>
+        <w:spacing w:after="0" w:line="312"/>
+        <w:ind w:firstLine="340"/>
+        <w:jc w:val="both"/>
+      </w:pPr>
+      <w:r>
+        <w:rPr>
+          <w:rFonts w:ascii="Georgia" w:cs="Georgia" w:eastAsia="Georgia" w:hAnsi="Georgia"/>
+          <w:sz w:val="21"/>
+          <w:szCs w:val="21"/>
+        </w:rPr>
+        <w:t xml:space="preserve">Ela abriu o e-mail pessoal do pai, aquele que Lucas tinha descoberto com a placa do carro prata. Leu as anotações sobre a Contabilidade, sobre o carro, sobre Otávio. Mas dessa vez leu todas, inclusive as que não falavam de crime nenhum e que Lucas, quando encaminhou para ela, tinha deixado de fora.</w:t>
+      </w:r>
+    </w:p>
+    <w:p>
+      <w:pPr>
+        <w:spacing w:after="0" w:line="312"/>
+        <w:ind w:firstLine="340"/>
+        <w:jc w:val="both"/>
+      </w:pPr>
+      <w:r>
+        <w:rPr>
+          <w:rFonts w:ascii="Georgia" w:cs="Georgia" w:eastAsia="Georgia" w:hAnsi="Georgia"/>
+          <w:sz w:val="21"/>
+          <w:szCs w:val="21"/>
+        </w:rPr>
+        <w:t xml:space="preserve">Havia três sobre ele.</w:t>
+      </w:r>
+    </w:p>
+    <w:p>
+      <w:pPr>
+        <w:spacing w:after="0" w:line="312"/>
+        <w:ind w:firstLine="340"/>
+        <w:jc w:val="both"/>
+      </w:pPr>
+      <w:r>
+        <w:rPr>
+          <w:rFonts w:ascii="Georgia" w:cs="Georgia" w:eastAsia="Georgia" w:hAnsi="Georgia"/>
+          <w:sz w:val="21"/>
+          <w:szCs w:val="21"/>
+        </w:rPr>
+        <w:t xml:space="preserve">A primeira era do começo de setembro.</w:t>
+      </w:r>
+    </w:p>
+    <w:p>
+      <w:pPr>
+        <w:spacing w:after="0" w:line="312"/>
+        <w:ind w:firstLine="340"/>
+        <w:jc w:val="both"/>
+      </w:pPr>
+      <w:r>
+        <w:rPr>
+          <w:rFonts w:ascii="Georgia" w:cs="Georgia" w:eastAsia="Georgia" w:hAnsi="Georgia"/>
+          <w:sz w:val="21"/>
+          <w:szCs w:val="21"/>
+        </w:rPr>
+        <w:t xml:space="preserve">Falei de novo com o Lucas sobre a corretora. Disse não de novo. Ele é o único em quem eu confiaria lá dentro, e é o único que não quer. Talvez seja por isso.</w:t>
+      </w:r>
+    </w:p>
+    <w:p>
+      <w:pPr>
+        <w:spacing w:after="0" w:line="312"/>
+        <w:ind w:firstLine="340"/>
+        <w:jc w:val="both"/>
+      </w:pPr>
+      <w:r>
+        <w:rPr>
+          <w:rFonts w:ascii="Georgia" w:cs="Georgia" w:eastAsia="Georgia" w:hAnsi="Georgia"/>
+          <w:sz w:val="21"/>
+          <w:szCs w:val="21"/>
+        </w:rPr>
+        <w:t xml:space="preserve">A segunda, de uma semana depois.</w:t>
+      </w:r>
+    </w:p>
+    <w:p>
+      <w:pPr>
+        <w:spacing w:after="0" w:line="312"/>
+        <w:ind w:firstLine="340"/>
+        <w:jc w:val="both"/>
+      </w:pPr>
+      <w:r>
+        <w:rPr>
+          <w:rFonts w:ascii="Georgia" w:cs="Georgia" w:eastAsia="Georgia" w:hAnsi="Georgia"/>
+          <w:sz w:val="21"/>
+          <w:szCs w:val="21"/>
+        </w:rPr>
+        <w:t xml:space="preserve">Insisti. Ele ficou bravo. Disse que eu nunca acreditei nele. Ele não sabe o que está em jogo e eu não posso contar.</w:t>
+      </w:r>
+    </w:p>
+    <w:p>
+      <w:pPr>
+        <w:spacing w:after="0" w:line="312"/>
+        <w:ind w:firstLine="340"/>
+        <w:jc w:val="both"/>
+      </w:pPr>
+      <w:r>
+        <w:rPr>
+          <w:rFonts w:ascii="Georgia" w:cs="Georgia" w:eastAsia="Georgia" w:hAnsi="Georgia"/>
+          <w:sz w:val="21"/>
+          <w:szCs w:val="21"/>
+        </w:rPr>
+        <w:t xml:space="preserve">E a terceira, de uma madrugada, sem pontuação, como se tivesse sido escrita com pressa.</w:t>
+      </w:r>
+    </w:p>
+    <w:p>
+      <w:pPr>
+        <w:spacing w:after="0" w:line="312"/>
+        <w:ind w:firstLine="340"/>
+        <w:jc w:val="both"/>
+      </w:pPr>
+      <w:r>
+        <w:rPr>
+          <w:rFonts w:ascii="Georgia" w:cs="Georgia" w:eastAsia="Georgia" w:hAnsi="Georgia"/>
+          <w:sz w:val="21"/>
+          <w:szCs w:val="21"/>
+        </w:rPr>
+        <w:t xml:space="preserve">ele me disse coisas que eu mereço ouvir mas não precisava ser agora não tenho tempo para esperar a raiva dele passar</w:t>
+      </w:r>
+    </w:p>
+    <w:p>
+      <w:pPr>
+        <w:spacing w:after="0" w:line="312"/>
+        <w:ind w:firstLine="340"/>
+        <w:jc w:val="both"/>
+      </w:pPr>
+      <w:r>
+        <w:rPr>
+          <w:rFonts w:ascii="Georgia" w:cs="Georgia" w:eastAsia="Georgia" w:hAnsi="Georgia"/>
+          <w:sz w:val="21"/>
+          <w:szCs w:val="21"/>
+        </w:rPr>
+        <w:t xml:space="preserve">Lia leu três vezes. Depois fechou o notebook devagar.</w:t>
+      </w:r>
+    </w:p>
+    <w:p>
+      <w:pPr>
+        <w:spacing w:after="0" w:line="312"/>
+        <w:ind w:firstLine="340"/>
+        <w:jc w:val="both"/>
+      </w:pPr>
+      <w:r>
+        <w:rPr>
+          <w:rFonts w:ascii="Georgia" w:cs="Georgia" w:eastAsia="Georgia" w:hAnsi="Georgia"/>
+          <w:sz w:val="21"/>
+          <w:szCs w:val="21"/>
+        </w:rPr>
+        <w:t xml:space="preserve">Não tenho tempo para esperar a raiva dele passar.</w:t>
+      </w:r>
+    </w:p>
+    <w:p>
+      <w:pPr>
+        <w:spacing w:after="0" w:line="312"/>
+        <w:ind w:firstLine="340"/>
+        <w:jc w:val="both"/>
+      </w:pPr>
+      <w:r>
+        <w:rPr>
+          <w:rFonts w:ascii="Georgia" w:cs="Georgia" w:eastAsia="Georgia" w:hAnsi="Georgia"/>
+          <w:sz w:val="21"/>
+          <w:szCs w:val="21"/>
+        </w:rPr>
+        <w:t xml:space="preserve">O pai tinha brigado com Lucas por causa da corretora, poucas semanas antes de morrer. Lucas tinha dito ao pai coisas que, segundo o próprio pai, ele merecia ouvir. E depois, quando o pai morreu, Lucas apagou a conversa do celular, escondeu as anotações sobre a briga quando encaminhou os e-mails para ela, e herdou a corretora inteira.</w:t>
+      </w:r>
+    </w:p>
+    <w:p>
+      <w:pPr>
+        <w:spacing w:after="0" w:line="312"/>
+        <w:ind w:firstLine="340"/>
+        <w:jc w:val="both"/>
+      </w:pPr>
+      <w:r>
+        <w:rPr>
+          <w:rFonts w:ascii="Georgia" w:cs="Georgia" w:eastAsia="Georgia" w:hAnsi="Georgia"/>
+          <w:sz w:val="21"/>
+          <w:szCs w:val="21"/>
+        </w:rPr>
+        <w:t xml:space="preserve">E, na calçada da Paulista, tinha dito que nunca levou a sério.</w:t>
+      </w:r>
+    </w:p>
+    <w:p>
+      <w:pPr>
+        <w:spacing w:after="200" w:before="200"/>
+        <w:jc w:val="center"/>
+      </w:pPr>
+      <w:r>
+        <w:rPr>
+          <w:rFonts w:ascii="Georgia" w:cs="Georgia" w:eastAsia="Georgia" w:hAnsi="Georgia"/>
+          <w:sz w:val="22"/>
+          <w:szCs w:val="22"/>
+        </w:rPr>
+        <w:t xml:space="preserve">*</w:t>
+      </w:r>
+    </w:p>
+    <w:p>
+      <w:pPr>
+        <w:spacing w:after="0" w:line="312"/>
+        <w:ind w:firstLine="340"/>
+        <w:jc w:val="both"/>
+      </w:pPr>
+      <w:r>
+        <w:rPr>
+          <w:rFonts w:ascii="Georgia" w:cs="Georgia" w:eastAsia="Georgia" w:hAnsi="Georgia"/>
+          <w:sz w:val="21"/>
+          <w:szCs w:val="21"/>
+        </w:rPr>
+        <w:t xml:space="preserve">Ela tentou se convencer de que estava sendo injusta. Lucas não era Otávio. Não era Falcão. Era o irmão que lhe tinha ensinado a andar de bicicleta na rua da casa do Jardim Europa, num domingo, segurando o banco até ela pedir para ele soltar. Era o irmão que tinha dito, no restaurante japonês, você sempre pula a parte que te assusta.</w:t>
+      </w:r>
+    </w:p>
+    <w:p>
+      <w:pPr>
+        <w:spacing w:after="0" w:line="312"/>
+        <w:ind w:firstLine="340"/>
+        <w:jc w:val="both"/>
+      </w:pPr>
+      <w:r>
+        <w:rPr>
+          <w:rFonts w:ascii="Georgia" w:cs="Georgia" w:eastAsia="Georgia" w:hAnsi="Georgia"/>
+          <w:sz w:val="21"/>
+          <w:szCs w:val="21"/>
+        </w:rPr>
+        <w:t xml:space="preserve">Mas também era o irmão que chegara ao crematório atrasado e não se aproximara do caixão nem uma vez. Com o rosto de quem tinha feito alguma coisa e esperava para ver se alguém ia descobrir.</w:t>
+      </w:r>
+    </w:p>
+    <w:p>
+      <w:pPr>
+        <w:spacing w:after="0" w:line="312"/>
+        <w:ind w:firstLine="340"/>
+        <w:jc w:val="both"/>
+      </w:pPr>
+      <w:r>
+        <w:rPr>
+          <w:rFonts w:ascii="Georgia" w:cs="Georgia" w:eastAsia="Georgia" w:hAnsi="Georgia"/>
+          <w:sz w:val="21"/>
+          <w:szCs w:val="21"/>
+        </w:rPr>
+        <w:t xml:space="preserve">Lia se levantou, foi até a cozinha e serviu um copo de vinho de uma garrafa aberta havia dias, que já tinha perdido o gosto. Bebeu metade de uma vez mesmo assim. Depois voltou ao sofá, pegou o próprio celular e abriu a conversa com o irmão.</w:t>
+      </w:r>
+    </w:p>
+    <w:p>
+      <w:pPr>
+        <w:spacing w:after="0" w:line="312"/>
+        <w:ind w:firstLine="340"/>
+        <w:jc w:val="both"/>
+      </w:pPr>
+      <w:r>
+        <w:rPr>
+          <w:rFonts w:ascii="Georgia" w:cs="Georgia" w:eastAsia="Georgia" w:hAnsi="Georgia"/>
+          <w:sz w:val="21"/>
+          <w:szCs w:val="21"/>
+        </w:rPr>
+        <w:t xml:space="preserve">A última mensagem era dele, da tarde da leitura do testamento. Depois a gente conversa com calma. Bj.</w:t>
+      </w:r>
+    </w:p>
+    <w:p>
+      <w:pPr>
+        <w:spacing w:after="0" w:line="312"/>
+        <w:ind w:firstLine="340"/>
+        <w:jc w:val="both"/>
+      </w:pPr>
+      <w:r>
+        <w:rPr>
+          <w:rFonts w:ascii="Georgia" w:cs="Georgia" w:eastAsia="Georgia" w:hAnsi="Georgia"/>
+          <w:sz w:val="21"/>
+          <w:szCs w:val="21"/>
+        </w:rPr>
+        <w:t xml:space="preserve">Ela digitou: Você brigou com o pai antes de ele morrer?</w:t>
+      </w:r>
+    </w:p>
+    <w:p>
+      <w:pPr>
+        <w:spacing w:after="0" w:line="312"/>
+        <w:ind w:firstLine="340"/>
+        <w:jc w:val="both"/>
+      </w:pPr>
+      <w:r>
+        <w:rPr>
+          <w:rFonts w:ascii="Georgia" w:cs="Georgia" w:eastAsia="Georgia" w:hAnsi="Georgia"/>
+          <w:sz w:val="21"/>
+          <w:szCs w:val="21"/>
+        </w:rPr>
+        <w:t xml:space="preserve">Ficou olhando para a pergunta por um minuto inteiro. Depois apagou, letra por letra.</w:t>
+      </w:r>
+    </w:p>
+    <w:p>
+      <w:pPr>
+        <w:spacing w:after="0" w:line="312"/>
+        <w:ind w:firstLine="340"/>
+        <w:jc w:val="both"/>
+      </w:pPr>
+      <w:r>
+        <w:rPr>
+          <w:rFonts w:ascii="Georgia" w:cs="Georgia" w:eastAsia="Georgia" w:hAnsi="Georgia"/>
+          <w:sz w:val="21"/>
+          <w:szCs w:val="21"/>
+        </w:rPr>
+        <w:t xml:space="preserve">Escreveu outra coisa: Obrigada por trazer o celular. Bj.</w:t>
+      </w:r>
+    </w:p>
+    <w:p>
+      <w:pPr>
+        <w:spacing w:after="0" w:line="312"/>
+        <w:ind w:firstLine="340"/>
+        <w:jc w:val="both"/>
+      </w:pPr>
+      <w:r>
+        <w:rPr>
+          <w:rFonts w:ascii="Georgia" w:cs="Georgia" w:eastAsia="Georgia" w:hAnsi="Georgia"/>
+          <w:sz w:val="21"/>
+          <w:szCs w:val="21"/>
+        </w:rPr>
+        <w:t xml:space="preserve">E mandou.</w:t>
+      </w:r>
+    </w:p>
+    <w:p>
+      <w:pPr>
+        <w:spacing w:after="0" w:line="312"/>
+        <w:ind w:firstLine="340"/>
+        <w:jc w:val="both"/>
+      </w:pPr>
+      <w:r>
+        <w:rPr>
+          <w:rFonts w:ascii="Georgia" w:cs="Georgia" w:eastAsia="Georgia" w:hAnsi="Georgia"/>
+          <w:sz w:val="21"/>
+          <w:szCs w:val="21"/>
+        </w:rPr>
+        <w:t xml:space="preserve">Naquela noite, Lia fez uma lista num papel, como sabia que o pai faria, e como, sem que ela soubesse, o irmão tinha feito na noite anterior. Uma lista curta, com um nome só no alto.</w:t>
+      </w:r>
+    </w:p>
+    <w:p>
+      <w:pPr>
+        <w:spacing w:after="0" w:line="312"/>
+        <w:ind w:firstLine="340"/>
+        <w:jc w:val="both"/>
+      </w:pPr>
+      <w:r>
+        <w:rPr>
+          <w:rFonts w:ascii="Georgia" w:cs="Georgia" w:eastAsia="Georgia" w:hAnsi="Georgia"/>
+          <w:sz w:val="21"/>
+          <w:szCs w:val="21"/>
+        </w:rPr>
+        <w:t xml:space="preserve">Lucas.</w:t>
+      </w:r>
+    </w:p>
+    <w:p>
+      <w:pPr>
+        <w:spacing w:after="0" w:line="312"/>
+        <w:ind w:firstLine="340"/>
+        <w:jc w:val="both"/>
+      </w:pPr>
+      <w:r>
+        <w:rPr>
+          <w:rFonts w:ascii="Georgia" w:cs="Georgia" w:eastAsia="Georgia" w:hAnsi="Georgia"/>
+          <w:sz w:val="21"/>
+          <w:szCs w:val="21"/>
+        </w:rPr>
+        <w:t xml:space="preserve">Embaixo, as perguntas. Brigou com o pai? Sim. Apagou as mensagens? Provavelmente. Herdou a corretora? Sim. Mentiu para mim? Sim.</w:t>
+      </w:r>
+    </w:p>
+    <w:p>
+      <w:pPr>
+        <w:spacing w:after="0" w:line="312"/>
+        <w:ind w:firstLine="340"/>
+        <w:jc w:val="both"/>
+      </w:pPr>
+      <w:r>
+        <w:rPr>
+          <w:rFonts w:ascii="Georgia" w:cs="Georgia" w:eastAsia="Georgia" w:hAnsi="Georgia"/>
+          <w:sz w:val="21"/>
+          <w:szCs w:val="21"/>
+        </w:rPr>
+        <w:t xml:space="preserve">Na última linha, escreveu: Estava lá?</w:t>
+      </w:r>
+    </w:p>
+    <w:p>
+      <w:pPr>
+        <w:spacing w:after="0" w:line="312"/>
+        <w:ind w:firstLine="340"/>
+        <w:jc w:val="both"/>
+      </w:pPr>
+      <w:r>
+        <w:rPr>
+          <w:rFonts w:ascii="Georgia" w:cs="Georgia" w:eastAsia="Georgia" w:hAnsi="Georgia"/>
+          <w:sz w:val="21"/>
+          <w:szCs w:val="21"/>
+        </w:rPr>
+        <w:t xml:space="preserve">E não soube responder.</w:t>
       </w:r>
     </w:p>
     <w:sectPr>

</xml_diff>

<commit_message>
Livro policial: capítulo 21 (As cinzas de Rodolfo); Santos e a foto do Pelé
Co-Authored-By: Claude Opus 5.5 <noreply@anthropic.com>
Claude-Session: https://claude.ai/code/session_01BrurxSYygRC3rRhaUYosm1
</commit_message>
<xml_diff>
--- a/docs/livro-policial/TODO_CRIME_TEM_UM_AUTOR.docx
+++ b/docs/livro-policial/TODO_CRIME_TEM_UM_AUTOR.docx
@@ -18424,7 +18424,7 @@
           <w:sz w:val="21"/>
           <w:szCs w:val="21"/>
         </w:rPr>
-        <w:t xml:space="preserve">O quarto de Carlos era o mesmo da adolescência, com as mesmas prateleiras de madeira clara e um pôster desbotado de um time de basquete que ele já não acompanhava. A diferença eram os livros, empilhados no chão, na escrivaninha, na cama. Ele tirou uma pilha da cadeira para que ela sentasse e sentou-se na beira da cama.</w:t>
+        <w:t xml:space="preserve">O quarto de Carlos era o mesmo da adolescência, com as mesmas prateleiras de madeira clara e uma foto emoldurada do Rei Pelé, com a camisa branca do Santos, que o pai tinha dado aos filhos no dia em que os levou a um Santos e Corinthians na Vila Belmiro. Carlos tinha oito anos. Era a única coisa do pai que ele nunca tinha tirado da parede. A diferença eram os livros, empilhados no chão, na escrivaninha, na cama. Ele tirou uma pilha da cadeira para que ela sentasse e sentou-se na beira da cama.</w:t>
       </w:r>
     </w:p>
     <w:p>
@@ -18693,7 +18693,7 @@
           <w:sz w:val="21"/>
           <w:szCs w:val="21"/>
         </w:rPr>
-        <w:t xml:space="preserve">Ele levou um tempo para começar. Quando começou, falou olhando para o pôster desbotado, e não para ela.</w:t>
+        <w:t xml:space="preserve">Ele levou um tempo para começar. Quando começou, falou olhando para a foto do Pelé, e não para ela.</w:t>
       </w:r>
     </w:p>
     <w:p>
@@ -21165,7 +21165,7 @@
           <w:sz w:val="21"/>
           <w:szCs w:val="21"/>
         </w:rPr>
-        <w:t xml:space="preserve">Nenhuma. Nem uma mensagem sobre futebol, nem um parabéns, nem um bom-dia. O pai e o filho mais velho, que trocavam mensagens toda segunda-feira desde que Lucas tinha o primeiro celular, para discutir o resultado do jogo do Corinthians. Lia sabia disso porque passara a adolescência inteira com ciúme daquelas mensagens.</w:t>
+        <w:t xml:space="preserve">Nenhuma. Nem uma mensagem sobre futebol, nem um parabéns, nem um bom-dia. O pai e o filho mais velho, que trocavam mensagens toda segunda-feira desde que Lucas tinha o primeiro celular, para discutir o resultado do jogo do Santos. Lia sabia disso porque passara a adolescência inteira com ciúme daquelas mensagens.</w:t>
       </w:r>
     </w:p>
     <w:p>
@@ -21663,6 +21663,859 @@
           <w:szCs w:val="21"/>
         </w:rPr>
         <w:t xml:space="preserve">E não soube responder.</w:t>
+      </w:r>
+    </w:p>
+    <w:p>
+      <w:pPr>
+        <w:pageBreakBefore/>
+        <w:spacing w:after="120" w:before="1800"/>
+        <w:jc w:val="center"/>
+      </w:pPr>
+      <w:r>
+        <w:rPr>
+          <w:rFonts w:ascii="Georgia" w:cs="Georgia" w:eastAsia="Georgia" w:hAnsi="Georgia"/>
+          <w:spacing w:val="40"/>
+          <w:sz w:val="20"/>
+          <w:szCs w:val="20"/>
+        </w:rPr>
+        <w:t xml:space="preserve">CAPÍTULO 21</w:t>
+      </w:r>
+    </w:p>
+    <w:p>
+      <w:pPr>
+        <w:spacing w:after="720"/>
+        <w:jc w:val="center"/>
+      </w:pPr>
+      <w:r>
+        <w:rPr>
+          <w:rFonts w:ascii="Georgia" w:cs="Georgia" w:eastAsia="Georgia" w:hAnsi="Georgia"/>
+          <w:b/>
+          <w:bCs/>
+          <w:sz w:val="32"/>
+          <w:szCs w:val="32"/>
+        </w:rPr>
+        <w:t xml:space="preserve">As cinzas de Rodolfo</w:t>
+      </w:r>
+    </w:p>
+    <w:p>
+      <w:pPr>
+        <w:spacing w:after="0" w:line="312"/>
+        <w:ind w:firstLine="340"/>
+        <w:jc w:val="both"/>
+      </w:pPr>
+      <w:r>
+        <w:rPr>
+          <w:rFonts w:ascii="Georgia" w:cs="Georgia" w:eastAsia="Georgia" w:hAnsi="Georgia"/>
+          <w:sz w:val="21"/>
+          <w:szCs w:val="21"/>
+        </w:rPr>
+        <w:t xml:space="preserve">Dois anos antes.</w:t>
+      </w:r>
+    </w:p>
+    <w:p>
+      <w:pPr>
+        <w:spacing w:after="0" w:line="312"/>
+        <w:ind w:firstLine="340"/>
+        <w:jc w:val="both"/>
+      </w:pPr>
+      <w:r>
+        <w:rPr>
+          <w:rFonts w:ascii="Georgia" w:cs="Georgia" w:eastAsia="Georgia" w:hAnsi="Georgia"/>
+          <w:sz w:val="21"/>
+          <w:szCs w:val="21"/>
+        </w:rPr>
+        <w:t xml:space="preserve">Rodolfo tinha pedido para ser cremado, e Henrique achou aquilo a coisa mais parecida com o irmão que podia existir. Rodolfo nunca quis ocupar espaço. Nem em vida, nem depois.</w:t>
+      </w:r>
+    </w:p>
+    <w:p>
+      <w:pPr>
+        <w:spacing w:after="0" w:line="312"/>
+        <w:ind w:firstLine="340"/>
+        <w:jc w:val="both"/>
+      </w:pPr>
+      <w:r>
+        <w:rPr>
+          <w:rFonts w:ascii="Georgia" w:cs="Georgia" w:eastAsia="Georgia" w:hAnsi="Georgia"/>
+          <w:sz w:val="21"/>
+          <w:szCs w:val="21"/>
+        </w:rPr>
+        <w:t xml:space="preserve">Era o mais velho dos dois por três anos e o mais bonito por uma distância que Henrique nunca conseguiu diminuir. Morou a vida inteira em Santos, numa casa pequena perto do canal 4, dava aulas de história numa escola pública e não entendia nada de seguros, de contratos, de dinheiro. Foi Rodolfo quem levou Henrique, aos nove anos, para ver o Santos jogar na Vila Belmiro pela primeira vez. Henrique lembrava do calor, do cheiro de amendoim torrado e do momento em que a arquibancada inteira se levantou ao mesmo tempo, como uma onda, e Rodolfo o pôs nos ombros para que ele visse o gol.</w:t>
+      </w:r>
+    </w:p>
+    <w:p>
+      <w:pPr>
+        <w:spacing w:after="0" w:line="312"/>
+        <w:ind w:firstLine="340"/>
+        <w:jc w:val="both"/>
+      </w:pPr>
+      <w:r>
+        <w:rPr>
+          <w:rFonts w:ascii="Georgia" w:cs="Georgia" w:eastAsia="Georgia" w:hAnsi="Georgia"/>
+          <w:sz w:val="21"/>
+          <w:szCs w:val="21"/>
+        </w:rPr>
+        <w:t xml:space="preserve">Anos depois, Henrique levou os próprios filhos à Vila Belmiro, num Santos e Corinthians, e comprou para eles na saída uma foto do Pelé numa moldura de plástico. Pensou no irmão a partida inteira. Não ligou para contar.</w:t>
+      </w:r>
+    </w:p>
+    <w:p>
+      <w:pPr>
+        <w:spacing w:after="0" w:line="312"/>
+        <w:ind w:firstLine="340"/>
+        <w:jc w:val="both"/>
+      </w:pPr>
+      <w:r>
+        <w:rPr>
+          <w:rFonts w:ascii="Georgia" w:cs="Georgia" w:eastAsia="Georgia" w:hAnsi="Georgia"/>
+          <w:sz w:val="21"/>
+          <w:szCs w:val="21"/>
+        </w:rPr>
+        <w:t xml:space="preserve">Os dois não se falavam direito havia quase dez anos quando o telefone tocou numa madrugada de março e uma voz de enfermeira disse que Rodolfo estava internado, que era o coração, que talvez fosse melhor ele vir. Henrique chegou a Santos às quatro da manhã. Rodolfo morreu às seis, sem acordar, com o irmão segurando a mão dele.</w:t>
+      </w:r>
+    </w:p>
+    <w:p>
+      <w:pPr>
+        <w:spacing w:after="200" w:before="200"/>
+        <w:jc w:val="center"/>
+      </w:pPr>
+      <w:r>
+        <w:rPr>
+          <w:rFonts w:ascii="Georgia" w:cs="Georgia" w:eastAsia="Georgia" w:hAnsi="Georgia"/>
+          <w:sz w:val="22"/>
+          <w:szCs w:val="22"/>
+        </w:rPr>
+        <w:t xml:space="preserve">*</w:t>
+      </w:r>
+    </w:p>
+    <w:p>
+      <w:pPr>
+        <w:spacing w:after="0" w:line="312"/>
+        <w:ind w:firstLine="340"/>
+        <w:jc w:val="both"/>
+      </w:pPr>
+      <w:r>
+        <w:rPr>
+          <w:rFonts w:ascii="Georgia" w:cs="Georgia" w:eastAsia="Georgia" w:hAnsi="Georgia"/>
+          <w:sz w:val="21"/>
+          <w:szCs w:val="21"/>
+        </w:rPr>
+        <w:t xml:space="preserve">A cerimônia foi no Crematório da Vila Alpina, numa quinta-feira de chuva fina.</w:t>
+      </w:r>
+    </w:p>
+    <w:p>
+      <w:pPr>
+        <w:spacing w:after="0" w:line="312"/>
+        <w:ind w:firstLine="340"/>
+        <w:jc w:val="both"/>
+      </w:pPr>
+      <w:r>
+        <w:rPr>
+          <w:rFonts w:ascii="Georgia" w:cs="Georgia" w:eastAsia="Georgia" w:hAnsi="Georgia"/>
+          <w:sz w:val="21"/>
+          <w:szCs w:val="21"/>
+        </w:rPr>
+        <w:t xml:space="preserve">Henrique já tinha estado em muitos velórios, de clientes, de sócios, de concorrentes. Nunca numa cremação. Estranhou o salão de poltronas em semicírculo, o piso liso e vazio no centro, o silêncio diferente do silêncio dos cemitérios. Estranhou mais ainda quando ouviu o ruído baixo de um motor e viu o alçapão se abrir no chão, e o caixão do irmão subir devagar do subsolo, numa plataforma, até ficar rente ao piso, cercado pelas poltronas.</w:t>
+      </w:r>
+    </w:p>
+    <w:p>
+      <w:pPr>
+        <w:spacing w:after="0" w:line="312"/>
+        <w:ind w:firstLine="340"/>
+        <w:jc w:val="both"/>
+      </w:pPr>
+      <w:r>
+        <w:rPr>
+          <w:rFonts w:ascii="Georgia" w:cs="Georgia" w:eastAsia="Georgia" w:hAnsi="Georgia"/>
+          <w:sz w:val="21"/>
+          <w:szCs w:val="21"/>
+        </w:rPr>
+        <w:t xml:space="preserve">Helena, sentada ao lado dele, pôs a mão sobre a sua. Fazia pouco mais de um ano que estavam casados. Ela tinha o hábito de tocá-lo assim em público e de se afastar em casa, e Henrique ainda não tinha decidido se aquilo era timidez ou outra coisa.</w:t>
+      </w:r>
+    </w:p>
+    <w:p>
+      <w:pPr>
+        <w:spacing w:after="0" w:line="312"/>
+        <w:ind w:firstLine="340"/>
+        <w:jc w:val="both"/>
+      </w:pPr>
+      <w:r>
+        <w:rPr>
+          <w:rFonts w:ascii="Georgia" w:cs="Georgia" w:eastAsia="Georgia" w:hAnsi="Georgia"/>
+          <w:sz w:val="21"/>
+          <w:szCs w:val="21"/>
+        </w:rPr>
+        <w:t xml:space="preserve">Do outro lado do semicírculo, Lucas estava sentado com Marta, de terno escuro. Lia, ao lado de Sílvia, chorava baixo. Carlos tinha vindo, o que surpreendeu a todos, e estava de pé no fundo do salão, sem sentar, sem olhar para o pai. Tinha vindo pelo tio. Rodolfo era o único Salvallus que Carlos ainda visitava.</w:t>
+      </w:r>
+    </w:p>
+    <w:p>
+      <w:pPr>
+        <w:spacing w:after="0" w:line="312"/>
+        <w:ind w:firstLine="340"/>
+        <w:jc w:val="both"/>
+      </w:pPr>
+      <w:r>
+        <w:rPr>
+          <w:rFonts w:ascii="Georgia" w:cs="Georgia" w:eastAsia="Georgia" w:hAnsi="Georgia"/>
+          <w:sz w:val="21"/>
+          <w:szCs w:val="21"/>
+        </w:rPr>
+        <w:t xml:space="preserve">O doutor Álvaro estava duas poltronas adiante, de cabeça baixa. Tinha conhecido Rodolfo na mesma época em que conheceu Henrique, quase quarenta anos antes, nas férias em Ubatuba, quando os três dividiam uma barraca de praia e uma única prancha de isopor.</w:t>
+      </w:r>
+    </w:p>
+    <w:p>
+      <w:pPr>
+        <w:spacing w:after="200" w:before="200"/>
+        <w:jc w:val="center"/>
+      </w:pPr>
+      <w:r>
+        <w:rPr>
+          <w:rFonts w:ascii="Georgia" w:cs="Georgia" w:eastAsia="Georgia" w:hAnsi="Georgia"/>
+          <w:sz w:val="22"/>
+          <w:szCs w:val="22"/>
+        </w:rPr>
+        <w:t xml:space="preserve">*</w:t>
+      </w:r>
+    </w:p>
+    <w:p>
+      <w:pPr>
+        <w:spacing w:after="0" w:line="312"/>
+        <w:ind w:firstLine="340"/>
+        <w:jc w:val="both"/>
+      </w:pPr>
+      <w:r>
+        <w:rPr>
+          <w:rFonts w:ascii="Georgia" w:cs="Georgia" w:eastAsia="Georgia" w:hAnsi="Georgia"/>
+          <w:sz w:val="21"/>
+          <w:szCs w:val="21"/>
+        </w:rPr>
+        <w:t xml:space="preserve">O padre falou pouco. Rodolfo não era de igreja, e o padre parecia saber disso.</w:t>
+      </w:r>
+    </w:p>
+    <w:p>
+      <w:pPr>
+        <w:spacing w:after="0" w:line="312"/>
+        <w:ind w:firstLine="340"/>
+        <w:jc w:val="both"/>
+      </w:pPr>
+      <w:r>
+        <w:rPr>
+          <w:rFonts w:ascii="Georgia" w:cs="Georgia" w:eastAsia="Georgia" w:hAnsi="Georgia"/>
+          <w:sz w:val="21"/>
+          <w:szCs w:val="21"/>
+        </w:rPr>
+        <w:t xml:space="preserve">Durante a fala, Henrique olhou para o caixão parado sobre a plataforma e pensou que, dali a alguns minutos, o irmão ia descer por aquele mesmo caminho e virar uma coisa que caberia numa caixa de madeira do tamanho de uma lata de biscoitos. Sentiu um aperto que não sabia nomear. Para se defender dele, fez o que sempre fazia nas horas difíceis: transformou a coisa num assunto prático.</w:t>
+      </w:r>
+    </w:p>
+    <w:p>
+      <w:pPr>
+        <w:spacing w:after="0" w:line="312"/>
+        <w:ind w:firstLine="340"/>
+        <w:jc w:val="both"/>
+      </w:pPr>
+      <w:r>
+        <w:rPr>
+          <w:rFonts w:ascii="Georgia" w:cs="Georgia" w:eastAsia="Georgia" w:hAnsi="Georgia"/>
+          <w:sz w:val="21"/>
+          <w:szCs w:val="21"/>
+        </w:rPr>
+        <w:t xml:space="preserve">Inclinou-se para Helena e perguntou, em voz baixa:</w:t>
+      </w:r>
+    </w:p>
+    <w:p>
+      <w:pPr>
+        <w:spacing w:after="0" w:line="312"/>
+        <w:ind w:firstLine="340"/>
+        <w:jc w:val="both"/>
+      </w:pPr>
+      <w:r>
+        <w:rPr>
+          <w:rFonts w:ascii="Georgia" w:cs="Georgia" w:eastAsia="Georgia" w:hAnsi="Georgia"/>
+          <w:sz w:val="21"/>
+          <w:szCs w:val="21"/>
+        </w:rPr>
+        <w:t xml:space="preserve">— Você quer ser cremada? Quando chegar a sua hora?</w:t>
+      </w:r>
+    </w:p>
+    <w:p>
+      <w:pPr>
+        <w:spacing w:after="0" w:line="312"/>
+        <w:ind w:firstLine="340"/>
+        <w:jc w:val="both"/>
+      </w:pPr>
+      <w:r>
+        <w:rPr>
+          <w:rFonts w:ascii="Georgia" w:cs="Georgia" w:eastAsia="Georgia" w:hAnsi="Georgia"/>
+          <w:sz w:val="21"/>
+          <w:szCs w:val="21"/>
+        </w:rPr>
+        <w:t xml:space="preserve">Ela o olhou, surpresa.</w:t>
+      </w:r>
+    </w:p>
+    <w:p>
+      <w:pPr>
+        <w:spacing w:after="0" w:line="312"/>
+        <w:ind w:firstLine="340"/>
+        <w:jc w:val="both"/>
+      </w:pPr>
+      <w:r>
+        <w:rPr>
+          <w:rFonts w:ascii="Georgia" w:cs="Georgia" w:eastAsia="Georgia" w:hAnsi="Georgia"/>
+          <w:sz w:val="21"/>
+          <w:szCs w:val="21"/>
+        </w:rPr>
+        <w:t xml:space="preserve">— Não.</w:t>
+      </w:r>
+    </w:p>
+    <w:p>
+      <w:pPr>
+        <w:spacing w:after="0" w:line="312"/>
+        <w:ind w:firstLine="340"/>
+        <w:jc w:val="both"/>
+      </w:pPr>
+      <w:r>
+        <w:rPr>
+          <w:rFonts w:ascii="Georgia" w:cs="Georgia" w:eastAsia="Georgia" w:hAnsi="Georgia"/>
+          <w:sz w:val="21"/>
+          <w:szCs w:val="21"/>
+        </w:rPr>
+        <w:t xml:space="preserve">— Por quê?</w:t>
+      </w:r>
+    </w:p>
+    <w:p>
+      <w:pPr>
+        <w:spacing w:after="0" w:line="312"/>
+        <w:ind w:firstLine="340"/>
+        <w:jc w:val="both"/>
+      </w:pPr>
+      <w:r>
+        <w:rPr>
+          <w:rFonts w:ascii="Georgia" w:cs="Georgia" w:eastAsia="Georgia" w:hAnsi="Georgia"/>
+          <w:sz w:val="21"/>
+          <w:szCs w:val="21"/>
+        </w:rPr>
+        <w:t xml:space="preserve">— Meu pai foi enterrado. — Ela disse aquilo rápido, e logo depois pareceu se arrepender. — Eu quero ficar onde ele ficou. Debaixo da terra.</w:t>
+      </w:r>
+    </w:p>
+    <w:p>
+      <w:pPr>
+        <w:spacing w:after="0" w:line="312"/>
+        <w:ind w:firstLine="340"/>
+        <w:jc w:val="both"/>
+      </w:pPr>
+      <w:r>
+        <w:rPr>
+          <w:rFonts w:ascii="Georgia" w:cs="Georgia" w:eastAsia="Georgia" w:hAnsi="Georgia"/>
+          <w:sz w:val="21"/>
+          <w:szCs w:val="21"/>
+        </w:rPr>
+        <w:t xml:space="preserve">Henrique franziu a testa. Em mais de um ano de casamento, nunca tinha ouvido Helena falar do pai. Sabia que tinha morrido, e só.</w:t>
+      </w:r>
+    </w:p>
+    <w:p>
+      <w:pPr>
+        <w:spacing w:after="0" w:line="312"/>
+        <w:ind w:firstLine="340"/>
+        <w:jc w:val="both"/>
+      </w:pPr>
+      <w:r>
+        <w:rPr>
+          <w:rFonts w:ascii="Georgia" w:cs="Georgia" w:eastAsia="Georgia" w:hAnsi="Georgia"/>
+          <w:sz w:val="21"/>
+          <w:szCs w:val="21"/>
+        </w:rPr>
+        <w:t xml:space="preserve">— Você nunca fala dele.</w:t>
+      </w:r>
+    </w:p>
+    <w:p>
+      <w:pPr>
+        <w:spacing w:after="0" w:line="312"/>
+        <w:ind w:firstLine="340"/>
+        <w:jc w:val="both"/>
+      </w:pPr>
+      <w:r>
+        <w:rPr>
+          <w:rFonts w:ascii="Georgia" w:cs="Georgia" w:eastAsia="Georgia" w:hAnsi="Georgia"/>
+          <w:sz w:val="21"/>
+          <w:szCs w:val="21"/>
+        </w:rPr>
+        <w:t xml:space="preserve">— Não tem o que falar. — Helena endireitou o corpo e devolveu a pergunta, mais alto do que talvez quisesse. — E você? Quer ser cremado?</w:t>
+      </w:r>
+    </w:p>
+    <w:p>
+      <w:pPr>
+        <w:spacing w:after="0" w:line="312"/>
+        <w:ind w:firstLine="340"/>
+        <w:jc w:val="both"/>
+      </w:pPr>
+      <w:r>
+        <w:rPr>
+          <w:rFonts w:ascii="Georgia" w:cs="Georgia" w:eastAsia="Georgia" w:hAnsi="Georgia"/>
+          <w:sz w:val="21"/>
+          <w:szCs w:val="21"/>
+        </w:rPr>
+        <w:t xml:space="preserve">Henrique pensou um pouco. Olhou para o caixão do irmão. Olhou para Helena.</w:t>
+      </w:r>
+    </w:p>
+    <w:p>
+      <w:pPr>
+        <w:spacing w:after="0" w:line="312"/>
+        <w:ind w:firstLine="340"/>
+        <w:jc w:val="both"/>
+      </w:pPr>
+      <w:r>
+        <w:rPr>
+          <w:rFonts w:ascii="Georgia" w:cs="Georgia" w:eastAsia="Georgia" w:hAnsi="Georgia"/>
+          <w:sz w:val="21"/>
+          <w:szCs w:val="21"/>
+        </w:rPr>
+        <w:t xml:space="preserve">— Deixo a decisão para você — disse. E, porque o aperto no peito continuava, porque não sabia fazer outra coisa com ele, acrescentou, com um meio sorriso: — Só não joga as minhas cinzas na privada.</w:t>
+      </w:r>
+    </w:p>
+    <w:p>
+      <w:pPr>
+        <w:spacing w:after="0" w:line="312"/>
+        <w:ind w:firstLine="340"/>
+        <w:jc w:val="both"/>
+      </w:pPr>
+      <w:r>
+        <w:rPr>
+          <w:rFonts w:ascii="Georgia" w:cs="Georgia" w:eastAsia="Georgia" w:hAnsi="Georgia"/>
+          <w:sz w:val="21"/>
+          <w:szCs w:val="21"/>
+        </w:rPr>
+        <w:t xml:space="preserve">Helena riu. Foi um riso curto, de susto, que escapou antes que ela pudesse segurar. Henrique riu também, baixo, pelo nariz.</w:t>
+      </w:r>
+    </w:p>
+    <w:p>
+      <w:pPr>
+        <w:spacing w:after="0" w:line="312"/>
+        <w:ind w:firstLine="340"/>
+        <w:jc w:val="both"/>
+      </w:pPr>
+      <w:r>
+        <w:rPr>
+          <w:rFonts w:ascii="Georgia" w:cs="Georgia" w:eastAsia="Georgia" w:hAnsi="Georgia"/>
+          <w:sz w:val="21"/>
+          <w:szCs w:val="21"/>
+        </w:rPr>
+        <w:t xml:space="preserve">Mas o salão estava em silêncio, e o riso dos dois atravessou o semicírculo inteiro.</w:t>
+      </w:r>
+    </w:p>
+    <w:p>
+      <w:pPr>
+        <w:spacing w:after="0" w:line="312"/>
+        <w:ind w:firstLine="340"/>
+        <w:jc w:val="both"/>
+      </w:pPr>
+      <w:r>
+        <w:rPr>
+          <w:rFonts w:ascii="Georgia" w:cs="Georgia" w:eastAsia="Georgia" w:hAnsi="Georgia"/>
+          <w:sz w:val="21"/>
+          <w:szCs w:val="21"/>
+        </w:rPr>
+        <w:t xml:space="preserve">O padre parou de falar. Marta virou a cabeça devagar e os olhou com um desprezo antigo e cansado. Sílvia baixou os olhos. Lia ficou vermelha. Lucas fechou os olhos como quem conta até dez. No fundo do salão, Carlos saiu sem dizer nada, e a porta bateu atrás dele.</w:t>
+      </w:r>
+    </w:p>
+    <w:p>
+      <w:pPr>
+        <w:spacing w:after="0" w:line="312"/>
+        <w:ind w:firstLine="340"/>
+        <w:jc w:val="both"/>
+      </w:pPr>
+      <w:r>
+        <w:rPr>
+          <w:rFonts w:ascii="Georgia" w:cs="Georgia" w:eastAsia="Georgia" w:hAnsi="Georgia"/>
+          <w:sz w:val="21"/>
+          <w:szCs w:val="21"/>
+        </w:rPr>
+        <w:t xml:space="preserve">Duas poltronas adiante, o doutor Álvaro não se virou. Mas Henrique viu os ombros dele se contraírem, como quem leva um golpe pelas costas.</w:t>
+      </w:r>
+    </w:p>
+    <w:p>
+      <w:pPr>
+        <w:spacing w:after="0" w:line="312"/>
+        <w:ind w:firstLine="340"/>
+        <w:jc w:val="both"/>
+      </w:pPr>
+      <w:r>
+        <w:rPr>
+          <w:rFonts w:ascii="Georgia" w:cs="Georgia" w:eastAsia="Georgia" w:hAnsi="Georgia"/>
+          <w:sz w:val="21"/>
+          <w:szCs w:val="21"/>
+        </w:rPr>
+        <w:t xml:space="preserve">O padre retomou a fala. Henrique sentiu o rosto queimar e ficou olhando para os próprios sapatos até o fim.</w:t>
+      </w:r>
+    </w:p>
+    <w:p>
+      <w:pPr>
+        <w:spacing w:after="200" w:before="200"/>
+        <w:jc w:val="center"/>
+      </w:pPr>
+      <w:r>
+        <w:rPr>
+          <w:rFonts w:ascii="Georgia" w:cs="Georgia" w:eastAsia="Georgia" w:hAnsi="Georgia"/>
+          <w:sz w:val="22"/>
+          <w:szCs w:val="22"/>
+        </w:rPr>
+        <w:t xml:space="preserve">*</w:t>
+      </w:r>
+    </w:p>
+    <w:p>
+      <w:pPr>
+        <w:spacing w:after="0" w:line="312"/>
+        <w:ind w:firstLine="340"/>
+        <w:jc w:val="both"/>
+      </w:pPr>
+      <w:r>
+        <w:rPr>
+          <w:rFonts w:ascii="Georgia" w:cs="Georgia" w:eastAsia="Georgia" w:hAnsi="Georgia"/>
+          <w:sz w:val="21"/>
+          <w:szCs w:val="21"/>
+        </w:rPr>
+        <w:t xml:space="preserve">Quando o padre terminou, o ruído do motor recomeçou, e a plataforma desceu levando Rodolfo pelo mesmo caminho por onde tinha subido. Devagar, centímetro por centímetro, como um caixão que baixa à cova. O alçapão se fechou. O piso voltou a ficar liso, como se nada tivesse acontecido ali.</w:t>
+      </w:r>
+    </w:p>
+    <w:p>
+      <w:pPr>
+        <w:spacing w:after="0" w:line="312"/>
+        <w:ind w:firstLine="340"/>
+        <w:jc w:val="both"/>
+      </w:pPr>
+      <w:r>
+        <w:rPr>
+          <w:rFonts w:ascii="Georgia" w:cs="Georgia" w:eastAsia="Georgia" w:hAnsi="Georgia"/>
+          <w:sz w:val="21"/>
+          <w:szCs w:val="21"/>
+        </w:rPr>
+        <w:t xml:space="preserve">Henrique ficou sentado depois que todos se levantaram. Helena foi cumprimentar umas primas de Rodolfo que ele não conhecia. Os filhos saíram, cada um com a sua mãe, sem passar por ele. Só o doutor Álvaro ficou, de pé ao lado da poltrona, com as mãos nos bolsos do paletó.</w:t>
+      </w:r>
+    </w:p>
+    <w:p>
+      <w:pPr>
+        <w:spacing w:after="0" w:line="312"/>
+        <w:ind w:firstLine="340"/>
+        <w:jc w:val="both"/>
+      </w:pPr>
+      <w:r>
+        <w:rPr>
+          <w:rFonts w:ascii="Georgia" w:cs="Georgia" w:eastAsia="Georgia" w:hAnsi="Georgia"/>
+          <w:sz w:val="21"/>
+          <w:szCs w:val="21"/>
+        </w:rPr>
+        <w:t xml:space="preserve">— Precisava daquilo? — perguntou o médico, baixo.</w:t>
+      </w:r>
+    </w:p>
+    <w:p>
+      <w:pPr>
+        <w:spacing w:after="0" w:line="312"/>
+        <w:ind w:firstLine="340"/>
+        <w:jc w:val="both"/>
+      </w:pPr>
+      <w:r>
+        <w:rPr>
+          <w:rFonts w:ascii="Georgia" w:cs="Georgia" w:eastAsia="Georgia" w:hAnsi="Georgia"/>
+          <w:sz w:val="21"/>
+          <w:szCs w:val="21"/>
+        </w:rPr>
+        <w:t xml:space="preserve">— Não. — Henrique esfregou o rosto. — Foi nervoso.</w:t>
+      </w:r>
+    </w:p>
+    <w:p>
+      <w:pPr>
+        <w:spacing w:after="0" w:line="312"/>
+        <w:ind w:firstLine="340"/>
+        <w:jc w:val="both"/>
+      </w:pPr>
+      <w:r>
+        <w:rPr>
+          <w:rFonts w:ascii="Georgia" w:cs="Georgia" w:eastAsia="Georgia" w:hAnsi="Georgia"/>
+          <w:sz w:val="21"/>
+          <w:szCs w:val="21"/>
+        </w:rPr>
+        <w:t xml:space="preserve">— Eu sei que foi. — Álvaro sentou-se na poltrona ao lado. Ficaram os dois olhando para o piso liso onde o alçapão tinha estado. — O Rodolfo teria rido.</w:t>
+      </w:r>
+    </w:p>
+    <w:p>
+      <w:pPr>
+        <w:spacing w:after="0" w:line="312"/>
+        <w:ind w:firstLine="340"/>
+        <w:jc w:val="both"/>
+      </w:pPr>
+      <w:r>
+        <w:rPr>
+          <w:rFonts w:ascii="Georgia" w:cs="Georgia" w:eastAsia="Georgia" w:hAnsi="Georgia"/>
+          <w:sz w:val="21"/>
+          <w:szCs w:val="21"/>
+        </w:rPr>
+        <w:t xml:space="preserve">— O Rodolfo teria rido mais alto do que eu.</w:t>
+      </w:r>
+    </w:p>
+    <w:p>
+      <w:pPr>
+        <w:spacing w:after="0" w:line="312"/>
+        <w:ind w:firstLine="340"/>
+        <w:jc w:val="both"/>
+      </w:pPr>
+      <w:r>
+        <w:rPr>
+          <w:rFonts w:ascii="Georgia" w:cs="Georgia" w:eastAsia="Georgia" w:hAnsi="Georgia"/>
+          <w:sz w:val="21"/>
+          <w:szCs w:val="21"/>
+        </w:rPr>
+        <w:t xml:space="preserve">Ficaram um tempo em silêncio. Lá fora, a chuva fina continuava.</w:t>
+      </w:r>
+    </w:p>
+    <w:p>
+      <w:pPr>
+        <w:spacing w:after="0" w:line="312"/>
+        <w:ind w:firstLine="340"/>
+        <w:jc w:val="both"/>
+      </w:pPr>
+      <w:r>
+        <w:rPr>
+          <w:rFonts w:ascii="Georgia" w:cs="Georgia" w:eastAsia="Georgia" w:hAnsi="Georgia"/>
+          <w:sz w:val="21"/>
+          <w:szCs w:val="21"/>
+        </w:rPr>
+        <w:t xml:space="preserve">— É bonito, não é? — disse Álvaro, apontando o queixo para o centro do salão. — Limpo. Sem terra, sem verme, sem lápide para os filhos lavarem no Dia de Finados. Eu sempre defendi isso. Enterro é coisa do passado, Henrique. Quando chegar a minha vez, quero ir assim. Uma cortina, um alçapão, e pronto.</w:t>
+      </w:r>
+    </w:p>
+    <w:p>
+      <w:pPr>
+        <w:spacing w:after="0" w:line="312"/>
+        <w:ind w:firstLine="340"/>
+        <w:jc w:val="both"/>
+      </w:pPr>
+      <w:r>
+        <w:rPr>
+          <w:rFonts w:ascii="Georgia" w:cs="Georgia" w:eastAsia="Georgia" w:hAnsi="Georgia"/>
+          <w:sz w:val="21"/>
+          <w:szCs w:val="21"/>
+        </w:rPr>
+        <w:t xml:space="preserve">— Você ainda vai enterrar todos nós.</w:t>
+      </w:r>
+    </w:p>
+    <w:p>
+      <w:pPr>
+        <w:spacing w:after="0" w:line="312"/>
+        <w:ind w:firstLine="340"/>
+        <w:jc w:val="both"/>
+      </w:pPr>
+      <w:r>
+        <w:rPr>
+          <w:rFonts w:ascii="Georgia" w:cs="Georgia" w:eastAsia="Georgia" w:hAnsi="Georgia"/>
+          <w:sz w:val="21"/>
+          <w:szCs w:val="21"/>
+        </w:rPr>
+        <w:t xml:space="preserve">— Ou cremar. — O médico sorriu, um sorriso triste. — Você vai viver mais do que todo mundo. Vaso ruim não quebra.</w:t>
+      </w:r>
+    </w:p>
+    <w:p>
+      <w:pPr>
+        <w:spacing w:after="0" w:line="312"/>
+        <w:ind w:firstLine="340"/>
+        <w:jc w:val="both"/>
+      </w:pPr>
+      <w:r>
+        <w:rPr>
+          <w:rFonts w:ascii="Georgia" w:cs="Georgia" w:eastAsia="Georgia" w:hAnsi="Georgia"/>
+          <w:sz w:val="21"/>
+          <w:szCs w:val="21"/>
+        </w:rPr>
+        <w:t xml:space="preserve">Henrique riu, de verdade agora, sem ninguém para olhar torto.</w:t>
+      </w:r>
+    </w:p>
+    <w:p>
+      <w:pPr>
+        <w:spacing w:after="0" w:line="312"/>
+        <w:ind w:firstLine="340"/>
+        <w:jc w:val="both"/>
+      </w:pPr>
+      <w:r>
+        <w:rPr>
+          <w:rFonts w:ascii="Georgia" w:cs="Georgia" w:eastAsia="Georgia" w:hAnsi="Georgia"/>
+          <w:sz w:val="21"/>
+          <w:szCs w:val="21"/>
+        </w:rPr>
+        <w:t xml:space="preserve">Depois ficou sério.</w:t>
+      </w:r>
+    </w:p>
+    <w:p>
+      <w:pPr>
+        <w:spacing w:after="0" w:line="312"/>
+        <w:ind w:firstLine="340"/>
+        <w:jc w:val="both"/>
+      </w:pPr>
+      <w:r>
+        <w:rPr>
+          <w:rFonts w:ascii="Georgia" w:cs="Georgia" w:eastAsia="Georgia" w:hAnsi="Georgia"/>
+          <w:sz w:val="21"/>
+          <w:szCs w:val="21"/>
+        </w:rPr>
+        <w:t xml:space="preserve">— Sabe o que eu pensei, quando o caixão desceu? — disse. — Que deve ser bom sumir assim. Sem barulho. Sem ninguém ficar sabendo para onde você foi. O Rodolfo passou a vida inteira querendo não incomodar ninguém, e conseguiu até no final.</w:t>
+      </w:r>
+    </w:p>
+    <w:p>
+      <w:pPr>
+        <w:spacing w:after="0" w:line="312"/>
+        <w:ind w:firstLine="340"/>
+        <w:jc w:val="both"/>
+      </w:pPr>
+      <w:r>
+        <w:rPr>
+          <w:rFonts w:ascii="Georgia" w:cs="Georgia" w:eastAsia="Georgia" w:hAnsi="Georgia"/>
+          <w:sz w:val="21"/>
+          <w:szCs w:val="21"/>
+        </w:rPr>
+        <w:t xml:space="preserve">O doutor Álvaro não respondeu. Ficou olhando para o piso liso do salão por muito tempo, como se estivesse vendo alguma coisa que ainda não estava lá.</w:t>
+      </w:r>
+    </w:p>
+    <w:p>
+      <w:pPr>
+        <w:spacing w:after="200" w:before="200"/>
+        <w:jc w:val="center"/>
+      </w:pPr>
+      <w:r>
+        <w:rPr>
+          <w:rFonts w:ascii="Georgia" w:cs="Georgia" w:eastAsia="Georgia" w:hAnsi="Georgia"/>
+          <w:sz w:val="22"/>
+          <w:szCs w:val="22"/>
+        </w:rPr>
+        <w:t xml:space="preserve">*</w:t>
+      </w:r>
+    </w:p>
+    <w:p>
+      <w:pPr>
+        <w:spacing w:after="0" w:line="312"/>
+        <w:ind w:firstLine="340"/>
+        <w:jc w:val="both"/>
+      </w:pPr>
+      <w:r>
+        <w:rPr>
+          <w:rFonts w:ascii="Georgia" w:cs="Georgia" w:eastAsia="Georgia" w:hAnsi="Georgia"/>
+          <w:sz w:val="21"/>
+          <w:szCs w:val="21"/>
+        </w:rPr>
+        <w:t xml:space="preserve">No carro, voltando para São Paulo pela Imigrantes, Helena ficou calada até o pedágio.</w:t>
+      </w:r>
+    </w:p>
+    <w:p>
+      <w:pPr>
+        <w:spacing w:after="0" w:line="312"/>
+        <w:ind w:firstLine="340"/>
+        <w:jc w:val="both"/>
+      </w:pPr>
+      <w:r>
+        <w:rPr>
+          <w:rFonts w:ascii="Georgia" w:cs="Georgia" w:eastAsia="Georgia" w:hAnsi="Georgia"/>
+          <w:sz w:val="21"/>
+          <w:szCs w:val="21"/>
+        </w:rPr>
+        <w:t xml:space="preserve">— Desculpa por ter rido — disse ela, enfim.</w:t>
+      </w:r>
+    </w:p>
+    <w:p>
+      <w:pPr>
+        <w:spacing w:after="0" w:line="312"/>
+        <w:ind w:firstLine="340"/>
+        <w:jc w:val="both"/>
+      </w:pPr>
+      <w:r>
+        <w:rPr>
+          <w:rFonts w:ascii="Georgia" w:cs="Georgia" w:eastAsia="Georgia" w:hAnsi="Georgia"/>
+          <w:sz w:val="21"/>
+          <w:szCs w:val="21"/>
+        </w:rPr>
+        <w:t xml:space="preserve">— Eu é que comecei.</w:t>
+      </w:r>
+    </w:p>
+    <w:p>
+      <w:pPr>
+        <w:spacing w:after="0" w:line="312"/>
+        <w:ind w:firstLine="340"/>
+        <w:jc w:val="both"/>
+      </w:pPr>
+      <w:r>
+        <w:rPr>
+          <w:rFonts w:ascii="Georgia" w:cs="Georgia" w:eastAsia="Georgia" w:hAnsi="Georgia"/>
+          <w:sz w:val="21"/>
+          <w:szCs w:val="21"/>
+        </w:rPr>
+        <w:t xml:space="preserve">— Mesmo assim. — Ela olhou pela janela, para a serra coberta de neblina. — Você falou sério? Que a decisão seria minha?</w:t>
+      </w:r>
+    </w:p>
+    <w:p>
+      <w:pPr>
+        <w:spacing w:after="0" w:line="312"/>
+        <w:ind w:firstLine="340"/>
+        <w:jc w:val="both"/>
+      </w:pPr>
+      <w:r>
+        <w:rPr>
+          <w:rFonts w:ascii="Georgia" w:cs="Georgia" w:eastAsia="Georgia" w:hAnsi="Georgia"/>
+          <w:sz w:val="21"/>
+          <w:szCs w:val="21"/>
+        </w:rPr>
+        <w:t xml:space="preserve">Henrique pensou na pergunta. Pensou que, em quase sessenta anos de vida, nunca tinha deixado ninguém decidir nada por ele. Nem os pais, nem as esposas, nem os sócios, nem os filhos.</w:t>
+      </w:r>
+    </w:p>
+    <w:p>
+      <w:pPr>
+        <w:spacing w:after="0" w:line="312"/>
+        <w:ind w:firstLine="340"/>
+        <w:jc w:val="both"/>
+      </w:pPr>
+      <w:r>
+        <w:rPr>
+          <w:rFonts w:ascii="Georgia" w:cs="Georgia" w:eastAsia="Georgia" w:hAnsi="Georgia"/>
+          <w:sz w:val="21"/>
+          <w:szCs w:val="21"/>
+        </w:rPr>
+        <w:t xml:space="preserve">— Falei — disse. — Se eu morrer antes de você, você decide.</w:t>
+      </w:r>
+    </w:p>
+    <w:p>
+      <w:pPr>
+        <w:spacing w:after="0" w:line="312"/>
+        <w:ind w:firstLine="340"/>
+        <w:jc w:val="both"/>
+      </w:pPr>
+      <w:r>
+        <w:rPr>
+          <w:rFonts w:ascii="Georgia" w:cs="Georgia" w:eastAsia="Georgia" w:hAnsi="Georgia"/>
+          <w:sz w:val="21"/>
+          <w:szCs w:val="21"/>
+        </w:rPr>
+        <w:t xml:space="preserve">Helena não respondeu. Mas Henrique, pelo canto do olho, viu que ela fechou a mão no colo, devagar, como quem guarda uma coisa pequena que acabou de receber.</w:t>
+      </w:r>
+    </w:p>
+    <w:p>
+      <w:pPr>
+        <w:spacing w:after="0" w:line="312"/>
+        <w:ind w:firstLine="340"/>
+        <w:jc w:val="both"/>
+      </w:pPr>
+      <w:r>
+        <w:rPr>
+          <w:rFonts w:ascii="Georgia" w:cs="Georgia" w:eastAsia="Georgia" w:hAnsi="Georgia"/>
+          <w:sz w:val="21"/>
+          <w:szCs w:val="21"/>
+        </w:rPr>
+        <w:t xml:space="preserve">Ele achou que era carinho.</w:t>
+      </w:r>
+    </w:p>
+    <w:p>
+      <w:pPr>
+        <w:spacing w:after="0" w:line="312"/>
+        <w:ind w:firstLine="340"/>
+        <w:jc w:val="both"/>
+      </w:pPr>
+      <w:r>
+        <w:rPr>
+          <w:rFonts w:ascii="Georgia" w:cs="Georgia" w:eastAsia="Georgia" w:hAnsi="Georgia"/>
+          <w:sz w:val="21"/>
+          <w:szCs w:val="21"/>
+        </w:rPr>
+        <w:t xml:space="preserve">Só muito depois, quando ele já não estivesse aqui para entender, aquela mão fechada ia decidir o que fazer com ele.</w:t>
       </w:r>
     </w:p>
     <w:sectPr>

</xml_diff>

<commit_message>
Livro policial: capítulo 22 (Vila Belmiro); plataforma à altura de mesa e despedida de Rodolfo
Co-Authored-By: Claude Opus 5.5 <noreply@anthropic.com>
Claude-Session: https://claude.ai/code/session_01BrurxSYygRC3rRhaUYosm1
</commit_message>
<xml_diff>
--- a/docs/livro-policial/TODO_CRIME_TEM_UM_AUTOR.docx
+++ b/docs/livro-policial/TODO_CRIME_TEM_UM_AUTOR.docx
@@ -626,7 +626,7 @@
           <w:sz w:val="21"/>
           <w:szCs w:val="21"/>
         </w:rPr>
-        <w:t xml:space="preserve">A cerimônia de despedida foi no salão principal. As poltronas formavam um semicírculo, e o centro ficava vazio: um piso liso, onde não havia nada. Lia estranhou aquele espaço em branco até ouvir o ruído suave de um motor. Um alçapão se abriu no chão e, de baixo, do subsolo, uma plataforma subiu devagar, trazendo o caixão já fechado. Parou no centro, rente ao piso, e ficou ali, cercado pelas poltronas, como se o pai estivesse no meio de uma roda de conversa.</w:t>
+        <w:t xml:space="preserve">A cerimônia de despedida foi no salão principal. As poltronas formavam um semicírculo, e o centro ficava vazio: um piso liso, onde não havia nada. Lia estranhou aquele espaço em branco até ouvir o ruído suave de um motor. Um alçapão se abriu no chão e, de baixo, do subsolo, uma plataforma subiu devagar, trazendo o caixão já fechado. Parou no centro, à altura de uma mesa, uns noventa centímetros acima do piso, e ficou ali, cercado pelas poltronas, como se o pai estivesse no meio de uma roda de conversa. Parecia um palco pequeno. A última apresentação dele.</w:t>
       </w:r>
     </w:p>
     <w:p>
@@ -21813,7 +21813,7 @@
           <w:sz w:val="21"/>
           <w:szCs w:val="21"/>
         </w:rPr>
-        <w:t xml:space="preserve">Henrique já tinha estado em muitos velórios, de clientes, de sócios, de concorrentes. Nunca numa cremação. Estranhou o salão de poltronas em semicírculo, o piso liso e vazio no centro, o silêncio diferente do silêncio dos cemitérios. Estranhou mais ainda quando ouviu o ruído baixo de um motor e viu o alçapão se abrir no chão, e o caixão do irmão subir devagar do subsolo, numa plataforma, até ficar rente ao piso, cercado pelas poltronas.</w:t>
+        <w:t xml:space="preserve">Henrique já tinha estado em muitos velórios, de clientes, de sócios, de concorrentes. Nunca numa cremação. Estranhou o salão de poltronas em semicírculo, o piso liso e vazio no centro, o silêncio diferente do silêncio dos cemitérios. Estranhou mais ainda quando ouviu o ruído baixo de um motor e viu o alçapão se abrir no chão, e o caixão do irmão subir devagar do subsolo, numa plataforma, até parar à altura de uma mesa, uns noventa centímetros acima do piso, no centro do semicírculo. Uma luz suave caía sobre ele do teto. Henrique pensou, sem querer, num palco. O irmão estava ali como um ator no centro da cena, para a última apresentação, e todos em volta, nas poltronas, eram a plateia que tinha vindo vê-lo uma última vez.</w:t>
       </w:r>
     </w:p>
     <w:p>
@@ -21887,7 +21887,7 @@
           <w:sz w:val="21"/>
           <w:szCs w:val="21"/>
         </w:rPr>
-        <w:t xml:space="preserve">O padre falou pouco. Rodolfo não era de igreja, e o padre parecia saber disso.</w:t>
+        <w:t xml:space="preserve">O padre falou pouco e bem. Conhecia Rodolfo desde menino. Contou que ele tinha sido católico de missa todo domingo, que na adolescência fizera parte do grupo de jovens da paróquia, em Santos, e tocava violão nas missas da juventude, desafinado e feliz. Que, com o tempo, foi se afastando da rotina da igreja, das procissões e das reuniões, mas nunca da fé. Rodolfo rezava sozinho, disse o padre, do jeito dele. E Deus sempre soube ouvir quem reza baixinho.</w:t>
       </w:r>
     </w:p>
     <w:p>
@@ -22171,7 +22171,37 @@
           <w:sz w:val="21"/>
           <w:szCs w:val="21"/>
         </w:rPr>
-        <w:t xml:space="preserve">Quando o padre terminou, o ruído do motor recomeçou, e a plataforma desceu levando Rodolfo pelo mesmo caminho por onde tinha subido. Devagar, centímetro por centímetro, como um caixão que baixa à cova. O alçapão se fechou. O piso voltou a ficar liso, como se nada tivesse acontecido ali.</w:t>
+        <w:t xml:space="preserve">Quando o padre terminou, ninguém se mexeu por um instante. Depois, uma a uma, as pessoas começaram a se levantar das poltronas. Primeiro as primas de Santos. Depois dois colegas da escola onde Rodolfo dava aulas, um deles com um caderno de chamada velho debaixo do braço. Depois um ex-aluno, já de barba, que pousou sobre a tampa uma flâmula do Santos dobrada em quatro. Cada um subia até o centro do salão, tocava a madeira, dizia alguma coisa em voz baixa e voltava ao seu lugar. Era como o fim de uma peça, quando a plateia não vai embora e sobe ao palco para cumprimentar o ator. Só que o ator, dessa vez, não se curvava para agradecer.</w:t>
+      </w:r>
+    </w:p>
+    <w:p>
+      <w:pPr>
+        <w:spacing w:after="0" w:line="312"/>
+        <w:ind w:firstLine="340"/>
+        <w:jc w:val="both"/>
+      </w:pPr>
+      <w:r>
+        <w:rPr>
+          <w:rFonts w:ascii="Georgia" w:cs="Georgia" w:eastAsia="Georgia" w:hAnsi="Georgia"/>
+          <w:sz w:val="21"/>
+          <w:szCs w:val="21"/>
+        </w:rPr>
+        <w:t xml:space="preserve">Henrique foi o último. Pôs a mão sobre a tampa, ao lado da flâmula, e não disse nada. Não conseguiu. Ficou ali até sentir o calor da luz do teto nas costas da mão. Depois voltou para a poltrona.</w:t>
+      </w:r>
+    </w:p>
+    <w:p>
+      <w:pPr>
+        <w:spacing w:after="0" w:line="312"/>
+        <w:ind w:firstLine="340"/>
+        <w:jc w:val="both"/>
+      </w:pPr>
+      <w:r>
+        <w:rPr>
+          <w:rFonts w:ascii="Georgia" w:cs="Georgia" w:eastAsia="Georgia" w:hAnsi="Georgia"/>
+          <w:sz w:val="21"/>
+          <w:szCs w:val="21"/>
+        </w:rPr>
+        <w:t xml:space="preserve">Então o ruído do motor recomeçou, e a plataforma desceu levando Rodolfo pelo mesmo caminho por onde tinha subido. Devagar, centímetro por centímetro, como um caixão que baixa à cova. O alçapão se fechou. O piso voltou a ficar liso, como se nada tivesse acontecido ali.</w:t>
       </w:r>
     </w:p>
     <w:p>
@@ -22516,6 +22546,877 @@
           <w:szCs w:val="21"/>
         </w:rPr>
         <w:t xml:space="preserve">Só muito depois, quando ele já não estivesse aqui para entender, aquela mão fechada ia decidir o que fazer com ele.</w:t>
+      </w:r>
+    </w:p>
+    <w:p>
+      <w:pPr>
+        <w:pageBreakBefore/>
+        <w:spacing w:after="120" w:before="1800"/>
+        <w:jc w:val="center"/>
+      </w:pPr>
+      <w:r>
+        <w:rPr>
+          <w:rFonts w:ascii="Georgia" w:cs="Georgia" w:eastAsia="Georgia" w:hAnsi="Georgia"/>
+          <w:spacing w:val="40"/>
+          <w:sz w:val="20"/>
+          <w:szCs w:val="20"/>
+        </w:rPr>
+        <w:t xml:space="preserve">CAPÍTULO 22</w:t>
+      </w:r>
+    </w:p>
+    <w:p>
+      <w:pPr>
+        <w:spacing w:after="720"/>
+        <w:jc w:val="center"/>
+      </w:pPr>
+      <w:r>
+        <w:rPr>
+          <w:rFonts w:ascii="Georgia" w:cs="Georgia" w:eastAsia="Georgia" w:hAnsi="Georgia"/>
+          <w:b/>
+          <w:bCs/>
+          <w:sz w:val="32"/>
+          <w:szCs w:val="32"/>
+        </w:rPr>
+        <w:t xml:space="preserve">Vila Belmiro</w:t>
+      </w:r>
+    </w:p>
+    <w:p>
+      <w:pPr>
+        <w:spacing w:after="0" w:line="312"/>
+        <w:ind w:firstLine="340"/>
+        <w:jc w:val="both"/>
+      </w:pPr>
+      <w:r>
+        <w:rPr>
+          <w:rFonts w:ascii="Georgia" w:cs="Georgia" w:eastAsia="Georgia" w:hAnsi="Georgia"/>
+          <w:sz w:val="21"/>
+          <w:szCs w:val="21"/>
+        </w:rPr>
+        <w:t xml:space="preserve">No domingo, o Santos jogou às quatro da tarde, e Lucas assistiu sozinho, no sofá do apartamento da Vila Nova Conceição, com uma cerveja que esquentou na mão antes do intervalo.</w:t>
+      </w:r>
+    </w:p>
+    <w:p>
+      <w:pPr>
+        <w:spacing w:after="0" w:line="312"/>
+        <w:ind w:firstLine="340"/>
+        <w:jc w:val="both"/>
+      </w:pPr>
+      <w:r>
+        <w:rPr>
+          <w:rFonts w:ascii="Georgia" w:cs="Georgia" w:eastAsia="Georgia" w:hAnsi="Georgia"/>
+          <w:sz w:val="21"/>
+          <w:szCs w:val="21"/>
+        </w:rPr>
+        <w:t xml:space="preserve">Não era um jogo importante. Meio de campeonato, adversário pequeno, estádio pela metade. O Santos fez um gol aos trinta e poucos do primeiro tempo, de cabeça, numa bola parada, e Lucas se pegou levantando do sofá, por reflexo, com o celular na mão, para mandar a mensagem de sempre.</w:t>
+      </w:r>
+    </w:p>
+    <w:p>
+      <w:pPr>
+        <w:spacing w:after="0" w:line="312"/>
+        <w:ind w:firstLine="340"/>
+        <w:jc w:val="both"/>
+      </w:pPr>
+      <w:r>
+        <w:rPr>
+          <w:rFonts w:ascii="Georgia" w:cs="Georgia" w:eastAsia="Georgia" w:hAnsi="Georgia"/>
+          <w:sz w:val="21"/>
+          <w:szCs w:val="21"/>
+        </w:rPr>
+        <w:t xml:space="preserve">Parou no meio do movimento.</w:t>
+      </w:r>
+    </w:p>
+    <w:p>
+      <w:pPr>
+        <w:spacing w:after="0" w:line="312"/>
+        <w:ind w:firstLine="340"/>
+        <w:jc w:val="both"/>
+      </w:pPr>
+      <w:r>
+        <w:rPr>
+          <w:rFonts w:ascii="Georgia" w:cs="Georgia" w:eastAsia="Georgia" w:hAnsi="Georgia"/>
+          <w:sz w:val="21"/>
+          <w:szCs w:val="21"/>
+        </w:rPr>
+        <w:t xml:space="preserve">Fazia mais de vinte anos que, depois de todo gol do Santos, ele e o pai trocavam uma mensagem. No começo, no telefone fixo de casa, ligações de dez segundos. Depois, no primeiro celular, mensagens de duas palavras. Golaço, pai. Sorte, filho. Na segunda-feira, a conversa continuava, mais longa, sobre o juiz, sobre o técnico, sobre o lateral que não marcava ninguém. Era a única conversa entre os dois que nunca tinha virado briga.</w:t>
+      </w:r>
+    </w:p>
+    <w:p>
+      <w:pPr>
+        <w:spacing w:after="0" w:line="312"/>
+        <w:ind w:firstLine="340"/>
+        <w:jc w:val="both"/>
+      </w:pPr>
+      <w:r>
+        <w:rPr>
+          <w:rFonts w:ascii="Georgia" w:cs="Georgia" w:eastAsia="Georgia" w:hAnsi="Georgia"/>
+          <w:sz w:val="21"/>
+          <w:szCs w:val="21"/>
+        </w:rPr>
+        <w:t xml:space="preserve">Lucas sentou de novo, com o celular na mão, olhando para a tela.</w:t>
+      </w:r>
+    </w:p>
+    <w:p>
+      <w:pPr>
+        <w:spacing w:after="0" w:line="312"/>
+        <w:ind w:firstLine="340"/>
+        <w:jc w:val="both"/>
+      </w:pPr>
+      <w:r>
+        <w:rPr>
+          <w:rFonts w:ascii="Georgia" w:cs="Georgia" w:eastAsia="Georgia" w:hAnsi="Georgia"/>
+          <w:sz w:val="21"/>
+          <w:szCs w:val="21"/>
+        </w:rPr>
+        <w:t xml:space="preserve">Na televisão, o jogo continuava. Ele não viu o resto.</w:t>
+      </w:r>
+    </w:p>
+    <w:p>
+      <w:pPr>
+        <w:spacing w:after="200" w:before="200"/>
+        <w:jc w:val="center"/>
+      </w:pPr>
+      <w:r>
+        <w:rPr>
+          <w:rFonts w:ascii="Georgia" w:cs="Georgia" w:eastAsia="Georgia" w:hAnsi="Georgia"/>
+          <w:sz w:val="22"/>
+          <w:szCs w:val="22"/>
+        </w:rPr>
+        <w:t xml:space="preserve">*</w:t>
+      </w:r>
+    </w:p>
+    <w:p>
+      <w:pPr>
+        <w:spacing w:after="0" w:line="312"/>
+        <w:ind w:firstLine="340"/>
+        <w:jc w:val="both"/>
+      </w:pPr>
+      <w:r>
+        <w:rPr>
+          <w:rFonts w:ascii="Georgia" w:cs="Georgia" w:eastAsia="Georgia" w:hAnsi="Georgia"/>
+          <w:sz w:val="21"/>
+          <w:szCs w:val="21"/>
+        </w:rPr>
+        <w:t xml:space="preserve">À noite, abriu o BlackBerry do pai, que estava com ele naquela semana, e procurou a agenda de dezembro. Não sabia o que esperava encontrar. Talvez só a sensação de que o pai ainda tinha planos.</w:t>
+      </w:r>
+    </w:p>
+    <w:p>
+      <w:pPr>
+        <w:spacing w:after="0" w:line="312"/>
+        <w:ind w:firstLine="340"/>
+        <w:jc w:val="both"/>
+      </w:pPr>
+      <w:r>
+        <w:rPr>
+          <w:rFonts w:ascii="Georgia" w:cs="Georgia" w:eastAsia="Georgia" w:hAnsi="Georgia"/>
+          <w:sz w:val="21"/>
+          <w:szCs w:val="21"/>
+        </w:rPr>
+        <w:t xml:space="preserve">Encontrou, num domingo de dezembro, uma entrada em verde, a cor das viagens.</w:t>
+      </w:r>
+    </w:p>
+    <w:p>
+      <w:pPr>
+        <w:spacing w:after="0" w:line="312"/>
+        <w:ind w:firstLine="340"/>
+        <w:jc w:val="both"/>
+      </w:pPr>
+      <w:r>
+        <w:rPr>
+          <w:rFonts w:ascii="Georgia" w:cs="Georgia" w:eastAsia="Georgia" w:hAnsi="Georgia"/>
+          <w:sz w:val="21"/>
+          <w:szCs w:val="21"/>
+        </w:rPr>
+        <w:t xml:space="preserve">Vila Belmiro. Levar o Lucas. Se ele quiser. Se eu ainda puder.</w:t>
+      </w:r>
+    </w:p>
+    <w:p>
+      <w:pPr>
+        <w:pBdr>
+          <w:top w:val="single" w:color="555555" w:sz="6" w:space="6"/>
+          <w:bottom w:val="single" w:color="555555" w:sz="6" w:space="6"/>
+          <w:left w:val="single" w:color="555555" w:sz="6" w:space="6"/>
+          <w:right w:val="single" w:color="555555" w:sz="6" w:space="6"/>
+        </w:pBdr>
+        <w:shd w:fill="EFEFEF" w:color="auto" w:val="clear"/>
+        <w:spacing w:after="0" w:before="240"/>
+        <w:ind w:left="227" w:right="227"/>
+        <w:jc w:val="center"/>
+      </w:pPr>
+      <w:r>
+        <w:rPr>
+          <w:rFonts w:ascii="Georgia" w:cs="Georgia" w:eastAsia="Georgia" w:hAnsi="Georgia"/>
+          <w:b/>
+          <w:bCs/>
+          <w:spacing w:val="30"/>
+          <w:sz w:val="17"/>
+          <w:szCs w:val="17"/>
+        </w:rPr>
+        <w:t xml:space="preserve">NO CELULAR DE HENRIQUE</w:t>
+      </w:r>
+    </w:p>
+    <w:p>
+      <w:pPr>
+        <w:pBdr>
+          <w:top w:val="single" w:color="555555" w:sz="6" w:space="6"/>
+          <w:bottom w:val="single" w:color="555555" w:sz="6" w:space="6"/>
+          <w:left w:val="single" w:color="555555" w:sz="6" w:space="6"/>
+          <w:right w:val="single" w:color="555555" w:sz="6" w:space="6"/>
+        </w:pBdr>
+        <w:shd w:fill="EFEFEF" w:color="auto" w:val="clear"/>
+        <w:spacing w:after="240" w:before="0" w:line="288"/>
+        <w:ind w:left="227" w:right="227"/>
+        <w:jc w:val="center"/>
+      </w:pPr>
+      <w:r>
+        <w:rPr>
+          <w:rFonts w:ascii="Georgia" w:cs="Georgia" w:eastAsia="Georgia" w:hAnsi="Georgia"/>
+          <w:i/>
+          <w:iCs/>
+          <w:sz w:val="19"/>
+          <w:szCs w:val="19"/>
+        </w:rPr>
+        <w:t xml:space="preserve">Abra a agenda do celular de Henrique em dezembro e procure o domingo marcado em verde. Leia a entrada até o fim.</w:t>
+      </w:r>
+    </w:p>
+    <w:p>
+      <w:pPr>
+        <w:spacing w:after="0" w:line="312"/>
+        <w:ind w:firstLine="340"/>
+        <w:jc w:val="both"/>
+      </w:pPr>
+      <w:r>
+        <w:rPr>
+          <w:rFonts w:ascii="Georgia" w:cs="Georgia" w:eastAsia="Georgia" w:hAnsi="Georgia"/>
+          <w:sz w:val="21"/>
+          <w:szCs w:val="21"/>
+        </w:rPr>
+        <w:t xml:space="preserve">Lucas leu duas vezes. Se ele quiser. Se eu ainda puder.</w:t>
+      </w:r>
+    </w:p>
+    <w:p>
+      <w:pPr>
+        <w:spacing w:after="0" w:line="312"/>
+        <w:ind w:firstLine="340"/>
+        <w:jc w:val="both"/>
+      </w:pPr>
+      <w:r>
+        <w:rPr>
+          <w:rFonts w:ascii="Georgia" w:cs="Georgia" w:eastAsia="Georgia" w:hAnsi="Georgia"/>
+          <w:sz w:val="21"/>
+          <w:szCs w:val="21"/>
+        </w:rPr>
+        <w:t xml:space="preserve">O pai tinha marcado aquilo em setembro, segundo a data de criação. No mesmo mês da briga pela corretora. No mesmo mês em que tinha escrito no e-mail que não tinha tempo para esperar a raiva do filho passar.</w:t>
+      </w:r>
+    </w:p>
+    <w:p>
+      <w:pPr>
+        <w:spacing w:after="0" w:line="312"/>
+        <w:ind w:firstLine="340"/>
+        <w:jc w:val="both"/>
+      </w:pPr>
+      <w:r>
+        <w:rPr>
+          <w:rFonts w:ascii="Georgia" w:cs="Georgia" w:eastAsia="Georgia" w:hAnsi="Georgia"/>
+          <w:sz w:val="21"/>
+          <w:szCs w:val="21"/>
+        </w:rPr>
+        <w:t xml:space="preserve">Se eu ainda puder. Um homem que sabe que vai morrer escreve assim. Ou um homem que tem medo de morrer. Ou um homem que tem outros planos.</w:t>
+      </w:r>
+    </w:p>
+    <w:p>
+      <w:pPr>
+        <w:spacing w:after="0" w:line="312"/>
+        <w:ind w:firstLine="340"/>
+        <w:jc w:val="both"/>
+      </w:pPr>
+      <w:r>
+        <w:rPr>
+          <w:rFonts w:ascii="Georgia" w:cs="Georgia" w:eastAsia="Georgia" w:hAnsi="Georgia"/>
+          <w:sz w:val="21"/>
+          <w:szCs w:val="21"/>
+        </w:rPr>
+        <w:t xml:space="preserve">Lucas não soube qual dos três. Fechou a agenda e deixou o celular sobre a mesa de centro, com a tela para baixo.</w:t>
+      </w:r>
+    </w:p>
+    <w:p>
+      <w:pPr>
+        <w:spacing w:after="200" w:before="200"/>
+        <w:jc w:val="center"/>
+      </w:pPr>
+      <w:r>
+        <w:rPr>
+          <w:rFonts w:ascii="Georgia" w:cs="Georgia" w:eastAsia="Georgia" w:hAnsi="Georgia"/>
+          <w:sz w:val="22"/>
+          <w:szCs w:val="22"/>
+        </w:rPr>
+        <w:t xml:space="preserve">*</w:t>
+      </w:r>
+    </w:p>
+    <w:p>
+      <w:pPr>
+        <w:spacing w:after="0" w:line="312"/>
+        <w:ind w:firstLine="340"/>
+        <w:jc w:val="both"/>
+      </w:pPr>
+      <w:r>
+        <w:rPr>
+          <w:rFonts w:ascii="Georgia" w:cs="Georgia" w:eastAsia="Georgia" w:hAnsi="Georgia"/>
+          <w:sz w:val="21"/>
+          <w:szCs w:val="21"/>
+        </w:rPr>
+        <w:t xml:space="preserve">Na terça-feira, seguiu a irmã.</w:t>
+      </w:r>
+    </w:p>
+    <w:p>
+      <w:pPr>
+        <w:spacing w:after="0" w:line="312"/>
+        <w:ind w:firstLine="340"/>
+        <w:jc w:val="both"/>
+      </w:pPr>
+      <w:r>
+        <w:rPr>
+          <w:rFonts w:ascii="Georgia" w:cs="Georgia" w:eastAsia="Georgia" w:hAnsi="Georgia"/>
+          <w:sz w:val="21"/>
+          <w:szCs w:val="21"/>
+        </w:rPr>
+        <w:t xml:space="preserve">Não planejou. Disse a si mesmo que não planejou. Saiu da corretora às seis, pegou o carro na garagem e, em vez de ir para casa, foi até a Fradique Coutinho. Estacionou do outro lado da rua, a meia quadra do prédio, desligou o motor e ficou esperando, com o rádio baixo numa estação de notícias.</w:t>
+      </w:r>
+    </w:p>
+    <w:p>
+      <w:pPr>
+        <w:spacing w:after="0" w:line="312"/>
+        <w:ind w:firstLine="340"/>
+        <w:jc w:val="both"/>
+      </w:pPr>
+      <w:r>
+        <w:rPr>
+          <w:rFonts w:ascii="Georgia" w:cs="Georgia" w:eastAsia="Georgia" w:hAnsi="Georgia"/>
+          <w:sz w:val="21"/>
+          <w:szCs w:val="21"/>
+        </w:rPr>
+        <w:t xml:space="preserve">Às sete e dez, Lia saiu pela garagem, no carro dela.</w:t>
+      </w:r>
+    </w:p>
+    <w:p>
+      <w:pPr>
+        <w:spacing w:after="0" w:line="312"/>
+        <w:ind w:firstLine="340"/>
+        <w:jc w:val="both"/>
+      </w:pPr>
+      <w:r>
+        <w:rPr>
+          <w:rFonts w:ascii="Georgia" w:cs="Georgia" w:eastAsia="Georgia" w:hAnsi="Georgia"/>
+          <w:sz w:val="21"/>
+          <w:szCs w:val="21"/>
+        </w:rPr>
+        <w:t xml:space="preserve">Lucas a seguiu de longe, dois, três carros atrás, como tinha visto em filmes e nunca imaginou fazer na vida. Sentia vergonha a cada semáforo. Não desistiu em nenhum. A irmã atravessou Pinheiros, subiu a Cardeal Arcoverde, entrou na Avenida Sumaré e virou à esquerda em Perdizes.</w:t>
+      </w:r>
+    </w:p>
+    <w:p>
+      <w:pPr>
+        <w:spacing w:after="0" w:line="312"/>
+        <w:ind w:firstLine="340"/>
+        <w:jc w:val="both"/>
+      </w:pPr>
+      <w:r>
+        <w:rPr>
+          <w:rFonts w:ascii="Georgia" w:cs="Georgia" w:eastAsia="Georgia" w:hAnsi="Georgia"/>
+          <w:sz w:val="21"/>
+          <w:szCs w:val="21"/>
+        </w:rPr>
+        <w:t xml:space="preserve">Ele sabia para onde ela ia antes de ela estacionar.</w:t>
+      </w:r>
+    </w:p>
+    <w:p>
+      <w:pPr>
+        <w:spacing w:after="0" w:line="312"/>
+        <w:ind w:firstLine="340"/>
+        <w:jc w:val="both"/>
+      </w:pPr>
+      <w:r>
+        <w:rPr>
+          <w:rFonts w:ascii="Georgia" w:cs="Georgia" w:eastAsia="Georgia" w:hAnsi="Georgia"/>
+          <w:sz w:val="21"/>
+          <w:szCs w:val="21"/>
+        </w:rPr>
+        <w:t xml:space="preserve">A casa de Sílvia tinha as janelas fechadas, como sempre. Lia tocou a campainha. Carlos abriu a porta. Os dois se abraçaram na soleira, um abraço longo, demorado, do tipo que Lucas não lembrava de ter recebido de nenhum dos dois. Depois entraram, e a porta se fechou.</w:t>
+      </w:r>
+    </w:p>
+    <w:p>
+      <w:pPr>
+        <w:spacing w:after="0" w:line="312"/>
+        <w:ind w:firstLine="340"/>
+        <w:jc w:val="both"/>
+      </w:pPr>
+      <w:r>
+        <w:rPr>
+          <w:rFonts w:ascii="Georgia" w:cs="Georgia" w:eastAsia="Georgia" w:hAnsi="Georgia"/>
+          <w:sz w:val="21"/>
+          <w:szCs w:val="21"/>
+        </w:rPr>
+        <w:t xml:space="preserve">Lucas ficou no carro, do outro lado da rua, sob uma árvore que derrubava flores roxas no para-brisa.</w:t>
+      </w:r>
+    </w:p>
+    <w:p>
+      <w:pPr>
+        <w:spacing w:after="200" w:before="200"/>
+        <w:jc w:val="center"/>
+      </w:pPr>
+      <w:r>
+        <w:rPr>
+          <w:rFonts w:ascii="Georgia" w:cs="Georgia" w:eastAsia="Georgia" w:hAnsi="Georgia"/>
+          <w:sz w:val="22"/>
+          <w:szCs w:val="22"/>
+        </w:rPr>
+        <w:t xml:space="preserve">*</w:t>
+      </w:r>
+    </w:p>
+    <w:p>
+      <w:pPr>
+        <w:spacing w:after="0" w:line="312"/>
+        <w:ind w:firstLine="340"/>
+        <w:jc w:val="both"/>
+      </w:pPr>
+      <w:r>
+        <w:rPr>
+          <w:rFonts w:ascii="Georgia" w:cs="Georgia" w:eastAsia="Georgia" w:hAnsi="Georgia"/>
+          <w:sz w:val="21"/>
+          <w:szCs w:val="21"/>
+        </w:rPr>
+        <w:t xml:space="preserve">Esperou uma hora e quarenta minutos.</w:t>
+      </w:r>
+    </w:p>
+    <w:p>
+      <w:pPr>
+        <w:spacing w:after="0" w:line="312"/>
+        <w:ind w:firstLine="340"/>
+        <w:jc w:val="both"/>
+      </w:pPr>
+      <w:r>
+        <w:rPr>
+          <w:rFonts w:ascii="Georgia" w:cs="Georgia" w:eastAsia="Georgia" w:hAnsi="Georgia"/>
+          <w:sz w:val="21"/>
+          <w:szCs w:val="21"/>
+        </w:rPr>
+        <w:t xml:space="preserve">Comeu metade de um pacote de amendoim que estava no porta-luvas havia meses, mastigando devagar, sem gosto nenhum. Pensou em ir embora quatro vezes. Pensou em tocar a campainha duas. Não fez nem uma coisa nem outra.</w:t>
+      </w:r>
+    </w:p>
+    <w:p>
+      <w:pPr>
+        <w:spacing w:after="0" w:line="312"/>
+        <w:ind w:firstLine="340"/>
+        <w:jc w:val="both"/>
+      </w:pPr>
+      <w:r>
+        <w:rPr>
+          <w:rFonts w:ascii="Georgia" w:cs="Georgia" w:eastAsia="Georgia" w:hAnsi="Georgia"/>
+          <w:sz w:val="21"/>
+          <w:szCs w:val="21"/>
+        </w:rPr>
+        <w:t xml:space="preserve">Às nove menos dez, a porta se abriu. Lia saiu primeiro, depois Carlos. Sílvia apareceu na janela da sala, entre as cortinas, e acenou. Era a primeira vez em anos que Lucas via aquela janela aberta.</w:t>
+      </w:r>
+    </w:p>
+    <w:p>
+      <w:pPr>
+        <w:spacing w:after="0" w:line="312"/>
+        <w:ind w:firstLine="340"/>
+        <w:jc w:val="both"/>
+      </w:pPr>
+      <w:r>
+        <w:rPr>
+          <w:rFonts w:ascii="Georgia" w:cs="Georgia" w:eastAsia="Georgia" w:hAnsi="Georgia"/>
+          <w:sz w:val="21"/>
+          <w:szCs w:val="21"/>
+        </w:rPr>
+        <w:t xml:space="preserve">No portão, Lia tirou da bolsa um envelope pardo, grosso, e o entregou a Carlos. Carlos olhou para dentro, fechou de novo e disse alguma coisa que Lucas não ouviu. Lia segurou o rosto do irmão com as duas mãos, do jeito que o pai fazia com os filhos quando eles eram pequenos, e falou com ele por um tempo, de perto. Carlos assentiu várias vezes.</w:t>
+      </w:r>
+    </w:p>
+    <w:p>
+      <w:pPr>
+        <w:spacing w:after="0" w:line="312"/>
+        <w:ind w:firstLine="340"/>
+        <w:jc w:val="both"/>
+      </w:pPr>
+      <w:r>
+        <w:rPr>
+          <w:rFonts w:ascii="Georgia" w:cs="Georgia" w:eastAsia="Georgia" w:hAnsi="Georgia"/>
+          <w:sz w:val="21"/>
+          <w:szCs w:val="21"/>
+        </w:rPr>
+        <w:t xml:space="preserve">Depois ela entrou no carro e foi embora. Carlos ficou no portão, com o envelope na mão, olhando para a rua escura. Por um segundo, Lucas teve certeza de que o meio-irmão estava olhando direto para ele, sob a árvore das flores roxas. Prendeu a respiração.</w:t>
+      </w:r>
+    </w:p>
+    <w:p>
+      <w:pPr>
+        <w:spacing w:after="0" w:line="312"/>
+        <w:ind w:firstLine="340"/>
+        <w:jc w:val="both"/>
+      </w:pPr>
+      <w:r>
+        <w:rPr>
+          <w:rFonts w:ascii="Georgia" w:cs="Georgia" w:eastAsia="Georgia" w:hAnsi="Georgia"/>
+          <w:sz w:val="21"/>
+          <w:szCs w:val="21"/>
+        </w:rPr>
+        <w:t xml:space="preserve">Carlos virou as costas e entrou.</w:t>
+      </w:r>
+    </w:p>
+    <w:p>
+      <w:pPr>
+        <w:spacing w:after="200" w:before="200"/>
+        <w:jc w:val="center"/>
+      </w:pPr>
+      <w:r>
+        <w:rPr>
+          <w:rFonts w:ascii="Georgia" w:cs="Georgia" w:eastAsia="Georgia" w:hAnsi="Georgia"/>
+          <w:sz w:val="22"/>
+          <w:szCs w:val="22"/>
+        </w:rPr>
+        <w:t xml:space="preserve">*</w:t>
+      </w:r>
+    </w:p>
+    <w:p>
+      <w:pPr>
+        <w:spacing w:after="0" w:line="312"/>
+        <w:ind w:firstLine="340"/>
+        <w:jc w:val="both"/>
+      </w:pPr>
+      <w:r>
+        <w:rPr>
+          <w:rFonts w:ascii="Georgia" w:cs="Georgia" w:eastAsia="Georgia" w:hAnsi="Georgia"/>
+          <w:sz w:val="21"/>
+          <w:szCs w:val="21"/>
+        </w:rPr>
+        <w:t xml:space="preserve">Na quarta-feira de manhã, Lucas foi ao escritório do doutor Mauro Bittencourt, na Paulista.</w:t>
+      </w:r>
+    </w:p>
+    <w:p>
+      <w:pPr>
+        <w:spacing w:after="0" w:line="312"/>
+        <w:ind w:firstLine="340"/>
+        <w:jc w:val="both"/>
+      </w:pPr>
+      <w:r>
+        <w:rPr>
+          <w:rFonts w:ascii="Georgia" w:cs="Georgia" w:eastAsia="Georgia" w:hAnsi="Georgia"/>
+          <w:sz w:val="21"/>
+          <w:szCs w:val="21"/>
+        </w:rPr>
+        <w:t xml:space="preserve">Disse que tinha dúvidas sobre a transferência das quotas da corretora. Era verdade. O advogado o recebeu com o mesmo ar paciente da leitura do testamento e respondeu às dúvidas uma a uma, com calma, enquanto tomava um chá de uma xícara de porcelana, aos golinhos.</w:t>
+      </w:r>
+    </w:p>
+    <w:p>
+      <w:pPr>
+        <w:spacing w:after="0" w:line="312"/>
+        <w:ind w:firstLine="340"/>
+        <w:jc w:val="both"/>
+      </w:pPr>
+      <w:r>
+        <w:rPr>
+          <w:rFonts w:ascii="Georgia" w:cs="Georgia" w:eastAsia="Georgia" w:hAnsi="Georgia"/>
+          <w:sz w:val="21"/>
+          <w:szCs w:val="21"/>
+        </w:rPr>
+        <w:t xml:space="preserve">No fim, Lucas perguntou, como quem não quer nada:</w:t>
+      </w:r>
+    </w:p>
+    <w:p>
+      <w:pPr>
+        <w:spacing w:after="0" w:line="312"/>
+        <w:ind w:firstLine="340"/>
+        <w:jc w:val="both"/>
+      </w:pPr>
+      <w:r>
+        <w:rPr>
+          <w:rFonts w:ascii="Georgia" w:cs="Georgia" w:eastAsia="Georgia" w:hAnsi="Georgia"/>
+          <w:sz w:val="21"/>
+          <w:szCs w:val="21"/>
+        </w:rPr>
+        <w:t xml:space="preserve">— Algum dos meus irmãos já procurou o senhor depois da leitura?</w:t>
+      </w:r>
+    </w:p>
+    <w:p>
+      <w:pPr>
+        <w:spacing w:after="0" w:line="312"/>
+        <w:ind w:firstLine="340"/>
+        <w:jc w:val="both"/>
+      </w:pPr>
+      <w:r>
+        <w:rPr>
+          <w:rFonts w:ascii="Georgia" w:cs="Georgia" w:eastAsia="Georgia" w:hAnsi="Georgia"/>
+          <w:sz w:val="21"/>
+          <w:szCs w:val="21"/>
+        </w:rPr>
+        <w:t xml:space="preserve">O doutor Mauro pousou a xícara.</w:t>
+      </w:r>
+    </w:p>
+    <w:p>
+      <w:pPr>
+        <w:spacing w:after="0" w:line="312"/>
+        <w:ind w:firstLine="340"/>
+        <w:jc w:val="both"/>
+      </w:pPr>
+      <w:r>
+        <w:rPr>
+          <w:rFonts w:ascii="Georgia" w:cs="Georgia" w:eastAsia="Georgia" w:hAnsi="Georgia"/>
+          <w:sz w:val="21"/>
+          <w:szCs w:val="21"/>
+        </w:rPr>
+        <w:t xml:space="preserve">— A sua irmã me ligou na segunda.</w:t>
+      </w:r>
+    </w:p>
+    <w:p>
+      <w:pPr>
+        <w:spacing w:after="0" w:line="312"/>
+        <w:ind w:firstLine="340"/>
+        <w:jc w:val="both"/>
+      </w:pPr>
+      <w:r>
+        <w:rPr>
+          <w:rFonts w:ascii="Georgia" w:cs="Georgia" w:eastAsia="Georgia" w:hAnsi="Georgia"/>
+          <w:sz w:val="21"/>
+          <w:szCs w:val="21"/>
+        </w:rPr>
+        <w:t xml:space="preserve">— A Lia?</w:t>
+      </w:r>
+    </w:p>
+    <w:p>
+      <w:pPr>
+        <w:spacing w:after="0" w:line="312"/>
+        <w:ind w:firstLine="340"/>
+        <w:jc w:val="both"/>
+      </w:pPr>
+      <w:r>
+        <w:rPr>
+          <w:rFonts w:ascii="Georgia" w:cs="Georgia" w:eastAsia="Georgia" w:hAnsi="Georgia"/>
+          <w:sz w:val="21"/>
+          <w:szCs w:val="21"/>
+        </w:rPr>
+        <w:t xml:space="preserve">— Ela queria saber se a parte dela e a do Carlos, os dois imóveis e a aplicação, podiam ser reunidas numa coisa só. Uma empresa, um fundo, alguma estrutura em que os dois decidissem juntos. — O advogado deu de ombros. — É possível, claro. Eu disse que podíamos conversar. Ela disse que ia falar com o irmão antes.</w:t>
+      </w:r>
+    </w:p>
+    <w:p>
+      <w:pPr>
+        <w:spacing w:after="0" w:line="312"/>
+        <w:ind w:firstLine="340"/>
+        <w:jc w:val="both"/>
+      </w:pPr>
+      <w:r>
+        <w:rPr>
+          <w:rFonts w:ascii="Georgia" w:cs="Georgia" w:eastAsia="Georgia" w:hAnsi="Georgia"/>
+          <w:sz w:val="21"/>
+          <w:szCs w:val="21"/>
+        </w:rPr>
+        <w:t xml:space="preserve">Lucas sentiu o rosto esquentar.</w:t>
+      </w:r>
+    </w:p>
+    <w:p>
+      <w:pPr>
+        <w:spacing w:after="0" w:line="312"/>
+        <w:ind w:firstLine="340"/>
+        <w:jc w:val="both"/>
+      </w:pPr>
+      <w:r>
+        <w:rPr>
+          <w:rFonts w:ascii="Georgia" w:cs="Georgia" w:eastAsia="Georgia" w:hAnsi="Georgia"/>
+          <w:sz w:val="21"/>
+          <w:szCs w:val="21"/>
+        </w:rPr>
+        <w:t xml:space="preserve">Um envelope pardo no portão de Perdizes. A parte de Lia e a de Carlos reunidas numa coisa só, em que os dois decidissem juntos. Os filhos de Sílvia de um lado. Ele, o filho de Marta, do outro, com cinquenta e um por cento de uma corretora e a fama de herdeiro.</w:t>
+      </w:r>
+    </w:p>
+    <w:p>
+      <w:pPr>
+        <w:spacing w:after="0" w:line="312"/>
+        <w:ind w:firstLine="340"/>
+        <w:jc w:val="both"/>
+      </w:pPr>
+      <w:r>
+        <w:rPr>
+          <w:rFonts w:ascii="Georgia" w:cs="Georgia" w:eastAsia="Georgia" w:hAnsi="Georgia"/>
+          <w:sz w:val="21"/>
+          <w:szCs w:val="21"/>
+        </w:rPr>
+        <w:t xml:space="preserve">— Ela disse para quê?</w:t>
+      </w:r>
+    </w:p>
+    <w:p>
+      <w:pPr>
+        <w:spacing w:after="0" w:line="312"/>
+        <w:ind w:firstLine="340"/>
+        <w:jc w:val="both"/>
+      </w:pPr>
+      <w:r>
+        <w:rPr>
+          <w:rFonts w:ascii="Georgia" w:cs="Georgia" w:eastAsia="Georgia" w:hAnsi="Georgia"/>
+          <w:sz w:val="21"/>
+          <w:szCs w:val="21"/>
+        </w:rPr>
+        <w:t xml:space="preserve">— Não. E eu não perguntei. — O doutor Mauro o olhou por cima dos óculos. — Família costuma ter os seus motivos, senhor Lucas. Nem sempre são os que a gente imagina.</w:t>
+      </w:r>
+    </w:p>
+    <w:p>
+      <w:pPr>
+        <w:spacing w:after="200" w:before="200"/>
+        <w:jc w:val="center"/>
+      </w:pPr>
+      <w:r>
+        <w:rPr>
+          <w:rFonts w:ascii="Georgia" w:cs="Georgia" w:eastAsia="Georgia" w:hAnsi="Georgia"/>
+          <w:sz w:val="22"/>
+          <w:szCs w:val="22"/>
+        </w:rPr>
+        <w:t xml:space="preserve">*</w:t>
+      </w:r>
+    </w:p>
+    <w:p>
+      <w:pPr>
+        <w:spacing w:after="0" w:line="312"/>
+        <w:ind w:firstLine="340"/>
+        <w:jc w:val="both"/>
+      </w:pPr>
+      <w:r>
+        <w:rPr>
+          <w:rFonts w:ascii="Georgia" w:cs="Georgia" w:eastAsia="Georgia" w:hAnsi="Georgia"/>
+          <w:sz w:val="21"/>
+          <w:szCs w:val="21"/>
+        </w:rPr>
+        <w:t xml:space="preserve">Lucas já estava na porta quando o advogado o chamou de volta.</w:t>
+      </w:r>
+    </w:p>
+    <w:p>
+      <w:pPr>
+        <w:spacing w:after="0" w:line="312"/>
+        <w:ind w:firstLine="340"/>
+        <w:jc w:val="both"/>
+      </w:pPr>
+      <w:r>
+        <w:rPr>
+          <w:rFonts w:ascii="Georgia" w:cs="Georgia" w:eastAsia="Georgia" w:hAnsi="Georgia"/>
+          <w:sz w:val="21"/>
+          <w:szCs w:val="21"/>
+        </w:rPr>
+        <w:t xml:space="preserve">— Ah, uma coisa que eu ia esquecendo, e que talvez seja útil para a corretora. — O doutor Mauro procurou um papel na mesa. — Em agosto, o seu pai me pediu para reconhecer a firma dele num documento. Não era o testamento. Era outra coisa, que ele mesmo redigiu e não quis me mostrar. Disse que era um assunto particular, que ia ficar guardado com uma pessoa de confiança, fora do escritório.</w:t>
+      </w:r>
+    </w:p>
+    <w:p>
+      <w:pPr>
+        <w:spacing w:after="0" w:line="312"/>
+        <w:ind w:firstLine="340"/>
+        <w:jc w:val="both"/>
+      </w:pPr>
+      <w:r>
+        <w:rPr>
+          <w:rFonts w:ascii="Georgia" w:cs="Georgia" w:eastAsia="Georgia" w:hAnsi="Georgia"/>
+          <w:sz w:val="21"/>
+          <w:szCs w:val="21"/>
+        </w:rPr>
+        <w:t xml:space="preserve">— Que pessoa?</w:t>
+      </w:r>
+    </w:p>
+    <w:p>
+      <w:pPr>
+        <w:spacing w:after="0" w:line="312"/>
+        <w:ind w:firstLine="340"/>
+        <w:jc w:val="both"/>
+      </w:pPr>
+      <w:r>
+        <w:rPr>
+          <w:rFonts w:ascii="Georgia" w:cs="Georgia" w:eastAsia="Georgia" w:hAnsi="Georgia"/>
+          <w:sz w:val="21"/>
+          <w:szCs w:val="21"/>
+        </w:rPr>
+        <w:t xml:space="preserve">— Ele não disse. E eu não tenho cópia. — O advogado ajeitou os óculos. — Só sei que era um documento curto, de duas páginas. E que ele assinou com uma caneta tinteiro que eu nunca tinha visto com ele, como quem assina uma coisa importante.</w:t>
+      </w:r>
+    </w:p>
+    <w:p>
+      <w:pPr>
+        <w:spacing w:after="0" w:line="312"/>
+        <w:ind w:firstLine="340"/>
+        <w:jc w:val="both"/>
+      </w:pPr>
+      <w:r>
+        <w:rPr>
+          <w:rFonts w:ascii="Georgia" w:cs="Georgia" w:eastAsia="Georgia" w:hAnsi="Georgia"/>
+          <w:sz w:val="21"/>
+          <w:szCs w:val="21"/>
+        </w:rPr>
+        <w:t xml:space="preserve">Lucas desceu os catorze andares pela escada, sem pressa nenhuma, só para ter tempo de pensar.</w:t>
+      </w:r>
+    </w:p>
+    <w:p>
+      <w:pPr>
+        <w:spacing w:after="0" w:line="312"/>
+        <w:ind w:firstLine="340"/>
+        <w:jc w:val="both"/>
+      </w:pPr>
+      <w:r>
+        <w:rPr>
+          <w:rFonts w:ascii="Georgia" w:cs="Georgia" w:eastAsia="Georgia" w:hAnsi="Georgia"/>
+          <w:sz w:val="21"/>
+          <w:szCs w:val="21"/>
+        </w:rPr>
+        <w:t xml:space="preserve">Um documento de agosto, fora do testamento, guardado com uma pessoa de confiança. Se eu ainda puder. Eu não vou estar aqui para cobrar. Os sinais estavam todos ali, espalhados, como as peças de um quebra-cabeça que alguém tinha derrubado no chão e ninguém ainda tinha montado.</w:t>
+      </w:r>
+    </w:p>
+    <w:p>
+      <w:pPr>
+        <w:spacing w:after="0" w:line="312"/>
+        <w:ind w:firstLine="340"/>
+        <w:jc w:val="both"/>
+      </w:pPr>
+      <w:r>
+        <w:rPr>
+          <w:rFonts w:ascii="Georgia" w:cs="Georgia" w:eastAsia="Georgia" w:hAnsi="Georgia"/>
+          <w:sz w:val="21"/>
+          <w:szCs w:val="21"/>
+        </w:rPr>
+        <w:t xml:space="preserve">Mas, naquela manhã, Lucas só conseguia pensar numa peça. A irmã segurando o rosto de Carlos com as duas mãos, no portão de Perdizes, e um envelope pardo mudando de mão.</w:t>
+      </w:r>
+    </w:p>
+    <w:p>
+      <w:pPr>
+        <w:spacing w:after="0" w:line="312"/>
+        <w:ind w:firstLine="340"/>
+        <w:jc w:val="both"/>
+      </w:pPr>
+      <w:r>
+        <w:rPr>
+          <w:rFonts w:ascii="Georgia" w:cs="Georgia" w:eastAsia="Georgia" w:hAnsi="Georgia"/>
+          <w:sz w:val="21"/>
+          <w:szCs w:val="21"/>
+        </w:rPr>
+        <w:t xml:space="preserve">Em casa, à noite, tirou da gaveta a folha da tabela, a da linha riscada até rasgar. Pegou uma caneta e, embaixo de todos os nomes, escreveu mais dois.</w:t>
+      </w:r>
+    </w:p>
+    <w:p>
+      <w:pPr>
+        <w:spacing w:after="0" w:line="312"/>
+        <w:ind w:firstLine="340"/>
+        <w:jc w:val="both"/>
+      </w:pPr>
+      <w:r>
+        <w:rPr>
+          <w:rFonts w:ascii="Georgia" w:cs="Georgia" w:eastAsia="Georgia" w:hAnsi="Georgia"/>
+          <w:sz w:val="21"/>
+          <w:szCs w:val="21"/>
+        </w:rPr>
+        <w:t xml:space="preserve">Lia e Carlos. Juntos?</w:t>
+      </w:r>
+    </w:p>
+    <w:p>
+      <w:pPr>
+        <w:spacing w:after="0" w:line="312"/>
+        <w:ind w:firstLine="340"/>
+        <w:jc w:val="both"/>
+      </w:pPr>
+      <w:r>
+        <w:rPr>
+          <w:rFonts w:ascii="Georgia" w:cs="Georgia" w:eastAsia="Georgia" w:hAnsi="Georgia"/>
+          <w:sz w:val="21"/>
+          <w:szCs w:val="21"/>
+        </w:rPr>
+        <w:t xml:space="preserve">Depois guardou a folha e não disse nada a ninguém.</w:t>
       </w:r>
     </w:p>
     <w:sectPr>

</xml_diff>

<commit_message>
Livro policial: capítulo 23 (Um lugar com neve)
Co-Authored-By: Claude Opus 5.5 <noreply@anthropic.com>
Claude-Session: https://claude.ai/code/session_01BrurxSYygRC3rRhaUYosm1
</commit_message>
<xml_diff>
--- a/docs/livro-policial/TODO_CRIME_TEM_UM_AUTOR.docx
+++ b/docs/livro-policial/TODO_CRIME_TEM_UM_AUTOR.docx
@@ -23417,6 +23417,1192 @@
           <w:szCs w:val="21"/>
         </w:rPr>
         <w:t xml:space="preserve">Depois guardou a folha e não disse nada a ninguém.</w:t>
+      </w:r>
+    </w:p>
+    <w:p>
+      <w:pPr>
+        <w:pageBreakBefore/>
+        <w:spacing w:after="120" w:before="1800"/>
+        <w:jc w:val="center"/>
+      </w:pPr>
+      <w:r>
+        <w:rPr>
+          <w:rFonts w:ascii="Georgia" w:cs="Georgia" w:eastAsia="Georgia" w:hAnsi="Georgia"/>
+          <w:spacing w:val="40"/>
+          <w:sz w:val="20"/>
+          <w:szCs w:val="20"/>
+        </w:rPr>
+        <w:t xml:space="preserve">CAPÍTULO 23</w:t>
+      </w:r>
+    </w:p>
+    <w:p>
+      <w:pPr>
+        <w:spacing w:after="720"/>
+        <w:jc w:val="center"/>
+      </w:pPr>
+      <w:r>
+        <w:rPr>
+          <w:rFonts w:ascii="Georgia" w:cs="Georgia" w:eastAsia="Georgia" w:hAnsi="Georgia"/>
+          <w:b/>
+          <w:bCs/>
+          <w:sz w:val="32"/>
+          <w:szCs w:val="32"/>
+        </w:rPr>
+        <w:t xml:space="preserve">Um lugar com neve</w:t>
+      </w:r>
+    </w:p>
+    <w:p>
+      <w:pPr>
+        <w:spacing w:after="0" w:line="312"/>
+        <w:ind w:firstLine="340"/>
+        <w:jc w:val="both"/>
+      </w:pPr>
+      <w:r>
+        <w:rPr>
+          <w:rFonts w:ascii="Georgia" w:cs="Georgia" w:eastAsia="Georgia" w:hAnsi="Georgia"/>
+          <w:sz w:val="21"/>
+          <w:szCs w:val="21"/>
+        </w:rPr>
+        <w:t xml:space="preserve">Marta morava sozinha num apartamento antigo de Higienópolis, de pé-direito alto e tacos de madeira que rangiam, com uma estante que ia do chão ao teto e um gato cinzento que se chamava Freud.</w:t>
+      </w:r>
+    </w:p>
+    <w:p>
+      <w:pPr>
+        <w:spacing w:after="0" w:line="312"/>
+        <w:ind w:firstLine="340"/>
+        <w:jc w:val="both"/>
+      </w:pPr>
+      <w:r>
+        <w:rPr>
+          <w:rFonts w:ascii="Georgia" w:cs="Georgia" w:eastAsia="Georgia" w:hAnsi="Georgia"/>
+          <w:sz w:val="21"/>
+          <w:szCs w:val="21"/>
+        </w:rPr>
+        <w:t xml:space="preserve">Lia nunca tinha estado ali. Em quase trinta anos, as duas tinham trocado talvez cem palavras, quase todas em aniversários de Lucas e em velórios. Marta era a primeira mulher do pai. Sílvia, a segunda. Entre as duas, havia uma cordialidade gelada que as crianças aprenderam cedo a não atravessar.</w:t>
+      </w:r>
+    </w:p>
+    <w:p>
+      <w:pPr>
+        <w:spacing w:after="0" w:line="312"/>
+        <w:ind w:firstLine="340"/>
+        <w:jc w:val="both"/>
+      </w:pPr>
+      <w:r>
+        <w:rPr>
+          <w:rFonts w:ascii="Georgia" w:cs="Georgia" w:eastAsia="Georgia" w:hAnsi="Georgia"/>
+          <w:sz w:val="21"/>
+          <w:szCs w:val="21"/>
+        </w:rPr>
+        <w:t xml:space="preserve">Mas, naquela quinta-feira, foi Marta quem ligou.</w:t>
+      </w:r>
+    </w:p>
+    <w:p>
+      <w:pPr>
+        <w:spacing w:after="0" w:line="312"/>
+        <w:ind w:firstLine="340"/>
+        <w:jc w:val="both"/>
+      </w:pPr>
+      <w:r>
+        <w:rPr>
+          <w:rFonts w:ascii="Georgia" w:cs="Georgia" w:eastAsia="Georgia" w:hAnsi="Georgia"/>
+          <w:sz w:val="21"/>
+          <w:szCs w:val="21"/>
+        </w:rPr>
+        <w:t xml:space="preserve">— O Lucas me contou que vocês estão investigando — disse, sem rodeios, quando Lia chegou. — E me contou que vocês dois não estão se falando direito. Senta. Aceita um café?</w:t>
+      </w:r>
+    </w:p>
+    <w:p>
+      <w:pPr>
+        <w:spacing w:after="0" w:line="312"/>
+        <w:ind w:firstLine="340"/>
+        <w:jc w:val="both"/>
+      </w:pPr>
+      <w:r>
+        <w:rPr>
+          <w:rFonts w:ascii="Georgia" w:cs="Georgia" w:eastAsia="Georgia" w:hAnsi="Georgia"/>
+          <w:sz w:val="21"/>
+          <w:szCs w:val="21"/>
+        </w:rPr>
+        <w:t xml:space="preserve">Lia aceitou. Marta serviu em xícaras finas, de porcelana com borda dourada, e bebeu o dela de pé, em dois goles, encostada na janela.</w:t>
+      </w:r>
+    </w:p>
+    <w:p>
+      <w:pPr>
+        <w:spacing w:after="0" w:line="312"/>
+        <w:ind w:firstLine="340"/>
+        <w:jc w:val="both"/>
+      </w:pPr>
+      <w:r>
+        <w:rPr>
+          <w:rFonts w:ascii="Georgia" w:cs="Georgia" w:eastAsia="Georgia" w:hAnsi="Georgia"/>
+          <w:sz w:val="21"/>
+          <w:szCs w:val="21"/>
+        </w:rPr>
+        <w:t xml:space="preserve">— Eu vou dizer uma coisa que o Lucas nunca vai te dizer, porque ele é orgulhoso como o pai — disse. — E depois você faz com isso o que quiser.</w:t>
+      </w:r>
+    </w:p>
+    <w:p>
+      <w:pPr>
+        <w:spacing w:after="200" w:before="200"/>
+        <w:jc w:val="center"/>
+      </w:pPr>
+      <w:r>
+        <w:rPr>
+          <w:rFonts w:ascii="Georgia" w:cs="Georgia" w:eastAsia="Georgia" w:hAnsi="Georgia"/>
+          <w:sz w:val="22"/>
+          <w:szCs w:val="22"/>
+        </w:rPr>
+        <w:t xml:space="preserve">*</w:t>
+      </w:r>
+    </w:p>
+    <w:p>
+      <w:pPr>
+        <w:spacing w:after="0" w:line="312"/>
+        <w:ind w:firstLine="340"/>
+        <w:jc w:val="both"/>
+      </w:pPr>
+      <w:r>
+        <w:rPr>
+          <w:rFonts w:ascii="Georgia" w:cs="Georgia" w:eastAsia="Georgia" w:hAnsi="Georgia"/>
+          <w:sz w:val="21"/>
+          <w:szCs w:val="21"/>
+        </w:rPr>
+        <w:t xml:space="preserve">— Ele brigou com o Henrique — continuou Marta. — Umas três semanas antes de tudo. Você sabe disso?</w:t>
+      </w:r>
+    </w:p>
+    <w:p>
+      <w:pPr>
+        <w:spacing w:after="0" w:line="312"/>
+        <w:ind w:firstLine="340"/>
+        <w:jc w:val="both"/>
+      </w:pPr>
+      <w:r>
+        <w:rPr>
+          <w:rFonts w:ascii="Georgia" w:cs="Georgia" w:eastAsia="Georgia" w:hAnsi="Georgia"/>
+          <w:sz w:val="21"/>
+          <w:szCs w:val="21"/>
+        </w:rPr>
+        <w:t xml:space="preserve">Lia demorou a responder.</w:t>
+      </w:r>
+    </w:p>
+    <w:p>
+      <w:pPr>
+        <w:spacing w:after="0" w:line="312"/>
+        <w:ind w:firstLine="340"/>
+        <w:jc w:val="both"/>
+      </w:pPr>
+      <w:r>
+        <w:rPr>
+          <w:rFonts w:ascii="Georgia" w:cs="Georgia" w:eastAsia="Georgia" w:hAnsi="Georgia"/>
+          <w:sz w:val="21"/>
+          <w:szCs w:val="21"/>
+        </w:rPr>
+        <w:t xml:space="preserve">— Sei que brigaram. Não sei por quê.</w:t>
+      </w:r>
+    </w:p>
+    <w:p>
+      <w:pPr>
+        <w:spacing w:after="0" w:line="312"/>
+        <w:ind w:firstLine="340"/>
+        <w:jc w:val="both"/>
+      </w:pPr>
+      <w:r>
+        <w:rPr>
+          <w:rFonts w:ascii="Georgia" w:cs="Georgia" w:eastAsia="Georgia" w:hAnsi="Georgia"/>
+          <w:sz w:val="21"/>
+          <w:szCs w:val="21"/>
+        </w:rPr>
+        <w:t xml:space="preserve">— Por causa da corretora. O Henrique cismou que o Lucas tinha de entrar na empresa. Não daqui a cinco anos. Naquela semana. Insistiu, insistiu, até o Lucas perder a paciência e dizer coisas que eu nunca ouvi o meu filho dizer a ninguém. — Marta pousou a xícara no parapeito. — Ele veio aqui na mesma madrugada. Sentou nesse sofá onde você está e chorou como não chorava desde os dez anos. Dizia que o pai nunca tinha acreditado nele. Que ele só queria fazer alguma coisa sozinho, sem o sobrenome na porta. Que não queria a corretora, não queria o dinheiro, não queria ficar ao lado daquele Otávio, que ele achava que roubava o pai havia anos.</w:t>
+      </w:r>
+    </w:p>
+    <w:p>
+      <w:pPr>
+        <w:spacing w:after="0" w:line="312"/>
+        <w:ind w:firstLine="340"/>
+        <w:jc w:val="both"/>
+      </w:pPr>
+      <w:r>
+        <w:rPr>
+          <w:rFonts w:ascii="Georgia" w:cs="Georgia" w:eastAsia="Georgia" w:hAnsi="Georgia"/>
+          <w:sz w:val="21"/>
+          <w:szCs w:val="21"/>
+        </w:rPr>
+        <w:t xml:space="preserve">Lia sentiu o rosto esquentar.</w:t>
+      </w:r>
+    </w:p>
+    <w:p>
+      <w:pPr>
+        <w:spacing w:after="0" w:line="312"/>
+        <w:ind w:firstLine="340"/>
+        <w:jc w:val="both"/>
+      </w:pPr>
+      <w:r>
+        <w:rPr>
+          <w:rFonts w:ascii="Georgia" w:cs="Georgia" w:eastAsia="Georgia" w:hAnsi="Georgia"/>
+          <w:sz w:val="21"/>
+          <w:szCs w:val="21"/>
+        </w:rPr>
+        <w:t xml:space="preserve">— E depois?</w:t>
+      </w:r>
+    </w:p>
+    <w:p>
+      <w:pPr>
+        <w:spacing w:after="0" w:line="312"/>
+        <w:ind w:firstLine="340"/>
+        <w:jc w:val="both"/>
+      </w:pPr>
+      <w:r>
+        <w:rPr>
+          <w:rFonts w:ascii="Georgia" w:cs="Georgia" w:eastAsia="Georgia" w:hAnsi="Georgia"/>
+          <w:sz w:val="21"/>
+          <w:szCs w:val="21"/>
+        </w:rPr>
+        <w:t xml:space="preserve">— Depois o Henrique morreu. E o Lucas herdou a corretora inteira, que ele nunca quis, com uma nota escrita à mão dizendo que era o único que o pai queria. — Marta olhou para ela. — Você sabe o que é isso para um filho? Ganhar exatamente o que você recusou, de presente, de alguém que já não pode ouvir você pedir desculpas?</w:t>
+      </w:r>
+    </w:p>
+    <w:p>
+      <w:pPr>
+        <w:spacing w:after="0" w:line="312"/>
+        <w:ind w:firstLine="340"/>
+        <w:jc w:val="both"/>
+      </w:pPr>
+      <w:r>
+        <w:rPr>
+          <w:rFonts w:ascii="Georgia" w:cs="Georgia" w:eastAsia="Georgia" w:hAnsi="Georgia"/>
+          <w:sz w:val="21"/>
+          <w:szCs w:val="21"/>
+        </w:rPr>
+        <w:t xml:space="preserve">Lia baixou os olhos para a xícara. O café estava amargo e forte, e ela bebeu até o fim, porque precisava fazer alguma coisa com as mãos.</w:t>
+      </w:r>
+    </w:p>
+    <w:p>
+      <w:pPr>
+        <w:spacing w:after="0" w:line="312"/>
+        <w:ind w:firstLine="340"/>
+        <w:jc w:val="both"/>
+      </w:pPr>
+      <w:r>
+        <w:rPr>
+          <w:rFonts w:ascii="Georgia" w:cs="Georgia" w:eastAsia="Georgia" w:hAnsi="Georgia"/>
+          <w:sz w:val="21"/>
+          <w:szCs w:val="21"/>
+        </w:rPr>
+        <w:t xml:space="preserve">— Ele apagou a conversa — disse, quase sem voz. — A briga. Do celular do pai.</w:t>
+      </w:r>
+    </w:p>
+    <w:p>
+      <w:pPr>
+        <w:spacing w:after="0" w:line="312"/>
+        <w:ind w:firstLine="340"/>
+        <w:jc w:val="both"/>
+      </w:pPr>
+      <w:r>
+        <w:rPr>
+          <w:rFonts w:ascii="Georgia" w:cs="Georgia" w:eastAsia="Georgia" w:hAnsi="Georgia"/>
+          <w:sz w:val="21"/>
+          <w:szCs w:val="21"/>
+        </w:rPr>
+        <w:t xml:space="preserve">— Eu sei. Ele me contou. Disse que não aguentava a ideia de alguém ler o que ele escreveu às duas da manhã. — Marta sorriu de leve, triste. — Vergonha, Lia. Só isso. O meu filho tem muitos defeitos. Mentir para esconder um crime não é um deles. Mentir para esconder uma vergonha, sim. Como o pai.</w:t>
+      </w:r>
+    </w:p>
+    <w:p>
+      <w:pPr>
+        <w:spacing w:after="200" w:before="200"/>
+        <w:jc w:val="center"/>
+      </w:pPr>
+      <w:r>
+        <w:rPr>
+          <w:rFonts w:ascii="Georgia" w:cs="Georgia" w:eastAsia="Georgia" w:hAnsi="Georgia"/>
+          <w:sz w:val="22"/>
+          <w:szCs w:val="22"/>
+        </w:rPr>
+        <w:t xml:space="preserve">*</w:t>
+      </w:r>
+    </w:p>
+    <w:p>
+      <w:pPr>
+        <w:spacing w:after="0" w:line="312"/>
+        <w:ind w:firstLine="340"/>
+        <w:jc w:val="both"/>
+      </w:pPr>
+      <w:r>
+        <w:rPr>
+          <w:rFonts w:ascii="Georgia" w:cs="Georgia" w:eastAsia="Georgia" w:hAnsi="Georgia"/>
+          <w:sz w:val="21"/>
+          <w:szCs w:val="21"/>
+        </w:rPr>
+        <w:t xml:space="preserve">Ficaram em silêncio. Freud, o gato, pulou no braço do sofá e se deitou ao lado de Lia, como se a conhecesse.</w:t>
+      </w:r>
+    </w:p>
+    <w:p>
+      <w:pPr>
+        <w:spacing w:after="0" w:line="312"/>
+        <w:ind w:firstLine="340"/>
+        <w:jc w:val="both"/>
+      </w:pPr>
+      <w:r>
+        <w:rPr>
+          <w:rFonts w:ascii="Georgia" w:cs="Georgia" w:eastAsia="Georgia" w:hAnsi="Georgia"/>
+          <w:sz w:val="21"/>
+          <w:szCs w:val="21"/>
+        </w:rPr>
+        <w:t xml:space="preserve">— A senhora o odiava? — perguntou Lia, sem pensar. — O meu pai?</w:t>
+      </w:r>
+    </w:p>
+    <w:p>
+      <w:pPr>
+        <w:spacing w:after="0" w:line="312"/>
+        <w:ind w:firstLine="340"/>
+        <w:jc w:val="both"/>
+      </w:pPr>
+      <w:r>
+        <w:rPr>
+          <w:rFonts w:ascii="Georgia" w:cs="Georgia" w:eastAsia="Georgia" w:hAnsi="Georgia"/>
+          <w:sz w:val="21"/>
+          <w:szCs w:val="21"/>
+        </w:rPr>
+        <w:t xml:space="preserve">Marta riu, um riso curto e seco.</w:t>
+      </w:r>
+    </w:p>
+    <w:p>
+      <w:pPr>
+        <w:spacing w:after="0" w:line="312"/>
+        <w:ind w:firstLine="340"/>
+        <w:jc w:val="both"/>
+      </w:pPr>
+      <w:r>
+        <w:rPr>
+          <w:rFonts w:ascii="Georgia" w:cs="Georgia" w:eastAsia="Georgia" w:hAnsi="Georgia"/>
+          <w:sz w:val="21"/>
+          <w:szCs w:val="21"/>
+        </w:rPr>
+        <w:t xml:space="preserve">— Durante muitos anos. Depois cansei. Ódio dá muito trabalho, e eu tinha um filho para criar. — Ela se sentou na poltrona em frente. — O Henrique era um homem difícil. Frio, mandão, incapaz de pedir desculpas. Mas não era só isso. Quando eu o conheci, ele tinha vinte e quatro anos e era o rapaz mais engraçado de São Paulo. Contava piada de tudo. Escrevia bilhetes. Tinha mania de senhas, de códigos, de coisas secretas, como um menino.</w:t>
+      </w:r>
+    </w:p>
+    <w:p>
+      <w:pPr>
+        <w:spacing w:after="0" w:line="312"/>
+        <w:ind w:firstLine="340"/>
+        <w:jc w:val="both"/>
+      </w:pPr>
+      <w:r>
+        <w:rPr>
+          <w:rFonts w:ascii="Georgia" w:cs="Georgia" w:eastAsia="Georgia" w:hAnsi="Georgia"/>
+          <w:sz w:val="21"/>
+          <w:szCs w:val="21"/>
+        </w:rPr>
+        <w:t xml:space="preserve">— Senhas?</w:t>
+      </w:r>
+    </w:p>
+    <w:p>
+      <w:pPr>
+        <w:spacing w:after="0" w:line="312"/>
+        <w:ind w:firstLine="340"/>
+        <w:jc w:val="both"/>
+      </w:pPr>
+      <w:r>
+        <w:rPr>
+          <w:rFonts w:ascii="Georgia" w:cs="Georgia" w:eastAsia="Georgia" w:hAnsi="Georgia"/>
+          <w:sz w:val="21"/>
+          <w:szCs w:val="21"/>
+        </w:rPr>
+        <w:t xml:space="preserve">— Para tudo. O cadeado da mala, o cofre do escritório, a combinação da bicicleta do Lucas. — Marta balançou a cabeça. — E era sempre a mesma senha, ou uma variação dela. Ele achava que ninguém ia descobrir. Eu descobri no primeiro ano de casamento.</w:t>
+      </w:r>
+    </w:p>
+    <w:p>
+      <w:pPr>
+        <w:spacing w:after="0" w:line="312"/>
+        <w:ind w:firstLine="340"/>
+        <w:jc w:val="both"/>
+      </w:pPr>
+      <w:r>
+        <w:rPr>
+          <w:rFonts w:ascii="Georgia" w:cs="Georgia" w:eastAsia="Georgia" w:hAnsi="Georgia"/>
+          <w:sz w:val="21"/>
+          <w:szCs w:val="21"/>
+        </w:rPr>
+        <w:t xml:space="preserve">Lia endireitou o corpo.</w:t>
+      </w:r>
+    </w:p>
+    <w:p>
+      <w:pPr>
+        <w:spacing w:after="0" w:line="312"/>
+        <w:ind w:firstLine="340"/>
+        <w:jc w:val="both"/>
+      </w:pPr>
+      <w:r>
+        <w:rPr>
+          <w:rFonts w:ascii="Georgia" w:cs="Georgia" w:eastAsia="Georgia" w:hAnsi="Georgia"/>
+          <w:sz w:val="21"/>
+          <w:szCs w:val="21"/>
+        </w:rPr>
+        <w:t xml:space="preserve">— Qual era?</w:t>
+      </w:r>
+    </w:p>
+    <w:p>
+      <w:pPr>
+        <w:spacing w:after="0" w:line="312"/>
+        <w:ind w:firstLine="340"/>
+        <w:jc w:val="both"/>
+      </w:pPr>
+      <w:r>
+        <w:rPr>
+          <w:rFonts w:ascii="Georgia" w:cs="Georgia" w:eastAsia="Georgia" w:hAnsi="Georgia"/>
+          <w:sz w:val="21"/>
+          <w:szCs w:val="21"/>
+        </w:rPr>
+        <w:t xml:space="preserve">Marta olhou para ela com curiosidade, como quem entende de repente que a pergunta não é por acaso.</w:t>
+      </w:r>
+    </w:p>
+    <w:p>
+      <w:pPr>
+        <w:spacing w:after="0" w:line="312"/>
+        <w:ind w:firstLine="340"/>
+        <w:jc w:val="both"/>
+      </w:pPr>
+      <w:r>
+        <w:rPr>
+          <w:rFonts w:ascii="Georgia" w:cs="Georgia" w:eastAsia="Georgia" w:hAnsi="Georgia"/>
+          <w:sz w:val="21"/>
+          <w:szCs w:val="21"/>
+        </w:rPr>
+        <w:t xml:space="preserve">— Dez e setenta e um. Um, zero, sete, um. O número da camisa do Pelé e o ano em que ele conheceu o Álvaro, em Ubatuba, numa barraca de praia que dividia com o Rodolfo. Ele dizia que eram as duas melhores coisas da vida dele: o Pelé, que o irmão o levou para ver na Vila Belmiro quando ele era menino, e aquele verão de 1971, em que ele ganhou um segundo irmão, de escolha. — Marta encolheu os ombros. — Coisa de menino. Ele nunca mudou.</w:t>
+      </w:r>
+    </w:p>
+    <w:p>
+      <w:pPr>
+        <w:spacing w:after="200" w:before="200"/>
+        <w:jc w:val="center"/>
+      </w:pPr>
+      <w:r>
+        <w:rPr>
+          <w:rFonts w:ascii="Georgia" w:cs="Georgia" w:eastAsia="Georgia" w:hAnsi="Georgia"/>
+          <w:sz w:val="22"/>
+          <w:szCs w:val="22"/>
+        </w:rPr>
+        <w:t xml:space="preserve">*</w:t>
+      </w:r>
+    </w:p>
+    <w:p>
+      <w:pPr>
+        <w:spacing w:after="0" w:line="312"/>
+        <w:ind w:firstLine="340"/>
+        <w:jc w:val="both"/>
+      </w:pPr>
+      <w:r>
+        <w:rPr>
+          <w:rFonts w:ascii="Georgia" w:cs="Georgia" w:eastAsia="Georgia" w:hAnsi="Georgia"/>
+          <w:sz w:val="21"/>
+          <w:szCs w:val="21"/>
+        </w:rPr>
+        <w:t xml:space="preserve">Lia digitou os números no carro, ainda na rua de Marta, com o motor desligado.</w:t>
+      </w:r>
+    </w:p>
+    <w:p>
+      <w:pPr>
+        <w:spacing w:after="0" w:line="312"/>
+        <w:ind w:firstLine="340"/>
+        <w:jc w:val="both"/>
+      </w:pPr>
+      <w:r>
+        <w:rPr>
+          <w:rFonts w:ascii="Georgia" w:cs="Georgia" w:eastAsia="Georgia" w:hAnsi="Georgia"/>
+          <w:sz w:val="21"/>
+          <w:szCs w:val="21"/>
+        </w:rPr>
+        <w:t xml:space="preserve">A galeria de fotos do BlackBerry do pai estava trancada por um aplicativo de privacidade, desses que se vendiam na loja do aparelho. Ela tinha tentado o ramal, a data do incêndio, a placa, a sala de aula. Nada.</w:t>
+      </w:r>
+    </w:p>
+    <w:p>
+      <w:pPr>
+        <w:spacing w:after="0" w:line="312"/>
+        <w:ind w:firstLine="340"/>
+        <w:jc w:val="both"/>
+      </w:pPr>
+      <w:r>
+        <w:rPr>
+          <w:rFonts w:ascii="Georgia" w:cs="Georgia" w:eastAsia="Georgia" w:hAnsi="Georgia"/>
+          <w:sz w:val="21"/>
+          <w:szCs w:val="21"/>
+        </w:rPr>
+        <w:t xml:space="preserve">Um, zero, sete, um.</w:t>
+      </w:r>
+    </w:p>
+    <w:p>
+      <w:pPr>
+        <w:pBdr>
+          <w:top w:val="single" w:color="555555" w:sz="6" w:space="6"/>
+          <w:bottom w:val="single" w:color="555555" w:sz="6" w:space="6"/>
+          <w:left w:val="single" w:color="555555" w:sz="6" w:space="6"/>
+          <w:right w:val="single" w:color="555555" w:sz="6" w:space="6"/>
+        </w:pBdr>
+        <w:shd w:fill="EFEFEF" w:color="auto" w:val="clear"/>
+        <w:spacing w:after="0" w:before="240"/>
+        <w:ind w:left="227" w:right="227"/>
+        <w:jc w:val="center"/>
+      </w:pPr>
+      <w:r>
+        <w:rPr>
+          <w:rFonts w:ascii="Georgia" w:cs="Georgia" w:eastAsia="Georgia" w:hAnsi="Georgia"/>
+          <w:b/>
+          <w:bCs/>
+          <w:spacing w:val="30"/>
+          <w:sz w:val="17"/>
+          <w:szCs w:val="17"/>
+        </w:rPr>
+        <w:t xml:space="preserve">NO CELULAR DE HENRIQUE</w:t>
+      </w:r>
+    </w:p>
+    <w:p>
+      <w:pPr>
+        <w:pBdr>
+          <w:top w:val="single" w:color="555555" w:sz="6" w:space="6"/>
+          <w:bottom w:val="single" w:color="555555" w:sz="6" w:space="6"/>
+          <w:left w:val="single" w:color="555555" w:sz="6" w:space="6"/>
+          <w:right w:val="single" w:color="555555" w:sz="6" w:space="6"/>
+        </w:pBdr>
+        <w:shd w:fill="EFEFEF" w:color="auto" w:val="clear"/>
+        <w:spacing w:after="240" w:before="0" w:line="288"/>
+        <w:ind w:left="227" w:right="227"/>
+        <w:jc w:val="center"/>
+      </w:pPr>
+      <w:r>
+        <w:rPr>
+          <w:rFonts w:ascii="Georgia" w:cs="Georgia" w:eastAsia="Georgia" w:hAnsi="Georgia"/>
+          <w:i/>
+          <w:iCs/>
+          <w:sz w:val="19"/>
+          <w:szCs w:val="19"/>
+        </w:rPr>
+        <w:t xml:space="preserve">Abra a galeria de fotos do celular de Henrique. A senha é a mesma que ele usava para tudo desde jovem: o número da camisa do Pelé e o ano de Ubatuba, somados ao seu código pessoal.</w:t>
+      </w:r>
+    </w:p>
+    <w:p>
+      <w:pPr>
+        <w:spacing w:after="0" w:line="312"/>
+        <w:ind w:firstLine="340"/>
+        <w:jc w:val="both"/>
+      </w:pPr>
+      <w:r>
+        <w:rPr>
+          <w:rFonts w:ascii="Georgia" w:cs="Georgia" w:eastAsia="Georgia" w:hAnsi="Georgia"/>
+          <w:sz w:val="21"/>
+          <w:szCs w:val="21"/>
+        </w:rPr>
+        <w:t xml:space="preserve">A galeria se abriu.</w:t>
+      </w:r>
+    </w:p>
+    <w:p>
+      <w:pPr>
+        <w:spacing w:after="0" w:line="312"/>
+        <w:ind w:firstLine="340"/>
+        <w:jc w:val="both"/>
+      </w:pPr>
+      <w:r>
+        <w:rPr>
+          <w:rFonts w:ascii="Georgia" w:cs="Georgia" w:eastAsia="Georgia" w:hAnsi="Georgia"/>
+          <w:sz w:val="21"/>
+          <w:szCs w:val="21"/>
+        </w:rPr>
+        <w:t xml:space="preserve">Não havia muitas fotos. O pai nunca tinha sido um homem de fotografias. Algumas da corretora, de documentos, de placas de obra. Uma de Dona Cida segurando um bolo de aniversário. Uma da foto de Ubatuba que ficava na parede do consultório do doutor Álvaro, fotografada de perto: três rapazes de calção numa praia, abraçados, rindo, em 1971. Rodolfo, o pai e o médico.</w:t>
+      </w:r>
+    </w:p>
+    <w:p>
+      <w:pPr>
+        <w:spacing w:after="0" w:line="312"/>
+        <w:ind w:firstLine="340"/>
+        <w:jc w:val="both"/>
+      </w:pPr>
+      <w:r>
+        <w:rPr>
+          <w:rFonts w:ascii="Georgia" w:cs="Georgia" w:eastAsia="Georgia" w:hAnsi="Georgia"/>
+          <w:sz w:val="21"/>
+          <w:szCs w:val="21"/>
+        </w:rPr>
+        <w:t xml:space="preserve">E, a partir de agosto, outras fotos. Fotos que Lia não esperava.</w:t>
+      </w:r>
+    </w:p>
+    <w:p>
+      <w:pPr>
+        <w:spacing w:after="0" w:line="312"/>
+        <w:ind w:firstLine="340"/>
+        <w:jc w:val="both"/>
+      </w:pPr>
+      <w:r>
+        <w:rPr>
+          <w:rFonts w:ascii="Georgia" w:cs="Georgia" w:eastAsia="Georgia" w:hAnsi="Georgia"/>
+          <w:sz w:val="21"/>
+          <w:szCs w:val="21"/>
+        </w:rPr>
+        <w:t xml:space="preserve">Montanhas cobertas de neve. Um vale verde com casas de madeira. Um trem vermelho atravessando uma ponte de pedra. E um chalé, fotografado de vários ângulos, como quem fotografa um imóvel para comprar: dois andares, telhado inclinado, uma varanda de madeira ao redor da casa inteira, e janelas, muitas janelas, uma fileira delas em cada lado.</w:t>
+      </w:r>
+    </w:p>
+    <w:p>
+      <w:pPr>
+        <w:spacing w:after="0" w:line="312"/>
+        <w:ind w:firstLine="340"/>
+        <w:jc w:val="both"/>
+      </w:pPr>
+      <w:r>
+        <w:rPr>
+          <w:rFonts w:ascii="Georgia" w:cs="Georgia" w:eastAsia="Georgia" w:hAnsi="Georgia"/>
+          <w:sz w:val="21"/>
+          <w:szCs w:val="21"/>
+        </w:rPr>
+        <w:t xml:space="preserve">Lia contou as janelas sem querer. Doze.</w:t>
+      </w:r>
+    </w:p>
+    <w:p>
+      <w:pPr>
+        <w:spacing w:after="0" w:line="312"/>
+        <w:ind w:firstLine="340"/>
+        <w:jc w:val="both"/>
+      </w:pPr>
+      <w:r>
+        <w:rPr>
+          <w:rFonts w:ascii="Georgia" w:cs="Georgia" w:eastAsia="Georgia" w:hAnsi="Georgia"/>
+          <w:sz w:val="21"/>
+          <w:szCs w:val="21"/>
+        </w:rPr>
+        <w:t xml:space="preserve">Ficou olhando para aquela imagem com a sensação de que alguém tinha apertado a garganta dela por dentro.</w:t>
+      </w:r>
+    </w:p>
+    <w:p>
+      <w:pPr>
+        <w:spacing w:after="0" w:line="312"/>
+        <w:ind w:firstLine="340"/>
+        <w:jc w:val="both"/>
+      </w:pPr>
+      <w:r>
+        <w:rPr>
+          <w:rFonts w:ascii="Georgia" w:cs="Georgia" w:eastAsia="Georgia" w:hAnsi="Georgia"/>
+          <w:sz w:val="21"/>
+          <w:szCs w:val="21"/>
+        </w:rPr>
+        <w:t xml:space="preserve">Pegou na bolsa a pasta de elástico que tinha trazido do escritório do pai, semanas antes, e que andava com ela desde então. Abriu na página do desenho de criança. Uma casa com doze janelas e nenhuma porta, e embaixo, com letra torta: EU E O PAPAI NA CASA QUE EU VOU FAZER PRA ELE.</w:t>
+      </w:r>
+    </w:p>
+    <w:p>
+      <w:pPr>
+        <w:spacing w:after="0" w:line="312"/>
+        <w:ind w:firstLine="340"/>
+        <w:jc w:val="both"/>
+      </w:pPr>
+      <w:r>
+        <w:rPr>
+          <w:rFonts w:ascii="Georgia" w:cs="Georgia" w:eastAsia="Georgia" w:hAnsi="Georgia"/>
+          <w:sz w:val="21"/>
+          <w:szCs w:val="21"/>
+        </w:rPr>
+        <w:t xml:space="preserve">O chalé da foto tinha porta. Mas tinha as mesmas doze janelas, a mesma varanda em volta, o mesmo telhado inclinado que ela tinha desenhado aos oito anos, com lápis de cor, num domingo na casa do Jardim Europa.</w:t>
+      </w:r>
+    </w:p>
+    <w:p>
+      <w:pPr>
+        <w:spacing w:after="0" w:line="312"/>
+        <w:ind w:firstLine="340"/>
+        <w:jc w:val="both"/>
+      </w:pPr>
+      <w:r>
+        <w:rPr>
+          <w:rFonts w:ascii="Georgia" w:cs="Georgia" w:eastAsia="Georgia" w:hAnsi="Georgia"/>
+          <w:sz w:val="21"/>
+          <w:szCs w:val="21"/>
+        </w:rPr>
+        <w:t xml:space="preserve">O pai tinha escolhido aquela casa por causa do desenho dela.</w:t>
+      </w:r>
+    </w:p>
+    <w:p>
+      <w:pPr>
+        <w:spacing w:after="200" w:before="200"/>
+        <w:jc w:val="center"/>
+      </w:pPr>
+      <w:r>
+        <w:rPr>
+          <w:rFonts w:ascii="Georgia" w:cs="Georgia" w:eastAsia="Georgia" w:hAnsi="Georgia"/>
+          <w:sz w:val="22"/>
+          <w:szCs w:val="22"/>
+        </w:rPr>
+        <w:t xml:space="preserve">*</w:t>
+      </w:r>
+    </w:p>
+    <w:p>
+      <w:pPr>
+        <w:spacing w:after="0" w:line="312"/>
+        <w:ind w:firstLine="340"/>
+        <w:jc w:val="both"/>
+      </w:pPr>
+      <w:r>
+        <w:rPr>
+          <w:rFonts w:ascii="Georgia" w:cs="Georgia" w:eastAsia="Georgia" w:hAnsi="Georgia"/>
+          <w:sz w:val="21"/>
+          <w:szCs w:val="21"/>
+        </w:rPr>
+        <w:t xml:space="preserve">A última foto da galeria não era foto. Era a imagem de uma tela, uma captura do navegador do celular. Uma página de companhia aérea, em inglês, com uma busca de voo. São Paulo, Guarulhos, para Zurique. Só ida. Data: uma sexta-feira do fim de outubro.</w:t>
+      </w:r>
+    </w:p>
+    <w:p>
+      <w:pPr>
+        <w:spacing w:after="0" w:line="312"/>
+        <w:ind w:firstLine="340"/>
+        <w:jc w:val="both"/>
+      </w:pPr>
+      <w:r>
+        <w:rPr>
+          <w:rFonts w:ascii="Georgia" w:cs="Georgia" w:eastAsia="Georgia" w:hAnsi="Georgia"/>
+          <w:sz w:val="21"/>
+          <w:szCs w:val="21"/>
+        </w:rPr>
+        <w:t xml:space="preserve">Três dias depois da cremação.</w:t>
+      </w:r>
+    </w:p>
+    <w:p>
+      <w:pPr>
+        <w:spacing w:after="0" w:line="312"/>
+        <w:ind w:firstLine="340"/>
+        <w:jc w:val="both"/>
+      </w:pPr>
+      <w:r>
+        <w:rPr>
+          <w:rFonts w:ascii="Georgia" w:cs="Georgia" w:eastAsia="Georgia" w:hAnsi="Georgia"/>
+          <w:sz w:val="21"/>
+          <w:szCs w:val="21"/>
+        </w:rPr>
+        <w:t xml:space="preserve">Logo abaixo, nas notas do celular, que também se abriram com a mesma senha, havia uma única nota, de setembro, com uma única palavra.</w:t>
+      </w:r>
+    </w:p>
+    <w:p>
+      <w:pPr>
+        <w:spacing w:after="0" w:line="312"/>
+        <w:ind w:firstLine="340"/>
+        <w:jc w:val="both"/>
+      </w:pPr>
+      <w:r>
+        <w:rPr>
+          <w:rFonts w:ascii="Georgia" w:cs="Georgia" w:eastAsia="Georgia" w:hAnsi="Georgia"/>
+          <w:sz w:val="21"/>
+          <w:szCs w:val="21"/>
+        </w:rPr>
+        <w:t xml:space="preserve">Zurique.</w:t>
+      </w:r>
+    </w:p>
+    <w:p>
+      <w:pPr>
+        <w:spacing w:after="0" w:line="312"/>
+        <w:ind w:firstLine="340"/>
+        <w:jc w:val="both"/>
+      </w:pPr>
+      <w:r>
+        <w:rPr>
+          <w:rFonts w:ascii="Georgia" w:cs="Georgia" w:eastAsia="Georgia" w:hAnsi="Georgia"/>
+          <w:sz w:val="21"/>
+          <w:szCs w:val="21"/>
+        </w:rPr>
+        <w:t xml:space="preserve">Lia encostou a cabeça no volante.</w:t>
+      </w:r>
+    </w:p>
+    <w:p>
+      <w:pPr>
+        <w:spacing w:after="0" w:line="312"/>
+        <w:ind w:firstLine="340"/>
+        <w:jc w:val="both"/>
+      </w:pPr>
+      <w:r>
+        <w:rPr>
+          <w:rFonts w:ascii="Georgia" w:cs="Georgia" w:eastAsia="Georgia" w:hAnsi="Georgia"/>
+          <w:sz w:val="21"/>
+          <w:szCs w:val="21"/>
+        </w:rPr>
+        <w:t xml:space="preserve">Um dia eu te mando um cartão-postal de um lugar com neve, e você vai entender. O passaporte. A viagem longa que ele anunciou a Sílvia. As fotos novas, de cabelo curto, que Lucas tinha achado na carteira. Os documentos de outubro, confirmar com A. O homem que não tinha tempo para esperar a raiva do filho passar. A casa de doze janelas.</w:t>
+      </w:r>
+    </w:p>
+    <w:p>
+      <w:pPr>
+        <w:spacing w:after="0" w:line="312"/>
+        <w:ind w:firstLine="340"/>
+        <w:jc w:val="both"/>
+      </w:pPr>
+      <w:r>
+        <w:rPr>
+          <w:rFonts w:ascii="Georgia" w:cs="Georgia" w:eastAsia="Georgia" w:hAnsi="Georgia"/>
+          <w:sz w:val="21"/>
+          <w:szCs w:val="21"/>
+        </w:rPr>
+        <w:t xml:space="preserve">O pai não estava esperando a morte. O pai estava indo embora.</w:t>
+      </w:r>
+    </w:p>
+    <w:p>
+      <w:pPr>
+        <w:spacing w:after="200" w:before="200"/>
+        <w:jc w:val="center"/>
+      </w:pPr>
+      <w:r>
+        <w:rPr>
+          <w:rFonts w:ascii="Georgia" w:cs="Georgia" w:eastAsia="Georgia" w:hAnsi="Georgia"/>
+          <w:sz w:val="22"/>
+          <w:szCs w:val="22"/>
+        </w:rPr>
+        <w:t xml:space="preserve">*</w:t>
+      </w:r>
+    </w:p>
+    <w:p>
+      <w:pPr>
+        <w:spacing w:after="0" w:line="312"/>
+        <w:ind w:firstLine="340"/>
+        <w:jc w:val="both"/>
+      </w:pPr>
+      <w:r>
+        <w:rPr>
+          <w:rFonts w:ascii="Georgia" w:cs="Georgia" w:eastAsia="Georgia" w:hAnsi="Georgia"/>
+          <w:sz w:val="21"/>
+          <w:szCs w:val="21"/>
+        </w:rPr>
+        <w:t xml:space="preserve">Ela ligou para Lucas. Ele atendeu no primeiro toque, como se estivesse esperando.</w:t>
+      </w:r>
+    </w:p>
+    <w:p>
+      <w:pPr>
+        <w:spacing w:after="0" w:line="312"/>
+        <w:ind w:firstLine="340"/>
+        <w:jc w:val="both"/>
+      </w:pPr>
+      <w:r>
+        <w:rPr>
+          <w:rFonts w:ascii="Georgia" w:cs="Georgia" w:eastAsia="Georgia" w:hAnsi="Georgia"/>
+          <w:sz w:val="21"/>
+          <w:szCs w:val="21"/>
+        </w:rPr>
+        <w:t xml:space="preserve">— Lia?</w:t>
+      </w:r>
+    </w:p>
+    <w:p>
+      <w:pPr>
+        <w:spacing w:after="0" w:line="312"/>
+        <w:ind w:firstLine="340"/>
+        <w:jc w:val="both"/>
+      </w:pPr>
+      <w:r>
+        <w:rPr>
+          <w:rFonts w:ascii="Georgia" w:cs="Georgia" w:eastAsia="Georgia" w:hAnsi="Georgia"/>
+          <w:sz w:val="21"/>
+          <w:szCs w:val="21"/>
+        </w:rPr>
+        <w:t xml:space="preserve">— A sua mãe me contou da briga — disse ela. — Da corretora. Que você nunca quis. Que você apagou a conversa por vergonha.</w:t>
+      </w:r>
+    </w:p>
+    <w:p>
+      <w:pPr>
+        <w:spacing w:after="0" w:line="312"/>
+        <w:ind w:firstLine="340"/>
+        <w:jc w:val="both"/>
+      </w:pPr>
+      <w:r>
+        <w:rPr>
+          <w:rFonts w:ascii="Georgia" w:cs="Georgia" w:eastAsia="Georgia" w:hAnsi="Georgia"/>
+          <w:sz w:val="21"/>
+          <w:szCs w:val="21"/>
+        </w:rPr>
+        <w:t xml:space="preserve">Do outro lado, o silêncio foi longo.</w:t>
+      </w:r>
+    </w:p>
+    <w:p>
+      <w:pPr>
+        <w:spacing w:after="0" w:line="312"/>
+        <w:ind w:firstLine="340"/>
+        <w:jc w:val="both"/>
+      </w:pPr>
+      <w:r>
+        <w:rPr>
+          <w:rFonts w:ascii="Georgia" w:cs="Georgia" w:eastAsia="Georgia" w:hAnsi="Georgia"/>
+          <w:sz w:val="21"/>
+          <w:szCs w:val="21"/>
+        </w:rPr>
+        <w:t xml:space="preserve">— Ela não devia ter contado.</w:t>
+      </w:r>
+    </w:p>
+    <w:p>
+      <w:pPr>
+        <w:spacing w:after="0" w:line="312"/>
+        <w:ind w:firstLine="340"/>
+        <w:jc w:val="both"/>
+      </w:pPr>
+      <w:r>
+        <w:rPr>
+          <w:rFonts w:ascii="Georgia" w:cs="Georgia" w:eastAsia="Georgia" w:hAnsi="Georgia"/>
+          <w:sz w:val="21"/>
+          <w:szCs w:val="21"/>
+        </w:rPr>
+        <w:t xml:space="preserve">— Devia, sim. — Lia respirou fundo. — Eu achei que você… Eu fiz uma lista, Lucas. Com o seu nome no alto.</w:t>
+      </w:r>
+    </w:p>
+    <w:p>
+      <w:pPr>
+        <w:spacing w:after="0" w:line="312"/>
+        <w:ind w:firstLine="340"/>
+        <w:jc w:val="both"/>
+      </w:pPr>
+      <w:r>
+        <w:rPr>
+          <w:rFonts w:ascii="Georgia" w:cs="Georgia" w:eastAsia="Georgia" w:hAnsi="Georgia"/>
+          <w:sz w:val="21"/>
+          <w:szCs w:val="21"/>
+        </w:rPr>
+        <w:t xml:space="preserve">Mais silêncio. Depois, uma risada curta, sem graça nenhuma.</w:t>
+      </w:r>
+    </w:p>
+    <w:p>
+      <w:pPr>
+        <w:spacing w:after="0" w:line="312"/>
+        <w:ind w:firstLine="340"/>
+        <w:jc w:val="both"/>
+      </w:pPr>
+      <w:r>
+        <w:rPr>
+          <w:rFonts w:ascii="Georgia" w:cs="Georgia" w:eastAsia="Georgia" w:hAnsi="Georgia"/>
+          <w:sz w:val="21"/>
+          <w:szCs w:val="21"/>
+        </w:rPr>
+        <w:t xml:space="preserve">— Eu também fiz uma. Com o seu.</w:t>
+      </w:r>
+    </w:p>
+    <w:p>
+      <w:pPr>
+        <w:spacing w:after="0" w:line="312"/>
+        <w:ind w:firstLine="340"/>
+        <w:jc w:val="both"/>
+      </w:pPr>
+      <w:r>
+        <w:rPr>
+          <w:rFonts w:ascii="Georgia" w:cs="Georgia" w:eastAsia="Georgia" w:hAnsi="Georgia"/>
+          <w:sz w:val="21"/>
+          <w:szCs w:val="21"/>
+        </w:rPr>
+        <w:t xml:space="preserve">Os dois ficaram calados, cada um num carro, em lados diferentes da cidade, ouvindo a respiração do outro.</w:t>
+      </w:r>
+    </w:p>
+    <w:p>
+      <w:pPr>
+        <w:spacing w:after="0" w:line="312"/>
+        <w:ind w:firstLine="340"/>
+        <w:jc w:val="both"/>
+      </w:pPr>
+      <w:r>
+        <w:rPr>
+          <w:rFonts w:ascii="Georgia" w:cs="Georgia" w:eastAsia="Georgia" w:hAnsi="Georgia"/>
+          <w:sz w:val="21"/>
+          <w:szCs w:val="21"/>
+        </w:rPr>
+        <w:t xml:space="preserve">— Eu ainda não posso te contar tudo — disse ela, enfim. — Tem uma coisa minha, da véspera, que eu ainda não consigo contar.</w:t>
+      </w:r>
+    </w:p>
+    <w:p>
+      <w:pPr>
+        <w:spacing w:after="0" w:line="312"/>
+        <w:ind w:firstLine="340"/>
+        <w:jc w:val="both"/>
+      </w:pPr>
+      <w:r>
+        <w:rPr>
+          <w:rFonts w:ascii="Georgia" w:cs="Georgia" w:eastAsia="Georgia" w:hAnsi="Georgia"/>
+          <w:sz w:val="21"/>
+          <w:szCs w:val="21"/>
+        </w:rPr>
+        <w:t xml:space="preserve">— Eu sei que o pai esteve no seu apartamento.</w:t>
+      </w:r>
+    </w:p>
+    <w:p>
+      <w:pPr>
+        <w:spacing w:after="0" w:line="312"/>
+        <w:ind w:firstLine="340"/>
+        <w:jc w:val="both"/>
+      </w:pPr>
+      <w:r>
+        <w:rPr>
+          <w:rFonts w:ascii="Georgia" w:cs="Georgia" w:eastAsia="Georgia" w:hAnsi="Georgia"/>
+          <w:sz w:val="21"/>
+          <w:szCs w:val="21"/>
+        </w:rPr>
+        <w:t xml:space="preserve">Lia fechou os olhos.</w:t>
+      </w:r>
+    </w:p>
+    <w:p>
+      <w:pPr>
+        <w:spacing w:after="0" w:line="312"/>
+        <w:ind w:firstLine="340"/>
+        <w:jc w:val="both"/>
+      </w:pPr>
+      <w:r>
+        <w:rPr>
+          <w:rFonts w:ascii="Georgia" w:cs="Georgia" w:eastAsia="Georgia" w:hAnsi="Georgia"/>
+          <w:sz w:val="21"/>
+          <w:szCs w:val="21"/>
+        </w:rPr>
+        <w:t xml:space="preserve">— Eu sei que você sabe.</w:t>
+      </w:r>
+    </w:p>
+    <w:p>
+      <w:pPr>
+        <w:spacing w:after="0" w:line="312"/>
+        <w:ind w:firstLine="340"/>
+        <w:jc w:val="both"/>
+      </w:pPr>
+      <w:r>
+        <w:rPr>
+          <w:rFonts w:ascii="Georgia" w:cs="Georgia" w:eastAsia="Georgia" w:hAnsi="Georgia"/>
+          <w:sz w:val="21"/>
+          <w:szCs w:val="21"/>
+        </w:rPr>
+        <w:t xml:space="preserve">— Um dia você me conta?</w:t>
+      </w:r>
+    </w:p>
+    <w:p>
+      <w:pPr>
+        <w:spacing w:after="0" w:line="312"/>
+        <w:ind w:firstLine="340"/>
+        <w:jc w:val="both"/>
+      </w:pPr>
+      <w:r>
+        <w:rPr>
+          <w:rFonts w:ascii="Georgia" w:cs="Georgia" w:eastAsia="Georgia" w:hAnsi="Georgia"/>
+          <w:sz w:val="21"/>
+          <w:szCs w:val="21"/>
+        </w:rPr>
+        <w:t xml:space="preserve">— Conto. — Ela olhou para a tela do BlackBerry, ainda aberta na foto do chalé de doze janelas. — Mas antes você precisa ver uma coisa. O pai tinha uma passagem para Zurique, Lucas. Ou ia ter. Para três dias depois da cremação.</w:t>
+      </w:r>
+    </w:p>
+    <w:p>
+      <w:pPr>
+        <w:spacing w:after="0" w:line="312"/>
+        <w:ind w:firstLine="340"/>
+        <w:jc w:val="both"/>
+      </w:pPr>
+      <w:r>
+        <w:rPr>
+          <w:rFonts w:ascii="Georgia" w:cs="Georgia" w:eastAsia="Georgia" w:hAnsi="Georgia"/>
+          <w:sz w:val="21"/>
+          <w:szCs w:val="21"/>
+        </w:rPr>
+        <w:t xml:space="preserve">O irmão não disse nada por um bom tempo.</w:t>
+      </w:r>
+    </w:p>
+    <w:p>
+      <w:pPr>
+        <w:spacing w:after="0" w:line="312"/>
+        <w:ind w:firstLine="340"/>
+        <w:jc w:val="both"/>
+      </w:pPr>
+      <w:r>
+        <w:rPr>
+          <w:rFonts w:ascii="Georgia" w:cs="Georgia" w:eastAsia="Georgia" w:hAnsi="Georgia"/>
+          <w:sz w:val="21"/>
+          <w:szCs w:val="21"/>
+        </w:rPr>
+        <w:t xml:space="preserve">— Zurique — repetiu, devagar. — Documentos: outubro. Confirmar com A.</w:t>
+      </w:r>
+    </w:p>
+    <w:p>
+      <w:pPr>
+        <w:spacing w:after="0" w:line="312"/>
+        <w:ind w:firstLine="340"/>
+        <w:jc w:val="both"/>
+      </w:pPr>
+      <w:r>
+        <w:rPr>
+          <w:rFonts w:ascii="Georgia" w:cs="Georgia" w:eastAsia="Georgia" w:hAnsi="Georgia"/>
+          <w:sz w:val="21"/>
+          <w:szCs w:val="21"/>
+        </w:rPr>
+        <w:t xml:space="preserve">— O quê?</w:t>
+      </w:r>
+    </w:p>
+    <w:p>
+      <w:pPr>
+        <w:spacing w:after="0" w:line="312"/>
+        <w:ind w:firstLine="340"/>
+        <w:jc w:val="both"/>
+      </w:pPr>
+      <w:r>
+        <w:rPr>
+          <w:rFonts w:ascii="Georgia" w:cs="Georgia" w:eastAsia="Georgia" w:hAnsi="Georgia"/>
+          <w:sz w:val="21"/>
+          <w:szCs w:val="21"/>
+        </w:rPr>
+        <w:t xml:space="preserve">— Uma anotação do e-mail dele. Eu achei que A era o advogado. Ou o Augusto Lemos.</w:t>
+      </w:r>
+    </w:p>
+    <w:p>
+      <w:pPr>
+        <w:spacing w:after="0" w:line="312"/>
+        <w:ind w:firstLine="340"/>
+        <w:jc w:val="both"/>
+      </w:pPr>
+      <w:r>
+        <w:rPr>
+          <w:rFonts w:ascii="Georgia" w:cs="Georgia" w:eastAsia="Georgia" w:hAnsi="Georgia"/>
+          <w:sz w:val="21"/>
+          <w:szCs w:val="21"/>
+        </w:rPr>
+        <w:t xml:space="preserve">Lia olhou para a foto de Ubatuba na galeria. Três rapazes abraçados numa praia. Rodolfo, que estava morto. O pai, que estava morto. E o terceiro, que estava vivo, e que tinha brigado com Helena no corredor do crematório para que o pai não fosse cremado.</w:t>
+      </w:r>
+    </w:p>
+    <w:p>
+      <w:pPr>
+        <w:spacing w:after="0" w:line="312"/>
+        <w:ind w:firstLine="340"/>
+        <w:jc w:val="both"/>
+      </w:pPr>
+      <w:r>
+        <w:rPr>
+          <w:rFonts w:ascii="Georgia" w:cs="Georgia" w:eastAsia="Georgia" w:hAnsi="Georgia"/>
+          <w:sz w:val="21"/>
+          <w:szCs w:val="21"/>
+        </w:rPr>
+        <w:t xml:space="preserve">Não disse nada a Lucas sobre isso. Ainda não sabia o que estava pensando. Só sabia que tinha pensado.</w:t>
+      </w:r>
+    </w:p>
+    <w:p>
+      <w:pPr>
+        <w:spacing w:after="0" w:line="312"/>
+        <w:ind w:firstLine="340"/>
+        <w:jc w:val="both"/>
+      </w:pPr>
+      <w:r>
+        <w:rPr>
+          <w:rFonts w:ascii="Georgia" w:cs="Georgia" w:eastAsia="Georgia" w:hAnsi="Georgia"/>
+          <w:sz w:val="21"/>
+          <w:szCs w:val="21"/>
+        </w:rPr>
+        <w:t xml:space="preserve">— Amanhã a gente se vê — disse o irmão. — Nós dois. Sem listas.</w:t>
+      </w:r>
+    </w:p>
+    <w:p>
+      <w:pPr>
+        <w:spacing w:after="0" w:line="312"/>
+        <w:ind w:firstLine="340"/>
+        <w:jc w:val="both"/>
+      </w:pPr>
+      <w:r>
+        <w:rPr>
+          <w:rFonts w:ascii="Georgia" w:cs="Georgia" w:eastAsia="Georgia" w:hAnsi="Georgia"/>
+          <w:sz w:val="21"/>
+          <w:szCs w:val="21"/>
+        </w:rPr>
+        <w:t xml:space="preserve">— Sem listas.</w:t>
+      </w:r>
+    </w:p>
+    <w:p>
+      <w:pPr>
+        <w:spacing w:after="0" w:line="312"/>
+        <w:ind w:firstLine="340"/>
+        <w:jc w:val="both"/>
+      </w:pPr>
+      <w:r>
+        <w:rPr>
+          <w:rFonts w:ascii="Georgia" w:cs="Georgia" w:eastAsia="Georgia" w:hAnsi="Georgia"/>
+          <w:sz w:val="21"/>
+          <w:szCs w:val="21"/>
+        </w:rPr>
+        <w:t xml:space="preserve">Ela desligou e ficou um tempo no carro, na rua escura de Higienópolis, com o celular do pai no colo, aberto na casa de doze janelas que alguém tinha impedido de existir.</w:t>
       </w:r>
     </w:p>
     <w:sectPr>

</xml_diff>

<commit_message>
Livro policial: capítulo 24 (Ubatuba Holdings)
Co-Authored-By: Claude Opus 5.5 <noreply@anthropic.com>
Claude-Session: https://claude.ai/code/session_01BrurxSYygRC3rRhaUYosm1
</commit_message>
<xml_diff>
--- a/docs/livro-policial/TODO_CRIME_TEM_UM_AUTOR.docx
+++ b/docs/livro-policial/TODO_CRIME_TEM_UM_AUTOR.docx
@@ -24603,6 +24603,982 @@
           <w:szCs w:val="21"/>
         </w:rPr>
         <w:t xml:space="preserve">Ela desligou e ficou um tempo no carro, na rua escura de Higienópolis, com o celular do pai no colo, aberto na casa de doze janelas que alguém tinha impedido de existir.</w:t>
+      </w:r>
+    </w:p>
+    <w:p>
+      <w:pPr>
+        <w:pageBreakBefore/>
+        <w:spacing w:after="120" w:before="1800"/>
+        <w:jc w:val="center"/>
+      </w:pPr>
+      <w:r>
+        <w:rPr>
+          <w:rFonts w:ascii="Georgia" w:cs="Georgia" w:eastAsia="Georgia" w:hAnsi="Georgia"/>
+          <w:spacing w:val="40"/>
+          <w:sz w:val="20"/>
+          <w:szCs w:val="20"/>
+        </w:rPr>
+        <w:t xml:space="preserve">CAPÍTULO 24</w:t>
+      </w:r>
+    </w:p>
+    <w:p>
+      <w:pPr>
+        <w:spacing w:after="720"/>
+        <w:jc w:val="center"/>
+      </w:pPr>
+      <w:r>
+        <w:rPr>
+          <w:rFonts w:ascii="Georgia" w:cs="Georgia" w:eastAsia="Georgia" w:hAnsi="Georgia"/>
+          <w:b/>
+          <w:bCs/>
+          <w:sz w:val="32"/>
+          <w:szCs w:val="32"/>
+        </w:rPr>
+        <w:t xml:space="preserve">Ubatuba Holdings</w:t>
+      </w:r>
+    </w:p>
+    <w:p>
+      <w:pPr>
+        <w:spacing w:after="0" w:line="312"/>
+        <w:ind w:firstLine="340"/>
+        <w:jc w:val="both"/>
+      </w:pPr>
+      <w:r>
+        <w:rPr>
+          <w:rFonts w:ascii="Georgia" w:cs="Georgia" w:eastAsia="Georgia" w:hAnsi="Georgia"/>
+          <w:sz w:val="21"/>
+          <w:szCs w:val="21"/>
+        </w:rPr>
+        <w:t xml:space="preserve">Entre as chaves que Helena tinha entregado no saco de farmácia, havia uma que ninguém sabia abrir.</w:t>
+      </w:r>
+    </w:p>
+    <w:p>
+      <w:pPr>
+        <w:spacing w:after="0" w:line="312"/>
+        <w:ind w:firstLine="340"/>
+        <w:jc w:val="both"/>
+      </w:pPr>
+      <w:r>
+        <w:rPr>
+          <w:rFonts w:ascii="Georgia" w:cs="Georgia" w:eastAsia="Georgia" w:hAnsi="Georgia"/>
+          <w:sz w:val="21"/>
+          <w:szCs w:val="21"/>
+        </w:rPr>
+        <w:t xml:space="preserve">Era uma chave dourada, comum, de fechadura de apartamento, presa a um chaveiro de couro com uma única letra gravada a fogo: M. Lucas tinha experimentado na casa do Jardim Europa, no escritório da corretora, no cofre, na gaveta trancada da mesa do pai. Nada. Tinha guardado a chave numa caixinha na estante e esquecido dela.</w:t>
+      </w:r>
+    </w:p>
+    <w:p>
+      <w:pPr>
+        <w:spacing w:after="0" w:line="312"/>
+        <w:ind w:firstLine="340"/>
+        <w:jc w:val="both"/>
+      </w:pPr>
+      <w:r>
+        <w:rPr>
+          <w:rFonts w:ascii="Georgia" w:cs="Georgia" w:eastAsia="Georgia" w:hAnsi="Georgia"/>
+          <w:sz w:val="21"/>
+          <w:szCs w:val="21"/>
+        </w:rPr>
+        <w:t xml:space="preserve">Lembrou na sexta-feira de manhã, às seis, acordado antes do despertador, ainda na cama. Um apartamento em Moema, que ninguém da família sabia que existia.</w:t>
+      </w:r>
+    </w:p>
+    <w:p>
+      <w:pPr>
+        <w:spacing w:after="0" w:line="312"/>
+        <w:ind w:firstLine="340"/>
+        <w:jc w:val="both"/>
+      </w:pPr>
+      <w:r>
+        <w:rPr>
+          <w:rFonts w:ascii="Georgia" w:cs="Georgia" w:eastAsia="Georgia" w:hAnsi="Georgia"/>
+          <w:sz w:val="21"/>
+          <w:szCs w:val="21"/>
+        </w:rPr>
+        <w:t xml:space="preserve">M de Moema.</w:t>
+      </w:r>
+    </w:p>
+    <w:p>
+      <w:pPr>
+        <w:spacing w:after="200" w:before="200"/>
+        <w:jc w:val="center"/>
+      </w:pPr>
+      <w:r>
+        <w:rPr>
+          <w:rFonts w:ascii="Georgia" w:cs="Georgia" w:eastAsia="Georgia" w:hAnsi="Georgia"/>
+          <w:sz w:val="22"/>
+          <w:szCs w:val="22"/>
+        </w:rPr>
+        <w:t xml:space="preserve">*</w:t>
+      </w:r>
+    </w:p>
+    <w:p>
+      <w:pPr>
+        <w:spacing w:after="0" w:line="312"/>
+        <w:ind w:firstLine="340"/>
+        <w:jc w:val="both"/>
+      </w:pPr>
+      <w:r>
+        <w:rPr>
+          <w:rFonts w:ascii="Georgia" w:cs="Georgia" w:eastAsia="Georgia" w:hAnsi="Georgia"/>
+          <w:sz w:val="21"/>
+          <w:szCs w:val="21"/>
+        </w:rPr>
+        <w:t xml:space="preserve">O prédio ficava numa rua tranquila, perto do Parque Ibirapuera, um edifício baixo dos anos setenta, de pastilhas azuis, sem porteiro, só com interfone. A chave dourada abriu o portão da rua. Lucas subiu de escada até o terceiro andar, porque o elevador era daqueles de porta pantográfica e ele não teve paciência de esperar.</w:t>
+      </w:r>
+    </w:p>
+    <w:p>
+      <w:pPr>
+        <w:spacing w:after="0" w:line="312"/>
+        <w:ind w:firstLine="340"/>
+        <w:jc w:val="both"/>
+      </w:pPr>
+      <w:r>
+        <w:rPr>
+          <w:rFonts w:ascii="Georgia" w:cs="Georgia" w:eastAsia="Georgia" w:hAnsi="Georgia"/>
+          <w:sz w:val="21"/>
+          <w:szCs w:val="21"/>
+        </w:rPr>
+        <w:t xml:space="preserve">O apartamento 32 tinha cheiro de coisa fechada e de produto de limpeza. Alguém vinha ali de vez em quando. Ou tinha vindo, até pouco tempo antes.</w:t>
+      </w:r>
+    </w:p>
+    <w:p>
+      <w:pPr>
+        <w:spacing w:after="0" w:line="312"/>
+        <w:ind w:firstLine="340"/>
+        <w:jc w:val="both"/>
+      </w:pPr>
+      <w:r>
+        <w:rPr>
+          <w:rFonts w:ascii="Georgia" w:cs="Georgia" w:eastAsia="Georgia" w:hAnsi="Georgia"/>
+          <w:sz w:val="21"/>
+          <w:szCs w:val="21"/>
+        </w:rPr>
+        <w:t xml:space="preserve">Era quase vazio. Uma sala com um sofá de dois lugares, uma mesa de madeira com duas cadeiras, uma televisão pequena desligada da tomada. Uma cozinha com uma garrafa de água mineral fechada na geladeira, um pacote de café pela metade e duas xícaras lavadas no escorredor. Um quarto com uma cama de casal arrumada, lençóis brancos, um abajur.</w:t>
+      </w:r>
+    </w:p>
+    <w:p>
+      <w:pPr>
+        <w:spacing w:after="0" w:line="312"/>
+        <w:ind w:firstLine="340"/>
+        <w:jc w:val="both"/>
+      </w:pPr>
+      <w:r>
+        <w:rPr>
+          <w:rFonts w:ascii="Georgia" w:cs="Georgia" w:eastAsia="Georgia" w:hAnsi="Georgia"/>
+          <w:sz w:val="21"/>
+          <w:szCs w:val="21"/>
+        </w:rPr>
+        <w:t xml:space="preserve">E, ao pé da cama, uma mala.</w:t>
+      </w:r>
+    </w:p>
+    <w:p>
+      <w:pPr>
+        <w:spacing w:after="0" w:line="312"/>
+        <w:ind w:firstLine="340"/>
+        <w:jc w:val="both"/>
+      </w:pPr>
+      <w:r>
+        <w:rPr>
+          <w:rFonts w:ascii="Georgia" w:cs="Georgia" w:eastAsia="Georgia" w:hAnsi="Georgia"/>
+          <w:sz w:val="21"/>
+          <w:szCs w:val="21"/>
+        </w:rPr>
+        <w:t xml:space="preserve">Não era uma mala de fim de semana. Era uma mala grande, de viagem longa, com rodinhas, aberta no chão e arrumada até a metade. Lucas se ajoelhou ao lado dela. Dentro, dobrados com o cuidado de quem nunca tinha dobrado as próprias roupas, um sobretudo de lã cinza, ainda com a etiqueta. Dois cachecóis. Luvas de couro forradas. Botas de cano alto. Três suéteres grossos. Um gorro.</w:t>
+      </w:r>
+    </w:p>
+    <w:p>
+      <w:pPr>
+        <w:spacing w:after="0" w:line="312"/>
+        <w:ind w:firstLine="340"/>
+        <w:jc w:val="both"/>
+      </w:pPr>
+      <w:r>
+        <w:rPr>
+          <w:rFonts w:ascii="Georgia" w:cs="Georgia" w:eastAsia="Georgia" w:hAnsi="Georgia"/>
+          <w:sz w:val="21"/>
+          <w:szCs w:val="21"/>
+        </w:rPr>
+        <w:t xml:space="preserve">Roupas para um lugar com neve.</w:t>
+      </w:r>
+    </w:p>
+    <w:p>
+      <w:pPr>
+        <w:spacing w:after="0" w:line="312"/>
+        <w:ind w:firstLine="340"/>
+        <w:jc w:val="both"/>
+      </w:pPr>
+      <w:r>
+        <w:rPr>
+          <w:rFonts w:ascii="Georgia" w:cs="Georgia" w:eastAsia="Georgia" w:hAnsi="Georgia"/>
+          <w:sz w:val="21"/>
+          <w:szCs w:val="21"/>
+        </w:rPr>
+        <w:t xml:space="preserve">Embaixo das luvas, um guia de viagem em capa mole, novo, com o lombo ainda duro: Suíça. Uma página estava dobrada no canto. Zermatt e os vilarejos do Valais. Na margem, a letra inclinada do pai: as doze janelas.</w:t>
+      </w:r>
+    </w:p>
+    <w:p>
+      <w:pPr>
+        <w:spacing w:after="0" w:line="312"/>
+        <w:ind w:firstLine="340"/>
+        <w:jc w:val="both"/>
+      </w:pPr>
+      <w:r>
+        <w:rPr>
+          <w:rFonts w:ascii="Georgia" w:cs="Georgia" w:eastAsia="Georgia" w:hAnsi="Georgia"/>
+          <w:sz w:val="21"/>
+          <w:szCs w:val="21"/>
+        </w:rPr>
+        <w:t xml:space="preserve">Lucas ficou um tempo sentado no chão do quarto, com o guia nas mãos, sem pensar em nada.</w:t>
+      </w:r>
+    </w:p>
+    <w:p>
+      <w:pPr>
+        <w:spacing w:after="200" w:before="200"/>
+        <w:jc w:val="center"/>
+      </w:pPr>
+      <w:r>
+        <w:rPr>
+          <w:rFonts w:ascii="Georgia" w:cs="Georgia" w:eastAsia="Georgia" w:hAnsi="Georgia"/>
+          <w:sz w:val="22"/>
+          <w:szCs w:val="22"/>
+        </w:rPr>
+        <w:t xml:space="preserve">*</w:t>
+      </w:r>
+    </w:p>
+    <w:p>
+      <w:pPr>
+        <w:spacing w:after="0" w:line="312"/>
+        <w:ind w:firstLine="340"/>
+        <w:jc w:val="both"/>
+      </w:pPr>
+      <w:r>
+        <w:rPr>
+          <w:rFonts w:ascii="Georgia" w:cs="Georgia" w:eastAsia="Georgia" w:hAnsi="Georgia"/>
+          <w:sz w:val="21"/>
+          <w:szCs w:val="21"/>
+        </w:rPr>
+        <w:t xml:space="preserve">Na escrivaninha do canto da sala, havia uma única gaveta. Estava trancada, mas a mesma chave dourada servia nela também. O pai era assim. Uma chave para tudo, uma senha para tudo.</w:t>
+      </w:r>
+    </w:p>
+    <w:p>
+      <w:pPr>
+        <w:spacing w:after="0" w:line="312"/>
+        <w:ind w:firstLine="340"/>
+        <w:jc w:val="both"/>
+      </w:pPr>
+      <w:r>
+        <w:rPr>
+          <w:rFonts w:ascii="Georgia" w:cs="Georgia" w:eastAsia="Georgia" w:hAnsi="Georgia"/>
+          <w:sz w:val="21"/>
+          <w:szCs w:val="21"/>
+        </w:rPr>
+        <w:t xml:space="preserve">Dentro, uma pasta de plástico transparente com duas folhas de papel timbrado, em inglês, e um envelope fechado.</w:t>
+      </w:r>
+    </w:p>
+    <w:p>
+      <w:pPr>
+        <w:spacing w:after="0" w:line="312"/>
+        <w:ind w:firstLine="340"/>
+        <w:jc w:val="both"/>
+      </w:pPr>
+      <w:r>
+        <w:rPr>
+          <w:rFonts w:ascii="Georgia" w:cs="Georgia" w:eastAsia="Georgia" w:hAnsi="Georgia"/>
+          <w:sz w:val="21"/>
+          <w:szCs w:val="21"/>
+        </w:rPr>
+        <w:t xml:space="preserve">As duas folhas eram uma ata. Lucas leu devagar, com a ajuda do inglês de escola e de quinze anos de contratos lidos de má vontade. Era a ata de uma empresa registrada nas Ilhas Virgens Britânicas, com conta num banco de Zurique. O nome da empresa o fez parar na primeira linha.</w:t>
+      </w:r>
+    </w:p>
+    <w:p>
+      <w:pPr>
+        <w:spacing w:after="0" w:line="312"/>
+        <w:ind w:firstLine="340"/>
+        <w:jc w:val="both"/>
+      </w:pPr>
+      <w:r>
+        <w:rPr>
+          <w:rFonts w:ascii="Georgia" w:cs="Georgia" w:eastAsia="Georgia" w:hAnsi="Georgia"/>
+          <w:sz w:val="21"/>
+          <w:szCs w:val="21"/>
+        </w:rPr>
+        <w:t xml:space="preserve">Ubatuba Holdings Ltd.</w:t>
+      </w:r>
+    </w:p>
+    <w:p>
+      <w:pPr>
+        <w:spacing w:after="0" w:line="312"/>
+        <w:ind w:firstLine="340"/>
+        <w:jc w:val="both"/>
+      </w:pPr>
+      <w:r>
+        <w:rPr>
+          <w:rFonts w:ascii="Georgia" w:cs="Georgia" w:eastAsia="Georgia" w:hAnsi="Georgia"/>
+          <w:sz w:val="21"/>
+          <w:szCs w:val="21"/>
+        </w:rPr>
+        <w:t xml:space="preserve">O único acionista era Henrique Salvallus. A ata, assinada por ele em agosto, com a firma reconhecida num cartório de São Paulo, nomeava um diretor com plenos poderes sobre a empresa e sobre a conta, inclusive para movimentar, transferir e encerrar, em caso de morte, incapacidade ou ausência do acionista.</w:t>
+      </w:r>
+    </w:p>
+    <w:p>
+      <w:pPr>
+        <w:spacing w:after="0" w:line="312"/>
+        <w:ind w:firstLine="340"/>
+        <w:jc w:val="both"/>
+      </w:pPr>
+      <w:r>
+        <w:rPr>
+          <w:rFonts w:ascii="Georgia" w:cs="Georgia" w:eastAsia="Georgia" w:hAnsi="Georgia"/>
+          <w:sz w:val="21"/>
+          <w:szCs w:val="21"/>
+        </w:rPr>
+        <w:t xml:space="preserve">O nome do diretor estava escrito na segunda página, em letras maiúsculas, com o número do passaporte ao lado.</w:t>
+      </w:r>
+    </w:p>
+    <w:p>
+      <w:pPr>
+        <w:spacing w:after="0" w:line="312"/>
+        <w:ind w:firstLine="340"/>
+        <w:jc w:val="both"/>
+      </w:pPr>
+      <w:r>
+        <w:rPr>
+          <w:rFonts w:ascii="Georgia" w:cs="Georgia" w:eastAsia="Georgia" w:hAnsi="Georgia"/>
+          <w:sz w:val="21"/>
+          <w:szCs w:val="21"/>
+        </w:rPr>
+        <w:t xml:space="preserve">ÁLVARO MENDES.</w:t>
+      </w:r>
+    </w:p>
+    <w:p>
+      <w:pPr>
+        <w:spacing w:after="0" w:line="312"/>
+        <w:ind w:firstLine="340"/>
+        <w:jc w:val="both"/>
+      </w:pPr>
+      <w:r>
+        <w:rPr>
+          <w:rFonts w:ascii="Georgia" w:cs="Georgia" w:eastAsia="Georgia" w:hAnsi="Georgia"/>
+          <w:sz w:val="21"/>
+          <w:szCs w:val="21"/>
+        </w:rPr>
+        <w:t xml:space="preserve">Lucas leu o nome três vezes. Depois leu o valor do saldo, numa folha de extrato grampeada no fim, e precisou ler duas vezes também. Era mais dinheiro do que a corretora inteira valia. Era dinheiro para três gerações viverem sem trabalhar.</w:t>
+      </w:r>
+    </w:p>
+    <w:p>
+      <w:pPr>
+        <w:spacing w:after="0" w:line="312"/>
+        <w:ind w:firstLine="340"/>
+        <w:jc w:val="both"/>
+      </w:pPr>
+      <w:r>
+        <w:rPr>
+          <w:rFonts w:ascii="Georgia" w:cs="Georgia" w:eastAsia="Georgia" w:hAnsi="Georgia"/>
+          <w:sz w:val="21"/>
+          <w:szCs w:val="21"/>
+        </w:rPr>
+        <w:t xml:space="preserve">E, desde a terça-feira em que o pai morreu, era dinheiro que só um homem no mundo podia movimentar.</w:t>
+      </w:r>
+    </w:p>
+    <w:p>
+      <w:pPr>
+        <w:pBdr>
+          <w:top w:val="single" w:color="555555" w:sz="6" w:space="6"/>
+          <w:bottom w:val="single" w:color="555555" w:sz="6" w:space="6"/>
+          <w:left w:val="single" w:color="555555" w:sz="6" w:space="6"/>
+          <w:right w:val="single" w:color="555555" w:sz="6" w:space="6"/>
+        </w:pBdr>
+        <w:shd w:fill="EFEFEF" w:color="auto" w:val="clear"/>
+        <w:spacing w:after="0" w:before="240"/>
+        <w:ind w:left="227" w:right="227"/>
+        <w:jc w:val="center"/>
+      </w:pPr>
+      <w:r>
+        <w:rPr>
+          <w:rFonts w:ascii="Georgia" w:cs="Georgia" w:eastAsia="Georgia" w:hAnsi="Georgia"/>
+          <w:b/>
+          <w:bCs/>
+          <w:spacing w:val="30"/>
+          <w:sz w:val="17"/>
+          <w:szCs w:val="17"/>
+        </w:rPr>
+        <w:t xml:space="preserve">NO CELULAR DE HENRIQUE</w:t>
+      </w:r>
+    </w:p>
+    <w:p>
+      <w:pPr>
+        <w:pBdr>
+          <w:top w:val="single" w:color="555555" w:sz="6" w:space="6"/>
+          <w:bottom w:val="single" w:color="555555" w:sz="6" w:space="6"/>
+          <w:left w:val="single" w:color="555555" w:sz="6" w:space="6"/>
+          <w:right w:val="single" w:color="555555" w:sz="6" w:space="6"/>
+        </w:pBdr>
+        <w:shd w:fill="EFEFEF" w:color="auto" w:val="clear"/>
+        <w:spacing w:after="240" w:before="0" w:line="288"/>
+        <w:ind w:left="227" w:right="227"/>
+        <w:jc w:val="center"/>
+      </w:pPr>
+      <w:r>
+        <w:rPr>
+          <w:rFonts w:ascii="Georgia" w:cs="Georgia" w:eastAsia="Georgia" w:hAnsi="Georgia"/>
+          <w:i/>
+          <w:iCs/>
+          <w:sz w:val="19"/>
+          <w:szCs w:val="19"/>
+        </w:rPr>
+        <w:t xml:space="preserve">Abra a agenda do celular de Henrique em agosto. Procure o compromisso com o doutor Mauro e leia o que o pai escreveu ao lado do nome.</w:t>
+      </w:r>
+    </w:p>
+    <w:p>
+      <w:pPr>
+        <w:spacing w:after="200" w:before="200"/>
+        <w:jc w:val="center"/>
+      </w:pPr>
+      <w:r>
+        <w:rPr>
+          <w:rFonts w:ascii="Georgia" w:cs="Georgia" w:eastAsia="Georgia" w:hAnsi="Georgia"/>
+          <w:sz w:val="22"/>
+          <w:szCs w:val="22"/>
+        </w:rPr>
+        <w:t xml:space="preserve">*</w:t>
+      </w:r>
+    </w:p>
+    <w:p>
+      <w:pPr>
+        <w:spacing w:after="0" w:line="312"/>
+        <w:ind w:firstLine="340"/>
+        <w:jc w:val="both"/>
+      </w:pPr>
+      <w:r>
+        <w:rPr>
+          <w:rFonts w:ascii="Georgia" w:cs="Georgia" w:eastAsia="Georgia" w:hAnsi="Georgia"/>
+          <w:sz w:val="21"/>
+          <w:szCs w:val="21"/>
+        </w:rPr>
+        <w:t xml:space="preserve">O envelope fechado estava endereçado, na letra do pai, a uma única pessoa. Álvaro.</w:t>
+      </w:r>
+    </w:p>
+    <w:p>
+      <w:pPr>
+        <w:spacing w:after="0" w:line="312"/>
+        <w:ind w:firstLine="340"/>
+        <w:jc w:val="both"/>
+      </w:pPr>
+      <w:r>
+        <w:rPr>
+          <w:rFonts w:ascii="Georgia" w:cs="Georgia" w:eastAsia="Georgia" w:hAnsi="Georgia"/>
+          <w:sz w:val="21"/>
+          <w:szCs w:val="21"/>
+        </w:rPr>
+        <w:t xml:space="preserve">Lucas segurou o envelope por muito tempo. Não tinha o direito de abrir. Sabia disso. Era uma carta do pai para outro homem, guardada numa gaveta trancada de um apartamento secreto. Abrir aquilo era entrar num lugar onde o pai não tinha convidado ninguém.</w:t>
+      </w:r>
+    </w:p>
+    <w:p>
+      <w:pPr>
+        <w:spacing w:after="0" w:line="312"/>
+        <w:ind w:firstLine="340"/>
+        <w:jc w:val="both"/>
+      </w:pPr>
+      <w:r>
+        <w:rPr>
+          <w:rFonts w:ascii="Georgia" w:cs="Georgia" w:eastAsia="Georgia" w:hAnsi="Georgia"/>
+          <w:sz w:val="21"/>
+          <w:szCs w:val="21"/>
+        </w:rPr>
+        <w:t xml:space="preserve">Abriu.</w:t>
+      </w:r>
+    </w:p>
+    <w:p>
+      <w:pPr>
+        <w:spacing w:after="0" w:line="312"/>
+        <w:ind w:firstLine="340"/>
+        <w:jc w:val="both"/>
+      </w:pPr>
+      <w:r>
+        <w:rPr>
+          <w:rFonts w:ascii="Georgia" w:cs="Georgia" w:eastAsia="Georgia" w:hAnsi="Georgia"/>
+          <w:sz w:val="21"/>
+          <w:szCs w:val="21"/>
+        </w:rPr>
+        <w:t xml:space="preserve">Era uma folha só, escrita à mão, sem data.</w:t>
+      </w:r>
+    </w:p>
+    <w:p>
+      <w:pPr>
+        <w:spacing w:after="0" w:line="312"/>
+        <w:ind w:firstLine="340"/>
+        <w:jc w:val="both"/>
+      </w:pPr>
+      <w:r>
+        <w:rPr>
+          <w:rFonts w:ascii="Georgia" w:cs="Georgia" w:eastAsia="Georgia" w:hAnsi="Georgia"/>
+          <w:sz w:val="21"/>
+          <w:szCs w:val="21"/>
+        </w:rPr>
+        <w:t xml:space="preserve">Álvaro. Se tudo der certo, você nunca vai precisar ler isto, porque eu mesmo vou te entregar a pasta no dia, em mãos, e a gente vai rir da minha mania de deixar bilhete. Se der errado, cuida de tudo como combinamos. A Ubatuba é sua para administrar, e você sabe para quem é cada parte. Os meninos não podem saber de nada. Quando chegar a hora, você explica. Eles vão ficar com raiva de mim, e vão ter razão. Diz a eles que eu tentei.</w:t>
+      </w:r>
+    </w:p>
+    <w:p>
+      <w:pPr>
+        <w:spacing w:after="0" w:line="312"/>
+        <w:ind w:firstLine="340"/>
+        <w:jc w:val="both"/>
+      </w:pPr>
+      <w:r>
+        <w:rPr>
+          <w:rFonts w:ascii="Georgia" w:cs="Georgia" w:eastAsia="Georgia" w:hAnsi="Georgia"/>
+          <w:sz w:val="21"/>
+          <w:szCs w:val="21"/>
+        </w:rPr>
+        <w:t xml:space="preserve">Obrigado por apagar a luz.</w:t>
+      </w:r>
+    </w:p>
+    <w:p>
+      <w:pPr>
+        <w:spacing w:after="0" w:line="312"/>
+        <w:ind w:firstLine="340"/>
+        <w:jc w:val="both"/>
+      </w:pPr>
+      <w:r>
+        <w:rPr>
+          <w:rFonts w:ascii="Georgia" w:cs="Georgia" w:eastAsia="Georgia" w:hAnsi="Georgia"/>
+          <w:sz w:val="21"/>
+          <w:szCs w:val="21"/>
+        </w:rPr>
+        <w:t xml:space="preserve">H.</w:t>
+      </w:r>
+    </w:p>
+    <w:p>
+      <w:pPr>
+        <w:spacing w:after="0" w:line="312"/>
+        <w:ind w:firstLine="340"/>
+        <w:jc w:val="both"/>
+      </w:pPr>
+      <w:r>
+        <w:rPr>
+          <w:rFonts w:ascii="Georgia" w:cs="Georgia" w:eastAsia="Georgia" w:hAnsi="Georgia"/>
+          <w:sz w:val="21"/>
+          <w:szCs w:val="21"/>
+        </w:rPr>
+        <w:t xml:space="preserve">Lucas leu a carta inteira duas vezes, sentado no sofá de dois lugares, com o sol da manhã entrando pela janela empoeirada.</w:t>
+      </w:r>
+    </w:p>
+    <w:p>
+      <w:pPr>
+        <w:spacing w:after="0" w:line="312"/>
+        <w:ind w:firstLine="340"/>
+        <w:jc w:val="both"/>
+      </w:pPr>
+      <w:r>
+        <w:rPr>
+          <w:rFonts w:ascii="Georgia" w:cs="Georgia" w:eastAsia="Georgia" w:hAnsi="Georgia"/>
+          <w:sz w:val="21"/>
+          <w:szCs w:val="21"/>
+        </w:rPr>
+        <w:t xml:space="preserve">Obrigado por apagar a luz.</w:t>
+      </w:r>
+    </w:p>
+    <w:p>
+      <w:pPr>
+        <w:spacing w:after="0" w:line="312"/>
+        <w:ind w:firstLine="340"/>
+        <w:jc w:val="both"/>
+      </w:pPr>
+      <w:r>
+        <w:rPr>
+          <w:rFonts w:ascii="Georgia" w:cs="Georgia" w:eastAsia="Georgia" w:hAnsi="Georgia"/>
+          <w:sz w:val="21"/>
+          <w:szCs w:val="21"/>
+        </w:rPr>
+        <w:t xml:space="preserve">Era uma expressão do pai. Ele a usava para tudo o que terminava: reuniões que se arrastavam, contratos encerrados, festas que passavam da hora. Quem apaga a luz é o último a sair, dizia. É o que fica para fechar a casa depois que todo mundo foi embora.</w:t>
+      </w:r>
+    </w:p>
+    <w:p>
+      <w:pPr>
+        <w:spacing w:after="0" w:line="312"/>
+        <w:ind w:firstLine="340"/>
+        <w:jc w:val="both"/>
+      </w:pPr>
+      <w:r>
+        <w:rPr>
+          <w:rFonts w:ascii="Georgia" w:cs="Georgia" w:eastAsia="Georgia" w:hAnsi="Georgia"/>
+          <w:sz w:val="21"/>
+          <w:szCs w:val="21"/>
+        </w:rPr>
+        <w:t xml:space="preserve">Se tudo der certo. Se der errado. No dia. Quando chegar a hora.</w:t>
+      </w:r>
+    </w:p>
+    <w:p>
+      <w:pPr>
+        <w:spacing w:after="0" w:line="312"/>
+        <w:ind w:firstLine="340"/>
+        <w:jc w:val="both"/>
+      </w:pPr>
+      <w:r>
+        <w:rPr>
+          <w:rFonts w:ascii="Georgia" w:cs="Georgia" w:eastAsia="Georgia" w:hAnsi="Georgia"/>
+          <w:sz w:val="21"/>
+          <w:szCs w:val="21"/>
+        </w:rPr>
+        <w:t xml:space="preserve">Que dia? Que hora? Dar certo o quê?</w:t>
+      </w:r>
+    </w:p>
+    <w:p>
+      <w:pPr>
+        <w:spacing w:after="200" w:before="200"/>
+        <w:jc w:val="center"/>
+      </w:pPr>
+      <w:r>
+        <w:rPr>
+          <w:rFonts w:ascii="Georgia" w:cs="Georgia" w:eastAsia="Georgia" w:hAnsi="Georgia"/>
+          <w:sz w:val="22"/>
+          <w:szCs w:val="22"/>
+        </w:rPr>
+        <w:t xml:space="preserve">*</w:t>
+      </w:r>
+    </w:p>
+    <w:p>
+      <w:pPr>
+        <w:spacing w:after="0" w:line="312"/>
+        <w:ind w:firstLine="340"/>
+        <w:jc w:val="both"/>
+      </w:pPr>
+      <w:r>
+        <w:rPr>
+          <w:rFonts w:ascii="Georgia" w:cs="Georgia" w:eastAsia="Georgia" w:hAnsi="Georgia"/>
+          <w:sz w:val="21"/>
+          <w:szCs w:val="21"/>
+        </w:rPr>
+        <w:t xml:space="preserve">Ele saiu do apartamento de Moema com a pasta debaixo do braço e a cabeça girando.</w:t>
+      </w:r>
+    </w:p>
+    <w:p>
+      <w:pPr>
+        <w:spacing w:after="0" w:line="312"/>
+        <w:ind w:firstLine="340"/>
+        <w:jc w:val="both"/>
+      </w:pPr>
+      <w:r>
+        <w:rPr>
+          <w:rFonts w:ascii="Georgia" w:cs="Georgia" w:eastAsia="Georgia" w:hAnsi="Georgia"/>
+          <w:sz w:val="21"/>
+          <w:szCs w:val="21"/>
+        </w:rPr>
+        <w:t xml:space="preserve">No carro, parado na rua de pastilhas azuis, tentou pôr as coisas em ordem, como o pai faria. Uma coluna para o que sabia, outra para o que achava.</w:t>
+      </w:r>
+    </w:p>
+    <w:p>
+      <w:pPr>
+        <w:spacing w:after="0" w:line="312"/>
+        <w:ind w:firstLine="340"/>
+        <w:jc w:val="both"/>
+      </w:pPr>
+      <w:r>
+        <w:rPr>
+          <w:rFonts w:ascii="Georgia" w:cs="Georgia" w:eastAsia="Georgia" w:hAnsi="Georgia"/>
+          <w:sz w:val="21"/>
+          <w:szCs w:val="21"/>
+        </w:rPr>
+        <w:t xml:space="preserve">Sabia que o pai estava se preparando para ir embora do Brasil. A mala, o sobretudo, o guia, o chalé, a passagem para Zurique que Lia tinha encontrado. Sabia que o pai tinha confiado todo o dinheiro que ninguém conhecia a um único homem, o médico da família, o amigo de Ubatuba. Sabia que esse homem tinha estado na casa do pai entre as sete e cinco e as oito e doze da manhã da morte. Que tinha assinado o atestado. Que tinha proibido a preparação do corpo. Que tinha lutado contra a cremação no corredor do crematório, ele que sempre defendera a cremação. Que tinha ligado para o celular do pai às sete e quarenta, de dentro da mesma casa.</w:t>
+      </w:r>
+    </w:p>
+    <w:p>
+      <w:pPr>
+        <w:spacing w:after="0" w:line="312"/>
+        <w:ind w:firstLine="340"/>
+        <w:jc w:val="both"/>
+      </w:pPr>
+      <w:r>
+        <w:rPr>
+          <w:rFonts w:ascii="Georgia" w:cs="Georgia" w:eastAsia="Georgia" w:hAnsi="Georgia"/>
+          <w:sz w:val="21"/>
+          <w:szCs w:val="21"/>
+        </w:rPr>
+        <w:t xml:space="preserve">E agora sabia que, com o pai morto, esse homem tinha plenos poderes sobre uma fortuna numa conta em Zurique. Sem que nenhum dos filhos soubesse que ela existia.</w:t>
+      </w:r>
+    </w:p>
+    <w:p>
+      <w:pPr>
+        <w:spacing w:after="0" w:line="312"/>
+        <w:ind w:firstLine="340"/>
+        <w:jc w:val="both"/>
+      </w:pPr>
+      <w:r>
+        <w:rPr>
+          <w:rFonts w:ascii="Georgia" w:cs="Georgia" w:eastAsia="Georgia" w:hAnsi="Georgia"/>
+          <w:sz w:val="21"/>
+          <w:szCs w:val="21"/>
+        </w:rPr>
+        <w:t xml:space="preserve">Achava que não podia ser.</w:t>
+      </w:r>
+    </w:p>
+    <w:p>
+      <w:pPr>
+        <w:spacing w:after="0" w:line="312"/>
+        <w:ind w:firstLine="340"/>
+        <w:jc w:val="both"/>
+      </w:pPr>
+      <w:r>
+        <w:rPr>
+          <w:rFonts w:ascii="Georgia" w:cs="Georgia" w:eastAsia="Georgia" w:hAnsi="Georgia"/>
+          <w:sz w:val="21"/>
+          <w:szCs w:val="21"/>
+        </w:rPr>
+        <w:t xml:space="preserve">Achava que o doutor Álvaro era o homem que tinha tratado a catapora dele. Que tinha chorado no crematório. Que estava abraçado ao pai numa foto de praia de 1971.</w:t>
+      </w:r>
+    </w:p>
+    <w:p>
+      <w:pPr>
+        <w:spacing w:after="0" w:line="312"/>
+        <w:ind w:firstLine="340"/>
+        <w:jc w:val="both"/>
+      </w:pPr>
+      <w:r>
+        <w:rPr>
+          <w:rFonts w:ascii="Georgia" w:cs="Georgia" w:eastAsia="Georgia" w:hAnsi="Georgia"/>
+          <w:sz w:val="21"/>
+          <w:szCs w:val="21"/>
+        </w:rPr>
+        <w:t xml:space="preserve">Achava também que, se fosse qualquer outro nome naquela ata, ele já estaria na sala da delegada Regina Paiva, com a pasta aberta sobre a mesa.</w:t>
+      </w:r>
+    </w:p>
+    <w:p>
+      <w:pPr>
+        <w:spacing w:after="0" w:line="312"/>
+        <w:ind w:firstLine="340"/>
+        <w:jc w:val="both"/>
+      </w:pPr>
+      <w:r>
+        <w:rPr>
+          <w:rFonts w:ascii="Georgia" w:cs="Georgia" w:eastAsia="Georgia" w:hAnsi="Georgia"/>
+          <w:sz w:val="21"/>
+          <w:szCs w:val="21"/>
+        </w:rPr>
+        <w:t xml:space="preserve">Lucas tirou do bolso a folha dobrada da tabela, a que tinha a linha do médico riscada até rasgar. Desdobrou sobre o volante. Olhou para o risco durante muito tempo.</w:t>
+      </w:r>
+    </w:p>
+    <w:p>
+      <w:pPr>
+        <w:spacing w:after="0" w:line="312"/>
+        <w:ind w:firstLine="340"/>
+        <w:jc w:val="both"/>
+      </w:pPr>
+      <w:r>
+        <w:rPr>
+          <w:rFonts w:ascii="Georgia" w:cs="Georgia" w:eastAsia="Georgia" w:hAnsi="Georgia"/>
+          <w:sz w:val="21"/>
+          <w:szCs w:val="21"/>
+        </w:rPr>
+        <w:t xml:space="preserve">Depois pegou uma caneta e, ao lado da linha rasgada, escreveu uma palavra só.</w:t>
+      </w:r>
+    </w:p>
+    <w:p>
+      <w:pPr>
+        <w:spacing w:after="0" w:line="312"/>
+        <w:ind w:firstLine="340"/>
+        <w:jc w:val="both"/>
+      </w:pPr>
+      <w:r>
+        <w:rPr>
+          <w:rFonts w:ascii="Georgia" w:cs="Georgia" w:eastAsia="Georgia" w:hAnsi="Georgia"/>
+          <w:sz w:val="21"/>
+          <w:szCs w:val="21"/>
+        </w:rPr>
+        <w:t xml:space="preserve">Ubatuba.</w:t>
+      </w:r>
+    </w:p>
+    <w:p>
+      <w:pPr>
+        <w:spacing w:after="200" w:before="200"/>
+        <w:jc w:val="center"/>
+      </w:pPr>
+      <w:r>
+        <w:rPr>
+          <w:rFonts w:ascii="Georgia" w:cs="Georgia" w:eastAsia="Georgia" w:hAnsi="Georgia"/>
+          <w:sz w:val="22"/>
+          <w:szCs w:val="22"/>
+        </w:rPr>
+        <w:t xml:space="preserve">*</w:t>
+      </w:r>
+    </w:p>
+    <w:p>
+      <w:pPr>
+        <w:spacing w:after="0" w:line="312"/>
+        <w:ind w:firstLine="340"/>
+        <w:jc w:val="both"/>
+      </w:pPr>
+      <w:r>
+        <w:rPr>
+          <w:rFonts w:ascii="Georgia" w:cs="Georgia" w:eastAsia="Georgia" w:hAnsi="Georgia"/>
+          <w:sz w:val="21"/>
+          <w:szCs w:val="21"/>
+        </w:rPr>
+        <w:t xml:space="preserve">Encontrou Lia às oito da noite, como tinham combinado, num café da Rua Augusta que ficava aberto até tarde. Ela já estava lá, numa mesa do fundo, com uma fatia de bolo de cenoura pela metade e um chá que ela mexia sem parar.</w:t>
+      </w:r>
+    </w:p>
+    <w:p>
+      <w:pPr>
+        <w:spacing w:after="0" w:line="312"/>
+        <w:ind w:firstLine="340"/>
+        <w:jc w:val="both"/>
+      </w:pPr>
+      <w:r>
+        <w:rPr>
+          <w:rFonts w:ascii="Georgia" w:cs="Georgia" w:eastAsia="Georgia" w:hAnsi="Georgia"/>
+          <w:sz w:val="21"/>
+          <w:szCs w:val="21"/>
+        </w:rPr>
+        <w:t xml:space="preserve">— Sem listas — disse ela, quando ele se sentou.</w:t>
+      </w:r>
+    </w:p>
+    <w:p>
+      <w:pPr>
+        <w:spacing w:after="0" w:line="312"/>
+        <w:ind w:firstLine="340"/>
+        <w:jc w:val="both"/>
+      </w:pPr>
+      <w:r>
+        <w:rPr>
+          <w:rFonts w:ascii="Georgia" w:cs="Georgia" w:eastAsia="Georgia" w:hAnsi="Georgia"/>
+          <w:sz w:val="21"/>
+          <w:szCs w:val="21"/>
+        </w:rPr>
+        <w:t xml:space="preserve">— Sem listas.</w:t>
+      </w:r>
+    </w:p>
+    <w:p>
+      <w:pPr>
+        <w:spacing w:after="0" w:line="312"/>
+        <w:ind w:firstLine="340"/>
+        <w:jc w:val="both"/>
+      </w:pPr>
+      <w:r>
+        <w:rPr>
+          <w:rFonts w:ascii="Georgia" w:cs="Georgia" w:eastAsia="Georgia" w:hAnsi="Georgia"/>
+          <w:sz w:val="21"/>
+          <w:szCs w:val="21"/>
+        </w:rPr>
+        <w:t xml:space="preserve">Ela contou da galeria, do chalé de doze janelas, do desenho de criança, da passagem para Zurique. Mostrou as fotos no celular do pai. Lucas olhou para o chalé e sentiu um nó na garganta que não conseguiu desatar a noite inteira.</w:t>
+      </w:r>
+    </w:p>
+    <w:p>
+      <w:pPr>
+        <w:spacing w:after="0" w:line="312"/>
+        <w:ind w:firstLine="340"/>
+        <w:jc w:val="both"/>
+      </w:pPr>
+      <w:r>
+        <w:rPr>
+          <w:rFonts w:ascii="Georgia" w:cs="Georgia" w:eastAsia="Georgia" w:hAnsi="Georgia"/>
+          <w:sz w:val="21"/>
+          <w:szCs w:val="21"/>
+        </w:rPr>
+        <w:t xml:space="preserve">Ele contou do apartamento de Moema. Da mala, do sobretudo com etiqueta, do guia da Suíça com a página dobrada. As doze janelas, escritas na margem. Lia levou a mão à boca.</w:t>
+      </w:r>
+    </w:p>
+    <w:p>
+      <w:pPr>
+        <w:spacing w:after="0" w:line="312"/>
+        <w:ind w:firstLine="340"/>
+        <w:jc w:val="both"/>
+      </w:pPr>
+      <w:r>
+        <w:rPr>
+          <w:rFonts w:ascii="Georgia" w:cs="Georgia" w:eastAsia="Georgia" w:hAnsi="Georgia"/>
+          <w:sz w:val="21"/>
+          <w:szCs w:val="21"/>
+        </w:rPr>
+        <w:t xml:space="preserve">Mas Lucas não contou da gaveta trancada. Não falou da ata, nem da Ubatuba Holdings, nem do nome em letras maiúsculas na segunda página. Não falou do envelope.</w:t>
+      </w:r>
+    </w:p>
+    <w:p>
+      <w:pPr>
+        <w:spacing w:after="0" w:line="312"/>
+        <w:ind w:firstLine="340"/>
+        <w:jc w:val="both"/>
+      </w:pPr>
+      <w:r>
+        <w:rPr>
+          <w:rFonts w:ascii="Georgia" w:cs="Georgia" w:eastAsia="Georgia" w:hAnsi="Georgia"/>
+          <w:sz w:val="21"/>
+          <w:szCs w:val="21"/>
+        </w:rPr>
+        <w:t xml:space="preserve">Do outro lado da mesa, Lia também não disse uma palavra sobre o que tinha pensado, sozinha no carro, olhando para a foto de Ubatuba na galeria.</w:t>
+      </w:r>
+    </w:p>
+    <w:p>
+      <w:pPr>
+        <w:spacing w:after="0" w:line="312"/>
+        <w:ind w:firstLine="340"/>
+        <w:jc w:val="both"/>
+      </w:pPr>
+      <w:r>
+        <w:rPr>
+          <w:rFonts w:ascii="Georgia" w:cs="Georgia" w:eastAsia="Georgia" w:hAnsi="Georgia"/>
+          <w:sz w:val="21"/>
+          <w:szCs w:val="21"/>
+        </w:rPr>
+        <w:t xml:space="preserve">Os dois tomaram o resto do chá e do café olhando para a rua, cada um com a mesma suspeita no bolso, cada um achando que estava protegendo o outro de uma ideia insuportável.</w:t>
+      </w:r>
+    </w:p>
+    <w:p>
+      <w:pPr>
+        <w:spacing w:after="0" w:line="312"/>
+        <w:ind w:firstLine="340"/>
+        <w:jc w:val="both"/>
+      </w:pPr>
+      <w:r>
+        <w:rPr>
+          <w:rFonts w:ascii="Georgia" w:cs="Georgia" w:eastAsia="Georgia" w:hAnsi="Georgia"/>
+          <w:sz w:val="21"/>
+          <w:szCs w:val="21"/>
+        </w:rPr>
+        <w:t xml:space="preserve">Na saída, Lia o abraçou, um abraço de verdade, demorado, o primeiro em semanas.</w:t>
+      </w:r>
+    </w:p>
+    <w:p>
+      <w:pPr>
+        <w:spacing w:after="0" w:line="312"/>
+        <w:ind w:firstLine="340"/>
+        <w:jc w:val="both"/>
+      </w:pPr>
+      <w:r>
+        <w:rPr>
+          <w:rFonts w:ascii="Georgia" w:cs="Georgia" w:eastAsia="Georgia" w:hAnsi="Georgia"/>
+          <w:sz w:val="21"/>
+          <w:szCs w:val="21"/>
+        </w:rPr>
+        <w:t xml:space="preserve">— Ele estava indo embora, Lucas — disse ela, no ouvido dele. — Alguém não deixou ele ir.</w:t>
+      </w:r>
+    </w:p>
+    <w:p>
+      <w:pPr>
+        <w:spacing w:after="0" w:line="312"/>
+        <w:ind w:firstLine="340"/>
+        <w:jc w:val="both"/>
+      </w:pPr>
+      <w:r>
+        <w:rPr>
+          <w:rFonts w:ascii="Georgia" w:cs="Georgia" w:eastAsia="Georgia" w:hAnsi="Georgia"/>
+          <w:sz w:val="21"/>
+          <w:szCs w:val="21"/>
+        </w:rPr>
+        <w:t xml:space="preserve">Lucas não respondeu. Pensou na carta na pasta debaixo do braço.</w:t>
+      </w:r>
+    </w:p>
+    <w:p>
+      <w:pPr>
+        <w:spacing w:after="0" w:line="312"/>
+        <w:ind w:firstLine="340"/>
+        <w:jc w:val="both"/>
+      </w:pPr>
+      <w:r>
+        <w:rPr>
+          <w:rFonts w:ascii="Georgia" w:cs="Georgia" w:eastAsia="Georgia" w:hAnsi="Georgia"/>
+          <w:sz w:val="21"/>
+          <w:szCs w:val="21"/>
+        </w:rPr>
+        <w:t xml:space="preserve">Obrigado por apagar a luz.</w:t>
       </w:r>
     </w:p>
     <w:sectPr>

</xml_diff>

<commit_message>
Livro policial: capítulo 25 (Protocolo 71)
Co-Authored-By: Claude Opus 5.5 <noreply@anthropic.com>
Claude-Session: https://claude.ai/code/session_01BrurxSYygRC3rRhaUYosm1
</commit_message>
<xml_diff>
--- a/docs/livro-policial/TODO_CRIME_TEM_UM_AUTOR.docx
+++ b/docs/livro-policial/TODO_CRIME_TEM_UM_AUTOR.docx
@@ -25579,6 +25579,998 @@
           <w:szCs w:val="21"/>
         </w:rPr>
         <w:t xml:space="preserve">Obrigado por apagar a luz.</w:t>
+      </w:r>
+    </w:p>
+    <w:p>
+      <w:pPr>
+        <w:pageBreakBefore/>
+        <w:spacing w:after="120" w:before="1800"/>
+        <w:jc w:val="center"/>
+      </w:pPr>
+      <w:r>
+        <w:rPr>
+          <w:rFonts w:ascii="Georgia" w:cs="Georgia" w:eastAsia="Georgia" w:hAnsi="Georgia"/>
+          <w:spacing w:val="40"/>
+          <w:sz w:val="20"/>
+          <w:szCs w:val="20"/>
+        </w:rPr>
+        <w:t xml:space="preserve">CAPÍTULO 25</w:t>
+      </w:r>
+    </w:p>
+    <w:p>
+      <w:pPr>
+        <w:spacing w:after="720"/>
+        <w:jc w:val="center"/>
+      </w:pPr>
+      <w:r>
+        <w:rPr>
+          <w:rFonts w:ascii="Georgia" w:cs="Georgia" w:eastAsia="Georgia" w:hAnsi="Georgia"/>
+          <w:b/>
+          <w:bCs/>
+          <w:sz w:val="32"/>
+          <w:szCs w:val="32"/>
+        </w:rPr>
+        <w:t xml:space="preserve">Protocolo 71</w:t>
+      </w:r>
+    </w:p>
+    <w:p>
+      <w:pPr>
+        <w:spacing w:after="0" w:line="312"/>
+        <w:ind w:firstLine="340"/>
+        <w:jc w:val="both"/>
+      </w:pPr>
+      <w:r>
+        <w:rPr>
+          <w:rFonts w:ascii="Georgia" w:cs="Georgia" w:eastAsia="Georgia" w:hAnsi="Georgia"/>
+          <w:sz w:val="21"/>
+          <w:szCs w:val="21"/>
+        </w:rPr>
+        <w:t xml:space="preserve">O consultório do doutor Álvaro Mendes ficava num prédio dos anos cinquenta na Avenida Angélica, com corredores de granito e uma placa de bronze na porta que Lia conhecia desde criança. Ali tinha tomado vacina, tirado ponto de queda de bicicleta, ouvido pela primeira vez a palavra apendicite.</w:t>
+      </w:r>
+    </w:p>
+    <w:p>
+      <w:pPr>
+        <w:spacing w:after="0" w:line="312"/>
+        <w:ind w:firstLine="340"/>
+        <w:jc w:val="both"/>
+      </w:pPr>
+      <w:r>
+        <w:rPr>
+          <w:rFonts w:ascii="Georgia" w:cs="Georgia" w:eastAsia="Georgia" w:hAnsi="Georgia"/>
+          <w:sz w:val="21"/>
+          <w:szCs w:val="21"/>
+        </w:rPr>
+        <w:t xml:space="preserve">A secretária, dona Neusa, era a mesma de vinte anos antes, só que mais branca e mais baixa.</w:t>
+      </w:r>
+    </w:p>
+    <w:p>
+      <w:pPr>
+        <w:spacing w:after="0" w:line="312"/>
+        <w:ind w:firstLine="340"/>
+        <w:jc w:val="both"/>
+      </w:pPr>
+      <w:r>
+        <w:rPr>
+          <w:rFonts w:ascii="Georgia" w:cs="Georgia" w:eastAsia="Georgia" w:hAnsi="Georgia"/>
+          <w:sz w:val="21"/>
+          <w:szCs w:val="21"/>
+        </w:rPr>
+        <w:t xml:space="preserve">— Menina Lia! — Levantou-se para abraçá-la. — O doutor não está. Viajou para um congresso em Belo Horizonte. Volta na terça. Era consulta?</w:t>
+      </w:r>
+    </w:p>
+    <w:p>
+      <w:pPr>
+        <w:spacing w:after="0" w:line="312"/>
+        <w:ind w:firstLine="340"/>
+        <w:jc w:val="both"/>
+      </w:pPr>
+      <w:r>
+        <w:rPr>
+          <w:rFonts w:ascii="Georgia" w:cs="Georgia" w:eastAsia="Georgia" w:hAnsi="Georgia"/>
+          <w:sz w:val="21"/>
+          <w:szCs w:val="21"/>
+        </w:rPr>
+        <w:t xml:space="preserve">— Não, dona Neusa. Eu só passei para agradecer. Por tudo o que ele fez pelo meu pai.</w:t>
+      </w:r>
+    </w:p>
+    <w:p>
+      <w:pPr>
+        <w:spacing w:after="0" w:line="312"/>
+        <w:ind w:firstLine="340"/>
+        <w:jc w:val="both"/>
+      </w:pPr>
+      <w:r>
+        <w:rPr>
+          <w:rFonts w:ascii="Georgia" w:cs="Georgia" w:eastAsia="Georgia" w:hAnsi="Georgia"/>
+          <w:sz w:val="21"/>
+          <w:szCs w:val="21"/>
+        </w:rPr>
+        <w:t xml:space="preserve">Era uma mentira que ela tinha ensaiado no carro, e a mentira saiu tão bem que Lia sentiu vergonha.</w:t>
+      </w:r>
+    </w:p>
+    <w:p>
+      <w:pPr>
+        <w:spacing w:after="0" w:line="312"/>
+        <w:ind w:firstLine="340"/>
+        <w:jc w:val="both"/>
+      </w:pPr>
+      <w:r>
+        <w:rPr>
+          <w:rFonts w:ascii="Georgia" w:cs="Georgia" w:eastAsia="Georgia" w:hAnsi="Georgia"/>
+          <w:sz w:val="21"/>
+          <w:szCs w:val="21"/>
+        </w:rPr>
+        <w:t xml:space="preserve">Dona Neusa a fez sentar, trouxe um copo de água com açúcar, que Lia bebeu de uma vez, e falou por quase meia hora. Do doutor Henrique, que entrava ali sem marcar hora e saía rindo. Da amizade de praia dos dois. Do jeito como o doutor Álvaro tinha ficado depois do enterro, quer dizer, da cremação, magro, calado, cancelando consultas, saindo cedo.</w:t>
+      </w:r>
+    </w:p>
+    <w:p>
+      <w:pPr>
+        <w:spacing w:after="0" w:line="312"/>
+        <w:ind w:firstLine="340"/>
+        <w:jc w:val="both"/>
+      </w:pPr>
+      <w:r>
+        <w:rPr>
+          <w:rFonts w:ascii="Georgia" w:cs="Georgia" w:eastAsia="Georgia" w:hAnsi="Georgia"/>
+          <w:sz w:val="21"/>
+          <w:szCs w:val="21"/>
+        </w:rPr>
+        <w:t xml:space="preserve">— Nunca vi o doutor assim — disse ela, baixando a voz. — Nem quando o sítio deu aquele problema, anos atrás.</w:t>
+      </w:r>
+    </w:p>
+    <w:p>
+      <w:pPr>
+        <w:spacing w:after="0" w:line="312"/>
+        <w:ind w:firstLine="340"/>
+        <w:jc w:val="both"/>
+      </w:pPr>
+      <w:r>
+        <w:rPr>
+          <w:rFonts w:ascii="Georgia" w:cs="Georgia" w:eastAsia="Georgia" w:hAnsi="Georgia"/>
+          <w:sz w:val="21"/>
+          <w:szCs w:val="21"/>
+        </w:rPr>
+        <w:t xml:space="preserve">— Que sítio?</w:t>
+      </w:r>
+    </w:p>
+    <w:p>
+      <w:pPr>
+        <w:spacing w:after="0" w:line="312"/>
+        <w:ind w:firstLine="340"/>
+        <w:jc w:val="both"/>
+      </w:pPr>
+      <w:r>
+        <w:rPr>
+          <w:rFonts w:ascii="Georgia" w:cs="Georgia" w:eastAsia="Georgia" w:hAnsi="Georgia"/>
+          <w:sz w:val="21"/>
+          <w:szCs w:val="21"/>
+        </w:rPr>
+        <w:t xml:space="preserve">— O de Cotia. Onde ele fazia as pesquisas dele. — Dona Neusa fez um gesto vago com a mão. — Coisa de rato, de remédio para dor, para paciente de câncer. Ele não gosta que eu fale. Teve um problema com uma comissão da faculdade, uns papéis que não foram aprovados. Ele ficou muito chateado. Disse que essa gente não entendia nada de sofrimento.</w:t>
+      </w:r>
+    </w:p>
+    <w:p>
+      <w:pPr>
+        <w:spacing w:after="200" w:before="200"/>
+        <w:jc w:val="center"/>
+      </w:pPr>
+      <w:r>
+        <w:rPr>
+          <w:rFonts w:ascii="Georgia" w:cs="Georgia" w:eastAsia="Georgia" w:hAnsi="Georgia"/>
+          <w:sz w:val="22"/>
+          <w:szCs w:val="22"/>
+        </w:rPr>
+        <w:t xml:space="preserve">*</w:t>
+      </w:r>
+    </w:p>
+    <w:p>
+      <w:pPr>
+        <w:spacing w:after="0" w:line="312"/>
+        <w:ind w:firstLine="340"/>
+        <w:jc w:val="both"/>
+      </w:pPr>
+      <w:r>
+        <w:rPr>
+          <w:rFonts w:ascii="Georgia" w:cs="Georgia" w:eastAsia="Georgia" w:hAnsi="Georgia"/>
+          <w:sz w:val="21"/>
+          <w:szCs w:val="21"/>
+        </w:rPr>
+        <w:t xml:space="preserve">Lia saiu do prédio da Angélica com o coração batendo forte e ligou para uma pessoa com quem não falava havia três anos.</w:t>
+      </w:r>
+    </w:p>
+    <w:p>
+      <w:pPr>
+        <w:spacing w:after="0" w:line="312"/>
+        <w:ind w:firstLine="340"/>
+        <w:jc w:val="both"/>
+      </w:pPr>
+      <w:r>
+        <w:rPr>
+          <w:rFonts w:ascii="Georgia" w:cs="Georgia" w:eastAsia="Georgia" w:hAnsi="Georgia"/>
+          <w:sz w:val="21"/>
+          <w:szCs w:val="21"/>
+        </w:rPr>
+        <w:t xml:space="preserve">Renata tinha sido sua colega de escola, das que sentavam no fundo da sala e desenhavam na última página do caderno. Depois Lia foi para a arquitetura e Renata para a biologia. Agora trabalhava no biotério de uma faculdade de medicina de São Paulo, cuidando de animais de laboratório, e era, entre outras coisas, secretária da comissão que aprovava ou recusava pesquisas com animais.</w:t>
+      </w:r>
+    </w:p>
+    <w:p>
+      <w:pPr>
+        <w:spacing w:after="0" w:line="312"/>
+        <w:ind w:firstLine="340"/>
+        <w:jc w:val="both"/>
+      </w:pPr>
+      <w:r>
+        <w:rPr>
+          <w:rFonts w:ascii="Georgia" w:cs="Georgia" w:eastAsia="Georgia" w:hAnsi="Georgia"/>
+          <w:sz w:val="21"/>
+          <w:szCs w:val="21"/>
+        </w:rPr>
+        <w:t xml:space="preserve">Encontraram-se num boteco perto da Avenida Doutor Arnaldo, à noite. Renata pediu uma cerveja e um pastel de queijo, e comeu o pastel inteiro antes que Lia terminasse de explicar o que queria.</w:t>
+      </w:r>
+    </w:p>
+    <w:p>
+      <w:pPr>
+        <w:spacing w:after="0" w:line="312"/>
+        <w:ind w:firstLine="340"/>
+        <w:jc w:val="both"/>
+      </w:pPr>
+      <w:r>
+        <w:rPr>
+          <w:rFonts w:ascii="Georgia" w:cs="Georgia" w:eastAsia="Georgia" w:hAnsi="Georgia"/>
+          <w:sz w:val="21"/>
+          <w:szCs w:val="21"/>
+        </w:rPr>
+        <w:t xml:space="preserve">— Álvaro Mendes — repetiu Renata, limpando os dedos no guardanapo. — Lia, você sabe o que está me pedindo?</w:t>
+      </w:r>
+    </w:p>
+    <w:p>
+      <w:pPr>
+        <w:spacing w:after="0" w:line="312"/>
+        <w:ind w:firstLine="340"/>
+        <w:jc w:val="both"/>
+      </w:pPr>
+      <w:r>
+        <w:rPr>
+          <w:rFonts w:ascii="Georgia" w:cs="Georgia" w:eastAsia="Georgia" w:hAnsi="Georgia"/>
+          <w:sz w:val="21"/>
+          <w:szCs w:val="21"/>
+        </w:rPr>
+        <w:t xml:space="preserve">— Sei.</w:t>
+      </w:r>
+    </w:p>
+    <w:p>
+      <w:pPr>
+        <w:spacing w:after="0" w:line="312"/>
+        <w:ind w:firstLine="340"/>
+        <w:jc w:val="both"/>
+      </w:pPr>
+      <w:r>
+        <w:rPr>
+          <w:rFonts w:ascii="Georgia" w:cs="Georgia" w:eastAsia="Georgia" w:hAnsi="Georgia"/>
+          <w:sz w:val="21"/>
+          <w:szCs w:val="21"/>
+        </w:rPr>
+        <w:t xml:space="preserve">— Isso é sigiloso. Projeto recusado não é público.</w:t>
+      </w:r>
+    </w:p>
+    <w:p>
+      <w:pPr>
+        <w:spacing w:after="0" w:line="312"/>
+        <w:ind w:firstLine="340"/>
+        <w:jc w:val="both"/>
+      </w:pPr>
+      <w:r>
+        <w:rPr>
+          <w:rFonts w:ascii="Georgia" w:cs="Georgia" w:eastAsia="Georgia" w:hAnsi="Georgia"/>
+          <w:sz w:val="21"/>
+          <w:szCs w:val="21"/>
+        </w:rPr>
+        <w:t xml:space="preserve">— Eu sei. — Lia girou o copo de água entre as mãos. — Renata, ele foi o último a ver o meu pai vivo.</w:t>
+      </w:r>
+    </w:p>
+    <w:p>
+      <w:pPr>
+        <w:spacing w:after="0" w:line="312"/>
+        <w:ind w:firstLine="340"/>
+        <w:jc w:val="both"/>
+      </w:pPr>
+      <w:r>
+        <w:rPr>
+          <w:rFonts w:ascii="Georgia" w:cs="Georgia" w:eastAsia="Georgia" w:hAnsi="Georgia"/>
+          <w:sz w:val="21"/>
+          <w:szCs w:val="21"/>
+        </w:rPr>
+        <w:t xml:space="preserve">A amiga ficou olhando para ela um tempo. Depois tirou o celular do bolso, procurou alguma coisa e virou a tela para Lia.</w:t>
+      </w:r>
+    </w:p>
+    <w:p>
+      <w:pPr>
+        <w:spacing w:after="0" w:line="312"/>
+        <w:ind w:firstLine="340"/>
+        <w:jc w:val="both"/>
+      </w:pPr>
+      <w:r>
+        <w:rPr>
+          <w:rFonts w:ascii="Georgia" w:cs="Georgia" w:eastAsia="Georgia" w:hAnsi="Georgia"/>
+          <w:sz w:val="21"/>
+          <w:szCs w:val="21"/>
+        </w:rPr>
+        <w:t xml:space="preserve">— Eu lembro desse projeto porque foi o mais esquisito que passou pela comissão desde que eu estou lá — disse. — Dois mil e oito. O nome era bonito, cheio de palavras técnicas. Mas o que ele queria, na prática, era induzir em ratos um estado de morte aparente. Uma catalepsia, ele chamava. O animal fica sem reação nenhuma, sem pulso que se sinta, com a respiração tão fraca que nenhum aparelho comum detecta. Durante horas. Às vezes, mais de um dia.</w:t>
+      </w:r>
+    </w:p>
+    <w:p>
+      <w:pPr>
+        <w:spacing w:after="0" w:line="312"/>
+        <w:ind w:firstLine="340"/>
+        <w:jc w:val="both"/>
+      </w:pPr>
+      <w:r>
+        <w:rPr>
+          <w:rFonts w:ascii="Georgia" w:cs="Georgia" w:eastAsia="Georgia" w:hAnsi="Georgia"/>
+          <w:sz w:val="21"/>
+          <w:szCs w:val="21"/>
+        </w:rPr>
+        <w:t xml:space="preserve">— Para quê?</w:t>
+      </w:r>
+    </w:p>
+    <w:p>
+      <w:pPr>
+        <w:spacing w:after="0" w:line="312"/>
+        <w:ind w:firstLine="340"/>
+        <w:jc w:val="both"/>
+      </w:pPr>
+      <w:r>
+        <w:rPr>
+          <w:rFonts w:ascii="Georgia" w:cs="Georgia" w:eastAsia="Georgia" w:hAnsi="Georgia"/>
+          <w:sz w:val="21"/>
+          <w:szCs w:val="21"/>
+        </w:rPr>
+        <w:t xml:space="preserve">— Para dor. Ele dizia que pacientes de câncer em estado terminal podiam passar pelos piores dias de dor nesse estado, desligados de tudo, e depois voltar. Como uma hibernação. — Renata deu um gole na cerveja. — No papel, era uma ideia quase bonita. Na prática, os animais não voltavam sempre. Precisavam de uma segunda substância, uma espécie de antídoto, aplicada dentro de um certo tempo. Se ninguém aplicasse, o estado virava morte de verdade.</w:t>
+      </w:r>
+    </w:p>
+    <w:p>
+      <w:pPr>
+        <w:spacing w:after="0" w:line="312"/>
+        <w:ind w:firstLine="340"/>
+        <w:jc w:val="both"/>
+      </w:pPr>
+      <w:r>
+        <w:rPr>
+          <w:rFonts w:ascii="Georgia" w:cs="Georgia" w:eastAsia="Georgia" w:hAnsi="Georgia"/>
+          <w:sz w:val="21"/>
+          <w:szCs w:val="21"/>
+        </w:rPr>
+        <w:t xml:space="preserve">Lia sentiu um frio subir pelas costas.</w:t>
+      </w:r>
+    </w:p>
+    <w:p>
+      <w:pPr>
+        <w:spacing w:after="0" w:line="312"/>
+        <w:ind w:firstLine="340"/>
+        <w:jc w:val="both"/>
+      </w:pPr>
+      <w:r>
+        <w:rPr>
+          <w:rFonts w:ascii="Georgia" w:cs="Georgia" w:eastAsia="Georgia" w:hAnsi="Georgia"/>
+          <w:sz w:val="21"/>
+          <w:szCs w:val="21"/>
+        </w:rPr>
+        <w:t xml:space="preserve">— A comissão recusou.</w:t>
+      </w:r>
+    </w:p>
+    <w:p>
+      <w:pPr>
+        <w:spacing w:after="0" w:line="312"/>
+        <w:ind w:firstLine="340"/>
+        <w:jc w:val="both"/>
+      </w:pPr>
+      <w:r>
+        <w:rPr>
+          <w:rFonts w:ascii="Georgia" w:cs="Georgia" w:eastAsia="Georgia" w:hAnsi="Georgia"/>
+          <w:sz w:val="21"/>
+          <w:szCs w:val="21"/>
+        </w:rPr>
+        <w:t xml:space="preserve">— Recusou por unanimidade. Era perigoso, não tinha base científica suficiente, e o pedido de testes em seres humanos, na fase seguinte, deixou todo mundo de cabelo em pé. — Renata guardou o celular. — Ele recorreu duas vezes. Perdeu as duas. Depois sumiu. A gente soube, por fora, que ele continuou num sítio particular. Sem autorização de ninguém.</w:t>
+      </w:r>
+    </w:p>
+    <w:p>
+      <w:pPr>
+        <w:spacing w:after="200" w:before="200"/>
+        <w:jc w:val="center"/>
+      </w:pPr>
+      <w:r>
+        <w:rPr>
+          <w:rFonts w:ascii="Georgia" w:cs="Georgia" w:eastAsia="Georgia" w:hAnsi="Georgia"/>
+          <w:sz w:val="22"/>
+          <w:szCs w:val="22"/>
+        </w:rPr>
+        <w:t xml:space="preserve">*</w:t>
+      </w:r>
+    </w:p>
+    <w:p>
+      <w:pPr>
+        <w:spacing w:after="0" w:line="312"/>
+        <w:ind w:firstLine="340"/>
+        <w:jc w:val="both"/>
+      </w:pPr>
+      <w:r>
+        <w:rPr>
+          <w:rFonts w:ascii="Georgia" w:cs="Georgia" w:eastAsia="Georgia" w:hAnsi="Georgia"/>
+          <w:sz w:val="21"/>
+          <w:szCs w:val="21"/>
+        </w:rPr>
+        <w:t xml:space="preserve">Na sexta-feira, Renata mandou para o e-mail de Lia um arquivo de catorze páginas, sem assunto e sem texto. Só um anexo.</w:t>
+      </w:r>
+    </w:p>
+    <w:p>
+      <w:pPr>
+        <w:spacing w:after="0" w:line="312"/>
+        <w:ind w:firstLine="340"/>
+        <w:jc w:val="both"/>
+      </w:pPr>
+      <w:r>
+        <w:rPr>
+          <w:rFonts w:ascii="Georgia" w:cs="Georgia" w:eastAsia="Georgia" w:hAnsi="Georgia"/>
+          <w:sz w:val="21"/>
+          <w:szCs w:val="21"/>
+        </w:rPr>
+        <w:t xml:space="preserve">Era uma cópia escaneada do projeto recusado, com o carimbo da comissão em cada página e a assinatura do doutor Álvaro Mendes na primeira. E, grampeado no fim, um relatório datilografado, mais antigo, que Renata explicou depois que tinha sido anexado por engano por ele mesmo, num dos recursos. Um relatório dos testes feitos no sítio de Cotia, por conta própria, antes de pedir autorização.</w:t>
+      </w:r>
+    </w:p>
+    <w:p>
+      <w:pPr>
+        <w:spacing w:after="0" w:line="312"/>
+        <w:ind w:firstLine="340"/>
+        <w:jc w:val="both"/>
+      </w:pPr>
+      <w:r>
+        <w:rPr>
+          <w:rFonts w:ascii="Georgia" w:cs="Georgia" w:eastAsia="Georgia" w:hAnsi="Georgia"/>
+          <w:sz w:val="21"/>
+          <w:szCs w:val="21"/>
+        </w:rPr>
+        <w:t xml:space="preserve">O título do relatório era só um código. Protocolo 71.</w:t>
+      </w:r>
+    </w:p>
+    <w:p>
+      <w:pPr>
+        <w:spacing w:after="0" w:line="312"/>
+        <w:ind w:firstLine="340"/>
+        <w:jc w:val="both"/>
+      </w:pPr>
+      <w:r>
+        <w:rPr>
+          <w:rFonts w:ascii="Georgia" w:cs="Georgia" w:eastAsia="Georgia" w:hAnsi="Georgia"/>
+          <w:sz w:val="21"/>
+          <w:szCs w:val="21"/>
+        </w:rPr>
+        <w:t xml:space="preserve">Setenta e um. Ubatuba.</w:t>
+      </w:r>
+    </w:p>
+    <w:p>
+      <w:pPr>
+        <w:spacing w:after="0" w:line="312"/>
+        <w:ind w:firstLine="340"/>
+        <w:jc w:val="both"/>
+      </w:pPr>
+      <w:r>
+        <w:rPr>
+          <w:rFonts w:ascii="Georgia" w:cs="Georgia" w:eastAsia="Georgia" w:hAnsi="Georgia"/>
+          <w:sz w:val="21"/>
+          <w:szCs w:val="21"/>
+        </w:rPr>
+        <w:t xml:space="preserve">Lia leu as catorze páginas no sofá, de madrugada, com o notebook no colo, sem entender metade dos termos e entendendo perfeitamente o resto.</w:t>
+      </w:r>
+    </w:p>
+    <w:p>
+      <w:pPr>
+        <w:spacing w:after="0" w:line="312"/>
+        <w:ind w:firstLine="340"/>
+        <w:jc w:val="both"/>
+      </w:pPr>
+      <w:r>
+        <w:rPr>
+          <w:rFonts w:ascii="Georgia" w:cs="Georgia" w:eastAsia="Georgia" w:hAnsi="Georgia"/>
+          <w:sz w:val="21"/>
+          <w:szCs w:val="21"/>
+        </w:rPr>
+        <w:t xml:space="preserve">O estado durava de um a dois dias, conforme a dose. Durante esse tempo, o animal parecia morto a qualquer observador e a qualquer exame simples. O despertar só acontecia com a segunda substância, aplicada antes do limite. E, numa lista de cuidados no fim do relatório, numerada, na letra miúda e caprichada de quem anota tudo, havia três itens que Lia leu e releu até as palavras perderem o sentido.</w:t>
+      </w:r>
+    </w:p>
+    <w:p>
+      <w:pPr>
+        <w:spacing w:after="0" w:line="312"/>
+        <w:ind w:firstLine="340"/>
+        <w:jc w:val="both"/>
+      </w:pPr>
+      <w:r>
+        <w:rPr>
+          <w:rFonts w:ascii="Georgia" w:cs="Georgia" w:eastAsia="Georgia" w:hAnsi="Georgia"/>
+          <w:sz w:val="21"/>
+          <w:szCs w:val="21"/>
+        </w:rPr>
+        <w:t xml:space="preserve">Não submeter o corpo a qualquer procedimento de conservação.</w:t>
+      </w:r>
+    </w:p>
+    <w:p>
+      <w:pPr>
+        <w:spacing w:after="0" w:line="312"/>
+        <w:ind w:firstLine="340"/>
+        <w:jc w:val="both"/>
+      </w:pPr>
+      <w:r>
+        <w:rPr>
+          <w:rFonts w:ascii="Georgia" w:cs="Georgia" w:eastAsia="Georgia" w:hAnsi="Georgia"/>
+          <w:sz w:val="21"/>
+          <w:szCs w:val="21"/>
+        </w:rPr>
+        <w:t xml:space="preserve">Não submeter o corpo a resfriamento intenso.</w:t>
+      </w:r>
+    </w:p>
+    <w:p>
+      <w:pPr>
+        <w:spacing w:after="0" w:line="312"/>
+        <w:ind w:firstLine="340"/>
+        <w:jc w:val="both"/>
+      </w:pPr>
+      <w:r>
+        <w:rPr>
+          <w:rFonts w:ascii="Georgia" w:cs="Georgia" w:eastAsia="Georgia" w:hAnsi="Georgia"/>
+          <w:sz w:val="21"/>
+          <w:szCs w:val="21"/>
+        </w:rPr>
+        <w:t xml:space="preserve">Não submeter o corpo a calor.</w:t>
+      </w:r>
+    </w:p>
+    <w:p>
+      <w:pPr>
+        <w:spacing w:after="200" w:before="200"/>
+        <w:jc w:val="center"/>
+      </w:pPr>
+      <w:r>
+        <w:rPr>
+          <w:rFonts w:ascii="Georgia" w:cs="Georgia" w:eastAsia="Georgia" w:hAnsi="Georgia"/>
+          <w:sz w:val="22"/>
+          <w:szCs w:val="22"/>
+        </w:rPr>
+        <w:t xml:space="preserve">*</w:t>
+      </w:r>
+    </w:p>
+    <w:p>
+      <w:pPr>
+        <w:spacing w:after="0" w:line="312"/>
+        <w:ind w:firstLine="340"/>
+        <w:jc w:val="both"/>
+      </w:pPr>
+      <w:r>
+        <w:rPr>
+          <w:rFonts w:ascii="Georgia" w:cs="Georgia" w:eastAsia="Georgia" w:hAnsi="Georgia"/>
+          <w:sz w:val="21"/>
+          <w:szCs w:val="21"/>
+        </w:rPr>
+        <w:t xml:space="preserve">Ela fechou o notebook e ficou no escuro.</w:t>
+      </w:r>
+    </w:p>
+    <w:p>
+      <w:pPr>
+        <w:spacing w:after="0" w:line="312"/>
+        <w:ind w:firstLine="340"/>
+        <w:jc w:val="both"/>
+      </w:pPr>
+      <w:r>
+        <w:rPr>
+          <w:rFonts w:ascii="Georgia" w:cs="Georgia" w:eastAsia="Georgia" w:hAnsi="Georgia"/>
+          <w:sz w:val="21"/>
+          <w:szCs w:val="21"/>
+        </w:rPr>
+        <w:t xml:space="preserve">Pensou no crematório. No doutor Álvaro no corredor, implorando a Helena que mudasse a decisão faltando meia hora. Ainda dá tempo, Helena. Eu falo com o cemitério, eu resolvo tudo. Ele, que tinha passado trinta anos defendendo a cremação. Pensou em Otávio dizendo, ao lado do caixão aberto, que o pai não tinha sido preparado porque o doutor não deixou. Pensou na pele do pai no caixão, pálida, mas sem aquele aspecto de cera. Parecia que ele ia abrir os olhos a qualquer momento e reclamar do barulho.</w:t>
+      </w:r>
+    </w:p>
+    <w:p>
+      <w:pPr>
+        <w:spacing w:after="0" w:line="312"/>
+        <w:ind w:firstLine="340"/>
+        <w:jc w:val="both"/>
+      </w:pPr>
+      <w:r>
+        <w:rPr>
+          <w:rFonts w:ascii="Georgia" w:cs="Georgia" w:eastAsia="Georgia" w:hAnsi="Georgia"/>
+          <w:sz w:val="21"/>
+          <w:szCs w:val="21"/>
+        </w:rPr>
+        <w:t xml:space="preserve">Pensou no médico olhando o relógio três vezes durante o velório, com a mão tremendo.</w:t>
+      </w:r>
+    </w:p>
+    <w:p>
+      <w:pPr>
+        <w:spacing w:after="0" w:line="312"/>
+        <w:ind w:firstLine="340"/>
+        <w:jc w:val="both"/>
+      </w:pPr>
+      <w:r>
+        <w:rPr>
+          <w:rFonts w:ascii="Georgia" w:cs="Georgia" w:eastAsia="Georgia" w:hAnsi="Georgia"/>
+          <w:sz w:val="21"/>
+          <w:szCs w:val="21"/>
+        </w:rPr>
+        <w:t xml:space="preserve">Pensou na plataforma descendo devagar, centímetro por centímetro, e no doutor Álvaro de olhos fechados, imóvel, até muito depois de o alçapão se fechar.</w:t>
+      </w:r>
+    </w:p>
+    <w:p>
+      <w:pPr>
+        <w:spacing w:after="0" w:line="312"/>
+        <w:ind w:firstLine="340"/>
+        <w:jc w:val="both"/>
+      </w:pPr>
+      <w:r>
+        <w:rPr>
+          <w:rFonts w:ascii="Georgia" w:cs="Georgia" w:eastAsia="Georgia" w:hAnsi="Georgia"/>
+          <w:sz w:val="21"/>
+          <w:szCs w:val="21"/>
+        </w:rPr>
+        <w:t xml:space="preserve">Lia pegou o BlackBerry do pai, que estava com ela naquela semana, e abriu a última conversa com o médico. Releu as mensagens da segunda-feira, a véspera. As que todos tinham lido sem ver nada.</w:t>
+      </w:r>
+    </w:p>
+    <w:p>
+      <w:pPr>
+        <w:spacing w:after="0" w:line="312"/>
+        <w:ind w:firstLine="340"/>
+        <w:jc w:val="both"/>
+      </w:pPr>
+      <w:r>
+        <w:rPr>
+          <w:rFonts w:ascii="Georgia" w:cs="Georgia" w:eastAsia="Georgia" w:hAnsi="Georgia"/>
+          <w:sz w:val="21"/>
+          <w:szCs w:val="21"/>
+        </w:rPr>
+        <w:t xml:space="preserve">Tudo certo com os exames. Amanhã cedo eu passo aí.</w:t>
+      </w:r>
+    </w:p>
+    <w:p>
+      <w:pPr>
+        <w:spacing w:after="0" w:line="312"/>
+        <w:ind w:firstLine="340"/>
+        <w:jc w:val="both"/>
+      </w:pPr>
+      <w:r>
+        <w:rPr>
+          <w:rFonts w:ascii="Georgia" w:cs="Georgia" w:eastAsia="Georgia" w:hAnsi="Georgia"/>
+          <w:sz w:val="21"/>
+          <w:szCs w:val="21"/>
+        </w:rPr>
+        <w:t xml:space="preserve">Minha vida em tuas mãos!!</w:t>
+      </w:r>
+    </w:p>
+    <w:p>
+      <w:pPr>
+        <w:pBdr>
+          <w:top w:val="single" w:color="555555" w:sz="6" w:space="6"/>
+          <w:bottom w:val="single" w:color="555555" w:sz="6" w:space="6"/>
+          <w:left w:val="single" w:color="555555" w:sz="6" w:space="6"/>
+          <w:right w:val="single" w:color="555555" w:sz="6" w:space="6"/>
+        </w:pBdr>
+        <w:shd w:fill="EFEFEF" w:color="auto" w:val="clear"/>
+        <w:spacing w:after="0" w:before="240"/>
+        <w:ind w:left="227" w:right="227"/>
+        <w:jc w:val="center"/>
+      </w:pPr>
+      <w:r>
+        <w:rPr>
+          <w:rFonts w:ascii="Georgia" w:cs="Georgia" w:eastAsia="Georgia" w:hAnsi="Georgia"/>
+          <w:b/>
+          <w:bCs/>
+          <w:spacing w:val="30"/>
+          <w:sz w:val="17"/>
+          <w:szCs w:val="17"/>
+        </w:rPr>
+        <w:t xml:space="preserve">NO CELULAR DE HENRIQUE</w:t>
+      </w:r>
+    </w:p>
+    <w:p>
+      <w:pPr>
+        <w:pBdr>
+          <w:top w:val="single" w:color="555555" w:sz="6" w:space="6"/>
+          <w:bottom w:val="single" w:color="555555" w:sz="6" w:space="6"/>
+          <w:left w:val="single" w:color="555555" w:sz="6" w:space="6"/>
+          <w:right w:val="single" w:color="555555" w:sz="6" w:space="6"/>
+        </w:pBdr>
+        <w:shd w:fill="EFEFEF" w:color="auto" w:val="clear"/>
+        <w:spacing w:after="240" w:before="0" w:line="288"/>
+        <w:ind w:left="227" w:right="227"/>
+        <w:jc w:val="center"/>
+      </w:pPr>
+      <w:r>
+        <w:rPr>
+          <w:rFonts w:ascii="Georgia" w:cs="Georgia" w:eastAsia="Georgia" w:hAnsi="Georgia"/>
+          <w:i/>
+          <w:iCs/>
+          <w:sz w:val="19"/>
+          <w:szCs w:val="19"/>
+        </w:rPr>
+        <w:t xml:space="preserve">Abra a conversa entre Henrique e o doutor Álvaro e releia as mensagens da véspera. Agora, com tudo o que você já sabe, leia de novo a última frase de Henrique.</w:t>
+      </w:r>
+    </w:p>
+    <w:p>
+      <w:pPr>
+        <w:spacing w:after="0" w:line="312"/>
+        <w:ind w:firstLine="340"/>
+        <w:jc w:val="both"/>
+      </w:pPr>
+      <w:r>
+        <w:rPr>
+          <w:rFonts w:ascii="Georgia" w:cs="Georgia" w:eastAsia="Georgia" w:hAnsi="Georgia"/>
+          <w:sz w:val="21"/>
+          <w:szCs w:val="21"/>
+        </w:rPr>
+        <w:t xml:space="preserve">Lia leu aquela frase até ela deixar de ser uma frase.</w:t>
+      </w:r>
+    </w:p>
+    <w:p>
+      <w:pPr>
+        <w:spacing w:after="0" w:line="312"/>
+        <w:ind w:firstLine="340"/>
+        <w:jc w:val="both"/>
+      </w:pPr>
+      <w:r>
+        <w:rPr>
+          <w:rFonts w:ascii="Georgia" w:cs="Georgia" w:eastAsia="Georgia" w:hAnsi="Georgia"/>
+          <w:sz w:val="21"/>
+          <w:szCs w:val="21"/>
+        </w:rPr>
+        <w:t xml:space="preserve">Minha vida em tuas mãos.</w:t>
+      </w:r>
+    </w:p>
+    <w:p>
+      <w:pPr>
+        <w:spacing w:after="0" w:line="312"/>
+        <w:ind w:firstLine="340"/>
+        <w:jc w:val="both"/>
+      </w:pPr>
+      <w:r>
+        <w:rPr>
+          <w:rFonts w:ascii="Georgia" w:cs="Georgia" w:eastAsia="Georgia" w:hAnsi="Georgia"/>
+          <w:sz w:val="21"/>
+          <w:szCs w:val="21"/>
+        </w:rPr>
+        <w:t xml:space="preserve">Não era um paciente confiando no médico. Não era uma frase bonita de um amigo de praia. Era uma instrução. Era um homem entregando a própria vida, literalmente, nas mãos de outro, na véspera de tomar alguma coisa que o faria parecer morto.</w:t>
+      </w:r>
+    </w:p>
+    <w:p>
+      <w:pPr>
+        <w:spacing w:after="0" w:line="312"/>
+        <w:ind w:firstLine="340"/>
+        <w:jc w:val="both"/>
+      </w:pPr>
+      <w:r>
+        <w:rPr>
+          <w:rFonts w:ascii="Georgia" w:cs="Georgia" w:eastAsia="Georgia" w:hAnsi="Georgia"/>
+          <w:sz w:val="21"/>
+          <w:szCs w:val="21"/>
+        </w:rPr>
+        <w:t xml:space="preserve">A passagem para Zurique, três dias depois da cremação. A mala com o sobretudo de etiqueta. O chalé de doze janelas. O cartão-postal de um lugar com neve. Não conta pra ninguém que eu vim, nem pro seu irmão. Ele não tinha ido ao apartamento dela na segunda à noite para se despedir de uma filha porque ia morrer.</w:t>
+      </w:r>
+    </w:p>
+    <w:p>
+      <w:pPr>
+        <w:spacing w:after="0" w:line="312"/>
+        <w:ind w:firstLine="340"/>
+        <w:jc w:val="both"/>
+      </w:pPr>
+      <w:r>
+        <w:rPr>
+          <w:rFonts w:ascii="Georgia" w:cs="Georgia" w:eastAsia="Georgia" w:hAnsi="Georgia"/>
+          <w:sz w:val="21"/>
+          <w:szCs w:val="21"/>
+        </w:rPr>
+        <w:t xml:space="preserve">Tinha ido se despedir porque ia sumir.</w:t>
+      </w:r>
+    </w:p>
+    <w:p>
+      <w:pPr>
+        <w:spacing w:after="200" w:before="200"/>
+        <w:jc w:val="center"/>
+      </w:pPr>
+      <w:r>
+        <w:rPr>
+          <w:rFonts w:ascii="Georgia" w:cs="Georgia" w:eastAsia="Georgia" w:hAnsi="Georgia"/>
+          <w:sz w:val="22"/>
+          <w:szCs w:val="22"/>
+        </w:rPr>
+        <w:t xml:space="preserve">*</w:t>
+      </w:r>
+    </w:p>
+    <w:p>
+      <w:pPr>
+        <w:spacing w:after="0" w:line="312"/>
+        <w:ind w:firstLine="340"/>
+        <w:jc w:val="both"/>
+      </w:pPr>
+      <w:r>
+        <w:rPr>
+          <w:rFonts w:ascii="Georgia" w:cs="Georgia" w:eastAsia="Georgia" w:hAnsi="Georgia"/>
+          <w:sz w:val="21"/>
+          <w:szCs w:val="21"/>
+        </w:rPr>
+        <w:t xml:space="preserve">Lia se levantou do sofá. Foi até a cozinha, encheu um copo de água da torneira, bebeu metade e jogou o resto na pia. Voltou ao sofá. Sentou. Levantou de novo.</w:t>
+      </w:r>
+    </w:p>
+    <w:p>
+      <w:pPr>
+        <w:spacing w:after="0" w:line="312"/>
+        <w:ind w:firstLine="340"/>
+        <w:jc w:val="both"/>
+      </w:pPr>
+      <w:r>
+        <w:rPr>
+          <w:rFonts w:ascii="Georgia" w:cs="Georgia" w:eastAsia="Georgia" w:hAnsi="Georgia"/>
+          <w:sz w:val="21"/>
+          <w:szCs w:val="21"/>
+        </w:rPr>
+        <w:t xml:space="preserve">Uma pergunta tinha se formado dentro dela e não ia embora. Ela tentou empurrá-la para longe, como se empurra um móvel pesado, e a pergunta voltava ao mesmo lugar, cada vez maior.</w:t>
+      </w:r>
+    </w:p>
+    <w:p>
+      <w:pPr>
+        <w:spacing w:after="0" w:line="312"/>
+        <w:ind w:firstLine="340"/>
+        <w:jc w:val="both"/>
+      </w:pPr>
+      <w:r>
+        <w:rPr>
+          <w:rFonts w:ascii="Georgia" w:cs="Georgia" w:eastAsia="Georgia" w:hAnsi="Georgia"/>
+          <w:sz w:val="21"/>
+          <w:szCs w:val="21"/>
+        </w:rPr>
+        <w:t xml:space="preserve">Se o pai tinha tomado aquela substância na terça de manhã para parecer morto. Se o plano era ser enterrado, e resgatado, e acordar, e ir embora para Zurique com outro nome. Se o doutor Álvaro sabia de tudo, e tinha implorado por um enterro, e tinha perdido.</w:t>
+      </w:r>
+    </w:p>
+    <w:p>
+      <w:pPr>
+        <w:spacing w:after="0" w:line="312"/>
+        <w:ind w:firstLine="340"/>
+        <w:jc w:val="both"/>
+      </w:pPr>
+      <w:r>
+        <w:rPr>
+          <w:rFonts w:ascii="Georgia" w:cs="Georgia" w:eastAsia="Georgia" w:hAnsi="Georgia"/>
+          <w:sz w:val="21"/>
+          <w:szCs w:val="21"/>
+        </w:rPr>
+        <w:t xml:space="preserve">Então, quando a plataforma desceu no crematório, quarta-feira de manhã, pouco mais de vinte e quatro horas depois…</w:t>
+      </w:r>
+    </w:p>
+    <w:p>
+      <w:pPr>
+        <w:spacing w:after="0" w:line="312"/>
+        <w:ind w:firstLine="340"/>
+        <w:jc w:val="both"/>
+      </w:pPr>
+      <w:r>
+        <w:rPr>
+          <w:rFonts w:ascii="Georgia" w:cs="Georgia" w:eastAsia="Georgia" w:hAnsi="Georgia"/>
+          <w:sz w:val="21"/>
+          <w:szCs w:val="21"/>
+        </w:rPr>
+        <w:t xml:space="preserve">Lia não terminou o pensamento. Não conseguiu.</w:t>
+      </w:r>
+    </w:p>
+    <w:p>
+      <w:pPr>
+        <w:spacing w:after="0" w:line="312"/>
+        <w:ind w:firstLine="340"/>
+        <w:jc w:val="both"/>
+      </w:pPr>
+      <w:r>
+        <w:rPr>
+          <w:rFonts w:ascii="Georgia" w:cs="Georgia" w:eastAsia="Georgia" w:hAnsi="Georgia"/>
+          <w:sz w:val="21"/>
+          <w:szCs w:val="21"/>
+        </w:rPr>
+        <w:t xml:space="preserve">Pegou o celular dela, abriu a conversa com Lucas e escreveu, com as mãos tremendo: Preciso te contar uma coisa sobre o doutor Álvaro.</w:t>
+      </w:r>
+    </w:p>
+    <w:p>
+      <w:pPr>
+        <w:spacing w:after="0" w:line="312"/>
+        <w:ind w:firstLine="340"/>
+        <w:jc w:val="both"/>
+      </w:pPr>
+      <w:r>
+        <w:rPr>
+          <w:rFonts w:ascii="Georgia" w:cs="Georgia" w:eastAsia="Georgia" w:hAnsi="Georgia"/>
+          <w:sz w:val="21"/>
+          <w:szCs w:val="21"/>
+        </w:rPr>
+        <w:t xml:space="preserve">Ficou olhando para a mensagem. O cursor piscava no fim da frase.</w:t>
+      </w:r>
+    </w:p>
+    <w:p>
+      <w:pPr>
+        <w:spacing w:after="0" w:line="312"/>
+        <w:ind w:firstLine="340"/>
+        <w:jc w:val="both"/>
+      </w:pPr>
+      <w:r>
+        <w:rPr>
+          <w:rFonts w:ascii="Georgia" w:cs="Georgia" w:eastAsia="Georgia" w:hAnsi="Georgia"/>
+          <w:sz w:val="21"/>
+          <w:szCs w:val="21"/>
+        </w:rPr>
+        <w:t xml:space="preserve">Lembrou de Lucas no café da Augusta, contando da mala, do guia, das doze janelas, e calando alguma coisa no fim. Lembrou que ele também tinha olhado para a foto de Ubatuba por tempo demais.</w:t>
+      </w:r>
+    </w:p>
+    <w:p>
+      <w:pPr>
+        <w:spacing w:after="0" w:line="312"/>
+        <w:ind w:firstLine="340"/>
+        <w:jc w:val="both"/>
+      </w:pPr>
+      <w:r>
+        <w:rPr>
+          <w:rFonts w:ascii="Georgia" w:cs="Georgia" w:eastAsia="Georgia" w:hAnsi="Georgia"/>
+          <w:sz w:val="21"/>
+          <w:szCs w:val="21"/>
+        </w:rPr>
+        <w:t xml:space="preserve">Talvez ele já soubesse. Talvez estivesse protegendo ela da mesma ideia.</w:t>
+      </w:r>
+    </w:p>
+    <w:p>
+      <w:pPr>
+        <w:spacing w:after="0" w:line="312"/>
+        <w:ind w:firstLine="340"/>
+        <w:jc w:val="both"/>
+      </w:pPr>
+      <w:r>
+        <w:rPr>
+          <w:rFonts w:ascii="Georgia" w:cs="Georgia" w:eastAsia="Georgia" w:hAnsi="Georgia"/>
+          <w:sz w:val="21"/>
+          <w:szCs w:val="21"/>
+        </w:rPr>
+        <w:t xml:space="preserve">Apagou a mensagem, letra por letra.</w:t>
+      </w:r>
+    </w:p>
+    <w:p>
+      <w:pPr>
+        <w:spacing w:after="0" w:line="312"/>
+        <w:ind w:firstLine="340"/>
+        <w:jc w:val="both"/>
+      </w:pPr>
+      <w:r>
+        <w:rPr>
+          <w:rFonts w:ascii="Georgia" w:cs="Georgia" w:eastAsia="Georgia" w:hAnsi="Georgia"/>
+          <w:sz w:val="21"/>
+          <w:szCs w:val="21"/>
+        </w:rPr>
+        <w:t xml:space="preserve">Às quatro da manhã, ainda acordada, Lia abriu o desenho de criança da casa de doze janelas e ficou olhando para ele até amanhecer. Na janela do apartamento, o céu de São Paulo foi ficando cinza, depois branco.</w:t>
+      </w:r>
+    </w:p>
+    <w:p>
+      <w:pPr>
+        <w:spacing w:after="0" w:line="312"/>
+        <w:ind w:firstLine="340"/>
+        <w:jc w:val="both"/>
+      </w:pPr>
+      <w:r>
+        <w:rPr>
+          <w:rFonts w:ascii="Georgia" w:cs="Georgia" w:eastAsia="Georgia" w:hAnsi="Georgia"/>
+          <w:sz w:val="21"/>
+          <w:szCs w:val="21"/>
+        </w:rPr>
+        <w:t xml:space="preserve">O pai não tinha chegado ao lugar com neve.</w:t>
+      </w:r>
+    </w:p>
+    <w:p>
+      <w:pPr>
+        <w:spacing w:after="0" w:line="312"/>
+        <w:ind w:firstLine="340"/>
+        <w:jc w:val="both"/>
+      </w:pPr>
+      <w:r>
+        <w:rPr>
+          <w:rFonts w:ascii="Georgia" w:cs="Georgia" w:eastAsia="Georgia" w:hAnsi="Georgia"/>
+          <w:sz w:val="21"/>
+          <w:szCs w:val="21"/>
+        </w:rPr>
+        <w:t xml:space="preserve">E ela começava a entender, devagar, com um horror que nenhuma palavra cobria, que talvez ele tivesse estado vivo até o último momento em que alguém poderia ter salvado ele.</w:t>
       </w:r>
     </w:p>
     <w:sectPr>

</xml_diff>

<commit_message>
Livro policial: capítulo 26 (A segunda assinatura) e revisão de continuidade
Corrige rua/prédio de pastilhas, cronologia da morte (5/10), foto de Ubatuba com três rapazes, Lia já conhecia o crematório, POV de Lucas no cap. 17, prazos e horários.

Co-Authored-By: Claude Opus 5.5 <noreply@anthropic.com>
Claude-Session: https://claude.ai/code/session_01BrurxSYygRC3rRhaUYosm1
</commit_message>
<xml_diff>
--- a/docs/livro-policial/TODO_CRIME_TEM_UM_AUTOR.docx
+++ b/docs/livro-policial/TODO_CRIME_TEM_UM_AUTOR.docx
@@ -626,7 +626,7 @@
           <w:sz w:val="21"/>
           <w:szCs w:val="21"/>
         </w:rPr>
-        <w:t xml:space="preserve">A cerimônia de despedida foi no salão principal. As poltronas formavam um semicírculo, e o centro ficava vazio: um piso liso, onde não havia nada. Lia estranhou aquele espaço em branco até ouvir o ruído suave de um motor. Um alçapão se abriu no chão e, de baixo, do subsolo, uma plataforma subiu devagar, trazendo o caixão já fechado. Parou no centro, à altura de uma mesa, uns noventa centímetros acima do piso, e ficou ali, cercado pelas poltronas, como se o pai estivesse no meio de uma roda de conversa. Parecia um palco pequeno. A última apresentação dele.</w:t>
+        <w:t xml:space="preserve">A cerimônia de despedida foi no salão principal. As poltronas formavam um semicírculo, e o centro ficava vazio: um piso liso, onde não havia nada. Lia já tinha visto aquilo uma vez, dois anos antes, na despedida do tio Rodolfo, e mesmo assim estranhou de novo aquele espaço em branco quando ouviu o ruído suave de um motor. Um alçapão se abriu no chão e, de baixo, do subsolo, uma plataforma subiu devagar, trazendo o caixão já fechado. Parou no centro, à altura de uma mesa, uns noventa centímetros acima do piso, e ficou ali, cercado pelas poltronas, como se o pai estivesse no meio de uma roda de conversa. Parecia um palco pequeno. A última apresentação dele.</w:t>
       </w:r>
     </w:p>
     <w:p>
@@ -701,7 +701,7 @@
           <w:sz w:val="21"/>
           <w:szCs w:val="21"/>
         </w:rPr>
-        <w:t xml:space="preserve">O alçapão se fechou. O piso voltou a ser liso, inteiro, como se nunca tivesse se aberto. Foi tudo silencioso, limpo, quase educado. Lia tinha imaginado algo mais dramático, uma chama, um estrondo. Não houve nada. Só o chão fechado e o zumbido do ar-condicionado.</w:t>
+        <w:t xml:space="preserve">O alçapão se fechou. O piso voltou a ser liso, inteiro, como se nunca tivesse se aberto. Foi tudo silencioso, limpo, quase educado, como tinha sido com o tio. Lia, de novo, esperou alguma coisa mais dramática, uma chama, um estrondo. De novo, não houve nada. Só o chão fechado e o zumbido do ar-condicionado.</w:t>
       </w:r>
     </w:p>
     <w:p>
@@ -1708,7 +1708,7 @@
           <w:sz w:val="21"/>
           <w:szCs w:val="21"/>
         </w:rPr>
-        <w:t xml:space="preserve">Lucas franziu a testa. Lia tinha ligado sete vezes para o pai entre as oito e as nove da manhã. Antes de alguém saber que ele estava morto.</w:t>
+        <w:t xml:space="preserve">Lucas franziu a testa. Lia tinha ligado sete vezes para o pai entre as oito e as nove da manhã. Antes de qualquer um dos filhos saber que ele estava morto.</w:t>
       </w:r>
     </w:p>
     <w:p>
@@ -2761,7 +2761,22 @@
           <w:sz w:val="19"/>
           <w:szCs w:val="19"/>
         </w:rPr>
-        <w:t xml:space="preserve">A mensagem de Bianca, enviada às duas e quarenta da madrugada, continua no celular de Henrique. Veja o que mais ela escreveu a ele naquela semana. Ele escreveu, apagou, escreveu de novo. Viu o jornal? Apagou. Não mandou nada.</w:t>
+        <w:t xml:space="preserve">A mensagem de Bianca, enviada às duas e quarenta da madrugada, continua no celular de Henrique. Veja o que mais ela escreveu a ele naquela semana.</w:t>
+      </w:r>
+    </w:p>
+    <w:p>
+      <w:pPr>
+        <w:spacing w:after="0" w:line="312"/>
+        <w:ind w:firstLine="340"/>
+        <w:jc w:val="both"/>
+      </w:pPr>
+      <w:r>
+        <w:rPr>
+          <w:rFonts w:ascii="Georgia" w:cs="Georgia" w:eastAsia="Georgia" w:hAnsi="Georgia"/>
+          <w:sz w:val="21"/>
+          <w:szCs w:val="21"/>
+        </w:rPr>
+        <w:t xml:space="preserve">Ele escreveu, apagou, escreveu de novo. Viu o jornal? Apagou. Não mandou nada.</w:t>
       </w:r>
     </w:p>
     <w:p>
@@ -3792,7 +3807,7 @@
           <w:sz w:val="21"/>
           <w:szCs w:val="21"/>
         </w:rPr>
-        <w:t xml:space="preserve">— Durante a investigação, tivemos autorização para acompanhar os registros de chamadas do seu pai. Na manhã em que ele morreu, a senhora ligou para ele sete vezes. Entre as oito e as nove. — Regina a observava sem pressa. — Ninguém da família sabia ainda que ele estava morto. Por que a senhora ligou tanto?</w:t>
+        <w:t xml:space="preserve">— Durante a investigação, tivemos autorização para acompanhar os registros de chamadas do seu pai. Na manhã em que ele morreu, a senhora ligou para ele sete vezes. Entre as oito e as nove. — Regina a observava sem pressa. — Nenhum dos filhos sabia ainda que ele estava morto. Por que a senhora ligou tanto?</w:t>
       </w:r>
     </w:p>
     <w:p>
@@ -6561,7 +6576,7 @@
           <w:sz w:val="21"/>
           <w:szCs w:val="21"/>
         </w:rPr>
-        <w:t xml:space="preserve">A menina tinha uma pinta pequena no canto esquerdo do queixo. Lia já tinha visto aquela pinta. Tinha visto naquela mesma casa, na semana anterior, de perto, quando Helena se inclinara sobre o caixão do pai.</w:t>
+        <w:t xml:space="preserve">A menina tinha uma pinta pequena no canto esquerdo do queixo. Lia já tinha visto aquela pinta. Tinha visto na semana anterior, de perto, no crematório, quando Helena se inclinara sobre o caixão do pai.</w:t>
       </w:r>
     </w:p>
     <w:p>
@@ -8292,7 +8307,7 @@
           <w:sz w:val="21"/>
           <w:szCs w:val="21"/>
         </w:rPr>
-        <w:t xml:space="preserve">Dona Cida trabalhava naquela casa havia vinte e dois anos. Tinha visto Lia aprender a andar no corredor de mármore, tinha cuidado da catapora dela, tinha chorado escondida na lavanderia no dia em que Sílvia saiu de casa levando as duas crianças. Para ela, a menina Lia nunca precisaria de motivo para entrar.</w:t>
+        <w:t xml:space="preserve">Dona Cida trabalhava naquela casa havia trinta anos. Tinha visto Lia aprender a andar no corredor de mármore, tinha cuidado da catapora dela, tinha chorado escondida na lavanderia no dia em que Sílvia saiu de casa levando as duas crianças. Para ela, a menina Lia nunca precisaria de motivo para entrar.</w:t>
       </w:r>
     </w:p>
     <w:p>
@@ -9324,7 +9339,7 @@
           <w:sz w:val="21"/>
           <w:szCs w:val="21"/>
         </w:rPr>
-        <w:t xml:space="preserve">O resultado chegou numa quinta-feira, cinco dias depois.</w:t>
+        <w:t xml:space="preserve">O resultado chegou numa quinta-feira, três dias depois.</w:t>
       </w:r>
     </w:p>
     <w:p>
@@ -10162,7 +10177,7 @@
           <w:sz w:val="21"/>
           <w:szCs w:val="21"/>
         </w:rPr>
-        <w:t xml:space="preserve">Naquela quinta-feira, o hotel era o Castellane, na Avenida Paulista. Quarto 908, no nome da corretora. Helena achava que ele estava em Belo Horizonte.</w:t>
+        <w:t xml:space="preserve">Naquela quarta-feira, o hotel era o Castellane, na Avenida Paulista. Quarto 908, no nome da corretora. Helena achava que ele estava em Belo Horizonte.</w:t>
       </w:r>
     </w:p>
     <w:p>
@@ -10714,7 +10729,7 @@
           <w:sz w:val="21"/>
           <w:szCs w:val="21"/>
         </w:rPr>
-        <w:t xml:space="preserve">Não era homem de subir ao quarto de desconhecidos. Também não era homem de beber quatro uísques numa quinta-feira, nem de rir com estranhos, nem de dormir em hotel com o nome da empresa. Era um ano de coisas que ele não era.</w:t>
+        <w:t xml:space="preserve">Não era homem de subir ao quarto de desconhecidos. Também não era homem de beber quatro uísques numa quarta-feira, nem de rir com estranhos, nem de dormir em hotel com o nome da empresa. Era um ano de coisas que ele não era.</w:t>
       </w:r>
     </w:p>
     <w:p>
@@ -12563,7 +12578,7 @@
           <w:sz w:val="19"/>
           <w:szCs w:val="19"/>
         </w:rPr>
-        <w:t xml:space="preserve">Que foto é essa? Abra o e-mail pessoal de Henrique no celular virtual e procure a mensagem de 28 de setembro, com um ponto de interrogação no assunto. Olhe com atenção para as duas fotos, uma ao lado da outra.</w:t>
+        <w:t xml:space="preserve">Que foto é essa? Abra o e-mail pessoal de Henrique no celular virtual e procure a mensagem de 21 de setembro, com um ponto de interrogação no assunto. Olhe com atenção para as duas fotos, uma ao lado da outra.</w:t>
       </w:r>
     </w:p>
     <w:p>
@@ -15694,7 +15709,7 @@
           <w:sz w:val="21"/>
           <w:szCs w:val="21"/>
         </w:rPr>
-        <w:t xml:space="preserve">Henrique não precisou ver mais nada. Soube pela cor do céu. Soube pela pasta que faltava. Soube pela mensagem que tinha mandado oito minutos antes, como quem manda o último recado sem saber que é o último.</w:t>
+        <w:t xml:space="preserve">Henrique não precisou ver mais nada. Soube pela cor do céu. Soube pela pasta que faltava. Soube pela mensagem que tinha mandado dez minutos antes, como quem manda o último recado sem saber que é o último.</w:t>
       </w:r>
     </w:p>
     <w:p>
@@ -15843,7 +15858,7 @@
           <w:sz w:val="21"/>
           <w:szCs w:val="21"/>
         </w:rPr>
-        <w:t xml:space="preserve">O consultório tinha o cheiro de sempre, de álcool e madeira encerada. Na parede, os diplomas, as fotos de congressos, uma foto antiga de dois rapazes de vinte e poucos anos numa praia, de calção, rindo. Henrique e Álvaro, em Ubatuba, em 1971. Henrique sentou-se na cadeira dos pacientes, como tinha feito centenas de vezes. Álvaro pegou o aparelho de pressão por reflexo, depois desistiu e o pousou sobre a mesa.</w:t>
+        <w:t xml:space="preserve">O consultório tinha o cheiro de sempre, de álcool e madeira encerada. Na parede, os diplomas, as fotos de congressos, uma foto antiga de três rapazes de vinte e poucos anos numa praia, de calção, abraçados, rindo. Rodolfo, Henrique e Álvaro, em Ubatuba, em 1971. Henrique sentou-se na cadeira dos pacientes, como tinha feito centenas de vezes. Álvaro pegou o aparelho de pressão por reflexo, depois desistiu e o pousou sobre a mesa.</w:t>
       </w:r>
     </w:p>
     <w:p>
@@ -15963,7 +15978,7 @@
           <w:sz w:val="21"/>
           <w:szCs w:val="21"/>
         </w:rPr>
-        <w:t xml:space="preserve">O médico tirou os óculos. Dobrou as hastes devagar e os guardou no bolso da camisa. Olhou para a foto de Ubatuba na parede, os dois rapazes rindo de calção numa praia, quarenta anos antes.</w:t>
+        <w:t xml:space="preserve">O médico tirou os óculos. Dobrou as hastes devagar e os guardou no bolso da camisa. Olhou para a foto de Ubatuba na parede, os três rapazes rindo de calção numa praia, quase quarenta anos antes.</w:t>
       </w:r>
     </w:p>
     <w:p>
@@ -17930,7 +17945,7 @@
           <w:sz w:val="21"/>
           <w:szCs w:val="21"/>
         </w:rPr>
-        <w:t xml:space="preserve">Era uma mensagem de Carlos, enviada às 18h47 da segunda-feira em que o pai tinha passado a noite no apartamento de alguém que Lucas não sabia quem era. A véspera da morte.</w:t>
+        <w:t xml:space="preserve">Era uma mensagem de Carlos, enviada às 18h47 de uma segunda-feira que Lucas reconheceu na hora. A véspera da morte.</w:t>
       </w:r>
     </w:p>
     <w:p>
@@ -18124,7 +18139,7 @@
           <w:sz w:val="21"/>
           <w:szCs w:val="21"/>
         </w:rPr>
-        <w:t xml:space="preserve">Lucas tirou o celular do bolso, abriu uma foto do aniversário de quinze anos de Lia, a única em que Carlos aparecia de corpo inteiro, e mostrou. Edson olhou por muito tempo.</w:t>
+        <w:t xml:space="preserve">Lucas tirou o celular do bolso, abriu uma foto que tinha achado no site da faculdade, Carlos de corpo inteiro, de pé, numa mesa de debate do mestrado, e mostrou. Edson olhou por muito tempo.</w:t>
       </w:r>
     </w:p>
     <w:p>
@@ -18857,7 +18872,7 @@
           <w:sz w:val="21"/>
           <w:szCs w:val="21"/>
         </w:rPr>
-        <w:t xml:space="preserve">— E aí ele chegou — disse Carlos. — Meia-noite e pouco. Sozinho, dirigindo. Desceu do carro para abrir o portão, porque o controle não funcionou na primeira vez. E eu vi ele de perto, debaixo do poste. Ele estava velho, Lia. Eu não via o pai fazia quatro anos e ele estava velho. Magro. Andando devagar, como quem carrega um saco de cimento nas costas. Ficou parado na frente do portão com o controle na mão, olhando para o nada, e eu pensei: esse homem já está morrendo. Não precisa de mim.</w:t>
+        <w:t xml:space="preserve">— E aí ele chegou — disse Carlos. — Meia-noite e pouco. Sozinho, dirigindo. Desceu do carro para abrir o portão, porque o controle não funcionou na primeira vez. E eu vi ele de perto, debaixo do poste. Ele estava velho, Lia. Eu não olhava direito para a cara do pai fazia quatro anos, nem no enterro do tio, e ele estava velho. Magro. Andando devagar, como quem carrega um saco de cimento nas costas. Ficou parado na frente do portão com o controle na mão, olhando para o nada, e eu pensei: esse homem já está morrendo. Não precisa de mim.</w:t>
       </w:r>
     </w:p>
     <w:p>
@@ -19726,7 +19741,7 @@
           <w:sz w:val="21"/>
           <w:szCs w:val="21"/>
         </w:rPr>
-        <w:t xml:space="preserve">— O seu pai estava vivo às sete e dois da manhã de terça-feira — disse. — Ligou para o doutor Álvaro e falou quarenta e sete segundos. Está no registro da operadora. — Ela virou a folha para ele. — O seu irmão foi embora da esquina à meia-noite e vinte e cinco. Às oito e quinze, segundo a dona Sílvia, estava em casa, em Perdizes, dormindo, quando ela o acordou com a notícia. Não há registro da moto dele em nenhuma câmera de trânsito entre Perdizes e o Jardim Europa naquela madrugada. Eu verifiquei semana passada.</w:t>
+        <w:t xml:space="preserve">— O seu pai estava vivo às sete e dois da manhã de terça-feira — disse. — Ligou para o doutor Álvaro e falou quarenta e sete segundos. Está no registro da operadora. — Ela virou a folha para ele. — O seu irmão foi embora da esquina à meia-noite e vinte e cinco. Às nove e dez, segundo a dona Sílvia, estava em casa, em Perdizes, dormindo, quando ela o acordou com a notícia. Não há registro da moto dele em nenhuma câmera de trânsito entre Perdizes e o Jardim Europa naquela madrugada. Eu verifiquei semana passada.</w:t>
       </w:r>
     </w:p>
     <w:p>
@@ -20566,7 +20581,7 @@
           <w:sz w:val="21"/>
           <w:szCs w:val="21"/>
         </w:rPr>
-        <w:t xml:space="preserve">A irmã tinha recebido o pai na véspera da morte, até meia-noite, e não tinha contado a ninguém. Tinha ligado sete vezes para ele na manhã seguinte, antes de qualquer pessoa saber que ele estava morto. Tinha apagado coisas, escondido coisas, protegido Carlos. E, agora, tinha mentido olhando nos olhos dele, comendo pipoca.</w:t>
+        <w:t xml:space="preserve">A irmã tinha recebido o pai na véspera da morte, até meia-noite, e não tinha contado a ninguém. Tinha ligado sete vezes para ele na manhã seguinte, antes de qualquer um dos filhos saber que ele estava morto. Tinha apagado coisas, escondido coisas, protegido Carlos. E, agora, tinha mentido olhando nos olhos dele, comendo pipoca.</w:t>
       </w:r>
     </w:p>
     <w:p>
@@ -21602,7 +21617,7 @@
           <w:sz w:val="21"/>
           <w:szCs w:val="21"/>
         </w:rPr>
-        <w:t xml:space="preserve">Naquela noite, Lia fez uma lista num papel, como sabia que o pai faria, e como, sem que ela soubesse, o irmão tinha feito na noite anterior. Uma lista curta, com um nome só no alto.</w:t>
+        <w:t xml:space="preserve">Naquela noite, Lia fez uma lista num papel, como sabia que o pai faria, e como, sem que ela soubesse, o irmão tinha feito dias antes. Uma lista curta, com um nome só no alto.</w:t>
       </w:r>
     </w:p>
     <w:p>
@@ -21769,7 +21784,7 @@
           <w:sz w:val="21"/>
           <w:szCs w:val="21"/>
         </w:rPr>
-        <w:t xml:space="preserve">Os dois não se falavam direito havia quase dez anos quando o telefone tocou numa madrugada de março e uma voz de enfermeira disse que Rodolfo estava internado, que era o coração, que talvez fosse melhor ele vir. Henrique chegou a Santos às quatro da manhã. Rodolfo morreu às seis, sem acordar, com o irmão segurando a mão dele.</w:t>
+        <w:t xml:space="preserve">Os dois não se falavam direito havia quase dez anos quando o telefone tocou numa madrugada de setembro e uma voz de enfermeira disse que Rodolfo estava internado, que era o coração, que talvez fosse melhor ele vir. Henrique chegou a Santos às quatro da manhã. Rodolfo morreu às seis, sem acordar, com o irmão segurando a mão dele.</w:t>
       </w:r>
     </w:p>
     <w:p>
@@ -23567,7 +23582,7 @@
           <w:sz w:val="21"/>
           <w:szCs w:val="21"/>
         </w:rPr>
-        <w:t xml:space="preserve">— Ele brigou com o Henrique — continuou Marta. — Umas três semanas antes de tudo. Você sabe disso?</w:t>
+        <w:t xml:space="preserve">— Ele brigou com o Henrique — continuou Marta. — Umas duas semanas antes de tudo. Você sabe disso?</w:t>
       </w:r>
     </w:p>
     <w:p>
@@ -24138,22 +24153,22 @@
           <w:sz w:val="21"/>
           <w:szCs w:val="21"/>
         </w:rPr>
-        <w:t xml:space="preserve">A última foto da galeria não era foto. Era a imagem de uma tela, uma captura do navegador do celular. Uma página de companhia aérea, em inglês, com uma busca de voo. São Paulo, Guarulhos, para Zurique. Só ida. Data: uma sexta-feira do fim de outubro.</w:t>
-      </w:r>
-    </w:p>
-    <w:p>
-      <w:pPr>
-        <w:spacing w:after="0" w:line="312"/>
-        <w:ind w:firstLine="340"/>
-        <w:jc w:val="both"/>
-      </w:pPr>
-      <w:r>
-        <w:rPr>
-          <w:rFonts w:ascii="Georgia" w:cs="Georgia" w:eastAsia="Georgia" w:hAnsi="Georgia"/>
-          <w:sz w:val="21"/>
-          <w:szCs w:val="21"/>
-        </w:rPr>
-        <w:t xml:space="preserve">Três dias depois da cremação.</w:t>
+        <w:t xml:space="preserve">A última foto da galeria não era foto. Era a imagem de uma tela, uma captura do navegador do celular. Uma página de companhia aérea, em inglês, com uma busca de voo. São Paulo, Guarulhos, para Zurique. Só ida. Data: a sexta-feira daquela mesma semana de outubro.</w:t>
+      </w:r>
+    </w:p>
+    <w:p>
+      <w:pPr>
+        <w:spacing w:after="0" w:line="312"/>
+        <w:ind w:firstLine="340"/>
+        <w:jc w:val="both"/>
+      </w:pPr>
+      <w:r>
+        <w:rPr>
+          <w:rFonts w:ascii="Georgia" w:cs="Georgia" w:eastAsia="Georgia" w:hAnsi="Georgia"/>
+          <w:sz w:val="21"/>
+          <w:szCs w:val="21"/>
+        </w:rPr>
+        <w:t xml:space="preserve">Dois dias depois da cremação.</w:t>
       </w:r>
     </w:p>
     <w:p>
@@ -24467,7 +24482,7 @@
           <w:sz w:val="21"/>
           <w:szCs w:val="21"/>
         </w:rPr>
-        <w:t xml:space="preserve">— Conto. — Ela olhou para a tela do BlackBerry, ainda aberta na foto do chalé de doze janelas. — Mas antes você precisa ver uma coisa. O pai tinha uma passagem para Zurique, Lucas. Ou ia ter. Para três dias depois da cremação.</w:t>
+        <w:t xml:space="preserve">— Conto. — Ela olhou para a tela do BlackBerry, ainda aberta na foto do chalé de doze janelas. — Mas antes você precisa ver uma coisa. O pai tinha uma passagem para Zurique, Lucas. Ou ia ter. Para dois dias depois da cremação.</w:t>
       </w:r>
     </w:p>
     <w:p>
@@ -25264,7 +25279,7 @@
           <w:sz w:val="21"/>
           <w:szCs w:val="21"/>
         </w:rPr>
-        <w:t xml:space="preserve">No carro, parado na rua de pastilhas azuis, tentou pôr as coisas em ordem, como o pai faria. Uma coluna para o que sabia, outra para o que achava.</w:t>
+        <w:t xml:space="preserve">No carro, parado em frente ao prédio de pastilhas azuis, tentou pôr as coisas em ordem, como o pai faria. Uma coluna para o que sabia, outra para o que achava.</w:t>
       </w:r>
     </w:p>
     <w:p>
@@ -26346,7 +26361,7 @@
           <w:sz w:val="21"/>
           <w:szCs w:val="21"/>
         </w:rPr>
-        <w:t xml:space="preserve">A passagem para Zurique, três dias depois da cremação. A mala com o sobretudo de etiqueta. O chalé de doze janelas. O cartão-postal de um lugar com neve. Não conta pra ninguém que eu vim, nem pro seu irmão. Ele não tinha ido ao apartamento dela na segunda à noite para se despedir de uma filha porque ia morrer.</w:t>
+        <w:t xml:space="preserve">A passagem para Zurique, dois dias depois da cremação. A mala com o sobretudo de etiqueta. O chalé de doze janelas. O cartão-postal de um lugar com neve. Não conta pra ninguém que eu vim, nem pro seu irmão. Ele não tinha ido ao apartamento dela na segunda à noite para se despedir de uma filha porque ia morrer.</w:t>
       </w:r>
     </w:p>
     <w:p>
@@ -26571,6 +26586,1608 @@
           <w:szCs w:val="21"/>
         </w:rPr>
         <w:t xml:space="preserve">E ela começava a entender, devagar, com um horror que nenhuma palavra cobria, que talvez ele tivesse estado vivo até o último momento em que alguém poderia ter salvado ele.</w:t>
+      </w:r>
+    </w:p>
+    <w:p>
+      <w:pPr>
+        <w:pageBreakBefore/>
+        <w:spacing w:after="120" w:before="1800"/>
+        <w:jc w:val="center"/>
+      </w:pPr>
+      <w:r>
+        <w:rPr>
+          <w:rFonts w:ascii="Georgia" w:cs="Georgia" w:eastAsia="Georgia" w:hAnsi="Georgia"/>
+          <w:spacing w:val="40"/>
+          <w:sz w:val="20"/>
+          <w:szCs w:val="20"/>
+        </w:rPr>
+        <w:t xml:space="preserve">CAPÍTULO 26</w:t>
+      </w:r>
+    </w:p>
+    <w:p>
+      <w:pPr>
+        <w:spacing w:after="720"/>
+        <w:jc w:val="center"/>
+      </w:pPr>
+      <w:r>
+        <w:rPr>
+          <w:rFonts w:ascii="Georgia" w:cs="Georgia" w:eastAsia="Georgia" w:hAnsi="Georgia"/>
+          <w:b/>
+          <w:bCs/>
+          <w:sz w:val="32"/>
+          <w:szCs w:val="32"/>
+        </w:rPr>
+        <w:t xml:space="preserve">A segunda assinatura</w:t>
+      </w:r>
+    </w:p>
+    <w:p>
+      <w:pPr>
+        <w:spacing w:after="0" w:line="312"/>
+        <w:ind w:firstLine="340"/>
+        <w:jc w:val="both"/>
+      </w:pPr>
+      <w:r>
+        <w:rPr>
+          <w:rFonts w:ascii="Georgia" w:cs="Georgia" w:eastAsia="Georgia" w:hAnsi="Georgia"/>
+          <w:sz w:val="21"/>
+          <w:szCs w:val="21"/>
+        </w:rPr>
+        <w:t xml:space="preserve">Na segunda-feira de manhã, o BlackBerry do pai voltou para as mãos de Lucas embrulhado no lenço de sempre, mas não pelas mãos de Lia. Foi o porteiro do prédio dela quem o entregou, na calçada da Fradique Coutinho, dentro de um envelope pardo fechado com fita. Sem bilhete. Sem mensagem no celular. A irmã, que nunca tinha deixado de descer para fazer a troca, nem nas semanas em que os dois mal se falavam, dessa vez não desceu.</w:t>
+      </w:r>
+    </w:p>
+    <w:p>
+      <w:pPr>
+        <w:spacing w:after="0" w:line="312"/>
+        <w:ind w:firstLine="340"/>
+        <w:jc w:val="both"/>
+      </w:pPr>
+      <w:r>
+        <w:rPr>
+          <w:rFonts w:ascii="Georgia" w:cs="Georgia" w:eastAsia="Georgia" w:hAnsi="Georgia"/>
+          <w:sz w:val="21"/>
+          <w:szCs w:val="21"/>
+        </w:rPr>
+        <w:t xml:space="preserve">Lucas ficou um tempo parado na calçada, com o envelope na mão, olhando para a janela do quarto andar. A cortina estava fechada.</w:t>
+      </w:r>
+    </w:p>
+    <w:p>
+      <w:pPr>
+        <w:spacing w:after="0" w:line="312"/>
+        <w:ind w:firstLine="340"/>
+        <w:jc w:val="both"/>
+      </w:pPr>
+      <w:r>
+        <w:rPr>
+          <w:rFonts w:ascii="Georgia" w:cs="Georgia" w:eastAsia="Georgia" w:hAnsi="Georgia"/>
+          <w:sz w:val="21"/>
+          <w:szCs w:val="21"/>
+        </w:rPr>
+        <w:t xml:space="preserve">Pensou em subir. Não subiu. Tinha na pasta, debaixo do braço, uma ata em inglês com um nome escrito em letras maiúsculas, e ainda não sabia como dizer aquele nome em voz alta para ela.</w:t>
+      </w:r>
+    </w:p>
+    <w:p>
+      <w:pPr>
+        <w:spacing w:after="200" w:before="200"/>
+        <w:jc w:val="center"/>
+      </w:pPr>
+      <w:r>
+        <w:rPr>
+          <w:rFonts w:ascii="Georgia" w:cs="Georgia" w:eastAsia="Georgia" w:hAnsi="Georgia"/>
+          <w:sz w:val="22"/>
+          <w:szCs w:val="22"/>
+        </w:rPr>
+        <w:t xml:space="preserve">*</w:t>
+      </w:r>
+    </w:p>
+    <w:p>
+      <w:pPr>
+        <w:spacing w:after="0" w:line="312"/>
+        <w:ind w:firstLine="340"/>
+        <w:jc w:val="both"/>
+      </w:pPr>
+      <w:r>
+        <w:rPr>
+          <w:rFonts w:ascii="Georgia" w:cs="Georgia" w:eastAsia="Georgia" w:hAnsi="Georgia"/>
+          <w:sz w:val="21"/>
+          <w:szCs w:val="21"/>
+        </w:rPr>
+        <w:t xml:space="preserve">A certidão de óbito estava na gaveta da escrivaninha desde a semana da cremação, junto com as outras coisas que ninguém quer ler duas vezes: o recibo da funerária, a nota do crematório, o cartão de pêsames da Associação Comercial. Lucas nunca tinha olhado para ela com atenção. Era um papel que dizia uma coisa que ele já sabia.</w:t>
+      </w:r>
+    </w:p>
+    <w:p>
+      <w:pPr>
+        <w:spacing w:after="0" w:line="312"/>
+        <w:ind w:firstLine="340"/>
+        <w:jc w:val="both"/>
+      </w:pPr>
+      <w:r>
+        <w:rPr>
+          <w:rFonts w:ascii="Georgia" w:cs="Georgia" w:eastAsia="Georgia" w:hAnsi="Georgia"/>
+          <w:sz w:val="21"/>
+          <w:szCs w:val="21"/>
+        </w:rPr>
+        <w:t xml:space="preserve">Naquela noite, olhou.</w:t>
+      </w:r>
+    </w:p>
+    <w:p>
+      <w:pPr>
+        <w:spacing w:after="0" w:line="312"/>
+        <w:ind w:firstLine="340"/>
+        <w:jc w:val="both"/>
+      </w:pPr>
+      <w:r>
+        <w:rPr>
+          <w:rFonts w:ascii="Georgia" w:cs="Georgia" w:eastAsia="Georgia" w:hAnsi="Georgia"/>
+          <w:sz w:val="21"/>
+          <w:szCs w:val="21"/>
+        </w:rPr>
+        <w:t xml:space="preserve">Causa da morte: infarto agudo do miocárdio. Hora: sete e trinta. Local: residência. E, no campo dos médicos, dois nomes. O primeiro, ele conhecia desde que se conhecia por gente. Álvaro Mendes. O segundo, nunca tinha ouvido.</w:t>
+      </w:r>
+    </w:p>
+    <w:p>
+      <w:pPr>
+        <w:spacing w:after="0" w:line="312"/>
+        <w:ind w:firstLine="340"/>
+        <w:jc w:val="both"/>
+      </w:pPr>
+      <w:r>
+        <w:rPr>
+          <w:rFonts w:ascii="Georgia" w:cs="Georgia" w:eastAsia="Georgia" w:hAnsi="Georgia"/>
+          <w:sz w:val="21"/>
+          <w:szCs w:val="21"/>
+        </w:rPr>
+        <w:t xml:space="preserve">Paulo Werneck.</w:t>
+      </w:r>
+    </w:p>
+    <w:p>
+      <w:pPr>
+        <w:spacing w:after="0" w:line="312"/>
+        <w:ind w:firstLine="340"/>
+        <w:jc w:val="both"/>
+      </w:pPr>
+      <w:r>
+        <w:rPr>
+          <w:rFonts w:ascii="Georgia" w:cs="Georgia" w:eastAsia="Georgia" w:hAnsi="Georgia"/>
+          <w:sz w:val="21"/>
+          <w:szCs w:val="21"/>
+        </w:rPr>
+        <w:t xml:space="preserve">Lucas lembrou da delegada, no primeiro encontro com Lia: um segundo médico, como a lei exige para a cremação. Lembrou de Tomás Ribeiro, o homem da seguradora: em vinte anos de profissão, poucas vezes vi uma família tão rápida. A cremação tinha sido decidida na terça à tarde e feita na quarta de manhã. Em algum lugar entre uma coisa e outra, um homem que Lucas nunca tinha visto pôs o nome num papel que transformou o pai em cinzas.</w:t>
+      </w:r>
+    </w:p>
+    <w:p>
+      <w:pPr>
+        <w:spacing w:after="0" w:line="312"/>
+        <w:ind w:firstLine="340"/>
+        <w:jc w:val="both"/>
+      </w:pPr>
+      <w:r>
+        <w:rPr>
+          <w:rFonts w:ascii="Georgia" w:cs="Georgia" w:eastAsia="Georgia" w:hAnsi="Georgia"/>
+          <w:sz w:val="21"/>
+          <w:szCs w:val="21"/>
+        </w:rPr>
+        <w:t xml:space="preserve">Procurou o nome na internet. Cardiologista, setenta e um anos, consultório na Rua Itapeva, a três quadras do Hospital Sírio-Libanês. Nenhuma foto. Uma única avaliação de paciente, de 2008: Doutor muito atencioso, mas a sala de espera precisa de reforma.</w:t>
+      </w:r>
+    </w:p>
+    <w:p>
+      <w:pPr>
+        <w:spacing w:after="200" w:before="200"/>
+        <w:jc w:val="center"/>
+      </w:pPr>
+      <w:r>
+        <w:rPr>
+          <w:rFonts w:ascii="Georgia" w:cs="Georgia" w:eastAsia="Georgia" w:hAnsi="Georgia"/>
+          <w:sz w:val="22"/>
+          <w:szCs w:val="22"/>
+        </w:rPr>
+        <w:t xml:space="preserve">*</w:t>
+      </w:r>
+    </w:p>
+    <w:p>
+      <w:pPr>
+        <w:spacing w:after="0" w:line="312"/>
+        <w:ind w:firstLine="340"/>
+        <w:jc w:val="both"/>
+      </w:pPr>
+      <w:r>
+        <w:rPr>
+          <w:rFonts w:ascii="Georgia" w:cs="Georgia" w:eastAsia="Georgia" w:hAnsi="Georgia"/>
+          <w:sz w:val="21"/>
+          <w:szCs w:val="21"/>
+        </w:rPr>
+        <w:t xml:space="preserve">A sala de espera precisava mesmo de reforma.</w:t>
+      </w:r>
+    </w:p>
+    <w:p>
+      <w:pPr>
+        <w:spacing w:after="0" w:line="312"/>
+        <w:ind w:firstLine="340"/>
+        <w:jc w:val="both"/>
+      </w:pPr>
+      <w:r>
+        <w:rPr>
+          <w:rFonts w:ascii="Georgia" w:cs="Georgia" w:eastAsia="Georgia" w:hAnsi="Georgia"/>
+          <w:sz w:val="21"/>
+          <w:szCs w:val="21"/>
+        </w:rPr>
+        <w:t xml:space="preserve">Ficava no segundo andar de um prédio estreito, com um sofá de couro rachado, uma samambaia de plástico e uma pilha de revistas de três anos antes. Não havia secretária. Havia uma campainha sobre uma mesinha e um aviso escrito à mão: toque e aguarde.</w:t>
+      </w:r>
+    </w:p>
+    <w:p>
+      <w:pPr>
+        <w:spacing w:after="0" w:line="312"/>
+        <w:ind w:firstLine="340"/>
+        <w:jc w:val="both"/>
+      </w:pPr>
+      <w:r>
+        <w:rPr>
+          <w:rFonts w:ascii="Georgia" w:cs="Georgia" w:eastAsia="Georgia" w:hAnsi="Georgia"/>
+          <w:sz w:val="21"/>
+          <w:szCs w:val="21"/>
+        </w:rPr>
+        <w:t xml:space="preserve">Lucas tocou. Aguardou onze minutos.</w:t>
+      </w:r>
+    </w:p>
+    <w:p>
+      <w:pPr>
+        <w:spacing w:after="0" w:line="312"/>
+        <w:ind w:firstLine="340"/>
+        <w:jc w:val="both"/>
+      </w:pPr>
+      <w:r>
+        <w:rPr>
+          <w:rFonts w:ascii="Georgia" w:cs="Georgia" w:eastAsia="Georgia" w:hAnsi="Georgia"/>
+          <w:sz w:val="21"/>
+          <w:szCs w:val="21"/>
+        </w:rPr>
+        <w:t xml:space="preserve">O doutor Paulo Werneck era um homem pequeno e curvado, de cabelo branco penteado para trás e uma gravata-borboleta que parecia ter sido amarrada por outra pessoa. Abriu a porta do consultório com um sorriso de boas-vindas que durou até Lucas dizer o próprio sobrenome.</w:t>
+      </w:r>
+    </w:p>
+    <w:p>
+      <w:pPr>
+        <w:spacing w:after="0" w:line="312"/>
+        <w:ind w:firstLine="340"/>
+        <w:jc w:val="both"/>
+      </w:pPr>
+      <w:r>
+        <w:rPr>
+          <w:rFonts w:ascii="Georgia" w:cs="Georgia" w:eastAsia="Georgia" w:hAnsi="Georgia"/>
+          <w:sz w:val="21"/>
+          <w:szCs w:val="21"/>
+        </w:rPr>
+        <w:t xml:space="preserve">— Salvallus — repetiu o médico.</w:t>
+      </w:r>
+    </w:p>
+    <w:p>
+      <w:pPr>
+        <w:spacing w:after="0" w:line="312"/>
+        <w:ind w:firstLine="340"/>
+        <w:jc w:val="both"/>
+      </w:pPr>
+      <w:r>
+        <w:rPr>
+          <w:rFonts w:ascii="Georgia" w:cs="Georgia" w:eastAsia="Georgia" w:hAnsi="Georgia"/>
+          <w:sz w:val="21"/>
+          <w:szCs w:val="21"/>
+        </w:rPr>
+        <w:t xml:space="preserve">— Henrique Salvallus era o meu pai. O senhor assinou o atestado de óbito dele.</w:t>
+      </w:r>
+    </w:p>
+    <w:p>
+      <w:pPr>
+        <w:spacing w:after="0" w:line="312"/>
+        <w:ind w:firstLine="340"/>
+        <w:jc w:val="both"/>
+      </w:pPr>
+      <w:r>
+        <w:rPr>
+          <w:rFonts w:ascii="Georgia" w:cs="Georgia" w:eastAsia="Georgia" w:hAnsi="Georgia"/>
+          <w:sz w:val="21"/>
+          <w:szCs w:val="21"/>
+        </w:rPr>
+        <w:t xml:space="preserve">O doutor Werneck não respondeu. Voltou para trás da mesa e sentou-se devagar, como quem precisa de apoio para uma coisa que não é física.</w:t>
+      </w:r>
+    </w:p>
+    <w:p>
+      <w:pPr>
+        <w:spacing w:after="0" w:line="312"/>
+        <w:ind w:firstLine="340"/>
+        <w:jc w:val="both"/>
+      </w:pPr>
+      <w:r>
+        <w:rPr>
+          <w:rFonts w:ascii="Georgia" w:cs="Georgia" w:eastAsia="Georgia" w:hAnsi="Georgia"/>
+          <w:sz w:val="21"/>
+          <w:szCs w:val="21"/>
+        </w:rPr>
+        <w:t xml:space="preserve">— Sente-se — disse. — Aceita uma água?</w:t>
+      </w:r>
+    </w:p>
+    <w:p>
+      <w:pPr>
+        <w:spacing w:after="0" w:line="312"/>
+        <w:ind w:firstLine="340"/>
+        <w:jc w:val="both"/>
+      </w:pPr>
+      <w:r>
+        <w:rPr>
+          <w:rFonts w:ascii="Georgia" w:cs="Georgia" w:eastAsia="Georgia" w:hAnsi="Georgia"/>
+          <w:sz w:val="21"/>
+          <w:szCs w:val="21"/>
+        </w:rPr>
+        <w:t xml:space="preserve">— Não, obrigado.</w:t>
+      </w:r>
+    </w:p>
+    <w:p>
+      <w:pPr>
+        <w:spacing w:after="0" w:line="312"/>
+        <w:ind w:firstLine="340"/>
+        <w:jc w:val="both"/>
+      </w:pPr>
+      <w:r>
+        <w:rPr>
+          <w:rFonts w:ascii="Georgia" w:cs="Georgia" w:eastAsia="Georgia" w:hAnsi="Georgia"/>
+          <w:sz w:val="21"/>
+          <w:szCs w:val="21"/>
+        </w:rPr>
+        <w:t xml:space="preserve">O médico se serviu de um copo da jarra que estava sobre a mesa, bebeu tudo de uma vez e encheu de novo. A mão tremia um pouco. Lucas reparou que a mão também tremia quando ele não estava segurando nada.</w:t>
+      </w:r>
+    </w:p>
+    <w:p>
+      <w:pPr>
+        <w:spacing w:after="200" w:before="200"/>
+        <w:jc w:val="center"/>
+      </w:pPr>
+      <w:r>
+        <w:rPr>
+          <w:rFonts w:ascii="Georgia" w:cs="Georgia" w:eastAsia="Georgia" w:hAnsi="Georgia"/>
+          <w:sz w:val="22"/>
+          <w:szCs w:val="22"/>
+        </w:rPr>
+        <w:t xml:space="preserve">*</w:t>
+      </w:r>
+    </w:p>
+    <w:p>
+      <w:pPr>
+        <w:spacing w:after="0" w:line="312"/>
+        <w:ind w:firstLine="340"/>
+        <w:jc w:val="both"/>
+      </w:pPr>
+      <w:r>
+        <w:rPr>
+          <w:rFonts w:ascii="Georgia" w:cs="Georgia" w:eastAsia="Georgia" w:hAnsi="Georgia"/>
+          <w:sz w:val="21"/>
+          <w:szCs w:val="21"/>
+        </w:rPr>
+        <w:t xml:space="preserve">— O senhor viu o corpo do meu pai? — perguntou Lucas.</w:t>
+      </w:r>
+    </w:p>
+    <w:p>
+      <w:pPr>
+        <w:spacing w:after="0" w:line="312"/>
+        <w:ind w:firstLine="340"/>
+        <w:jc w:val="both"/>
+      </w:pPr>
+      <w:r>
+        <w:rPr>
+          <w:rFonts w:ascii="Georgia" w:cs="Georgia" w:eastAsia="Georgia" w:hAnsi="Georgia"/>
+          <w:sz w:val="21"/>
+          <w:szCs w:val="21"/>
+        </w:rPr>
+        <w:t xml:space="preserve">Era a pergunta que ele tinha ensaiado no carro, e saiu mais curta do que no ensaio. O médico olhou para ele por cima dos óculos durante muito tempo.</w:t>
+      </w:r>
+    </w:p>
+    <w:p>
+      <w:pPr>
+        <w:spacing w:after="0" w:line="312"/>
+        <w:ind w:firstLine="340"/>
+        <w:jc w:val="both"/>
+      </w:pPr>
+      <w:r>
+        <w:rPr>
+          <w:rFonts w:ascii="Georgia" w:cs="Georgia" w:eastAsia="Georgia" w:hAnsi="Georgia"/>
+          <w:sz w:val="21"/>
+          <w:szCs w:val="21"/>
+        </w:rPr>
+        <w:t xml:space="preserve">— O senhor é advogado?</w:t>
+      </w:r>
+    </w:p>
+    <w:p>
+      <w:pPr>
+        <w:spacing w:after="0" w:line="312"/>
+        <w:ind w:firstLine="340"/>
+        <w:jc w:val="both"/>
+      </w:pPr>
+      <w:r>
+        <w:rPr>
+          <w:rFonts w:ascii="Georgia" w:cs="Georgia" w:eastAsia="Georgia" w:hAnsi="Georgia"/>
+          <w:sz w:val="21"/>
+          <w:szCs w:val="21"/>
+        </w:rPr>
+        <w:t xml:space="preserve">— Não.</w:t>
+      </w:r>
+    </w:p>
+    <w:p>
+      <w:pPr>
+        <w:spacing w:after="0" w:line="312"/>
+        <w:ind w:firstLine="340"/>
+        <w:jc w:val="both"/>
+      </w:pPr>
+      <w:r>
+        <w:rPr>
+          <w:rFonts w:ascii="Georgia" w:cs="Georgia" w:eastAsia="Georgia" w:hAnsi="Georgia"/>
+          <w:sz w:val="21"/>
+          <w:szCs w:val="21"/>
+        </w:rPr>
+        <w:t xml:space="preserve">— Jornalista?</w:t>
+      </w:r>
+    </w:p>
+    <w:p>
+      <w:pPr>
+        <w:spacing w:after="0" w:line="312"/>
+        <w:ind w:firstLine="340"/>
+        <w:jc w:val="both"/>
+      </w:pPr>
+      <w:r>
+        <w:rPr>
+          <w:rFonts w:ascii="Georgia" w:cs="Georgia" w:eastAsia="Georgia" w:hAnsi="Georgia"/>
+          <w:sz w:val="21"/>
+          <w:szCs w:val="21"/>
+        </w:rPr>
+        <w:t xml:space="preserve">— Sou filho dele.</w:t>
+      </w:r>
+    </w:p>
+    <w:p>
+      <w:pPr>
+        <w:spacing w:after="0" w:line="312"/>
+        <w:ind w:firstLine="340"/>
+        <w:jc w:val="both"/>
+      </w:pPr>
+      <w:r>
+        <w:rPr>
+          <w:rFonts w:ascii="Georgia" w:cs="Georgia" w:eastAsia="Georgia" w:hAnsi="Georgia"/>
+          <w:sz w:val="21"/>
+          <w:szCs w:val="21"/>
+        </w:rPr>
+        <w:t xml:space="preserve">O doutor Werneck tirou os óculos e os pousou sobre a mesa, com cuidado, ao lado de um aparelho de pressão que parecia mais velho que o prédio.</w:t>
+      </w:r>
+    </w:p>
+    <w:p>
+      <w:pPr>
+        <w:spacing w:after="0" w:line="312"/>
+        <w:ind w:firstLine="340"/>
+        <w:jc w:val="both"/>
+      </w:pPr>
+      <w:r>
+        <w:rPr>
+          <w:rFonts w:ascii="Georgia" w:cs="Georgia" w:eastAsia="Georgia" w:hAnsi="Georgia"/>
+          <w:sz w:val="21"/>
+          <w:szCs w:val="21"/>
+        </w:rPr>
+        <w:t xml:space="preserve">— Não — disse. — Não vi.</w:t>
+      </w:r>
+    </w:p>
+    <w:p>
+      <w:pPr>
+        <w:spacing w:after="0" w:line="312"/>
+        <w:ind w:firstLine="340"/>
+        <w:jc w:val="both"/>
+      </w:pPr>
+      <w:r>
+        <w:rPr>
+          <w:rFonts w:ascii="Georgia" w:cs="Georgia" w:eastAsia="Georgia" w:hAnsi="Georgia"/>
+          <w:sz w:val="21"/>
+          <w:szCs w:val="21"/>
+        </w:rPr>
+        <w:t xml:space="preserve">Lucas tinha imaginado que ia sentir raiva quando ouvisse aquilo. Não sentiu. Sentiu uma coisa mais fria, mais parecida com o que sentia quando uma conta de cinco colunas finalmente fechava.</w:t>
+      </w:r>
+    </w:p>
+    <w:p>
+      <w:pPr>
+        <w:spacing w:after="0" w:line="312"/>
+        <w:ind w:firstLine="340"/>
+        <w:jc w:val="both"/>
+      </w:pPr>
+      <w:r>
+        <w:rPr>
+          <w:rFonts w:ascii="Georgia" w:cs="Georgia" w:eastAsia="Georgia" w:hAnsi="Georgia"/>
+          <w:sz w:val="21"/>
+          <w:szCs w:val="21"/>
+        </w:rPr>
+        <w:t xml:space="preserve">— O Álvaro chegou aqui na terça-feira, perto do meio-dia — continuou o médico, olhando para os próprios óculos. — Sem marcar hora. Eu estava atendendo uma senhora com arritmia. Ele esperou na sala, naquele sofá. Quando ela saiu, ele entrou com o formulário já preenchido. Tudo. Causa, hora, local. Só faltava o meu nome no segundo campo.</w:t>
+      </w:r>
+    </w:p>
+    <w:p>
+      <w:pPr>
+        <w:spacing w:after="0" w:line="312"/>
+        <w:ind w:firstLine="340"/>
+        <w:jc w:val="both"/>
+      </w:pPr>
+      <w:r>
+        <w:rPr>
+          <w:rFonts w:ascii="Georgia" w:cs="Georgia" w:eastAsia="Georgia" w:hAnsi="Georgia"/>
+          <w:sz w:val="21"/>
+          <w:szCs w:val="21"/>
+        </w:rPr>
+        <w:t xml:space="preserve">— E o senhor assinou.</w:t>
+      </w:r>
+    </w:p>
+    <w:p>
+      <w:pPr>
+        <w:spacing w:after="0" w:line="312"/>
+        <w:ind w:firstLine="340"/>
+        <w:jc w:val="both"/>
+      </w:pPr>
+      <w:r>
+        <w:rPr>
+          <w:rFonts w:ascii="Georgia" w:cs="Georgia" w:eastAsia="Georgia" w:hAnsi="Georgia"/>
+          <w:sz w:val="21"/>
+          <w:szCs w:val="21"/>
+        </w:rPr>
+        <w:t xml:space="preserve">— Eu conheço o Álvaro há quarenta anos, senhor Salvallus. Fizemos residência juntos. Quando a minha mulher adoeceu, foi ele que ficou com ela no hospital nas noites em que eu não aguentava mais. — O médico esfregou os olhos. — Ele me disse: Paulo, eu estava lá. Eu vi tudo. Infarto fulminante, paciente meu há trinta anos, hipertenso, histórico registrado. A viúva quer cremar, e a lei pede dois nomes. Eu acreditei. Por que não acreditaria?</w:t>
+      </w:r>
+    </w:p>
+    <w:p>
+      <w:pPr>
+        <w:spacing w:after="0" w:line="312"/>
+        <w:ind w:firstLine="340"/>
+        <w:jc w:val="both"/>
+      </w:pPr>
+      <w:r>
+        <w:rPr>
+          <w:rFonts w:ascii="Georgia" w:cs="Georgia" w:eastAsia="Georgia" w:hAnsi="Georgia"/>
+          <w:sz w:val="21"/>
+          <w:szCs w:val="21"/>
+        </w:rPr>
+        <w:t xml:space="preserve">Era a mesma frase de Otávio. Lucas reparou nisso e não disse nada.</w:t>
+      </w:r>
+    </w:p>
+    <w:p>
+      <w:pPr>
+        <w:spacing w:after="0" w:line="312"/>
+        <w:ind w:firstLine="340"/>
+        <w:jc w:val="both"/>
+      </w:pPr>
+      <w:r>
+        <w:rPr>
+          <w:rFonts w:ascii="Georgia" w:cs="Georgia" w:eastAsia="Georgia" w:hAnsi="Georgia"/>
+          <w:sz w:val="21"/>
+          <w:szCs w:val="21"/>
+        </w:rPr>
+        <w:t xml:space="preserve">— O senhor sabe que isso é crime — disse, em vez disso.</w:t>
+      </w:r>
+    </w:p>
+    <w:p>
+      <w:pPr>
+        <w:spacing w:after="0" w:line="312"/>
+        <w:ind w:firstLine="340"/>
+        <w:jc w:val="both"/>
+      </w:pPr>
+      <w:r>
+        <w:rPr>
+          <w:rFonts w:ascii="Georgia" w:cs="Georgia" w:eastAsia="Georgia" w:hAnsi="Georgia"/>
+          <w:sz w:val="21"/>
+          <w:szCs w:val="21"/>
+        </w:rPr>
+        <w:t xml:space="preserve">— Sei. — O doutor Werneck pôs os óculos de volta. — Sei desde aquela tarde. Faz semanas que eu não durmo direito por causa disso. Pode chamar o Conselho de Medicina, se quiser. Pode chamar a polícia. Eu estou com setenta e um anos. Não tenho mais muito o que perder.</w:t>
+      </w:r>
+    </w:p>
+    <w:p>
+      <w:pPr>
+        <w:spacing w:after="200" w:before="200"/>
+        <w:jc w:val="center"/>
+      </w:pPr>
+      <w:r>
+        <w:rPr>
+          <w:rFonts w:ascii="Georgia" w:cs="Georgia" w:eastAsia="Georgia" w:hAnsi="Georgia"/>
+          <w:sz w:val="22"/>
+          <w:szCs w:val="22"/>
+        </w:rPr>
+        <w:t xml:space="preserve">*</w:t>
+      </w:r>
+    </w:p>
+    <w:p>
+      <w:pPr>
+        <w:spacing w:after="0" w:line="312"/>
+        <w:ind w:firstLine="340"/>
+        <w:jc w:val="both"/>
+      </w:pPr>
+      <w:r>
+        <w:rPr>
+          <w:rFonts w:ascii="Georgia" w:cs="Georgia" w:eastAsia="Georgia" w:hAnsi="Georgia"/>
+          <w:sz w:val="21"/>
+          <w:szCs w:val="21"/>
+        </w:rPr>
+        <w:t xml:space="preserve">Lucas não chamou ninguém. Ficou sentado na cadeira dos pacientes, olhando para a samambaia de plástico pela porta entreaberta.</w:t>
+      </w:r>
+    </w:p>
+    <w:p>
+      <w:pPr>
+        <w:spacing w:after="0" w:line="312"/>
+        <w:ind w:firstLine="340"/>
+        <w:jc w:val="both"/>
+      </w:pPr>
+      <w:r>
+        <w:rPr>
+          <w:rFonts w:ascii="Georgia" w:cs="Georgia" w:eastAsia="Georgia" w:hAnsi="Georgia"/>
+          <w:sz w:val="21"/>
+          <w:szCs w:val="21"/>
+        </w:rPr>
+        <w:t xml:space="preserve">— Tem mais alguma coisa — disse. Não era uma pergunta.</w:t>
+      </w:r>
+    </w:p>
+    <w:p>
+      <w:pPr>
+        <w:spacing w:after="0" w:line="312"/>
+        <w:ind w:firstLine="340"/>
+        <w:jc w:val="both"/>
+      </w:pPr>
+      <w:r>
+        <w:rPr>
+          <w:rFonts w:ascii="Georgia" w:cs="Georgia" w:eastAsia="Georgia" w:hAnsi="Georgia"/>
+          <w:sz w:val="21"/>
+          <w:szCs w:val="21"/>
+        </w:rPr>
+        <w:t xml:space="preserve">O médico demorou a responder.</w:t>
+      </w:r>
+    </w:p>
+    <w:p>
+      <w:pPr>
+        <w:spacing w:after="0" w:line="312"/>
+        <w:ind w:firstLine="340"/>
+        <w:jc w:val="both"/>
+      </w:pPr>
+      <w:r>
+        <w:rPr>
+          <w:rFonts w:ascii="Georgia" w:cs="Georgia" w:eastAsia="Georgia" w:hAnsi="Georgia"/>
+          <w:sz w:val="21"/>
+          <w:szCs w:val="21"/>
+        </w:rPr>
+        <w:t xml:space="preserve">— Tem uma coisa que eu nunca entendi. — Ele girou o copo vazio sobre a mesa. — O Álvaro não queria que eu assinasse.</w:t>
+      </w:r>
+    </w:p>
+    <w:p>
+      <w:pPr>
+        <w:spacing w:after="0" w:line="312"/>
+        <w:ind w:firstLine="340"/>
+        <w:jc w:val="both"/>
+      </w:pPr>
+      <w:r>
+        <w:rPr>
+          <w:rFonts w:ascii="Georgia" w:cs="Georgia" w:eastAsia="Georgia" w:hAnsi="Georgia"/>
+          <w:sz w:val="21"/>
+          <w:szCs w:val="21"/>
+        </w:rPr>
+        <w:t xml:space="preserve">— Como assim?</w:t>
+      </w:r>
+    </w:p>
+    <w:p>
+      <w:pPr>
+        <w:spacing w:after="0" w:line="312"/>
+        <w:ind w:firstLine="340"/>
+        <w:jc w:val="both"/>
+      </w:pPr>
+      <w:r>
+        <w:rPr>
+          <w:rFonts w:ascii="Georgia" w:cs="Georgia" w:eastAsia="Georgia" w:hAnsi="Georgia"/>
+          <w:sz w:val="21"/>
+          <w:szCs w:val="21"/>
+        </w:rPr>
+        <w:t xml:space="preserve">— Ele trouxe o formulário pronto, me pediu a assinatura, e quando eu peguei a caneta ele segurou a minha mão. Assim. — O médico pôs a mão direita sobre o próprio pulso esquerdo. — E disse: tomara que você não precise disso, Paulo. Tomara que isso vá para o lixo. Eu vou tentar convencer a viúva a enterrar. Se eu conseguir, este papel não vale nada.</w:t>
+      </w:r>
+    </w:p>
+    <w:p>
+      <w:pPr>
+        <w:spacing w:after="0" w:line="312"/>
+        <w:ind w:firstLine="340"/>
+        <w:jc w:val="both"/>
+      </w:pPr>
+      <w:r>
+        <w:rPr>
+          <w:rFonts w:ascii="Georgia" w:cs="Georgia" w:eastAsia="Georgia" w:hAnsi="Georgia"/>
+          <w:sz w:val="21"/>
+          <w:szCs w:val="21"/>
+        </w:rPr>
+        <w:t xml:space="preserve">Lucas sentiu a nuca gelar.</w:t>
+      </w:r>
+    </w:p>
+    <w:p>
+      <w:pPr>
+        <w:spacing w:after="0" w:line="312"/>
+        <w:ind w:firstLine="340"/>
+        <w:jc w:val="both"/>
+      </w:pPr>
+      <w:r>
+        <w:rPr>
+          <w:rFonts w:ascii="Georgia" w:cs="Georgia" w:eastAsia="Georgia" w:hAnsi="Georgia"/>
+          <w:sz w:val="21"/>
+          <w:szCs w:val="21"/>
+        </w:rPr>
+        <w:t xml:space="preserve">— Ele já sabia que ia brigar com a Helena.</w:t>
+      </w:r>
+    </w:p>
+    <w:p>
+      <w:pPr>
+        <w:spacing w:after="0" w:line="312"/>
+        <w:ind w:firstLine="340"/>
+        <w:jc w:val="both"/>
+      </w:pPr>
+      <w:r>
+        <w:rPr>
+          <w:rFonts w:ascii="Georgia" w:cs="Georgia" w:eastAsia="Georgia" w:hAnsi="Georgia"/>
+          <w:sz w:val="21"/>
+          <w:szCs w:val="21"/>
+        </w:rPr>
+        <w:t xml:space="preserve">— Sabia que ia tentar. Disse que o Henrique merecia um enterro. Que não ia deixar o amigo virar fumaça por causa de uma piada. — O doutor Werneck balançou a cabeça. — Eu achei que era luto. Homem da nossa idade, quando perde o amigo de juventude, fica assim. Agarra-se a qualquer coisa. Mas ele estava estranho de um jeito que eu nunca tinha visto. Olhava o relógio o tempo todo. Antes de sair, me perguntou uma coisa que eu levei dias para entender por que tinha me incomodado.</w:t>
+      </w:r>
+    </w:p>
+    <w:p>
+      <w:pPr>
+        <w:spacing w:after="0" w:line="312"/>
+        <w:ind w:firstLine="340"/>
+        <w:jc w:val="both"/>
+      </w:pPr>
+      <w:r>
+        <w:rPr>
+          <w:rFonts w:ascii="Georgia" w:cs="Georgia" w:eastAsia="Georgia" w:hAnsi="Georgia"/>
+          <w:sz w:val="21"/>
+          <w:szCs w:val="21"/>
+        </w:rPr>
+        <w:t xml:space="preserve">— O quê?</w:t>
+      </w:r>
+    </w:p>
+    <w:p>
+      <w:pPr>
+        <w:spacing w:after="0" w:line="312"/>
+        <w:ind w:firstLine="340"/>
+        <w:jc w:val="both"/>
+      </w:pPr>
+      <w:r>
+        <w:rPr>
+          <w:rFonts w:ascii="Georgia" w:cs="Georgia" w:eastAsia="Georgia" w:hAnsi="Georgia"/>
+          <w:sz w:val="21"/>
+          <w:szCs w:val="21"/>
+        </w:rPr>
+        <w:t xml:space="preserve">— Perguntou quanto tempo, na minha experiência, um corpo leva para esfriar por completo num quarto fechado, sem ar-condicionado. — O médico olhou para Lucas. — Um clínico com quarenta anos de profissão, perguntando isso a um cardiologista. Como se ele não soubesse. Como se precisasse ouvir de outra pessoa um número que não fosse o dele.</w:t>
+      </w:r>
+    </w:p>
+    <w:p>
+      <w:pPr>
+        <w:spacing w:after="200" w:before="200"/>
+        <w:jc w:val="center"/>
+      </w:pPr>
+      <w:r>
+        <w:rPr>
+          <w:rFonts w:ascii="Georgia" w:cs="Georgia" w:eastAsia="Georgia" w:hAnsi="Georgia"/>
+          <w:sz w:val="22"/>
+          <w:szCs w:val="22"/>
+        </w:rPr>
+        <w:t xml:space="preserve">*</w:t>
+      </w:r>
+    </w:p>
+    <w:p>
+      <w:pPr>
+        <w:spacing w:after="0" w:line="312"/>
+        <w:ind w:firstLine="340"/>
+        <w:jc w:val="both"/>
+      </w:pPr>
+      <w:r>
+        <w:rPr>
+          <w:rFonts w:ascii="Georgia" w:cs="Georgia" w:eastAsia="Georgia" w:hAnsi="Georgia"/>
+          <w:sz w:val="21"/>
+          <w:szCs w:val="21"/>
+        </w:rPr>
+        <w:t xml:space="preserve">A funerária ficava na Rua Teodoro Sampaio, a poucas quadras da padaria onde Lucas e Lia tinham feito a primeira lista num guardanapo. Lucas foi a pé, para ter tempo de pensar, e não pensou em nada. Contou os passos. Contou as lojas de móveis. Contou os ônibus.</w:t>
+      </w:r>
+    </w:p>
+    <w:p>
+      <w:pPr>
+        <w:spacing w:after="0" w:line="312"/>
+        <w:ind w:firstLine="340"/>
+        <w:jc w:val="both"/>
+      </w:pPr>
+      <w:r>
+        <w:rPr>
+          <w:rFonts w:ascii="Georgia" w:cs="Georgia" w:eastAsia="Georgia" w:hAnsi="Georgia"/>
+          <w:sz w:val="21"/>
+          <w:szCs w:val="21"/>
+        </w:rPr>
+        <w:t xml:space="preserve">Seu Gilberto, o agente funerário que tinha cuidado de tudo naquela terça, era um homem grande, de voz mansa, com as mãos mais limpas que Lucas já tinha visto. Trabalhava ali havia trinta e dois anos. Recebeu Lucas numa salinha dos fundos, entre catálogos de urnas e caixas de lenços de papel estrategicamente espalhadas, e ofereceu um café de garrafa térmica que Lucas aceitou e tomou inteiro, porque estava frio por dentro e o café estava quente.</w:t>
+      </w:r>
+    </w:p>
+    <w:p>
+      <w:pPr>
+        <w:spacing w:after="0" w:line="312"/>
+        <w:ind w:firstLine="340"/>
+        <w:jc w:val="both"/>
+      </w:pPr>
+      <w:r>
+        <w:rPr>
+          <w:rFonts w:ascii="Georgia" w:cs="Georgia" w:eastAsia="Georgia" w:hAnsi="Georgia"/>
+          <w:sz w:val="21"/>
+          <w:szCs w:val="21"/>
+        </w:rPr>
+        <w:t xml:space="preserve">— O doutor Álvaro — disse seu Gilberto, quando Lucas perguntou. — Lembro bem. Não é todo dia que um médico fica tanto tempo do lado de um corpo.</w:t>
+      </w:r>
+    </w:p>
+    <w:p>
+      <w:pPr>
+        <w:spacing w:after="0" w:line="312"/>
+        <w:ind w:firstLine="340"/>
+        <w:jc w:val="both"/>
+      </w:pPr>
+      <w:r>
+        <w:rPr>
+          <w:rFonts w:ascii="Georgia" w:cs="Georgia" w:eastAsia="Georgia" w:hAnsi="Georgia"/>
+          <w:sz w:val="21"/>
+          <w:szCs w:val="21"/>
+        </w:rPr>
+        <w:t xml:space="preserve">— Quanto tempo?</w:t>
+      </w:r>
+    </w:p>
+    <w:p>
+      <w:pPr>
+        <w:spacing w:after="0" w:line="312"/>
+        <w:ind w:firstLine="340"/>
+        <w:jc w:val="both"/>
+      </w:pPr>
+      <w:r>
+        <w:rPr>
+          <w:rFonts w:ascii="Georgia" w:cs="Georgia" w:eastAsia="Georgia" w:hAnsi="Georgia"/>
+          <w:sz w:val="21"/>
+          <w:szCs w:val="21"/>
+        </w:rPr>
+        <w:t xml:space="preserve">— O tempo todo. — O agente funerário cruzou as mãos sobre a mesa. — Ele mesmo chamou a remoção, às oito e pouco, de uma empresa particular, e veio junto, no banco da frente. Aqui, não deixou ninguém encostar no seu pai sem ele estar presente. Nem para trocar a roupa. Eu já tinha visto família assim. Médico, nunca.</w:t>
+      </w:r>
+    </w:p>
+    <w:p>
+      <w:pPr>
+        <w:spacing w:after="0" w:line="312"/>
+        <w:ind w:firstLine="340"/>
+        <w:jc w:val="both"/>
+      </w:pPr>
+      <w:r>
+        <w:rPr>
+          <w:rFonts w:ascii="Georgia" w:cs="Georgia" w:eastAsia="Georgia" w:hAnsi="Georgia"/>
+          <w:sz w:val="21"/>
+          <w:szCs w:val="21"/>
+        </w:rPr>
+        <w:t xml:space="preserve">— Ele proibiu a preparação.</w:t>
+      </w:r>
+    </w:p>
+    <w:p>
+      <w:pPr>
+        <w:spacing w:after="0" w:line="312"/>
+        <w:ind w:firstLine="340"/>
+        <w:jc w:val="both"/>
+      </w:pPr>
+      <w:r>
+        <w:rPr>
+          <w:rFonts w:ascii="Georgia" w:cs="Georgia" w:eastAsia="Georgia" w:hAnsi="Georgia"/>
+          <w:sz w:val="21"/>
+          <w:szCs w:val="21"/>
+        </w:rPr>
+        <w:t xml:space="preserve">— Proibiu tudo. Formol, maquiagem, algodão, nada. Isso eu até entendo, tem gente que não gosta. — Seu Gilberto baixou a voz, embora não houvesse mais ninguém na sala. — O que eu não entendi foi a câmara fria.</w:t>
+      </w:r>
+    </w:p>
+    <w:p>
+      <w:pPr>
+        <w:spacing w:after="0" w:line="312"/>
+        <w:ind w:firstLine="340"/>
+        <w:jc w:val="both"/>
+      </w:pPr>
+      <w:r>
+        <w:rPr>
+          <w:rFonts w:ascii="Georgia" w:cs="Georgia" w:eastAsia="Georgia" w:hAnsi="Georgia"/>
+          <w:sz w:val="21"/>
+          <w:szCs w:val="21"/>
+        </w:rPr>
+        <w:t xml:space="preserve">— Que câmara fria?</w:t>
+      </w:r>
+    </w:p>
+    <w:p>
+      <w:pPr>
+        <w:spacing w:after="0" w:line="312"/>
+        <w:ind w:firstLine="340"/>
+        <w:jc w:val="both"/>
+      </w:pPr>
+      <w:r>
+        <w:rPr>
+          <w:rFonts w:ascii="Georgia" w:cs="Georgia" w:eastAsia="Georgia" w:hAnsi="Georgia"/>
+          <w:sz w:val="21"/>
+          <w:szCs w:val="21"/>
+        </w:rPr>
+        <w:t xml:space="preserve">— Todo corpo que passa a noite aqui vai para a câmara fria, senhor Lucas. É a regra. É higiene. Seu pai chegou na terça de manhã e o velório era só na quarta. Uma noite inteira. — O agente balançou a cabeça devagar. — O doutor não deixou. Disse que o paciente tinha horror ao frio. Disse que se responsabilizava. Ficou numa sala de velório pequena que a gente tem aqui atrás, com o caixão aberto, a noite inteira, sentado numa cadeira do lado. Eu passei lá duas vezes, de madrugada. Ele estava de olhos fechados, mexendo a boca. Achei que estava rezando.</w:t>
+      </w:r>
+    </w:p>
+    <w:p>
+      <w:pPr>
+        <w:spacing w:after="0" w:line="312"/>
+        <w:ind w:firstLine="340"/>
+        <w:jc w:val="both"/>
+      </w:pPr>
+      <w:r>
+        <w:rPr>
+          <w:rFonts w:ascii="Georgia" w:cs="Georgia" w:eastAsia="Georgia" w:hAnsi="Georgia"/>
+          <w:sz w:val="21"/>
+          <w:szCs w:val="21"/>
+        </w:rPr>
+        <w:t xml:space="preserve">Rezando. Lucas lembrou de Otávio, sentado na mesma cadeira de sempre, na sala da corretora: uma voz lá em cima, falando baixo, parecia que estava rezando.</w:t>
+      </w:r>
+    </w:p>
+    <w:p>
+      <w:pPr>
+        <w:spacing w:after="200" w:before="200"/>
+        <w:jc w:val="center"/>
+      </w:pPr>
+      <w:r>
+        <w:rPr>
+          <w:rFonts w:ascii="Georgia" w:cs="Georgia" w:eastAsia="Georgia" w:hAnsi="Georgia"/>
+          <w:sz w:val="22"/>
+          <w:szCs w:val="22"/>
+        </w:rPr>
+        <w:t xml:space="preserve">*</w:t>
+      </w:r>
+    </w:p>
+    <w:p>
+      <w:pPr>
+        <w:spacing w:after="0" w:line="312"/>
+        <w:ind w:firstLine="340"/>
+        <w:jc w:val="both"/>
+      </w:pPr>
+      <w:r>
+        <w:rPr>
+          <w:rFonts w:ascii="Georgia" w:cs="Georgia" w:eastAsia="Georgia" w:hAnsi="Georgia"/>
+          <w:sz w:val="21"/>
+          <w:szCs w:val="21"/>
+        </w:rPr>
+        <w:t xml:space="preserve">— Seu Gilberto — disse Lucas, depois de um tempo. — Tem mais alguma coisa que o senhor estranhou?</w:t>
+      </w:r>
+    </w:p>
+    <w:p>
+      <w:pPr>
+        <w:spacing w:after="0" w:line="312"/>
+        <w:ind w:firstLine="340"/>
+        <w:jc w:val="both"/>
+      </w:pPr>
+      <w:r>
+        <w:rPr>
+          <w:rFonts w:ascii="Georgia" w:cs="Georgia" w:eastAsia="Georgia" w:hAnsi="Georgia"/>
+          <w:sz w:val="21"/>
+          <w:szCs w:val="21"/>
+        </w:rPr>
+        <w:t xml:space="preserve">O agente funerário olhou para ele com uma expressão que Lucas não soube ler. Depois se levantou, fechou a porta da salinha e voltou a sentar.</w:t>
+      </w:r>
+    </w:p>
+    <w:p>
+      <w:pPr>
+        <w:spacing w:after="0" w:line="312"/>
+        <w:ind w:firstLine="340"/>
+        <w:jc w:val="both"/>
+      </w:pPr>
+      <w:r>
+        <w:rPr>
+          <w:rFonts w:ascii="Georgia" w:cs="Georgia" w:eastAsia="Georgia" w:hAnsi="Georgia"/>
+          <w:sz w:val="21"/>
+          <w:szCs w:val="21"/>
+        </w:rPr>
+        <w:t xml:space="preserve">— Eu faço isso há trinta e dois anos — disse. — Já vesti mais de dez mil pessoas. Gente velha, gente nova, gente que morreu dormindo, gente que morreu na rua. E tem uma coisa que nunca falha, senhor Lucas. Depois de umas horas, o corpo endurece. Começa pelo queixo, depois o pescoço, depois os braços. Dura um dia, mais ou menos, e depois amolece de novo. Todo mundo que trabalha nisso sabe. É como o relógio da morte.</w:t>
+      </w:r>
+    </w:p>
+    <w:p>
+      <w:pPr>
+        <w:spacing w:after="0" w:line="312"/>
+        <w:ind w:firstLine="340"/>
+        <w:jc w:val="both"/>
+      </w:pPr>
+      <w:r>
+        <w:rPr>
+          <w:rFonts w:ascii="Georgia" w:cs="Georgia" w:eastAsia="Georgia" w:hAnsi="Georgia"/>
+          <w:sz w:val="21"/>
+          <w:szCs w:val="21"/>
+        </w:rPr>
+        <w:t xml:space="preserve">Lucas não respondeu. Esperou.</w:t>
+      </w:r>
+    </w:p>
+    <w:p>
+      <w:pPr>
+        <w:spacing w:after="0" w:line="312"/>
+        <w:ind w:firstLine="340"/>
+        <w:jc w:val="both"/>
+      </w:pPr>
+      <w:r>
+        <w:rPr>
+          <w:rFonts w:ascii="Georgia" w:cs="Georgia" w:eastAsia="Georgia" w:hAnsi="Georgia"/>
+          <w:sz w:val="21"/>
+          <w:szCs w:val="21"/>
+        </w:rPr>
+        <w:t xml:space="preserve">— Quando eu fui vestir o seu pai, na terça à tarde, com o doutor do lado, ele não estava duro. — Seu Gilberto falou devagar, escolhendo cada palavra. — Nem um pouco. Eu dobrei o braço dele para passar a manga da camisa e o braço dobrou como o de gente dormindo. Eu olhei para o doutor. Ele disse que era efeito de um remédio do coração que o seu pai tomava. Que às vezes acontecia. Eu nunca tinha ouvido falar desse remédio. Mas ele era o médico, e eu sou só o homem que veste.</w:t>
+      </w:r>
+    </w:p>
+    <w:p>
+      <w:pPr>
+        <w:spacing w:after="0" w:line="312"/>
+        <w:ind w:firstLine="340"/>
+        <w:jc w:val="both"/>
+      </w:pPr>
+      <w:r>
+        <w:rPr>
+          <w:rFonts w:ascii="Georgia" w:cs="Georgia" w:eastAsia="Georgia" w:hAnsi="Georgia"/>
+          <w:sz w:val="21"/>
+          <w:szCs w:val="21"/>
+        </w:rPr>
+        <w:t xml:space="preserve">Lucas sentiu a xícara vazia escorregar entre os dedos. Segurou com mais força.</w:t>
+      </w:r>
+    </w:p>
+    <w:p>
+      <w:pPr>
+        <w:spacing w:after="0" w:line="312"/>
+        <w:ind w:firstLine="340"/>
+        <w:jc w:val="both"/>
+      </w:pPr>
+      <w:r>
+        <w:rPr>
+          <w:rFonts w:ascii="Georgia" w:cs="Georgia" w:eastAsia="Georgia" w:hAnsi="Georgia"/>
+          <w:sz w:val="21"/>
+          <w:szCs w:val="21"/>
+        </w:rPr>
+        <w:t xml:space="preserve">— O senhor contou isso a alguém?</w:t>
+      </w:r>
+    </w:p>
+    <w:p>
+      <w:pPr>
+        <w:spacing w:after="0" w:line="312"/>
+        <w:ind w:firstLine="340"/>
+        <w:jc w:val="both"/>
+      </w:pPr>
+      <w:r>
+        <w:rPr>
+          <w:rFonts w:ascii="Georgia" w:cs="Georgia" w:eastAsia="Georgia" w:hAnsi="Georgia"/>
+          <w:sz w:val="21"/>
+          <w:szCs w:val="21"/>
+        </w:rPr>
+        <w:t xml:space="preserve">— A quem? A família tinha decidido cremar. Tinha dois médicos assinando. — O agente abriu as mãos. — E eu aprendi há muito tempo que, nesta profissão, a gente não vê nada. Só veste.</w:t>
+      </w:r>
+    </w:p>
+    <w:p>
+      <w:pPr>
+        <w:spacing w:after="200" w:before="200"/>
+        <w:jc w:val="center"/>
+      </w:pPr>
+      <w:r>
+        <w:rPr>
+          <w:rFonts w:ascii="Georgia" w:cs="Georgia" w:eastAsia="Georgia" w:hAnsi="Georgia"/>
+          <w:sz w:val="22"/>
+          <w:szCs w:val="22"/>
+        </w:rPr>
+        <w:t xml:space="preserve">*</w:t>
+      </w:r>
+    </w:p>
+    <w:p>
+      <w:pPr>
+        <w:spacing w:after="0" w:line="312"/>
+        <w:ind w:firstLine="340"/>
+        <w:jc w:val="both"/>
+      </w:pPr>
+      <w:r>
+        <w:rPr>
+          <w:rFonts w:ascii="Georgia" w:cs="Georgia" w:eastAsia="Georgia" w:hAnsi="Georgia"/>
+          <w:sz w:val="21"/>
+          <w:szCs w:val="21"/>
+        </w:rPr>
+        <w:t xml:space="preserve">Na porta, já com a mão na maçaneta, seu Gilberto disse mais uma coisa.</w:t>
+      </w:r>
+    </w:p>
+    <w:p>
+      <w:pPr>
+        <w:spacing w:after="0" w:line="312"/>
+        <w:ind w:firstLine="340"/>
+        <w:jc w:val="both"/>
+      </w:pPr>
+      <w:r>
+        <w:rPr>
+          <w:rFonts w:ascii="Georgia" w:cs="Georgia" w:eastAsia="Georgia" w:hAnsi="Georgia"/>
+          <w:sz w:val="21"/>
+          <w:szCs w:val="21"/>
+        </w:rPr>
+        <w:t xml:space="preserve">— Ah. Teve outra. Pequena. Talvez nem seja nada.</w:t>
+      </w:r>
+    </w:p>
+    <w:p>
+      <w:pPr>
+        <w:spacing w:after="0" w:line="312"/>
+        <w:ind w:firstLine="340"/>
+        <w:jc w:val="both"/>
+      </w:pPr>
+      <w:r>
+        <w:rPr>
+          <w:rFonts w:ascii="Georgia" w:cs="Georgia" w:eastAsia="Georgia" w:hAnsi="Georgia"/>
+          <w:sz w:val="21"/>
+          <w:szCs w:val="21"/>
+        </w:rPr>
+        <w:t xml:space="preserve">— Fala.</w:t>
+      </w:r>
+    </w:p>
+    <w:p>
+      <w:pPr>
+        <w:spacing w:after="0" w:line="312"/>
+        <w:ind w:firstLine="340"/>
+        <w:jc w:val="both"/>
+      </w:pPr>
+      <w:r>
+        <w:rPr>
+          <w:rFonts w:ascii="Georgia" w:cs="Georgia" w:eastAsia="Georgia" w:hAnsi="Georgia"/>
+          <w:sz w:val="21"/>
+          <w:szCs w:val="21"/>
+        </w:rPr>
+        <w:t xml:space="preserve">— Na terça de manhã, logo que chegou com o corpo, antes de a família decidir qualquer coisa, o doutor me pediu o preço de uma gaveta no Cemitério do Araçá. Uma gaveta de parede, não cova na terra. Térrea, se tivesse, e perto de um portão lateral, desses que quase ninguém usa. — O agente coçou a cabeça. — Eu achei que ele estava adiantando o serviço para a viúva. Depois a viúva escolheu a cremação, e ele brigou com ela. Eu ouvi a briga daqui, pelo telefone. Ele gritava.</w:t>
+      </w:r>
+    </w:p>
+    <w:p>
+      <w:pPr>
+        <w:spacing w:after="0" w:line="312"/>
+        <w:ind w:firstLine="340"/>
+        <w:jc w:val="both"/>
+      </w:pPr>
+      <w:r>
+        <w:rPr>
+          <w:rFonts w:ascii="Georgia" w:cs="Georgia" w:eastAsia="Georgia" w:hAnsi="Georgia"/>
+          <w:sz w:val="21"/>
+          <w:szCs w:val="21"/>
+        </w:rPr>
+        <w:t xml:space="preserve">— Perto do portão — repetiu Lucas.</w:t>
+      </w:r>
+    </w:p>
+    <w:p>
+      <w:pPr>
+        <w:spacing w:after="0" w:line="312"/>
+        <w:ind w:firstLine="340"/>
+        <w:jc w:val="both"/>
+      </w:pPr>
+      <w:r>
+        <w:rPr>
+          <w:rFonts w:ascii="Georgia" w:cs="Georgia" w:eastAsia="Georgia" w:hAnsi="Georgia"/>
+          <w:sz w:val="21"/>
+          <w:szCs w:val="21"/>
+        </w:rPr>
+        <w:t xml:space="preserve">— Perto do portão. E perguntou se a tampa da gaveta era lacrada com cimento no mesmo dia ou só no dia seguinte. — Seu Gilberto encolheu os ombros. — Ninguém nunca me fez essa pergunta. Em trinta e dois anos.</w:t>
+      </w:r>
+    </w:p>
+    <w:p>
+      <w:pPr>
+        <w:spacing w:after="200" w:before="200"/>
+        <w:jc w:val="center"/>
+      </w:pPr>
+      <w:r>
+        <w:rPr>
+          <w:rFonts w:ascii="Georgia" w:cs="Georgia" w:eastAsia="Georgia" w:hAnsi="Georgia"/>
+          <w:sz w:val="22"/>
+          <w:szCs w:val="22"/>
+        </w:rPr>
+        <w:t xml:space="preserve">*</w:t>
+      </w:r>
+    </w:p>
+    <w:p>
+      <w:pPr>
+        <w:spacing w:after="0" w:line="312"/>
+        <w:ind w:firstLine="340"/>
+        <w:jc w:val="both"/>
+      </w:pPr>
+      <w:r>
+        <w:rPr>
+          <w:rFonts w:ascii="Georgia" w:cs="Georgia" w:eastAsia="Georgia" w:hAnsi="Georgia"/>
+          <w:sz w:val="21"/>
+          <w:szCs w:val="21"/>
+        </w:rPr>
+        <w:t xml:space="preserve">Lucas ficou no carro, estacionado na Teodoro Sampaio, com o motor desligado e o BlackBerry do pai no colo, até a rua escurecer.</w:t>
+      </w:r>
+    </w:p>
+    <w:p>
+      <w:pPr>
+        <w:spacing w:after="0" w:line="312"/>
+        <w:ind w:firstLine="340"/>
+        <w:jc w:val="both"/>
+      </w:pPr>
+      <w:r>
+        <w:rPr>
+          <w:rFonts w:ascii="Georgia" w:cs="Georgia" w:eastAsia="Georgia" w:hAnsi="Georgia"/>
+          <w:sz w:val="21"/>
+          <w:szCs w:val="21"/>
+        </w:rPr>
+        <w:t xml:space="preserve">Abriu a agenda na terça-feira da morte. Não sabia o que procurava. Talvez só ver o dia como o pai o tinha imaginado, antes de ele acontecer.</w:t>
+      </w:r>
+    </w:p>
+    <w:p>
+      <w:pPr>
+        <w:spacing w:after="0" w:line="312"/>
+        <w:ind w:firstLine="340"/>
+        <w:jc w:val="both"/>
+      </w:pPr>
+      <w:r>
+        <w:rPr>
+          <w:rFonts w:ascii="Georgia" w:cs="Georgia" w:eastAsia="Georgia" w:hAnsi="Georgia"/>
+          <w:sz w:val="21"/>
+          <w:szCs w:val="21"/>
+        </w:rPr>
+        <w:t xml:space="preserve">Havia um único compromisso, em vermelho, a cor dos médicos.</w:t>
+      </w:r>
+    </w:p>
+    <w:p>
+      <w:pPr>
+        <w:spacing w:after="0" w:line="312"/>
+        <w:ind w:firstLine="340"/>
+        <w:jc w:val="both"/>
+      </w:pPr>
+      <w:r>
+        <w:rPr>
+          <w:rFonts w:ascii="Georgia" w:cs="Georgia" w:eastAsia="Georgia" w:hAnsi="Georgia"/>
+          <w:sz w:val="21"/>
+          <w:szCs w:val="21"/>
+        </w:rPr>
+        <w:t xml:space="preserve">7h — Álvaro. Em casa.</w:t>
+      </w:r>
+    </w:p>
+    <w:p>
+      <w:pPr>
+        <w:pBdr>
+          <w:top w:val="single" w:color="555555" w:sz="6" w:space="6"/>
+          <w:bottom w:val="single" w:color="555555" w:sz="6" w:space="6"/>
+          <w:left w:val="single" w:color="555555" w:sz="6" w:space="6"/>
+          <w:right w:val="single" w:color="555555" w:sz="6" w:space="6"/>
+        </w:pBdr>
+        <w:shd w:fill="EFEFEF" w:color="auto" w:val="clear"/>
+        <w:spacing w:after="0" w:before="240"/>
+        <w:ind w:left="227" w:right="227"/>
+        <w:jc w:val="center"/>
+      </w:pPr>
+      <w:r>
+        <w:rPr>
+          <w:rFonts w:ascii="Georgia" w:cs="Georgia" w:eastAsia="Georgia" w:hAnsi="Georgia"/>
+          <w:b/>
+          <w:bCs/>
+          <w:spacing w:val="30"/>
+          <w:sz w:val="17"/>
+          <w:szCs w:val="17"/>
+        </w:rPr>
+        <w:t xml:space="preserve">NO CELULAR DE HENRIQUE</w:t>
+      </w:r>
+    </w:p>
+    <w:p>
+      <w:pPr>
+        <w:pBdr>
+          <w:top w:val="single" w:color="555555" w:sz="6" w:space="6"/>
+          <w:bottom w:val="single" w:color="555555" w:sz="6" w:space="6"/>
+          <w:left w:val="single" w:color="555555" w:sz="6" w:space="6"/>
+          <w:right w:val="single" w:color="555555" w:sz="6" w:space="6"/>
+        </w:pBdr>
+        <w:shd w:fill="EFEFEF" w:color="auto" w:val="clear"/>
+        <w:spacing w:after="240" w:before="0" w:line="288"/>
+        <w:ind w:left="227" w:right="227"/>
+        <w:jc w:val="center"/>
+      </w:pPr>
+      <w:r>
+        <w:rPr>
+          <w:rFonts w:ascii="Georgia" w:cs="Georgia" w:eastAsia="Georgia" w:hAnsi="Georgia"/>
+          <w:i/>
+          <w:iCs/>
+          <w:sz w:val="19"/>
+          <w:szCs w:val="19"/>
+        </w:rPr>
+        <w:t xml:space="preserve">Abra a agenda do celular de Henrique na terça-feira da morte. Há um único compromisso, em vermelho. Veja o que está escrito e repare na data em que ele foi marcado.</w:t>
+      </w:r>
+    </w:p>
+    <w:p>
+      <w:pPr>
+        <w:spacing w:after="0" w:line="312"/>
+        <w:ind w:firstLine="340"/>
+        <w:jc w:val="both"/>
+      </w:pPr>
+      <w:r>
+        <w:rPr>
+          <w:rFonts w:ascii="Georgia" w:cs="Georgia" w:eastAsia="Georgia" w:hAnsi="Georgia"/>
+          <w:sz w:val="21"/>
+          <w:szCs w:val="21"/>
+        </w:rPr>
+        <w:t xml:space="preserve">A data de criação estava no pé da tela, em letra miúda. Quinze de setembro. Três semanas antes. Dois dias depois da estrada de Cajamar, do carro na ribanceira, de Nestor reconhecido pela aliança.</w:t>
+      </w:r>
+    </w:p>
+    <w:p>
+      <w:pPr>
+        <w:spacing w:after="0" w:line="312"/>
+        <w:ind w:firstLine="340"/>
+        <w:jc w:val="both"/>
+      </w:pPr>
+      <w:r>
+        <w:rPr>
+          <w:rFonts w:ascii="Georgia" w:cs="Georgia" w:eastAsia="Georgia" w:hAnsi="Georgia"/>
+          <w:sz w:val="21"/>
+          <w:szCs w:val="21"/>
+        </w:rPr>
+        <w:t xml:space="preserve">Ninguém marca uma consulta em casa, às sete da manhã, com três semanas de antecedência, para morrer de infarto.</w:t>
+      </w:r>
+    </w:p>
+    <w:p>
+      <w:pPr>
+        <w:spacing w:after="0" w:line="312"/>
+        <w:ind w:firstLine="340"/>
+        <w:jc w:val="both"/>
+      </w:pPr>
+      <w:r>
+        <w:rPr>
+          <w:rFonts w:ascii="Georgia" w:cs="Georgia" w:eastAsia="Georgia" w:hAnsi="Georgia"/>
+          <w:sz w:val="21"/>
+          <w:szCs w:val="21"/>
+        </w:rPr>
+        <w:t xml:space="preserve">Lucas pegou o caderninho onde vinha anotando tudo desde a primeira semana e escreveu, uma embaixo da outra, as coisas que tinha ouvido naquele dia.</w:t>
+      </w:r>
+    </w:p>
+    <w:p>
+      <w:pPr>
+        <w:spacing w:after="0" w:line="312"/>
+        <w:ind w:firstLine="340"/>
+        <w:jc w:val="both"/>
+      </w:pPr>
+      <w:r>
+        <w:rPr>
+          <w:rFonts w:ascii="Georgia" w:cs="Georgia" w:eastAsia="Georgia" w:hAnsi="Georgia"/>
+          <w:sz w:val="21"/>
+          <w:szCs w:val="21"/>
+        </w:rPr>
+        <w:t xml:space="preserve">Atestado assinado sem ver o corpo.</w:t>
+      </w:r>
+    </w:p>
+    <w:p>
+      <w:pPr>
+        <w:spacing w:after="0" w:line="312"/>
+        <w:ind w:firstLine="340"/>
+        <w:jc w:val="both"/>
+      </w:pPr>
+      <w:r>
+        <w:rPr>
+          <w:rFonts w:ascii="Georgia" w:cs="Georgia" w:eastAsia="Georgia" w:hAnsi="Georgia"/>
+          <w:sz w:val="21"/>
+          <w:szCs w:val="21"/>
+        </w:rPr>
+        <w:t xml:space="preserve">Tomara que este papel vá para o lixo.</w:t>
+      </w:r>
+    </w:p>
+    <w:p>
+      <w:pPr>
+        <w:spacing w:after="0" w:line="312"/>
+        <w:ind w:firstLine="340"/>
+        <w:jc w:val="both"/>
+      </w:pPr>
+      <w:r>
+        <w:rPr>
+          <w:rFonts w:ascii="Georgia" w:cs="Georgia" w:eastAsia="Georgia" w:hAnsi="Georgia"/>
+          <w:sz w:val="21"/>
+          <w:szCs w:val="21"/>
+        </w:rPr>
+        <w:t xml:space="preserve">Quanto tempo leva para esfriar.</w:t>
+      </w:r>
+    </w:p>
+    <w:p>
+      <w:pPr>
+        <w:spacing w:after="0" w:line="312"/>
+        <w:ind w:firstLine="340"/>
+        <w:jc w:val="both"/>
+      </w:pPr>
+      <w:r>
+        <w:rPr>
+          <w:rFonts w:ascii="Georgia" w:cs="Georgia" w:eastAsia="Georgia" w:hAnsi="Georgia"/>
+          <w:sz w:val="21"/>
+          <w:szCs w:val="21"/>
+        </w:rPr>
+        <w:t xml:space="preserve">Sem formol. Sem câmara fria. Ele tinha horror ao frio.</w:t>
+      </w:r>
+    </w:p>
+    <w:p>
+      <w:pPr>
+        <w:spacing w:after="0" w:line="312"/>
+        <w:ind w:firstLine="340"/>
+        <w:jc w:val="both"/>
+      </w:pPr>
+      <w:r>
+        <w:rPr>
+          <w:rFonts w:ascii="Georgia" w:cs="Georgia" w:eastAsia="Georgia" w:hAnsi="Georgia"/>
+          <w:sz w:val="21"/>
+          <w:szCs w:val="21"/>
+        </w:rPr>
+        <w:t xml:space="preserve">O corpo não endureceu.</w:t>
+      </w:r>
+    </w:p>
+    <w:p>
+      <w:pPr>
+        <w:spacing w:after="0" w:line="312"/>
+        <w:ind w:firstLine="340"/>
+        <w:jc w:val="both"/>
+      </w:pPr>
+      <w:r>
+        <w:rPr>
+          <w:rFonts w:ascii="Georgia" w:cs="Georgia" w:eastAsia="Georgia" w:hAnsi="Georgia"/>
+          <w:sz w:val="21"/>
+          <w:szCs w:val="21"/>
+        </w:rPr>
+        <w:t xml:space="preserve">Uma gaveta perto do portão. A tampa lacrada no mesmo dia ou no dia seguinte?</w:t>
+      </w:r>
+    </w:p>
+    <w:p>
+      <w:pPr>
+        <w:spacing w:after="0" w:line="312"/>
+        <w:ind w:firstLine="340"/>
+        <w:jc w:val="both"/>
+      </w:pPr>
+      <w:r>
+        <w:rPr>
+          <w:rFonts w:ascii="Georgia" w:cs="Georgia" w:eastAsia="Georgia" w:hAnsi="Georgia"/>
+          <w:sz w:val="21"/>
+          <w:szCs w:val="21"/>
+        </w:rPr>
+        <w:t xml:space="preserve">Ficou olhando para a lista. Depois tirou da pasta a ata da Ubatuba Holdings e a carta do pai e pôs tudo junto, no banco do passageiro, como peças de um quebra-cabeça.</w:t>
+      </w:r>
+    </w:p>
+    <w:p>
+      <w:pPr>
+        <w:spacing w:after="0" w:line="312"/>
+        <w:ind w:firstLine="340"/>
+        <w:jc w:val="both"/>
+      </w:pPr>
+      <w:r>
+        <w:rPr>
+          <w:rFonts w:ascii="Georgia" w:cs="Georgia" w:eastAsia="Georgia" w:hAnsi="Georgia"/>
+          <w:sz w:val="21"/>
+          <w:szCs w:val="21"/>
+        </w:rPr>
+        <w:t xml:space="preserve">Obrigado por apagar a luz.</w:t>
+      </w:r>
+    </w:p>
+    <w:p>
+      <w:pPr>
+        <w:spacing w:after="0" w:line="312"/>
+        <w:ind w:firstLine="340"/>
+        <w:jc w:val="both"/>
+      </w:pPr>
+      <w:r>
+        <w:rPr>
+          <w:rFonts w:ascii="Georgia" w:cs="Georgia" w:eastAsia="Georgia" w:hAnsi="Georgia"/>
+          <w:sz w:val="21"/>
+          <w:szCs w:val="21"/>
+        </w:rPr>
+        <w:t xml:space="preserve">Um médico que precisava que um morto não esfriasse. Que não endurecesse. Que ficasse numa gaveta perto do portão de um cemitério, com a tampa ainda sem cimento.</w:t>
+      </w:r>
+    </w:p>
+    <w:p>
+      <w:pPr>
+        <w:spacing w:after="0" w:line="312"/>
+        <w:ind w:firstLine="340"/>
+        <w:jc w:val="both"/>
+      </w:pPr>
+      <w:r>
+        <w:rPr>
+          <w:rFonts w:ascii="Georgia" w:cs="Georgia" w:eastAsia="Georgia" w:hAnsi="Georgia"/>
+          <w:sz w:val="21"/>
+          <w:szCs w:val="21"/>
+        </w:rPr>
+        <w:t xml:space="preserve">Lucas não deixou a frase se completar dentro da cabeça. Sentiu que, se deixasse, não ia conseguir dirigir até em casa.</w:t>
+      </w:r>
+    </w:p>
+    <w:p>
+      <w:pPr>
+        <w:spacing w:after="200" w:before="200"/>
+        <w:jc w:val="center"/>
+      </w:pPr>
+      <w:r>
+        <w:rPr>
+          <w:rFonts w:ascii="Georgia" w:cs="Georgia" w:eastAsia="Georgia" w:hAnsi="Georgia"/>
+          <w:sz w:val="22"/>
+          <w:szCs w:val="22"/>
+        </w:rPr>
+        <w:t xml:space="preserve">*</w:t>
+      </w:r>
+    </w:p>
+    <w:p>
+      <w:pPr>
+        <w:spacing w:after="0" w:line="312"/>
+        <w:ind w:firstLine="340"/>
+        <w:jc w:val="both"/>
+      </w:pPr>
+      <w:r>
+        <w:rPr>
+          <w:rFonts w:ascii="Georgia" w:cs="Georgia" w:eastAsia="Georgia" w:hAnsi="Georgia"/>
+          <w:sz w:val="21"/>
+          <w:szCs w:val="21"/>
+        </w:rPr>
+        <w:t xml:space="preserve">Na sexta-feira, era a vez de Lia ficar com o celular.</w:t>
+      </w:r>
+    </w:p>
+    <w:p>
+      <w:pPr>
+        <w:spacing w:after="0" w:line="312"/>
+        <w:ind w:firstLine="340"/>
+        <w:jc w:val="both"/>
+      </w:pPr>
+      <w:r>
+        <w:rPr>
+          <w:rFonts w:ascii="Georgia" w:cs="Georgia" w:eastAsia="Georgia" w:hAnsi="Georgia"/>
+          <w:sz w:val="21"/>
+          <w:szCs w:val="21"/>
+        </w:rPr>
+        <w:t xml:space="preserve">Lucas embrulhou o BlackBerry no lenço, como sempre. Antes de fechar o envelope, tirou da pasta uma cópia da declaração de óbito do pai, que tinha pedido naquela tarde no cartório, com o número impresso em vermelho no alto da folha. Dobrou em quatro e pôs junto do aparelho. No verso, escreveu com a caneta do pai, a mesma letra inclinada que ele tinha herdado sem querer:</w:t>
+      </w:r>
+    </w:p>
+    <w:p>
+      <w:pPr>
+        <w:spacing w:after="0" w:line="312"/>
+        <w:ind w:firstLine="340"/>
+        <w:jc w:val="both"/>
+      </w:pPr>
+      <w:r>
+        <w:rPr>
+          <w:rFonts w:ascii="Georgia" w:cs="Georgia" w:eastAsia="Georgia" w:hAnsi="Georgia"/>
+          <w:sz w:val="21"/>
+          <w:szCs w:val="21"/>
+        </w:rPr>
+        <w:t xml:space="preserve">A segunda assinatura. Ele nunca viu o pai. Precisamos conversar sem listas. L.</w:t>
+      </w:r>
+    </w:p>
+    <w:p>
+      <w:pPr>
+        <w:spacing w:after="0" w:line="312"/>
+        <w:ind w:firstLine="340"/>
+        <w:jc w:val="both"/>
+      </w:pPr>
+      <w:r>
+        <w:rPr>
+          <w:rFonts w:ascii="Georgia" w:cs="Georgia" w:eastAsia="Georgia" w:hAnsi="Georgia"/>
+          <w:sz w:val="21"/>
+          <w:szCs w:val="21"/>
+        </w:rPr>
+        <w:t xml:space="preserve">Deixou o envelope com o porteiro da Fradique Coutinho, às sete da noite. Não pediu para subir.</w:t>
+      </w:r>
+    </w:p>
+    <w:p>
+      <w:pPr>
+        <w:spacing w:after="0" w:line="312"/>
+        <w:ind w:firstLine="340"/>
+        <w:jc w:val="both"/>
+      </w:pPr>
+      <w:r>
+        <w:rPr>
+          <w:rFonts w:ascii="Georgia" w:cs="Georgia" w:eastAsia="Georgia" w:hAnsi="Georgia"/>
+          <w:sz w:val="21"/>
+          <w:szCs w:val="21"/>
+        </w:rPr>
+        <w:t xml:space="preserve">No carro, antes de dar a partida, olhou para a janela do quarto andar. A cortina continuava fechada. Mas, por um segundo, achou ter visto uma sombra parada atrás dela.</w:t>
+      </w:r>
+    </w:p>
+    <w:p>
+      <w:pPr>
+        <w:spacing w:after="0" w:line="312"/>
+        <w:ind w:firstLine="340"/>
+        <w:jc w:val="both"/>
+      </w:pPr>
+      <w:r>
+        <w:rPr>
+          <w:rFonts w:ascii="Georgia" w:cs="Georgia" w:eastAsia="Georgia" w:hAnsi="Georgia"/>
+          <w:sz w:val="21"/>
+          <w:szCs w:val="21"/>
+        </w:rPr>
+        <w:t xml:space="preserve">Ficou esperando que a sombra se mexesse. Ela não se mexeu.</w:t>
+      </w:r>
+    </w:p>
+    <w:p>
+      <w:pPr>
+        <w:spacing w:after="0" w:line="312"/>
+        <w:ind w:firstLine="340"/>
+        <w:jc w:val="both"/>
+      </w:pPr>
+      <w:r>
+        <w:rPr>
+          <w:rFonts w:ascii="Georgia" w:cs="Georgia" w:eastAsia="Georgia" w:hAnsi="Georgia"/>
+          <w:sz w:val="21"/>
+          <w:szCs w:val="21"/>
+        </w:rPr>
+        <w:t xml:space="preserve">Lucas ligou o carro e foi embora devagar, pensando que, pela primeira vez em semanas, tinha contado à irmã uma coisa antes de ter certeza.</w:t>
       </w:r>
     </w:p>
     <w:sectPr>

</xml_diff>

<commit_message>
Livro policial: capítulo 27 (O papel que me deixa ir) e justificativa da segunda assinatura
Co-Authored-By: Claude Opus 5.5 <noreply@anthropic.com>
Claude-Session: https://claude.ai/code/session_01BrurxSYygRC3rRhaUYosm1
</commit_message>
<xml_diff>
--- a/docs/livro-policial/TODO_CRIME_TEM_UM_AUTOR.docx
+++ b/docs/livro-policial/TODO_CRIME_TEM_UM_AUTOR.docx
@@ -27288,7 +27288,82 @@
           <w:sz w:val="21"/>
           <w:szCs w:val="21"/>
         </w:rPr>
-        <w:t xml:space="preserve">Lucas sentiu a nuca gelar.</w:t>
+        <w:t xml:space="preserve">Lucas franziu a testa.</w:t>
+      </w:r>
+    </w:p>
+    <w:p>
+      <w:pPr>
+        <w:spacing w:after="0" w:line="312"/>
+        <w:ind w:firstLine="340"/>
+        <w:jc w:val="both"/>
+      </w:pPr>
+      <w:r>
+        <w:rPr>
+          <w:rFonts w:ascii="Georgia" w:cs="Georgia" w:eastAsia="Georgia" w:hAnsi="Georgia"/>
+          <w:sz w:val="21"/>
+          <w:szCs w:val="21"/>
+        </w:rPr>
+        <w:t xml:space="preserve">— Isso não faz sentido. Se ele queria o enterro, bastava não pedir a sua assinatura. Sem o segundo médico, não tinha cremação.</w:t>
+      </w:r>
+    </w:p>
+    <w:p>
+      <w:pPr>
+        <w:spacing w:after="0" w:line="312"/>
+        <w:ind w:firstLine="340"/>
+        <w:jc w:val="both"/>
+      </w:pPr>
+      <w:r>
+        <w:rPr>
+          <w:rFonts w:ascii="Georgia" w:cs="Georgia" w:eastAsia="Georgia" w:hAnsi="Georgia"/>
+          <w:sz w:val="21"/>
+          <w:szCs w:val="21"/>
+        </w:rPr>
+        <w:t xml:space="preserve">— Foi exatamente o que eu disse a ele. — O doutor Werneck soltou o próprio pulso. — E ele me respondeu uma coisa que eu nunca esqueci. Disse: Paulo, sem a sua assinatura não acontece enterro. Acontece o IML. A viúva tem o direito de cremar, e o crematório aceita dois médicos ou um legista. Se faltar o seu nome, mandam o corpo para um legista, e o legista assina sozinho. Mas antes ele abre. Um homem que a polícia investiga em quatro mortes, eles abrem do queixo à barriga. E aí não sobra escolha nenhuma, nem enterro, nem cremação, nem nada.</w:t>
+      </w:r>
+    </w:p>
+    <w:p>
+      <w:pPr>
+        <w:spacing w:after="0" w:line="312"/>
+        <w:ind w:firstLine="340"/>
+        <w:jc w:val="both"/>
+      </w:pPr>
+      <w:r>
+        <w:rPr>
+          <w:rFonts w:ascii="Georgia" w:cs="Georgia" w:eastAsia="Georgia" w:hAnsi="Georgia"/>
+          <w:sz w:val="21"/>
+          <w:szCs w:val="21"/>
+        </w:rPr>
+        <w:t xml:space="preserve">— E ele preferiu…</w:t>
+      </w:r>
+    </w:p>
+    <w:p>
+      <w:pPr>
+        <w:spacing w:after="0" w:line="312"/>
+        <w:ind w:firstLine="340"/>
+        <w:jc w:val="both"/>
+      </w:pPr>
+      <w:r>
+        <w:rPr>
+          <w:rFonts w:ascii="Georgia" w:cs="Georgia" w:eastAsia="Georgia" w:hAnsi="Georgia"/>
+          <w:sz w:val="21"/>
+          <w:szCs w:val="21"/>
+        </w:rPr>
+        <w:t xml:space="preserve">— Preferiu ter os dois caminhos na mão. Lutar pelo enterro até o último minuto e deixar a cremação de reserva, assinada por um amigo que não ia fazer perguntas. — O médico baixou os olhos. — Ele disse uma frase que me pareceu exagero de luto. Eu não deixo abrirem o Henrique, Paulo. Nem morto.</w:t>
+      </w:r>
+    </w:p>
+    <w:p>
+      <w:pPr>
+        <w:spacing w:after="0" w:line="312"/>
+        <w:ind w:firstLine="340"/>
+        <w:jc w:val="both"/>
+      </w:pPr>
+      <w:r>
+        <w:rPr>
+          <w:rFonts w:ascii="Georgia" w:cs="Georgia" w:eastAsia="Georgia" w:hAnsi="Georgia"/>
+          <w:sz w:val="21"/>
+          <w:szCs w:val="21"/>
+        </w:rPr>
+        <w:t xml:space="preserve">Nem morto. Lucas sentiu a nuca gelar.</w:t>
       </w:r>
     </w:p>
     <w:p>
@@ -28188,6 +28263,1610 @@
           <w:szCs w:val="21"/>
         </w:rPr>
         <w:t xml:space="preserve">Lucas ligou o carro e foi embora devagar, pensando que, pela primeira vez em semanas, tinha contado à irmã uma coisa antes de ter certeza.</w:t>
+      </w:r>
+    </w:p>
+    <w:p>
+      <w:pPr>
+        <w:pageBreakBefore/>
+        <w:spacing w:after="120" w:before="1800"/>
+        <w:jc w:val="center"/>
+      </w:pPr>
+      <w:r>
+        <w:rPr>
+          <w:rFonts w:ascii="Georgia" w:cs="Georgia" w:eastAsia="Georgia" w:hAnsi="Georgia"/>
+          <w:spacing w:val="40"/>
+          <w:sz w:val="20"/>
+          <w:szCs w:val="20"/>
+        </w:rPr>
+        <w:t xml:space="preserve">CAPÍTULO 27</w:t>
+      </w:r>
+    </w:p>
+    <w:p>
+      <w:pPr>
+        <w:spacing w:after="720"/>
+        <w:jc w:val="center"/>
+      </w:pPr>
+      <w:r>
+        <w:rPr>
+          <w:rFonts w:ascii="Georgia" w:cs="Georgia" w:eastAsia="Georgia" w:hAnsi="Georgia"/>
+          <w:b/>
+          <w:bCs/>
+          <w:sz w:val="32"/>
+          <w:szCs w:val="32"/>
+        </w:rPr>
+        <w:t xml:space="preserve">O papel que me deixa ir</w:t>
+      </w:r>
+    </w:p>
+    <w:p>
+      <w:pPr>
+        <w:spacing w:after="0" w:line="312"/>
+        <w:ind w:firstLine="340"/>
+        <w:jc w:val="both"/>
+      </w:pPr>
+      <w:r>
+        <w:rPr>
+          <w:rFonts w:ascii="Georgia" w:cs="Georgia" w:eastAsia="Georgia" w:hAnsi="Georgia"/>
+          <w:sz w:val="21"/>
+          <w:szCs w:val="21"/>
+        </w:rPr>
+        <w:t xml:space="preserve">O envelope pardo ficou dois dias fechado sobre a mesa da sala de Lia, ao lado do vaso de lírios que ela tinha esquecido de regar.</w:t>
+      </w:r>
+    </w:p>
+    <w:p>
+      <w:pPr>
+        <w:spacing w:after="0" w:line="312"/>
+        <w:ind w:firstLine="340"/>
+        <w:jc w:val="both"/>
+      </w:pPr>
+      <w:r>
+        <w:rPr>
+          <w:rFonts w:ascii="Georgia" w:cs="Georgia" w:eastAsia="Georgia" w:hAnsi="Georgia"/>
+          <w:sz w:val="21"/>
+          <w:szCs w:val="21"/>
+        </w:rPr>
+        <w:t xml:space="preserve">Ela sabia o que havia dentro. O celular do pai, embrulhado no lenço, como toda sexta. Mas o porteiro, ao entregar, tinha dito que o irmão deixara um papel junto, e que parecia importante, porque ele tinha ficado parado na calçada um tempão olhando para a janela antes de ir embora. Lia não teve coragem de abrir. Depois da madrugada do Protocolo 71, tinha medo de qualquer papel novo.</w:t>
+      </w:r>
+    </w:p>
+    <w:p>
+      <w:pPr>
+        <w:spacing w:after="0" w:line="312"/>
+        <w:ind w:firstLine="340"/>
+        <w:jc w:val="both"/>
+      </w:pPr>
+      <w:r>
+        <w:rPr>
+          <w:rFonts w:ascii="Georgia" w:cs="Georgia" w:eastAsia="Georgia" w:hAnsi="Georgia"/>
+          <w:sz w:val="21"/>
+          <w:szCs w:val="21"/>
+        </w:rPr>
+        <w:t xml:space="preserve">No domingo à noite, abriu.</w:t>
+      </w:r>
+    </w:p>
+    <w:p>
+      <w:pPr>
+        <w:spacing w:after="0" w:line="312"/>
+        <w:ind w:firstLine="340"/>
+        <w:jc w:val="both"/>
+      </w:pPr>
+      <w:r>
+        <w:rPr>
+          <w:rFonts w:ascii="Georgia" w:cs="Georgia" w:eastAsia="Georgia" w:hAnsi="Georgia"/>
+          <w:sz w:val="21"/>
+          <w:szCs w:val="21"/>
+        </w:rPr>
+        <w:t xml:space="preserve">O BlackBerry estava lá. E, dobrada em quatro, uma folha de cartório: a cópia da declaração de óbito do pai. Causa, hora, local. Dois nomes de médicos. No alto da folha, impresso em vermelho, um número comprido: 10-03847215. No verso, a letra de Lucas, inclinada como a do pai.</w:t>
+      </w:r>
+    </w:p>
+    <w:p>
+      <w:pPr>
+        <w:spacing w:after="0" w:line="312"/>
+        <w:ind w:firstLine="340"/>
+        <w:jc w:val="both"/>
+      </w:pPr>
+      <w:r>
+        <w:rPr>
+          <w:rFonts w:ascii="Georgia" w:cs="Georgia" w:eastAsia="Georgia" w:hAnsi="Georgia"/>
+          <w:sz w:val="21"/>
+          <w:szCs w:val="21"/>
+        </w:rPr>
+        <w:t xml:space="preserve">A segunda assinatura. Ele nunca viu o pai. Precisamos conversar sem listas. L.</w:t>
+      </w:r>
+    </w:p>
+    <w:p>
+      <w:pPr>
+        <w:spacing w:after="0" w:line="312"/>
+        <w:ind w:firstLine="340"/>
+        <w:jc w:val="both"/>
+      </w:pPr>
+      <w:r>
+        <w:rPr>
+          <w:rFonts w:ascii="Georgia" w:cs="Georgia" w:eastAsia="Georgia" w:hAnsi="Georgia"/>
+          <w:sz w:val="21"/>
+          <w:szCs w:val="21"/>
+        </w:rPr>
+        <w:t xml:space="preserve">Lia leu o bilhete com o polegar sobre o L, como se pudesse sentir a pressão da caneta.</w:t>
+      </w:r>
+    </w:p>
+    <w:p>
+      <w:pPr>
+        <w:spacing w:after="0" w:line="312"/>
+        <w:ind w:firstLine="340"/>
+        <w:jc w:val="both"/>
+      </w:pPr>
+      <w:r>
+        <w:rPr>
+          <w:rFonts w:ascii="Georgia" w:cs="Georgia" w:eastAsia="Georgia" w:hAnsi="Georgia"/>
+          <w:sz w:val="21"/>
+          <w:szCs w:val="21"/>
+        </w:rPr>
+        <w:t xml:space="preserve">O irmão tinha chegado ao mesmo lugar que ela, por outro caminho. Ou estava muito perto. E, pela primeira vez em semanas, tinha contado antes de ter certeza.</w:t>
+      </w:r>
+    </w:p>
+    <w:p>
+      <w:pPr>
+        <w:spacing w:after="0" w:line="312"/>
+        <w:ind w:firstLine="340"/>
+        <w:jc w:val="both"/>
+      </w:pPr>
+      <w:r>
+        <w:rPr>
+          <w:rFonts w:ascii="Georgia" w:cs="Georgia" w:eastAsia="Georgia" w:hAnsi="Georgia"/>
+          <w:sz w:val="21"/>
+          <w:szCs w:val="21"/>
+        </w:rPr>
+        <w:t xml:space="preserve">Ela pegou o celular dela para responder. Escreveu sim. Apagou. Escreveu amanhã. Apagou também.</w:t>
+      </w:r>
+    </w:p>
+    <w:p>
+      <w:pPr>
+        <w:spacing w:after="0" w:line="312"/>
+        <w:ind w:firstLine="340"/>
+        <w:jc w:val="both"/>
+      </w:pPr>
+      <w:r>
+        <w:rPr>
+          <w:rFonts w:ascii="Georgia" w:cs="Georgia" w:eastAsia="Georgia" w:hAnsi="Georgia"/>
+          <w:sz w:val="21"/>
+          <w:szCs w:val="21"/>
+        </w:rPr>
+        <w:t xml:space="preserve">Antes, precisava saber de tudo.</w:t>
+      </w:r>
+    </w:p>
+    <w:p>
+      <w:pPr>
+        <w:spacing w:after="200" w:before="200"/>
+        <w:jc w:val="center"/>
+      </w:pPr>
+      <w:r>
+        <w:rPr>
+          <w:rFonts w:ascii="Georgia" w:cs="Georgia" w:eastAsia="Georgia" w:hAnsi="Georgia"/>
+          <w:sz w:val="22"/>
+          <w:szCs w:val="22"/>
+        </w:rPr>
+        <w:t xml:space="preserve">*</w:t>
+      </w:r>
+    </w:p>
+    <w:p>
+      <w:pPr>
+        <w:spacing w:after="0" w:line="312"/>
+        <w:ind w:firstLine="340"/>
+        <w:jc w:val="both"/>
+      </w:pPr>
+      <w:r>
+        <w:rPr>
+          <w:rFonts w:ascii="Georgia" w:cs="Georgia" w:eastAsia="Georgia" w:hAnsi="Georgia"/>
+          <w:sz w:val="21"/>
+          <w:szCs w:val="21"/>
+        </w:rPr>
+        <w:t xml:space="preserve">Desde que Lucas abrira a pasta protegida com a data do incêndio, Lia achava que o celular do pai já não guardava segredos. Tinha lido as mensagens, a agenda, o e-mail, a galeria. Tinha aberto cada porta com um número.</w:t>
+      </w:r>
+    </w:p>
+    <w:p>
+      <w:pPr>
+        <w:spacing w:after="0" w:line="312"/>
+        <w:ind w:firstLine="340"/>
+        <w:jc w:val="both"/>
+      </w:pPr>
+      <w:r>
+        <w:rPr>
+          <w:rFonts w:ascii="Georgia" w:cs="Georgia" w:eastAsia="Georgia" w:hAnsi="Georgia"/>
+          <w:sz w:val="21"/>
+          <w:szCs w:val="21"/>
+        </w:rPr>
+        <w:t xml:space="preserve">Mas, na madrugada do Protocolo 71, procurando a conversa da véspera, tinha visto uma coisa em que não reparara antes. No fim do menu de aplicativos, depois da calculadora e do relógio, havia um segundo cadeado. Um ícone cinza, sem nome, igual ao do aplicativo de privacidade que escondia a conversa da família de Raul, só que mais apagado, como se alguém tivesse escolhido a cor mais discreta da lista.</w:t>
+      </w:r>
+    </w:p>
+    <w:p>
+      <w:pPr>
+        <w:spacing w:after="0" w:line="312"/>
+        <w:ind w:firstLine="340"/>
+        <w:jc w:val="both"/>
+      </w:pPr>
+      <w:r>
+        <w:rPr>
+          <w:rFonts w:ascii="Georgia" w:cs="Georgia" w:eastAsia="Georgia" w:hAnsi="Georgia"/>
+          <w:sz w:val="21"/>
+          <w:szCs w:val="21"/>
+        </w:rPr>
+        <w:t xml:space="preserve">Ela tocou nele. O aparelho pediu uma senha. Embaixo do campo, uma dica digitada pelo pai:</w:t>
+      </w:r>
+    </w:p>
+    <w:p>
+      <w:pPr>
+        <w:spacing w:after="0" w:line="312"/>
+        <w:ind w:firstLine="340"/>
+        <w:jc w:val="both"/>
+      </w:pPr>
+      <w:r>
+        <w:rPr>
+          <w:rFonts w:ascii="Georgia" w:cs="Georgia" w:eastAsia="Georgia" w:hAnsi="Georgia"/>
+          <w:sz w:val="21"/>
+          <w:szCs w:val="21"/>
+        </w:rPr>
+        <w:t xml:space="preserve">O papel que me deixa ir.</w:t>
+      </w:r>
+    </w:p>
+    <w:p>
+      <w:pPr>
+        <w:spacing w:after="0" w:line="312"/>
+        <w:ind w:firstLine="340"/>
+        <w:jc w:val="both"/>
+      </w:pPr>
+      <w:r>
+        <w:rPr>
+          <w:rFonts w:ascii="Georgia" w:cs="Georgia" w:eastAsia="Georgia" w:hAnsi="Georgia"/>
+          <w:sz w:val="21"/>
+          <w:szCs w:val="21"/>
+        </w:rPr>
+        <w:t xml:space="preserve">Na madrugada, tinha achado aquilo uma frase sem sentido. Um passaporte? Uma passagem? Tentou as duas coisas de todos os jeitos possíveis. O aparelho avisou que restavam duas tentativas e ela desistiu.</w:t>
+      </w:r>
+    </w:p>
+    <w:p>
+      <w:pPr>
+        <w:spacing w:after="0" w:line="312"/>
+        <w:ind w:firstLine="340"/>
+        <w:jc w:val="both"/>
+      </w:pPr>
+      <w:r>
+        <w:rPr>
+          <w:rFonts w:ascii="Georgia" w:cs="Georgia" w:eastAsia="Georgia" w:hAnsi="Georgia"/>
+          <w:sz w:val="21"/>
+          <w:szCs w:val="21"/>
+        </w:rPr>
+        <w:t xml:space="preserve">Agora olhava para a folha de cartório aberta sobre a mesa.</w:t>
+      </w:r>
+    </w:p>
+    <w:p>
+      <w:pPr>
+        <w:spacing w:after="0" w:line="312"/>
+        <w:ind w:firstLine="340"/>
+        <w:jc w:val="both"/>
+      </w:pPr>
+      <w:r>
+        <w:rPr>
+          <w:rFonts w:ascii="Georgia" w:cs="Georgia" w:eastAsia="Georgia" w:hAnsi="Georgia"/>
+          <w:sz w:val="21"/>
+          <w:szCs w:val="21"/>
+        </w:rPr>
+        <w:t xml:space="preserve">O papel que me deixa ir.</w:t>
+      </w:r>
+    </w:p>
+    <w:p>
+      <w:pPr>
+        <w:spacing w:after="0" w:line="312"/>
+        <w:ind w:firstLine="340"/>
+        <w:jc w:val="both"/>
+      </w:pPr>
+      <w:r>
+        <w:rPr>
+          <w:rFonts w:ascii="Georgia" w:cs="Georgia" w:eastAsia="Georgia" w:hAnsi="Georgia"/>
+          <w:sz w:val="21"/>
+          <w:szCs w:val="21"/>
+        </w:rPr>
+        <w:t xml:space="preserve">Não era o passaporte. Não era a passagem. Para um homem que queria sumir sem que ninguém fosse procurá-lo, o papel que deixava ir embora era o que dizia ao mundo que ele já tinha ido.</w:t>
+      </w:r>
+    </w:p>
+    <w:p>
+      <w:pPr>
+        <w:spacing w:after="0" w:line="312"/>
+        <w:ind w:firstLine="340"/>
+        <w:jc w:val="both"/>
+      </w:pPr>
+      <w:r>
+        <w:rPr>
+          <w:rFonts w:ascii="Georgia" w:cs="Georgia" w:eastAsia="Georgia" w:hAnsi="Georgia"/>
+          <w:sz w:val="21"/>
+          <w:szCs w:val="21"/>
+        </w:rPr>
+        <w:t xml:space="preserve">Lia digitou os quatro últimos números da declaração de óbito.</w:t>
+      </w:r>
+    </w:p>
+    <w:p>
+      <w:pPr>
+        <w:spacing w:after="0" w:line="312"/>
+        <w:ind w:firstLine="340"/>
+        <w:jc w:val="both"/>
+      </w:pPr>
+      <w:r>
+        <w:rPr>
+          <w:rFonts w:ascii="Georgia" w:cs="Georgia" w:eastAsia="Georgia" w:hAnsi="Georgia"/>
+          <w:sz w:val="21"/>
+          <w:szCs w:val="21"/>
+        </w:rPr>
+        <w:t xml:space="preserve">Sete, dois, um, cinco.</w:t>
+      </w:r>
+    </w:p>
+    <w:p>
+      <w:pPr>
+        <w:pBdr>
+          <w:top w:val="single" w:color="555555" w:sz="6" w:space="6"/>
+          <w:bottom w:val="single" w:color="555555" w:sz="6" w:space="6"/>
+          <w:left w:val="single" w:color="555555" w:sz="6" w:space="6"/>
+          <w:right w:val="single" w:color="555555" w:sz="6" w:space="6"/>
+        </w:pBdr>
+        <w:shd w:fill="EFEFEF" w:color="auto" w:val="clear"/>
+        <w:spacing w:after="0" w:before="240"/>
+        <w:ind w:left="227" w:right="227"/>
+        <w:jc w:val="center"/>
+      </w:pPr>
+      <w:r>
+        <w:rPr>
+          <w:rFonts w:ascii="Georgia" w:cs="Georgia" w:eastAsia="Georgia" w:hAnsi="Georgia"/>
+          <w:b/>
+          <w:bCs/>
+          <w:spacing w:val="30"/>
+          <w:sz w:val="17"/>
+          <w:szCs w:val="17"/>
+        </w:rPr>
+        <w:t xml:space="preserve">NO CELULAR DE HENRIQUE</w:t>
+      </w:r>
+    </w:p>
+    <w:p>
+      <w:pPr>
+        <w:pBdr>
+          <w:top w:val="single" w:color="555555" w:sz="6" w:space="6"/>
+          <w:bottom w:val="single" w:color="555555" w:sz="6" w:space="6"/>
+          <w:left w:val="single" w:color="555555" w:sz="6" w:space="6"/>
+          <w:right w:val="single" w:color="555555" w:sz="6" w:space="6"/>
+        </w:pBdr>
+        <w:shd w:fill="EFEFEF" w:color="auto" w:val="clear"/>
+        <w:spacing w:after="240" w:before="0" w:line="288"/>
+        <w:ind w:left="227" w:right="227"/>
+        <w:jc w:val="center"/>
+      </w:pPr>
+      <w:r>
+        <w:rPr>
+          <w:rFonts w:ascii="Georgia" w:cs="Georgia" w:eastAsia="Georgia" w:hAnsi="Georgia"/>
+          <w:i/>
+          <w:iCs/>
+          <w:sz w:val="19"/>
+          <w:szCs w:val="19"/>
+        </w:rPr>
+        <w:t xml:space="preserve">Abra o segundo cadeado do celular de Henrique. A senha está no papel que o deixava ir: digite os quatro últimos números da declaração de óbito, somados ao seu código pessoal. Leia a conversa inteira, do começo.</w:t>
+      </w:r>
+    </w:p>
+    <w:p>
+      <w:pPr>
+        <w:spacing w:after="0" w:line="312"/>
+        <w:ind w:firstLine="340"/>
+        <w:jc w:val="both"/>
+      </w:pPr>
+      <w:r>
+        <w:rPr>
+          <w:rFonts w:ascii="Georgia" w:cs="Georgia" w:eastAsia="Georgia" w:hAnsi="Georgia"/>
+          <w:sz w:val="21"/>
+          <w:szCs w:val="21"/>
+        </w:rPr>
+        <w:t xml:space="preserve">O cadeado se abriu.</w:t>
+      </w:r>
+    </w:p>
+    <w:p>
+      <w:pPr>
+        <w:spacing w:after="0" w:line="312"/>
+        <w:ind w:firstLine="340"/>
+        <w:jc w:val="both"/>
+      </w:pPr>
+      <w:r>
+        <w:rPr>
+          <w:rFonts w:ascii="Georgia" w:cs="Georgia" w:eastAsia="Georgia" w:hAnsi="Georgia"/>
+          <w:sz w:val="21"/>
+          <w:szCs w:val="21"/>
+        </w:rPr>
+        <w:t xml:space="preserve">Lia demorou a tocar na tela. Só então percebeu o que aquilo significava. O pai tinha escolhido como senha o número de um documento que só ia existir depois da morte dele. Ninguém sabe esse número antes. A não ser quem viu o formulário em branco, já numerado, na mão do médico que ia preenchê-lo.</w:t>
+      </w:r>
+    </w:p>
+    <w:p>
+      <w:pPr>
+        <w:spacing w:after="200" w:before="200"/>
+        <w:jc w:val="center"/>
+      </w:pPr>
+      <w:r>
+        <w:rPr>
+          <w:rFonts w:ascii="Georgia" w:cs="Georgia" w:eastAsia="Georgia" w:hAnsi="Georgia"/>
+          <w:sz w:val="22"/>
+          <w:szCs w:val="22"/>
+        </w:rPr>
+        <w:t xml:space="preserve">*</w:t>
+      </w:r>
+    </w:p>
+    <w:p>
+      <w:pPr>
+        <w:spacing w:after="0" w:line="312"/>
+        <w:ind w:firstLine="340"/>
+        <w:jc w:val="both"/>
+      </w:pPr>
+      <w:r>
+        <w:rPr>
+          <w:rFonts w:ascii="Georgia" w:cs="Georgia" w:eastAsia="Georgia" w:hAnsi="Georgia"/>
+          <w:sz w:val="21"/>
+          <w:szCs w:val="21"/>
+        </w:rPr>
+        <w:t xml:space="preserve">Havia um único contato. O nome era uma letra só. A.</w:t>
+      </w:r>
+    </w:p>
+    <w:p>
+      <w:pPr>
+        <w:spacing w:after="0" w:line="312"/>
+        <w:ind w:firstLine="340"/>
+        <w:jc w:val="both"/>
+      </w:pPr>
+      <w:r>
+        <w:rPr>
+          <w:rFonts w:ascii="Georgia" w:cs="Georgia" w:eastAsia="Georgia" w:hAnsi="Georgia"/>
+          <w:sz w:val="21"/>
+          <w:szCs w:val="21"/>
+        </w:rPr>
+        <w:t xml:space="preserve">Lia sentiu as mãos esfriarem antes de ler a primeira linha. Não precisava que ninguém dissesse quem era A. Documentos: outubro. Confirmar com A. O homem que tinha ligado para o pai às sete e quarenta de dentro da mesma casa.</w:t>
+      </w:r>
+    </w:p>
+    <w:p>
+      <w:pPr>
+        <w:spacing w:after="0" w:line="312"/>
+        <w:ind w:firstLine="340"/>
+        <w:jc w:val="both"/>
+      </w:pPr>
+      <w:r>
+        <w:rPr>
+          <w:rFonts w:ascii="Georgia" w:cs="Georgia" w:eastAsia="Georgia" w:hAnsi="Georgia"/>
+          <w:sz w:val="21"/>
+          <w:szCs w:val="21"/>
+        </w:rPr>
+        <w:t xml:space="preserve">A conversa começava numa madrugada de setembro. A madrugada depois da estrada de Cajamar, do carro na ribanceira, de Nestor.</w:t>
+      </w:r>
+    </w:p>
+    <w:p>
+      <w:pPr>
+        <w:spacing w:after="0" w:line="312"/>
+        <w:ind w:firstLine="340"/>
+        <w:jc w:val="both"/>
+      </w:pPr>
+      <w:r>
+        <w:rPr>
+          <w:rFonts w:ascii="Georgia" w:cs="Georgia" w:eastAsia="Georgia" w:hAnsi="Georgia"/>
+          <w:sz w:val="21"/>
+          <w:szCs w:val="21"/>
+        </w:rPr>
+        <w:t xml:space="preserve">Obrigado por ontem. Pensei no que você disse. Sim.</w:t>
+      </w:r>
+    </w:p>
+    <w:p>
+      <w:pPr>
+        <w:spacing w:after="0" w:line="312"/>
+        <w:ind w:firstLine="340"/>
+        <w:jc w:val="both"/>
+      </w:pPr>
+      <w:r>
+        <w:rPr>
+          <w:rFonts w:ascii="Georgia" w:cs="Georgia" w:eastAsia="Georgia" w:hAnsi="Georgia"/>
+          <w:sz w:val="21"/>
+          <w:szCs w:val="21"/>
+        </w:rPr>
+        <w:t xml:space="preserve">A resposta tinha vindo de manhã cedo.</w:t>
+      </w:r>
+    </w:p>
+    <w:p>
+      <w:pPr>
+        <w:spacing w:after="0" w:line="312"/>
+        <w:ind w:firstLine="340"/>
+        <w:jc w:val="both"/>
+      </w:pPr>
+      <w:r>
+        <w:rPr>
+          <w:rFonts w:ascii="Georgia" w:cs="Georgia" w:eastAsia="Georgia" w:hAnsi="Georgia"/>
+          <w:sz w:val="21"/>
+          <w:szCs w:val="21"/>
+        </w:rPr>
+        <w:t xml:space="preserve">Não é decisão para tomar de luto, Henrique. Dorme. Fala comigo daqui a uma semana.</w:t>
+      </w:r>
+    </w:p>
+    <w:p>
+      <w:pPr>
+        <w:spacing w:after="0" w:line="312"/>
+        <w:ind w:firstLine="340"/>
+        <w:jc w:val="both"/>
+      </w:pPr>
+      <w:r>
+        <w:rPr>
+          <w:rFonts w:ascii="Georgia" w:cs="Georgia" w:eastAsia="Georgia" w:hAnsi="Georgia"/>
+          <w:sz w:val="21"/>
+          <w:szCs w:val="21"/>
+        </w:rPr>
+        <w:t xml:space="preserve">Não é luto. É conta. Cinco pessoas, Álvaro. A próxima pode ser o Lucas, ou a Lia, num carro que eu mandei buscar uma pasta.</w:t>
+      </w:r>
+    </w:p>
+    <w:p>
+      <w:pPr>
+        <w:spacing w:after="0" w:line="312"/>
+        <w:ind w:firstLine="340"/>
+        <w:jc w:val="both"/>
+      </w:pPr>
+      <w:r>
+        <w:rPr>
+          <w:rFonts w:ascii="Georgia" w:cs="Georgia" w:eastAsia="Georgia" w:hAnsi="Georgia"/>
+          <w:sz w:val="21"/>
+          <w:szCs w:val="21"/>
+        </w:rPr>
+        <w:t xml:space="preserve">Lia parou. Releu o próprio nome na letra do pai. Depois continuou.</w:t>
+      </w:r>
+    </w:p>
+    <w:p>
+      <w:pPr>
+        <w:spacing w:after="200" w:before="200"/>
+        <w:jc w:val="center"/>
+      </w:pPr>
+      <w:r>
+        <w:rPr>
+          <w:rFonts w:ascii="Georgia" w:cs="Georgia" w:eastAsia="Georgia" w:hAnsi="Georgia"/>
+          <w:sz w:val="22"/>
+          <w:szCs w:val="22"/>
+        </w:rPr>
+        <w:t xml:space="preserve">*</w:t>
+      </w:r>
+    </w:p>
+    <w:p>
+      <w:pPr>
+        <w:spacing w:after="0" w:line="312"/>
+        <w:ind w:firstLine="340"/>
+        <w:jc w:val="both"/>
+      </w:pPr>
+      <w:r>
+        <w:rPr>
+          <w:rFonts w:ascii="Georgia" w:cs="Georgia" w:eastAsia="Georgia" w:hAnsi="Georgia"/>
+          <w:sz w:val="21"/>
+          <w:szCs w:val="21"/>
+        </w:rPr>
+        <w:t xml:space="preserve">Durante as semanas seguintes, a conversa mudava de tom a cada dia. Às vezes eram dois homens velhos discutindo como discutem os amigos de praia, com piadas, com palavrão, com saudade. Às vezes eram um médico e um paciente. Às vezes, Lia teve a sensação de ler o roteiro de uma peça que alguém tinha escrito para não ser encenada.</w:t>
+      </w:r>
+    </w:p>
+    <w:p>
+      <w:pPr>
+        <w:spacing w:after="0" w:line="312"/>
+        <w:ind w:firstLine="340"/>
+        <w:jc w:val="both"/>
+      </w:pPr>
+      <w:r>
+        <w:rPr>
+          <w:rFonts w:ascii="Georgia" w:cs="Georgia" w:eastAsia="Georgia" w:hAnsi="Georgia"/>
+          <w:sz w:val="21"/>
+          <w:szCs w:val="21"/>
+        </w:rPr>
+        <w:t xml:space="preserve">O 71 funciona em rato. Em homem, nunca ninguém fez. Eu não posso te garantir nada.</w:t>
+      </w:r>
+    </w:p>
+    <w:p>
+      <w:pPr>
+        <w:spacing w:after="0" w:line="312"/>
+        <w:ind w:firstLine="340"/>
+        <w:jc w:val="both"/>
+      </w:pPr>
+      <w:r>
+        <w:rPr>
+          <w:rFonts w:ascii="Georgia" w:cs="Georgia" w:eastAsia="Georgia" w:hAnsi="Georgia"/>
+          <w:sz w:val="21"/>
+          <w:szCs w:val="21"/>
+        </w:rPr>
+        <w:t xml:space="preserve">Você nunca me garantiu nada na vida e sempre acertou.</w:t>
+      </w:r>
+    </w:p>
+    <w:p>
+      <w:pPr>
+        <w:spacing w:after="0" w:line="312"/>
+        <w:ind w:firstLine="340"/>
+        <w:jc w:val="both"/>
+      </w:pPr>
+      <w:r>
+        <w:rPr>
+          <w:rFonts w:ascii="Georgia" w:cs="Georgia" w:eastAsia="Georgia" w:hAnsi="Georgia"/>
+          <w:sz w:val="21"/>
+          <w:szCs w:val="21"/>
+        </w:rPr>
+        <w:t xml:space="preserve">Estou falando sério. Entre a dose e o antídoto, você tem pouco mais de um dia. Depois disso, eu não te trago de volta. Ninguém traz.</w:t>
+      </w:r>
+    </w:p>
+    <w:p>
+      <w:pPr>
+        <w:spacing w:after="0" w:line="312"/>
+        <w:ind w:firstLine="340"/>
+        <w:jc w:val="both"/>
+      </w:pPr>
+      <w:r>
+        <w:rPr>
+          <w:rFonts w:ascii="Georgia" w:cs="Georgia" w:eastAsia="Georgia" w:hAnsi="Georgia"/>
+          <w:sz w:val="21"/>
+          <w:szCs w:val="21"/>
+        </w:rPr>
+        <w:t xml:space="preserve">Então não passa de um dia.</w:t>
+      </w:r>
+    </w:p>
+    <w:p>
+      <w:pPr>
+        <w:spacing w:after="0" w:line="312"/>
+        <w:ind w:firstLine="340"/>
+        <w:jc w:val="both"/>
+      </w:pPr>
+      <w:r>
+        <w:rPr>
+          <w:rFonts w:ascii="Georgia" w:cs="Georgia" w:eastAsia="Georgia" w:hAnsi="Georgia"/>
+          <w:sz w:val="21"/>
+          <w:szCs w:val="21"/>
+        </w:rPr>
+        <w:t xml:space="preserve">Depois, os detalhes. Escritos com a frieza de quem monta um contrato, cláusula por cláusula, e Lia reconheceu o pai em cada uma delas.</w:t>
+      </w:r>
+    </w:p>
+    <w:p>
+      <w:pPr>
+        <w:spacing w:after="0" w:line="312"/>
+        <w:ind w:firstLine="340"/>
+        <w:jc w:val="both"/>
+      </w:pPr>
+      <w:r>
+        <w:rPr>
+          <w:rFonts w:ascii="Georgia" w:cs="Georgia" w:eastAsia="Georgia" w:hAnsi="Georgia"/>
+          <w:sz w:val="21"/>
+          <w:szCs w:val="21"/>
+        </w:rPr>
+        <w:t xml:space="preserve">Dose às sete, em casa. Você chega às sete e cinco, pela porta da frente. Ninguém mais em casa: a Cida de folga, a Helena em Americana com a mãe, como toda segunda.</w:t>
+      </w:r>
+    </w:p>
+    <w:p>
+      <w:pPr>
+        <w:spacing w:after="0" w:line="312"/>
+        <w:ind w:firstLine="340"/>
+        <w:jc w:val="both"/>
+      </w:pPr>
+      <w:r>
+        <w:rPr>
+          <w:rFonts w:ascii="Georgia" w:cs="Georgia" w:eastAsia="Georgia" w:hAnsi="Georgia"/>
+          <w:sz w:val="21"/>
+          <w:szCs w:val="21"/>
+        </w:rPr>
+        <w:t xml:space="preserve">O atestado é meu. A segunda assinatura eu consigo com o Paulo.</w:t>
+      </w:r>
+    </w:p>
+    <w:p>
+      <w:pPr>
+        <w:spacing w:after="0" w:line="312"/>
+        <w:ind w:firstLine="340"/>
+        <w:jc w:val="both"/>
+      </w:pPr>
+      <w:r>
+        <w:rPr>
+          <w:rFonts w:ascii="Georgia" w:cs="Georgia" w:eastAsia="Georgia" w:hAnsi="Georgia"/>
+          <w:sz w:val="21"/>
+          <w:szCs w:val="21"/>
+        </w:rPr>
+        <w:t xml:space="preserve">Nada de formol. Nada de geladeira. Nada de calor. Você fica do lado o tempo todo.</w:t>
+      </w:r>
+    </w:p>
+    <w:p>
+      <w:pPr>
+        <w:spacing w:after="0" w:line="312"/>
+        <w:ind w:firstLine="340"/>
+        <w:jc w:val="both"/>
+      </w:pPr>
+      <w:r>
+        <w:rPr>
+          <w:rFonts w:ascii="Georgia" w:cs="Georgia" w:eastAsia="Georgia" w:hAnsi="Georgia"/>
+          <w:sz w:val="21"/>
+          <w:szCs w:val="21"/>
+        </w:rPr>
+        <w:t xml:space="preserve">Enterro numa gaveta, não na terra. Térrea, perto de um portão. A tampa só é cimentada no dia seguinte. Na madrugada de quarta, você abre, aplica o antídoto e me tira de lá. Às seis, eu estou no apartamento de Moema, esperando a sexta.</w:t>
+      </w:r>
+    </w:p>
+    <w:p>
+      <w:pPr>
+        <w:spacing w:after="0" w:line="312"/>
+        <w:ind w:firstLine="340"/>
+        <w:jc w:val="both"/>
+      </w:pPr>
+      <w:r>
+        <w:rPr>
+          <w:rFonts w:ascii="Georgia" w:cs="Georgia" w:eastAsia="Georgia" w:hAnsi="Georgia"/>
+          <w:sz w:val="21"/>
+          <w:szCs w:val="21"/>
+        </w:rPr>
+        <w:t xml:space="preserve">Na sexta, Zurique. Os documentos novos ficam prontos no começo de outubro. O passaporte com o outro nome, eu pego em mãos.</w:t>
+      </w:r>
+    </w:p>
+    <w:p>
+      <w:pPr>
+        <w:spacing w:after="0" w:line="312"/>
+        <w:ind w:firstLine="340"/>
+        <w:jc w:val="both"/>
+      </w:pPr>
+      <w:r>
+        <w:rPr>
+          <w:rFonts w:ascii="Georgia" w:cs="Georgia" w:eastAsia="Georgia" w:hAnsi="Georgia"/>
+          <w:sz w:val="21"/>
+          <w:szCs w:val="21"/>
+        </w:rPr>
+        <w:t xml:space="preserve">Lia leu aquela parte três vezes. Na terceira, percebeu que estava segurando a respiração.</w:t>
+      </w:r>
+    </w:p>
+    <w:p>
+      <w:pPr>
+        <w:spacing w:after="0" w:line="312"/>
+        <w:ind w:firstLine="340"/>
+        <w:jc w:val="both"/>
+      </w:pPr>
+      <w:r>
+        <w:rPr>
+          <w:rFonts w:ascii="Georgia" w:cs="Georgia" w:eastAsia="Georgia" w:hAnsi="Georgia"/>
+          <w:sz w:val="21"/>
+          <w:szCs w:val="21"/>
+        </w:rPr>
+        <w:t xml:space="preserve">O pai não tinha morrido. O pai tinha marcado a própria morte na agenda, em vermelho, como uma consulta.</w:t>
+      </w:r>
+    </w:p>
+    <w:p>
+      <w:pPr>
+        <w:spacing w:after="200" w:before="200"/>
+        <w:jc w:val="center"/>
+      </w:pPr>
+      <w:r>
+        <w:rPr>
+          <w:rFonts w:ascii="Georgia" w:cs="Georgia" w:eastAsia="Georgia" w:hAnsi="Georgia"/>
+          <w:sz w:val="22"/>
+          <w:szCs w:val="22"/>
+        </w:rPr>
+        <w:t xml:space="preserve">*</w:t>
+      </w:r>
+    </w:p>
+    <w:p>
+      <w:pPr>
+        <w:spacing w:after="0" w:line="312"/>
+        <w:ind w:firstLine="340"/>
+        <w:jc w:val="both"/>
+      </w:pPr>
+      <w:r>
+        <w:rPr>
+          <w:rFonts w:ascii="Georgia" w:cs="Georgia" w:eastAsia="Georgia" w:hAnsi="Georgia"/>
+          <w:sz w:val="21"/>
+          <w:szCs w:val="21"/>
+        </w:rPr>
+        <w:t xml:space="preserve">Numa noite de setembro, a conversa tinha parado num ponto que Lia não conseguiu atravessar de primeira.</w:t>
+      </w:r>
+    </w:p>
+    <w:p>
+      <w:pPr>
+        <w:spacing w:after="0" w:line="312"/>
+        <w:ind w:firstLine="340"/>
+        <w:jc w:val="both"/>
+      </w:pPr>
+      <w:r>
+        <w:rPr>
+          <w:rFonts w:ascii="Georgia" w:cs="Georgia" w:eastAsia="Georgia" w:hAnsi="Georgia"/>
+          <w:sz w:val="21"/>
+          <w:szCs w:val="21"/>
+        </w:rPr>
+        <w:t xml:space="preserve">E se a Helena quiser cremar?</w:t>
+      </w:r>
+    </w:p>
+    <w:p>
+      <w:pPr>
+        <w:spacing w:after="0" w:line="312"/>
+        <w:ind w:firstLine="340"/>
+        <w:jc w:val="both"/>
+      </w:pPr>
+      <w:r>
+        <w:rPr>
+          <w:rFonts w:ascii="Georgia" w:cs="Georgia" w:eastAsia="Georgia" w:hAnsi="Georgia"/>
+          <w:sz w:val="21"/>
+          <w:szCs w:val="21"/>
+        </w:rPr>
+        <w:t xml:space="preserve">Não vai. O pai dela foi enterrado. Ela me disse no Rodolfo, lembra? Eu quero ficar onde ele ficou, debaixo da terra. Ela odeia cremação.</w:t>
+      </w:r>
+    </w:p>
+    <w:p>
+      <w:pPr>
+        <w:spacing w:after="0" w:line="312"/>
+        <w:ind w:firstLine="340"/>
+        <w:jc w:val="both"/>
+      </w:pPr>
+      <w:r>
+        <w:rPr>
+          <w:rFonts w:ascii="Georgia" w:cs="Georgia" w:eastAsia="Georgia" w:hAnsi="Georgia"/>
+          <w:sz w:val="21"/>
+          <w:szCs w:val="21"/>
+        </w:rPr>
+        <w:t xml:space="preserve">Você deixou a decisão com ela. Na frente de todo mundo.</w:t>
+      </w:r>
+    </w:p>
+    <w:p>
+      <w:pPr>
+        <w:spacing w:after="0" w:line="312"/>
+        <w:ind w:firstLine="340"/>
+        <w:jc w:val="both"/>
+      </w:pPr>
+      <w:r>
+        <w:rPr>
+          <w:rFonts w:ascii="Georgia" w:cs="Georgia" w:eastAsia="Georgia" w:hAnsi="Georgia"/>
+          <w:sz w:val="21"/>
+          <w:szCs w:val="21"/>
+        </w:rPr>
+        <w:t xml:space="preserve">Por isso mesmo. Uma viúva que escolhe enterrar ninguém questiona. Se fosse eu que tivesse deixado escrito, iam perguntar por quê.</w:t>
+      </w:r>
+    </w:p>
+    <w:p>
+      <w:pPr>
+        <w:spacing w:after="0" w:line="312"/>
+        <w:ind w:firstLine="340"/>
+        <w:jc w:val="both"/>
+      </w:pPr>
+      <w:r>
+        <w:rPr>
+          <w:rFonts w:ascii="Georgia" w:cs="Georgia" w:eastAsia="Georgia" w:hAnsi="Georgia"/>
+          <w:sz w:val="21"/>
+          <w:szCs w:val="21"/>
+        </w:rPr>
+        <w:t xml:space="preserve">E se ela escolher cremar mesmo assim?</w:t>
+      </w:r>
+    </w:p>
+    <w:p>
+      <w:pPr>
+        <w:spacing w:after="0" w:line="312"/>
+        <w:ind w:firstLine="340"/>
+        <w:jc w:val="both"/>
+      </w:pPr>
+      <w:r>
+        <w:rPr>
+          <w:rFonts w:ascii="Georgia" w:cs="Georgia" w:eastAsia="Georgia" w:hAnsi="Georgia"/>
+          <w:sz w:val="21"/>
+          <w:szCs w:val="21"/>
+        </w:rPr>
+        <w:t xml:space="preserve">Então você não deixa.</w:t>
+      </w:r>
+    </w:p>
+    <w:p>
+      <w:pPr>
+        <w:spacing w:after="0" w:line="312"/>
+        <w:ind w:firstLine="340"/>
+        <w:jc w:val="both"/>
+      </w:pPr>
+      <w:r>
+        <w:rPr>
+          <w:rFonts w:ascii="Georgia" w:cs="Georgia" w:eastAsia="Georgia" w:hAnsi="Georgia"/>
+          <w:sz w:val="21"/>
+          <w:szCs w:val="21"/>
+        </w:rPr>
+        <w:t xml:space="preserve">Eu sou médico, Henrique. Não sou viúvo. Não decido nada.</w:t>
+      </w:r>
+    </w:p>
+    <w:p>
+      <w:pPr>
+        <w:spacing w:after="0" w:line="312"/>
+        <w:ind w:firstLine="340"/>
+        <w:jc w:val="both"/>
+      </w:pPr>
+      <w:r>
+        <w:rPr>
+          <w:rFonts w:ascii="Georgia" w:cs="Georgia" w:eastAsia="Georgia" w:hAnsi="Georgia"/>
+          <w:sz w:val="21"/>
+          <w:szCs w:val="21"/>
+        </w:rPr>
+        <w:t xml:space="preserve">Por isso mesmo também. Ninguém desconfia de quem não decide.</w:t>
+      </w:r>
+    </w:p>
+    <w:p>
+      <w:pPr>
+        <w:spacing w:after="0" w:line="312"/>
+        <w:ind w:firstLine="340"/>
+        <w:jc w:val="both"/>
+      </w:pPr>
+      <w:r>
+        <w:rPr>
+          <w:rFonts w:ascii="Georgia" w:cs="Georgia" w:eastAsia="Georgia" w:hAnsi="Georgia"/>
+          <w:sz w:val="21"/>
+          <w:szCs w:val="21"/>
+        </w:rPr>
+        <w:t xml:space="preserve">Lia fechou os olhos.</w:t>
+      </w:r>
+    </w:p>
+    <w:p>
+      <w:pPr>
+        <w:spacing w:after="0" w:line="312"/>
+        <w:ind w:firstLine="340"/>
+        <w:jc w:val="both"/>
+      </w:pPr>
+      <w:r>
+        <w:rPr>
+          <w:rFonts w:ascii="Georgia" w:cs="Georgia" w:eastAsia="Georgia" w:hAnsi="Georgia"/>
+          <w:sz w:val="21"/>
+          <w:szCs w:val="21"/>
+        </w:rPr>
+        <w:t xml:space="preserve">Lembrou do pai no crematório do tio Rodolfo, dois anos antes, inclinado para Helena, perguntando se ela queria ser cremada. Lembrou da piada que fez a sala inteira se virar. Só não joga as minhas cinzas na privada. O pai tinha deixado a decisão nas mãos da única pessoa da família que, pelo que sabia, nunca escolheria o fogo.</w:t>
+      </w:r>
+    </w:p>
+    <w:p>
+      <w:pPr>
+        <w:spacing w:after="0" w:line="312"/>
+        <w:ind w:firstLine="340"/>
+        <w:jc w:val="both"/>
+      </w:pPr>
+      <w:r>
+        <w:rPr>
+          <w:rFonts w:ascii="Georgia" w:cs="Georgia" w:eastAsia="Georgia" w:hAnsi="Georgia"/>
+          <w:sz w:val="21"/>
+          <w:szCs w:val="21"/>
+        </w:rPr>
+        <w:t xml:space="preserve">Não sabia que, para Helena, o fogo era o único jeito de ter certeza de que ele não ia voltar.</w:t>
+      </w:r>
+    </w:p>
+    <w:p>
+      <w:pPr>
+        <w:spacing w:after="200" w:before="200"/>
+        <w:jc w:val="center"/>
+      </w:pPr>
+      <w:r>
+        <w:rPr>
+          <w:rFonts w:ascii="Georgia" w:cs="Georgia" w:eastAsia="Georgia" w:hAnsi="Georgia"/>
+          <w:sz w:val="22"/>
+          <w:szCs w:val="22"/>
+        </w:rPr>
+        <w:t xml:space="preserve">*</w:t>
+      </w:r>
+    </w:p>
+    <w:p>
+      <w:pPr>
+        <w:spacing w:after="0" w:line="312"/>
+        <w:ind w:firstLine="340"/>
+        <w:jc w:val="both"/>
+      </w:pPr>
+      <w:r>
+        <w:rPr>
+          <w:rFonts w:ascii="Georgia" w:cs="Georgia" w:eastAsia="Georgia" w:hAnsi="Georgia"/>
+          <w:sz w:val="21"/>
+          <w:szCs w:val="21"/>
+        </w:rPr>
+        <w:t xml:space="preserve">A última semana da conversa era curta.</w:t>
+      </w:r>
+    </w:p>
+    <w:p>
+      <w:pPr>
+        <w:spacing w:after="0" w:line="312"/>
+        <w:ind w:firstLine="340"/>
+        <w:jc w:val="both"/>
+      </w:pPr>
+      <w:r>
+        <w:rPr>
+          <w:rFonts w:ascii="Georgia" w:cs="Georgia" w:eastAsia="Georgia" w:hAnsi="Georgia"/>
+          <w:sz w:val="21"/>
+          <w:szCs w:val="21"/>
+        </w:rPr>
+        <w:t xml:space="preserve">Mais nenhuma mensagem de amigo de praia. Só horários.</w:t>
+      </w:r>
+    </w:p>
+    <w:p>
+      <w:pPr>
+        <w:spacing w:after="0" w:line="312"/>
+        <w:ind w:firstLine="340"/>
+        <w:jc w:val="both"/>
+      </w:pPr>
+      <w:r>
+        <w:rPr>
+          <w:rFonts w:ascii="Georgia" w:cs="Georgia" w:eastAsia="Georgia" w:hAnsi="Georgia"/>
+          <w:sz w:val="21"/>
+          <w:szCs w:val="21"/>
+        </w:rPr>
+        <w:t xml:space="preserve">Às sete e quarenta eu ligo para o seu celular. Precisa ficar registrado que você não atendeu.</w:t>
+      </w:r>
+    </w:p>
+    <w:p>
+      <w:pPr>
+        <w:spacing w:after="0" w:line="312"/>
+        <w:ind w:firstLine="340"/>
+        <w:jc w:val="both"/>
+      </w:pPr>
+      <w:r>
+        <w:rPr>
+          <w:rFonts w:ascii="Georgia" w:cs="Georgia" w:eastAsia="Georgia" w:hAnsi="Georgia"/>
+          <w:sz w:val="21"/>
+          <w:szCs w:val="21"/>
+        </w:rPr>
+        <w:t xml:space="preserve">Lia levou a mão à boca. A chamada das sete e quarenta. A chamada que tinha atormentado Lucas por semanas. Um homem ligando para o celular de outro homem que estava no andar de cima da mesma casa. Não era um mistério. Era uma cláusula.</w:t>
+      </w:r>
+    </w:p>
+    <w:p>
+      <w:pPr>
+        <w:spacing w:after="0" w:line="312"/>
+        <w:ind w:firstLine="340"/>
+        <w:jc w:val="both"/>
+      </w:pPr>
+      <w:r>
+        <w:rPr>
+          <w:rFonts w:ascii="Georgia" w:cs="Georgia" w:eastAsia="Georgia" w:hAnsi="Georgia"/>
+          <w:sz w:val="21"/>
+          <w:szCs w:val="21"/>
+        </w:rPr>
+        <w:t xml:space="preserve">Às oito e quinze eu ligo para a Helena. Às oito e meia, para o Otávio. Os filhos, só depois que a Helena souber.</w:t>
+      </w:r>
+    </w:p>
+    <w:p>
+      <w:pPr>
+        <w:spacing w:after="0" w:line="312"/>
+        <w:ind w:firstLine="340"/>
+        <w:jc w:val="both"/>
+      </w:pPr>
+      <w:r>
+        <w:rPr>
+          <w:rFonts w:ascii="Georgia" w:cs="Georgia" w:eastAsia="Georgia" w:hAnsi="Georgia"/>
+          <w:sz w:val="21"/>
+          <w:szCs w:val="21"/>
+        </w:rPr>
+        <w:t xml:space="preserve">E, na segunda-feira, a véspera, às onze e cinquenta da noite, quando ele ainda devia estar sentado no sofá dela, a última mensagem do pai.</w:t>
+      </w:r>
+    </w:p>
+    <w:p>
+      <w:pPr>
+        <w:spacing w:after="0" w:line="312"/>
+        <w:ind w:firstLine="340"/>
+        <w:jc w:val="both"/>
+      </w:pPr>
+      <w:r>
+        <w:rPr>
+          <w:rFonts w:ascii="Georgia" w:cs="Georgia" w:eastAsia="Georgia" w:hAnsi="Georgia"/>
+          <w:sz w:val="21"/>
+          <w:szCs w:val="21"/>
+        </w:rPr>
+        <w:t xml:space="preserve">Acabei de ver a Lia. Quase contei. Não desisto. Amanhã, sete horas. Cuida de tudo, irmão. Obrigado por apagar a luz.</w:t>
+      </w:r>
+    </w:p>
+    <w:p>
+      <w:pPr>
+        <w:spacing w:after="0" w:line="312"/>
+        <w:ind w:firstLine="340"/>
+        <w:jc w:val="both"/>
+      </w:pPr>
+      <w:r>
+        <w:rPr>
+          <w:rFonts w:ascii="Georgia" w:cs="Georgia" w:eastAsia="Georgia" w:hAnsi="Georgia"/>
+          <w:sz w:val="21"/>
+          <w:szCs w:val="21"/>
+        </w:rPr>
+        <w:t xml:space="preserve">Lia ficou um tempo olhando para o próprio nome na tela, de novo. Acabei de ver a Lia. Quase contei.</w:t>
+      </w:r>
+    </w:p>
+    <w:p>
+      <w:pPr>
+        <w:spacing w:after="0" w:line="312"/>
+        <w:ind w:firstLine="340"/>
+        <w:jc w:val="both"/>
+      </w:pPr>
+      <w:r>
+        <w:rPr>
+          <w:rFonts w:ascii="Georgia" w:cs="Georgia" w:eastAsia="Georgia" w:hAnsi="Georgia"/>
+          <w:sz w:val="21"/>
+          <w:szCs w:val="21"/>
+        </w:rPr>
+        <w:t xml:space="preserve">Ela se lembrou das mãos do pai segurando o rosto dela no sofá, do cartão-postal de um lugar com neve, do não conta pra ninguém que eu vim. Pela primeira vez desde a morte, entendeu que naquela noite o pai não tinha ido se despedir dela. Tinha ido pedir licença.</w:t>
+      </w:r>
+    </w:p>
+    <w:p>
+      <w:pPr>
+        <w:spacing w:after="200" w:before="200"/>
+        <w:jc w:val="center"/>
+      </w:pPr>
+      <w:r>
+        <w:rPr>
+          <w:rFonts w:ascii="Georgia" w:cs="Georgia" w:eastAsia="Georgia" w:hAnsi="Georgia"/>
+          <w:sz w:val="22"/>
+          <w:szCs w:val="22"/>
+        </w:rPr>
+        <w:t xml:space="preserve">*</w:t>
+      </w:r>
+    </w:p>
+    <w:p>
+      <w:pPr>
+        <w:spacing w:after="0" w:line="312"/>
+        <w:ind w:firstLine="340"/>
+        <w:jc w:val="both"/>
+      </w:pPr>
+      <w:r>
+        <w:rPr>
+          <w:rFonts w:ascii="Georgia" w:cs="Georgia" w:eastAsia="Georgia" w:hAnsi="Georgia"/>
+          <w:sz w:val="21"/>
+          <w:szCs w:val="21"/>
+        </w:rPr>
+        <w:t xml:space="preserve">A conversa não terminava ali.</w:t>
+      </w:r>
+    </w:p>
+    <w:p>
+      <w:pPr>
+        <w:spacing w:after="0" w:line="312"/>
+        <w:ind w:firstLine="340"/>
+        <w:jc w:val="both"/>
+      </w:pPr>
+      <w:r>
+        <w:rPr>
+          <w:rFonts w:ascii="Georgia" w:cs="Georgia" w:eastAsia="Georgia" w:hAnsi="Georgia"/>
+          <w:sz w:val="21"/>
+          <w:szCs w:val="21"/>
+        </w:rPr>
+        <w:t xml:space="preserve">Depois da última mensagem do pai, havia outras, todas do mesmo lado. Todas de A. Mensagens que ninguém tinha lido, enviadas para um celular que, a essa altura, estava num saco de farmácia nas mãos de Helena.</w:t>
+      </w:r>
+    </w:p>
+    <w:p>
+      <w:pPr>
+        <w:spacing w:after="0" w:line="312"/>
+        <w:ind w:firstLine="340"/>
+        <w:jc w:val="both"/>
+      </w:pPr>
+      <w:r>
+        <w:rPr>
+          <w:rFonts w:ascii="Georgia" w:cs="Georgia" w:eastAsia="Georgia" w:hAnsi="Georgia"/>
+          <w:sz w:val="21"/>
+          <w:szCs w:val="21"/>
+        </w:rPr>
+        <w:t xml:space="preserve">Terça-feira, duas e dez da tarde.</w:t>
+      </w:r>
+    </w:p>
+    <w:p>
+      <w:pPr>
+        <w:spacing w:after="0" w:line="312"/>
+        <w:ind w:firstLine="340"/>
+        <w:jc w:val="both"/>
+      </w:pPr>
+      <w:r>
+        <w:rPr>
+          <w:rFonts w:ascii="Georgia" w:cs="Georgia" w:eastAsia="Georgia" w:hAnsi="Georgia"/>
+          <w:sz w:val="21"/>
+          <w:szCs w:val="21"/>
+        </w:rPr>
+        <w:t xml:space="preserve">A Helena decidiu cremar. Estou tentando mudar. Aguenta.</w:t>
+      </w:r>
+    </w:p>
+    <w:p>
+      <w:pPr>
+        <w:spacing w:after="0" w:line="312"/>
+        <w:ind w:firstLine="340"/>
+        <w:jc w:val="both"/>
+      </w:pPr>
+      <w:r>
+        <w:rPr>
+          <w:rFonts w:ascii="Georgia" w:cs="Georgia" w:eastAsia="Georgia" w:hAnsi="Georgia"/>
+          <w:sz w:val="21"/>
+          <w:szCs w:val="21"/>
+        </w:rPr>
+        <w:t xml:space="preserve">Terça-feira, dez da noite.</w:t>
+      </w:r>
+    </w:p>
+    <w:p>
+      <w:pPr>
+        <w:spacing w:after="0" w:line="312"/>
+        <w:ind w:firstLine="340"/>
+        <w:jc w:val="both"/>
+      </w:pPr>
+      <w:r>
+        <w:rPr>
+          <w:rFonts w:ascii="Georgia" w:cs="Georgia" w:eastAsia="Georgia" w:hAnsi="Georgia"/>
+          <w:sz w:val="21"/>
+          <w:szCs w:val="21"/>
+        </w:rPr>
+        <w:t xml:space="preserve">Não consegui. Amanhã cedo, na Vila Alpina, eu tento de novo. Ela não me ouve. Ninguém me ouve.</w:t>
+      </w:r>
+    </w:p>
+    <w:p>
+      <w:pPr>
+        <w:spacing w:after="0" w:line="312"/>
+        <w:ind w:firstLine="340"/>
+        <w:jc w:val="both"/>
+      </w:pPr>
+      <w:r>
+        <w:rPr>
+          <w:rFonts w:ascii="Georgia" w:cs="Georgia" w:eastAsia="Georgia" w:hAnsi="Georgia"/>
+          <w:sz w:val="21"/>
+          <w:szCs w:val="21"/>
+        </w:rPr>
+        <w:t xml:space="preserve">Quarta-feira, três e quarenta da manhã. A hora em que, segundo o plano, ele devia estar abrindo uma gaveta perto de um portão.</w:t>
+      </w:r>
+    </w:p>
+    <w:p>
+      <w:pPr>
+        <w:spacing w:after="0" w:line="312"/>
+        <w:ind w:firstLine="340"/>
+        <w:jc w:val="both"/>
+      </w:pPr>
+      <w:r>
+        <w:rPr>
+          <w:rFonts w:ascii="Georgia" w:cs="Georgia" w:eastAsia="Georgia" w:hAnsi="Georgia"/>
+          <w:sz w:val="21"/>
+          <w:szCs w:val="21"/>
+        </w:rPr>
+        <w:t xml:space="preserve">Estou do seu lado. Você ainda está quente.</w:t>
+      </w:r>
+    </w:p>
+    <w:p>
+      <w:pPr>
+        <w:spacing w:after="0" w:line="312"/>
+        <w:ind w:firstLine="340"/>
+        <w:jc w:val="both"/>
+      </w:pPr>
+      <w:r>
+        <w:rPr>
+          <w:rFonts w:ascii="Georgia" w:cs="Georgia" w:eastAsia="Georgia" w:hAnsi="Georgia"/>
+          <w:sz w:val="21"/>
+          <w:szCs w:val="21"/>
+        </w:rPr>
+        <w:t xml:space="preserve">Lia largou o celular sobre o sofá como se ele tivesse queimado a mão dela. Ficou de pé no meio da sala, sem saber para onde ir, com o coração batendo tão forte que doía nas costelas.</w:t>
+      </w:r>
+    </w:p>
+    <w:p>
+      <w:pPr>
+        <w:spacing w:after="0" w:line="312"/>
+        <w:ind w:firstLine="340"/>
+        <w:jc w:val="both"/>
+      </w:pPr>
+      <w:r>
+        <w:rPr>
+          <w:rFonts w:ascii="Georgia" w:cs="Georgia" w:eastAsia="Georgia" w:hAnsi="Georgia"/>
+          <w:sz w:val="21"/>
+          <w:szCs w:val="21"/>
+        </w:rPr>
+        <w:t xml:space="preserve">Você ainda está quente.</w:t>
+      </w:r>
+    </w:p>
+    <w:p>
+      <w:pPr>
+        <w:spacing w:after="0" w:line="312"/>
+        <w:ind w:firstLine="340"/>
+        <w:jc w:val="both"/>
+      </w:pPr>
+      <w:r>
+        <w:rPr>
+          <w:rFonts w:ascii="Georgia" w:cs="Georgia" w:eastAsia="Georgia" w:hAnsi="Georgia"/>
+          <w:sz w:val="21"/>
+          <w:szCs w:val="21"/>
+        </w:rPr>
+        <w:t xml:space="preserve">Às três e quarenta da manhã de quarta, o doutor Álvaro estava sentado ao lado do pai numa sala de velório, sabendo que ele estava vivo. Faltavam seis horas para a plataforma descer. E ele tinha escrito aquilo para um celular que ninguém ia ler, em vez de abrir a porta e gritar.</w:t>
+      </w:r>
+    </w:p>
+    <w:p>
+      <w:pPr>
+        <w:spacing w:after="0" w:line="312"/>
+        <w:ind w:firstLine="340"/>
+        <w:jc w:val="both"/>
+      </w:pPr>
+      <w:r>
+        <w:rPr>
+          <w:rFonts w:ascii="Georgia" w:cs="Georgia" w:eastAsia="Georgia" w:hAnsi="Georgia"/>
+          <w:sz w:val="21"/>
+          <w:szCs w:val="21"/>
+        </w:rPr>
+        <w:t xml:space="preserve">Ela voltou ao sofá. Pegou o aparelho de novo. Havia mais uma mensagem.</w:t>
+      </w:r>
+    </w:p>
+    <w:p>
+      <w:pPr>
+        <w:spacing w:after="0" w:line="312"/>
+        <w:ind w:firstLine="340"/>
+        <w:jc w:val="both"/>
+      </w:pPr>
+      <w:r>
+        <w:rPr>
+          <w:rFonts w:ascii="Georgia" w:cs="Georgia" w:eastAsia="Georgia" w:hAnsi="Georgia"/>
+          <w:sz w:val="21"/>
+          <w:szCs w:val="21"/>
+        </w:rPr>
+        <w:t xml:space="preserve">Quarta-feira, dez e cinquenta e dois da manhã. Quase uma hora depois de o alçapão se fechar.</w:t>
+      </w:r>
+    </w:p>
+    <w:p>
+      <w:pPr>
+        <w:spacing w:after="0" w:line="312"/>
+        <w:ind w:firstLine="340"/>
+        <w:jc w:val="both"/>
+      </w:pPr>
+      <w:r>
+        <w:rPr>
+          <w:rFonts w:ascii="Georgia" w:cs="Georgia" w:eastAsia="Georgia" w:hAnsi="Georgia"/>
+          <w:sz w:val="21"/>
+          <w:szCs w:val="21"/>
+        </w:rPr>
+        <w:t xml:space="preserve">Perdão, irmão.</w:t>
+      </w:r>
+    </w:p>
+    <w:p>
+      <w:pPr>
+        <w:spacing w:after="200" w:before="200"/>
+        <w:jc w:val="center"/>
+      </w:pPr>
+      <w:r>
+        <w:rPr>
+          <w:rFonts w:ascii="Georgia" w:cs="Georgia" w:eastAsia="Georgia" w:hAnsi="Georgia"/>
+          <w:sz w:val="22"/>
+          <w:szCs w:val="22"/>
+        </w:rPr>
+        <w:t xml:space="preserve">*</w:t>
+      </w:r>
+    </w:p>
+    <w:p>
+      <w:pPr>
+        <w:spacing w:after="0" w:line="312"/>
+        <w:ind w:firstLine="340"/>
+        <w:jc w:val="both"/>
+      </w:pPr>
+      <w:r>
+        <w:rPr>
+          <w:rFonts w:ascii="Georgia" w:cs="Georgia" w:eastAsia="Georgia" w:hAnsi="Georgia"/>
+          <w:sz w:val="21"/>
+          <w:szCs w:val="21"/>
+        </w:rPr>
+        <w:t xml:space="preserve">Lia não chorou. Achou que ia chorar, e não chorou. Ficou sentada no sofá até o céu da janela mudar de cor, como na madrugada do Protocolo 71, com a folha de cartório numa mão e o celular do pai na outra.</w:t>
+      </w:r>
+    </w:p>
+    <w:p>
+      <w:pPr>
+        <w:spacing w:after="0" w:line="312"/>
+        <w:ind w:firstLine="340"/>
+        <w:jc w:val="both"/>
+      </w:pPr>
+      <w:r>
+        <w:rPr>
+          <w:rFonts w:ascii="Georgia" w:cs="Georgia" w:eastAsia="Georgia" w:hAnsi="Georgia"/>
+          <w:sz w:val="21"/>
+          <w:szCs w:val="21"/>
+        </w:rPr>
+        <w:t xml:space="preserve">Uma pergunta tinha ocupado o lugar de todas as outras.</w:t>
+      </w:r>
+    </w:p>
+    <w:p>
+      <w:pPr>
+        <w:spacing w:after="0" w:line="312"/>
+        <w:ind w:firstLine="340"/>
+        <w:jc w:val="both"/>
+      </w:pPr>
+      <w:r>
+        <w:rPr>
+          <w:rFonts w:ascii="Georgia" w:cs="Georgia" w:eastAsia="Georgia" w:hAnsi="Georgia"/>
+          <w:sz w:val="21"/>
+          <w:szCs w:val="21"/>
+        </w:rPr>
+        <w:t xml:space="preserve">Por que ele não fez nada?</w:t>
+      </w:r>
+    </w:p>
+    <w:p>
+      <w:pPr>
+        <w:spacing w:after="0" w:line="312"/>
+        <w:ind w:firstLine="340"/>
+        <w:jc w:val="both"/>
+      </w:pPr>
+      <w:r>
+        <w:rPr>
+          <w:rFonts w:ascii="Georgia" w:cs="Georgia" w:eastAsia="Georgia" w:hAnsi="Georgia"/>
+          <w:sz w:val="21"/>
+          <w:szCs w:val="21"/>
+        </w:rPr>
+        <w:t xml:space="preserve">Tinha o antídoto. Tinha o corpo do lado, a noite inteira, sem ninguém olhando. Tinha seis horas. Bastava uma injeção, uma ambulância, um escândalo no corredor do crematório. Bastava dizer, na frente de todo mundo: ele está vivo, parem tudo. Seria preso, talvez. Perderia o diploma, a reputação, o nome. Mas o pai estaria vivo.</w:t>
+      </w:r>
+    </w:p>
+    <w:p>
+      <w:pPr>
+        <w:spacing w:after="0" w:line="312"/>
+        <w:ind w:firstLine="340"/>
+        <w:jc w:val="both"/>
+      </w:pPr>
+      <w:r>
+        <w:rPr>
+          <w:rFonts w:ascii="Georgia" w:cs="Georgia" w:eastAsia="Georgia" w:hAnsi="Georgia"/>
+          <w:sz w:val="21"/>
+          <w:szCs w:val="21"/>
+        </w:rPr>
+        <w:t xml:space="preserve">E ele escolheu ficar sentado numa cadeira, de olhos fechados, mexendo a boca. E depois, no crematório, escolheu fechar os olhos quando a plataforma começou a descer.</w:t>
+      </w:r>
+    </w:p>
+    <w:p>
+      <w:pPr>
+        <w:spacing w:after="0" w:line="312"/>
+        <w:ind w:firstLine="340"/>
+        <w:jc w:val="both"/>
+      </w:pPr>
+      <w:r>
+        <w:rPr>
+          <w:rFonts w:ascii="Georgia" w:cs="Georgia" w:eastAsia="Georgia" w:hAnsi="Georgia"/>
+          <w:sz w:val="21"/>
+          <w:szCs w:val="21"/>
+        </w:rPr>
+        <w:t xml:space="preserve">Às seis da manhã, Lia pegou o próprio celular e escreveu para Lucas.</w:t>
+      </w:r>
+    </w:p>
+    <w:p>
+      <w:pPr>
+        <w:spacing w:after="0" w:line="312"/>
+        <w:ind w:firstLine="340"/>
+        <w:jc w:val="both"/>
+      </w:pPr>
+      <w:r>
+        <w:rPr>
+          <w:rFonts w:ascii="Georgia" w:cs="Georgia" w:eastAsia="Georgia" w:hAnsi="Georgia"/>
+          <w:sz w:val="21"/>
+          <w:szCs w:val="21"/>
+        </w:rPr>
+        <w:t xml:space="preserve">Recebi. Precisamos conversar. Sábado, sem listas.</w:t>
+      </w:r>
+    </w:p>
+    <w:p>
+      <w:pPr>
+        <w:spacing w:after="0" w:line="312"/>
+        <w:ind w:firstLine="340"/>
+        <w:jc w:val="both"/>
+      </w:pPr>
+      <w:r>
+        <w:rPr>
+          <w:rFonts w:ascii="Georgia" w:cs="Georgia" w:eastAsia="Georgia" w:hAnsi="Georgia"/>
+          <w:sz w:val="21"/>
+          <w:szCs w:val="21"/>
+        </w:rPr>
+        <w:t xml:space="preserve">Mandou. Ele respondeu em menos de um minuto, como se também não tivesse dormido.</w:t>
+      </w:r>
+    </w:p>
+    <w:p>
+      <w:pPr>
+        <w:spacing w:after="0" w:line="312"/>
+        <w:ind w:firstLine="340"/>
+        <w:jc w:val="both"/>
+      </w:pPr>
+      <w:r>
+        <w:rPr>
+          <w:rFonts w:ascii="Georgia" w:cs="Georgia" w:eastAsia="Georgia" w:hAnsi="Georgia"/>
+          <w:sz w:val="21"/>
+          <w:szCs w:val="21"/>
+        </w:rPr>
+        <w:t xml:space="preserve">Sábado. Sem listas.</w:t>
+      </w:r>
+    </w:p>
+    <w:p>
+      <w:pPr>
+        <w:spacing w:after="0" w:line="312"/>
+        <w:ind w:firstLine="340"/>
+        <w:jc w:val="both"/>
+      </w:pPr>
+      <w:r>
+        <w:rPr>
+          <w:rFonts w:ascii="Georgia" w:cs="Georgia" w:eastAsia="Georgia" w:hAnsi="Georgia"/>
+          <w:sz w:val="21"/>
+          <w:szCs w:val="21"/>
+        </w:rPr>
+        <w:t xml:space="preserve">Ela não disse que sábado era longe demais. Não disse que, até sábado, havia uma terça-feira no meio.</w:t>
+      </w:r>
+    </w:p>
+    <w:p>
+      <w:pPr>
+        <w:spacing w:after="0" w:line="312"/>
+        <w:ind w:firstLine="340"/>
+        <w:jc w:val="both"/>
+      </w:pPr>
+      <w:r>
+        <w:rPr>
+          <w:rFonts w:ascii="Georgia" w:cs="Georgia" w:eastAsia="Georgia" w:hAnsi="Georgia"/>
+          <w:sz w:val="21"/>
+          <w:szCs w:val="21"/>
+        </w:rPr>
+        <w:t xml:space="preserve">Às oito em ponto, ligou para o consultório da Avenida Angélica. Dona Neusa atendeu com a voz alegre de quem começa a semana.</w:t>
+      </w:r>
+    </w:p>
+    <w:p>
+      <w:pPr>
+        <w:spacing w:after="0" w:line="312"/>
+        <w:ind w:firstLine="340"/>
+        <w:jc w:val="both"/>
+      </w:pPr>
+      <w:r>
+        <w:rPr>
+          <w:rFonts w:ascii="Georgia" w:cs="Georgia" w:eastAsia="Georgia" w:hAnsi="Georgia"/>
+          <w:sz w:val="21"/>
+          <w:szCs w:val="21"/>
+        </w:rPr>
+        <w:t xml:space="preserve">— Menina Lia! O doutor volta de Belo Horizonte amanhã, sim. Quer marcar?</w:t>
+      </w:r>
+    </w:p>
+    <w:p>
+      <w:pPr>
+        <w:spacing w:after="0" w:line="312"/>
+        <w:ind w:firstLine="340"/>
+        <w:jc w:val="both"/>
+      </w:pPr>
+      <w:r>
+        <w:rPr>
+          <w:rFonts w:ascii="Georgia" w:cs="Georgia" w:eastAsia="Georgia" w:hAnsi="Georgia"/>
+          <w:sz w:val="21"/>
+          <w:szCs w:val="21"/>
+        </w:rPr>
+        <w:t xml:space="preserve">— Quero, dona Neusa. O primeiro horário.</w:t>
+      </w:r>
+    </w:p>
+    <w:p>
+      <w:pPr>
+        <w:spacing w:after="0" w:line="312"/>
+        <w:ind w:firstLine="340"/>
+        <w:jc w:val="both"/>
+      </w:pPr>
+      <w:r>
+        <w:rPr>
+          <w:rFonts w:ascii="Georgia" w:cs="Georgia" w:eastAsia="Georgia" w:hAnsi="Georgia"/>
+          <w:sz w:val="21"/>
+          <w:szCs w:val="21"/>
+        </w:rPr>
+        <w:t xml:space="preserve">— Sete e meia? Ele gosta de começar cedo.</w:t>
+      </w:r>
+    </w:p>
+    <w:p>
+      <w:pPr>
+        <w:spacing w:after="0" w:line="312"/>
+        <w:ind w:firstLine="340"/>
+        <w:jc w:val="both"/>
+      </w:pPr>
+      <w:r>
+        <w:rPr>
+          <w:rFonts w:ascii="Georgia" w:cs="Georgia" w:eastAsia="Georgia" w:hAnsi="Georgia"/>
+          <w:sz w:val="21"/>
+          <w:szCs w:val="21"/>
+        </w:rPr>
+        <w:t xml:space="preserve">Lia olhou para o celular do pai, ainda aberto na última mensagem. Perdão, irmão.</w:t>
+      </w:r>
+    </w:p>
+    <w:p>
+      <w:pPr>
+        <w:spacing w:after="0" w:line="312"/>
+        <w:ind w:firstLine="340"/>
+        <w:jc w:val="both"/>
+      </w:pPr>
+      <w:r>
+        <w:rPr>
+          <w:rFonts w:ascii="Georgia" w:cs="Georgia" w:eastAsia="Georgia" w:hAnsi="Georgia"/>
+          <w:sz w:val="21"/>
+          <w:szCs w:val="21"/>
+        </w:rPr>
+        <w:t xml:space="preserve">— Sete e meia está ótimo — disse.</w:t>
+      </w:r>
+    </w:p>
+    <w:p>
+      <w:pPr>
+        <w:spacing w:after="0" w:line="312"/>
+        <w:ind w:firstLine="340"/>
+        <w:jc w:val="both"/>
+      </w:pPr>
+      <w:r>
+        <w:rPr>
+          <w:rFonts w:ascii="Georgia" w:cs="Georgia" w:eastAsia="Georgia" w:hAnsi="Georgia"/>
+          <w:sz w:val="21"/>
+          <w:szCs w:val="21"/>
+        </w:rPr>
+        <w:t xml:space="preserve">Desligou. Guardou a folha de cartório na bolsa, junto com o desenho da casa de doze janelas. Não ia contar a Lucas. Não ainda.</w:t>
+      </w:r>
+    </w:p>
+    <w:p>
+      <w:pPr>
+        <w:spacing w:after="0" w:line="312"/>
+        <w:ind w:firstLine="340"/>
+        <w:jc w:val="both"/>
+      </w:pPr>
+      <w:r>
+        <w:rPr>
+          <w:rFonts w:ascii="Georgia" w:cs="Georgia" w:eastAsia="Georgia" w:hAnsi="Georgia"/>
+          <w:sz w:val="21"/>
+          <w:szCs w:val="21"/>
+        </w:rPr>
+        <w:t xml:space="preserve">Dessa vez, não era para se proteger. Era para proteger o irmão do que ela ia dizer àquele homem.</w:t>
       </w:r>
     </w:p>
     <w:sectPr>

</xml_diff>

<commit_message>
Livro policial: capítulo 28 (Quem apaga a luz)
Co-Authored-By: Claude Opus 5.5 <noreply@anthropic.com>
Claude-Session: https://claude.ai/code/session_01BrurxSYygRC3rRhaUYosm1
</commit_message>
<xml_diff>
--- a/docs/livro-policial/TODO_CRIME_TEM_UM_AUTOR.docx
+++ b/docs/livro-policial/TODO_CRIME_TEM_UM_AUTOR.docx
@@ -29867,6 +29867,1550 @@
           <w:szCs w:val="21"/>
         </w:rPr>
         <w:t xml:space="preserve">Dessa vez, não era para se proteger. Era para proteger o irmão do que ela ia dizer àquele homem.</w:t>
+      </w:r>
+    </w:p>
+    <w:p>
+      <w:pPr>
+        <w:pageBreakBefore/>
+        <w:spacing w:after="120" w:before="1800"/>
+        <w:jc w:val="center"/>
+      </w:pPr>
+      <w:r>
+        <w:rPr>
+          <w:rFonts w:ascii="Georgia" w:cs="Georgia" w:eastAsia="Georgia" w:hAnsi="Georgia"/>
+          <w:spacing w:val="40"/>
+          <w:sz w:val="20"/>
+          <w:szCs w:val="20"/>
+        </w:rPr>
+        <w:t xml:space="preserve">CAPÍTULO 28</w:t>
+      </w:r>
+    </w:p>
+    <w:p>
+      <w:pPr>
+        <w:spacing w:after="720"/>
+        <w:jc w:val="center"/>
+      </w:pPr>
+      <w:r>
+        <w:rPr>
+          <w:rFonts w:ascii="Georgia" w:cs="Georgia" w:eastAsia="Georgia" w:hAnsi="Georgia"/>
+          <w:b/>
+          <w:bCs/>
+          <w:sz w:val="32"/>
+          <w:szCs w:val="32"/>
+        </w:rPr>
+        <w:t xml:space="preserve">Quem apaga a luz</w:t>
+      </w:r>
+    </w:p>
+    <w:p>
+      <w:pPr>
+        <w:spacing w:after="0" w:line="312"/>
+        <w:ind w:firstLine="340"/>
+        <w:jc w:val="both"/>
+      </w:pPr>
+      <w:r>
+        <w:rPr>
+          <w:rFonts w:ascii="Georgia" w:cs="Georgia" w:eastAsia="Georgia" w:hAnsi="Georgia"/>
+          <w:sz w:val="21"/>
+          <w:szCs w:val="21"/>
+        </w:rPr>
+        <w:t xml:space="preserve">O Cemitério do Araçá abria às sete. Lucas chegou às seis e cinquenta e ficou no carro, do outro lado da Avenida Doutor Arnaldo, olhando para o portão principal e para as copas das árvores que apareciam por cima do muro, como se lá dentro houvesse um parque, e não uma cidade de mortos.</w:t>
+      </w:r>
+    </w:p>
+    <w:p>
+      <w:pPr>
+        <w:spacing w:after="0" w:line="312"/>
+        <w:ind w:firstLine="340"/>
+        <w:jc w:val="both"/>
+      </w:pPr>
+      <w:r>
+        <w:rPr>
+          <w:rFonts w:ascii="Georgia" w:cs="Georgia" w:eastAsia="Georgia" w:hAnsi="Georgia"/>
+          <w:sz w:val="21"/>
+          <w:szCs w:val="21"/>
+        </w:rPr>
+        <w:t xml:space="preserve">Tinha dormido duas horas. Na mesa de cabeceira, ao lado do despertador, ficara a lista do caderninho, com as frases do doutor Werneck e de seu Gilberto, uma embaixo da outra. A última dizia: uma gaveta perto do portão. A tampa lacrada no mesmo dia ou no dia seguinte?</w:t>
+      </w:r>
+    </w:p>
+    <w:p>
+      <w:pPr>
+        <w:spacing w:after="0" w:line="312"/>
+        <w:ind w:firstLine="340"/>
+        <w:jc w:val="both"/>
+      </w:pPr>
+      <w:r>
+        <w:rPr>
+          <w:rFonts w:ascii="Georgia" w:cs="Georgia" w:eastAsia="Georgia" w:hAnsi="Georgia"/>
+          <w:sz w:val="21"/>
+          <w:szCs w:val="21"/>
+        </w:rPr>
+        <w:t xml:space="preserve">Às sete em ponto, um funcionário de uniforme abriu o portão. Lucas atravessou a avenida.</w:t>
+      </w:r>
+    </w:p>
+    <w:p>
+      <w:pPr>
+        <w:spacing w:after="200" w:before="200"/>
+        <w:jc w:val="center"/>
+      </w:pPr>
+      <w:r>
+        <w:rPr>
+          <w:rFonts w:ascii="Georgia" w:cs="Georgia" w:eastAsia="Georgia" w:hAnsi="Georgia"/>
+          <w:sz w:val="22"/>
+          <w:szCs w:val="22"/>
+        </w:rPr>
+        <w:t xml:space="preserve">*</w:t>
+      </w:r>
+    </w:p>
+    <w:p>
+      <w:pPr>
+        <w:spacing w:after="0" w:line="312"/>
+        <w:ind w:firstLine="340"/>
+        <w:jc w:val="both"/>
+      </w:pPr>
+      <w:r>
+        <w:rPr>
+          <w:rFonts w:ascii="Georgia" w:cs="Georgia" w:eastAsia="Georgia" w:hAnsi="Georgia"/>
+          <w:sz w:val="21"/>
+          <w:szCs w:val="21"/>
+        </w:rPr>
+        <w:t xml:space="preserve">A administração ficava numa casinha amarela logo depois da entrada, com um balcão de fórmica e um quadro de avisos coberto de papéis de prefeitura. A funcionária que o atendeu, dona Edite, tinha óculos pendurados numa corrente e a paciência de quem passou a vida inteira explicando taxas a gente que chora.</w:t>
+      </w:r>
+    </w:p>
+    <w:p>
+      <w:pPr>
+        <w:spacing w:after="0" w:line="312"/>
+        <w:ind w:firstLine="340"/>
+        <w:jc w:val="both"/>
+      </w:pPr>
+      <w:r>
+        <w:rPr>
+          <w:rFonts w:ascii="Georgia" w:cs="Georgia" w:eastAsia="Georgia" w:hAnsi="Georgia"/>
+          <w:sz w:val="21"/>
+          <w:szCs w:val="21"/>
+        </w:rPr>
+        <w:t xml:space="preserve">— Salvallus — repetiu ela, procurando no computador. — Não tem ninguém com esse nome sepultado aqui, senhor.</w:t>
+      </w:r>
+    </w:p>
+    <w:p>
+      <w:pPr>
+        <w:spacing w:after="0" w:line="312"/>
+        <w:ind w:firstLine="340"/>
+        <w:jc w:val="both"/>
+      </w:pPr>
+      <w:r>
+        <w:rPr>
+          <w:rFonts w:ascii="Georgia" w:cs="Georgia" w:eastAsia="Georgia" w:hAnsi="Georgia"/>
+          <w:sz w:val="21"/>
+          <w:szCs w:val="21"/>
+        </w:rPr>
+        <w:t xml:space="preserve">— Eu sei. Ele foi cremado. Eu queria saber se alguém reservou alguma coisa no nome dele. Numa terça-feira, no começo de outubro.</w:t>
+      </w:r>
+    </w:p>
+    <w:p>
+      <w:pPr>
+        <w:spacing w:after="0" w:line="312"/>
+        <w:ind w:firstLine="340"/>
+        <w:jc w:val="both"/>
+      </w:pPr>
+      <w:r>
+        <w:rPr>
+          <w:rFonts w:ascii="Georgia" w:cs="Georgia" w:eastAsia="Georgia" w:hAnsi="Georgia"/>
+          <w:sz w:val="21"/>
+          <w:szCs w:val="21"/>
+        </w:rPr>
+        <w:t xml:space="preserve">Dona Edite o olhou por cima dos óculos. Depois voltou à tela, digitou, rolou, digitou de novo.</w:t>
+      </w:r>
+    </w:p>
+    <w:p>
+      <w:pPr>
+        <w:spacing w:after="0" w:line="312"/>
+        <w:ind w:firstLine="340"/>
+        <w:jc w:val="both"/>
+      </w:pPr>
+      <w:r>
+        <w:rPr>
+          <w:rFonts w:ascii="Georgia" w:cs="Georgia" w:eastAsia="Georgia" w:hAnsi="Georgia"/>
+          <w:sz w:val="21"/>
+          <w:szCs w:val="21"/>
+        </w:rPr>
+        <w:t xml:space="preserve">— Ah — disse. — Aqui.</w:t>
+      </w:r>
+    </w:p>
+    <w:p>
+      <w:pPr>
+        <w:spacing w:after="0" w:line="312"/>
+        <w:ind w:firstLine="340"/>
+        <w:jc w:val="both"/>
+      </w:pPr>
+      <w:r>
+        <w:rPr>
+          <w:rFonts w:ascii="Georgia" w:cs="Georgia" w:eastAsia="Georgia" w:hAnsi="Georgia"/>
+          <w:sz w:val="21"/>
+          <w:szCs w:val="21"/>
+        </w:rPr>
+        <w:t xml:space="preserve">Virou o monitor para ele.</w:t>
+      </w:r>
+    </w:p>
+    <w:p>
+      <w:pPr>
+        <w:spacing w:after="0" w:line="312"/>
+        <w:ind w:firstLine="340"/>
+        <w:jc w:val="both"/>
+      </w:pPr>
+      <w:r>
+        <w:rPr>
+          <w:rFonts w:ascii="Georgia" w:cs="Georgia" w:eastAsia="Georgia" w:hAnsi="Georgia"/>
+          <w:sz w:val="21"/>
+          <w:szCs w:val="21"/>
+        </w:rPr>
+        <w:t xml:space="preserve">Reserva de gaveta. Quadra lateral, fileira térrea, número trinta e um. Em nome de Henrique Salvallus. Solicitante: Álvaro Mendes, médico. Pagamento à vista, em dinheiro. Data: a terça-feira da morte, às nove e vinte da manhã.</w:t>
+      </w:r>
+    </w:p>
+    <w:p>
+      <w:pPr>
+        <w:spacing w:after="0" w:line="312"/>
+        <w:ind w:firstLine="340"/>
+        <w:jc w:val="both"/>
+      </w:pPr>
+      <w:r>
+        <w:rPr>
+          <w:rFonts w:ascii="Georgia" w:cs="Georgia" w:eastAsia="Georgia" w:hAnsi="Georgia"/>
+          <w:sz w:val="21"/>
+          <w:szCs w:val="21"/>
+        </w:rPr>
+        <w:t xml:space="preserve">— Nunca foi usada — disse dona Edite. — Nem cancelada. Ele não pediu o dinheiro de volta. Eu lembro, porque é raro. — Ela tirou os óculos. — E lembro dele, porque ele voltou.</w:t>
+      </w:r>
+    </w:p>
+    <w:p>
+      <w:pPr>
+        <w:spacing w:after="0" w:line="312"/>
+        <w:ind w:firstLine="340"/>
+        <w:jc w:val="both"/>
+      </w:pPr>
+      <w:r>
+        <w:rPr>
+          <w:rFonts w:ascii="Georgia" w:cs="Georgia" w:eastAsia="Georgia" w:hAnsi="Georgia"/>
+          <w:sz w:val="21"/>
+          <w:szCs w:val="21"/>
+        </w:rPr>
+        <w:t xml:space="preserve">— Voltou quando?</w:t>
+      </w:r>
+    </w:p>
+    <w:p>
+      <w:pPr>
+        <w:spacing w:after="0" w:line="312"/>
+        <w:ind w:firstLine="340"/>
+        <w:jc w:val="both"/>
+      </w:pPr>
+      <w:r>
+        <w:rPr>
+          <w:rFonts w:ascii="Georgia" w:cs="Georgia" w:eastAsia="Georgia" w:hAnsi="Georgia"/>
+          <w:sz w:val="21"/>
+          <w:szCs w:val="21"/>
+        </w:rPr>
+        <w:t xml:space="preserve">— Na quarta à tarde. Depois do almoço. Pediu para ver a gaveta. Eu disse que não tinha nada para ver, que estava vazia, e ele disse que sabia. Que só queria olhar. — A funcionária baixou a voz. — Levei ele até lá. Ele ficou meia hora em pé, na frente de uma parede de mármore, olhando para uma gaveta vazia. Não rezou. Não chorou. Só olhou. Depois agradeceu e foi embora.</w:t>
+      </w:r>
+    </w:p>
+    <w:p>
+      <w:pPr>
+        <w:spacing w:after="200" w:before="200"/>
+        <w:jc w:val="center"/>
+      </w:pPr>
+      <w:r>
+        <w:rPr>
+          <w:rFonts w:ascii="Georgia" w:cs="Georgia" w:eastAsia="Georgia" w:hAnsi="Georgia"/>
+          <w:sz w:val="22"/>
+          <w:szCs w:val="22"/>
+        </w:rPr>
+        <w:t xml:space="preserve">*</w:t>
+      </w:r>
+    </w:p>
+    <w:p>
+      <w:pPr>
+        <w:spacing w:after="0" w:line="312"/>
+        <w:ind w:firstLine="340"/>
+        <w:jc w:val="both"/>
+      </w:pPr>
+      <w:r>
+        <w:rPr>
+          <w:rFonts w:ascii="Georgia" w:cs="Georgia" w:eastAsia="Georgia" w:hAnsi="Georgia"/>
+          <w:sz w:val="21"/>
+          <w:szCs w:val="21"/>
+        </w:rPr>
+        <w:t xml:space="preserve">A quadra lateral ficava no fundo do cemitério, ao lado de um portão de ferro pintado de verde, trancado com cadeado, que dava para uma rua estreita e sem movimento. Uma parede comprida de gavetas de mármore, quatro fileiras de altura. A de baixo, rente ao chão, ao alcance de qualquer mão.</w:t>
+      </w:r>
+    </w:p>
+    <w:p>
+      <w:pPr>
+        <w:spacing w:after="0" w:line="312"/>
+        <w:ind w:firstLine="340"/>
+        <w:jc w:val="both"/>
+      </w:pPr>
+      <w:r>
+        <w:rPr>
+          <w:rFonts w:ascii="Georgia" w:cs="Georgia" w:eastAsia="Georgia" w:hAnsi="Georgia"/>
+          <w:sz w:val="21"/>
+          <w:szCs w:val="21"/>
+        </w:rPr>
+        <w:t xml:space="preserve">A trinta e um ficava a seis passos do portão.</w:t>
+      </w:r>
+    </w:p>
+    <w:p>
+      <w:pPr>
+        <w:spacing w:after="0" w:line="312"/>
+        <w:ind w:firstLine="340"/>
+        <w:jc w:val="both"/>
+      </w:pPr>
+      <w:r>
+        <w:rPr>
+          <w:rFonts w:ascii="Georgia" w:cs="Georgia" w:eastAsia="Georgia" w:hAnsi="Georgia"/>
+          <w:sz w:val="21"/>
+          <w:szCs w:val="21"/>
+        </w:rPr>
+        <w:t xml:space="preserve">Lucas se agachou na frente dela. A tampa de mármore cinza estava encostada na abertura, sem nome, sem data, presa só por dois parafusos de latão nos cantos. Não havia cimento nenhum em volta. Atrás dela, ele sabia, havia um espaço do tamanho exato de um caixão, que nunca tinha recebido caixão nenhum.</w:t>
+      </w:r>
+    </w:p>
+    <w:p>
+      <w:pPr>
+        <w:spacing w:after="0" w:line="312"/>
+        <w:ind w:firstLine="340"/>
+        <w:jc w:val="both"/>
+      </w:pPr>
+      <w:r>
+        <w:rPr>
+          <w:rFonts w:ascii="Georgia" w:cs="Georgia" w:eastAsia="Georgia" w:hAnsi="Georgia"/>
+          <w:sz w:val="21"/>
+          <w:szCs w:val="21"/>
+        </w:rPr>
+        <w:t xml:space="preserve">Ficou um tempo ali, de cócoras, com os joelhos doendo.</w:t>
+      </w:r>
+    </w:p>
+    <w:p>
+      <w:pPr>
+        <w:spacing w:after="0" w:line="312"/>
+        <w:ind w:firstLine="340"/>
+        <w:jc w:val="both"/>
+      </w:pPr>
+      <w:r>
+        <w:rPr>
+          <w:rFonts w:ascii="Georgia" w:cs="Georgia" w:eastAsia="Georgia" w:hAnsi="Georgia"/>
+          <w:sz w:val="21"/>
+          <w:szCs w:val="21"/>
+        </w:rPr>
+        <w:t xml:space="preserve">Uma gaveta, não uma cova. Perto de um portão que ninguém usava. Com uma tampa que dois parafusos seguravam e que só seria cimentada no dia seguinte. Um médico que pagou em dinheiro, às nove e vinte da manhã da morte, antes de a viúva decidir qualquer coisa. E que, um dia depois de a viúva decidir, voltou para olhar para o lugar vazio durante meia hora.</w:t>
+      </w:r>
+    </w:p>
+    <w:p>
+      <w:pPr>
+        <w:spacing w:after="0" w:line="312"/>
+        <w:ind w:firstLine="340"/>
+        <w:jc w:val="both"/>
+      </w:pPr>
+      <w:r>
+        <w:rPr>
+          <w:rFonts w:ascii="Georgia" w:cs="Georgia" w:eastAsia="Georgia" w:hAnsi="Georgia"/>
+          <w:sz w:val="21"/>
+          <w:szCs w:val="21"/>
+        </w:rPr>
+        <w:t xml:space="preserve">Ninguém escolhe um túmulo assim para guardar um morto.</w:t>
+      </w:r>
+    </w:p>
+    <w:p>
+      <w:pPr>
+        <w:spacing w:after="0" w:line="312"/>
+        <w:ind w:firstLine="340"/>
+        <w:jc w:val="both"/>
+      </w:pPr>
+      <w:r>
+        <w:rPr>
+          <w:rFonts w:ascii="Georgia" w:cs="Georgia" w:eastAsia="Georgia" w:hAnsi="Georgia"/>
+          <w:sz w:val="21"/>
+          <w:szCs w:val="21"/>
+        </w:rPr>
+        <w:t xml:space="preserve">Escolhe para tirar alguém de lá.</w:t>
+      </w:r>
+    </w:p>
+    <w:p>
+      <w:pPr>
+        <w:spacing w:after="200" w:before="200"/>
+        <w:jc w:val="center"/>
+      </w:pPr>
+      <w:r>
+        <w:rPr>
+          <w:rFonts w:ascii="Georgia" w:cs="Georgia" w:eastAsia="Georgia" w:hAnsi="Georgia"/>
+          <w:sz w:val="22"/>
+          <w:szCs w:val="22"/>
+        </w:rPr>
+        <w:t xml:space="preserve">*</w:t>
+      </w:r>
+    </w:p>
+    <w:p>
+      <w:pPr>
+        <w:spacing w:after="0" w:line="312"/>
+        <w:ind w:firstLine="340"/>
+        <w:jc w:val="both"/>
+      </w:pPr>
+      <w:r>
+        <w:rPr>
+          <w:rFonts w:ascii="Georgia" w:cs="Georgia" w:eastAsia="Georgia" w:hAnsi="Georgia"/>
+          <w:sz w:val="21"/>
+          <w:szCs w:val="21"/>
+        </w:rPr>
+        <w:t xml:space="preserve">Lucas passou a tarde inteira tentando não completar o pensamento. Atendeu dois clientes na corretora, assinou um aditivo sem ler, esqueceu o celular na sala de reuniões. Às seis, desistiu de fingir e foi até Moema.</w:t>
+      </w:r>
+    </w:p>
+    <w:p>
+      <w:pPr>
+        <w:spacing w:after="0" w:line="312"/>
+        <w:ind w:firstLine="340"/>
+        <w:jc w:val="both"/>
+      </w:pPr>
+      <w:r>
+        <w:rPr>
+          <w:rFonts w:ascii="Georgia" w:cs="Georgia" w:eastAsia="Georgia" w:hAnsi="Georgia"/>
+          <w:sz w:val="21"/>
+          <w:szCs w:val="21"/>
+        </w:rPr>
+        <w:t xml:space="preserve">O prédio de pastilhas azuis estava com a luz da escada acesa. Lucas subiu os três andares a pé, como da outra vez, e já estava com a chave dourada na mão, diante da porta do 32, quando a porta do 31 se abriu.</w:t>
+      </w:r>
+    </w:p>
+    <w:p>
+      <w:pPr>
+        <w:spacing w:after="0" w:line="312"/>
+        <w:ind w:firstLine="340"/>
+        <w:jc w:val="both"/>
+      </w:pPr>
+      <w:r>
+        <w:rPr>
+          <w:rFonts w:ascii="Georgia" w:cs="Georgia" w:eastAsia="Georgia" w:hAnsi="Georgia"/>
+          <w:sz w:val="21"/>
+          <w:szCs w:val="21"/>
+        </w:rPr>
+        <w:t xml:space="preserve">Uma senhora muito pequena, de cabelo branco preso num coque e avental de cozinha, olhou para ele com a cara de quem passava os dias vigiando a escada pelo olho mágico e não tinha vergonha nenhuma disso.</w:t>
+      </w:r>
+    </w:p>
+    <w:p>
+      <w:pPr>
+        <w:spacing w:after="0" w:line="312"/>
+        <w:ind w:firstLine="340"/>
+        <w:jc w:val="both"/>
+      </w:pPr>
+      <w:r>
+        <w:rPr>
+          <w:rFonts w:ascii="Georgia" w:cs="Georgia" w:eastAsia="Georgia" w:hAnsi="Georgia"/>
+          <w:sz w:val="21"/>
+          <w:szCs w:val="21"/>
+        </w:rPr>
+        <w:t xml:space="preserve">— O senhor é parente do moço do 32?</w:t>
+      </w:r>
+    </w:p>
+    <w:p>
+      <w:pPr>
+        <w:spacing w:after="0" w:line="312"/>
+        <w:ind w:firstLine="340"/>
+        <w:jc w:val="both"/>
+      </w:pPr>
+      <w:r>
+        <w:rPr>
+          <w:rFonts w:ascii="Georgia" w:cs="Georgia" w:eastAsia="Georgia" w:hAnsi="Georgia"/>
+          <w:sz w:val="21"/>
+          <w:szCs w:val="21"/>
+        </w:rPr>
+        <w:t xml:space="preserve">— Sou filho dele.</w:t>
+      </w:r>
+    </w:p>
+    <w:p>
+      <w:pPr>
+        <w:spacing w:after="0" w:line="312"/>
+        <w:ind w:firstLine="340"/>
+        <w:jc w:val="both"/>
+      </w:pPr>
+      <w:r>
+        <w:rPr>
+          <w:rFonts w:ascii="Georgia" w:cs="Georgia" w:eastAsia="Georgia" w:hAnsi="Georgia"/>
+          <w:sz w:val="21"/>
+          <w:szCs w:val="21"/>
+        </w:rPr>
+        <w:t xml:space="preserve">— Ah. — A expressão dela mudou. — Ele morreu, não foi? Eu imaginei. Nunca mais veio.</w:t>
+      </w:r>
+    </w:p>
+    <w:p>
+      <w:pPr>
+        <w:spacing w:after="0" w:line="312"/>
+        <w:ind w:firstLine="340"/>
+        <w:jc w:val="both"/>
+      </w:pPr>
+      <w:r>
+        <w:rPr>
+          <w:rFonts w:ascii="Georgia" w:cs="Georgia" w:eastAsia="Georgia" w:hAnsi="Georgia"/>
+          <w:sz w:val="21"/>
+          <w:szCs w:val="21"/>
+        </w:rPr>
+        <w:t xml:space="preserve">Chamava-se dona Zilá, morava ali havia quarenta anos e sabia de tudo o que acontecia naquele andar. Fez Lucas entrar, porque não se conversa no corredor, e serviu a ele um pedaço de bolo de fubá ainda morno, que ele comeu até o fim sem perceber, enquanto ela falava.</w:t>
+      </w:r>
+    </w:p>
+    <w:p>
+      <w:pPr>
+        <w:spacing w:after="0" w:line="312"/>
+        <w:ind w:firstLine="340"/>
+        <w:jc w:val="both"/>
+      </w:pPr>
+      <w:r>
+        <w:rPr>
+          <w:rFonts w:ascii="Georgia" w:cs="Georgia" w:eastAsia="Georgia" w:hAnsi="Georgia"/>
+          <w:sz w:val="21"/>
+          <w:szCs w:val="21"/>
+        </w:rPr>
+        <w:t xml:space="preserve">O moço do 32 vinha pouco. Uma vez por semana, às vezes duas, sempre à noite, sempre sozinho. Educado. Dava boa-noite e carregava as compras dela quando cruzava na escada. Nos últimos meses, trazia sacolas de loja. Uma vez, uma mala grande, nova, que ele subiu sozinho, bufando, recusando ajuda.</w:t>
+      </w:r>
+    </w:p>
+    <w:p>
+      <w:pPr>
+        <w:spacing w:after="0" w:line="312"/>
+        <w:ind w:firstLine="340"/>
+        <w:jc w:val="both"/>
+      </w:pPr>
+      <w:r>
+        <w:rPr>
+          <w:rFonts w:ascii="Georgia" w:cs="Georgia" w:eastAsia="Georgia" w:hAnsi="Georgia"/>
+          <w:sz w:val="21"/>
+          <w:szCs w:val="21"/>
+        </w:rPr>
+        <w:t xml:space="preserve">— E depois — disse dona Zilá — teve o outro.</w:t>
+      </w:r>
+    </w:p>
+    <w:p>
+      <w:pPr>
+        <w:spacing w:after="0" w:line="312"/>
+        <w:ind w:firstLine="340"/>
+        <w:jc w:val="both"/>
+      </w:pPr>
+      <w:r>
+        <w:rPr>
+          <w:rFonts w:ascii="Georgia" w:cs="Georgia" w:eastAsia="Georgia" w:hAnsi="Georgia"/>
+          <w:sz w:val="21"/>
+          <w:szCs w:val="21"/>
+        </w:rPr>
+        <w:t xml:space="preserve">— Que outro?</w:t>
+      </w:r>
+    </w:p>
+    <w:p>
+      <w:pPr>
+        <w:spacing w:after="0" w:line="312"/>
+        <w:ind w:firstLine="340"/>
+        <w:jc w:val="both"/>
+      </w:pPr>
+      <w:r>
+        <w:rPr>
+          <w:rFonts w:ascii="Georgia" w:cs="Georgia" w:eastAsia="Georgia" w:hAnsi="Georgia"/>
+          <w:sz w:val="21"/>
+          <w:szCs w:val="21"/>
+        </w:rPr>
+        <w:t xml:space="preserve">— O senhor de cabelo branco. Mais velho que o seu pai, acho. — Ela alisou o avental. — Foi numa madrugada de sexta-feira. A da semana em que o seu pai deixou de vir. Eu tenho sono leve, ouvi alguém subir a escada às três da manhã. Olhei pelo olho mágico. Era um senhor de terno, com uma maleta de médico, dessas antigas, de couro. Ele tocou a campainha do 32. Tocou de novo. Ninguém abriu, claro. Aí ele sentou no degrau, ali, de costas para a minha porta.</w:t>
+      </w:r>
+    </w:p>
+    <w:p>
+      <w:pPr>
+        <w:spacing w:after="0" w:line="312"/>
+        <w:ind w:firstLine="340"/>
+        <w:jc w:val="both"/>
+      </w:pPr>
+      <w:r>
+        <w:rPr>
+          <w:rFonts w:ascii="Georgia" w:cs="Georgia" w:eastAsia="Georgia" w:hAnsi="Georgia"/>
+          <w:sz w:val="21"/>
+          <w:szCs w:val="21"/>
+        </w:rPr>
+        <w:t xml:space="preserve">— E ficou quanto tempo?</w:t>
+      </w:r>
+    </w:p>
+    <w:p>
+      <w:pPr>
+        <w:spacing w:after="0" w:line="312"/>
+        <w:ind w:firstLine="340"/>
+        <w:jc w:val="both"/>
+      </w:pPr>
+      <w:r>
+        <w:rPr>
+          <w:rFonts w:ascii="Georgia" w:cs="Georgia" w:eastAsia="Georgia" w:hAnsi="Georgia"/>
+          <w:sz w:val="21"/>
+          <w:szCs w:val="21"/>
+        </w:rPr>
+        <w:t xml:space="preserve">— Até clarear. Seis horas, mais ou menos. Eu fiquei olhando um pouco, depois voltei para a cama, depois levantei de novo. Ele não saiu do lugar. — Dona Zilá baixou os olhos. — Chorava. Baixinho, para não acordar ninguém. Eu pensei em abrir a porta e oferecer um café, mas tive medo. Às seis, ele olhou o relógio, levantou e foi embora. Deixou isso no degrau.</w:t>
+      </w:r>
+    </w:p>
+    <w:p>
+      <w:pPr>
+        <w:spacing w:after="0" w:line="312"/>
+        <w:ind w:firstLine="340"/>
+        <w:jc w:val="both"/>
+      </w:pPr>
+      <w:r>
+        <w:rPr>
+          <w:rFonts w:ascii="Georgia" w:cs="Georgia" w:eastAsia="Georgia" w:hAnsi="Georgia"/>
+          <w:sz w:val="21"/>
+          <w:szCs w:val="21"/>
+        </w:rPr>
+        <w:t xml:space="preserve">Ela se levantou, abriu a gaveta de um aparador e voltou com uma coisa na palma da mão.</w:t>
+      </w:r>
+    </w:p>
+    <w:p>
+      <w:pPr>
+        <w:spacing w:after="0" w:line="312"/>
+        <w:ind w:firstLine="340"/>
+        <w:jc w:val="both"/>
+      </w:pPr>
+      <w:r>
+        <w:rPr>
+          <w:rFonts w:ascii="Georgia" w:cs="Georgia" w:eastAsia="Georgia" w:hAnsi="Georgia"/>
+          <w:sz w:val="21"/>
+          <w:szCs w:val="21"/>
+        </w:rPr>
+        <w:t xml:space="preserve">Um frasco âmbar, do tamanho de um dedo, com tampa de rosca e nenhum rótulo. Vazio.</w:t>
+      </w:r>
+    </w:p>
+    <w:p>
+      <w:pPr>
+        <w:spacing w:after="200" w:before="200"/>
+        <w:jc w:val="center"/>
+      </w:pPr>
+      <w:r>
+        <w:rPr>
+          <w:rFonts w:ascii="Georgia" w:cs="Georgia" w:eastAsia="Georgia" w:hAnsi="Georgia"/>
+          <w:sz w:val="22"/>
+          <w:szCs w:val="22"/>
+        </w:rPr>
+        <w:t xml:space="preserve">*</w:t>
+      </w:r>
+    </w:p>
+    <w:p>
+      <w:pPr>
+        <w:spacing w:after="0" w:line="312"/>
+        <w:ind w:firstLine="340"/>
+        <w:jc w:val="both"/>
+      </w:pPr>
+      <w:r>
+        <w:rPr>
+          <w:rFonts w:ascii="Georgia" w:cs="Georgia" w:eastAsia="Georgia" w:hAnsi="Georgia"/>
+          <w:sz w:val="21"/>
+          <w:szCs w:val="21"/>
+        </w:rPr>
+        <w:t xml:space="preserve">Lucas segurou o frasco na mão fechada até chegar ao carro.</w:t>
+      </w:r>
+    </w:p>
+    <w:p>
+      <w:pPr>
+        <w:spacing w:after="0" w:line="312"/>
+        <w:ind w:firstLine="340"/>
+        <w:jc w:val="both"/>
+      </w:pPr>
+      <w:r>
+        <w:rPr>
+          <w:rFonts w:ascii="Georgia" w:cs="Georgia" w:eastAsia="Georgia" w:hAnsi="Georgia"/>
+          <w:sz w:val="21"/>
+          <w:szCs w:val="21"/>
+        </w:rPr>
+        <w:t xml:space="preserve">Sentou-se no banco do motorista e não deu a partida. A rua de Moema estava escura e tranquila, com o barulho distante da Avenida Ibirapuera e um cachorro latindo em algum quintal.</w:t>
+      </w:r>
+    </w:p>
+    <w:p>
+      <w:pPr>
+        <w:spacing w:after="0" w:line="312"/>
+        <w:ind w:firstLine="340"/>
+        <w:jc w:val="both"/>
+      </w:pPr>
+      <w:r>
+        <w:rPr>
+          <w:rFonts w:ascii="Georgia" w:cs="Georgia" w:eastAsia="Georgia" w:hAnsi="Georgia"/>
+          <w:sz w:val="21"/>
+          <w:szCs w:val="21"/>
+        </w:rPr>
+        <w:t xml:space="preserve">Tentou fazer o que o pai faria. Uma coluna para o que sabia, outra para o que achava. Não conseguiu. As duas colunas tinham virado uma só.</w:t>
+      </w:r>
+    </w:p>
+    <w:p>
+      <w:pPr>
+        <w:spacing w:after="0" w:line="312"/>
+        <w:ind w:firstLine="340"/>
+        <w:jc w:val="both"/>
+      </w:pPr>
+      <w:r>
+        <w:rPr>
+          <w:rFonts w:ascii="Georgia" w:cs="Georgia" w:eastAsia="Georgia" w:hAnsi="Georgia"/>
+          <w:sz w:val="21"/>
+          <w:szCs w:val="21"/>
+        </w:rPr>
+        <w:t xml:space="preserve">O pai ia embora do Brasil. Mala, sobretudo, guia, chalé, passaporte com fotos novas, documentos de outubro. O pai tinha entregado a um único homem tudo o que tinha escondido do mundo, a empresa, a conta, a carta. O pai tinha marcado com esse homem, em vermelho, uma consulta em casa às sete da manhã do dia em que morreu. Esse homem assinou o atestado e arranjou uma segunda assinatura de quem não viu o corpo. Proibiu o formol, proibiu a geladeira, ficou a noite inteira ao lado do caixão aberto. O corpo não endureceu. Esse homem reservou uma gaveta perto de um portão, com a tampa presa por dois parafusos. Brigou com Helena para que não houvesse cremação. Perdeu. Fechou os olhos quando a plataforma desceu. Voltou ao cemitério para olhar para a gaveta vazia. E, na sexta-feira, às três da manhã, a hora em que alguém que tivesse acordado na quarta já estaria pronto para ir embora, sentou numa escada de Moema com uma maleta de médico e chorou até clarear, diante de uma porta que ninguém ia abrir.</w:t>
+      </w:r>
+    </w:p>
+    <w:p>
+      <w:pPr>
+        <w:spacing w:after="0" w:line="312"/>
+        <w:ind w:firstLine="340"/>
+        <w:jc w:val="both"/>
+      </w:pPr>
+      <w:r>
+        <w:rPr>
+          <w:rFonts w:ascii="Georgia" w:cs="Georgia" w:eastAsia="Georgia" w:hAnsi="Georgia"/>
+          <w:sz w:val="21"/>
+          <w:szCs w:val="21"/>
+        </w:rPr>
+        <w:t xml:space="preserve">Lucas abriu a mão e olhou para o frasco vazio.</w:t>
+      </w:r>
+    </w:p>
+    <w:p>
+      <w:pPr>
+        <w:spacing w:after="0" w:line="312"/>
+        <w:ind w:firstLine="340"/>
+        <w:jc w:val="both"/>
+      </w:pPr>
+      <w:r>
+        <w:rPr>
+          <w:rFonts w:ascii="Georgia" w:cs="Georgia" w:eastAsia="Georgia" w:hAnsi="Georgia"/>
+          <w:sz w:val="21"/>
+          <w:szCs w:val="21"/>
+        </w:rPr>
+        <w:t xml:space="preserve">Eles não tinham planejado uma morte. Tinham planejado uma ressurreição. E alguma coisa tinha dado errado no meio.</w:t>
+      </w:r>
+    </w:p>
+    <w:p>
+      <w:pPr>
+        <w:pBdr>
+          <w:top w:val="single" w:color="555555" w:sz="6" w:space="6"/>
+          <w:bottom w:val="single" w:color="555555" w:sz="6" w:space="6"/>
+          <w:left w:val="single" w:color="555555" w:sz="6" w:space="6"/>
+          <w:right w:val="single" w:color="555555" w:sz="6" w:space="6"/>
+        </w:pBdr>
+        <w:shd w:fill="EFEFEF" w:color="auto" w:val="clear"/>
+        <w:spacing w:after="0" w:before="240"/>
+        <w:ind w:left="227" w:right="227"/>
+        <w:jc w:val="center"/>
+      </w:pPr>
+      <w:r>
+        <w:rPr>
+          <w:rFonts w:ascii="Georgia" w:cs="Georgia" w:eastAsia="Georgia" w:hAnsi="Georgia"/>
+          <w:b/>
+          <w:bCs/>
+          <w:spacing w:val="30"/>
+          <w:sz w:val="17"/>
+          <w:szCs w:val="17"/>
+        </w:rPr>
+        <w:t xml:space="preserve">NO CELULAR DE HENRIQUE</w:t>
+      </w:r>
+    </w:p>
+    <w:p>
+      <w:pPr>
+        <w:pBdr>
+          <w:top w:val="single" w:color="555555" w:sz="6" w:space="6"/>
+          <w:bottom w:val="single" w:color="555555" w:sz="6" w:space="6"/>
+          <w:left w:val="single" w:color="555555" w:sz="6" w:space="6"/>
+          <w:right w:val="single" w:color="555555" w:sz="6" w:space="6"/>
+        </w:pBdr>
+        <w:shd w:fill="EFEFEF" w:color="auto" w:val="clear"/>
+        <w:spacing w:after="240" w:before="0" w:line="288"/>
+        <w:ind w:left="227" w:right="227"/>
+        <w:jc w:val="center"/>
+      </w:pPr>
+      <w:r>
+        <w:rPr>
+          <w:rFonts w:ascii="Georgia" w:cs="Georgia" w:eastAsia="Georgia" w:hAnsi="Georgia"/>
+          <w:i/>
+          <w:iCs/>
+          <w:sz w:val="19"/>
+          <w:szCs w:val="19"/>
+        </w:rPr>
+        <w:t xml:space="preserve">Abra a agenda do celular de Henrique na semana da morte e procure as entradas em verde, a cor das viagens. Veja o que estava marcado para a quarta-feira de madrugada e para a sexta.</w:t>
+      </w:r>
+    </w:p>
+    <w:p>
+      <w:pPr>
+        <w:spacing w:after="0" w:line="312"/>
+        <w:ind w:firstLine="340"/>
+        <w:jc w:val="both"/>
+      </w:pPr>
+      <w:r>
+        <w:rPr>
+          <w:rFonts w:ascii="Georgia" w:cs="Georgia" w:eastAsia="Georgia" w:hAnsi="Georgia"/>
+          <w:sz w:val="21"/>
+          <w:szCs w:val="21"/>
+        </w:rPr>
+        <w:t xml:space="preserve">Ele lembrou, de repente, de duas entradas em verde que tinha visto semanas antes na agenda do pai e que tinha tomado por viagens de trabalho. Quarta, seis da manhã: Moema. Sexta: Z.</w:t>
+      </w:r>
+    </w:p>
+    <w:p>
+      <w:pPr>
+        <w:spacing w:after="0" w:line="312"/>
+        <w:ind w:firstLine="340"/>
+        <w:jc w:val="both"/>
+      </w:pPr>
+      <w:r>
+        <w:rPr>
+          <w:rFonts w:ascii="Georgia" w:cs="Georgia" w:eastAsia="Georgia" w:hAnsi="Georgia"/>
+          <w:sz w:val="21"/>
+          <w:szCs w:val="21"/>
+        </w:rPr>
+        <w:t xml:space="preserve">Z de Zurique.</w:t>
+      </w:r>
+    </w:p>
+    <w:p>
+      <w:pPr>
+        <w:spacing w:after="0" w:line="312"/>
+        <w:ind w:firstLine="340"/>
+        <w:jc w:val="both"/>
+      </w:pPr>
+      <w:r>
+        <w:rPr>
+          <w:rFonts w:ascii="Georgia" w:cs="Georgia" w:eastAsia="Georgia" w:hAnsi="Georgia"/>
+          <w:sz w:val="21"/>
+          <w:szCs w:val="21"/>
+        </w:rPr>
+        <w:t xml:space="preserve">Na quarta-feira, às seis da manhã, o pai devia estar subindo aquela escada. Estava descendo por um alçapão.</w:t>
+      </w:r>
+    </w:p>
+    <w:p>
+      <w:pPr>
+        <w:spacing w:after="0" w:line="312"/>
+        <w:ind w:firstLine="340"/>
+        <w:jc w:val="both"/>
+      </w:pPr>
+      <w:r>
+        <w:rPr>
+          <w:rFonts w:ascii="Georgia" w:cs="Georgia" w:eastAsia="Georgia" w:hAnsi="Georgia"/>
+          <w:sz w:val="21"/>
+          <w:szCs w:val="21"/>
+        </w:rPr>
+        <w:t xml:space="preserve">Lucas encostou a testa no volante e ficou assim muito tempo. Não chorou. Pensou na plataforma descendo, centímetro por centímetro, no zumbido do ar-condicionado, no silêncio educado do salão. No pai deitado no escuro do caixão, quente, sem conseguir mexer um dedo. Talvez ouvindo. Talvez ouvindo o padre, o riso abafado na segunda fileira, a voz satisfeita entre os homens de terno. Agora o imorrível morreu.</w:t>
+      </w:r>
+    </w:p>
+    <w:p>
+      <w:pPr>
+        <w:spacing w:after="0" w:line="312"/>
+        <w:ind w:firstLine="340"/>
+        <w:jc w:val="both"/>
+      </w:pPr>
+      <w:r>
+        <w:rPr>
+          <w:rFonts w:ascii="Georgia" w:cs="Georgia" w:eastAsia="Georgia" w:hAnsi="Georgia"/>
+          <w:sz w:val="21"/>
+          <w:szCs w:val="21"/>
+        </w:rPr>
+        <w:t xml:space="preserve">E um homem sentado a duas poltronas dele, de olhos fechados, que sabia.</w:t>
+      </w:r>
+    </w:p>
+    <w:p>
+      <w:pPr>
+        <w:spacing w:after="0" w:line="312"/>
+        <w:ind w:firstLine="340"/>
+        <w:jc w:val="both"/>
+      </w:pPr>
+      <w:r>
+        <w:rPr>
+          <w:rFonts w:ascii="Georgia" w:cs="Georgia" w:eastAsia="Georgia" w:hAnsi="Georgia"/>
+          <w:sz w:val="21"/>
+          <w:szCs w:val="21"/>
+        </w:rPr>
+        <w:t xml:space="preserve">Obrigado por apagar a luz.</w:t>
+      </w:r>
+    </w:p>
+    <w:p>
+      <w:pPr>
+        <w:spacing w:after="0" w:line="312"/>
+        <w:ind w:firstLine="340"/>
+        <w:jc w:val="both"/>
+      </w:pPr>
+      <w:r>
+        <w:rPr>
+          <w:rFonts w:ascii="Georgia" w:cs="Georgia" w:eastAsia="Georgia" w:hAnsi="Georgia"/>
+          <w:sz w:val="21"/>
+          <w:szCs w:val="21"/>
+        </w:rPr>
+        <w:t xml:space="preserve">O pai tinha escrito aquilo como quem agradece ao último a sair de uma festa. Quem apaga a luz é o que fica para fechar a casa depois que todo mundo foi embora. Lucas entendeu, sentado no carro escuro, que o doutor Álvaro tinha apagado a luz. Só que com o pai ainda lá dentro.</w:t>
+      </w:r>
+    </w:p>
+    <w:p>
+      <w:pPr>
+        <w:spacing w:after="200" w:before="200"/>
+        <w:jc w:val="center"/>
+      </w:pPr>
+      <w:r>
+        <w:rPr>
+          <w:rFonts w:ascii="Georgia" w:cs="Georgia" w:eastAsia="Georgia" w:hAnsi="Georgia"/>
+          <w:sz w:val="22"/>
+          <w:szCs w:val="22"/>
+        </w:rPr>
+        <w:t xml:space="preserve">*</w:t>
+      </w:r>
+    </w:p>
+    <w:p>
+      <w:pPr>
+        <w:spacing w:after="0" w:line="312"/>
+        <w:ind w:firstLine="340"/>
+        <w:jc w:val="both"/>
+      </w:pPr>
+      <w:r>
+        <w:rPr>
+          <w:rFonts w:ascii="Georgia" w:cs="Georgia" w:eastAsia="Georgia" w:hAnsi="Georgia"/>
+          <w:sz w:val="21"/>
+          <w:szCs w:val="21"/>
+        </w:rPr>
+        <w:t xml:space="preserve">Na terça de manhã, às oito e dez, Lucas ligou para o consultório da Avenida Angélica.</w:t>
+      </w:r>
+    </w:p>
+    <w:p>
+      <w:pPr>
+        <w:spacing w:after="0" w:line="312"/>
+        <w:ind w:firstLine="340"/>
+        <w:jc w:val="both"/>
+      </w:pPr>
+      <w:r>
+        <w:rPr>
+          <w:rFonts w:ascii="Georgia" w:cs="Georgia" w:eastAsia="Georgia" w:hAnsi="Georgia"/>
+          <w:sz w:val="21"/>
+          <w:szCs w:val="21"/>
+        </w:rPr>
+        <w:t xml:space="preserve">Tinha decidido ir até lá e olhar na cara do médico, como tinha olhado na cara de Otávio. Não tinha decidido o que ia dizer. Talvez nada. Talvez só pôr o frasco vazio sobre a mesa e esperar.</w:t>
+      </w:r>
+    </w:p>
+    <w:p>
+      <w:pPr>
+        <w:spacing w:after="0" w:line="312"/>
+        <w:ind w:firstLine="340"/>
+        <w:jc w:val="both"/>
+      </w:pPr>
+      <w:r>
+        <w:rPr>
+          <w:rFonts w:ascii="Georgia" w:cs="Georgia" w:eastAsia="Georgia" w:hAnsi="Georgia"/>
+          <w:sz w:val="21"/>
+          <w:szCs w:val="21"/>
+        </w:rPr>
+        <w:t xml:space="preserve">Dona Neusa atendeu com a voz atrapalhada de quem estava no meio de uma confusão.</w:t>
+      </w:r>
+    </w:p>
+    <w:p>
+      <w:pPr>
+        <w:spacing w:after="0" w:line="312"/>
+        <w:ind w:firstLine="340"/>
+        <w:jc w:val="both"/>
+      </w:pPr>
+      <w:r>
+        <w:rPr>
+          <w:rFonts w:ascii="Georgia" w:cs="Georgia" w:eastAsia="Georgia" w:hAnsi="Georgia"/>
+          <w:sz w:val="21"/>
+          <w:szCs w:val="21"/>
+        </w:rPr>
+        <w:t xml:space="preserve">— Menino Lucas! Ai, meu Deus, hoje é dia de Salvallus. A sua irmã acabou de sair daqui.</w:t>
+      </w:r>
+    </w:p>
+    <w:p>
+      <w:pPr>
+        <w:spacing w:after="0" w:line="312"/>
+        <w:ind w:firstLine="340"/>
+        <w:jc w:val="both"/>
+      </w:pPr>
+      <w:r>
+        <w:rPr>
+          <w:rFonts w:ascii="Georgia" w:cs="Georgia" w:eastAsia="Georgia" w:hAnsi="Georgia"/>
+          <w:sz w:val="21"/>
+          <w:szCs w:val="21"/>
+        </w:rPr>
+        <w:t xml:space="preserve">Lucas ficou imóvel.</w:t>
+      </w:r>
+    </w:p>
+    <w:p>
+      <w:pPr>
+        <w:spacing w:after="0" w:line="312"/>
+        <w:ind w:firstLine="340"/>
+        <w:jc w:val="both"/>
+      </w:pPr>
+      <w:r>
+        <w:rPr>
+          <w:rFonts w:ascii="Georgia" w:cs="Georgia" w:eastAsia="Georgia" w:hAnsi="Georgia"/>
+          <w:sz w:val="21"/>
+          <w:szCs w:val="21"/>
+        </w:rPr>
+        <w:t xml:space="preserve">— A Lia?</w:t>
+      </w:r>
+    </w:p>
+    <w:p>
+      <w:pPr>
+        <w:spacing w:after="0" w:line="312"/>
+        <w:ind w:firstLine="340"/>
+        <w:jc w:val="both"/>
+      </w:pPr>
+      <w:r>
+        <w:rPr>
+          <w:rFonts w:ascii="Georgia" w:cs="Georgia" w:eastAsia="Georgia" w:hAnsi="Georgia"/>
+          <w:sz w:val="21"/>
+          <w:szCs w:val="21"/>
+        </w:rPr>
+        <w:t xml:space="preserve">— Marcou o primeiro horário, sete e meia. Chegou às sete e quinze. E o doutor não veio. — Dona Neusa suspirou. — Ele ligou às sete e vinte, da casa dele. Disse que não estava bem, que ia tirar uns dias, para eu desmarcar a semana inteira. Nunca fez isso, menino, em vinte anos. A sua irmã ficou sentada ali na sala de espera, branca, segurando a bolsa no colo. Esperou até as oito. Depois foi embora sem dizer nada.</w:t>
+      </w:r>
+    </w:p>
+    <w:p>
+      <w:pPr>
+        <w:spacing w:after="0" w:line="312"/>
+        <w:ind w:firstLine="340"/>
+        <w:jc w:val="both"/>
+      </w:pPr>
+      <w:r>
+        <w:rPr>
+          <w:rFonts w:ascii="Georgia" w:cs="Georgia" w:eastAsia="Georgia" w:hAnsi="Georgia"/>
+          <w:sz w:val="21"/>
+          <w:szCs w:val="21"/>
+        </w:rPr>
+        <w:t xml:space="preserve">— Ela disse o que queria com ele?</w:t>
+      </w:r>
+    </w:p>
+    <w:p>
+      <w:pPr>
+        <w:spacing w:after="0" w:line="312"/>
+        <w:ind w:firstLine="340"/>
+        <w:jc w:val="both"/>
+      </w:pPr>
+      <w:r>
+        <w:rPr>
+          <w:rFonts w:ascii="Georgia" w:cs="Georgia" w:eastAsia="Georgia" w:hAnsi="Georgia"/>
+          <w:sz w:val="21"/>
+          <w:szCs w:val="21"/>
+        </w:rPr>
+        <w:t xml:space="preserve">— Não. Só perguntou se ele tinha algum outro consultório. Ou alguma casa fora de São Paulo. Eu falei do sítio de Cotia. — Uma pausa. — Menino, aconteceu alguma coisa? Vocês dois estão com uma cara…</w:t>
+      </w:r>
+    </w:p>
+    <w:p>
+      <w:pPr>
+        <w:spacing w:after="0" w:line="312"/>
+        <w:ind w:firstLine="340"/>
+        <w:jc w:val="both"/>
+      </w:pPr>
+      <w:r>
+        <w:rPr>
+          <w:rFonts w:ascii="Georgia" w:cs="Georgia" w:eastAsia="Georgia" w:hAnsi="Georgia"/>
+          <w:sz w:val="21"/>
+          <w:szCs w:val="21"/>
+        </w:rPr>
+        <w:t xml:space="preserve">Lucas agradeceu e desligou.</w:t>
+      </w:r>
+    </w:p>
+    <w:p>
+      <w:pPr>
+        <w:spacing w:after="0" w:line="312"/>
+        <w:ind w:firstLine="340"/>
+        <w:jc w:val="both"/>
+      </w:pPr>
+      <w:r>
+        <w:rPr>
+          <w:rFonts w:ascii="Georgia" w:cs="Georgia" w:eastAsia="Georgia" w:hAnsi="Georgia"/>
+          <w:sz w:val="21"/>
+          <w:szCs w:val="21"/>
+        </w:rPr>
+        <w:t xml:space="preserve">Lia sabia. Tinha chegado ao mesmo lugar, sozinha, por algum caminho que ele não conhecia. E tinha ido enfrentar o médico sozinha, às sete e meia da manhã, sem dizer uma palavra a ele, quatro dias antes do sábado sem listas.</w:t>
+      </w:r>
+    </w:p>
+    <w:p>
+      <w:pPr>
+        <w:spacing w:after="0" w:line="312"/>
+        <w:ind w:firstLine="340"/>
+        <w:jc w:val="both"/>
+      </w:pPr>
+      <w:r>
+        <w:rPr>
+          <w:rFonts w:ascii="Georgia" w:cs="Georgia" w:eastAsia="Georgia" w:hAnsi="Georgia"/>
+          <w:sz w:val="21"/>
+          <w:szCs w:val="21"/>
+        </w:rPr>
+        <w:t xml:space="preserve">Ele pensou em ligar para ela. Pegou o celular. Olhou para o nome dela na tela.</w:t>
+      </w:r>
+    </w:p>
+    <w:p>
+      <w:pPr>
+        <w:spacing w:after="0" w:line="312"/>
+        <w:ind w:firstLine="340"/>
+        <w:jc w:val="both"/>
+      </w:pPr>
+      <w:r>
+        <w:rPr>
+          <w:rFonts w:ascii="Georgia" w:cs="Georgia" w:eastAsia="Georgia" w:hAnsi="Georgia"/>
+          <w:sz w:val="21"/>
+          <w:szCs w:val="21"/>
+        </w:rPr>
+        <w:t xml:space="preserve">Pensou num homem que tinha deixado o melhor amigo descer vivo para dentro de um forno. Que agora sabia que alguém da família estava atrás dele, porque uma Salvallus tinha marcado o primeiro horário da manhã e ele fugira vinte minutos antes. Um homem assim não tinha mais nada a perder.</w:t>
+      </w:r>
+    </w:p>
+    <w:p>
+      <w:pPr>
+        <w:spacing w:after="0" w:line="312"/>
+        <w:ind w:firstLine="340"/>
+        <w:jc w:val="both"/>
+      </w:pPr>
+      <w:r>
+        <w:rPr>
+          <w:rFonts w:ascii="Georgia" w:cs="Georgia" w:eastAsia="Georgia" w:hAnsi="Georgia"/>
+          <w:sz w:val="21"/>
+          <w:szCs w:val="21"/>
+        </w:rPr>
+        <w:t xml:space="preserve">Se Lia estava procurando o médico, Lucas precisava encontrá-lo antes dela.</w:t>
+      </w:r>
+    </w:p>
+    <w:p>
+      <w:pPr>
+        <w:spacing w:after="0" w:line="312"/>
+        <w:ind w:firstLine="340"/>
+        <w:jc w:val="both"/>
+      </w:pPr>
+      <w:r>
+        <w:rPr>
+          <w:rFonts w:ascii="Georgia" w:cs="Georgia" w:eastAsia="Georgia" w:hAnsi="Georgia"/>
+          <w:sz w:val="21"/>
+          <w:szCs w:val="21"/>
+        </w:rPr>
+        <w:t xml:space="preserve">Guardou o celular sem ligar.</w:t>
+      </w:r>
+    </w:p>
+    <w:p>
+      <w:pPr>
+        <w:spacing w:after="200" w:before="200"/>
+        <w:jc w:val="center"/>
+      </w:pPr>
+      <w:r>
+        <w:rPr>
+          <w:rFonts w:ascii="Georgia" w:cs="Georgia" w:eastAsia="Georgia" w:hAnsi="Georgia"/>
+          <w:sz w:val="22"/>
+          <w:szCs w:val="22"/>
+        </w:rPr>
+        <w:t xml:space="preserve">*</w:t>
+      </w:r>
+    </w:p>
+    <w:p>
+      <w:pPr>
+        <w:spacing w:after="0" w:line="312"/>
+        <w:ind w:firstLine="340"/>
+        <w:jc w:val="both"/>
+      </w:pPr>
+      <w:r>
+        <w:rPr>
+          <w:rFonts w:ascii="Georgia" w:cs="Georgia" w:eastAsia="Georgia" w:hAnsi="Georgia"/>
+          <w:sz w:val="21"/>
+          <w:szCs w:val="21"/>
+        </w:rPr>
+        <w:t xml:space="preserve">Valdir atendeu no segundo toque.</w:t>
+      </w:r>
+    </w:p>
+    <w:p>
+      <w:pPr>
+        <w:spacing w:after="0" w:line="312"/>
+        <w:ind w:firstLine="340"/>
+        <w:jc w:val="both"/>
+      </w:pPr>
+      <w:r>
+        <w:rPr>
+          <w:rFonts w:ascii="Georgia" w:cs="Georgia" w:eastAsia="Georgia" w:hAnsi="Georgia"/>
+          <w:sz w:val="21"/>
+          <w:szCs w:val="21"/>
+        </w:rPr>
+        <w:t xml:space="preserve">— Seu Lucas. Tudo bem?</w:t>
+      </w:r>
+    </w:p>
+    <w:p>
+      <w:pPr>
+        <w:spacing w:after="0" w:line="312"/>
+        <w:ind w:firstLine="340"/>
+        <w:jc w:val="both"/>
+      </w:pPr>
+      <w:r>
+        <w:rPr>
+          <w:rFonts w:ascii="Georgia" w:cs="Georgia" w:eastAsia="Georgia" w:hAnsi="Georgia"/>
+          <w:sz w:val="21"/>
+          <w:szCs w:val="21"/>
+        </w:rPr>
+        <w:t xml:space="preserve">— Valdir, o senhor disse uma vez à minha irmã que ainda tem amigos na polícia.</w:t>
+      </w:r>
+    </w:p>
+    <w:p>
+      <w:pPr>
+        <w:spacing w:after="0" w:line="312"/>
+        <w:ind w:firstLine="340"/>
+        <w:jc w:val="both"/>
+      </w:pPr>
+      <w:r>
+        <w:rPr>
+          <w:rFonts w:ascii="Georgia" w:cs="Georgia" w:eastAsia="Georgia" w:hAnsi="Georgia"/>
+          <w:sz w:val="21"/>
+          <w:szCs w:val="21"/>
+        </w:rPr>
+        <w:t xml:space="preserve">— Alguns. Os que ainda me atendem. — O ex-policial ficou em silêncio um instante. — O que o senhor precisa?</w:t>
+      </w:r>
+    </w:p>
+    <w:p>
+      <w:pPr>
+        <w:spacing w:after="0" w:line="312"/>
+        <w:ind w:firstLine="340"/>
+        <w:jc w:val="both"/>
+      </w:pPr>
+      <w:r>
+        <w:rPr>
+          <w:rFonts w:ascii="Georgia" w:cs="Georgia" w:eastAsia="Georgia" w:hAnsi="Georgia"/>
+          <w:sz w:val="21"/>
+          <w:szCs w:val="21"/>
+        </w:rPr>
+        <w:t xml:space="preserve">— Saber se um homem vai sair do país. Nome, Álvaro Mendes. Médico. Uns sessenta e poucos anos.</w:t>
+      </w:r>
+    </w:p>
+    <w:p>
+      <w:pPr>
+        <w:spacing w:after="0" w:line="312"/>
+        <w:ind w:firstLine="340"/>
+        <w:jc w:val="both"/>
+      </w:pPr>
+      <w:r>
+        <w:rPr>
+          <w:rFonts w:ascii="Georgia" w:cs="Georgia" w:eastAsia="Georgia" w:hAnsi="Georgia"/>
+          <w:sz w:val="21"/>
+          <w:szCs w:val="21"/>
+        </w:rPr>
+        <w:t xml:space="preserve">Do outro lado, um silêncio mais longo.</w:t>
+      </w:r>
+    </w:p>
+    <w:p>
+      <w:pPr>
+        <w:spacing w:after="0" w:line="312"/>
+        <w:ind w:firstLine="340"/>
+        <w:jc w:val="both"/>
+      </w:pPr>
+      <w:r>
+        <w:rPr>
+          <w:rFonts w:ascii="Georgia" w:cs="Georgia" w:eastAsia="Georgia" w:hAnsi="Georgia"/>
+          <w:sz w:val="21"/>
+          <w:szCs w:val="21"/>
+        </w:rPr>
+        <w:t xml:space="preserve">— O doutor Álvaro? O médico do seu pai?</w:t>
+      </w:r>
+    </w:p>
+    <w:p>
+      <w:pPr>
+        <w:spacing w:after="0" w:line="312"/>
+        <w:ind w:firstLine="340"/>
+        <w:jc w:val="both"/>
+      </w:pPr>
+      <w:r>
+        <w:rPr>
+          <w:rFonts w:ascii="Georgia" w:cs="Georgia" w:eastAsia="Georgia" w:hAnsi="Georgia"/>
+          <w:sz w:val="21"/>
+          <w:szCs w:val="21"/>
+        </w:rPr>
+        <w:t xml:space="preserve">— Ele mesmo.</w:t>
+      </w:r>
+    </w:p>
+    <w:p>
+      <w:pPr>
+        <w:spacing w:after="0" w:line="312"/>
+        <w:ind w:firstLine="340"/>
+        <w:jc w:val="both"/>
+      </w:pPr>
+      <w:r>
+        <w:rPr>
+          <w:rFonts w:ascii="Georgia" w:cs="Georgia" w:eastAsia="Georgia" w:hAnsi="Georgia"/>
+          <w:sz w:val="21"/>
+          <w:szCs w:val="21"/>
+        </w:rPr>
+        <w:t xml:space="preserve">— Seu Lucas… — Valdir suspirou. — Eu tenho um amigo no aeroporto, na Federal. Não prometo nada. E se ele me perguntar por quê?</w:t>
+      </w:r>
+    </w:p>
+    <w:p>
+      <w:pPr>
+        <w:spacing w:after="0" w:line="312"/>
+        <w:ind w:firstLine="340"/>
+        <w:jc w:val="both"/>
+      </w:pPr>
+      <w:r>
+        <w:rPr>
+          <w:rFonts w:ascii="Georgia" w:cs="Georgia" w:eastAsia="Georgia" w:hAnsi="Georgia"/>
+          <w:sz w:val="21"/>
+          <w:szCs w:val="21"/>
+        </w:rPr>
+        <w:t xml:space="preserve">— Diz que é pela família de um homem que o senhor protegeu durante cinco meses e que morreu mesmo assim.</w:t>
+      </w:r>
+    </w:p>
+    <w:p>
+      <w:pPr>
+        <w:spacing w:after="0" w:line="312"/>
+        <w:ind w:firstLine="340"/>
+        <w:jc w:val="both"/>
+      </w:pPr>
+      <w:r>
+        <w:rPr>
+          <w:rFonts w:ascii="Georgia" w:cs="Georgia" w:eastAsia="Georgia" w:hAnsi="Georgia"/>
+          <w:sz w:val="21"/>
+          <w:szCs w:val="21"/>
+        </w:rPr>
+        <w:t xml:space="preserve">Valdir ligou de volta às quatro da tarde.</w:t>
+      </w:r>
+    </w:p>
+    <w:p>
+      <w:pPr>
+        <w:spacing w:after="0" w:line="312"/>
+        <w:ind w:firstLine="340"/>
+        <w:jc w:val="both"/>
+      </w:pPr>
+      <w:r>
+        <w:rPr>
+          <w:rFonts w:ascii="Georgia" w:cs="Georgia" w:eastAsia="Georgia" w:hAnsi="Georgia"/>
+          <w:sz w:val="21"/>
+          <w:szCs w:val="21"/>
+        </w:rPr>
+        <w:t xml:space="preserve">— Comprou hoje de manhã — disse, sem rodeios. — Às nove e pouco, numa agência da Paulista, à vista. Guarulhos para Zurique. Só ida. Quinta-feira, voo das onze da noite.</w:t>
+      </w:r>
+    </w:p>
+    <w:p>
+      <w:pPr>
+        <w:spacing w:after="0" w:line="312"/>
+        <w:ind w:firstLine="340"/>
+        <w:jc w:val="both"/>
+      </w:pPr>
+      <w:r>
+        <w:rPr>
+          <w:rFonts w:ascii="Georgia" w:cs="Georgia" w:eastAsia="Georgia" w:hAnsi="Georgia"/>
+          <w:sz w:val="21"/>
+          <w:szCs w:val="21"/>
+        </w:rPr>
+        <w:t xml:space="preserve">Lucas fechou os olhos.</w:t>
+      </w:r>
+    </w:p>
+    <w:p>
+      <w:pPr>
+        <w:spacing w:after="0" w:line="312"/>
+        <w:ind w:firstLine="340"/>
+        <w:jc w:val="both"/>
+      </w:pPr>
+      <w:r>
+        <w:rPr>
+          <w:rFonts w:ascii="Georgia" w:cs="Georgia" w:eastAsia="Georgia" w:hAnsi="Georgia"/>
+          <w:sz w:val="21"/>
+          <w:szCs w:val="21"/>
+        </w:rPr>
+        <w:t xml:space="preserve">Zurique. A cidade da conta da Ubatuba Holdings. A cidade do passaporte com outro nome. A cidade do lugar com neve, das doze janelas, do cartão-postal que o pai prometera à filha. O médico não estava fugindo para um lugar qualquer. Estava indo, sozinho, para a vida que tinha sido planejada para o pai.</w:t>
+      </w:r>
+    </w:p>
+    <w:p>
+      <w:pPr>
+        <w:spacing w:after="0" w:line="312"/>
+        <w:ind w:firstLine="340"/>
+        <w:jc w:val="both"/>
+      </w:pPr>
+      <w:r>
+        <w:rPr>
+          <w:rFonts w:ascii="Georgia" w:cs="Georgia" w:eastAsia="Georgia" w:hAnsi="Georgia"/>
+          <w:sz w:val="21"/>
+          <w:szCs w:val="21"/>
+        </w:rPr>
+        <w:t xml:space="preserve">— Seu Lucas? — disse Valdir. — Seu Lucas, o senhor vai avisar a polícia, não vai?</w:t>
+      </w:r>
+    </w:p>
+    <w:p>
+      <w:pPr>
+        <w:spacing w:after="0" w:line="312"/>
+        <w:ind w:firstLine="340"/>
+        <w:jc w:val="both"/>
+      </w:pPr>
+      <w:r>
+        <w:rPr>
+          <w:rFonts w:ascii="Georgia" w:cs="Georgia" w:eastAsia="Georgia" w:hAnsi="Georgia"/>
+          <w:sz w:val="21"/>
+          <w:szCs w:val="21"/>
+        </w:rPr>
+        <w:t xml:space="preserve">— Vou — disse Lucas.</w:t>
+      </w:r>
+    </w:p>
+    <w:p>
+      <w:pPr>
+        <w:spacing w:after="0" w:line="312"/>
+        <w:ind w:firstLine="340"/>
+        <w:jc w:val="both"/>
+      </w:pPr>
+      <w:r>
+        <w:rPr>
+          <w:rFonts w:ascii="Georgia" w:cs="Georgia" w:eastAsia="Georgia" w:hAnsi="Georgia"/>
+          <w:sz w:val="21"/>
+          <w:szCs w:val="21"/>
+        </w:rPr>
+        <w:t xml:space="preserve">Não disse quando.</w:t>
+      </w:r>
+    </w:p>
+    <w:p>
+      <w:pPr>
+        <w:spacing w:after="200" w:before="200"/>
+        <w:jc w:val="center"/>
+      </w:pPr>
+      <w:r>
+        <w:rPr>
+          <w:rFonts w:ascii="Georgia" w:cs="Georgia" w:eastAsia="Georgia" w:hAnsi="Georgia"/>
+          <w:sz w:val="22"/>
+          <w:szCs w:val="22"/>
+        </w:rPr>
+        <w:t xml:space="preserve">*</w:t>
+      </w:r>
+    </w:p>
+    <w:p>
+      <w:pPr>
+        <w:spacing w:after="0" w:line="312"/>
+        <w:ind w:firstLine="340"/>
+        <w:jc w:val="both"/>
+      </w:pPr>
+      <w:r>
+        <w:rPr>
+          <w:rFonts w:ascii="Georgia" w:cs="Georgia" w:eastAsia="Georgia" w:hAnsi="Georgia"/>
+          <w:sz w:val="21"/>
+          <w:szCs w:val="21"/>
+        </w:rPr>
+        <w:t xml:space="preserve">Na quinta-feira, às oito da noite, Lucas saiu da corretora sem se despedir de ninguém.</w:t>
+      </w:r>
+    </w:p>
+    <w:p>
+      <w:pPr>
+        <w:spacing w:after="0" w:line="312"/>
+        <w:ind w:firstLine="340"/>
+        <w:jc w:val="both"/>
+      </w:pPr>
+      <w:r>
+        <w:rPr>
+          <w:rFonts w:ascii="Georgia" w:cs="Georgia" w:eastAsia="Georgia" w:hAnsi="Georgia"/>
+          <w:sz w:val="21"/>
+          <w:szCs w:val="21"/>
+        </w:rPr>
+        <w:t xml:space="preserve">Tinha passado dois dias ensaiando o telefonema para a delegada Regina Paiva e não tinha feito. Disse a si mesmo que faltava prova. Que um frasco vazio, uma gaveta sem cimento e uma vizinha de olho mágico não convenciam um juiz. Que, se a polícia chegasse antes, o médico negaria tudo, chamaria um advogado, e eles nunca saberiam o que tinha acontecido dentro daquela casa entre as sete e cinco e as oito e doze.</w:t>
+      </w:r>
+    </w:p>
+    <w:p>
+      <w:pPr>
+        <w:spacing w:after="0" w:line="312"/>
+        <w:ind w:firstLine="340"/>
+        <w:jc w:val="both"/>
+      </w:pPr>
+      <w:r>
+        <w:rPr>
+          <w:rFonts w:ascii="Georgia" w:cs="Georgia" w:eastAsia="Georgia" w:hAnsi="Georgia"/>
+          <w:sz w:val="21"/>
+          <w:szCs w:val="21"/>
+        </w:rPr>
+        <w:t xml:space="preserve">Era tudo verdade. Não era tudo.</w:t>
+      </w:r>
+    </w:p>
+    <w:p>
+      <w:pPr>
+        <w:spacing w:after="0" w:line="312"/>
+        <w:ind w:firstLine="340"/>
+        <w:jc w:val="both"/>
+      </w:pPr>
+      <w:r>
+        <w:rPr>
+          <w:rFonts w:ascii="Georgia" w:cs="Georgia" w:eastAsia="Georgia" w:hAnsi="Georgia"/>
+          <w:sz w:val="21"/>
+          <w:szCs w:val="21"/>
+        </w:rPr>
+        <w:t xml:space="preserve">A verdade inteira era que ele queria ouvir da boca daquele homem. Antes da polícia, antes dos advogados, antes de qualquer pessoa. Queria ver o rosto do doutor Álvaro quando ele dissesse em voz alta o que tinha feito com o pai.</w:t>
+      </w:r>
+    </w:p>
+    <w:p>
+      <w:pPr>
+        <w:spacing w:after="0" w:line="312"/>
+        <w:ind w:firstLine="340"/>
+        <w:jc w:val="both"/>
+      </w:pPr>
+      <w:r>
+        <w:rPr>
+          <w:rFonts w:ascii="Georgia" w:cs="Georgia" w:eastAsia="Georgia" w:hAnsi="Georgia"/>
+          <w:sz w:val="21"/>
+          <w:szCs w:val="21"/>
+        </w:rPr>
+        <w:t xml:space="preserve">Pegou a Marginal do Tietê com o rádio desligado. O trânsito andava devagar, uma fila de luzes vermelhas até onde a vista alcançava. No banco do passageiro, dentro do envelope pardo, a ata da Ubatuba Holdings, a carta do pai e, embrulhado num lenço, o frasco vazio de dona Zilá.</w:t>
+      </w:r>
+    </w:p>
+    <w:p>
+      <w:pPr>
+        <w:spacing w:after="0" w:line="312"/>
+        <w:ind w:firstLine="340"/>
+        <w:jc w:val="both"/>
+      </w:pPr>
+      <w:r>
+        <w:rPr>
+          <w:rFonts w:ascii="Georgia" w:cs="Georgia" w:eastAsia="Georgia" w:hAnsi="Georgia"/>
+          <w:sz w:val="21"/>
+          <w:szCs w:val="21"/>
+        </w:rPr>
+        <w:t xml:space="preserve">Às nove e quarenta, entrou no estacionamento do Terminal 3 de Guarulhos. Rodou dois andares procurando vaga. No terceiro, encontrou uma, no fim de uma fileira, ao lado de um pilar de concreto.</w:t>
+      </w:r>
+    </w:p>
+    <w:p>
+      <w:pPr>
+        <w:spacing w:after="0" w:line="312"/>
+        <w:ind w:firstLine="340"/>
+        <w:jc w:val="both"/>
+      </w:pPr>
+      <w:r>
+        <w:rPr>
+          <w:rFonts w:ascii="Georgia" w:cs="Georgia" w:eastAsia="Georgia" w:hAnsi="Georgia"/>
+          <w:sz w:val="21"/>
+          <w:szCs w:val="21"/>
+        </w:rPr>
+        <w:t xml:space="preserve">Desligou o motor. Pegou o envelope. Abriu a porta.</w:t>
+      </w:r>
+    </w:p>
+    <w:p>
+      <w:pPr>
+        <w:spacing w:after="0" w:line="312"/>
+        <w:ind w:firstLine="340"/>
+        <w:jc w:val="both"/>
+      </w:pPr>
+      <w:r>
+        <w:rPr>
+          <w:rFonts w:ascii="Georgia" w:cs="Georgia" w:eastAsia="Georgia" w:hAnsi="Georgia"/>
+          <w:sz w:val="21"/>
+          <w:szCs w:val="21"/>
+        </w:rPr>
+        <w:t xml:space="preserve">E parou com um pé no chão.</w:t>
+      </w:r>
+    </w:p>
+    <w:p>
+      <w:pPr>
+        <w:spacing w:after="0" w:line="312"/>
+        <w:ind w:firstLine="340"/>
+        <w:jc w:val="both"/>
+      </w:pPr>
+      <w:r>
+        <w:rPr>
+          <w:rFonts w:ascii="Georgia" w:cs="Georgia" w:eastAsia="Georgia" w:hAnsi="Georgia"/>
+          <w:sz w:val="21"/>
+          <w:szCs w:val="21"/>
+        </w:rPr>
+        <w:t xml:space="preserve">Na vaga do outro lado do pilar, estacionado torto, às pressas, com uma das rodas em cima da faixa amarela, estava um carro que ele conhecia. Prata metálico, com um adesivo de escritório de arquitetura no vidro de trás e um desenho de criança preso no quebra-sol, uma casa com doze janelas.</w:t>
+      </w:r>
+    </w:p>
+    <w:p>
+      <w:pPr>
+        <w:spacing w:after="0" w:line="312"/>
+        <w:ind w:firstLine="340"/>
+        <w:jc w:val="both"/>
+      </w:pPr>
+      <w:r>
+        <w:rPr>
+          <w:rFonts w:ascii="Georgia" w:cs="Georgia" w:eastAsia="Georgia" w:hAnsi="Georgia"/>
+          <w:sz w:val="21"/>
+          <w:szCs w:val="21"/>
+        </w:rPr>
+        <w:t xml:space="preserve">O carro de Lia.</w:t>
+      </w:r>
+    </w:p>
+    <w:p>
+      <w:pPr>
+        <w:spacing w:after="0" w:line="312"/>
+        <w:ind w:firstLine="340"/>
+        <w:jc w:val="both"/>
+      </w:pPr>
+      <w:r>
+        <w:rPr>
+          <w:rFonts w:ascii="Georgia" w:cs="Georgia" w:eastAsia="Georgia" w:hAnsi="Georgia"/>
+          <w:sz w:val="21"/>
+          <w:szCs w:val="21"/>
+        </w:rPr>
+        <w:t xml:space="preserve">O capô ainda estava quente quando ele encostou a mão.</w:t>
       </w:r>
     </w:p>
     <w:sectPr>

</xml_diff>

<commit_message>
Livro policial: ajustes no capítulo 28 (frasco cheio, carro de Lia) e data do segurança
Co-Authored-By: Claude Opus 5.5 <noreply@anthropic.com>
Claude-Session: https://claude.ai/code/session_01BrurxSYygRC3rRhaUYosm1
</commit_message>
<xml_diff>
--- a/docs/livro-policial/TODO_CRIME_TEM_UM_AUTOR.docx
+++ b/docs/livro-policial/TODO_CRIME_TEM_UM_AUTOR.docx
@@ -30465,7 +30465,7 @@
           <w:sz w:val="21"/>
           <w:szCs w:val="21"/>
         </w:rPr>
-        <w:t xml:space="preserve">Um frasco âmbar, do tamanho de um dedo, com tampa de rosca e nenhum rótulo. Vazio.</w:t>
+        <w:t xml:space="preserve">Um frasco âmbar, do tamanho de um dedo, com tampa de rosca e nenhum rótulo. Cheio até a boca de um líquido transparente, que ninguém tinha usado.</w:t>
       </w:r>
     </w:p>
     <w:p>
@@ -30554,7 +30554,7 @@
           <w:sz w:val="21"/>
           <w:szCs w:val="21"/>
         </w:rPr>
-        <w:t xml:space="preserve">Lucas abriu a mão e olhou para o frasco vazio.</w:t>
+        <w:t xml:space="preserve">Lucas abriu a mão e olhou para o frasco cheio.</w:t>
       </w:r>
     </w:p>
     <w:p>
@@ -30767,7 +30767,7 @@
           <w:sz w:val="21"/>
           <w:szCs w:val="21"/>
         </w:rPr>
-        <w:t xml:space="preserve">Tinha decidido ir até lá e olhar na cara do médico, como tinha olhado na cara de Otávio. Não tinha decidido o que ia dizer. Talvez nada. Talvez só pôr o frasco vazio sobre a mesa e esperar.</w:t>
+        <w:t xml:space="preserve">Tinha decidido ir até lá e olhar na cara do médico, como tinha olhado na cara de Otávio. Não tinha decidido o que ia dizer. Talvez nada. Talvez só pôr o frasco cheio sobre a mesa e esperar.</w:t>
       </w:r>
     </w:p>
     <w:p>
@@ -31021,7 +31021,7 @@
           <w:sz w:val="21"/>
           <w:szCs w:val="21"/>
         </w:rPr>
-        <w:t xml:space="preserve">— Valdir, o senhor disse uma vez à minha irmã que ainda tem amigos na polícia.</w:t>
+        <w:t xml:space="preserve">— Valdir, o senhor foi policial. Ainda tem amigos lá?</w:t>
       </w:r>
     </w:p>
     <w:p>
@@ -31126,7 +31126,7 @@
           <w:sz w:val="21"/>
           <w:szCs w:val="21"/>
         </w:rPr>
-        <w:t xml:space="preserve">— Diz que é pela família de um homem que o senhor protegeu durante cinco meses e que morreu mesmo assim.</w:t>
+        <w:t xml:space="preserve">— Diz que é pela família de um homem que o senhor protegeu durante sete meses e que morreu mesmo assim.</w:t>
       </w:r>
     </w:p>
     <w:p>
@@ -31275,7 +31275,7 @@
           <w:sz w:val="21"/>
           <w:szCs w:val="21"/>
         </w:rPr>
-        <w:t xml:space="preserve">Tinha passado dois dias ensaiando o telefonema para a delegada Regina Paiva e não tinha feito. Disse a si mesmo que faltava prova. Que um frasco vazio, uma gaveta sem cimento e uma vizinha de olho mágico não convenciam um juiz. Que, se a polícia chegasse antes, o médico negaria tudo, chamaria um advogado, e eles nunca saberiam o que tinha acontecido dentro daquela casa entre as sete e cinco e as oito e doze.</w:t>
+        <w:t xml:space="preserve">Tinha passado dois dias ensaiando o telefonema para a delegada Regina Paiva e não tinha feito. Disse a si mesmo que faltava prova. Que um frasco cheio, uma gaveta sem cimento e uma vizinha de olho mágico não convenciam um juiz. Que, se a polícia chegasse antes, o médico negaria tudo, chamaria um advogado, e eles nunca saberiam o que tinha acontecido dentro daquela casa entre as sete e cinco e as oito e doze.</w:t>
       </w:r>
     </w:p>
     <w:p>
@@ -31320,22 +31320,22 @@
           <w:sz w:val="21"/>
           <w:szCs w:val="21"/>
         </w:rPr>
-        <w:t xml:space="preserve">Pegou a Marginal do Tietê com o rádio desligado. O trânsito andava devagar, uma fila de luzes vermelhas até onde a vista alcançava. No banco do passageiro, dentro do envelope pardo, a ata da Ubatuba Holdings, a carta do pai e, embrulhado num lenço, o frasco vazio de dona Zilá.</w:t>
-      </w:r>
-    </w:p>
-    <w:p>
-      <w:pPr>
-        <w:spacing w:after="0" w:line="312"/>
-        <w:ind w:firstLine="340"/>
-        <w:jc w:val="both"/>
-      </w:pPr>
-      <w:r>
-        <w:rPr>
-          <w:rFonts w:ascii="Georgia" w:cs="Georgia" w:eastAsia="Georgia" w:hAnsi="Georgia"/>
-          <w:sz w:val="21"/>
-          <w:szCs w:val="21"/>
-        </w:rPr>
-        <w:t xml:space="preserve">Às nove e quarenta, entrou no estacionamento do Terminal 3 de Guarulhos. Rodou dois andares procurando vaga. No terceiro, encontrou uma, no fim de uma fileira, ao lado de um pilar de concreto.</w:t>
+        <w:t xml:space="preserve">Pegou a Marginal do Tietê com o rádio desligado. O trânsito andava devagar, uma fila de luzes vermelhas até onde a vista alcançava. No banco do passageiro, dentro do envelope pardo, a ata da Ubatuba Holdings, a carta do pai e, embrulhado num lenço, o frasco cheio de dona Zilá.</w:t>
+      </w:r>
+    </w:p>
+    <w:p>
+      <w:pPr>
+        <w:spacing w:after="0" w:line="312"/>
+        <w:ind w:firstLine="340"/>
+        <w:jc w:val="both"/>
+      </w:pPr>
+      <w:r>
+        <w:rPr>
+          <w:rFonts w:ascii="Georgia" w:cs="Georgia" w:eastAsia="Georgia" w:hAnsi="Georgia"/>
+          <w:sz w:val="21"/>
+          <w:szCs w:val="21"/>
+        </w:rPr>
+        <w:t xml:space="preserve">Às nove e quarenta, entrou no estacionamento do aeroporto de Guarulhos. Rodou dois andares procurando vaga. No terceiro, encontrou uma, no fim de uma fileira, ao lado de um pilar de concreto.</w:t>
       </w:r>
     </w:p>
     <w:p>
@@ -31380,7 +31380,7 @@
           <w:sz w:val="21"/>
           <w:szCs w:val="21"/>
         </w:rPr>
-        <w:t xml:space="preserve">Na vaga do outro lado do pilar, estacionado torto, às pressas, com uma das rodas em cima da faixa amarela, estava um carro que ele conhecia. Prata metálico, com um adesivo de escritório de arquitetura no vidro de trás e um desenho de criança preso no quebra-sol, uma casa com doze janelas.</w:t>
+        <w:t xml:space="preserve">Na vaga do outro lado do pilar, estacionado torto, às pressas, com uma das rodas em cima da faixa amarela, estava um carro que ele conhecia. Um hatch vermelho, com um adesivo de escritório de arquitetura no vidro de trás. No banco do passageiro, aberta, a pasta de elástico com os desenhos de criança. Por cima de todos, uma casa com doze janelas.</w:t>
       </w:r>
     </w:p>
     <w:p>

</xml_diff>

<commit_message>
Livro policial: capítulo 29 (A escada rolante)
Co-Authored-By: Claude Opus 5.5 <noreply@anthropic.com>
Claude-Session: https://claude.ai/code/session_01BrurxSYygRC3rRhaUYosm1
</commit_message>
<xml_diff>
--- a/docs/livro-policial/TODO_CRIME_TEM_UM_AUTOR.docx
+++ b/docs/livro-policial/TODO_CRIME_TEM_UM_AUTOR.docx
@@ -31411,6 +31411,1694 @@
           <w:szCs w:val="21"/>
         </w:rPr>
         <w:t xml:space="preserve">O capô ainda estava quente quando ele encostou a mão.</w:t>
+      </w:r>
+    </w:p>
+    <w:p>
+      <w:pPr>
+        <w:pageBreakBefore/>
+        <w:spacing w:after="120" w:before="1800"/>
+        <w:jc w:val="center"/>
+      </w:pPr>
+      <w:r>
+        <w:rPr>
+          <w:rFonts w:ascii="Georgia" w:cs="Georgia" w:eastAsia="Georgia" w:hAnsi="Georgia"/>
+          <w:spacing w:val="40"/>
+          <w:sz w:val="20"/>
+          <w:szCs w:val="20"/>
+        </w:rPr>
+        <w:t xml:space="preserve">CAPÍTULO 29</w:t>
+      </w:r>
+    </w:p>
+    <w:p>
+      <w:pPr>
+        <w:spacing w:after="720"/>
+        <w:jc w:val="center"/>
+      </w:pPr>
+      <w:r>
+        <w:rPr>
+          <w:rFonts w:ascii="Georgia" w:cs="Georgia" w:eastAsia="Georgia" w:hAnsi="Georgia"/>
+          <w:b/>
+          <w:bCs/>
+          <w:sz w:val="32"/>
+          <w:szCs w:val="32"/>
+        </w:rPr>
+        <w:t xml:space="preserve">A escada rolante</w:t>
+      </w:r>
+    </w:p>
+    <w:p>
+      <w:pPr>
+        <w:spacing w:after="0" w:line="312"/>
+        <w:ind w:firstLine="340"/>
+        <w:jc w:val="both"/>
+      </w:pPr>
+      <w:r>
+        <w:rPr>
+          <w:rFonts w:ascii="Georgia" w:cs="Georgia" w:eastAsia="Georgia" w:hAnsi="Georgia"/>
+          <w:sz w:val="21"/>
+          <w:szCs w:val="21"/>
+        </w:rPr>
+        <w:t xml:space="preserve">O sítio de Cotia ficava no fim de uma estrada de terra, depois de uma porteira azul e de um cachorro que latia sem vontade. Lia chegou lá na quarta-feira à tarde, um dia depois de passar quarenta e cinco minutos sentada na sala de espera da Avenida Angélica, olhando para a porta de um consultório que não se abriu.</w:t>
+      </w:r>
+    </w:p>
+    <w:p>
+      <w:pPr>
+        <w:spacing w:after="0" w:line="312"/>
+        <w:ind w:firstLine="340"/>
+        <w:jc w:val="both"/>
+      </w:pPr>
+      <w:r>
+        <w:rPr>
+          <w:rFonts w:ascii="Georgia" w:cs="Georgia" w:eastAsia="Georgia" w:hAnsi="Georgia"/>
+          <w:sz w:val="21"/>
+          <w:szCs w:val="21"/>
+        </w:rPr>
+        <w:t xml:space="preserve">O caseiro, seu Dito, estava capinando em volta de um galpão de alvenaria com as janelas fechadas por tela. Não fez perguntas. Para ele, uma moça de carro da cidade que dizia ser da família de um paciente antigo do doutor era só mais uma visita.</w:t>
+      </w:r>
+    </w:p>
+    <w:p>
+      <w:pPr>
+        <w:spacing w:after="0" w:line="312"/>
+        <w:ind w:firstLine="340"/>
+        <w:jc w:val="both"/>
+      </w:pPr>
+      <w:r>
+        <w:rPr>
+          <w:rFonts w:ascii="Georgia" w:cs="Georgia" w:eastAsia="Georgia" w:hAnsi="Georgia"/>
+          <w:sz w:val="21"/>
+          <w:szCs w:val="21"/>
+        </w:rPr>
+        <w:t xml:space="preserve">— O doutor? Esteve aqui ontem. — Ele apoiou a enxada no ombro. — Chegou cedo, ficou no galpão o dia inteiro. Queimou um monte de papel no tambor lá atrás. Depois levou uma mala.</w:t>
+      </w:r>
+    </w:p>
+    <w:p>
+      <w:pPr>
+        <w:spacing w:after="0" w:line="312"/>
+        <w:ind w:firstLine="340"/>
+        <w:jc w:val="both"/>
+      </w:pPr>
+      <w:r>
+        <w:rPr>
+          <w:rFonts w:ascii="Georgia" w:cs="Georgia" w:eastAsia="Georgia" w:hAnsi="Georgia"/>
+          <w:sz w:val="21"/>
+          <w:szCs w:val="21"/>
+        </w:rPr>
+        <w:t xml:space="preserve">— Uma mala?</w:t>
+      </w:r>
+    </w:p>
+    <w:p>
+      <w:pPr>
+        <w:spacing w:after="0" w:line="312"/>
+        <w:ind w:firstLine="340"/>
+        <w:jc w:val="both"/>
+      </w:pPr>
+      <w:r>
+        <w:rPr>
+          <w:rFonts w:ascii="Georgia" w:cs="Georgia" w:eastAsia="Georgia" w:hAnsi="Georgia"/>
+          <w:sz w:val="21"/>
+          <w:szCs w:val="21"/>
+        </w:rPr>
+        <w:t xml:space="preserve">— Grande. Disse que ia viajar. Que ia ficar um tempo fora. — Seu Dito coçou a nuca. — Me pagou três meses adiantado. Nunca fez isso. Perguntei para onde ia, por causa das plantas, e ele disse Suíça, quinta à noite. Disse que lá tem neve. Que um amigo dele sempre quis ver neve.</w:t>
+      </w:r>
+    </w:p>
+    <w:p>
+      <w:pPr>
+        <w:spacing w:after="0" w:line="312"/>
+        <w:ind w:firstLine="340"/>
+        <w:jc w:val="both"/>
+      </w:pPr>
+      <w:r>
+        <w:rPr>
+          <w:rFonts w:ascii="Georgia" w:cs="Georgia" w:eastAsia="Georgia" w:hAnsi="Georgia"/>
+          <w:sz w:val="21"/>
+          <w:szCs w:val="21"/>
+        </w:rPr>
+        <w:t xml:space="preserve">Lia agradeceu. Voltou para o carro. Ficou um tempo parada na estrada de terra, com as mãos no volante, olhando para a fumaça fina que ainda subia do tambor atrás do galpão.</w:t>
+      </w:r>
+    </w:p>
+    <w:p>
+      <w:pPr>
+        <w:spacing w:after="0" w:line="312"/>
+        <w:ind w:firstLine="340"/>
+        <w:jc w:val="both"/>
+      </w:pPr>
+      <w:r>
+        <w:rPr>
+          <w:rFonts w:ascii="Georgia" w:cs="Georgia" w:eastAsia="Georgia" w:hAnsi="Georgia"/>
+          <w:sz w:val="21"/>
+          <w:szCs w:val="21"/>
+        </w:rPr>
+        <w:t xml:space="preserve">Um amigo dele sempre quis ver neve.</w:t>
+      </w:r>
+    </w:p>
+    <w:p>
+      <w:pPr>
+        <w:spacing w:after="200" w:before="200"/>
+        <w:jc w:val="center"/>
+      </w:pPr>
+      <w:r>
+        <w:rPr>
+          <w:rFonts w:ascii="Georgia" w:cs="Georgia" w:eastAsia="Georgia" w:hAnsi="Georgia"/>
+          <w:sz w:val="22"/>
+          <w:szCs w:val="22"/>
+        </w:rPr>
+        <w:t xml:space="preserve">*</w:t>
+      </w:r>
+    </w:p>
+    <w:p>
+      <w:pPr>
+        <w:spacing w:after="0" w:line="312"/>
+        <w:ind w:firstLine="340"/>
+        <w:jc w:val="both"/>
+      </w:pPr>
+      <w:r>
+        <w:rPr>
+          <w:rFonts w:ascii="Georgia" w:cs="Georgia" w:eastAsia="Georgia" w:hAnsi="Georgia"/>
+          <w:sz w:val="21"/>
+          <w:szCs w:val="21"/>
+        </w:rPr>
+        <w:t xml:space="preserve">Na quinta-feira, às nove e vinte da noite, ela entrou no saguão de embarque de Guarulhos com o coração batendo na garganta e a pasta dos desenhos debaixo do braço, porque não tinha conseguido deixá-la no carro.</w:t>
+      </w:r>
+    </w:p>
+    <w:p>
+      <w:pPr>
+        <w:spacing w:after="0" w:line="312"/>
+        <w:ind w:firstLine="340"/>
+        <w:jc w:val="both"/>
+      </w:pPr>
+      <w:r>
+        <w:rPr>
+          <w:rFonts w:ascii="Georgia" w:cs="Georgia" w:eastAsia="Georgia" w:hAnsi="Georgia"/>
+          <w:sz w:val="21"/>
+          <w:szCs w:val="21"/>
+        </w:rPr>
+        <w:t xml:space="preserve">Não tinha plano. Tinha um horário, um voo e uma cidade. Tinha a cópia da declaração de óbito na bolsa, o celular do pai no bolso do casaco e uma frase que ensaiava desde Cotia e que, a cada vez, saía diferente.</w:t>
+      </w:r>
+    </w:p>
+    <w:p>
+      <w:pPr>
+        <w:spacing w:after="0" w:line="312"/>
+        <w:ind w:firstLine="340"/>
+        <w:jc w:val="both"/>
+      </w:pPr>
+      <w:r>
+        <w:rPr>
+          <w:rFonts w:ascii="Georgia" w:cs="Georgia" w:eastAsia="Georgia" w:hAnsi="Georgia"/>
+          <w:sz w:val="21"/>
+          <w:szCs w:val="21"/>
+        </w:rPr>
+        <w:t xml:space="preserve">O saguão de baixo estava cheio de gente chegando: famílias com balões, motoristas segurando plaquinhas com nomes, um grupo de estudantes sentados no chão. O embarque internacional ficava no andar de cima. Lia foi até a escada rolante e subiu.</w:t>
+      </w:r>
+    </w:p>
+    <w:p>
+      <w:pPr>
+        <w:spacing w:after="0" w:line="312"/>
+        <w:ind w:firstLine="340"/>
+        <w:jc w:val="both"/>
+      </w:pPr>
+      <w:r>
+        <w:rPr>
+          <w:rFonts w:ascii="Georgia" w:cs="Georgia" w:eastAsia="Georgia" w:hAnsi="Georgia"/>
+          <w:sz w:val="21"/>
+          <w:szCs w:val="21"/>
+        </w:rPr>
+        <w:t xml:space="preserve">Estava na metade quando o viu.</w:t>
+      </w:r>
+    </w:p>
+    <w:p>
+      <w:pPr>
+        <w:spacing w:after="0" w:line="312"/>
+        <w:ind w:firstLine="340"/>
+        <w:jc w:val="both"/>
+      </w:pPr>
+      <w:r>
+        <w:rPr>
+          <w:rFonts w:ascii="Georgia" w:cs="Georgia" w:eastAsia="Georgia" w:hAnsi="Georgia"/>
+          <w:sz w:val="21"/>
+          <w:szCs w:val="21"/>
+        </w:rPr>
+        <w:t xml:space="preserve">Ele vinha descendo pela outra escada, a que corria ao lado, em sentido contrário. De terno escuro, sem gravata, com a mesma maleta de couro de sempre na mão direita. Mais magro do que no crematório. Mais velho do que Lia lembrava. Olhava para baixo, para o saguão de chegadas, como quem procura uma saída, e só levantou os olhos quando os dois degraus ficaram lado a lado.</w:t>
+      </w:r>
+    </w:p>
+    <w:p>
+      <w:pPr>
+        <w:spacing w:after="0" w:line="312"/>
+        <w:ind w:firstLine="340"/>
+        <w:jc w:val="both"/>
+      </w:pPr>
+      <w:r>
+        <w:rPr>
+          <w:rFonts w:ascii="Georgia" w:cs="Georgia" w:eastAsia="Georgia" w:hAnsi="Georgia"/>
+          <w:sz w:val="21"/>
+          <w:szCs w:val="21"/>
+        </w:rPr>
+        <w:t xml:space="preserve">Durou um segundo. As duas escadas levaram os dois em direções opostas, ela para cima, ele para baixo, e por um segundo inteiro ficaram frente a frente, a meio metro de distância, como num espelho que se move.</w:t>
+      </w:r>
+    </w:p>
+    <w:p>
+      <w:pPr>
+        <w:spacing w:after="0" w:line="312"/>
+        <w:ind w:firstLine="340"/>
+        <w:jc w:val="both"/>
+      </w:pPr>
+      <w:r>
+        <w:rPr>
+          <w:rFonts w:ascii="Georgia" w:cs="Georgia" w:eastAsia="Georgia" w:hAnsi="Georgia"/>
+          <w:sz w:val="21"/>
+          <w:szCs w:val="21"/>
+        </w:rPr>
+        <w:t xml:space="preserve">O doutor Álvaro não fugiu. Não apertou o passo. Não desviou o olhar.</w:t>
+      </w:r>
+    </w:p>
+    <w:p>
+      <w:pPr>
+        <w:spacing w:after="0" w:line="312"/>
+        <w:ind w:firstLine="340"/>
+        <w:jc w:val="both"/>
+      </w:pPr>
+      <w:r>
+        <w:rPr>
+          <w:rFonts w:ascii="Georgia" w:cs="Georgia" w:eastAsia="Georgia" w:hAnsi="Georgia"/>
+          <w:sz w:val="21"/>
+          <w:szCs w:val="21"/>
+        </w:rPr>
+        <w:t xml:space="preserve">Disse só o nome dela, baixinho, como dizia quando ela era criança e chegava ao consultório com febre.</w:t>
+      </w:r>
+    </w:p>
+    <w:p>
+      <w:pPr>
+        <w:spacing w:after="0" w:line="312"/>
+        <w:ind w:firstLine="340"/>
+        <w:jc w:val="both"/>
+      </w:pPr>
+      <w:r>
+        <w:rPr>
+          <w:rFonts w:ascii="Georgia" w:cs="Georgia" w:eastAsia="Georgia" w:hAnsi="Georgia"/>
+          <w:sz w:val="21"/>
+          <w:szCs w:val="21"/>
+        </w:rPr>
+        <w:t xml:space="preserve">— Lia.</w:t>
+      </w:r>
+    </w:p>
+    <w:p>
+      <w:pPr>
+        <w:spacing w:after="0" w:line="312"/>
+        <w:ind w:firstLine="340"/>
+        <w:jc w:val="both"/>
+      </w:pPr>
+      <w:r>
+        <w:rPr>
+          <w:rFonts w:ascii="Georgia" w:cs="Georgia" w:eastAsia="Georgia" w:hAnsi="Georgia"/>
+          <w:sz w:val="21"/>
+          <w:szCs w:val="21"/>
+        </w:rPr>
+        <w:t xml:space="preserve">E a escada o levou.</w:t>
+      </w:r>
+    </w:p>
+    <w:p>
+      <w:pPr>
+        <w:spacing w:after="200" w:before="200"/>
+        <w:jc w:val="center"/>
+      </w:pPr>
+      <w:r>
+        <w:rPr>
+          <w:rFonts w:ascii="Georgia" w:cs="Georgia" w:eastAsia="Georgia" w:hAnsi="Georgia"/>
+          <w:sz w:val="22"/>
+          <w:szCs w:val="22"/>
+        </w:rPr>
+        <w:t xml:space="preserve">*</w:t>
+      </w:r>
+    </w:p>
+    <w:p>
+      <w:pPr>
+        <w:spacing w:after="0" w:line="312"/>
+        <w:ind w:firstLine="340"/>
+        <w:jc w:val="both"/>
+      </w:pPr>
+      <w:r>
+        <w:rPr>
+          <w:rFonts w:ascii="Georgia" w:cs="Georgia" w:eastAsia="Georgia" w:hAnsi="Georgia"/>
+          <w:sz w:val="21"/>
+          <w:szCs w:val="21"/>
+        </w:rPr>
+        <w:t xml:space="preserve">Ela não pensou. Chegou ao alto, deu a volta no corrimão, quase derrubou um senhor de muletas, pediu desculpa sem olhar e desceu correndo pela escada que descia, empurrando malas, ouvindo alguém reclamar atrás dela.</w:t>
+      </w:r>
+    </w:p>
+    <w:p>
+      <w:pPr>
+        <w:spacing w:after="0" w:line="312"/>
+        <w:ind w:firstLine="340"/>
+        <w:jc w:val="both"/>
+      </w:pPr>
+      <w:r>
+        <w:rPr>
+          <w:rFonts w:ascii="Georgia" w:cs="Georgia" w:eastAsia="Georgia" w:hAnsi="Georgia"/>
+          <w:sz w:val="21"/>
+          <w:szCs w:val="21"/>
+        </w:rPr>
+        <w:t xml:space="preserve">Lá embaixo, o médico estava parado ao pé da escada, com a maleta na mão, esperando.</w:t>
+      </w:r>
+    </w:p>
+    <w:p>
+      <w:pPr>
+        <w:spacing w:after="0" w:line="312"/>
+        <w:ind w:firstLine="340"/>
+        <w:jc w:val="both"/>
+      </w:pPr>
+      <w:r>
+        <w:rPr>
+          <w:rFonts w:ascii="Georgia" w:cs="Georgia" w:eastAsia="Georgia" w:hAnsi="Georgia"/>
+          <w:sz w:val="21"/>
+          <w:szCs w:val="21"/>
+        </w:rPr>
+        <w:t xml:space="preserve">Lia parou a dois passos dele, sem fôlego.</w:t>
+      </w:r>
+    </w:p>
+    <w:p>
+      <w:pPr>
+        <w:spacing w:after="0" w:line="312"/>
+        <w:ind w:firstLine="340"/>
+        <w:jc w:val="both"/>
+      </w:pPr>
+      <w:r>
+        <w:rPr>
+          <w:rFonts w:ascii="Georgia" w:cs="Georgia" w:eastAsia="Georgia" w:hAnsi="Georgia"/>
+          <w:sz w:val="21"/>
+          <w:szCs w:val="21"/>
+        </w:rPr>
+        <w:t xml:space="preserve">— O senhor ia embora — disse.</w:t>
+      </w:r>
+    </w:p>
+    <w:p>
+      <w:pPr>
+        <w:spacing w:after="0" w:line="312"/>
+        <w:ind w:firstLine="340"/>
+        <w:jc w:val="both"/>
+      </w:pPr>
+      <w:r>
+        <w:rPr>
+          <w:rFonts w:ascii="Georgia" w:cs="Georgia" w:eastAsia="Georgia" w:hAnsi="Georgia"/>
+          <w:sz w:val="21"/>
+          <w:szCs w:val="21"/>
+        </w:rPr>
+        <w:t xml:space="preserve">— Ia. — Ele olhou para o relógio, um gesto que ela conhecia do crematório. — O embarque já começou. Eu fiz o check-in, passei a mala, cheguei até a porta da Polícia Federal. E não consegui entrar. Fiquei olhando para aquela porta e pensei: depois dela, nunca mais. Desci para tomar um ar. Para decidir.</w:t>
+      </w:r>
+    </w:p>
+    <w:p>
+      <w:pPr>
+        <w:spacing w:after="0" w:line="312"/>
+        <w:ind w:firstLine="340"/>
+        <w:jc w:val="both"/>
+      </w:pPr>
+      <w:r>
+        <w:rPr>
+          <w:rFonts w:ascii="Georgia" w:cs="Georgia" w:eastAsia="Georgia" w:hAnsi="Georgia"/>
+          <w:sz w:val="21"/>
+          <w:szCs w:val="21"/>
+        </w:rPr>
+        <w:t xml:space="preserve">— Decidir o quê?</w:t>
+      </w:r>
+    </w:p>
+    <w:p>
+      <w:pPr>
+        <w:spacing w:after="0" w:line="312"/>
+        <w:ind w:firstLine="340"/>
+        <w:jc w:val="both"/>
+      </w:pPr>
+      <w:r>
+        <w:rPr>
+          <w:rFonts w:ascii="Georgia" w:cs="Georgia" w:eastAsia="Georgia" w:hAnsi="Georgia"/>
+          <w:sz w:val="21"/>
+          <w:szCs w:val="21"/>
+        </w:rPr>
+        <w:t xml:space="preserve">O doutor Álvaro olhou para ela durante muito tempo.</w:t>
+      </w:r>
+    </w:p>
+    <w:p>
+      <w:pPr>
+        <w:spacing w:after="0" w:line="312"/>
+        <w:ind w:firstLine="340"/>
+        <w:jc w:val="both"/>
+      </w:pPr>
+      <w:r>
+        <w:rPr>
+          <w:rFonts w:ascii="Georgia" w:cs="Georgia" w:eastAsia="Georgia" w:hAnsi="Georgia"/>
+          <w:sz w:val="21"/>
+          <w:szCs w:val="21"/>
+        </w:rPr>
+        <w:t xml:space="preserve">— Se eu ia conseguir viver o resto da vida sem contar a alguém o que eu fiz. — Ele apontou com o queixo para um banco de metal vazio, encostado numa coluna, perto de uma loja de câmbio fechada. — Senta comigo, Lia. Eu acho que não vou conseguir.</w:t>
+      </w:r>
+    </w:p>
+    <w:p>
+      <w:pPr>
+        <w:spacing w:after="200" w:before="200"/>
+        <w:jc w:val="center"/>
+      </w:pPr>
+      <w:r>
+        <w:rPr>
+          <w:rFonts w:ascii="Georgia" w:cs="Georgia" w:eastAsia="Georgia" w:hAnsi="Georgia"/>
+          <w:sz w:val="22"/>
+          <w:szCs w:val="22"/>
+        </w:rPr>
+        <w:t xml:space="preserve">*</w:t>
+      </w:r>
+    </w:p>
+    <w:p>
+      <w:pPr>
+        <w:spacing w:after="0" w:line="312"/>
+        <w:ind w:firstLine="340"/>
+        <w:jc w:val="both"/>
+      </w:pPr>
+      <w:r>
+        <w:rPr>
+          <w:rFonts w:ascii="Georgia" w:cs="Georgia" w:eastAsia="Georgia" w:hAnsi="Georgia"/>
+          <w:sz w:val="21"/>
+          <w:szCs w:val="21"/>
+        </w:rPr>
+        <w:t xml:space="preserve">Lucas os viu antes que eles o vissem.</w:t>
+      </w:r>
+    </w:p>
+    <w:p>
+      <w:pPr>
+        <w:spacing w:after="0" w:line="312"/>
+        <w:ind w:firstLine="340"/>
+        <w:jc w:val="both"/>
+      </w:pPr>
+      <w:r>
+        <w:rPr>
+          <w:rFonts w:ascii="Georgia" w:cs="Georgia" w:eastAsia="Georgia" w:hAnsi="Georgia"/>
+          <w:sz w:val="21"/>
+          <w:szCs w:val="21"/>
+        </w:rPr>
+        <w:t xml:space="preserve">Tinha atravessado o estacionamento correndo, subido ao saguão de embarque, rodado entre os balcões das companhias aéreas procurando a irmã, e voltado ao andar de baixo quase sem esperança. Foi quando viu, perto de uma coluna, um homem de cabelo branco e uma mulher de casaco escuro sentados lado a lado num banco de metal, sem se olhar, como dois desconhecidos esperando o mesmo voo.</w:t>
+      </w:r>
+    </w:p>
+    <w:p>
+      <w:pPr>
+        <w:spacing w:after="0" w:line="312"/>
+        <w:ind w:firstLine="340"/>
+        <w:jc w:val="both"/>
+      </w:pPr>
+      <w:r>
+        <w:rPr>
+          <w:rFonts w:ascii="Georgia" w:cs="Georgia" w:eastAsia="Georgia" w:hAnsi="Georgia"/>
+          <w:sz w:val="21"/>
+          <w:szCs w:val="21"/>
+        </w:rPr>
+        <w:t xml:space="preserve">Ficou parado no meio do saguão, com o envelope pardo na mão.</w:t>
+      </w:r>
+    </w:p>
+    <w:p>
+      <w:pPr>
+        <w:spacing w:after="0" w:line="312"/>
+        <w:ind w:firstLine="340"/>
+        <w:jc w:val="both"/>
+      </w:pPr>
+      <w:r>
+        <w:rPr>
+          <w:rFonts w:ascii="Georgia" w:cs="Georgia" w:eastAsia="Georgia" w:hAnsi="Georgia"/>
+          <w:sz w:val="21"/>
+          <w:szCs w:val="21"/>
+        </w:rPr>
+        <w:t xml:space="preserve">Antes de sair do carro, às nove e quarenta e cinco, tinha finalmente ligado para a delegada Regina Paiva. Contou tudo em quatro minutos, sem respirar: a gaveta, a vizinha, o frasco, o voo. Do outro lado, ela ficou em silêncio e depois disse uma coisa que ele não esperava.</w:t>
+      </w:r>
+    </w:p>
+    <w:p>
+      <w:pPr>
+        <w:spacing w:after="0" w:line="312"/>
+        <w:ind w:firstLine="340"/>
+        <w:jc w:val="both"/>
+      </w:pPr>
+      <w:r>
+        <w:rPr>
+          <w:rFonts w:ascii="Georgia" w:cs="Georgia" w:eastAsia="Georgia" w:hAnsi="Georgia"/>
+          <w:sz w:val="21"/>
+          <w:szCs w:val="21"/>
+        </w:rPr>
+        <w:t xml:space="preserve">— Eu sei, senhor Salvallus. O seu Valdir me ligou na terça. Fique longe dele. Eu chego em meia hora.</w:t>
+      </w:r>
+    </w:p>
+    <w:p>
+      <w:pPr>
+        <w:spacing w:after="0" w:line="312"/>
+        <w:ind w:firstLine="340"/>
+        <w:jc w:val="both"/>
+      </w:pPr>
+      <w:r>
+        <w:rPr>
+          <w:rFonts w:ascii="Georgia" w:cs="Georgia" w:eastAsia="Georgia" w:hAnsi="Georgia"/>
+          <w:sz w:val="21"/>
+          <w:szCs w:val="21"/>
+        </w:rPr>
+        <w:t xml:space="preserve">Lucas não ficou longe. Atravessou o saguão e parou na frente do banco.</w:t>
+      </w:r>
+    </w:p>
+    <w:p>
+      <w:pPr>
+        <w:spacing w:after="0" w:line="312"/>
+        <w:ind w:firstLine="340"/>
+        <w:jc w:val="both"/>
+      </w:pPr>
+      <w:r>
+        <w:rPr>
+          <w:rFonts w:ascii="Georgia" w:cs="Georgia" w:eastAsia="Georgia" w:hAnsi="Georgia"/>
+          <w:sz w:val="21"/>
+          <w:szCs w:val="21"/>
+        </w:rPr>
+        <w:t xml:space="preserve">Lia levantou os olhos para ele. Não pareceu surpresa. Pareceu aliviada, e depois envergonhada de estar aliviada, e depois só cansada.</w:t>
+      </w:r>
+    </w:p>
+    <w:p>
+      <w:pPr>
+        <w:spacing w:after="0" w:line="312"/>
+        <w:ind w:firstLine="340"/>
+        <w:jc w:val="both"/>
+      </w:pPr>
+      <w:r>
+        <w:rPr>
+          <w:rFonts w:ascii="Georgia" w:cs="Georgia" w:eastAsia="Georgia" w:hAnsi="Georgia"/>
+          <w:sz w:val="21"/>
+          <w:szCs w:val="21"/>
+        </w:rPr>
+        <w:t xml:space="preserve">— Senta — disse ela. — Ele está contando.</w:t>
+      </w:r>
+    </w:p>
+    <w:p>
+      <w:pPr>
+        <w:spacing w:after="0" w:line="312"/>
+        <w:ind w:firstLine="340"/>
+        <w:jc w:val="both"/>
+      </w:pPr>
+      <w:r>
+        <w:rPr>
+          <w:rFonts w:ascii="Georgia" w:cs="Georgia" w:eastAsia="Georgia" w:hAnsi="Georgia"/>
+          <w:sz w:val="21"/>
+          <w:szCs w:val="21"/>
+        </w:rPr>
+        <w:t xml:space="preserve">O doutor Álvaro olhou para Lucas como tinha olhado para Lia na escada. Como quem reconhece um paciente.</w:t>
+      </w:r>
+    </w:p>
+    <w:p>
+      <w:pPr>
+        <w:spacing w:after="0" w:line="312"/>
+        <w:ind w:firstLine="340"/>
+        <w:jc w:val="both"/>
+      </w:pPr>
+      <w:r>
+        <w:rPr>
+          <w:rFonts w:ascii="Georgia" w:cs="Georgia" w:eastAsia="Georgia" w:hAnsi="Georgia"/>
+          <w:sz w:val="21"/>
+          <w:szCs w:val="21"/>
+        </w:rPr>
+        <w:t xml:space="preserve">— Lucas. Que bom. Assim eu só conto uma vez.</w:t>
+      </w:r>
+    </w:p>
+    <w:p>
+      <w:pPr>
+        <w:spacing w:after="200" w:before="200"/>
+        <w:jc w:val="center"/>
+      </w:pPr>
+      <w:r>
+        <w:rPr>
+          <w:rFonts w:ascii="Georgia" w:cs="Georgia" w:eastAsia="Georgia" w:hAnsi="Georgia"/>
+          <w:sz w:val="22"/>
+          <w:szCs w:val="22"/>
+        </w:rPr>
+        <w:t xml:space="preserve">*</w:t>
+      </w:r>
+    </w:p>
+    <w:p>
+      <w:pPr>
+        <w:spacing w:after="0" w:line="312"/>
+        <w:ind w:firstLine="340"/>
+        <w:jc w:val="both"/>
+      </w:pPr>
+      <w:r>
+        <w:rPr>
+          <w:rFonts w:ascii="Georgia" w:cs="Georgia" w:eastAsia="Georgia" w:hAnsi="Georgia"/>
+          <w:sz w:val="21"/>
+          <w:szCs w:val="21"/>
+        </w:rPr>
+        <w:t xml:space="preserve">Lucas sentou do outro lado do médico. Os três ficaram assim, lado a lado no banco de metal, olhando para as portas automáticas do desembarque, que se abriam e fechavam soltando gente que chorava de alegria.</w:t>
+      </w:r>
+    </w:p>
+    <w:p>
+      <w:pPr>
+        <w:spacing w:after="0" w:line="312"/>
+        <w:ind w:firstLine="340"/>
+        <w:jc w:val="both"/>
+      </w:pPr>
+      <w:r>
+        <w:rPr>
+          <w:rFonts w:ascii="Georgia" w:cs="Georgia" w:eastAsia="Georgia" w:hAnsi="Georgia"/>
+          <w:sz w:val="21"/>
+          <w:szCs w:val="21"/>
+        </w:rPr>
+        <w:t xml:space="preserve">— Ele me procurou na noite da estrada — começou o doutor Álvaro. — Vocês já sabem disso, pelo jeito. Disse: preciso sumir. E eu, que sou um velho tolo e vaidoso, disse a ele que tinha um jeito. O 71. Uma coisa que eu tinha feito em ratos, escondido, porque uma comissão de gente que nunca viu um paciente gritar de dor me proibiu de fazer. Eu queria tanto que aquilo servisse para alguma coisa. Quando o Henrique disse que precisava morrer sem morrer, eu pensei: é para isso. Deus me deu aquilo para isso.</w:t>
+      </w:r>
+    </w:p>
+    <w:p>
+      <w:pPr>
+        <w:spacing w:after="0" w:line="312"/>
+        <w:ind w:firstLine="340"/>
+        <w:jc w:val="both"/>
+      </w:pPr>
+      <w:r>
+        <w:rPr>
+          <w:rFonts w:ascii="Georgia" w:cs="Georgia" w:eastAsia="Georgia" w:hAnsi="Georgia"/>
+          <w:sz w:val="21"/>
+          <w:szCs w:val="21"/>
+        </w:rPr>
+        <w:t xml:space="preserve">Ele respirou fundo.</w:t>
+      </w:r>
+    </w:p>
+    <w:p>
+      <w:pPr>
+        <w:spacing w:after="0" w:line="312"/>
+        <w:ind w:firstLine="340"/>
+        <w:jc w:val="both"/>
+      </w:pPr>
+      <w:r>
+        <w:rPr>
+          <w:rFonts w:ascii="Georgia" w:cs="Georgia" w:eastAsia="Georgia" w:hAnsi="Georgia"/>
+          <w:sz w:val="21"/>
+          <w:szCs w:val="21"/>
+        </w:rPr>
+        <w:t xml:space="preserve">— Na terça, às sete, ele tomou. Na cozinha, sozinho, com um copo de água. Me ligou às sete e dois. Disse: tomei, Álvaro, está subindo pelos braços, vem logo. Quarenta e sete segundos. Eu estava na esquina, dentro do carro, esperando a hora. Entrei às sete e cinco. Ele estava no quarto, deitado de roupa sobre a cama, já mole, de olhos meio abertos. Ainda me ouvia. Eu sei que ouvia, porque apertou a minha mão uma vez.</w:t>
+      </w:r>
+    </w:p>
+    <w:p>
+      <w:pPr>
+        <w:spacing w:after="0" w:line="312"/>
+        <w:ind w:firstLine="340"/>
+        <w:jc w:val="both"/>
+      </w:pPr>
+      <w:r>
+        <w:rPr>
+          <w:rFonts w:ascii="Georgia" w:cs="Georgia" w:eastAsia="Georgia" w:hAnsi="Georgia"/>
+          <w:sz w:val="21"/>
+          <w:szCs w:val="21"/>
+        </w:rPr>
+        <w:t xml:space="preserve">— E o senhor rezou — disse Lucas.</w:t>
+      </w:r>
+    </w:p>
+    <w:p>
+      <w:pPr>
+        <w:spacing w:after="0" w:line="312"/>
+        <w:ind w:firstLine="340"/>
+        <w:jc w:val="both"/>
+      </w:pPr>
+      <w:r>
+        <w:rPr>
+          <w:rFonts w:ascii="Georgia" w:cs="Georgia" w:eastAsia="Georgia" w:hAnsi="Georgia"/>
+          <w:sz w:val="21"/>
+          <w:szCs w:val="21"/>
+        </w:rPr>
+        <w:t xml:space="preserve">O médico se virou para ele, surpreso.</w:t>
+      </w:r>
+    </w:p>
+    <w:p>
+      <w:pPr>
+        <w:spacing w:after="0" w:line="312"/>
+        <w:ind w:firstLine="340"/>
+        <w:jc w:val="both"/>
+      </w:pPr>
+      <w:r>
+        <w:rPr>
+          <w:rFonts w:ascii="Georgia" w:cs="Georgia" w:eastAsia="Georgia" w:hAnsi="Georgia"/>
+          <w:sz w:val="21"/>
+          <w:szCs w:val="21"/>
+        </w:rPr>
+        <w:t xml:space="preserve">— O Otávio ouviu. Do escritório de baixo.</w:t>
+      </w:r>
+    </w:p>
+    <w:p>
+      <w:pPr>
+        <w:spacing w:after="0" w:line="312"/>
+        <w:ind w:firstLine="340"/>
+        <w:jc w:val="both"/>
+      </w:pPr>
+      <w:r>
+        <w:rPr>
+          <w:rFonts w:ascii="Georgia" w:cs="Georgia" w:eastAsia="Georgia" w:hAnsi="Georgia"/>
+          <w:sz w:val="21"/>
+          <w:szCs w:val="21"/>
+        </w:rPr>
+        <w:t xml:space="preserve">O doutor Álvaro fechou os olhos.</w:t>
+      </w:r>
+    </w:p>
+    <w:p>
+      <w:pPr>
+        <w:spacing w:after="0" w:line="312"/>
+        <w:ind w:firstLine="340"/>
+        <w:jc w:val="both"/>
+      </w:pPr>
+      <w:r>
+        <w:rPr>
+          <w:rFonts w:ascii="Georgia" w:cs="Georgia" w:eastAsia="Georgia" w:hAnsi="Georgia"/>
+          <w:sz w:val="21"/>
+          <w:szCs w:val="21"/>
+        </w:rPr>
+        <w:t xml:space="preserve">— Rezei. O Pai-Nosso. O Rodolfo ensinou para nós dois em Ubatuba, quando a gente era moço. Ele rezava antes de entrar no mar de noite. Dizia que o mar não leva quem pede licença. — A voz falhou. — O Henrique dormiu na terceira vez. Eu rezei mais umas vinte, sentado do lado da cama, segurando o pulso dele, sentindo o pulso ir sumindo, sumindo, até ficar tão fraco que só eu, que sabia onde procurar, encontrava. Às sete e quarenta, liguei para o celular dele, do meu, de dentro do quarto, para ficar registrado que ele não atendia. Às oito e quinze, liguei para a Helena.</w:t>
+      </w:r>
+    </w:p>
+    <w:p>
+      <w:pPr>
+        <w:spacing w:after="200" w:before="200"/>
+        <w:jc w:val="center"/>
+      </w:pPr>
+      <w:r>
+        <w:rPr>
+          <w:rFonts w:ascii="Georgia" w:cs="Georgia" w:eastAsia="Georgia" w:hAnsi="Georgia"/>
+          <w:sz w:val="22"/>
+          <w:szCs w:val="22"/>
+        </w:rPr>
+        <w:t xml:space="preserve">*</w:t>
+      </w:r>
+    </w:p>
+    <w:p>
+      <w:pPr>
+        <w:spacing w:after="0" w:line="312"/>
+        <w:ind w:firstLine="340"/>
+        <w:jc w:val="both"/>
+      </w:pPr>
+      <w:r>
+        <w:rPr>
+          <w:rFonts w:ascii="Georgia" w:cs="Georgia" w:eastAsia="Georgia" w:hAnsi="Georgia"/>
+          <w:sz w:val="21"/>
+          <w:szCs w:val="21"/>
+        </w:rPr>
+        <w:t xml:space="preserve">— O enterro — disse Lia. — Era tudo pelo enterro.</w:t>
+      </w:r>
+    </w:p>
+    <w:p>
+      <w:pPr>
+        <w:spacing w:after="0" w:line="312"/>
+        <w:ind w:firstLine="340"/>
+        <w:jc w:val="both"/>
+      </w:pPr>
+      <w:r>
+        <w:rPr>
+          <w:rFonts w:ascii="Georgia" w:cs="Georgia" w:eastAsia="Georgia" w:hAnsi="Georgia"/>
+          <w:sz w:val="21"/>
+          <w:szCs w:val="21"/>
+        </w:rPr>
+        <w:t xml:space="preserve">— Era tudo pelo enterro. Na gaveta, a tampa só de parafuso, eu com a chave do portão lateral, que custou mais caro do que a gaveta. Na madrugada de quarta, eu abria, aplicava a segunda substância, e às seis ele estava em Moema, tomando café. — O médico sorriu, um sorriso horrível. — Ele dizia que a Helena ia enterrar. Que ela tinha horror de cremação. Ele deixou a decisão com ela de propósito, na frente de todo mundo, no velório do irmão, porque achava que uma viúva que enterra o marido não levanta suspeita. Ele não sabia quem ela era. Eu também não sabia.</w:t>
+      </w:r>
+    </w:p>
+    <w:p>
+      <w:pPr>
+        <w:spacing w:after="0" w:line="312"/>
+        <w:ind w:firstLine="340"/>
+        <w:jc w:val="both"/>
+      </w:pPr>
+      <w:r>
+        <w:rPr>
+          <w:rFonts w:ascii="Georgia" w:cs="Georgia" w:eastAsia="Georgia" w:hAnsi="Georgia"/>
+          <w:sz w:val="21"/>
+          <w:szCs w:val="21"/>
+        </w:rPr>
+        <w:t xml:space="preserve">— E quando ela escolheu cremar? — perguntou Lucas.</w:t>
+      </w:r>
+    </w:p>
+    <w:p>
+      <w:pPr>
+        <w:spacing w:after="0" w:line="312"/>
+        <w:ind w:firstLine="340"/>
+        <w:jc w:val="both"/>
+      </w:pPr>
+      <w:r>
+        <w:rPr>
+          <w:rFonts w:ascii="Georgia" w:cs="Georgia" w:eastAsia="Georgia" w:hAnsi="Georgia"/>
+          <w:sz w:val="21"/>
+          <w:szCs w:val="21"/>
+        </w:rPr>
+        <w:t xml:space="preserve">— Eu lutei. Vocês sabem que eu lutei. — Ele se voltou para Lia. — Você ouviu, no corredor. Eu implorei. Mas todo mundo queria aquele fogo. O Otávio. Os amigos da Associação. O deputado mandou recado. Parecia a cidade inteira empurrando a mesma porta.</w:t>
+      </w:r>
+    </w:p>
+    <w:p>
+      <w:pPr>
+        <w:spacing w:after="0" w:line="312"/>
+        <w:ind w:firstLine="340"/>
+        <w:jc w:val="both"/>
+      </w:pPr>
+      <w:r>
+        <w:rPr>
+          <w:rFonts w:ascii="Georgia" w:cs="Georgia" w:eastAsia="Georgia" w:hAnsi="Georgia"/>
+          <w:sz w:val="21"/>
+          <w:szCs w:val="21"/>
+        </w:rPr>
+        <w:t xml:space="preserve">Lia segurou a pasta dos desenhos contra o peito.</w:t>
+      </w:r>
+    </w:p>
+    <w:p>
+      <w:pPr>
+        <w:spacing w:after="0" w:line="312"/>
+        <w:ind w:firstLine="340"/>
+        <w:jc w:val="both"/>
+      </w:pPr>
+      <w:r>
+        <w:rPr>
+          <w:rFonts w:ascii="Georgia" w:cs="Georgia" w:eastAsia="Georgia" w:hAnsi="Georgia"/>
+          <w:sz w:val="21"/>
+          <w:szCs w:val="21"/>
+        </w:rPr>
+        <w:t xml:space="preserve">— O senhor tinha o antídoto no bolso.</w:t>
+      </w:r>
+    </w:p>
+    <w:p>
+      <w:pPr>
+        <w:spacing w:after="0" w:line="312"/>
+        <w:ind w:firstLine="340"/>
+        <w:jc w:val="both"/>
+      </w:pPr>
+      <w:r>
+        <w:rPr>
+          <w:rFonts w:ascii="Georgia" w:cs="Georgia" w:eastAsia="Georgia" w:hAnsi="Georgia"/>
+          <w:sz w:val="21"/>
+          <w:szCs w:val="21"/>
+        </w:rPr>
+        <w:t xml:space="preserve">O doutor Álvaro não respondeu.</w:t>
+      </w:r>
+    </w:p>
+    <w:p>
+      <w:pPr>
+        <w:spacing w:after="0" w:line="312"/>
+        <w:ind w:firstLine="340"/>
+        <w:jc w:val="both"/>
+      </w:pPr>
+      <w:r>
+        <w:rPr>
+          <w:rFonts w:ascii="Georgia" w:cs="Georgia" w:eastAsia="Georgia" w:hAnsi="Georgia"/>
+          <w:sz w:val="21"/>
+          <w:szCs w:val="21"/>
+        </w:rPr>
+        <w:t xml:space="preserve">— O senhor passou a noite inteira do lado dele, na funerária. Sozinho. Às três e quarenta da manhã, o senhor escreveu no celular dele: você ainda está quente. — A voz dela tremia, mas não quebrou. — Bastava uma injeção. Bastava abrir a porta e gritar. O senhor tinha seis horas.</w:t>
+      </w:r>
+    </w:p>
+    <w:p>
+      <w:pPr>
+        <w:spacing w:after="200" w:before="200"/>
+        <w:jc w:val="center"/>
+      </w:pPr>
+      <w:r>
+        <w:rPr>
+          <w:rFonts w:ascii="Georgia" w:cs="Georgia" w:eastAsia="Georgia" w:hAnsi="Georgia"/>
+          <w:sz w:val="22"/>
+          <w:szCs w:val="22"/>
+        </w:rPr>
+        <w:t xml:space="preserve">*</w:t>
+      </w:r>
+    </w:p>
+    <w:p>
+      <w:pPr>
+        <w:spacing w:after="0" w:line="312"/>
+        <w:ind w:firstLine="340"/>
+        <w:jc w:val="both"/>
+      </w:pPr>
+      <w:r>
+        <w:rPr>
+          <w:rFonts w:ascii="Georgia" w:cs="Georgia" w:eastAsia="Georgia" w:hAnsi="Georgia"/>
+          <w:sz w:val="21"/>
+          <w:szCs w:val="21"/>
+        </w:rPr>
+        <w:t xml:space="preserve">O médico ficou muito tempo calado. Nas portas automáticas, uma menina de uns cinco anos se soltou da mão da mãe e correu para abraçar um homem de uniforme de piloto.</w:t>
+      </w:r>
+    </w:p>
+    <w:p>
+      <w:pPr>
+        <w:spacing w:after="0" w:line="312"/>
+        <w:ind w:firstLine="340"/>
+        <w:jc w:val="both"/>
+      </w:pPr>
+      <w:r>
+        <w:rPr>
+          <w:rFonts w:ascii="Georgia" w:cs="Georgia" w:eastAsia="Georgia" w:hAnsi="Georgia"/>
+          <w:sz w:val="21"/>
+          <w:szCs w:val="21"/>
+        </w:rPr>
+        <w:t xml:space="preserve">— Eu tive seis horas — disse ele, enfim. — Passei as seis com a seringa na mão.</w:t>
+      </w:r>
+    </w:p>
+    <w:p>
+      <w:pPr>
+        <w:spacing w:after="0" w:line="312"/>
+        <w:ind w:firstLine="340"/>
+        <w:jc w:val="both"/>
+      </w:pPr>
+      <w:r>
+        <w:rPr>
+          <w:rFonts w:ascii="Georgia" w:cs="Georgia" w:eastAsia="Georgia" w:hAnsi="Georgia"/>
+          <w:sz w:val="21"/>
+          <w:szCs w:val="21"/>
+        </w:rPr>
+        <w:t xml:space="preserve">Lucas sentiu o estômago revirar.</w:t>
+      </w:r>
+    </w:p>
+    <w:p>
+      <w:pPr>
+        <w:spacing w:after="0" w:line="312"/>
+        <w:ind w:firstLine="340"/>
+        <w:jc w:val="both"/>
+      </w:pPr>
+      <w:r>
+        <w:rPr>
+          <w:rFonts w:ascii="Georgia" w:cs="Georgia" w:eastAsia="Georgia" w:hAnsi="Georgia"/>
+          <w:sz w:val="21"/>
+          <w:szCs w:val="21"/>
+        </w:rPr>
+        <w:t xml:space="preserve">— Se eu acordasse o Henrique numa sala de velório — continuou o médico, devagar, como quem lê um laudo —, era o fim de tudo. Para ele e para mim. Um homem investigado por quatro mortes, que forjou a própria morte com a ajuda do médico. Um atestado falso. Uma assinatura falsa, do Paulo, que não tinha culpa de nada. Uma substância que nenhuma comissão aprovou. Um seguro de vida aumentado três meses antes, em nome dos filhos. Fraude, falsidade, sei lá quantos outros nomes. Eu ia preso, com sessenta e um anos. Perdia o diploma, o nome, tudo o que eu fui. Eu disse a mim mesmo que era isso. Que era medo.</w:t>
+      </w:r>
+    </w:p>
+    <w:p>
+      <w:pPr>
+        <w:spacing w:after="0" w:line="312"/>
+        <w:ind w:firstLine="340"/>
+        <w:jc w:val="both"/>
+      </w:pPr>
+      <w:r>
+        <w:rPr>
+          <w:rFonts w:ascii="Georgia" w:cs="Georgia" w:eastAsia="Georgia" w:hAnsi="Georgia"/>
+          <w:sz w:val="21"/>
+          <w:szCs w:val="21"/>
+        </w:rPr>
+        <w:t xml:space="preserve">Ele parou. Olhou para as próprias mãos.</w:t>
+      </w:r>
+    </w:p>
+    <w:p>
+      <w:pPr>
+        <w:spacing w:after="0" w:line="312"/>
+        <w:ind w:firstLine="340"/>
+        <w:jc w:val="both"/>
+      </w:pPr>
+      <w:r>
+        <w:rPr>
+          <w:rFonts w:ascii="Georgia" w:cs="Georgia" w:eastAsia="Georgia" w:hAnsi="Georgia"/>
+          <w:sz w:val="21"/>
+          <w:szCs w:val="21"/>
+        </w:rPr>
+        <w:t xml:space="preserve">— Era medo. Mas não era só medo. — A voz baixou tanto que Lia precisou se inclinar. — Às três da manhã, sentado do lado dele, com a seringa na mão, eu pensei na conta de Zurique. Pensei uma vez só. Que, se o Henrique não acordasse, eu ficava com a chave de tudo. Ninguém sabia que aquela conta existia. Ninguém ia perguntar. — Ele fechou os olhos. — Pensei uma vez só. Foi o bastante. Eu guardei a seringa no bolso.</w:t>
+      </w:r>
+    </w:p>
+    <w:p>
+      <w:pPr>
+        <w:spacing w:after="0" w:line="312"/>
+        <w:ind w:firstLine="340"/>
+        <w:jc w:val="both"/>
+      </w:pPr>
+      <w:r>
+        <w:rPr>
+          <w:rFonts w:ascii="Georgia" w:cs="Georgia" w:eastAsia="Georgia" w:hAnsi="Georgia"/>
+          <w:sz w:val="21"/>
+          <w:szCs w:val="21"/>
+        </w:rPr>
+        <w:t xml:space="preserve">Ninguém disse nada.</w:t>
+      </w:r>
+    </w:p>
+    <w:p>
+      <w:pPr>
+        <w:spacing w:after="0" w:line="312"/>
+        <w:ind w:firstLine="340"/>
+        <w:jc w:val="both"/>
+      </w:pPr>
+      <w:r>
+        <w:rPr>
+          <w:rFonts w:ascii="Georgia" w:cs="Georgia" w:eastAsia="Georgia" w:hAnsi="Georgia"/>
+          <w:sz w:val="21"/>
+          <w:szCs w:val="21"/>
+        </w:rPr>
+        <w:t xml:space="preserve">— Às nove, antes de fecharem o caixão para a cerimônia, eu pus a mão no pescoço dele, como quem se despede — disse o doutor Álvaro, sem abrir os olhos. — Tinha pulso. Fraquinho. Eu senti. E deixei fechar.</w:t>
+      </w:r>
+    </w:p>
+    <w:p>
+      <w:pPr>
+        <w:spacing w:after="0" w:line="312"/>
+        <w:ind w:firstLine="340"/>
+        <w:jc w:val="both"/>
+      </w:pPr>
+      <w:r>
+        <w:rPr>
+          <w:rFonts w:ascii="Georgia" w:cs="Georgia" w:eastAsia="Georgia" w:hAnsi="Georgia"/>
+          <w:sz w:val="21"/>
+          <w:szCs w:val="21"/>
+        </w:rPr>
+        <w:t xml:space="preserve">Lia se levantou de uma vez, deu dois passos e parou, de costas para os dois, com a pasta dos desenhos apertada contra o peito. Lucas não se mexeu. Estava com as mãos fechadas sobre os joelhos, tão apertadas que os nós dos dedos tinham ficado brancos.</w:t>
+      </w:r>
+    </w:p>
+    <w:p>
+      <w:pPr>
+        <w:spacing w:after="0" w:line="312"/>
+        <w:ind w:firstLine="340"/>
+        <w:jc w:val="both"/>
+      </w:pPr>
+      <w:r>
+        <w:rPr>
+          <w:rFonts w:ascii="Georgia" w:cs="Georgia" w:eastAsia="Georgia" w:hAnsi="Georgia"/>
+          <w:sz w:val="21"/>
+          <w:szCs w:val="21"/>
+        </w:rPr>
+        <w:t xml:space="preserve">— Quando a plataforma desceu — disse o médico —, eu fechei os olhos. Fiquei de olhos fechados até muito depois. Vocês viram. Eu não tinha coragem de olhar para o chão onde ele tinha estado.</w:t>
+      </w:r>
+    </w:p>
+    <w:p>
+      <w:pPr>
+        <w:spacing w:after="200" w:before="200"/>
+        <w:jc w:val="center"/>
+      </w:pPr>
+      <w:r>
+        <w:rPr>
+          <w:rFonts w:ascii="Georgia" w:cs="Georgia" w:eastAsia="Georgia" w:hAnsi="Georgia"/>
+          <w:sz w:val="22"/>
+          <w:szCs w:val="22"/>
+        </w:rPr>
+        <w:t xml:space="preserve">*</w:t>
+      </w:r>
+    </w:p>
+    <w:p>
+      <w:pPr>
+        <w:spacing w:after="0" w:line="312"/>
+        <w:ind w:firstLine="340"/>
+        <w:jc w:val="both"/>
+      </w:pPr>
+      <w:r>
+        <w:rPr>
+          <w:rFonts w:ascii="Georgia" w:cs="Georgia" w:eastAsia="Georgia" w:hAnsi="Georgia"/>
+          <w:sz w:val="21"/>
+          <w:szCs w:val="21"/>
+        </w:rPr>
+        <w:t xml:space="preserve">Foi Lia quem falou primeiro, ainda de costas.</w:t>
+      </w:r>
+    </w:p>
+    <w:p>
+      <w:pPr>
+        <w:spacing w:after="0" w:line="312"/>
+        <w:ind w:firstLine="340"/>
+        <w:jc w:val="both"/>
+      </w:pPr>
+      <w:r>
+        <w:rPr>
+          <w:rFonts w:ascii="Georgia" w:cs="Georgia" w:eastAsia="Georgia" w:hAnsi="Georgia"/>
+          <w:sz w:val="21"/>
+          <w:szCs w:val="21"/>
+        </w:rPr>
+        <w:t xml:space="preserve">— Ele foi ao meu apartamento na segunda — disse, para Lucas, não para o médico. — Você já sabe. Ficou até quase meia-noite. Trouxe um vinho que não abriu. Perguntou se o meu passaporte estava válido. Disse que um dia ia me mandar um cartão-postal de um lugar com neve, e que eu ia entender. Pediu para eu não contar para ninguém. Nem para você.</w:t>
+      </w:r>
+    </w:p>
+    <w:p>
+      <w:pPr>
+        <w:spacing w:after="0" w:line="312"/>
+        <w:ind w:firstLine="340"/>
+        <w:jc w:val="both"/>
+      </w:pPr>
+      <w:r>
+        <w:rPr>
+          <w:rFonts w:ascii="Georgia" w:cs="Georgia" w:eastAsia="Georgia" w:hAnsi="Georgia"/>
+          <w:sz w:val="21"/>
+          <w:szCs w:val="21"/>
+        </w:rPr>
+        <w:t xml:space="preserve">Ela se virou.</w:t>
+      </w:r>
+    </w:p>
+    <w:p>
+      <w:pPr>
+        <w:spacing w:after="0" w:line="312"/>
+        <w:ind w:firstLine="340"/>
+        <w:jc w:val="both"/>
+      </w:pPr>
+      <w:r>
+        <w:rPr>
+          <w:rFonts w:ascii="Georgia" w:cs="Georgia" w:eastAsia="Georgia" w:hAnsi="Georgia"/>
+          <w:sz w:val="21"/>
+          <w:szCs w:val="21"/>
+        </w:rPr>
+        <w:t xml:space="preserve">— Eu liguei sete vezes para ele na terça porque acordei com a certeza de que tinha sido uma despedida. E não te contei porque ele pediu. E depois não contei porque fiquei com medo de que você achasse que eu sabia de alguma coisa. — Respirou fundo. — E tem outra. O pai mandou um áudio para o Carlos, no sábado. Dizendo que ia contar tudo para a minha mãe. Eu achei, apaguei do celular antes de você ver, e menti para você na calçada do japonês. Achei que você ia culpar o Carlos.</w:t>
+      </w:r>
+    </w:p>
+    <w:p>
+      <w:pPr>
+        <w:spacing w:after="0" w:line="312"/>
+        <w:ind w:firstLine="340"/>
+        <w:jc w:val="both"/>
+      </w:pPr>
+      <w:r>
+        <w:rPr>
+          <w:rFonts w:ascii="Georgia" w:cs="Georgia" w:eastAsia="Georgia" w:hAnsi="Georgia"/>
+          <w:sz w:val="21"/>
+          <w:szCs w:val="21"/>
+        </w:rPr>
+        <w:t xml:space="preserve">Lucas olhou para ela por um tempo.</w:t>
+      </w:r>
+    </w:p>
+    <w:p>
+      <w:pPr>
+        <w:spacing w:after="0" w:line="312"/>
+        <w:ind w:firstLine="340"/>
+        <w:jc w:val="both"/>
+      </w:pPr>
+      <w:r>
+        <w:rPr>
+          <w:rFonts w:ascii="Georgia" w:cs="Georgia" w:eastAsia="Georgia" w:hAnsi="Georgia"/>
+          <w:sz w:val="21"/>
+          <w:szCs w:val="21"/>
+        </w:rPr>
+        <w:t xml:space="preserve">— Eu ia — disse. — Eu culpei.</w:t>
+      </w:r>
+    </w:p>
+    <w:p>
+      <w:pPr>
+        <w:spacing w:after="0" w:line="312"/>
+        <w:ind w:firstLine="340"/>
+        <w:jc w:val="both"/>
+      </w:pPr>
+      <w:r>
+        <w:rPr>
+          <w:rFonts w:ascii="Georgia" w:cs="Georgia" w:eastAsia="Georgia" w:hAnsi="Georgia"/>
+          <w:sz w:val="21"/>
+          <w:szCs w:val="21"/>
+        </w:rPr>
+        <w:t xml:space="preserve">Depois baixou os olhos.</w:t>
+      </w:r>
+    </w:p>
+    <w:p>
+      <w:pPr>
+        <w:spacing w:after="0" w:line="312"/>
+        <w:ind w:firstLine="340"/>
+        <w:jc w:val="both"/>
+      </w:pPr>
+      <w:r>
+        <w:rPr>
+          <w:rFonts w:ascii="Georgia" w:cs="Georgia" w:eastAsia="Georgia" w:hAnsi="Georgia"/>
+          <w:sz w:val="21"/>
+          <w:szCs w:val="21"/>
+        </w:rPr>
+        <w:t xml:space="preserve">— A briga era minha. A conversa que sumiu do celular. Ele queria que eu entrasse na corretora, eu disse coisas horríveis às duas da manhã, e apaguei tudo no primeiro dia, na cozinha, antes de qualquer pessoa ver. — Ele abriu o envelope pardo e tirou a ata. — E isso. Achei em Moema, numa gaveta trancada. A empresa de Zurique, no nome do pai, com ele de diretor. — Indicou o médico com o queixo, sem olhar. — E não te contei. Eu te segui até a casa da sua mãe, Lia. Vi você entregar um envelope ao Carlos e pus o seu nome na minha lista.</w:t>
+      </w:r>
+    </w:p>
+    <w:p>
+      <w:pPr>
+        <w:spacing w:after="0" w:line="312"/>
+        <w:ind w:firstLine="340"/>
+        <w:jc w:val="both"/>
+      </w:pPr>
+      <w:r>
+        <w:rPr>
+          <w:rFonts w:ascii="Georgia" w:cs="Georgia" w:eastAsia="Georgia" w:hAnsi="Georgia"/>
+          <w:sz w:val="21"/>
+          <w:szCs w:val="21"/>
+        </w:rPr>
+        <w:t xml:space="preserve">— Era o dinheiro da minha parte e da dele — disse Lia. — Para pagar uma clínica boa para a minha mãe. Uma de verdade.</w:t>
+      </w:r>
+    </w:p>
+    <w:p>
+      <w:pPr>
+        <w:spacing w:after="0" w:line="312"/>
+        <w:ind w:firstLine="340"/>
+        <w:jc w:val="both"/>
+      </w:pPr>
+      <w:r>
+        <w:rPr>
+          <w:rFonts w:ascii="Georgia" w:cs="Georgia" w:eastAsia="Georgia" w:hAnsi="Georgia"/>
+          <w:sz w:val="21"/>
+          <w:szCs w:val="21"/>
+        </w:rPr>
+        <w:t xml:space="preserve">— Eu sei. Agora eu sei.</w:t>
+      </w:r>
+    </w:p>
+    <w:p>
+      <w:pPr>
+        <w:spacing w:after="0" w:line="312"/>
+        <w:ind w:firstLine="340"/>
+        <w:jc w:val="both"/>
+      </w:pPr>
+      <w:r>
+        <w:rPr>
+          <w:rFonts w:ascii="Georgia" w:cs="Georgia" w:eastAsia="Georgia" w:hAnsi="Georgia"/>
+          <w:sz w:val="21"/>
+          <w:szCs w:val="21"/>
+        </w:rPr>
+        <w:t xml:space="preserve">Os dois se olharam por cima do médico, sentado entre eles, curvado sobre a maleta. Lia sentiu uma vontade absurda de rir, e depois de chorar, e não fez nenhuma das duas coisas.</w:t>
+      </w:r>
+    </w:p>
+    <w:p>
+      <w:pPr>
+        <w:spacing w:after="0" w:line="312"/>
+        <w:ind w:firstLine="340"/>
+        <w:jc w:val="both"/>
+      </w:pPr>
+      <w:r>
+        <w:rPr>
+          <w:rFonts w:ascii="Georgia" w:cs="Georgia" w:eastAsia="Georgia" w:hAnsi="Georgia"/>
+          <w:sz w:val="21"/>
+          <w:szCs w:val="21"/>
+        </w:rPr>
+        <w:t xml:space="preserve">— A gente fez uma lista um do outro — disse ela.</w:t>
+      </w:r>
+    </w:p>
+    <w:p>
+      <w:pPr>
+        <w:spacing w:after="0" w:line="312"/>
+        <w:ind w:firstLine="340"/>
+        <w:jc w:val="both"/>
+      </w:pPr>
+      <w:r>
+        <w:rPr>
+          <w:rFonts w:ascii="Georgia" w:cs="Georgia" w:eastAsia="Georgia" w:hAnsi="Georgia"/>
+          <w:sz w:val="21"/>
+          <w:szCs w:val="21"/>
+        </w:rPr>
+        <w:t xml:space="preserve">— Com o mesmo pai no meio.</w:t>
+      </w:r>
+    </w:p>
+    <w:p>
+      <w:pPr>
+        <w:spacing w:after="200" w:before="200"/>
+        <w:jc w:val="center"/>
+      </w:pPr>
+      <w:r>
+        <w:rPr>
+          <w:rFonts w:ascii="Georgia" w:cs="Georgia" w:eastAsia="Georgia" w:hAnsi="Georgia"/>
+          <w:sz w:val="22"/>
+          <w:szCs w:val="22"/>
+        </w:rPr>
+        <w:t xml:space="preserve">*</w:t>
+      </w:r>
+    </w:p>
+    <w:p>
+      <w:pPr>
+        <w:spacing w:after="0" w:line="312"/>
+        <w:ind w:firstLine="340"/>
+        <w:jc w:val="both"/>
+      </w:pPr>
+      <w:r>
+        <w:rPr>
+          <w:rFonts w:ascii="Georgia" w:cs="Georgia" w:eastAsia="Georgia" w:hAnsi="Georgia"/>
+          <w:sz w:val="21"/>
+          <w:szCs w:val="21"/>
+        </w:rPr>
+        <w:t xml:space="preserve">Regina Paiva chegou às dez e dezoito, pela porta do estacionamento, com dois agentes da Polícia Federal de colete e um investigador que Lia reconheceu do Departamento de Homicídios. Não correu. Atravessou o saguão no mesmo passo de sempre, com o terninho azul-marinho e a pasta debaixo do braço, e parou na frente do banco.</w:t>
+      </w:r>
+    </w:p>
+    <w:p>
+      <w:pPr>
+        <w:spacing w:after="0" w:line="312"/>
+        <w:ind w:firstLine="340"/>
+        <w:jc w:val="both"/>
+      </w:pPr>
+      <w:r>
+        <w:rPr>
+          <w:rFonts w:ascii="Georgia" w:cs="Georgia" w:eastAsia="Georgia" w:hAnsi="Georgia"/>
+          <w:sz w:val="21"/>
+          <w:szCs w:val="21"/>
+        </w:rPr>
+        <w:t xml:space="preserve">Olhou para Lucas. Olhou para Lia. Balançou a cabeça devagar.</w:t>
+      </w:r>
+    </w:p>
+    <w:p>
+      <w:pPr>
+        <w:spacing w:after="0" w:line="312"/>
+        <w:ind w:firstLine="340"/>
+        <w:jc w:val="both"/>
+      </w:pPr>
+      <w:r>
+        <w:rPr>
+          <w:rFonts w:ascii="Georgia" w:cs="Georgia" w:eastAsia="Georgia" w:hAnsi="Georgia"/>
+          <w:sz w:val="21"/>
+          <w:szCs w:val="21"/>
+        </w:rPr>
+        <w:t xml:space="preserve">— Eu pedi para ficarem longe — disse.</w:t>
+      </w:r>
+    </w:p>
+    <w:p>
+      <w:pPr>
+        <w:spacing w:after="0" w:line="312"/>
+        <w:ind w:firstLine="340"/>
+        <w:jc w:val="both"/>
+      </w:pPr>
+      <w:r>
+        <w:rPr>
+          <w:rFonts w:ascii="Georgia" w:cs="Georgia" w:eastAsia="Georgia" w:hAnsi="Georgia"/>
+          <w:sz w:val="21"/>
+          <w:szCs w:val="21"/>
+        </w:rPr>
+        <w:t xml:space="preserve">— Ele não fugiu — disse Lia. — Ficou esperando.</w:t>
+      </w:r>
+    </w:p>
+    <w:p>
+      <w:pPr>
+        <w:spacing w:after="0" w:line="312"/>
+        <w:ind w:firstLine="340"/>
+        <w:jc w:val="both"/>
+      </w:pPr>
+      <w:r>
+        <w:rPr>
+          <w:rFonts w:ascii="Georgia" w:cs="Georgia" w:eastAsia="Georgia" w:hAnsi="Georgia"/>
+          <w:sz w:val="21"/>
+          <w:szCs w:val="21"/>
+        </w:rPr>
+        <w:t xml:space="preserve">A delegada se virou para o médico.</w:t>
+      </w:r>
+    </w:p>
+    <w:p>
+      <w:pPr>
+        <w:spacing w:after="0" w:line="312"/>
+        <w:ind w:firstLine="340"/>
+        <w:jc w:val="both"/>
+      </w:pPr>
+      <w:r>
+        <w:rPr>
+          <w:rFonts w:ascii="Georgia" w:cs="Georgia" w:eastAsia="Georgia" w:hAnsi="Georgia"/>
+          <w:sz w:val="21"/>
+          <w:szCs w:val="21"/>
+        </w:rPr>
+        <w:t xml:space="preserve">— Doutor Álvaro Mendes. — Ela tirou da pasta uma folha dobrada. — Tenho aqui um mandado de prisão temporária, expedido hoje à tarde. O senhor vai responder pela morte de Henrique Salvallus, além da falsidade do atestado e do uso de uma substância que ninguém autorizou. O promotor vai decidir o nome exato de cada coisa, mas eu já adianto o principal. Um médico que se compromete a cuidar de um paciente e, podendo salvá-lo, não faz nada, responde pela morte dele como se tivesse matado com as próprias mãos.</w:t>
+      </w:r>
+    </w:p>
+    <w:p>
+      <w:pPr>
+        <w:spacing w:after="0" w:line="312"/>
+        <w:ind w:firstLine="340"/>
+        <w:jc w:val="both"/>
+      </w:pPr>
+      <w:r>
+        <w:rPr>
+          <w:rFonts w:ascii="Georgia" w:cs="Georgia" w:eastAsia="Georgia" w:hAnsi="Georgia"/>
+          <w:sz w:val="21"/>
+          <w:szCs w:val="21"/>
+        </w:rPr>
+        <w:t xml:space="preserve">O doutor Álvaro se levantou. Estendeu os pulsos sozinho, antes que alguém pedisse.</w:t>
+      </w:r>
+    </w:p>
+    <w:p>
+      <w:pPr>
+        <w:spacing w:after="0" w:line="312"/>
+        <w:ind w:firstLine="340"/>
+        <w:jc w:val="both"/>
+      </w:pPr>
+      <w:r>
+        <w:rPr>
+          <w:rFonts w:ascii="Georgia" w:cs="Georgia" w:eastAsia="Georgia" w:hAnsi="Georgia"/>
+          <w:sz w:val="21"/>
+          <w:szCs w:val="21"/>
+        </w:rPr>
+        <w:t xml:space="preserve">— Não precisa — disse Regina. — O senhor não vai a lugar nenhum. Já percebeu isso.</w:t>
+      </w:r>
+    </w:p>
+    <w:p>
+      <w:pPr>
+        <w:spacing w:after="0" w:line="312"/>
+        <w:ind w:firstLine="340"/>
+        <w:jc w:val="both"/>
+      </w:pPr>
+      <w:r>
+        <w:rPr>
+          <w:rFonts w:ascii="Georgia" w:cs="Georgia" w:eastAsia="Georgia" w:hAnsi="Georgia"/>
+          <w:sz w:val="21"/>
+          <w:szCs w:val="21"/>
+        </w:rPr>
+        <w:t xml:space="preserve">Ele baixou os braços. Pegou a maleta. Olhou uma última vez para os dois irmãos.</w:t>
+      </w:r>
+    </w:p>
+    <w:p>
+      <w:pPr>
+        <w:spacing w:after="0" w:line="312"/>
+        <w:ind w:firstLine="340"/>
+        <w:jc w:val="both"/>
+      </w:pPr>
+      <w:r>
+        <w:rPr>
+          <w:rFonts w:ascii="Georgia" w:cs="Georgia" w:eastAsia="Georgia" w:hAnsi="Georgia"/>
+          <w:sz w:val="21"/>
+          <w:szCs w:val="21"/>
+        </w:rPr>
+        <w:t xml:space="preserve">— Ele amava vocês do jeito torto dele — disse. — O plano era por vocês. As mortes iam parar. A conta era para vocês três, dividida, quando a poeira baixasse. Ele ia mandar o cartão-postal. Eu juro.</w:t>
+      </w:r>
+    </w:p>
+    <w:p>
+      <w:pPr>
+        <w:spacing w:after="0" w:line="312"/>
+        <w:ind w:firstLine="340"/>
+        <w:jc w:val="both"/>
+      </w:pPr>
+      <w:r>
+        <w:rPr>
+          <w:rFonts w:ascii="Georgia" w:cs="Georgia" w:eastAsia="Georgia" w:hAnsi="Georgia"/>
+          <w:sz w:val="21"/>
+          <w:szCs w:val="21"/>
+        </w:rPr>
+        <w:t xml:space="preserve">Lia não respondeu. Lucas também não.</w:t>
+      </w:r>
+    </w:p>
+    <w:p>
+      <w:pPr>
+        <w:spacing w:after="0" w:line="312"/>
+        <w:ind w:firstLine="340"/>
+        <w:jc w:val="both"/>
+      </w:pPr>
+      <w:r>
+        <w:rPr>
+          <w:rFonts w:ascii="Georgia" w:cs="Georgia" w:eastAsia="Georgia" w:hAnsi="Georgia"/>
+          <w:sz w:val="21"/>
+          <w:szCs w:val="21"/>
+        </w:rPr>
+        <w:t xml:space="preserve">Os agentes o levaram pela porta do estacionamento. Ele andou entre os dois, de cabeça baixa, a maleta de couro na mão, e não olhou para trás nem quando a porta automática se abriu.</w:t>
+      </w:r>
+    </w:p>
+    <w:p>
+      <w:pPr>
+        <w:spacing w:after="200" w:before="200"/>
+        <w:jc w:val="center"/>
+      </w:pPr>
+      <w:r>
+        <w:rPr>
+          <w:rFonts w:ascii="Georgia" w:cs="Georgia" w:eastAsia="Georgia" w:hAnsi="Georgia"/>
+          <w:sz w:val="22"/>
+          <w:szCs w:val="22"/>
+        </w:rPr>
+        <w:t xml:space="preserve">*</w:t>
+      </w:r>
+    </w:p>
+    <w:p>
+      <w:pPr>
+        <w:spacing w:after="0" w:line="312"/>
+        <w:ind w:firstLine="340"/>
+        <w:jc w:val="both"/>
+      </w:pPr>
+      <w:r>
+        <w:rPr>
+          <w:rFonts w:ascii="Georgia" w:cs="Georgia" w:eastAsia="Georgia" w:hAnsi="Georgia"/>
+          <w:sz w:val="21"/>
+          <w:szCs w:val="21"/>
+        </w:rPr>
+        <w:t xml:space="preserve">Regina ficou.</w:t>
+      </w:r>
+    </w:p>
+    <w:p>
+      <w:pPr>
+        <w:spacing w:after="0" w:line="312"/>
+        <w:ind w:firstLine="340"/>
+        <w:jc w:val="both"/>
+      </w:pPr>
+      <w:r>
+        <w:rPr>
+          <w:rFonts w:ascii="Georgia" w:cs="Georgia" w:eastAsia="Georgia" w:hAnsi="Georgia"/>
+          <w:sz w:val="21"/>
+          <w:szCs w:val="21"/>
+        </w:rPr>
+        <w:t xml:space="preserve">Sentou-se no banco de metal, no lugar onde o médico tinha estado, entre os dois irmãos. Ficou um tempo calada, olhando para as portas do desembarque.</w:t>
+      </w:r>
+    </w:p>
+    <w:p>
+      <w:pPr>
+        <w:spacing w:after="0" w:line="312"/>
+        <w:ind w:firstLine="340"/>
+        <w:jc w:val="both"/>
+      </w:pPr>
+      <w:r>
+        <w:rPr>
+          <w:rFonts w:ascii="Georgia" w:cs="Georgia" w:eastAsia="Georgia" w:hAnsi="Georgia"/>
+          <w:sz w:val="21"/>
+          <w:szCs w:val="21"/>
+        </w:rPr>
+        <w:t xml:space="preserve">— Vocês dois deviam ter me ligado antes — disse, enfim. — Os dois. Separados. Cada um achando que estava protegendo o outro.</w:t>
+      </w:r>
+    </w:p>
+    <w:p>
+      <w:pPr>
+        <w:spacing w:after="0" w:line="312"/>
+        <w:ind w:firstLine="340"/>
+        <w:jc w:val="both"/>
+      </w:pPr>
+      <w:r>
+        <w:rPr>
+          <w:rFonts w:ascii="Georgia" w:cs="Georgia" w:eastAsia="Georgia" w:hAnsi="Georgia"/>
+          <w:sz w:val="21"/>
+          <w:szCs w:val="21"/>
+        </w:rPr>
+        <w:t xml:space="preserve">— A senhora sabia desde terça — disse Lucas.</w:t>
+      </w:r>
+    </w:p>
+    <w:p>
+      <w:pPr>
+        <w:spacing w:after="0" w:line="312"/>
+        <w:ind w:firstLine="340"/>
+        <w:jc w:val="both"/>
+      </w:pPr>
+      <w:r>
+        <w:rPr>
+          <w:rFonts w:ascii="Georgia" w:cs="Georgia" w:eastAsia="Georgia" w:hAnsi="Georgia"/>
+          <w:sz w:val="21"/>
+          <w:szCs w:val="21"/>
+        </w:rPr>
+        <w:t xml:space="preserve">— Desde terça eu sabia do voo, pelo seu Valdir. Na quarta, ouvi o doutor Werneck e o seu Gilberto. Hoje de manhã, o juiz assinou. — Ela se recostou. — Vocês fizeram um bom trabalho. Um trabalho perigoso, burro e bom.</w:t>
+      </w:r>
+    </w:p>
+    <w:p>
+      <w:pPr>
+        <w:spacing w:after="0" w:line="312"/>
+        <w:ind w:firstLine="340"/>
+        <w:jc w:val="both"/>
+      </w:pPr>
+      <w:r>
+        <w:rPr>
+          <w:rFonts w:ascii="Georgia" w:cs="Georgia" w:eastAsia="Georgia" w:hAnsi="Georgia"/>
+          <w:sz w:val="21"/>
+          <w:szCs w:val="21"/>
+        </w:rPr>
+        <w:t xml:space="preserve">Lia quase riu.</w:t>
+      </w:r>
+    </w:p>
+    <w:p>
+      <w:pPr>
+        <w:spacing w:after="0" w:line="312"/>
+        <w:ind w:firstLine="340"/>
+        <w:jc w:val="both"/>
+      </w:pPr>
+      <w:r>
+        <w:rPr>
+          <w:rFonts w:ascii="Georgia" w:cs="Georgia" w:eastAsia="Georgia" w:hAnsi="Georgia"/>
+          <w:sz w:val="21"/>
+          <w:szCs w:val="21"/>
+        </w:rPr>
+        <w:t xml:space="preserve">A delegada se levantou e ajeitou a pasta debaixo do braço. Já tinha dado dois passos quando se virou.</w:t>
+      </w:r>
+    </w:p>
+    <w:p>
+      <w:pPr>
+        <w:spacing w:after="0" w:line="312"/>
+        <w:ind w:firstLine="340"/>
+        <w:jc w:val="both"/>
+      </w:pPr>
+      <w:r>
+        <w:rPr>
+          <w:rFonts w:ascii="Georgia" w:cs="Georgia" w:eastAsia="Georgia" w:hAnsi="Georgia"/>
+          <w:sz w:val="21"/>
+          <w:szCs w:val="21"/>
+        </w:rPr>
+        <w:t xml:space="preserve">— Mas não acabou — disse. — O doutor Álvaro deixou o pai de vocês morrer. Isso está resolvido. Mas alguém tentou matar o seu pai quatro vezes antes disso. Alguém envenenou um uísque num motel, alugou uma sala no décimo segundo andar com um fuzil, entrou num quarto de hotel de colete escuro e mexeu nos freios de um carro em Cajamar. Cinco pessoas morreram no lugar dele.</w:t>
+      </w:r>
+    </w:p>
+    <w:p>
+      <w:pPr>
+        <w:spacing w:after="0" w:line="312"/>
+        <w:ind w:firstLine="340"/>
+        <w:jc w:val="both"/>
+      </w:pPr>
+      <w:r>
+        <w:rPr>
+          <w:rFonts w:ascii="Georgia" w:cs="Georgia" w:eastAsia="Georgia" w:hAnsi="Georgia"/>
+          <w:sz w:val="21"/>
+          <w:szCs w:val="21"/>
+        </w:rPr>
+        <w:t xml:space="preserve">Lucas ergueu a cabeça.</w:t>
+      </w:r>
+    </w:p>
+    <w:p>
+      <w:pPr>
+        <w:spacing w:after="0" w:line="312"/>
+        <w:ind w:firstLine="340"/>
+        <w:jc w:val="both"/>
+      </w:pPr>
+      <w:r>
+        <w:rPr>
+          <w:rFonts w:ascii="Georgia" w:cs="Georgia" w:eastAsia="Georgia" w:hAnsi="Georgia"/>
+          <w:sz w:val="21"/>
+          <w:szCs w:val="21"/>
+        </w:rPr>
+        <w:t xml:space="preserve">— A senhora sabe quem foi?</w:t>
+      </w:r>
+    </w:p>
+    <w:p>
+      <w:pPr>
+        <w:spacing w:after="0" w:line="312"/>
+        <w:ind w:firstLine="340"/>
+        <w:jc w:val="both"/>
+      </w:pPr>
+      <w:r>
+        <w:rPr>
+          <w:rFonts w:ascii="Georgia" w:cs="Georgia" w:eastAsia="Georgia" w:hAnsi="Georgia"/>
+          <w:sz w:val="21"/>
+          <w:szCs w:val="21"/>
+        </w:rPr>
+        <w:t xml:space="preserve">— Sei de quase tudo. Agora eu preciso que um juiz saiba também. — Regina olhou para os dois. — Todo mundo queria o seu pai morto, senhor Salvallus. Agora que eu sei quem deixou, vou provar quem mandou.</w:t>
+      </w:r>
+    </w:p>
+    <w:p>
+      <w:pPr>
+        <w:spacing w:after="0" w:line="312"/>
+        <w:ind w:firstLine="340"/>
+        <w:jc w:val="both"/>
+      </w:pPr>
+      <w:r>
+        <w:rPr>
+          <w:rFonts w:ascii="Georgia" w:cs="Georgia" w:eastAsia="Georgia" w:hAnsi="Georgia"/>
+          <w:sz w:val="21"/>
+          <w:szCs w:val="21"/>
+        </w:rPr>
+        <w:t xml:space="preserve">Ela foi embora pelo saguão, no mesmo passo de sempre.</w:t>
+      </w:r>
+    </w:p>
+    <w:p>
+      <w:pPr>
+        <w:spacing w:after="0" w:line="312"/>
+        <w:ind w:firstLine="340"/>
+        <w:jc w:val="both"/>
+      </w:pPr>
+      <w:r>
+        <w:rPr>
+          <w:rFonts w:ascii="Georgia" w:cs="Georgia" w:eastAsia="Georgia" w:hAnsi="Georgia"/>
+          <w:sz w:val="21"/>
+          <w:szCs w:val="21"/>
+        </w:rPr>
+        <w:t xml:space="preserve">Lia sentou de novo, ao lado do irmão. O banco de metal ainda estava morno do corpo do médico. Ela abriu a pasta dos desenhos no colo, tirou a casa de doze janelas e ficou olhando para ela.</w:t>
+      </w:r>
+    </w:p>
+    <w:p>
+      <w:pPr>
+        <w:spacing w:after="0" w:line="312"/>
+        <w:ind w:firstLine="340"/>
+        <w:jc w:val="both"/>
+      </w:pPr>
+      <w:r>
+        <w:rPr>
+          <w:rFonts w:ascii="Georgia" w:cs="Georgia" w:eastAsia="Georgia" w:hAnsi="Georgia"/>
+          <w:sz w:val="21"/>
+          <w:szCs w:val="21"/>
+        </w:rPr>
+        <w:t xml:space="preserve">Lucas pôs a mão sobre a dela.</w:t>
+      </w:r>
+    </w:p>
+    <w:p>
+      <w:pPr>
+        <w:spacing w:after="0" w:line="312"/>
+        <w:ind w:firstLine="340"/>
+        <w:jc w:val="both"/>
+      </w:pPr>
+      <w:r>
+        <w:rPr>
+          <w:rFonts w:ascii="Georgia" w:cs="Georgia" w:eastAsia="Georgia" w:hAnsi="Georgia"/>
+          <w:sz w:val="21"/>
+          <w:szCs w:val="21"/>
+        </w:rPr>
+        <w:t xml:space="preserve">Ficaram assim, os dois, no saguão de chegadas, até o último voo da noite pousar.</w:t>
       </w:r>
     </w:p>
     <w:sectPr>

</xml_diff>

<commit_message>
Livro policial: confissão do Dr. Álvaro mais dramática (cap. 29)
Co-Authored-By: Claude Opus 5.5 <noreply@anthropic.com>
Claude-Session: https://claude.ai/code/session_01BrurxSYygRC3rRhaUYosm1
</commit_message>
<xml_diff>
--- a/docs/livro-policial/TODO_CRIME_TEM_UM_AUTOR.docx
+++ b/docs/livro-policial/TODO_CRIME_TEM_UM_AUTOR.docx
@@ -32461,6 +32461,171 @@
     </w:p>
     <w:p>
       <w:pPr>
+        <w:spacing w:after="0" w:line="312"/>
+        <w:ind w:firstLine="340"/>
+        <w:jc w:val="both"/>
+      </w:pPr>
+      <w:r>
+        <w:rPr>
+          <w:rFonts w:ascii="Georgia" w:cs="Georgia" w:eastAsia="Georgia" w:hAnsi="Georgia"/>
+          <w:sz w:val="21"/>
+          <w:szCs w:val="21"/>
+        </w:rPr>
+        <w:t xml:space="preserve">Então a voz dele mudou. Perdeu a calma de laudo, de consultório, de quarenta anos de notícias ruins dadas com educação, e saiu rachada, aos pedaços, como se alguma coisa dentro dele tivesse cedido de uma vez.</w:t>
+      </w:r>
+    </w:p>
+    <w:p>
+      <w:pPr>
+        <w:spacing w:after="0" w:line="312"/>
+        <w:ind w:firstLine="340"/>
+        <w:jc w:val="both"/>
+      </w:pPr>
+      <w:r>
+        <w:rPr>
+          <w:rFonts w:ascii="Georgia" w:cs="Georgia" w:eastAsia="Georgia" w:hAnsi="Georgia"/>
+          <w:sz w:val="21"/>
+          <w:szCs w:val="21"/>
+        </w:rPr>
+        <w:t xml:space="preserve">— Eu me arrependo — disse. — Vocês não fazem ideia do quanto eu me arrependo. Eu me arrependo da seringa no bolso, da mão no pescoço, dos olhos fechados. Mas eu me arrependo, antes de tudo, do dia em que eu disse a ele que tinha um jeito. — Ele apertou a alça da maleta até os dedos tremerem. — Sabem o que mata um cientista? Não é o erro. É a vaidade. É achar que a sua inteligência é maior do que o mundo. Eu passei a vida inteira com raiva daquela comissão, daquela gente que não acreditou em mim. E quando o Henrique me pediu ajuda, uma parte de mim, uma parte pequena e suja, ficou feliz. Pensei: agora eu provo. Agora eles vão ver. Eu não consegui dominar a minha própria vaidade, e ela me levou pela mão até a ruína. E levou o meu irmão junto.</w:t>
+      </w:r>
+    </w:p>
+    <w:p>
+      <w:pPr>
+        <w:spacing w:after="0" w:line="312"/>
+        <w:ind w:firstLine="340"/>
+        <w:jc w:val="both"/>
+      </w:pPr>
+      <w:r>
+        <w:rPr>
+          <w:rFonts w:ascii="Georgia" w:cs="Georgia" w:eastAsia="Georgia" w:hAnsi="Georgia"/>
+          <w:sz w:val="21"/>
+          <w:szCs w:val="21"/>
+        </w:rPr>
+        <w:t xml:space="preserve">Ele respirou fundo, e o ar entrou aos solavancos.</w:t>
+      </w:r>
+    </w:p>
+    <w:p>
+      <w:pPr>
+        <w:spacing w:after="0" w:line="312"/>
+        <w:ind w:firstLine="340"/>
+        <w:jc w:val="both"/>
+      </w:pPr>
+      <w:r>
+        <w:rPr>
+          <w:rFonts w:ascii="Georgia" w:cs="Georgia" w:eastAsia="Georgia" w:hAnsi="Georgia"/>
+          <w:sz w:val="21"/>
+          <w:szCs w:val="21"/>
+        </w:rPr>
+        <w:t xml:space="preserve">— Eu tinha certeza. Certeza absoluta de que tudo ia dar certo. Eu tinha calculado a dose, o tempo, a temperatura, a gaveta, o portão, a chave. Eu tinha previsto tudo. — Riu, um riso curto e errado, que não combinava com o rosto molhado. — Menos o fogo. A cremação não estava no roteiro. Não estava em nenhuma página. E desde aquela quarta-feira, todo dia, todo santo dia, eu acordo e a culpa está lá, sentada na beira da minha cama, me esperando. Ela me come por dentro, devagar, como ácido. Eu não durmo. Eu não como. Eu converso com ele à noite, em voz alta, no escuro, e às vezes eu juro que ele responde.</w:t>
+      </w:r>
+    </w:p>
+    <w:p>
+      <w:pPr>
+        <w:spacing w:after="0" w:line="312"/>
+        <w:ind w:firstLine="340"/>
+        <w:jc w:val="both"/>
+      </w:pPr>
+      <w:r>
+        <w:rPr>
+          <w:rFonts w:ascii="Georgia" w:cs="Georgia" w:eastAsia="Georgia" w:hAnsi="Georgia"/>
+          <w:sz w:val="21"/>
+          <w:szCs w:val="21"/>
+        </w:rPr>
+        <w:t xml:space="preserve">Lia se virou devagar. Tinha o rosto branco, e a pergunta saiu dela antes que pudesse segurar, numa voz que não parecia a sua.</w:t>
+      </w:r>
+    </w:p>
+    <w:p>
+      <w:pPr>
+        <w:spacing w:after="0" w:line="312"/>
+        <w:ind w:firstLine="340"/>
+        <w:jc w:val="both"/>
+      </w:pPr>
+      <w:r>
+        <w:rPr>
+          <w:rFonts w:ascii="Georgia" w:cs="Georgia" w:eastAsia="Georgia" w:hAnsi="Georgia"/>
+          <w:sz w:val="21"/>
+          <w:szCs w:val="21"/>
+        </w:rPr>
+        <w:t xml:space="preserve">— Ele sofreu?</w:t>
+      </w:r>
+    </w:p>
+    <w:p>
+      <w:pPr>
+        <w:spacing w:after="0" w:line="312"/>
+        <w:ind w:firstLine="340"/>
+        <w:jc w:val="both"/>
+      </w:pPr>
+      <w:r>
+        <w:rPr>
+          <w:rFonts w:ascii="Georgia" w:cs="Georgia" w:eastAsia="Georgia" w:hAnsi="Georgia"/>
+          <w:sz w:val="21"/>
+          <w:szCs w:val="21"/>
+        </w:rPr>
+        <w:t xml:space="preserve">O doutor Álvaro olhou para ela.</w:t>
+      </w:r>
+    </w:p>
+    <w:p>
+      <w:pPr>
+        <w:spacing w:after="0" w:line="312"/>
+        <w:ind w:firstLine="340"/>
+        <w:jc w:val="both"/>
+      </w:pPr>
+      <w:r>
+        <w:rPr>
+          <w:rFonts w:ascii="Georgia" w:cs="Georgia" w:eastAsia="Georgia" w:hAnsi="Georgia"/>
+          <w:sz w:val="21"/>
+          <w:szCs w:val="21"/>
+        </w:rPr>
+        <w:t xml:space="preserve">— Quando a plataforma desceu. Lá embaixo. — Lia engoliu em seco. — Ele sentiu? Ele sabia onde estava?</w:t>
+      </w:r>
+    </w:p>
+    <w:p>
+      <w:pPr>
+        <w:spacing w:after="0" w:line="312"/>
+        <w:ind w:firstLine="340"/>
+        <w:jc w:val="both"/>
+      </w:pPr>
+      <w:r>
+        <w:rPr>
+          <w:rFonts w:ascii="Georgia" w:cs="Georgia" w:eastAsia="Georgia" w:hAnsi="Georgia"/>
+          <w:sz w:val="21"/>
+          <w:szCs w:val="21"/>
+        </w:rPr>
+        <w:t xml:space="preserve">O médico abriu a boca e não saiu nada. Depois o rosto dele se desfez. Começou a chorar como Lia nunca tinha visto um homem velho chorar, de soluçar, com os ombros sacudindo, as mãos cobrindo os olhos, a maleta escorregando do colo para o chão sem que ele percebesse.</w:t>
+      </w:r>
+    </w:p>
+    <w:p>
+      <w:pPr>
+        <w:spacing w:after="0" w:line="312"/>
+        <w:ind w:firstLine="340"/>
+        <w:jc w:val="both"/>
+      </w:pPr>
+      <w:r>
+        <w:rPr>
+          <w:rFonts w:ascii="Georgia" w:cs="Georgia" w:eastAsia="Georgia" w:hAnsi="Georgia"/>
+          <w:sz w:val="21"/>
+          <w:szCs w:val="21"/>
+        </w:rPr>
+        <w:t xml:space="preserve">— Eu não sei — disse, entre os soluços. — Eu não sei, Lia. Nos ratos, alguns reagiam ao som. Alguns, ao toque. Eu nunca soube se eles sentiam alguma coisa ou se era só o corpo. — Ele abaixou as mãos e olhou para ela com os olhos vermelhos, perdidos. — E é isso que mais me consome. Não é a prisão. Não é o diploma. É não saber. É acordar todo dia sem saber se o meu irmão me ouviu rezando, se ouviu o padre, se ouviu o motor da plataforma. Se ele sabia que era eu que estava ali do lado, de olhos fechados, sem fazer nada. — A voz quebrou de vez. — Me perdoem. Me perdoem, por favor. Perdão. Perdão. Perdão…</w:t>
+      </w:r>
+    </w:p>
+    <w:p>
+      <w:pPr>
+        <w:spacing w:after="0" w:line="312"/>
+        <w:ind w:firstLine="340"/>
+        <w:jc w:val="both"/>
+      </w:pPr>
+      <w:r>
+        <w:rPr>
+          <w:rFonts w:ascii="Georgia" w:cs="Georgia" w:eastAsia="Georgia" w:hAnsi="Georgia"/>
+          <w:sz w:val="21"/>
+          <w:szCs w:val="21"/>
+        </w:rPr>
+        <w:t xml:space="preserve">Repetiu a palavra mais vezes do que Lia conseguiu contar, cada vez mais baixo, olhando para o chão, como uma reza que não tinha mais para quem ser dita.</w:t>
+      </w:r>
+    </w:p>
+    <w:p>
+      <w:pPr>
         <w:spacing w:after="200" w:before="200"/>
         <w:jc w:val="center"/>
       </w:pPr>
@@ -32485,7 +32650,156 @@
           <w:sz w:val="21"/>
           <w:szCs w:val="21"/>
         </w:rPr>
-        <w:t xml:space="preserve">Foi Lia quem falou primeiro, ainda de costas.</w:t>
+        <w:t xml:space="preserve">Os dois irmãos ficaram imóveis.</w:t>
+      </w:r>
+    </w:p>
+    <w:p>
+      <w:pPr>
+        <w:spacing w:after="0" w:line="312"/>
+        <w:ind w:firstLine="340"/>
+        <w:jc w:val="both"/>
+      </w:pPr>
+      <w:r>
+        <w:rPr>
+          <w:rFonts w:ascii="Georgia" w:cs="Georgia" w:eastAsia="Georgia" w:hAnsi="Georgia"/>
+          <w:sz w:val="21"/>
+          <w:szCs w:val="21"/>
+        </w:rPr>
+        <w:t xml:space="preserve">Lucas sentiu uma coisa subir do estômago até a garganta e não soube dar nome a ela. Pensou no pai deitado no escuro, quente, talvez ouvindo. Talvez ouvindo tudo. E sentiu raiva. Raiva do médico, ali, encolhido no banco. E, para sua própria surpresa, raiva do pai. Do homem que tinha resolvido sumir sem perguntar a ninguém, que tinha brincado de morrer, que tinha posto a própria vida no bolso de outro e chamado aquilo de plano. Minha vida em tuas mãos. Que direito ele tinha?</w:t>
+      </w:r>
+    </w:p>
+    <w:p>
+      <w:pPr>
+        <w:spacing w:after="0" w:line="312"/>
+        <w:ind w:firstLine="340"/>
+        <w:jc w:val="both"/>
+      </w:pPr>
+      <w:r>
+        <w:rPr>
+          <w:rFonts w:ascii="Georgia" w:cs="Georgia" w:eastAsia="Georgia" w:hAnsi="Georgia"/>
+          <w:sz w:val="21"/>
+          <w:szCs w:val="21"/>
+        </w:rPr>
+        <w:t xml:space="preserve">Ao lado dele, Lia sentia a mesma coisa e outras ao mesmo tempo. Raiva, nojo, uma tristeza tão funda que parecia não ter fundo, e, por baixo de tudo, uma saudade enorme e absurda do pai, de ouvi-lo reclamar do barulho, de ouvi-lo dizer qualquer coisa.</w:t>
+      </w:r>
+    </w:p>
+    <w:p>
+      <w:pPr>
+        <w:spacing w:after="0" w:line="312"/>
+        <w:ind w:firstLine="340"/>
+        <w:jc w:val="both"/>
+      </w:pPr>
+      <w:r>
+        <w:rPr>
+          <w:rFonts w:ascii="Georgia" w:cs="Georgia" w:eastAsia="Georgia" w:hAnsi="Georgia"/>
+          <w:sz w:val="21"/>
+          <w:szCs w:val="21"/>
+        </w:rPr>
+        <w:t xml:space="preserve">Mas os dois olhavam para o doutor Álvaro, e o que viam não era um assassino.</w:t>
+      </w:r>
+    </w:p>
+    <w:p>
+      <w:pPr>
+        <w:spacing w:after="0" w:line="312"/>
+        <w:ind w:firstLine="340"/>
+        <w:jc w:val="both"/>
+      </w:pPr>
+      <w:r>
+        <w:rPr>
+          <w:rFonts w:ascii="Georgia" w:cs="Georgia" w:eastAsia="Georgia" w:hAnsi="Georgia"/>
+          <w:sz w:val="21"/>
+          <w:szCs w:val="21"/>
+        </w:rPr>
+        <w:t xml:space="preserve">Era um velho que não terminava as frases. Que falava sozinho. Que tinha passado uma madrugada inteira sentado numa escada de Moema chorando diante de uma porta, e que agora repetia perdão para o chão de um aeroporto como se o chão pudesse responder. Havia alguma coisa nos olhos dele que tinha se soltado do lugar. Uma luz que não estava mais inteira. A culpa não estava só corroendo aquele homem. Estava terminando de matá-lo, devagar, por dentro, e ele sabia.</w:t>
+      </w:r>
+    </w:p>
+    <w:p>
+      <w:pPr>
+        <w:spacing w:after="0" w:line="312"/>
+        <w:ind w:firstLine="340"/>
+        <w:jc w:val="both"/>
+      </w:pPr>
+      <w:r>
+        <w:rPr>
+          <w:rFonts w:ascii="Georgia" w:cs="Georgia" w:eastAsia="Georgia" w:hAnsi="Georgia"/>
+          <w:sz w:val="21"/>
+          <w:szCs w:val="21"/>
+        </w:rPr>
+        <w:t xml:space="preserve">Lucas se abaixou, pegou a maleta do chão e a pôs de volta no colo do médico. Não disse nada.</w:t>
+      </w:r>
+    </w:p>
+    <w:p>
+      <w:pPr>
+        <w:spacing w:after="0" w:line="312"/>
+        <w:ind w:firstLine="340"/>
+        <w:jc w:val="both"/>
+      </w:pPr>
+      <w:r>
+        <w:rPr>
+          <w:rFonts w:ascii="Georgia" w:cs="Georgia" w:eastAsia="Georgia" w:hAnsi="Georgia"/>
+          <w:sz w:val="21"/>
+          <w:szCs w:val="21"/>
+        </w:rPr>
+        <w:t xml:space="preserve">Lia ficou olhando para os dois. Para o irmão e para o velho. Pensou nos três rapazes da foto de Ubatuba, abraçados numa praia, rindo, dividindo uma prancha de isopor. Dois tinham virado cinza. O terceiro estava ali, virando outra coisa.</w:t>
+      </w:r>
+    </w:p>
+    <w:p>
+      <w:pPr>
+        <w:spacing w:after="0" w:line="312"/>
+        <w:ind w:firstLine="340"/>
+        <w:jc w:val="both"/>
+      </w:pPr>
+      <w:r>
+        <w:rPr>
+          <w:rFonts w:ascii="Georgia" w:cs="Georgia" w:eastAsia="Georgia" w:hAnsi="Georgia"/>
+          <w:sz w:val="21"/>
+          <w:szCs w:val="21"/>
+        </w:rPr>
+        <w:t xml:space="preserve">Eles eram irmãos, pensou. Do jeito que só se é irmão de quem se escolhe.</w:t>
+      </w:r>
+    </w:p>
+    <w:p>
+      <w:pPr>
+        <w:spacing w:after="0" w:line="312"/>
+        <w:ind w:firstLine="340"/>
+        <w:jc w:val="both"/>
+      </w:pPr>
+      <w:r>
+        <w:rPr>
+          <w:rFonts w:ascii="Georgia" w:cs="Georgia" w:eastAsia="Georgia" w:hAnsi="Georgia"/>
+          <w:sz w:val="21"/>
+          <w:szCs w:val="21"/>
+        </w:rPr>
+        <w:t xml:space="preserve">E descobriu, sem querer, que não conseguia odiá-lo tanto quanto queria. Sentia mais pena do que ódio. E não sabia se isso era bondade ou só cansaço.</w:t>
+      </w:r>
+    </w:p>
+    <w:p>
+      <w:pPr>
+        <w:spacing w:after="200" w:before="200"/>
+        <w:jc w:val="center"/>
+      </w:pPr>
+      <w:r>
+        <w:rPr>
+          <w:rFonts w:ascii="Georgia" w:cs="Georgia" w:eastAsia="Georgia" w:hAnsi="Georgia"/>
+          <w:sz w:val="22"/>
+          <w:szCs w:val="22"/>
+        </w:rPr>
+        <w:t xml:space="preserve">*</w:t>
+      </w:r>
+    </w:p>
+    <w:p>
+      <w:pPr>
+        <w:spacing w:after="0" w:line="312"/>
+        <w:ind w:firstLine="340"/>
+        <w:jc w:val="both"/>
+      </w:pPr>
+      <w:r>
+        <w:rPr>
+          <w:rFonts w:ascii="Georgia" w:cs="Georgia" w:eastAsia="Georgia" w:hAnsi="Georgia"/>
+          <w:sz w:val="21"/>
+          <w:szCs w:val="21"/>
+        </w:rPr>
+        <w:t xml:space="preserve">Foi Lia quem falou primeiro, depois de muito tempo.</w:t>
       </w:r>
     </w:p>
     <w:p>
@@ -32515,7 +32829,7 @@
           <w:sz w:val="21"/>
           <w:szCs w:val="21"/>
         </w:rPr>
-        <w:t xml:space="preserve">Ela se virou.</w:t>
+        <w:t xml:space="preserve">Ela sentou de novo no banco, do outro lado do médico.</w:t>
       </w:r>
     </w:p>
     <w:p>

</xml_diff>

<commit_message>
Livro policial: capítulo 30 (Todo crime tem um autor?) — desfecho
Co-Authored-By: Claude Opus 5.5 <noreply@anthropic.com>
Claude-Session: https://claude.ai/code/session_01BrurxSYygRC3rRhaUYosm1
</commit_message>
<xml_diff>
--- a/docs/livro-policial/TODO_CRIME_TEM_UM_AUTOR.docx
+++ b/docs/livro-policial/TODO_CRIME_TEM_UM_AUTOR.docx
@@ -33413,6 +33413,1548 @@
           <w:szCs w:val="21"/>
         </w:rPr>
         <w:t xml:space="preserve">Ficaram assim, os dois, no saguão de chegadas, até o último voo da noite pousar.</w:t>
+      </w:r>
+    </w:p>
+    <w:p>
+      <w:pPr>
+        <w:pageBreakBefore/>
+        <w:spacing w:after="120" w:before="1800"/>
+        <w:jc w:val="center"/>
+      </w:pPr>
+      <w:r>
+        <w:rPr>
+          <w:rFonts w:ascii="Georgia" w:cs="Georgia" w:eastAsia="Georgia" w:hAnsi="Georgia"/>
+          <w:spacing w:val="40"/>
+          <w:sz w:val="20"/>
+          <w:szCs w:val="20"/>
+        </w:rPr>
+        <w:t xml:space="preserve">CAPÍTULO 30</w:t>
+      </w:r>
+    </w:p>
+    <w:p>
+      <w:pPr>
+        <w:spacing w:after="720"/>
+        <w:jc w:val="center"/>
+      </w:pPr>
+      <w:r>
+        <w:rPr>
+          <w:rFonts w:ascii="Georgia" w:cs="Georgia" w:eastAsia="Georgia" w:hAnsi="Georgia"/>
+          <w:b/>
+          <w:bCs/>
+          <w:sz w:val="32"/>
+          <w:szCs w:val="32"/>
+        </w:rPr>
+        <w:t xml:space="preserve">Todo crime tem um autor?</w:t>
+      </w:r>
+    </w:p>
+    <w:p>
+      <w:pPr>
+        <w:spacing w:after="0" w:line="312"/>
+        <w:ind w:firstLine="340"/>
+        <w:jc w:val="both"/>
+      </w:pPr>
+      <w:r>
+        <w:rPr>
+          <w:rFonts w:ascii="Georgia" w:cs="Georgia" w:eastAsia="Georgia" w:hAnsi="Georgia"/>
+          <w:sz w:val="21"/>
+          <w:szCs w:val="21"/>
+        </w:rPr>
+        <w:t xml:space="preserve">A delegada Regina Paiva não dormiu na noite de quinta para sexta.</w:t>
+      </w:r>
+    </w:p>
+    <w:p>
+      <w:pPr>
+        <w:spacing w:after="0" w:line="312"/>
+        <w:ind w:firstLine="340"/>
+        <w:jc w:val="both"/>
+      </w:pPr>
+      <w:r>
+        <w:rPr>
+          <w:rFonts w:ascii="Georgia" w:cs="Georgia" w:eastAsia="Georgia" w:hAnsi="Georgia"/>
+          <w:sz w:val="21"/>
+          <w:szCs w:val="21"/>
+        </w:rPr>
+        <w:t xml:space="preserve">Voltou de Guarulhos direto para a sala sem janelas do Departamento de Homicídios, pendurou o terninho azul-marinho no encosto da cadeira e espalhou sobre a mesa as cinco pastas que carregava havia oito meses. Joaquim Ferreira da Silva. Marcelo Duarte. Fábio Teixeira. Renato Sales. Nestor Gomes. Em cima de todas, uma sexta pasta, mais fina, com o nome que ela tinha escrito tantas vezes na coluna dos suspeitos e que, naquela noite, mudou de coluna pela última vez.</w:t>
+      </w:r>
+    </w:p>
+    <w:p>
+      <w:pPr>
+        <w:spacing w:after="0" w:line="312"/>
+        <w:ind w:firstLine="340"/>
+        <w:jc w:val="both"/>
+      </w:pPr>
+      <w:r>
+        <w:rPr>
+          <w:rFonts w:ascii="Georgia" w:cs="Georgia" w:eastAsia="Georgia" w:hAnsi="Georgia"/>
+          <w:sz w:val="21"/>
+          <w:szCs w:val="21"/>
+        </w:rPr>
+        <w:t xml:space="preserve">Henrique Salvallus.</w:t>
+      </w:r>
+    </w:p>
+    <w:p>
+      <w:pPr>
+        <w:spacing w:after="0" w:line="312"/>
+        <w:ind w:firstLine="340"/>
+        <w:jc w:val="both"/>
+      </w:pPr>
+      <w:r>
+        <w:rPr>
+          <w:rFonts w:ascii="Georgia" w:cs="Georgia" w:eastAsia="Georgia" w:hAnsi="Georgia"/>
+          <w:sz w:val="21"/>
+          <w:szCs w:val="21"/>
+        </w:rPr>
+        <w:t xml:space="preserve">Durante oito meses, cada pasta tinha apontado para ele. Agora Regina sabia que era o contrário. Ele não estava no centro das mortes porque as causava. Estava no centro porque era o alvo. E cada pessoa que tinha morrido ao lado dele tinha morrido por estar perto demais do homem que todos queriam morto.</w:t>
+      </w:r>
+    </w:p>
+    <w:p>
+      <w:pPr>
+        <w:spacing w:after="0" w:line="312"/>
+        <w:ind w:firstLine="340"/>
+        <w:jc w:val="both"/>
+      </w:pPr>
+      <w:r>
+        <w:rPr>
+          <w:rFonts w:ascii="Georgia" w:cs="Georgia" w:eastAsia="Georgia" w:hAnsi="Georgia"/>
+          <w:sz w:val="21"/>
+          <w:szCs w:val="21"/>
+        </w:rPr>
+        <w:t xml:space="preserve">O ventilador de teto girava devagar. Às quatro da manhã, ela pegou uma folha em branco e começou a escrever o pedido ao juiz.</w:t>
+      </w:r>
+    </w:p>
+    <w:p>
+      <w:pPr>
+        <w:spacing w:after="0" w:line="312"/>
+        <w:ind w:firstLine="340"/>
+        <w:jc w:val="both"/>
+      </w:pPr>
+      <w:r>
+        <w:rPr>
+          <w:rFonts w:ascii="Georgia" w:cs="Georgia" w:eastAsia="Georgia" w:hAnsi="Georgia"/>
+          <w:sz w:val="21"/>
+          <w:szCs w:val="21"/>
+        </w:rPr>
+        <w:t xml:space="preserve">Levou até as nove.</w:t>
+      </w:r>
+    </w:p>
+    <w:p>
+      <w:pPr>
+        <w:spacing w:after="200" w:before="200"/>
+        <w:jc w:val="center"/>
+      </w:pPr>
+      <w:r>
+        <w:rPr>
+          <w:rFonts w:ascii="Georgia" w:cs="Georgia" w:eastAsia="Georgia" w:hAnsi="Georgia"/>
+          <w:sz w:val="22"/>
+          <w:szCs w:val="22"/>
+        </w:rPr>
+        <w:t xml:space="preserve">*</w:t>
+      </w:r>
+    </w:p>
+    <w:p>
+      <w:pPr>
+        <w:spacing w:after="0" w:line="312"/>
+        <w:ind w:firstLine="340"/>
+        <w:jc w:val="both"/>
+      </w:pPr>
+      <w:r>
+        <w:rPr>
+          <w:rFonts w:ascii="Georgia" w:cs="Georgia" w:eastAsia="Georgia" w:hAnsi="Georgia"/>
+          <w:sz w:val="21"/>
+          <w:szCs w:val="21"/>
+        </w:rPr>
+        <w:t xml:space="preserve">O primeiro mandado foi cumprido numa segunda-feira, às seis da manhã, num apartamento do Itaim Bibi que Henrique Salvallus pagava sem que a mulher soubesse.</w:t>
+      </w:r>
+    </w:p>
+    <w:p>
+      <w:pPr>
+        <w:spacing w:after="0" w:line="312"/>
+        <w:ind w:firstLine="340"/>
+        <w:jc w:val="both"/>
+      </w:pPr>
+      <w:r>
+        <w:rPr>
+          <w:rFonts w:ascii="Georgia" w:cs="Georgia" w:eastAsia="Georgia" w:hAnsi="Georgia"/>
+          <w:sz w:val="21"/>
+          <w:szCs w:val="21"/>
+        </w:rPr>
+        <w:t xml:space="preserve">Bianca Lacerda abriu a porta de roupão, com o cabelo preso e uma xícara de café na mão, e não pareceu surpresa. Olhou para a delegada, para os dois investigadores atrás dela, e disse só:</w:t>
+      </w:r>
+    </w:p>
+    <w:p>
+      <w:pPr>
+        <w:spacing w:after="0" w:line="312"/>
+        <w:ind w:firstLine="340"/>
+        <w:jc w:val="both"/>
+      </w:pPr>
+      <w:r>
+        <w:rPr>
+          <w:rFonts w:ascii="Georgia" w:cs="Georgia" w:eastAsia="Georgia" w:hAnsi="Georgia"/>
+          <w:sz w:val="21"/>
+          <w:szCs w:val="21"/>
+        </w:rPr>
+        <w:t xml:space="preserve">— Demoraram.</w:t>
+      </w:r>
+    </w:p>
+    <w:p>
+      <w:pPr>
+        <w:spacing w:after="0" w:line="312"/>
+        <w:ind w:firstLine="340"/>
+        <w:jc w:val="both"/>
+      </w:pPr>
+      <w:r>
+        <w:rPr>
+          <w:rFonts w:ascii="Georgia" w:cs="Georgia" w:eastAsia="Georgia" w:hAnsi="Georgia"/>
+          <w:sz w:val="21"/>
+          <w:szCs w:val="21"/>
+        </w:rPr>
+        <w:t xml:space="preserve">O arsênico tinha sido comprado em janeiro, numa loja de produtos agrícolas de Mogi Mirim, a cidade onde ela nasceu, em nome de um primo que nunca soube de nada. A nota fiscal estava na gaveta de uma loja que guardava tudo. O taxista que a levou do motel às duas e vinte da manhã lembrava dela, porque ela pediu para parar duas vezes no caminho, para vomitar. E o copo que ela jurou ter deixado intacto na mesa de cabeceira tinha, sob as digitais de Henrique, um traço das dela, do lado de dentro da borda, onde ninguém encosta o dedo para beber. Encosta para pôr alguma coisa.</w:t>
+      </w:r>
+    </w:p>
+    <w:p>
+      <w:pPr>
+        <w:spacing w:after="0" w:line="312"/>
+        <w:ind w:firstLine="340"/>
+        <w:jc w:val="both"/>
+      </w:pPr>
+      <w:r>
+        <w:rPr>
+          <w:rFonts w:ascii="Georgia" w:cs="Georgia" w:eastAsia="Georgia" w:hAnsi="Georgia"/>
+          <w:sz w:val="21"/>
+          <w:szCs w:val="21"/>
+        </w:rPr>
+        <w:t xml:space="preserve">O motivo era o mais velho de todos. Dois anos antes, num aniversário dela, Henrique, homem de seguros até na cama, tinha lhe dado de presente uma apólice de vida pequena, numa seguradora do Paraná, com ela como única beneficiária. Uma piada, ele disse. Para você ficar bem se eu cair duro aqui. Bianca não achou piada. Em dezembro, quando percebeu que ele nunca ia deixar Helena, que nunca ia levá-la à Europa e que o apartamento do Itaim estava no nome dele e não no dela, foi atrás da única coisa que estava.</w:t>
+      </w:r>
+    </w:p>
+    <w:p>
+      <w:pPr>
+        <w:spacing w:after="0" w:line="312"/>
+        <w:ind w:firstLine="340"/>
+        <w:jc w:val="both"/>
+      </w:pPr>
+      <w:r>
+        <w:rPr>
+          <w:rFonts w:ascii="Georgia" w:cs="Georgia" w:eastAsia="Georgia" w:hAnsi="Georgia"/>
+          <w:sz w:val="21"/>
+          <w:szCs w:val="21"/>
+        </w:rPr>
+        <w:t xml:space="preserve">— Eu ia ficar bem — disse ela, na sala sem janelas, quando Regina mostrou a apólice. — Ele mesmo disse.</w:t>
+      </w:r>
+    </w:p>
+    <w:p>
+      <w:pPr>
+        <w:spacing w:after="0" w:line="312"/>
+        <w:ind w:firstLine="340"/>
+        <w:jc w:val="both"/>
+      </w:pPr>
+      <w:r>
+        <w:rPr>
+          <w:rFonts w:ascii="Georgia" w:cs="Georgia" w:eastAsia="Georgia" w:hAnsi="Georgia"/>
+          <w:sz w:val="21"/>
+          <w:szCs w:val="21"/>
+        </w:rPr>
+        <w:t xml:space="preserve">— Quem ficou foi o seu Joaquim — respondeu a delegada. — Debaixo da terra. Com sessenta e três anos e três netos.</w:t>
+      </w:r>
+    </w:p>
+    <w:p>
+      <w:pPr>
+        <w:spacing w:after="0" w:line="312"/>
+        <w:ind w:firstLine="340"/>
+        <w:jc w:val="both"/>
+      </w:pPr>
+      <w:r>
+        <w:rPr>
+          <w:rFonts w:ascii="Georgia" w:cs="Georgia" w:eastAsia="Georgia" w:hAnsi="Georgia"/>
+          <w:sz w:val="21"/>
+          <w:szCs w:val="21"/>
+        </w:rPr>
+        <w:t xml:space="preserve">Bianca olhou para a parede.</w:t>
+      </w:r>
+    </w:p>
+    <w:p>
+      <w:pPr>
+        <w:spacing w:after="0" w:line="312"/>
+        <w:ind w:firstLine="340"/>
+        <w:jc w:val="both"/>
+      </w:pPr>
+      <w:r>
+        <w:rPr>
+          <w:rFonts w:ascii="Georgia" w:cs="Georgia" w:eastAsia="Georgia" w:hAnsi="Georgia"/>
+          <w:sz w:val="21"/>
+          <w:szCs w:val="21"/>
+        </w:rPr>
+        <w:t xml:space="preserve">— Eu não conhecia o seu Joaquim.</w:t>
+      </w:r>
+    </w:p>
+    <w:p>
+      <w:pPr>
+        <w:spacing w:after="0" w:line="312"/>
+        <w:ind w:firstLine="340"/>
+        <w:jc w:val="both"/>
+      </w:pPr>
+      <w:r>
+        <w:rPr>
+          <w:rFonts w:ascii="Georgia" w:cs="Georgia" w:eastAsia="Georgia" w:hAnsi="Georgia"/>
+          <w:sz w:val="21"/>
+          <w:szCs w:val="21"/>
+        </w:rPr>
+        <w:t xml:space="preserve">— Ninguém conhecia. É por isso que ele bebeu.</w:t>
+      </w:r>
+    </w:p>
+    <w:p>
+      <w:pPr>
+        <w:spacing w:after="200" w:before="200"/>
+        <w:jc w:val="center"/>
+      </w:pPr>
+      <w:r>
+        <w:rPr>
+          <w:rFonts w:ascii="Georgia" w:cs="Georgia" w:eastAsia="Georgia" w:hAnsi="Georgia"/>
+          <w:sz w:val="22"/>
+          <w:szCs w:val="22"/>
+        </w:rPr>
+        <w:t xml:space="preserve">*</w:t>
+      </w:r>
+    </w:p>
+    <w:p>
+      <w:pPr>
+        <w:spacing w:after="0" w:line="312"/>
+        <w:ind w:firstLine="340"/>
+        <w:jc w:val="both"/>
+      </w:pPr>
+      <w:r>
+        <w:rPr>
+          <w:rFonts w:ascii="Georgia" w:cs="Georgia" w:eastAsia="Georgia" w:hAnsi="Georgia"/>
+          <w:sz w:val="21"/>
+          <w:szCs w:val="21"/>
+        </w:rPr>
+        <w:t xml:space="preserve">O segundo exigiu mais tempo e mais papel.</w:t>
+      </w:r>
+    </w:p>
+    <w:p>
+      <w:pPr>
+        <w:spacing w:after="0" w:line="312"/>
+        <w:ind w:firstLine="340"/>
+        <w:jc w:val="both"/>
+      </w:pPr>
+      <w:r>
+        <w:rPr>
+          <w:rFonts w:ascii="Georgia" w:cs="Georgia" w:eastAsia="Georgia" w:hAnsi="Georgia"/>
+          <w:sz w:val="21"/>
+          <w:szCs w:val="21"/>
+        </w:rPr>
+        <w:t xml:space="preserve">Rubens Falcão era deputado estadual, e um deputado não se prende como qualquer pessoa. Regina levou três semanas para montar o pedido que o Ministério Público mandou ao Tribunal de Justiça, e mais duas para que os desembargadores o lessem. Nesse tempo, o atirador da Haddock Lobo foi preso numa chácara perto de Goiânia, com o fuzil desmontado dentro de um armário de cozinha e o dinheiro ainda em notas, guardado numa caixa de sapatos.</w:t>
+      </w:r>
+    </w:p>
+    <w:p>
+      <w:pPr>
+        <w:spacing w:after="0" w:line="312"/>
+        <w:ind w:firstLine="340"/>
+        <w:jc w:val="both"/>
+      </w:pPr>
+      <w:r>
+        <w:rPr>
+          <w:rFonts w:ascii="Georgia" w:cs="Georgia" w:eastAsia="Georgia" w:hAnsi="Georgia"/>
+          <w:sz w:val="21"/>
+          <w:szCs w:val="21"/>
+        </w:rPr>
+        <w:t xml:space="preserve">Chamava-se Edvaldo, tinha sido atirador do Exército e cobrava caro. Contou tudo em troca de um acordo. A sala do décimo segundo andar do prédio espelhado, em frente ao Il Ponte, tinha sido alugada em abril, por seis meses, em nome de uma empresa de Barueri. A mesma empresa que pagava as prestações de um sedã prata, placa EJK-7316. A mesma que recebia, havia dois anos, pagamentos da Salvallus Seguros aprovados com um ok.</w:t>
+      </w:r>
+    </w:p>
+    <w:p>
+      <w:pPr>
+        <w:spacing w:after="0" w:line="312"/>
+        <w:ind w:firstLine="340"/>
+        <w:jc w:val="both"/>
+      </w:pPr>
+      <w:r>
+        <w:rPr>
+          <w:rFonts w:ascii="Georgia" w:cs="Georgia" w:eastAsia="Georgia" w:hAnsi="Georgia"/>
+          <w:sz w:val="21"/>
+          <w:szCs w:val="21"/>
+        </w:rPr>
+        <w:t xml:space="preserve">Cumeeira Engenharia e Participações.</w:t>
+      </w:r>
+    </w:p>
+    <w:p>
+      <w:pPr>
+        <w:spacing w:after="0" w:line="312"/>
+        <w:ind w:firstLine="340"/>
+        <w:jc w:val="both"/>
+      </w:pPr>
+      <w:r>
+        <w:rPr>
+          <w:rFonts w:ascii="Georgia" w:cs="Georgia" w:eastAsia="Georgia" w:hAnsi="Georgia"/>
+          <w:sz w:val="21"/>
+          <w:szCs w:val="21"/>
+        </w:rPr>
+        <w:t xml:space="preserve">O dinheiro que Otávio desviava da corretora não ia só para o bolso dele. Uma parte, a maior, ia para a Cumeeira, e da Cumeeira para a campanha e para os negócios de Rubens Falcão, que em troca abria as portas do loteamento de Cajamar na Assembleia. Quando Henrique começou a fazer perguntas sobre fornecedores que não conhecia, quem mais tinha a perder não era o sócio. Era o deputado.</w:t>
+      </w:r>
+    </w:p>
+    <w:p>
+      <w:pPr>
+        <w:spacing w:after="0" w:line="312"/>
+        <w:ind w:firstLine="340"/>
+        <w:jc w:val="both"/>
+      </w:pPr>
+      <w:r>
+        <w:rPr>
+          <w:rFonts w:ascii="Georgia" w:cs="Georgia" w:eastAsia="Georgia" w:hAnsi="Georgia"/>
+          <w:sz w:val="21"/>
+          <w:szCs w:val="21"/>
+        </w:rPr>
+        <w:t xml:space="preserve">Edvaldo disse que tinha mirado em Henrique. Que Marcelo Duarte entrou na frente, agarrado à gola do paletó do alvo, no último segundo, e que ele já tinha apertado o gatilho. Erro de cálculo, disse, como quem fala de uma bola fora.</w:t>
+      </w:r>
+    </w:p>
+    <w:p>
+      <w:pPr>
+        <w:spacing w:after="0" w:line="312"/>
+        <w:ind w:firstLine="340"/>
+        <w:jc w:val="both"/>
+      </w:pPr>
+      <w:r>
+        <w:rPr>
+          <w:rFonts w:ascii="Georgia" w:cs="Georgia" w:eastAsia="Georgia" w:hAnsi="Georgia"/>
+          <w:sz w:val="21"/>
+          <w:szCs w:val="21"/>
+        </w:rPr>
+        <w:t xml:space="preserve">E o funcionário humilde, num motel? A frase que Lia tinha ouvido quatro vezes no vídeo do YouTube? Um escrivão de uma delegacia da zona oeste, que almoçava toda sexta com o assessor de Falcão, confessou ter comentado o caso do motel num desses almoços, em março. Por isso o deputado sabia. Por isso disse duas tentativas, em maio, quando ninguém mais na cidade pensava em tentativas.</w:t>
+      </w:r>
+    </w:p>
+    <w:p>
+      <w:pPr>
+        <w:spacing w:after="0" w:line="312"/>
+        <w:ind w:firstLine="340"/>
+        <w:jc w:val="both"/>
+      </w:pPr>
+      <w:r>
+        <w:rPr>
+          <w:rFonts w:ascii="Georgia" w:cs="Georgia" w:eastAsia="Georgia" w:hAnsi="Georgia"/>
+          <w:sz w:val="21"/>
+          <w:szCs w:val="21"/>
+        </w:rPr>
+        <w:t xml:space="preserve">E por isso, na janela do estande de vendas de Cajamar, olhando para a fumaça na estrada, deixou escapar a palavra que não devia.</w:t>
+      </w:r>
+    </w:p>
+    <w:p>
+      <w:pPr>
+        <w:spacing w:after="0" w:line="312"/>
+        <w:ind w:firstLine="340"/>
+        <w:jc w:val="both"/>
+      </w:pPr>
+      <w:r>
+        <w:rPr>
+          <w:rFonts w:ascii="Georgia" w:cs="Georgia" w:eastAsia="Georgia" w:hAnsi="Georgia"/>
+          <w:sz w:val="21"/>
+          <w:szCs w:val="21"/>
+        </w:rPr>
+        <w:t xml:space="preserve">De novo.</w:t>
+      </w:r>
+    </w:p>
+    <w:p>
+      <w:pPr>
+        <w:spacing w:after="0" w:line="312"/>
+        <w:ind w:firstLine="340"/>
+        <w:jc w:val="both"/>
+      </w:pPr>
+      <w:r>
+        <w:rPr>
+          <w:rFonts w:ascii="Georgia" w:cs="Georgia" w:eastAsia="Georgia" w:hAnsi="Georgia"/>
+          <w:sz w:val="21"/>
+          <w:szCs w:val="21"/>
+        </w:rPr>
+        <w:t xml:space="preserve">Não porque tivesse mandado. Porque sabia quem tinha.</w:t>
+      </w:r>
+    </w:p>
+    <w:p>
+      <w:pPr>
+        <w:spacing w:after="200" w:before="200"/>
+        <w:jc w:val="center"/>
+      </w:pPr>
+      <w:r>
+        <w:rPr>
+          <w:rFonts w:ascii="Georgia" w:cs="Georgia" w:eastAsia="Georgia" w:hAnsi="Georgia"/>
+          <w:sz w:val="22"/>
+          <w:szCs w:val="22"/>
+        </w:rPr>
+        <w:t xml:space="preserve">*</w:t>
+      </w:r>
+    </w:p>
+    <w:p>
+      <w:pPr>
+        <w:spacing w:after="0" w:line="312"/>
+        <w:ind w:firstLine="340"/>
+        <w:jc w:val="both"/>
+      </w:pPr>
+      <w:r>
+        <w:rPr>
+          <w:rFonts w:ascii="Georgia" w:cs="Georgia" w:eastAsia="Georgia" w:hAnsi="Georgia"/>
+          <w:sz w:val="21"/>
+          <w:szCs w:val="21"/>
+        </w:rPr>
+        <w:t xml:space="preserve">Otávio Prado foi preso em casa, num sábado de manhã, de chinelo e com o jornal debaixo do braço, na frente da churrasqueira onde tinha queimado os originais de Henrique.</w:t>
+      </w:r>
+    </w:p>
+    <w:p>
+      <w:pPr>
+        <w:spacing w:after="0" w:line="312"/>
+        <w:ind w:firstLine="340"/>
+        <w:jc w:val="both"/>
+      </w:pPr>
+      <w:r>
+        <w:rPr>
+          <w:rFonts w:ascii="Georgia" w:cs="Georgia" w:eastAsia="Georgia" w:hAnsi="Georgia"/>
+          <w:sz w:val="21"/>
+          <w:szCs w:val="21"/>
+        </w:rPr>
+        <w:t xml:space="preserve">Não resistiu. Pediu só para trocar de roupa. Na delegacia, chamou um advogado e não disse uma palavra durante três dias. No quarto dia, quando Regina pôs sobre a mesa o depoimento do homem de colete escuro, começou a falar.</w:t>
+      </w:r>
+    </w:p>
+    <w:p>
+      <w:pPr>
+        <w:spacing w:after="0" w:line="312"/>
+        <w:ind w:firstLine="340"/>
+        <w:jc w:val="both"/>
+      </w:pPr>
+      <w:r>
+        <w:rPr>
+          <w:rFonts w:ascii="Georgia" w:cs="Georgia" w:eastAsia="Georgia" w:hAnsi="Georgia"/>
+          <w:sz w:val="21"/>
+          <w:szCs w:val="21"/>
+        </w:rPr>
+        <w:t xml:space="preserve">Em junho, Henrique tinha avisado o sócio de que ia contratar uma auditoria externa no fim do ano. Otávio fez as contas e concluiu que não chegaria ao fim do ano.</w:t>
+      </w:r>
+    </w:p>
+    <w:p>
+      <w:pPr>
+        <w:spacing w:after="0" w:line="312"/>
+        <w:ind w:firstLine="340"/>
+        <w:jc w:val="both"/>
+      </w:pPr>
+      <w:r>
+        <w:rPr>
+          <w:rFonts w:ascii="Georgia" w:cs="Georgia" w:eastAsia="Georgia" w:hAnsi="Georgia"/>
+          <w:sz w:val="21"/>
+          <w:szCs w:val="21"/>
+        </w:rPr>
+        <w:t xml:space="preserve">O homem de colete escuro se chamava Wellington. Durante dois anos, tinha sido supervisor de segurança noturna do Hotel Castellane, na Paulista, com acesso a todos os andares e a todas as câmeras. Em julho, Otávio pagou a ele o equivalente a cinco anos de salário para matar Henrique Salvallus na primeira noite em que ele dormisse no hotel. A chance veio numa quarta-feira, quando Wellington, parado ao pé da escada do mezanino, ouviu um representante comercial de Curitiba, bêbado, dar ao imorrível o número do quarto dele. Wellington entrou no escuro, viu um homem deitado na cama, coberto até os ombros, como alguém que se deitou para esperar, e não acendeu a luz. Às zero e cinquenta e dois, desligou a câmera do corredor por onze minutos. Quando saiu, ainda não sabia que tinha matado o homem errado.</w:t>
+      </w:r>
+    </w:p>
+    <w:p>
+      <w:pPr>
+        <w:spacing w:after="0" w:line="312"/>
+        <w:ind w:firstLine="340"/>
+        <w:jc w:val="both"/>
+      </w:pPr>
+      <w:r>
+        <w:rPr>
+          <w:rFonts w:ascii="Georgia" w:cs="Georgia" w:eastAsia="Georgia" w:hAnsi="Georgia"/>
+          <w:sz w:val="21"/>
+          <w:szCs w:val="21"/>
+        </w:rPr>
+        <w:t xml:space="preserve">Henrique tinha posto o edredom sobre Fábio por gentileza. Foi o que o matou.</w:t>
+      </w:r>
+    </w:p>
+    <w:p>
+      <w:pPr>
+        <w:spacing w:after="0" w:line="312"/>
+        <w:ind w:firstLine="340"/>
+        <w:jc w:val="both"/>
+      </w:pPr>
+      <w:r>
+        <w:rPr>
+          <w:rFonts w:ascii="Georgia" w:cs="Georgia" w:eastAsia="Georgia" w:hAnsi="Georgia"/>
+          <w:sz w:val="21"/>
+          <w:szCs w:val="21"/>
+        </w:rPr>
+        <w:t xml:space="preserve">Em setembro, Wellington estava de colete escuro outra vez, agora com o crachá falso da organização de um evento, no estande de vendas do loteamento. Na noite anterior, o próprio Otávio tinha tirado da pasta do contrato, sobre a mesa de Henrique, o anexo de vistoria. Sem ele, Henrique teria de voltar a São Paulo. No carro de sempre. Wellington chamou Nestor ao estande, com uma desculpa qualquer, e, enquanto o motorista subia, instalou embaixo do carro um dispositivo pequeno, que, a distância, cortava o freio e travava o acelerador.</w:t>
+      </w:r>
+    </w:p>
+    <w:p>
+      <w:pPr>
+        <w:spacing w:after="0" w:line="312"/>
+        <w:ind w:firstLine="340"/>
+        <w:jc w:val="both"/>
+      </w:pPr>
+      <w:r>
+        <w:rPr>
+          <w:rFonts w:ascii="Georgia" w:cs="Georgia" w:eastAsia="Georgia" w:hAnsi="Georgia"/>
+          <w:sz w:val="21"/>
+          <w:szCs w:val="21"/>
+        </w:rPr>
+        <w:t xml:space="preserve">Mas Henrique não voltou. Mandou Renato.</w:t>
+      </w:r>
+    </w:p>
+    <w:p>
+      <w:pPr>
+        <w:spacing w:after="0" w:line="312"/>
+        <w:ind w:firstLine="340"/>
+        <w:jc w:val="both"/>
+      </w:pPr>
+      <w:r>
+        <w:rPr>
+          <w:rFonts w:ascii="Georgia" w:cs="Georgia" w:eastAsia="Georgia" w:hAnsi="Georgia"/>
+          <w:sz w:val="21"/>
+          <w:szCs w:val="21"/>
+        </w:rPr>
+        <w:t xml:space="preserve">E Renato, antes de entrar no carro, mandou uma mensagem para Otávio. Regina a recuperou na operadora, apagada do celular dele, mas não do mundo.</w:t>
+      </w:r>
+    </w:p>
+    <w:p>
+      <w:pPr>
+        <w:spacing w:after="0" w:line="312"/>
+        <w:ind w:firstLine="340"/>
+        <w:jc w:val="both"/>
+      </w:pPr>
+      <w:r>
+        <w:rPr>
+          <w:rFonts w:ascii="Georgia" w:cs="Georgia" w:eastAsia="Georgia" w:hAnsi="Georgia"/>
+          <w:sz w:val="21"/>
+          <w:szCs w:val="21"/>
+        </w:rPr>
+        <w:t xml:space="preserve">O velho não vem. Mandou eu e o Nestor buscar o anexo. Faço o quê?</w:t>
+      </w:r>
+    </w:p>
+    <w:p>
+      <w:pPr>
+        <w:spacing w:after="0" w:line="312"/>
+        <w:ind w:firstLine="340"/>
+        <w:jc w:val="both"/>
+      </w:pPr>
+      <w:r>
+        <w:rPr>
+          <w:rFonts w:ascii="Georgia" w:cs="Georgia" w:eastAsia="Georgia" w:hAnsi="Georgia"/>
+          <w:sz w:val="21"/>
+          <w:szCs w:val="21"/>
+        </w:rPr>
+        <w:t xml:space="preserve">A resposta de Otávio chegou dois minutos depois.</w:t>
+      </w:r>
+    </w:p>
+    <w:p>
+      <w:pPr>
+        <w:spacing w:after="0" w:line="312"/>
+        <w:ind w:firstLine="340"/>
+        <w:jc w:val="both"/>
+      </w:pPr>
+      <w:r>
+        <w:rPr>
+          <w:rFonts w:ascii="Georgia" w:cs="Georgia" w:eastAsia="Georgia" w:hAnsi="Georgia"/>
+          <w:sz w:val="21"/>
+          <w:szCs w:val="21"/>
+        </w:rPr>
+        <w:t xml:space="preserve">Vai.</w:t>
+      </w:r>
+    </w:p>
+    <w:p>
+      <w:pPr>
+        <w:spacing w:after="0" w:line="312"/>
+        <w:ind w:firstLine="340"/>
+        <w:jc w:val="both"/>
+      </w:pPr>
+      <w:r>
+        <w:rPr>
+          <w:rFonts w:ascii="Georgia" w:cs="Georgia" w:eastAsia="Georgia" w:hAnsi="Georgia"/>
+          <w:sz w:val="21"/>
+          <w:szCs w:val="21"/>
+        </w:rPr>
+        <w:t xml:space="preserve">O sócio sabia que o carro ia cair. Sabia quem estava dentro. E deixou acontecer, porque um braço direito que sabia demais morrendo num carro que Henrique mandou para a estrada pesava mais na ficha de Henrique do que qualquer prova.</w:t>
+      </w:r>
+    </w:p>
+    <w:p>
+      <w:pPr>
+        <w:spacing w:after="0" w:line="312"/>
+        <w:ind w:firstLine="340"/>
+        <w:jc w:val="both"/>
+      </w:pPr>
+      <w:r>
+        <w:rPr>
+          <w:rFonts w:ascii="Georgia" w:cs="Georgia" w:eastAsia="Georgia" w:hAnsi="Georgia"/>
+          <w:sz w:val="21"/>
+          <w:szCs w:val="21"/>
+        </w:rPr>
+        <w:t xml:space="preserve">— Eu não matei ninguém — repetiu Otávio, na sala sem janelas, a mesma frase que tinha dito a Lucas meses antes. — Eu não encostei em ninguém.</w:t>
+      </w:r>
+    </w:p>
+    <w:p>
+      <w:pPr>
+        <w:spacing w:after="0" w:line="312"/>
+        <w:ind w:firstLine="340"/>
+        <w:jc w:val="both"/>
+      </w:pPr>
+      <w:r>
+        <w:rPr>
+          <w:rFonts w:ascii="Georgia" w:cs="Georgia" w:eastAsia="Georgia" w:hAnsi="Georgia"/>
+          <w:sz w:val="21"/>
+          <w:szCs w:val="21"/>
+        </w:rPr>
+        <w:t xml:space="preserve">— O senhor escreveu vai — disse Regina. — Às vezes, uma palavra é a mão inteira.</w:t>
+      </w:r>
+    </w:p>
+    <w:p>
+      <w:pPr>
+        <w:spacing w:after="200" w:before="200"/>
+        <w:jc w:val="center"/>
+      </w:pPr>
+      <w:r>
+        <w:rPr>
+          <w:rFonts w:ascii="Georgia" w:cs="Georgia" w:eastAsia="Georgia" w:hAnsi="Georgia"/>
+          <w:sz w:val="22"/>
+          <w:szCs w:val="22"/>
+        </w:rPr>
+        <w:t xml:space="preserve">*</w:t>
+      </w:r>
+    </w:p>
+    <w:p>
+      <w:pPr>
+        <w:spacing w:after="0" w:line="312"/>
+        <w:ind w:firstLine="340"/>
+        <w:jc w:val="both"/>
+      </w:pPr>
+      <w:r>
+        <w:rPr>
+          <w:rFonts w:ascii="Georgia" w:cs="Georgia" w:eastAsia="Georgia" w:hAnsi="Georgia"/>
+          <w:sz w:val="21"/>
+          <w:szCs w:val="21"/>
+        </w:rPr>
+        <w:t xml:space="preserve">O Código Penal brasileiro tem um artigo curto que Regina sabia de cor desde a faculdade, e que naquele caso valia mais do que todos os outros. Quem quer matar uma pessoa e, por erro, mata outra responde como se tivesse acertado a pessoa que queria matar.</w:t>
+      </w:r>
+    </w:p>
+    <w:p>
+      <w:pPr>
+        <w:spacing w:after="0" w:line="312"/>
+        <w:ind w:firstLine="340"/>
+        <w:jc w:val="both"/>
+      </w:pPr>
+      <w:r>
+        <w:rPr>
+          <w:rFonts w:ascii="Georgia" w:cs="Georgia" w:eastAsia="Georgia" w:hAnsi="Georgia"/>
+          <w:sz w:val="21"/>
+          <w:szCs w:val="21"/>
+        </w:rPr>
+        <w:t xml:space="preserve">Bianca não escapava por ter envenenado o homem errado. Falcão e Edvaldo não escapavam por ter acertado Marcelo em vez de Henrique. Otávio e Wellington não escapavam por terem esfaqueado um vendedor de elevadores debaixo de um edredom, nem por terem explodido um carro com o motorista e o braço direito dentro. Cada um respondia pelo que queria, e pelo que fez.</w:t>
+      </w:r>
+    </w:p>
+    <w:p>
+      <w:pPr>
+        <w:spacing w:after="0" w:line="312"/>
+        <w:ind w:firstLine="340"/>
+        <w:jc w:val="both"/>
+      </w:pPr>
+      <w:r>
+        <w:rPr>
+          <w:rFonts w:ascii="Georgia" w:cs="Georgia" w:eastAsia="Georgia" w:hAnsi="Georgia"/>
+          <w:sz w:val="21"/>
+          <w:szCs w:val="21"/>
+        </w:rPr>
+        <w:t xml:space="preserve">E o doutor Álvaro Mendes, que não quis matar ninguém, respondia pelo que deixou de fazer. Quem cria o risco tem o dever de evitar o resultado. Ele tinha criado o risco com as próprias mãos, num sítio de Cotia, e tinha ficado seis horas com o resultado no bolso.</w:t>
+      </w:r>
+    </w:p>
+    <w:p>
+      <w:pPr>
+        <w:spacing w:after="0" w:line="312"/>
+        <w:ind w:firstLine="340"/>
+        <w:jc w:val="both"/>
+      </w:pPr>
+      <w:r>
+        <w:rPr>
+          <w:rFonts w:ascii="Georgia" w:cs="Georgia" w:eastAsia="Georgia" w:hAnsi="Georgia"/>
+          <w:sz w:val="21"/>
+          <w:szCs w:val="21"/>
+        </w:rPr>
+        <w:t xml:space="preserve">O médico nunca chegou a ser julgado da forma que Regina esperava. Na terceira semana de prisão, os outros presos começaram a contar que ele conversava a noite inteira com alguém que não estava na cela. Rezava o Pai-Nosso em voz alta, até o dia nascer. Pedia perdão às paredes. O juiz mandou fazer um exame de sanidade mental, e o psiquiatra que fez o exame escreveu, numa linguagem cheia de termos técnicos, aquilo que Lucas e Lia tinham visto num banco de metal de Guarulhos: a culpa tinha terminado o serviço.</w:t>
+      </w:r>
+    </w:p>
+    <w:p>
+      <w:pPr>
+        <w:spacing w:after="0" w:line="312"/>
+        <w:ind w:firstLine="340"/>
+        <w:jc w:val="both"/>
+      </w:pPr>
+      <w:r>
+        <w:rPr>
+          <w:rFonts w:ascii="Georgia" w:cs="Georgia" w:eastAsia="Georgia" w:hAnsi="Georgia"/>
+          <w:sz w:val="21"/>
+          <w:szCs w:val="21"/>
+        </w:rPr>
+        <w:t xml:space="preserve">Ele foi transferido para um hospital de custódia, no interior. Lia mandou uma carta a ele, no Natal, que nunca soube se ele chegou a ler. Tinha uma frase só.</w:t>
+      </w:r>
+    </w:p>
+    <w:p>
+      <w:pPr>
+        <w:spacing w:after="0" w:line="312"/>
+        <w:ind w:firstLine="340"/>
+        <w:jc w:val="both"/>
+      </w:pPr>
+      <w:r>
+        <w:rPr>
+          <w:rFonts w:ascii="Georgia" w:cs="Georgia" w:eastAsia="Georgia" w:hAnsi="Georgia"/>
+          <w:sz w:val="21"/>
+          <w:szCs w:val="21"/>
+        </w:rPr>
+        <w:t xml:space="preserve">Eu ainda não consigo te perdoar. Mas rezo por você do jeito do tio Rodolfo.</w:t>
+      </w:r>
+    </w:p>
+    <w:p>
+      <w:pPr>
+        <w:spacing w:after="200" w:before="200"/>
+        <w:jc w:val="center"/>
+      </w:pPr>
+      <w:r>
+        <w:rPr>
+          <w:rFonts w:ascii="Georgia" w:cs="Georgia" w:eastAsia="Georgia" w:hAnsi="Georgia"/>
+          <w:sz w:val="22"/>
+          <w:szCs w:val="22"/>
+        </w:rPr>
+        <w:t xml:space="preserve">*</w:t>
+      </w:r>
+    </w:p>
+    <w:p>
+      <w:pPr>
+        <w:spacing w:after="0" w:line="312"/>
+        <w:ind w:firstLine="340"/>
+        <w:jc w:val="both"/>
+      </w:pPr>
+      <w:r>
+        <w:rPr>
+          <w:rFonts w:ascii="Georgia" w:cs="Georgia" w:eastAsia="Georgia" w:hAnsi="Georgia"/>
+          <w:sz w:val="21"/>
+          <w:szCs w:val="21"/>
+        </w:rPr>
+        <w:t xml:space="preserve">Numa terça-feira de novembro, Regina Paiva deu a primeira e única entrevista coletiva da carreira dela, na porta do Departamento de Homicídios, com o terninho azul-marinho de sempre e oito microfones à frente.</w:t>
+      </w:r>
+    </w:p>
+    <w:p>
+      <w:pPr>
+        <w:spacing w:after="0" w:line="312"/>
+        <w:ind w:firstLine="340"/>
+        <w:jc w:val="both"/>
+      </w:pPr>
+      <w:r>
+        <w:rPr>
+          <w:rFonts w:ascii="Georgia" w:cs="Georgia" w:eastAsia="Georgia" w:hAnsi="Georgia"/>
+          <w:sz w:val="21"/>
+          <w:szCs w:val="21"/>
+        </w:rPr>
+        <w:t xml:space="preserve">Falou durante doze minutos, sem ler nada. Disse os nomes de cada morto e, ao lado de cada nome, o nome de quem tinha mandado matar e de quem tinha executado. No fim, um repórter perguntou se Henrique Salvallus, o empresário que a cidade inteira tinha chamado de imorrível, tinha alguma culpa naquelas mortes.</w:t>
+      </w:r>
+    </w:p>
+    <w:p>
+      <w:pPr>
+        <w:spacing w:after="0" w:line="312"/>
+        <w:ind w:firstLine="340"/>
+        <w:jc w:val="both"/>
+      </w:pPr>
+      <w:r>
+        <w:rPr>
+          <w:rFonts w:ascii="Georgia" w:cs="Georgia" w:eastAsia="Georgia" w:hAnsi="Georgia"/>
+          <w:sz w:val="21"/>
+          <w:szCs w:val="21"/>
+        </w:rPr>
+        <w:t xml:space="preserve">Regina demorou a responder.</w:t>
+      </w:r>
+    </w:p>
+    <w:p>
+      <w:pPr>
+        <w:spacing w:after="0" w:line="312"/>
+        <w:ind w:firstLine="340"/>
+        <w:jc w:val="both"/>
+      </w:pPr>
+      <w:r>
+        <w:rPr>
+          <w:rFonts w:ascii="Georgia" w:cs="Georgia" w:eastAsia="Georgia" w:hAnsi="Georgia"/>
+          <w:sz w:val="21"/>
+          <w:szCs w:val="21"/>
+        </w:rPr>
+        <w:t xml:space="preserve">— Nenhuma das cinco mortes foi cometida por ele — disse, enfim. — Nenhuma foi encomendada por ele. Ele não era o assassino desta história, senhores. Era o alvo. Todos queriam Henrique morto. Por dinheiro, por vingança, por poder, por medo. Quem morreu foram os outros, e ele carregou a culpa de todos eles, na rua e na televisão, até o fim. — Ela fez uma pausa. — O nome dele está limpo. Infelizmente, ele não está aqui para ouvir.</w:t>
+      </w:r>
+    </w:p>
+    <w:p>
+      <w:pPr>
+        <w:spacing w:after="0" w:line="312"/>
+        <w:ind w:firstLine="340"/>
+        <w:jc w:val="both"/>
+      </w:pPr>
+      <w:r>
+        <w:rPr>
+          <w:rFonts w:ascii="Georgia" w:cs="Georgia" w:eastAsia="Georgia" w:hAnsi="Georgia"/>
+          <w:sz w:val="21"/>
+          <w:szCs w:val="21"/>
+        </w:rPr>
+        <w:t xml:space="preserve">Naquela noite, a mesma emissora que tinha exibido a foto de Henrique algemado, com o paletó rasgado, na porta do Il Ponte, exibiu a entrevista da delegada. Lucas assistiu sozinho, no sofá da Vila Nova Conceição. Lia assistiu com a mãe e com Carlos, na sala de Perdizes, com as janelas abertas.</w:t>
+      </w:r>
+    </w:p>
+    <w:p>
+      <w:pPr>
+        <w:spacing w:after="0" w:line="312"/>
+        <w:ind w:firstLine="340"/>
+        <w:jc w:val="both"/>
+      </w:pPr>
+      <w:r>
+        <w:rPr>
+          <w:rFonts w:ascii="Georgia" w:cs="Georgia" w:eastAsia="Georgia" w:hAnsi="Georgia"/>
+          <w:sz w:val="21"/>
+          <w:szCs w:val="21"/>
+        </w:rPr>
+        <w:t xml:space="preserve">Helena não assistiu. Tinha voltado para Americana na semana anterior, para cuidar da mãe. Não respondeu a nenhum processo, porque querer matar não é crime e guardar um frasco numa nécessaire também não. Antes de ir, deixou na casa do Jardim Europa, sobre a mesa do escritório do marido, o caderno de capa preta. Na última página, embaixo de Amanhã. Por você., tinha escrito uma linha nova, com outra caneta.</w:t>
+      </w:r>
+    </w:p>
+    <w:p>
+      <w:pPr>
+        <w:spacing w:after="0" w:line="312"/>
+        <w:ind w:firstLine="340"/>
+        <w:jc w:val="both"/>
+      </w:pPr>
+      <w:r>
+        <w:rPr>
+          <w:rFonts w:ascii="Georgia" w:cs="Georgia" w:eastAsia="Georgia" w:hAnsi="Georgia"/>
+          <w:sz w:val="21"/>
+          <w:szCs w:val="21"/>
+        </w:rPr>
+        <w:t xml:space="preserve">Não fui eu, pai. Mas eu também não salvei ninguém.</w:t>
+      </w:r>
+    </w:p>
+    <w:p>
+      <w:pPr>
+        <w:spacing w:after="200" w:before="200"/>
+        <w:jc w:val="center"/>
+      </w:pPr>
+      <w:r>
+        <w:rPr>
+          <w:rFonts w:ascii="Georgia" w:cs="Georgia" w:eastAsia="Georgia" w:hAnsi="Georgia"/>
+          <w:sz w:val="22"/>
+          <w:szCs w:val="22"/>
+        </w:rPr>
+        <w:t xml:space="preserve">*</w:t>
+      </w:r>
+    </w:p>
+    <w:p>
+      <w:pPr>
+        <w:spacing w:after="0" w:line="312"/>
+        <w:ind w:firstLine="340"/>
+        <w:jc w:val="both"/>
+      </w:pPr>
+      <w:r>
+        <w:rPr>
+          <w:rFonts w:ascii="Georgia" w:cs="Georgia" w:eastAsia="Georgia" w:hAnsi="Georgia"/>
+          <w:sz w:val="21"/>
+          <w:szCs w:val="21"/>
+        </w:rPr>
+        <w:t xml:space="preserve">Num domingo de dezembro, o Santos jogou na Vila Belmiro, às quatro da tarde.</w:t>
+      </w:r>
+    </w:p>
+    <w:p>
+      <w:pPr>
+        <w:spacing w:after="0" w:line="312"/>
+        <w:ind w:firstLine="340"/>
+        <w:jc w:val="both"/>
+      </w:pPr>
+      <w:r>
+        <w:rPr>
+          <w:rFonts w:ascii="Georgia" w:cs="Georgia" w:eastAsia="Georgia" w:hAnsi="Georgia"/>
+          <w:sz w:val="21"/>
+          <w:szCs w:val="21"/>
+        </w:rPr>
+        <w:t xml:space="preserve">Lucas comprou quatro ingressos. Foi com Lia, com Carlos e com Marta, que nunca tinha pisado num estádio e foi de óculos escuros e chapéu, reclamando do calor, e não perdeu um lance. Sentaram na arquibancada do lado da sombra, onde o pai sempre sentava. Carlos levou a foto do Rei Pelé que tinha passado vinte anos pendurada no quarto. Não sabia bem por quê. Segurou no colo o jogo inteiro.</w:t>
+      </w:r>
+    </w:p>
+    <w:p>
+      <w:pPr>
+        <w:spacing w:after="0" w:line="312"/>
+        <w:ind w:firstLine="340"/>
+        <w:jc w:val="both"/>
+      </w:pPr>
+      <w:r>
+        <w:rPr>
+          <w:rFonts w:ascii="Georgia" w:cs="Georgia" w:eastAsia="Georgia" w:hAnsi="Georgia"/>
+          <w:sz w:val="21"/>
+          <w:szCs w:val="21"/>
+        </w:rPr>
+        <w:t xml:space="preserve">Não era um jogo importante. O Santos fez um gol aos vinte do segundo tempo, de fora da área, e a arquibancada inteira se levantou ao mesmo tempo, como uma onda.</w:t>
+      </w:r>
+    </w:p>
+    <w:p>
+      <w:pPr>
+        <w:spacing w:after="0" w:line="312"/>
+        <w:ind w:firstLine="340"/>
+        <w:jc w:val="both"/>
+      </w:pPr>
+      <w:r>
+        <w:rPr>
+          <w:rFonts w:ascii="Georgia" w:cs="Georgia" w:eastAsia="Georgia" w:hAnsi="Georgia"/>
+          <w:sz w:val="21"/>
+          <w:szCs w:val="21"/>
+        </w:rPr>
+        <w:t xml:space="preserve">Lucas se levantou junto. Tirou do bolso o BlackBerry do pai, que tinha mantido com a linha ativa, pagando a conta todo mês sem saber direito por quê, e o segurou numa mão. Com a outra, mandou do próprio celular a mensagem de sempre.</w:t>
+      </w:r>
+    </w:p>
+    <w:p>
+      <w:pPr>
+        <w:spacing w:after="0" w:line="312"/>
+        <w:ind w:firstLine="340"/>
+        <w:jc w:val="both"/>
+      </w:pPr>
+      <w:r>
+        <w:rPr>
+          <w:rFonts w:ascii="Georgia" w:cs="Georgia" w:eastAsia="Georgia" w:hAnsi="Georgia"/>
+          <w:sz w:val="21"/>
+          <w:szCs w:val="21"/>
+        </w:rPr>
+        <w:t xml:space="preserve">Golaço, pai.</w:t>
+      </w:r>
+    </w:p>
+    <w:p>
+      <w:pPr>
+        <w:spacing w:after="0" w:line="312"/>
+        <w:ind w:firstLine="340"/>
+        <w:jc w:val="both"/>
+      </w:pPr>
+      <w:r>
+        <w:rPr>
+          <w:rFonts w:ascii="Georgia" w:cs="Georgia" w:eastAsia="Georgia" w:hAnsi="Georgia"/>
+          <w:sz w:val="21"/>
+          <w:szCs w:val="21"/>
+        </w:rPr>
+        <w:t xml:space="preserve">O BlackBerry vibrou na mão esquerda dele. Lucas abriu a mensagem e, do celular do pai, respondeu.</w:t>
+      </w:r>
+    </w:p>
+    <w:p>
+      <w:pPr>
+        <w:spacing w:after="0" w:line="312"/>
+        <w:ind w:firstLine="340"/>
+        <w:jc w:val="both"/>
+      </w:pPr>
+      <w:r>
+        <w:rPr>
+          <w:rFonts w:ascii="Georgia" w:cs="Georgia" w:eastAsia="Georgia" w:hAnsi="Georgia"/>
+          <w:sz w:val="21"/>
+          <w:szCs w:val="21"/>
+        </w:rPr>
+        <w:t xml:space="preserve">Sorte, filho.</w:t>
+      </w:r>
+    </w:p>
+    <w:p>
+      <w:pPr>
+        <w:spacing w:after="0" w:line="312"/>
+        <w:ind w:firstLine="340"/>
+        <w:jc w:val="both"/>
+      </w:pPr>
+      <w:r>
+        <w:rPr>
+          <w:rFonts w:ascii="Georgia" w:cs="Georgia" w:eastAsia="Georgia" w:hAnsi="Georgia"/>
+          <w:sz w:val="21"/>
+          <w:szCs w:val="21"/>
+        </w:rPr>
+        <w:t xml:space="preserve">Lia viu e não disse nada. Pôs a mão no ombro do irmão e deixou lá.</w:t>
+      </w:r>
+    </w:p>
+    <w:p>
+      <w:pPr>
+        <w:spacing w:after="200" w:before="200"/>
+        <w:jc w:val="center"/>
+      </w:pPr>
+      <w:r>
+        <w:rPr>
+          <w:rFonts w:ascii="Georgia" w:cs="Georgia" w:eastAsia="Georgia" w:hAnsi="Georgia"/>
+          <w:sz w:val="22"/>
+          <w:szCs w:val="22"/>
+        </w:rPr>
+        <w:t xml:space="preserve">*</w:t>
+      </w:r>
+    </w:p>
+    <w:p>
+      <w:pPr>
+        <w:spacing w:after="0" w:line="312"/>
+        <w:ind w:firstLine="340"/>
+        <w:jc w:val="both"/>
+      </w:pPr>
+      <w:r>
+        <w:rPr>
+          <w:rFonts w:ascii="Georgia" w:cs="Georgia" w:eastAsia="Georgia" w:hAnsi="Georgia"/>
+          <w:sz w:val="21"/>
+          <w:szCs w:val="21"/>
+        </w:rPr>
+        <w:t xml:space="preserve">As cinzas ficaram três meses numa caixa de madeira no escritório de Lucas, do tamanho de uma lata de biscoitos, como Henrique tinha imaginado no crematório do irmão.</w:t>
+      </w:r>
+    </w:p>
+    <w:p>
+      <w:pPr>
+        <w:spacing w:after="0" w:line="312"/>
+        <w:ind w:firstLine="340"/>
+        <w:jc w:val="both"/>
+      </w:pPr>
+      <w:r>
+        <w:rPr>
+          <w:rFonts w:ascii="Georgia" w:cs="Georgia" w:eastAsia="Georgia" w:hAnsi="Georgia"/>
+          <w:sz w:val="21"/>
+          <w:szCs w:val="21"/>
+        </w:rPr>
+        <w:t xml:space="preserve">Em janeiro, os três filhos as levaram a Ubatuba. Escolheram a praia da foto de 1971, que Lia achou comparando o morro ao fundo com as imagens antigas da prefeitura. Era uma praia pequena, quase vazia num dia de semana, com uma barraca de coco e duas canoas de pescador na areia.</w:t>
+      </w:r>
+    </w:p>
+    <w:p>
+      <w:pPr>
+        <w:spacing w:after="0" w:line="312"/>
+        <w:ind w:firstLine="340"/>
+        <w:jc w:val="both"/>
+      </w:pPr>
+      <w:r>
+        <w:rPr>
+          <w:rFonts w:ascii="Georgia" w:cs="Georgia" w:eastAsia="Georgia" w:hAnsi="Georgia"/>
+          <w:sz w:val="21"/>
+          <w:szCs w:val="21"/>
+        </w:rPr>
+        <w:t xml:space="preserve">Ninguém fez discurso. Lucas abriu a caixa. Carlos segurou a tampa. Lia jogou as cinzas no mar, no começo da manhã, quando a água estava parada. O vento levou uma parte para a areia. Ninguém se importou.</w:t>
+      </w:r>
+    </w:p>
+    <w:p>
+      <w:pPr>
+        <w:spacing w:after="0" w:line="312"/>
+        <w:ind w:firstLine="340"/>
+        <w:jc w:val="both"/>
+      </w:pPr>
+      <w:r>
+        <w:rPr>
+          <w:rFonts w:ascii="Georgia" w:cs="Georgia" w:eastAsia="Georgia" w:hAnsi="Georgia"/>
+          <w:sz w:val="21"/>
+          <w:szCs w:val="21"/>
+        </w:rPr>
+        <w:t xml:space="preserve">— Ele ia rir disso — disse Lucas.</w:t>
+      </w:r>
+    </w:p>
+    <w:p>
+      <w:pPr>
+        <w:spacing w:after="0" w:line="312"/>
+        <w:ind w:firstLine="340"/>
+        <w:jc w:val="both"/>
+      </w:pPr>
+      <w:r>
+        <w:rPr>
+          <w:rFonts w:ascii="Georgia" w:cs="Georgia" w:eastAsia="Georgia" w:hAnsi="Georgia"/>
+          <w:sz w:val="21"/>
+          <w:szCs w:val="21"/>
+        </w:rPr>
+        <w:t xml:space="preserve">— Ele ia dizer que pelo menos não foi na privada — disse Lia.</w:t>
+      </w:r>
+    </w:p>
+    <w:p>
+      <w:pPr>
+        <w:spacing w:after="0" w:line="312"/>
+        <w:ind w:firstLine="340"/>
+        <w:jc w:val="both"/>
+      </w:pPr>
+      <w:r>
+        <w:rPr>
+          <w:rFonts w:ascii="Georgia" w:cs="Georgia" w:eastAsia="Georgia" w:hAnsi="Georgia"/>
+          <w:sz w:val="21"/>
+          <w:szCs w:val="21"/>
+        </w:rPr>
+        <w:t xml:space="preserve">E os três riram, sozinhos naquela praia, um riso curto e molhado que ninguém ouviu, e que não precisou pedir desculpas a ninguém.</w:t>
+      </w:r>
+    </w:p>
+    <w:p>
+      <w:pPr>
+        <w:spacing w:after="200" w:before="200"/>
+        <w:jc w:val="center"/>
+      </w:pPr>
+      <w:r>
+        <w:rPr>
+          <w:rFonts w:ascii="Georgia" w:cs="Georgia" w:eastAsia="Georgia" w:hAnsi="Georgia"/>
+          <w:sz w:val="22"/>
+          <w:szCs w:val="22"/>
+        </w:rPr>
+        <w:t xml:space="preserve">*</w:t>
+      </w:r>
+    </w:p>
+    <w:p>
+      <w:pPr>
+        <w:spacing w:after="0" w:line="312"/>
+        <w:ind w:firstLine="340"/>
+        <w:jc w:val="both"/>
+      </w:pPr>
+      <w:r>
+        <w:rPr>
+          <w:rFonts w:ascii="Georgia" w:cs="Georgia" w:eastAsia="Georgia" w:hAnsi="Georgia"/>
+          <w:sz w:val="21"/>
+          <w:szCs w:val="21"/>
+        </w:rPr>
+        <w:t xml:space="preserve">O cartão-postal apareceu em fevereiro.</w:t>
+      </w:r>
+    </w:p>
+    <w:p>
+      <w:pPr>
+        <w:spacing w:after="0" w:line="312"/>
+        <w:ind w:firstLine="340"/>
+        <w:jc w:val="both"/>
+      </w:pPr>
+      <w:r>
+        <w:rPr>
+          <w:rFonts w:ascii="Georgia" w:cs="Georgia" w:eastAsia="Georgia" w:hAnsi="Georgia"/>
+          <w:sz w:val="21"/>
+          <w:szCs w:val="21"/>
+        </w:rPr>
+        <w:t xml:space="preserve">Helena tinha ficado com o apartamento de Moema, pelo testamento, e não quis nada do que havia dentro. Ligou para Lucas pedindo que ele tirasse as coisas do pai antes de ela pôr o imóvel à venda. Lucas foi num sábado, com Lia. Esvaziaram a geladeira, o armário, a escrivaninha. Por último, a mala grande, ainda aberta ao pé da cama, com o sobretudo de etiqueta, os cachecóis, as botas.</w:t>
+      </w:r>
+    </w:p>
+    <w:p>
+      <w:pPr>
+        <w:spacing w:after="0" w:line="312"/>
+        <w:ind w:firstLine="340"/>
+        <w:jc w:val="both"/>
+      </w:pPr>
+      <w:r>
+        <w:rPr>
+          <w:rFonts w:ascii="Georgia" w:cs="Georgia" w:eastAsia="Georgia" w:hAnsi="Georgia"/>
+          <w:sz w:val="21"/>
+          <w:szCs w:val="21"/>
+        </w:rPr>
+        <w:t xml:space="preserve">Foi Lia quem achou, ao dobrar o sobretudo. No bolso de dentro, do lado do coração, um cartão-postal novo, com selo da Suíça já colado e o endereço dela escrito na letra inclinada do pai. Na frente, uma foto de montanhas cobertas de neve e, no pé de uma delas, um chalé de madeira com uma varanda em volta e doze janelas.</w:t>
+      </w:r>
+    </w:p>
+    <w:p>
+      <w:pPr>
+        <w:spacing w:after="0" w:line="312"/>
+        <w:ind w:firstLine="340"/>
+        <w:jc w:val="both"/>
+      </w:pPr>
+      <w:r>
+        <w:rPr>
+          <w:rFonts w:ascii="Georgia" w:cs="Georgia" w:eastAsia="Georgia" w:hAnsi="Georgia"/>
+          <w:sz w:val="21"/>
+          <w:szCs w:val="21"/>
+        </w:rPr>
+        <w:t xml:space="preserve">Ele tinha escrito antes. Para mandar depois. Para quando chegasse.</w:t>
+      </w:r>
+    </w:p>
+    <w:p>
+      <w:pPr>
+        <w:pBdr>
+          <w:top w:val="single" w:color="555555" w:sz="6" w:space="6"/>
+          <w:bottom w:val="single" w:color="555555" w:sz="6" w:space="6"/>
+          <w:left w:val="single" w:color="555555" w:sz="6" w:space="6"/>
+          <w:right w:val="single" w:color="555555" w:sz="6" w:space="6"/>
+        </w:pBdr>
+        <w:shd w:fill="EFEFEF" w:color="auto" w:val="clear"/>
+        <w:spacing w:after="0" w:before="240"/>
+        <w:ind w:left="227" w:right="227"/>
+        <w:jc w:val="center"/>
+      </w:pPr>
+      <w:r>
+        <w:rPr>
+          <w:rFonts w:ascii="Georgia" w:cs="Georgia" w:eastAsia="Georgia" w:hAnsi="Georgia"/>
+          <w:b/>
+          <w:bCs/>
+          <w:spacing w:val="30"/>
+          <w:sz w:val="17"/>
+          <w:szCs w:val="17"/>
+        </w:rPr>
+        <w:t xml:space="preserve">NO CELULAR DE HENRIQUE</w:t>
+      </w:r>
+    </w:p>
+    <w:p>
+      <w:pPr>
+        <w:pBdr>
+          <w:top w:val="single" w:color="555555" w:sz="6" w:space="6"/>
+          <w:bottom w:val="single" w:color="555555" w:sz="6" w:space="6"/>
+          <w:left w:val="single" w:color="555555" w:sz="6" w:space="6"/>
+          <w:right w:val="single" w:color="555555" w:sz="6" w:space="6"/>
+        </w:pBdr>
+        <w:shd w:fill="EFEFEF" w:color="auto" w:val="clear"/>
+        <w:spacing w:after="240" w:before="0" w:line="288"/>
+        <w:ind w:left="227" w:right="227"/>
+        <w:jc w:val="center"/>
+      </w:pPr>
+      <w:r>
+        <w:rPr>
+          <w:rFonts w:ascii="Georgia" w:cs="Georgia" w:eastAsia="Georgia" w:hAnsi="Georgia"/>
+          <w:i/>
+          <w:iCs/>
+          <w:sz w:val="19"/>
+          <w:szCs w:val="19"/>
+        </w:rPr>
+        <w:t xml:space="preserve">Abra o celular de Henrique pela última vez. Para ler o cartão-postal inteiro, digite o número de janelas da casa que Lia desenhou aos oito anos e o ano em que Henrique ganhou um irmão em Ubatuba, somados ao seu código pessoal.</w:t>
+      </w:r>
+    </w:p>
+    <w:p>
+      <w:pPr>
+        <w:spacing w:after="0" w:line="312"/>
+        <w:ind w:firstLine="340"/>
+        <w:jc w:val="both"/>
+      </w:pPr>
+      <w:r>
+        <w:rPr>
+          <w:rFonts w:ascii="Georgia" w:cs="Georgia" w:eastAsia="Georgia" w:hAnsi="Georgia"/>
+          <w:sz w:val="21"/>
+          <w:szCs w:val="21"/>
+        </w:rPr>
+        <w:t xml:space="preserve">Lia leu sentada na beira da cama arrumada, com Lucas de pé ao lado dela.</w:t>
+      </w:r>
+    </w:p>
+    <w:p>
+      <w:pPr>
+        <w:spacing w:after="0" w:line="312"/>
+        <w:ind w:firstLine="340"/>
+        <w:jc w:val="both"/>
+      </w:pPr>
+      <w:r>
+        <w:rPr>
+          <w:rFonts w:ascii="Georgia" w:cs="Georgia" w:eastAsia="Georgia" w:hAnsi="Georgia"/>
+          <w:sz w:val="21"/>
+          <w:szCs w:val="21"/>
+        </w:rPr>
+        <w:t xml:space="preserve">Filha. Cheguei. Agora você entende. Desculpa pelo susto, desculpa por tudo, desculpa por não ter sabido ser pai do jeito que vocês mereciam. Aqui tem neve, e a casa tem doze janelas, e eu deixei uma porta, porque a gente nunca sabe quando alguém vai querer entrar. Quando a poeira baixar, o tio Álvaro vai explicar tudo. Diz ao seu irmão que a corretora é dele, mas que ele não precisa ficar nela. Diz ao Carlos que eu esperei. Diz à sua mãe que era verdade. E vem me ver. Vocês três. Eu apago a luz e deixo a varanda acesa. Pai.</w:t>
+      </w:r>
+    </w:p>
+    <w:p>
+      <w:pPr>
+        <w:spacing w:after="0" w:line="312"/>
+        <w:ind w:firstLine="340"/>
+        <w:jc w:val="both"/>
+      </w:pPr>
+      <w:r>
+        <w:rPr>
+          <w:rFonts w:ascii="Georgia" w:cs="Georgia" w:eastAsia="Georgia" w:hAnsi="Georgia"/>
+          <w:sz w:val="21"/>
+          <w:szCs w:val="21"/>
+        </w:rPr>
+        <w:t xml:space="preserve">Lia não terminou de ler em voz alta. Não conseguiu. Lucas tirou o cartão da mão dela com cuidado e leu o resto sozinho, em silêncio. Depois sentou ao lado da irmã, na beira da cama, e os dois ficaram olhando para a janela empoeirada, onde a luz da tarde entrava torta.</w:t>
+      </w:r>
+    </w:p>
+    <w:p>
+      <w:pPr>
+        <w:spacing w:after="0" w:line="312"/>
+        <w:ind w:firstLine="340"/>
+        <w:jc w:val="both"/>
+      </w:pPr>
+      <w:r>
+        <w:rPr>
+          <w:rFonts w:ascii="Georgia" w:cs="Georgia" w:eastAsia="Georgia" w:hAnsi="Georgia"/>
+          <w:sz w:val="21"/>
+          <w:szCs w:val="21"/>
+        </w:rPr>
+        <w:t xml:space="preserve">— Ele achava que ia dar certo — disse Lia.</w:t>
+      </w:r>
+    </w:p>
+    <w:p>
+      <w:pPr>
+        <w:spacing w:after="0" w:line="312"/>
+        <w:ind w:firstLine="340"/>
+        <w:jc w:val="both"/>
+      </w:pPr>
+      <w:r>
+        <w:rPr>
+          <w:rFonts w:ascii="Georgia" w:cs="Georgia" w:eastAsia="Georgia" w:hAnsi="Georgia"/>
+          <w:sz w:val="21"/>
+          <w:szCs w:val="21"/>
+        </w:rPr>
+        <w:t xml:space="preserve">— Todo mundo achava — disse Lucas. — Cada um achava que o seu plano ia dar certo.</w:t>
+      </w:r>
+    </w:p>
+    <w:p>
+      <w:pPr>
+        <w:spacing w:after="200" w:before="200"/>
+        <w:jc w:val="center"/>
+      </w:pPr>
+      <w:r>
+        <w:rPr>
+          <w:rFonts w:ascii="Georgia" w:cs="Georgia" w:eastAsia="Georgia" w:hAnsi="Georgia"/>
+          <w:sz w:val="22"/>
+          <w:szCs w:val="22"/>
+        </w:rPr>
+        <w:t xml:space="preserve">*</w:t>
+      </w:r>
+    </w:p>
+    <w:p>
+      <w:pPr>
+        <w:spacing w:after="0" w:line="312"/>
+        <w:ind w:firstLine="340"/>
+        <w:jc w:val="both"/>
+      </w:pPr>
+      <w:r>
+        <w:rPr>
+          <w:rFonts w:ascii="Georgia" w:cs="Georgia" w:eastAsia="Georgia" w:hAnsi="Georgia"/>
+          <w:sz w:val="21"/>
+          <w:szCs w:val="21"/>
+        </w:rPr>
+        <w:t xml:space="preserve">Regina Paiva guardou as seis pastas no arquivo do Departamento numa sexta-feira de março, no fim do expediente. Antes de fechar a gaveta, abriu a mais fina, a de Henrique Salvallus, e releu a última folha, a que ela mesma tinha escrito à mão, no dia em que encerrou o caso.</w:t>
+      </w:r>
+    </w:p>
+    <w:p>
+      <w:pPr>
+        <w:spacing w:after="0" w:line="312"/>
+        <w:ind w:firstLine="340"/>
+        <w:jc w:val="both"/>
+      </w:pPr>
+      <w:r>
+        <w:rPr>
+          <w:rFonts w:ascii="Georgia" w:cs="Georgia" w:eastAsia="Georgia" w:hAnsi="Georgia"/>
+          <w:sz w:val="21"/>
+          <w:szCs w:val="21"/>
+        </w:rPr>
+        <w:t xml:space="preserve">Era uma lista. Ela gostava de listas, como o morto.</w:t>
+      </w:r>
+    </w:p>
+    <w:p>
+      <w:pPr>
+        <w:spacing w:after="0" w:line="312"/>
+        <w:ind w:firstLine="340"/>
+        <w:jc w:val="both"/>
+      </w:pPr>
+      <w:r>
+        <w:rPr>
+          <w:rFonts w:ascii="Georgia" w:cs="Georgia" w:eastAsia="Georgia" w:hAnsi="Georgia"/>
+          <w:sz w:val="21"/>
+          <w:szCs w:val="21"/>
+        </w:rPr>
+        <w:t xml:space="preserve">Quem quis que ele morresse: Bianca. Rubens Falcão. Otávio Prado. Helena, durante três anos. Carlos, durante uma hora.</w:t>
+      </w:r>
+    </w:p>
+    <w:p>
+      <w:pPr>
+        <w:spacing w:after="0" w:line="312"/>
+        <w:ind w:firstLine="340"/>
+        <w:jc w:val="both"/>
+      </w:pPr>
+      <w:r>
+        <w:rPr>
+          <w:rFonts w:ascii="Georgia" w:cs="Georgia" w:eastAsia="Georgia" w:hAnsi="Georgia"/>
+          <w:sz w:val="21"/>
+          <w:szCs w:val="21"/>
+        </w:rPr>
+        <w:t xml:space="preserve">Quem pediu que ele virasse cinza: Otávio. Falcão. Dois amigos da Associação Comercial. Uma cliente antiga. Meia cidade.</w:t>
+      </w:r>
+    </w:p>
+    <w:p>
+      <w:pPr>
+        <w:spacing w:after="0" w:line="312"/>
+        <w:ind w:firstLine="340"/>
+        <w:jc w:val="both"/>
+      </w:pPr>
+      <w:r>
+        <w:rPr>
+          <w:rFonts w:ascii="Georgia" w:cs="Georgia" w:eastAsia="Georgia" w:hAnsi="Georgia"/>
+          <w:sz w:val="21"/>
+          <w:szCs w:val="21"/>
+        </w:rPr>
+        <w:t xml:space="preserve">Quem escolheu o fogo: Helena.</w:t>
+      </w:r>
+    </w:p>
+    <w:p>
+      <w:pPr>
+        <w:spacing w:after="0" w:line="312"/>
+        <w:ind w:firstLine="340"/>
+        <w:jc w:val="both"/>
+      </w:pPr>
+      <w:r>
+        <w:rPr>
+          <w:rFonts w:ascii="Georgia" w:cs="Georgia" w:eastAsia="Georgia" w:hAnsi="Georgia"/>
+          <w:sz w:val="21"/>
+          <w:szCs w:val="21"/>
+        </w:rPr>
+        <w:t xml:space="preserve">Quem assinou sem ver: Paulo Werneck.</w:t>
+      </w:r>
+    </w:p>
+    <w:p>
+      <w:pPr>
+        <w:spacing w:after="0" w:line="312"/>
+        <w:ind w:firstLine="340"/>
+        <w:jc w:val="both"/>
+      </w:pPr>
+      <w:r>
+        <w:rPr>
+          <w:rFonts w:ascii="Georgia" w:cs="Georgia" w:eastAsia="Georgia" w:hAnsi="Georgia"/>
+          <w:sz w:val="21"/>
+          <w:szCs w:val="21"/>
+        </w:rPr>
+        <w:t xml:space="preserve">Quem tinha a vida dele nas mãos e fechou os olhos: Álvaro Mendes.</w:t>
+      </w:r>
+    </w:p>
+    <w:p>
+      <w:pPr>
+        <w:spacing w:after="0" w:line="312"/>
+        <w:ind w:firstLine="340"/>
+        <w:jc w:val="both"/>
+      </w:pPr>
+      <w:r>
+        <w:rPr>
+          <w:rFonts w:ascii="Georgia" w:cs="Georgia" w:eastAsia="Georgia" w:hAnsi="Georgia"/>
+          <w:sz w:val="21"/>
+          <w:szCs w:val="21"/>
+        </w:rPr>
+        <w:t xml:space="preserve">Quem escreveu o plano, marcou a hora na agenda e tomou o copo de água na cozinha, sozinho, às sete da manhã: o próprio Henrique.</w:t>
+      </w:r>
+    </w:p>
+    <w:p>
+      <w:pPr>
+        <w:spacing w:after="0" w:line="312"/>
+        <w:ind w:firstLine="340"/>
+        <w:jc w:val="both"/>
+      </w:pPr>
+      <w:r>
+        <w:rPr>
+          <w:rFonts w:ascii="Georgia" w:cs="Georgia" w:eastAsia="Georgia" w:hAnsi="Georgia"/>
+          <w:sz w:val="21"/>
+          <w:szCs w:val="21"/>
+        </w:rPr>
+        <w:t xml:space="preserve">Para a lei, a resposta era simples. Cada crime tinha um autor, com nome, sobrenome e número de processo. Ela tinha encontrado todos. Tinha feito o trabalho dela.</w:t>
+      </w:r>
+    </w:p>
+    <w:p>
+      <w:pPr>
+        <w:spacing w:after="0" w:line="312"/>
+        <w:ind w:firstLine="340"/>
+        <w:jc w:val="both"/>
+      </w:pPr>
+      <w:r>
+        <w:rPr>
+          <w:rFonts w:ascii="Georgia" w:cs="Georgia" w:eastAsia="Georgia" w:hAnsi="Georgia"/>
+          <w:sz w:val="21"/>
+          <w:szCs w:val="21"/>
+        </w:rPr>
+        <w:t xml:space="preserve">Mas, olhando para aquela lista, Regina pensou que a morte de Henrique Salvallus não cabia num processo. Tinha sido escrita a muitas mãos, por gente que queria e gente que não queria, por quem agiu e por quem se calou, por quem riu num velório e por quem deixou a decisão a outra pessoa, de brincadeira, num dia de chuva fina. Cada um tinha escrito uma linha. Nenhum tinha escrito a história inteira.</w:t>
+      </w:r>
+    </w:p>
+    <w:p>
+      <w:pPr>
+        <w:spacing w:after="0" w:line="312"/>
+        <w:ind w:firstLine="340"/>
+        <w:jc w:val="both"/>
+      </w:pPr>
+      <w:r>
+        <w:rPr>
+          <w:rFonts w:ascii="Georgia" w:cs="Georgia" w:eastAsia="Georgia" w:hAnsi="Georgia"/>
+          <w:sz w:val="21"/>
+          <w:szCs w:val="21"/>
+        </w:rPr>
+        <w:t xml:space="preserve">Ela fechou a pasta, guardou-a na gaveta e apagou a luz da sala.</w:t>
+      </w:r>
+    </w:p>
+    <w:p>
+      <w:pPr>
+        <w:spacing w:after="0" w:line="312"/>
+        <w:ind w:firstLine="340"/>
+        <w:jc w:val="both"/>
+      </w:pPr>
+      <w:r>
+        <w:rPr>
+          <w:rFonts w:ascii="Georgia" w:cs="Georgia" w:eastAsia="Georgia" w:hAnsi="Georgia"/>
+          <w:sz w:val="21"/>
+          <w:szCs w:val="21"/>
+        </w:rPr>
+        <w:t xml:space="preserve">No escuro, ficou um instante parada na porta, com a mão no interruptor, pensando na pergunta que não tinha posto em relatório nenhum, e que nenhum juiz ia lhe fazer.</w:t>
+      </w:r>
+    </w:p>
+    <w:p>
+      <w:pPr>
+        <w:spacing w:after="0" w:line="312"/>
+        <w:ind w:firstLine="340"/>
+        <w:jc w:val="both"/>
+      </w:pPr>
+      <w:r>
+        <w:rPr>
+          <w:rFonts w:ascii="Georgia" w:cs="Georgia" w:eastAsia="Georgia" w:hAnsi="Georgia"/>
+          <w:sz w:val="21"/>
+          <w:szCs w:val="21"/>
+        </w:rPr>
+        <w:t xml:space="preserve">Todo crime tem um autor?</w:t>
       </w:r>
     </w:p>
     <w:sectPr>

</xml_diff>

<commit_message>
Livro policial: P.S. do cartão-postal e os três ditados de Regina (cap. 30)
Co-Authored-By: Claude Opus 5.5 <noreply@anthropic.com>
Claude-Session: https://claude.ai/code/session_01BrurxSYygRC3rRhaUYosm1
</commit_message>
<xml_diff>
--- a/docs/livro-policial/TODO_CRIME_TEM_UM_AUTOR.docx
+++ b/docs/livro-policial/TODO_CRIME_TEM_UM_AUTOR.docx
@@ -34750,6 +34750,141 @@
     </w:p>
     <w:p>
       <w:pPr>
+        <w:spacing w:after="0" w:line="312"/>
+        <w:ind w:firstLine="340"/>
+        <w:jc w:val="both"/>
+      </w:pPr>
+      <w:r>
+        <w:rPr>
+          <w:rFonts w:ascii="Georgia" w:cs="Georgia" w:eastAsia="Georgia" w:hAnsi="Georgia"/>
+          <w:sz w:val="21"/>
+          <w:szCs w:val="21"/>
+        </w:rPr>
+        <w:t xml:space="preserve">Foi quando ele virou o cartão para devolvê-lo à irmã que viu.</w:t>
+      </w:r>
+    </w:p>
+    <w:p>
+      <w:pPr>
+        <w:spacing w:after="0" w:line="312"/>
+        <w:ind w:firstLine="340"/>
+        <w:jc w:val="both"/>
+      </w:pPr>
+      <w:r>
+        <w:rPr>
+          <w:rFonts w:ascii="Georgia" w:cs="Georgia" w:eastAsia="Georgia" w:hAnsi="Georgia"/>
+          <w:sz w:val="21"/>
+          <w:szCs w:val="21"/>
+        </w:rPr>
+        <w:t xml:space="preserve">Na margem do lado da foto, subindo pela beira da montanha, na vertical, havia mais algumas linhas. Escritas tão miúdas, tão apertadas contra a borda, que se confundiam com o desenho da neve. Os dois tinham passado os olhos por ali sem ver nada. Lucas aproximou o cartão da janela e inclinou contra a luz.</w:t>
+      </w:r>
+    </w:p>
+    <w:p>
+      <w:pPr>
+        <w:spacing w:after="0" w:line="312"/>
+        <w:ind w:firstLine="340"/>
+        <w:jc w:val="both"/>
+      </w:pPr>
+      <w:r>
+        <w:rPr>
+          <w:rFonts w:ascii="Georgia" w:cs="Georgia" w:eastAsia="Georgia" w:hAnsi="Georgia"/>
+          <w:sz w:val="21"/>
+          <w:szCs w:val="21"/>
+        </w:rPr>
+        <w:t xml:space="preserve">P.S. Não conta ao Álvaro que eu escrevi isto. Ele acha que só me ajudou a fugir. Mas eu também quis ajudar ele. Alguém precisava ser o primeiro, filha, e quem melhor do que um velho que já tem vontade de sumir? Se eu acordar, o remédio dele funciona em gente. Milhares de pessoas com câncer vão poder dormir durante os piores dias de dor, em vez de gritar. O Álvaro vai ser reconhecido no mundo inteiro, como sempre mereceu, e aquela comissão que não acreditou nele vai ter que engolir. Não é só fuga, Lia. É o meu jeito de pagar a ele os trinta anos que ele cuidou de todos nós. Uma causa nobre, pela primeira vez na vida do seu pai.</w:t>
+      </w:r>
+    </w:p>
+    <w:p>
+      <w:pPr>
+        <w:spacing w:after="0" w:line="312"/>
+        <w:ind w:firstLine="340"/>
+        <w:jc w:val="both"/>
+      </w:pPr>
+      <w:r>
+        <w:rPr>
+          <w:rFonts w:ascii="Georgia" w:cs="Georgia" w:eastAsia="Georgia" w:hAnsi="Georgia"/>
+          <w:sz w:val="21"/>
+          <w:szCs w:val="21"/>
+        </w:rPr>
+        <w:t xml:space="preserve">Lucas leu em voz alta, devagar, até o fim. Quando terminou, ninguém disse nada.</w:t>
+      </w:r>
+    </w:p>
+    <w:p>
+      <w:pPr>
+        <w:spacing w:after="0" w:line="312"/>
+        <w:ind w:firstLine="340"/>
+        <w:jc w:val="both"/>
+      </w:pPr>
+      <w:r>
+        <w:rPr>
+          <w:rFonts w:ascii="Georgia" w:cs="Georgia" w:eastAsia="Georgia" w:hAnsi="Georgia"/>
+          <w:sz w:val="21"/>
+          <w:szCs w:val="21"/>
+        </w:rPr>
+        <w:t xml:space="preserve">Lia foi a primeira a chorar. Depois Lucas, que não tinha chorado no crematório, nem na leitura do testamento, nem no banco do aeroporto. Choraram os dois, sentados na beira da cama arrumada do pai, com o cartão-postal entre eles.</w:t>
+      </w:r>
+    </w:p>
+    <w:p>
+      <w:pPr>
+        <w:spacing w:after="0" w:line="312"/>
+        <w:ind w:firstLine="340"/>
+        <w:jc w:val="both"/>
+      </w:pPr>
+      <w:r>
+        <w:rPr>
+          <w:rFonts w:ascii="Georgia" w:cs="Georgia" w:eastAsia="Georgia" w:hAnsi="Georgia"/>
+          <w:sz w:val="21"/>
+          <w:szCs w:val="21"/>
+        </w:rPr>
+        <w:t xml:space="preserve">O pai não tinha só planejado uma fuga. Tinha oferecido o próprio corpo para que o amigo pudesse provar ao mundo que estava certo. Para que o médico que cuidou da catapora de um e da apendicite da outra fosse, enfim, o que sempre quis ser. E o amigo, no fim, tinha recebido exatamente o que o pai quis lhe dar, a prova de que a vaidade dele estava certa, e tinha deixado essa prova descer por um alçapão.</w:t>
+      </w:r>
+    </w:p>
+    <w:p>
+      <w:pPr>
+        <w:spacing w:after="0" w:line="312"/>
+        <w:ind w:firstLine="340"/>
+        <w:jc w:val="both"/>
+      </w:pPr>
+      <w:r>
+        <w:rPr>
+          <w:rFonts w:ascii="Georgia" w:cs="Georgia" w:eastAsia="Georgia" w:hAnsi="Georgia"/>
+          <w:sz w:val="21"/>
+          <w:szCs w:val="21"/>
+        </w:rPr>
+        <w:t xml:space="preserve">— Ele planejou o crime perfeito — disse Lia, enxugando o rosto com a manga. — A própria morte. Com hora, com assinatura, com papel. Não faltava nada.</w:t>
+      </w:r>
+    </w:p>
+    <w:p>
+      <w:pPr>
+        <w:spacing w:after="0" w:line="312"/>
+        <w:ind w:firstLine="340"/>
+        <w:jc w:val="both"/>
+      </w:pPr>
+      <w:r>
+        <w:rPr>
+          <w:rFonts w:ascii="Georgia" w:cs="Georgia" w:eastAsia="Georgia" w:hAnsi="Georgia"/>
+          <w:sz w:val="21"/>
+          <w:szCs w:val="21"/>
+        </w:rPr>
+        <w:t xml:space="preserve">Lucas dobrou o cartão com cuidado e o guardou no bolso de dentro do paletó, do lado do coração, onde o pai o tinha guardado.</w:t>
+      </w:r>
+    </w:p>
+    <w:p>
+      <w:pPr>
+        <w:spacing w:after="0" w:line="312"/>
+        <w:ind w:firstLine="340"/>
+        <w:jc w:val="both"/>
+      </w:pPr>
+      <w:r>
+        <w:rPr>
+          <w:rFonts w:ascii="Georgia" w:cs="Georgia" w:eastAsia="Georgia" w:hAnsi="Georgia"/>
+          <w:sz w:val="21"/>
+          <w:szCs w:val="21"/>
+        </w:rPr>
+        <w:t xml:space="preserve">— Faltou uma coisa — disse. — Nenhum crime é perfeito.</w:t>
+      </w:r>
+    </w:p>
+    <w:p>
+      <w:pPr>
         <w:spacing w:after="200" w:before="200"/>
         <w:jc w:val="center"/>
       </w:pPr>
@@ -34939,22 +35074,157 @@
           <w:sz w:val="21"/>
           <w:szCs w:val="21"/>
         </w:rPr>
-        <w:t xml:space="preserve">No escuro, ficou um instante parada na porta, com a mão no interruptor, pensando na pergunta que não tinha posto em relatório nenhum, e que nenhum juiz ia lhe fazer.</w:t>
-      </w:r>
-    </w:p>
-    <w:p>
-      <w:pPr>
-        <w:spacing w:after="0" w:line="312"/>
-        <w:ind w:firstLine="340"/>
-        <w:jc w:val="both"/>
-      </w:pPr>
-      <w:r>
-        <w:rPr>
-          <w:rFonts w:ascii="Georgia" w:cs="Georgia" w:eastAsia="Georgia" w:hAnsi="Georgia"/>
-          <w:sz w:val="21"/>
-          <w:szCs w:val="21"/>
-        </w:rPr>
-        <w:t xml:space="preserve">Todo crime tem um autor?</w:t>
+        <w:t xml:space="preserve">No escuro, ficou um instante parada na porta, com a mão no interruptor. E então, sem perceber, começou a pensar em voz alta, como fazia às vezes quando estava sozinha na sala, para ninguém e para todos ao mesmo tempo.</w:t>
+      </w:r>
+    </w:p>
+    <w:p>
+      <w:pPr>
+        <w:spacing w:after="0" w:line="312"/>
+        <w:ind w:firstLine="340"/>
+        <w:jc w:val="both"/>
+      </w:pPr>
+      <w:r>
+        <w:rPr>
+          <w:rFonts w:ascii="Georgia" w:cs="Georgia" w:eastAsia="Georgia" w:hAnsi="Georgia"/>
+          <w:sz w:val="21"/>
+          <w:szCs w:val="21"/>
+        </w:rPr>
+        <w:t xml:space="preserve">— Três ditados — disse, baixinho. — Esse homem confirmou três ditados.</w:t>
+      </w:r>
+    </w:p>
+    <w:p>
+      <w:pPr>
+        <w:spacing w:after="0" w:line="312"/>
+        <w:ind w:firstLine="340"/>
+        <w:jc w:val="both"/>
+      </w:pPr>
+      <w:r>
+        <w:rPr>
+          <w:rFonts w:ascii="Georgia" w:cs="Georgia" w:eastAsia="Georgia" w:hAnsi="Georgia"/>
+          <w:sz w:val="21"/>
+          <w:szCs w:val="21"/>
+        </w:rPr>
+        <w:t xml:space="preserve">Contou nos dedos, no escuro.</w:t>
+      </w:r>
+    </w:p>
+    <w:p>
+      <w:pPr>
+        <w:spacing w:after="0" w:line="312"/>
+        <w:ind w:firstLine="340"/>
+        <w:jc w:val="both"/>
+      </w:pPr>
+      <w:r>
+        <w:rPr>
+          <w:rFonts w:ascii="Georgia" w:cs="Georgia" w:eastAsia="Georgia" w:hAnsi="Georgia"/>
+          <w:sz w:val="21"/>
+          <w:szCs w:val="21"/>
+        </w:rPr>
+        <w:t xml:space="preserve">— Ninguém morre antes da hora. Escapou quatro vezes. Morreu na quinta, quando ninguém queria mais que ele escapasse. Nem ele.</w:t>
+      </w:r>
+    </w:p>
+    <w:p>
+      <w:pPr>
+        <w:spacing w:after="0" w:line="312"/>
+        <w:ind w:firstLine="340"/>
+        <w:jc w:val="both"/>
+      </w:pPr>
+      <w:r>
+        <w:rPr>
+          <w:rFonts w:ascii="Georgia" w:cs="Georgia" w:eastAsia="Georgia" w:hAnsi="Georgia"/>
+          <w:sz w:val="21"/>
+          <w:szCs w:val="21"/>
+        </w:rPr>
+        <w:t xml:space="preserve">O segundo dedo.</w:t>
+      </w:r>
+    </w:p>
+    <w:p>
+      <w:pPr>
+        <w:spacing w:after="0" w:line="312"/>
+        <w:ind w:firstLine="340"/>
+        <w:jc w:val="both"/>
+      </w:pPr>
+      <w:r>
+        <w:rPr>
+          <w:rFonts w:ascii="Georgia" w:cs="Georgia" w:eastAsia="Georgia" w:hAnsi="Georgia"/>
+          <w:sz w:val="21"/>
+          <w:szCs w:val="21"/>
+        </w:rPr>
+        <w:t xml:space="preserve">— O que pedires com fé será atendido. — Ela quase sorriu. — Ele pediu para morrer. Pediu com toda a fé que tinha, com papel assinado e hora marcada. E foi atendido.</w:t>
+      </w:r>
+    </w:p>
+    <w:p>
+      <w:pPr>
+        <w:spacing w:after="0" w:line="312"/>
+        <w:ind w:firstLine="340"/>
+        <w:jc w:val="both"/>
+      </w:pPr>
+      <w:r>
+        <w:rPr>
+          <w:rFonts w:ascii="Georgia" w:cs="Georgia" w:eastAsia="Georgia" w:hAnsi="Georgia"/>
+          <w:sz w:val="21"/>
+          <w:szCs w:val="21"/>
+        </w:rPr>
+        <w:t xml:space="preserve">O terceiro dedo demorou a se levantar.</w:t>
+      </w:r>
+    </w:p>
+    <w:p>
+      <w:pPr>
+        <w:spacing w:after="0" w:line="312"/>
+        <w:ind w:firstLine="340"/>
+        <w:jc w:val="both"/>
+      </w:pPr>
+      <w:r>
+        <w:rPr>
+          <w:rFonts w:ascii="Georgia" w:cs="Georgia" w:eastAsia="Georgia" w:hAnsi="Georgia"/>
+          <w:sz w:val="21"/>
+          <w:szCs w:val="21"/>
+        </w:rPr>
+        <w:t xml:space="preserve">— Todo crime tem um autor.</w:t>
+      </w:r>
+    </w:p>
+    <w:p>
+      <w:pPr>
+        <w:spacing w:after="0" w:line="312"/>
+        <w:ind w:firstLine="340"/>
+        <w:jc w:val="both"/>
+      </w:pPr>
+      <w:r>
+        <w:rPr>
+          <w:rFonts w:ascii="Georgia" w:cs="Georgia" w:eastAsia="Georgia" w:hAnsi="Georgia"/>
+          <w:sz w:val="21"/>
+          <w:szCs w:val="21"/>
+        </w:rPr>
+        <w:t xml:space="preserve">Ficou parada, com a mão erguida no escuro, olhando para os três dedos que não conseguia ver. Pensou em Bianca, em Falcão, em Otávio. Em Helena e no fogo. No médico de olhos fechados. No homem que tomou um copo de água sozinho na cozinha, às sete da manhã, para ajudar um amigo e sumir do mundo.</w:t>
+      </w:r>
+    </w:p>
+    <w:p>
+      <w:pPr>
+        <w:spacing w:after="0" w:line="312"/>
+        <w:ind w:firstLine="340"/>
+        <w:jc w:val="both"/>
+      </w:pPr>
+      <w:r>
+        <w:rPr>
+          <w:rFonts w:ascii="Georgia" w:cs="Georgia" w:eastAsia="Georgia" w:hAnsi="Georgia"/>
+          <w:sz w:val="21"/>
+          <w:szCs w:val="21"/>
+        </w:rPr>
+        <w:t xml:space="preserve">Baixou a mão devagar e se corrigiu.</w:t>
+      </w:r>
+    </w:p>
+    <w:p>
+      <w:pPr>
+        <w:spacing w:after="0" w:line="312"/>
+        <w:ind w:firstLine="340"/>
+        <w:jc w:val="both"/>
+      </w:pPr>
+      <w:r>
+        <w:rPr>
+          <w:rFonts w:ascii="Georgia" w:cs="Georgia" w:eastAsia="Georgia" w:hAnsi="Georgia"/>
+          <w:sz w:val="21"/>
+          <w:szCs w:val="21"/>
+        </w:rPr>
+        <w:t xml:space="preserve">— Será que todo crime tem um autor?</w:t>
       </w:r>
     </w:p>
     <w:sectPr>

</xml_diff>

<commit_message>
Livro policial: nome do autor completo no miolo e capa escolhida
Co-Authored-By: Claude Opus 5.5 <noreply@anthropic.com>
Claude-Session: https://claude.ai/code/session_01BrurxSYygRC3rRhaUYosm1
</commit_message>
<xml_diff>
--- a/docs/livro-policial/TODO_CRIME_TEM_UM_AUTOR.docx
+++ b/docs/livro-policial/TODO_CRIME_TEM_UM_AUTOR.docx
@@ -72,7 +72,7 @@
           <w:sz w:val="28"/>
           <w:szCs w:val="28"/>
         </w:rPr>
-        <w:t xml:space="preserve">A S TORRES</w:t>
+        <w:t xml:space="preserve">ROGÉRIO A S TORRES</w:t>
       </w:r>
     </w:p>
     <w:p>
@@ -38870,7 +38870,7 @@
           <w:sz w:val="22"/>
           <w:szCs w:val="22"/>
         </w:rPr>
-        <w:t xml:space="preserve">A S TORRES é o nome de autor de Rogério Aparecido da Silva Torres, psicólogo e fundador da Irmandade Conhecimento com Luz.</w:t>
+        <w:t xml:space="preserve">ROGÉRIO A S TORRES é psicólogo e fundador da Irmandade Conhecimento com Luz.</w:t>
       </w:r>
     </w:p>
     <w:p>

</xml_diff>

<commit_message>
Livro policial: endereço do site na página do celular e capa com a frase
</commit_message>
<xml_diff>
--- a/docs/livro-policial/TODO_CRIME_TEM_UM_AUTOR.docx
+++ b/docs/livro-policial/TODO_CRIME_TEM_UM_AUTOR.docx
@@ -346,8 +346,8 @@
         <w:keepLines/>
         <w:pBdr>
           <w:top w:val="single" w:color="555555" w:sz="6" w:space="6"/>
+          <w:left w:val="single" w:color="555555" w:sz="6" w:space="6"/>
           <w:bottom w:val="single" w:color="555555" w:sz="6" w:space="6"/>
-          <w:left w:val="single" w:color="555555" w:sz="6" w:space="6"/>
           <w:right w:val="single" w:color="555555" w:sz="6" w:space="6"/>
         </w:pBdr>
         <w:shd w:fill="EFEFEF" w:color="auto" w:val="clear"/>
@@ -372,8 +372,8 @@
         <w:keepLines/>
         <w:pBdr>
           <w:top w:val="single" w:color="555555" w:sz="6" w:space="6"/>
+          <w:left w:val="single" w:color="555555" w:sz="6" w:space="6"/>
           <w:bottom w:val="single" w:color="555555" w:sz="6" w:space="6"/>
-          <w:left w:val="single" w:color="555555" w:sz="6" w:space="6"/>
           <w:right w:val="single" w:color="555555" w:sz="6" w:space="6"/>
         </w:pBdr>
         <w:shd w:fill="EFEFEF" w:color="auto" w:val="clear"/>
@@ -422,7 +422,23 @@
           <w:sz w:val="22"/>
           <w:szCs w:val="22"/>
         </w:rPr>
-        <w:t xml:space="preserve">Endereço: [ENDEREÇO DO SITE]</w:t>
+        <w:t xml:space="preserve">Endereço:</w:t>
+      </w:r>
+    </w:p>
+    <w:p>
+      <w:pPr>
+        <w:spacing w:after="120"/>
+        <w:jc w:val="center"/>
+      </w:pPr>
+      <w:r>
+        <w:rPr>
+          <w:rFonts w:ascii="Times New Roman" w:cs="Times New Roman" w:eastAsia="Times New Roman" w:hAnsi="Times New Roman"/>
+          <w:b/>
+          <w:bCs/>
+          <w:sz w:val="20"/>
+          <w:szCs w:val="20"/>
+        </w:rPr>
+        <w:t xml:space="preserve">irmandade-conhecimento-com-luz.onrender.com/henrique</w:t>
       </w:r>
     </w:p>
     <w:p>
@@ -2549,8 +2565,8 @@
         <w:keepLines/>
         <w:pBdr>
           <w:top w:val="single" w:color="555555" w:sz="6" w:space="6"/>
+          <w:left w:val="single" w:color="555555" w:sz="6" w:space="6"/>
           <w:bottom w:val="single" w:color="555555" w:sz="6" w:space="6"/>
-          <w:left w:val="single" w:color="555555" w:sz="6" w:space="6"/>
           <w:right w:val="single" w:color="555555" w:sz="6" w:space="6"/>
         </w:pBdr>
         <w:shd w:fill="EFEFEF" w:color="auto" w:val="clear"/>
@@ -2575,8 +2591,8 @@
         <w:keepLines/>
         <w:pBdr>
           <w:top w:val="single" w:color="555555" w:sz="6" w:space="6"/>
+          <w:left w:val="single" w:color="555555" w:sz="6" w:space="6"/>
           <w:bottom w:val="single" w:color="555555" w:sz="6" w:space="6"/>
-          <w:left w:val="single" w:color="555555" w:sz="6" w:space="6"/>
           <w:right w:val="single" w:color="555555" w:sz="6" w:space="6"/>
         </w:pBdr>
         <w:shd w:fill="EFEFEF" w:color="auto" w:val="clear"/>
@@ -4165,8 +4181,8 @@
         <w:keepLines/>
         <w:pBdr>
           <w:top w:val="single" w:color="555555" w:sz="6" w:space="6"/>
+          <w:left w:val="single" w:color="555555" w:sz="6" w:space="6"/>
           <w:bottom w:val="single" w:color="555555" w:sz="6" w:space="6"/>
-          <w:left w:val="single" w:color="555555" w:sz="6" w:space="6"/>
           <w:right w:val="single" w:color="555555" w:sz="6" w:space="6"/>
         </w:pBdr>
         <w:shd w:fill="EFEFEF" w:color="auto" w:val="clear"/>
@@ -4191,8 +4207,8 @@
         <w:keepLines/>
         <w:pBdr>
           <w:top w:val="single" w:color="555555" w:sz="6" w:space="6"/>
+          <w:left w:val="single" w:color="555555" w:sz="6" w:space="6"/>
           <w:bottom w:val="single" w:color="555555" w:sz="6" w:space="6"/>
-          <w:left w:val="single" w:color="555555" w:sz="6" w:space="6"/>
           <w:right w:val="single" w:color="555555" w:sz="6" w:space="6"/>
         </w:pBdr>
         <w:shd w:fill="EFEFEF" w:color="auto" w:val="clear"/>
@@ -8574,8 +8590,8 @@
         <w:keepLines/>
         <w:pBdr>
           <w:top w:val="single" w:color="555555" w:sz="6" w:space="6"/>
+          <w:left w:val="single" w:color="555555" w:sz="6" w:space="6"/>
           <w:bottom w:val="single" w:color="555555" w:sz="6" w:space="6"/>
-          <w:left w:val="single" w:color="555555" w:sz="6" w:space="6"/>
           <w:right w:val="single" w:color="555555" w:sz="6" w:space="6"/>
         </w:pBdr>
         <w:shd w:fill="EFEFEF" w:color="auto" w:val="clear"/>
@@ -8600,8 +8616,8 @@
         <w:keepLines/>
         <w:pBdr>
           <w:top w:val="single" w:color="555555" w:sz="6" w:space="6"/>
+          <w:left w:val="single" w:color="555555" w:sz="6" w:space="6"/>
           <w:bottom w:val="single" w:color="555555" w:sz="6" w:space="6"/>
-          <w:left w:val="single" w:color="555555" w:sz="6" w:space="6"/>
           <w:right w:val="single" w:color="555555" w:sz="6" w:space="6"/>
         </w:pBdr>
         <w:shd w:fill="EFEFEF" w:color="auto" w:val="clear"/>
@@ -9170,8 +9186,8 @@
         <w:keepLines/>
         <w:pBdr>
           <w:top w:val="single" w:color="555555" w:sz="6" w:space="6"/>
+          <w:left w:val="single" w:color="555555" w:sz="6" w:space="6"/>
           <w:bottom w:val="single" w:color="555555" w:sz="6" w:space="6"/>
-          <w:left w:val="single" w:color="555555" w:sz="6" w:space="6"/>
           <w:right w:val="single" w:color="555555" w:sz="6" w:space="6"/>
         </w:pBdr>
         <w:shd w:fill="EFEFEF" w:color="auto" w:val="clear"/>
@@ -9196,8 +9212,8 @@
         <w:keepLines/>
         <w:pBdr>
           <w:top w:val="single" w:color="555555" w:sz="6" w:space="6"/>
+          <w:left w:val="single" w:color="555555" w:sz="6" w:space="6"/>
           <w:bottom w:val="single" w:color="555555" w:sz="6" w:space="6"/>
-          <w:left w:val="single" w:color="555555" w:sz="6" w:space="6"/>
           <w:right w:val="single" w:color="555555" w:sz="6" w:space="6"/>
         </w:pBdr>
         <w:shd w:fill="EFEFEF" w:color="auto" w:val="clear"/>
@@ -13499,8 +13515,8 @@
         <w:keepLines/>
         <w:pBdr>
           <w:top w:val="single" w:color="555555" w:sz="6" w:space="6"/>
+          <w:left w:val="single" w:color="555555" w:sz="6" w:space="6"/>
           <w:bottom w:val="single" w:color="555555" w:sz="6" w:space="6"/>
-          <w:left w:val="single" w:color="555555" w:sz="6" w:space="6"/>
           <w:right w:val="single" w:color="555555" w:sz="6" w:space="6"/>
         </w:pBdr>
         <w:shd w:fill="EFEFEF" w:color="auto" w:val="clear"/>
@@ -13525,8 +13541,8 @@
         <w:keepLines/>
         <w:pBdr>
           <w:top w:val="single" w:color="555555" w:sz="6" w:space="6"/>
+          <w:left w:val="single" w:color="555555" w:sz="6" w:space="6"/>
           <w:bottom w:val="single" w:color="555555" w:sz="6" w:space="6"/>
-          <w:left w:val="single" w:color="555555" w:sz="6" w:space="6"/>
           <w:right w:val="single" w:color="555555" w:sz="6" w:space="6"/>
         </w:pBdr>
         <w:shd w:fill="EFEFEF" w:color="auto" w:val="clear"/>
@@ -14637,8 +14653,8 @@
         <w:keepLines/>
         <w:pBdr>
           <w:top w:val="single" w:color="555555" w:sz="6" w:space="6"/>
+          <w:left w:val="single" w:color="555555" w:sz="6" w:space="6"/>
           <w:bottom w:val="single" w:color="555555" w:sz="6" w:space="6"/>
-          <w:left w:val="single" w:color="555555" w:sz="6" w:space="6"/>
           <w:right w:val="single" w:color="555555" w:sz="6" w:space="6"/>
         </w:pBdr>
         <w:shd w:fill="EFEFEF" w:color="auto" w:val="clear"/>
@@ -14663,8 +14679,8 @@
         <w:keepLines/>
         <w:pBdr>
           <w:top w:val="single" w:color="555555" w:sz="6" w:space="6"/>
+          <w:left w:val="single" w:color="555555" w:sz="6" w:space="6"/>
           <w:bottom w:val="single" w:color="555555" w:sz="6" w:space="6"/>
-          <w:left w:val="single" w:color="555555" w:sz="6" w:space="6"/>
           <w:right w:val="single" w:color="555555" w:sz="6" w:space="6"/>
         </w:pBdr>
         <w:shd w:fill="EFEFEF" w:color="auto" w:val="clear"/>
@@ -17111,8 +17127,8 @@
         <w:keepLines/>
         <w:pBdr>
           <w:top w:val="single" w:color="555555" w:sz="6" w:space="6"/>
+          <w:left w:val="single" w:color="555555" w:sz="6" w:space="6"/>
           <w:bottom w:val="single" w:color="555555" w:sz="6" w:space="6"/>
-          <w:left w:val="single" w:color="555555" w:sz="6" w:space="6"/>
           <w:right w:val="single" w:color="555555" w:sz="6" w:space="6"/>
         </w:pBdr>
         <w:shd w:fill="EFEFEF" w:color="auto" w:val="clear"/>
@@ -17137,8 +17153,8 @@
         <w:keepLines/>
         <w:pBdr>
           <w:top w:val="single" w:color="555555" w:sz="6" w:space="6"/>
+          <w:left w:val="single" w:color="555555" w:sz="6" w:space="6"/>
           <w:bottom w:val="single" w:color="555555" w:sz="6" w:space="6"/>
-          <w:left w:val="single" w:color="555555" w:sz="6" w:space="6"/>
           <w:right w:val="single" w:color="555555" w:sz="6" w:space="6"/>
         </w:pBdr>
         <w:shd w:fill="EFEFEF" w:color="auto" w:val="clear"/>
@@ -17897,8 +17913,8 @@
         <w:keepLines/>
         <w:pBdr>
           <w:top w:val="single" w:color="555555" w:sz="6" w:space="6"/>
+          <w:left w:val="single" w:color="555555" w:sz="6" w:space="6"/>
           <w:bottom w:val="single" w:color="555555" w:sz="6" w:space="6"/>
-          <w:left w:val="single" w:color="555555" w:sz="6" w:space="6"/>
           <w:right w:val="single" w:color="555555" w:sz="6" w:space="6"/>
         </w:pBdr>
         <w:shd w:fill="EFEFEF" w:color="auto" w:val="clear"/>
@@ -17923,8 +17939,8 @@
         <w:keepLines/>
         <w:pBdr>
           <w:top w:val="single" w:color="555555" w:sz="6" w:space="6"/>
+          <w:left w:val="single" w:color="555555" w:sz="6" w:space="6"/>
           <w:bottom w:val="single" w:color="555555" w:sz="6" w:space="6"/>
-          <w:left w:val="single" w:color="555555" w:sz="6" w:space="6"/>
           <w:right w:val="single" w:color="555555" w:sz="6" w:space="6"/>
         </w:pBdr>
         <w:shd w:fill="EFEFEF" w:color="auto" w:val="clear"/>
@@ -18970,8 +18986,8 @@
         <w:keepLines/>
         <w:pBdr>
           <w:top w:val="single" w:color="555555" w:sz="6" w:space="6"/>
+          <w:left w:val="single" w:color="555555" w:sz="6" w:space="6"/>
           <w:bottom w:val="single" w:color="555555" w:sz="6" w:space="6"/>
-          <w:left w:val="single" w:color="555555" w:sz="6" w:space="6"/>
           <w:right w:val="single" w:color="555555" w:sz="6" w:space="6"/>
         </w:pBdr>
         <w:shd w:fill="EFEFEF" w:color="auto" w:val="clear"/>
@@ -18996,8 +19012,8 @@
         <w:keepLines/>
         <w:pBdr>
           <w:top w:val="single" w:color="555555" w:sz="6" w:space="6"/>
+          <w:left w:val="single" w:color="555555" w:sz="6" w:space="6"/>
           <w:bottom w:val="single" w:color="555555" w:sz="6" w:space="6"/>
-          <w:left w:val="single" w:color="555555" w:sz="6" w:space="6"/>
           <w:right w:val="single" w:color="555555" w:sz="6" w:space="6"/>
         </w:pBdr>
         <w:shd w:fill="EFEFEF" w:color="auto" w:val="clear"/>
@@ -19757,8 +19773,8 @@
         <w:keepLines/>
         <w:pBdr>
           <w:top w:val="single" w:color="555555" w:sz="6" w:space="6"/>
+          <w:left w:val="single" w:color="555555" w:sz="6" w:space="6"/>
           <w:bottom w:val="single" w:color="555555" w:sz="6" w:space="6"/>
-          <w:left w:val="single" w:color="555555" w:sz="6" w:space="6"/>
           <w:right w:val="single" w:color="555555" w:sz="6" w:space="6"/>
         </w:pBdr>
         <w:shd w:fill="EFEFEF" w:color="auto" w:val="clear"/>
@@ -19783,8 +19799,8 @@
         <w:keepLines/>
         <w:pBdr>
           <w:top w:val="single" w:color="555555" w:sz="6" w:space="6"/>
+          <w:left w:val="single" w:color="555555" w:sz="6" w:space="6"/>
           <w:bottom w:val="single" w:color="555555" w:sz="6" w:space="6"/>
-          <w:left w:val="single" w:color="555555" w:sz="6" w:space="6"/>
           <w:right w:val="single" w:color="555555" w:sz="6" w:space="6"/>
         </w:pBdr>
         <w:shd w:fill="EFEFEF" w:color="auto" w:val="clear"/>
@@ -22808,8 +22824,8 @@
         <w:keepLines/>
         <w:pBdr>
           <w:top w:val="single" w:color="555555" w:sz="6" w:space="6"/>
+          <w:left w:val="single" w:color="555555" w:sz="6" w:space="6"/>
           <w:bottom w:val="single" w:color="555555" w:sz="6" w:space="6"/>
-          <w:left w:val="single" w:color="555555" w:sz="6" w:space="6"/>
           <w:right w:val="single" w:color="555555" w:sz="6" w:space="6"/>
         </w:pBdr>
         <w:shd w:fill="EFEFEF" w:color="auto" w:val="clear"/>
@@ -22834,8 +22850,8 @@
         <w:keepLines/>
         <w:pBdr>
           <w:top w:val="single" w:color="555555" w:sz="6" w:space="6"/>
+          <w:left w:val="single" w:color="555555" w:sz="6" w:space="6"/>
           <w:bottom w:val="single" w:color="555555" w:sz="6" w:space="6"/>
-          <w:left w:val="single" w:color="555555" w:sz="6" w:space="6"/>
           <w:right w:val="single" w:color="555555" w:sz="6" w:space="6"/>
         </w:pBdr>
         <w:shd w:fill="EFEFEF" w:color="auto" w:val="clear"/>
@@ -23865,8 +23881,8 @@
         <w:keepLines/>
         <w:pBdr>
           <w:top w:val="single" w:color="555555" w:sz="6" w:space="6"/>
+          <w:left w:val="single" w:color="555555" w:sz="6" w:space="6"/>
           <w:bottom w:val="single" w:color="555555" w:sz="6" w:space="6"/>
-          <w:left w:val="single" w:color="555555" w:sz="6" w:space="6"/>
           <w:right w:val="single" w:color="555555" w:sz="6" w:space="6"/>
         </w:pBdr>
         <w:shd w:fill="EFEFEF" w:color="auto" w:val="clear"/>
@@ -23891,8 +23907,8 @@
         <w:keepLines/>
         <w:pBdr>
           <w:top w:val="single" w:color="555555" w:sz="6" w:space="6"/>
+          <w:left w:val="single" w:color="555555" w:sz="6" w:space="6"/>
           <w:bottom w:val="single" w:color="555555" w:sz="6" w:space="6"/>
-          <w:left w:val="single" w:color="555555" w:sz="6" w:space="6"/>
           <w:right w:val="single" w:color="555555" w:sz="6" w:space="6"/>
         </w:pBdr>
         <w:shd w:fill="EFEFEF" w:color="auto" w:val="clear"/>
@@ -25530,8 +25546,8 @@
         <w:keepLines/>
         <w:pBdr>
           <w:top w:val="single" w:color="555555" w:sz="6" w:space="6"/>
+          <w:left w:val="single" w:color="555555" w:sz="6" w:space="6"/>
           <w:bottom w:val="single" w:color="555555" w:sz="6" w:space="6"/>
-          <w:left w:val="single" w:color="555555" w:sz="6" w:space="6"/>
           <w:right w:val="single" w:color="555555" w:sz="6" w:space="6"/>
         </w:pBdr>
         <w:shd w:fill="EFEFEF" w:color="auto" w:val="clear"/>
@@ -25556,8 +25572,8 @@
         <w:keepLines/>
         <w:pBdr>
           <w:top w:val="single" w:color="555555" w:sz="6" w:space="6"/>
+          <w:left w:val="single" w:color="555555" w:sz="6" w:space="6"/>
           <w:bottom w:val="single" w:color="555555" w:sz="6" w:space="6"/>
-          <w:left w:val="single" w:color="555555" w:sz="6" w:space="6"/>
           <w:right w:val="single" w:color="555555" w:sz="6" w:space="6"/>
         </w:pBdr>
         <w:shd w:fill="EFEFEF" w:color="auto" w:val="clear"/>
@@ -26809,8 +26825,8 @@
         <w:keepLines/>
         <w:pBdr>
           <w:top w:val="single" w:color="555555" w:sz="6" w:space="6"/>
+          <w:left w:val="single" w:color="555555" w:sz="6" w:space="6"/>
           <w:bottom w:val="single" w:color="555555" w:sz="6" w:space="6"/>
-          <w:left w:val="single" w:color="555555" w:sz="6" w:space="6"/>
           <w:right w:val="single" w:color="555555" w:sz="6" w:space="6"/>
         </w:pBdr>
         <w:shd w:fill="EFEFEF" w:color="auto" w:val="clear"/>
@@ -26835,8 +26851,8 @@
         <w:keepLines/>
         <w:pBdr>
           <w:top w:val="single" w:color="555555" w:sz="6" w:space="6"/>
+          <w:left w:val="single" w:color="555555" w:sz="6" w:space="6"/>
           <w:bottom w:val="single" w:color="555555" w:sz="6" w:space="6"/>
-          <w:left w:val="single" w:color="555555" w:sz="6" w:space="6"/>
           <w:right w:val="single" w:color="555555" w:sz="6" w:space="6"/>
         </w:pBdr>
         <w:shd w:fill="EFEFEF" w:color="auto" w:val="clear"/>
@@ -27931,8 +27947,8 @@
         <w:keepLines/>
         <w:pBdr>
           <w:top w:val="single" w:color="555555" w:sz="6" w:space="6"/>
+          <w:left w:val="single" w:color="555555" w:sz="6" w:space="6"/>
           <w:bottom w:val="single" w:color="555555" w:sz="6" w:space="6"/>
-          <w:left w:val="single" w:color="555555" w:sz="6" w:space="6"/>
           <w:right w:val="single" w:color="555555" w:sz="6" w:space="6"/>
         </w:pBdr>
         <w:shd w:fill="EFEFEF" w:color="auto" w:val="clear"/>
@@ -27957,8 +27973,8 @@
         <w:keepLines/>
         <w:pBdr>
           <w:top w:val="single" w:color="555555" w:sz="6" w:space="6"/>
+          <w:left w:val="single" w:color="555555" w:sz="6" w:space="6"/>
           <w:bottom w:val="single" w:color="555555" w:sz="6" w:space="6"/>
-          <w:left w:val="single" w:color="555555" w:sz="6" w:space="6"/>
           <w:right w:val="single" w:color="555555" w:sz="6" w:space="6"/>
         </w:pBdr>
         <w:shd w:fill="EFEFEF" w:color="auto" w:val="clear"/>
@@ -29275,8 +29291,8 @@
         <w:keepLines/>
         <w:pBdr>
           <w:top w:val="single" w:color="555555" w:sz="6" w:space="6"/>
+          <w:left w:val="single" w:color="555555" w:sz="6" w:space="6"/>
           <w:bottom w:val="single" w:color="555555" w:sz="6" w:space="6"/>
-          <w:left w:val="single" w:color="555555" w:sz="6" w:space="6"/>
           <w:right w:val="single" w:color="555555" w:sz="6" w:space="6"/>
         </w:pBdr>
         <w:shd w:fill="EFEFEF" w:color="auto" w:val="clear"/>
@@ -29301,8 +29317,8 @@
         <w:keepLines/>
         <w:pBdr>
           <w:top w:val="single" w:color="555555" w:sz="6" w:space="6"/>
+          <w:left w:val="single" w:color="555555" w:sz="6" w:space="6"/>
           <w:bottom w:val="single" w:color="555555" w:sz="6" w:space="6"/>
-          <w:left w:val="single" w:color="555555" w:sz="6" w:space="6"/>
           <w:right w:val="single" w:color="555555" w:sz="6" w:space="6"/>
         </w:pBdr>
         <w:shd w:fill="EFEFEF" w:color="auto" w:val="clear"/>
@@ -31032,8 +31048,8 @@
         <w:keepLines/>
         <w:pBdr>
           <w:top w:val="single" w:color="555555" w:sz="6" w:space="6"/>
+          <w:left w:val="single" w:color="555555" w:sz="6" w:space="6"/>
           <w:bottom w:val="single" w:color="555555" w:sz="6" w:space="6"/>
-          <w:left w:val="single" w:color="555555" w:sz="6" w:space="6"/>
           <w:right w:val="single" w:color="555555" w:sz="6" w:space="6"/>
         </w:pBdr>
         <w:shd w:fill="EFEFEF" w:color="auto" w:val="clear"/>
@@ -31058,8 +31074,8 @@
         <w:keepLines/>
         <w:pBdr>
           <w:top w:val="single" w:color="555555" w:sz="6" w:space="6"/>
+          <w:left w:val="single" w:color="555555" w:sz="6" w:space="6"/>
           <w:bottom w:val="single" w:color="555555" w:sz="6" w:space="6"/>
-          <w:left w:val="single" w:color="555555" w:sz="6" w:space="6"/>
           <w:right w:val="single" w:color="555555" w:sz="6" w:space="6"/>
         </w:pBdr>
         <w:shd w:fill="EFEFEF" w:color="auto" w:val="clear"/>
@@ -31772,8 +31788,8 @@
         <w:keepLines/>
         <w:pBdr>
           <w:top w:val="single" w:color="555555" w:sz="6" w:space="6"/>
+          <w:left w:val="single" w:color="555555" w:sz="6" w:space="6"/>
           <w:bottom w:val="single" w:color="555555" w:sz="6" w:space="6"/>
-          <w:left w:val="single" w:color="555555" w:sz="6" w:space="6"/>
           <w:right w:val="single" w:color="555555" w:sz="6" w:space="6"/>
         </w:pBdr>
         <w:shd w:fill="EFEFEF" w:color="auto" w:val="clear"/>
@@ -31798,8 +31814,8 @@
         <w:keepLines/>
         <w:pBdr>
           <w:top w:val="single" w:color="555555" w:sz="6" w:space="6"/>
+          <w:left w:val="single" w:color="555555" w:sz="6" w:space="6"/>
           <w:bottom w:val="single" w:color="555555" w:sz="6" w:space="6"/>
-          <w:left w:val="single" w:color="555555" w:sz="6" w:space="6"/>
           <w:right w:val="single" w:color="555555" w:sz="6" w:space="6"/>
         </w:pBdr>
         <w:shd w:fill="EFEFEF" w:color="auto" w:val="clear"/>
@@ -33880,8 +33896,8 @@
         <w:keepLines/>
         <w:pBdr>
           <w:top w:val="single" w:color="555555" w:sz="6" w:space="6"/>
+          <w:left w:val="single" w:color="555555" w:sz="6" w:space="6"/>
           <w:bottom w:val="single" w:color="555555" w:sz="6" w:space="6"/>
-          <w:left w:val="single" w:color="555555" w:sz="6" w:space="6"/>
           <w:right w:val="single" w:color="555555" w:sz="6" w:space="6"/>
         </w:pBdr>
         <w:shd w:fill="EFEFEF" w:color="auto" w:val="clear"/>
@@ -33906,8 +33922,8 @@
         <w:keepLines/>
         <w:pBdr>
           <w:top w:val="single" w:color="555555" w:sz="6" w:space="6"/>
+          <w:left w:val="single" w:color="555555" w:sz="6" w:space="6"/>
           <w:bottom w:val="single" w:color="555555" w:sz="6" w:space="6"/>
-          <w:left w:val="single" w:color="555555" w:sz="6" w:space="6"/>
           <w:right w:val="single" w:color="555555" w:sz="6" w:space="6"/>
         </w:pBdr>
         <w:shd w:fill="EFEFEF" w:color="auto" w:val="clear"/>
@@ -38203,8 +38219,8 @@
         <w:keepLines/>
         <w:pBdr>
           <w:top w:val="single" w:color="555555" w:sz="6" w:space="6"/>
+          <w:left w:val="single" w:color="555555" w:sz="6" w:space="6"/>
           <w:bottom w:val="single" w:color="555555" w:sz="6" w:space="6"/>
-          <w:left w:val="single" w:color="555555" w:sz="6" w:space="6"/>
           <w:right w:val="single" w:color="555555" w:sz="6" w:space="6"/>
         </w:pBdr>
         <w:shd w:fill="EFEFEF" w:color="auto" w:val="clear"/>
@@ -38229,8 +38245,8 @@
         <w:keepLines/>
         <w:pBdr>
           <w:top w:val="single" w:color="555555" w:sz="6" w:space="6"/>
+          <w:left w:val="single" w:color="555555" w:sz="6" w:space="6"/>
           <w:bottom w:val="single" w:color="555555" w:sz="6" w:space="6"/>
-          <w:left w:val="single" w:color="555555" w:sz="6" w:space="6"/>
           <w:right w:val="single" w:color="555555" w:sz="6" w:space="6"/>
         </w:pBdr>
         <w:shd w:fill="EFEFEF" w:color="auto" w:val="clear"/>
@@ -38904,7 +38920,7 @@
       </w:r>
     </w:p>
     <w:sectPr>
-      <w:footerReference w:type="default" r:id="rId7"/>
+      <w:footerReference w:type="default" r:id="rId6"/>
       <w:pgSz w:w="7938" w:h="11907" w:orient="portrait"/>
       <w:pgMar w:top="1134" w:right="1077" w:bottom="1247" w:left="1191" w:header="708" w:footer="567" w:gutter="0"/>
       <w:pgNumType w:start="1"/>
@@ -38912,10 +38928,6 @@
     </w:sectPr>
   </w:body>
 </w:document>
-</file>
-
-<file path=word/comments.xml><?xml version="1.0" encoding="utf-8"?>
-<w:comments xmlns:cx="http://schemas.microsoft.com/office/drawing/2014/chartex" xmlns:cx1="http://schemas.microsoft.com/office/drawing/2015/9/8/chartex" xmlns:cx2="http://schemas.microsoft.com/office/drawing/2015/10/21/chartex" xmlns:cx3="http://schemas.microsoft.com/office/drawing/2016/5/9/chartex" xmlns:cx4="http://schemas.microsoft.com/office/drawing/2016/5/10/chartex" xmlns:cx5="http://schemas.microsoft.com/office/drawing/2016/5/11/chartex" xmlns:cx6="http://schemas.microsoft.com/office/drawing/2016/5/12/chartex" xmlns:cx7="http://schemas.microsoft.com/office/drawing/2016/5/13/chartex" xmlns:cx8="http://schemas.microsoft.com/office/drawing/2016/5/14/chartex" xmlns:mc="http://schemas.openxmlformats.org/markup-compatibility/2006" xmlns:aink="http://schemas.microsoft.com/office/drawing/2016/ink" xmlns:am3d="http://schemas.microsoft.com/office/drawing/2017/model3d" xmlns:o="urn:schemas-microsoft-com:office:office" xmlns:r="http://schemas.openxmlformats.org/officeDocument/2006/relationships" xmlns:m="http://schemas.openxmlformats.org/officeDocument/2006/math" xmlns:v="urn:schemas-microsoft-com:vml" xmlns:wp14="http://schemas.microsoft.com/office/word/2010/wordprocessingDrawing" xmlns:wp="http://schemas.openxmlformats.org/drawingml/2006/wordprocessingDrawing" xmlns:w10="urn:schemas-microsoft-com:office:word" xmlns:w="http://schemas.openxmlformats.org/wordprocessingml/2006/main" xmlns:w14="http://schemas.microsoft.com/office/word/2010/wordml" xmlns:w15="http://schemas.microsoft.com/office/word/2012/wordml" xmlns:w16cex="http://schemas.microsoft.com/office/word/2018/wordml/cex" xmlns:w16cid="http://schemas.microsoft.com/office/word/2016/wordml/cid" xmlns:w16="http://schemas.microsoft.com/office/word/2018/wordml" xmlns:w16sdtdh="http://schemas.microsoft.com/office/word/2020/wordml/sdtdatahash" xmlns:w16se="http://schemas.microsoft.com/office/word/2015/wordml/symex" xmlns:wpg="http://schemas.microsoft.com/office/word/2010/wordprocessingGroup" xmlns:wpi="http://schemas.microsoft.com/office/word/2010/wordprocessingInk" xmlns:wne="http://schemas.microsoft.com/office/word/2006/wordml" xmlns:wps="http://schemas.microsoft.com/office/word/2010/wordprocessingShape"/>
 </file>
 
 <file path=word/endnotes.xml><?xml version="1.0" encoding="utf-8"?>
@@ -39017,7 +39029,7 @@
 <w:numbering xmlns:wpc="http://schemas.microsoft.com/office/word/2010/wordprocessingCanvas" xmlns:mc="http://schemas.openxmlformats.org/markup-compatibility/2006" xmlns:o="urn:schemas-microsoft-com:office:office" xmlns:r="http://schemas.openxmlformats.org/officeDocument/2006/relationships" xmlns:m="http://schemas.openxmlformats.org/officeDocument/2006/math" xmlns:v="urn:schemas-microsoft-com:vml" xmlns:wp14="http://schemas.microsoft.com/office/word/2010/wordprocessingDrawing" xmlns:wp="http://schemas.openxmlformats.org/drawingml/2006/wordprocessingDrawing" xmlns:w10="urn:schemas-microsoft-com:office:word" xmlns:w="http://schemas.openxmlformats.org/wordprocessingml/2006/main" xmlns:w14="http://schemas.microsoft.com/office/word/2010/wordml" xmlns:w15="http://schemas.microsoft.com/office/word/2012/wordml" xmlns:wpg="http://schemas.microsoft.com/office/word/2010/wordprocessingGroup" xmlns:wpi="http://schemas.microsoft.com/office/word/2010/wordprocessingInk" xmlns:wne="http://schemas.microsoft.com/office/word/2006/wordml" xmlns:wps="http://schemas.microsoft.com/office/word/2010/wordprocessingShape" mc:Ignorable="w14 w15 wp14">
   <w:abstractNum w:abstractNumId="1" w15:restartNumberingAfterBreak="0">
     <w:multiLevelType w:val="hybridMultilevel"/>
-    <w:lvl w:ilvl="0" w15:tentative="1">
+    <w:lvl w:ilvl="0" w:tentative="1">
       <w:start w:val="1"/>
       <w:numFmt w:val="bullet"/>
       <w:lvlText w:val="●"/>
@@ -39026,7 +39038,7 @@
         <w:ind w:left="720" w:hanging="360"/>
       </w:pPr>
     </w:lvl>
-    <w:lvl w:ilvl="1" w15:tentative="1">
+    <w:lvl w:ilvl="1" w:tentative="1">
       <w:start w:val="1"/>
       <w:numFmt w:val="bullet"/>
       <w:lvlText w:val="○"/>
@@ -39035,7 +39047,7 @@
         <w:ind w:left="1440" w:hanging="360"/>
       </w:pPr>
     </w:lvl>
-    <w:lvl w:ilvl="2" w15:tentative="1">
+    <w:lvl w:ilvl="2" w:tentative="1">
       <w:start w:val="1"/>
       <w:numFmt w:val="bullet"/>
       <w:lvlText w:val="■"/>
@@ -39044,7 +39056,7 @@
         <w:ind w:left="2160" w:hanging="360"/>
       </w:pPr>
     </w:lvl>
-    <w:lvl w:ilvl="3" w15:tentative="1">
+    <w:lvl w:ilvl="3" w:tentative="1">
       <w:start w:val="1"/>
       <w:numFmt w:val="bullet"/>
       <w:lvlText w:val="●"/>
@@ -39053,7 +39065,7 @@
         <w:ind w:left="2880" w:hanging="360"/>
       </w:pPr>
     </w:lvl>
-    <w:lvl w:ilvl="4" w15:tentative="1">
+    <w:lvl w:ilvl="4" w:tentative="1">
       <w:start w:val="1"/>
       <w:numFmt w:val="bullet"/>
       <w:lvlText w:val="○"/>
@@ -39062,7 +39074,7 @@
         <w:ind w:left="3600" w:hanging="360"/>
       </w:pPr>
     </w:lvl>
-    <w:lvl w:ilvl="5" w15:tentative="1">
+    <w:lvl w:ilvl="5" w:tentative="1">
       <w:start w:val="1"/>
       <w:numFmt w:val="bullet"/>
       <w:lvlText w:val="■"/>
@@ -39071,7 +39083,7 @@
         <w:ind w:left="4320" w:hanging="360"/>
       </w:pPr>
     </w:lvl>
-    <w:lvl w:ilvl="6" w15:tentative="1">
+    <w:lvl w:ilvl="6" w:tentative="1">
       <w:start w:val="1"/>
       <w:numFmt w:val="bullet"/>
       <w:lvlText w:val="●"/>
@@ -39080,7 +39092,7 @@
         <w:ind w:left="5040" w:hanging="360"/>
       </w:pPr>
     </w:lvl>
-    <w:lvl w:ilvl="7" w15:tentative="1">
+    <w:lvl w:ilvl="7" w:tentative="1">
       <w:start w:val="1"/>
       <w:numFmt w:val="bullet"/>
       <w:lvlText w:val="●"/>
@@ -39089,7 +39101,7 @@
         <w:ind w:left="5760" w:hanging="360"/>
       </w:pPr>
     </w:lvl>
-    <w:lvl w:ilvl="8" w15:tentative="1">
+    <w:lvl w:ilvl="8" w:tentative="1">
       <w:start w:val="1"/>
       <w:numFmt w:val="bullet"/>
       <w:lvlText w:val="●"/>
@@ -39120,6 +39132,10 @@
     </w:rPrDefault>
     <w:pPrDefault/>
   </w:docDefaults>
+  <w:style w:type="paragraph" w:styleId="Normal" w:default="1">
+    <w:name w:val="Normal"/>
+    <w:qFormat/>
+  </w:style>
   <w:style w:type="paragraph" w:styleId="Title">
     <w:name w:val="Title"/>
     <w:basedOn w:val="Normal"/>
@@ -39292,4 +39308,294 @@
     </w:rPr>
   </w:style>
 </w:styles>
+</file>
+
+<file path=word/theme/theme1.xml><?xml version="1.0" encoding="utf-8"?>
+<a:theme xmlns:a="http://schemas.openxmlformats.org/drawingml/2006/main" name="Office Theme">
+  <a:themeElements>
+    <a:clrScheme name="Office">
+      <a:dk1>
+        <a:sysClr val="windowText" lastClr="000000"/>
+      </a:dk1>
+      <a:lt1>
+        <a:sysClr val="window" lastClr="FFFFFF"/>
+      </a:lt1>
+      <a:dk2>
+        <a:srgbClr val="44546A"/>
+      </a:dk2>
+      <a:lt2>
+        <a:srgbClr val="E7E6E6"/>
+      </a:lt2>
+      <a:accent1>
+        <a:srgbClr val="4472C4"/>
+      </a:accent1>
+      <a:accent2>
+        <a:srgbClr val="ED7D31"/>
+      </a:accent2>
+      <a:accent3>
+        <a:srgbClr val="A5A5A5"/>
+      </a:accent3>
+      <a:accent4>
+        <a:srgbClr val="FFC000"/>
+      </a:accent4>
+      <a:accent5>
+        <a:srgbClr val="5B9BD5"/>
+      </a:accent5>
+      <a:accent6>
+        <a:srgbClr val="70AD47"/>
+      </a:accent6>
+      <a:hlink>
+        <a:srgbClr val="0563C1"/>
+      </a:hlink>
+      <a:folHlink>
+        <a:srgbClr val="954F72"/>
+      </a:folHlink>
+    </a:clrScheme>
+    <a:fontScheme name="Office">
+      <a:majorFont>
+        <a:latin typeface="Calibri Light" panose="020F0302020204030204"/>
+        <a:ea typeface=""/>
+        <a:cs typeface=""/>
+        <a:font script="Jpan" typeface="游ゴシック Light"/>
+        <a:font script="Hang" typeface="맑은 고딕"/>
+        <a:font script="Hans" typeface="等线 Light"/>
+        <a:font script="Hant" typeface="新細明體"/>
+        <a:font script="Arab" typeface="Times New Roman"/>
+        <a:font script="Hebr" typeface="Times New Roman"/>
+        <a:font script="Thai" typeface="Angsana New"/>
+        <a:font script="Ethi" typeface="Nyala"/>
+        <a:font script="Beng" typeface="Vrinda"/>
+        <a:font script="Gujr" typeface="Shruti"/>
+        <a:font script="Khmr" typeface="MoolBoran"/>
+        <a:font script="Knda" typeface="Tunga"/>
+        <a:font script="Guru" typeface="Raavi"/>
+        <a:font script="Cans" typeface="Euphemia"/>
+        <a:font script="Cher" typeface="Plantagenet Cherokee"/>
+        <a:font script="Yiii" typeface="Microsoft Yi Baiti"/>
+        <a:font script="Tibt" typeface="Microsoft Himalaya"/>
+        <a:font script="Thaa" typeface="MV Boli"/>
+        <a:font script="Deva" typeface="Mangal"/>
+        <a:font script="Telu" typeface="Gautami"/>
+        <a:font script="Taml" typeface="Latha"/>
+        <a:font script="Syrc" typeface="Estrangelo Edessa"/>
+        <a:font script="Orya" typeface="Kalinga"/>
+        <a:font script="Mlym" typeface="Kartika"/>
+        <a:font script="Laoo" typeface="DokChampa"/>
+        <a:font script="Sinh" typeface="Iskoola Pota"/>
+        <a:font script="Mong" typeface="Mongolian Baiti"/>
+        <a:font script="Viet" typeface="Times New Roman"/>
+        <a:font script="Uigh" typeface="Microsoft Uighur"/>
+        <a:font script="Geor" typeface="Sylfaen"/>
+        <a:font script="Armn" typeface="Arial"/>
+        <a:font script="Bugi" typeface="Leelawadee UI"/>
+        <a:font script="Bopo" typeface="Microsoft JhengHei"/>
+        <a:font script="Java" typeface="Javanese Text"/>
+        <a:font script="Lisu" typeface="Segoe UI"/>
+        <a:font script="Mymr" typeface="Myanmar Text"/>
+        <a:font script="Nkoo" typeface="Ebrima"/>
+        <a:font script="Olck" typeface="Nirmala UI"/>
+        <a:font script="Osma" typeface="Ebrima"/>
+        <a:font script="Phag" typeface="Phagspa"/>
+        <a:font script="Syrn" typeface="Estrangelo Edessa"/>
+        <a:font script="Syrj" typeface="Estrangelo Edessa"/>
+        <a:font script="Syre" typeface="Estrangelo Edessa"/>
+        <a:font script="Sora" typeface="Nirmala UI"/>
+        <a:font script="Tale" typeface="Microsoft Tai Le"/>
+        <a:font script="Talu" typeface="Microsoft New Tai Lue"/>
+        <a:font script="Tfng" typeface="Ebrima"/>
+      </a:majorFont>
+      <a:minorFont>
+        <a:latin typeface="Calibri" panose="020F0502020204030204"/>
+        <a:ea typeface=""/>
+        <a:cs typeface=""/>
+        <a:font script="Jpan" typeface="游明朝"/>
+        <a:font script="Hang" typeface="맑은 고딕"/>
+        <a:font script="Hans" typeface="等线"/>
+        <a:font script="Hant" typeface="新細明體"/>
+        <a:font script="Arab" typeface="Arial"/>
+        <a:font script="Hebr" typeface="Arial"/>
+        <a:font script="Thai" typeface="Cordia New"/>
+        <a:font script="Ethi" typeface="Nyala"/>
+        <a:font script="Beng" typeface="Vrinda"/>
+        <a:font script="Gujr" typeface="Shruti"/>
+        <a:font script="Khmr" typeface="DaunPenh"/>
+        <a:font script="Knda" typeface="Tunga"/>
+        <a:font script="Guru" typeface="Raavi"/>
+        <a:font script="Cans" typeface="Euphemia"/>
+        <a:font script="Cher" typeface="Plantagenet Cherokee"/>
+        <a:font script="Yiii" typeface="Microsoft Yi Baiti"/>
+        <a:font script="Tibt" typeface="Microsoft Himalaya"/>
+        <a:font script="Thaa" typeface="MV Boli"/>
+        <a:font script="Deva" typeface="Mangal"/>
+        <a:font script="Telu" typeface="Gautami"/>
+        <a:font script="Taml" typeface="Latha"/>
+        <a:font script="Syrc" typeface="Estrangelo Edessa"/>
+        <a:font script="Orya" typeface="Kalinga"/>
+        <a:font script="Mlym" typeface="Kartika"/>
+        <a:font script="Laoo" typeface="DokChampa"/>
+        <a:font script="Sinh" typeface="Iskoola Pota"/>
+        <a:font script="Mong" typeface="Mongolian Baiti"/>
+        <a:font script="Viet" typeface="Arial"/>
+        <a:font script="Uigh" typeface="Microsoft Uighur"/>
+        <a:font script="Geor" typeface="Sylfaen"/>
+        <a:font script="Armn" typeface="Arial"/>
+        <a:font script="Bugi" typeface="Leelawadee UI"/>
+        <a:font script="Bopo" typeface="Microsoft JhengHei"/>
+        <a:font script="Java" typeface="Javanese Text"/>
+        <a:font script="Lisu" typeface="Segoe UI"/>
+        <a:font script="Mymr" typeface="Myanmar Text"/>
+        <a:font script="Nkoo" typeface="Ebrima"/>
+        <a:font script="Olck" typeface="Nirmala UI"/>
+        <a:font script="Osma" typeface="Ebrima"/>
+        <a:font script="Phag" typeface="Phagspa"/>
+        <a:font script="Syrn" typeface="Estrangelo Edessa"/>
+        <a:font script="Syrj" typeface="Estrangelo Edessa"/>
+        <a:font script="Syre" typeface="Estrangelo Edessa"/>
+        <a:font script="Sora" typeface="Nirmala UI"/>
+        <a:font script="Tale" typeface="Microsoft Tai Le"/>
+        <a:font script="Talu" typeface="Microsoft New Tai Lue"/>
+        <a:font script="Tfng" typeface="Ebrima"/>
+      </a:minorFont>
+    </a:fontScheme>
+    <a:fmtScheme name="Office">
+      <a:fillStyleLst>
+        <a:solidFill>
+          <a:schemeClr val="phClr"/>
+        </a:solidFill>
+        <a:gradFill rotWithShape="true">
+          <a:gsLst>
+            <a:gs pos="0">
+              <a:schemeClr val="phClr">
+                <a:lumMod val="110000"/>
+                <a:satMod val="105000"/>
+                <a:tint val="67000"/>
+              </a:schemeClr>
+            </a:gs>
+            <a:gs pos="50000">
+              <a:schemeClr val="phClr">
+                <a:lumMod val="105000"/>
+                <a:satMod val="103000"/>
+                <a:tint val="73000"/>
+              </a:schemeClr>
+            </a:gs>
+            <a:gs pos="100000">
+              <a:schemeClr val="phClr">
+                <a:lumMod val="105000"/>
+                <a:satMod val="109000"/>
+                <a:tint val="81000"/>
+              </a:schemeClr>
+            </a:gs>
+          </a:gsLst>
+          <a:lin ang="5400000" scaled="false"/>
+        </a:gradFill>
+        <a:gradFill rotWithShape="true">
+          <a:gsLst>
+            <a:gs pos="0">
+              <a:schemeClr val="phClr">
+                <a:satMod val="103000"/>
+                <a:lumMod val="102000"/>
+                <a:tint val="94000"/>
+              </a:schemeClr>
+            </a:gs>
+            <a:gs pos="50000">
+              <a:schemeClr val="phClr">
+                <a:satMod val="110000"/>
+                <a:lumMod val="100000"/>
+                <a:shade val="100000"/>
+              </a:schemeClr>
+            </a:gs>
+            <a:gs pos="100000">
+              <a:schemeClr val="phClr">
+                <a:lumMod val="99000"/>
+                <a:satMod val="120000"/>
+                <a:shade val="78000"/>
+              </a:schemeClr>
+            </a:gs>
+          </a:gsLst>
+          <a:lin ang="5400000" scaled="false"/>
+        </a:gradFill>
+      </a:fillStyleLst>
+      <a:lnStyleLst>
+        <a:ln w="6350" cap="flat" cmpd="sng" algn="ctr">
+          <a:solidFill>
+            <a:schemeClr val="phClr"/>
+          </a:solidFill>
+          <a:prstDash val="solid"/>
+          <a:miter lim="800000"/>
+        </a:ln>
+        <a:ln w="12700" cap="flat" cmpd="sng" algn="ctr">
+          <a:solidFill>
+            <a:schemeClr val="phClr"/>
+          </a:solidFill>
+          <a:prstDash val="solid"/>
+          <a:miter lim="800000"/>
+        </a:ln>
+        <a:ln w="19050" cap="flat" cmpd="sng" algn="ctr">
+          <a:solidFill>
+            <a:schemeClr val="phClr"/>
+          </a:solidFill>
+          <a:prstDash val="solid"/>
+          <a:miter lim="800000"/>
+        </a:ln>
+      </a:lnStyleLst>
+      <a:effectStyleLst>
+        <a:effectStyle>
+          <a:effectLst/>
+        </a:effectStyle>
+        <a:effectStyle>
+          <a:effectLst/>
+        </a:effectStyle>
+        <a:effectStyle>
+          <a:effectLst>
+            <a:outerShdw blurRad="57150" dist="19050" dir="5400000" algn="ctr" rotWithShape="false">
+              <a:srgbClr val="000000">
+                <a:alpha val="63000"/>
+              </a:srgbClr>
+            </a:outerShdw>
+          </a:effectLst>
+        </a:effectStyle>
+      </a:effectStyleLst>
+      <a:bgFillStyleLst>
+        <a:solidFill>
+          <a:schemeClr val="phClr"/>
+        </a:solidFill>
+        <a:solidFill>
+          <a:schemeClr val="phClr">
+            <a:tint val="95000"/>
+            <a:satMod val="170000"/>
+          </a:schemeClr>
+        </a:solidFill>
+        <a:gradFill rotWithShape="true">
+          <a:gsLst>
+            <a:gs pos="0">
+              <a:schemeClr val="phClr">
+                <a:tint val="93000"/>
+                <a:satMod val="150000"/>
+                <a:shade val="98000"/>
+                <a:lumMod val="102000"/>
+              </a:schemeClr>
+            </a:gs>
+            <a:gs pos="50000">
+              <a:schemeClr val="phClr">
+                <a:tint val="98000"/>
+                <a:satMod val="130000"/>
+                <a:shade val="90000"/>
+                <a:lumMod val="103000"/>
+              </a:schemeClr>
+            </a:gs>
+            <a:gs pos="100000">
+              <a:schemeClr val="phClr">
+                <a:shade val="63000"/>
+                <a:satMod val="120000"/>
+              </a:schemeClr>
+            </a:gs>
+          </a:gsLst>
+          <a:lin ang="5400000" scaled="false"/>
+        </a:gradFill>
+      </a:bgFillStyleLst>
+    </a:fmtScheme>
+  </a:themeElements>
+  <a:objectDefaults/>
+  <a:extraClrSchemeLst/>
+</a:theme>
 </file>
</xml_diff>